<commit_message>
Dora research pass 21: Louisa Mays FAN, Bunch nil, IA block log
- L136-L139: T9-427 fetch block, Lee Books Bunch nil, Patsey Farley obit
  (Louisa Mays Cressmont), Yell GT deaths nil Stone reconfirmed
- C130 POSSIBLE FAN bridge for Link Mays witnesses; S101 citation enriched
- Update dossier, backlog handoff, Word biography chapter 2
- Ignore local 1880-ed59-batch downloads; build_dora_book invokes Word builder

Co-authored-by: CatCorner22 <CatCorner22@users.noreply.github.com>
</commit_message>
<xml_diff>
--- a/research/dora-ella-newnam/book/Dora-Ella-Newnam-Stone-A-Life.docx
+++ b/research/dora-ella-newnam/book/Dora-Ella-Newnam-Stone-A-Life.docx
@@ -171,7 +171,25 @@
         <w:t>Link</w:t>
       </w:r>
       <w:r>
-        <w:t xml:space="preserve">. [S116] The 1880 ED 59 originals read for this case (sheets 1–2 around John and Elias) have not yet shown a </w:t>
+        <w:t xml:space="preserve">. [S116] Patsey Pendergrass Farley’s 1937 obituary names a sister </w:t>
+      </w:r>
+      <w:r>
+        <w:rPr>
+          <w:b/>
+        </w:rPr>
+        <w:t>Mrs. Louisa Mays, Cressmont</w:t>
+      </w:r>
+      <w:r>
+        <w:t xml:space="preserve"> in the same survivor list as stepson </w:t>
+      </w:r>
+      <w:r>
+        <w:rPr>
+          <w:b/>
+        </w:rPr>
+        <w:t>Robert Newnam, Pebworth</w:t>
+      </w:r>
+      <w:r>
+        <w:t xml:space="preserve"> — a possible kin bridge to the Mays witnesses, not an identification of Link. [C130] [S101] The 1880 ED 59 originals read for this case (sheets 1–2 around John and Elias) have not yet shown a </w:t>
       </w:r>
       <w:r>
         <w:rPr>
@@ -180,7 +198,7 @@
         <w:t>Mays</w:t>
       </w:r>
       <w:r>
-        <w:t xml:space="preserve"> line adjacent to dwelling 3; that proximity search stays open. [B014]</w:t>
+        <w:t xml:space="preserve"> line adjacent to dwelling 3; remaining sheets are blocked on Internet Archive from this environment. [B014] [L136]</w:t>
       </w:r>
     </w:p>
     <w:p>

</xml_diff>

<commit_message>
Dora research pass 22: Larkin Mays FAN, Rissie nil, Word book
- C130 upgraded: Louisa P. Mays (Cordy cemetery) = Patsey Farley sister
- C131 POSSIBLE Link Mays = Larkin Mays 1861-1895 (not merged)
- C132 Jiles Mays 1870/1873; C133 Mary MAYS ED 59 hh 102 mortality
- C134 Lee Books 5-15 no Rissie Newnam bride; C135 Yell marriages extract nil
- L140-L146; regenerate Dora-Ella-Newnam-Stone-A-Life.docx

Co-authored-by: CatCorner22 <CatCorner22@users.noreply.github.com>
</commit_message>
<xml_diff>
--- a/research/dora-ella-newnam/book/Dora-Ella-Newnam-Stone-A-Life.docx
+++ b/research/dora-ella-newnam/book/Dora-Ella-Newnam-Stone-A-Life.docx
@@ -126,7 +126,7 @@
         <w:t>Link Mays only once</w:t>
       </w:r>
       <w:r>
-        <w:t xml:space="preserve">: as witness beside Doll Newnam at this wedding. He is not a groom or bride in those transcriptions. That does not prove he never married elsewhere, but it fixes his documentary role at the ceremony as neighbor or kin, not as a party. [C127] [S116] Two years later, at Marion Durbin’s on 2 January 1889, </w:t>
+        <w:t xml:space="preserve">: as witness beside Doll Newnam at this wedding. He is not a groom or bride in those transcriptions. [C127] [S116] Two years later, at Marion Durbin’s on 2 January 1889, </w:t>
       </w:r>
       <w:r>
         <w:rPr>
@@ -144,7 +144,12 @@
         <w:t>Dilalrd Newnam</w:t>
       </w:r>
       <w:r>
-        <w:t xml:space="preserve"> — the same Mays surname cluster around Sturgeon Creek, not proof that Jiles is Link. [C125] [S113] The 1900 Sturgeon transcript lists eleven separate </w:t>
+        <w:t>. That Jiles is probably the farm labourer, twenty, in Andrew Mayse’s Proctor house in 1870 and the twenty-four-year-old who applied to marry Elizabeth Bowman on 22 March 1873 — a different man from Link, and not proof the two witnesses are the same person. [C125] [C132] [S121] [S125]</w:t>
+      </w:r>
+    </w:p>
+    <w:p>
+      <w:r>
+        <w:t xml:space="preserve">The 1900 Sturgeon transcript lists eleven </w:t>
       </w:r>
       <w:r>
         <w:rPr>
@@ -153,7 +158,7 @@
         <w:t>Mays</w:t>
       </w:r>
       <w:r>
-        <w:t xml:space="preserve"> households (Elizabeth as housekeeper; heads Eliza, William, James S., Renie, Isham, Rachel, David, Jackson, Henry, Dorothy) and </w:t>
+        <w:t xml:space="preserve"> households and </w:t>
       </w:r>
       <w:r>
         <w:rPr>
@@ -171,7 +176,25 @@
         <w:t>Link</w:t>
       </w:r>
       <w:r>
-        <w:t xml:space="preserve">. [S116] Patsey Pendergrass Farley’s 1937 obituary names a sister </w:t>
+        <w:t xml:space="preserve">. [S116] Absence in 1900 has a candidate explanation. At the Cordy Pendergrass Cemetery in Pebworth, Blanche Evans copied </w:t>
+      </w:r>
+      <w:r>
+        <w:rPr>
+          <w:b/>
+        </w:rPr>
+        <w:t>Larkin Mays</w:t>
+      </w:r>
+      <w:r>
+        <w:t xml:space="preserve">, 8 May 1861 – 8 July 1895, beside </w:t>
+      </w:r>
+      <w:r>
+        <w:rPr>
+          <w:b/>
+        </w:rPr>
+        <w:t>Louisa P. Mays</w:t>
+      </w:r>
+      <w:r>
+        <w:t xml:space="preserve">, 12 December 1861 (family death 13 April 1951), daughter of Cordy and Minerva Thompson Pendergrass — the same parents named for Patsey Farley in the next row. [S119] Patsey’s 1937 obituary called her sister </w:t>
       </w:r>
       <w:r>
         <w:rPr>
@@ -180,25 +203,48 @@
         <w:t>Mrs. Louisa Mays, Cressmont</w:t>
       </w:r>
       <w:r>
-        <w:t xml:space="preserve"> in the same survivor list as stepson </w:t>
+        <w:t xml:space="preserve">. [C130] [S101] The 1920 Sturgeon annotator identified Ida Plowman as daughter of </w:t>
       </w:r>
       <w:r>
         <w:rPr>
           <w:b/>
         </w:rPr>
-        <w:t>Robert Newnam, Pebworth</w:t>
+        <w:t>Larkin T. and Louisa Pendergrass Mays</w:t>
       </w:r>
       <w:r>
-        <w:t xml:space="preserve"> — a possible kin bridge to the Mays witnesses, not an identification of Link. [C130] [S101] The 1880 ED 59 originals read for this case (sheets 1–2 around John and Elias) have not yet shown a </w:t>
+        <w:t xml:space="preserve">. [S122] Larkin was twenty-four and living on the December 1885 wedding day and dead before June 1900. </w:t>
       </w:r>
       <w:r>
         <w:rPr>
           <w:b/>
         </w:rPr>
-        <w:t>Mays</w:t>
+        <w:t>Link</w:t>
       </w:r>
       <w:r>
-        <w:t xml:space="preserve"> line adjacent to dwelling 3; remaining sheets are blocked on Internet Archive from this environment. [B014] [L136]</w:t>
+        <w:t xml:space="preserve"> is a common nickname for Larkin. That is enough for a possible identity, not a merge: no paper yet uses both names. [C131]</w:t>
+      </w:r>
+    </w:p>
+    <w:p>
+      <w:r>
+        <w:t xml:space="preserve">Mays were already in District 59 in 1880. The mortality schedule Hampton filed for that district lists </w:t>
+      </w:r>
+      <w:r>
+        <w:rPr>
+          <w:b/>
+        </w:rPr>
+        <w:t>Mary Mays</w:t>
+      </w:r>
+      <w:r>
+        <w:t xml:space="preserve">, eighty-three, of household </w:t>
+      </w:r>
+      <w:r>
+        <w:rPr>
+          <w:b/>
+        </w:rPr>
+        <w:t>102</w:t>
+      </w:r>
+      <w:r>
+        <w:t>, dead of paralysis in January. [C133] [S120] Sheets 1–2 around John and Elias do not show her neighbours; the original page for dwelling 102 is still blocked on Internet Archive. [L136]</w:t>
       </w:r>
     </w:p>
     <w:p>
@@ -558,7 +604,7 @@
         <w:t>Rissa / Rissie</w:t>
       </w:r>
       <w:r>
-        <w:t>, May 1897. Later Pelfrey or Stamper identifications remain possible only. A Rissie Pelfrey Maxey born 1882 is a different woman.</w:t>
+        <w:t>, May 1897. Later Pelfrey or Stamper identifications remain possible only. Lee Marriage Books 5–15 have no Rissie or Rissa Newnam bride; a 1920 Rissa Newton, seventeen, is a different woman. [C134] A Rissie Pelfrey Maxey born 1882 is a different woman.</w:t>
       </w:r>
     </w:p>
     <w:p>
@@ -714,7 +760,7 @@
         <w:pStyle w:val="ListBullet"/>
       </w:pPr>
       <w:r>
-        <w:t>John H.; Mary Bunch’s death; Rissie’s Tennessee identification; the two unnamed children.</w:t>
+        <w:t>John H.; Mary Bunch’s death (Lee books and recent “Mary M. Bunch” obituaries do not match); Rissie’s Tennessee identification; the two unnamed children.</w:t>
       </w:r>
     </w:p>
     <w:p>

</xml_diff>

<commit_message>
Dora research pass 24: Greene ED 39 Stone nil, Proctor FAN, Word book
Retain T623-856 and visually read Springfield ED 39 name columns (no Stone
household; Thomas A. remains reel 855). File 1910 Proctor negatives for
Louisa and Dora, SortedByName Louisa Brandenburg / Mary Bunch gaps, and
rebuild the Word biography.

Co-authored-by: CatCorner22 <CatCorner22@users.noreply.github.com>
</commit_message>
<xml_diff>
--- a/research/dora-ella-newnam/book/Dora-Ella-Newnam-Stone-A-Life.docx
+++ b/research/dora-ella-newnam/book/Dora-Ella-Newnam-Stone-A-Life.docx
@@ -144,7 +144,16 @@
         <w:t>Dilalrd Newnam</w:t>
       </w:r>
       <w:r>
-        <w:t>. That Jiles is probably the farm labourer, twenty, in Andrew Mayse’s Proctor house in 1870 and the twenty-four-year-old who applied to marry Elizabeth Bowman on 22 March 1873 — a different man from Link, and not proof the two witnesses are the same person. [C125] [C132] [S121] [S125]</w:t>
+        <w:t xml:space="preserve">. That Jiles is probably the farm labourer, twenty, in Andrew Mayse’s Proctor house in 1870, the twenty-four-year-old who applied to marry Elizabeth Bowman on 22 March 1873, and the </w:t>
+      </w:r>
+      <w:r>
+        <w:rPr>
+          <w:b/>
+        </w:rPr>
+        <w:t>Giles Mays</w:t>
+      </w:r>
+      <w:r>
+        <w:t xml:space="preserve"> (1849, son of Andrew and Rachel, husband of Lizzie Bowman) copied at William Mays Cemetery on Elk Creek — a different man from Link. A bracketed death year of 1904 on that cemetery list is a transcriber’s note, not a proved date. [C125] [C132] [C145] [S121] [S125] [S129]</w:t>
       </w:r>
     </w:p>
     <w:p>
@@ -176,25 +185,93 @@
         <w:t>Link</w:t>
       </w:r>
       <w:r>
-        <w:t xml:space="preserve">. [S116] Absence in 1900 has a candidate explanation. At the Cordy Pendergrass Cemetery in Pebworth, Blanche Evans copied </w:t>
+        <w:t xml:space="preserve">. [S116] Absence in 1900 now has a paper trail, not only a nickname. In Booneville in 1880, </w:t>
       </w:r>
       <w:r>
         <w:rPr>
           <w:b/>
         </w:rPr>
-        <w:t>Larkin Mays</w:t>
+        <w:t>Louisa Pendergrass</w:t>
       </w:r>
       <w:r>
-        <w:t xml:space="preserve">, 8 May 1861 – 8 July 1895, beside </w:t>
+        <w:t xml:space="preserve">, eighteen, was still single in Cordy Pendergrass’s house; two dwellings away, </w:t>
       </w:r>
       <w:r>
         <w:rPr>
           <w:b/>
         </w:rPr>
-        <w:t>Louisa P. Mays</w:t>
+        <w:t>Larkin T. Mayse</w:t>
       </w:r>
       <w:r>
-        <w:t xml:space="preserve">, 12 December 1861 (family death 13 April 1951), daughter of Cordy and Minerva Thompson Pendergrass — the same parents named for Patsey Farley in the next row. [S119] Patsey’s 1937 obituary called her sister </w:t>
+        <w:t xml:space="preserve">, twenty, was a single labourer in Stephen McPhearson’s. [C136] [C137] [S128] They married after that census. On 23 March 1911, at Elizabeth Brandenburg’s in Idamay, Geo. Pliman married </w:t>
+      </w:r>
+      <w:r>
+        <w:rPr>
+          <w:b/>
+        </w:rPr>
+        <w:t>Ida Mays</w:t>
+      </w:r>
+      <w:r>
+        <w:t xml:space="preserve">, seventeen. The clerk wrote her parents: </w:t>
+      </w:r>
+      <w:r>
+        <w:rPr>
+          <w:b/>
+        </w:rPr>
+        <w:t>Larkin Mays, Lee County</w:t>
+      </w:r>
+      <w:r>
+        <w:t xml:space="preserve">, and </w:t>
+      </w:r>
+      <w:r>
+        <w:rPr>
+          <w:b/>
+        </w:rPr>
+        <w:t>Louisa Pendergrass, Owsley County</w:t>
+      </w:r>
+      <w:r>
+        <w:t xml:space="preserve">. One witness was </w:t>
+      </w:r>
+      <w:r>
+        <w:rPr>
+          <w:b/>
+        </w:rPr>
+        <w:t>Sshelia Newnam</w:t>
+      </w:r>
+      <w:r>
+        <w:t>. [C142] [S132]</w:t>
+      </w:r>
+    </w:p>
+    <w:p>
+      <w:r>
+        <w:t xml:space="preserve">The 1927 Kentucky Court of Appeals said the rest in a sentence. *Brandenburg v. Petroleum Exploration*, 218 Ky. 557: </w:t>
+      </w:r>
+      <w:r>
+        <w:rPr>
+          <w:b/>
+        </w:rPr>
+        <w:t>“The appellant, Louisa Brandenburg, is the widow of Larkin Mays, who died intestate on June 8, 1895,”</w:t>
+      </w:r>
+      <w:r>
+        <w:t xml:space="preserve"> leaving four infant children and a Lee County tract worth less than a thousand dollars, which she still occupied as a homestead. [C139] [C141] [S131] The Cordy Pendergrass Cemetery stone says </w:t>
+      </w:r>
+      <w:r>
+        <w:rPr>
+          <w:b/>
+        </w:rPr>
+        <w:t>8 July 1895</w:t>
+      </w:r>
+      <w:r>
+        <w:t xml:space="preserve">. The court says </w:t>
+      </w:r>
+      <w:r>
+        <w:rPr>
+          <w:b/>
+        </w:rPr>
+        <w:t>8 June</w:t>
+      </w:r>
+      <w:r>
+        <w:t xml:space="preserve">. This book prints both and does not invent a third date. [C140] By 15 July 1903 Louisa had married John Brandenburg; Burtie was born that day. [C143] [S133] Patsey Farley’s 1937 obituary still called her sister </w:t>
       </w:r>
       <w:r>
         <w:rPr>
@@ -203,16 +280,21 @@
         <w:t>Mrs. Louisa Mays, Cressmont</w:t>
       </w:r>
       <w:r>
-        <w:t xml:space="preserve">. [C130] [S101] The 1920 Sturgeon annotator identified Ida Plowman as daughter of </w:t>
+        <w:t xml:space="preserve">. [C130] [S101] In April 1910 she is not in Proctor precinct under either married name. [C154] The 1911 witness </w:t>
       </w:r>
       <w:r>
         <w:rPr>
           <w:b/>
         </w:rPr>
-        <w:t>Larkin T. and Louisa Pendergrass Mays</w:t>
+        <w:t>Sshelia Newnam</w:t>
       </w:r>
       <w:r>
-        <w:t xml:space="preserve">. [S122] Larkin was twenty-four and living on the December 1885 wedding day and dead before June 1900. </w:t>
+        <w:t xml:space="preserve"> is not Celia McGuire, fifty-five, née Newman, in Christopher McGuire’s Proctor house that year. [C156] SortedByName’s Louisa Brandenburg block has no 1951 Lee or Owsley death; the family’s 13 April 1951 date stays family information. [C157]</w:t>
+      </w:r>
+    </w:p>
+    <w:p>
+      <w:r>
+        <w:t xml:space="preserve">Larkin was twenty-four and living on the December 1885 wedding day and dead before June 1900. </w:t>
       </w:r>
       <w:r>
         <w:rPr>
@@ -221,7 +303,7 @@
         <w:t>Link</w:t>
       </w:r>
       <w:r>
-        <w:t xml:space="preserve"> is a common nickname for Larkin. That is enough for a possible identity, not a merge: no paper yet uses both names. [C131]</w:t>
+        <w:t xml:space="preserve"> is a common nickname for Larkin. That is enough for a possible identity, not a merge: no paper yet uses both names. [C131] Published Owsley marriage vital-statistics years — 1853–59, 1874–78, 1903–10 — do not contain their license. The gap is 1879–1902. [C148] [S126]</w:t>
       </w:r>
     </w:p>
     <w:p>
@@ -244,7 +326,30 @@
         <w:t>102</w:t>
       </w:r>
       <w:r>
-        <w:t>, dead of paralysis in January. [C133] [S120] Sheets 1–2 around John and Elias do not show her neighbours; the original page for dwelling 102 is still blocked on Internet Archive. [L136]</w:t>
+        <w:t xml:space="preserve">, dead of paralysis in January. [C133] [S120] William Mays Cemetery, just over the Lee line at Cross Roads, has </w:t>
+      </w:r>
+      <w:r>
+        <w:rPr>
+          <w:b/>
+        </w:rPr>
+        <w:t>Mary A. “Pollie” Mays</w:t>
+      </w:r>
+      <w:r>
+        <w:t>, 1800–1880, née Gross. Ages 80 and 83 are close; the birthplaces do not yet match. She is a possible neighbour, not a merge. [C147] Sheets 1–2 around John and Elias do not show household 102; the original page is still blocked on Internet Archive. [L136]</w:t>
+      </w:r>
+    </w:p>
+    <w:p>
+      <w:r>
+        <w:t xml:space="preserve">A separate </w:t>
+      </w:r>
+      <w:r>
+        <w:rPr>
+          <w:b/>
+        </w:rPr>
+        <w:t>Newnam Cemetery</w:t>
+      </w:r>
+      <w:r>
+        <w:t xml:space="preserve"> at Pebworth — also called Newman or Newman-Combs, a Kentucky Landmark, 101 Find a Grave memorials — is the earlier clan yard, not High View on Spencer Ridge. No Samuel P. or Dora listing turned up in the free sources opened this pass. [C150] [S130]</w:t>
       </w:r>
     </w:p>
     <w:p>
@@ -582,7 +687,7 @@
         <w:t>Mary Magdalene Newnam</w:t>
       </w:r>
       <w:r>
-        <w:t>, June 1892 on the census, 12 June 1893 Beattyville on her Social Security account, later Mary M. Bunch. Marriage and death are not closed.</w:t>
+        <w:t>, June 1892 on the census, 12 June 1893 Beattyville on her Social Security account, later Mary M. Bunch. Marriage and death are not closed. Free SortedByName Mary Bunch pages still give no death date for her Social Security number; recent “Mary M. Bunch” obituaries and other Mary Bunch deaths (Jefferson County 1935, Campbell County, Tennessee, 1963, a 1923 Illinois woman) are other people. [C158]</w:t>
       </w:r>
     </w:p>
     <w:p>
@@ -744,7 +849,43 @@
         <w:pStyle w:val="ListBullet"/>
       </w:pPr>
       <w:r>
-        <w:t>Conflict #4 and #11: which Missouri Thomas Stone, if any, is the 1920 Perry County widower.</w:t>
+        <w:t xml:space="preserve">Conflict #4 and #11: which Missouri Thomas Stone, if any, is the 1920 Perry County widower. Greene Campbell ED </w:t>
+      </w:r>
+      <w:r>
+        <w:rPr>
+          <w:b/>
+        </w:rPr>
+        <w:t>37</w:t>
+      </w:r>
+      <w:r>
+        <w:t xml:space="preserve"> sheet </w:t>
+      </w:r>
+      <w:r>
+        <w:rPr>
+          <w:b/>
+        </w:rPr>
+        <w:t>18 A</w:t>
+      </w:r>
+      <w:r>
+        <w:t xml:space="preserve"> is Thomas A., 32, with Matilda — not merged. Springfield ED </w:t>
+      </w:r>
+      <w:r>
+        <w:rPr>
+          <w:b/>
+        </w:rPr>
+        <w:t>39</w:t>
+      </w:r>
+      <w:r>
+        <w:t xml:space="preserve"> sheets </w:t>
+      </w:r>
+      <w:r>
+        <w:rPr>
+          <w:b/>
+        </w:rPr>
+        <w:t>6 through 31 B</w:t>
+      </w:r>
+      <w:r>
+        <w:t>, read on the original 856 reel, have no second Stone household. [C117] [C153]</w:t>
       </w:r>
     </w:p>
     <w:p>
@@ -752,7 +893,7 @@
         <w:pStyle w:val="ListBullet"/>
       </w:pPr>
       <w:r>
-        <w:t>Conflict #13: whether the 1910 Sturgeon enumerator signed Elam Brandenburg or Elton E. Newnam.</w:t>
+        <w:t>Louisa P. Mays Brandenburg: not in 1910 Proctor; no 1951 Lee/Owsley death on SortedByName; Lee 1911–1929 B-index has no Louisa. [C154] [C157] [C159]</w:t>
       </w:r>
     </w:p>
     <w:p>
@@ -760,7 +901,49 @@
         <w:pStyle w:val="ListBullet"/>
       </w:pPr>
       <w:r>
-        <w:t>John H.; Mary Bunch’s death (Lee books and recent “Mary M. Bunch” obituaries do not match); Rissie’s Tennessee identification; the two unnamed children.</w:t>
+        <w:t xml:space="preserve">Conflict #13: the 1910 Sturgeon enumerator’s given name (surname </w:t>
+      </w:r>
+      <w:r>
+        <w:rPr>
+          <w:b/>
+        </w:rPr>
+        <w:t>Treadway</w:t>
+      </w:r>
+      <w:r>
+        <w:t xml:space="preserve"> on the JPEG).</w:t>
+      </w:r>
+    </w:p>
+    <w:p>
+      <w:pPr>
+        <w:pStyle w:val="ListBullet"/>
+      </w:pPr>
+      <w:r>
+        <w:t>Conflict #14: Larkin Mays, 8 June 1895 (court) versus 8 July 1895 (stone).</w:t>
+      </w:r>
+    </w:p>
+    <w:p>
+      <w:pPr>
+        <w:pStyle w:val="ListBullet"/>
+      </w:pPr>
+      <w:r>
+        <w:t>John H.; Mary Bunch’s death (Lee books and recent “Mary M. Bunch” obituaries do not match); Rissie’s Tennessee identification (SortedByName Newnam R-block is nil); the two unnamed children.</w:t>
+      </w:r>
+    </w:p>
+    <w:p>
+      <w:pPr>
+        <w:pStyle w:val="ListBullet"/>
+      </w:pPr>
+      <w:r>
+        <w:t xml:space="preserve">Whether witness </w:t>
+      </w:r>
+      <w:r>
+        <w:rPr>
+          <w:b/>
+        </w:rPr>
+        <w:t>Link Mays</w:t>
+      </w:r>
+      <w:r>
+        <w:t xml:space="preserve"> is Larkin T. Mays — still possible, not merged.</w:t>
       </w:r>
     </w:p>
     <w:p>

</xml_diff>

<commit_message>
Dora research pass 26: reject 1910 John/Louisa 28; find Samuel Farmer
1910 Miracode and the Sturgeon originals close two Louisa leads: ED 99
family 97 is a different John Brandenburg (wife Susan/Louisa, 26; Ida 6;
Bertie 5). Samuel Farmer, 33, and Martha, 23, are on sheet 13B with Flora
and Everett and no mother-in-law. Word biography rebuilt.

Co-authored-by: CatCorner22 <CatCorner22@users.noreply.github.com>
</commit_message>
<xml_diff>
--- a/research/dora-ella-newnam/book/Dora-Ella-Newnam-Stone-A-Life.docx
+++ b/research/dora-ella-newnam/book/Dora-Ella-Newnam-Stone-A-Life.docx
@@ -18,7 +18,7 @@
         <w:rPr>
           <w:i/>
         </w:rPr>
-        <w:t>A documented life, 1871–1926. Compiled from every research chat in this project, 27–28 October 2026. Living descendants are not named. Facts below the line of proof are labelled in the text. Nothing here is family lore presented as fact.</w:t>
+        <w:t>A documented life, 1871–1926. Compiled from every research chat in this project, 27–29 October 2026. Living descendants are not named. Facts below the line of proof are labelled in the text. Nothing here is family lore presented as fact.</w:t>
       </w:r>
     </w:p>
     <w:p>
@@ -271,7 +271,80 @@
         <w:t>8 June</w:t>
       </w:r>
       <w:r>
-        <w:t xml:space="preserve">. This book prints both and does not invent a third date. [C140] By 15 July 1903 Louisa had married John Brandenburg; Burtie was born that day. [C143] [S133] Patsey Farley’s 1937 obituary still called her sister </w:t>
+        <w:t>. This book prints both and does not invent a third date. [C140]</w:t>
+      </w:r>
+    </w:p>
+    <w:p>
+      <w:r>
+        <w:t xml:space="preserve">On 1 June 1900 she was already the widow </w:t>
+      </w:r>
+      <w:r>
+        <w:rPr>
+          <w:b/>
+        </w:rPr>
+        <w:t>Eliza MAYS</w:t>
+      </w:r>
+      <w:r>
+        <w:t xml:space="preserve"> at Sturgeon household 26: born December 1861, four children living. Whitly, June 1884; Martha, November 1886; and Ida, October 1894, were in the house. A hired hand, John Brandenburgh, March 1882, boarded there. The fourth child, </w:t>
+      </w:r>
+      <w:r>
+        <w:rPr>
+          <w:b/>
+        </w:rPr>
+        <w:t>Vesta</w:t>
+      </w:r>
+      <w:r>
+        <w:t xml:space="preserve">, had married Hardin Gray at Liza Mays’s on 4 October 1897. [C161] [C162] [C166] Martha’s 1927 death certificate names Larkin Mays and Louisa Pendergrass and gives her birth as 1 November 1886. [C164] On 29 August 1903 S. P. Farmer married Martha at </w:t>
+      </w:r>
+      <w:r>
+        <w:rPr>
+          <w:b/>
+        </w:rPr>
+        <w:t>her mother’s, Eliza Brandenburg’s</w:t>
+      </w:r>
+      <w:r>
+        <w:t>. [C165] Burtie Brandenburg was born 15 July 1903, so the second marriage was in place by midsummer. [C143] [S133]</w:t>
+      </w:r>
+    </w:p>
+    <w:p>
+      <w:r>
+        <w:t xml:space="preserve">The 1910 census has two traps with the same names. In Sturgeon family 97 a </w:t>
+      </w:r>
+      <w:r>
+        <w:rPr>
+          <w:b/>
+        </w:rPr>
+        <w:t>John Brandenburg</w:t>
+      </w:r>
+      <w:r>
+        <w:t xml:space="preserve">, twenty-nine, lives with a wife the Miracode clerk wrote as Louisa (the schedule itself reads </w:t>
+      </w:r>
+      <w:r>
+        <w:rPr>
+          <w:b/>
+        </w:rPr>
+        <w:t>Susan</w:t>
+      </w:r>
+      <w:r>
+        <w:t xml:space="preserve">), twenty-six, and daughters Ida, six, and Bertie, five. Those ages are twenty years too young for Louisa, Ida, and Burtie. [C177] [C178] The real Martha is in the same precinct, family 251, sheet 13 B: </w:t>
+      </w:r>
+      <w:r>
+        <w:rPr>
+          <w:b/>
+        </w:rPr>
+        <w:t>Samuel Farmer</w:t>
+      </w:r>
+      <w:r>
+        <w:t xml:space="preserve">, thirty-three, married six years; </w:t>
+      </w:r>
+      <w:r>
+        <w:rPr>
+          <w:b/>
+        </w:rPr>
+        <w:t>Martha</w:t>
+      </w:r>
+      <w:r>
+        <w:t xml:space="preserve">, twenty-three; Flora, five; Everett, three. There is no mother-in-law in that house. [C182] Patsey Farley’s 1937 obituary still called her sister </w:t>
       </w:r>
       <w:r>
         <w:rPr>
@@ -280,7 +353,7 @@
         <w:t>Mrs. Louisa Mays, Cressmont</w:t>
       </w:r>
       <w:r>
-        <w:t xml:space="preserve">. [C130] [S101] In April 1910 she is not in Proctor precinct under either married name. [C154] The 1911 witness </w:t>
+        <w:t xml:space="preserve">. [C130] [S101] Cressmont is a post office, not a 1910 precinct. [C173] In April 1910 Louisa is not in Proctor under either married name. [C154] The 1911 witness </w:t>
       </w:r>
       <w:r>
         <w:rPr>

</xml_diff>

<commit_message>
Dora research pass 27: Hardin Gray 1910 card; M-200 negatives
1910 Miracode puts Hardin and Vista Gray in Lee ED 99 family 248 with
no Louisa. M-200 has no Lee Louisa, Eliza, Ida, or Whitley as a head.
Word biography rebuilt.

Co-authored-by: CatCorner22 <CatCorner22@users.noreply.github.com>
</commit_message>
<xml_diff>
--- a/research/dora-ella-newnam/book/Dora-Ella-Newnam-Stone-A-Life.docx
+++ b/research/dora-ella-newnam/book/Dora-Ella-Newnam-Stone-A-Life.docx
@@ -344,7 +344,25 @@
         <w:t>Martha</w:t>
       </w:r>
       <w:r>
-        <w:t xml:space="preserve">, twenty-three; Flora, five; Everett, three. There is no mother-in-law in that house. [C182] Patsey Farley’s 1937 obituary still called her sister </w:t>
+        <w:t xml:space="preserve">, twenty-three; Flora, five; Everett, three. There is no mother-in-law in that house. [C182] Two families away on the Miracode, </w:t>
+      </w:r>
+      <w:r>
+        <w:rPr>
+          <w:b/>
+        </w:rPr>
+        <w:t>Hardin Gray</w:t>
+      </w:r>
+      <w:r>
+        <w:t xml:space="preserve">, thirty-four, lives with </w:t>
+      </w:r>
+      <w:r>
+        <w:rPr>
+          <w:b/>
+        </w:rPr>
+        <w:t>Vista</w:t>
+      </w:r>
+      <w:r>
+        <w:t xml:space="preserve">, twenty-seven — Vesta — and four children. Louisa is not on that card either. [C184] [C166] Kentucky’s 1910 Mays soundex (M-200) has no Lee Louisa, Eliza, Ida, or Whitley as a head. A Clark County Whitley Mats, twenty-four, boarding with Zack Nopper, is a different man. [C185] [C186] [C187] [C188] Patsey Farley’s 1937 obituary still called her sister </w:t>
       </w:r>
       <w:r>
         <w:rPr>

</xml_diff>

<commit_message>
Dora research pass 28: Vestie 1958 DC; 1900 Gray household
Vestie Bell Gray's 1958 Lee extract names Larkin Mays and Eliza
Pendergrass. 1900 Sturgeon household 85 is Hardin and Vestie, without
Louisa. ED 99 family 248 is not on the bound sheets. Word book rebuilt.

Co-authored-by: CatCorner22 <CatCorner22@users.noreply.github.com>
</commit_message>
<xml_diff>
--- a/research/dora-ella-newnam/book/Dora-Ella-Newnam-Stone-A-Life.docx
+++ b/research/dora-ella-newnam/book/Dora-Ella-Newnam-Stone-A-Life.docx
@@ -294,7 +294,25 @@
         <w:t>Vesta</w:t>
       </w:r>
       <w:r>
-        <w:t xml:space="preserve">, had married Hardin Gray at Liza Mays’s on 4 October 1897. [C161] [C162] [C166] Martha’s 1927 death certificate names Larkin Mays and Louisa Pendergrass and gives her birth as 1 November 1886. [C164] On 29 August 1903 S. P. Farmer married Martha at </w:t>
+        <w:t xml:space="preserve">, had married Hardin Gray at Liza Mays’s on 4 October 1897 and was two dozen households away: Hardin, Vestie, and baby Rosco at household 85. Louisa was not in that house. [C161] [C162] [C166] [C191] Vestie Bell Gray died 21 October 1958. The Lee County death-certificate extract names her parents </w:t>
+      </w:r>
+      <w:r>
+        <w:rPr>
+          <w:b/>
+        </w:rPr>
+        <w:t>Larkin Mays</w:t>
+      </w:r>
+      <w:r>
+        <w:t xml:space="preserve"> and </w:t>
+      </w:r>
+      <w:r>
+        <w:rPr>
+          <w:b/>
+        </w:rPr>
+        <w:t>Eliza Pendergrass</w:t>
+      </w:r>
+      <w:r>
+        <w:t xml:space="preserve">. The Gray Cemetery stone on Highway 587 says 9 September 1882; the 1900 census said September 1881. [C192] [C193] [S164] Martha’s 1927 death certificate names Larkin Mays and Louisa Pendergrass and gives her birth as 1 November 1886. [C164] On 29 August 1903 S. P. Farmer married Martha at </w:t>
       </w:r>
       <w:r>
         <w:rPr>
@@ -362,7 +380,7 @@
         <w:t>Vista</w:t>
       </w:r>
       <w:r>
-        <w:t xml:space="preserve">, twenty-seven — Vesta — and four children. Louisa is not on that card either. [C184] [C166] Kentucky’s 1910 Mays soundex (M-200) has no Lee Louisa, Eliza, Ida, or Whitley as a head. A Clark County Whitley Mats, twenty-four, boarding with Zack Nopper, is a different man. [C185] [C186] [C187] [C188] Patsey Farley’s 1937 obituary still called her sister </w:t>
+        <w:t xml:space="preserve">, twenty-seven — Vesta — and four children. Louisa is not on that card either. The bound Sturgeon sheets skip family numbers 243–249; sheet 14 B is blank. The original line for family 248 is not on the film. [C184] [C166] [C194] Kentucky’s 1910 Mays soundex (M-200) has no Lee Louisa, Eliza, Ida, or Whitley as a head. A Clark County Whitley Mats, twenty-four, boarding with Zack Nopper, is a different man. [C185] [C186] [C187] [C188] Patsey Farley’s 1937 obituary still called her sister </w:t>
       </w:r>
       <w:r>
         <w:rPr>

</xml_diff>

<commit_message>
Dora research pass 29: Posa Stone index alias, Greene ED41/42 sample
Log L208–L209: free AR index search nil for Posa Stone; user index misfile
documented as S168/C198 (conflict #16). T623-856 name-column OCR sample nil
Stone on ED 41 tail and ED 42 (C199). Book and dossier note Newman/Newnam
variants; rebuild Word docx.

Co-authored-by: CatCorner22 <CatCorner22@users.noreply.github.com>
</commit_message>
<xml_diff>
--- a/research/dora-ella-newnam/book/Dora-Ella-Newnam-Stone-A-Life.docx
+++ b/research/dora-ella-newnam/book/Dora-Ella-Newnam-Stone-A-Life.docx
@@ -678,6 +678,74 @@
     </w:p>
     <w:p>
       <w:r>
+        <w:t xml:space="preserve">The statewide Arkansas death index and its Ancestry mirror are notorious for misreading given names. You reported that this death was indexed as </w:t>
+      </w:r>
+      <w:r>
+        <w:rPr>
+          <w:b/>
+        </w:rPr>
+        <w:t>Posa Stone</w:t>
+      </w:r>
+      <w:r>
+        <w:t xml:space="preserve"> — a common misfile for </w:t>
+      </w:r>
+      <w:r>
+        <w:rPr>
+          <w:b/>
+        </w:rPr>
+        <w:t>Dora</w:t>
+      </w:r>
+      <w:r>
+        <w:t xml:space="preserve"> — while the certificate face still reads Dora Stone, certificate </w:t>
+      </w:r>
+      <w:r>
+        <w:rPr>
+          <w:b/>
+        </w:rPr>
+        <w:t>1524</w:t>
+      </w:r>
+      <w:r>
+        <w:t xml:space="preserve">. Treat </w:t>
+      </w:r>
+      <w:r>
+        <w:rPr>
+          <w:b/>
+        </w:rPr>
+        <w:t>Newman</w:t>
+      </w:r>
+      <w:r>
+        <w:t xml:space="preserve"> and </w:t>
+      </w:r>
+      <w:r>
+        <w:rPr>
+          <w:b/>
+        </w:rPr>
+        <w:t>Newnam</w:t>
+      </w:r>
+      <w:r>
+        <w:t xml:space="preserve"> as the same family on every index pass; Carter Cove and Coy’s informant line already spell the maiden name both ways. This pass found no free index row under Posa Stone to screenshot; confirming the misfile on FamilySearch collection </w:t>
+      </w:r>
+      <w:r>
+        <w:rPr>
+          <w:b/>
+        </w:rPr>
+        <w:t>1940760</w:t>
+      </w:r>
+      <w:r>
+        <w:t xml:space="preserve"> or Ancestry </w:t>
+      </w:r>
+      <w:r>
+        <w:rPr>
+          <w:b/>
+        </w:rPr>
+        <w:t>8771</w:t>
+      </w:r>
+      <w:r>
+        <w:t xml:space="preserve"> remains the cleanest proof. [C198] [S168]</w:t>
+      </w:r>
+    </w:p>
+    <w:p>
+      <w:r>
         <w:t>Coy Newnam of Ola was informant. He named her spouse T. A. Stone and her parents E. T. Newnam and Mary Smallwood, and he sent her the next day to Carters Chapel. Daniels and Cossey, copying Carter Cove Cemetery on 5 February 1993, found “Newman, Dora” without dates — the name of the husband of her youth, and of the son who buried her. Nearby they copied “Stone, Thomas | 1845 | 1925.” [C016] [S078]</w:t>
       </w:r>
     </w:p>

</xml_diff>

<commit_message>
Add Places 1900-death section and location research log L170-L177
Expand the biography with an explicit residence narrative, sync dossier
location summary, retry Greene T623-856 and Yell probate/land free indexes,
and rebuild PDF/docx.

Co-authored-by: blakereaganlaw <blakereaganlaw@gmail.com>
</commit_message>
<xml_diff>
--- a/research/dora-ella-newnam/book/Dora-Ella-Newnam-Stone-A-Life.docx
+++ b/research/dora-ella-newnam/book/Dora-Ella-Newnam-Stone-A-Life.docx
@@ -303,6 +303,409 @@
     <w:p>
       <w:r>
         <w:t>Those NUMIDENT files were read in the first research chat. They close identity for two daughters. They do not locate the mother after 1900.</w:t>
+      </w:r>
+    </w:p>
+    <w:p>
+      <w:r>
+        <w:br w:type="page"/>
+      </w:r>
+    </w:p>
+    <w:p>
+      <w:pPr>
+        <w:pStyle w:val="Heading1"/>
+      </w:pPr>
+      <w:r>
+        <w:t>Places: 1900 to death</w:t>
+      </w:r>
+    </w:p>
+    <w:p>
+      <w:r>
+        <w:t xml:space="preserve">This section states only what records pin Dora’s </w:t>
+      </w:r>
+      <w:r>
+        <w:rPr>
+          <w:b/>
+        </w:rPr>
+        <w:t>physical location</w:t>
+      </w:r>
+      <w:r>
+        <w:t>. Confidence labels match the dossier (`06-dossier.md`).</w:t>
+      </w:r>
+    </w:p>
+    <w:p>
+      <w:r>
+        <w:rPr>
+          <w:b/>
+        </w:rPr>
+        <w:t>1 June 1900 — PROVEN.</w:t>
+      </w:r>
+      <w:r>
+        <w:t xml:space="preserve"> Sturgeon precinct, Lee County, Kentucky, dwelling 67/67, with husband Samuel P. Newnam and five living children. [C011] [S005]</w:t>
+      </w:r>
+    </w:p>
+    <w:p>
+      <w:r>
+        <w:rPr>
+          <w:b/>
+        </w:rPr>
+        <w:t>1900–April 1910 — PROBABLE Kentucky, place unknown.</w:t>
+      </w:r>
+      <w:r>
+        <w:t xml:space="preserve"> Samuel is not a Kentucky Newman head in April 1910; Pearl is in Owsley with widowed grandmother Elizabeth — consistent with Samuel’s death before that census, but </w:t>
+      </w:r>
+      <w:r>
+        <w:rPr>
+          <w:b/>
+        </w:rPr>
+        <w:t>no death certificate, obituary, or burial record</w:t>
+      </w:r>
+      <w:r>
+        <w:t xml:space="preserve"> names him or a place. Lee vital-statistics gaps for 1905–1910 and published cemetery transcripts are </w:t>
+      </w:r>
+      <w:r>
+        <w:rPr>
+          <w:b/>
+        </w:rPr>
+        <w:t>nil</w:t>
+      </w:r>
+      <w:r>
+        <w:t xml:space="preserve"> for Samuel P. [C012] [C090] [C110] An August 1904 Lee license for </w:t>
+      </w:r>
+      <w:r>
+        <w:rPr>
+          <w:b/>
+        </w:rPr>
+        <w:t>S. P. Newnam</w:t>
+      </w:r>
+      <w:r>
+        <w:t xml:space="preserve"> × Rosa L. Banks is </w:t>
+      </w:r>
+      <w:r>
+        <w:rPr>
+          <w:b/>
+        </w:rPr>
+        <w:t>not merged</w:t>
+      </w:r>
+      <w:r>
+        <w:t xml:space="preserve"> with Samuel; if it were the same man, Lee County would still be the last documented venue for those initials — not Dora’s whereabouts. [C136]</w:t>
+      </w:r>
+    </w:p>
+    <w:p>
+      <w:r>
+        <w:rPr>
+          <w:b/>
+        </w:rPr>
+        <w:t>April 1910 — UNKNOWN (honest gap).</w:t>
+      </w:r>
+      <w:r>
+        <w:t xml:space="preserve"> After statewide Soundex and original-schedule negatives in Kentucky, Arkansas, Missouri, Oklahoma, and Texas, plus Tennessee Coy/McCoy negatives and Peebles negatives, she is </w:t>
+      </w:r>
+      <w:r>
+        <w:rPr>
+          <w:b/>
+        </w:rPr>
+        <w:t>not</w:t>
+      </w:r>
+      <w:r>
+        <w:t xml:space="preserve"> located under Newman, Newnam, Stone, or Peebles at thirty-nine. She is </w:t>
+      </w:r>
+      <w:r>
+        <w:rPr>
+          <w:b/>
+        </w:rPr>
+        <w:t>not</w:t>
+      </w:r>
+      <w:r>
+        <w:t xml:space="preserve"> on the original Sturgeon ED 99 schedule as a Newnam; the 1900 dwelling 67 site is reoccupied. [C030] [C088] [C033] This is not proof she left Kentucky; it is proof the usual indexes and the Sturgeon original do not show her.</w:t>
+      </w:r>
+    </w:p>
+    <w:p>
+      <w:r>
+        <w:rPr>
+          <w:b/>
+        </w:rPr>
+        <w:t>January 1920 — UNKNOWN for P001; FAN in two states.</w:t>
+      </w:r>
+      <w:r>
+        <w:t xml:space="preserve"> She is </w:t>
+      </w:r>
+      <w:r>
+        <w:rPr>
+          <w:b/>
+        </w:rPr>
+        <w:t>not</w:t>
+      </w:r>
+      <w:r>
+        <w:t xml:space="preserve"> in Arkansas or Kentucky Soundex as Dora Stone or Dora Newman ~48. Coy is at </w:t>
+      </w:r>
+      <w:r>
+        <w:rPr>
+          <w:b/>
+        </w:rPr>
+        <w:t>Danville</w:t>
+      </w:r>
+      <w:r>
+        <w:t xml:space="preserve">, Yell County, Arkansas, with wife Letha; Dora is </w:t>
+      </w:r>
+      <w:r>
+        <w:rPr>
+          <w:b/>
+        </w:rPr>
+        <w:t>not</w:t>
+      </w:r>
+      <w:r>
+        <w:t xml:space="preserve"> in that house. [C032] [C139] Her father Elias T. Newman, widowed, is in </w:t>
+      </w:r>
+      <w:r>
+        <w:rPr>
+          <w:b/>
+        </w:rPr>
+        <w:t>Beattyville</w:t>
+      </w:r>
+      <w:r>
+        <w:t xml:space="preserve">, Lee County, in C. B. Burke’s postmaster household — Dora is </w:t>
+      </w:r>
+      <w:r>
+        <w:rPr>
+          <w:b/>
+        </w:rPr>
+        <w:t>not</w:t>
+      </w:r>
+      <w:r>
+        <w:t xml:space="preserve"> there. [C091] [C141] Tom A. Stone, widowed, is in </w:t>
+      </w:r>
+      <w:r>
+        <w:rPr>
+          <w:b/>
+        </w:rPr>
+        <w:t>Howell Township, Perry County, Arkansas</w:t>
+      </w:r>
+      <w:r>
+        <w:t xml:space="preserve"> — adjacent timber country to Carter Cove, but that is </w:t>
+      </w:r>
+      <w:r>
+        <w:rPr>
+          <w:b/>
+        </w:rPr>
+        <w:t>his</w:t>
+      </w:r>
+      <w:r>
+        <w:t xml:space="preserve"> address, not hers. [C050] [C145] The </w:t>
+      </w:r>
+      <w:r>
+        <w:rPr>
+          <w:b/>
+        </w:rPr>
+        <w:t>1920 Ola</w:t>
+      </w:r>
+      <w:r>
+        <w:t xml:space="preserve"> town schedule (ED 200 on NARA T625-86) has </w:t>
+      </w:r>
+      <w:r>
+        <w:rPr>
+          <w:b/>
+        </w:rPr>
+        <w:t>not</w:t>
+      </w:r>
+      <w:r>
+        <w:t xml:space="preserve"> been read; absence from published extracts is </w:t>
+      </w:r>
+      <w:r>
+        <w:rPr>
+          <w:b/>
+        </w:rPr>
+        <w:t>not</w:t>
+      </w:r>
+      <w:r>
+        <w:t xml:space="preserve"> proof she was absent from Ola. [B046]</w:t>
+      </w:r>
+    </w:p>
+    <w:p>
+      <w:r>
+        <w:rPr>
+          <w:b/>
+        </w:rPr>
+        <w:t>18 February 1917 — PROVEN event, PROBABLE inference for mother.</w:t>
+      </w:r>
+      <w:r>
+        <w:t xml:space="preserve"> McCoy Newnam married Letha Viola Sullivan at </w:t>
+      </w:r>
+      <w:r>
+        <w:rPr>
+          <w:b/>
+        </w:rPr>
+        <w:t>Ola</w:t>
+      </w:r>
+      <w:r>
+        <w:t xml:space="preserve">, Yell County. [C027] [S024] That is the first </w:t>
+      </w:r>
+      <w:r>
+        <w:rPr>
+          <w:b/>
+        </w:rPr>
+        <w:t>documented Arkansas event</w:t>
+      </w:r>
+      <w:r>
+        <w:t xml:space="preserve"> for this family. It does not state that Dora stood at the courthouse; it makes </w:t>
+      </w:r>
+      <w:r>
+        <w:rPr>
+          <w:b/>
+        </w:rPr>
+        <w:t>western Arkansas</w:t>
+      </w:r>
+      <w:r>
+        <w:t xml:space="preserve"> plausible from 1917 onward.</w:t>
+      </w:r>
+    </w:p>
+    <w:p>
+      <w:r>
+        <w:rPr>
+          <w:b/>
+        </w:rPr>
+        <w:t>1920–August 1926 — PROBABLE Lamar / Carter Cove sector, Yell County.</w:t>
+      </w:r>
+      <w:r>
+        <w:t xml:space="preserve"> No census line names her as Mrs. Stone. Burial geography, death registration at </w:t>
+      </w:r>
+      <w:r>
+        <w:rPr>
+          <w:b/>
+        </w:rPr>
+        <w:t>Ola</w:t>
+      </w:r>
+      <w:r>
+        <w:t xml:space="preserve">, informant Coy of </w:t>
+      </w:r>
+      <w:r>
+        <w:rPr>
+          <w:b/>
+        </w:rPr>
+        <w:t>Ola</w:t>
+      </w:r>
+      <w:r>
+        <w:t xml:space="preserve">, and husband Thomas Stone’s </w:t>
+      </w:r>
+      <w:r>
+        <w:rPr>
+          <w:b/>
+        </w:rPr>
+        <w:t>1925</w:t>
+      </w:r>
+      <w:r>
+        <w:t xml:space="preserve"> marker at Carter Cove support residence in that neighborhood after </w:t>
+      </w:r>
+      <w:r>
+        <w:rPr>
+          <w:b/>
+        </w:rPr>
+        <w:t>probable</w:t>
+      </w:r>
+      <w:r>
+        <w:t xml:space="preserve"> remarriage to T. A. Stone. [C014] [C016] [C144] [C129] The death certificate residence field reads </w:t>
+      </w:r>
+      <w:r>
+        <w:rPr>
+          <w:b/>
+        </w:rPr>
+        <w:t>“Mammoth, Ark.”</w:t>
+      </w:r>
+      <w:r>
+        <w:t xml:space="preserve"> — printed as written; no Mammoth post office is known in Yell or Perry, and a </w:t>
+      </w:r>
+      <w:r>
+        <w:rPr>
+          <w:b/>
+        </w:rPr>
+        <w:t>Nimrod</w:t>
+      </w:r>
+      <w:r>
+        <w:t xml:space="preserve"> misread remains </w:t>
+      </w:r>
+      <w:r>
+        <w:rPr>
+          <w:b/>
+        </w:rPr>
+        <w:t>untested</w:t>
+      </w:r>
+      <w:r>
+        <w:t xml:space="preserve"> against the certificate image. [C143]</w:t>
+      </w:r>
+    </w:p>
+    <w:p>
+      <w:r>
+        <w:rPr>
+          <w:b/>
+        </w:rPr>
+        <w:t>23 August 1926 — PROVEN.</w:t>
+      </w:r>
+      <w:r>
+        <w:t xml:space="preserve"> Death at </w:t>
+      </w:r>
+      <w:r>
+        <w:rPr>
+          <w:b/>
+        </w:rPr>
+        <w:t>Ola</w:t>
+      </w:r>
+      <w:r>
+        <w:t xml:space="preserve">, Yell County, Arkansas; burial </w:t>
+      </w:r>
+      <w:r>
+        <w:rPr>
+          <w:b/>
+        </w:rPr>
+        <w:t>Carters Chapel / Carter Cemetery</w:t>
+      </w:r>
+      <w:r>
+        <w:t>, Lamar Township (Carter Cove). [C015] [C138] [S003]</w:t>
+      </w:r>
+    </w:p>
+    <w:p>
+      <w:r>
+        <w:rPr>
+          <w:b/>
+        </w:rPr>
+        <w:t>Missouri, Tennessee, Oklahoma, Texas — not documented as her home</w:t>
+      </w:r>
+      <w:r>
+        <w:t xml:space="preserve"> in the 1900–1926 window except as </w:t>
+      </w:r>
+      <w:r>
+        <w:rPr>
+          <w:b/>
+        </w:rPr>
+        <w:t>negative</w:t>
+      </w:r>
+      <w:r>
+        <w:t xml:space="preserve"> Soundex/census searches (Newman Dora ~39 in 1910; ~48 in Jan 1920). Greene County, Missouri, holds a </w:t>
+      </w:r>
+      <w:r>
+        <w:rPr>
+          <w:b/>
+        </w:rPr>
+        <w:t>Thomas A. Stone</w:t>
+      </w:r>
+      <w:r>
+        <w:t xml:space="preserve"> household in 1900 that may be the same man as Perry County’s 1920 widower — that pins </w:t>
+      </w:r>
+      <w:r>
+        <w:rPr>
+          <w:b/>
+        </w:rPr>
+        <w:t>Tom A.</w:t>
+      </w:r>
+      <w:r>
+        <w:t xml:space="preserve">, not Dora, and is </w:t>
+      </w:r>
+      <w:r>
+        <w:rPr>
+          <w:b/>
+        </w:rPr>
+        <w:t>not merged</w:t>
+      </w:r>
+      <w:r>
+        <w:t>. [C117] [C050]</w:t>
       </w:r>
     </w:p>
     <w:p>

</xml_diff>

<commit_message>
Book Places: note C146 USGenNet 1910 transcript pass and B044 gaps
Extend April 1910 paragraph with partial Lee/Owsley transcript negatives,
Beattyville ED 91-98 not on USGenNet, and blocked Ella wife-card Soundex.

Co-authored-by: blakereaganlaw <blakereaganlaw@gmail.com>
</commit_message>
<xml_diff>
--- a/research/dora-ella-newnam/book/Dora-Ella-Newnam-Stone-A-Life.docx
+++ b/research/dora-ella-newnam/book/Dora-Ella-Newnam-Stone-A-Life.docx
@@ -416,7 +416,61 @@
         <w:t>not</w:t>
       </w:r>
       <w:r>
-        <w:t xml:space="preserve"> on the original Sturgeon ED 99 schedule as a Newnam; the 1900 dwelling 67 site is reoccupied. [C030] [C088] [C033] This is not proof she left Kentucky; it is proof the usual indexes and the Sturgeon original do not show her.</w:t>
+        <w:t xml:space="preserve"> on the original Sturgeon ED 99 schedule as a Newnam; the 1900 dwelling 67 site is reoccupied. [C030] [C088] [C033] A </w:t>
+      </w:r>
+      <w:r>
+        <w:rPr>
+          <w:b/>
+        </w:rPr>
+        <w:t>partial</w:t>
+      </w:r>
+      <w:r>
+        <w:t xml:space="preserve"> USGenNet transcript pass — Lee’s published Proctor, Fincastle, and New Virginia precincts plus all </w:t>
+      </w:r>
+      <w:r>
+        <w:rPr>
+          <w:b/>
+        </w:rPr>
+        <w:t>seven</w:t>
+      </w:r>
+      <w:r>
+        <w:t xml:space="preserve"> published Owsley districts — is likewise </w:t>
+      </w:r>
+      <w:r>
+        <w:rPr>
+          <w:b/>
+        </w:rPr>
+        <w:t>nil</w:t>
+      </w:r>
+      <w:r>
+        <w:t xml:space="preserve"> for P001 (no boarder, servant, or Ella ~39 on a Newman head); Pearl still appears with Elizabeth Newman in Buck Creek without a Newnam spelling. [C146] Lee Beattyville ED </w:t>
+      </w:r>
+      <w:r>
+        <w:rPr>
+          <w:b/>
+        </w:rPr>
+        <w:t>91–98</w:t>
+      </w:r>
+      <w:r>
+        <w:t xml:space="preserve"> is </w:t>
+      </w:r>
+      <w:r>
+        <w:rPr>
+          <w:b/>
+        </w:rPr>
+        <w:t>not</w:t>
+      </w:r>
+      <w:r>
+        <w:t xml:space="preserve"> on USGenNet, and the 1910 Kentucky Soundex </w:t>
+      </w:r>
+      <w:r>
+        <w:rPr>
+          <w:b/>
+        </w:rPr>
+        <w:t>Ella</w:t>
+      </w:r>
+      <w:r>
+        <w:t xml:space="preserve"> wife-on-husband reel was not readable here — so the 1910 hole stands. [B044] This is not proof she left Kentucky; it is proof the usual indexes, the Sturgeon original, and these transcripts do not show her.</w:t>
       </w:r>
     </w:p>
     <w:p>

</xml_diff>

<commit_message>
Book Places: 1920 Ola ED 200 read negative (C147–C148, S134)
Sync § Places Jan 1920 after B046 closed on dossier (L184); rebuild docx/pdf.

Co-authored-by: blakereaganlaw <blakereaganlaw@gmail.com>
</commit_message>
<xml_diff>
--- a/research/dora-ella-newnam/book/Dora-Ella-Newnam-Stone-A-Life.docx
+++ b/research/dora-ella-newnam/book/Dora-Ella-Newnam-Stone-A-Life.docx
@@ -553,25 +553,151 @@
         <w:t>1920 Ola</w:t>
       </w:r>
       <w:r>
-        <w:t xml:space="preserve"> town schedule (ED 200 on NARA T625-86) has </w:t>
+        <w:t xml:space="preserve"> town schedule (</w:t>
       </w:r>
       <w:r>
         <w:rPr>
           <w:b/>
         </w:rPr>
-        <w:t>not</w:t>
-      </w:r>
-      <w:r>
-        <w:t xml:space="preserve"> been read; absence from published extracts is </w:t>
+        <w:t>ED 200</w:t>
+      </w:r>
+      <w:r>
+        <w:t xml:space="preserve">, NARA </w:t>
       </w:r>
       <w:r>
         <w:rPr>
           <w:b/>
         </w:rPr>
-        <w:t>not</w:t>
-      </w:r>
-      <w:r>
-        <w:t xml:space="preserve"> proof she was absent from Ola. [B046]</w:t>
+        <w:t>T625-86</w:t>
+      </w:r>
+      <w:r>
+        <w:t>) was read in full on Internet Archive (</w:t>
+      </w:r>
+      <w:r>
+        <w:rPr>
+          <w:b/>
+        </w:rPr>
+        <w:t>S134</w:t>
+      </w:r>
+      <w:r>
+        <w:t xml:space="preserve">); </w:t>
+      </w:r>
+      <w:r>
+        <w:rPr>
+          <w:b/>
+        </w:rPr>
+        <w:t>P001 is not on that enumeration</w:t>
+      </w:r>
+      <w:r>
+        <w:t xml:space="preserve"> — no matching Dora Stone, Newnam, or Newman ~48 b. Kentucky with parents </w:t>
+      </w:r>
+      <w:r>
+        <w:rPr>
+          <w:b/>
+        </w:rPr>
+        <w:t>E. T. Newnam</w:t>
+      </w:r>
+      <w:r>
+        <w:t xml:space="preserve"> and </w:t>
+      </w:r>
+      <w:r>
+        <w:rPr>
+          <w:b/>
+        </w:rPr>
+        <w:t>Mary Smallwood</w:t>
+      </w:r>
+      <w:r>
+        <w:t xml:space="preserve"> and son </w:t>
+      </w:r>
+      <w:r>
+        <w:rPr>
+          <w:b/>
+        </w:rPr>
+        <w:t>McCoy</w:t>
+      </w:r>
+      <w:r>
+        <w:t xml:space="preserve"> ~30 (</w:t>
+      </w:r>
+      <w:r>
+        <w:rPr>
+          <w:b/>
+        </w:rPr>
+        <w:t>C147</w:t>
+      </w:r>
+      <w:r>
+        <w:t xml:space="preserve">). Near-miss </w:t>
+      </w:r>
+      <w:r>
+        <w:rPr>
+          <w:b/>
+        </w:rPr>
+        <w:t>Newman</w:t>
+      </w:r>
+      <w:r>
+        <w:t xml:space="preserve">, Coy, with wife </w:t>
+      </w:r>
+      <w:r>
+        <w:rPr>
+          <w:b/>
+        </w:rPr>
+        <w:t>Dora</w:t>
+      </w:r>
+      <w:r>
+        <w:t xml:space="preserve"> 48, and </w:t>
+      </w:r>
+      <w:r>
+        <w:rPr>
+          <w:b/>
+        </w:rPr>
+        <w:t>Stone</w:t>
+      </w:r>
+      <w:r>
+        <w:t xml:space="preserve">, </w:t>
+      </w:r>
+      <w:r>
+        <w:rPr>
+          <w:b/>
+        </w:rPr>
+        <w:t>Dora</w:t>
+      </w:r>
+      <w:r>
+        <w:t xml:space="preserve"> 45, wife of </w:t>
+      </w:r>
+      <w:r>
+        <w:rPr>
+          <w:b/>
+        </w:rPr>
+        <w:t>Samuel</w:t>
+      </w:r>
+      <w:r>
+        <w:t xml:space="preserve">, were </w:t>
+      </w:r>
+      <w:r>
+        <w:rPr>
+          <w:b/>
+        </w:rPr>
+        <w:t>rejected</w:t>
+      </w:r>
+      <w:r>
+        <w:t xml:space="preserve"> as different people (</w:t>
+      </w:r>
+      <w:r>
+        <w:rPr>
+          <w:b/>
+        </w:rPr>
+        <w:t>C148</w:t>
+      </w:r>
+      <w:r>
+        <w:t xml:space="preserve">). That is a </w:t>
+      </w:r>
+      <w:r>
+        <w:rPr>
+          <w:b/>
+        </w:rPr>
+        <w:t>negative</w:t>
+      </w:r>
+      <w:r>
+        <w:t xml:space="preserve"> in ED 200 originals, not proof she never lived near Ola; other Yell EDs on the same reel remain untested for her line.</w:t>
       </w:r>
     </w:p>
     <w:p>

</xml_diff>

<commit_message>
Document Lamar ED 191 and Beattyville 1910 partial census reads
Log L185-L187; claims C149-C151; S135-S136. Partial read of Yell
T625-86 ED 191 (Lamar) and Lee T624-478 Beattyville ED 91-98 with
homonym rejections. Rebuild Places narrative and Word book.

Co-authored-by: blakereaganlaw <blakereaganlaw@gmail.com>
</commit_message>
<xml_diff>
--- a/research/dora-ella-newnam/book/Dora-Ella-Newnam-Stone-A-Life.docx
+++ b/research/dora-ella-newnam/book/Dora-Ella-Newnam-Stone-A-Life.docx
@@ -416,16 +416,7 @@
         <w:t>not</w:t>
       </w:r>
       <w:r>
-        <w:t xml:space="preserve"> on the original Sturgeon ED 99 schedule as a Newnam; the 1900 dwelling 67 site is reoccupied. [C030] [C088] [C033] A </w:t>
-      </w:r>
-      <w:r>
-        <w:rPr>
-          <w:b/>
-        </w:rPr>
-        <w:t>partial</w:t>
-      </w:r>
-      <w:r>
-        <w:t xml:space="preserve"> USGenNet transcript pass — Lee’s published Proctor, Fincastle, and New Virginia precincts plus all </w:t>
+        <w:t xml:space="preserve"> on the original Sturgeon ED 99 schedule as a Newnam; the 1900 dwelling 67 site is reoccupied. [C030] [C088] [C033] USGenNet transcripts for Lee’s Proctor, Fincastle, and New Virginia precincts plus all </w:t>
       </w:r>
       <w:r>
         <w:rPr>
@@ -434,7 +425,7 @@
         <w:t>seven</w:t>
       </w:r>
       <w:r>
-        <w:t xml:space="preserve"> published Owsley districts — is likewise </w:t>
+        <w:t xml:space="preserve"> published Owsley districts are </w:t>
       </w:r>
       <w:r>
         <w:rPr>
@@ -443,16 +434,90 @@
         <w:t>nil</w:t>
       </w:r>
       <w:r>
-        <w:t xml:space="preserve"> for P001 (no boarder, servant, or Ella ~39 on a Newman head); Pearl still appears with Elizabeth Newman in Buck Creek without a Newnam spelling. [C146] Lee Beattyville ED </w:t>
+        <w:t xml:space="preserve"> for P001. [C146] </w:t>
       </w:r>
       <w:r>
         <w:rPr>
           <w:b/>
         </w:rPr>
-        <w:t>91–98</w:t>
-      </w:r>
-      <w:r>
-        <w:t xml:space="preserve"> is </w:t>
+        <w:t>Partial</w:t>
+      </w:r>
+      <w:r>
+        <w:t xml:space="preserve"> Beattyville </w:t>
+      </w:r>
+      <w:r>
+        <w:rPr>
+          <w:b/>
+        </w:rPr>
+        <w:t>ED 91–98</w:t>
+      </w:r>
+      <w:r>
+        <w:t xml:space="preserve"> originals on NARA </w:t>
+      </w:r>
+      <w:r>
+        <w:rPr>
+          <w:b/>
+        </w:rPr>
+        <w:t>T624-478</w:t>
+      </w:r>
+      <w:r>
+        <w:t xml:space="preserve"> likewise show </w:t>
+      </w:r>
+      <w:r>
+        <w:rPr>
+          <w:b/>
+        </w:rPr>
+        <w:t>no</w:t>
+      </w:r>
+      <w:r>
+        <w:t xml:space="preserve"> P001 line on sheets read; a </w:t>
+      </w:r>
+      <w:r>
+        <w:rPr>
+          <w:b/>
+        </w:rPr>
+        <w:t>Stone, Dora</w:t>
+      </w:r>
+      <w:r>
+        <w:t xml:space="preserve">, 32, wife of </w:t>
+      </w:r>
+      <w:r>
+        <w:rPr>
+          <w:b/>
+        </w:rPr>
+        <w:t>Jas P. Stone</w:t>
+      </w:r>
+      <w:r>
+        <w:t xml:space="preserve"> in ED 98 is a </w:t>
+      </w:r>
+      <w:r>
+        <w:rPr>
+          <w:b/>
+        </w:rPr>
+        <w:t>different woman</w:t>
+      </w:r>
+      <w:r>
+        <w:t xml:space="preserve">. [C150] [C151] [S136] The 1910 Kentucky Soundex </w:t>
+      </w:r>
+      <w:r>
+        <w:rPr>
+          <w:b/>
+        </w:rPr>
+        <w:t>Ella</w:t>
+      </w:r>
+      <w:r>
+        <w:t xml:space="preserve"> wife-on-husband reel remains unread here. [B044]</w:t>
+      </w:r>
+    </w:p>
+    <w:p>
+      <w:r>
+        <w:rPr>
+          <w:b/>
+        </w:rPr>
+        <w:t>January 1920 — UNKNOWN for P001; FAN in two states.</w:t>
+      </w:r>
+      <w:r>
+        <w:t xml:space="preserve"> She is </w:t>
       </w:r>
       <w:r>
         <w:rPr>
@@ -461,27 +526,16 @@
         <w:t>not</w:t>
       </w:r>
       <w:r>
-        <w:t xml:space="preserve"> on USGenNet, and the 1910 Kentucky Soundex </w:t>
+        <w:t xml:space="preserve"> in Arkansas or Kentucky Soundex as Dora Stone or Dora Newman ~48. Coy is at </w:t>
       </w:r>
       <w:r>
         <w:rPr>
           <w:b/>
         </w:rPr>
-        <w:t>Ella</w:t>
-      </w:r>
-      <w:r>
-        <w:t xml:space="preserve"> wife-on-husband reel was not readable here — so the 1910 hole stands. [B044] This is not proof she left Kentucky; it is proof the usual indexes, the Sturgeon original, and these transcripts do not show her.</w:t>
-      </w:r>
-    </w:p>
-    <w:p>
-      <w:r>
-        <w:rPr>
-          <w:b/>
-        </w:rPr>
-        <w:t>January 1920 — UNKNOWN for P001; FAN in two states.</w:t>
-      </w:r>
-      <w:r>
-        <w:t xml:space="preserve"> She is </w:t>
+        <w:t>Danville</w:t>
+      </w:r>
+      <w:r>
+        <w:t xml:space="preserve">, Yell County, Arkansas, with wife Letha; Dora is </w:t>
       </w:r>
       <w:r>
         <w:rPr>
@@ -490,16 +544,16 @@
         <w:t>not</w:t>
       </w:r>
       <w:r>
-        <w:t xml:space="preserve"> in Arkansas or Kentucky Soundex as Dora Stone or Dora Newman ~48. Coy is at </w:t>
+        <w:t xml:space="preserve"> in that house. [C032] [C139] Her father Elias T. Newman, widowed, is in </w:t>
       </w:r>
       <w:r>
         <w:rPr>
           <w:b/>
         </w:rPr>
-        <w:t>Danville</w:t>
-      </w:r>
-      <w:r>
-        <w:t xml:space="preserve">, Yell County, Arkansas, with wife Letha; Dora is </w:t>
+        <w:t>Beattyville</w:t>
+      </w:r>
+      <w:r>
+        <w:t xml:space="preserve">, Lee County, in C. B. Burke’s postmaster household — Dora is </w:t>
       </w:r>
       <w:r>
         <w:rPr>
@@ -508,24 +562,6 @@
         <w:t>not</w:t>
       </w:r>
       <w:r>
-        <w:t xml:space="preserve"> in that house. [C032] [C139] Her father Elias T. Newman, widowed, is in </w:t>
-      </w:r>
-      <w:r>
-        <w:rPr>
-          <w:b/>
-        </w:rPr>
-        <w:t>Beattyville</w:t>
-      </w:r>
-      <w:r>
-        <w:t xml:space="preserve">, Lee County, in C. B. Burke’s postmaster household — Dora is </w:t>
-      </w:r>
-      <w:r>
-        <w:rPr>
-          <w:b/>
-        </w:rPr>
-        <w:t>not</w:t>
-      </w:r>
-      <w:r>
         <w:t xml:space="preserve"> there. [C091] [C141] Tom A. Stone, widowed, is in </w:t>
       </w:r>
       <w:r>
@@ -544,16 +580,7 @@
         <w:t>his</w:t>
       </w:r>
       <w:r>
-        <w:t xml:space="preserve"> address, not hers. [C050] [C145] The </w:t>
-      </w:r>
-      <w:r>
-        <w:rPr>
-          <w:b/>
-        </w:rPr>
-        <w:t>1920 Ola</w:t>
-      </w:r>
-      <w:r>
-        <w:t xml:space="preserve"> town schedule (</w:t>
+        <w:t xml:space="preserve"> address, not hers. [C050] [C145] </w:t>
       </w:r>
       <w:r>
         <w:rPr>
@@ -562,16 +589,7 @@
         <w:t>ED 200</w:t>
       </w:r>
       <w:r>
-        <w:t xml:space="preserve">, NARA </w:t>
-      </w:r>
-      <w:r>
-        <w:rPr>
-          <w:b/>
-        </w:rPr>
-        <w:t>T625-86</w:t>
-      </w:r>
-      <w:r>
-        <w:t>) was read in full on Internet Archive (</w:t>
+        <w:t xml:space="preserve"> (Ola / Ward Twp) was read in full (</w:t>
       </w:r>
       <w:r>
         <w:rPr>
@@ -589,25 +607,52 @@
         <w:t>P001 is not on that enumeration</w:t>
       </w:r>
       <w:r>
-        <w:t xml:space="preserve"> — no matching Dora Stone, Newnam, or Newman ~48 b. Kentucky with parents </w:t>
+        <w:t xml:space="preserve"> (</w:t>
       </w:r>
       <w:r>
         <w:rPr>
           <w:b/>
         </w:rPr>
-        <w:t>E. T. Newnam</w:t>
-      </w:r>
-      <w:r>
-        <w:t xml:space="preserve"> and </w:t>
+        <w:t>C147</w:t>
+      </w:r>
+      <w:r>
+        <w:t xml:space="preserve">). </w:t>
       </w:r>
       <w:r>
         <w:rPr>
           <w:b/>
         </w:rPr>
-        <w:t>Mary Smallwood</w:t>
-      </w:r>
-      <w:r>
-        <w:t xml:space="preserve"> and son </w:t>
+        <w:t>ED 191</w:t>
+      </w:r>
+      <w:r>
+        <w:t xml:space="preserve"> (Lamar / Plainview / Carter Cove sector) was </w:t>
+      </w:r>
+      <w:r>
+        <w:rPr>
+          <w:b/>
+        </w:rPr>
+        <w:t>partially</w:t>
+      </w:r>
+      <w:r>
+        <w:t xml:space="preserve"> read on the same reel; </w:t>
+      </w:r>
+      <w:r>
+        <w:rPr>
+          <w:b/>
+        </w:rPr>
+        <w:t>no</w:t>
+      </w:r>
+      <w:r>
+        <w:t xml:space="preserve"> Mrs. </w:t>
+      </w:r>
+      <w:r>
+        <w:rPr>
+          <w:b/>
+        </w:rPr>
+        <w:t>T. A. Stone</w:t>
+      </w:r>
+      <w:r>
+        <w:t xml:space="preserve"> ~48 b. Kentucky with son </w:t>
       </w:r>
       <w:r>
         <w:rPr>
@@ -616,61 +661,25 @@
         <w:t>McCoy</w:t>
       </w:r>
       <w:r>
-        <w:t xml:space="preserve"> ~30 (</w:t>
+        <w:t xml:space="preserve"> on pages examined (</w:t>
       </w:r>
       <w:r>
         <w:rPr>
           <w:b/>
         </w:rPr>
-        <w:t>C147</w:t>
-      </w:r>
-      <w:r>
-        <w:t xml:space="preserve">). Near-miss </w:t>
+        <w:t>C149</w:t>
+      </w:r>
+      <w:r>
+        <w:t xml:space="preserve">). [S135] Near-miss </w:t>
       </w:r>
       <w:r>
         <w:rPr>
           <w:b/>
         </w:rPr>
-        <w:t>Newman</w:t>
-      </w:r>
-      <w:r>
-        <w:t xml:space="preserve">, Coy, with wife </w:t>
-      </w:r>
-      <w:r>
-        <w:rPr>
-          <w:b/>
-        </w:rPr>
-        <w:t>Dora</w:t>
-      </w:r>
-      <w:r>
-        <w:t xml:space="preserve"> 48, and </w:t>
-      </w:r>
-      <w:r>
-        <w:rPr>
-          <w:b/>
-        </w:rPr>
-        <w:t>Stone</w:t>
-      </w:r>
-      <w:r>
-        <w:t xml:space="preserve">, </w:t>
-      </w:r>
-      <w:r>
-        <w:rPr>
-          <w:b/>
-        </w:rPr>
-        <w:t>Dora</w:t>
-      </w:r>
-      <w:r>
-        <w:t xml:space="preserve"> 45, wife of </w:t>
-      </w:r>
-      <w:r>
-        <w:rPr>
-          <w:b/>
-        </w:rPr>
-        <w:t>Samuel</w:t>
-      </w:r>
-      <w:r>
-        <w:t xml:space="preserve">, were </w:t>
+        <w:t>Dora Stone</w:t>
+      </w:r>
+      <w:r>
+        <w:t xml:space="preserve"> lines in ED 200 and ED 191 were </w:t>
       </w:r>
       <w:r>
         <w:rPr>
@@ -679,25 +688,7 @@
         <w:t>rejected</w:t>
       </w:r>
       <w:r>
-        <w:t xml:space="preserve"> as different people (</w:t>
-      </w:r>
-      <w:r>
-        <w:rPr>
-          <w:b/>
-        </w:rPr>
-        <w:t>C148</w:t>
-      </w:r>
-      <w:r>
-        <w:t xml:space="preserve">). That is a </w:t>
-      </w:r>
-      <w:r>
-        <w:rPr>
-          <w:b/>
-        </w:rPr>
-        <w:t>negative</w:t>
-      </w:r>
-      <w:r>
-        <w:t xml:space="preserve"> in ED 200 originals, not proof she never lived near Ola; other Yell EDs on the same reel remain untested for her line.</w:t>
+        <w:t xml:space="preserve"> as other households. [C148] [C149]</w:t>
       </w:r>
     </w:p>
     <w:p>

</xml_diff>

<commit_message>
Close B043: 1910 Yell T624-68 targeted sweep (L191, C153)
Log image-read probes near Ola/Lamar/Rose Creek on IA po0068unit without
duplicating L190 samples. Mark Yell 1910 originals PROBABLE negative on
free reel alongside AR N-550 nil. Sync Places section, dossier, timeline,
S137; rebuild docx/pdf.

Co-authored-by: blakereaganlaw <blakereaganlaw@gmail.com>
</commit_message>
<xml_diff>
--- a/research/dora-ella-newnam/book/Dora-Ella-Newnam-Stone-A-Life.docx
+++ b/research/dora-ella-newnam/book/Dora-Ella-Newnam-Stone-A-Life.docx
@@ -440,16 +440,7 @@
         <w:rPr>
           <w:b/>
         </w:rPr>
-        <w:t>Partial</w:t>
-      </w:r>
-      <w:r>
-        <w:t xml:space="preserve"> Beattyville </w:t>
-      </w:r>
-      <w:r>
-        <w:rPr>
-          <w:b/>
-        </w:rPr>
-        <w:t>ED 91–98</w:t>
+        <w:t>Beattyville ED 91–98</w:t>
       </w:r>
       <w:r>
         <w:t xml:space="preserve"> originals on NARA </w:t>
@@ -461,7 +452,16 @@
         <w:t>T624-478</w:t>
       </w:r>
       <w:r>
-        <w:t xml:space="preserve"> likewise show </w:t>
+        <w:t xml:space="preserve"> (full PDF bracket </w:t>
+      </w:r>
+      <w:r>
+        <w:rPr>
+          <w:b/>
+        </w:rPr>
+        <w:t>490–548</w:t>
+      </w:r>
+      <w:r>
+        <w:t xml:space="preserve">) show </w:t>
       </w:r>
       <w:r>
         <w:rPr>
@@ -470,7 +470,16 @@
         <w:t>no</w:t>
       </w:r>
       <w:r>
-        <w:t xml:space="preserve"> P001 line on sheets read; a </w:t>
+        <w:t xml:space="preserve"> P001 line (</w:t>
+      </w:r>
+      <w:r>
+        <w:rPr>
+          <w:b/>
+        </w:rPr>
+        <w:t>C150</w:t>
+      </w:r>
+      <w:r>
+        <w:t xml:space="preserve">); a </w:t>
       </w:r>
       <w:r>
         <w:rPr>
@@ -497,7 +506,115 @@
         <w:t>different woman</w:t>
       </w:r>
       <w:r>
-        <w:t xml:space="preserve">. [C150] [C151] [S136] The 1910 Kentucky Soundex </w:t>
+        <w:t xml:space="preserve">. [C151] [S136] </w:t>
+      </w:r>
+      <w:r>
+        <w:rPr>
+          <w:b/>
+        </w:rPr>
+        <w:t>Yell County, Arkansas</w:t>
+      </w:r>
+      <w:r>
+        <w:t xml:space="preserve"> population on NARA </w:t>
+      </w:r>
+      <w:r>
+        <w:rPr>
+          <w:b/>
+        </w:rPr>
+        <w:t>T624-68</w:t>
+      </w:r>
+      <w:r>
+        <w:t xml:space="preserve"> (IA </w:t>
+      </w:r>
+      <w:r>
+        <w:rPr>
+          <w:b/>
+        </w:rPr>
+        <w:t>`13thcensus1910po0068unit`</w:t>
+      </w:r>
+      <w:r>
+        <w:t xml:space="preserve">) — including </w:t>
+      </w:r>
+      <w:r>
+        <w:rPr>
+          <w:b/>
+        </w:rPr>
+        <w:t>Ola Road</w:t>
+      </w:r>
+      <w:r>
+        <w:t xml:space="preserve"> / </w:t>
+      </w:r>
+      <w:r>
+        <w:rPr>
+          <w:b/>
+        </w:rPr>
+        <w:t>Rose Creek</w:t>
+      </w:r>
+      <w:r>
+        <w:t xml:space="preserve"> sector sheets read — shows </w:t>
+      </w:r>
+      <w:r>
+        <w:rPr>
+          <w:b/>
+        </w:rPr>
+        <w:t>no</w:t>
+      </w:r>
+      <w:r>
+        <w:t xml:space="preserve"> </w:t>
+      </w:r>
+      <w:r>
+        <w:rPr>
+          <w:b/>
+        </w:rPr>
+        <w:t>Newnam/Newman/Stone</w:t>
+      </w:r>
+      <w:r>
+        <w:t xml:space="preserve"> + </w:t>
+      </w:r>
+      <w:r>
+        <w:rPr>
+          <w:b/>
+        </w:rPr>
+        <w:t>Dora/Ella</w:t>
+      </w:r>
+      <w:r>
+        <w:t xml:space="preserve"> ~35–42 b. Kentucky merge (</w:t>
+      </w:r>
+      <w:r>
+        <w:rPr>
+          <w:b/>
+        </w:rPr>
+        <w:t>C153</w:t>
+      </w:r>
+      <w:r>
+        <w:t xml:space="preserve">), consistent with prior </w:t>
+      </w:r>
+      <w:r>
+        <w:rPr>
+          <w:b/>
+        </w:rPr>
+        <w:t>AR N-550</w:t>
+      </w:r>
+      <w:r>
+        <w:t xml:space="preserve"> nil (</w:t>
+      </w:r>
+      <w:r>
+        <w:rPr>
+          <w:b/>
+        </w:rPr>
+        <w:t>C032</w:t>
+      </w:r>
+      <w:r>
+        <w:t xml:space="preserve">). [S137] The </w:t>
+      </w:r>
+      <w:r>
+        <w:rPr>
+          <w:b/>
+        </w:rPr>
+        <w:t>1910</w:t>
+      </w:r>
+      <w:r>
+        <w:t xml:space="preserve"> Kentucky Soundex </w:t>
       </w:r>
       <w:r>
         <w:rPr>
@@ -506,7 +623,13 @@
         <w:t>Ella</w:t>
       </w:r>
       <w:r>
-        <w:t xml:space="preserve"> wife-on-husband reel remains unread here. [B044]</w:t>
+        <w:t xml:space="preserve"> wife-on-husband reel remains unread here. [B044] / </w:t>
+      </w:r>
+      <w:r>
+        <w:rPr>
+          <w:b/>
+        </w:rPr>
+        <w:t>L180</w:t>
       </w:r>
     </w:p>
     <w:p>
@@ -688,7 +811,61 @@
         <w:t>rejected</w:t>
       </w:r>
       <w:r>
-        <w:t xml:space="preserve"> as other households. [C148] [C149]</w:t>
+        <w:t xml:space="preserve"> as other households. [C148] [C149] The </w:t>
+      </w:r>
+      <w:r>
+        <w:rPr>
+          <w:b/>
+        </w:rPr>
+        <w:t>1920</w:t>
+      </w:r>
+      <w:r>
+        <w:t xml:space="preserve"> Kentucky N-550 </w:t>
+      </w:r>
+      <w:r>
+        <w:rPr>
+          <w:b/>
+        </w:rPr>
+        <w:t>Ella</w:t>
+      </w:r>
+      <w:r>
+        <w:t xml:space="preserve"> tab lists </w:t>
+      </w:r>
+      <w:r>
+        <w:rPr>
+          <w:b/>
+        </w:rPr>
+        <w:t>Newman, Ella</w:t>
+      </w:r>
+      <w:r>
+        <w:t xml:space="preserve">, 48, b. Kentucky, </w:t>
+      </w:r>
+      <w:r>
+        <w:rPr>
+          <w:b/>
+        </w:rPr>
+        <w:t>Shelby County</w:t>
+      </w:r>
+      <w:r>
+        <w:t xml:space="preserve"> only — </w:t>
+      </w:r>
+      <w:r>
+        <w:rPr>
+          <w:b/>
+        </w:rPr>
+        <w:t>rejected</w:t>
+      </w:r>
+      <w:r>
+        <w:t xml:space="preserve"> as P001 (</w:t>
+      </w:r>
+      <w:r>
+        <w:rPr>
+          <w:b/>
+        </w:rPr>
+        <w:t>C152</w:t>
+      </w:r>
+      <w:r>
+        <w:t>). [S138]</w:t>
       </w:r>
     </w:p>
     <w:p>

</xml_diff>

<commit_message>
Birth pass L236: Katty Newnam VS 5 Aug 1874 (C044, S230); nil Dora civil birth (C220)
- Chapter 1 narrative on Lee VS extracts and sister register
- Evidence, timeline, transcriptions, dossier synced; book rebuilt

Co-authored-by: blakereaganlaw <blakereaganlaw@gmail.com>
</commit_message>
<xml_diff>
--- a/research/dora-ella-newnam/book/Dora-Ella-Newnam-Stone-A-Life.docx
+++ b/research/dora-ella-newnam/book/Dora-Ella-Newnam-Stone-A-Life.docx
@@ -89,17 +89,107 @@
     </w:p>
     <w:p>
       <w:r>
-        <w:t>Ten years earlier, on 7 June 1870, Elias and Mary were at Travellers Rest in Owsley County with William, Malissa, Frances and a one-year-old Mary. There was no Dora. That absence fits an 1871 birth.</w:t>
+        <w:t>Ten years earlier, on 7 June 1870, Elias and Mary were at Travellers Rest in Owsley County with William, Malissa, Frances and a one-year-old Mary. There was no Dora. That absence fits an 1871 birth. [C067] [S048]</w:t>
       </w:r>
     </w:p>
     <w:p>
       <w:r>
-        <w:t>A compiled Boone descent through Leah Scholl sits on WikiTree and on cemetery markers. This case has not independently re-proved those steps. They stay speculative.</w:t>
+        <w:t xml:space="preserve">Kentucky did not yet keep statewide birth registers the way it would after 1911. The surviving Lee County vital-statistics birth extracts for </w:t>
+      </w:r>
+      <w:r>
+        <w:rPr>
+          <w:b/>
+        </w:rPr>
+        <w:t>1874–1878</w:t>
+      </w:r>
+      <w:r>
+        <w:t xml:space="preserve"> (USGenNet Kendrick transcriptions) contain </w:t>
+      </w:r>
+      <w:r>
+        <w:rPr>
+          <w:b/>
+        </w:rPr>
+        <w:t>no</w:t>
+      </w:r>
+      <w:r>
+        <w:t xml:space="preserve"> line for Dora or Dora Ella Newnam. They do contain her younger sister: </w:t>
+      </w:r>
+      <w:r>
+        <w:rPr>
+          <w:b/>
+        </w:rPr>
+        <w:t>5 August 1874</w:t>
+      </w:r>
+      <w:r>
+        <w:t xml:space="preserve">, </w:t>
+      </w:r>
+      <w:r>
+        <w:rPr>
+          <w:b/>
+        </w:rPr>
+        <w:t>Katty Newnam</w:t>
+      </w:r>
+      <w:r>
+        <w:t xml:space="preserve">, female, born Lee County, daughter of </w:t>
+      </w:r>
+      <w:r>
+        <w:rPr>
+          <w:b/>
+        </w:rPr>
+        <w:t>Elias Newman</w:t>
+      </w:r>
+      <w:r>
+        <w:t xml:space="preserve"> born Clark County and </w:t>
+      </w:r>
+      <w:r>
+        <w:rPr>
+          <w:b/>
+        </w:rPr>
+        <w:t>Mary Smallwood</w:t>
+      </w:r>
+      <w:r>
+        <w:t xml:space="preserve"> born Owsley County. The clerk spelled the surname Newman; the family used Newnam on the census. That register names the same parents the 1880 schedule and 1926 death certificate would — and it fixes Catharine’s birth year independently of the census age. [C044] [C220] [S230] Dora’s August </w:t>
+      </w:r>
+      <w:r>
+        <w:rPr>
+          <w:b/>
+        </w:rPr>
+        <w:t>1871</w:t>
+      </w:r>
+      <w:r>
+        <w:t xml:space="preserve"> month and year therefore rest on the </w:t>
+      </w:r>
+      <w:r>
+        <w:rPr>
+          <w:b/>
+        </w:rPr>
+        <w:t>1880 age 8</w:t>
+      </w:r>
+      <w:r>
+        <w:t xml:space="preserve">, the </w:t>
+      </w:r>
+      <w:r>
+        <w:rPr>
+          <w:b/>
+        </w:rPr>
+        <w:t>1900 August 1871</w:t>
+      </w:r>
+      <w:r>
+        <w:t xml:space="preserve">, and the </w:t>
+      </w:r>
+      <w:r>
+        <w:rPr>
+          <w:b/>
+        </w:rPr>
+        <w:t>1885 age 14</w:t>
+      </w:r>
+      <w:r>
+        <w:t>, not on a civil birth certificate. [C001]</w:t>
       </w:r>
     </w:p>
     <w:p>
       <w:r>
-        <w:br w:type="page"/>
+        <w:t>A compiled Boone descent through Leah Scholl sits on WikiTree and on cemetery markers. This case has not independently re-proved those steps. They stay speculative.</w:t>
       </w:r>
     </w:p>
     <w:p>

</xml_diff>

<commit_message>
L237-L239: 1870 Elias original (S231); 1910 Ella Miracode E-block (C221); Greene sample
Co-authored-by: blakereaganlaw <blakereaganlaw@gmail.com>
</commit_message>
<xml_diff>
--- a/research/dora-ella-newnam/book/Dora-Ella-Newnam-Stone-A-Life.docx
+++ b/research/dora-ella-newnam/book/Dora-Ella-Newnam-Stone-A-Life.docx
@@ -89,7 +89,25 @@
     </w:p>
     <w:p>
       <w:r>
-        <w:t>Ten years earlier, on 7 June 1870, Elias and Mary were at Travellers Rest in Owsley County with William, Malissa, Frances and a one-year-old Mary. There was no Dora. That absence fits an 1871 birth. [C067] [S048]</w:t>
+        <w:t xml:space="preserve">Ten years earlier, on the 1870 Travellers Rest schedule (USGenNet transcript </w:t>
+      </w:r>
+      <w:r>
+        <w:rPr>
+          <w:b/>
+        </w:rPr>
+        <w:t>7 June</w:t>
+      </w:r>
+      <w:r>
+        <w:t xml:space="preserve">; original enumerator sheet </w:t>
+      </w:r>
+      <w:r>
+        <w:rPr>
+          <w:b/>
+        </w:rPr>
+        <w:t>17 June</w:t>
+      </w:r>
+      <w:r>
+        <w:t>), Elias and Mary were in Owsley County with William, Malissa, Frances and a one-year-old Mary. There was no Dora. That absence fits an 1871 birth. [C067] [S048] [S231]</w:t>
       </w:r>
     </w:p>
     <w:p>

</xml_diff>

<commit_message>
Pass 41: Rissie WikiTree lead (C230–C231, S241–S242, L262–L263)
Co-authored-by: blakereaganlaw <blakereaganlaw@gmail.com>
</commit_message>
<xml_diff>
--- a/research/dora-ella-newnam/book/Dora-Ella-Newnam-Stone-A-Life.docx
+++ b/research/dora-ella-newnam/book/Dora-Ella-Newnam-Stone-A-Life.docx
@@ -402,7 +402,7 @@
         <w:t>Vesta</w:t>
       </w:r>
       <w:r>
-        <w:t xml:space="preserve">, had married Hardin Gray at Liza Mays’s on 4 October 1897 and was two dozen households away: Hardin, Vestie, and baby Rosco at household 85. Louisa was not in that house. [C161] [C162] [C166] [C191] Vestie Bell Gray died 21 October 1958. The Lee County death-certificate extract names her parents </w:t>
+        <w:t xml:space="preserve">, had married Hardin Gray at Liza Mays’s on 4 October 1897 and was two dozen households away: Hardin, Vestie, and baby Rosco at household 85. Louisa was not in that house. [C161] [C162] [C166] [C191] [S233] Vestie Bell Gray died 21 October 1958. The Lee County death-certificate extract names her parents </w:t>
       </w:r>
       <w:r>
         <w:rPr>
@@ -470,7 +470,34 @@
         <w:t>Martha</w:t>
       </w:r>
       <w:r>
-        <w:t xml:space="preserve">, twenty-three; Flora, five; Everett, three. There is no mother-in-law in that house. [C182] Two families away on the Miracode, </w:t>
+        <w:t xml:space="preserve">, twenty-three; Flora, five; Everett, three. There is no mother-in-law in that house. [C182] Two families away on the Miracode—and on the </w:t>
+      </w:r>
+      <w:r>
+        <w:rPr>
+          <w:b/>
+        </w:rPr>
+        <w:t>original</w:t>
+      </w:r>
+      <w:r>
+        <w:t xml:space="preserve"> census at family </w:t>
+      </w:r>
+      <w:r>
+        <w:rPr>
+          <w:b/>
+        </w:rPr>
+        <w:t>248</w:t>
+      </w:r>
+      <w:r>
+        <w:t xml:space="preserve">, sheet </w:t>
+      </w:r>
+      <w:r>
+        <w:rPr>
+          <w:b/>
+        </w:rPr>
+        <w:t>13 B</w:t>
+      </w:r>
+      <w:r>
+        <w:t>—</w:t>
       </w:r>
       <w:r>
         <w:rPr>
@@ -485,10 +512,28 @@
         <w:rPr>
           <w:b/>
         </w:rPr>
-        <w:t>Vista</w:t>
-      </w:r>
-      <w:r>
-        <w:t xml:space="preserve">, twenty-seven — Vesta — and four children. Louisa is not on that card either. The bound Sturgeon sheets skip family numbers 243–249; sheet 14 B is blank. The original line for family 248 is not on the film. [C184] [C166] [C194] Kentucky’s 1910 Mays soundex (M-200) has no Lee Louisa, Eliza, Ida, or Whitley as a head. A Clark County Whitley Mats, twenty-four, boarding with Zack Nopper, is a different man. [C185] [C186] [C187] [C188] Patsey Farley’s 1937 obituary still called her sister </w:t>
+        <w:t>Vesta</w:t>
+      </w:r>
+      <w:r>
+        <w:t xml:space="preserve">, twenty-seven, and four children. Louisa is not in that house. Sheet </w:t>
+      </w:r>
+      <w:r>
+        <w:rPr>
+          <w:b/>
+        </w:rPr>
+        <w:t>14 B</w:t>
+      </w:r>
+      <w:r>
+        <w:t xml:space="preserve"> is blank; that is the only gap on the bound ED </w:t>
+      </w:r>
+      <w:r>
+        <w:rPr>
+          <w:b/>
+        </w:rPr>
+        <w:t>99</w:t>
+      </w:r>
+      <w:r>
+        <w:t xml:space="preserve"> roll. [C184] [C166] [C225] [S236] Kentucky’s 1910 Mays soundex (M-200) has no Lee Louisa, Eliza, Ida, or Whitley as a head. A Clark County Whitley Mats, twenty-four, boarding with Zack Nopper, is a different man. [C185] [C186] [C187] [C188] Patsey Farley’s 1937 obituary still called her sister </w:t>
       </w:r>
       <w:r>
         <w:rPr>
@@ -1723,7 +1768,52 @@
         <w:t>Mary Magdalene Newnam</w:t>
       </w:r>
       <w:r>
-        <w:t>, June 1892 on the census, 12 June 1893 Beattyville on her Social Security account, later Mary M. Bunch. Marriage and death are not closed. Free SortedByName Mary Bunch pages still give no death date for her Social Security number; recent “Mary M. Bunch” obituaries and other Mary Bunch deaths (Jefferson County 1935, Campbell County, Tennessee, 1963, a 1923 Illinois woman) are other people. [C158]</w:t>
+        <w:t xml:space="preserve">, June 1892 on the census, 12 June 1893 Beattyville on her Social Security account, later Mary M. Bunch. Marriage and death are not closed in free sources: Lee marriage books have no Bunch row; NUMIDENT lists her </w:t>
+      </w:r>
+      <w:r>
+        <w:rPr>
+          <w:b/>
+        </w:rPr>
+        <w:t>deceased</w:t>
+      </w:r>
+      <w:r>
+        <w:t xml:space="preserve"> but gives </w:t>
+      </w:r>
+      <w:r>
+        <w:rPr>
+          <w:b/>
+        </w:rPr>
+        <w:t>no death date</w:t>
+      </w:r>
+      <w:r>
+        <w:t xml:space="preserve">; the public Social Security Death Index API returned no match for SSN </w:t>
+      </w:r>
+      <w:r>
+        <w:rPr>
+          <w:b/>
+        </w:rPr>
+        <w:t>410-19-2658</w:t>
+      </w:r>
+      <w:r>
+        <w:t>; Tennessee archives and Knox marriage indexes were not reachable from the research VM (</w:t>
+      </w:r>
+      <w:r>
+        <w:rPr>
+          <w:b/>
+        </w:rPr>
+        <w:t>R007</w:t>
+      </w:r>
+      <w:r>
+        <w:t xml:space="preserve">, </w:t>
+      </w:r>
+      <w:r>
+        <w:rPr>
+          <w:b/>
+        </w:rPr>
+        <w:t>L257</w:t>
+      </w:r>
+      <w:r>
+        <w:t>). [C158]</w:t>
       </w:r>
     </w:p>
     <w:p>
@@ -1745,7 +1835,70 @@
         <w:t>Rissa / Rissie</w:t>
       </w:r>
       <w:r>
-        <w:t>, May 1897. Later Pelfrey or Stamper identifications remain possible only. Lee Marriage Books 5–15 have no Rissie or Rissa Newnam bride; a 1920 Rissa Newton, seventeen, is a different woman. [C134] A Rissie Pelfrey Maxey born 1882 is a different woman.</w:t>
+        <w:t>, May 1897. After the 1900 census she does not reappear on the Kentucky child Soundex pass or in Pearl’s 1910 Owsley household. An unsourced WikiTree profile (</w:t>
+      </w:r>
+      <w:r>
+        <w:rPr>
+          <w:b/>
+        </w:rPr>
+        <w:t>Newnam-46</w:t>
+      </w:r>
+      <w:r>
+        <w:t xml:space="preserve">) names her </w:t>
+      </w:r>
+      <w:r>
+        <w:rPr>
+          <w:b/>
+        </w:rPr>
+        <w:t>Rissie (Newnam) Pelfrey</w:t>
+      </w:r>
+      <w:r>
+        <w:t xml:space="preserve">, born at </w:t>
+      </w:r>
+      <w:r>
+        <w:rPr>
+          <w:b/>
+        </w:rPr>
+        <w:t>Pebworth</w:t>
+      </w:r>
+      <w:r>
+        <w:t xml:space="preserve">, died </w:t>
+      </w:r>
+      <w:r>
+        <w:rPr>
+          <w:b/>
+        </w:rPr>
+        <w:t>13 May 1980</w:t>
+      </w:r>
+      <w:r>
+        <w:t xml:space="preserve"> in </w:t>
+      </w:r>
+      <w:r>
+        <w:rPr>
+          <w:b/>
+        </w:rPr>
+        <w:t>Knoxville, Tennessee</w:t>
+      </w:r>
+      <w:r>
+        <w:t xml:space="preserve">, with </w:t>
+      </w:r>
+      <w:r>
+        <w:rPr>
+          <w:b/>
+        </w:rPr>
+        <w:t>Samuel Parriott Newnam</w:t>
+      </w:r>
+      <w:r>
+        <w:t xml:space="preserve"> as father — a </w:t>
+      </w:r>
+      <w:r>
+        <w:rPr>
+          <w:b/>
+        </w:rPr>
+        <w:t>possible</w:t>
+      </w:r>
+      <w:r>
+        <w:t xml:space="preserve"> lead only, not printed here as proved death. [C230] Free Tennessee death and obituary indexes searched from this case did not independently confirm that row. [C231] Lee Marriage Books 5–15 have no Rissie or Rissa Newnam bride; a 1920 Rissa Newton, seventeen, is a different woman. [C134] A Rissie Pelfrey Maxey born 1882 is a different woman.</w:t>
       </w:r>
     </w:p>
     <w:p>

</xml_diff>

<commit_message>
Pass 44: John H death index + Book 12 reject; book Samuel wills (C238-C239)
Co-authored-by: blakereaganlaw <blakereaganlaw@gmail.com>
</commit_message>
<xml_diff>
--- a/research/dora-ella-newnam/book/Dora-Ella-Newnam-Stone-A-Life.docx
+++ b/research/dora-ella-newnam/book/Dora-Ella-Newnam-Stone-A-Life.docx
@@ -1448,7 +1448,7 @@
     </w:p>
     <w:p>
       <w:r>
-        <w:t>The grandmother who took Pearl was a widow. Combined with the empty Kentucky Soundex slot for Samuel P. Newnam as a head, that makes Samuel’s death before April 1910 probable. The place and the day are unknown. He is not in the Lee County death index for 1911–1929, not in the 1912–1929 certificate extracts, not in the surviving Lee vital-statistics dumps for 1874–1878 or 1900–1904, not on the Proctor Cemetery transcript, not on the 2001 High View / Newman Cemetery transcript, and not in the Booneville Association obituaries of 1883–1904. Lee County has no inventoried death register for 1905–1910 (KDLA lists 1874–1878, 1900–1904, then 1911–1967). Owsley’s 1907–1910 vital-statistics dumps have been read: Samuel P. is not in them. The only Newnam is Lester, thirteen months, who died at Pebworth on 15 April 1909; parents Robert and Sallie Newnam — not merged with Samuel. [C108] [C109] [C110] The remaining Kentucky search is unmarked graves and on-site church minutes.</w:t>
+        <w:t>The grandmother who took Pearl was a widow. Combined with the empty Kentucky Soundex slot for Samuel P. Newnam as a head, that makes Samuel’s death before April 1910 probable. The place and the day are unknown. He is not in the Lee County death index for 1911–1929, not in the 1912–1929 certificate extracts, not in the surviving Lee vital-statistics dumps for 1874–1878 or 1900–1904, not on the Proctor Cemetery transcript, not on the 2001 High View / Newman Cemetery transcript, and not in the Booneville Association obituaries of 1883–1904. The published Lee will transcript index lists no Samuel P. Newnam will; Elizabeth’s will names Pearl only. [C232] [C233] Lee County has no inventoried death register for 1905–1910 (KDLA lists 1874–1878, 1900–1904, then 1911–1967). Owsley’s 1907–1910 vital-statistics dumps have been read: Samuel P. is not in them. The only Newnam is Lester, thirteen months, who died at Pebworth on 15 April 1909; parents Robert and Sallie Newnam — not merged with Samuel. [C108] [C109] [C110] The remaining Kentucky search is unmarked graves, on-site church minutes, and unread probate film.</w:t>
       </w:r>
     </w:p>
     <w:p>
@@ -1909,7 +1909,16 @@
         <w:t>John H. Newnam</w:t>
       </w:r>
       <w:r>
-        <w:t>, August 1899. Adult trail blank. Herbert of Lee County, Virginia, was rejected.</w:t>
+        <w:t xml:space="preserve">, August 1899. Herbert Newman of Lee County, Virginia, was rejected. The Kentucky statewide death index (Reclaim The Records, 1911–1990) has no John H. Newnam death in Lee consistent with an August 1899 birth. [C234] [C237] [C238] Lee Marriage Book 12 has a different </w:t>
+      </w:r>
+      <w:r>
+        <w:rPr>
+          <w:b/>
+        </w:rPr>
+        <w:t>John Newnam</w:t>
+      </w:r>
+      <w:r>
+        <w:t>, age twenty-five in 1917, son of John and Serilda — rejected. [C239] The September 1918 draft card for Lee County has not been read in this case.</w:t>
       </w:r>
     </w:p>
     <w:p>

</xml_diff>

<commit_message>
Pass 48: B007 Bollinger 1910 PDF workaround (Letha Sullivan, Newnam FAN)
Bypass IA jp2 146B failures by downloading T624-769 full PDF and reading
Liberty Township ED 4-5 bracket (pp 348-480). Log L277-L279; evidence
S251-S252; claims C244-C246. Key finds: Letha Sullivan 12 servant (possible
Coy wife); Newman in-laws in John Sullivan hh; still nil P001 ~39.

Co-authored-by: blakereaganlaw <blakereaganlaw@gmail.com>
</commit_message>
<xml_diff>
--- a/research/dora-ella-newnam/book/Dora-Ella-Newnam-Stone-A-Life.docx
+++ b/research/dora-ella-newnam/book/Dora-Ella-Newnam-Stone-A-Life.docx
@@ -1463,7 +1463,88 @@
     </w:p>
     <w:p>
       <w:r>
-        <w:t>Statewide negatives close the obvious surnames and states. Arkansas has no Coy between Cora and Dan, no Dora before the E-names, no McCoy between Mayme and Melvina. Missouri has no Coy between Cyrus and Daisy, one wrong Dora (Dora L. Neimann, forty-eight, Illinois-born, in St. Louis), and no McCoy between May and Michael. Oklahoma and Texas Newman windows were sampled; they do not hold her. Tennessee’s handwritten N-550 reel has a blank D-tab after Clifford of Lauderdale — no Coy — and an M-window of Mary D., Mek. G. of Cheatham, two Melvins of Giles, Minerva, Minnie, Mitchell — no McCoy.</w:t>
+        <w:t xml:space="preserve">Statewide negatives close the obvious surnames and states. Arkansas has no Coy between Cora and Dan, no Dora before the E-names, no McCoy between Mayme and Melvina. Missouri Soundex has no Coy, no McCoy, and no Dora ~39 as a Newman head — but </w:t>
+      </w:r>
+      <w:r>
+        <w:rPr>
+          <w:b/>
+        </w:rPr>
+        <w:t>Bollinger County</w:t>
+      </w:r>
+      <w:r>
+        <w:t xml:space="preserve"> originals place </w:t>
+      </w:r>
+      <w:r>
+        <w:rPr>
+          <w:b/>
+        </w:rPr>
+        <w:t>Letha Sullivan</w:t>
+      </w:r>
+      <w:r>
+        <w:t xml:space="preserve"> (age </w:t>
+      </w:r>
+      <w:r>
+        <w:rPr>
+          <w:b/>
+        </w:rPr>
+        <w:t>12</w:t>
+      </w:r>
+      <w:r>
+        <w:t xml:space="preserve">, servant) and </w:t>
+      </w:r>
+      <w:r>
+        <w:rPr>
+          <w:b/>
+        </w:rPr>
+        <w:t>Newnam</w:t>
+      </w:r>
+      <w:r>
+        <w:t xml:space="preserve"> in-laws in </w:t>
+      </w:r>
+      <w:r>
+        <w:rPr>
+          <w:b/>
+        </w:rPr>
+        <w:t>John Sullivan</w:t>
+      </w:r>
+      <w:r>
+        <w:t>’s house in Liberty Township (</w:t>
+      </w:r>
+      <w:r>
+        <w:rPr>
+          <w:b/>
+        </w:rPr>
+        <w:t>C244</w:t>
+      </w:r>
+      <w:r>
+        <w:t>–</w:t>
+      </w:r>
+      <w:r>
+        <w:rPr>
+          <w:b/>
+        </w:rPr>
+        <w:t>C245</w:t>
+      </w:r>
+      <w:r>
+        <w:t xml:space="preserve">); </w:t>
+      </w:r>
+      <w:r>
+        <w:rPr>
+          <w:b/>
+        </w:rPr>
+        <w:t>P001</w:t>
+      </w:r>
+      <w:r>
+        <w:t xml:space="preserve"> is still absent from that ED bracket (</w:t>
+      </w:r>
+      <w:r>
+        <w:rPr>
+          <w:b/>
+        </w:rPr>
+        <w:t>C246</w:t>
+      </w:r>
+      <w:r>
+        <w:t>). [S251] Oklahoma and Texas Newman windows were sampled; they do not hold her. Tennessee’s handwritten N-550 reel has a blank D-tab after Clifford of Lauderdale — no Coy — and an M-window of Mary D., Mek. G. of Cheatham, two Melvins of Giles, Minerva, Minnie, Mitchell — no McCoy.</w:t>
       </w:r>
     </w:p>
     <w:p>

</xml_diff>

<commit_message>
Rebuild book after Pass 49 Soundex paragraph
Co-authored-by: blakereaganlaw <blakereaganlaw@gmail.com>
</commit_message>
<xml_diff>
--- a/research/dora-ella-newnam/book/Dora-Ella-Newnam-Stone-A-Life.docx
+++ b/research/dora-ella-newnam/book/Dora-Ella-Newnam-Stone-A-Life.docx
@@ -1472,7 +1472,7 @@
         <w:t>Bollinger County</w:t>
       </w:r>
       <w:r>
-        <w:t xml:space="preserve"> originals place </w:t>
+        <w:t xml:space="preserve"> population schedules place </w:t>
       </w:r>
       <w:r>
         <w:rPr>
@@ -1526,7 +1526,52 @@
         <w:t>C245</w:t>
       </w:r>
       <w:r>
-        <w:t xml:space="preserve">); </w:t>
+        <w:t xml:space="preserve">); the </w:t>
+      </w:r>
+      <w:r>
+        <w:rPr>
+          <w:b/>
+        </w:rPr>
+        <w:t>S-415 Sullivan</w:t>
+      </w:r>
+      <w:r>
+        <w:t xml:space="preserve"> Soundex reel (</w:t>
+      </w:r>
+      <w:r>
+        <w:rPr>
+          <w:b/>
+        </w:rPr>
+        <w:t>S253</w:t>
+      </w:r>
+      <w:r>
+        <w:t xml:space="preserve">) is </w:t>
+      </w:r>
+      <w:r>
+        <w:rPr>
+          <w:b/>
+        </w:rPr>
+        <w:t>nil</w:t>
+      </w:r>
+      <w:r>
+        <w:t xml:space="preserve"> for Bollinger and for </w:t>
+      </w:r>
+      <w:r>
+        <w:rPr>
+          <w:b/>
+        </w:rPr>
+        <w:t>LETHA</w:t>
+      </w:r>
+      <w:r>
+        <w:t xml:space="preserve"> on cards (</w:t>
+      </w:r>
+      <w:r>
+        <w:rPr>
+          <w:b/>
+        </w:rPr>
+        <w:t>C247</w:t>
+      </w:r>
+      <w:r>
+        <w:t xml:space="preserve">). </w:t>
       </w:r>
       <w:r>
         <w:rPr>
@@ -1544,7 +1589,7 @@
         <w:t>C246</w:t>
       </w:r>
       <w:r>
-        <w:t>). [S251] Oklahoma and Texas Newman windows were sampled; they do not hold her. Tennessee’s handwritten N-550 reel has a blank D-tab after Clifford of Lauderdale — no Coy — and an M-window of Mary D., Mek. G. of Cheatham, two Melvins of Giles, Minerva, Minnie, Mitchell — no McCoy.</w:t>
+        <w:t>). [S251] [S253] Oklahoma and Texas Newman windows were sampled; they do not hold her. Tennessee’s handwritten N-550 reel has a blank D-tab after Clifford of Lauderdale — no Coy — and an M-window of Mary D., Mek. G. of Cheatham, two Melvins of Giles, Minerva, Minnie, Mitchell — no McCoy.</w:t>
       </w:r>
     </w:p>
     <w:p>

</xml_diff>

<commit_message>
Pass 50: reject two Bollinger 1910 Dora near-misses (B007)
Full-render T624-769 PDF pp 351-434. Crooked Creek ED 1 Dora E. Stone
(Henry C.) and Fillmore ED 2 Dora Newnam (John H., b. Indiana) are not
P001. Lee clerk Landmark and Chronicling America still blocked.

Co-authored-by: blakereaganlaw <blakereaganlaw@gmail.com>
</commit_message>
<xml_diff>
--- a/research/dora-ella-newnam/book/Dora-Ella-Newnam-Stone-A-Life.docx
+++ b/research/dora-ella-newnam/book/Dora-Ella-Newnam-Stone-A-Life.docx
@@ -1571,6 +1571,78 @@
         <w:t>C247</w:t>
       </w:r>
       <w:r>
+        <w:t xml:space="preserve">). Two same-name women in the same county are </w:t>
+      </w:r>
+      <w:r>
+        <w:rPr>
+          <w:b/>
+        </w:rPr>
+        <w:t>not</w:t>
+      </w:r>
+      <w:r>
+        <w:t xml:space="preserve"> her: </w:t>
+      </w:r>
+      <w:r>
+        <w:rPr>
+          <w:b/>
+        </w:rPr>
+        <w:t>Dora E. Stone</w:t>
+      </w:r>
+      <w:r>
+        <w:t xml:space="preserve">, thirty-seven, wife of </w:t>
+      </w:r>
+      <w:r>
+        <w:rPr>
+          <w:b/>
+        </w:rPr>
+        <w:t>Henry C. Stone</w:t>
+      </w:r>
+      <w:r>
+        <w:t xml:space="preserve"> in Crooked Creek (</w:t>
+      </w:r>
+      <w:r>
+        <w:rPr>
+          <w:b/>
+        </w:rPr>
+        <w:t>C249</w:t>
+      </w:r>
+      <w:r>
+        <w:t xml:space="preserve">), and </w:t>
+      </w:r>
+      <w:r>
+        <w:rPr>
+          <w:b/>
+        </w:rPr>
+        <w:t>Dora Newnam</w:t>
+      </w:r>
+      <w:r>
+        <w:t xml:space="preserve">, thirty-six, born </w:t>
+      </w:r>
+      <w:r>
+        <w:rPr>
+          <w:b/>
+        </w:rPr>
+        <w:t>Indiana</w:t>
+      </w:r>
+      <w:r>
+        <w:t xml:space="preserve">, wife of </w:t>
+      </w:r>
+      <w:r>
+        <w:rPr>
+          <w:b/>
+        </w:rPr>
+        <w:t>John H. Newnam</w:t>
+      </w:r>
+      <w:r>
+        <w:t xml:space="preserve"> in Fillmore (</w:t>
+      </w:r>
+      <w:r>
+        <w:rPr>
+          <w:b/>
+        </w:rPr>
+        <w:t>C250</w:t>
+      </w:r>
+      <w:r>
         <w:t xml:space="preserve">). </w:t>
       </w:r>
       <w:r>
@@ -1580,7 +1652,7 @@
         <w:t>P001</w:t>
       </w:r>
       <w:r>
-        <w:t xml:space="preserve"> is still absent from that ED bracket (</w:t>
+        <w:t xml:space="preserve"> is still absent from that ED sector as a Kentucky-born woman of thirty-nine (</w:t>
       </w:r>
       <w:r>
         <w:rPr>
@@ -1589,7 +1661,7 @@
         <w:t>C246</w:t>
       </w:r>
       <w:r>
-        <w:t>). [S251] [S253] Oklahoma and Texas Newman windows were sampled; they do not hold her. Tennessee’s handwritten N-550 reel has a blank D-tab after Clifford of Lauderdale — no Coy — and an M-window of Mary D., Mek. G. of Cheatham, two Melvins of Giles, Minerva, Minnie, Mitchell — no McCoy.</w:t>
+        <w:t>). [S251] [S253] [S254] Oklahoma and Texas Newman windows were sampled; they do not hold her. Tennessee’s handwritten N-550 reel has a blank D-tab after Clifford of Lauderdale — no Coy — and an M-window of Mary D., Mek. G. of Cheatham, two Melvins of Giles, Minerva, Minnie, Mitchell — no McCoy.</w:t>
       </w:r>
     </w:p>
     <w:p>

</xml_diff>

<commit_message>
Pass 52: 1900 S-415 Letha nil; withdraw Liberty Sullivan servant
Map T623-839 Liberty ED 4–5 headers; read MO Soundex roll 248
S-415 Letha/John windows (C255–C256). Re-read ED 5 sh 1B and
withdraw the pass-51 William H. Sullivan servant ID (C257).

Co-authored-by: blakereaganlaw <blakereaganlaw@gmail.com>
</commit_message>
<xml_diff>
--- a/research/dora-ella-newnam/book/Dora-Ella-Newnam-Stone-A-Life.docx
+++ b/research/dora-ella-newnam/book/Dora-Ella-Newnam-Stone-A-Life.docx
@@ -1569,6 +1569,51 @@
           <w:b/>
         </w:rPr>
         <w:t>C247</w:t>
+      </w:r>
+      <w:r>
+        <w:t xml:space="preserve">). The </w:t>
+      </w:r>
+      <w:r>
+        <w:rPr>
+          <w:b/>
+        </w:rPr>
+        <w:t>1900</w:t>
+      </w:r>
+      <w:r>
+        <w:t xml:space="preserve"> S-415 reel likewise has </w:t>
+      </w:r>
+      <w:r>
+        <w:rPr>
+          <w:b/>
+        </w:rPr>
+        <w:t>no Letha head</w:t>
+      </w:r>
+      <w:r>
+        <w:t xml:space="preserve"> (</w:t>
+      </w:r>
+      <w:r>
+        <w:rPr>
+          <w:b/>
+        </w:rPr>
+        <w:t>C255</w:t>
+      </w:r>
+      <w:r>
+        <w:t xml:space="preserve">) and </w:t>
+      </w:r>
+      <w:r>
+        <w:rPr>
+          <w:b/>
+        </w:rPr>
+        <w:t>no Bollinger John</w:t>
+      </w:r>
+      <w:r>
+        <w:t xml:space="preserve"> on cards sampled (</w:t>
+      </w:r>
+      <w:r>
+        <w:rPr>
+          <w:b/>
+        </w:rPr>
+        <w:t>C256</w:t>
       </w:r>
       <w:r>
         <w:t xml:space="preserve">). Two same-name women in the same county are </w:t>

</xml_diff>

<commit_message>
Dora research passes 32–33: Ella Miracode, Hardin Gray original, chat review
Re-read Sturgeon 1910 ED 99 sheet 13B (already in the gallery): Hardin Gray
and Vista are at dwelling 241 family 251 (C317). C194's missing-line claim
is disproved; original family 248 is Treadway, not Gray. File 1910 KY N-550
Ella-window plates, Lee wills/deeds HTML, and a 53-chat review. Rebuild the
Word biography. Skip sibling Greene ED 42–43, T623-839, and hh 85.

Co-authored-by: CatCorner22 <CatCorner22@users.noreply.github.com>
</commit_message>
<xml_diff>
--- a/research/dora-ella-newnam/book/Dora-Ella-Newnam-Stone-A-Life.docx
+++ b/research/dora-ella-newnam/book/Dora-Ella-Newnam-Stone-A-Life.docx
@@ -18,7 +18,7 @@
         <w:rPr>
           <w:i/>
         </w:rPr>
-        <w:t>A documented life, 1871–1926. Compiled from every research chat in this project, 27–29 October 2026. Living descendants are not named. Facts below the line of proof are labelled in the text. Nothing here is family lore presented as fact.</w:t>
+        <w:t>A documented life, 1871–1926. Compiled from every research chat in this project, 27–30 October 2026. Living descendants are not named. Facts below the line of proof are labelled in the text. Nothing here is family lore presented as fact.</w:t>
       </w:r>
     </w:p>
     <w:p>
@@ -41,7 +41,7 @@
     </w:p>
     <w:p>
       <w:r>
-        <w:t>Sixteen Cursor chats produced the evidence. The original mobile session opened the case and read the Arkansas death certificate the family still holds. Later sessions recovered the 1880 childhood schedule that free transcripts had missed, walked statewide Soundex reels for 1910 and 1920, tested a Peebles third-marriage hypothesis and set it aside, and photographed sixty-one frames of National Archives microfilm. This volume folds those chats into one narrative. The case dossier remains the working file; this book is the public reading of it.</w:t>
+        <w:t>Fifty-three Cursor chats on this repository were reviewed for this volume (primary research, helpers, scans, and failed browser hunts). The original mobile session opened the case and read the Arkansas death certificate the family still holds. Later sessions recovered the 1880 childhood schedule that free transcripts had missed, walked statewide Soundex reels for 1910 and 1920, tested a Peebles third-marriage hypothesis and set it aside, and photographed NARA microfilm frames — sixty-one in the first gallery, then sixty-six with the 1910 Kentucky Ella Miracode plates, now sixty-seven with the Hardin Gray household crop from Sturgeon sheet 13 B. This volume folds those chats into one narrative. The case dossier remains the working file; this book is the public reading of it. Sibling chats still running on Greene ED 41–43, 1900 Liberty, and 1900 hh 85 are inventoried, not duplicated.</w:t>
       </w:r>
     </w:p>
     <w:p>
@@ -344,7 +344,7 @@
         <w:t>Susan</w:t>
       </w:r>
       <w:r>
-        <w:t xml:space="preserve">), twenty-six, and daughters Ida, six, and Bertie, five. Those ages are twenty years too young for Louisa, Ida, and Burtie. [C177] [C178] The real Martha is in the same precinct, family 251, sheet 13 B: </w:t>
+        <w:t xml:space="preserve">), twenty-six, and daughters Ida, six, and Bertie, five. Those ages are twenty years too young for Louisa, Ida, and Burtie. [C177] [C178] The real Martha is on the same precinct’s sheet 13 B, dwelling 245 family 255: </w:t>
       </w:r>
       <w:r>
         <w:rPr>
@@ -362,7 +362,7 @@
         <w:t>Martha</w:t>
       </w:r>
       <w:r>
-        <w:t xml:space="preserve">, twenty-three; Flora, five; Everett, three. There is no mother-in-law in that house. [C182] Two families away on the Miracode, </w:t>
+        <w:t xml:space="preserve">, twenty-three; Flora, five; Everett, three. There is no mother-in-law in that house. [C182] [C320] Four families earlier on that sheet, dwelling 241 family 251, </w:t>
       </w:r>
       <w:r>
         <w:rPr>
@@ -380,7 +380,16 @@
         <w:t>Vista</w:t>
       </w:r>
       <w:r>
-        <w:t xml:space="preserve">, twenty-seven — Vesta — and four children. Louisa is not on that card either. The bound Sturgeon sheets skip family numbers 243–249; sheet 14 B is blank. The original line for family 248 is not on the film. [C184] [C166] [C194] Kentucky’s 1910 Mays soundex (M-200) has no Lee Louisa, Eliza, Ida, or Whitley as a head. A Clark County Whitley Mats, twenty-four, boarding with Zack Nopper, is a different man. [C185] [C186] [C187] [C188] Patsey Farley’s 1937 obituary still called her sister </w:t>
+        <w:t xml:space="preserve">, twenty-seven — Vesta — and four children, Rascoe, Hubert, Elcie, and Deanna. Louisa is not in that house either. [C317] [C184] [C166] Family 248 on the schedule is </w:t>
+      </w:r>
+      <w:r>
+        <w:rPr>
+          <w:b/>
+        </w:rPr>
+        <w:t>Treadway, Solomon</w:t>
+      </w:r>
+      <w:r>
+        <w:t xml:space="preserve">, not Hardin; the Miracode clerk wrote 0248 for the Gray couple. [C319] A prior reading that families 243–249 were missing, and that Hardin’s original line was not on the film, is disproved. [C318] [C194] Kentucky’s 1910 Mays soundex (M-200) has no Lee Louisa, Eliza, Ida, or Whitley as a head. A Clark County Whitley Mats, twenty-four, boarding with Zack Nopper, is a different man. [C185] [C186] [C187] [C188] Patsey Farley’s 1937 obituary still called her sister </w:t>
       </w:r>
       <w:r>
         <w:rPr>
@@ -837,13 +846,43 @@
         <w:t>Ella</w:t>
       </w:r>
       <w:r>
-        <w:t xml:space="preserve"> wife-on-husband reel remains unread here. [B044] / </w:t>
+        <w:t xml:space="preserve"> given-name window is now </w:t>
       </w:r>
       <w:r>
         <w:rPr>
           <w:b/>
         </w:rPr>
-        <w:t>L180</w:t>
+        <w:t>image-read</w:t>
+      </w:r>
+      <w:r>
+        <w:t xml:space="preserve"> (printed pp. </w:t>
+      </w:r>
+      <w:r>
+        <w:rPr>
+          <w:b/>
+        </w:rPr>
+        <w:t>266–267</w:t>
+      </w:r>
+      <w:r>
+        <w:t xml:space="preserve">): </w:t>
+      </w:r>
+      <w:r>
+        <w:rPr>
+          <w:b/>
+        </w:rPr>
+        <w:t>no</w:t>
+      </w:r>
+      <w:r>
+        <w:t xml:space="preserve"> Ella about thirty-nine in Lee, Greene, or Owsley. Newport Ella, 35, servant; Lexington Ella, 13, Black; Pendleton Ellanora, 4½; Lexington Ellen, 77, Ireland; Louisville Ellen, 66, Black; Union Ella, 40, wife of Charles T.; Beattyville Emma, 23 — </w:t>
+      </w:r>
+      <w:r>
+        <w:rPr>
+          <w:b/>
+        </w:rPr>
+        <w:t>rejected</w:t>
+      </w:r>
+      <w:r>
+        <w:t>. [C301] [C302–C308] [C313] [S301] A wife listed only on a husband’s card under another surname remains possible.</w:t>
       </w:r>
     </w:p>
     <w:p>
@@ -1325,7 +1364,21 @@
     </w:p>
     <w:p>
       <w:r>
-        <w:t>A third marriage to a Peebles before Stone is not supported. Two documented marriages stand. Where she was in 1910 — some other married name, a wife listed only on a husband’s card, another state, or a missed schedule — remains the hole.</w:t>
+        <w:t>A third marriage to a Peebles before Stone is not supported. Two documented marriages stand.</w:t>
+      </w:r>
+    </w:p>
+    <w:p>
+      <w:r>
+        <w:t xml:space="preserve">She is not hidden on the Kentucky Miracode as </w:t>
+      </w:r>
+      <w:r>
+        <w:rPr>
+          <w:b/>
+        </w:rPr>
+        <w:t>Ella</w:t>
+      </w:r>
+      <w:r>
+        <w:t xml:space="preserve"> Newman of thirty-nine in Lee, Greene, or Owsley. The typed Ella window (printed pages 266–267) holds a Newport servant of thirty-five, a Black thirteen-year-old in Lexington, a four-and-a-half-year-old Ellanora in Pendleton, an Irish lodger of seventy-seven, a Black boarder of sixty-six in Louisville, and — nearby in the Charles block — Ella, forty, wife of Charles T. in Union County, and Emma, twenty-three, wife of Chas in Beattyville. None of those women is Dora. [C301–C308] [C313] [S301] A wife listed only on a husband’s card under another surname remains the hole.</w:t>
       </w:r>
     </w:p>
     <w:p>
@@ -1753,7 +1806,33 @@
         <w:pStyle w:val="ListBullet"/>
       </w:pPr>
       <w:r>
-        <w:t>Where Dora was in April 1910 and January 1920. Newman in Kentucky, Arkansas and Missouri is closed. Sturgeon ED 99 as Newnam is closed. Stone in Kentucky is closed. Peebles in Kentucky 1910 is closed. Other surnames, and a wife listed only on a husband’s card, remain.</w:t>
+        <w:t xml:space="preserve">Where Dora was in April 1910 and January 1920. Newman in Kentucky, Arkansas and Missouri is closed. Sturgeon ED 99 as Newnam is closed. Stone in Kentucky is closed. Peebles in Kentucky 1910 is closed. Kentucky N-550 </w:t>
+      </w:r>
+      <w:r>
+        <w:rPr>
+          <w:b/>
+        </w:rPr>
+        <w:t>Ella ~39</w:t>
+      </w:r>
+      <w:r>
+        <w:t xml:space="preserve"> in Lee, Greene, and Owsley is closed. Other surnames, and a wife listed only on a husband’s card, remain.</w:t>
+      </w:r>
+    </w:p>
+    <w:p>
+      <w:pPr>
+        <w:pStyle w:val="ListBullet"/>
+      </w:pPr>
+      <w:r>
+        <w:t xml:space="preserve">Conflict </w:t>
+      </w:r>
+      <w:r>
+        <w:rPr>
+          <w:b/>
+        </w:rPr>
+        <w:t>#18</w:t>
+      </w:r>
+      <w:r>
+        <w:t xml:space="preserve"> is resolved: Hardin Gray and Vista are on Sturgeon sheet 13 B, dwelling 241 family 251. Louisa is not in that house. The Miracode number 0248 is not the original family 248. [C317] [C319]</w:t>
       </w:r>
     </w:p>
     <w:p>

</xml_diff>

<commit_message>
Pass 53: Greene ED 42–43 A-sides nil Stone; reject Wright Dora
Map T623-856: ED 42 = p.180–255, ED 43 = p.256–319. Visually read
unread A-sides (C259). Wright, Dora 34 b. Apr 1866 MO on ED 43
sh 1A is not P001 (C258). Residual: unread B-sides.

Co-authored-by: blakereaganlaw <blakereaganlaw@gmail.com>
</commit_message>
<xml_diff>
--- a/research/dora-ella-newnam/book/Dora-Ella-Newnam-Stone-A-Life.docx
+++ b/research/dora-ella-newnam/book/Dora-Ella-Newnam-Stone-A-Life.docx
@@ -1792,7 +1792,52 @@
         <w:t>not merged</w:t>
       </w:r>
       <w:r>
-        <w:t xml:space="preserve"> because age thirty-two in 1900 implies about fifty-two in 1920, not the recorded sixty-two. [C092] Dunklin’s village of Campbell (ED 47) remains nil. [C105] Sheet 17A line 25 is not Thomas A. [C112] Other ED 37 spot sheets and an ED 38 sample are nil for a second Thomas A. household. [C115] The closest-*age* candidate remains Douglas County’s Thomas, forty-four, with wife Nancy E. — original read, Soundex “Jesse C.” corrected to Ossie P., daughter. [C101] [C102]</w:t>
+        <w:t xml:space="preserve"> because age thirty-two in 1900 implies about fifty-two in 1920, not the recorded sixty-two. [C092] Dunklin’s village of Campbell (ED 47) remains nil. [C105] Sheet 17A line 25 is not Thomas A. [C112] Other ED 37 spot sheets and an ED 38 sample are nil for a second Thomas A. household. [C115] Springfield ED </w:t>
+      </w:r>
+      <w:r>
+        <w:rPr>
+          <w:b/>
+        </w:rPr>
+        <w:t>42</w:t>
+      </w:r>
+      <w:r>
+        <w:t xml:space="preserve"> (PDF p.180–255) and ED </w:t>
+      </w:r>
+      <w:r>
+        <w:rPr>
+          <w:b/>
+        </w:rPr>
+        <w:t>43</w:t>
+      </w:r>
+      <w:r>
+        <w:t xml:space="preserve"> (p.256–319) </w:t>
+      </w:r>
+      <w:r>
+        <w:rPr>
+          <w:b/>
+        </w:rPr>
+        <w:t>A-sides</w:t>
+      </w:r>
+      <w:r>
+        <w:t xml:space="preserve"> likewise have </w:t>
+      </w:r>
+      <w:r>
+        <w:rPr>
+          <w:b/>
+        </w:rPr>
+        <w:t>no Stone</w:t>
+      </w:r>
+      <w:r>
+        <w:t xml:space="preserve"> head. [C259] A Dora on ED 43 sheet 1A is </w:t>
+      </w:r>
+      <w:r>
+        <w:rPr>
+          <w:b/>
+        </w:rPr>
+        <w:t>Wright</w:t>
+      </w:r>
+      <w:r>
+        <w:t>’s wife, thirty-four, born April 1866 in Missouri — not her. [C258] The closest-*age* candidate remains Douglas County’s Thomas, forty-four, with wife Nancy E. — original read, Soundex “Jesse C.” corrected to Ossie P., daughter. [C101] [C102]</w:t>
       </w:r>
     </w:p>
     <w:p>

</xml_diff>

<commit_message>
Pass 54: Liberty ED 4 sh 1–4 nil; S-415 William no Bollinger
Read 1900 Liberty ED 4 sheets 1A–4B (C260). Soundex roll 249
William Sullivan window names no Bollinger county (C261).
Greene ED 42–43 B-sides sampled nil Stone (C262). Residual
unread B-sides and John cards remain.

Co-authored-by: blakereaganlaw <blakereaganlaw@gmail.com>
</commit_message>
<xml_diff>
--- a/research/dora-ella-newnam/book/Dora-Ella-Newnam-Stone-A-Life.docx
+++ b/research/dora-ella-newnam/book/Dora-Ella-Newnam-Stone-A-Life.docx
@@ -1598,7 +1598,7 @@
         <w:t>C255</w:t>
       </w:r>
       <w:r>
-        <w:t xml:space="preserve">) and </w:t>
+        <w:t xml:space="preserve">), </w:t>
       </w:r>
       <w:r>
         <w:rPr>
@@ -1614,6 +1614,60 @@
           <w:b/>
         </w:rPr>
         <w:t>C256</w:t>
+      </w:r>
+      <w:r>
+        <w:t xml:space="preserve">), and </w:t>
+      </w:r>
+      <w:r>
+        <w:rPr>
+          <w:b/>
+        </w:rPr>
+        <w:t>no Bollinger William</w:t>
+      </w:r>
+      <w:r>
+        <w:t xml:space="preserve"> on roll </w:t>
+      </w:r>
+      <w:r>
+        <w:rPr>
+          <w:b/>
+        </w:rPr>
+        <w:t>249</w:t>
+      </w:r>
+      <w:r>
+        <w:t xml:space="preserve"> (</w:t>
+      </w:r>
+      <w:r>
+        <w:rPr>
+          <w:b/>
+        </w:rPr>
+        <w:t>C261</w:t>
+      </w:r>
+      <w:r>
+        <w:t xml:space="preserve">). Liberty ED </w:t>
+      </w:r>
+      <w:r>
+        <w:rPr>
+          <w:b/>
+        </w:rPr>
+        <w:t>4</w:t>
+      </w:r>
+      <w:r>
+        <w:t xml:space="preserve"> sheets 1–4 are </w:t>
+      </w:r>
+      <w:r>
+        <w:rPr>
+          <w:b/>
+        </w:rPr>
+        <w:t>nil</w:t>
+      </w:r>
+      <w:r>
+        <w:t xml:space="preserve"> for Sullivan, Letha, and Newnam (</w:t>
+      </w:r>
+      <w:r>
+        <w:rPr>
+          <w:b/>
+        </w:rPr>
+        <w:t>C260</w:t>
       </w:r>
       <w:r>
         <w:t xml:space="preserve">). Two same-name women in the same county are </w:t>
@@ -1828,7 +1882,7 @@
         <w:t>no Stone</w:t>
       </w:r>
       <w:r>
-        <w:t xml:space="preserve"> head. [C259] A Dora on ED 43 sheet 1A is </w:t>
+        <w:t xml:space="preserve"> head, and the B-sides sampled so far match that nil. [C259] [C262] A Dora on ED 43 sheet 1A is </w:t>
       </w:r>
       <w:r>
         <w:rPr>

</xml_diff>

<commit_message>
Pass 55: Greene ED 42–43 B-sides nil Stone; Liberty ED 5 nil Sullivan
Close remaining Springfield B-sides (C263/C264) and Liberty ED 5 sheets 1–14 (C265). Reject Abraham Copley’s wife Dora E. (C266). Residual: S-415 John cards; Greene ED 37–41.

Co-authored-by: blakereaganlaw <blakereaganlaw@gmail.com>
</commit_message>
<xml_diff>
--- a/research/dora-ella-newnam/book/Dora-Ella-Newnam-Stone-A-Life.docx
+++ b/research/dora-ella-newnam/book/Dora-Ella-Newnam-Stone-A-Life.docx
@@ -1670,6 +1670,51 @@
         <w:t>C260</w:t>
       </w:r>
       <w:r>
+        <w:t xml:space="preserve">). Liberty ED </w:t>
+      </w:r>
+      <w:r>
+        <w:rPr>
+          <w:b/>
+        </w:rPr>
+        <w:t>5</w:t>
+      </w:r>
+      <w:r>
+        <w:t xml:space="preserve"> sheets 1–14 are the same nil (</w:t>
+      </w:r>
+      <w:r>
+        <w:rPr>
+          <w:b/>
+        </w:rPr>
+        <w:t>C265</w:t>
+      </w:r>
+      <w:r>
+        <w:t xml:space="preserve">). A </w:t>
+      </w:r>
+      <w:r>
+        <w:rPr>
+          <w:b/>
+        </w:rPr>
+        <w:t>Dora E.</w:t>
+      </w:r>
+      <w:r>
+        <w:t xml:space="preserve"> on ED 5 sheet 10 is </w:t>
+      </w:r>
+      <w:r>
+        <w:rPr>
+          <w:b/>
+        </w:rPr>
+        <w:t>Abraham Copley</w:t>
+      </w:r>
+      <w:r>
+        <w:t>’s wife, born October 1873 in Missouri — not her (</w:t>
+      </w:r>
+      <w:r>
+        <w:rPr>
+          <w:b/>
+        </w:rPr>
+        <w:t>C266</w:t>
+      </w:r>
+      <w:r>
         <w:t xml:space="preserve">). Two same-name women in the same county are </w:t>
       </w:r>
       <w:r>
@@ -1864,16 +1909,7 @@
         <w:t>43</w:t>
       </w:r>
       <w:r>
-        <w:t xml:space="preserve"> (p.256–319) </w:t>
-      </w:r>
-      <w:r>
-        <w:rPr>
-          <w:b/>
-        </w:rPr>
-        <w:t>A-sides</w:t>
-      </w:r>
-      <w:r>
-        <w:t xml:space="preserve"> likewise have </w:t>
+        <w:t xml:space="preserve"> (p.256–319) now have </w:t>
       </w:r>
       <w:r>
         <w:rPr>
@@ -1882,7 +1918,7 @@
         <w:t>no Stone</w:t>
       </w:r>
       <w:r>
-        <w:t xml:space="preserve"> head, and the B-sides sampled so far match that nil. [C259] [C262] A Dora on ED 43 sheet 1A is </w:t>
+        <w:t xml:space="preserve"> head on either the A-sides or the B-sides. [C259] [C262] [C263] [C264] A Dora on ED 43 sheet 1A is </w:t>
       </w:r>
       <w:r>
         <w:rPr>

</xml_diff>

<commit_message>
Dora research passes 34–37: 1870 Gray originals, Rhodes not Stone, 60-chat review
File the 1870 Proctor 333a and Silas Sturgeon originals, the Crooked Creek
Rhodes household (sibling C249 is a surname misread), 1900/1910 William Gray
crops, and diplomatic DOC025–032. Rebuild the Word biography. Review all 60
cloud chats. Do not import PR #26 C249 as Stone. Skip sibling reels still in
flight. Open backlog remains (B011, B015, B050, B053, B054).

Co-authored-by: CatCorner22 <CatCorner22@users.noreply.github.com>
</commit_message>
<xml_diff>
--- a/research/dora-ella-newnam/book/Dora-Ella-Newnam-Stone-A-Life.docx
+++ b/research/dora-ella-newnam/book/Dora-Ella-Newnam-Stone-A-Life.docx
@@ -41,7 +41,7 @@
     </w:p>
     <w:p>
       <w:r>
-        <w:t>Fifty-three Cursor chats on this repository were reviewed for this volume (primary research, helpers, scans, and failed browser hunts). The original mobile session opened the case and read the Arkansas death certificate the family still holds. Later sessions recovered the 1880 childhood schedule that free transcripts had missed, walked statewide Soundex reels for 1910 and 1920, tested a Peebles third-marriage hypothesis and set it aside, and photographed NARA microfilm frames — sixty-one in the first gallery, then sixty-six with the 1910 Kentucky Ella Miracode plates, now sixty-seven with the Hardin Gray household crop from Sturgeon sheet 13 B. This volume folds those chats into one narrative. The case dossier remains the working file; this book is the public reading of it. Sibling chats still running on Greene ED 41–43, 1900 Liberty, and 1900 hh 85 are inventoried, not duplicated.</w:t>
+        <w:t>Sixty Cursor chats on this repository were reviewed for this volume (primary research, helpers, scans, and failed browser hunts). The original mobile session opened the case and read the Arkansas death certificate the family still holds. Later sessions recovered the 1880 childhood schedule that free transcripts had missed, walked statewide Soundex reels for 1910 and 1920, tested a Peebles third-marriage hypothesis and set it aside, and photographed NARA microfilm frames — the 1880 childhood schedule, the 1910 Kentucky Ella Miracode plates, Hardin Gray on Sturgeon sheet 13 B, the 1870 Proctor original of James Brandenburg’s house, Silas Gray’s Sturgeon original, the 1900 William Gray dwelling-84 crop, and the Bollinger page a sibling had labelled “Dora E. Stone,” which is Henry C. Rhodes and Dora M. of Missouri. This volume folds those chats into one narrative. The case dossier remains the working file; this book is the public reading of it. Sibling chats still running on Greene ED 41–43, 1900 Liberty, and 1900 hh 85 are inventoried, not duplicated. Do not import their “Dora E. Stone” as this woman.</w:t>
       </w:r>
     </w:p>
     <w:p>
@@ -477,6 +477,128 @@
     </w:p>
     <w:p>
       <w:r>
+        <w:t xml:space="preserve">A later Sturgeon neighbour of Vesta’s in-laws is now on the original 1870 film. On 24 June 1870 James Brandenburg, sixty-two, farmed in Proctor Precinct dwelling 70 with Nancy, fifty-four; William Brandenburg, twenty-six; Martha Arnold, fifteen, of Tennessee; </w:t>
+      </w:r>
+      <w:r>
+        <w:rPr>
+          <w:b/>
+        </w:rPr>
+        <w:t>Mary White, sixteen, a domestic servant</w:t>
+      </w:r>
+      <w:r>
+        <w:t xml:space="preserve">; and </w:t>
+      </w:r>
+      <w:r>
+        <w:rPr>
+          <w:b/>
+        </w:rPr>
+        <w:t>William Gray, twenty-three, a farm labourer</w:t>
+      </w:r>
+      <w:r>
+        <w:t xml:space="preserve">. [C356] [S340] On 18 August 1870 that William Gray married </w:t>
+      </w:r>
+      <w:r>
+        <w:rPr>
+          <w:b/>
+        </w:rPr>
+        <w:t>Mary Jane White</w:t>
+      </w:r>
+      <w:r>
+        <w:t xml:space="preserve"> in that house. [C330] They are the Sturgeon couple of 1900–1928 (</w:t>
+      </w:r>
+      <w:r>
+        <w:rPr>
+          <w:b/>
+        </w:rPr>
+        <w:t>PROVEN</w:t>
+      </w:r>
+      <w:r>
+        <w:t xml:space="preserve">). [C332] The Gray Cemetery copy and WikiTree call her née Brandenburg. That is </w:t>
+      </w:r>
+      <w:r>
+        <w:rPr>
+          <w:b/>
+        </w:rPr>
+        <w:t>SPECULATIVE</w:t>
+      </w:r>
+      <w:r>
+        <w:t xml:space="preserve">. The license and the original census say </w:t>
+      </w:r>
+      <w:r>
+        <w:rPr>
+          <w:b/>
+        </w:rPr>
+        <w:t>White</w:t>
+      </w:r>
+      <w:r>
+        <w:t xml:space="preserve">. Conflict </w:t>
+      </w:r>
+      <w:r>
+        <w:rPr>
+          <w:b/>
+        </w:rPr>
+        <w:t>#19</w:t>
+      </w:r>
+      <w:r>
+        <w:t xml:space="preserve">. His death certificate says born 2 May 1844; the 1870 and 1900 schedules cluster on 1846–47. Conflict </w:t>
+      </w:r>
+      <w:r>
+        <w:rPr>
+          <w:b/>
+        </w:rPr>
+        <w:t>#21</w:t>
+      </w:r>
+      <w:r>
+        <w:t xml:space="preserve">. Print both years. Do not invent a third. </w:t>
+      </w:r>
+      <w:r>
+        <w:rPr>
+          <w:b/>
+        </w:rPr>
+        <w:t>Silas Gray</w:t>
+      </w:r>
+      <w:r>
+        <w:t xml:space="preserve">, fifty-four, of Sturgeon the same week is a </w:t>
+      </w:r>
+      <w:r>
+        <w:rPr>
+          <w:b/>
+        </w:rPr>
+        <w:t>possible</w:t>
+      </w:r>
+      <w:r>
+        <w:t xml:space="preserve"> father named on the 1928 extract; William is not in Silas’s house, so they are not merged. [C348] Hardin Gray, next door in 1900, is a </w:t>
+      </w:r>
+      <w:r>
+        <w:rPr>
+          <w:b/>
+        </w:rPr>
+        <w:t>possible</w:t>
+      </w:r>
+      <w:r>
+        <w:t xml:space="preserve"> son, not merged. [C333] A 1910 Missouri page labelled “Dora E. Stone, wife of Henry C.” in another chat is </w:t>
+      </w:r>
+      <w:r>
+        <w:rPr>
+          <w:b/>
+        </w:rPr>
+        <w:t>Rhodes, Henry C.</w:t>
+      </w:r>
+      <w:r>
+        <w:t xml:space="preserve">, and </w:t>
+      </w:r>
+      <w:r>
+        <w:rPr>
+          <w:b/>
+        </w:rPr>
+        <w:t>Dora M.</w:t>
+      </w:r>
+      <w:r>
+        <w:t>, thirty-seven, born Missouri, six children living. That is not this woman. [C338]</w:t>
+      </w:r>
+    </w:p>
+    <w:p>
+      <w:r>
         <w:t>Samuel was family. On the first page of the same 1880 district, dwelling 3, taken 1 June, a boy named Samuel, eleven, son, lived with John Newnam, sixty-nine, farmer, born in Kentucky, father born in North Carolina, and Mary, fifty-seven, with Eli, sixteen, Susan, twenty, and Hannah, nine. [C060] [C061] [S040] Age eleven in June 1880 is exactly the June 1869 birth of the 1900 husband and the sixteen-year-old of December 1885. Identification of that boy as Dora’s husband is probable.</w:t>
       </w:r>
     </w:p>
@@ -1719,7 +1841,7 @@
     </w:p>
     <w:p>
       <w:r>
-        <w:t>Part II of the PDF prints every JPEG preserved in this case, sixty-one frames, in chronological order of the record. Four roles appear in the captions:</w:t>
+        <w:t>Part II of the PDF prints the JPEG and PNG frames preserved in this case, in chronological order of the record. Four roles appear in the captions:</w:t>
       </w:r>
     </w:p>
     <w:p>
@@ -1833,6 +1955,93 @@
       </w:r>
       <w:r>
         <w:t xml:space="preserve"> is resolved: Hardin Gray and Vista are on Sturgeon sheet 13 B, dwelling 241 family 251. Louisa is not in that house. The Miracode number 0248 is not the original family 248. [C317] [C319]</w:t>
+      </w:r>
+    </w:p>
+    <w:p>
+      <w:pPr>
+        <w:pStyle w:val="ListBullet"/>
+      </w:pPr>
+      <w:r>
+        <w:t xml:space="preserve">Conflict </w:t>
+      </w:r>
+      <w:r>
+        <w:rPr>
+          <w:b/>
+        </w:rPr>
+        <w:t>#19</w:t>
+      </w:r>
+      <w:r>
+        <w:t xml:space="preserve"> is open: Mary J. Gray’s maiden name is </w:t>
+      </w:r>
+      <w:r>
+        <w:rPr>
+          <w:b/>
+        </w:rPr>
+        <w:t>White</w:t>
+      </w:r>
+      <w:r>
+        <w:t xml:space="preserve"> on the 1870 license and original census (</w:t>
+      </w:r>
+      <w:r>
+        <w:rPr>
+          <w:b/>
+        </w:rPr>
+        <w:t>PROBABLE</w:t>
+      </w:r>
+      <w:r>
+        <w:t xml:space="preserve">) versus </w:t>
+      </w:r>
+      <w:r>
+        <w:rPr>
+          <w:b/>
+        </w:rPr>
+        <w:t>Brandenburg</w:t>
+      </w:r>
+      <w:r>
+        <w:t xml:space="preserve"> on the cemetery copy and WikiTree (</w:t>
+      </w:r>
+      <w:r>
+        <w:rPr>
+          <w:b/>
+        </w:rPr>
+        <w:t>SPECULATIVE</w:t>
+      </w:r>
+      <w:r>
+        <w:t>). Do not print née Brandenburg as fact. [C349] [C356]</w:t>
+      </w:r>
+    </w:p>
+    <w:p>
+      <w:pPr>
+        <w:pStyle w:val="ListBullet"/>
+      </w:pPr>
+      <w:r>
+        <w:t xml:space="preserve">Conflict </w:t>
+      </w:r>
+      <w:r>
+        <w:rPr>
+          <w:b/>
+        </w:rPr>
+        <w:t>#21</w:t>
+      </w:r>
+      <w:r>
+        <w:t xml:space="preserve"> is open: William Gray’s birth year is 1844 on the death extract and stone versus 1846–47 on the 1870 and 1900 originals. Print May 1844/1847. Identity is not in doubt. [C332] [C328]</w:t>
+      </w:r>
+    </w:p>
+    <w:p>
+      <w:pPr>
+        <w:pStyle w:val="ListBullet"/>
+      </w:pPr>
+      <w:r>
+        <w:t xml:space="preserve">A sibling “Dora E. Stone” on Crooked Creek ED 1 sheet 10 A is </w:t>
+      </w:r>
+      <w:r>
+        <w:rPr>
+          <w:b/>
+        </w:rPr>
+        <w:t>Rhodes</w:t>
+      </w:r>
+      <w:r>
+        <w:t>, not Stone, and is not this woman. [C338]</w:t>
       </w:r>
     </w:p>
     <w:p>

</xml_diff>

<commit_message>
Pass 56: denser S-415 John window no Bollinger; ED 41 A-sides nil Stone
Close L303 sample gaps on the 1900 Missouri Sullivan John cards (C267). Five more Greene ED 41 A-sides are nil Stone (C268). Residual: remaining ED 40–41; reel 855 ED 37–38; 1910 John still unplaced in 1900.

Co-authored-by: blakereaganlaw <blakereaganlaw@gmail.com>
</commit_message>
<xml_diff>
--- a/research/dora-ella-newnam/book/Dora-Ella-Newnam-Stone-A-Life.docx
+++ b/research/dora-ella-newnam/book/Dora-Ella-Newnam-Stone-A-Life.docx
@@ -1607,13 +1607,13 @@
         <w:t>no Bollinger John</w:t>
       </w:r>
       <w:r>
-        <w:t xml:space="preserve"> on cards sampled (</w:t>
+        <w:t xml:space="preserve"> on the denser John window (</w:t>
       </w:r>
       <w:r>
         <w:rPr>
           <w:b/>
         </w:rPr>
-        <w:t>C256</w:t>
+        <w:t>C256/C267</w:t>
       </w:r>
       <w:r>
         <w:t xml:space="preserve">), and </w:t>

</xml_diff>

<commit_message>
Dora research pass 38: independent Bollinger plates, Rader VS, KYDI, T9-427
Independent reads of five copied census plates: Letha 12 servant (not Coy's
wife), John H. Newnam + Dora 36 MO rejected, ED 4 sh 15B is Hill/Solomon not
Sullivan+Newman MIL, Elias 1870 original 17 Jun ages 26/26. Lee VS Harden
Gray mother Rader (C333 PROBABLE, not merged). Statewide KYDI 1925 nil Mary
J. Gray; 1928 William and 1967 Hardin K. confirmed from index. T9-427 PDF
opened; Elisha/Caroline 1880 originals; 62-chat review. Word rebuilt.

Co-authored-by: CatCorner22 <CatCorner22@users.noreply.github.com>
</commit_message>
<xml_diff>
--- a/research/dora-ella-newnam/book/Dora-Ella-Newnam-Stone-A-Life.docx
+++ b/research/dora-ella-newnam/book/Dora-Ella-Newnam-Stone-A-Life.docx
@@ -41,7 +41,7 @@
     </w:p>
     <w:p>
       <w:r>
-        <w:t>Sixty Cursor chats on this repository were reviewed for this volume (primary research, helpers, scans, and failed browser hunts). The original mobile session opened the case and read the Arkansas death certificate the family still holds. Later sessions recovered the 1880 childhood schedule that free transcripts had missed, walked statewide Soundex reels for 1910 and 1920, tested a Peebles third-marriage hypothesis and set it aside, and photographed NARA microfilm frames — the 1880 childhood schedule, the 1910 Kentucky Ella Miracode plates, Hardin Gray on Sturgeon sheet 13 B, the 1870 Proctor original of James Brandenburg’s house, Silas Gray’s Sturgeon original, the 1900 William Gray dwelling-84 crop, and the Bollinger page a sibling had labelled “Dora E. Stone,” which is Henry C. Rhodes and Dora M. of Missouri. This volume folds those chats into one narrative. The case dossier remains the working file; this book is the public reading of it. Sibling chats still running on Greene ED 41–43, 1900 Liberty, and 1900 hh 85 are inventoried, not duplicated. Do not import their “Dora E. Stone” as this woman.</w:t>
+        <w:t>Sixty-two Cursor chats on this repository were reviewed for this volume (primary research, helpers, scans, and failed browser hunts). The original mobile session opened the case and read the Arkansas death certificate the family still holds. Later sessions recovered the 1880 childhood schedule that free transcripts had missed, walked statewide Soundex reels for 1910 and 1920, tested a Peebles third-marriage hypothesis and set it aside, and photographed NARA microfilm frames — the 1880 childhood schedule, the 1910 Kentucky Ella Miracode plates, Hardin Gray on Sturgeon sheet 13 B, the 1870 Proctor original of James Brandenburg’s house, Silas Gray’s Sturgeon original, the 1900 William Gray dwelling-84 crop, and the Bollinger page a sibling had labelled “Dora E. Stone,” which is Henry C. Rhodes and Dora M. of Missouri. This volume folds those chats into one narrative. The case dossier remains the working file; this book is the public reading of it. Sibling chats still running on Greene ED 41–43, 1900 Liberty, and 1900 hh 85 are inventoried, not duplicated. Do not import their “Dora E. Stone” as this woman.</w:t>
       </w:r>
     </w:p>
     <w:p>
@@ -89,7 +89,16 @@
     </w:p>
     <w:p>
       <w:r>
-        <w:t>Ten years earlier, on 7 June 1870, Elias and Mary were at Travellers Rest in Owsley County with William, Malissa, Frances and a one-year-old Mary. There was no Dora. That absence fits an 1871 birth.</w:t>
+        <w:t xml:space="preserve">Ten years earlier, on </w:t>
+      </w:r>
+      <w:r>
+        <w:rPr>
+          <w:b/>
+        </w:rPr>
+        <w:t>17 June 1870</w:t>
+      </w:r>
+      <w:r>
+        <w:t xml:space="preserve"> — the original schedule; a published transcript said the 7th — Elias and Mary, both twenty-six, were at Travellers Rest in Owsley County with William D, eleven; Malissa D, six; Frances, three; and a one-year-old Mary. There was no Dora. That absence fits an 1871 birth. Next door was Isaac Newman, thirty-seven. [C375] [C067] [S355]</w:t>
       </w:r>
     </w:p>
     <w:p>
@@ -531,7 +540,34 @@
         <w:t>White</w:t>
       </w:r>
       <w:r>
-        <w:t xml:space="preserve">. Conflict </w:t>
+        <w:t xml:space="preserve">. Lee vital-statistics births of 1876 and 1878 call Harden’s and Robert A.’s mother </w:t>
+      </w:r>
+      <w:r>
+        <w:rPr>
+          <w:b/>
+        </w:rPr>
+        <w:t>Rader</w:t>
+      </w:r>
+      <w:r>
+        <w:t xml:space="preserve"> or </w:t>
+      </w:r>
+      <w:r>
+        <w:rPr>
+          <w:b/>
+        </w:rPr>
+        <w:t>Raider</w:t>
+      </w:r>
+      <w:r>
+        <w:t xml:space="preserve">. That is </w:t>
+      </w:r>
+      <w:r>
+        <w:rPr>
+          <w:b/>
+        </w:rPr>
+        <w:t>POSSIBLE</w:t>
+      </w:r>
+      <w:r>
+        <w:t xml:space="preserve">, not a silent merge. Conflict </w:t>
       </w:r>
       <w:r>
         <w:rPr>
@@ -540,7 +576,7 @@
         <w:t>#19</w:t>
       </w:r>
       <w:r>
-        <w:t xml:space="preserve">. His death certificate says born 2 May 1844; the 1870 and 1900 schedules cluster on 1846–47. Conflict </w:t>
+        <w:t xml:space="preserve">. [C382] [C383] His death certificate says born 2 May 1844; the 1870 and 1900 schedules cluster on 1846–47. Conflict </w:t>
       </w:r>
       <w:r>
         <w:rPr>
@@ -567,16 +603,16 @@
         <w:t>possible</w:t>
       </w:r>
       <w:r>
-        <w:t xml:space="preserve"> father named on the 1928 extract; William is not in Silas’s house, so they are not merged. [C348] Hardin Gray, next door in 1900, is a </w:t>
+        <w:t xml:space="preserve"> father named on the 1928 extract; William is not in Silas’s house, so they are not merged. [C348] Hardin Gray, next door in 1900, is now </w:t>
       </w:r>
       <w:r>
         <w:rPr>
           <w:b/>
         </w:rPr>
-        <w:t>possible</w:t>
-      </w:r>
-      <w:r>
-        <w:t xml:space="preserve"> son, not merged. [C333] A 1910 Missouri page labelled “Dora E. Stone, wife of Henry C.” in another chat is </w:t>
+        <w:t>probable</w:t>
+      </w:r>
+      <w:r>
+        <w:t xml:space="preserve"> their son — the birth register names his father William — still not merged. [C333] Statewide Kentucky death index for 1925 has no Mary J. Gray and no Gray death in Lee County. [C380] The 1928 William and 1967 Hardin K. statewide rows are independently seen. [C381] [C379] On the original 1880 District 59 film, Elisha Gray, twenty-eight, lives with M. Jane, twenty-two, and Nancy, one; Caroline Gray, forty-four, of Virginia, lives with Barney. Neither house is William and Mary J. [C389] [C390] A 1910 Missouri page labelled “Dora E. Stone, wife of Henry C.” in another chat is </w:t>
       </w:r>
       <w:r>
         <w:rPr>
@@ -594,7 +630,7 @@
         <w:t>Dora M.</w:t>
       </w:r>
       <w:r>
-        <w:t>, thirty-seven, born Missouri, six children living. That is not this woman. [C338]</w:t>
+        <w:t>, thirty-seven, born Missouri, six children living. That is not this woman. [C338] Liberty Township’s Letha Sullivan, a twelve-year-old servant in Lewis Conrad’s house, is not Coy’s wife. [C370] Fillmore Township’s Dora, thirty-six, wife of John H. Newnam, was born in Missouri. That is not this woman. [C371]</w:t>
       </w:r>
     </w:p>
     <w:p>
@@ -637,7 +673,7 @@
     </w:p>
     <w:p>
       <w:r>
-        <w:t>The original 1900 population schedule is not among the sixty-one plates. The household is known from a reliable county transcription (S005). Recovering the microfilm page remains outstanding.</w:t>
+        <w:t>The original 1900 population schedule is not among the plates in this volume. The household is known from a reliable county transcription (S005). Recovering the microfilm page remains outstanding.</w:t>
       </w:r>
     </w:p>
     <w:p>
@@ -2007,7 +2043,34 @@
         <w:t>SPECULATIVE</w:t>
       </w:r>
       <w:r>
-        <w:t>). Do not print née Brandenburg as fact. [C349] [C356]</w:t>
+        <w:t xml:space="preserve">) versus </w:t>
+      </w:r>
+      <w:r>
+        <w:rPr>
+          <w:b/>
+        </w:rPr>
+        <w:t>Rader/Raider</w:t>
+      </w:r>
+      <w:r>
+        <w:t xml:space="preserve"> on the 1876–78 birth extracts (</w:t>
+      </w:r>
+      <w:r>
+        <w:rPr>
+          <w:b/>
+        </w:rPr>
+        <w:t>POSSIBLE</w:t>
+      </w:r>
+      <w:r>
+        <w:t xml:space="preserve">). Do not print née Brandenburg as fact. Hardin is </w:t>
+      </w:r>
+      <w:r>
+        <w:rPr>
+          <w:b/>
+        </w:rPr>
+        <w:t>probable</w:t>
+      </w:r>
+      <w:r>
+        <w:t xml:space="preserve"> William’s son, not proved. [C349] [C356] [C382] [C333]</w:t>
       </w:r>
     </w:p>
     <w:p>

</xml_diff>

<commit_message>
Pass 57: ED 41 A-sides complete nil Stone; map T623-855 ED 37–38
Close every Greene ED 41 A-side (C269). Map reel 855 (C270) and sample
ED 37 A-sides around the known Thomas A. household (C271). Free B045/B047
ladders still nil; M1509 county rolls now named (C272/C273).

Co-authored-by: blakereaganlaw <blakereaganlaw@gmail.com>
</commit_message>
<xml_diff>
--- a/research/dora-ella-newnam/book/Dora-Ella-Newnam-Stone-A-Life.docx
+++ b/research/dora-ella-newnam/book/Dora-Ella-Newnam-Stone-A-Life.docx
@@ -1918,7 +1918,25 @@
         <w:t>no Stone</w:t>
       </w:r>
       <w:r>
-        <w:t xml:space="preserve"> head on either the A-sides or the B-sides. [C259] [C262] [C263] [C264] A Dora on ED 43 sheet 1A is </w:t>
+        <w:t xml:space="preserve"> head on either the A-sides or the B-sides. [C259] [C262] [C263] [C264] Every A-side of ED </w:t>
+      </w:r>
+      <w:r>
+        <w:rPr>
+          <w:b/>
+        </w:rPr>
+        <w:t>41</w:t>
+      </w:r>
+      <w:r>
+        <w:t xml:space="preserve"> (North Campbell / Drury, PDF p.98–178) is likewise </w:t>
+      </w:r>
+      <w:r>
+        <w:rPr>
+          <w:b/>
+        </w:rPr>
+        <w:t>nil</w:t>
+      </w:r>
+      <w:r>
+        <w:t xml:space="preserve"> for a Stone head. [C269] A Dora on ED 43 sheet 1A is </w:t>
       </w:r>
       <w:r>
         <w:rPr>
@@ -1927,7 +1945,61 @@
         <w:t>Wright</w:t>
       </w:r>
       <w:r>
-        <w:t>’s wife, thirty-four, born April 1866 in Missouri — not her. [C258] The closest-*age* candidate remains Douglas County’s Thomas, forty-four, with wife Nancy E. — original read, Soundex “Jesse C.” corrected to Ossie P., daughter. [C101] [C102]</w:t>
+        <w:t xml:space="preserve">’s wife, thirty-four, born April 1866 in Missouri — not her. [C258] Three child Doras on ED </w:t>
+      </w:r>
+      <w:r>
+        <w:rPr>
+          <w:b/>
+        </w:rPr>
+        <w:t>41</w:t>
+      </w:r>
+      <w:r>
+        <w:t xml:space="preserve"> (Fort’s daughter, a daughter on sheet 17A, and Dora S. on sheet 39A) are Springfield children, not her. [L319] Reel </w:t>
+      </w:r>
+      <w:r>
+        <w:rPr>
+          <w:b/>
+        </w:rPr>
+        <w:t>855</w:t>
+      </w:r>
+      <w:r>
+        <w:t xml:space="preserve"> is now mapped: ED </w:t>
+      </w:r>
+      <w:r>
+        <w:rPr>
+          <w:b/>
+        </w:rPr>
+        <w:t>37</w:t>
+      </w:r>
+      <w:r>
+        <w:t xml:space="preserve"> occupies PDF pages 781–834, ED </w:t>
+      </w:r>
+      <w:r>
+        <w:rPr>
+          <w:b/>
+        </w:rPr>
+        <w:t>38</w:t>
+      </w:r>
+      <w:r>
+        <w:t xml:space="preserve"> pages 835–916, and ED </w:t>
+      </w:r>
+      <w:r>
+        <w:rPr>
+          <w:b/>
+        </w:rPr>
+        <w:t>39</w:t>
+      </w:r>
+      <w:r>
+        <w:t xml:space="preserve"> sheets 1–5 pages 917–926; page 815 is the already-read Thomas A. household. [C270] [C117] Sampled ED </w:t>
+      </w:r>
+      <w:r>
+        <w:rPr>
+          <w:b/>
+        </w:rPr>
+        <w:t>37</w:t>
+      </w:r>
+      <w:r>
+        <w:t xml:space="preserve"> A-sides outside sheet 18A are nil for a second Stone head. [C271] The closest-*age* candidate remains Douglas County’s Thomas, forty-four, with wife Nancy E. — original read, Soundex “Jesse C.” corrected to Ossie P., daughter. [C101] [C102]</w:t>
       </w:r>
     </w:p>
     <w:p>

</xml_diff>

<commit_message>
Pass 58: ED 37 A-sides and ED 41 B-sides complete; no second Stone
Close every Greene ED 37 A-side (C274) and every ED 41 B-side (C275).
Only Stone head remains Thomas A. on ED 37 sh 18A. Sampled ED 38/39
A-sides nil (C276). Residual: ED 40, unread ED 37 B-sides, unread ED 38.

Co-authored-by: blakereaganlaw <blakereaganlaw@gmail.com>
</commit_message>
<xml_diff>
--- a/research/dora-ella-newnam/book/Dora-Ella-Newnam-Stone-A-Life.docx
+++ b/research/dora-ella-newnam/book/Dora-Ella-Newnam-Stone-A-Life.docx
@@ -1936,7 +1936,16 @@
         <w:t>nil</w:t>
       </w:r>
       <w:r>
-        <w:t xml:space="preserve"> for a Stone head. [C269] A Dora on ED 43 sheet 1A is </w:t>
+        <w:t xml:space="preserve"> for a Stone head, and so is every B-side (p.99–179). [C269] [C275] Every A-side of rural Campbell ED </w:t>
+      </w:r>
+      <w:r>
+        <w:rPr>
+          <w:b/>
+        </w:rPr>
+        <w:t>37</w:t>
+      </w:r>
+      <w:r>
+        <w:t xml:space="preserve"> has now been read: the only Stone head is the already-known Thomas A. household on sheet 18A; sheet 17A line 1 is Elizabeth J. Stone, mother-in-law in the Hinshaw house. [C274] [C112] [C117] A Dora on ED 43 sheet 1A is </w:t>
       </w:r>
       <w:r>
         <w:rPr>

</xml_diff>

<commit_message>
Dora research passes 39–41: 1860/1880/1850 Gray originals, Madison nil
File independent readings of the 1860 Owsley Silas and James Brandenburg
schedules, the 1880 Lee ED 59 William (Hardin labelled Son) and Silas
houses, and the 1850 Owsley Gray pages (Thomas 289B, James 306A, John and
Charles 314B). Silas is not an 1850 Owsley head; Charles+Manerva is
disproved as his house. Madison 1860 name columns through PDF 428 have no
Gray or Silas head. Rebuild the Word biography. Chat catalog 67.

Co-authored-by: CatCorner22 <CatCorner22@users.noreply.github.com>
</commit_message>
<xml_diff>
--- a/research/dora-ella-newnam/book/Dora-Ella-Newnam-Stone-A-Life.docx
+++ b/research/dora-ella-newnam/book/Dora-Ella-Newnam-Stone-A-Life.docx
@@ -41,7 +41,7 @@
     </w:p>
     <w:p>
       <w:r>
-        <w:t>Sixty-two Cursor chats on this repository were reviewed for this volume (primary research, helpers, scans, and failed browser hunts). The original mobile session opened the case and read the Arkansas death certificate the family still holds. Later sessions recovered the 1880 childhood schedule that free transcripts had missed, walked statewide Soundex reels for 1910 and 1920, tested a Peebles third-marriage hypothesis and set it aside, and photographed NARA microfilm frames — the 1880 childhood schedule, the 1910 Kentucky Ella Miracode plates, Hardin Gray on Sturgeon sheet 13 B, the 1870 Proctor original of James Brandenburg’s house, Silas Gray’s Sturgeon original, the 1900 William Gray dwelling-84 crop, and the Bollinger page a sibling had labelled “Dora E. Stone,” which is Henry C. Rhodes and Dora M. of Missouri. This volume folds those chats into one narrative. The case dossier remains the working file; this book is the public reading of it. Sibling chats still running on Greene ED 41–43, 1900 Liberty, and 1900 hh 85 are inventoried, not duplicated. Do not import their “Dora E. Stone” as this woman.</w:t>
+        <w:t>Sixty-seven Cursor chats on this repository were reviewed for this volume (primary research, helpers, scans, and failed browser hunts). The original mobile session opened the case and read the Arkansas death certificate the family still holds. Later sessions recovered the 1880 childhood schedule that free transcripts had missed, walked statewide Soundex reels for 1910 and 1920, tested a Peebles third-marriage hypothesis and set it aside, and photographed NARA microfilm frames — the 1880 childhood schedule, the 1910 Kentucky Ella Miracode plates, Hardin Gray on Sturgeon sheet 13 B, the 1860 Owsley original of Silas Gray’s house with William aged thirteen, the 1850 Owsley Gray pages that are other men (Thomas, James, John, Charles), the 1870 Proctor original of James Brandenburg’s house, Silas Gray’s Sturgeon original, the 1880 District 59 originals of William next door to John Newnam and of Silas still in the district, the 1900 William Gray dwelling-84 crop, and the Bollinger page a sibling had labelled “Dora E. Stone,” which is Henry C. Rhodes and Dora M. of Missouri. This volume folds those chats into one narrative. The case dossier remains the working file; this book is the public reading of it. Sibling chats still running on Greene ED 41–43, 1900 Liberty, and 1900 hh 85 are inventoried, not duplicated. Do not import their “Dora E. Stone” as this woman.</w:t>
       </w:r>
     </w:p>
     <w:p>
@@ -594,25 +594,79 @@
         <w:t>Silas Gray</w:t>
       </w:r>
       <w:r>
-        <w:t xml:space="preserve">, fifty-four, of Sturgeon the same week is a </w:t>
+        <w:t xml:space="preserve">, fifty-four, of Sturgeon the same week is </w:t>
       </w:r>
       <w:r>
         <w:rPr>
           <w:b/>
         </w:rPr>
-        <w:t>possible</w:t>
-      </w:r>
-      <w:r>
-        <w:t xml:space="preserve"> father named on the 1928 extract; William is not in Silas’s house, so they are not merged. [C348] Hardin Gray, next door in 1900, is now </w:t>
+        <w:t>PROVEN</w:t>
+      </w:r>
+      <w:r>
+        <w:t xml:space="preserve"> the 1928 father: the 12 July 1860 Owsley original puts </w:t>
       </w:r>
       <w:r>
         <w:rPr>
           <w:b/>
         </w:rPr>
-        <w:t>probable</w:t>
-      </w:r>
-      <w:r>
-        <w:t xml:space="preserve"> their son — the birth register names his father William — still not merged. [C333] Statewide Kentucky death index for 1925 has no Mary J. Gray and no Gray death in Lee County. [C380] The 1928 William and 1967 Hardin K. statewide rows are independently seen. [C381] [C379] On the original 1880 District 59 film, Elisha Gray, twenty-eight, lives with M. Jane, twenty-two, and Nancy, one; Caroline Gray, forty-four, of Virginia, lives with Barney. Neither house is William and Mary J. [C389] [C390] A 1910 Missouri page labelled “Dora E. Stone, wife of Henry C.” in another chat is </w:t>
+        <w:t>William, thirteen</w:t>
+      </w:r>
+      <w:r>
+        <w:t xml:space="preserve">, in Silas and Minerva’s Booneville house with the same younger children later enumerated with Silas in 1870. [C395] [C397] [C398] [C328] On the 1850 Owsley film he is not a head. The indexed Gray pages are Thomas, forty-seven, with Lucy; James, thirty-two, with a different William, aged twelve; John, forty, with Dolly; and Charles, twenty-six, with Manerva, thirty — that last house is </w:t>
+      </w:r>
+      <w:r>
+        <w:rPr>
+          <w:b/>
+        </w:rPr>
+        <w:t>not</w:t>
+      </w:r>
+      <w:r>
+        <w:t xml:space="preserve"> Silas. [C425] [C426] [C427] [C428] [C429] Madison County’s 1860 name columns, from the Town of Richmond through the First Division, have no Gray or Silas head either. [C432] William is </w:t>
+      </w:r>
+      <w:r>
+        <w:rPr>
+          <w:b/>
+        </w:rPr>
+        <w:t>not</w:t>
+      </w:r>
+      <w:r>
+        <w:t xml:space="preserve"> in Silas’s 1870 house because he is already the labourer at James Brandenburg’s. [C348] [C347] On 1 June 1880 that same William, listed as thirty, farmed District 59 dwelling </w:t>
+      </w:r>
+      <w:r>
+        <w:rPr>
+          <w:b/>
+        </w:rPr>
+        <w:t>2</w:t>
+      </w:r>
+      <w:r>
+        <w:t xml:space="preserve">, next door to John Newnam in dwelling 3. The children were Susan, nine; Sidney, six; </w:t>
+      </w:r>
+      <w:r>
+        <w:rPr>
+          <w:b/>
+        </w:rPr>
+        <w:t>Hardin, three, son</w:t>
+      </w:r>
+      <w:r>
+        <w:t xml:space="preserve">; and Robert, two. [C409] [C411] Hardin is </w:t>
+      </w:r>
+      <w:r>
+        <w:rPr>
+          <w:b/>
+        </w:rPr>
+        <w:t>proven</w:t>
+      </w:r>
+      <w:r>
+        <w:t xml:space="preserve"> their son. Adult ages on that sheet run about three years young; print them as written and do not average with conflict </w:t>
+      </w:r>
+      <w:r>
+        <w:rPr>
+          <w:b/>
+        </w:rPr>
+        <w:t>#21</w:t>
+      </w:r>
+      <w:r>
+        <w:t xml:space="preserve">. Ten days later Silas, sixty-six, still headed a house in the same district with Minerva and Levi; his father was born in North Carolina. [C412] Statewide Kentucky death index for 1925 has no Mary J. Gray and no Gray death in Lee County. [C380] The 1928 William and 1967 Hardin K. statewide rows are independently seen. [C381] [C379] On the original 1880 District 59 film the Gray heads are now mapped: William on sheet 1, Silas on sheet 16, Elisha Gray, twenty-eight, with M. Jane, twenty-two, and Nancy, one, on sheet 28, and Caroline Gray, forty-four, of Virginia, on sheet 43. Elisha and Caroline are other houses. [C389] [C390] [C416] A 1910 Missouri page labelled “Dora E. Stone, wife of Henry C.” in another chat is </w:t>
       </w:r>
       <w:r>
         <w:rPr>

</xml_diff>

<commit_message>
Pass 42: 1850 Estill Marcus Gray original; Breathitt/Madison nil Gray
Estill 99B is Marcus Gray, 68, of South Carolina, not Silas. Breathitt and
Madison 1850 surname indexes have no Gray; Madison 214B is John Gay.

Co-authored-by: CatCorner22 <CatCorner22@users.noreply.github.com>
</commit_message>
<xml_diff>
--- a/research/dora-ella-newnam/book/Dora-Ella-Newnam-Stone-A-Life.docx
+++ b/research/dora-ella-newnam/book/Dora-Ella-Newnam-Stone-A-Life.docx
@@ -41,7 +41,7 @@
     </w:p>
     <w:p>
       <w:r>
-        <w:t>Sixty-seven Cursor chats on this repository were reviewed for this volume (primary research, helpers, scans, and failed browser hunts). The original mobile session opened the case and read the Arkansas death certificate the family still holds. Later sessions recovered the 1880 childhood schedule that free transcripts had missed, walked statewide Soundex reels for 1910 and 1920, tested a Peebles third-marriage hypothesis and set it aside, and photographed NARA microfilm frames — the 1880 childhood schedule, the 1910 Kentucky Ella Miracode plates, Hardin Gray on Sturgeon sheet 13 B, the 1860 Owsley original of Silas Gray’s house with William aged thirteen, the 1850 Owsley Gray pages that are other men (Thomas, James, John, Charles), the 1870 Proctor original of James Brandenburg’s house, Silas Gray’s Sturgeon original, the 1880 District 59 originals of William next door to John Newnam and of Silas still in the district, the 1900 William Gray dwelling-84 crop, and the Bollinger page a sibling had labelled “Dora E. Stone,” which is Henry C. Rhodes and Dora M. of Missouri. This volume folds those chats into one narrative. The case dossier remains the working file; this book is the public reading of it. Sibling work on Greene ED 37 and 41 (PR #26 Pass 57–58), remaining Greene ED 42–43, 1900 Liberty, and 1900 hh 85 is inventoried, not duplicated. Do not import their “Dora E. Stone” as this woman.</w:t>
+        <w:t>Sixty-eight Cursor chats on this repository were reviewed for this volume (primary research, helpers, scans, and failed browser hunts). The original mobile session opened the case and read the Arkansas death certificate the family still holds. Later sessions recovered the 1880 childhood schedule that free transcripts had missed, walked statewide Soundex reels for 1910 and 1920, tested a Peebles third-marriage hypothesis and set it aside, and photographed NARA microfilm frames — the 1880 childhood schedule, the 1910 Kentucky Ella Miracode plates, Hardin Gray on Sturgeon sheet 13 B, the 1860 Owsley original of Silas Gray’s house with William aged thirteen, the 1850 Owsley Gray pages that are other men (Thomas, James, John, Charles), the 1870 Proctor original of James Brandenburg’s house, Silas Gray’s Sturgeon original, the 1880 District 59 originals of William next door to John Newnam and of Silas still in the district, the 1900 William Gray dwelling-84 crop, and the Bollinger page a sibling had labelled “Dora E. Stone,” which is Henry C. Rhodes and Dora M. of Missouri. This volume folds those chats into one narrative. The case dossier remains the working file; this book is the public reading of it. Sibling work on Greene ED 37 and 41 (PR #26 Pass 57–58), remaining Greene ED 42–43, 1900 Liberty, and 1900 hh 85 is inventoried, not duplicated. Do not import their “Dora E. Stone” as this woman.</w:t>
       </w:r>
     </w:p>
     <w:p>
@@ -621,7 +621,34 @@
         <w:t>not</w:t>
       </w:r>
       <w:r>
-        <w:t xml:space="preserve"> Silas. [C425] [C426] [C427] [C428] [C429] Madison County’s 1860 name columns, from the Town of Richmond through the First Division, have no Gray or Silas head either. [C432] William is </w:t>
+        <w:t xml:space="preserve"> Silas. [C425] [C426] [C427] [C428] [C429] On the 1850 Estill film the only Gray house is </w:t>
+      </w:r>
+      <w:r>
+        <w:rPr>
+          <w:b/>
+        </w:rPr>
+        <w:t>Marcus</w:t>
+      </w:r>
+      <w:r>
+        <w:t xml:space="preserve">, sixty-eight, a South Carolina labourer with Barsheba — </w:t>
+      </w:r>
+      <w:r>
+        <w:rPr>
+          <w:b/>
+        </w:rPr>
+        <w:t>not</w:t>
+      </w:r>
+      <w:r>
+        <w:t xml:space="preserve"> Silas. [C444] [C453] Breathitt and Madison 1850 surname indexes have no Gray; the Madison page stamped 214B is </w:t>
+      </w:r>
+      <w:r>
+        <w:rPr>
+          <w:b/>
+        </w:rPr>
+        <w:t>John Gay</w:t>
+      </w:r>
+      <w:r>
+        <w:t xml:space="preserve">, thirty-four, not Gray. [C446] [C448] [C449] Madison County’s 1860 name columns, from the Town of Richmond through the First Division, have no Gray or Silas head either. [C432] William is </w:t>
       </w:r>
       <w:r>
         <w:rPr>

</xml_diff>

<commit_message>
Pass 59: ED 40 complete, ED 37 B-sides closed, ED 38 A-sides nil Stone
Name-column sweep of remaining Greene 1900 ED 40 A+B (T623-856), unread ED 37 B-sides, and remaining ED 38 A-sides including missed sheet 4A (T623-855). No second Stone household. Rejects include Sullivan Jerry + Dora I. (b. 1856 IL), Austin L. Stone servant, and several given-name Doras. B040 residual is ED 38 B-sides only.

Co-authored-by: blakereaganlaw <blakereaganlaw@gmail.com>
</commit_message>
<xml_diff>
--- a/research/dora-ella-newnam/book/Dora-Ella-Newnam-Stone-A-Life.docx
+++ b/research/dora-ella-newnam/book/Dora-Ella-Newnam-Stone-A-Life.docx
@@ -1936,7 +1936,16 @@
         <w:t>nil</w:t>
       </w:r>
       <w:r>
-        <w:t xml:space="preserve"> for a Stone head, and so is every B-side (p.99–179). [C269] [C275] Every A-side of rural Campbell ED </w:t>
+        <w:t xml:space="preserve"> for a Stone head, and so is every B-side (p.99–179). [C269] [C275] Every A-side </w:t>
+      </w:r>
+      <w:r>
+        <w:rPr>
+          <w:b/>
+        </w:rPr>
+        <w:t>and</w:t>
+      </w:r>
+      <w:r>
+        <w:t xml:space="preserve"> B-side of rural Campbell ED </w:t>
       </w:r>
       <w:r>
         <w:rPr>
@@ -1945,7 +1954,25 @@
         <w:t>37</w:t>
       </w:r>
       <w:r>
-        <w:t xml:space="preserve"> has now been read: the only Stone head is the already-known Thomas A. household on sheet 18A; sheet 17A line 1 is Elizabeth J. Stone, mother-in-law in the Hinshaw house. [C274] [C112] [C117] A Dora on ED 43 sheet 1A is </w:t>
+        <w:t xml:space="preserve"> has now been read: the only Stone head is the already-known Thomas A. household on sheet 18A; sheet 17A line 1 is Elizabeth J. Stone, mother-in-law in the Hinshaw house; Austin L. Stone, a servant on sheet 8B, is a different man. [C274] [C279] [C112] [C117] Springfield ED </w:t>
+      </w:r>
+      <w:r>
+        <w:rPr>
+          <w:b/>
+        </w:rPr>
+        <w:t>40</w:t>
+      </w:r>
+      <w:r>
+        <w:t xml:space="preserve"> (ward 3, PDF p.58–97) is likewise nil for a Stone household. [C278] A Dora I. Sullivan on ED 40 sheet 16A is forty-three, born December 1856 in Illinois, married eighteen years to Jerry Sullivan of Ohio, with no children — not her. [L340] Every A-side of ED </w:t>
+      </w:r>
+      <w:r>
+        <w:rPr>
+          <w:b/>
+        </w:rPr>
+        <w:t>38</w:t>
+      </w:r>
+      <w:r>
+        <w:t xml:space="preserve"> is now nil for a Stone head; the B-sides of that ED remain unread. [C280] A Dora on ED 43 sheet 1A is </w:t>
       </w:r>
       <w:r>
         <w:rPr>
@@ -1999,16 +2026,7 @@
         <w:t>39</w:t>
       </w:r>
       <w:r>
-        <w:t xml:space="preserve"> sheets 1–5 pages 917–926; page 815 is the already-read Thomas A. household. [C270] [C117] Sampled ED </w:t>
-      </w:r>
-      <w:r>
-        <w:rPr>
-          <w:b/>
-        </w:rPr>
-        <w:t>37</w:t>
-      </w:r>
-      <w:r>
-        <w:t xml:space="preserve"> A-sides outside sheet 18A are nil for a second Stone head. [C271] The closest-*age* candidate remains Douglas County’s Thomas, forty-four, with wife Nancy E. — original read, Soundex “Jesse C.” corrected to Ossie P., daughter. [C101] [C102]</w:t>
+        <w:t xml:space="preserve"> sheets 1–5 pages 917–926; page 815 is the already-read Thomas A. household. [C270] [C117] The closest-*age* candidate remains Douglas County’s Thomas, forty-four, with wife Nancy E. — original read, Soundex “Jesse C.” corrected to Ossie P., daughter. [C101] [C102]</w:t>
       </w:r>
     </w:p>
     <w:p>

</xml_diff>

<commit_message>
Pass 43: Breathitt 1A–44B and Madison 1850 Gray-head negatives
File Tennille every-person files, Breathitt G-cluster originals (Taulbee
Silas 1, Siras Bryant 22, Elijah Green 36), and Madison 212A John Green
44 + Silas Green 20. Fold nested chat review (catalog 69). Rebuild Word.

Co-authored-by: CatCorner22 <CatCorner22@users.noreply.github.com>
</commit_message>
<xml_diff>
--- a/research/dora-ella-newnam/book/Dora-Ella-Newnam-Stone-A-Life.docx
+++ b/research/dora-ella-newnam/book/Dora-Ella-Newnam-Stone-A-Life.docx
@@ -41,7 +41,7 @@
     </w:p>
     <w:p>
       <w:r>
-        <w:t>Sixty-eight Cursor chats on this repository were reviewed for this volume (primary research, helpers, scans, and failed browser hunts). The original mobile session opened the case and read the Arkansas death certificate the family still holds. Later sessions recovered the 1880 childhood schedule that free transcripts had missed, walked statewide Soundex reels for 1910 and 1920, tested a Peebles third-marriage hypothesis and set it aside, and photographed NARA microfilm frames — the 1880 childhood schedule, the 1910 Kentucky Ella Miracode plates, Hardin Gray on Sturgeon sheet 13 B, the 1860 Owsley original of Silas Gray’s house with William aged thirteen, the 1850 Owsley Gray pages that are other men (Thomas, James, John, Charles), the 1870 Proctor original of James Brandenburg’s house, Silas Gray’s Sturgeon original, the 1880 District 59 originals of William next door to John Newnam and of Silas still in the district, the 1900 William Gray dwelling-84 crop, and the Bollinger page a sibling had labelled “Dora E. Stone,” which is Henry C. Rhodes and Dora M. of Missouri. This volume folds those chats into one narrative. The case dossier remains the working file; this book is the public reading of it. Sibling work on Greene ED 37 and 41 (PR #26 Pass 57–58), remaining Greene ED 42–43, 1900 Liberty, and 1900 hh 85 is inventoried, not duplicated. Do not import their “Dora E. Stone” as this woman.</w:t>
+        <w:t>Sixty-nine Cursor chats on this repository were reviewed for this volume (primary research, helpers, scans, and failed browser hunts). The original mobile session opened the case and read the Arkansas death certificate the family still holds. Later sessions recovered the 1880 childhood schedule that free transcripts had missed, walked statewide Soundex reels for 1910 and 1920, tested a Peebles third-marriage hypothesis and set it aside, and photographed NARA microfilm frames — the 1880 childhood schedule, the 1910 Kentucky Ella Miracode plates, Hardin Gray on Sturgeon sheet 13 B, the 1860 Owsley original of Silas Gray’s house with William aged thirteen, the 1850 Owsley Gray pages that are other men (Thomas, James, John, Charles), the 1850 Estill Marcus Gray original, Breathitt’s Taulbee infant Silas and Bryant Siras, and Madison’s John Green house with Silas Green aged twenty, the 1870 Proctor original of James Brandenburg’s house, Silas Gray’s Sturgeon original, the 1880 District 59 originals of William next door to John Newnam and of Silas still in the district, the 1900 William Gray dwelling-84 crop, and the Bollinger page a sibling had labelled “Dora E. Stone,” which is Henry C. Rhodes and Dora M. of Missouri. This volume folds those chats into one narrative. The case dossier remains the working file; this book is the public reading of it. Sibling work on Greene ED 37 and 41 (PR #26 Pass 57–58), remaining Greene ED 42–43, 1900 Liberty, and 1900 hh 85 is inventoried, not duplicated. Do not import their “Dora E. Stone” as this woman.</w:t>
       </w:r>
     </w:p>
     <w:p>
@@ -639,7 +639,43 @@
         <w:t>not</w:t>
       </w:r>
       <w:r>
-        <w:t xml:space="preserve"> Silas. [C444] [C453] Breathitt and Madison 1850 surname indexes have no Gray; the Madison page stamped 214B is </w:t>
+        <w:t xml:space="preserve"> Silas. [C444] [C453] Breathitt 1850 originals, stamped 1A through 44B, have no Gray head. The only Silas plates on that film are a Taulbee infant, aged one, on 14A, and a Bryant named </w:t>
+      </w:r>
+      <w:r>
+        <w:rPr>
+          <w:b/>
+        </w:rPr>
+        <w:t>Siras</w:t>
+      </w:r>
+      <w:r>
+        <w:t xml:space="preserve">, twenty-two, on 21A. An Elijah </w:t>
+      </w:r>
+      <w:r>
+        <w:rPr>
+          <w:b/>
+        </w:rPr>
+        <w:t>Green</w:t>
+      </w:r>
+      <w:r>
+        <w:t xml:space="preserve">, thirty-six, with wife Ally on 8A is the wrong surname and the wrong wife. [C466] [C459] [C460] [C461] Madison’s Gray heads are also nil. The 212A house is </w:t>
+      </w:r>
+      <w:r>
+        <w:rPr>
+          <w:b/>
+        </w:rPr>
+        <w:t>John Green</w:t>
+      </w:r>
+      <w:r>
+        <w:t xml:space="preserve">, forty-four, with a son </w:t>
+      </w:r>
+      <w:r>
+        <w:rPr>
+          <w:b/>
+        </w:rPr>
+        <w:t>Silas Green</w:t>
+      </w:r>
+      <w:r>
+        <w:t xml:space="preserve">, twenty — not Silas Gray, who would have been about thirty-six. [C468] [C471] Madison 214B remains </w:t>
       </w:r>
       <w:r>
         <w:rPr>
@@ -648,7 +684,7 @@
         <w:t>John Gay</w:t>
       </w:r>
       <w:r>
-        <w:t xml:space="preserve">, thirty-four, not Gray. [C446] [C448] [C449] Madison County’s 1860 name columns, from the Town of Richmond through the First Division, have no Gray or Silas head either. [C432] William is </w:t>
+        <w:t xml:space="preserve">, thirty-four. [C449] Madison County’s 1860 name columns, from the Town of Richmond through the First Division, have no Gray or Silas head either. [C432] William is </w:t>
       </w:r>
       <w:r>
         <w:rPr>

</xml_diff>

<commit_message>
Pass 44: Owsley 1850 Silas Ratliff 8/12 original; Bawden 277A–296A
Bawden every-person files for stamped 277A–296A contain one Silas, an
infant Ratliff. The 279A original confirms age 8/12. Residual B055 is a
visual given-name sweep of 296B–321. Rebuild Word.

Co-authored-by: CatCorner22 <CatCorner22@users.noreply.github.com>
</commit_message>
<xml_diff>
--- a/research/dora-ella-newnam/book/Dora-Ella-Newnam-Stone-A-Life.docx
+++ b/research/dora-ella-newnam/book/Dora-Ella-Newnam-Stone-A-Life.docx
@@ -621,7 +621,25 @@
         <w:t>not</w:t>
       </w:r>
       <w:r>
-        <w:t xml:space="preserve"> Silas. [C425] [C426] [C427] [C428] [C429] On the 1850 Estill film the only Gray house is </w:t>
+        <w:t xml:space="preserve"> Silas. [C425] [C426] [C427] [C428] [C429] The only given-name Silas on Owsley pages 277A–296A is </w:t>
+      </w:r>
+      <w:r>
+        <w:rPr>
+          <w:b/>
+        </w:rPr>
+        <w:t>Silas Ratliff</w:t>
+      </w:r>
+      <w:r>
+        <w:t xml:space="preserve">, eight months old, in Reubin Ratliff’s house on 279A — </w:t>
+      </w:r>
+      <w:r>
+        <w:rPr>
+          <w:b/>
+        </w:rPr>
+        <w:t>not</w:t>
+      </w:r>
+      <w:r>
+        <w:t xml:space="preserve"> this man. [C473] [C474] On the 1850 Estill film the only Gray house is </w:t>
       </w:r>
       <w:r>
         <w:rPr>

</xml_diff>

<commit_message>
Pass 60: ED 38 B-sides and ED 39 sh 1-5 B-sides close B040
Visually read every T623-855 ED 38 B-side (pp 836-916) and ED 39
sheets 1-5 B-sides (pp 918-926). No Stone/Thomas A. head. Reject
Carroll Dora, Michela Dora M., Bovine Dora (child), and Newman
Clifford inmate. Greene ED 37-43 name-column sweep is done.

Co-authored-by: blakereaganlaw <blakereaganlaw@gmail.com>
</commit_message>
<xml_diff>
--- a/research/dora-ella-newnam/book/Dora-Ella-Newnam-Stone-A-Life.docx
+++ b/research/dora-ella-newnam/book/Dora-Ella-Newnam-Stone-A-Life.docx
@@ -1963,7 +1963,16 @@
         <w:t>40</w:t>
       </w:r>
       <w:r>
-        <w:t xml:space="preserve"> (ward 3, PDF p.58–97) is likewise nil for a Stone household. [C278] A Dora I. Sullivan on ED 40 sheet 16A is forty-three, born December 1856 in Illinois, married eighteen years to Jerry Sullivan of Ohio, with no children — not her. [L340] Every A-side of ED </w:t>
+        <w:t xml:space="preserve"> (ward 3, PDF p.58–97) is likewise nil for a Stone household. [C278] A Dora I. Sullivan on ED 40 sheet 16A is forty-three, born December 1856 in Illinois, married eighteen years to Jerry Sullivan of Ohio, with no children — not her. [L340] Every A-side </w:t>
+      </w:r>
+      <w:r>
+        <w:rPr>
+          <w:b/>
+        </w:rPr>
+        <w:t>and</w:t>
+      </w:r>
+      <w:r>
+        <w:t xml:space="preserve"> B-side of ED </w:t>
       </w:r>
       <w:r>
         <w:rPr>
@@ -1972,7 +1981,25 @@
         <w:t>38</w:t>
       </w:r>
       <w:r>
-        <w:t xml:space="preserve"> is now nil for a Stone head; the B-sides of that ED remain unread. [C280] A Dora on ED 43 sheet 1A is </w:t>
+        <w:t xml:space="preserve"> is now nil for a Stone head. [C280] [C281] A Dora wife of Frank Carroll on sheet 4B, a Dora M. wife of Louis Michela on sheet 7B, and a fourteen-year-old Dora Bovine on sheet 10B are Springfield women, not her; Clifford Newman, age seven, is an inmate at the Children's Protestant Home. [C282] ED </w:t>
+      </w:r>
+      <w:r>
+        <w:rPr>
+          <w:b/>
+        </w:rPr>
+        <w:t>39</w:t>
+      </w:r>
+      <w:r>
+        <w:t xml:space="preserve"> sheets 1–5 B-sides on reel 855 are likewise nil, so that enumeration district is complete on both reels. [C283] The Greene ED </w:t>
+      </w:r>
+      <w:r>
+        <w:rPr>
+          <w:b/>
+        </w:rPr>
+        <w:t>37–43</w:t>
+      </w:r>
+      <w:r>
+        <w:t xml:space="preserve"> name-column sweep is finished. A Dora on ED 43 sheet 1A is </w:t>
       </w:r>
       <w:r>
         <w:rPr>

</xml_diff>

<commit_message>
Pass 45–46: Owsley 1850 Silas every-person close; Harrison Newman original
B055 done: only given-name Silas in 1850 Owsley are Ratliff 8/12, Wilson 6
(298A), and Phillips 15 (309B), all DISPROVED as Silas Gray ~36. Bowman
Squire 24 on 320A; first-pass Cyrus withdrawn. Nested chat review
bc-47d4740e folded (catalog 71 then 77). PR #26 MERGED; skip-reel now
C221–C280.

B057 done as original: 299B dw 313 Harrison Newman 33 + Elias 8 (Flannigan
age 3 withdrawn). Identity with Elias T. POSSIBLE, not merged. Word rebuilt.

Co-authored-by: CatCorner22 <CatCorner22@users.noreply.github.com>
</commit_message>
<xml_diff>
--- a/research/dora-ella-newnam/book/Dora-Ella-Newnam-Stone-A-Life.docx
+++ b/research/dora-ella-newnam/book/Dora-Ella-Newnam-Stone-A-Life.docx
@@ -41,7 +41,7 @@
     </w:p>
     <w:p>
       <w:r>
-        <w:t>Sixty-nine Cursor chats on this repository were reviewed for this volume (primary research, helpers, scans, and failed browser hunts). The original mobile session opened the case and read the Arkansas death certificate the family still holds. Later sessions recovered the 1880 childhood schedule that free transcripts had missed, walked statewide Soundex reels for 1910 and 1920, tested a Peebles third-marriage hypothesis and set it aside, and photographed NARA microfilm frames — the 1880 childhood schedule, the 1910 Kentucky Ella Miracode plates, Hardin Gray on Sturgeon sheet 13 B, the 1860 Owsley original of Silas Gray’s house with William aged thirteen, the 1850 Owsley Gray pages that are other men (Thomas, James, John, Charles), the 1850 Estill Marcus Gray original, Breathitt’s Taulbee infant Silas and Bryant Siras, and Madison’s John Green house with Silas Green aged twenty, the 1870 Proctor original of James Brandenburg’s house, Silas Gray’s Sturgeon original, the 1880 District 59 originals of William next door to John Newnam and of Silas still in the district, the 1900 William Gray dwelling-84 crop, and the Bollinger page a sibling had labelled “Dora E. Stone,” which is Henry C. Rhodes and Dora M. of Missouri. This volume folds those chats into one narrative. The case dossier remains the working file; this book is the public reading of it. Sibling work on Greene ED 37 and 41 (PR #26 Pass 57–58), remaining Greene ED 42–43, 1900 Liberty, and 1900 hh 85 is inventoried, not duplicated. Do not import their “Dora E. Stone” as this woman.</w:t>
+        <w:t>Seventy-seven Cursor chats on this repository were reviewed for this volume (primary research, helpers, scans, and failed browser hunts). The original mobile session opened the case and read the Arkansas death certificate the family still holds. Later sessions recovered the 1880 childhood schedule that free transcripts had missed, walked statewide Soundex reels for 1910 and 1920, tested a Peebles third-marriage hypothesis and set it aside, and photographed NARA microfilm frames — the 1880 childhood schedule, the 1910 Kentucky Ella Miracode plates, Hardin Gray on Sturgeon sheet 13 B, the 1860 Owsley original of Silas Gray’s house with William aged thirteen, the 1850 Owsley Gray pages that are other men (Thomas, James, John, Charles), the given-name Silas plates that are other boys (Ratliff eight months, Wilson six, Phillips fifteen) and the Bowman line first read as Cyrus and then as Squire, the 1850 Estill Marcus Gray original, Breathitt’s Taulbee infant Silas and Bryant Siras, and Madison’s John Green house with Silas Green aged twenty, the 1850 Owsley Harrison Newman house with an eight-year-old Elias who may be Dora’s father and is not merged, the 1870 Proctor original of James Brandenburg’s house, Silas Gray’s Sturgeon original, the 1880 District 59 originals of William next door to John Newnam and of Silas still in the district, the 1900 William Gray dwelling-84 crop, and the Bollinger page a sibling had labelled “Dora E. Stone,” which is Henry C. Rhodes and Dora M. of Missouri. This volume folds those chats into one narrative. The case dossier remains the working file; this book is the public reading of it. Sibling work on Greene ED 37 through 41 is now on merged PR #26 through Pass 59; remaining Greene ED 38 B-sides, 1900 Liberty, and 1900 hh 85 are inventoried, not duplicated. Do not import their “Dora E. Stone” as this woman.</w:t>
       </w:r>
     </w:p>
     <w:p>
@@ -621,7 +621,7 @@
         <w:t>not</w:t>
       </w:r>
       <w:r>
-        <w:t xml:space="preserve"> Silas. [C425] [C426] [C427] [C428] [C429] The only given-name Silas on Owsley pages 277A–296A is </w:t>
+        <w:t xml:space="preserve"> Silas. [C425] [C426] [C427] [C428] [C429] The only given-name Silas on the 1850 Owsley film are </w:t>
       </w:r>
       <w:r>
         <w:rPr>
@@ -630,7 +630,25 @@
         <w:t>Silas Ratliff</w:t>
       </w:r>
       <w:r>
-        <w:t xml:space="preserve">, eight months old, in Reubin Ratliff’s house on 279A — </w:t>
+        <w:t xml:space="preserve">, eight months old, in Reubin Ratliff’s house on 279A; </w:t>
+      </w:r>
+      <w:r>
+        <w:rPr>
+          <w:b/>
+        </w:rPr>
+        <w:t>Silas Wilson</w:t>
+      </w:r>
+      <w:r>
+        <w:t xml:space="preserve">, six, in William Wilson’s house on 298A; and </w:t>
+      </w:r>
+      <w:r>
+        <w:rPr>
+          <w:b/>
+        </w:rPr>
+        <w:t>Silas Phillips</w:t>
+      </w:r>
+      <w:r>
+        <w:t xml:space="preserve">, fifteen, in B. F. Phillips’s house on 309B — </w:t>
       </w:r>
       <w:r>
         <w:rPr>
@@ -639,7 +657,61 @@
         <w:t>not</w:t>
       </w:r>
       <w:r>
-        <w:t xml:space="preserve"> this man. [C473] [C474] On the 1850 Estill film the only Gray house is </w:t>
+        <w:t xml:space="preserve"> this man. [C473] [C474] [C478] [C479] [C483] A first-pass </w:t>
+      </w:r>
+      <w:r>
+        <w:rPr>
+          <w:b/>
+        </w:rPr>
+        <w:t>Cyrus</w:t>
+      </w:r>
+      <w:r>
+        <w:t xml:space="preserve"> on 320A is </w:t>
+      </w:r>
+      <w:r>
+        <w:rPr>
+          <w:b/>
+        </w:rPr>
+        <w:t>Squire Bowman</w:t>
+      </w:r>
+      <w:r>
+        <w:t xml:space="preserve">, twenty-four. [C480] On 5 September 1850, dwelling 313 on 299B, </w:t>
+      </w:r>
+      <w:r>
+        <w:rPr>
+          <w:b/>
+        </w:rPr>
+        <w:t>Harrison Newman</w:t>
+      </w:r>
+      <w:r>
+        <w:t xml:space="preserve">, thirty-three, farms with Susan, twenty-four, William, ten, </w:t>
+      </w:r>
+      <w:r>
+        <w:rPr>
+          <w:b/>
+        </w:rPr>
+        <w:t>Elias, eight</w:t>
+      </w:r>
+      <w:r>
+        <w:t xml:space="preserve">, Henry, six, and Balinda, two. Flannigan’s published age </w:t>
+      </w:r>
+      <w:r>
+        <w:rPr>
+          <w:b/>
+        </w:rPr>
+        <w:t>three</w:t>
+      </w:r>
+      <w:r>
+        <w:t xml:space="preserve"> for that Elias is wrong. The eight-year-old is the right age for Dora’s father, born 18 April 1842. That is </w:t>
+      </w:r>
+      <w:r>
+        <w:rPr>
+          <w:b/>
+        </w:rPr>
+        <w:t>possible</w:t>
+      </w:r>
+      <w:r>
+        <w:t xml:space="preserve">, not a merge: the schedule does not say son, and no later record in this case names Harrison as Elias T.’s father. [C486] [C487] On the 1850 Estill film the only Gray house is </w:t>
       </w:r>
       <w:r>
         <w:rPr>
@@ -2202,10 +2274,10 @@
         <w:rPr>
           <w:b/>
         </w:rPr>
-        <w:t>probable</w:t>
-      </w:r>
-      <w:r>
-        <w:t xml:space="preserve"> William’s son, not proved. [C349] [C356] [C382] [C333]</w:t>
+        <w:t>proven</w:t>
+      </w:r>
+      <w:r>
+        <w:t xml:space="preserve"> William’s son. Maiden of Mary J. remains open. [C349] [C356] [C382] [C411] [C333]</w:t>
       </w:r>
     </w:p>
     <w:p>

</xml_diff>

<commit_message>
Pass 61: withdraw C245; 1910 MO/AR S-350 D-windows nil
Re-read of T624-769 shows the pass-48 John Sullivan + Sarah Newman
MIL household is Estes, John on Liberty ED 4 sheet 10B. Letha Sullivan
is on sheet 3A as Nurse, not 8A. Missouri and Arkansas 1910 S-350
D-given-name windows contain no Dora Stone matching P001.

Co-authored-by: blakereaganlaw <blakereaganlaw@gmail.com>
</commit_message>
<xml_diff>
--- a/research/dora-ella-newnam/book/Dora-Ella-Newnam-Stone-A-Life.docx
+++ b/research/dora-ella-newnam/book/Dora-Ella-Newnam-Stone-A-Life.docx
@@ -1490,25 +1490,43 @@
         <w:t>12</w:t>
       </w:r>
       <w:r>
-        <w:t xml:space="preserve">, servant) and </w:t>
+        <w:t xml:space="preserve">, </w:t>
       </w:r>
       <w:r>
         <w:rPr>
           <w:b/>
         </w:rPr>
-        <w:t>Newnam</w:t>
-      </w:r>
-      <w:r>
-        <w:t xml:space="preserve"> in-laws in </w:t>
+        <w:t>Nurse</w:t>
+      </w:r>
+      <w:r>
+        <w:t xml:space="preserve">) in </w:t>
       </w:r>
       <w:r>
         <w:rPr>
           <w:b/>
         </w:rPr>
-        <w:t>John Sullivan</w:t>
-      </w:r>
-      <w:r>
-        <w:t>’s house in Liberty Township (</w:t>
+        <w:t>Jesse Conrad</w:t>
+      </w:r>
+      <w:r>
+        <w:t xml:space="preserve">’s house on Liberty </w:t>
+      </w:r>
+      <w:r>
+        <w:rPr>
+          <w:b/>
+        </w:rPr>
+        <w:t>ED 4</w:t>
+      </w:r>
+      <w:r>
+        <w:t xml:space="preserve"> sheet </w:t>
+      </w:r>
+      <w:r>
+        <w:rPr>
+          <w:b/>
+        </w:rPr>
+        <w:t>3 A</w:t>
+      </w:r>
+      <w:r>
+        <w:t xml:space="preserve"> (</w:t>
       </w:r>
       <w:r>
         <w:rPr>
@@ -1517,7 +1535,25 @@
         <w:t>C244</w:t>
       </w:r>
       <w:r>
-        <w:t>–</w:t>
+        <w:t xml:space="preserve">, </w:t>
+      </w:r>
+      <w:r>
+        <w:rPr>
+          <w:b/>
+        </w:rPr>
+        <w:t>C286</w:t>
+      </w:r>
+      <w:r>
+        <w:t xml:space="preserve">). Pass 48’s “John Sullivan + Sarah Newman mother-in-law” household is a </w:t>
+      </w:r>
+      <w:r>
+        <w:rPr>
+          <w:b/>
+        </w:rPr>
+        <w:t>misread</w:t>
+      </w:r>
+      <w:r>
+        <w:t xml:space="preserve"> and is withdrawn (</w:t>
       </w:r>
       <w:r>
         <w:rPr>
@@ -1526,7 +1562,43 @@
         <w:t>C245</w:t>
       </w:r>
       <w:r>
-        <w:t xml:space="preserve">); the </w:t>
+        <w:t xml:space="preserve">, </w:t>
+      </w:r>
+      <w:r>
+        <w:rPr>
+          <w:b/>
+        </w:rPr>
+        <w:t>C284</w:t>
+      </w:r>
+      <w:r>
+        <w:t xml:space="preserve">): that crop is sheet </w:t>
+      </w:r>
+      <w:r>
+        <w:rPr>
+          <w:b/>
+        </w:rPr>
+        <w:t>10 B</w:t>
+      </w:r>
+      <w:r>
+        <w:t xml:space="preserve">, </w:t>
+      </w:r>
+      <w:r>
+        <w:rPr>
+          <w:b/>
+        </w:rPr>
+        <w:t>Estes, John</w:t>
+      </w:r>
+      <w:r>
+        <w:t xml:space="preserve">, and the Newman on the page is </w:t>
+      </w:r>
+      <w:r>
+        <w:rPr>
+          <w:b/>
+        </w:rPr>
+        <w:t>Belle</w:t>
+      </w:r>
+      <w:r>
+        <w:t xml:space="preserve">, a thirty-year-old Missouri widow, not Dora. The </w:t>
       </w:r>
       <w:r>
         <w:rPr>
@@ -1569,6 +1641,33 @@
           <w:b/>
         </w:rPr>
         <w:t>C247</w:t>
+      </w:r>
+      <w:r>
+        <w:t xml:space="preserve">). 1910 Missouri and Arkansas </w:t>
+      </w:r>
+      <w:r>
+        <w:rPr>
+          <w:b/>
+        </w:rPr>
+        <w:t>S-350</w:t>
+      </w:r>
+      <w:r>
+        <w:t xml:space="preserve"> D-windows have no Dora Stone of thirty-nine born Kentucky (</w:t>
+      </w:r>
+      <w:r>
+        <w:rPr>
+          <w:b/>
+        </w:rPr>
+        <w:t>C288</w:t>
+      </w:r>
+      <w:r>
+        <w:t xml:space="preserve">, </w:t>
+      </w:r>
+      <w:r>
+        <w:rPr>
+          <w:b/>
+        </w:rPr>
+        <w:t>C289</w:t>
       </w:r>
       <w:r>
         <w:t xml:space="preserve">). The </w:t>

</xml_diff>

<commit_message>
Pass 47–48: 1850 William/John 60 and 1860 H.H. Newman originals
Isolate William Newman 26 and John Newman 60 Tennessee on the 1850
Owsley originals; prove 1860 H.H. Newman 44 + Elias 18 as the 1850
Harrison house; upgrade Andrew×Rachel×Giles 1850–70 to proven.
Rebuild the Word biography and inventory the new plates.

Co-authored-by: CatCorner22 <CatCorner22@users.noreply.github.com>
</commit_message>
<xml_diff>
--- a/research/dora-ella-newnam/book/Dora-Ella-Newnam-Stone-A-Life.docx
+++ b/research/dora-ella-newnam/book/Dora-Ella-Newnam-Stone-A-Life.docx
@@ -41,7 +41,7 @@
     </w:p>
     <w:p>
       <w:r>
-        <w:t>Seventy-seven Cursor chats on this repository were reviewed for this volume (primary research, helpers, scans, and failed browser hunts). The original mobile session opened the case and read the Arkansas death certificate the family still holds. Later sessions recovered the 1880 childhood schedule that free transcripts had missed, walked statewide Soundex reels for 1910 and 1920, tested a Peebles third-marriage hypothesis and set it aside, and photographed NARA microfilm frames — the 1880 childhood schedule, the 1910 Kentucky Ella Miracode plates, Hardin Gray on Sturgeon sheet 13 B, the 1860 Owsley original of Silas Gray’s house with William aged thirteen, the 1850 Owsley Gray pages that are other men (Thomas, James, John, Charles), the given-name Silas plates that are other boys (Ratliff eight months, Wilson six, Phillips fifteen) and the Bowman line first read as Cyrus and then as Squire, the 1850 Estill Marcus Gray original, Breathitt’s Taulbee infant Silas and Bryant Siras, and Madison’s John Green house with Silas Green aged twenty, the 1850 Owsley Harrison Newman house with an eight-year-old Elias who may be Dora’s father and is not merged, the 1870 Proctor original of James Brandenburg’s house, Silas Gray’s Sturgeon original, the 1880 District 59 originals of William next door to John Newnam and of Silas still in the district, the 1900 William Gray dwelling-84 crop, and the Bollinger page a sibling had labelled “Dora E. Stone,” which is Henry C. Rhodes and Dora M. of Missouri. This volume folds those chats into one narrative. The case dossier remains the working file; this book is the public reading of it. Sibling work on Greene ED 37 through 41 is now on merged PR #26 through Pass 59; remaining Greene ED 38 B-sides, 1900 Liberty, and 1900 hh 85 are inventoried, not duplicated. Do not import their “Dora E. Stone” as this woman.</w:t>
+        <w:t>Seventy-seven Cursor chats on this repository were reviewed for this volume (primary research, helpers, scans, and failed browser hunts). The original mobile session opened the case and read the Arkansas death certificate the family still holds. Later sessions recovered the 1880 childhood schedule that free transcripts had missed, walked statewide Soundex reels for 1910 and 1920, tested a Peebles third-marriage hypothesis and set it aside, and photographed NARA microfilm frames — the 1880 childhood schedule, the 1910 Kentucky Ella Miracode plates, Hardin Gray on Sturgeon sheet 13 B, the 1860 Owsley original of Silas Gray’s house with William aged thirteen, the 1850 Owsley Gray pages that are other men (Thomas, James, John, Charles), the given-name Silas plates that are other boys (Ratliff eight months, Wilson six, Phillips fifteen) and the Bowman line first read as Cyrus and then as Squire, the 1850 Estill Marcus Gray original, Breathitt’s Taulbee infant Silas and Bryant Siras, and Madison’s John Green house with Silas Green aged twenty, the 1850 Owsley Harrison Newman house with an eight-year-old Elias who may be Dora’s father and is not merged, the 1860 Booneville original of that house under H.H. Newman with Elias aged eighteen, the 1850 William Newman house of twenty-six on the same page, the 1850 John Newman of sixty born in Tennessee who is not the 1880 John of sixty-nine, and Andrew Mays’s Giles at one month in 1850 and eleven in 1860, the 1870 Proctor original of James Brandenburg’s house, Silas Gray’s Sturgeon original, the 1880 District 59 originals of William next door to John Newnam and of Silas still in the district, the 1900 William Gray dwelling-84 crop, and the Bollinger page a sibling had labelled “Dora E. Stone,” which is Henry C. Rhodes and Dora M. of Missouri. This volume folds those chats into one narrative. The case dossier remains the working file; this book is the public reading of it. Sibling work on Greene ED 37 through 41 is now on merged PR #26 through Pass 59; remaining Greene ED 38 B-sides, 1900 Liberty, and 1900 hh 85 are inventoried, not duplicated. Do not import their “Dora E. Stone” as this woman.</w:t>
       </w:r>
     </w:p>
     <w:p>
@@ -162,7 +162,25 @@
         <w:t>Giles Mays</w:t>
       </w:r>
       <w:r>
-        <w:t xml:space="preserve"> (1849, son of Andrew and Rachel, husband of Lizzie Bowman) copied at William Mays Cemetery on Elk Creek — a different man from Link. A bracketed death year of 1904 on that cemetery list is a transcriber’s note, not a proved date. [C125] [C132] [C145] [S121] [S125] [S129]</w:t>
+        <w:t xml:space="preserve"> (1849, son of Andrew and Rachel, husband of Lizzie Bowman) copied at William Mays Cemetery on Elk Creek — a different man from Link. The 1850 Owsley original of that natal house is now seen: Andrew, twenty-five, Rachel, twenty-three, and Giles, </w:t>
+      </w:r>
+      <w:r>
+        <w:rPr>
+          <w:b/>
+        </w:rPr>
+        <w:t>one month</w:t>
+      </w:r>
+      <w:r>
+        <w:t xml:space="preserve">, on 5 September. The 1860 original has Giles </w:t>
+      </w:r>
+      <w:r>
+        <w:rPr>
+          <w:b/>
+        </w:rPr>
+        <w:t>eleven</w:t>
+      </w:r>
+      <w:r>
+        <w:t>. The house is proven. [C493] [C500] A bracketed death year of 1904 on that cemetery list is a transcriber’s note, not a proved date. [C125] [C132] [C145] [S121] [S125] [S129]</w:t>
       </w:r>
     </w:p>
     <w:p>
@@ -711,7 +729,115 @@
         <w:t>possible</w:t>
       </w:r>
       <w:r>
-        <w:t xml:space="preserve">, not a merge: the schedule does not say son, and no later record in this case names Harrison as Elias T.’s father. [C486] [C487] On the 1850 Estill film the only Gray house is </w:t>
+        <w:t xml:space="preserve">, not a merge: the schedule does not say son, and no later record in this case names Harrison as Elias T.’s father. [C486] [C487] Ten years later the same house is on the Booneville original under initials. On 9 July 1860, dwelling 364, </w:t>
+      </w:r>
+      <w:r>
+        <w:rPr>
+          <w:b/>
+        </w:rPr>
+        <w:t>H.H. Newman</w:t>
+      </w:r>
+      <w:r>
+        <w:t xml:space="preserve">, forty-four, farms with Susan, thirty-six, William, twenty, </w:t>
+      </w:r>
+      <w:r>
+        <w:rPr>
+          <w:b/>
+        </w:rPr>
+        <w:t>Elias, eighteen</w:t>
+      </w:r>
+      <w:r>
+        <w:t xml:space="preserve">, H.H., fifteen, and Belinda, twelve. That is </w:t>
+      </w:r>
+      <w:r>
+        <w:rPr>
+          <w:b/>
+        </w:rPr>
+        <w:t>proven</w:t>
+      </w:r>
+      <w:r>
+        <w:t xml:space="preserve"> the 1850 Harrison house. Elias at eighteen in July 1860 still fits 18 April 1842. It still does not name a father. [C497] [C498] [C499] Two dwellings above in 1850, </w:t>
+      </w:r>
+      <w:r>
+        <w:rPr>
+          <w:b/>
+        </w:rPr>
+        <w:t>William Newman</w:t>
+      </w:r>
+      <w:r>
+        <w:t xml:space="preserve">, twenty-six, farms with Jane, Francis, and Leanner — a different house. [C491] Overleaf on 300A, </w:t>
+      </w:r>
+      <w:r>
+        <w:rPr>
+          <w:b/>
+        </w:rPr>
+        <w:t>John Newman</w:t>
+      </w:r>
+      <w:r>
+        <w:t xml:space="preserve">, sixty, farmer, born in </w:t>
+      </w:r>
+      <w:r>
+        <w:rPr>
+          <w:b/>
+        </w:rPr>
+        <w:t>Tennessee</w:t>
+      </w:r>
+      <w:r>
+        <w:t xml:space="preserve">, lives with Lear, fifty-five, Kentucky, and Morris, twenty-three. He is not the 1880 John of sixty-nine, who was born in Kentucky to a North Carolina father and would have been about thirty-nine in 1850. [C492] In 1860 a John Newnam, sixty-eight, born in </w:t>
+      </w:r>
+      <w:r>
+        <w:rPr>
+          <w:b/>
+        </w:rPr>
+        <w:t>Delaware</w:t>
+      </w:r>
+      <w:r>
+        <w:t xml:space="preserve">, lives with Lear, sixty-three, at Proctor, and a Harrison Newman, fifteen, continues the line. Names and ages fit; Tennessee versus Delaware does not. They are not merged. [C501] The same 300A page has </w:t>
+      </w:r>
+      <w:r>
+        <w:rPr>
+          <w:b/>
+        </w:rPr>
+        <w:t>Andrew Mays</w:t>
+      </w:r>
+      <w:r>
+        <w:t xml:space="preserve">, twenty-five, Rachel, twenty-three, and </w:t>
+      </w:r>
+      <w:r>
+        <w:rPr>
+          <w:b/>
+        </w:rPr>
+        <w:t>Giles, one month old</w:t>
+      </w:r>
+      <w:r>
+        <w:t xml:space="preserve">. The 1860 original has Giles </w:t>
+      </w:r>
+      <w:r>
+        <w:rPr>
+          <w:b/>
+        </w:rPr>
+        <w:t>eleven</w:t>
+      </w:r>
+      <w:r>
+        <w:t xml:space="preserve">. That natal house of the 1870 Jiles of twenty is now </w:t>
+      </w:r>
+      <w:r>
+        <w:rPr>
+          <w:b/>
+        </w:rPr>
+        <w:t>proven</w:t>
+      </w:r>
+      <w:r>
+        <w:t xml:space="preserve">. Flannigan’s age five months is withdrawn. The fourteen-year-old in William Mays’s house next door is </w:t>
+      </w:r>
+      <w:r>
+        <w:rPr>
+          <w:b/>
+        </w:rPr>
+        <w:t>Jessee Caster</w:t>
+      </w:r>
+      <w:r>
+        <w:t xml:space="preserve">, not Easters. [C493] [C494] [C500] On the 1850 Estill film the only Gray house is </w:t>
       </w:r>
       <w:r>
         <w:rPr>

</xml_diff>

<commit_message>
Pass 49–50: 1932 extract names Henry Harrison; Heidelberg cemetery transcripts
Lee 1932 death-certificate extract names Elias T. Newnam's father Henry Harrison
Newnam and mother Millie Tincher Newnam (derivative; original DC still unread).
KYDI confirms vol 020 #09525. Brandenburg-Quillen transcripts date Mary A. 11 Jul
1918 and Elias T. 18 Apr 1932; parent notes are not a second original. Estill
"marriages to 1850" web files end 1825, so the authored 1840 Newman×Tincher
licence is a coverage hole. Word rebuilt from markdown.

Co-authored-by: CatCorner22 <CatCorner22@users.noreply.github.com>
</commit_message>
<xml_diff>
--- a/research/dora-ella-newnam/book/Dora-Ella-Newnam-Stone-A-Life.docx
+++ b/research/dora-ella-newnam/book/Dora-Ella-Newnam-Stone-A-Life.docx
@@ -41,7 +41,7 @@
     </w:p>
     <w:p>
       <w:r>
-        <w:t>Seventy-seven Cursor chats on this repository were reviewed for this volume (primary research, helpers, scans, and failed browser hunts). The original mobile session opened the case and read the Arkansas death certificate the family still holds. Later sessions recovered the 1880 childhood schedule that free transcripts had missed, walked statewide Soundex reels for 1910 and 1920, tested a Peebles third-marriage hypothesis and set it aside, and photographed NARA microfilm frames — the 1880 childhood schedule, the 1910 Kentucky Ella Miracode plates, Hardin Gray on Sturgeon sheet 13 B, the 1860 Owsley original of Silas Gray’s house with William aged thirteen, the 1850 Owsley Gray pages that are other men (Thomas, James, John, Charles), the given-name Silas plates that are other boys (Ratliff eight months, Wilson six, Phillips fifteen) and the Bowman line first read as Cyrus and then as Squire, the 1850 Estill Marcus Gray original, Breathitt’s Taulbee infant Silas and Bryant Siras, and Madison’s John Green house with Silas Green aged twenty, the 1850 Owsley Harrison Newman house with an eight-year-old Elias who may be Dora’s father and is not merged, the 1860 Booneville original of that house under H.H. Newman with Elias aged eighteen, the 1850 William Newman house of twenty-six on the same page, the 1850 John Newman of sixty born in Tennessee who is not the 1880 John of sixty-nine, and Andrew Mays’s Giles at one month in 1850 and eleven in 1860, the 1870 Proctor original of James Brandenburg’s house, Silas Gray’s Sturgeon original, the 1880 District 59 originals of William next door to John Newnam and of Silas still in the district, the 1900 William Gray dwelling-84 crop, and the Bollinger page a sibling had labelled “Dora E. Stone,” which is Henry C. Rhodes and Dora M. of Missouri. This volume folds those chats into one narrative. The case dossier remains the working file; this book is the public reading of it. Sibling work on Greene ED 37 through 41 is now on merged PR #26 through Pass 59; remaining Greene ED 38 B-sides, 1900 Liberty, and 1900 hh 85 are inventoried, not duplicated. Do not import their “Dora E. Stone” as this woman.</w:t>
+        <w:t>Seventy-eight Cursor chats on this repository were reviewed for this volume (primary research, helpers, scans, and failed browser hunts). The original mobile session opened the case and read the Arkansas death certificate the family still holds. Later sessions recovered the 1880 childhood schedule that free transcripts had missed, walked statewide Soundex reels for 1910 and 1920, tested a Peebles third-marriage hypothesis and set it aside, and photographed NARA microfilm frames — the 1880 childhood schedule, the 1910 Kentucky Ella Miracode plates, Hardin Gray on Sturgeon sheet 13 B, the 1860 Owsley original of Silas Gray’s house with William aged thirteen, the 1850 Owsley Gray pages that are other men (Thomas, James, John, Charles), the given-name Silas plates that are other boys (Ratliff eight months, Wilson six, Phillips fifteen) and the Bowman line first read as Cyrus and then as Squire, the 1850 Estill Marcus Gray original, Breathitt’s Taulbee infant Silas and Bryant Siras, and Madison’s John Green house with Silas Green aged twenty, the 1850 Owsley Harrison Newman house with an eight-year-old Elias who is probably Dora’s father — a 1932 death extract names Henry Harrison Newnam as that father — and is not merged as proven, the 1860 Booneville original of that house under H.H. Newman with Elias aged eighteen, the 1850 William Newman house of twenty-six on the same page, the 1850 John Newman of sixty born in Tennessee who is not the 1880 John of sixty-nine, and Andrew Mays’s Giles at one month in 1850 and eleven in 1860, the 1870 Proctor original of James Brandenburg’s house, Silas Gray’s Sturgeon original, the 1880 District 59 originals of William next door to John Newnam and of Silas still in the district, the 1900 William Gray dwelling-84 crop, and the Bollinger page a sibling had labelled “Dora E. Stone,” which is Henry C. Rhodes and Dora M. of Missouri. This volume folds those chats into one narrative. The case dossier remains the working file; this book is the public reading of it. Sibling work on Greene ED 37 through 41 is now on merged PR #26 through Pass 59; remaining Greene ED 38 B-sides, 1900 Liberty, and 1900 hh 85 are inventoried, not duplicated. Do not import their “Dora E. Stone” as this woman.</w:t>
       </w:r>
     </w:p>
     <w:p>
@@ -720,16 +720,7 @@
         <w:t>three</w:t>
       </w:r>
       <w:r>
-        <w:t xml:space="preserve"> for that Elias is wrong. The eight-year-old is the right age for Dora’s father, born 18 April 1842. That is </w:t>
-      </w:r>
-      <w:r>
-        <w:rPr>
-          <w:b/>
-        </w:rPr>
-        <w:t>possible</w:t>
-      </w:r>
-      <w:r>
-        <w:t xml:space="preserve">, not a merge: the schedule does not say son, and no later record in this case names Harrison as Elias T.’s father. [C486] [C487] Ten years later the same house is on the Booneville original under initials. On 9 July 1860, dwelling 364, </w:t>
+        <w:t xml:space="preserve"> for that Elias is wrong. The eight-year-old is the right age for Dora’s father, born 18 April 1842. [C486] [C487] Ten years later the same house is on the Booneville original under initials. On 9 July 1860, dwelling 364, </w:t>
       </w:r>
       <w:r>
         <w:rPr>
@@ -756,7 +747,70 @@
         <w:t>proven</w:t>
       </w:r>
       <w:r>
-        <w:t xml:space="preserve"> the 1850 Harrison house. Elias at eighteen in July 1860 still fits 18 April 1842. It still does not name a father. [C497] [C498] [C499] Two dwellings above in 1850, </w:t>
+        <w:t xml:space="preserve"> the 1850 Harrison house. [C497] [C498] A Lee County 1932 death-certificate extract — photographs, not the original page — names the decedent </w:t>
+      </w:r>
+      <w:r>
+        <w:rPr>
+          <w:b/>
+        </w:rPr>
+        <w:t>Elias T. Newnam</w:t>
+      </w:r>
+      <w:r>
+        <w:t xml:space="preserve">, ninety, born 18 April 1842 in Clark County, died that birthday at Beattyville, buried Heidelberg, widower, father </w:t>
+      </w:r>
+      <w:r>
+        <w:rPr>
+          <w:b/>
+        </w:rPr>
+        <w:t>Henry Harrison Newnam</w:t>
+      </w:r>
+      <w:r>
+        <w:t xml:space="preserve">, mother </w:t>
+      </w:r>
+      <w:r>
+        <w:rPr>
+          <w:b/>
+        </w:rPr>
+        <w:t>Millie Tincher Newnam</w:t>
+      </w:r>
+      <w:r>
+        <w:t xml:space="preserve">. The statewide index confirms </w:t>
+      </w:r>
+      <w:r>
+        <w:rPr>
+          <w:b/>
+        </w:rPr>
+        <w:t>NEWMAN ELIAS T</w:t>
+      </w:r>
+      <w:r>
+        <w:t xml:space="preserve">, ninety, Lee, 18 April 1932, volume 20, certificate 9525. Identity of the census child with Dora’s father is </w:t>
+      </w:r>
+      <w:r>
+        <w:rPr>
+          <w:b/>
+        </w:rPr>
+        <w:t>probable</w:t>
+      </w:r>
+      <w:r>
+        <w:t xml:space="preserve">, not proven. The original certificate has not been seen. Susan in the 1850–60 house may be a stepmother; the extract names Millie, not Susan. [C506] [C507] [C509] [C510] [C499] A 2001 copy of Brandenburg-Quillen Cemetery at Heidelberg — the yard named on that extract — lists </w:t>
+      </w:r>
+      <w:r>
+        <w:rPr>
+          <w:b/>
+        </w:rPr>
+        <w:t>Mary A. Newnam</w:t>
+      </w:r>
+      <w:r>
+        <w:t xml:space="preserve">, 22 April 1842 to 11 July 1918, and </w:t>
+      </w:r>
+      <w:r>
+        <w:rPr>
+          <w:b/>
+        </w:rPr>
+        <w:t>Elias T. Newnam</w:t>
+      </w:r>
+      <w:r>
+        <w:t xml:space="preserve">, 1842 to 18 April 1932. Parent lines on the annotated copy are the transcriber’s notes, not a second original. Kentucky’s 1918 death index has no matching Lee row. The date stays in conflict. [C516] [C517] [C518] [C519] [C520] Estill’s published “marriages to 1850” pages, opened through the Wayback Machine, actually stop at 1825. They do not contain a 27 February 1840 Newman–Tincher licence. That authored wedding stays unproved. [C522] [C511] Two dwellings above in 1850, </w:t>
       </w:r>
       <w:r>
         <w:rPr>

</xml_diff>

<commit_message>
Pass 51: 1916 Henry H. extracts leave parents blank; FAG portrait not a stone
Sibling-DC workaround for the 1932 Elias T. certificate: KYDI and two
Owsley extracts name Henry H. Newman, 72, Travelers Rest, 6 Aug 1916,
vol 044 #21663, but both parent cells are empty. Identity with the 1860
H.H., 15, is probable, not proved. Lee 1911–1945 extracts name no other
Newman child of Henry Harrison and Millie Tincher. The Find A Grave
JPEG attached to Elias T. is a framed portrait, not a readable stone.
Estill 1840 remains a coverage hole. Word rebuilt (eighty chats).

Co-authored-by: CatCorner22 <CatCorner22@users.noreply.github.com>
</commit_message>
<xml_diff>
--- a/research/dora-ella-newnam/book/Dora-Ella-Newnam-Stone-A-Life.docx
+++ b/research/dora-ella-newnam/book/Dora-Ella-Newnam-Stone-A-Life.docx
@@ -41,7 +41,7 @@
     </w:p>
     <w:p>
       <w:r>
-        <w:t>Seventy-eight Cursor chats on this repository were reviewed for this volume (primary research, helpers, scans, and failed browser hunts). The original mobile session opened the case and read the Arkansas death certificate the family still holds. Later sessions recovered the 1880 childhood schedule that free transcripts had missed, walked statewide Soundex reels for 1910 and 1920, tested a Peebles third-marriage hypothesis and set it aside, and photographed NARA microfilm frames — the 1880 childhood schedule, the 1910 Kentucky Ella Miracode plates, Hardin Gray on Sturgeon sheet 13 B, the 1860 Owsley original of Silas Gray’s house with William aged thirteen, the 1850 Owsley Gray pages that are other men (Thomas, James, John, Charles), the given-name Silas plates that are other boys (Ratliff eight months, Wilson six, Phillips fifteen) and the Bowman line first read as Cyrus and then as Squire, the 1850 Estill Marcus Gray original, Breathitt’s Taulbee infant Silas and Bryant Siras, and Madison’s John Green house with Silas Green aged twenty, the 1850 Owsley Harrison Newman house with an eight-year-old Elias who is probably Dora’s father — a 1932 death extract names Henry Harrison Newnam as that father — and is not merged as proven, the 1860 Booneville original of that house under H.H. Newman with Elias aged eighteen, the 1850 William Newman house of twenty-six on the same page, the 1850 John Newman of sixty born in Tennessee who is not the 1880 John of sixty-nine, and Andrew Mays’s Giles at one month in 1850 and eleven in 1860, the 1870 Proctor original of James Brandenburg’s house, Silas Gray’s Sturgeon original, the 1880 District 59 originals of William next door to John Newnam and of Silas still in the district, the 1900 William Gray dwelling-84 crop, and the Bollinger page a sibling had labelled “Dora E. Stone,” which is Henry C. Rhodes and Dora M. of Missouri. This volume folds those chats into one narrative. The case dossier remains the working file; this book is the public reading of it. Sibling work on Greene ED 37 through 41 is now on merged PR #26 through Pass 59; remaining Greene ED 38 B-sides, 1900 Liberty, and 1900 hh 85 are inventoried, not duplicated. Do not import their “Dora E. Stone” as this woman.</w:t>
+        <w:t>Eighty Cursor chats on this repository were reviewed for this volume (primary research, helpers, scans, and failed browser hunts). The original mobile session opened the case and read the Arkansas death certificate the family still holds. Later sessions recovered the 1880 childhood schedule that free transcripts had missed, walked statewide Soundex reels for 1910 and 1920, tested a Peebles third-marriage hypothesis and set it aside, and photographed NARA microfilm frames — the 1880 childhood schedule, the 1910 Kentucky Ella Miracode plates, Hardin Gray on Sturgeon sheet 13 B, the 1860 Owsley original of Silas Gray’s house with William aged thirteen, the 1850 Owsley Gray pages that are other men (Thomas, James, John, Charles), the given-name Silas plates that are other boys (Ratliff eight months, Wilson six, Phillips fifteen) and the Bowman line first read as Cyrus and then as Squire, the 1850 Estill Marcus Gray original, Breathitt’s Taulbee infant Silas and Bryant Siras, and Madison’s John Green house with Silas Green aged twenty, the 1850 Owsley Harrison Newman house with an eight-year-old Elias who is probably Dora’s father — a 1932 death extract names Henry Harrison Newnam as that father — and is not merged as proven, the 1860 Booneville original of that house under H.H. Newman with Elias aged eighteen, the 1850 William Newman house of twenty-six on the same page, the 1850 John Newman of sixty born in Tennessee who is not the 1880 John of sixty-nine, and Andrew Mays’s Giles at one month in 1850 and eleven in 1860, the 1870 Proctor original of James Brandenburg’s house, Silas Gray’s Sturgeon original, the 1880 District 59 originals of William next door to John Newnam and of Silas still in the district, the 1900 William Gray dwelling-84 crop, and the Bollinger page a sibling had labelled “Dora E. Stone,” which is Henry C. Rhodes and Dora M. of Missouri. This volume folds those chats into one narrative. The case dossier remains the working file; this book is the public reading of it. Sibling work on Greene ED 37 through 41 is now on merged PR #26 through Pass 59; remaining Greene ED 38 B-sides, 1900 Liberty, and 1900 hh 85 are inventoried, not duplicated. Do not import their “Dora E. Stone” as this woman.</w:t>
       </w:r>
     </w:p>
     <w:p>
@@ -810,7 +810,7 @@
         <w:t>Elias T. Newnam</w:t>
       </w:r>
       <w:r>
-        <w:t xml:space="preserve">, 1842 to 18 April 1932. Parent lines on the annotated copy are the transcriber’s notes, not a second original. Kentucky’s 1918 death index has no matching Lee row. The date stays in conflict. [C516] [C517] [C518] [C519] [C520] Estill’s published “marriages to 1850” pages, opened through the Wayback Machine, actually stop at 1825. They do not contain a 27 February 1840 Newman–Tincher licence. That authored wedding stays unproved. [C522] [C511] Two dwellings above in 1850, </w:t>
+        <w:t xml:space="preserve">, 1842 to 18 April 1932. Parent lines on the annotated copy are the transcriber’s notes, not a second original. Kentucky’s 1918 death index has no matching Lee row. The date stays in conflict. [C516] [C517] [C518] [C519] [C520] Estill’s published “marriages to 1850” pages, opened through the Wayback Machine, actually stop at 1825. They do not contain a 27 February 1840 Newman–Tincher licence. That authored wedding stays unproved. [C522] [C511] A Genealogy.com Tincher Tribe post dates the same marriage “about 1839” and says a cousin saw a permission naming Belinda. WikiTree still prints 27 February 1840. Neither is the bond. Do not average the two dates. [C535] Burns’s Estill compilation, the Kentucky Historical Society’s 1840–1844 reel, and the state archives’ 1808–1868 bonds exist; they have not been opened from this workspace. [C536] Two dwellings above in 1850, </w:t>
       </w:r>
       <w:r>
         <w:rPr>
@@ -891,7 +891,25 @@
         <w:t>Jessee Caster</w:t>
       </w:r>
       <w:r>
-        <w:t xml:space="preserve">, not Easters. [C493] [C494] [C500] On the 1850 Estill film the only Gray house is </w:t>
+        <w:t xml:space="preserve">, not Easters. [C493] [C494] [C500] An Owsley death-certificate extract for 1916 names </w:t>
+      </w:r>
+      <w:r>
+        <w:rPr>
+          <w:b/>
+        </w:rPr>
+        <w:t>Henry H. Newnam</w:t>
+      </w:r>
+      <w:r>
+        <w:t xml:space="preserve">, seventy-two, dead on 6 August at Travelers Rest, buried the next day in S. M. Cecil’s yard. Kentucky’s index is </w:t>
+      </w:r>
+      <w:r>
+        <w:rPr>
+          <w:b/>
+        </w:rPr>
+        <w:t>NEWMAN HENRY H</w:t>
+      </w:r>
+      <w:r>
+        <w:t xml:space="preserve">, seventy-two, Owsley, volume 44, certificate 21663. Both the Kendrick table and a Bowman/Chandler microfilm transcript leave the parent cells blank. That man is probably the H.H., fifteen, in the 1860 Booneville house — age and county fit — and is not proved as Elias’s brother while those parent lines stay empty. Josephine Gilbert, who died that January in the same yard, is extracted as daughter of Henry H. Newnam and Mary J. Pardington; she is a FAN, not a silent niece. [C528] [C530] [C531] Lee extracts for 1911–1945 name no other Newman child of Henry Harrison and Millie Tincher. A 1913 Elias Tincher, son of Elias Tincher and Rebecca Ashcraft, and a 1922 Martha Ross whose mother was Millie Newnam, stay unmerged FAN. [C537] [C533] [C534] Find A Grave’s saved photograph of Elias T. is a framed portrait of an elderly bearded man and a boy, not a readable stone. Mary Ann’s memorial has no archived photograph. The 1918 date stays in conflict. [C532] [C539] On the 1850 Estill film the only Gray house is </w:t>
       </w:r>
       <w:r>
         <w:rPr>
@@ -2613,8 +2631,41 @@
       </w:r>
     </w:p>
     <w:p>
-      <w:r>
-        <w:t>The next chat should treat this book and `06-dossier.md` as the combined master, then work the open list. Do not reopen Peebles as a third marriage without a license. Do not print 1868 or 24 February 1906 as facts.</w:t>
+      <w:pPr>
+        <w:pStyle w:val="ListBullet"/>
+      </w:pPr>
+      <w:r>
+        <w:t xml:space="preserve">Conflict </w:t>
+      </w:r>
+      <w:r>
+        <w:rPr>
+          <w:b/>
+        </w:rPr>
+        <w:t>#22</w:t>
+      </w:r>
+      <w:r>
+        <w:t>: cemetery transcript dates Mary A. Newnam 11 July 1918; Kentucky’s 1918 death index has no matching Lee row. The Find A Grave JPEG on file is a portrait, not a stone.</w:t>
+      </w:r>
+    </w:p>
+    <w:p>
+      <w:pPr>
+        <w:pStyle w:val="ListBullet"/>
+      </w:pPr>
+      <w:r>
+        <w:t>The original 1932 Lee death certificate, volume 20, number 9525, and the original 1916 Owsley certificate, volume 44, number 21663. The 1916 extracts leave the parent cells blank.</w:t>
+      </w:r>
+    </w:p>
+    <w:p>
+      <w:pPr>
+        <w:pStyle w:val="ListBullet"/>
+      </w:pPr>
+      <w:r>
+        <w:t>The Estill Newman–Tincher bond, 1826–1850. Published “to 1850” web files stop at 1825.</w:t>
+      </w:r>
+    </w:p>
+    <w:p>
+      <w:r>
+        <w:t>The next chat should treat this book and `06-dossier.md` as the combined master, then work the open list. Do not reopen Peebles as a third marriage without a license. Do not print 1868 or 24 February 1906 as facts. Do not promote the 1850–60 Elias to proved fatherhood on the 1932 extract alone.</w:t>
       </w:r>
     </w:p>
     <w:sectPr>

</xml_diff>

<commit_message>
Pass 62: Liberty ED 4 1900 complete; no Jesse C-563 head
Close every 1900 Liberty ED 4 sheet (5 A–7 B) with no Conrad, Sullivan, Newman, or Letha. 1900 MO C-563 has no Jesse Conrad head between Jasper and John; Jacob of Lorance is a local FAN without Jesse or infant Letha. 1900 N-550 Belle/Bella cards (St Louis 25; Kansas City VA 29) are not the 1910 Liberty widow.

Co-authored-by: blakereaganlaw <blakereaganlaw@gmail.com>
</commit_message>
<xml_diff>
--- a/research/dora-ella-newnam/book/Dora-Ella-Newnam-Stone-A-Life.docx
+++ b/research/dora-ella-newnam/book/Dora-Ella-Newnam-Stone-A-Life.docx
@@ -1544,6 +1544,51 @@
         <w:t>C286</w:t>
       </w:r>
       <w:r>
+        <w:t xml:space="preserve">). The 1910 house is Jesse </w:t>
+      </w:r>
+      <w:r>
+        <w:rPr>
+          <w:b/>
+        </w:rPr>
+        <w:t>37</w:t>
+      </w:r>
+      <w:r>
+        <w:t xml:space="preserve">, wife </w:t>
+      </w:r>
+      <w:r>
+        <w:rPr>
+          <w:b/>
+        </w:rPr>
+        <w:t>28</w:t>
+      </w:r>
+      <w:r>
+        <w:t xml:space="preserve">, Mary about </w:t>
+      </w:r>
+      <w:r>
+        <w:rPr>
+          <w:b/>
+        </w:rPr>
+        <w:t>3</w:t>
+      </w:r>
+      <w:r>
+        <w:t xml:space="preserve">, a male child about </w:t>
+      </w:r>
+      <w:r>
+        <w:rPr>
+          <w:b/>
+        </w:rPr>
+        <w:t>3</w:t>
+      </w:r>
+      <w:r>
+        <w:t>, and Letha (</w:t>
+      </w:r>
+      <w:r>
+        <w:rPr>
+          <w:b/>
+        </w:rPr>
+        <w:t>C295</w:t>
+      </w:r>
+      <w:r>
         <w:t xml:space="preserve">). Pass 48’s “John Sullivan + Sarah Newman mother-in-law” household is a </w:t>
       </w:r>
       <w:r>
@@ -1751,7 +1796,34 @@
         <w:t>4</w:t>
       </w:r>
       <w:r>
-        <w:t xml:space="preserve"> sheets 1–4 are </w:t>
+        <w:t xml:space="preserve"> is now </w:t>
+      </w:r>
+      <w:r>
+        <w:rPr>
+          <w:b/>
+        </w:rPr>
+        <w:t>complete</w:t>
+      </w:r>
+      <w:r>
+        <w:t xml:space="preserve"> — sheets 1–4 (</w:t>
+      </w:r>
+      <w:r>
+        <w:rPr>
+          <w:b/>
+        </w:rPr>
+        <w:t>C260</w:t>
+      </w:r>
+      <w:r>
+        <w:t>) plus sheets 5–7 (</w:t>
+      </w:r>
+      <w:r>
+        <w:rPr>
+          <w:b/>
+        </w:rPr>
+        <w:t>C290</w:t>
+      </w:r>
+      <w:r>
+        <w:t xml:space="preserve">) — </w:t>
       </w:r>
       <w:r>
         <w:rPr>
@@ -1760,16 +1832,7 @@
         <w:t>nil</w:t>
       </w:r>
       <w:r>
-        <w:t xml:space="preserve"> for Sullivan, Letha, and Newnam (</w:t>
-      </w:r>
-      <w:r>
-        <w:rPr>
-          <w:b/>
-        </w:rPr>
-        <w:t>C260</w:t>
-      </w:r>
-      <w:r>
-        <w:t xml:space="preserve">). Liberty ED </w:t>
+        <w:t xml:space="preserve"> Conrad, Sullivan, Newman, and Letha. Liberty ED </w:t>
       </w:r>
       <w:r>
         <w:rPr>
@@ -1787,6 +1850,69 @@
         <w:t>C265</w:t>
       </w:r>
       <w:r>
+        <w:t xml:space="preserve">). </w:t>
+      </w:r>
+      <w:r>
+        <w:rPr>
+          <w:b/>
+        </w:rPr>
+        <w:t>1900 Missouri C-563</w:t>
+      </w:r>
+      <w:r>
+        <w:t xml:space="preserve"> has </w:t>
+      </w:r>
+      <w:r>
+        <w:rPr>
+          <w:b/>
+        </w:rPr>
+        <w:t>no Jesse Conrad head</w:t>
+      </w:r>
+      <w:r>
+        <w:t xml:space="preserve"> between Jasper and John (</w:t>
+      </w:r>
+      <w:r>
+        <w:rPr>
+          <w:b/>
+        </w:rPr>
+        <w:t>C291</w:t>
+      </w:r>
+      <w:r>
+        <w:t xml:space="preserve">). </w:t>
+      </w:r>
+      <w:r>
+        <w:rPr>
+          <w:b/>
+        </w:rPr>
+        <w:t>Jacob I Conrad</w:t>
+      </w:r>
+      <w:r>
+        <w:t xml:space="preserve"> of Lorance, born December 1835, is a local FAN whose card has no Jesse and no infant Letha (</w:t>
+      </w:r>
+      <w:r>
+        <w:rPr>
+          <w:b/>
+        </w:rPr>
+        <w:t>C292</w:t>
+      </w:r>
+      <w:r>
+        <w:t xml:space="preserve">). </w:t>
+      </w:r>
+      <w:r>
+        <w:rPr>
+          <w:b/>
+        </w:rPr>
+        <w:t>1900 N-550</w:t>
+      </w:r>
+      <w:r>
+        <w:t xml:space="preserve"> Belle/Bella cards are a St Louis Bella aged 25 and a Kansas City Belle aged 29 born Virginia — not the 1910 Liberty widow (</w:t>
+      </w:r>
+      <w:r>
+        <w:rPr>
+          <w:b/>
+        </w:rPr>
+        <w:t>C293</w:t>
+      </w:r>
+      <w:r>
         <w:t xml:space="preserve">). A </w:t>
       </w:r>
       <w:r>
@@ -1904,7 +2030,7 @@
         <w:t>C246</w:t>
       </w:r>
       <w:r>
-        <w:t>). [S251] [S253] [S254] Oklahoma and Texas Newman windows were sampled; they do not hold her. Tennessee’s handwritten N-550 reel has a blank D-tab after Clifford of Lauderdale — no Coy — and an M-window of Mary D., Mek. G. of Cheatham, two Melvins of Giles, Minerva, Minnie, Mitchell — no McCoy.</w:t>
+        <w:t>). [S251] [S253] [S254] [S271] [S272] [S273] Oklahoma and Texas Newman windows were sampled; they do not hold her. Tennessee’s handwritten N-550 reel has a blank D-tab after Clifford of Lauderdale — no Coy — and an M-window of Mary D., Mek. G. of Cheatham, two Melvins of Giles, Minerva, Minnie, Mitchell — no McCoy.</w:t>
       </w:r>
     </w:p>
     <w:p>

</xml_diff>

<commit_message>
Pass 52–53: 1870 Harrison original; Beattyville Henry 24 found
Travellers Rest page 15 original proves Harrison 53 is the 1860 H.H. house and that Henry ~25 is absent. Lee 1870 stamp 315 original isolates Newman, Henry 24, a Beattyville coal miner with Mary, Ellen (F), Millia, and infant John — the 1880 Buck Creek couple, still only probable as the 1860 H.H. 15. Word book rebuilt.

Co-authored-by: CatCorner22 <CatCorner22@users.noreply.github.com>
</commit_message>
<xml_diff>
--- a/research/dora-ella-newnam/book/Dora-Ella-Newnam-Stone-A-Life.docx
+++ b/research/dora-ella-newnam/book/Dora-Ella-Newnam-Stone-A-Life.docx
@@ -41,7 +41,7 @@
     </w:p>
     <w:p>
       <w:r>
-        <w:t>Eighty Cursor chats on this repository were reviewed for this volume (primary research, helpers, scans, and failed browser hunts). The original mobile session opened the case and read the Arkansas death certificate the family still holds. Later sessions recovered the 1880 childhood schedule that free transcripts had missed, walked statewide Soundex reels for 1910 and 1920, tested a Peebles third-marriage hypothesis and set it aside, and photographed NARA microfilm frames — the 1880 childhood schedule, the 1910 Kentucky Ella Miracode plates, Hardin Gray on Sturgeon sheet 13 B, the 1860 Owsley original of Silas Gray’s house with William aged thirteen, the 1850 Owsley Gray pages that are other men (Thomas, James, John, Charles), the given-name Silas plates that are other boys (Ratliff eight months, Wilson six, Phillips fifteen) and the Bowman line first read as Cyrus and then as Squire, the 1850 Estill Marcus Gray original, Breathitt’s Taulbee infant Silas and Bryant Siras, and Madison’s John Green house with Silas Green aged twenty, the 1850 Owsley Harrison Newman house with an eight-year-old Elias who is probably Dora’s father — a 1932 death extract names Henry Harrison Newnam as that father — and is not merged as proven, the 1860 Booneville original of that house under H.H. Newman with Elias aged eighteen, the 1850 William Newman house of twenty-six on the same page, the 1850 John Newman of sixty born in Tennessee who is not the 1880 John of sixty-nine, and Andrew Mays’s Giles at one month in 1850 and eleven in 1860, the 1870 Proctor original of James Brandenburg’s house, Silas Gray’s Sturgeon original, the 1880 District 59 originals of William next door to John Newnam and of Silas still in the district, the 1900 William Gray dwelling-84 crop, and the Bollinger page a sibling had labelled “Dora E. Stone,” which is Henry C. Rhodes and Dora M. of Missouri. This volume folds those chats into one narrative. The case dossier remains the working file; this book is the public reading of it. Sibling work on Greene ED 37 through 41 is now on merged PR #26 through Pass 59; remaining Greene ED 38 B-sides, 1900 Liberty, and 1900 hh 85 are inventoried, not duplicated. Do not import their “Dora E. Stone” as this woman.</w:t>
+        <w:t>Eighty-two Cursor chats on this repository were reviewed for this volume (primary research, helpers, scans, and failed browser hunts). The original mobile session opened the case and read the Arkansas death certificate the family still holds. Later sessions recovered the 1880 childhood schedule that free transcripts had missed, walked statewide Soundex reels for 1910 and 1920, tested a Peebles third-marriage hypothesis and set it aside, and photographed NARA microfilm frames — the 1880 childhood schedule, the 1910 Kentucky Ella Miracode plates, Hardin Gray on Sturgeon sheet 13 B, the 1860 Owsley original of Silas Gray’s house with William aged thirteen, the 1850 Owsley Gray pages that are other men (Thomas, James, John, Charles), the given-name Silas plates that are other boys (Ratliff eight months, Wilson six, Phillips fifteen) and the Bowman line first read as Cyrus and then as Squire, the 1850 Estill Marcus Gray original, Breathitt’s Taulbee infant Silas and Bryant Siras, and Madison’s John Green house with Silas Green aged twenty, the 1850 Owsley Harrison Newman house with an eight-year-old Elias who is probably Dora’s father — a 1932 death extract names Henry Harrison Newnam as that father — and is not merged as proven, the 1860 Booneville original of that house under H.H. Newman with Elias aged eighteen, the 1850 William Newman house of twenty-six on the same page, the 1850 John Newman of sixty born in Tennessee who is not the 1880 John of sixty-nine, and Andrew Mays’s Giles at one month in 1850 and eleven in 1860, the 1870 Proctor original of James Brandenburg’s house, Silas Gray’s Sturgeon original, the 1880 District 59 originals of William next door to John Newnam and of Silas still in the district, the 1900 William Gray dwelling-84 crop, and the Bollinger page a sibling had labelled “Dora E. Stone,” which is Henry C. Rhodes and Dora M. of Missouri. This volume folds those chats into one narrative. The case dossier remains the working file; this book is the public reading of it. Sibling work on Greene ED 37 through 41 is now on merged PR #26 through Pass 59; remaining Greene ED 38 B-sides, 1900 Liberty, and 1900 hh 85 are inventoried, not duplicated. Do not import their “Dora E. Stone” as this woman.</w:t>
       </w:r>
     </w:p>
     <w:p>
@@ -103,6 +103,29 @@
     </w:p>
     <w:p>
       <w:r>
+        <w:t xml:space="preserve">On the next sheet of that Travellers Rest original, dwelling 134 is </w:t>
+      </w:r>
+      <w:r>
+        <w:rPr>
+          <w:b/>
+        </w:rPr>
+        <w:t>Harrison Newman</w:t>
+      </w:r>
+      <w:r>
+        <w:t xml:space="preserve">, fifty-three, with Susan, forty-seven, and eight children from John, eighteen, down to twins Hiram and Sarah, two. That is the 1860 H.H. house, proven. There is no Henry of twenty-five in it. [C542] [C543] [C544] On 8 August 1870 a </w:t>
+      </w:r>
+      <w:r>
+        <w:rPr>
+          <w:b/>
+        </w:rPr>
+        <w:t>Henry Newman</w:t>
+      </w:r>
+      <w:r>
+        <w:t>, twenty-four, worked in a coal mine in the Town of Beattyville with Mary, twenty-three, Ellen, five, Millia, three, and infant John. That house is the 1880 Buck Creek couple, proven. Identity with the 1860 boy remains probable, not proved. Millia, three, is not Millie Tincher. [C550] [C551] [C552] [C555]</w:t>
+      </w:r>
+    </w:p>
+    <w:p>
+      <w:r>
         <w:t>A compiled Boone descent through Leah Scholl sits on WikiTree and on cemetery markers. This case has not independently re-proved those steps. They stay speculative.</w:t>
       </w:r>
     </w:p>
@@ -891,7 +914,16 @@
         <w:t>Jessee Caster</w:t>
       </w:r>
       <w:r>
-        <w:t xml:space="preserve">, not Easters. [C493] [C494] [C500] An Owsley death-certificate extract for 1916 names </w:t>
+        <w:t xml:space="preserve">, not Easters. [C493] [C494] [C500] On 17 June 1870, on the sheet after Elias’s Travellers Rest original, dwelling 134 is </w:t>
+      </w:r>
+      <w:r>
+        <w:rPr>
+          <w:b/>
+        </w:rPr>
+        <w:t>Harrison Newman</w:t>
+      </w:r>
+      <w:r>
+        <w:t xml:space="preserve">, fifty-three, with Susan, forty-seven, and eight children from John, eighteen, down to twins Hiram and Sarah, two. That is the 1860 H.H. house, proven. There is no Henry of twenty-five in it. [C542] [C543] [C544] An Owsley death-certificate extract for 1916 names </w:t>
       </w:r>
       <w:r>
         <w:rPr>
@@ -2653,6 +2685,14 @@
       </w:pPr>
       <w:r>
         <w:t>The original 1932 Lee death certificate, volume 20, number 9525, and the original 1916 Owsley certificate, volume 44, number 21663. The 1916 extracts leave the parent cells blank.</w:t>
+      </w:r>
+    </w:p>
+    <w:p>
+      <w:pPr>
+        <w:pStyle w:val="ListBullet"/>
+      </w:pPr>
+      <w:r>
+        <w:t>The original 1880 Buck Creek schedule for Henry Newnam, thirty-four, whose 1870 Beattyville house is now on the film.</w:t>
       </w:r>
     </w:p>
     <w:p>

</xml_diff>

<commit_message>
Pass 54: 1880 Buck Creek original of Henry 34 (T9-438 p.9)
Isolate Owsley ED 80 Page 9 (stamp 309, 8 Jun 1880) on NARA T9-438:
Newman, Henry, 34, farm laborer, with Mary (father England), Ellen F.,
Milla A., Chalista, Laura B., and Arthur. Proves the 1870 Beattyville
house; identity with 1860 H.H. 15 remains probable.

Co-authored-by: CatCorner22 <CatCorner22@users.noreply.github.com>
</commit_message>
<xml_diff>
--- a/research/dora-ella-newnam/book/Dora-Ella-Newnam-Stone-A-Life.docx
+++ b/research/dora-ella-newnam/book/Dora-Ella-Newnam-Stone-A-Life.docx
@@ -121,7 +121,16 @@
         <w:t>Henry Newman</w:t>
       </w:r>
       <w:r>
-        <w:t>, twenty-four, worked in a coal mine in the Town of Beattyville with Mary, twenty-three, Ellen, five, Millia, three, and infant John. That house is the 1880 Buck Creek couple, proven. Identity with the 1860 boy remains probable, not proved. Millia, three, is not Millie Tincher. [C550] [C551] [C552] [C555]</w:t>
+        <w:t xml:space="preserve">, twenty-four, worked in a coal mine in the Town of Beattyville with Mary, twenty-three, Ellen, five, Millia, three, and infant John. That house is the 1880 Buck Creek couple, proven. On 8 June 1880 the original Buck Creek schedule — Owsley district 80, page 9 — lists </w:t>
+      </w:r>
+      <w:r>
+        <w:rPr>
+          <w:b/>
+        </w:rPr>
+        <w:t>Newman, Henry</w:t>
+      </w:r>
+      <w:r>
+        <w:t>, thirty-four, a farm labourer, with Mary, thirty-three, whose father was born in England, Ellen F., fourteen, Milla A., twelve, Chalista, seven, Laura B., four, and Arthur, two. The enumerator wrote Newman, not Newnam. Identity with the 1860 boy remains probable, not proved. Millia, three, is not Millie Tincher. Infant John of 1870 is not in the 1880 house. [C550] [C551] [C552] [C555] [C561] [C562] [C563]</w:t>
       </w:r>
     </w:p>
     <w:p>
@@ -2685,14 +2694,6 @@
       </w:pPr>
       <w:r>
         <w:t>The original 1932 Lee death certificate, volume 20, number 9525, and the original 1916 Owsley certificate, volume 44, number 21663. The 1916 extracts leave the parent cells blank.</w:t>
-      </w:r>
-    </w:p>
-    <w:p>
-      <w:pPr>
-        <w:pStyle w:val="ListBullet"/>
-      </w:pPr>
-      <w:r>
-        <w:t>The original 1880 Buck Creek schedule for Henry Newnam, thirty-four, whose 1870 Beattyville house is now on the film.</w:t>
       </w:r>
     </w:p>
     <w:p>

</xml_diff>

<commit_message>
Pass 55: 1840 Estill original — Tincher heads, no Newman head
Warren Lewis Estill name pages (M704-109) show John and Christian Tincher as young heads. No Newman or Elias Tincher named head. Recap 5535. A first-pass William Tincher is William Newton. Original 1932 DC and 1840 bond still unseen.

Co-authored-by: CatCorner22 <CatCorner22@users.noreply.github.com>
</commit_message>
<xml_diff>
--- a/research/dora-ella-newnam/book/Dora-Ella-Newnam-Stone-A-Life.docx
+++ b/research/dora-ella-newnam/book/Dora-Ella-Newnam-Stone-A-Life.docx
@@ -41,7 +41,7 @@
     </w:p>
     <w:p>
       <w:r>
-        <w:t>Eighty-two Cursor chats on this repository were reviewed for this volume (primary research, helpers, scans, and failed browser hunts). The original mobile session opened the case and read the Arkansas death certificate the family still holds. Later sessions recovered the 1880 childhood schedule that free transcripts had missed, walked statewide Soundex reels for 1910 and 1920, tested a Peebles third-marriage hypothesis and set it aside, and photographed NARA microfilm frames — the 1880 childhood schedule, the 1910 Kentucky Ella Miracode plates, Hardin Gray on Sturgeon sheet 13 B, the 1860 Owsley original of Silas Gray’s house with William aged thirteen, the 1850 Owsley Gray pages that are other men (Thomas, James, John, Charles), the given-name Silas plates that are other boys (Ratliff eight months, Wilson six, Phillips fifteen) and the Bowman line first read as Cyrus and then as Squire, the 1850 Estill Marcus Gray original, Breathitt’s Taulbee infant Silas and Bryant Siras, and Madison’s John Green house with Silas Green aged twenty, the 1850 Owsley Harrison Newman house with an eight-year-old Elias who is probably Dora’s father — a 1932 death extract names Henry Harrison Newnam as that father — and is not merged as proven, the 1860 Booneville original of that house under H.H. Newman with Elias aged eighteen, the 1850 William Newman house of twenty-six on the same page, the 1850 John Newman of sixty born in Tennessee who is not the 1880 John of sixty-nine, and Andrew Mays’s Giles at one month in 1850 and eleven in 1860, the 1870 Proctor original of James Brandenburg’s house, Silas Gray’s Sturgeon original, the 1880 District 59 originals of William next door to John Newnam and of Silas still in the district, the 1900 William Gray dwelling-84 crop, and the Bollinger page a sibling had labelled “Dora E. Stone,” which is Henry C. Rhodes and Dora M. of Missouri. This volume folds those chats into one narrative. The case dossier remains the working file; this book is the public reading of it. Sibling work on Greene ED 37 through 41 is now on merged PR #26 through Pass 59; remaining Greene ED 38 B-sides, 1900 Liberty, and 1900 hh 85 are inventoried, not duplicated. Do not import their “Dora E. Stone” as this woman.</w:t>
+        <w:t>Eighty-four Cursor chats on this repository were reviewed for this volume (primary research, helpers, scans, and failed browser hunts). The original mobile session opened the case and read the Arkansas death certificate the family still holds. Later sessions recovered the 1880 childhood schedule that free transcripts had missed, walked statewide Soundex reels for 1910 and 1920, tested a Peebles third-marriage hypothesis and set it aside, and photographed NARA microfilm frames — the 1880 childhood schedule, the 1910 Kentucky Ella Miracode plates, Hardin Gray on Sturgeon sheet 13 B, the 1860 Owsley original of Silas Gray’s house with William aged thirteen, the 1850 Owsley Gray pages that are other men (Thomas, James, John, Charles), the given-name Silas plates that are other boys (Ratliff eight months, Wilson six, Phillips fifteen) and the Bowman line first read as Cyrus and then as Squire, the 1850 Estill Marcus Gray original, Breathitt’s Taulbee infant Silas and Bryant Siras, and Madison’s John Green house with Silas Green aged twenty, the 1850 Owsley Harrison Newman house with an eight-year-old Elias who is probably Dora’s father — a 1932 death extract names Henry Harrison Newnam as that father — and is not merged as proven, the 1860 Booneville original of that house under H.H. Newman with Elias aged eighteen, the 1850 William Newman house of twenty-six on the same page, the 1850 John Newman of sixty born in Tennessee who is not the 1880 John of sixty-nine, and Andrew Mays’s Giles at one month in 1850 and eleven in 1860, the 1870 Proctor original of James Brandenburg’s house, Silas Gray’s Sturgeon original, the 1880 District 59 originals of William next door to John Newnam and of Silas still in the district, the 1900 William Gray dwelling-84 crop, and the Bollinger page a sibling had labelled “Dora E. Stone,” which is Henry C. Rhodes and Dora M. of Missouri. This volume folds those chats into one narrative. The case dossier remains the working file; this book is the public reading of it. Sibling work on Greene ED 37 through 41 is now on merged PR #26 through Pass 59; remaining Greene ED 38 B-sides, 1900 Liberty, and 1900 hh 85 are inventoried, not duplicated. Do not import their “Dora E. Stone” as this woman.</w:t>
       </w:r>
     </w:p>
     <w:p>
@@ -842,7 +842,34 @@
         <w:t>Elias T. Newnam</w:t>
       </w:r>
       <w:r>
-        <w:t xml:space="preserve">, 1842 to 18 April 1932. Parent lines on the annotated copy are the transcriber’s notes, not a second original. Kentucky’s 1918 death index has no matching Lee row. The date stays in conflict. [C516] [C517] [C518] [C519] [C520] Estill’s published “marriages to 1850” pages, opened through the Wayback Machine, actually stop at 1825. They do not contain a 27 February 1840 Newman–Tincher licence. That authored wedding stays unproved. [C522] [C511] A Genealogy.com Tincher Tribe post dates the same marriage “about 1839” and says a cousin saw a permission naming Belinda. WikiTree still prints 27 February 1840. Neither is the bond. Do not average the two dates. [C535] Burns’s Estill compilation, the Kentucky Historical Society’s 1840–1844 reel, and the state archives’ 1808–1868 bonds exist; they have not been opened from this workspace. [C536] Two dwellings above in 1850, </w:t>
+        <w:t xml:space="preserve">, 1842 to 18 April 1932. Parent lines on the annotated copy are the transcriber’s notes, not a second original. Kentucky’s 1918 death index has no matching Lee row. The date stays in conflict. [C516] [C517] [C518] [C519] [C520] Estill’s published “marriages to 1850” pages, opened through the Wayback Machine, actually stop at 1825. They do not contain a 27 February 1840 Newman–Tincher licence. That authored wedding stays unproved. [C522] [C511] A Genealogy.com Tincher Tribe post dates the same marriage “about 1839” and says a cousin saw a permission naming Belinda. WikiTree still prints 27 February 1840. Neither is the bond. Do not average the two dates. [C535] Burns’s Estill compilation, the Kentucky Historical Society’s 1840–1844 reel, and the state archives’ 1808–1868 bonds exist; they have not been opened from this workspace. [C536] A KY Footsteps “1808–1851” file is C-groom surnames only — another coverage hole, not a nil. [C573] The 1840 Estill population schedule *has* been seen. On Warren Lewis’s name pages, </w:t>
+      </w:r>
+      <w:r>
+        <w:rPr>
+          <w:b/>
+        </w:rPr>
+        <w:t>John Tincher</w:t>
+      </w:r>
+      <w:r>
+        <w:t xml:space="preserve"> and </w:t>
+      </w:r>
+      <w:r>
+        <w:rPr>
+          <w:b/>
+        </w:rPr>
+        <w:t>Christian Tincher</w:t>
+      </w:r>
+      <w:r>
+        <w:t xml:space="preserve"> are young heads — each a man of twenty to thirty, not a father of fifty — and are not merged as brothers of the authored Belinda. [C567] [C568] There is no Newman or Newnam head on those pages, and no Elias Tincher head. [C569] [C570] J.G. Riddle’s county recap states 5,535 inhabitants. [C571] A line first read as William Tincher is </w:t>
+      </w:r>
+      <w:r>
+        <w:rPr>
+          <w:b/>
+        </w:rPr>
+        <w:t>William Newton</w:t>
+      </w:r>
+      <w:r>
+        <w:t xml:space="preserve">. [C572] The original 1932 certificate remains unread. Do not promote that identity to proved. [C576] [C509] Two dwellings above in 1850, </w:t>
       </w:r>
       <w:r>
         <w:rPr>

</xml_diff>

<commit_message>
Pass 56: 1840 Clay original — 23 name pages, no Newman/Tincher head
Image-read all 23 Clay County name pages on NARA M704-108 (IA populationsc18400108unit). Nil Newman/Tincher named heads. Recap overlay 0127 lists pages 1–23. McIlvain overlay 0084 is not Edmonson published page 84. Do not promote C509.

Co-authored-by: CatCorner22 <CatCorner22@users.noreply.github.com>
</commit_message>
<xml_diff>
--- a/research/dora-ella-newnam/book/Dora-Ella-Newnam-Stone-A-Life.docx
+++ b/research/dora-ella-newnam/book/Dora-Ella-Newnam-Stone-A-Life.docx
@@ -135,6 +135,38 @@
     </w:p>
     <w:p>
       <w:r>
+        <w:t xml:space="preserve">Thirty years before that Travellers Rest sheet, the 1840 Estill original lists young heads </w:t>
+      </w:r>
+      <w:r>
+        <w:rPr>
+          <w:b/>
+        </w:rPr>
+        <w:t>John Tincher</w:t>
+      </w:r>
+      <w:r>
+        <w:t xml:space="preserve"> and </w:t>
+      </w:r>
+      <w:r>
+        <w:rPr>
+          <w:b/>
+        </w:rPr>
+        <w:t>Christian Tincher</w:t>
+      </w:r>
+      <w:r>
+        <w:t xml:space="preserve"> — men in their twenties, not a man of fifty — and no named Newman or Elias Tincher head on Warren Lewis’s pages. A first-pass William Tincher on that film is </w:t>
+      </w:r>
+      <w:r>
+        <w:rPr>
+          <w:b/>
+        </w:rPr>
+        <w:t>William Newton</w:t>
+      </w:r>
+      <w:r>
+        <w:t>. Clay County’s original, twenty-three name pages, likewise has no Newman or Tincher head; the recap is labelled Recapitulation of Clay County, pages 1–23. Four Smallwood heads in Clay are not merged as Mary Ann’s kin. The enumerator after Estill’s recap, Andrew McIlvain, is not Edmonson’s published page 84. The authored 27 February 1840 Newman–Tincher bond remains unseen. Do not promote the 1932 extract’s father to proved. [C567] [C568] [C569] [C570] [C572] [C579] [C580] [C581] [C582] [C509]</w:t>
+      </w:r>
+    </w:p>
+    <w:p>
+      <w:r>
         <w:t>A compiled Boone descent through Leah Scholl sits on WikiTree and on cemetery markers. This case has not independently re-proved those steps. They stay speculative.</w:t>
       </w:r>
     </w:p>
@@ -2728,7 +2760,7 @@
         <w:pStyle w:val="ListBullet"/>
       </w:pPr>
       <w:r>
-        <w:t>The Estill Newman–Tincher bond, 1826–1850. Published “to 1850” web files stop at 1825.</w:t>
+        <w:t>The Estill Newman–Tincher bond, 1826–1850. Published “to 1850” web files stop at 1825. The 1840 Estill and Clay census originals are now seen; they do not name a Newman head. Breathitt 1840 remains unread.</w:t>
       </w:r>
     </w:p>
     <w:p>

</xml_diff>

<commit_message>
Pass 57: 1840 Breathitt original — 12 name pages, no Newman/Tincher head
Image-read all 12 Breathitt County name pages on NARA M704-105 (IA populationsc18400105unit, even leaves 132–154). Nil Newman/Tincher named heads. Recap Abstract has 11 rows; certification dated 13 Nov 1840. John Bowman is not Newman. Do not promote C509.

Co-authored-by: CatCorner22 <CatCorner22@users.noreply.github.com>
</commit_message>
<xml_diff>
--- a/research/dora-ella-newnam/book/Dora-Ella-Newnam-Stone-A-Life.docx
+++ b/research/dora-ella-newnam/book/Dora-Ella-Newnam-Stone-A-Life.docx
@@ -162,7 +162,7 @@
         <w:t>William Newton</w:t>
       </w:r>
       <w:r>
-        <w:t>. Clay County’s original, twenty-three name pages, likewise has no Newman or Tincher head; the recap is labelled Recapitulation of Clay County, pages 1–23. Four Smallwood heads in Clay are not merged as Mary Ann’s kin. The enumerator after Estill’s recap, Andrew McIlvain, is not Edmonson’s published page 84. The authored 27 February 1840 Newman–Tincher bond remains unseen. Do not promote the 1932 extract’s father to proved. [C567] [C568] [C569] [C570] [C572] [C579] [C580] [C581] [C582] [C509]</w:t>
+        <w:t>. Clay County’s original, twenty-three name pages, likewise has no Newman or Tincher head; the recap is labelled Recapitulation of Clay County, pages 1–23. Breathitt’s original, twelve name pages, is the same nil; a John Bowman on the first Breathitt page is not a Newman. Four Smallwood heads in Clay are not merged as Mary Ann’s kin. The enumerator after Estill’s recap, Andrew McIlvain, is not Edmonson’s published page 84. The authored 27 February 1840 Newman–Tincher bond remains unseen. Do not promote the 1932 extract’s father to proved. [C567] [C568] [C569] [C570] [C572] [C579] [C580] [C581] [C582] [C584] [C585] [C509]</w:t>
       </w:r>
     </w:p>
     <w:p>
@@ -2760,7 +2760,7 @@
         <w:pStyle w:val="ListBullet"/>
       </w:pPr>
       <w:r>
-        <w:t>The Estill Newman–Tincher bond, 1826–1850. Published “to 1850” web files stop at 1825. The 1840 Estill and Clay census originals are now seen; they do not name a Newman head. Breathitt 1840 remains unread.</w:t>
+        <w:t>The Estill Newman–Tincher bond, 1826–1850. Published “to 1850” web files stop at 1825. The 1840 Estill, Clay, and Breathitt census originals are now seen; they do not name a Newman head.</w:t>
       </w:r>
     </w:p>
     <w:p>

</xml_diff>

<commit_message>
Dora pass 60–61: close Greene ED 38, copy Word bio, expand cited life
Close the Greene 37–43 Stone sweep (C281). Copy the latest Word biography
with SHA-256 provenance. Add Beattyville press (Doll 1928/1932), Carter Cove
compiled rows, Lee Book 23 Clay × Ladona (15 Mar 1932), and Everett 1939
obituary. Expand the full biography with TOC, numbered footnotes/URLs, and
source index. Add project genealogy subagent; Agent SDK GitHub channel is n/a.

Co-authored-by: blakereaganlaw <blakereaganlaw@gmail.com>
</commit_message>
<xml_diff>
--- a/research/dora-ella-newnam/book/Dora-Ella-Newnam-Stone-A-Life.docx
+++ b/research/dora-ella-newnam/book/Dora-Ella-Newnam-Stone-A-Life.docx
@@ -18,7 +18,85 @@
         <w:rPr>
           <w:i/>
         </w:rPr>
-        <w:t>A documented life, 1871–1926. Compiled from every research chat in this project, 27–29 October 2026. Living descendants are not named. Facts below the line of proof are labelled in the text. Nothing here is family lore presented as fact.</w:t>
+        <w:t>A documented life, 1871–1926. Compiled from every research chat in this project, 27–30 October 2026. Living descendants are not named. Facts below the line of proof are labelled in the text. Nothing here is family lore presented as fact.</w:t>
+      </w:r>
+    </w:p>
+    <w:p>
+      <w:pPr>
+        <w:pStyle w:val="Heading1"/>
+      </w:pPr>
+      <w:r>
+        <w:t>Table of contents</w:t>
+      </w:r>
+    </w:p>
+    <w:p>
+      <w:r>
+        <w:t>1. [Preface](#preface)</w:t>
+      </w:r>
+    </w:p>
+    <w:p>
+      <w:r>
+        <w:t>2. [Chapter 1. The girl on Sturgeon Creek](#chapter-1-the-girl-on-sturgeon-creek)</w:t>
+      </w:r>
+    </w:p>
+    <w:p>
+      <w:r>
+        <w:t>3. [Chapter 2. Thursday at Doll Newnam’s](#chapter-2-thursday-at-doll-newnams)</w:t>
+      </w:r>
+    </w:p>
+    <w:p>
+      <w:r>
+        <w:t>4. [Chapter 3. Seven born, five living](#chapter-3-seven-born-five-living)</w:t>
+      </w:r>
+    </w:p>
+    <w:p>
+      <w:r>
+        <w:t>5. [Places: 1900 to death](#places-1900-to-death)</w:t>
+      </w:r>
+    </w:p>
+    <w:p>
+      <w:r>
+        <w:t>6. [Chapter 4. The years the census lost](#chapter-4-the-years-the-census-lost)</w:t>
+      </w:r>
+    </w:p>
+    <w:p>
+      <w:r>
+        <w:t>7. [Chapter 5. Arkansas, and the name Stone](#chapter-5-arkansas-and-the-name-stone)</w:t>
+      </w:r>
+    </w:p>
+    <w:p>
+      <w:r>
+        <w:t>8. [Chapter 6. Noon, Monday, 23 August 1926](#chapter-6-noon-monday-23-august-1926)</w:t>
+      </w:r>
+    </w:p>
+    <w:p>
+      <w:r>
+        <w:t>9. [Chapter 7. After she was gone — Beattyville paper, Greene sweep, FAN](#chapter-7-after-she-was-gone--beattyville-paper-greene-sweep-fan)</w:t>
+      </w:r>
+    </w:p>
+    <w:p>
+      <w:r>
+        <w:t>10. [The children, in brief](#the-children-in-brief)</w:t>
+      </w:r>
+    </w:p>
+    <w:p>
+      <w:r>
+        <w:t>11. [How to read the plates](#how-to-read-the-plates)</w:t>
+      </w:r>
+    </w:p>
+    <w:p>
+      <w:r>
+        <w:t>12. [What remains open](#what-remains-open)</w:t>
+      </w:r>
+    </w:p>
+    <w:p>
+      <w:r>
+        <w:t>13. [Footnotes](#footnotes)</w:t>
+      </w:r>
+    </w:p>
+    <w:p>
+      <w:r>
+        <w:t>14. [Source index](#source-index)</w:t>
       </w:r>
     </w:p>
     <w:p>
@@ -1963,7 +2041,16 @@
         <w:t>40</w:t>
       </w:r>
       <w:r>
-        <w:t xml:space="preserve"> (ward 3, PDF p.58–97) is likewise nil for a Stone household. [C278] A Dora I. Sullivan on ED 40 sheet 16A is forty-three, born December 1856 in Illinois, married eighteen years to Jerry Sullivan of Ohio, with no children — not her. [L340] Every A-side of ED </w:t>
+        <w:t xml:space="preserve"> (ward 3, PDF p.58–97) is likewise nil for a Stone household. [C278] A Dora I. Sullivan on ED 40 sheet 16A is forty-three, born December 1856 in Illinois, married eighteen years to Jerry Sullivan of Ohio, with no children — not her. [L340] Every A-side </w:t>
+      </w:r>
+      <w:r>
+        <w:rPr>
+          <w:b/>
+        </w:rPr>
+        <w:t>and</w:t>
+      </w:r>
+      <w:r>
+        <w:t xml:space="preserve"> B-side of ED </w:t>
       </w:r>
       <w:r>
         <w:rPr>
@@ -1972,7 +2059,43 @@
         <w:t>38</w:t>
       </w:r>
       <w:r>
-        <w:t xml:space="preserve"> is now nil for a Stone head; the B-sides of that ED remain unread. [C280] A Dora on ED 43 sheet 1A is </w:t>
+        <w:t xml:space="preserve"> is now nil for a Stone, Newnam, or Dora household. Combined with Greene </w:t>
+      </w:r>
+      <w:r>
+        <w:rPr>
+          <w:b/>
+        </w:rPr>
+        <w:t>37–43</w:t>
+      </w:r>
+      <w:r>
+        <w:t xml:space="preserve">, the only Stone </w:t>
+      </w:r>
+      <w:r>
+        <w:rPr>
+          <w:b/>
+        </w:rPr>
+        <w:t>head</w:t>
+      </w:r>
+      <w:r>
+        <w:t xml:space="preserve"> in that band is Thomas A. on ED </w:t>
+      </w:r>
+      <w:r>
+        <w:rPr>
+          <w:b/>
+        </w:rPr>
+        <w:t>37</w:t>
+      </w:r>
+      <w:r>
+        <w:t xml:space="preserve"> sheet 18A — </w:t>
+      </w:r>
+      <w:r>
+        <w:rPr>
+          <w:b/>
+        </w:rPr>
+        <w:t>not merged</w:t>
+      </w:r>
+      <w:r>
+        <w:t xml:space="preserve">. [C280] [C281] A Dora on ED 43 sheet 1A is </w:t>
       </w:r>
       <w:r>
         <w:rPr>
@@ -2195,17 +2318,85 @@
         <w:t>C129</w:t>
       </w:r>
       <w:r>
-        <w:t>), not vital records, but they align with the certificate and the copyists’ lines. No photograph of either stone is in the case file.</w:t>
+        <w:t xml:space="preserve">), not vital records, but they align with the certificate and the copyists’ lines. The compiled yellcountyobits cemetery index (extract dated 29 January 2013), captured 30 October 2026, repeats the same two rows: </w:t>
+      </w:r>
+      <w:r>
+        <w:rPr>
+          <w:b/>
+        </w:rPr>
+        <w:t>Newman, Dora | no dates | Carter Cove Cemetery, Plainview</w:t>
+      </w:r>
+      <w:r>
+        <w:t xml:space="preserve"> and </w:t>
+      </w:r>
+      <w:r>
+        <w:rPr>
+          <w:b/>
+        </w:rPr>
+        <w:t>Stone, Thomas | 1845 | 1925 | Carter Cove Cemetery, Plainview</w:t>
+      </w:r>
+      <w:r>
+        <w:t>. [C282] [C283] [S268] [S269] No photograph of either stone is in the case file.</w:t>
       </w:r>
     </w:p>
     <w:p>
       <w:r>
-        <w:t>The *Yell County Journal* at Ola for late August and early September 1926 has not been read. Neither has the *Beattyville Enterprise* for the same weeks. An obituary, if one ran, would be the kin list this biography still lacks.</w:t>
+        <w:t xml:space="preserve">The *Yell County Journal* at Ola for late August and early September 1926 has not been read. The only free *Beattyville Enterprise* issues on Internet Archive item `beatty` are six numbers from 1924, 1925, 1928, and 1932 — </w:t>
+      </w:r>
+      <w:r>
+        <w:rPr>
+          <w:b/>
+        </w:rPr>
+        <w:t>1926 is not among them</w:t>
+      </w:r>
+      <w:r>
+        <w:t xml:space="preserve">. [C293] University of Kentucky’s film catalog lists 1909–1911, 1915, 1924–1925, 1928, and 1932 — again </w:t>
+      </w:r>
+      <w:r>
+        <w:rPr>
+          <w:b/>
+        </w:rPr>
+        <w:t>no 1926</w:t>
+      </w:r>
+      <w:r>
+        <w:t xml:space="preserve">. [S271] Internet Archive Solr returned </w:t>
+      </w:r>
+      <w:r>
+        <w:rPr>
+          <w:b/>
+        </w:rPr>
+        <w:t>zero</w:t>
+      </w:r>
+      <w:r>
+        <w:t xml:space="preserve"> items for *Yell County Journal* 1926 and </w:t>
+      </w:r>
+      <w:r>
+        <w:rPr>
+          <w:b/>
+        </w:rPr>
+        <w:t>zero</w:t>
+      </w:r>
+      <w:r>
+        <w:t xml:space="preserve"> for a 1926 *Enterprise*. [C301] Genealogy Trails’ Yell obituaries landing has no Stone/Newnam/Dora 1926 hit. [C302] An obituary, if one ran, would be the kin list this biography still lacks. Retrieval path: Newspapers.com *Beattyville Enterprise*; UK microfilm </w:t>
+      </w:r>
+      <w:r>
+        <w:rPr>
+          <w:b/>
+        </w:rPr>
+        <w:t>S 90-033</w:t>
+      </w:r>
+      <w:r>
+        <w:t>; Arkansas State Archives / a Danville or Plainview library for the *Yell County Journal*.</w:t>
       </w:r>
     </w:p>
     <w:p>
       <w:r>
         <w:t>She was fifty-five if she was the eight-year-old of District 59. The certificate called her fifty-eight. The child on sheet 6 is the better witness to her beginning than the grieving son was to a date he never saw.</w:t>
+      </w:r>
+    </w:p>
+    <w:p>
+      <w:r>
+        <w:br w:type="page"/>
       </w:r>
     </w:p>
     <w:p>
@@ -2218,184 +2409,131 @@
         <w:pStyle w:val="Heading1"/>
       </w:pPr>
       <w:r>
-        <w:t>The children, in brief</w:t>
+        <w:t>Chapter 7. After she was gone — Beattyville paper, Greene sweep, FAN</w:t>
       </w:r>
     </w:p>
     <w:p>
       <w:r>
-        <w:t>Two children born to Dora and Samuel died before 1 June 1900. They have no names in any record yet read.</w:t>
+        <w:t xml:space="preserve">Dora had been in the ground two years when the *Beattyville Enterprise* of 30 November 1928 printed a sick-list note: “Uncle Doll Newman has been very sick… not able to be out.” On 1 April 1932 the same paper said E. T. Sparks of Hazard was visiting Uncle Doll Newnam in town. Seventeen days later Elias T. Newnam died on his ninetieth birthday. Nickname, town, and lifespan are two independent identifiers and no contradiction: the man in those notes is </w:t>
+      </w:r>
+      <w:r>
+        <w:rPr>
+          <w:b/>
+        </w:rPr>
+        <w:t>probable</w:t>
+      </w:r>
+      <w:r>
+        <w:t xml:space="preserve"> her father. [C284] [C048] [S270]</w:t>
       </w:r>
     </w:p>
     <w:p>
       <w:r>
-        <w:rPr>
-          <w:b/>
-        </w:rPr>
-        <w:t>McCoy “Coy” Newnam</w:t>
-      </w:r>
-      <w:r>
-        <w:t>, born April 1890, married Letha Viola Sullivan at Ola on 18 February 1917. In 1920 they were at Danville, Yell County. In 1930 they were back in Buck Creek, Owsley County. He is the 1926 informant. Living descendants are not named here.</w:t>
+        <w:t xml:space="preserve">The six free issues do not name Dora Stone, Dora Newnam, or Samuel P. They do name a living Beattyville Newnam cluster that is </w:t>
+      </w:r>
+      <w:r>
+        <w:rPr>
+          <w:b/>
+        </w:rPr>
+        <w:t>not</w:t>
+      </w:r>
+      <w:r>
+        <w:t xml:space="preserve"> silently merged with her household. Rev. Luther Newnam appears as Christian Church pastor in March–April 1932; Lee marriage books 20–24 show him officiating at Beattyville from at least 24 November 1926 through 1933, including 6 April 1932 — </w:t>
+      </w:r>
+      <w:r>
+        <w:rPr>
+          <w:b/>
+        </w:rPr>
+        <w:t>probable</w:t>
+      </w:r>
+      <w:r>
+        <w:t xml:space="preserve"> the same minister, </w:t>
+      </w:r>
+      <w:r>
+        <w:rPr>
+          <w:b/>
+        </w:rPr>
+        <w:t>not</w:t>
+      </w:r>
+      <w:r>
+        <w:t xml:space="preserve"> Samuel (dead by 1910). [C285] [C300] [S282] Everett Newnam of Idamay planned two acres of cane in March 1932; the *Enterprise* of 14 December 1939 reported Everett Newnam, fifty, of Idamay, dead of an accidental pistol discharge on the Heidelberg road — </w:t>
+      </w:r>
+      <w:r>
+        <w:rPr>
+          <w:b/>
+        </w:rPr>
+        <w:t>probable</w:t>
+      </w:r>
+      <w:r>
+        <w:t xml:space="preserve"> the same man (name + Idamay). His three daughters are living and are not named here. [C286] [C299] [S278]</w:t>
       </w:r>
     </w:p>
     <w:p>
       <w:r>
-        <w:rPr>
-          <w:b/>
-        </w:rPr>
-        <w:t>Mary Magdalene Newnam</w:t>
-      </w:r>
-      <w:r>
-        <w:t xml:space="preserve">, June 1892 on the census, 12 June 1893 Beattyville on her Social Security account, later Mary M. Bunch. Marriage and death are not closed in free sources: Lee marriage books have no Bunch row; NUMIDENT lists her </w:t>
-      </w:r>
-      <w:r>
-        <w:rPr>
-          <w:b/>
-        </w:rPr>
-        <w:t>deceased</w:t>
-      </w:r>
-      <w:r>
-        <w:t xml:space="preserve"> but gives </w:t>
-      </w:r>
-      <w:r>
-        <w:rPr>
-          <w:b/>
-        </w:rPr>
-        <w:t>no death date</w:t>
-      </w:r>
-      <w:r>
-        <w:t xml:space="preserve">; the public Social Security Death Index API returned no match for SSN </w:t>
-      </w:r>
-      <w:r>
-        <w:rPr>
-          <w:b/>
-        </w:rPr>
-        <w:t>410-19-2658</w:t>
-      </w:r>
-      <w:r>
-        <w:t>; Tennessee archives and Knox marriage indexes were not reachable from the research VM (</w:t>
-      </w:r>
-      <w:r>
-        <w:rPr>
-          <w:b/>
-        </w:rPr>
-        <w:t>R007</w:t>
-      </w:r>
-      <w:r>
-        <w:t xml:space="preserve">, </w:t>
-      </w:r>
-      <w:r>
-        <w:rPr>
-          <w:b/>
-        </w:rPr>
-        <w:t>L257</w:t>
-      </w:r>
-      <w:r>
-        <w:t>). [C158]</w:t>
+        <w:t xml:space="preserve">On 15 March 1932, at Delvinta, George Botner married Clay Dunigan, twenty-three, of Idamay, son of R. C. Dunigan and Sirena Porter, to Ladona Newman, sixteen, of Delvinta, daughter of </w:t>
+      </w:r>
+      <w:r>
+        <w:rPr>
+          <w:b/>
+        </w:rPr>
+        <w:t>Shelby Newman</w:t>
+      </w:r>
+      <w:r>
+        <w:t xml:space="preserve"> and </w:t>
+      </w:r>
+      <w:r>
+        <w:rPr>
+          <w:b/>
+        </w:rPr>
+        <w:t>Grace Brandenburg</w:t>
+      </w:r>
+      <w:r>
+        <w:t xml:space="preserve">. [C297] [S277] The 1 April paper said Clay and Ladonna had “quietly married last week.” Same names, same month: </w:t>
+      </w:r>
+      <w:r>
+        <w:rPr>
+          <w:b/>
+        </w:rPr>
+        <w:t>probable</w:t>
+      </w:r>
+      <w:r>
+        <w:t xml:space="preserve"> one couple. The bride is </w:t>
+      </w:r>
+      <w:r>
+        <w:rPr>
+          <w:b/>
+        </w:rPr>
+        <w:t>not</w:t>
+      </w:r>
+      <w:r>
+        <w:t xml:space="preserve"> Dora’s child — the license names other parents, and Dora had been dead five and a half years. [C298] Living descendants of that 1932 marriage are withheld.</w:t>
       </w:r>
     </w:p>
     <w:p>
       <w:r>
-        <w:rPr>
-          <w:b/>
-        </w:rPr>
-        <w:t>Pearl P. Newnam</w:t>
-      </w:r>
-      <w:r>
-        <w:t>, 15 March 1895, Banford, later Pearl P. Jackson, died 19 September 1980, Shelby County, Tennessee. The 1910 grandmother household, the 1922 Elizabeth Newnam will, and the NUMIDENT file make her identification the strongest of the five.</w:t>
+        <w:t>Carrie Newman (1898–1915) at Sandlin Cemetery, Ola, fails the same-person test against Dora. [C295] A 1906 Hopkinsville correspondent-column “newnam” and an 1902 Richmond quote from Will Newnam are other men in other counties. [C291] [C292]</w:t>
       </w:r>
     </w:p>
     <w:p>
       <w:r>
-        <w:rPr>
-          <w:b/>
-        </w:rPr>
-        <w:t>Rissa / Rissie</w:t>
-      </w:r>
-      <w:r>
-        <w:t>, May 1897. After the 1900 census she does not reappear on the Kentucky child Soundex pass or in Pearl’s 1910 Owsley household. An unsourced WikiTree profile (</w:t>
-      </w:r>
-      <w:r>
-        <w:rPr>
-          <w:b/>
-        </w:rPr>
-        <w:t>Newnam-46</w:t>
-      </w:r>
-      <w:r>
-        <w:t xml:space="preserve">) names her </w:t>
-      </w:r>
-      <w:r>
-        <w:rPr>
-          <w:b/>
-        </w:rPr>
-        <w:t>Rissie (Newnam) Pelfrey</w:t>
-      </w:r>
-      <w:r>
-        <w:t xml:space="preserve">, born at </w:t>
-      </w:r>
-      <w:r>
-        <w:rPr>
-          <w:b/>
-        </w:rPr>
-        <w:t>Pebworth</w:t>
-      </w:r>
-      <w:r>
-        <w:t xml:space="preserve">, died </w:t>
-      </w:r>
-      <w:r>
-        <w:rPr>
-          <w:b/>
-        </w:rPr>
-        <w:t>13 May 1980</w:t>
-      </w:r>
-      <w:r>
-        <w:t xml:space="preserve"> in </w:t>
-      </w:r>
-      <w:r>
-        <w:rPr>
-          <w:b/>
-        </w:rPr>
-        <w:t>Knoxville, Tennessee</w:t>
-      </w:r>
-      <w:r>
-        <w:t xml:space="preserve">, with </w:t>
-      </w:r>
-      <w:r>
-        <w:rPr>
-          <w:b/>
-        </w:rPr>
-        <w:t>Samuel Parriott Newnam</w:t>
-      </w:r>
-      <w:r>
-        <w:t xml:space="preserve"> as father — a </w:t>
-      </w:r>
-      <w:r>
-        <w:rPr>
-          <w:b/>
-        </w:rPr>
-        <w:t>possible</w:t>
-      </w:r>
-      <w:r>
-        <w:t xml:space="preserve"> lead only, not printed here as proved death. [C230] Free Tennessee death and obituary indexes searched from this case did not independently confirm that row. [C231] Lee Marriage Books 5–15 have no Rissie or Rissa Newnam bride; a 1920 Rissa Newton, seventeen, is a different woman. [C134] A Rissie Pelfrey Maxey born 1882 is a different woman.</w:t>
-      </w:r>
-    </w:p>
-    <w:p>
-      <w:r>
-        <w:rPr>
-          <w:b/>
-        </w:rPr>
-        <w:t>John H. Newnam</w:t>
-      </w:r>
-      <w:r>
-        <w:t xml:space="preserve">, August 1899. Herbert Newman of Lee County, Virginia, was rejected. The Kentucky statewide death index (Reclaim The Records, 1911–1990) has no John H. Newnam death in Lee consistent with an August 1899 birth. [C234] [C237] [C238] Lee Marriage Book 12 has a different </w:t>
-      </w:r>
-      <w:r>
-        <w:rPr>
-          <w:b/>
-        </w:rPr>
-        <w:t>John Newnam</w:t>
-      </w:r>
-      <w:r>
-        <w:t>, age twenty-five in 1917, son of John and Serilda — rejected. [C239] Genealogy Trails’ Lee County WWI draft transcript (1,126 cards) lists no Newnam, Newman, or McCoy registrant; other men born in 1899 appear on the September 1918 Beattyville board, but not John under that surname. [C240] [C241] [S248] A cross-border free transcript pass (Owsley, Estill, Arkansas Perry/Yell, Knox KYGenWeb, Missouri Digital Heritage WWI biographies) also returned no Newnam/Newman draft row. [C242] [S249] NARA M1509 / FamilySearch card images have not been read in this case.</w:t>
+        <w:t xml:space="preserve">The Greene County, Missouri, 1900 hunt for a second Thomas A. Stone household is finished on free film. Enumeration districts 37 through 43 — every A-side and every B-side — have been read from NARA T623-855/856. The only Stone </w:t>
+      </w:r>
+      <w:r>
+        <w:rPr>
+          <w:b/>
+        </w:rPr>
+        <w:t>head</w:t>
+      </w:r>
+      <w:r>
+        <w:t xml:space="preserve"> in that band remains Thomas A., thirty-two, with Matilda and Gertrude, on ED 37 sheet 18A, 27 June 1900. He is still </w:t>
+      </w:r>
+      <w:r>
+        <w:rPr>
+          <w:b/>
+        </w:rPr>
+        <w:t>not merged</w:t>
+      </w:r>
+      <w:r>
+        <w:t xml:space="preserve"> with the 1920 Perry County widower. [C281] [C117]</w:t>
       </w:r>
     </w:p>
     <w:p>
@@ -2408,6 +2546,196 @@
         <w:pStyle w:val="Heading1"/>
       </w:pPr>
       <w:r>
+        <w:t>The children, in brief</w:t>
+      </w:r>
+    </w:p>
+    <w:p>
+      <w:r>
+        <w:t>Two children born to Dora and Samuel died before 1 June 1900. They have no names in any record yet read.</w:t>
+      </w:r>
+    </w:p>
+    <w:p>
+      <w:r>
+        <w:rPr>
+          <w:b/>
+        </w:rPr>
+        <w:t>McCoy “Coy” Newnam</w:t>
+      </w:r>
+      <w:r>
+        <w:t>, born April 1890, married Letha Viola Sullivan at Ola on 18 February 1917. In 1920 they were at Danville, Yell County. In 1930 they were back in Buck Creek, Owsley County. He is the 1926 informant. Living descendants are not named here.</w:t>
+      </w:r>
+    </w:p>
+    <w:p>
+      <w:r>
+        <w:rPr>
+          <w:b/>
+        </w:rPr>
+        <w:t>Mary Magdalene Newnam</w:t>
+      </w:r>
+      <w:r>
+        <w:t xml:space="preserve">, June 1892 on the census, 12 June 1893 Beattyville on her Social Security account, later Mary M. Bunch. Marriage and death are not closed in free sources: Lee marriage books have no Bunch row; NUMIDENT lists her </w:t>
+      </w:r>
+      <w:r>
+        <w:rPr>
+          <w:b/>
+        </w:rPr>
+        <w:t>deceased</w:t>
+      </w:r>
+      <w:r>
+        <w:t xml:space="preserve"> but gives </w:t>
+      </w:r>
+      <w:r>
+        <w:rPr>
+          <w:b/>
+        </w:rPr>
+        <w:t>no death date</w:t>
+      </w:r>
+      <w:r>
+        <w:t xml:space="preserve">; the public Social Security Death Index API returned no match for SSN </w:t>
+      </w:r>
+      <w:r>
+        <w:rPr>
+          <w:b/>
+        </w:rPr>
+        <w:t>410-19-2658</w:t>
+      </w:r>
+      <w:r>
+        <w:t>; Tennessee archives and Knox marriage indexes were not reachable from the research VM (</w:t>
+      </w:r>
+      <w:r>
+        <w:rPr>
+          <w:b/>
+        </w:rPr>
+        <w:t>R007</w:t>
+      </w:r>
+      <w:r>
+        <w:t xml:space="preserve">, </w:t>
+      </w:r>
+      <w:r>
+        <w:rPr>
+          <w:b/>
+        </w:rPr>
+        <w:t>L257</w:t>
+      </w:r>
+      <w:r>
+        <w:t>). [C158]</w:t>
+      </w:r>
+    </w:p>
+    <w:p>
+      <w:r>
+        <w:rPr>
+          <w:b/>
+        </w:rPr>
+        <w:t>Pearl P. Newnam</w:t>
+      </w:r>
+      <w:r>
+        <w:t>, 15 March 1895, Banford, later Pearl P. Jackson, died 19 September 1980, Shelby County, Tennessee. The 1910 grandmother household, the 1922 Elizabeth Newnam will, and the NUMIDENT file make her identification the strongest of the five.</w:t>
+      </w:r>
+    </w:p>
+    <w:p>
+      <w:r>
+        <w:rPr>
+          <w:b/>
+        </w:rPr>
+        <w:t>Rissa / Rissie</w:t>
+      </w:r>
+      <w:r>
+        <w:t>, May 1897. After the 1900 census she does not reappear on the Kentucky child Soundex pass or in Pearl’s 1910 Owsley household. An unsourced WikiTree profile (</w:t>
+      </w:r>
+      <w:r>
+        <w:rPr>
+          <w:b/>
+        </w:rPr>
+        <w:t>Newnam-46</w:t>
+      </w:r>
+      <w:r>
+        <w:t xml:space="preserve">) names her </w:t>
+      </w:r>
+      <w:r>
+        <w:rPr>
+          <w:b/>
+        </w:rPr>
+        <w:t>Rissie (Newnam) Pelfrey</w:t>
+      </w:r>
+      <w:r>
+        <w:t xml:space="preserve">, born at </w:t>
+      </w:r>
+      <w:r>
+        <w:rPr>
+          <w:b/>
+        </w:rPr>
+        <w:t>Pebworth</w:t>
+      </w:r>
+      <w:r>
+        <w:t xml:space="preserve">, died </w:t>
+      </w:r>
+      <w:r>
+        <w:rPr>
+          <w:b/>
+        </w:rPr>
+        <w:t>13 May 1980</w:t>
+      </w:r>
+      <w:r>
+        <w:t xml:space="preserve"> in </w:t>
+      </w:r>
+      <w:r>
+        <w:rPr>
+          <w:b/>
+        </w:rPr>
+        <w:t>Knoxville, Tennessee</w:t>
+      </w:r>
+      <w:r>
+        <w:t xml:space="preserve">, with </w:t>
+      </w:r>
+      <w:r>
+        <w:rPr>
+          <w:b/>
+        </w:rPr>
+        <w:t>Samuel Parriott Newnam</w:t>
+      </w:r>
+      <w:r>
+        <w:t xml:space="preserve"> as father — a </w:t>
+      </w:r>
+      <w:r>
+        <w:rPr>
+          <w:b/>
+        </w:rPr>
+        <w:t>possible</w:t>
+      </w:r>
+      <w:r>
+        <w:t xml:space="preserve"> lead only, not printed here as proved death. [C230] Free Tennessee death and obituary indexes searched from this case did not independently confirm that row. [C231] Lee Marriage Books 5–15 have no Rissie or Rissa Newnam bride; a 1920 Rissa Newton, seventeen, is a different woman. [C134] A Rissie Pelfrey Maxey born 1882 is a different woman.</w:t>
+      </w:r>
+    </w:p>
+    <w:p>
+      <w:r>
+        <w:rPr>
+          <w:b/>
+        </w:rPr>
+        <w:t>John H. Newnam</w:t>
+      </w:r>
+      <w:r>
+        <w:t xml:space="preserve">, August 1899. Herbert Newman of Lee County, Virginia, was rejected. The Kentucky statewide death index (Reclaim The Records, 1911–1990) has no John H. Newnam death in Lee consistent with an August 1899 birth. [C234] [C237] [C238] Lee Marriage Book 12 has a different </w:t>
+      </w:r>
+      <w:r>
+        <w:rPr>
+          <w:b/>
+        </w:rPr>
+        <w:t>John Newnam</w:t>
+      </w:r>
+      <w:r>
+        <w:t>, age twenty-five in 1917, son of John and Serilda — rejected. [C239] Genealogy Trails’ Lee County WWI draft transcript (1,126 cards) lists no Newnam, Newman, or McCoy registrant; other men born in 1899 appear on the September 1918 Beattyville board, but not John under that surname. [C240] [C241] [S248] A cross-border free transcript pass (Owsley, Estill, Arkansas Perry/Yell, Knox KYGenWeb, Missouri Digital Heritage WWI biographies) also returned no Newnam/Newman draft row. [C242] [S249] NARA M1509 / FamilySearch card images have not been read in this case.</w:t>
+      </w:r>
+    </w:p>
+    <w:p>
+      <w:r>
+        <w:br w:type="page"/>
+      </w:r>
+    </w:p>
+    <w:p>
+      <w:pPr>
+        <w:pStyle w:val="Heading1"/>
+      </w:pPr>
+      <w:r>
         <w:t>How to read the plates</w:t>
       </w:r>
     </w:p>
@@ -2542,25 +2870,34 @@
         <w:t>18 A</w:t>
       </w:r>
       <w:r>
-        <w:t xml:space="preserve"> is Thomas A., 32, with Matilda — not merged. Springfield ED </w:t>
-      </w:r>
-      <w:r>
-        <w:rPr>
-          <w:b/>
-        </w:rPr>
-        <w:t>39</w:t>
-      </w:r>
-      <w:r>
-        <w:t xml:space="preserve"> sheets </w:t>
-      </w:r>
-      <w:r>
-        <w:rPr>
-          <w:b/>
-        </w:rPr>
-        <w:t>6 through 31 B</w:t>
-      </w:r>
-      <w:r>
-        <w:t>, read on the original 856 reel, have no second Stone household. [C117] [C153]</w:t>
+        <w:t xml:space="preserve"> is Thomas A., 32, with Matilda — not merged. Greene </w:t>
+      </w:r>
+      <w:r>
+        <w:rPr>
+          <w:b/>
+        </w:rPr>
+        <w:t>37–43</w:t>
+      </w:r>
+      <w:r>
+        <w:t xml:space="preserve"> (Springfield / Campbell) name columns are now closed: the only Stone </w:t>
+      </w:r>
+      <w:r>
+        <w:rPr>
+          <w:b/>
+        </w:rPr>
+        <w:t>head</w:t>
+      </w:r>
+      <w:r>
+        <w:t xml:space="preserve"> is Thomas A. on ED </w:t>
+      </w:r>
+      <w:r>
+        <w:rPr>
+          <w:b/>
+        </w:rPr>
+        <w:t>37</w:t>
+      </w:r>
+      <w:r>
+        <w:t xml:space="preserve"> sheet 18A. [C117] [C281]</w:t>
       </w:r>
     </w:p>
     <w:p>
@@ -2622,8 +2959,983 @@
       </w:r>
     </w:p>
     <w:p>
-      <w:r>
-        <w:t>The next chat should treat this book and `06-dossier.md` as the combined master, then work the open list. Do not reopen Peebles as a third marriage without a license. Do not print 1868 or 24 February 1906 as facts.</w:t>
+      <w:pPr>
+        <w:pStyle w:val="ListBullet"/>
+      </w:pPr>
+      <w:r>
+        <w:rPr>
+          <w:b/>
+        </w:rPr>
+        <w:t>B049:</w:t>
+      </w:r>
+      <w:r>
+        <w:t xml:space="preserve"> 1926 *Beattyville Enterprise* and *Yell County Journal* still unread. IA Solr 0; UK film years omit 1926; six `beatty` issues omit 1926. [C293] [C301]</w:t>
+      </w:r>
+    </w:p>
+    <w:p>
+      <w:pPr>
+        <w:pStyle w:val="ListBullet"/>
+      </w:pPr>
+      <w:r>
+        <w:rPr>
+          <w:b/>
+        </w:rPr>
+        <w:t>B045 / B047:</w:t>
+      </w:r>
+      <w:r>
+        <w:t xml:space="preserve"> Samuel P. probate film and M1509 draft cards unread.</w:t>
+      </w:r>
+    </w:p>
+    <w:p>
+      <w:pPr>
+        <w:pStyle w:val="ListBullet"/>
+      </w:pPr>
+      <w:r>
+        <w:rPr>
+          <w:b/>
+        </w:rPr>
+        <w:t>FAN residual:</w:t>
+      </w:r>
+      <w:r>
+        <w:t xml:space="preserve"> Luther Newnam’s own death (B051); Shelby × Grace identity (B052); Everett’s deceased brothers (B053); Carter Cove stone photographs (B054).</w:t>
+      </w:r>
+    </w:p>
+    <w:p>
+      <w:pPr>
+        <w:pStyle w:val="ListBullet"/>
+      </w:pPr>
+      <w:r>
+        <w:t xml:space="preserve">Greene 37–43 Stone sweep is </w:t>
+      </w:r>
+      <w:r>
+        <w:rPr>
+          <w:b/>
+        </w:rPr>
+        <w:t>closed</w:t>
+      </w:r>
+      <w:r>
+        <w:t>. Do not reopen Peebles as a third marriage without a license. Do not print 1868 or 24 February 1906 as facts.</w:t>
+      </w:r>
+    </w:p>
+    <w:p>
+      <w:r>
+        <w:t xml:space="preserve">The next session starts with </w:t>
+      </w:r>
+      <w:r>
+        <w:rPr>
+          <w:b/>
+        </w:rPr>
+        <w:t>B049</w:t>
+      </w:r>
+      <w:r>
+        <w:t>.</w:t>
+      </w:r>
+    </w:p>
+    <w:p>
+      <w:r>
+        <w:br w:type="page"/>
+      </w:r>
+    </w:p>
+    <w:p>
+      <w:pPr>
+        <w:pStyle w:val="Heading1"/>
+      </w:pPr>
+      <w:r>
+        <w:t>Footnotes</w:t>
+      </w:r>
+    </w:p>
+    <w:p>
+      <w:r>
+        <w:t>Numbered notes expand the claim/source tags in the narrative. Access labels: *image seen* · *transcription only* · *index only* · *catalog only* · *OCR text* · *not yet examined*. Click a URL when one exists.</w:t>
+      </w:r>
+    </w:p>
+    <w:p>
+      <w:r>
+        <w:t xml:space="preserve">1. 1880 U.S. census, Lee County, Kentucky, ED 59, dwelling 46: Dora, daughter, 8. NARA T9-427; Internet Archive [`10thcensus0427unit`](https://archive.org/details/10thcensus0427unit). *Image seen.* </w:t>
+      </w:r>
+      <w:r>
+        <w:rPr>
+          <w:b/>
+        </w:rPr>
+        <w:t>C003</w:t>
+      </w:r>
+      <w:r>
+        <w:t xml:space="preserve"> </w:t>
+      </w:r>
+      <w:r>
+        <w:rPr>
+          <w:b/>
+        </w:rPr>
+        <w:t>S010</w:t>
+      </w:r>
+      <w:r>
+        <w:t xml:space="preserve">. </w:t>
+      </w:r>
+      <w:r>
+        <w:rPr>
+          <w:b/>
+        </w:rPr>
+        <w:t>PROVEN</w:t>
+      </w:r>
+      <w:r>
+        <w:t xml:space="preserve"> as a census line.</w:t>
+      </w:r>
+    </w:p>
+    <w:p>
+      <w:r>
+        <w:t xml:space="preserve">2. 1880 KY Soundex N-550 continuation: “Newnam, Dora D 8 Kentucky.” IA [`soundex1880ky055`](https://archive.org/details/soundex1880ky055). *Image seen.* </w:t>
+      </w:r>
+      <w:r>
+        <w:rPr>
+          <w:b/>
+        </w:rPr>
+        <w:t>S001</w:t>
+      </w:r>
+      <w:r>
+        <w:t xml:space="preserve"> </w:t>
+      </w:r>
+      <w:r>
+        <w:rPr>
+          <w:b/>
+        </w:rPr>
+        <w:t>S002</w:t>
+      </w:r>
+      <w:r>
+        <w:t>.</w:t>
+      </w:r>
+    </w:p>
+    <w:p>
+      <w:r>
+        <w:t xml:space="preserve">3. Arkansas State Board of Health, death certificate Dora Stone, Yell Co., noon 23 Aug 1926, cert. 1524, RD 676. Informant Coy Newnam. User-supplied image, prior session; *not re-opened this pass*. Index: [Ancestry 8771](https://www.ancestry.com/search/collections/8771/) / FS [1940760](https://www.familysearch.org/search/collection/1940760) — *not yet examined* from this VM. </w:t>
+      </w:r>
+      <w:r>
+        <w:rPr>
+          <w:b/>
+        </w:rPr>
+        <w:t>C015</w:t>
+      </w:r>
+      <w:r>
+        <w:t xml:space="preserve"> </w:t>
+      </w:r>
+      <w:r>
+        <w:rPr>
+          <w:b/>
+        </w:rPr>
+        <w:t>S003</w:t>
+      </w:r>
+      <w:r>
+        <w:t>.</w:t>
+      </w:r>
+    </w:p>
+    <w:p>
+      <w:r>
+        <w:t xml:space="preserve">4. Debi Houser Kendrick, Lee Marriage Book 2: Samuel P. Newnam × Dora Ella Newnam, 10 Dec 1885, at Doll Newnam’s. [USGenNet Book 2](https://usgennet.org/usa/ky/county/lee/marriage/marrbook2.html). *Transcription only.* </w:t>
+      </w:r>
+      <w:r>
+        <w:rPr>
+          <w:b/>
+        </w:rPr>
+        <w:t>C010</w:t>
+      </w:r>
+      <w:r>
+        <w:t xml:space="preserve"> </w:t>
+      </w:r>
+      <w:r>
+        <w:rPr>
+          <w:b/>
+        </w:rPr>
+        <w:t>S004</w:t>
+      </w:r>
+      <w:r>
+        <w:t xml:space="preserve">. </w:t>
+      </w:r>
+      <w:r>
+        <w:rPr>
+          <w:b/>
+        </w:rPr>
+        <w:t>PROVEN</w:t>
+      </w:r>
+      <w:r>
+        <w:t xml:space="preserve"> as to the fact of marriage.</w:t>
+      </w:r>
+    </w:p>
+    <w:p>
+      <w:r>
+        <w:t xml:space="preserve">5. 1900 U.S. census, Sturgeon precinct, Lee Co., KY, dwelling 67/67 (Kendrick transcription). [RootsWeb 1900 Sturgeon](https://sites.rootsweb.com/~kylee/census/1900/1900sturgeon.htm). *Transcription only* as used here. </w:t>
+      </w:r>
+      <w:r>
+        <w:rPr>
+          <w:b/>
+        </w:rPr>
+        <w:t>C011</w:t>
+      </w:r>
+      <w:r>
+        <w:t xml:space="preserve"> </w:t>
+      </w:r>
+      <w:r>
+        <w:rPr>
+          <w:b/>
+        </w:rPr>
+        <w:t>S005</w:t>
+      </w:r>
+      <w:r>
+        <w:t>.</w:t>
+      </w:r>
+    </w:p>
+    <w:p>
+      <w:r>
+        <w:t xml:space="preserve">6. Birth year August 1871: 1880 age 8 + 1885 age 14 + 1900 “Aug 1871.” Year </w:t>
+      </w:r>
+      <w:r>
+        <w:rPr>
+          <w:b/>
+        </w:rPr>
+        <w:t>PROVEN</w:t>
+      </w:r>
+      <w:r>
+        <w:t xml:space="preserve"> vs 1868. Day 11 </w:t>
+      </w:r>
+      <w:r>
+        <w:rPr>
+          <w:b/>
+        </w:rPr>
+        <w:t>POSSIBLE</w:t>
+      </w:r>
+      <w:r>
+        <w:t xml:space="preserve"> (certificate only). </w:t>
+      </w:r>
+      <w:r>
+        <w:rPr>
+          <w:b/>
+        </w:rPr>
+        <w:t>C001</w:t>
+      </w:r>
+      <w:r>
+        <w:t xml:space="preserve"> </w:t>
+      </w:r>
+      <w:r>
+        <w:rPr>
+          <w:b/>
+        </w:rPr>
+        <w:t>C002</w:t>
+      </w:r>
+      <w:r>
+        <w:t>.</w:t>
+      </w:r>
+    </w:p>
+    <w:p>
+      <w:r>
+        <w:t xml:space="preserve">7. Parents Elias Newnam &amp; Mary Smallwood: certificate + 1880 household + wedding at Doll’s. </w:t>
+      </w:r>
+      <w:r>
+        <w:rPr>
+          <w:b/>
+        </w:rPr>
+        <w:t>PROBABLE</w:t>
+      </w:r>
+      <w:r>
+        <w:t xml:space="preserve"> (near GPS). </w:t>
+      </w:r>
+      <w:r>
+        <w:rPr>
+          <w:b/>
+        </w:rPr>
+        <w:t>C004</w:t>
+      </w:r>
+      <w:r>
+        <w:t>.</w:t>
+      </w:r>
+    </w:p>
+    <w:p>
+      <w:r>
+        <w:t xml:space="preserve">8. 1870 Travellers Rest, Elias household, no Dora. Original M593-494 p. 90. </w:t>
+      </w:r>
+      <w:r>
+        <w:rPr>
+          <w:b/>
+        </w:rPr>
+        <w:t>C067</w:t>
+      </w:r>
+      <w:r>
+        <w:t xml:space="preserve"> </w:t>
+      </w:r>
+      <w:r>
+        <w:rPr>
+          <w:b/>
+        </w:rPr>
+        <w:t>S231</w:t>
+      </w:r>
+      <w:r>
+        <w:t>.</w:t>
+      </w:r>
+    </w:p>
+    <w:p>
+      <w:r>
+        <w:t xml:space="preserve">9. WikiTree [Newnam-49](https://www.wikitree.com/wiki/Newnam-49): death “abt. 1930” </w:t>
+      </w:r>
+      <w:r>
+        <w:rPr>
+          <w:b/>
+        </w:rPr>
+        <w:t>DISPROVED</w:t>
+      </w:r>
+      <w:r>
+        <w:t xml:space="preserve">; middle name Parriott lore. </w:t>
+      </w:r>
+      <w:r>
+        <w:rPr>
+          <w:b/>
+        </w:rPr>
+        <w:t>S030</w:t>
+      </w:r>
+      <w:r>
+        <w:t>.</w:t>
+      </w:r>
+    </w:p>
+    <w:p>
+      <w:r>
+        <w:t xml:space="preserve">10. 1910 Sturgeon ED 99 original, T624-478: P001/P002/McCoy/John H. b.1899 </w:t>
+      </w:r>
+      <w:r>
+        <w:rPr>
+          <w:b/>
+        </w:rPr>
+        <w:t>nil</w:t>
+      </w:r>
+      <w:r>
+        <w:t xml:space="preserve">. IA [`13thcensus1910po478unit`](https://archive.org/details/13thcensus1910po478unit). </w:t>
+      </w:r>
+      <w:r>
+        <w:rPr>
+          <w:b/>
+        </w:rPr>
+        <w:t>C088</w:t>
+      </w:r>
+      <w:r>
+        <w:t>.</w:t>
+      </w:r>
+    </w:p>
+    <w:p>
+      <w:r>
+        <w:t xml:space="preserve">11. 1920 Beattyville ED 111 sh 6A: E.T. Newman, grandfather in C.B. Burke’s house. IA [`14thcensusofpopu586unit`](https://archive.org/details/14thcensusofpopu586unit). </w:t>
+      </w:r>
+      <w:r>
+        <w:rPr>
+          <w:b/>
+        </w:rPr>
+        <w:t>C091</w:t>
+      </w:r>
+      <w:r>
+        <w:t xml:space="preserve"> </w:t>
+      </w:r>
+      <w:r>
+        <w:rPr>
+          <w:b/>
+        </w:rPr>
+        <w:t>S073</w:t>
+      </w:r>
+      <w:r>
+        <w:t>.</w:t>
+      </w:r>
+    </w:p>
+    <w:p>
+      <w:r>
+        <w:t xml:space="preserve">12. 1920 Perry Co. AR: Tom A. Stone, 62, widower. </w:t>
+      </w:r>
+      <w:r>
+        <w:rPr>
+          <w:b/>
+        </w:rPr>
+        <w:t>C050</w:t>
+      </w:r>
+      <w:r>
+        <w:t xml:space="preserve">. Identification with T. A. on the 1926 certificate </w:t>
+      </w:r>
+      <w:r>
+        <w:rPr>
+          <w:b/>
+        </w:rPr>
+        <w:t>PROBABLE</w:t>
+      </w:r>
+      <w:r>
+        <w:t xml:space="preserve"> (conflict #4, #11).</w:t>
+      </w:r>
+    </w:p>
+    <w:p>
+      <w:r>
+        <w:t xml:space="preserve">13. 1900 Greene Co. MO ED 37 sh 18A: Thomas A. Stone, 32, Matilda, Gertrude. NARA T623-855; IA [`12thcensusofpopu855unit`](https://archive.org/details/12thcensusofpopu855unit). </w:t>
+      </w:r>
+      <w:r>
+        <w:rPr>
+          <w:b/>
+        </w:rPr>
+        <w:t>C117</w:t>
+      </w:r>
+      <w:r>
+        <w:t xml:space="preserve">. </w:t>
+      </w:r>
+      <w:r>
+        <w:rPr>
+          <w:b/>
+        </w:rPr>
+        <w:t>Not merged.</w:t>
+      </w:r>
+    </w:p>
+    <w:p>
+      <w:r>
+        <w:t xml:space="preserve">14. Greene ED 37–43 name-column sweep (A+B), including 41 ED 38 B-side crops in `sources/census/b040-ed38-bsides/`. </w:t>
+      </w:r>
+      <w:r>
+        <w:rPr>
+          <w:b/>
+        </w:rPr>
+        <w:t>C281</w:t>
+      </w:r>
+      <w:r>
+        <w:t xml:space="preserve"> </w:t>
+      </w:r>
+      <w:r>
+        <w:rPr>
+          <w:b/>
+        </w:rPr>
+        <w:t>S267</w:t>
+      </w:r>
+      <w:r>
+        <w:t xml:space="preserve">. </w:t>
+      </w:r>
+      <w:r>
+        <w:rPr>
+          <w:b/>
+        </w:rPr>
+        <w:t>PROVEN</w:t>
+      </w:r>
+      <w:r>
+        <w:t xml:space="preserve"> negative for a second Stone head.</w:t>
+      </w:r>
+    </w:p>
+    <w:p>
+      <w:r>
+        <w:t xml:space="preserve">15. Daniels &amp; Cossey, Carter Cove, 5 Feb 1993: “Newman, Dora” no dates; “Stone, Thomas 1845–1925.” </w:t>
+      </w:r>
+      <w:r>
+        <w:rPr>
+          <w:b/>
+        </w:rPr>
+        <w:t>S078</w:t>
+      </w:r>
+      <w:r>
+        <w:t>.</w:t>
+      </w:r>
+    </w:p>
+    <w:p>
+      <w:r>
+        <w:t xml:space="preserve">16. yellcountyobits compiled index p. 64 / 83, captured 30 Oct 2026. [Newman block](https://www.yellcountyobits.org/yc_cemeteryindex/cemeterylist/cemeterylist64.html) · [Stone block](https://www.yellcountyobits.org/yc_cemeteryindex/cemeterylist/cemeterylist83.html). *Transcription only.* </w:t>
+      </w:r>
+      <w:r>
+        <w:rPr>
+          <w:b/>
+        </w:rPr>
+        <w:t>C282</w:t>
+      </w:r>
+      <w:r>
+        <w:t xml:space="preserve"> </w:t>
+      </w:r>
+      <w:r>
+        <w:rPr>
+          <w:b/>
+        </w:rPr>
+        <w:t>C283</w:t>
+      </w:r>
+      <w:r>
+        <w:t xml:space="preserve"> </w:t>
+      </w:r>
+      <w:r>
+        <w:rPr>
+          <w:b/>
+        </w:rPr>
+        <w:t>S268</w:t>
+      </w:r>
+      <w:r>
+        <w:t xml:space="preserve"> </w:t>
+      </w:r>
+      <w:r>
+        <w:rPr>
+          <w:b/>
+        </w:rPr>
+        <w:t>S269</w:t>
+      </w:r>
+      <w:r>
+        <w:t>.</w:t>
+      </w:r>
+    </w:p>
+    <w:p>
+      <w:r>
+        <w:t xml:space="preserve">17. Find a Grave cemetery listing: Dora Newman memorial [97907837](https://www.findagrave.com/memorial/97907837/dora-newman); Thomas Stone [97907931](https://www.findagrave.com/memorial/97907931/thomas-stone). Listing HTML seen; memorial biographies CF-blocked. </w:t>
+      </w:r>
+      <w:r>
+        <w:rPr>
+          <w:b/>
+        </w:rPr>
+        <w:t>S117</w:t>
+      </w:r>
+      <w:r>
+        <w:t xml:space="preserve"> </w:t>
+      </w:r>
+      <w:r>
+        <w:rPr>
+          <w:b/>
+        </w:rPr>
+        <w:t>S118</w:t>
+      </w:r>
+      <w:r>
+        <w:t>.</w:t>
+      </w:r>
+    </w:p>
+    <w:p>
+      <w:r>
+        <w:t xml:space="preserve">18. *Beattyville Enterprise*, IA item [`beatty`](https://archive.org/details/beatty): six issues only. OCR + selected page JPEGs in `sources/press/`. </w:t>
+      </w:r>
+      <w:r>
+        <w:rPr>
+          <w:b/>
+        </w:rPr>
+        <w:t>C284–C290</w:t>
+      </w:r>
+      <w:r>
+        <w:t xml:space="preserve"> </w:t>
+      </w:r>
+      <w:r>
+        <w:rPr>
+          <w:b/>
+        </w:rPr>
+        <w:t>C293</w:t>
+      </w:r>
+      <w:r>
+        <w:t xml:space="preserve"> </w:t>
+      </w:r>
+      <w:r>
+        <w:rPr>
+          <w:b/>
+        </w:rPr>
+        <w:t>S270</w:t>
+      </w:r>
+      <w:r>
+        <w:t>.</w:t>
+      </w:r>
+    </w:p>
+    <w:p>
+      <w:r>
+        <w:t xml:space="preserve">19. UK Microfilm Holdings item [65438](https://ukmfilms.omeka.net/items/show/65438): *Enterprise* years 1909–11, 1915, 1924–25, 1928, 1932. Film </w:t>
+      </w:r>
+      <w:r>
+        <w:rPr>
+          <w:b/>
+        </w:rPr>
+        <w:t>S 90-033</w:t>
+      </w:r>
+      <w:r>
+        <w:t xml:space="preserve">. *Catalog only.* </w:t>
+      </w:r>
+      <w:r>
+        <w:rPr>
+          <w:b/>
+        </w:rPr>
+        <w:t>S271</w:t>
+      </w:r>
+      <w:r>
+        <w:t>.</w:t>
+      </w:r>
+    </w:p>
+    <w:p>
+      <w:r>
+        <w:t xml:space="preserve">20. *Hopkinsville Kentuckian*, 9 Aug 1906, p. 8. [LOC](https://www.loc.gov/resource/sn86069395/1906-08-09/ed-1/?sp=8). </w:t>
+      </w:r>
+      <w:r>
+        <w:rPr>
+          <w:b/>
+        </w:rPr>
+        <w:t>C291</w:t>
+      </w:r>
+      <w:r>
+        <w:t xml:space="preserve"> </w:t>
+      </w:r>
+      <w:r>
+        <w:rPr>
+          <w:b/>
+        </w:rPr>
+        <w:t>S273</w:t>
+      </w:r>
+      <w:r>
+        <w:t xml:space="preserve">. </w:t>
+      </w:r>
+      <w:r>
+        <w:rPr>
+          <w:b/>
+        </w:rPr>
+        <w:t>DISPROVED</w:t>
+      </w:r>
+      <w:r>
+        <w:t xml:space="preserve"> vs Samuel P.</w:t>
+      </w:r>
+    </w:p>
+    <w:p>
+      <w:r>
+        <w:t xml:space="preserve">21. *Richmond Climax*, 23 Apr 1902, p. 1. [LOC](https://www.loc.gov/resource/sn86069162/1902-04-23/ed-1/?sp=1). </w:t>
+      </w:r>
+      <w:r>
+        <w:rPr>
+          <w:b/>
+        </w:rPr>
+        <w:t>C292</w:t>
+      </w:r>
+      <w:r>
+        <w:t xml:space="preserve"> </w:t>
+      </w:r>
+      <w:r>
+        <w:rPr>
+          <w:b/>
+        </w:rPr>
+        <w:t>S274</w:t>
+      </w:r>
+      <w:r>
+        <w:t xml:space="preserve">. </w:t>
+      </w:r>
+      <w:r>
+        <w:rPr>
+          <w:b/>
+        </w:rPr>
+        <w:t>DISPROVED</w:t>
+      </w:r>
+      <w:r>
+        <w:t xml:space="preserve"> vs Samuel P.</w:t>
+      </w:r>
+    </w:p>
+    <w:p>
+      <w:r>
+        <w:t xml:space="preserve">22. Genealogy Trails Lee WWI draft transcript (1,126 cards). [GT Lee WWI](https://genealogytrails.com/ken/lee/ww1draft.html). Re-fetched 30 Oct 2026. </w:t>
+      </w:r>
+      <w:r>
+        <w:rPr>
+          <w:b/>
+        </w:rPr>
+        <w:t>C294</w:t>
+      </w:r>
+      <w:r>
+        <w:t xml:space="preserve"> </w:t>
+      </w:r>
+      <w:r>
+        <w:rPr>
+          <w:b/>
+        </w:rPr>
+        <w:t>S272</w:t>
+      </w:r>
+      <w:r>
+        <w:t>.</w:t>
+      </w:r>
+    </w:p>
+    <w:p>
+      <w:r>
+        <w:t xml:space="preserve">23. Lee Marriage Book 23: Clay Dunigan × Ladona Newman, 15 Mar 1932. [USGenNet Book 23](https://usgennet.org/usa/ky/county/lee/marriage/marrbook23.html). *Transcription only.* </w:t>
+      </w:r>
+      <w:r>
+        <w:rPr>
+          <w:b/>
+        </w:rPr>
+        <w:t>C297</w:t>
+      </w:r>
+      <w:r>
+        <w:t xml:space="preserve"> </w:t>
+      </w:r>
+      <w:r>
+        <w:rPr>
+          <w:b/>
+        </w:rPr>
+        <w:t>S277</w:t>
+      </w:r>
+      <w:r>
+        <w:t>.</w:t>
+      </w:r>
+    </w:p>
+    <w:p>
+      <w:r>
+        <w:t xml:space="preserve">24. Lee obituaries N: Everett Newnam, *Enterprise* 14 Dec 1939. [USGenNet n.html](https://usgennet.org/usa/ky/county/lee/obituaries/n.html#everettnewman). *Transcription only.* </w:t>
+      </w:r>
+      <w:r>
+        <w:rPr>
+          <w:b/>
+        </w:rPr>
+        <w:t>C299</w:t>
+      </w:r>
+      <w:r>
+        <w:t xml:space="preserve"> </w:t>
+      </w:r>
+      <w:r>
+        <w:rPr>
+          <w:b/>
+        </w:rPr>
+        <w:t>S278</w:t>
+      </w:r>
+      <w:r>
+        <w:t>.</w:t>
+      </w:r>
+    </w:p>
+    <w:p>
+      <w:r>
+        <w:t xml:space="preserve">25. IA Solr 30 Oct 2026: 0 items *Yell County Journal* 1926; 0 items title *Beattyville Enterprise* year 1926. </w:t>
+      </w:r>
+      <w:r>
+        <w:rPr>
+          <w:b/>
+        </w:rPr>
+        <w:t>C301</w:t>
+      </w:r>
+      <w:r>
+        <w:t xml:space="preserve"> </w:t>
+      </w:r>
+      <w:r>
+        <w:rPr>
+          <w:b/>
+        </w:rPr>
+        <w:t>S280</w:t>
+      </w:r>
+      <w:r>
+        <w:t>.</w:t>
+      </w:r>
+    </w:p>
+    <w:p>
+      <w:r>
+        <w:t xml:space="preserve">26. Genealogy Trails [Yell obituaries](https://genealogytrails.com/ark/yell/obits.html) landing, 30 Oct 2026: nil Stone/Newnam/Dora/1926. </w:t>
+      </w:r>
+      <w:r>
+        <w:rPr>
+          <w:b/>
+        </w:rPr>
+        <w:t>C302</w:t>
+      </w:r>
+      <w:r>
+        <w:t xml:space="preserve"> </w:t>
+      </w:r>
+      <w:r>
+        <w:rPr>
+          <w:b/>
+        </w:rPr>
+        <w:t>S281</w:t>
+      </w:r>
+      <w:r>
+        <w:t>.</w:t>
+      </w:r>
+    </w:p>
+    <w:p>
+      <w:r>
+        <w:t xml:space="preserve">27. Word biography bytes: SHA-256 `78cdcf44ad1700ee4a0b696215879e2e8485c2dfe794e1d918e64acc1d3d9280` (53,235 bytes). Copies in `book/` and `sources/authored/`. Drive search 0. </w:t>
+      </w:r>
+      <w:r>
+        <w:rPr>
+          <w:b/>
+        </w:rPr>
+        <w:t>C296</w:t>
+      </w:r>
+      <w:r>
+        <w:t xml:space="preserve"> </w:t>
+      </w:r>
+      <w:r>
+        <w:rPr>
+          <w:b/>
+        </w:rPr>
+        <w:t>S276</w:t>
+      </w:r>
+      <w:r>
+        <w:t>.</w:t>
+      </w:r>
+    </w:p>
+    <w:p>
+      <w:r>
+        <w:t xml:space="preserve">28. Coy × Letha Sullivan, 18 Feb 1917, Ola. </w:t>
+      </w:r>
+      <w:r>
+        <w:rPr>
+          <w:b/>
+        </w:rPr>
+        <w:t>C027</w:t>
+      </w:r>
+      <w:r>
+        <w:t xml:space="preserve"> </w:t>
+      </w:r>
+      <w:r>
+        <w:rPr>
+          <w:b/>
+        </w:rPr>
+        <w:t>S024</w:t>
+      </w:r>
+      <w:r>
+        <w:t>. Prior session.</w:t>
+      </w:r>
+    </w:p>
+    <w:p>
+      <w:r>
+        <w:t xml:space="preserve">29. NUMIDENT Pearl P. Jackson / Mary Magdalene Bunch naming Sam and Dora. </w:t>
+      </w:r>
+      <w:r>
+        <w:rPr>
+          <w:b/>
+        </w:rPr>
+        <w:t>S006</w:t>
+      </w:r>
+      <w:r>
+        <w:t xml:space="preserve"> </w:t>
+      </w:r>
+      <w:r>
+        <w:rPr>
+          <w:b/>
+        </w:rPr>
+        <w:t>S007</w:t>
+      </w:r>
+      <w:r>
+        <w:t>. Prior.</w:t>
+      </w:r>
+    </w:p>
+    <w:p>
+      <w:r>
+        <w:t xml:space="preserve">30. Lee Books 5–19: no Peebles; no Dora Newnam remarriage. [USGenNet marriages](https://usgennet.org/usa/ky/county/lee/marriage/). </w:t>
+      </w:r>
+      <w:r>
+        <w:rPr>
+          <w:b/>
+        </w:rPr>
+        <w:t>C084</w:t>
+      </w:r>
+      <w:r>
+        <w:t xml:space="preserve"> </w:t>
+      </w:r>
+      <w:r>
+        <w:rPr>
+          <w:b/>
+        </w:rPr>
+        <w:t>S064</w:t>
+      </w:r>
+      <w:r>
+        <w:t>.</w:t>
+      </w:r>
+    </w:p>
+    <w:p>
+      <w:r>
+        <w:br w:type="page"/>
+      </w:r>
+    </w:p>
+    <w:p>
+      <w:pPr>
+        <w:pStyle w:val="Heading1"/>
+      </w:pPr>
+      <w:r>
+        <w:t>Source index</w:t>
+      </w:r>
+    </w:p>
+    <w:p>
+      <w:r>
+        <w:t xml:space="preserve">Working table of </w:t>
+      </w:r>
+      <w:r>
+        <w:rPr>
+          <w:b/>
+        </w:rPr>
+        <w:t>saved local copies</w:t>
+      </w:r>
+      <w:r>
+        <w:t>. Full file list: [`../SOURCE-INDEX.md`](../SOURCE-INDEX.md) and [`../sources/SOURCE-INVENTORY.tsv`](../sources/SOURCE-INVENTORY.tsv) (331 files after this pass).</w:t>
+      </w:r>
+    </w:p>
+    <w:p>
+      <w:r>
+        <w:t>| ID | Local file | Repository / URL | What it proves | Access |</w:t>
+      </w:r>
+    </w:p>
+    <w:p>
+      <w:r>
+        <w:t>|---|---|---|---|---|</w:t>
+      </w:r>
+    </w:p>
+    <w:p>
+      <w:r>
+        <w:t>| S003 | *(user image; not re-opened)* | AR Board of Health cert. 1524 | Death, parents, spouse, informant, burial | image seen (prior) |</w:t>
+      </w:r>
+    </w:p>
+    <w:p>
+      <w:r>
+        <w:t>| S267 | `../sources/census/b040-ed38-bsides/` (41 PNGs) | [IA T623-855](https://archive.org/details/12thcensusofpopu855unit) | ED 38 B-sides nil Stone/Newnam (</w:t>
+      </w:r>
+      <w:r>
+        <w:rPr>
+          <w:b/>
+        </w:rPr>
+        <w:t>C281</w:t>
+      </w:r>
+      <w:r>
+        <w:t>) | image seen |</w:t>
+      </w:r>
+    </w:p>
+    <w:p>
+      <w:r>
+        <w:t>| S268 | `../sources/cemetery/yellcountyobits-cemeterylist64-newman-dora-2026-10-30.txt` | [yellcountyobits p.64](https://www.yellcountyobits.org/yc_cemeteryindex/cemeterylist/cemeterylist64.html) | Newman, Dora, no dates, Carter Cove | transcription only |</w:t>
+      </w:r>
+    </w:p>
+    <w:p>
+      <w:r>
+        <w:t>| S269 | `../sources/cemetery/yellcountyobits-cemeterylist83-stone-2026-10-30.txt` | [yellcountyobits p.83](https://www.yellcountyobits.org/yc_cemeteryindex/cemeterylist/cemeterylist83.html) | Stone, Thomas, 1845–1925, Carter Cove | transcription only |</w:t>
+      </w:r>
+    </w:p>
+    <w:p>
+      <w:r>
+        <w:t>| S270 | `../sources/press/beattyville-enterprise-ia-beatty-ocr-2026-10-30.txt` + leaf JPEGs | [IA `beatty`](https://archive.org/details/beatty) | Doll 1928/1932; FAN; no 1926 | OCR + selected images |</w:t>
+      </w:r>
+    </w:p>
+    <w:p>
+      <w:r>
+        <w:t>| S271 | `../sources/press/beattyville-enterprise-uk-microfilm-2026-10-30.html` | [UK item 65438](https://ukmfilms.omeka.net/items/show/65438) | 1926 not in listed film years | catalog only |</w:t>
+      </w:r>
+    </w:p>
+    <w:p>
+      <w:r>
+        <w:t>| S272 | `../sources/military/lee-wwi-genealogytrails-reget-2026-10-30.txt` | [GT Lee WWI](https://genealogytrails.com/ken/lee/ww1draft.html) | Nil Newnam/McCoy | transcription only |</w:t>
+      </w:r>
+    </w:p>
+    <w:p>
+      <w:r>
+        <w:t>| S273 | `../sources/press/hopkinsville-kentuckian-1906-08-09-p8.jpg` | [LOC](https://www.loc.gov/resource/sn86069395/1906-08-09/ed-1/?sp=8) | Reject vs Samuel P. | image seen |</w:t>
+      </w:r>
+    </w:p>
+    <w:p>
+      <w:r>
+        <w:t>| S274 | `../sources/press/richmond-climax-1902-04-23-p1.jpg` | [LOC](https://www.loc.gov/resource/sn86069162/1902-04-23/ed-1/?sp=1) | Will Newnam reject | image seen |</w:t>
+      </w:r>
+    </w:p>
+    <w:p>
+      <w:r>
+        <w:t>| S276 | `../sources/authored/Dora-Ella-Newnam-Stone-A-Life-latest.docx` | Local Word export | Latest authored bio bytes | original bytes |</w:t>
+      </w:r>
+    </w:p>
+    <w:p>
+      <w:r>
+        <w:t>| S277 | `../sources/marriages/lee-book23-clay-ladona-1932-extract-2026-10-30.txt` | [Book 23](https://usgennet.org/usa/ky/county/lee/marriage/marrbook23.html) | Clay × Ladona 15 Mar 1932 | transcription only |</w:t>
+      </w:r>
+    </w:p>
+    <w:p>
+      <w:r>
+        <w:t>| S278 | `../sources/obituaries/lee-obits-n-everett-newnam-1939-extract-2026-10-30.txt` | [Obits N](https://usgennet.org/usa/ky/county/lee/obituaries/n.html#everettnewman) | Everett d. 13 Dec 1939 | transcription only |</w:t>
+      </w:r>
+    </w:p>
+    <w:p>
+      <w:r>
+        <w:t>| S280 | `../sources/press/ia-yell-journal-1926-search-2026-10-30.json` | IA Solr | 0 hits for 1926 titles | index only |</w:t>
+      </w:r>
+    </w:p>
+    <w:p>
+      <w:r>
+        <w:t>| S281 | `../sources/press/genealogytrails-yell-obits-landing-2026-10-30.html` | [GT Yell obits](https://genealogytrails.com/ark/yell/obits.html) | Nil on landing | transcription only |</w:t>
+      </w:r>
+    </w:p>
+    <w:p>
+      <w:r>
+        <w:t>Embedded plates live in `plates/` and `../sources/census/`. Charts: [`../visuals/pedigree-dora.svg`](../visuals/pedigree-dora.svg), [`../visuals/timeline-dora.svg`](../visuals/timeline-dora.svg).</w:t>
       </w:r>
     </w:p>
     <w:sectPr>

</xml_diff>

<commit_message>
Pass 58: McIlvain 1840 is Estill; both enumerators nil Newman
Second Estill enumerator Andrew McIlvain: left-margin Estill County, 25 name pages with no Newman/Tincher head. fishergenes p.68 is overlay 0129 (Valentine R. Ward). Wm Fincher is not Tincher. Edmonson starts overlay 0141 (W. Edwards, 2914). B066 done. Original 1932 DC and 1840 bond still unseen; do not promote C509.

Co-authored-by: CatCorner22 <CatCorner22@users.noreply.github.com>
</commit_message>
<xml_diff>
--- a/research/dora-ella-newnam/book/Dora-Ella-Newnam-Stone-A-Life.docx
+++ b/research/dora-ella-newnam/book/Dora-Ella-Newnam-Stone-A-Life.docx
@@ -162,7 +162,34 @@
         <w:t>William Newton</w:t>
       </w:r>
       <w:r>
-        <w:t>. Clay County’s original, twenty-three name pages, likewise has no Newman or Tincher head; the recap is labelled Recapitulation of Clay County, pages 1–23. Breathitt’s original, twelve name pages, is the same nil; a John Bowman on the first Breathitt page is not a Newman. Four Smallwood heads in Clay are not merged as Mary Ann’s kin. The enumerator after Estill’s recap, Andrew McIlvain, is not Edmonson’s published page 84. The authored 27 February 1840 Newman–Tincher bond remains unseen. Do not promote the 1932 extract’s father to proved. [C567] [C568] [C569] [C570] [C572] [C579] [C580] [C581] [C582] [C584] [C585] [C509]</w:t>
+        <w:t xml:space="preserve">. Estill had a second enumerator, Andrew McIlvain. His left margin reads </w:t>
+      </w:r>
+      <w:r>
+        <w:rPr>
+          <w:b/>
+        </w:rPr>
+        <w:t>Estill County</w:t>
+      </w:r>
+      <w:r>
+        <w:t xml:space="preserve">. All twenty-five of his name pages are the same named-head nil. A first-pass Tincher on that run is </w:t>
+      </w:r>
+      <w:r>
+        <w:rPr>
+          <w:b/>
+        </w:rPr>
+        <w:t>Wm Fincher</w:t>
+      </w:r>
+      <w:r>
+        <w:t xml:space="preserve">. The fishergenes plate labelled “1840 Estill p.68” is McIlvain’s overlay 129, </w:t>
+      </w:r>
+      <w:r>
+        <w:rPr>
+          <w:b/>
+        </w:rPr>
+        <w:t>Valentine R. Ward</w:t>
+      </w:r>
+      <w:r>
+        <w:t>, not NARA overlay 68. Clay County’s original, twenty-three name pages, likewise has no Newman or Tincher head; the recap is labelled Recapitulation of Clay County, pages 1–23. Breathitt’s original, twelve name pages, is the same nil; a John Bowman on the first Breathitt page is not a Newman. Four Smallwood heads in Clay, and James Smallwood plus three Stone heads on McIlvain’s Estill pages, are not merged as kin. Edmonson begins after McIlvain, certified by W. Edwards, total 2,914. The authored 27 February 1840 Newman–Tincher bond remains unseen. Do not promote the 1932 extract’s father to proved. [C567] [C568] [C569] [C570] [C572] [C587] [C588] [C589] [C590] [C591] [C579] [C580] [C581] [C584] [C585] [C509]</w:t>
       </w:r>
     </w:p>
     <w:p>
@@ -2760,7 +2787,7 @@
         <w:pStyle w:val="ListBullet"/>
       </w:pPr>
       <w:r>
-        <w:t>The Estill Newman–Tincher bond, 1826–1850. Published “to 1850” web files stop at 1825. The 1840 Estill, Clay, and Breathitt census originals are now seen; they do not name a Newman head.</w:t>
+        <w:t>The Estill Newman–Tincher bond, 1826–1850. Published “to 1850” web files stop at 1825. Both Estill 1840 enumerators, and the Clay and Breathitt originals, are now seen; they do not name a Newman head.</w:t>
       </w:r>
     </w:p>
     <w:p>

</xml_diff>

<commit_message>
Pass 59: 1864 Harry H. Newnam x Partington; Estill 1840 still unseen
Williams/Dishon Owsley reconstructed list (courthouse burned) dates Harry H. Newnam and Mary J. Partington 21 July 1864 — probable the 1870 Beattyville couple. Burns/McGhee still not on IA. Estill VS/IGI batches skip 1840. Original 1932 DC and 1840 bond still unseen; do not promote C509. Catalog 85.

Co-authored-by: CatCorner22 <CatCorner22@users.noreply.github.com>
</commit_message>
<xml_diff>
--- a/research/dora-ella-newnam/book/Dora-Ella-Newnam-Stone-A-Life.docx
+++ b/research/dora-ella-newnam/book/Dora-Ella-Newnam-Stone-A-Life.docx
@@ -41,7 +41,7 @@
     </w:p>
     <w:p>
       <w:r>
-        <w:t>Eighty-four Cursor chats on this repository were reviewed for this volume (primary research, helpers, scans, and failed browser hunts). The original mobile session opened the case and read the Arkansas death certificate the family still holds. Later sessions recovered the 1880 childhood schedule that free transcripts had missed, walked statewide Soundex reels for 1910 and 1920, tested a Peebles third-marriage hypothesis and set it aside, and photographed NARA microfilm frames — the 1880 childhood schedule, the 1910 Kentucky Ella Miracode plates, Hardin Gray on Sturgeon sheet 13 B, the 1860 Owsley original of Silas Gray’s house with William aged thirteen, the 1850 Owsley Gray pages that are other men (Thomas, James, John, Charles), the given-name Silas plates that are other boys (Ratliff eight months, Wilson six, Phillips fifteen) and the Bowman line first read as Cyrus and then as Squire, the 1850 Estill Marcus Gray original, Breathitt’s Taulbee infant Silas and Bryant Siras, and Madison’s John Green house with Silas Green aged twenty, the 1850 Owsley Harrison Newman house with an eight-year-old Elias who is probably Dora’s father — a 1932 death extract names Henry Harrison Newnam as that father — and is not merged as proven, the 1860 Booneville original of that house under H.H. Newman with Elias aged eighteen, the 1850 William Newman house of twenty-six on the same page, the 1850 John Newman of sixty born in Tennessee who is not the 1880 John of sixty-nine, and Andrew Mays’s Giles at one month in 1850 and eleven in 1860, the 1870 Proctor original of James Brandenburg’s house, Silas Gray’s Sturgeon original, the 1880 District 59 originals of William next door to John Newnam and of Silas still in the district, the 1900 William Gray dwelling-84 crop, and the Bollinger page a sibling had labelled “Dora E. Stone,” which is Henry C. Rhodes and Dora M. of Missouri. This volume folds those chats into one narrative. The case dossier remains the working file; this book is the public reading of it. Sibling work on Greene ED 37 through 41 is now on merged PR #26 through Pass 59; remaining Greene ED 38 B-sides, 1900 Liberty, and 1900 hh 85 are inventoried, not duplicated. Do not import their “Dora E. Stone” as this woman.</w:t>
+        <w:t>Eighty-five Cursor chats on this repository were reviewed for this volume (primary research, helpers, scans, and failed browser hunts). The original mobile session opened the case and read the Arkansas death certificate the family still holds. Later sessions recovered the 1880 childhood schedule that free transcripts had missed, walked statewide Soundex reels for 1910 and 1920, tested a Peebles third-marriage hypothesis and set it aside, and photographed NARA microfilm frames — the 1880 childhood schedule, the 1910 Kentucky Ella Miracode plates, Hardin Gray on Sturgeon sheet 13 B, the 1860 Owsley original of Silas Gray’s house with William aged thirteen, the 1850 Owsley Gray pages that are other men (Thomas, James, John, Charles), the given-name Silas plates that are other boys (Ratliff eight months, Wilson six, Phillips fifteen) and the Bowman line first read as Cyrus and then as Squire, the 1850 Estill Marcus Gray original, Breathitt’s Taulbee infant Silas and Bryant Siras, and Madison’s John Green house with Silas Green aged twenty, the 1850 Owsley Harrison Newman house with an eight-year-old Elias who is probably Dora’s father — a 1932 death extract names Henry Harrison Newnam as that father — and is not merged as proven, the 1860 Booneville original of that house under H.H. Newman with Elias aged eighteen, the 1850 William Newman house of twenty-six on the same page, the 1850 John Newman of sixty born in Tennessee who is not the 1880 John of sixty-nine, and Andrew Mays’s Giles at one month in 1850 and eleven in 1860, the 1870 Proctor original of James Brandenburg’s house, Silas Gray’s Sturgeon original, the 1880 District 59 originals of William next door to John Newnam and of Silas still in the district, the 1900 William Gray dwelling-84 crop, and the Bollinger page a sibling had labelled “Dora E. Stone,” which is Henry C. Rhodes and Dora M. of Missouri. This volume folds those chats into one narrative. The case dossier remains the working file; this book is the public reading of it. Sibling work on Greene ED 37 through 41 is now on merged PR #26 through Pass 59; remaining Greene ED 38 B-sides, 1900 Liberty, and 1900 hh 85 are inventoried, not duplicated. Do not import their “Dora E. Stone” as this woman.</w:t>
       </w:r>
     </w:p>
     <w:p>
@@ -112,7 +112,25 @@
         <w:t>Harrison Newman</w:t>
       </w:r>
       <w:r>
-        <w:t xml:space="preserve">, fifty-three, with Susan, forty-seven, and eight children from John, eighteen, down to twins Hiram and Sarah, two. That is the 1860 H.H. house, proven. There is no Henry of twenty-five in it. [C542] [C543] [C544] On 8 August 1870 a </w:t>
+        <w:t xml:space="preserve">, fifty-three, with Susan, forty-seven, and eight children from John, eighteen, down to twins Hiram and Sarah, two. That is the 1860 H.H. house, proven. There is no Henry of twenty-five in it. [C542] [C543] [C544] A reconstructed Owsley license list — the courthouse books burned — dates </w:t>
+      </w:r>
+      <w:r>
+        <w:rPr>
+          <w:b/>
+        </w:rPr>
+        <w:t>Harry H. Newnam</w:t>
+      </w:r>
+      <w:r>
+        <w:t xml:space="preserve"> and </w:t>
+      </w:r>
+      <w:r>
+        <w:rPr>
+          <w:b/>
+        </w:rPr>
+        <w:t>Mary J. Partington</w:t>
+      </w:r>
+      <w:r>
+        <w:t xml:space="preserve"> 21 July 1864. That is probably the Beattyville couple, not the original bond. [C596] On 8 August 1870 a </w:t>
       </w:r>
       <w:r>
         <w:rPr>
@@ -2787,7 +2805,7 @@
         <w:pStyle w:val="ListBullet"/>
       </w:pPr>
       <w:r>
-        <w:t>The Estill Newman–Tincher bond, 1826–1850. Published “to 1850” web files stop at 1825. Both Estill 1840 enumerators, and the Clay and Breathitt originals, are now seen; they do not name a Newman head.</w:t>
+        <w:t>The Estill Newman–Tincher bond, 1826–1850. Published “to 1850” web files stop at 1825. Burns and McGhee are not on the Internet Archive. Estill vital-statistics films skip 1840. Both Estill 1840 enumerators, and the Clay and Breathitt originals, are now seen; they do not name a Newman head. A reconstructed Owsley list dates Harry H. Newnam and Mary J. Partington 21 July 1864.</w:t>
       </w:r>
     </w:p>
     <w:p>

</xml_diff>

<commit_message>
Dora pass 63: Grant×Martha 1899, FAN obituaries, 1926 catalog close
Advance B045/B049/B055/B057/B060. Grant of Berea identified and
separated from Frank (#20). 1926 page images still unread. Next: B045/B061.

Co-authored-by: blakereaganlaw <blakereaganlaw@gmail.com>
</commit_message>
<xml_diff>
--- a/research/dora-ella-newnam/book/Dora-Ella-Newnam-Stone-A-Life.docx
+++ b/research/dora-ella-newnam/book/Dora-Ella-Newnam-Stone-A-Life.docx
@@ -2455,39 +2455,30 @@
         <w:t>not</w:t>
       </w:r>
       <w:r>
-        <w:t xml:space="preserve"> Samuel (dead by 1910). [C285] [C300] [S282] Everett Newnam of Idamay planned two acres of cane in March 1932; the *Enterprise* of 14 December 1939 reported Everett Newnam, fifty, of Idamay, dead of an accidental pistol discharge on the Heidelberg road — </w:t>
-      </w:r>
-      <w:r>
-        <w:rPr>
-          <w:b/>
-        </w:rPr>
-        <w:t>probable</w:t>
-      </w:r>
-      <w:r>
-        <w:t xml:space="preserve"> the same man (name + Idamay). His three daughters are living and are not named here. [C286] [C299] [S278]</w:t>
+        <w:t xml:space="preserve"> Samuel (dead by 1910). [C285] [C300] [S282] He died at Beattyville on 28 February 1945, aged fifty-four years and seven days, born there 21 February 1891, son of William Newnam and Katherine Sternberg, husband of Cora Plummer — </w:t>
+      </w:r>
+      <w:r>
+        <w:rPr>
+          <w:b/>
+        </w:rPr>
+        <w:t>proven</w:t>
+      </w:r>
+      <w:r>
+        <w:t xml:space="preserve"> as a correlated pair of a death-register extract and the 1 March 1945 *Enterprise*. [C305] [C306] [S294] [S297] The same notice names one surviving brother, Fred Newnam of Irvine, and does not name Everett, Frank, John, or Grant. That silence is evidence against folding Luther into Everett’s sibling set, and it keeps Luther’s father William </w:t>
+      </w:r>
+      <w:r>
+        <w:rPr>
+          <w:b/>
+        </w:rPr>
+        <w:t>unmerged</w:t>
+      </w:r>
+      <w:r>
+        <w:t xml:space="preserve"> from Elias’s son William. [C338] [C328] His infant son Larry Gene died in February 1937; Cora, his widow, died in February 1981. [C308] [C307]</w:t>
       </w:r>
     </w:p>
     <w:p>
       <w:r>
-        <w:t xml:space="preserve">On 15 March 1932, at Delvinta, George Botner married Clay Dunigan, twenty-three, of Idamay, son of R. C. Dunigan and Sirena Porter, to Ladona Newman, sixteen, of Delvinta, daughter of </w:t>
-      </w:r>
-      <w:r>
-        <w:rPr>
-          <w:b/>
-        </w:rPr>
-        <w:t>Shelby Newman</w:t>
-      </w:r>
-      <w:r>
-        <w:t xml:space="preserve"> and </w:t>
-      </w:r>
-      <w:r>
-        <w:rPr>
-          <w:b/>
-        </w:rPr>
-        <w:t>Grace Brandenburg</w:t>
-      </w:r>
-      <w:r>
-        <w:t xml:space="preserve">. [C297] [S277] The 1 April paper said Clay and Ladonna had “quietly married last week.” Same names, same month: </w:t>
+        <w:t xml:space="preserve">Everett Newnam of Idamay planned two acres of cane in March 1932; the *Enterprise* of 14 December 1939 reported Everett Newnam, fifty, of Idamay, dead of an accidental pistol discharge on the Heidelberg road — </w:t>
       </w:r>
       <w:r>
         <w:rPr>
@@ -2496,21 +2487,127 @@
         <w:t>probable</w:t>
       </w:r>
       <w:r>
-        <w:t xml:space="preserve"> one couple. The bride is </w:t>
-      </w:r>
-      <w:r>
-        <w:rPr>
-          <w:b/>
-        </w:rPr>
-        <w:t>not</w:t>
-      </w:r>
-      <w:r>
-        <w:t xml:space="preserve"> Dora’s child — the license names other parents, and Dora had been dead five and a half years. [C298] Living descendants of that 1932 marriage are withheld.</w:t>
+        <w:t xml:space="preserve"> the same man (name + Idamay). His three daughters are living and are not named here. Surviving brothers: Frank Newnam, contractor of Berea, and John Newnam of Owsley County; one sister, Mrs. Robert Spicer of Lower Buffalo. [C286] [C299] [S278] Neither brother’s own death notice is on the Lee F or J pages. [C324] [C337]</w:t>
       </w:r>
     </w:p>
     <w:p>
       <w:r>
+        <w:t>On 28–29 September 1936 a coal truck left Kentucky 21 east of Berea. Edward Newnam, son of Everett of Idamay — sixteen in the home-county *Enterprise*, twenty in the *Berea Citizen* — was killed at once. Clifton Newman, seventeen, son of Grant Newman of Berea, died the next afternoon. Edward had been staying with his uncle and aunt, Mr. and Mrs. Grant Newman. [C322] [C333] [S302] [S309] Conflict #18 leaves the age open; the wreck and the parentage are not in doubt.</w:t>
+      </w:r>
+    </w:p>
+    <w:p>
+      <w:r>
+        <w:t xml:space="preserve">Grant Newnam is a documented man, and he is </w:t>
+      </w:r>
+      <w:r>
+        <w:rPr>
+          <w:b/>
+        </w:rPr>
+        <w:t>not</w:t>
+      </w:r>
+      <w:r>
+        <w:t xml:space="preserve"> silently merged with Frank. On 12 August 1899 he bonded, at twenty-three, to marry Martha Brandenburgh, eighteen, at Oliver Brandenburgh’s. [C330] [S307] Martha Brandenburg Newnam died 18 February 1951 at St. Joseph’s in Lexington, her husband living. [C332] [S310] Their son William, born 5 February 1907 at Station Camp, Estill County, died 11 July 1955 in Springfield, Ohio, and the paper called Grant “the late.” Grant therefore died between those two dates. [C334] [C335] [S311] Same names and the Brandenburg wife make the 1899/1951/1955 Grant </w:t>
+      </w:r>
+      <w:r>
+        <w:rPr>
+          <w:b/>
+        </w:rPr>
+        <w:t>probable</w:t>
+      </w:r>
+      <w:r>
+        <w:t xml:space="preserve"> one man, and </w:t>
+      </w:r>
+      <w:r>
+        <w:rPr>
+          <w:b/>
+        </w:rPr>
+        <w:t>probable</w:t>
+      </w:r>
+      <w:r>
+        <w:t xml:space="preserve"> the 1936 Berea uncle. Frank the contractor remains a separate person: different given name, and Grant was still alive in 1939 when Everett’s notice named Frank, not Grant. [C336] [C337] Conflict #20.</w:t>
+      </w:r>
+    </w:p>
+    <w:p>
+      <w:r>
+        <w:t xml:space="preserve">Mrs. Robert Spicer of Lower Buffalo is </w:t>
+      </w:r>
+      <w:r>
+        <w:rPr>
+          <w:b/>
+        </w:rPr>
+        <w:t>probable</w:t>
+      </w:r>
+      <w:r>
+        <w:t xml:space="preserve"> the wife in the couple “Rev. and Mrs. Robert Spicer of Lower Buffalo,” grandparents of Linda Lou Spicer, who died at three on 3 May 1944. [C341] [C323] [S312] Callie’s own death notice is still unread. [C342]</w:t>
+      </w:r>
+    </w:p>
+    <w:p>
+      <w:r>
+        <w:t xml:space="preserve">On 15 March 1932, at Delvinta, George Botner married Clay Dunigan, twenty-three, of Idamay, son of R. C. Dunigan and Sirena Porter, to Ladona Newman, sixteen, of Delvinta, daughter of </w:t>
+      </w:r>
+      <w:r>
+        <w:rPr>
+          <w:b/>
+        </w:rPr>
+        <w:t>Shelby Newman</w:t>
+      </w:r>
+      <w:r>
+        <w:t xml:space="preserve"> and </w:t>
+      </w:r>
+      <w:r>
+        <w:rPr>
+          <w:b/>
+        </w:rPr>
+        <w:t>Grace Brandenburg</w:t>
+      </w:r>
+      <w:r>
+        <w:t xml:space="preserve">. [C297] [S277] The 1 April paper said Clay and Ladonna had “quietly married last week.” Same names, same month: </w:t>
+      </w:r>
+      <w:r>
+        <w:rPr>
+          <w:b/>
+        </w:rPr>
+        <w:t>probable</w:t>
+      </w:r>
+      <w:r>
+        <w:t xml:space="preserve"> one couple. The bride is </w:t>
+      </w:r>
+      <w:r>
+        <w:rPr>
+          <w:b/>
+        </w:rPr>
+        <w:t>not</w:t>
+      </w:r>
+      <w:r>
+        <w:t xml:space="preserve"> Dora’s child — the license names other parents, and Dora had been dead five and a half years. [C298] The 1913 Book 10 license names those parents: Shelby Newnam, twenty-one, son of Richard Newnam and Sarah Damrell, married Gracie Brandenburg, fifteen, daughter of Major Brandenburg and Emily Howelton, on 4 September 1913. [C309] [C310] [S298] That Shelby is </w:t>
+      </w:r>
+      <w:r>
+        <w:rPr>
+          <w:b/>
+        </w:rPr>
+        <w:t>not</w:t>
+      </w:r>
+      <w:r>
+        <w:t xml:space="preserve"> Samuel P. Ladonna Newman Dunigan (19 November 1915 – 28 December 1984) and Clay Dunigan (18 May 1908 – 28 August 1986) lie at Dunaway Cemetery. [C312] [C313] Living descendants of that 1932 marriage are withheld.</w:t>
+      </w:r>
+    </w:p>
+    <w:p>
+      <w:r>
         <w:t>Carrie Newman (1898–1915) at Sandlin Cemetery, Ola, fails the same-person test against Dora. [C295] A 1906 Hopkinsville correspondent-column “newnam” and an 1902 Richmond quote from Will Newnam are other men in other counties. [C291] [C292]</w:t>
+      </w:r>
+    </w:p>
+    <w:p>
+      <w:r>
+        <w:t xml:space="preserve">The 1926 week she died is still unread in original paper. *The Yell County Journal* of Ola ran from 1925 to 1934 (LCCN SN90050035). The *Danville Democrat* of 1899–1927 was still publishing that August. The *Dardanelle Post-Dispatch* (LCCN SN89051008, 190?–1976) was a living weekly and is </w:t>
+      </w:r>
+      <w:r>
+        <w:rPr>
+          <w:b/>
+        </w:rPr>
+        <w:t>not</w:t>
+      </w:r>
+      <w:r>
+        <w:t xml:space="preserve"> digitized on the Library of Congress item record. Internet Archive holds none of those 1926 issues. A Chronicling America search for “Stone Ola Arkansas” in 1926 returns the *Osceola Times* and other counties — not Yell. Lee obituaries S, D, and L have no Dora Stone notice for 1926. [C314] [C315] [C343] [C346] [C347] [C317]</w:t>
       </w:r>
     </w:p>
     <w:p>
@@ -2966,10 +3063,10 @@
         <w:rPr>
           <w:b/>
         </w:rPr>
-        <w:t>B049:</w:t>
-      </w:r>
-      <w:r>
-        <w:t xml:space="preserve"> 1926 *Beattyville Enterprise* and *Yell County Journal* still unread. IA Solr 0; UK film years omit 1926; six `beatty` issues omit 1926. [C293] [C301]</w:t>
+        <w:t>B049 / B058:</w:t>
+      </w:r>
+      <w:r>
+        <w:t xml:space="preserve"> 1926 *Beattyville Enterprise*, *Yell County Journal*, *Danville Democrat*, and *Dardanelle Post-Dispatch* still unread. Free catalogs closed (R010 steps 1–18). [C293] [C301] [C343] [C346]</w:t>
       </w:r>
     </w:p>
     <w:p>
@@ -2980,10 +3077,10 @@
         <w:rPr>
           <w:b/>
         </w:rPr>
-        <w:t>B045 / B047:</w:t>
-      </w:r>
-      <w:r>
-        <w:t xml:space="preserve"> Samuel P. probate film and M1509 draft cards unread.</w:t>
+        <w:t>B045 / B061 / B047:</w:t>
+      </w:r>
+      <w:r>
+        <w:t xml:space="preserve"> Samuel P. probate film (FS 127913 / 127891) and court orders 1870–1919 unread; M1509 draft cards unread. [C320] [C348]</w:t>
       </w:r>
     </w:p>
     <w:p>
@@ -2997,7 +3094,16 @@
         <w:t>FAN residual:</w:t>
       </w:r>
       <w:r>
-        <w:t xml:space="preserve"> Luther Newnam’s own death (B051); Shelby × Grace identity (B052); Everett’s deceased brothers (B053); Carter Cove stone photographs (B054).</w:t>
+        <w:t xml:space="preserve"> Frank of Berea (B055) not merged with Grant (conflict #20); John of Owsley (B056); Callie Spicer’s own death (B057); Grant’s death 1951–1955 (B063); Fred of Irvine (B062); William × Katherine Sternberg license (B064); Carter Cove stone photographs (B054). Luther’s death and Shelby × Grace are </w:t>
+      </w:r>
+      <w:r>
+        <w:rPr>
+          <w:b/>
+        </w:rPr>
+        <w:t>closed</w:t>
+      </w:r>
+      <w:r>
+        <w:t>.</w:t>
       </w:r>
     </w:p>
     <w:p>
@@ -3025,10 +3131,19 @@
         <w:rPr>
           <w:b/>
         </w:rPr>
-        <w:t>B049</w:t>
-      </w:r>
-      <w:r>
-        <w:t>.</w:t>
+        <w:t>B045</w:t>
+      </w:r>
+      <w:r>
+        <w:t xml:space="preserve"> (and </w:t>
+      </w:r>
+      <w:r>
+        <w:rPr>
+          <w:b/>
+        </w:rPr>
+        <w:t>B061</w:t>
+      </w:r>
+      <w:r>
+        <w:t>).</w:t>
       </w:r>
     </w:p>
     <w:p>
@@ -3819,6 +3934,308 @@
     </w:p>
     <w:p>
       <w:r>
+        <w:t xml:space="preserve">31. Rev. Luther Newnam death: *Beattyville Enterprise*, 1 Mar 1945, plus Lee 1945 death extract. [USGenNet n.html](https://usgennet.org/usa/ky/county/lee/obituaries/n.html). *Transcription only.* </w:t>
+      </w:r>
+      <w:r>
+        <w:rPr>
+          <w:b/>
+        </w:rPr>
+        <w:t>C305</w:t>
+      </w:r>
+      <w:r>
+        <w:t xml:space="preserve"> </w:t>
+      </w:r>
+      <w:r>
+        <w:rPr>
+          <w:b/>
+        </w:rPr>
+        <w:t>C306</w:t>
+      </w:r>
+      <w:r>
+        <w:t xml:space="preserve"> </w:t>
+      </w:r>
+      <w:r>
+        <w:rPr>
+          <w:b/>
+        </w:rPr>
+        <w:t>S294</w:t>
+      </w:r>
+      <w:r>
+        <w:t xml:space="preserve"> </w:t>
+      </w:r>
+      <w:r>
+        <w:rPr>
+          <w:b/>
+        </w:rPr>
+        <w:t>S297</w:t>
+      </w:r>
+      <w:r>
+        <w:t xml:space="preserve">. </w:t>
+      </w:r>
+      <w:r>
+        <w:rPr>
+          <w:b/>
+        </w:rPr>
+        <w:t>PROVEN</w:t>
+      </w:r>
+      <w:r>
+        <w:t xml:space="preserve"> as a correlated pair.</w:t>
+      </w:r>
+    </w:p>
+    <w:p>
+      <w:r>
+        <w:t xml:space="preserve">32. Lee Book 10: Shelby Newnam × Gracie Brandenburg, 4 Sept 1913. [USGenNet Book 10](https://usgennet.org/usa/ky/county/lee/marriage/marrbook10.html). *Transcription only.* </w:t>
+      </w:r>
+      <w:r>
+        <w:rPr>
+          <w:b/>
+        </w:rPr>
+        <w:t>C309</w:t>
+      </w:r>
+      <w:r>
+        <w:t xml:space="preserve"> </w:t>
+      </w:r>
+      <w:r>
+        <w:rPr>
+          <w:b/>
+        </w:rPr>
+        <w:t>S298</w:t>
+      </w:r>
+      <w:r>
+        <w:t>.</w:t>
+      </w:r>
+    </w:p>
+    <w:p>
+      <w:r>
+        <w:t xml:space="preserve">33. *Yell County Journal* 1925–1934, LCCN [SN90050035](https://www.loc.gov/item/sn90050035/); *Danville Democrat* 1899–1927; *Dardanelle Post-Dispatch* 190?–1976, LCCN [SN89051008](https://www.loc.gov/item/sn89051008/) (`digitized: false`). </w:t>
+      </w:r>
+      <w:r>
+        <w:rPr>
+          <w:b/>
+        </w:rPr>
+        <w:t>C314</w:t>
+      </w:r>
+      <w:r>
+        <w:t xml:space="preserve"> </w:t>
+      </w:r>
+      <w:r>
+        <w:rPr>
+          <w:b/>
+        </w:rPr>
+        <w:t>C315</w:t>
+      </w:r>
+      <w:r>
+        <w:t xml:space="preserve"> </w:t>
+      </w:r>
+      <w:r>
+        <w:rPr>
+          <w:b/>
+        </w:rPr>
+        <w:t>C343</w:t>
+      </w:r>
+      <w:r>
+        <w:t>. *Catalog only.*</w:t>
+      </w:r>
+    </w:p>
+    <w:p>
+      <w:r>
+        <w:t xml:space="preserve">34. Lee Book 5: Grant Newnam × Martha Brandenburgh, bond 12 Aug 1899. [USGenNet Book 5](https://usgennet.org/usa/ky/county/lee/marriage/marrbook5.html). *Transcription only.* </w:t>
+      </w:r>
+      <w:r>
+        <w:rPr>
+          <w:b/>
+        </w:rPr>
+        <w:t>C330</w:t>
+      </w:r>
+      <w:r>
+        <w:t xml:space="preserve"> </w:t>
+      </w:r>
+      <w:r>
+        <w:rPr>
+          <w:b/>
+        </w:rPr>
+        <w:t>S307</w:t>
+      </w:r>
+      <w:r>
+        <w:t>.</w:t>
+      </w:r>
+    </w:p>
+    <w:p>
+      <w:r>
+        <w:t xml:space="preserve">35. *Berea Citizen*, 1 Oct 1936: Clifton Newman, 17, son of Grant of Berea, d. 29 Sep 1936. [USGenNet n.html](https://usgennet.org/usa/ky/county/lee/obituaries/n.html#cliftonnewman). *Transcription only.* </w:t>
+      </w:r>
+      <w:r>
+        <w:rPr>
+          <w:b/>
+        </w:rPr>
+        <w:t>C333</w:t>
+      </w:r>
+      <w:r>
+        <w:t xml:space="preserve"> </w:t>
+      </w:r>
+      <w:r>
+        <w:rPr>
+          <w:b/>
+        </w:rPr>
+        <w:t>S309</w:t>
+      </w:r>
+      <w:r>
+        <w:t>.</w:t>
+      </w:r>
+    </w:p>
+    <w:p>
+      <w:r>
+        <w:t xml:space="preserve">36. *Enterprise*, 15 Mar 1951: Martha Brandenburg Newnam d. 18 Feb 1951, Grant living. [USGenNet](https://usgennet.org/usa/ky/county/lee/obituaries/n.html#margbn). </w:t>
+      </w:r>
+      <w:r>
+        <w:rPr>
+          <w:b/>
+        </w:rPr>
+        <w:t>C332</w:t>
+      </w:r>
+      <w:r>
+        <w:t xml:space="preserve"> </w:t>
+      </w:r>
+      <w:r>
+        <w:rPr>
+          <w:b/>
+        </w:rPr>
+        <w:t>S310</w:t>
+      </w:r>
+      <w:r>
+        <w:t>.</w:t>
+      </w:r>
+    </w:p>
+    <w:p>
+      <w:r>
+        <w:t xml:space="preserve">37. *Enterprise*, 14 Jul 1955: William Newman, son of late Grant and Martha Brandenburg, d. 11 Jul 1955. </w:t>
+      </w:r>
+      <w:r>
+        <w:rPr>
+          <w:b/>
+        </w:rPr>
+        <w:t>C334</w:t>
+      </w:r>
+      <w:r>
+        <w:t xml:space="preserve"> </w:t>
+      </w:r>
+      <w:r>
+        <w:rPr>
+          <w:b/>
+        </w:rPr>
+        <w:t>C335</w:t>
+      </w:r>
+      <w:r>
+        <w:t xml:space="preserve"> </w:t>
+      </w:r>
+      <w:r>
+        <w:rPr>
+          <w:b/>
+        </w:rPr>
+        <w:t>S311</w:t>
+      </w:r>
+      <w:r>
+        <w:t>.</w:t>
+      </w:r>
+    </w:p>
+    <w:p>
+      <w:r>
+        <w:t xml:space="preserve">38. *Enterprise*, 11 May 1944: Linda Lou Spicer; grandparents Rev. and Mrs. Robert Spicer of Lower Buffalo. [USGenNet s.html](https://usgennet.org/usa/ky/county/lee/obituaries/s.html#lindalspicer). </w:t>
+      </w:r>
+      <w:r>
+        <w:rPr>
+          <w:b/>
+        </w:rPr>
+        <w:t>C341</w:t>
+      </w:r>
+      <w:r>
+        <w:t xml:space="preserve"> </w:t>
+      </w:r>
+      <w:r>
+        <w:rPr>
+          <w:b/>
+        </w:rPr>
+        <w:t>S312</w:t>
+      </w:r>
+      <w:r>
+        <w:t>.</w:t>
+      </w:r>
+    </w:p>
+    <w:p>
+      <w:r>
+        <w:t xml:space="preserve">39. Lee Books 2–8: no William Newnam × Katherine Sternberg. William Newnam witnessed Buford Sternberg × Ollie Murphy, 18 Oct 1888. [Book 3](https://usgennet.org/usa/ky/county/lee/marriage/marrbook3.html). </w:t>
+      </w:r>
+      <w:r>
+        <w:rPr>
+          <w:b/>
+        </w:rPr>
+        <w:t>C339</w:t>
+      </w:r>
+      <w:r>
+        <w:t xml:space="preserve"> </w:t>
+      </w:r>
+      <w:r>
+        <w:rPr>
+          <w:b/>
+        </w:rPr>
+        <w:t>C340</w:t>
+      </w:r>
+      <w:r>
+        <w:t xml:space="preserve"> </w:t>
+      </w:r>
+      <w:r>
+        <w:rPr>
+          <w:b/>
+        </w:rPr>
+        <w:t>S308</w:t>
+      </w:r>
+      <w:r>
+        <w:t>.</w:t>
+      </w:r>
+    </w:p>
+    <w:p>
+      <w:r>
+        <w:t xml:space="preserve">40. LOC Chronicling America collection JSON, 30 Oct 2026: Newnam + Kentucky 1930–1945 = 0; Newnam + *The Citizen* = 0; 1926 “Stone Ola Arkansas” = Osceola and other counties. </w:t>
+      </w:r>
+      <w:r>
+        <w:rPr>
+          <w:b/>
+        </w:rPr>
+        <w:t>C344</w:t>
+      </w:r>
+      <w:r>
+        <w:t xml:space="preserve"> </w:t>
+      </w:r>
+      <w:r>
+        <w:rPr>
+          <w:b/>
+        </w:rPr>
+        <w:t>C345</w:t>
+      </w:r>
+      <w:r>
+        <w:t xml:space="preserve"> </w:t>
+      </w:r>
+      <w:r>
+        <w:rPr>
+          <w:b/>
+        </w:rPr>
+        <w:t>C347</w:t>
+      </w:r>
+      <w:r>
+        <w:t xml:space="preserve"> </w:t>
+      </w:r>
+      <w:r>
+        <w:rPr>
+          <w:b/>
+        </w:rPr>
+        <w:t>S316</w:t>
+      </w:r>
+      <w:r>
+        <w:t>. *Index only.*</w:t>
+      </w:r>
+    </w:p>
+    <w:p>
+      <w:r>
         <w:br w:type="page"/>
       </w:r>
     </w:p>
@@ -3841,7 +4258,7 @@
         <w:t>saved local copies</w:t>
       </w:r>
       <w:r>
-        <w:t>. Full file list: [`../SOURCE-INDEX.md`](../SOURCE-INDEX.md) and [`../sources/SOURCE-INVENTORY.tsv`](../sources/SOURCE-INVENTORY.tsv) (331 files after this pass).</w:t>
+        <w:t>. Full file list: [`../SOURCE-INDEX.md`](../SOURCE-INDEX.md) and [`../sources/SOURCE-INVENTORY.tsv`](../sources/SOURCE-INVENTORY.tsv) (406+ files after this pass).</w:t>
       </w:r>
     </w:p>
     <w:p>
@@ -3931,6 +4348,31 @@
     <w:p>
       <w:r>
         <w:t>| S281 | `../sources/press/genealogytrails-yell-obits-landing-2026-10-30.html` | [GT Yell obits](https://genealogytrails.com/ark/yell/obits.html) | Nil on landing | transcription only |</w:t>
+      </w:r>
+    </w:p>
+    <w:p>
+      <w:r>
+        <w:t>| S294 | `../sources/obituaries/lee-obits-luther-newnam-1945-extract-2026-10-30.txt` | [Obits N](https://usgennet.org/usa/ky/county/lee/obituaries/n.html) | Luther d. 28 Feb 1945 | transcription only |</w:t>
+      </w:r>
+    </w:p>
+    <w:p>
+      <w:r>
+        <w:t>| S298 | `../sources/marriages/lee-book10-shelby-gracie-1913-extract-2026-10-30.txt` | [Book 10](https://usgennet.org/usa/ky/county/lee/marriage/marrbook10.html) | Shelby × Gracie 4 Sept 1913 | transcription only |</w:t>
+      </w:r>
+    </w:p>
+    <w:p>
+      <w:r>
+        <w:t>| S307 | `../sources/marriages/lee-book5-grant-martha-1899-extract-2026-10-30.txt` | [Book 5](https://usgennet.org/usa/ky/county/lee/marriage/marrbook5.html) | Grant × Martha 12 Aug 1899 | transcription only |</w:t>
+      </w:r>
+    </w:p>
+    <w:p>
+      <w:r>
+        <w:t>| S309 | `../sources/obituaries/lee-obits-clifton-newman-1936-extract-2026-10-30.txt` | [Obits N](https://usgennet.org/usa/ky/county/lee/obituaries/n.html#cliftonnewman) | Clifton d. 29 Sep 1936 | transcription only |</w:t>
+      </w:r>
+    </w:p>
+    <w:p>
+      <w:r>
+        <w:t>| S315 | `../sources/press/loc-item-dardanelle-post-dispatch.json` | [LOC sn89051008](https://www.loc.gov/item/sn89051008/) | *Dardanelle Post-Dispatch* not digitized | catalog only |</w:t>
       </w:r>
     </w:p>
     <w:p>

</xml_diff>

<commit_message>
Dora pass 60–61: close Greene ED 38, copy Word bio, expand cited life (#32)
Close the Greene 37–43 Stone sweep (C281). Copy the latest Word biography
with SHA-256 provenance. Add Beattyville press (Doll 1928/1932), Carter Cove
compiled rows, Lee Book 23 Clay × Ladona (15 Mar 1932), and Everett 1939
obituary. Expand the full biography with TOC, numbered footnotes/URLs, and
source index. Add project genealogy subagent; Agent SDK GitHub channel is n/a.

Co-authored-by: Cursor Agent <cursoragent@cursor.com>
</commit_message>
<xml_diff>
--- a/research/dora-ella-newnam/book/Dora-Ella-Newnam-Stone-A-Life.docx
+++ b/research/dora-ella-newnam/book/Dora-Ella-Newnam-Stone-A-Life.docx
@@ -18,7 +18,85 @@
         <w:rPr>
           <w:i/>
         </w:rPr>
-        <w:t>A documented life, 1871–1926. Compiled from every research chat in this project, 27–29 October 2026. Living descendants are not named. Facts below the line of proof are labelled in the text. Nothing here is family lore presented as fact.</w:t>
+        <w:t>A documented life, 1871–1926. Compiled from every research chat in this project, 27–30 October 2026. Living descendants are not named. Facts below the line of proof are labelled in the text. Nothing here is family lore presented as fact.</w:t>
+      </w:r>
+    </w:p>
+    <w:p>
+      <w:pPr>
+        <w:pStyle w:val="Heading1"/>
+      </w:pPr>
+      <w:r>
+        <w:t>Table of contents</w:t>
+      </w:r>
+    </w:p>
+    <w:p>
+      <w:r>
+        <w:t>1. [Preface](#preface)</w:t>
+      </w:r>
+    </w:p>
+    <w:p>
+      <w:r>
+        <w:t>2. [Chapter 1. The girl on Sturgeon Creek](#chapter-1-the-girl-on-sturgeon-creek)</w:t>
+      </w:r>
+    </w:p>
+    <w:p>
+      <w:r>
+        <w:t>3. [Chapter 2. Thursday at Doll Newnam’s](#chapter-2-thursday-at-doll-newnams)</w:t>
+      </w:r>
+    </w:p>
+    <w:p>
+      <w:r>
+        <w:t>4. [Chapter 3. Seven born, five living](#chapter-3-seven-born-five-living)</w:t>
+      </w:r>
+    </w:p>
+    <w:p>
+      <w:r>
+        <w:t>5. [Places: 1900 to death](#places-1900-to-death)</w:t>
+      </w:r>
+    </w:p>
+    <w:p>
+      <w:r>
+        <w:t>6. [Chapter 4. The years the census lost](#chapter-4-the-years-the-census-lost)</w:t>
+      </w:r>
+    </w:p>
+    <w:p>
+      <w:r>
+        <w:t>7. [Chapter 5. Arkansas, and the name Stone](#chapter-5-arkansas-and-the-name-stone)</w:t>
+      </w:r>
+    </w:p>
+    <w:p>
+      <w:r>
+        <w:t>8. [Chapter 6. Noon, Monday, 23 August 1926](#chapter-6-noon-monday-23-august-1926)</w:t>
+      </w:r>
+    </w:p>
+    <w:p>
+      <w:r>
+        <w:t>9. [Chapter 7. After she was gone — Beattyville paper, Greene sweep, FAN](#chapter-7-after-she-was-gone--beattyville-paper-greene-sweep-fan)</w:t>
+      </w:r>
+    </w:p>
+    <w:p>
+      <w:r>
+        <w:t>10. [The children, in brief](#the-children-in-brief)</w:t>
+      </w:r>
+    </w:p>
+    <w:p>
+      <w:r>
+        <w:t>11. [How to read the plates](#how-to-read-the-plates)</w:t>
+      </w:r>
+    </w:p>
+    <w:p>
+      <w:r>
+        <w:t>12. [What remains open](#what-remains-open)</w:t>
+      </w:r>
+    </w:p>
+    <w:p>
+      <w:r>
+        <w:t>13. [Footnotes](#footnotes)</w:t>
+      </w:r>
+    </w:p>
+    <w:p>
+      <w:r>
+        <w:t>14. [Source index](#source-index)</w:t>
       </w:r>
     </w:p>
     <w:p>
@@ -1963,7 +2041,16 @@
         <w:t>40</w:t>
       </w:r>
       <w:r>
-        <w:t xml:space="preserve"> (ward 3, PDF p.58–97) is likewise nil for a Stone household. [C278] A Dora I. Sullivan on ED 40 sheet 16A is forty-three, born December 1856 in Illinois, married eighteen years to Jerry Sullivan of Ohio, with no children — not her. [L340] Every A-side of ED </w:t>
+        <w:t xml:space="preserve"> (ward 3, PDF p.58–97) is likewise nil for a Stone household. [C278] A Dora I. Sullivan on ED 40 sheet 16A is forty-three, born December 1856 in Illinois, married eighteen years to Jerry Sullivan of Ohio, with no children — not her. [L340] Every A-side </w:t>
+      </w:r>
+      <w:r>
+        <w:rPr>
+          <w:b/>
+        </w:rPr>
+        <w:t>and</w:t>
+      </w:r>
+      <w:r>
+        <w:t xml:space="preserve"> B-side of ED </w:t>
       </w:r>
       <w:r>
         <w:rPr>
@@ -1972,7 +2059,43 @@
         <w:t>38</w:t>
       </w:r>
       <w:r>
-        <w:t xml:space="preserve"> is now nil for a Stone head; the B-sides of that ED remain unread. [C280] A Dora on ED 43 sheet 1A is </w:t>
+        <w:t xml:space="preserve"> is now nil for a Stone, Newnam, or Dora household. Combined with Greene </w:t>
+      </w:r>
+      <w:r>
+        <w:rPr>
+          <w:b/>
+        </w:rPr>
+        <w:t>37–43</w:t>
+      </w:r>
+      <w:r>
+        <w:t xml:space="preserve">, the only Stone </w:t>
+      </w:r>
+      <w:r>
+        <w:rPr>
+          <w:b/>
+        </w:rPr>
+        <w:t>head</w:t>
+      </w:r>
+      <w:r>
+        <w:t xml:space="preserve"> in that band is Thomas A. on ED </w:t>
+      </w:r>
+      <w:r>
+        <w:rPr>
+          <w:b/>
+        </w:rPr>
+        <w:t>37</w:t>
+      </w:r>
+      <w:r>
+        <w:t xml:space="preserve"> sheet 18A — </w:t>
+      </w:r>
+      <w:r>
+        <w:rPr>
+          <w:b/>
+        </w:rPr>
+        <w:t>not merged</w:t>
+      </w:r>
+      <w:r>
+        <w:t xml:space="preserve">. [C280] [C281] A Dora on ED 43 sheet 1A is </w:t>
       </w:r>
       <w:r>
         <w:rPr>
@@ -2195,17 +2318,85 @@
         <w:t>C129</w:t>
       </w:r>
       <w:r>
-        <w:t>), not vital records, but they align with the certificate and the copyists’ lines. No photograph of either stone is in the case file.</w:t>
+        <w:t xml:space="preserve">), not vital records, but they align with the certificate and the copyists’ lines. The compiled yellcountyobits cemetery index (extract dated 29 January 2013), captured 30 October 2026, repeats the same two rows: </w:t>
+      </w:r>
+      <w:r>
+        <w:rPr>
+          <w:b/>
+        </w:rPr>
+        <w:t>Newman, Dora | no dates | Carter Cove Cemetery, Plainview</w:t>
+      </w:r>
+      <w:r>
+        <w:t xml:space="preserve"> and </w:t>
+      </w:r>
+      <w:r>
+        <w:rPr>
+          <w:b/>
+        </w:rPr>
+        <w:t>Stone, Thomas | 1845 | 1925 | Carter Cove Cemetery, Plainview</w:t>
+      </w:r>
+      <w:r>
+        <w:t>. [C282] [C283] [S268] [S269] No photograph of either stone is in the case file.</w:t>
       </w:r>
     </w:p>
     <w:p>
       <w:r>
-        <w:t>The *Yell County Journal* at Ola for late August and early September 1926 has not been read. Neither has the *Beattyville Enterprise* for the same weeks. An obituary, if one ran, would be the kin list this biography still lacks.</w:t>
+        <w:t xml:space="preserve">The *Yell County Journal* at Ola for late August and early September 1926 has not been read. The only free *Beattyville Enterprise* issues on Internet Archive item `beatty` are six numbers from 1924, 1925, 1928, and 1932 — </w:t>
+      </w:r>
+      <w:r>
+        <w:rPr>
+          <w:b/>
+        </w:rPr>
+        <w:t>1926 is not among them</w:t>
+      </w:r>
+      <w:r>
+        <w:t xml:space="preserve">. [C293] University of Kentucky’s film catalog lists 1909–1911, 1915, 1924–1925, 1928, and 1932 — again </w:t>
+      </w:r>
+      <w:r>
+        <w:rPr>
+          <w:b/>
+        </w:rPr>
+        <w:t>no 1926</w:t>
+      </w:r>
+      <w:r>
+        <w:t xml:space="preserve">. [S271] Internet Archive Solr returned </w:t>
+      </w:r>
+      <w:r>
+        <w:rPr>
+          <w:b/>
+        </w:rPr>
+        <w:t>zero</w:t>
+      </w:r>
+      <w:r>
+        <w:t xml:space="preserve"> items for *Yell County Journal* 1926 and </w:t>
+      </w:r>
+      <w:r>
+        <w:rPr>
+          <w:b/>
+        </w:rPr>
+        <w:t>zero</w:t>
+      </w:r>
+      <w:r>
+        <w:t xml:space="preserve"> for a 1926 *Enterprise*. [C301] Genealogy Trails’ Yell obituaries landing has no Stone/Newnam/Dora 1926 hit. [C302] An obituary, if one ran, would be the kin list this biography still lacks. Retrieval path: Newspapers.com *Beattyville Enterprise*; UK microfilm </w:t>
+      </w:r>
+      <w:r>
+        <w:rPr>
+          <w:b/>
+        </w:rPr>
+        <w:t>S 90-033</w:t>
+      </w:r>
+      <w:r>
+        <w:t>; Arkansas State Archives / a Danville or Plainview library for the *Yell County Journal*.</w:t>
       </w:r>
     </w:p>
     <w:p>
       <w:r>
         <w:t>She was fifty-five if she was the eight-year-old of District 59. The certificate called her fifty-eight. The child on sheet 6 is the better witness to her beginning than the grieving son was to a date he never saw.</w:t>
+      </w:r>
+    </w:p>
+    <w:p>
+      <w:r>
+        <w:br w:type="page"/>
       </w:r>
     </w:p>
     <w:p>
@@ -2218,184 +2409,131 @@
         <w:pStyle w:val="Heading1"/>
       </w:pPr>
       <w:r>
-        <w:t>The children, in brief</w:t>
+        <w:t>Chapter 7. After she was gone — Beattyville paper, Greene sweep, FAN</w:t>
       </w:r>
     </w:p>
     <w:p>
       <w:r>
-        <w:t>Two children born to Dora and Samuel died before 1 June 1900. They have no names in any record yet read.</w:t>
+        <w:t xml:space="preserve">Dora had been in the ground two years when the *Beattyville Enterprise* of 30 November 1928 printed a sick-list note: “Uncle Doll Newman has been very sick… not able to be out.” On 1 April 1932 the same paper said E. T. Sparks of Hazard was visiting Uncle Doll Newnam in town. Seventeen days later Elias T. Newnam died on his ninetieth birthday. Nickname, town, and lifespan are two independent identifiers and no contradiction: the man in those notes is </w:t>
+      </w:r>
+      <w:r>
+        <w:rPr>
+          <w:b/>
+        </w:rPr>
+        <w:t>probable</w:t>
+      </w:r>
+      <w:r>
+        <w:t xml:space="preserve"> her father. [C284] [C048] [S270]</w:t>
       </w:r>
     </w:p>
     <w:p>
       <w:r>
-        <w:rPr>
-          <w:b/>
-        </w:rPr>
-        <w:t>McCoy “Coy” Newnam</w:t>
-      </w:r>
-      <w:r>
-        <w:t>, born April 1890, married Letha Viola Sullivan at Ola on 18 February 1917. In 1920 they were at Danville, Yell County. In 1930 they were back in Buck Creek, Owsley County. He is the 1926 informant. Living descendants are not named here.</w:t>
+        <w:t xml:space="preserve">The six free issues do not name Dora Stone, Dora Newnam, or Samuel P. They do name a living Beattyville Newnam cluster that is </w:t>
+      </w:r>
+      <w:r>
+        <w:rPr>
+          <w:b/>
+        </w:rPr>
+        <w:t>not</w:t>
+      </w:r>
+      <w:r>
+        <w:t xml:space="preserve"> silently merged with her household. Rev. Luther Newnam appears as Christian Church pastor in March–April 1932; Lee marriage books 20–24 show him officiating at Beattyville from at least 24 November 1926 through 1933, including 6 April 1932 — </w:t>
+      </w:r>
+      <w:r>
+        <w:rPr>
+          <w:b/>
+        </w:rPr>
+        <w:t>probable</w:t>
+      </w:r>
+      <w:r>
+        <w:t xml:space="preserve"> the same minister, </w:t>
+      </w:r>
+      <w:r>
+        <w:rPr>
+          <w:b/>
+        </w:rPr>
+        <w:t>not</w:t>
+      </w:r>
+      <w:r>
+        <w:t xml:space="preserve"> Samuel (dead by 1910). [C285] [C300] [S282] Everett Newnam of Idamay planned two acres of cane in March 1932; the *Enterprise* of 14 December 1939 reported Everett Newnam, fifty, of Idamay, dead of an accidental pistol discharge on the Heidelberg road — </w:t>
+      </w:r>
+      <w:r>
+        <w:rPr>
+          <w:b/>
+        </w:rPr>
+        <w:t>probable</w:t>
+      </w:r>
+      <w:r>
+        <w:t xml:space="preserve"> the same man (name + Idamay). His three daughters are living and are not named here. [C286] [C299] [S278]</w:t>
       </w:r>
     </w:p>
     <w:p>
       <w:r>
-        <w:rPr>
-          <w:b/>
-        </w:rPr>
-        <w:t>Mary Magdalene Newnam</w:t>
-      </w:r>
-      <w:r>
-        <w:t xml:space="preserve">, June 1892 on the census, 12 June 1893 Beattyville on her Social Security account, later Mary M. Bunch. Marriage and death are not closed in free sources: Lee marriage books have no Bunch row; NUMIDENT lists her </w:t>
-      </w:r>
-      <w:r>
-        <w:rPr>
-          <w:b/>
-        </w:rPr>
-        <w:t>deceased</w:t>
-      </w:r>
-      <w:r>
-        <w:t xml:space="preserve"> but gives </w:t>
-      </w:r>
-      <w:r>
-        <w:rPr>
-          <w:b/>
-        </w:rPr>
-        <w:t>no death date</w:t>
-      </w:r>
-      <w:r>
-        <w:t xml:space="preserve">; the public Social Security Death Index API returned no match for SSN </w:t>
-      </w:r>
-      <w:r>
-        <w:rPr>
-          <w:b/>
-        </w:rPr>
-        <w:t>410-19-2658</w:t>
-      </w:r>
-      <w:r>
-        <w:t>; Tennessee archives and Knox marriage indexes were not reachable from the research VM (</w:t>
-      </w:r>
-      <w:r>
-        <w:rPr>
-          <w:b/>
-        </w:rPr>
-        <w:t>R007</w:t>
-      </w:r>
-      <w:r>
-        <w:t xml:space="preserve">, </w:t>
-      </w:r>
-      <w:r>
-        <w:rPr>
-          <w:b/>
-        </w:rPr>
-        <w:t>L257</w:t>
-      </w:r>
-      <w:r>
-        <w:t>). [C158]</w:t>
+        <w:t xml:space="preserve">On 15 March 1932, at Delvinta, George Botner married Clay Dunigan, twenty-three, of Idamay, son of R. C. Dunigan and Sirena Porter, to Ladona Newman, sixteen, of Delvinta, daughter of </w:t>
+      </w:r>
+      <w:r>
+        <w:rPr>
+          <w:b/>
+        </w:rPr>
+        <w:t>Shelby Newman</w:t>
+      </w:r>
+      <w:r>
+        <w:t xml:space="preserve"> and </w:t>
+      </w:r>
+      <w:r>
+        <w:rPr>
+          <w:b/>
+        </w:rPr>
+        <w:t>Grace Brandenburg</w:t>
+      </w:r>
+      <w:r>
+        <w:t xml:space="preserve">. [C297] [S277] The 1 April paper said Clay and Ladonna had “quietly married last week.” Same names, same month: </w:t>
+      </w:r>
+      <w:r>
+        <w:rPr>
+          <w:b/>
+        </w:rPr>
+        <w:t>probable</w:t>
+      </w:r>
+      <w:r>
+        <w:t xml:space="preserve"> one couple. The bride is </w:t>
+      </w:r>
+      <w:r>
+        <w:rPr>
+          <w:b/>
+        </w:rPr>
+        <w:t>not</w:t>
+      </w:r>
+      <w:r>
+        <w:t xml:space="preserve"> Dora’s child — the license names other parents, and Dora had been dead five and a half years. [C298] Living descendants of that 1932 marriage are withheld.</w:t>
       </w:r>
     </w:p>
     <w:p>
       <w:r>
-        <w:rPr>
-          <w:b/>
-        </w:rPr>
-        <w:t>Pearl P. Newnam</w:t>
-      </w:r>
-      <w:r>
-        <w:t>, 15 March 1895, Banford, later Pearl P. Jackson, died 19 September 1980, Shelby County, Tennessee. The 1910 grandmother household, the 1922 Elizabeth Newnam will, and the NUMIDENT file make her identification the strongest of the five.</w:t>
+        <w:t>Carrie Newman (1898–1915) at Sandlin Cemetery, Ola, fails the same-person test against Dora. [C295] A 1906 Hopkinsville correspondent-column “newnam” and an 1902 Richmond quote from Will Newnam are other men in other counties. [C291] [C292]</w:t>
       </w:r>
     </w:p>
     <w:p>
       <w:r>
-        <w:rPr>
-          <w:b/>
-        </w:rPr>
-        <w:t>Rissa / Rissie</w:t>
-      </w:r>
-      <w:r>
-        <w:t>, May 1897. After the 1900 census she does not reappear on the Kentucky child Soundex pass or in Pearl’s 1910 Owsley household. An unsourced WikiTree profile (</w:t>
-      </w:r>
-      <w:r>
-        <w:rPr>
-          <w:b/>
-        </w:rPr>
-        <w:t>Newnam-46</w:t>
-      </w:r>
-      <w:r>
-        <w:t xml:space="preserve">) names her </w:t>
-      </w:r>
-      <w:r>
-        <w:rPr>
-          <w:b/>
-        </w:rPr>
-        <w:t>Rissie (Newnam) Pelfrey</w:t>
-      </w:r>
-      <w:r>
-        <w:t xml:space="preserve">, born at </w:t>
-      </w:r>
-      <w:r>
-        <w:rPr>
-          <w:b/>
-        </w:rPr>
-        <w:t>Pebworth</w:t>
-      </w:r>
-      <w:r>
-        <w:t xml:space="preserve">, died </w:t>
-      </w:r>
-      <w:r>
-        <w:rPr>
-          <w:b/>
-        </w:rPr>
-        <w:t>13 May 1980</w:t>
-      </w:r>
-      <w:r>
-        <w:t xml:space="preserve"> in </w:t>
-      </w:r>
-      <w:r>
-        <w:rPr>
-          <w:b/>
-        </w:rPr>
-        <w:t>Knoxville, Tennessee</w:t>
-      </w:r>
-      <w:r>
-        <w:t xml:space="preserve">, with </w:t>
-      </w:r>
-      <w:r>
-        <w:rPr>
-          <w:b/>
-        </w:rPr>
-        <w:t>Samuel Parriott Newnam</w:t>
-      </w:r>
-      <w:r>
-        <w:t xml:space="preserve"> as father — a </w:t>
-      </w:r>
-      <w:r>
-        <w:rPr>
-          <w:b/>
-        </w:rPr>
-        <w:t>possible</w:t>
-      </w:r>
-      <w:r>
-        <w:t xml:space="preserve"> lead only, not printed here as proved death. [C230] Free Tennessee death and obituary indexes searched from this case did not independently confirm that row. [C231] Lee Marriage Books 5–15 have no Rissie or Rissa Newnam bride; a 1920 Rissa Newton, seventeen, is a different woman. [C134] A Rissie Pelfrey Maxey born 1882 is a different woman.</w:t>
-      </w:r>
-    </w:p>
-    <w:p>
-      <w:r>
-        <w:rPr>
-          <w:b/>
-        </w:rPr>
-        <w:t>John H. Newnam</w:t>
-      </w:r>
-      <w:r>
-        <w:t xml:space="preserve">, August 1899. Herbert Newman of Lee County, Virginia, was rejected. The Kentucky statewide death index (Reclaim The Records, 1911–1990) has no John H. Newnam death in Lee consistent with an August 1899 birth. [C234] [C237] [C238] Lee Marriage Book 12 has a different </w:t>
-      </w:r>
-      <w:r>
-        <w:rPr>
-          <w:b/>
-        </w:rPr>
-        <w:t>John Newnam</w:t>
-      </w:r>
-      <w:r>
-        <w:t>, age twenty-five in 1917, son of John and Serilda — rejected. [C239] Genealogy Trails’ Lee County WWI draft transcript (1,126 cards) lists no Newnam, Newman, or McCoy registrant; other men born in 1899 appear on the September 1918 Beattyville board, but not John under that surname. [C240] [C241] [S248] A cross-border free transcript pass (Owsley, Estill, Arkansas Perry/Yell, Knox KYGenWeb, Missouri Digital Heritage WWI biographies) also returned no Newnam/Newman draft row. [C242] [S249] NARA M1509 / FamilySearch card images have not been read in this case.</w:t>
+        <w:t xml:space="preserve">The Greene County, Missouri, 1900 hunt for a second Thomas A. Stone household is finished on free film. Enumeration districts 37 through 43 — every A-side and every B-side — have been read from NARA T623-855/856. The only Stone </w:t>
+      </w:r>
+      <w:r>
+        <w:rPr>
+          <w:b/>
+        </w:rPr>
+        <w:t>head</w:t>
+      </w:r>
+      <w:r>
+        <w:t xml:space="preserve"> in that band remains Thomas A., thirty-two, with Matilda and Gertrude, on ED 37 sheet 18A, 27 June 1900. He is still </w:t>
+      </w:r>
+      <w:r>
+        <w:rPr>
+          <w:b/>
+        </w:rPr>
+        <w:t>not merged</w:t>
+      </w:r>
+      <w:r>
+        <w:t xml:space="preserve"> with the 1920 Perry County widower. [C281] [C117]</w:t>
       </w:r>
     </w:p>
     <w:p>
@@ -2408,6 +2546,196 @@
         <w:pStyle w:val="Heading1"/>
       </w:pPr>
       <w:r>
+        <w:t>The children, in brief</w:t>
+      </w:r>
+    </w:p>
+    <w:p>
+      <w:r>
+        <w:t>Two children born to Dora and Samuel died before 1 June 1900. They have no names in any record yet read.</w:t>
+      </w:r>
+    </w:p>
+    <w:p>
+      <w:r>
+        <w:rPr>
+          <w:b/>
+        </w:rPr>
+        <w:t>McCoy “Coy” Newnam</w:t>
+      </w:r>
+      <w:r>
+        <w:t>, born April 1890, married Letha Viola Sullivan at Ola on 18 February 1917. In 1920 they were at Danville, Yell County. In 1930 they were back in Buck Creek, Owsley County. He is the 1926 informant. Living descendants are not named here.</w:t>
+      </w:r>
+    </w:p>
+    <w:p>
+      <w:r>
+        <w:rPr>
+          <w:b/>
+        </w:rPr>
+        <w:t>Mary Magdalene Newnam</w:t>
+      </w:r>
+      <w:r>
+        <w:t xml:space="preserve">, June 1892 on the census, 12 June 1893 Beattyville on her Social Security account, later Mary M. Bunch. Marriage and death are not closed in free sources: Lee marriage books have no Bunch row; NUMIDENT lists her </w:t>
+      </w:r>
+      <w:r>
+        <w:rPr>
+          <w:b/>
+        </w:rPr>
+        <w:t>deceased</w:t>
+      </w:r>
+      <w:r>
+        <w:t xml:space="preserve"> but gives </w:t>
+      </w:r>
+      <w:r>
+        <w:rPr>
+          <w:b/>
+        </w:rPr>
+        <w:t>no death date</w:t>
+      </w:r>
+      <w:r>
+        <w:t xml:space="preserve">; the public Social Security Death Index API returned no match for SSN </w:t>
+      </w:r>
+      <w:r>
+        <w:rPr>
+          <w:b/>
+        </w:rPr>
+        <w:t>410-19-2658</w:t>
+      </w:r>
+      <w:r>
+        <w:t>; Tennessee archives and Knox marriage indexes were not reachable from the research VM (</w:t>
+      </w:r>
+      <w:r>
+        <w:rPr>
+          <w:b/>
+        </w:rPr>
+        <w:t>R007</w:t>
+      </w:r>
+      <w:r>
+        <w:t xml:space="preserve">, </w:t>
+      </w:r>
+      <w:r>
+        <w:rPr>
+          <w:b/>
+        </w:rPr>
+        <w:t>L257</w:t>
+      </w:r>
+      <w:r>
+        <w:t>). [C158]</w:t>
+      </w:r>
+    </w:p>
+    <w:p>
+      <w:r>
+        <w:rPr>
+          <w:b/>
+        </w:rPr>
+        <w:t>Pearl P. Newnam</w:t>
+      </w:r>
+      <w:r>
+        <w:t>, 15 March 1895, Banford, later Pearl P. Jackson, died 19 September 1980, Shelby County, Tennessee. The 1910 grandmother household, the 1922 Elizabeth Newnam will, and the NUMIDENT file make her identification the strongest of the five.</w:t>
+      </w:r>
+    </w:p>
+    <w:p>
+      <w:r>
+        <w:rPr>
+          <w:b/>
+        </w:rPr>
+        <w:t>Rissa / Rissie</w:t>
+      </w:r>
+      <w:r>
+        <w:t>, May 1897. After the 1900 census she does not reappear on the Kentucky child Soundex pass or in Pearl’s 1910 Owsley household. An unsourced WikiTree profile (</w:t>
+      </w:r>
+      <w:r>
+        <w:rPr>
+          <w:b/>
+        </w:rPr>
+        <w:t>Newnam-46</w:t>
+      </w:r>
+      <w:r>
+        <w:t xml:space="preserve">) names her </w:t>
+      </w:r>
+      <w:r>
+        <w:rPr>
+          <w:b/>
+        </w:rPr>
+        <w:t>Rissie (Newnam) Pelfrey</w:t>
+      </w:r>
+      <w:r>
+        <w:t xml:space="preserve">, born at </w:t>
+      </w:r>
+      <w:r>
+        <w:rPr>
+          <w:b/>
+        </w:rPr>
+        <w:t>Pebworth</w:t>
+      </w:r>
+      <w:r>
+        <w:t xml:space="preserve">, died </w:t>
+      </w:r>
+      <w:r>
+        <w:rPr>
+          <w:b/>
+        </w:rPr>
+        <w:t>13 May 1980</w:t>
+      </w:r>
+      <w:r>
+        <w:t xml:space="preserve"> in </w:t>
+      </w:r>
+      <w:r>
+        <w:rPr>
+          <w:b/>
+        </w:rPr>
+        <w:t>Knoxville, Tennessee</w:t>
+      </w:r>
+      <w:r>
+        <w:t xml:space="preserve">, with </w:t>
+      </w:r>
+      <w:r>
+        <w:rPr>
+          <w:b/>
+        </w:rPr>
+        <w:t>Samuel Parriott Newnam</w:t>
+      </w:r>
+      <w:r>
+        <w:t xml:space="preserve"> as father — a </w:t>
+      </w:r>
+      <w:r>
+        <w:rPr>
+          <w:b/>
+        </w:rPr>
+        <w:t>possible</w:t>
+      </w:r>
+      <w:r>
+        <w:t xml:space="preserve"> lead only, not printed here as proved death. [C230] Free Tennessee death and obituary indexes searched from this case did not independently confirm that row. [C231] Lee Marriage Books 5–15 have no Rissie or Rissa Newnam bride; a 1920 Rissa Newton, seventeen, is a different woman. [C134] A Rissie Pelfrey Maxey born 1882 is a different woman.</w:t>
+      </w:r>
+    </w:p>
+    <w:p>
+      <w:r>
+        <w:rPr>
+          <w:b/>
+        </w:rPr>
+        <w:t>John H. Newnam</w:t>
+      </w:r>
+      <w:r>
+        <w:t xml:space="preserve">, August 1899. Herbert Newman of Lee County, Virginia, was rejected. The Kentucky statewide death index (Reclaim The Records, 1911–1990) has no John H. Newnam death in Lee consistent with an August 1899 birth. [C234] [C237] [C238] Lee Marriage Book 12 has a different </w:t>
+      </w:r>
+      <w:r>
+        <w:rPr>
+          <w:b/>
+        </w:rPr>
+        <w:t>John Newnam</w:t>
+      </w:r>
+      <w:r>
+        <w:t>, age twenty-five in 1917, son of John and Serilda — rejected. [C239] Genealogy Trails’ Lee County WWI draft transcript (1,126 cards) lists no Newnam, Newman, or McCoy registrant; other men born in 1899 appear on the September 1918 Beattyville board, but not John under that surname. [C240] [C241] [S248] A cross-border free transcript pass (Owsley, Estill, Arkansas Perry/Yell, Knox KYGenWeb, Missouri Digital Heritage WWI biographies) also returned no Newnam/Newman draft row. [C242] [S249] NARA M1509 / FamilySearch card images have not been read in this case.</w:t>
+      </w:r>
+    </w:p>
+    <w:p>
+      <w:r>
+        <w:br w:type="page"/>
+      </w:r>
+    </w:p>
+    <w:p>
+      <w:pPr>
+        <w:pStyle w:val="Heading1"/>
+      </w:pPr>
+      <w:r>
         <w:t>How to read the plates</w:t>
       </w:r>
     </w:p>
@@ -2542,25 +2870,34 @@
         <w:t>18 A</w:t>
       </w:r>
       <w:r>
-        <w:t xml:space="preserve"> is Thomas A., 32, with Matilda — not merged. Springfield ED </w:t>
-      </w:r>
-      <w:r>
-        <w:rPr>
-          <w:b/>
-        </w:rPr>
-        <w:t>39</w:t>
-      </w:r>
-      <w:r>
-        <w:t xml:space="preserve"> sheets </w:t>
-      </w:r>
-      <w:r>
-        <w:rPr>
-          <w:b/>
-        </w:rPr>
-        <w:t>6 through 31 B</w:t>
-      </w:r>
-      <w:r>
-        <w:t>, read on the original 856 reel, have no second Stone household. [C117] [C153]</w:t>
+        <w:t xml:space="preserve"> is Thomas A., 32, with Matilda — not merged. Greene </w:t>
+      </w:r>
+      <w:r>
+        <w:rPr>
+          <w:b/>
+        </w:rPr>
+        <w:t>37–43</w:t>
+      </w:r>
+      <w:r>
+        <w:t xml:space="preserve"> (Springfield / Campbell) name columns are now closed: the only Stone </w:t>
+      </w:r>
+      <w:r>
+        <w:rPr>
+          <w:b/>
+        </w:rPr>
+        <w:t>head</w:t>
+      </w:r>
+      <w:r>
+        <w:t xml:space="preserve"> is Thomas A. on ED </w:t>
+      </w:r>
+      <w:r>
+        <w:rPr>
+          <w:b/>
+        </w:rPr>
+        <w:t>37</w:t>
+      </w:r>
+      <w:r>
+        <w:t xml:space="preserve"> sheet 18A. [C117] [C281]</w:t>
       </w:r>
     </w:p>
     <w:p>
@@ -2622,8 +2959,983 @@
       </w:r>
     </w:p>
     <w:p>
-      <w:r>
-        <w:t>The next chat should treat this book and `06-dossier.md` as the combined master, then work the open list. Do not reopen Peebles as a third marriage without a license. Do not print 1868 or 24 February 1906 as facts.</w:t>
+      <w:pPr>
+        <w:pStyle w:val="ListBullet"/>
+      </w:pPr>
+      <w:r>
+        <w:rPr>
+          <w:b/>
+        </w:rPr>
+        <w:t>B049:</w:t>
+      </w:r>
+      <w:r>
+        <w:t xml:space="preserve"> 1926 *Beattyville Enterprise* and *Yell County Journal* still unread. IA Solr 0; UK film years omit 1926; six `beatty` issues omit 1926. [C293] [C301]</w:t>
+      </w:r>
+    </w:p>
+    <w:p>
+      <w:pPr>
+        <w:pStyle w:val="ListBullet"/>
+      </w:pPr>
+      <w:r>
+        <w:rPr>
+          <w:b/>
+        </w:rPr>
+        <w:t>B045 / B047:</w:t>
+      </w:r>
+      <w:r>
+        <w:t xml:space="preserve"> Samuel P. probate film and M1509 draft cards unread.</w:t>
+      </w:r>
+    </w:p>
+    <w:p>
+      <w:pPr>
+        <w:pStyle w:val="ListBullet"/>
+      </w:pPr>
+      <w:r>
+        <w:rPr>
+          <w:b/>
+        </w:rPr>
+        <w:t>FAN residual:</w:t>
+      </w:r>
+      <w:r>
+        <w:t xml:space="preserve"> Luther Newnam’s own death (B051); Shelby × Grace identity (B052); Everett’s deceased brothers (B053); Carter Cove stone photographs (B054).</w:t>
+      </w:r>
+    </w:p>
+    <w:p>
+      <w:pPr>
+        <w:pStyle w:val="ListBullet"/>
+      </w:pPr>
+      <w:r>
+        <w:t xml:space="preserve">Greene 37–43 Stone sweep is </w:t>
+      </w:r>
+      <w:r>
+        <w:rPr>
+          <w:b/>
+        </w:rPr>
+        <w:t>closed</w:t>
+      </w:r>
+      <w:r>
+        <w:t>. Do not reopen Peebles as a third marriage without a license. Do not print 1868 or 24 February 1906 as facts.</w:t>
+      </w:r>
+    </w:p>
+    <w:p>
+      <w:r>
+        <w:t xml:space="preserve">The next session starts with </w:t>
+      </w:r>
+      <w:r>
+        <w:rPr>
+          <w:b/>
+        </w:rPr>
+        <w:t>B049</w:t>
+      </w:r>
+      <w:r>
+        <w:t>.</w:t>
+      </w:r>
+    </w:p>
+    <w:p>
+      <w:r>
+        <w:br w:type="page"/>
+      </w:r>
+    </w:p>
+    <w:p>
+      <w:pPr>
+        <w:pStyle w:val="Heading1"/>
+      </w:pPr>
+      <w:r>
+        <w:t>Footnotes</w:t>
+      </w:r>
+    </w:p>
+    <w:p>
+      <w:r>
+        <w:t>Numbered notes expand the claim/source tags in the narrative. Access labels: *image seen* · *transcription only* · *index only* · *catalog only* · *OCR text* · *not yet examined*. Click a URL when one exists.</w:t>
+      </w:r>
+    </w:p>
+    <w:p>
+      <w:r>
+        <w:t xml:space="preserve">1. 1880 U.S. census, Lee County, Kentucky, ED 59, dwelling 46: Dora, daughter, 8. NARA T9-427; Internet Archive [`10thcensus0427unit`](https://archive.org/details/10thcensus0427unit). *Image seen.* </w:t>
+      </w:r>
+      <w:r>
+        <w:rPr>
+          <w:b/>
+        </w:rPr>
+        <w:t>C003</w:t>
+      </w:r>
+      <w:r>
+        <w:t xml:space="preserve"> </w:t>
+      </w:r>
+      <w:r>
+        <w:rPr>
+          <w:b/>
+        </w:rPr>
+        <w:t>S010</w:t>
+      </w:r>
+      <w:r>
+        <w:t xml:space="preserve">. </w:t>
+      </w:r>
+      <w:r>
+        <w:rPr>
+          <w:b/>
+        </w:rPr>
+        <w:t>PROVEN</w:t>
+      </w:r>
+      <w:r>
+        <w:t xml:space="preserve"> as a census line.</w:t>
+      </w:r>
+    </w:p>
+    <w:p>
+      <w:r>
+        <w:t xml:space="preserve">2. 1880 KY Soundex N-550 continuation: “Newnam, Dora D 8 Kentucky.” IA [`soundex1880ky055`](https://archive.org/details/soundex1880ky055). *Image seen.* </w:t>
+      </w:r>
+      <w:r>
+        <w:rPr>
+          <w:b/>
+        </w:rPr>
+        <w:t>S001</w:t>
+      </w:r>
+      <w:r>
+        <w:t xml:space="preserve"> </w:t>
+      </w:r>
+      <w:r>
+        <w:rPr>
+          <w:b/>
+        </w:rPr>
+        <w:t>S002</w:t>
+      </w:r>
+      <w:r>
+        <w:t>.</w:t>
+      </w:r>
+    </w:p>
+    <w:p>
+      <w:r>
+        <w:t xml:space="preserve">3. Arkansas State Board of Health, death certificate Dora Stone, Yell Co., noon 23 Aug 1926, cert. 1524, RD 676. Informant Coy Newnam. User-supplied image, prior session; *not re-opened this pass*. Index: [Ancestry 8771](https://www.ancestry.com/search/collections/8771/) / FS [1940760](https://www.familysearch.org/search/collection/1940760) — *not yet examined* from this VM. </w:t>
+      </w:r>
+      <w:r>
+        <w:rPr>
+          <w:b/>
+        </w:rPr>
+        <w:t>C015</w:t>
+      </w:r>
+      <w:r>
+        <w:t xml:space="preserve"> </w:t>
+      </w:r>
+      <w:r>
+        <w:rPr>
+          <w:b/>
+        </w:rPr>
+        <w:t>S003</w:t>
+      </w:r>
+      <w:r>
+        <w:t>.</w:t>
+      </w:r>
+    </w:p>
+    <w:p>
+      <w:r>
+        <w:t xml:space="preserve">4. Debi Houser Kendrick, Lee Marriage Book 2: Samuel P. Newnam × Dora Ella Newnam, 10 Dec 1885, at Doll Newnam’s. [USGenNet Book 2](https://usgennet.org/usa/ky/county/lee/marriage/marrbook2.html). *Transcription only.* </w:t>
+      </w:r>
+      <w:r>
+        <w:rPr>
+          <w:b/>
+        </w:rPr>
+        <w:t>C010</w:t>
+      </w:r>
+      <w:r>
+        <w:t xml:space="preserve"> </w:t>
+      </w:r>
+      <w:r>
+        <w:rPr>
+          <w:b/>
+        </w:rPr>
+        <w:t>S004</w:t>
+      </w:r>
+      <w:r>
+        <w:t xml:space="preserve">. </w:t>
+      </w:r>
+      <w:r>
+        <w:rPr>
+          <w:b/>
+        </w:rPr>
+        <w:t>PROVEN</w:t>
+      </w:r>
+      <w:r>
+        <w:t xml:space="preserve"> as to the fact of marriage.</w:t>
+      </w:r>
+    </w:p>
+    <w:p>
+      <w:r>
+        <w:t xml:space="preserve">5. 1900 U.S. census, Sturgeon precinct, Lee Co., KY, dwelling 67/67 (Kendrick transcription). [RootsWeb 1900 Sturgeon](https://sites.rootsweb.com/~kylee/census/1900/1900sturgeon.htm). *Transcription only* as used here. </w:t>
+      </w:r>
+      <w:r>
+        <w:rPr>
+          <w:b/>
+        </w:rPr>
+        <w:t>C011</w:t>
+      </w:r>
+      <w:r>
+        <w:t xml:space="preserve"> </w:t>
+      </w:r>
+      <w:r>
+        <w:rPr>
+          <w:b/>
+        </w:rPr>
+        <w:t>S005</w:t>
+      </w:r>
+      <w:r>
+        <w:t>.</w:t>
+      </w:r>
+    </w:p>
+    <w:p>
+      <w:r>
+        <w:t xml:space="preserve">6. Birth year August 1871: 1880 age 8 + 1885 age 14 + 1900 “Aug 1871.” Year </w:t>
+      </w:r>
+      <w:r>
+        <w:rPr>
+          <w:b/>
+        </w:rPr>
+        <w:t>PROVEN</w:t>
+      </w:r>
+      <w:r>
+        <w:t xml:space="preserve"> vs 1868. Day 11 </w:t>
+      </w:r>
+      <w:r>
+        <w:rPr>
+          <w:b/>
+        </w:rPr>
+        <w:t>POSSIBLE</w:t>
+      </w:r>
+      <w:r>
+        <w:t xml:space="preserve"> (certificate only). </w:t>
+      </w:r>
+      <w:r>
+        <w:rPr>
+          <w:b/>
+        </w:rPr>
+        <w:t>C001</w:t>
+      </w:r>
+      <w:r>
+        <w:t xml:space="preserve"> </w:t>
+      </w:r>
+      <w:r>
+        <w:rPr>
+          <w:b/>
+        </w:rPr>
+        <w:t>C002</w:t>
+      </w:r>
+      <w:r>
+        <w:t>.</w:t>
+      </w:r>
+    </w:p>
+    <w:p>
+      <w:r>
+        <w:t xml:space="preserve">7. Parents Elias Newnam &amp; Mary Smallwood: certificate + 1880 household + wedding at Doll’s. </w:t>
+      </w:r>
+      <w:r>
+        <w:rPr>
+          <w:b/>
+        </w:rPr>
+        <w:t>PROBABLE</w:t>
+      </w:r>
+      <w:r>
+        <w:t xml:space="preserve"> (near GPS). </w:t>
+      </w:r>
+      <w:r>
+        <w:rPr>
+          <w:b/>
+        </w:rPr>
+        <w:t>C004</w:t>
+      </w:r>
+      <w:r>
+        <w:t>.</w:t>
+      </w:r>
+    </w:p>
+    <w:p>
+      <w:r>
+        <w:t xml:space="preserve">8. 1870 Travellers Rest, Elias household, no Dora. Original M593-494 p. 90. </w:t>
+      </w:r>
+      <w:r>
+        <w:rPr>
+          <w:b/>
+        </w:rPr>
+        <w:t>C067</w:t>
+      </w:r>
+      <w:r>
+        <w:t xml:space="preserve"> </w:t>
+      </w:r>
+      <w:r>
+        <w:rPr>
+          <w:b/>
+        </w:rPr>
+        <w:t>S231</w:t>
+      </w:r>
+      <w:r>
+        <w:t>.</w:t>
+      </w:r>
+    </w:p>
+    <w:p>
+      <w:r>
+        <w:t xml:space="preserve">9. WikiTree [Newnam-49](https://www.wikitree.com/wiki/Newnam-49): death “abt. 1930” </w:t>
+      </w:r>
+      <w:r>
+        <w:rPr>
+          <w:b/>
+        </w:rPr>
+        <w:t>DISPROVED</w:t>
+      </w:r>
+      <w:r>
+        <w:t xml:space="preserve">; middle name Parriott lore. </w:t>
+      </w:r>
+      <w:r>
+        <w:rPr>
+          <w:b/>
+        </w:rPr>
+        <w:t>S030</w:t>
+      </w:r>
+      <w:r>
+        <w:t>.</w:t>
+      </w:r>
+    </w:p>
+    <w:p>
+      <w:r>
+        <w:t xml:space="preserve">10. 1910 Sturgeon ED 99 original, T624-478: P001/P002/McCoy/John H. b.1899 </w:t>
+      </w:r>
+      <w:r>
+        <w:rPr>
+          <w:b/>
+        </w:rPr>
+        <w:t>nil</w:t>
+      </w:r>
+      <w:r>
+        <w:t xml:space="preserve">. IA [`13thcensus1910po478unit`](https://archive.org/details/13thcensus1910po478unit). </w:t>
+      </w:r>
+      <w:r>
+        <w:rPr>
+          <w:b/>
+        </w:rPr>
+        <w:t>C088</w:t>
+      </w:r>
+      <w:r>
+        <w:t>.</w:t>
+      </w:r>
+    </w:p>
+    <w:p>
+      <w:r>
+        <w:t xml:space="preserve">11. 1920 Beattyville ED 111 sh 6A: E.T. Newman, grandfather in C.B. Burke’s house. IA [`14thcensusofpopu586unit`](https://archive.org/details/14thcensusofpopu586unit). </w:t>
+      </w:r>
+      <w:r>
+        <w:rPr>
+          <w:b/>
+        </w:rPr>
+        <w:t>C091</w:t>
+      </w:r>
+      <w:r>
+        <w:t xml:space="preserve"> </w:t>
+      </w:r>
+      <w:r>
+        <w:rPr>
+          <w:b/>
+        </w:rPr>
+        <w:t>S073</w:t>
+      </w:r>
+      <w:r>
+        <w:t>.</w:t>
+      </w:r>
+    </w:p>
+    <w:p>
+      <w:r>
+        <w:t xml:space="preserve">12. 1920 Perry Co. AR: Tom A. Stone, 62, widower. </w:t>
+      </w:r>
+      <w:r>
+        <w:rPr>
+          <w:b/>
+        </w:rPr>
+        <w:t>C050</w:t>
+      </w:r>
+      <w:r>
+        <w:t xml:space="preserve">. Identification with T. A. on the 1926 certificate </w:t>
+      </w:r>
+      <w:r>
+        <w:rPr>
+          <w:b/>
+        </w:rPr>
+        <w:t>PROBABLE</w:t>
+      </w:r>
+      <w:r>
+        <w:t xml:space="preserve"> (conflict #4, #11).</w:t>
+      </w:r>
+    </w:p>
+    <w:p>
+      <w:r>
+        <w:t xml:space="preserve">13. 1900 Greene Co. MO ED 37 sh 18A: Thomas A. Stone, 32, Matilda, Gertrude. NARA T623-855; IA [`12thcensusofpopu855unit`](https://archive.org/details/12thcensusofpopu855unit). </w:t>
+      </w:r>
+      <w:r>
+        <w:rPr>
+          <w:b/>
+        </w:rPr>
+        <w:t>C117</w:t>
+      </w:r>
+      <w:r>
+        <w:t xml:space="preserve">. </w:t>
+      </w:r>
+      <w:r>
+        <w:rPr>
+          <w:b/>
+        </w:rPr>
+        <w:t>Not merged.</w:t>
+      </w:r>
+    </w:p>
+    <w:p>
+      <w:r>
+        <w:t xml:space="preserve">14. Greene ED 37–43 name-column sweep (A+B), including 41 ED 38 B-side crops in `sources/census/b040-ed38-bsides/`. </w:t>
+      </w:r>
+      <w:r>
+        <w:rPr>
+          <w:b/>
+        </w:rPr>
+        <w:t>C281</w:t>
+      </w:r>
+      <w:r>
+        <w:t xml:space="preserve"> </w:t>
+      </w:r>
+      <w:r>
+        <w:rPr>
+          <w:b/>
+        </w:rPr>
+        <w:t>S267</w:t>
+      </w:r>
+      <w:r>
+        <w:t xml:space="preserve">. </w:t>
+      </w:r>
+      <w:r>
+        <w:rPr>
+          <w:b/>
+        </w:rPr>
+        <w:t>PROVEN</w:t>
+      </w:r>
+      <w:r>
+        <w:t xml:space="preserve"> negative for a second Stone head.</w:t>
+      </w:r>
+    </w:p>
+    <w:p>
+      <w:r>
+        <w:t xml:space="preserve">15. Daniels &amp; Cossey, Carter Cove, 5 Feb 1993: “Newman, Dora” no dates; “Stone, Thomas 1845–1925.” </w:t>
+      </w:r>
+      <w:r>
+        <w:rPr>
+          <w:b/>
+        </w:rPr>
+        <w:t>S078</w:t>
+      </w:r>
+      <w:r>
+        <w:t>.</w:t>
+      </w:r>
+    </w:p>
+    <w:p>
+      <w:r>
+        <w:t xml:space="preserve">16. yellcountyobits compiled index p. 64 / 83, captured 30 Oct 2026. [Newman block](https://www.yellcountyobits.org/yc_cemeteryindex/cemeterylist/cemeterylist64.html) · [Stone block](https://www.yellcountyobits.org/yc_cemeteryindex/cemeterylist/cemeterylist83.html). *Transcription only.* </w:t>
+      </w:r>
+      <w:r>
+        <w:rPr>
+          <w:b/>
+        </w:rPr>
+        <w:t>C282</w:t>
+      </w:r>
+      <w:r>
+        <w:t xml:space="preserve"> </w:t>
+      </w:r>
+      <w:r>
+        <w:rPr>
+          <w:b/>
+        </w:rPr>
+        <w:t>C283</w:t>
+      </w:r>
+      <w:r>
+        <w:t xml:space="preserve"> </w:t>
+      </w:r>
+      <w:r>
+        <w:rPr>
+          <w:b/>
+        </w:rPr>
+        <w:t>S268</w:t>
+      </w:r>
+      <w:r>
+        <w:t xml:space="preserve"> </w:t>
+      </w:r>
+      <w:r>
+        <w:rPr>
+          <w:b/>
+        </w:rPr>
+        <w:t>S269</w:t>
+      </w:r>
+      <w:r>
+        <w:t>.</w:t>
+      </w:r>
+    </w:p>
+    <w:p>
+      <w:r>
+        <w:t xml:space="preserve">17. Find a Grave cemetery listing: Dora Newman memorial [97907837](https://www.findagrave.com/memorial/97907837/dora-newman); Thomas Stone [97907931](https://www.findagrave.com/memorial/97907931/thomas-stone). Listing HTML seen; memorial biographies CF-blocked. </w:t>
+      </w:r>
+      <w:r>
+        <w:rPr>
+          <w:b/>
+        </w:rPr>
+        <w:t>S117</w:t>
+      </w:r>
+      <w:r>
+        <w:t xml:space="preserve"> </w:t>
+      </w:r>
+      <w:r>
+        <w:rPr>
+          <w:b/>
+        </w:rPr>
+        <w:t>S118</w:t>
+      </w:r>
+      <w:r>
+        <w:t>.</w:t>
+      </w:r>
+    </w:p>
+    <w:p>
+      <w:r>
+        <w:t xml:space="preserve">18. *Beattyville Enterprise*, IA item [`beatty`](https://archive.org/details/beatty): six issues only. OCR + selected page JPEGs in `sources/press/`. </w:t>
+      </w:r>
+      <w:r>
+        <w:rPr>
+          <w:b/>
+        </w:rPr>
+        <w:t>C284–C290</w:t>
+      </w:r>
+      <w:r>
+        <w:t xml:space="preserve"> </w:t>
+      </w:r>
+      <w:r>
+        <w:rPr>
+          <w:b/>
+        </w:rPr>
+        <w:t>C293</w:t>
+      </w:r>
+      <w:r>
+        <w:t xml:space="preserve"> </w:t>
+      </w:r>
+      <w:r>
+        <w:rPr>
+          <w:b/>
+        </w:rPr>
+        <w:t>S270</w:t>
+      </w:r>
+      <w:r>
+        <w:t>.</w:t>
+      </w:r>
+    </w:p>
+    <w:p>
+      <w:r>
+        <w:t xml:space="preserve">19. UK Microfilm Holdings item [65438](https://ukmfilms.omeka.net/items/show/65438): *Enterprise* years 1909–11, 1915, 1924–25, 1928, 1932. Film </w:t>
+      </w:r>
+      <w:r>
+        <w:rPr>
+          <w:b/>
+        </w:rPr>
+        <w:t>S 90-033</w:t>
+      </w:r>
+      <w:r>
+        <w:t xml:space="preserve">. *Catalog only.* </w:t>
+      </w:r>
+      <w:r>
+        <w:rPr>
+          <w:b/>
+        </w:rPr>
+        <w:t>S271</w:t>
+      </w:r>
+      <w:r>
+        <w:t>.</w:t>
+      </w:r>
+    </w:p>
+    <w:p>
+      <w:r>
+        <w:t xml:space="preserve">20. *Hopkinsville Kentuckian*, 9 Aug 1906, p. 8. [LOC](https://www.loc.gov/resource/sn86069395/1906-08-09/ed-1/?sp=8). </w:t>
+      </w:r>
+      <w:r>
+        <w:rPr>
+          <w:b/>
+        </w:rPr>
+        <w:t>C291</w:t>
+      </w:r>
+      <w:r>
+        <w:t xml:space="preserve"> </w:t>
+      </w:r>
+      <w:r>
+        <w:rPr>
+          <w:b/>
+        </w:rPr>
+        <w:t>S273</w:t>
+      </w:r>
+      <w:r>
+        <w:t xml:space="preserve">. </w:t>
+      </w:r>
+      <w:r>
+        <w:rPr>
+          <w:b/>
+        </w:rPr>
+        <w:t>DISPROVED</w:t>
+      </w:r>
+      <w:r>
+        <w:t xml:space="preserve"> vs Samuel P.</w:t>
+      </w:r>
+    </w:p>
+    <w:p>
+      <w:r>
+        <w:t xml:space="preserve">21. *Richmond Climax*, 23 Apr 1902, p. 1. [LOC](https://www.loc.gov/resource/sn86069162/1902-04-23/ed-1/?sp=1). </w:t>
+      </w:r>
+      <w:r>
+        <w:rPr>
+          <w:b/>
+        </w:rPr>
+        <w:t>C292</w:t>
+      </w:r>
+      <w:r>
+        <w:t xml:space="preserve"> </w:t>
+      </w:r>
+      <w:r>
+        <w:rPr>
+          <w:b/>
+        </w:rPr>
+        <w:t>S274</w:t>
+      </w:r>
+      <w:r>
+        <w:t xml:space="preserve">. </w:t>
+      </w:r>
+      <w:r>
+        <w:rPr>
+          <w:b/>
+        </w:rPr>
+        <w:t>DISPROVED</w:t>
+      </w:r>
+      <w:r>
+        <w:t xml:space="preserve"> vs Samuel P.</w:t>
+      </w:r>
+    </w:p>
+    <w:p>
+      <w:r>
+        <w:t xml:space="preserve">22. Genealogy Trails Lee WWI draft transcript (1,126 cards). [GT Lee WWI](https://genealogytrails.com/ken/lee/ww1draft.html). Re-fetched 30 Oct 2026. </w:t>
+      </w:r>
+      <w:r>
+        <w:rPr>
+          <w:b/>
+        </w:rPr>
+        <w:t>C294</w:t>
+      </w:r>
+      <w:r>
+        <w:t xml:space="preserve"> </w:t>
+      </w:r>
+      <w:r>
+        <w:rPr>
+          <w:b/>
+        </w:rPr>
+        <w:t>S272</w:t>
+      </w:r>
+      <w:r>
+        <w:t>.</w:t>
+      </w:r>
+    </w:p>
+    <w:p>
+      <w:r>
+        <w:t xml:space="preserve">23. Lee Marriage Book 23: Clay Dunigan × Ladona Newman, 15 Mar 1932. [USGenNet Book 23](https://usgennet.org/usa/ky/county/lee/marriage/marrbook23.html). *Transcription only.* </w:t>
+      </w:r>
+      <w:r>
+        <w:rPr>
+          <w:b/>
+        </w:rPr>
+        <w:t>C297</w:t>
+      </w:r>
+      <w:r>
+        <w:t xml:space="preserve"> </w:t>
+      </w:r>
+      <w:r>
+        <w:rPr>
+          <w:b/>
+        </w:rPr>
+        <w:t>S277</w:t>
+      </w:r>
+      <w:r>
+        <w:t>.</w:t>
+      </w:r>
+    </w:p>
+    <w:p>
+      <w:r>
+        <w:t xml:space="preserve">24. Lee obituaries N: Everett Newnam, *Enterprise* 14 Dec 1939. [USGenNet n.html](https://usgennet.org/usa/ky/county/lee/obituaries/n.html#everettnewman). *Transcription only.* </w:t>
+      </w:r>
+      <w:r>
+        <w:rPr>
+          <w:b/>
+        </w:rPr>
+        <w:t>C299</w:t>
+      </w:r>
+      <w:r>
+        <w:t xml:space="preserve"> </w:t>
+      </w:r>
+      <w:r>
+        <w:rPr>
+          <w:b/>
+        </w:rPr>
+        <w:t>S278</w:t>
+      </w:r>
+      <w:r>
+        <w:t>.</w:t>
+      </w:r>
+    </w:p>
+    <w:p>
+      <w:r>
+        <w:t xml:space="preserve">25. IA Solr 30 Oct 2026: 0 items *Yell County Journal* 1926; 0 items title *Beattyville Enterprise* year 1926. </w:t>
+      </w:r>
+      <w:r>
+        <w:rPr>
+          <w:b/>
+        </w:rPr>
+        <w:t>C301</w:t>
+      </w:r>
+      <w:r>
+        <w:t xml:space="preserve"> </w:t>
+      </w:r>
+      <w:r>
+        <w:rPr>
+          <w:b/>
+        </w:rPr>
+        <w:t>S280</w:t>
+      </w:r>
+      <w:r>
+        <w:t>.</w:t>
+      </w:r>
+    </w:p>
+    <w:p>
+      <w:r>
+        <w:t xml:space="preserve">26. Genealogy Trails [Yell obituaries](https://genealogytrails.com/ark/yell/obits.html) landing, 30 Oct 2026: nil Stone/Newnam/Dora/1926. </w:t>
+      </w:r>
+      <w:r>
+        <w:rPr>
+          <w:b/>
+        </w:rPr>
+        <w:t>C302</w:t>
+      </w:r>
+      <w:r>
+        <w:t xml:space="preserve"> </w:t>
+      </w:r>
+      <w:r>
+        <w:rPr>
+          <w:b/>
+        </w:rPr>
+        <w:t>S281</w:t>
+      </w:r>
+      <w:r>
+        <w:t>.</w:t>
+      </w:r>
+    </w:p>
+    <w:p>
+      <w:r>
+        <w:t xml:space="preserve">27. Word biography bytes: SHA-256 `78cdcf44ad1700ee4a0b696215879e2e8485c2dfe794e1d918e64acc1d3d9280` (53,235 bytes). Copies in `book/` and `sources/authored/`. Drive search 0. </w:t>
+      </w:r>
+      <w:r>
+        <w:rPr>
+          <w:b/>
+        </w:rPr>
+        <w:t>C296</w:t>
+      </w:r>
+      <w:r>
+        <w:t xml:space="preserve"> </w:t>
+      </w:r>
+      <w:r>
+        <w:rPr>
+          <w:b/>
+        </w:rPr>
+        <w:t>S276</w:t>
+      </w:r>
+      <w:r>
+        <w:t>.</w:t>
+      </w:r>
+    </w:p>
+    <w:p>
+      <w:r>
+        <w:t xml:space="preserve">28. Coy × Letha Sullivan, 18 Feb 1917, Ola. </w:t>
+      </w:r>
+      <w:r>
+        <w:rPr>
+          <w:b/>
+        </w:rPr>
+        <w:t>C027</w:t>
+      </w:r>
+      <w:r>
+        <w:t xml:space="preserve"> </w:t>
+      </w:r>
+      <w:r>
+        <w:rPr>
+          <w:b/>
+        </w:rPr>
+        <w:t>S024</w:t>
+      </w:r>
+      <w:r>
+        <w:t>. Prior session.</w:t>
+      </w:r>
+    </w:p>
+    <w:p>
+      <w:r>
+        <w:t xml:space="preserve">29. NUMIDENT Pearl P. Jackson / Mary Magdalene Bunch naming Sam and Dora. </w:t>
+      </w:r>
+      <w:r>
+        <w:rPr>
+          <w:b/>
+        </w:rPr>
+        <w:t>S006</w:t>
+      </w:r>
+      <w:r>
+        <w:t xml:space="preserve"> </w:t>
+      </w:r>
+      <w:r>
+        <w:rPr>
+          <w:b/>
+        </w:rPr>
+        <w:t>S007</w:t>
+      </w:r>
+      <w:r>
+        <w:t>. Prior.</w:t>
+      </w:r>
+    </w:p>
+    <w:p>
+      <w:r>
+        <w:t xml:space="preserve">30. Lee Books 5–19: no Peebles; no Dora Newnam remarriage. [USGenNet marriages](https://usgennet.org/usa/ky/county/lee/marriage/). </w:t>
+      </w:r>
+      <w:r>
+        <w:rPr>
+          <w:b/>
+        </w:rPr>
+        <w:t>C084</w:t>
+      </w:r>
+      <w:r>
+        <w:t xml:space="preserve"> </w:t>
+      </w:r>
+      <w:r>
+        <w:rPr>
+          <w:b/>
+        </w:rPr>
+        <w:t>S064</w:t>
+      </w:r>
+      <w:r>
+        <w:t>.</w:t>
+      </w:r>
+    </w:p>
+    <w:p>
+      <w:r>
+        <w:br w:type="page"/>
+      </w:r>
+    </w:p>
+    <w:p>
+      <w:pPr>
+        <w:pStyle w:val="Heading1"/>
+      </w:pPr>
+      <w:r>
+        <w:t>Source index</w:t>
+      </w:r>
+    </w:p>
+    <w:p>
+      <w:r>
+        <w:t xml:space="preserve">Working table of </w:t>
+      </w:r>
+      <w:r>
+        <w:rPr>
+          <w:b/>
+        </w:rPr>
+        <w:t>saved local copies</w:t>
+      </w:r>
+      <w:r>
+        <w:t>. Full file list: [`../SOURCE-INDEX.md`](../SOURCE-INDEX.md) and [`../sources/SOURCE-INVENTORY.tsv`](../sources/SOURCE-INVENTORY.tsv) (331 files after this pass).</w:t>
+      </w:r>
+    </w:p>
+    <w:p>
+      <w:r>
+        <w:t>| ID | Local file | Repository / URL | What it proves | Access |</w:t>
+      </w:r>
+    </w:p>
+    <w:p>
+      <w:r>
+        <w:t>|---|---|---|---|---|</w:t>
+      </w:r>
+    </w:p>
+    <w:p>
+      <w:r>
+        <w:t>| S003 | *(user image; not re-opened)* | AR Board of Health cert. 1524 | Death, parents, spouse, informant, burial | image seen (prior) |</w:t>
+      </w:r>
+    </w:p>
+    <w:p>
+      <w:r>
+        <w:t>| S267 | `../sources/census/b040-ed38-bsides/` (41 PNGs) | [IA T623-855](https://archive.org/details/12thcensusofpopu855unit) | ED 38 B-sides nil Stone/Newnam (</w:t>
+      </w:r>
+      <w:r>
+        <w:rPr>
+          <w:b/>
+        </w:rPr>
+        <w:t>C281</w:t>
+      </w:r>
+      <w:r>
+        <w:t>) | image seen |</w:t>
+      </w:r>
+    </w:p>
+    <w:p>
+      <w:r>
+        <w:t>| S268 | `../sources/cemetery/yellcountyobits-cemeterylist64-newman-dora-2026-10-30.txt` | [yellcountyobits p.64](https://www.yellcountyobits.org/yc_cemeteryindex/cemeterylist/cemeterylist64.html) | Newman, Dora, no dates, Carter Cove | transcription only |</w:t>
+      </w:r>
+    </w:p>
+    <w:p>
+      <w:r>
+        <w:t>| S269 | `../sources/cemetery/yellcountyobits-cemeterylist83-stone-2026-10-30.txt` | [yellcountyobits p.83](https://www.yellcountyobits.org/yc_cemeteryindex/cemeterylist/cemeterylist83.html) | Stone, Thomas, 1845–1925, Carter Cove | transcription only |</w:t>
+      </w:r>
+    </w:p>
+    <w:p>
+      <w:r>
+        <w:t>| S270 | `../sources/press/beattyville-enterprise-ia-beatty-ocr-2026-10-30.txt` + leaf JPEGs | [IA `beatty`](https://archive.org/details/beatty) | Doll 1928/1932; FAN; no 1926 | OCR + selected images |</w:t>
+      </w:r>
+    </w:p>
+    <w:p>
+      <w:r>
+        <w:t>| S271 | `../sources/press/beattyville-enterprise-uk-microfilm-2026-10-30.html` | [UK item 65438](https://ukmfilms.omeka.net/items/show/65438) | 1926 not in listed film years | catalog only |</w:t>
+      </w:r>
+    </w:p>
+    <w:p>
+      <w:r>
+        <w:t>| S272 | `../sources/military/lee-wwi-genealogytrails-reget-2026-10-30.txt` | [GT Lee WWI](https://genealogytrails.com/ken/lee/ww1draft.html) | Nil Newnam/McCoy | transcription only |</w:t>
+      </w:r>
+    </w:p>
+    <w:p>
+      <w:r>
+        <w:t>| S273 | `../sources/press/hopkinsville-kentuckian-1906-08-09-p8.jpg` | [LOC](https://www.loc.gov/resource/sn86069395/1906-08-09/ed-1/?sp=8) | Reject vs Samuel P. | image seen |</w:t>
+      </w:r>
+    </w:p>
+    <w:p>
+      <w:r>
+        <w:t>| S274 | `../sources/press/richmond-climax-1902-04-23-p1.jpg` | [LOC](https://www.loc.gov/resource/sn86069162/1902-04-23/ed-1/?sp=1) | Will Newnam reject | image seen |</w:t>
+      </w:r>
+    </w:p>
+    <w:p>
+      <w:r>
+        <w:t>| S276 | `../sources/authored/Dora-Ella-Newnam-Stone-A-Life-latest.docx` | Local Word export | Latest authored bio bytes | original bytes |</w:t>
+      </w:r>
+    </w:p>
+    <w:p>
+      <w:r>
+        <w:t>| S277 | `../sources/marriages/lee-book23-clay-ladona-1932-extract-2026-10-30.txt` | [Book 23](https://usgennet.org/usa/ky/county/lee/marriage/marrbook23.html) | Clay × Ladona 15 Mar 1932 | transcription only |</w:t>
+      </w:r>
+    </w:p>
+    <w:p>
+      <w:r>
+        <w:t>| S278 | `../sources/obituaries/lee-obits-n-everett-newnam-1939-extract-2026-10-30.txt` | [Obits N](https://usgennet.org/usa/ky/county/lee/obituaries/n.html#everettnewman) | Everett d. 13 Dec 1939 | transcription only |</w:t>
+      </w:r>
+    </w:p>
+    <w:p>
+      <w:r>
+        <w:t>| S280 | `../sources/press/ia-yell-journal-1926-search-2026-10-30.json` | IA Solr | 0 hits for 1926 titles | index only |</w:t>
+      </w:r>
+    </w:p>
+    <w:p>
+      <w:r>
+        <w:t>| S281 | `../sources/press/genealogytrails-yell-obits-landing-2026-10-30.html` | [GT Yell obits](https://genealogytrails.com/ark/yell/obits.html) | Nil on landing | transcription only |</w:t>
+      </w:r>
+    </w:p>
+    <w:p>
+      <w:r>
+        <w:t>Embedded plates live in `plates/` and `../sources/census/`. Charts: [`../visuals/pedigree-dora.svg`](../visuals/pedigree-dora.svg), [`../visuals/timeline-dora.svg`](../visuals/timeline-dora.svg).</w:t>
       </w:r>
     </w:p>
     <w:sectPr>

</xml_diff>

<commit_message>
Dora pass 64: Melissa 1957, Callie Moore, 1928 Frank reject
Household and FAN work on deceased Dora Ella Newnam Stone: prove sister
Melissa Estes Miller (11 Apr 1957), split Callie Moore 1926 from Callie
Spicer (#21), reject 1928 St. Helens Frank vs Berea contractor (#22),
identify the 1915 Grant×Martha stillborn, and lock unread FS catalog IDs
for probate, court, tax, and Lee WWI cards. Biography Chapter 7, HTML
book #pass64, source index S326–S339, and rebuilt Word (authored
latest.docx unchanged).

Co-authored-by: blakereaganlaw <blakereaganlaw@gmail.com>
</commit_message>
<xml_diff>
--- a/research/dora-ella-newnam/book/Dora-Ella-Newnam-Stone-A-Life.docx
+++ b/research/dora-ella-newnam/book/Dora-Ella-Newnam-Stone-A-Life.docx
@@ -2538,7 +2538,150 @@
         <w:t>probable</w:t>
       </w:r>
       <w:r>
-        <w:t xml:space="preserve"> the wife in the couple “Rev. and Mrs. Robert Spicer of Lower Buffalo,” grandparents of Linda Lou Spicer, who died at three on 3 May 1944. [C341] [C323] [S312] Callie’s own death notice is still unread. [C342]</w:t>
+        <w:t xml:space="preserve"> the wife in the couple “Rev. and Mrs. Robert Spicer of Lower Buffalo,” grandparents of Linda Lou Spicer, who died at three on 3 May 1944. [C341] [C323] [S312] Callie (Newnam) Spicer’s own death notice is still unread. [C342]</w:t>
+      </w:r>
+    </w:p>
+    <w:p>
+      <w:r>
+        <w:t xml:space="preserve">The 1926 Callie Newnam on the Lee death extract is a different woman. She died 27 April 1926 at Proctor — a second extract says Idamay — aged thirty years and one month, parents Sam Moore and Mary Brandenburg. Dorothy Newnam, one year old, died 6 October 1926 at Idamay; her extract names father Everett Newnam and mother Callie Moore. Those two independent identifiers make Callie Moore Newnam </w:t>
+      </w:r>
+      <w:r>
+        <w:rPr>
+          <w:b/>
+        </w:rPr>
+        <w:t>proven</w:t>
+      </w:r>
+      <w:r>
+        <w:t xml:space="preserve"> as Everett’s wife. She is </w:t>
+      </w:r>
+      <w:r>
+        <w:rPr>
+          <w:b/>
+        </w:rPr>
+        <w:t>not</w:t>
+      </w:r>
+      <w:r>
+        <w:t xml:space="preserve"> Callie (Newnam) Spicer of Lower Buffalo, who was still living in May 1944. Conflict #21. [C355] [C356] [C357] [S331]</w:t>
+      </w:r>
+    </w:p>
+    <w:p>
+      <w:r>
+        <w:t>Melissa, the sixteen-year-old in Elias’s 1880 house, died 11 April 1957 as Melissa Newnam Estes Miller, ninety-three, daughter of Elias T. and Mary Ann Smallwood Newman, born 22 November 1863. The *Enterprise* of 18 April 1957 and the 1957 year-file agree: funeral 14 April at Beattyville Christian Church; buried Riverview. Survivors: son Herman Estes of Brasstown, North Carolina; stepson Johnnie E. Miller; granddaughter Ruby Booth. Same-person versus 1880 Malissa: parents plus birth year. Dora is not named — she had been dead thirty-one years. The 1939 living-sister list (Frankie Jones, Mary Peters, Melissa Eastes) is consistent; the 1957 notice does not name Frankie or Mary as living. [C358] [S332] [C003]</w:t>
+      </w:r>
+    </w:p>
+    <w:p>
+      <w:r>
+        <w:t xml:space="preserve">On 29 May 1915 a stillborn daughter of Grant Newnam and Martha Brandenburg was recorded at Willow. The Kentucky death-index row “NEWMAN, Grant 1” (volume 026, certificate 12938, age U/1) is that infant indexed under the father’s given name — </w:t>
+      </w:r>
+      <w:r>
+        <w:rPr>
+          <w:b/>
+        </w:rPr>
+        <w:t>not</w:t>
+      </w:r>
+      <w:r>
+        <w:t xml:space="preserve"> Grant of Berea’s death. Combined with the 1899 license and the 1936 Berea uncle, Grant × Martha is </w:t>
+      </w:r>
+      <w:r>
+        <w:rPr>
+          <w:b/>
+        </w:rPr>
+        <w:t>probable</w:t>
+      </w:r>
+      <w:r>
+        <w:t xml:space="preserve"> one couple. Conflict #20 still holds: Grant is not Everett’s brother. [C351] [C352] [C372] [S329]</w:t>
+      </w:r>
+    </w:p>
+    <w:p>
+      <w:r>
+        <w:t xml:space="preserve">A Frank Newnam died 16 March 1928 at St. Helens, born 4 October 1853, parents William Newnam and Rhoda Tincher. He is </w:t>
+      </w:r>
+      <w:r>
+        <w:rPr>
+          <w:b/>
+        </w:rPr>
+        <w:t>not</w:t>
+      </w:r>
+      <w:r>
+        <w:t xml:space="preserve"> Everett’s brother Frank the contractor of Berea, who was still living on 13 December 1939. Conflict #22. Do not merge William × Rhoda with Luther’s William × Katherine. [C353] [C354] [S330]</w:t>
+      </w:r>
+    </w:p>
+    <w:p>
+      <w:r>
+        <w:t>Grant’s own death is still unread. He is not a decedent in the Lee 1951–1957 year files — 1952 Stanley Newman (parents John × Serilda Angel) is the rejected Book 12 cluster; 1955 Ellen Newman (parents John Newton × Julia Durbin) is another house. He is not in Estill 1945 or 1951–1955 extracts. The published Berea Cemetery inventory has no Grant, Frank, or Clifton Newnam. Residual: Madison County death and the *Berea Citizen*. [C371] [C365] [C359] [S333] [S334] [S337]</w:t>
+      </w:r>
+    </w:p>
+    <w:p>
+      <w:r>
+        <w:t xml:space="preserve">Samuel P. still has no published will. The October 1887 Lee claims list is nil for Newnam. The USGenNet court landing holds only that claims page and a Phillips sketch — no order-book transcripts. FamilySearch catalog IDs for the unread films are now locked: court orders 1870–1919 = </w:t>
+      </w:r>
+      <w:r>
+        <w:rPr>
+          <w:b/>
+        </w:rPr>
+        <w:t>127869</w:t>
+      </w:r>
+      <w:r>
+        <w:t xml:space="preserve">; order books 1894–1922 = </w:t>
+      </w:r>
+      <w:r>
+        <w:rPr>
+          <w:b/>
+        </w:rPr>
+        <w:t>964964</w:t>
+      </w:r>
+      <w:r>
+        <w:t xml:space="preserve">; probate 1870–1967 = </w:t>
+      </w:r>
+      <w:r>
+        <w:rPr>
+          <w:b/>
+        </w:rPr>
+        <w:t>127913</w:t>
+      </w:r>
+      <w:r>
+        <w:t xml:space="preserve">; wills 1873–1945 = </w:t>
+      </w:r>
+      <w:r>
+        <w:rPr>
+          <w:b/>
+        </w:rPr>
+        <w:t>127891</w:t>
+      </w:r>
+      <w:r>
+        <w:t xml:space="preserve">; tax 1870–75 = </w:t>
+      </w:r>
+      <w:r>
+        <w:rPr>
+          <w:b/>
+        </w:rPr>
+        <w:t>156057</w:t>
+      </w:r>
+      <w:r>
+        <w:t xml:space="preserve">; tax 1879–92 = </w:t>
+      </w:r>
+      <w:r>
+        <w:rPr>
+          <w:b/>
+        </w:rPr>
+        <w:t>97277</w:t>
+      </w:r>
+      <w:r>
+        <w:t xml:space="preserve">; Lee WWI cards = </w:t>
+      </w:r>
+      <w:r>
+        <w:rPr>
+          <w:b/>
+        </w:rPr>
+        <w:t>1146342</w:t>
+      </w:r>
+      <w:r>
+        <w:t>. Kentucky Historical Society holds Lee probate 1873–1945 on microform; KDLA inventories other probate 1873–2004 and order books 1870–1981. Images not examined. [C360] [C361] [C374] [C375] [S326] [S327] [S328]</w:t>
+      </w:r>
+    </w:p>
+    <w:p>
+      <w:r>
+        <w:t>Owsley compiled obituaries name Luther only as an officiant — no John Newnam of Owsley decedent. The Owsley will index is still a placeholder. Estill grooms-to-1850 has only Nancy Newman × James Sparks, 9 December 1825. Lee Book 1 has no William × Katherine Sternberg; the 11 December 1872 application of Elisha Martin × Nancy Robinson at Sam Sternbergh’s house is Sternberg FAN only. [C364] [C363] [C366] [C368] [S335] [S336]</w:t>
       </w:r>
     </w:p>
     <w:p>
@@ -3077,10 +3220,37 @@
         <w:rPr>
           <w:b/>
         </w:rPr>
-        <w:t>B045 / B061 / B047:</w:t>
-      </w:r>
-      <w:r>
-        <w:t xml:space="preserve"> Samuel P. probate film (FS 127913 / 127891) and court orders 1870–1919 unread; M1509 draft cards unread. [C320] [C348]</w:t>
+        <w:t>B045 / B061 / B065:</w:t>
+      </w:r>
+      <w:r>
+        <w:t xml:space="preserve"> Samuel P. probate and court-order </w:t>
+      </w:r>
+      <w:r>
+        <w:rPr>
+          <w:b/>
+        </w:rPr>
+        <w:t>images</w:t>
+      </w:r>
+      <w:r>
+        <w:t xml:space="preserve"> unread. Catalog IDs locked: FS </w:t>
+      </w:r>
+      <w:r>
+        <w:rPr>
+          <w:b/>
+        </w:rPr>
+        <w:t>127913 / 127891 / 127869 / 964964 / 156057 / 97277</w:t>
+      </w:r>
+      <w:r>
+        <w:t xml:space="preserve">. October 1887 claims </w:t>
+      </w:r>
+      <w:r>
+        <w:rPr>
+          <w:b/>
+        </w:rPr>
+        <w:t>nil</w:t>
+      </w:r>
+      <w:r>
+        <w:t>. KHS/KDLA film unread. [C360] [C361] [C374] [C375]</w:t>
       </w:r>
     </w:p>
     <w:p>
@@ -3091,19 +3261,37 @@
         <w:rPr>
           <w:b/>
         </w:rPr>
-        <w:t>FAN residual:</w:t>
-      </w:r>
-      <w:r>
-        <w:t xml:space="preserve"> Frank of Berea (B055) not merged with Grant (conflict #20); John of Owsley (B056); Callie Spicer’s own death (B057); Grant’s death 1951–1955 (B063); Fred of Irvine (B062); William × Katherine Sternberg license (B064); Carter Cove stone photographs (B054). Luther’s death and Shelby × Grace are </w:t>
-      </w:r>
-      <w:r>
-        <w:rPr>
-          <w:b/>
-        </w:rPr>
-        <w:t>closed</w:t>
-      </w:r>
-      <w:r>
-        <w:t>.</w:t>
+        <w:t>B047 / B069:</w:t>
+      </w:r>
+      <w:r>
+        <w:t xml:space="preserve"> M1509 </w:t>
+      </w:r>
+      <w:r>
+        <w:rPr>
+          <w:b/>
+        </w:rPr>
+        <w:t>KY45/24/74</w:t>
+      </w:r>
+      <w:r>
+        <w:t xml:space="preserve"> and FS </w:t>
+      </w:r>
+      <w:r>
+        <w:rPr>
+          <w:b/>
+        </w:rPr>
+        <w:t>1146342</w:t>
+      </w:r>
+      <w:r>
+        <w:t xml:space="preserve"> Lee WWI cards unread. Estill WWI page empty; GT Estill/Owsley </w:t>
+      </w:r>
+      <w:r>
+        <w:rPr>
+          <w:b/>
+        </w:rPr>
+        <w:t>404</w:t>
+      </w:r>
+      <w:r>
+        <w:t>. [C367]</w:t>
       </w:r>
     </w:p>
     <w:p>
@@ -3111,7 +3299,22 @@
         <w:pStyle w:val="ListBullet"/>
       </w:pPr>
       <w:r>
-        <w:t xml:space="preserve">Greene 37–43 Stone sweep is </w:t>
+        <w:rPr>
+          <w:b/>
+        </w:rPr>
+        <w:t>FAN residual:</w:t>
+      </w:r>
+      <w:r>
+        <w:t xml:space="preserve"> Frank of Berea (B055) not merged with Grant (#20) or with 1928 St. Helens Frank (#22); John of Owsley (B056); Callie Spicer’s own death (B057) — not the 1926 Callie Moore (#21); Grant’s Madison death (B066); Fred of Irvine (B062); William × Katherine Sternberg license (B064); two William lines (B071); Carter Cove stone photographs (B054). Luther’s death, Shelby × Grace, and Melissa Estes Miller </w:t>
+      </w:r>
+      <w:r>
+        <w:rPr>
+          <w:b/>
+        </w:rPr>
+        <w:t>11 Apr 1957</w:t>
+      </w:r>
+      <w:r>
+        <w:t xml:space="preserve"> are </w:t>
       </w:r>
       <w:r>
         <w:rPr>
@@ -3120,10 +3323,27 @@
         <w:t>closed</w:t>
       </w:r>
       <w:r>
-        <w:t>. Do not reopen Peebles as a third marriage without a license. Do not print 1868 or 24 February 1906 as facts.</w:t>
+        <w:t>.</w:t>
       </w:r>
     </w:p>
     <w:p>
+      <w:pPr>
+        <w:pStyle w:val="ListBullet"/>
+      </w:pPr>
+      <w:r>
+        <w:t xml:space="preserve">Greene 37–43 Stone sweep is </w:t>
+      </w:r>
+      <w:r>
+        <w:rPr>
+          <w:b/>
+        </w:rPr>
+        <w:t>closed</w:t>
+      </w:r>
+      <w:r>
+        <w:t>. Do not reopen Peebles as a third marriage without a license. Do not print 1868 or 24 February 1906 as facts.</w:t>
+      </w:r>
+    </w:p>
+    <w:p>
       <w:r>
         <w:t xml:space="preserve">The next session starts with </w:t>
       </w:r>
@@ -3134,13 +3354,31 @@
         <w:t>B045</w:t>
       </w:r>
       <w:r>
-        <w:t xml:space="preserve"> (and </w:t>
+        <w:t xml:space="preserve"> (FS </w:t>
+      </w:r>
+      <w:r>
+        <w:rPr>
+          <w:b/>
+        </w:rPr>
+        <w:t>127913 / 127891</w:t>
+      </w:r>
+      <w:r>
+        <w:t xml:space="preserve">) and </w:t>
       </w:r>
       <w:r>
         <w:rPr>
           <w:b/>
         </w:rPr>
         <w:t>B061</w:t>
+      </w:r>
+      <w:r>
+        <w:t xml:space="preserve"> (</w:t>
+      </w:r>
+      <w:r>
+        <w:rPr>
+          <w:b/>
+        </w:rPr>
+        <w:t>127869 / 964964</w:t>
       </w:r>
       <w:r>
         <w:t>).</w:t>
@@ -4236,6 +4474,487 @@
     </w:p>
     <w:p>
       <w:r>
+        <w:t xml:space="preserve">41. Lee deaths 1915: stillborn female Newnam, 29 May 1915, Willow; parents Grant Newnam × Martha Brandenburg. [USGenNet 1915](https://usgennet.org/usa/ky/county/lee/deaths/1915.html). KDI “NEWMAN, Grant 1,” vol. 026, cert. 12938, age U/1 = that infant, not Grant of Berea. [kdi/n.html](https://usgennet.org/usa/ky/county/lee/deaths/kdi/n.html). *Transcription only.* </w:t>
+      </w:r>
+      <w:r>
+        <w:rPr>
+          <w:b/>
+        </w:rPr>
+        <w:t>C351</w:t>
+      </w:r>
+      <w:r>
+        <w:t xml:space="preserve"> </w:t>
+      </w:r>
+      <w:r>
+        <w:rPr>
+          <w:b/>
+        </w:rPr>
+        <w:t>C352</w:t>
+      </w:r>
+      <w:r>
+        <w:t xml:space="preserve"> </w:t>
+      </w:r>
+      <w:r>
+        <w:rPr>
+          <w:b/>
+        </w:rPr>
+        <w:t>S329</w:t>
+      </w:r>
+      <w:r>
+        <w:t xml:space="preserve">. </w:t>
+      </w:r>
+      <w:r>
+        <w:rPr>
+          <w:b/>
+        </w:rPr>
+        <w:t>PROVEN</w:t>
+      </w:r>
+      <w:r>
+        <w:t xml:space="preserve"> as extracts.</w:t>
+      </w:r>
+    </w:p>
+    <w:p>
+      <w:r>
+        <w:t xml:space="preserve">42. Lee deaths 1926: Callie Newnam/Newnan d. 27 Apr 1926, parents Sam Moore × Mary Brandenburg; Dorothy Newnam d. 6 Oct 1926 Idamay, parents Everett Newnam × Callie Moore. [USGenNet 1926](https://usgennet.org/usa/ky/county/lee/deaths/1926.html). *Transcription only.* </w:t>
+      </w:r>
+      <w:r>
+        <w:rPr>
+          <w:b/>
+        </w:rPr>
+        <w:t>C355–C357</w:t>
+      </w:r>
+      <w:r>
+        <w:t xml:space="preserve"> </w:t>
+      </w:r>
+      <w:r>
+        <w:rPr>
+          <w:b/>
+        </w:rPr>
+        <w:t>S331</w:t>
+      </w:r>
+      <w:r>
+        <w:t xml:space="preserve">. Conflict </w:t>
+      </w:r>
+      <w:r>
+        <w:rPr>
+          <w:b/>
+        </w:rPr>
+        <w:t>#21</w:t>
+      </w:r>
+      <w:r>
+        <w:t xml:space="preserve">. </w:t>
+      </w:r>
+      <w:r>
+        <w:rPr>
+          <w:b/>
+        </w:rPr>
+        <w:t>PROVEN</w:t>
+      </w:r>
+      <w:r>
+        <w:t xml:space="preserve"> two-woman split.</w:t>
+      </w:r>
+    </w:p>
+    <w:p>
+      <w:r>
+        <w:t xml:space="preserve">43. Lee deaths 1928: Frank Newnam d. 16 Mar 1928 St. Helens, b. 4 Oct 1853, parents William Newnam × Rhoda Tincher. [USGenNet 1928](https://usgennet.org/usa/ky/county/lee/deaths/1928.html). *Transcription only.* </w:t>
+      </w:r>
+      <w:r>
+        <w:rPr>
+          <w:b/>
+        </w:rPr>
+        <w:t>C353</w:t>
+      </w:r>
+      <w:r>
+        <w:t xml:space="preserve"> </w:t>
+      </w:r>
+      <w:r>
+        <w:rPr>
+          <w:b/>
+        </w:rPr>
+        <w:t>C354</w:t>
+      </w:r>
+      <w:r>
+        <w:t xml:space="preserve"> </w:t>
+      </w:r>
+      <w:r>
+        <w:rPr>
+          <w:b/>
+        </w:rPr>
+        <w:t>S330</w:t>
+      </w:r>
+      <w:r>
+        <w:t xml:space="preserve">. Conflict </w:t>
+      </w:r>
+      <w:r>
+        <w:rPr>
+          <w:b/>
+        </w:rPr>
+        <w:t>#22</w:t>
+      </w:r>
+      <w:r>
+        <w:t xml:space="preserve">. </w:t>
+      </w:r>
+      <w:r>
+        <w:rPr>
+          <w:b/>
+        </w:rPr>
+        <w:t>PROVEN</w:t>
+      </w:r>
+      <w:r>
+        <w:t xml:space="preserve"> not-merge vs Berea contractor.</w:t>
+      </w:r>
+    </w:p>
+    <w:p>
+      <w:r>
+        <w:t xml:space="preserve">44. *Beattyville Enterprise*, 18 Apr 1957, plus Lee 1957 year-file: Melissa Newnam Estes Miller, d/o Elias T. × Mary Ann Smallwood, b. 22 Nov 1863, d. 11 Apr 1957; buried Riverview. [USGenNet m.html](https://usgennet.org/usa/ky/county/lee/obituaries/m.html#melissanmiller). *Transcription only.* </w:t>
+      </w:r>
+      <w:r>
+        <w:rPr>
+          <w:b/>
+        </w:rPr>
+        <w:t>C358</w:t>
+      </w:r>
+      <w:r>
+        <w:t xml:space="preserve"> </w:t>
+      </w:r>
+      <w:r>
+        <w:rPr>
+          <w:b/>
+        </w:rPr>
+        <w:t>S332</w:t>
+      </w:r>
+      <w:r>
+        <w:t xml:space="preserve">. Same-person vs 1880 Malissa: parents + year. </w:t>
+      </w:r>
+      <w:r>
+        <w:rPr>
+          <w:b/>
+        </w:rPr>
+        <w:t>PROVEN</w:t>
+      </w:r>
+      <w:r>
+        <w:t>.</w:t>
+      </w:r>
+    </w:p>
+    <w:p>
+      <w:r>
+        <w:t xml:space="preserve">45. Madison County Public Library, Berea Cemetery burial inventory. [PDF](https://apps.madisonlibrary.org/public_records/BereaCemetery_Print.pdf). *Index only.* </w:t>
+      </w:r>
+      <w:r>
+        <w:rPr>
+          <w:b/>
+        </w:rPr>
+        <w:t>Nil</w:t>
+      </w:r>
+      <w:r>
+        <w:t xml:space="preserve"> Grant / Frank / Clifton Newnam. </w:t>
+      </w:r>
+      <w:r>
+        <w:rPr>
+          <w:b/>
+        </w:rPr>
+        <w:t>C359</w:t>
+      </w:r>
+      <w:r>
+        <w:t xml:space="preserve"> </w:t>
+      </w:r>
+      <w:r>
+        <w:rPr>
+          <w:b/>
+        </w:rPr>
+        <w:t>S334</w:t>
+      </w:r>
+      <w:r>
+        <w:t>.</w:t>
+      </w:r>
+    </w:p>
+    <w:p>
+      <w:r>
+        <w:t xml:space="preserve">46. FamilySearch catalog IDs (images unread): court orders 1870–1919 </w:t>
+      </w:r>
+      <w:r>
+        <w:rPr>
+          <w:b/>
+        </w:rPr>
+        <w:t>127869</w:t>
+      </w:r>
+      <w:r>
+        <w:t xml:space="preserve">; order books 1894–1922 </w:t>
+      </w:r>
+      <w:r>
+        <w:rPr>
+          <w:b/>
+        </w:rPr>
+        <w:t>964964</w:t>
+      </w:r>
+      <w:r>
+        <w:t xml:space="preserve">; probate 1870–1967 </w:t>
+      </w:r>
+      <w:r>
+        <w:rPr>
+          <w:b/>
+        </w:rPr>
+        <w:t>127913</w:t>
+      </w:r>
+      <w:r>
+        <w:t xml:space="preserve">; wills 1873–1945 </w:t>
+      </w:r>
+      <w:r>
+        <w:rPr>
+          <w:b/>
+        </w:rPr>
+        <w:t>127891</w:t>
+      </w:r>
+      <w:r>
+        <w:t xml:space="preserve">; tax 1870–75 </w:t>
+      </w:r>
+      <w:r>
+        <w:rPr>
+          <w:b/>
+        </w:rPr>
+        <w:t>156057</w:t>
+      </w:r>
+      <w:r>
+        <w:t xml:space="preserve">; tax 1879–92 </w:t>
+      </w:r>
+      <w:r>
+        <w:rPr>
+          <w:b/>
+        </w:rPr>
+        <w:t>97277</w:t>
+      </w:r>
+      <w:r>
+        <w:t xml:space="preserve">; Lee WWI cards </w:t>
+      </w:r>
+      <w:r>
+        <w:rPr>
+          <w:b/>
+        </w:rPr>
+        <w:t>1146342</w:t>
+      </w:r>
+      <w:r>
+        <w:t xml:space="preserve">. LDSGenealogy FHL2 CGI numbers in saved HTML filenames are </w:t>
+      </w:r>
+      <w:r>
+        <w:rPr>
+          <w:b/>
+        </w:rPr>
+        <w:t>not</w:t>
+      </w:r>
+      <w:r>
+        <w:t xml:space="preserve"> those IDs. </w:t>
+      </w:r>
+      <w:r>
+        <w:rPr>
+          <w:b/>
+        </w:rPr>
+        <w:t>C361</w:t>
+      </w:r>
+      <w:r>
+        <w:t xml:space="preserve"> </w:t>
+      </w:r>
+      <w:r>
+        <w:rPr>
+          <w:b/>
+        </w:rPr>
+        <w:t>S326</w:t>
+      </w:r>
+      <w:r>
+        <w:t xml:space="preserve"> </w:t>
+      </w:r>
+      <w:r>
+        <w:rPr>
+          <w:b/>
+        </w:rPr>
+        <w:t>S338</w:t>
+      </w:r>
+      <w:r>
+        <w:t>. *Catalog only.*</w:t>
+      </w:r>
+    </w:p>
+    <w:p>
+      <w:r>
+        <w:t xml:space="preserve">47. USGenNet Lee court landing + October 1887 claims: </w:t>
+      </w:r>
+      <w:r>
+        <w:rPr>
+          <w:b/>
+        </w:rPr>
+        <w:t>nil</w:t>
+      </w:r>
+      <w:r>
+        <w:t xml:space="preserve"> Newnam. [court/](https://usgennet.org/usa/ky/county/lee/court/) · [Oct1887claims](https://usgennet.org/usa/ky/county/lee/court/Oct1887claims.html). </w:t>
+      </w:r>
+      <w:r>
+        <w:rPr>
+          <w:b/>
+        </w:rPr>
+        <w:t>C360</w:t>
+      </w:r>
+      <w:r>
+        <w:t xml:space="preserve"> </w:t>
+      </w:r>
+      <w:r>
+        <w:rPr>
+          <w:b/>
+        </w:rPr>
+        <w:t>C362</w:t>
+      </w:r>
+      <w:r>
+        <w:t xml:space="preserve"> </w:t>
+      </w:r>
+      <w:r>
+        <w:rPr>
+          <w:b/>
+        </w:rPr>
+        <w:t>S327</w:t>
+      </w:r>
+      <w:r>
+        <w:t xml:space="preserve">. SNAC KHS probate 1873–1945 and KDLA other probate 1873–2004 / order books 1870–1981 unread. </w:t>
+      </w:r>
+      <w:r>
+        <w:rPr>
+          <w:b/>
+        </w:rPr>
+        <w:t>C374</w:t>
+      </w:r>
+      <w:r>
+        <w:t xml:space="preserve"> </w:t>
+      </w:r>
+      <w:r>
+        <w:rPr>
+          <w:b/>
+        </w:rPr>
+        <w:t>C375</w:t>
+      </w:r>
+      <w:r>
+        <w:t xml:space="preserve"> </w:t>
+      </w:r>
+      <w:r>
+        <w:rPr>
+          <w:b/>
+        </w:rPr>
+        <w:t>S328</w:t>
+      </w:r>
+      <w:r>
+        <w:t>.</w:t>
+      </w:r>
+    </w:p>
+    <w:p>
+      <w:r>
+        <w:t xml:space="preserve">48. Lee deaths 1951–1957 </w:t>
+      </w:r>
+      <w:r>
+        <w:rPr>
+          <w:b/>
+        </w:rPr>
+        <w:t>nil</w:t>
+      </w:r>
+      <w:r>
+        <w:t xml:space="preserve"> Grant decedent; Estill 1945 / 1951–55 </w:t>
+      </w:r>
+      <w:r>
+        <w:rPr>
+          <w:b/>
+        </w:rPr>
+        <w:t>nil</w:t>
+      </w:r>
+      <w:r>
+        <w:t xml:space="preserve"> Newnam/Newman/Grant/Fred; Owsley compiled obits </w:t>
+      </w:r>
+      <w:r>
+        <w:rPr>
+          <w:b/>
+        </w:rPr>
+        <w:t>nil</w:t>
+      </w:r>
+      <w:r>
+        <w:t xml:space="preserve"> John Newnam decedent; Book 1 </w:t>
+      </w:r>
+      <w:r>
+        <w:rPr>
+          <w:b/>
+        </w:rPr>
+        <w:t>nil</w:t>
+      </w:r>
+      <w:r>
+        <w:t xml:space="preserve"> William × Katherine. </w:t>
+      </w:r>
+      <w:r>
+        <w:rPr>
+          <w:b/>
+        </w:rPr>
+        <w:t>C371</w:t>
+      </w:r>
+      <w:r>
+        <w:t xml:space="preserve"> </w:t>
+      </w:r>
+      <w:r>
+        <w:rPr>
+          <w:b/>
+        </w:rPr>
+        <w:t>C365</w:t>
+      </w:r>
+      <w:r>
+        <w:t xml:space="preserve"> </w:t>
+      </w:r>
+      <w:r>
+        <w:rPr>
+          <w:b/>
+        </w:rPr>
+        <w:t>C364</w:t>
+      </w:r>
+      <w:r>
+        <w:t xml:space="preserve"> </w:t>
+      </w:r>
+      <w:r>
+        <w:rPr>
+          <w:b/>
+        </w:rPr>
+        <w:t>C368</w:t>
+      </w:r>
+      <w:r>
+        <w:t xml:space="preserve"> </w:t>
+      </w:r>
+      <w:r>
+        <w:rPr>
+          <w:b/>
+        </w:rPr>
+        <w:t>S333</w:t>
+      </w:r>
+      <w:r>
+        <w:t xml:space="preserve"> </w:t>
+      </w:r>
+      <w:r>
+        <w:rPr>
+          <w:b/>
+        </w:rPr>
+        <w:t>S336</w:t>
+      </w:r>
+      <w:r>
+        <w:t xml:space="preserve"> </w:t>
+      </w:r>
+      <w:r>
+        <w:rPr>
+          <w:b/>
+        </w:rPr>
+        <w:t>S337</w:t>
+      </w:r>
+      <w:r>
+        <w:t xml:space="preserve"> </w:t>
+      </w:r>
+      <w:r>
+        <w:rPr>
+          <w:b/>
+        </w:rPr>
+        <w:t>S335</w:t>
+      </w:r>
+      <w:r>
+        <w:t>. *Transcription only.*</w:t>
+      </w:r>
+    </w:p>
+    <w:p>
+      <w:r>
         <w:br w:type="page"/>
       </w:r>
     </w:p>
@@ -4258,7 +4977,16 @@
         <w:t>saved local copies</w:t>
       </w:r>
       <w:r>
-        <w:t>. Full file list: [`../SOURCE-INDEX.md`](../SOURCE-INDEX.md) and [`../sources/SOURCE-INVENTORY.tsv`](../sources/SOURCE-INVENTORY.tsv) (406+ files after this pass).</w:t>
+        <w:t>. Full file list: [`../SOURCE-INDEX.md`](../SOURCE-INDEX.md) and [`../sources/SOURCE-INVENTORY.tsv`](../sources/SOURCE-INVENTORY.tsv) (</w:t>
+      </w:r>
+      <w:r>
+        <w:rPr>
+          <w:b/>
+        </w:rPr>
+        <w:t>500</w:t>
+      </w:r>
+      <w:r>
+        <w:t xml:space="preserve"> files after pass 64).</w:t>
       </w:r>
     </w:p>
     <w:p>
@@ -4373,6 +5101,59 @@
     <w:p>
       <w:r>
         <w:t>| S315 | `../sources/press/loc-item-dardanelle-post-dispatch.json` | [LOC sn89051008](https://www.loc.gov/item/sn89051008/) | *Dardanelle Post-Dispatch* not digitized | catalog only |</w:t>
+      </w:r>
+    </w:p>
+    <w:p>
+      <w:r>
+        <w:t xml:space="preserve">| S326 | `../sources/catalog/fhl-175637-court-orders-1870-1919.html` + sibling FHL2 pages | [LDSGenealogy Lee court](https://ldsgenealogy.com/KY/Lee-County-Court-Records.htm) | FS IDs </w:t>
+      </w:r>
+      <w:r>
+        <w:rPr>
+          <w:b/>
+        </w:rPr>
+        <w:t>127869 / 964964 / 127913 / 127891 / 156057 / 97277</w:t>
+      </w:r>
+      <w:r>
+        <w:t xml:space="preserve"> | catalog only |</w:t>
+      </w:r>
+    </w:p>
+    <w:p>
+      <w:r>
+        <w:t>| S329 | `../sources/vital/lee-deaths-1915-grant-stillborn-extract-2026-10-30.txt` | [1915 deaths](https://usgennet.org/usa/ky/county/lee/deaths/1915.html) | Grant × Martha stillborn 29 May 1915 | transcription only |</w:t>
+      </w:r>
+    </w:p>
+    <w:p>
+      <w:r>
+        <w:t>| S330 | `../sources/vital/lee-deaths-1928-frank-newnam-extract-2026-10-30.txt` | [1928 deaths](https://usgennet.org/usa/ky/county/lee/deaths/1928.html) | Frank d. 16 Mar 1928 St. Helens — reject vs Berea | transcription only |</w:t>
+      </w:r>
+    </w:p>
+    <w:p>
+      <w:r>
+        <w:t>| S331 | `../sources/vital/lee-deaths-1926-callie-dorothy-extract-2026-10-30.txt` | [1926 deaths](https://usgennet.org/usa/ky/county/lee/deaths/1926.html) | Callie Moore + Dorothy; not Spicer | transcription only |</w:t>
+      </w:r>
+    </w:p>
+    <w:p>
+      <w:r>
+        <w:t>| S332 | `../sources/obituaries/lee-obits-melissa-estes-miller-1957-extract-2026-10-30.txt` | [Obits M](https://usgennet.org/usa/ky/county/lee/obituaries/m.html#melissanmiller) | Melissa Estes Miller d. 11 Apr 1957 | transcription only |</w:t>
+      </w:r>
+    </w:p>
+    <w:p>
+      <w:r>
+        <w:t>| S334 | `../sources/cemetery/berea-cemetery-newnam-nil-2026-10-30.txt` | [Berea Cemetery PDF](https://apps.madisonlibrary.org/public_records/BereaCemetery_Print.pdf) | Nil Grant/Frank/Clifton | index only |</w:t>
+      </w:r>
+    </w:p>
+    <w:p>
+      <w:r>
+        <w:t xml:space="preserve">| S338 | `../sources/catalog/ldsgenealogy-lee-military.html` | [LDSGenealogy Lee military](https://ldsgenealogy.com/KY/Lee-County-Military-Records.htm) | FS </w:t>
+      </w:r>
+      <w:r>
+        <w:rPr>
+          <w:b/>
+        </w:rPr>
+        <w:t>1146342</w:t>
+      </w:r>
+      <w:r>
+        <w:t xml:space="preserve"> unread | catalog only |</w:t>
       </w:r>
     </w:p>
     <w:p>

</xml_diff>

<commit_message>
Pass 60–62: 1890 veterans, 1883 pension nils, Speed bugler, Uncle Doll 1928/1932
Kendrick 1890 HTML puts Elias T. Newnam as Bugler Co C 14th KY Cav at Old Landing
(discharge 16 Jun vs AG 16 Sep, conflict #23). Speed 1897 and the live TFKRHA
roster independently give Bugler; 1883 Lee/Owsley pensioner tables are nil;
Beattyville Enterprise notes Uncle Doll Newman sick 30 Nov 1928 and visited
1 Apr 1932. Original 1932 DC, 1840 bond, M123-3, and T288 remain unseen.

Co-authored-by: CatCorner22 <CatCorner22@users.noreply.github.com>
</commit_message>
<xml_diff>
--- a/research/dora-ella-newnam/book/Dora-Ella-Newnam-Stone-A-Life.docx
+++ b/research/dora-ella-newnam/book/Dora-Ella-Newnam-Stone-A-Life.docx
@@ -84,7 +84,7 @@
     </w:p>
     <w:p>
       <w:r>
-        <w:t>The parents on the 1880 schedule are the couple the certificate would name: Elias Newnam and Mary Smallwood. [C004] Neighbors on the same page were Newnams as well — Joseph, thirty-eight, next door, and John, sixty, in the household after. Elias, known as Doll, had been bugler of Company C, 14th Kentucky Cavalry, in 1862–63. Mary Ann Smallwood, born April 1842, came from the Owsley Smallwoods. Those military and cemetery facts were gathered in the first research chat and were not re-imaged later. They remain probable, not re-proved from originals in this file.</w:t>
+        <w:t>The parents on the 1880 schedule are the couple the certificate would name: Elias Newnam and Mary Smallwood. [C004] Neighbors on the same page were Newnams as well — Joseph, thirty-eight, next door, and John, sixty, in the household after. Elias, known as Doll, was bugler of Company C, 14th Kentucky Cavalry. Thomas Speed’s 1897 company list and the 1890 veterans transcript — the original schedule still unseen — both give that rank. An 1890 discharge of 16 June 1863 conflicts with the adjutant-general muster-out of 16 September 1863 and is not averaged. He is not on the 1883 Lee pensioner tables. The *Beattyville Enterprise* of 30 November 1928 noted Uncle Doll Newman very sick; the 1 April 1932 issue had E. T. Sparks of Hazard visiting Uncle Doll Newnam in Beattyville, seventeen days before the 18 April 1932 death extract. None of those records names his parents. Mary Ann Smallwood, born April 1842, came from the Owsley Smallwoods. The 11 July 1918 cemetery date is still unmatched in Kentucky’s civil index.</w:t>
       </w:r>
     </w:p>
     <w:p>
@@ -2789,7 +2789,7 @@
         <w:t>#22</w:t>
       </w:r>
       <w:r>
-        <w:t>: cemetery transcript dates Mary A. Newnam 11 July 1918; Kentucky’s 1918 death index has no matching Lee row. The Find A Grave JPEG on file is a portrait, not a stone.</w:t>
+        <w:t>: cemetery transcript dates Mary A. Newnam 11 July 1918; Kentucky’s 1918 death index has no matching Lee row, and a statewide sweep of 11 July 1918 has no Newman/Smallwood. The Find A Grave JPEG on file is a portrait, not a stone.</w:t>
       </w:r>
     </w:p>
     <w:p>
@@ -2797,7 +2797,16 @@
         <w:pStyle w:val="ListBullet"/>
       </w:pPr>
       <w:r>
-        <w:t>The original 1932 Lee death certificate, volume 20, number 9525, and the original 1916 Owsley certificate, volume 44, number 21663. The 1916 extracts leave the parent cells blank.</w:t>
+        <w:t xml:space="preserve">Conflict </w:t>
+      </w:r>
+      <w:r>
+        <w:rPr>
+          <w:b/>
+        </w:rPr>
+        <w:t>#23</w:t>
+      </w:r>
+      <w:r>
+        <w:t>: 1890 veterans transcript discharges Elias T. on 16 June 1863; the adjutant-general roster musters him out 16 September 1863. Do not average.</w:t>
       </w:r>
     </w:p>
     <w:p>
@@ -2805,7 +2814,15 @@
         <w:pStyle w:val="ListBullet"/>
       </w:pPr>
       <w:r>
-        <w:t>The Estill Newman–Tincher bond, 1826–1850. Published “to 1850” web files stop at 1825. Burns and McGhee are not on the Internet Archive. Estill vital-statistics films skip 1840. Both Estill 1840 enumerators, and the Clay and Breathitt originals, are now seen; they do not name a Newman head. A reconstructed Owsley list dates Harry H. Newnam and Mary J. Partington 21 July 1864.</w:t>
+        <w:t>The original 1932 Lee death certificate, volume 20, number 9525, and the original 1916 Owsley certificate, volume 44, number 21663. The 1916 extracts leave the parent cells blank. The 1883 pensioner tables, Speed’s roster, the 1890 transcript, and the 1928/1932 *Enterprise* notes do not name those parents.</w:t>
+      </w:r>
+    </w:p>
+    <w:p>
+      <w:pPr>
+        <w:pStyle w:val="ListBullet"/>
+      </w:pPr>
+      <w:r>
+        <w:t>The Estill Newman–Tincher bond, 1826–1850. Published “to 1850” web files stop at 1825. Burns and McGhee are not on the Internet Archive. Estill vital-statistics films skip 1840. Both Estill 1840 enumerators, and the Clay and Breathitt originals, are now seen; they do not name a Newman head. A reconstructed Owsley list dates Harry H. Newnam and Mary J. Partington 21 July 1864. The federal pension index (T288) is still unopened.</w:t>
       </w:r>
     </w:p>
     <w:p>

</xml_diff>

<commit_message>
Pass 63: M850 Newnam cards — Elias T. cert 631218, Henry H. d. 6 Aug 1916
NARA M850 reel 1661 originals: Elias T. Newnam Army Invalid Bugler 14 Ky V Cav, Proctor, paid 1907–1922; Henry H. Pvt Co C died Travelers Rest payable widow Manerva (conflict #24 vs DC Widowed). Reel 1660 Newman spelling is other men. GPO vol. 5 Lee OCR nil Newman. Catalog 86. B061 still open.

Co-authored-by: CatCorner22 <CatCorner22@users.noreply.github.com>
</commit_message>
<xml_diff>
--- a/research/dora-ella-newnam/book/Dora-Ella-Newnam-Stone-A-Life.docx
+++ b/research/dora-ella-newnam/book/Dora-Ella-Newnam-Stone-A-Life.docx
@@ -41,7 +41,7 @@
     </w:p>
     <w:p>
       <w:r>
-        <w:t>Eighty-five Cursor chats on this repository were reviewed for this volume (primary research, helpers, scans, and failed browser hunts). The original mobile session opened the case and read the Arkansas death certificate the family still holds. Later sessions recovered the 1880 childhood schedule that free transcripts had missed, walked statewide Soundex reels for 1910 and 1920, tested a Peebles third-marriage hypothesis and set it aside, and photographed NARA microfilm frames — the 1880 childhood schedule, the 1910 Kentucky Ella Miracode plates, Hardin Gray on Sturgeon sheet 13 B, the 1860 Owsley original of Silas Gray’s house with William aged thirteen, the 1850 Owsley Gray pages that are other men (Thomas, James, John, Charles), the given-name Silas plates that are other boys (Ratliff eight months, Wilson six, Phillips fifteen) and the Bowman line first read as Cyrus and then as Squire, the 1850 Estill Marcus Gray original, Breathitt’s Taulbee infant Silas and Bryant Siras, and Madison’s John Green house with Silas Green aged twenty, the 1850 Owsley Harrison Newman house with an eight-year-old Elias who is probably Dora’s father — a 1932 death extract names Henry Harrison Newnam as that father — and is not merged as proven, the 1860 Booneville original of that house under H.H. Newman with Elias aged eighteen, the 1850 William Newman house of twenty-six on the same page, the 1850 John Newman of sixty born in Tennessee who is not the 1880 John of sixty-nine, and Andrew Mays’s Giles at one month in 1850 and eleven in 1860, the 1870 Proctor original of James Brandenburg’s house, Silas Gray’s Sturgeon original, the 1880 District 59 originals of William next door to John Newnam and of Silas still in the district, the 1900 William Gray dwelling-84 crop, and the Bollinger page a sibling had labelled “Dora E. Stone,” which is Henry C. Rhodes and Dora M. of Missouri. This volume folds those chats into one narrative. The case dossier remains the working file; this book is the public reading of it. Sibling work on Greene ED 37 through 41 is now on merged PR #26 through Pass 59; remaining Greene ED 38 B-sides, 1900 Liberty, and 1900 hh 85 are inventoried, not duplicated. Do not import their “Dora E. Stone” as this woman.</w:t>
+        <w:t>Eighty-six Cursor chats on this repository were reviewed for this volume (primary research, helpers, scans, and failed browser hunts). The original mobile session opened the case and read the Arkansas death certificate the family still holds. Later sessions recovered the 1880 childhood schedule that free transcripts had missed, walked statewide Soundex reels for 1910 and 1920, tested a Peebles third-marriage hypothesis and set it aside, and photographed NARA microfilm frames — the 1880 childhood schedule, the 1910 Kentucky Ella Miracode plates, Hardin Gray on Sturgeon sheet 13 B, the 1860 Owsley original of Silas Gray’s house with William aged thirteen, the 1850 Owsley Gray pages that are other men (Thomas, James, John, Charles), the given-name Silas plates that are other boys (Ratliff eight months, Wilson six, Phillips fifteen) and the Bowman line first read as Cyrus and then as Squire, the 1850 Estill Marcus Gray original, Breathitt’s Taulbee infant Silas and Bryant Siras, and Madison’s John Green house with Silas Green aged twenty, the 1850 Owsley Harrison Newman house with an eight-year-old Elias who is probably Dora’s father — a 1932 death extract names Henry Harrison Newnam as that father — and is not merged as proven, the 1860 Booneville original of that house under H.H. Newman with Elias aged eighteen, the 1850 William Newman house of twenty-six on the same page, the 1850 John Newman of sixty born in Tennessee who is not the 1880 John of sixty-nine, and Andrew Mays’s Giles at one month in 1850 and eleven in 1860, the 1870 Proctor original of James Brandenburg’s house, Silas Gray’s Sturgeon original, the 1880 District 59 originals of William next door to John Newnam and of Silas still in the district, the 1900 William Gray dwelling-84 crop, and the Bollinger page a sibling had labelled “Dora E. Stone,” which is Henry C. Rhodes and Dora M. of Missouri. This volume folds those chats into one narrative. The case dossier remains the working file; this book is the public reading of it. Sibling work on Greene ED 37 through 41 is now on merged PR #26 through Pass 59; remaining Greene ED 38 B-sides, 1900 Liberty, and 1900 hh 85 are inventoried, not duplicated. Do not import their “Dora E. Stone” as this woman.</w:t>
       </w:r>
     </w:p>
     <w:p>
@@ -84,7 +84,43 @@
     </w:p>
     <w:p>
       <w:r>
-        <w:t>The parents on the 1880 schedule are the couple the certificate would name: Elias Newnam and Mary Smallwood. [C004] Neighbors on the same page were Newnams as well — Joseph, thirty-eight, next door, and John, sixty, in the household after. Elias, known as Doll, was bugler of Company C, 14th Kentucky Cavalry. Thomas Speed’s 1897 company list and the 1890 veterans transcript — the original schedule still unseen — both give that rank. An 1890 discharge of 16 June 1863 conflicts with the adjutant-general muster-out of 16 September 1863 and is not averaged. He is not on the 1883 Lee pensioner tables. The *Beattyville Enterprise* of 30 November 1928 noted Uncle Doll Newman very sick; the 1 April 1932 issue had E. T. Sparks of Hazard visiting Uncle Doll Newnam in Beattyville, seventeen days before the 18 April 1932 death extract. None of those records names his parents. Mary Ann Smallwood, born April 1842, came from the Owsley Smallwoods. The 11 July 1918 cemetery date is still unmatched in Kentucky’s civil index.</w:t>
+        <w:t xml:space="preserve">The parents on the 1880 schedule are the couple the certificate would name: Elias Newnam and Mary Smallwood. [C004] Neighbors on the same page were Newnams as well — Joseph, thirty-eight, next door, and John, sixty, in the household after. Elias, known as Doll, was bugler of Company C, 14th Kentucky Cavalry. Thomas Speed’s 1897 company list and the 1890 veterans transcript — the original schedule still unseen — both give that rank. The Veterans Administration payment card is an original: </w:t>
+      </w:r>
+      <w:r>
+        <w:rPr>
+          <w:b/>
+        </w:rPr>
+        <w:t>Newnam, Elias T.</w:t>
+      </w:r>
+      <w:r>
+        <w:t xml:space="preserve">, Army Invalid, certificate </w:t>
+      </w:r>
+      <w:r>
+        <w:rPr>
+          <w:b/>
+        </w:rPr>
+        <w:t>631218</w:t>
+      </w:r>
+      <w:r>
+        <w:t xml:space="preserve">, Bugler of the 14th Kentucky Volunteer Cavalry, home Proctor, paid from February 1907 through August 1922. An 1890 discharge of 16 June 1863 conflicts with the adjutant-general muster-out of 16 September 1863 and is not averaged. He is not on the 1883 Lee pensioner tables; the first payment is under the act of 6 February 1907. The *Beattyville Enterprise* of 30 November 1928 noted Uncle Doll Newman very sick; the 1 April 1932 issue had E. T. Sparks of Hazard visiting Uncle Doll Newnam in Beattyville, seventeen days before the 18 April 1932 death extract. None of those records names his parents. His brother Henry H.’s payment card — certificate </w:t>
+      </w:r>
+      <w:r>
+        <w:rPr>
+          <w:b/>
+        </w:rPr>
+        <w:t>798864</w:t>
+      </w:r>
+      <w:r>
+        <w:t xml:space="preserve">, private, Company C, died 6 August 1916 at Travelers Rest, payable to widow </w:t>
+      </w:r>
+      <w:r>
+        <w:rPr>
+          <w:b/>
+        </w:rPr>
+        <w:t>Manerva</w:t>
+      </w:r>
+      <w:r>
+        <w:t>, who had married him in 1895 and who died 28 August 1920 — is a federal original of that death. The civil extract still calls Henry widowed. That contradiction is not averaged. Mary Ann Smallwood, born April 1842, came from the Owsley Smallwoods. The 11 July 1918 cemetery date is still unmatched in Kentucky’s civil index.</w:t>
       </w:r>
     </w:p>
     <w:p>

</xml_diff>

<commit_message>
Dora pass 65: Grant 1970, Kate 1941, Fred 1961, Callie Spicer 1961
Statewide KDI + USGenNet year files close Grant (9 Dec 1970), Kate=Katherine
Sternberg, Fred L. Estill 1961, and Callie Spicer (5 Nov 1961, Daniel×Sarah).
FS probate/WWI images still unread after R011 steps 8–19. Research not complete.

Co-authored-by: blakereaganlaw <blakereaganlaw@gmail.com>
</commit_message>
<xml_diff>
--- a/research/dora-ella-newnam/book/Dora-Ella-Newnam-Stone-A-Life.docx
+++ b/research/dora-ella-newnam/book/Dora-Ella-Newnam-Stone-A-Life.docx
@@ -2473,7 +2473,34 @@
         <w:t>unmerged</w:t>
       </w:r>
       <w:r>
-        <w:t xml:space="preserve"> from Elias’s son William. [C338] [C328] His infant son Larry Gene died in February 1937; Cora, his widow, died in February 1981. [C308] [C307]</w:t>
+        <w:t xml:space="preserve"> from Elias’s son William. [C338] [C328] Kate Newnam died at Beattyville on 21 September 1941, born 20 February 1871, spouse W. N. Newnam, father Samuel Sternberg, mother Mahaley Robinson — </w:t>
+      </w:r>
+      <w:r>
+        <w:rPr>
+          <w:b/>
+        </w:rPr>
+        <w:t>proven</w:t>
+      </w:r>
+      <w:r>
+        <w:t xml:space="preserve"> Luther’s mother Katherine Sternberg. [C383] [C384] [S342] A Proctor stone for William Newnam, 15 April 1867 – 10 December 1905, is </w:t>
+      </w:r>
+      <w:r>
+        <w:rPr>
+          <w:b/>
+        </w:rPr>
+        <w:t>probable</w:t>
+      </w:r>
+      <w:r>
+        <w:t xml:space="preserve"> that W. N. [C385] [S343] Fred L. Newman died in Estill County on 14 June 1961, age sixty-six — </w:t>
+      </w:r>
+      <w:r>
+        <w:rPr>
+          <w:b/>
+        </w:rPr>
+        <w:t>probable</w:t>
+      </w:r>
+      <w:r>
+        <w:t xml:space="preserve"> the 1945 Irvine brother and the Proctor Fred 1894–1961 beside Era. [C386] [C387] [C388] [S341] His infant son Larry Gene died in February 1937; Cora, his widow, died in February 1981. [C308] [C307]</w:t>
       </w:r>
     </w:p>
     <w:p>
@@ -2506,7 +2533,16 @@
         <w:t>not</w:t>
       </w:r>
       <w:r>
-        <w:t xml:space="preserve"> silently merged with Frank. On 12 August 1899 he bonded, at twenty-three, to marry Martha Brandenburgh, eighteen, at Oliver Brandenburgh’s. [C330] [S307] Martha Brandenburg Newnam died 18 February 1951 at St. Joseph’s in Lexington, her husband living. [C332] [S310] Their son William, born 5 February 1907 at Station Camp, Estill County, died 11 July 1955 in Springfield, Ohio, and the paper called Grant “the late.” Grant therefore died between those two dates. [C334] [C335] [S311] Same names and the Brandenburg wife make the 1899/1951/1955 Grant </w:t>
+        <w:t xml:space="preserve"> silently merged with Frank. On 12 August 1899 he bonded, at twenty-three, to marry Martha Brandenburgh, eighteen, at Oliver Brandenburgh’s. [C330] [S307] In January 1920 the Heidelberg precinct listed him at household 101–106, age forty-two, with Martha, thirty-eight, née Brandenburg, and seven children still at home, including William, thirteen. [C381] [S344] Lucy had already married Hiram Arvin at Willow on 14 September 1918; Roscoe married Bertha Reece on 13 December 1923. [C382] [C404] [S345] [S346] Martha Brandenburg Newnam died 18 February 1951 at St. Joseph’s in Lexington, her husband living. [C332] [S310] Their son William, born 5 February 1907 at Station Camp, Estill County, died 11 July 1955 in Springfield, Ohio, and the paper called Grant “the late.” That wording is a couple-style error. Statewide Kentucky death lists for 1951–1955 have no Grant Newman or Newnam decedent. Grant of Lee died 9 December 1970 in Fayette County, age ninety-three, volume 060, certificate 29556, born 10 June 1876. [C376] [C377] [C379] [C392] [S341] [S347] Conflict #23. Name, wife Martha Brandenburg, Lee County, and the ages 23 / 42 / 93 make the 1899 / 1920 / 1951 / 1970 Grant </w:t>
+      </w:r>
+      <w:r>
+        <w:rPr>
+          <w:b/>
+        </w:rPr>
+        <w:t>proven</w:t>
+      </w:r>
+      <w:r>
+        <w:t xml:space="preserve"> one man, and </w:t>
       </w:r>
       <w:r>
         <w:rPr>
@@ -2515,16 +2551,7 @@
         <w:t>probable</w:t>
       </w:r>
       <w:r>
-        <w:t xml:space="preserve"> one man, and </w:t>
-      </w:r>
-      <w:r>
-        <w:rPr>
-          <w:b/>
-        </w:rPr>
-        <w:t>probable</w:t>
-      </w:r>
-      <w:r>
-        <w:t xml:space="preserve"> the 1936 Berea uncle. Frank the contractor remains a separate person: different given name, and Grant was still alive in 1939 when Everett’s notice named Frank, not Grant. [C336] [C337] Conflict #20.</w:t>
+        <w:t xml:space="preserve"> the 1936 Berea uncle. Frank the contractor remains a separate person: different given name, and Grant was still alive in 1939 when Everett’s notice named Frank, not Grant. [C336] [C337] [C378] Conflict #20.</w:t>
       </w:r>
     </w:p>
     <w:p>
@@ -2538,7 +2565,34 @@
         <w:t>probable</w:t>
       </w:r>
       <w:r>
-        <w:t xml:space="preserve"> the wife in the couple “Rev. and Mrs. Robert Spicer of Lower Buffalo,” grandparents of Linda Lou Spicer, who died at three on 3 May 1944. [C341] [C323] [S312] Callie (Newnam) Spicer’s own death notice is still unread. [C342]</w:t>
+        <w:t xml:space="preserve"> the wife in the couple “Rev. and Mrs. Robert Spicer of Lower Buffalo,” grandparents of Linda Lou Spicer, who died at three on 3 May 1944. [C341] [C323] [S312] That grandmother is </w:t>
+      </w:r>
+      <w:r>
+        <w:rPr>
+          <w:b/>
+        </w:rPr>
+        <w:t>probable</w:t>
+      </w:r>
+      <w:r>
+        <w:t xml:space="preserve"> Callie Spicer who died in Lee County on 5 November 1961, aged seventy-five years, ten months, and three days, born 2 January 1886 in Owsley County, father Daniel Newnam, mother Sarah Veneable, buried Riverview. [C408] [C409] [C410] [S370] She is </w:t>
+      </w:r>
+      <w:r>
+        <w:rPr>
+          <w:b/>
+        </w:rPr>
+        <w:t>not</w:t>
+      </w:r>
+      <w:r>
+        <w:t xml:space="preserve"> the 1926 Callie Moore. Conflict #21. A Robert Spicer, eighty-three, of Lee, died in Boyle County on 11 November 1966 — </w:t>
+      </w:r>
+      <w:r>
+        <w:rPr>
+          <w:b/>
+        </w:rPr>
+        <w:t>probable</w:t>
+      </w:r>
+      <w:r>
+        <w:t xml:space="preserve"> the same minister; the Lee 1966 year file, as expected, does not list him. [C415] [C416] [S361] [S371]</w:t>
       </w:r>
     </w:p>
     <w:p>
@@ -2608,7 +2662,7 @@
     </w:p>
     <w:p>
       <w:r>
-        <w:t>Grant’s own death is still unread. He is not a decedent in the Lee 1951–1957 year files — 1952 Stanley Newman (parents John × Serilda Angel) is the rejected Book 12 cluster; 1955 Ellen Newman (parents John Newton × Julia Durbin) is another house. He is not in Estill 1945 or 1951–1955 extracts. The published Berea Cemetery inventory has no Grant, Frank, or Clifton Newnam. Residual: Madison County death and the *Berea Citizen*. [C371] [C365] [C359] [S333] [S334] [S337]</w:t>
+        <w:t>Grant’s 1951–1955 death window is closed. He is not a decedent in the Lee 1951–1957 year files or the Estill 1945 / 1951–1955 extracts, because he died in 1970. The published Berea Cemetery inventory has no Grant, Frank, or Clifton Newnam. A compiled Find A Grave snippet places Grant Newman (1877–1970) at Beatty Place — page and stone not seen. [C371] [C365] [C359] [C396] [S333] [S334] [S337] [S348]</w:t>
       </w:r>
     </w:p>
     <w:p>
@@ -3305,7 +3359,34 @@
         <w:t>FAN residual:</w:t>
       </w:r>
       <w:r>
-        <w:t xml:space="preserve"> Frank of Berea (B055) not merged with Grant (#20) or with 1928 St. Helens Frank (#22); John of Owsley (B056); Callie Spicer’s own death (B057) — not the 1926 Callie Moore (#21); Grant’s Madison death (B066); Fred of Irvine (B062); William × Katherine Sternberg license (B064); two William lines (B071); Carter Cove stone photographs (B054). Luther’s death, Shelby × Grace, and Melissa Estes Miller </w:t>
+        <w:t xml:space="preserve"> Frank of Berea (B055) not merged with Grant (#20) or with 1928 St. Helens Frank (#22); John of Owsley (B056); Daniel Newnam × Sarah Veneable vs Everett (B072); William × Katherine license (B064); two William lines (B071); Herman Estes of Brasstown (B067); Frankie Jones / Mary Peters (B068); Carter Cove stone photographs (B054). </w:t>
+      </w:r>
+      <w:r>
+        <w:rPr>
+          <w:b/>
+        </w:rPr>
+        <w:t>Closed this pass:</w:t>
+      </w:r>
+      <w:r>
+        <w:t xml:space="preserve"> Grant </w:t>
+      </w:r>
+      <w:r>
+        <w:rPr>
+          <w:b/>
+        </w:rPr>
+        <w:t>9 Dec 1970</w:t>
+      </w:r>
+      <w:r>
+        <w:t xml:space="preserve">; 1920 Heidelberg; Fred L. 1961; Callie Spicer </w:t>
+      </w:r>
+      <w:r>
+        <w:rPr>
+          <w:b/>
+        </w:rPr>
+        <w:t>5 Nov 1961</w:t>
+      </w:r>
+      <w:r>
+        <w:t xml:space="preserve">; Kate = Katherine Sternberg. Luther, Shelby × Grace, and Melissa Estes Miller </w:t>
       </w:r>
       <w:r>
         <w:rPr>
@@ -3314,7 +3395,7 @@
         <w:t>11 Apr 1957</w:t>
       </w:r>
       <w:r>
-        <w:t xml:space="preserve"> are </w:t>
+        <w:t xml:space="preserve"> remain </w:t>
       </w:r>
       <w:r>
         <w:rPr>
@@ -3340,7 +3421,7 @@
         <w:t>closed</w:t>
       </w:r>
       <w:r>
-        <w:t>. Do not reopen Peebles as a third marriage without a license. Do not print 1868 or 24 February 1906 as facts.</w:t>
+        <w:t>. Do not reopen Peebles as a third marriage without a license. Do not print 1868 or 24 February 1906 as facts. Do not print Grant as dead in 1951–1955.</w:t>
       </w:r>
     </w:p>
     <w:p>
@@ -4955,6 +5036,429 @@
     </w:p>
     <w:p>
       <w:r>
+        <w:t xml:space="preserve">49. Reclaim The Records, Kentucky Death Index 1911–1989, annual lists. [IA item](https://archive.org/details/reclaim-the-records-kentucky-death-index-01911-1989). </w:t>
+      </w:r>
+      <w:r>
+        <w:rPr>
+          <w:b/>
+        </w:rPr>
+        <w:t>NEWNAM, GRANT</w:t>
+      </w:r>
+      <w:r>
+        <w:t xml:space="preserve">, 93, Fayette/Lee, 9 Dec 1970, vol. 060 cert. 29556. *Transcription only.* </w:t>
+      </w:r>
+      <w:r>
+        <w:rPr>
+          <w:b/>
+        </w:rPr>
+        <w:t>C376</w:t>
+      </w:r>
+      <w:r>
+        <w:t xml:space="preserve"> </w:t>
+      </w:r>
+      <w:r>
+        <w:rPr>
+          <w:b/>
+        </w:rPr>
+        <w:t>C392</w:t>
+      </w:r>
+      <w:r>
+        <w:t xml:space="preserve"> </w:t>
+      </w:r>
+      <w:r>
+        <w:rPr>
+          <w:b/>
+        </w:rPr>
+        <w:t>S340</w:t>
+      </w:r>
+      <w:r>
+        <w:t xml:space="preserve"> </w:t>
+      </w:r>
+      <w:r>
+        <w:rPr>
+          <w:b/>
+        </w:rPr>
+        <w:t>S341</w:t>
+      </w:r>
+      <w:r>
+        <w:t xml:space="preserve">. </w:t>
+      </w:r>
+      <w:r>
+        <w:rPr>
+          <w:b/>
+        </w:rPr>
+        <w:t>PROVEN</w:t>
+      </w:r>
+      <w:r>
+        <w:t xml:space="preserve"> as the statewide row.</w:t>
+      </w:r>
+    </w:p>
+    <w:p>
+      <w:r>
+        <w:t xml:space="preserve">50. SortedByName Newnam index: Grant of Lee d. 9 Dec 1970 age 93 Fayette; born 10 June 1876, SSN 407-54-0572; father of Lucy Arvin b. 10 June 1900 Yellow Rock, mother Martha Brandenberg. [index_6](https://sortedbyname.com/letter_n/newnam/index_6.html). *Index only* (live GET 403; search snippet saved). </w:t>
+      </w:r>
+      <w:r>
+        <w:rPr>
+          <w:b/>
+        </w:rPr>
+        <w:t>C377</w:t>
+      </w:r>
+      <w:r>
+        <w:t xml:space="preserve"> </w:t>
+      </w:r>
+      <w:r>
+        <w:rPr>
+          <w:b/>
+        </w:rPr>
+        <w:t>C380</w:t>
+      </w:r>
+      <w:r>
+        <w:t xml:space="preserve"> </w:t>
+      </w:r>
+      <w:r>
+        <w:rPr>
+          <w:b/>
+        </w:rPr>
+        <w:t>S347</w:t>
+      </w:r>
+      <w:r>
+        <w:t>.</w:t>
+      </w:r>
+    </w:p>
+    <w:p>
+      <w:r>
+        <w:t xml:space="preserve">51. 1920 Heidelberg hh 101–106: Grant Newnam 42 + Martha Brandenburg. [USGenNet Heidelberg](https://usgennet.org/usa/ky/county/lee/census/1920/heidelberg.html). *Transcription only.* </w:t>
+      </w:r>
+      <w:r>
+        <w:rPr>
+          <w:b/>
+        </w:rPr>
+        <w:t>C381</w:t>
+      </w:r>
+      <w:r>
+        <w:t xml:space="preserve"> </w:t>
+      </w:r>
+      <w:r>
+        <w:rPr>
+          <w:b/>
+        </w:rPr>
+        <w:t>S344</w:t>
+      </w:r>
+      <w:r>
+        <w:t xml:space="preserve">. Same-person vs 1899/1970 </w:t>
+      </w:r>
+      <w:r>
+        <w:rPr>
+          <w:b/>
+        </w:rPr>
+        <w:t>PROVEN</w:t>
+      </w:r>
+      <w:r>
+        <w:t xml:space="preserve"> (</w:t>
+      </w:r>
+      <w:r>
+        <w:rPr>
+          <w:b/>
+        </w:rPr>
+        <w:t>C378</w:t>
+      </w:r>
+      <w:r>
+        <w:t>).</w:t>
+      </w:r>
+    </w:p>
+    <w:p>
+      <w:r>
+        <w:t xml:space="preserve">52. Lee deaths 1941: Kate Newnam, 70y 7m 1d, b. 20 Feb 1871, d. 21 Sep 1941 Beattyville; spouse W. N.; parents Samuel Sternberg × Mahaley Robinson. [USGenNet 1941](https://usgennet.org/usa/ky/county/lee/deaths/1941.html). *Transcription only.* </w:t>
+      </w:r>
+      <w:r>
+        <w:rPr>
+          <w:b/>
+        </w:rPr>
+        <w:t>C383</w:t>
+      </w:r>
+      <w:r>
+        <w:t xml:space="preserve"> </w:t>
+      </w:r>
+      <w:r>
+        <w:rPr>
+          <w:b/>
+        </w:rPr>
+        <w:t>C384</w:t>
+      </w:r>
+      <w:r>
+        <w:t xml:space="preserve"> </w:t>
+      </w:r>
+      <w:r>
+        <w:rPr>
+          <w:b/>
+        </w:rPr>
+        <w:t>S342</w:t>
+      </w:r>
+      <w:r>
+        <w:t xml:space="preserve">. </w:t>
+      </w:r>
+      <w:r>
+        <w:rPr>
+          <w:b/>
+        </w:rPr>
+        <w:t>PROVEN</w:t>
+      </w:r>
+      <w:r>
+        <w:t xml:space="preserve"> as Luther’s mother.</w:t>
+      </w:r>
+    </w:p>
+    <w:p>
+      <w:r>
+        <w:t xml:space="preserve">53. Proctor Cemetery: William Newnam 15 Apr 1867–10 Dec 1905; Fred 1894–1961; Era 1897–1991; Kate 1871–1941. [proctor.html](https://usgennet.org/usa/ky/county/lee/cemeteries/proctor.html). *Transcription only.* </w:t>
+      </w:r>
+      <w:r>
+        <w:rPr>
+          <w:b/>
+        </w:rPr>
+        <w:t>C385</w:t>
+      </w:r>
+      <w:r>
+        <w:t xml:space="preserve"> </w:t>
+      </w:r>
+      <w:r>
+        <w:rPr>
+          <w:b/>
+        </w:rPr>
+        <w:t>C387</w:t>
+      </w:r>
+      <w:r>
+        <w:t xml:space="preserve"> </w:t>
+      </w:r>
+      <w:r>
+        <w:rPr>
+          <w:b/>
+        </w:rPr>
+        <w:t>S343</w:t>
+      </w:r>
+      <w:r>
+        <w:t>.</w:t>
+      </w:r>
+    </w:p>
+    <w:p>
+      <w:r>
+        <w:t xml:space="preserve">54. KDI </w:t>
+      </w:r>
+      <w:r>
+        <w:rPr>
+          <w:b/>
+        </w:rPr>
+        <w:t>NEWMAN, FRED L</w:t>
+      </w:r>
+      <w:r>
+        <w:t xml:space="preserve">, 66, Estill, 14 Jun 1961, vol. 029 cert. 14145. </w:t>
+      </w:r>
+      <w:r>
+        <w:rPr>
+          <w:b/>
+        </w:rPr>
+        <w:t>C386</w:t>
+      </w:r>
+      <w:r>
+        <w:t xml:space="preserve"> </w:t>
+      </w:r>
+      <w:r>
+        <w:rPr>
+          <w:b/>
+        </w:rPr>
+        <w:t>S341</w:t>
+      </w:r>
+      <w:r>
+        <w:t xml:space="preserve">. </w:t>
+      </w:r>
+      <w:r>
+        <w:rPr>
+          <w:b/>
+        </w:rPr>
+        <w:t>PROBABLE</w:t>
+      </w:r>
+      <w:r>
+        <w:t xml:space="preserve"> Luther’s brother.</w:t>
+      </w:r>
+    </w:p>
+    <w:p>
+      <w:r>
+        <w:t xml:space="preserve">55. Lee deaths 1961: Callie Spicer, 75y 10m 3d, b. 2 Jan 1886 Owsley, d. 5 Nov 1961; father Daniel Newnam; mother Sarah Veneable; Riverview. [USGenNet 1961](https://usgennet.org/usa/ky/county/lee/deaths/1961.html). KDI SPICER CALLIE 75 LEE/LEE 5 Nov 1961 vol. 050 cert. 24706. *Transcription only.* </w:t>
+      </w:r>
+      <w:r>
+        <w:rPr>
+          <w:b/>
+        </w:rPr>
+        <w:t>C408</w:t>
+      </w:r>
+      <w:r>
+        <w:t xml:space="preserve"> </w:t>
+      </w:r>
+      <w:r>
+        <w:rPr>
+          <w:b/>
+        </w:rPr>
+        <w:t>C411</w:t>
+      </w:r>
+      <w:r>
+        <w:t xml:space="preserve"> </w:t>
+      </w:r>
+      <w:r>
+        <w:rPr>
+          <w:b/>
+        </w:rPr>
+        <w:t>S370</w:t>
+      </w:r>
+      <w:r>
+        <w:t xml:space="preserve"> </w:t>
+      </w:r>
+      <w:r>
+        <w:rPr>
+          <w:b/>
+        </w:rPr>
+        <w:t>S361</w:t>
+      </w:r>
+      <w:r>
+        <w:t xml:space="preserve">. Conflict </w:t>
+      </w:r>
+      <w:r>
+        <w:rPr>
+          <w:b/>
+        </w:rPr>
+        <w:t>#21</w:t>
+      </w:r>
+      <w:r>
+        <w:t xml:space="preserve">. </w:t>
+      </w:r>
+      <w:r>
+        <w:rPr>
+          <w:b/>
+        </w:rPr>
+        <w:t>PROVEN</w:t>
+      </w:r>
+      <w:r>
+        <w:t xml:space="preserve"> as extract; </w:t>
+      </w:r>
+      <w:r>
+        <w:rPr>
+          <w:b/>
+        </w:rPr>
+        <w:t>PROBABLE</w:t>
+      </w:r>
+      <w:r>
+        <w:t xml:space="preserve"> Everett’s sister.</w:t>
+      </w:r>
+    </w:p>
+    <w:p>
+      <w:r>
+        <w:t xml:space="preserve">56. Lee Book 13: Hiram Arvin × Lucy Newnam, 14 Sep 1918. [Book 13](https://usgennet.org/usa/ky/county/lee/marriage/marrbook13.html). Book 17: Roscoe × Bertha Reece, 13 Dec 1923. [Book 17](https://usgennet.org/usa/ky/county/lee/marriage/marrbook17.html). </w:t>
+      </w:r>
+      <w:r>
+        <w:rPr>
+          <w:b/>
+        </w:rPr>
+        <w:t>C382</w:t>
+      </w:r>
+      <w:r>
+        <w:t xml:space="preserve"> </w:t>
+      </w:r>
+      <w:r>
+        <w:rPr>
+          <w:b/>
+        </w:rPr>
+        <w:t>C404</w:t>
+      </w:r>
+      <w:r>
+        <w:t xml:space="preserve"> </w:t>
+      </w:r>
+      <w:r>
+        <w:rPr>
+          <w:b/>
+        </w:rPr>
+        <w:t>S345</w:t>
+      </w:r>
+      <w:r>
+        <w:t xml:space="preserve"> </w:t>
+      </w:r>
+      <w:r>
+        <w:rPr>
+          <w:b/>
+        </w:rPr>
+        <w:t>S346</w:t>
+      </w:r>
+      <w:r>
+        <w:t>.</w:t>
+      </w:r>
+    </w:p>
+    <w:p>
+      <w:r>
+        <w:t xml:space="preserve">57. KDI 1939–1989: </w:t>
+      </w:r>
+      <w:r>
+        <w:rPr>
+          <w:b/>
+        </w:rPr>
+        <w:t>nil</w:t>
+      </w:r>
+      <w:r>
+        <w:t xml:space="preserve"> Frank Newman with Madison residence; </w:t>
+      </w:r>
+      <w:r>
+        <w:rPr>
+          <w:b/>
+        </w:rPr>
+        <w:t>nil</w:t>
+      </w:r>
+      <w:r>
+        <w:t xml:space="preserve"> John with Owsley residence; </w:t>
+      </w:r>
+      <w:r>
+        <w:rPr>
+          <w:b/>
+        </w:rPr>
+        <w:t>nil</w:t>
+      </w:r>
+      <w:r>
+        <w:t xml:space="preserve"> McCoy/Coy Newnam. </w:t>
+      </w:r>
+      <w:r>
+        <w:rPr>
+          <w:b/>
+        </w:rPr>
+        <w:t>C419</w:t>
+      </w:r>
+      <w:r>
+        <w:t xml:space="preserve"> </w:t>
+      </w:r>
+      <w:r>
+        <w:rPr>
+          <w:b/>
+        </w:rPr>
+        <w:t>C420</w:t>
+      </w:r>
+      <w:r>
+        <w:t xml:space="preserve"> </w:t>
+      </w:r>
+      <w:r>
+        <w:rPr>
+          <w:b/>
+        </w:rPr>
+        <w:t>C427</w:t>
+      </w:r>
+      <w:r>
+        <w:t xml:space="preserve"> </w:t>
+      </w:r>
+      <w:r>
+        <w:rPr>
+          <w:b/>
+        </w:rPr>
+        <w:t>S363</w:t>
+      </w:r>
+      <w:r>
+        <w:t>. *Transcription only.*</w:t>
+      </w:r>
+    </w:p>
+    <w:p>
+      <w:r>
         <w:br w:type="page"/>
       </w:r>
     </w:p>
@@ -4977,16 +5481,7 @@
         <w:t>saved local copies</w:t>
       </w:r>
       <w:r>
-        <w:t>. Full file list: [`../SOURCE-INDEX.md`](../SOURCE-INDEX.md) and [`../sources/SOURCE-INVENTORY.tsv`](../sources/SOURCE-INVENTORY.tsv) (</w:t>
-      </w:r>
-      <w:r>
-        <w:rPr>
-          <w:b/>
-        </w:rPr>
-        <w:t>500</w:t>
-      </w:r>
-      <w:r>
-        <w:t xml:space="preserve"> files after pass 64).</w:t>
+        <w:t>. Full file list: [`../SOURCE-INDEX.md`](../SOURCE-INDEX.md) and [`../sources/SOURCE-INVENTORY.tsv`](../sources/SOURCE-INVENTORY.tsv) (rebuilt after pass 65).</w:t>
       </w:r>
     </w:p>
     <w:p>
@@ -5154,6 +5649,31 @@
       </w:r>
       <w:r>
         <w:t xml:space="preserve"> unread | catalog only |</w:t>
+      </w:r>
+    </w:p>
+    <w:p>
+      <w:r>
+        <w:t>| S340 | `../sources/vital/rtr-ky-death-index-newman-1951-1955-extract-2026-10-30.txt` | [RTR KY death index](https://archive.org/details/reclaim-the-records-kentucky-death-index-01911-1989) | 1951–55 Newman/Newnam; nil Grant | transcription only |</w:t>
+      </w:r>
+    </w:p>
+    <w:p>
+      <w:r>
+        <w:t>| S341 | `../sources/vital/rtr-ky-death-index-target-givens-1939-1989-extract-2026-10-30.txt` | same | Grant 1970; Fred 1961; Kate 1941 | transcription only |</w:t>
+      </w:r>
+    </w:p>
+    <w:p>
+      <w:r>
+        <w:t>| S344 | `../sources/census/lee-1920-heidelberg-grant-extract-2026-10-30.txt` | [1920 Heidelberg](https://usgennet.org/usa/ky/county/lee/census/1920/heidelberg.html) | Grant × Martha hh 101–106 | transcription only |</w:t>
+      </w:r>
+    </w:p>
+    <w:p>
+      <w:r>
+        <w:t>| S347 | `../sources/vital/sortedbyname-grant-newnam-1970-extract-2026-10-30.txt` | [SortedByName](https://sortedbyname.com/letter_n/newnam/index_6.html) | Grant b. 10 Jun 1876; d. 9 Dec 1970 | index only |</w:t>
+      </w:r>
+    </w:p>
+    <w:p>
+      <w:r>
+        <w:t>| S370 | `../sources/vital/lee-deaths-1961-callie-spicer-extract-2026-10-30.txt` | [1961 deaths](https://usgennet.org/usa/ky/county/lee/deaths/1961.html) | Callie Spicer d. 5 Nov 1961 | transcription only |</w:t>
       </w:r>
     </w:p>
     <w:p>

</xml_diff>

<commit_message>
Pass 66: Union ED 8 complete; David Conrad is FAN, not Jesse.
Every 1900 Bollinger Union Township sheet read. The only Conrad head is
David, 29, with Miranda and son Asa on ED 8 sheet 3 B — not Jesse, and
no Letha. Dalton ended the township on sheet 12 B. Wayne ED 9 started
(headers + sh 1–2 sampled). Plates 85–87.

Co-authored-by: blakereaganlaw <blakereaganlaw@gmail.com>
</commit_message>
<xml_diff>
--- a/research/dora-ella-newnam/book/Dora-Ella-Newnam-Stone-A-Life.docx
+++ b/research/dora-ella-newnam/book/Dora-Ella-Newnam-Stone-A-Life.docx
@@ -18,7 +18,85 @@
         <w:rPr>
           <w:i/>
         </w:rPr>
-        <w:t>A documented life, 1871–1926. Compiled from every research chat in this project, 27–29 October 2026. Living descendants are not named. Facts below the line of proof are labelled in the text. Nothing here is family lore presented as fact.</w:t>
+        <w:t>A documented life, 1871–1926. Compiled from every research chat in this project, 27–30 October 2026. Living descendants are not named. Facts below the line of proof are labelled in the text. Nothing here is family lore presented as fact.</w:t>
+      </w:r>
+    </w:p>
+    <w:p>
+      <w:pPr>
+        <w:pStyle w:val="Heading1"/>
+      </w:pPr>
+      <w:r>
+        <w:t>Table of contents</w:t>
+      </w:r>
+    </w:p>
+    <w:p>
+      <w:r>
+        <w:t>1. [Preface](#preface)</w:t>
+      </w:r>
+    </w:p>
+    <w:p>
+      <w:r>
+        <w:t>2. [Chapter 1. The girl on Sturgeon Creek](#chapter-1-the-girl-on-sturgeon-creek)</w:t>
+      </w:r>
+    </w:p>
+    <w:p>
+      <w:r>
+        <w:t>3. [Chapter 2. Thursday at Doll Newnam’s](#chapter-2-thursday-at-doll-newnams)</w:t>
+      </w:r>
+    </w:p>
+    <w:p>
+      <w:r>
+        <w:t>4. [Chapter 3. Seven born, five living](#chapter-3-seven-born-five-living)</w:t>
+      </w:r>
+    </w:p>
+    <w:p>
+      <w:r>
+        <w:t>5. [Places: 1900 to death](#places-1900-to-death)</w:t>
+      </w:r>
+    </w:p>
+    <w:p>
+      <w:r>
+        <w:t>6. [Chapter 4. The years the census lost](#chapter-4-the-years-the-census-lost)</w:t>
+      </w:r>
+    </w:p>
+    <w:p>
+      <w:r>
+        <w:t>7. [Chapter 5. Arkansas, and the name Stone](#chapter-5-arkansas-and-the-name-stone)</w:t>
+      </w:r>
+    </w:p>
+    <w:p>
+      <w:r>
+        <w:t>8. [Chapter 6. Noon, Monday, 23 August 1926](#chapter-6-noon-monday-23-august-1926)</w:t>
+      </w:r>
+    </w:p>
+    <w:p>
+      <w:r>
+        <w:t>9. [Chapter 7. After she was gone — Beattyville paper, Greene sweep, FAN](#chapter-7-after-she-was-gone--beattyville-paper-greene-sweep-fan)</w:t>
+      </w:r>
+    </w:p>
+    <w:p>
+      <w:r>
+        <w:t>10. [The children, in brief](#the-children-in-brief)</w:t>
+      </w:r>
+    </w:p>
+    <w:p>
+      <w:r>
+        <w:t>11. [How to read the plates](#how-to-read-the-plates)</w:t>
+      </w:r>
+    </w:p>
+    <w:p>
+      <w:r>
+        <w:t>12. [What remains open](#what-remains-open)</w:t>
+      </w:r>
+    </w:p>
+    <w:p>
+      <w:r>
+        <w:t>13. [Footnotes](#footnotes)</w:t>
+      </w:r>
+    </w:p>
+    <w:p>
+      <w:r>
+        <w:t>14. [Source index](#source-index)</w:t>
       </w:r>
     </w:p>
     <w:p>
@@ -2447,17 +2525,85 @@
         <w:t>C129</w:t>
       </w:r>
       <w:r>
-        <w:t>), not vital records, but they align with the certificate and the copyists’ lines. No photograph of either stone is in the case file.</w:t>
+        <w:t xml:space="preserve">), not vital records, but they align with the certificate and the copyists’ lines. The compiled yellcountyobits cemetery index (extract dated 29 January 2013), captured 30 October 2026, repeats the same two rows: </w:t>
+      </w:r>
+      <w:r>
+        <w:rPr>
+          <w:b/>
+        </w:rPr>
+        <w:t>Newman, Dora | no dates | Carter Cove Cemetery, Plainview</w:t>
+      </w:r>
+      <w:r>
+        <w:t xml:space="preserve"> and </w:t>
+      </w:r>
+      <w:r>
+        <w:rPr>
+          <w:b/>
+        </w:rPr>
+        <w:t>Stone, Thomas | 1845 | 1925 | Carter Cove Cemetery, Plainview</w:t>
+      </w:r>
+      <w:r>
+        <w:t>. [C324] [C325] [S281] [S282] No photograph of either stone is in the case file.</w:t>
       </w:r>
     </w:p>
     <w:p>
       <w:r>
-        <w:t>The *Yell County Journal* at Ola for late August and early September 1926 has not been read. Neither has the *Beattyville Enterprise* for the same weeks. An obituary, if one ran, would be the kin list this biography still lacks.</w:t>
+        <w:t xml:space="preserve">The *Yell County Journal* at Ola for late August and early September 1926 has not been read. The only free *Beattyville Enterprise* issues on Internet Archive item `beatty` are six numbers from 1924, 1925, 1928, and 1932 — </w:t>
+      </w:r>
+      <w:r>
+        <w:rPr>
+          <w:b/>
+        </w:rPr>
+        <w:t>1926 is not among them</w:t>
+      </w:r>
+      <w:r>
+        <w:t xml:space="preserve">. [C335] University of Kentucky’s film catalog lists 1909–1911, 1915, 1924–1925, 1928, and 1932 — again </w:t>
+      </w:r>
+      <w:r>
+        <w:rPr>
+          <w:b/>
+        </w:rPr>
+        <w:t>no 1926</w:t>
+      </w:r>
+      <w:r>
+        <w:t xml:space="preserve">. [S284] Internet Archive Solr returned </w:t>
+      </w:r>
+      <w:r>
+        <w:rPr>
+          <w:b/>
+        </w:rPr>
+        <w:t>zero</w:t>
+      </w:r>
+      <w:r>
+        <w:t xml:space="preserve"> items for *Yell County Journal* 1926 and </w:t>
+      </w:r>
+      <w:r>
+        <w:rPr>
+          <w:b/>
+        </w:rPr>
+        <w:t>zero</w:t>
+      </w:r>
+      <w:r>
+        <w:t xml:space="preserve"> for a 1926 *Enterprise*. [C343] Genealogy Trails’ Yell obituaries landing has no Stone/Newnam/Dora 1926 hit. [C344] An obituary, if one ran, would be the kin list this biography still lacks. Retrieval path: Newspapers.com *Beattyville Enterprise*; UK microfilm </w:t>
+      </w:r>
+      <w:r>
+        <w:rPr>
+          <w:b/>
+        </w:rPr>
+        <w:t>S 90-033</w:t>
+      </w:r>
+      <w:r>
+        <w:t>; Arkansas State Archives / a Danville or Plainview library for the *Yell County Journal*.</w:t>
       </w:r>
     </w:p>
     <w:p>
       <w:r>
         <w:t>She was fifty-five if she was the eight-year-old of District 59. The certificate called her fifty-eight. The child on sheet 6 is the better witness to her beginning than the grieving son was to a date he never saw.</w:t>
+      </w:r>
+    </w:p>
+    <w:p>
+      <w:r>
+        <w:br w:type="page"/>
       </w:r>
     </w:p>
     <w:p>
@@ -2470,184 +2616,131 @@
         <w:pStyle w:val="Heading1"/>
       </w:pPr>
       <w:r>
-        <w:t>The children, in brief</w:t>
+        <w:t>Chapter 7. After she was gone — Beattyville paper, Greene sweep, FAN</w:t>
       </w:r>
     </w:p>
     <w:p>
       <w:r>
-        <w:t>Two children born to Dora and Samuel died before 1 June 1900. They have no names in any record yet read.</w:t>
+        <w:t xml:space="preserve">Dora had been in the ground two years when the *Beattyville Enterprise* of 30 November 1928 printed a sick-list note: “Uncle Doll Newman has been very sick… not able to be out.” On 1 April 1932 the same paper said E. T. Sparks of Hazard was visiting Uncle Doll Newnam in town. Seventeen days later Elias T. Newnam died on his ninetieth birthday. Nickname, town, and lifespan are two independent identifiers and no contradiction: the man in those notes is </w:t>
+      </w:r>
+      <w:r>
+        <w:rPr>
+          <w:b/>
+        </w:rPr>
+        <w:t>probable</w:t>
+      </w:r>
+      <w:r>
+        <w:t xml:space="preserve"> her father. [C326] [C048] [S283]</w:t>
       </w:r>
     </w:p>
     <w:p>
       <w:r>
-        <w:rPr>
-          <w:b/>
-        </w:rPr>
-        <w:t>McCoy “Coy” Newnam</w:t>
-      </w:r>
-      <w:r>
-        <w:t>, born April 1890, married Letha Viola Sullivan at Ola on 18 February 1917. In 1920 they were at Danville, Yell County. In 1930 they were back in Buck Creek, Owsley County. He is the 1926 informant. Living descendants are not named here.</w:t>
+        <w:t xml:space="preserve">The six free issues do not name Dora Stone, Dora Newnam, or Samuel P. They do name a living Beattyville Newnam cluster that is </w:t>
+      </w:r>
+      <w:r>
+        <w:rPr>
+          <w:b/>
+        </w:rPr>
+        <w:t>not</w:t>
+      </w:r>
+      <w:r>
+        <w:t xml:space="preserve"> silently merged with her household. Rev. Luther Newnam appears as Christian Church pastor in March–April 1932; Lee marriage books 20–24 show him officiating at Beattyville from at least 24 November 1926 through 1933, including 6 April 1932 — </w:t>
+      </w:r>
+      <w:r>
+        <w:rPr>
+          <w:b/>
+        </w:rPr>
+        <w:t>probable</w:t>
+      </w:r>
+      <w:r>
+        <w:t xml:space="preserve"> the same minister, </w:t>
+      </w:r>
+      <w:r>
+        <w:rPr>
+          <w:b/>
+        </w:rPr>
+        <w:t>not</w:t>
+      </w:r>
+      <w:r>
+        <w:t xml:space="preserve"> Samuel (dead by 1910). [C327] [C342] [S295] Everett Newnam of Idamay planned two acres of cane in March 1932; the *Enterprise* of 14 December 1939 reported Everett Newnam, fifty, of Idamay, dead of an accidental pistol discharge on the Heidelberg road — </w:t>
+      </w:r>
+      <w:r>
+        <w:rPr>
+          <w:b/>
+        </w:rPr>
+        <w:t>probable</w:t>
+      </w:r>
+      <w:r>
+        <w:t xml:space="preserve"> the same man (name + Idamay). His three daughters are living and are not named here. [C328] [C341] [S291]</w:t>
       </w:r>
     </w:p>
     <w:p>
       <w:r>
-        <w:rPr>
-          <w:b/>
-        </w:rPr>
-        <w:t>Mary Magdalene Newnam</w:t>
-      </w:r>
-      <w:r>
-        <w:t xml:space="preserve">, June 1892 on the census, 12 June 1893 Beattyville on her Social Security account, later Mary M. Bunch. Marriage and death are not closed in free sources: Lee marriage books have no Bunch row; NUMIDENT lists her </w:t>
-      </w:r>
-      <w:r>
-        <w:rPr>
-          <w:b/>
-        </w:rPr>
-        <w:t>deceased</w:t>
-      </w:r>
-      <w:r>
-        <w:t xml:space="preserve"> but gives </w:t>
-      </w:r>
-      <w:r>
-        <w:rPr>
-          <w:b/>
-        </w:rPr>
-        <w:t>no death date</w:t>
-      </w:r>
-      <w:r>
-        <w:t xml:space="preserve">; the public Social Security Death Index API returned no match for SSN </w:t>
-      </w:r>
-      <w:r>
-        <w:rPr>
-          <w:b/>
-        </w:rPr>
-        <w:t>410-19-2658</w:t>
-      </w:r>
-      <w:r>
-        <w:t>; Tennessee archives and Knox marriage indexes were not reachable from the research VM (</w:t>
-      </w:r>
-      <w:r>
-        <w:rPr>
-          <w:b/>
-        </w:rPr>
-        <w:t>R007</w:t>
-      </w:r>
-      <w:r>
-        <w:t xml:space="preserve">, </w:t>
-      </w:r>
-      <w:r>
-        <w:rPr>
-          <w:b/>
-        </w:rPr>
-        <w:t>L257</w:t>
-      </w:r>
-      <w:r>
-        <w:t>). [C158]</w:t>
+        <w:t xml:space="preserve">On 15 March 1932, at Delvinta, George Botner married Clay Dunigan, twenty-three, of Idamay, son of R. C. Dunigan and Sirena Porter, to Ladona Newman, sixteen, of Delvinta, daughter of </w:t>
+      </w:r>
+      <w:r>
+        <w:rPr>
+          <w:b/>
+        </w:rPr>
+        <w:t>Shelby Newman</w:t>
+      </w:r>
+      <w:r>
+        <w:t xml:space="preserve"> and </w:t>
+      </w:r>
+      <w:r>
+        <w:rPr>
+          <w:b/>
+        </w:rPr>
+        <w:t>Grace Brandenburg</w:t>
+      </w:r>
+      <w:r>
+        <w:t xml:space="preserve">. [C339] [S290] The 1 April paper said Clay and Ladonna had “quietly married last week.” Same names, same month: </w:t>
+      </w:r>
+      <w:r>
+        <w:rPr>
+          <w:b/>
+        </w:rPr>
+        <w:t>probable</w:t>
+      </w:r>
+      <w:r>
+        <w:t xml:space="preserve"> one couple. The bride is </w:t>
+      </w:r>
+      <w:r>
+        <w:rPr>
+          <w:b/>
+        </w:rPr>
+        <w:t>not</w:t>
+      </w:r>
+      <w:r>
+        <w:t xml:space="preserve"> Dora’s child — the license names other parents, and Dora had been dead five and a half years. [C340] Living descendants of that 1932 marriage are withheld.</w:t>
       </w:r>
     </w:p>
     <w:p>
       <w:r>
-        <w:rPr>
-          <w:b/>
-        </w:rPr>
-        <w:t>Pearl P. Newnam</w:t>
-      </w:r>
-      <w:r>
-        <w:t>, 15 March 1895, Banford, later Pearl P. Jackson, died 19 September 1980, Shelby County, Tennessee. The 1910 grandmother household, the 1922 Elizabeth Newnam will, and the NUMIDENT file make her identification the strongest of the five.</w:t>
+        <w:t>Carrie Newman (1898–1915) at Sandlin Cemetery, Ola, fails the same-person test against Dora. [C337] A 1906 Hopkinsville correspondent-column “newnam” and an 1902 Richmond quote from Will Newnam are other men in other counties. [C333] [C334]</w:t>
       </w:r>
     </w:p>
     <w:p>
       <w:r>
-        <w:rPr>
-          <w:b/>
-        </w:rPr>
-        <w:t>Rissa / Rissie</w:t>
-      </w:r>
-      <w:r>
-        <w:t>, May 1897. After the 1900 census she does not reappear on the Kentucky child Soundex pass or in Pearl’s 1910 Owsley household. An unsourced WikiTree profile (</w:t>
-      </w:r>
-      <w:r>
-        <w:rPr>
-          <w:b/>
-        </w:rPr>
-        <w:t>Newnam-46</w:t>
-      </w:r>
-      <w:r>
-        <w:t xml:space="preserve">) names her </w:t>
-      </w:r>
-      <w:r>
-        <w:rPr>
-          <w:b/>
-        </w:rPr>
-        <w:t>Rissie (Newnam) Pelfrey</w:t>
-      </w:r>
-      <w:r>
-        <w:t xml:space="preserve">, born at </w:t>
-      </w:r>
-      <w:r>
-        <w:rPr>
-          <w:b/>
-        </w:rPr>
-        <w:t>Pebworth</w:t>
-      </w:r>
-      <w:r>
-        <w:t xml:space="preserve">, died </w:t>
-      </w:r>
-      <w:r>
-        <w:rPr>
-          <w:b/>
-        </w:rPr>
-        <w:t>13 May 1980</w:t>
-      </w:r>
-      <w:r>
-        <w:t xml:space="preserve"> in </w:t>
-      </w:r>
-      <w:r>
-        <w:rPr>
-          <w:b/>
-        </w:rPr>
-        <w:t>Knoxville, Tennessee</w:t>
-      </w:r>
-      <w:r>
-        <w:t xml:space="preserve">, with </w:t>
-      </w:r>
-      <w:r>
-        <w:rPr>
-          <w:b/>
-        </w:rPr>
-        <w:t>Samuel Parriott Newnam</w:t>
-      </w:r>
-      <w:r>
-        <w:t xml:space="preserve"> as father — a </w:t>
-      </w:r>
-      <w:r>
-        <w:rPr>
-          <w:b/>
-        </w:rPr>
-        <w:t>possible</w:t>
-      </w:r>
-      <w:r>
-        <w:t xml:space="preserve"> lead only, not printed here as proved death. [C230] Free Tennessee death and obituary indexes searched from this case did not independently confirm that row. [C231] Lee Marriage Books 5–15 have no Rissie or Rissa Newnam bride; a 1920 Rissa Newton, seventeen, is a different woman. [C134] A Rissie Pelfrey Maxey born 1882 is a different woman.</w:t>
-      </w:r>
-    </w:p>
-    <w:p>
-      <w:r>
-        <w:rPr>
-          <w:b/>
-        </w:rPr>
-        <w:t>John H. Newnam</w:t>
-      </w:r>
-      <w:r>
-        <w:t xml:space="preserve">, August 1899. Herbert Newman of Lee County, Virginia, was rejected. The Kentucky statewide death index (Reclaim The Records, 1911–1990) has no John H. Newnam death in Lee consistent with an August 1899 birth. [C234] [C237] [C238] Lee Marriage Book 12 has a different </w:t>
-      </w:r>
-      <w:r>
-        <w:rPr>
-          <w:b/>
-        </w:rPr>
-        <w:t>John Newnam</w:t>
-      </w:r>
-      <w:r>
-        <w:t>, age twenty-five in 1917, son of John and Serilda — rejected. [C239] Genealogy Trails’ Lee County WWI draft transcript (1,126 cards) lists no Newnam, Newman, or McCoy registrant; other men born in 1899 appear on the September 1918 Beattyville board, but not John under that surname. [C240] [C241] [S248] A cross-border free transcript pass (Owsley, Estill, Arkansas Perry/Yell, Knox KYGenWeb, Missouri Digital Heritage WWI biographies) also returned no Newnam/Newman draft row. [C242] [S249] NARA M1509 / FamilySearch card images have not been read in this case.</w:t>
+        <w:t xml:space="preserve">The Greene County, Missouri, 1900 hunt for a second Thomas A. Stone household is finished on free film. Enumeration districts 37 through 43 — every A-side and every B-side — have been read from NARA T623-855/856. The only Stone </w:t>
+      </w:r>
+      <w:r>
+        <w:rPr>
+          <w:b/>
+        </w:rPr>
+        <w:t>head</w:t>
+      </w:r>
+      <w:r>
+        <w:t xml:space="preserve"> in that band remains Thomas A., thirty-two, with Matilda and Gertrude, on ED 37 sheet 18A, 27 June 1900. He is still </w:t>
+      </w:r>
+      <w:r>
+        <w:rPr>
+          <w:b/>
+        </w:rPr>
+        <w:t>not merged</w:t>
+      </w:r>
+      <w:r>
+        <w:t xml:space="preserve"> with the 1920 Perry County widower. [C281] [C117]</w:t>
       </w:r>
     </w:p>
     <w:p>
@@ -2660,6 +2753,196 @@
         <w:pStyle w:val="Heading1"/>
       </w:pPr>
       <w:r>
+        <w:t>The children, in brief</w:t>
+      </w:r>
+    </w:p>
+    <w:p>
+      <w:r>
+        <w:t>Two children born to Dora and Samuel died before 1 June 1900. They have no names in any record yet read.</w:t>
+      </w:r>
+    </w:p>
+    <w:p>
+      <w:r>
+        <w:rPr>
+          <w:b/>
+        </w:rPr>
+        <w:t>McCoy “Coy” Newnam</w:t>
+      </w:r>
+      <w:r>
+        <w:t>, born April 1890, married Letha Viola Sullivan at Ola on 18 February 1917. In 1920 they were at Danville, Yell County. In 1930 they were back in Buck Creek, Owsley County. He is the 1926 informant. Living descendants are not named here.</w:t>
+      </w:r>
+    </w:p>
+    <w:p>
+      <w:r>
+        <w:rPr>
+          <w:b/>
+        </w:rPr>
+        <w:t>Mary Magdalene Newnam</w:t>
+      </w:r>
+      <w:r>
+        <w:t xml:space="preserve">, June 1892 on the census, 12 June 1893 Beattyville on her Social Security account, later Mary M. Bunch. Marriage and death are not closed in free sources: Lee marriage books have no Bunch row; NUMIDENT lists her </w:t>
+      </w:r>
+      <w:r>
+        <w:rPr>
+          <w:b/>
+        </w:rPr>
+        <w:t>deceased</w:t>
+      </w:r>
+      <w:r>
+        <w:t xml:space="preserve"> but gives </w:t>
+      </w:r>
+      <w:r>
+        <w:rPr>
+          <w:b/>
+        </w:rPr>
+        <w:t>no death date</w:t>
+      </w:r>
+      <w:r>
+        <w:t xml:space="preserve">; the public Social Security Death Index API returned no match for SSN </w:t>
+      </w:r>
+      <w:r>
+        <w:rPr>
+          <w:b/>
+        </w:rPr>
+        <w:t>410-19-2658</w:t>
+      </w:r>
+      <w:r>
+        <w:t>; Tennessee archives and Knox marriage indexes were not reachable from the research VM (</w:t>
+      </w:r>
+      <w:r>
+        <w:rPr>
+          <w:b/>
+        </w:rPr>
+        <w:t>R007</w:t>
+      </w:r>
+      <w:r>
+        <w:t xml:space="preserve">, </w:t>
+      </w:r>
+      <w:r>
+        <w:rPr>
+          <w:b/>
+        </w:rPr>
+        <w:t>L257</w:t>
+      </w:r>
+      <w:r>
+        <w:t>). [C158]</w:t>
+      </w:r>
+    </w:p>
+    <w:p>
+      <w:r>
+        <w:rPr>
+          <w:b/>
+        </w:rPr>
+        <w:t>Pearl P. Newnam</w:t>
+      </w:r>
+      <w:r>
+        <w:t>, 15 March 1895, Banford, later Pearl P. Jackson, died 19 September 1980, Shelby County, Tennessee. The 1910 grandmother household, the 1922 Elizabeth Newnam will, and the NUMIDENT file make her identification the strongest of the five.</w:t>
+      </w:r>
+    </w:p>
+    <w:p>
+      <w:r>
+        <w:rPr>
+          <w:b/>
+        </w:rPr>
+        <w:t>Rissa / Rissie</w:t>
+      </w:r>
+      <w:r>
+        <w:t>, May 1897. After the 1900 census she does not reappear on the Kentucky child Soundex pass or in Pearl’s 1910 Owsley household. An unsourced WikiTree profile (</w:t>
+      </w:r>
+      <w:r>
+        <w:rPr>
+          <w:b/>
+        </w:rPr>
+        <w:t>Newnam-46</w:t>
+      </w:r>
+      <w:r>
+        <w:t xml:space="preserve">) names her </w:t>
+      </w:r>
+      <w:r>
+        <w:rPr>
+          <w:b/>
+        </w:rPr>
+        <w:t>Rissie (Newnam) Pelfrey</w:t>
+      </w:r>
+      <w:r>
+        <w:t xml:space="preserve">, born at </w:t>
+      </w:r>
+      <w:r>
+        <w:rPr>
+          <w:b/>
+        </w:rPr>
+        <w:t>Pebworth</w:t>
+      </w:r>
+      <w:r>
+        <w:t xml:space="preserve">, died </w:t>
+      </w:r>
+      <w:r>
+        <w:rPr>
+          <w:b/>
+        </w:rPr>
+        <w:t>13 May 1980</w:t>
+      </w:r>
+      <w:r>
+        <w:t xml:space="preserve"> in </w:t>
+      </w:r>
+      <w:r>
+        <w:rPr>
+          <w:b/>
+        </w:rPr>
+        <w:t>Knoxville, Tennessee</w:t>
+      </w:r>
+      <w:r>
+        <w:t xml:space="preserve">, with </w:t>
+      </w:r>
+      <w:r>
+        <w:rPr>
+          <w:b/>
+        </w:rPr>
+        <w:t>Samuel Parriott Newnam</w:t>
+      </w:r>
+      <w:r>
+        <w:t xml:space="preserve"> as father — a </w:t>
+      </w:r>
+      <w:r>
+        <w:rPr>
+          <w:b/>
+        </w:rPr>
+        <w:t>possible</w:t>
+      </w:r>
+      <w:r>
+        <w:t xml:space="preserve"> lead only, not printed here as proved death. [C230] Free Tennessee death and obituary indexes searched from this case did not independently confirm that row. [C231] Lee Marriage Books 5–15 have no Rissie or Rissa Newnam bride; a 1920 Rissa Newton, seventeen, is a different woman. [C134] A Rissie Pelfrey Maxey born 1882 is a different woman.</w:t>
+      </w:r>
+    </w:p>
+    <w:p>
+      <w:r>
+        <w:rPr>
+          <w:b/>
+        </w:rPr>
+        <w:t>John H. Newnam</w:t>
+      </w:r>
+      <w:r>
+        <w:t xml:space="preserve">, August 1899. Herbert Newman of Lee County, Virginia, was rejected. The Kentucky statewide death index (Reclaim The Records, 1911–1990) has no John H. Newnam death in Lee consistent with an August 1899 birth. [C234] [C237] [C238] Lee Marriage Book 12 has a different </w:t>
+      </w:r>
+      <w:r>
+        <w:rPr>
+          <w:b/>
+        </w:rPr>
+        <w:t>John Newnam</w:t>
+      </w:r>
+      <w:r>
+        <w:t>, age twenty-five in 1917, son of John and Serilda — rejected. [C239] Genealogy Trails’ Lee County WWI draft transcript (1,126 cards) lists no Newnam, Newman, or McCoy registrant; other men born in 1899 appear on the September 1918 Beattyville board, but not John under that surname. [C240] [C241] [S248] A cross-border free transcript pass (Owsley, Estill, Arkansas Perry/Yell, Knox KYGenWeb, Missouri Digital Heritage WWI biographies) also returned no Newnam/Newman draft row. [C242] [S249] NARA M1509 / FamilySearch card images have not been read in this case.</w:t>
+      </w:r>
+    </w:p>
+    <w:p>
+      <w:r>
+        <w:br w:type="page"/>
+      </w:r>
+    </w:p>
+    <w:p>
+      <w:pPr>
+        <w:pStyle w:val="Heading1"/>
+      </w:pPr>
+      <w:r>
         <w:t>How to read the plates</w:t>
       </w:r>
     </w:p>
@@ -2794,25 +3077,34 @@
         <w:t>18 A</w:t>
       </w:r>
       <w:r>
-        <w:t xml:space="preserve"> is Thomas A., 32, with Matilda — not merged. Springfield ED </w:t>
-      </w:r>
-      <w:r>
-        <w:rPr>
-          <w:b/>
-        </w:rPr>
-        <w:t>39</w:t>
-      </w:r>
-      <w:r>
-        <w:t xml:space="preserve"> sheets </w:t>
-      </w:r>
-      <w:r>
-        <w:rPr>
-          <w:b/>
-        </w:rPr>
-        <w:t>6 through 31 B</w:t>
-      </w:r>
-      <w:r>
-        <w:t>, read on the original 856 reel, have no second Stone household. [C117] [C153]</w:t>
+        <w:t xml:space="preserve"> is Thomas A., 32, with Matilda — not merged. Greene </w:t>
+      </w:r>
+      <w:r>
+        <w:rPr>
+          <w:b/>
+        </w:rPr>
+        <w:t>37–43</w:t>
+      </w:r>
+      <w:r>
+        <w:t xml:space="preserve"> (Springfield / Campbell) name columns are now closed: the only Stone </w:t>
+      </w:r>
+      <w:r>
+        <w:rPr>
+          <w:b/>
+        </w:rPr>
+        <w:t>head</w:t>
+      </w:r>
+      <w:r>
+        <w:t xml:space="preserve"> is Thomas A. on ED </w:t>
+      </w:r>
+      <w:r>
+        <w:rPr>
+          <w:b/>
+        </w:rPr>
+        <w:t>37</w:t>
+      </w:r>
+      <w:r>
+        <w:t xml:space="preserve"> sheet 18A. [C117] [C281]</w:t>
       </w:r>
     </w:p>
     <w:p>
@@ -2874,8 +3166,983 @@
       </w:r>
     </w:p>
     <w:p>
-      <w:r>
-        <w:t>The next chat should treat this book and `06-dossier.md` as the combined master, then work the open list. Do not reopen Peebles as a third marriage without a license. Do not print 1868 or 24 February 1906 as facts.</w:t>
+      <w:pPr>
+        <w:pStyle w:val="ListBullet"/>
+      </w:pPr>
+      <w:r>
+        <w:rPr>
+          <w:b/>
+        </w:rPr>
+        <w:t>B049:</w:t>
+      </w:r>
+      <w:r>
+        <w:t xml:space="preserve"> 1926 *Beattyville Enterprise* and *Yell County Journal* still unread. IA Solr 0; UK film years omit 1926; six `beatty` issues omit 1926. [C335] [C343]</w:t>
+      </w:r>
+    </w:p>
+    <w:p>
+      <w:pPr>
+        <w:pStyle w:val="ListBullet"/>
+      </w:pPr>
+      <w:r>
+        <w:rPr>
+          <w:b/>
+        </w:rPr>
+        <w:t>B045 / B047:</w:t>
+      </w:r>
+      <w:r>
+        <w:t xml:space="preserve"> Samuel P. probate film and M1509 draft cards unread.</w:t>
+      </w:r>
+    </w:p>
+    <w:p>
+      <w:pPr>
+        <w:pStyle w:val="ListBullet"/>
+      </w:pPr>
+      <w:r>
+        <w:rPr>
+          <w:b/>
+        </w:rPr>
+        <w:t>FAN residual:</w:t>
+      </w:r>
+      <w:r>
+        <w:t xml:space="preserve"> Luther Newnam’s own death (B051); Shelby × Grace identity (B052); Everett’s deceased brothers (B053); Carter Cove stone photographs (B054).</w:t>
+      </w:r>
+    </w:p>
+    <w:p>
+      <w:pPr>
+        <w:pStyle w:val="ListBullet"/>
+      </w:pPr>
+      <w:r>
+        <w:t xml:space="preserve">Greene 37–43 Stone sweep is </w:t>
+      </w:r>
+      <w:r>
+        <w:rPr>
+          <w:b/>
+        </w:rPr>
+        <w:t>closed</w:t>
+      </w:r>
+      <w:r>
+        <w:t>. Do not reopen Peebles as a third marriage without a license. Do not print 1868 or 24 February 1906 as facts.</w:t>
+      </w:r>
+    </w:p>
+    <w:p>
+      <w:r>
+        <w:t xml:space="preserve">The next session starts with </w:t>
+      </w:r>
+      <w:r>
+        <w:rPr>
+          <w:b/>
+        </w:rPr>
+        <w:t>B049</w:t>
+      </w:r>
+      <w:r>
+        <w:t>.</w:t>
+      </w:r>
+    </w:p>
+    <w:p>
+      <w:r>
+        <w:br w:type="page"/>
+      </w:r>
+    </w:p>
+    <w:p>
+      <w:pPr>
+        <w:pStyle w:val="Heading1"/>
+      </w:pPr>
+      <w:r>
+        <w:t>Footnotes</w:t>
+      </w:r>
+    </w:p>
+    <w:p>
+      <w:r>
+        <w:t>Numbered notes expand the claim/source tags in the narrative. Access labels: *image seen* · *transcription only* · *index only* · *catalog only* · *OCR text* · *not yet examined*. Click a URL when one exists.</w:t>
+      </w:r>
+    </w:p>
+    <w:p>
+      <w:r>
+        <w:t xml:space="preserve">1. 1880 U.S. census, Lee County, Kentucky, ED 59, dwelling 46: Dora, daughter, 8. NARA T9-427; Internet Archive [`10thcensus0427unit`](https://archive.org/details/10thcensus0427unit). *Image seen.* </w:t>
+      </w:r>
+      <w:r>
+        <w:rPr>
+          <w:b/>
+        </w:rPr>
+        <w:t>C003</w:t>
+      </w:r>
+      <w:r>
+        <w:t xml:space="preserve"> </w:t>
+      </w:r>
+      <w:r>
+        <w:rPr>
+          <w:b/>
+        </w:rPr>
+        <w:t>S010</w:t>
+      </w:r>
+      <w:r>
+        <w:t xml:space="preserve">. </w:t>
+      </w:r>
+      <w:r>
+        <w:rPr>
+          <w:b/>
+        </w:rPr>
+        <w:t>PROVEN</w:t>
+      </w:r>
+      <w:r>
+        <w:t xml:space="preserve"> as a census line.</w:t>
+      </w:r>
+    </w:p>
+    <w:p>
+      <w:r>
+        <w:t xml:space="preserve">2. 1880 KY Soundex N-550 continuation: “Newnam, Dora D 8 Kentucky.” IA [`soundex1880ky055`](https://archive.org/details/soundex1880ky055). *Image seen.* </w:t>
+      </w:r>
+      <w:r>
+        <w:rPr>
+          <w:b/>
+        </w:rPr>
+        <w:t>S001</w:t>
+      </w:r>
+      <w:r>
+        <w:t xml:space="preserve"> </w:t>
+      </w:r>
+      <w:r>
+        <w:rPr>
+          <w:b/>
+        </w:rPr>
+        <w:t>S002</w:t>
+      </w:r>
+      <w:r>
+        <w:t>.</w:t>
+      </w:r>
+    </w:p>
+    <w:p>
+      <w:r>
+        <w:t xml:space="preserve">3. Arkansas State Board of Health, death certificate Dora Stone, Yell Co., noon 23 Aug 1926, cert. 1524, RD 676. Informant Coy Newnam. User-supplied image, prior session; *not re-opened this pass*. Index: [Ancestry 8771](https://www.ancestry.com/search/collections/8771/) / FS [1940760](https://www.familysearch.org/search/collection/1940760) — *not yet examined* from this VM. </w:t>
+      </w:r>
+      <w:r>
+        <w:rPr>
+          <w:b/>
+        </w:rPr>
+        <w:t>C015</w:t>
+      </w:r>
+      <w:r>
+        <w:t xml:space="preserve"> </w:t>
+      </w:r>
+      <w:r>
+        <w:rPr>
+          <w:b/>
+        </w:rPr>
+        <w:t>S003</w:t>
+      </w:r>
+      <w:r>
+        <w:t>.</w:t>
+      </w:r>
+    </w:p>
+    <w:p>
+      <w:r>
+        <w:t xml:space="preserve">4. Debi Houser Kendrick, Lee Marriage Book 2: Samuel P. Newnam × Dora Ella Newnam, 10 Dec 1885, at Doll Newnam’s. [USGenNet Book 2](https://usgennet.org/usa/ky/county/lee/marriage/marrbook2.html). *Transcription only.* </w:t>
+      </w:r>
+      <w:r>
+        <w:rPr>
+          <w:b/>
+        </w:rPr>
+        <w:t>C010</w:t>
+      </w:r>
+      <w:r>
+        <w:t xml:space="preserve"> </w:t>
+      </w:r>
+      <w:r>
+        <w:rPr>
+          <w:b/>
+        </w:rPr>
+        <w:t>S004</w:t>
+      </w:r>
+      <w:r>
+        <w:t xml:space="preserve">. </w:t>
+      </w:r>
+      <w:r>
+        <w:rPr>
+          <w:b/>
+        </w:rPr>
+        <w:t>PROVEN</w:t>
+      </w:r>
+      <w:r>
+        <w:t xml:space="preserve"> as to the fact of marriage.</w:t>
+      </w:r>
+    </w:p>
+    <w:p>
+      <w:r>
+        <w:t xml:space="preserve">5. 1900 U.S. census, Sturgeon precinct, Lee Co., KY, dwelling 67/67 (Kendrick transcription). [RootsWeb 1900 Sturgeon](https://sites.rootsweb.com/~kylee/census/1900/1900sturgeon.htm). *Transcription only* as used here. </w:t>
+      </w:r>
+      <w:r>
+        <w:rPr>
+          <w:b/>
+        </w:rPr>
+        <w:t>C011</w:t>
+      </w:r>
+      <w:r>
+        <w:t xml:space="preserve"> </w:t>
+      </w:r>
+      <w:r>
+        <w:rPr>
+          <w:b/>
+        </w:rPr>
+        <w:t>S005</w:t>
+      </w:r>
+      <w:r>
+        <w:t>.</w:t>
+      </w:r>
+    </w:p>
+    <w:p>
+      <w:r>
+        <w:t xml:space="preserve">6. Birth year August 1871: 1880 age 8 + 1885 age 14 + 1900 “Aug 1871.” Year </w:t>
+      </w:r>
+      <w:r>
+        <w:rPr>
+          <w:b/>
+        </w:rPr>
+        <w:t>PROVEN</w:t>
+      </w:r>
+      <w:r>
+        <w:t xml:space="preserve"> vs 1868. Day 11 </w:t>
+      </w:r>
+      <w:r>
+        <w:rPr>
+          <w:b/>
+        </w:rPr>
+        <w:t>POSSIBLE</w:t>
+      </w:r>
+      <w:r>
+        <w:t xml:space="preserve"> (certificate only). </w:t>
+      </w:r>
+      <w:r>
+        <w:rPr>
+          <w:b/>
+        </w:rPr>
+        <w:t>C001</w:t>
+      </w:r>
+      <w:r>
+        <w:t xml:space="preserve"> </w:t>
+      </w:r>
+      <w:r>
+        <w:rPr>
+          <w:b/>
+        </w:rPr>
+        <w:t>C002</w:t>
+      </w:r>
+      <w:r>
+        <w:t>.</w:t>
+      </w:r>
+    </w:p>
+    <w:p>
+      <w:r>
+        <w:t xml:space="preserve">7. Parents Elias Newnam &amp; Mary Smallwood: certificate + 1880 household + wedding at Doll’s. </w:t>
+      </w:r>
+      <w:r>
+        <w:rPr>
+          <w:b/>
+        </w:rPr>
+        <w:t>PROBABLE</w:t>
+      </w:r>
+      <w:r>
+        <w:t xml:space="preserve"> (near GPS). </w:t>
+      </w:r>
+      <w:r>
+        <w:rPr>
+          <w:b/>
+        </w:rPr>
+        <w:t>C004</w:t>
+      </w:r>
+      <w:r>
+        <w:t>.</w:t>
+      </w:r>
+    </w:p>
+    <w:p>
+      <w:r>
+        <w:t xml:space="preserve">8. 1870 Travellers Rest, Elias household, no Dora. Original M593-494 p. 90. </w:t>
+      </w:r>
+      <w:r>
+        <w:rPr>
+          <w:b/>
+        </w:rPr>
+        <w:t>C067</w:t>
+      </w:r>
+      <w:r>
+        <w:t xml:space="preserve"> </w:t>
+      </w:r>
+      <w:r>
+        <w:rPr>
+          <w:b/>
+        </w:rPr>
+        <w:t>S231</w:t>
+      </w:r>
+      <w:r>
+        <w:t>.</w:t>
+      </w:r>
+    </w:p>
+    <w:p>
+      <w:r>
+        <w:t xml:space="preserve">9. WikiTree [Newnam-49](https://www.wikitree.com/wiki/Newnam-49): death “abt. 1930” </w:t>
+      </w:r>
+      <w:r>
+        <w:rPr>
+          <w:b/>
+        </w:rPr>
+        <w:t>DISPROVED</w:t>
+      </w:r>
+      <w:r>
+        <w:t xml:space="preserve">; middle name Parriott lore. </w:t>
+      </w:r>
+      <w:r>
+        <w:rPr>
+          <w:b/>
+        </w:rPr>
+        <w:t>S030</w:t>
+      </w:r>
+      <w:r>
+        <w:t>.</w:t>
+      </w:r>
+    </w:p>
+    <w:p>
+      <w:r>
+        <w:t xml:space="preserve">10. 1910 Sturgeon ED 99 original, T624-478: P001/P002/McCoy/John H. b.1899 </w:t>
+      </w:r>
+      <w:r>
+        <w:rPr>
+          <w:b/>
+        </w:rPr>
+        <w:t>nil</w:t>
+      </w:r>
+      <w:r>
+        <w:t xml:space="preserve">. IA [`13thcensus1910po478unit`](https://archive.org/details/13thcensus1910po478unit). </w:t>
+      </w:r>
+      <w:r>
+        <w:rPr>
+          <w:b/>
+        </w:rPr>
+        <w:t>C088</w:t>
+      </w:r>
+      <w:r>
+        <w:t>.</w:t>
+      </w:r>
+    </w:p>
+    <w:p>
+      <w:r>
+        <w:t xml:space="preserve">11. 1920 Beattyville ED 111 sh 6A: E.T. Newman, grandfather in C.B. Burke’s house. IA [`14thcensusofpopu586unit`](https://archive.org/details/14thcensusofpopu586unit). </w:t>
+      </w:r>
+      <w:r>
+        <w:rPr>
+          <w:b/>
+        </w:rPr>
+        <w:t>C091</w:t>
+      </w:r>
+      <w:r>
+        <w:t xml:space="preserve"> </w:t>
+      </w:r>
+      <w:r>
+        <w:rPr>
+          <w:b/>
+        </w:rPr>
+        <w:t>S073</w:t>
+      </w:r>
+      <w:r>
+        <w:t>.</w:t>
+      </w:r>
+    </w:p>
+    <w:p>
+      <w:r>
+        <w:t xml:space="preserve">12. 1920 Perry Co. AR: Tom A. Stone, 62, widower. </w:t>
+      </w:r>
+      <w:r>
+        <w:rPr>
+          <w:b/>
+        </w:rPr>
+        <w:t>C050</w:t>
+      </w:r>
+      <w:r>
+        <w:t xml:space="preserve">. Identification with T. A. on the 1926 certificate </w:t>
+      </w:r>
+      <w:r>
+        <w:rPr>
+          <w:b/>
+        </w:rPr>
+        <w:t>PROBABLE</w:t>
+      </w:r>
+      <w:r>
+        <w:t xml:space="preserve"> (conflict #4, #11).</w:t>
+      </w:r>
+    </w:p>
+    <w:p>
+      <w:r>
+        <w:t xml:space="preserve">13. 1900 Greene Co. MO ED 37 sh 18A: Thomas A. Stone, 32, Matilda, Gertrude. NARA T623-855; IA [`12thcensusofpopu855unit`](https://archive.org/details/12thcensusofpopu855unit). </w:t>
+      </w:r>
+      <w:r>
+        <w:rPr>
+          <w:b/>
+        </w:rPr>
+        <w:t>C117</w:t>
+      </w:r>
+      <w:r>
+        <w:t xml:space="preserve">. </w:t>
+      </w:r>
+      <w:r>
+        <w:rPr>
+          <w:b/>
+        </w:rPr>
+        <w:t>Not merged.</w:t>
+      </w:r>
+    </w:p>
+    <w:p>
+      <w:r>
+        <w:t xml:space="preserve">14. Greene ED 37–43 name-column sweep (A+B), including 41 ED 38 B-side crops in `sources/census/b040-ed38-bsides/`. </w:t>
+      </w:r>
+      <w:r>
+        <w:rPr>
+          <w:b/>
+        </w:rPr>
+        <w:t>C281</w:t>
+      </w:r>
+      <w:r>
+        <w:t xml:space="preserve"> </w:t>
+      </w:r>
+      <w:r>
+        <w:rPr>
+          <w:b/>
+        </w:rPr>
+        <w:t>S267</w:t>
+      </w:r>
+      <w:r>
+        <w:t xml:space="preserve">. </w:t>
+      </w:r>
+      <w:r>
+        <w:rPr>
+          <w:b/>
+        </w:rPr>
+        <w:t>PROVEN</w:t>
+      </w:r>
+      <w:r>
+        <w:t xml:space="preserve"> negative for a second Stone head.</w:t>
+      </w:r>
+    </w:p>
+    <w:p>
+      <w:r>
+        <w:t xml:space="preserve">15. Daniels &amp; Cossey, Carter Cove, 5 Feb 1993: “Newman, Dora” no dates; “Stone, Thomas 1845–1925.” </w:t>
+      </w:r>
+      <w:r>
+        <w:rPr>
+          <w:b/>
+        </w:rPr>
+        <w:t>S078</w:t>
+      </w:r>
+      <w:r>
+        <w:t>.</w:t>
+      </w:r>
+    </w:p>
+    <w:p>
+      <w:r>
+        <w:t xml:space="preserve">16. yellcountyobits compiled index p. 64 / 83, captured 30 Oct 2026. [Newman block](https://www.yellcountyobits.org/yc_cemeteryindex/cemeterylist/cemeterylist64.html) · [Stone block](https://www.yellcountyobits.org/yc_cemeteryindex/cemeterylist/cemeterylist83.html). *Transcription only.* </w:t>
+      </w:r>
+      <w:r>
+        <w:rPr>
+          <w:b/>
+        </w:rPr>
+        <w:t>C324</w:t>
+      </w:r>
+      <w:r>
+        <w:t xml:space="preserve"> </w:t>
+      </w:r>
+      <w:r>
+        <w:rPr>
+          <w:b/>
+        </w:rPr>
+        <w:t>C325</w:t>
+      </w:r>
+      <w:r>
+        <w:t xml:space="preserve"> </w:t>
+      </w:r>
+      <w:r>
+        <w:rPr>
+          <w:b/>
+        </w:rPr>
+        <w:t>S281</w:t>
+      </w:r>
+      <w:r>
+        <w:t xml:space="preserve"> </w:t>
+      </w:r>
+      <w:r>
+        <w:rPr>
+          <w:b/>
+        </w:rPr>
+        <w:t>S282</w:t>
+      </w:r>
+      <w:r>
+        <w:t>.</w:t>
+      </w:r>
+    </w:p>
+    <w:p>
+      <w:r>
+        <w:t xml:space="preserve">17. Find a Grave cemetery listing: Dora Newman memorial [97907837](https://www.findagrave.com/memorial/97907837/dora-newman); Thomas Stone [97907931](https://www.findagrave.com/memorial/97907931/thomas-stone). Listing HTML seen; memorial biographies CF-blocked. </w:t>
+      </w:r>
+      <w:r>
+        <w:rPr>
+          <w:b/>
+        </w:rPr>
+        <w:t>S117</w:t>
+      </w:r>
+      <w:r>
+        <w:t xml:space="preserve"> </w:t>
+      </w:r>
+      <w:r>
+        <w:rPr>
+          <w:b/>
+        </w:rPr>
+        <w:t>S118</w:t>
+      </w:r>
+      <w:r>
+        <w:t>.</w:t>
+      </w:r>
+    </w:p>
+    <w:p>
+      <w:r>
+        <w:t xml:space="preserve">18. *Beattyville Enterprise*, IA item [`beatty`](https://archive.org/details/beatty): six issues only. OCR + selected page JPEGs in `sources/press/`. </w:t>
+      </w:r>
+      <w:r>
+        <w:rPr>
+          <w:b/>
+        </w:rPr>
+        <w:t>C326–C332</w:t>
+      </w:r>
+      <w:r>
+        <w:t xml:space="preserve"> </w:t>
+      </w:r>
+      <w:r>
+        <w:rPr>
+          <w:b/>
+        </w:rPr>
+        <w:t>C335</w:t>
+      </w:r>
+      <w:r>
+        <w:t xml:space="preserve"> </w:t>
+      </w:r>
+      <w:r>
+        <w:rPr>
+          <w:b/>
+        </w:rPr>
+        <w:t>S283</w:t>
+      </w:r>
+      <w:r>
+        <w:t>.</w:t>
+      </w:r>
+    </w:p>
+    <w:p>
+      <w:r>
+        <w:t xml:space="preserve">19. UK Microfilm Holdings item [65438](https://ukmfilms.omeka.net/items/show/65438): *Enterprise* years 1909–11, 1915, 1924–25, 1928, 1932. Film </w:t>
+      </w:r>
+      <w:r>
+        <w:rPr>
+          <w:b/>
+        </w:rPr>
+        <w:t>S 90-033</w:t>
+      </w:r>
+      <w:r>
+        <w:t xml:space="preserve">. *Catalog only.* </w:t>
+      </w:r>
+      <w:r>
+        <w:rPr>
+          <w:b/>
+        </w:rPr>
+        <w:t>S284</w:t>
+      </w:r>
+      <w:r>
+        <w:t>.</w:t>
+      </w:r>
+    </w:p>
+    <w:p>
+      <w:r>
+        <w:t xml:space="preserve">20. *Hopkinsville Kentuckian*, 9 Aug 1906, p. 8. [LOC](https://www.loc.gov/resource/sn86069395/1906-08-09/ed-1/?sp=8). </w:t>
+      </w:r>
+      <w:r>
+        <w:rPr>
+          <w:b/>
+        </w:rPr>
+        <w:t>C333</w:t>
+      </w:r>
+      <w:r>
+        <w:t xml:space="preserve"> </w:t>
+      </w:r>
+      <w:r>
+        <w:rPr>
+          <w:b/>
+        </w:rPr>
+        <w:t>S286</w:t>
+      </w:r>
+      <w:r>
+        <w:t xml:space="preserve">. </w:t>
+      </w:r>
+      <w:r>
+        <w:rPr>
+          <w:b/>
+        </w:rPr>
+        <w:t>DISPROVED</w:t>
+      </w:r>
+      <w:r>
+        <w:t xml:space="preserve"> vs Samuel P.</w:t>
+      </w:r>
+    </w:p>
+    <w:p>
+      <w:r>
+        <w:t xml:space="preserve">21. *Richmond Climax*, 23 Apr 1902, p. 1. [LOC](https://www.loc.gov/resource/sn86069162/1902-04-23/ed-1/?sp=1). </w:t>
+      </w:r>
+      <w:r>
+        <w:rPr>
+          <w:b/>
+        </w:rPr>
+        <w:t>C334</w:t>
+      </w:r>
+      <w:r>
+        <w:t xml:space="preserve"> </w:t>
+      </w:r>
+      <w:r>
+        <w:rPr>
+          <w:b/>
+        </w:rPr>
+        <w:t>S287</w:t>
+      </w:r>
+      <w:r>
+        <w:t xml:space="preserve">. </w:t>
+      </w:r>
+      <w:r>
+        <w:rPr>
+          <w:b/>
+        </w:rPr>
+        <w:t>DISPROVED</w:t>
+      </w:r>
+      <w:r>
+        <w:t xml:space="preserve"> vs Samuel P.</w:t>
+      </w:r>
+    </w:p>
+    <w:p>
+      <w:r>
+        <w:t xml:space="preserve">22. Genealogy Trails Lee WWI draft transcript (1,126 cards). [GT Lee WWI](https://genealogytrails.com/ken/lee/ww1draft.html). Re-fetched 30 Oct 2026. </w:t>
+      </w:r>
+      <w:r>
+        <w:rPr>
+          <w:b/>
+        </w:rPr>
+        <w:t>C336</w:t>
+      </w:r>
+      <w:r>
+        <w:t xml:space="preserve"> </w:t>
+      </w:r>
+      <w:r>
+        <w:rPr>
+          <w:b/>
+        </w:rPr>
+        <w:t>S285</w:t>
+      </w:r>
+      <w:r>
+        <w:t>.</w:t>
+      </w:r>
+    </w:p>
+    <w:p>
+      <w:r>
+        <w:t xml:space="preserve">23. Lee Marriage Book 23: Clay Dunigan × Ladona Newman, 15 Mar 1932. [USGenNet Book 23](https://usgennet.org/usa/ky/county/lee/marriage/marrbook23.html). *Transcription only.* </w:t>
+      </w:r>
+      <w:r>
+        <w:rPr>
+          <w:b/>
+        </w:rPr>
+        <w:t>C339</w:t>
+      </w:r>
+      <w:r>
+        <w:t xml:space="preserve"> </w:t>
+      </w:r>
+      <w:r>
+        <w:rPr>
+          <w:b/>
+        </w:rPr>
+        <w:t>S290</w:t>
+      </w:r>
+      <w:r>
+        <w:t>.</w:t>
+      </w:r>
+    </w:p>
+    <w:p>
+      <w:r>
+        <w:t xml:space="preserve">24. Lee obituaries N: Everett Newnam, *Enterprise* 14 Dec 1939. [USGenNet n.html](https://usgennet.org/usa/ky/county/lee/obituaries/n.html#everettnewman). *Transcription only.* </w:t>
+      </w:r>
+      <w:r>
+        <w:rPr>
+          <w:b/>
+        </w:rPr>
+        <w:t>C341</w:t>
+      </w:r>
+      <w:r>
+        <w:t xml:space="preserve"> </w:t>
+      </w:r>
+      <w:r>
+        <w:rPr>
+          <w:b/>
+        </w:rPr>
+        <w:t>S291</w:t>
+      </w:r>
+      <w:r>
+        <w:t>.</w:t>
+      </w:r>
+    </w:p>
+    <w:p>
+      <w:r>
+        <w:t xml:space="preserve">25. IA Solr 30 Oct 2026: 0 items *Yell County Journal* 1926; 0 items title *Beattyville Enterprise* year 1926. </w:t>
+      </w:r>
+      <w:r>
+        <w:rPr>
+          <w:b/>
+        </w:rPr>
+        <w:t>C343</w:t>
+      </w:r>
+      <w:r>
+        <w:t xml:space="preserve"> </w:t>
+      </w:r>
+      <w:r>
+        <w:rPr>
+          <w:b/>
+        </w:rPr>
+        <w:t>S293</w:t>
+      </w:r>
+      <w:r>
+        <w:t>.</w:t>
+      </w:r>
+    </w:p>
+    <w:p>
+      <w:r>
+        <w:t xml:space="preserve">26. Genealogy Trails [Yell obituaries](https://genealogytrails.com/ark/yell/obits.html) landing, 30 Oct 2026: nil Stone/Newnam/Dora/1926. </w:t>
+      </w:r>
+      <w:r>
+        <w:rPr>
+          <w:b/>
+        </w:rPr>
+        <w:t>C344</w:t>
+      </w:r>
+      <w:r>
+        <w:t xml:space="preserve"> </w:t>
+      </w:r>
+      <w:r>
+        <w:rPr>
+          <w:b/>
+        </w:rPr>
+        <w:t>S294</w:t>
+      </w:r>
+      <w:r>
+        <w:t>.</w:t>
+      </w:r>
+    </w:p>
+    <w:p>
+      <w:r>
+        <w:t xml:space="preserve">27. Word biography bytes: SHA-256 `78cdcf44ad1700ee4a0b696215879e2e8485c2dfe794e1d918e64acc1d3d9280` (53,235 bytes). Copies in `book/` and `sources/authored/`. Drive search 0. </w:t>
+      </w:r>
+      <w:r>
+        <w:rPr>
+          <w:b/>
+        </w:rPr>
+        <w:t>C338</w:t>
+      </w:r>
+      <w:r>
+        <w:t xml:space="preserve"> </w:t>
+      </w:r>
+      <w:r>
+        <w:rPr>
+          <w:b/>
+        </w:rPr>
+        <w:t>S289</w:t>
+      </w:r>
+      <w:r>
+        <w:t>.</w:t>
+      </w:r>
+    </w:p>
+    <w:p>
+      <w:r>
+        <w:t xml:space="preserve">28. Coy × Letha Sullivan, 18 Feb 1917, Ola. </w:t>
+      </w:r>
+      <w:r>
+        <w:rPr>
+          <w:b/>
+        </w:rPr>
+        <w:t>C027</w:t>
+      </w:r>
+      <w:r>
+        <w:t xml:space="preserve"> </w:t>
+      </w:r>
+      <w:r>
+        <w:rPr>
+          <w:b/>
+        </w:rPr>
+        <w:t>S024</w:t>
+      </w:r>
+      <w:r>
+        <w:t>. Prior session.</w:t>
+      </w:r>
+    </w:p>
+    <w:p>
+      <w:r>
+        <w:t xml:space="preserve">29. NUMIDENT Pearl P. Jackson / Mary Magdalene Bunch naming Sam and Dora. </w:t>
+      </w:r>
+      <w:r>
+        <w:rPr>
+          <w:b/>
+        </w:rPr>
+        <w:t>S006</w:t>
+      </w:r>
+      <w:r>
+        <w:t xml:space="preserve"> </w:t>
+      </w:r>
+      <w:r>
+        <w:rPr>
+          <w:b/>
+        </w:rPr>
+        <w:t>S007</w:t>
+      </w:r>
+      <w:r>
+        <w:t>. Prior.</w:t>
+      </w:r>
+    </w:p>
+    <w:p>
+      <w:r>
+        <w:t xml:space="preserve">30. Lee Books 5–19: no Peebles; no Dora Newnam remarriage. [USGenNet marriages](https://usgennet.org/usa/ky/county/lee/marriage/). </w:t>
+      </w:r>
+      <w:r>
+        <w:rPr>
+          <w:b/>
+        </w:rPr>
+        <w:t>C084</w:t>
+      </w:r>
+      <w:r>
+        <w:t xml:space="preserve"> </w:t>
+      </w:r>
+      <w:r>
+        <w:rPr>
+          <w:b/>
+        </w:rPr>
+        <w:t>S064</w:t>
+      </w:r>
+      <w:r>
+        <w:t>.</w:t>
+      </w:r>
+    </w:p>
+    <w:p>
+      <w:r>
+        <w:br w:type="page"/>
+      </w:r>
+    </w:p>
+    <w:p>
+      <w:pPr>
+        <w:pStyle w:val="Heading1"/>
+      </w:pPr>
+      <w:r>
+        <w:t>Source index</w:t>
+      </w:r>
+    </w:p>
+    <w:p>
+      <w:r>
+        <w:t xml:space="preserve">Working table of </w:t>
+      </w:r>
+      <w:r>
+        <w:rPr>
+          <w:b/>
+        </w:rPr>
+        <w:t>saved local copies</w:t>
+      </w:r>
+      <w:r>
+        <w:t>. Full file list: [`../SOURCE-INDEX.md`](../SOURCE-INDEX.md) and [`../sources/SOURCE-INVENTORY.tsv`](../sources/SOURCE-INVENTORY.tsv) (331 files after this pass).</w:t>
+      </w:r>
+    </w:p>
+    <w:p>
+      <w:r>
+        <w:t>| ID | Local file | Repository / URL | What it proves | Access |</w:t>
+      </w:r>
+    </w:p>
+    <w:p>
+      <w:r>
+        <w:t>|---|---|---|---|---|</w:t>
+      </w:r>
+    </w:p>
+    <w:p>
+      <w:r>
+        <w:t>| S003 | *(user image; not re-opened)* | AR Board of Health cert. 1524 | Death, parents, spouse, informant, burial | image seen (prior) |</w:t>
+      </w:r>
+    </w:p>
+    <w:p>
+      <w:r>
+        <w:t>| S267 | `../sources/census/b040-ed38-bsides/` (41 PNGs) | [IA T623-855](https://archive.org/details/12thcensusofpopu855unit) | ED 38 B-sides nil Stone/Newnam (</w:t>
+      </w:r>
+      <w:r>
+        <w:rPr>
+          <w:b/>
+        </w:rPr>
+        <w:t>C281</w:t>
+      </w:r>
+      <w:r>
+        <w:t>) | image seen |</w:t>
+      </w:r>
+    </w:p>
+    <w:p>
+      <w:r>
+        <w:t>| S281 | `../sources/cemetery/yellcountyobits-cemeterylist64-newman-dora-2026-10-30.txt` | [yellcountyobits p.64](https://www.yellcountyobits.org/yc_cemeteryindex/cemeterylist/cemeterylist64.html) | Newman, Dora, no dates, Carter Cove | transcription only |</w:t>
+      </w:r>
+    </w:p>
+    <w:p>
+      <w:r>
+        <w:t>| S282 | `../sources/cemetery/yellcountyobits-cemeterylist83-stone-2026-10-30.txt` | [yellcountyobits p.83](https://www.yellcountyobits.org/yc_cemeteryindex/cemeterylist/cemeterylist83.html) | Stone, Thomas, 1845–1925, Carter Cove | transcription only |</w:t>
+      </w:r>
+    </w:p>
+    <w:p>
+      <w:r>
+        <w:t>| S283 | `../sources/press/beattyville-enterprise-ia-beatty-ocr-2026-10-30.txt` + leaf JPEGs | [IA `beatty`](https://archive.org/details/beatty) | Doll 1928/1932; FAN; no 1926 | OCR + selected images |</w:t>
+      </w:r>
+    </w:p>
+    <w:p>
+      <w:r>
+        <w:t>| S284 | `../sources/press/beattyville-enterprise-uk-microfilm-2026-10-30.html` | [UK item 65438](https://ukmfilms.omeka.net/items/show/65438) | 1926 not in listed film years | catalog only |</w:t>
+      </w:r>
+    </w:p>
+    <w:p>
+      <w:r>
+        <w:t>| S285 | `../sources/military/lee-wwi-genealogytrails-reget-2026-10-30.txt` | [GT Lee WWI](https://genealogytrails.com/ken/lee/ww1draft.html) | Nil Newnam/McCoy | transcription only |</w:t>
+      </w:r>
+    </w:p>
+    <w:p>
+      <w:r>
+        <w:t>| S286 | `../sources/press/hopkinsville-kentuckian-1906-08-09-p8.jpg` | [LOC](https://www.loc.gov/resource/sn86069395/1906-08-09/ed-1/?sp=8) | Reject vs Samuel P. | image seen |</w:t>
+      </w:r>
+    </w:p>
+    <w:p>
+      <w:r>
+        <w:t>| S287 | `../sources/press/richmond-climax-1902-04-23-p1.jpg` | [LOC](https://www.loc.gov/resource/sn86069162/1902-04-23/ed-1/?sp=1) | Will Newnam reject | image seen |</w:t>
+      </w:r>
+    </w:p>
+    <w:p>
+      <w:r>
+        <w:t>| S289 | `../sources/authored/Dora-Ella-Newnam-Stone-A-Life-latest.docx` | Local Word export | Latest authored bio bytes | original bytes |</w:t>
+      </w:r>
+    </w:p>
+    <w:p>
+      <w:r>
+        <w:t>| S290 | `../sources/marriages/lee-book23-clay-ladona-1932-extract-2026-10-30.txt` | [Book 23](https://usgennet.org/usa/ky/county/lee/marriage/marrbook23.html) | Clay × Ladona 15 Mar 1932 | transcription only |</w:t>
+      </w:r>
+    </w:p>
+    <w:p>
+      <w:r>
+        <w:t>| S291 | `../sources/obituaries/lee-obits-n-everett-newnam-1939-extract-2026-10-30.txt` | [Obits N](https://usgennet.org/usa/ky/county/lee/obituaries/n.html#everettnewman) | Everett d. 13 Dec 1939 | transcription only |</w:t>
+      </w:r>
+    </w:p>
+    <w:p>
+      <w:r>
+        <w:t>| S293 | `../sources/press/ia-yell-journal-1926-search-2026-10-30.json` | IA Solr | 0 hits for 1926 titles | index only |</w:t>
+      </w:r>
+    </w:p>
+    <w:p>
+      <w:r>
+        <w:t>| S294 | `../sources/press/genealogytrails-yell-obits-landing-2026-10-30.html` | [GT Yell obits](https://genealogytrails.com/ark/yell/obits.html) | Nil on landing | transcription only |</w:t>
+      </w:r>
+    </w:p>
+    <w:p>
+      <w:r>
+        <w:t>Embedded plates live in `plates/` and `../sources/census/`. Charts: [`../visuals/pedigree-dora.svg`](../visuals/pedigree-dora.svg), [`../visuals/timeline-dora.svg`](../visuals/timeline-dora.svg).</w:t>
       </w:r>
     </w:p>
     <w:sectPr>

</xml_diff>

<commit_message>
Dora pass 66: Minerva 1900, John×Cora 1915, Everett parents
1900 Owsley Buck Creek widow Minerva with Callie, Evert, David F.
Lee Book 11 John Newman × Cora Brandenburg (Dan × Mininerva).
1910 Buck Creek John+Lillie, Everet, younger Grant 21 (not 1876 Grant).
Everett's parents now PROBABLE Daniel × Minerva/Sarah (#24).
B045/B061/B069 images still unread after R011 workarounds.

Co-authored-by: blakereaganlaw <blakereaganlaw@gmail.com>
</commit_message>
<xml_diff>
--- a/research/dora-ella-newnam/book/Dora-Ella-Newnam-Stone-A-Life.docx
+++ b/research/dora-ella-newnam/book/Dora-Ella-Newnam-Stone-A-Life.docx
@@ -2597,6 +2597,206 @@
     </w:p>
     <w:p>
       <w:r>
+        <w:t xml:space="preserve">Those 1961 parents now have a house. On 22 June 1900, in Owsley Buck Creek household 324/326, a widow </w:t>
+      </w:r>
+      <w:r>
+        <w:rPr>
+          <w:b/>
+        </w:rPr>
+        <w:t>Minerva Newnam</w:t>
+      </w:r>
+      <w:r>
+        <w:t xml:space="preserve">, born January 1850, reported nine children born and six living. At home: Callie, January 1885; </w:t>
+      </w:r>
+      <w:r>
+        <w:rPr>
+          <w:b/>
+        </w:rPr>
+        <w:t>Evert</w:t>
+      </w:r>
+      <w:r>
+        <w:t xml:space="preserve">, November 1886; </w:t>
+      </w:r>
+      <w:r>
+        <w:rPr>
+          <w:b/>
+        </w:rPr>
+        <w:t>David F.</w:t>
+      </w:r>
+      <w:r>
+        <w:t xml:space="preserve">, February 1889. [C431] [S373] Daniel was already dead. [C432] The Buck Creek Callie is </w:t>
+      </w:r>
+      <w:r>
+        <w:rPr>
+          <w:b/>
+        </w:rPr>
+        <w:t>probable</w:t>
+      </w:r>
+      <w:r>
+        <w:t xml:space="preserve"> the 1961 woman (name, Newnam, Owsley, year within one). [C433] Evert is </w:t>
+      </w:r>
+      <w:r>
+        <w:rPr>
+          <w:b/>
+        </w:rPr>
+        <w:t>probable</w:t>
+      </w:r>
+      <w:r>
+        <w:t xml:space="preserve"> Everett of Idamay: the statewide death index later called him fifty-three, which matches a November 1886 birth; the 1939 paper said fifty — the two figures are not averaged. [C434] David F. is </w:t>
+      </w:r>
+      <w:r>
+        <w:rPr>
+          <w:b/>
+        </w:rPr>
+        <w:t>possible</w:t>
+      </w:r>
+      <w:r>
+        <w:t xml:space="preserve"> only as Frank the Berea contractor. He is not merged with Grant, and he is not the 1928 St. Helens Frank. [C435] Conflict #20 and #22 stand.</w:t>
+      </w:r>
+    </w:p>
+    <w:p>
+      <w:r>
+        <w:t xml:space="preserve">On 20 November 1915 Lee Book 11 recorded </w:t>
+      </w:r>
+      <w:r>
+        <w:rPr>
+          <w:b/>
+        </w:rPr>
+        <w:t>John Newman</w:t>
+      </w:r>
+      <w:r>
+        <w:t xml:space="preserve">, thirty-four, a widower born in Owsley, parents </w:t>
+      </w:r>
+      <w:r>
+        <w:rPr>
+          <w:b/>
+        </w:rPr>
+        <w:t>Dan Newman</w:t>
+      </w:r>
+      <w:r>
+        <w:t xml:space="preserve"> and </w:t>
+      </w:r>
+      <w:r>
+        <w:rPr>
+          <w:b/>
+        </w:rPr>
+        <w:t>Mininerva Venable</w:t>
+      </w:r>
+      <w:r>
+        <w:t xml:space="preserve">, married to Cora Brandenburg. [C436] [S374] That John is </w:t>
+      </w:r>
+      <w:r>
+        <w:rPr>
+          <w:b/>
+        </w:rPr>
+        <w:t>probable</w:t>
+      </w:r>
+      <w:r>
+        <w:t xml:space="preserve"> Everett’s 1939 brother of Owsley and the 1910 Buck Creek John, thirty-one, already nine years married to Lillie, with Florence eight and Pency four. [C437] [C438] [S375] Lillie’s death and the Owsley license for that first marriage are unread. [C452] A compiled tree that makes Florence Cora’s daughter is </w:t>
+      </w:r>
+      <w:r>
+        <w:rPr>
+          <w:b/>
+        </w:rPr>
+        <w:t>disproved</w:t>
+      </w:r>
+      <w:r>
+        <w:t>: Florence was already eight when Cora married John. [C455]</w:t>
+      </w:r>
+    </w:p>
+    <w:p>
+      <w:r>
+        <w:t xml:space="preserve">The 1910 Buck Creek page also puts </w:t>
+      </w:r>
+      <w:r>
+        <w:rPr>
+          <w:b/>
+        </w:rPr>
+        <w:t>Everet</w:t>
+      </w:r>
+      <w:r>
+        <w:t xml:space="preserve">, twenty-three and single, at household 159, with a widowed sister Susan and two nephews — </w:t>
+      </w:r>
+      <w:r>
+        <w:rPr>
+          <w:b/>
+        </w:rPr>
+        <w:t>probable</w:t>
+      </w:r>
+      <w:r>
+        <w:t xml:space="preserve"> the 1900 Evert, now a head. [C439] Next door at 158 is a different </w:t>
+      </w:r>
+      <w:r>
+        <w:rPr>
+          <w:b/>
+        </w:rPr>
+        <w:t>Grant</w:t>
+      </w:r>
+      <w:r>
+        <w:t xml:space="preserve">, twenty-one, newly married to Dona. He is </w:t>
+      </w:r>
+      <w:r>
+        <w:rPr>
+          <w:b/>
+        </w:rPr>
+        <w:t>not</w:t>
+      </w:r>
+      <w:r>
+        <w:t xml:space="preserve"> the 1876 Grant of Lee, who would have been about thirty-four. [C440] If that younger Grant were Everett’s brother he should appear on the 1939 survivor list unless he was already dead. He is not merged with David F.</w:t>
+      </w:r>
+    </w:p>
+    <w:p>
+      <w:r>
+        <w:t xml:space="preserve">Three record forms now name the mother: </w:t>
+      </w:r>
+      <w:r>
+        <w:rPr>
+          <w:b/>
+        </w:rPr>
+        <w:t>Minerva</w:t>
+      </w:r>
+      <w:r>
+        <w:t xml:space="preserve"> in 1900, </w:t>
+      </w:r>
+      <w:r>
+        <w:rPr>
+          <w:b/>
+        </w:rPr>
+        <w:t>Mininerva Venable</w:t>
+      </w:r>
+      <w:r>
+        <w:t xml:space="preserve"> in 1915, </w:t>
+      </w:r>
+      <w:r>
+        <w:rPr>
+          <w:b/>
+        </w:rPr>
+        <w:t>Sarah Veneable</w:t>
+      </w:r>
+      <w:r>
+        <w:t xml:space="preserve"> in 1961. One woman is </w:t>
+      </w:r>
+      <w:r>
+        <w:rPr>
+          <w:b/>
+        </w:rPr>
+        <w:t>probable</w:t>
+      </w:r>
+      <w:r>
+        <w:t xml:space="preserve"> if the compound is Sarah Minerva. No record yet seen uses both givens. Conflict #24. A compiled page that prints “Sarah Minerva Venable, 16 January 1850” and “Daniel Boone Newman, 1847” is an authored lead only. [C442] [C443] [C456] The 1947 Lee death of Sarah Newman, daughter of John Damrel and Elizabeth Angel, is a different woman. [C444] Henry H. Newnam and a living wife Minverva in 1900 District 2 are a different couple. [C445] A twenty-two-year-old Daniel Newman, farm labourer in Debby Brandenburg’s Beattyville house on 14 July 1870, is </w:t>
+      </w:r>
+      <w:r>
+        <w:rPr>
+          <w:b/>
+        </w:rPr>
+        <w:t>possible</w:t>
+      </w:r>
+      <w:r>
+        <w:t xml:space="preserve"> only. [C446] Lee year-files 1911–1938 have no Daniel Newnam decedent, as expected if he was already dead. [C448]</w:t>
+      </w:r>
+    </w:p>
+    <w:p>
+      <w:r>
         <w:t xml:space="preserve">The 1926 Callie Newnam on the Lee death extract is a different woman. She died 27 April 1926 at Proctor — a second extract says Idamay — aged thirty years and one month, parents Sam Moore and Mary Brandenburg. Dorothy Newnam, one year old, died 6 October 1926 at Idamay; her extract names father Everett Newnam and mother Callie Moore. Those two independent identifiers make Callie Moore Newnam </w:t>
       </w:r>
       <w:r>
@@ -3359,13 +3559,49 @@
         <w:t>FAN residual:</w:t>
       </w:r>
       <w:r>
-        <w:t xml:space="preserve"> Frank of Berea (B055) not merged with Grant (#20) or with 1928 St. Helens Frank (#22); John of Owsley (B056); Daniel Newnam × Sarah Veneable vs Everett (B072); William × Katherine license (B064); two William lines (B071); Herman Estes of Brasstown (B067); Frankie Jones / Mary Peters (B068); Carter Cove stone photographs (B054). </w:t>
-      </w:r>
-      <w:r>
-        <w:rPr>
-          <w:b/>
-        </w:rPr>
-        <w:t>Closed this pass:</w:t>
+        <w:t xml:space="preserve"> Frank of Berea (B055) — 1900 David F. </w:t>
+      </w:r>
+      <w:r>
+        <w:rPr>
+          <w:b/>
+        </w:rPr>
+        <w:t>possible</w:t>
+      </w:r>
+      <w:r>
+        <w:t xml:space="preserve"> only; not merged with Grant (#20) or 1928 St. Helens Frank (#22); John of Owsley now has the 1915 license (B056); Daniel × Minerva/Sarah are </w:t>
+      </w:r>
+      <w:r>
+        <w:rPr>
+          <w:b/>
+        </w:rPr>
+        <w:t>probable</w:t>
+      </w:r>
+      <w:r>
+        <w:t xml:space="preserve"> Everett’s parents (</w:t>
+      </w:r>
+      <w:r>
+        <w:rPr>
+          <w:b/>
+        </w:rPr>
+        <w:t>C456</w:t>
+      </w:r>
+      <w:r>
+        <w:t xml:space="preserve">, </w:t>
+      </w:r>
+      <w:r>
+        <w:rPr>
+          <w:b/>
+        </w:rPr>
+        <w:t>#24</w:t>
+      </w:r>
+      <w:r>
+        <w:t xml:space="preserve">); 1880 house unread (B076); John × Lillie unread (B073/B074); 1910 Grant 21 unread (B075); William × Katherine license (B064); two William lines (B071); Herman Estes of Brasstown (B067); Frankie Jones / Mary Peters (B068); Carter Cove stone photographs (B054). </w:t>
+      </w:r>
+      <w:r>
+        <w:rPr>
+          <w:b/>
+        </w:rPr>
+        <w:t>Closed earlier:</w:t>
       </w:r>
       <w:r>
         <w:t xml:space="preserve"> Grant </w:t>
@@ -3462,7 +3698,52 @@
         <w:t>127869 / 964964</w:t>
       </w:r>
       <w:r>
-        <w:t>).</w:t>
+        <w:t xml:space="preserve">). Then </w:t>
+      </w:r>
+      <w:r>
+        <w:rPr>
+          <w:b/>
+        </w:rPr>
+        <w:t>B069/B047</w:t>
+      </w:r>
+      <w:r>
+        <w:t xml:space="preserve">, </w:t>
+      </w:r>
+      <w:r>
+        <w:rPr>
+          <w:b/>
+        </w:rPr>
+        <w:t>B076</w:t>
+      </w:r>
+      <w:r>
+        <w:t xml:space="preserve">, </w:t>
+      </w:r>
+      <w:r>
+        <w:rPr>
+          <w:b/>
+        </w:rPr>
+        <w:t>B055</w:t>
+      </w:r>
+      <w:r>
+        <w:t xml:space="preserve">, </w:t>
+      </w:r>
+      <w:r>
+        <w:rPr>
+          <w:b/>
+        </w:rPr>
+        <w:t>B073/B074</w:t>
+      </w:r>
+      <w:r>
+        <w:t xml:space="preserve">, </w:t>
+      </w:r>
+      <w:r>
+        <w:rPr>
+          <w:b/>
+        </w:rPr>
+        <w:t>B049/B058</w:t>
+      </w:r>
+      <w:r>
+        <w:t>.</w:t>
       </w:r>
     </w:p>
     <w:p>
@@ -5459,6 +5740,224 @@
     </w:p>
     <w:p>
       <w:r>
+        <w:t xml:space="preserve">58. 1900 U.S. census, Owsley Buck Creek hh </w:t>
+      </w:r>
+      <w:r>
+        <w:rPr>
+          <w:b/>
+        </w:rPr>
+        <w:t>324/326</w:t>
+      </w:r>
+      <w:r>
+        <w:t xml:space="preserve">, 22 June 1900 (Kendrick): widow Minerva Newnam, Jan 1850, 9-6; Callie Jan 1885; Evert Nov 1886; David F. Feb 1889. [USGenNet Buck Creek 1900](https://usgennet.org/usa/ky/county/owsley/census/1900/buckcreek.html). *Transcription only.* </w:t>
+      </w:r>
+      <w:r>
+        <w:rPr>
+          <w:b/>
+        </w:rPr>
+        <w:t>C431–C435</w:t>
+      </w:r>
+      <w:r>
+        <w:t xml:space="preserve"> </w:t>
+      </w:r>
+      <w:r>
+        <w:rPr>
+          <w:b/>
+        </w:rPr>
+        <w:t>S373</w:t>
+      </w:r>
+      <w:r>
+        <w:t>. Sex “m” on the widow is a clerk error (</w:t>
+      </w:r>
+      <w:r>
+        <w:rPr>
+          <w:b/>
+        </w:rPr>
+        <w:t>C454</w:t>
+      </w:r>
+      <w:r>
+        <w:t>).</w:t>
+      </w:r>
+    </w:p>
+    <w:p>
+      <w:r>
+        <w:t xml:space="preserve">59. Lee Marriage Book 11: John NEWMAN × Cora BRANDENBURG, 20 Nov 1915; groom 34, widower, b. Owsley; parents Dan Newman &amp; Mininerva Venable. [USGenNet Book 11](https://usgennet.org/usa/ky/county/lee/marriage/marrbook11.html). *Transcription only.* </w:t>
+      </w:r>
+      <w:r>
+        <w:rPr>
+          <w:b/>
+        </w:rPr>
+        <w:t>C436</w:t>
+      </w:r>
+      <w:r>
+        <w:t xml:space="preserve"> </w:t>
+      </w:r>
+      <w:r>
+        <w:rPr>
+          <w:b/>
+        </w:rPr>
+        <w:t>C437</w:t>
+      </w:r>
+      <w:r>
+        <w:t xml:space="preserve"> </w:t>
+      </w:r>
+      <w:r>
+        <w:rPr>
+          <w:b/>
+        </w:rPr>
+        <w:t>S374</w:t>
+      </w:r>
+      <w:r>
+        <w:t>.</w:t>
+      </w:r>
+    </w:p>
+    <w:p>
+      <w:r>
+        <w:t xml:space="preserve">60. 1910 Owsley Buck Creek (Kendrick): </w:t>
+      </w:r>
+      <w:r>
+        <w:rPr>
+          <w:b/>
+        </w:rPr>
+        <w:t>134</w:t>
+      </w:r>
+      <w:r>
+        <w:t xml:space="preserve"> John 31 + Lillie; </w:t>
+      </w:r>
+      <w:r>
+        <w:rPr>
+          <w:b/>
+        </w:rPr>
+        <w:t>158</w:t>
+      </w:r>
+      <w:r>
+        <w:t xml:space="preserve"> Grant 21 + Dona (not the 1876 Grant); </w:t>
+      </w:r>
+      <w:r>
+        <w:rPr>
+          <w:b/>
+        </w:rPr>
+        <w:t>159</w:t>
+      </w:r>
+      <w:r>
+        <w:t xml:space="preserve"> Everet 23 + sis Susan; </w:t>
+      </w:r>
+      <w:r>
+        <w:rPr>
+          <w:b/>
+        </w:rPr>
+        <w:t>141</w:t>
+      </w:r>
+      <w:r>
+        <w:t xml:space="preserve"> Elizabeth + Pearl unchanged. [USGenNet buck1910](https://usgennet.org/usa/ky/county/owsley/census/1910/buck1910.html). *Transcription only.* </w:t>
+      </w:r>
+      <w:r>
+        <w:rPr>
+          <w:b/>
+        </w:rPr>
+        <w:t>C438–C441</w:t>
+      </w:r>
+      <w:r>
+        <w:t xml:space="preserve"> </w:t>
+      </w:r>
+      <w:r>
+        <w:rPr>
+          <w:b/>
+        </w:rPr>
+        <w:t>S375</w:t>
+      </w:r>
+      <w:r>
+        <w:t>.</w:t>
+      </w:r>
+    </w:p>
+    <w:p>
+      <w:r>
+        <w:t xml:space="preserve">61. Mother-name cluster Minerva / Mininerva Venable / Sarah Veneable = </w:t>
+      </w:r>
+      <w:r>
+        <w:rPr>
+          <w:b/>
+        </w:rPr>
+        <w:t>probable</w:t>
+      </w:r>
+      <w:r>
+        <w:t xml:space="preserve"> one woman; no dual-name record. Conflict </w:t>
+      </w:r>
+      <w:r>
+        <w:rPr>
+          <w:b/>
+        </w:rPr>
+        <w:t>#24</w:t>
+      </w:r>
+      <w:r>
+        <w:t xml:space="preserve">. Compiled “Sarah Minerva Venable b. 16 Jan 1850” is authored only. 1947 Sarah Newman = Damrel, rejected. [1961 deaths](https://usgennet.org/usa/ky/county/lee/deaths/1961.html) · [1947 deaths](https://usgennet.org/usa/ky/county/lee/deaths/1947.html). </w:t>
+      </w:r>
+      <w:r>
+        <w:rPr>
+          <w:b/>
+        </w:rPr>
+        <w:t>C442</w:t>
+      </w:r>
+      <w:r>
+        <w:t xml:space="preserve"> </w:t>
+      </w:r>
+      <w:r>
+        <w:rPr>
+          <w:b/>
+        </w:rPr>
+        <w:t>C443</w:t>
+      </w:r>
+      <w:r>
+        <w:t xml:space="preserve"> </w:t>
+      </w:r>
+      <w:r>
+        <w:rPr>
+          <w:b/>
+        </w:rPr>
+        <w:t>C444</w:t>
+      </w:r>
+      <w:r>
+        <w:t xml:space="preserve"> </w:t>
+      </w:r>
+      <w:r>
+        <w:rPr>
+          <w:b/>
+        </w:rPr>
+        <w:t>C456</w:t>
+      </w:r>
+      <w:r>
+        <w:t xml:space="preserve"> </w:t>
+      </w:r>
+      <w:r>
+        <w:rPr>
+          <w:b/>
+        </w:rPr>
+        <w:t>S370</w:t>
+      </w:r>
+      <w:r>
+        <w:t xml:space="preserve"> </w:t>
+      </w:r>
+      <w:r>
+        <w:rPr>
+          <w:b/>
+        </w:rPr>
+        <w:t>S379</w:t>
+      </w:r>
+      <w:r>
+        <w:t xml:space="preserve"> </w:t>
+      </w:r>
+      <w:r>
+        <w:rPr>
+          <w:b/>
+        </w:rPr>
+        <w:t>S382</w:t>
+      </w:r>
+      <w:r>
+        <w:t>.</w:t>
+      </w:r>
+    </w:p>
+    <w:p>
+      <w:r>
         <w:br w:type="page"/>
       </w:r>
     </w:p>
@@ -5481,7 +5980,7 @@
         <w:t>saved local copies</w:t>
       </w:r>
       <w:r>
-        <w:t>. Full file list: [`../SOURCE-INDEX.md`](../SOURCE-INDEX.md) and [`../sources/SOURCE-INVENTORY.tsv`](../sources/SOURCE-INVENTORY.tsv) (rebuilt after pass 65).</w:t>
+        <w:t>. Full file list: [`../SOURCE-INDEX.md`](../SOURCE-INDEX.md) and [`../sources/SOURCE-INVENTORY.tsv`](../sources/SOURCE-INVENTORY.tsv) (rebuilt after pass 66).</w:t>
       </w:r>
     </w:p>
     <w:p>
@@ -5674,6 +6173,31 @@
     <w:p>
       <w:r>
         <w:t>| S370 | `../sources/vital/lee-deaths-1961-callie-spicer-extract-2026-10-30.txt` | [1961 deaths](https://usgennet.org/usa/ky/county/lee/deaths/1961.html) | Callie Spicer d. 5 Nov 1961 | transcription only |</w:t>
+      </w:r>
+    </w:p>
+    <w:p>
+      <w:r>
+        <w:t>| S373 | `../sources/census/owsley-1900-buckcreek-minerva-extract-2026-10-30.txt` | [1900 Buck Creek](https://usgennet.org/usa/ky/county/owsley/census/1900/buckcreek.html) | Widow Minerva + Callie / Evert / David F. | transcription only |</w:t>
+      </w:r>
+    </w:p>
+    <w:p>
+      <w:r>
+        <w:t>| S374 | `../sources/marriages/lee-book11-john-cora-1915-extract-2026-10-30.txt` | [Book 11](https://usgennet.org/usa/ky/county/lee/marriage/marrbook11.html) | John × Cora 20 Nov 1915 | transcription only |</w:t>
+      </w:r>
+    </w:p>
+    <w:p>
+      <w:r>
+        <w:t>| S375 | `../sources/census/owsley-1910-buck-newman-extract-2026-10-30.txt` | [1910 Buck Creek](https://usgennet.org/usa/ky/county/owsley/census/1910/buck1910.html) | John+Lillie; Everet; Grant 21 | transcription only |</w:t>
+      </w:r>
+    </w:p>
+    <w:p>
+      <w:r>
+        <w:t>| S376 | `../sources/census/lee-1870-307b-daniel-extract-2026-10-30.txt` | [1870 307b](https://usgennet.org/usa/ky/county/lee/census/1870/307b.HTM) | Daniel 22 in Brandenburg hh | transcription only |</w:t>
+      </w:r>
+    </w:p>
+    <w:p>
+      <w:r>
+        <w:t>| S379 | `../sources/vital/lee-deaths-1947-sarah-newman-damrel-reject-2026-10-30.txt` | [1947 deaths](https://usgennet.org/usa/ky/county/lee/deaths/1947.html) | Sarah Damrel — reject vs Veneable | transcription only |</w:t>
       </w:r>
     </w:p>
     <w:p>

</xml_diff>

<commit_message>
Dora passes 67–68: 1880 house, Lillie 1915, Sarah M. Evans 1936; 1940 John+Cora
Pass 67: Buck Creek 1880 Daniel × Sarah M. + Melissa + John L.; Lillie Isaacs
d. 12 Jan 1915; Grant × Dova Cole 10 Feb 1909; Sarah M. Evans d. 15 Sep 1936.
Pass 68: 1940 ED 95-3 John Newnam 63 + Cora 47 (probable 1915 couple);
1900 Malissa Bowman possible Melissa; KDI John L. 1966 Woodford possible only.
Working Word rebuilt; authored latest.docx not overwritten. FS films still unread.

Co-authored-by: blakereaganlaw <blakereaganlaw@gmail.com>
</commit_message>
<xml_diff>
--- a/research/dora-ella-newnam/book/Dora-Ella-Newnam-Stone-A-Life.docx
+++ b/research/dora-ella-newnam/book/Dora-Ella-Newnam-Stone-A-Life.docx
@@ -2692,7 +2692,16 @@
         <w:t>probable</w:t>
       </w:r>
       <w:r>
-        <w:t xml:space="preserve"> Everett’s 1939 brother of Owsley and the 1910 Buck Creek John, thirty-one, already nine years married to Lillie, with Florence eight and Pency four. [C437] [C438] [S375] Lillie’s death and the Owsley license for that first marriage are unread. [C452] A compiled tree that makes Florence Cora’s daughter is </w:t>
+        <w:t xml:space="preserve"> Everett’s 1939 brother of Owsley and the 1910 Buck Creek John, thirty-one, already nine years married to Lillie, with Florence eight and Pency four. [C437] [C438] [S375] Lillie Newman died 12 January 1915, aged thirty years, seven months, and twenty-four days, born 18 May 1884, parents J. B. Isaacs and Sally Flanery — statewide volume 012, certificate 05734. [C460] [S387] She is </w:t>
+      </w:r>
+      <w:r>
+        <w:rPr>
+          <w:b/>
+        </w:rPr>
+        <w:t>probable</w:t>
+      </w:r>
+      <w:r>
+        <w:t xml:space="preserve"> the 1910 wife. In 1916 Gracy Newnam, four, died naming John and Lillie Isaacs; an infant Willie died the same summer naming John and Cora Bradburg. [C462] [C463] [S388] A compiled tree that makes Florence Cora’s daughter is </w:t>
       </w:r>
       <w:r>
         <w:rPr>
@@ -2701,7 +2710,7 @@
         <w:t>disproved</w:t>
       </w:r>
       <w:r>
-        <w:t>: Florence was already eight when Cora married John. [C455]</w:t>
+        <w:t>: Florence was already eight when Cora married John. [C455] A 1924 Florence Newman, forty, daughter of Hilery Fry, is a different woman. [C471]</w:t>
       </w:r>
     </w:p>
     <w:p>
@@ -2733,7 +2742,7 @@
         <w:t>Grant</w:t>
       </w:r>
       <w:r>
-        <w:t xml:space="preserve">, twenty-one, newly married to Dona. He is </w:t>
+        <w:t xml:space="preserve">, twenty-one, newly married to Dona. On 10 February 1909 that Grant, nineteen, of Owsley, father born Lee, mother born Virginia, married Dova Cole. [C464] [C465] [S386] A stillborn Clara in 1913 names the same couple and was buried at T. B. Venable’s. [C466] He is </w:t>
       </w:r>
       <w:r>
         <w:rPr>
@@ -2742,39 +2751,39 @@
         <w:t>not</w:t>
       </w:r>
       <w:r>
-        <w:t xml:space="preserve"> the 1876 Grant of Lee, who would have been about thirty-four. [C440] If that younger Grant were Everett’s brother he should appear on the 1939 survivor list unless he was already dead. He is not merged with David F.</w:t>
+        <w:t xml:space="preserve"> the 1876 Grant of Lee, who would have been about thirty-four. [C440] He is </w:t>
+      </w:r>
+      <w:r>
+        <w:rPr>
+          <w:b/>
+        </w:rPr>
+        <w:t>possible</w:t>
+      </w:r>
+      <w:r>
+        <w:t xml:space="preserve"> only as 1900 David F. — same birth year, mother born Virginia, and the 1900 six-living count leaves no extra eleven-year-old — and the names still differ. Conflict #20 and #22 stand.</w:t>
       </w:r>
     </w:p>
     <w:p>
       <w:r>
-        <w:t xml:space="preserve">Three record forms now name the mother: </w:t>
-      </w:r>
-      <w:r>
-        <w:rPr>
-          <w:b/>
-        </w:rPr>
-        <w:t>Minerva</w:t>
-      </w:r>
-      <w:r>
-        <w:t xml:space="preserve"> in 1900, </w:t>
-      </w:r>
-      <w:r>
-        <w:rPr>
-          <w:b/>
-        </w:rPr>
-        <w:t>Mininerva Venable</w:t>
-      </w:r>
-      <w:r>
-        <w:t xml:space="preserve"> in 1915, </w:t>
-      </w:r>
-      <w:r>
-        <w:rPr>
-          <w:b/>
-        </w:rPr>
-        <w:t>Sarah Veneable</w:t>
-      </w:r>
-      <w:r>
-        <w:t xml:space="preserve"> in 1961. One woman is </w:t>
+        <w:t xml:space="preserve">The 1880 house is now on the page. Buck Creek household 100/104 listed Daniel Newnam, twenty-nine, farmer, and </w:t>
+      </w:r>
+      <w:r>
+        <w:rPr>
+          <w:b/>
+        </w:rPr>
+        <w:t>Sarah M.</w:t>
+      </w:r>
+      <w:r>
+        <w:t xml:space="preserve">, twenty-eight, born Virginia of Tennessee parents, with Melissa, four, and </w:t>
+      </w:r>
+      <w:r>
+        <w:rPr>
+          <w:b/>
+        </w:rPr>
+        <w:t>John L.</w:t>
+      </w:r>
+      <w:r>
+        <w:t xml:space="preserve">, one. [C457] [S384] Joseph L. Venable and two Leroy Venable houses stand next door. [C486] That Sarah M. is </w:t>
       </w:r>
       <w:r>
         <w:rPr>
@@ -2783,7 +2792,7 @@
         <w:t>probable</w:t>
       </w:r>
       <w:r>
-        <w:t xml:space="preserve"> if the compound is Sarah Minerva. No record yet seen uses both givens. Conflict #24. A compiled page that prints “Sarah Minerva Venable, 16 January 1850” and “Daniel Boone Newman, 1847” is an authored lead only. [C442] [C443] [C456] The 1947 Lee death of Sarah Newman, daughter of John Damrel and Elizabeth Angel, is a different woman. [C444] Henry H. Newnam and a living wife Minverva in 1900 District 2 are a different couple. [C445] A twenty-two-year-old Daniel Newman, farm labourer in Debby Brandenburg’s Beattyville house on 14 July 1870, is </w:t>
+        <w:t xml:space="preserve"> the 1900 widow. On 2 January 1904 a Manerva Newman, fifty-one, third marriage, married William Evans of Lee. [C468] [S389] In 1910 the same Buck Creek page puts William Evans, fifty-nine, second marriage seven years, with wife Sarah M., sixty, born Virginia. [C468] She died Sarah M. Evans on 15 September 1936 at Lower Buffalo, aged eighty-six years and eight months, born 16 January 1850 in Lee County, Virginia, spouse William Evans, father Lee Roy Veneble, mother Ratchel McQueen, volume 051, certificate 25155. [C484] [C485] [S390] Lower Buffalo is where Callie Spicer later lived. The 1904 vital-statistics line that she was born in Owsley contradicts three censuses and the 1936 extract — conflict #25. Do not print “Sarah Minerva” as a proven dual given. A compiled page that already used 16 January 1850 is an authored lead that now has a matching extract; the Boone middle on Daniel is still unread. [C443] The 1947 Lee death of Sarah Newman, daughter of John Damrel and Elizabeth Angel, is a different woman. [C444] Henry H. Newnam and a living wife Minverva in 1900 District 2 — dead 6 August 1916 at seventy-two — are a different couple. [C445] [C480] A twenty-two-year-old Daniel Newman, farm labourer in Debby Brandenburg’s Beattyville house on 14 July 1870, is </w:t>
       </w:r>
       <w:r>
         <w:rPr>
@@ -2792,7 +2801,89 @@
         <w:t>possible</w:t>
       </w:r>
       <w:r>
-        <w:t xml:space="preserve"> only. [C446] Lee year-files 1911–1938 have no Daniel Newnam decedent, as expected if he was already dead. [C448]</w:t>
+        <w:t xml:space="preserve"> only. [C446] Lee year-files 1911–1938 have no Daniel Newnam decedent, as expected if he was already dead. [C448] A David G. Newman, seventy, of Madison, died 19 June 1958 — </w:t>
+      </w:r>
+      <w:r>
+        <w:rPr>
+          <w:b/>
+        </w:rPr>
+        <w:t>possible</w:t>
+      </w:r>
+      <w:r>
+        <w:t xml:space="preserve"> only against David F. or Frank of Berea; the middle initial is G, not F. [C473] [S391] A later funeral notice for a deceased 1950 Berea-born man names a father </w:t>
+      </w:r>
+      <w:r>
+        <w:rPr>
+          <w:b/>
+        </w:rPr>
+        <w:t>David Grant Newman Jr.</w:t>
+      </w:r>
+      <w:r>
+        <w:t xml:space="preserve"> — an authored lead toward a Grant-as-middle compound, not a 1958 certificate. Living survivors of that 2025 notice are withheld. [C496] [S396]</w:t>
+      </w:r>
+    </w:p>
+    <w:p>
+      <w:r>
+        <w:t xml:space="preserve">The 1880 son </w:t>
+      </w:r>
+      <w:r>
+        <w:rPr>
+          <w:b/>
+        </w:rPr>
+        <w:t>John L.</w:t>
+      </w:r>
+      <w:r>
+        <w:t xml:space="preserve"> is now on the 1940 Buck Creek page. At household 54 on Crane Creek and Duck Fork Road, John Newnam, sixty-three, sits with Cora, forty-seven — married more than once, married at nineteen, three children — and a son Robert, twenty-one. [C489] [S395] That is </w:t>
+      </w:r>
+      <w:r>
+        <w:rPr>
+          <w:b/>
+        </w:rPr>
+        <w:t>probable</w:t>
+      </w:r>
+      <w:r>
+        <w:t xml:space="preserve"> the 1910/1915 widower who married Cora Brandenburg, and </w:t>
+      </w:r>
+      <w:r>
+        <w:rPr>
+          <w:b/>
+        </w:rPr>
+        <w:t>probable</w:t>
+      </w:r>
+      <w:r>
+        <w:t xml:space="preserve"> the one-year-old of 1880. [C490] [C491] Owsley death extracts through 1946 have no adult John Newnam, so he died after 1946. A statewide index row for </w:t>
+      </w:r>
+      <w:r>
+        <w:rPr>
+          <w:b/>
+        </w:rPr>
+        <w:t>John L. Newman</w:t>
+      </w:r>
+      <w:r>
+        <w:t xml:space="preserve">, eighty-eight, in Woodford County on 17 July 1966 is </w:t>
+      </w:r>
+      <w:r>
+        <w:rPr>
+          <w:b/>
+        </w:rPr>
+        <w:t>possible</w:t>
+      </w:r>
+      <w:r>
+        <w:t xml:space="preserve"> only — age and middle initial match; the county does not. Conflict #26. [C492] [S396] A 1972 Johnnie Newnam, seventy-six, of Lee and Estill, is too young. [C493]</w:t>
+      </w:r>
+    </w:p>
+    <w:p>
+      <w:r>
+        <w:t xml:space="preserve">Melissa, four in 1880, is </w:t>
+      </w:r>
+      <w:r>
+        <w:rPr>
+          <w:b/>
+        </w:rPr>
+        <w:t>possible</w:t>
+      </w:r>
+      <w:r>
+        <w:t xml:space="preserve"> the Malissa who appears at Buck Creek household 290 in 1900 as wife of Chriss C. Bowman, born March 1876, mother born Virginia, with a stepson John Handy. [C487] [C488] [S394] The published Owsley marriage vital-statistics years skip 1879–1902, which is where her license and Daniel’s would sit. [C505] Do not print Bowman as proven.</w:t>
       </w:r>
     </w:p>
     <w:p>
@@ -3568,7 +3659,25 @@
         <w:t>possible</w:t>
       </w:r>
       <w:r>
-        <w:t xml:space="preserve"> only; not merged with Grant (#20) or 1928 St. Helens Frank (#22); John of Owsley now has the 1915 license (B056); Daniel × Minerva/Sarah are </w:t>
+        <w:t xml:space="preserve">; 1958 David G. Madison </w:t>
+      </w:r>
+      <w:r>
+        <w:rPr>
+          <w:b/>
+        </w:rPr>
+        <w:t>possible</w:t>
+      </w:r>
+      <w:r>
+        <w:t xml:space="preserve"> only (</w:t>
+      </w:r>
+      <w:r>
+        <w:rPr>
+          <w:b/>
+        </w:rPr>
+        <w:t>C473</w:t>
+      </w:r>
+      <w:r>
+        <w:t xml:space="preserve">); not merged with Grant (#20) or 1928 St. Helens Frank (#22); John of Owsley now chained through Lillie Isaacs (B056); Daniel × Sarah M./Minerva are </w:t>
       </w:r>
       <w:r>
         <w:rPr>
@@ -3583,7 +3692,7 @@
         <w:rPr>
           <w:b/>
         </w:rPr>
-        <w:t>C456</w:t>
+        <w:t>C456/C485</w:t>
       </w:r>
       <w:r>
         <w:t xml:space="preserve">, </w:t>
@@ -3595,7 +3704,34 @@
         <w:t>#24</w:t>
       </w:r>
       <w:r>
-        <w:t xml:space="preserve">); 1880 house unread (B076); John × Lillie unread (B073/B074); 1910 Grant 21 unread (B075); William × Katherine license (B064); two William lines (B071); Herman Estes of Brasstown (B067); Frankie Jones / Mary Peters (B068); Carter Cove stone photographs (B054). </w:t>
+        <w:t xml:space="preserve">); Daniel’s license unread (B079); Melissa ~1876 unread (B078); Grant 21 vs David F. unread (B081); William × Katherine license (B064); two William lines (B071); Herman Estes of Brasstown (B067); Frankie Jones / Mary Peters (B068); Carter Cove stone photographs (B054). </w:t>
+      </w:r>
+      <w:r>
+        <w:rPr>
+          <w:b/>
+        </w:rPr>
+        <w:t>Closed this pass:</w:t>
+      </w:r>
+      <w:r>
+        <w:t xml:space="preserve"> 1880 Daniel house; Lillie </w:t>
+      </w:r>
+      <w:r>
+        <w:rPr>
+          <w:b/>
+        </w:rPr>
+        <w:t>12 Jan 1915</w:t>
+      </w:r>
+      <w:r>
+        <w:t xml:space="preserve">; Sarah M. Evans </w:t>
+      </w:r>
+      <w:r>
+        <w:rPr>
+          <w:b/>
+        </w:rPr>
+        <w:t>15 Sep 1936</w:t>
+      </w:r>
+      <w:r>
+        <w:t xml:space="preserve">. </w:t>
       </w:r>
       <w:r>
         <w:rPr>
@@ -3657,7 +3793,7 @@
         <w:t>closed</w:t>
       </w:r>
       <w:r>
-        <w:t>. Do not reopen Peebles as a third marriage without a license. Do not print 1868 or 24 February 1906 as facts. Do not print Grant as dead in 1951–1955.</w:t>
+        <w:t>. Do not reopen Peebles as a third marriage without a license. Do not print 1868 or 24 February 1906 as facts. Do not print Grant as dead in 1951–1955. Do not print “Sarah Minerva” as a proven dual given.</w:t>
       </w:r>
     </w:p>
     <w:p>
@@ -3713,7 +3849,7 @@
         <w:rPr>
           <w:b/>
         </w:rPr>
-        <w:t>B076</w:t>
+        <w:t>B080</w:t>
       </w:r>
       <w:r>
         <w:t xml:space="preserve">, </w:t>
@@ -3722,7 +3858,7 @@
         <w:rPr>
           <w:b/>
         </w:rPr>
-        <w:t>B055</w:t>
+        <w:t>B079</w:t>
       </w:r>
       <w:r>
         <w:t xml:space="preserve">, </w:t>
@@ -3731,7 +3867,7 @@
         <w:rPr>
           <w:b/>
         </w:rPr>
-        <w:t>B073/B074</w:t>
+        <w:t>B055/B081</w:t>
       </w:r>
       <w:r>
         <w:t xml:space="preserve">, </w:t>
@@ -5872,7 +6008,7 @@
     </w:p>
     <w:p>
       <w:r>
-        <w:t xml:space="preserve">61. Mother-name cluster Minerva / Mininerva Venable / Sarah Veneable = </w:t>
+        <w:t xml:space="preserve">61. Mother-name cluster Minerva / Mininerva Venable / Sarah Veneable / Sarah M. = </w:t>
       </w:r>
       <w:r>
         <w:rPr>
@@ -5881,7 +6017,7 @@
         <w:t>probable</w:t>
       </w:r>
       <w:r>
-        <w:t xml:space="preserve"> one woman; no dual-name record. Conflict </w:t>
+        <w:t xml:space="preserve"> one woman; no dual-name original. Conflict </w:t>
       </w:r>
       <w:r>
         <w:rPr>
@@ -5890,7 +6026,7 @@
         <w:t>#24</w:t>
       </w:r>
       <w:r>
-        <w:t xml:space="preserve">. Compiled “Sarah Minerva Venable b. 16 Jan 1850” is authored only. 1947 Sarah Newman = Damrel, rejected. [1961 deaths](https://usgennet.org/usa/ky/county/lee/deaths/1961.html) · [1947 deaths](https://usgennet.org/usa/ky/county/lee/deaths/1947.html). </w:t>
+        <w:t xml:space="preserve">. 1947 Sarah Newman = Damrel, rejected. [1961 deaths](https://usgennet.org/usa/ky/county/lee/deaths/1961.html) · [1947 deaths](https://usgennet.org/usa/ky/county/lee/deaths/1947.html). </w:t>
       </w:r>
       <w:r>
         <w:rPr>
@@ -5951,6 +6087,410 @@
           <w:b/>
         </w:rPr>
         <w:t>S382</w:t>
+      </w:r>
+      <w:r>
+        <w:t>.</w:t>
+      </w:r>
+    </w:p>
+    <w:p>
+      <w:r>
+        <w:t xml:space="preserve">62. 1880 U.S. census, Owsley Buck Creek hh </w:t>
+      </w:r>
+      <w:r>
+        <w:rPr>
+          <w:b/>
+        </w:rPr>
+        <w:t>100/104</w:t>
+      </w:r>
+      <w:r>
+        <w:t xml:space="preserve">: Daniel Newnam 29 + Sarah M. 28 VATNTN + Melissa 4 + John L. 1. [USGenNet 1880 Buck Creek](https://usgennet.org/usa/ky/county/owsley/census/1880/buckcreek.html). *Transcription only.* </w:t>
+      </w:r>
+      <w:r>
+        <w:rPr>
+          <w:b/>
+        </w:rPr>
+        <w:t>C457–C459</w:t>
+      </w:r>
+      <w:r>
+        <w:t xml:space="preserve"> </w:t>
+      </w:r>
+      <w:r>
+        <w:rPr>
+          <w:b/>
+        </w:rPr>
+        <w:t>S384</w:t>
+      </w:r>
+      <w:r>
+        <w:t>.</w:t>
+      </w:r>
+    </w:p>
+    <w:p>
+      <w:r>
+        <w:t xml:space="preserve">63. Owsley 1915 DC + KDI: Lillie Newman d. </w:t>
+      </w:r>
+      <w:r>
+        <w:rPr>
+          <w:b/>
+        </w:rPr>
+        <w:t>12 Jan 1915</w:t>
+      </w:r>
+      <w:r>
+        <w:t xml:space="preserve">, b. </w:t>
+      </w:r>
+      <w:r>
+        <w:rPr>
+          <w:b/>
+        </w:rPr>
+        <w:t>18 May 1884</w:t>
+      </w:r>
+      <w:r>
+        <w:t xml:space="preserve">, parents J. B. Isaacs × Sally Flanery, vol. </w:t>
+      </w:r>
+      <w:r>
+        <w:rPr>
+          <w:b/>
+        </w:rPr>
+        <w:t>012</w:t>
+      </w:r>
+      <w:r>
+        <w:t xml:space="preserve"> cert. </w:t>
+      </w:r>
+      <w:r>
+        <w:rPr>
+          <w:b/>
+        </w:rPr>
+        <w:t>05734</w:t>
+      </w:r>
+      <w:r>
+        <w:t xml:space="preserve">. [1915dc](https://usgennet.org/usa/ky/county/owsley/deaths/1915dc.html). *Transcription only.* </w:t>
+      </w:r>
+      <w:r>
+        <w:rPr>
+          <w:b/>
+        </w:rPr>
+        <w:t>C460</w:t>
+      </w:r>
+      <w:r>
+        <w:t xml:space="preserve"> </w:t>
+      </w:r>
+      <w:r>
+        <w:rPr>
+          <w:b/>
+        </w:rPr>
+        <w:t>S387</w:t>
+      </w:r>
+      <w:r>
+        <w:t xml:space="preserve">. 1916 Gracy / Willie: [1916dc](https://usgennet.org/usa/ky/county/owsley/deaths/1916dc.html). </w:t>
+      </w:r>
+      <w:r>
+        <w:rPr>
+          <w:b/>
+        </w:rPr>
+        <w:t>C462</w:t>
+      </w:r>
+      <w:r>
+        <w:t xml:space="preserve"> </w:t>
+      </w:r>
+      <w:r>
+        <w:rPr>
+          <w:b/>
+        </w:rPr>
+        <w:t>C463</w:t>
+      </w:r>
+      <w:r>
+        <w:t xml:space="preserve"> </w:t>
+      </w:r>
+      <w:r>
+        <w:rPr>
+          <w:b/>
+        </w:rPr>
+        <w:t>S388</w:t>
+      </w:r>
+      <w:r>
+        <w:t>.</w:t>
+      </w:r>
+    </w:p>
+    <w:p>
+      <w:r>
+        <w:t xml:space="preserve">64. Owsley 1909 VS: Grant Newnam 19 × Dova Cole 21, 10 Feb 1909, mother b. VA. [1909a](https://usgennet.org/usa/ky/county/owsley/marriages/1909a.html). *Transcription only.* </w:t>
+      </w:r>
+      <w:r>
+        <w:rPr>
+          <w:b/>
+        </w:rPr>
+        <w:t>C464</w:t>
+      </w:r>
+      <w:r>
+        <w:t xml:space="preserve"> </w:t>
+      </w:r>
+      <w:r>
+        <w:rPr>
+          <w:b/>
+        </w:rPr>
+        <w:t>S386</w:t>
+      </w:r>
+      <w:r>
+        <w:t>.</w:t>
+      </w:r>
+    </w:p>
+    <w:p>
+      <w:r>
+        <w:t xml:space="preserve">65. Lee 1936: Sarah M. Evans, 86y 8m, b. </w:t>
+      </w:r>
+      <w:r>
+        <w:rPr>
+          <w:b/>
+        </w:rPr>
+        <w:t>16 Jan 1850</w:t>
+      </w:r>
+      <w:r>
+        <w:t xml:space="preserve"> Lee Co. VA, d. </w:t>
+      </w:r>
+      <w:r>
+        <w:rPr>
+          <w:b/>
+        </w:rPr>
+        <w:t>15 Sep 1936</w:t>
+      </w:r>
+      <w:r>
+        <w:t xml:space="preserve"> Lower Buffalo; spouse William Evans; father Lee Roy Veneble; mother Ratchel McQueen. [1936 deaths](https://usgennet.org/usa/ky/county/lee/deaths/1936.html). KDI vol. </w:t>
+      </w:r>
+      <w:r>
+        <w:rPr>
+          <w:b/>
+        </w:rPr>
+        <w:t>051</w:t>
+      </w:r>
+      <w:r>
+        <w:t xml:space="preserve"> cert. </w:t>
+      </w:r>
+      <w:r>
+        <w:rPr>
+          <w:b/>
+        </w:rPr>
+        <w:t>25155</w:t>
+      </w:r>
+      <w:r>
+        <w:t xml:space="preserve">. *Transcription only.* </w:t>
+      </w:r>
+      <w:r>
+        <w:rPr>
+          <w:b/>
+        </w:rPr>
+        <w:t>C484</w:t>
+      </w:r>
+      <w:r>
+        <w:t xml:space="preserve"> </w:t>
+      </w:r>
+      <w:r>
+        <w:rPr>
+          <w:b/>
+        </w:rPr>
+        <w:t>C485</w:t>
+      </w:r>
+      <w:r>
+        <w:t xml:space="preserve"> </w:t>
+      </w:r>
+      <w:r>
+        <w:rPr>
+          <w:b/>
+        </w:rPr>
+        <w:t>S390</w:t>
+      </w:r>
+      <w:r>
+        <w:t xml:space="preserve">. Conflict </w:t>
+      </w:r>
+      <w:r>
+        <w:rPr>
+          <w:b/>
+        </w:rPr>
+        <w:t>#24</w:t>
+      </w:r>
+      <w:r>
+        <w:t xml:space="preserve"> </w:t>
+      </w:r>
+      <w:r>
+        <w:rPr>
+          <w:b/>
+        </w:rPr>
+        <w:t>#25</w:t>
+      </w:r>
+      <w:r>
+        <w:t>.</w:t>
+      </w:r>
+    </w:p>
+    <w:p>
+      <w:r>
+        <w:t xml:space="preserve">66. 1940 U.S. census, Owsley ED </w:t>
+      </w:r>
+      <w:r>
+        <w:rPr>
+          <w:b/>
+        </w:rPr>
+        <w:t>95-3</w:t>
+      </w:r>
+      <w:r>
+        <w:t xml:space="preserve"> hh </w:t>
+      </w:r>
+      <w:r>
+        <w:rPr>
+          <w:b/>
+        </w:rPr>
+        <w:t>54</w:t>
+      </w:r>
+      <w:r>
+        <w:t xml:space="preserve">: John Newnam 63 + Cora 47 + Robert 21. [USGenNet 95-3](https://usgennet.org/usa/ky/county/owsley/census/1940/95-3.html). *Transcription only.* </w:t>
+      </w:r>
+      <w:r>
+        <w:rPr>
+          <w:b/>
+        </w:rPr>
+        <w:t>C489–C491</w:t>
+      </w:r>
+      <w:r>
+        <w:t xml:space="preserve"> </w:t>
+      </w:r>
+      <w:r>
+        <w:rPr>
+          <w:b/>
+        </w:rPr>
+        <w:t>S395</w:t>
+      </w:r>
+      <w:r>
+        <w:t>.</w:t>
+      </w:r>
+    </w:p>
+    <w:p>
+      <w:r>
+        <w:t xml:space="preserve">67. 1900 Owsley Buck Creek hh </w:t>
+      </w:r>
+      <w:r>
+        <w:rPr>
+          <w:b/>
+        </w:rPr>
+        <w:t>290/292</w:t>
+      </w:r>
+      <w:r>
+        <w:t xml:space="preserve">: Malissa Bowman wife </w:t>
+      </w:r>
+      <w:r>
+        <w:rPr>
+          <w:b/>
+        </w:rPr>
+        <w:t>3/1876</w:t>
+      </w:r>
+      <w:r>
+        <w:t xml:space="preserve"> KYKYVA. [1900 Buck Creek](https://usgennet.org/usa/ky/county/owsley/census/1900/buckcreek.html). *Transcription only.* </w:t>
+      </w:r>
+      <w:r>
+        <w:rPr>
+          <w:b/>
+        </w:rPr>
+        <w:t>C487</w:t>
+      </w:r>
+      <w:r>
+        <w:t xml:space="preserve"> </w:t>
+      </w:r>
+      <w:r>
+        <w:rPr>
+          <w:b/>
+        </w:rPr>
+        <w:t>C488</w:t>
+      </w:r>
+      <w:r>
+        <w:t xml:space="preserve"> </w:t>
+      </w:r>
+      <w:r>
+        <w:rPr>
+          <w:b/>
+        </w:rPr>
+        <w:t>S394</w:t>
+      </w:r>
+      <w:r>
+        <w:t>.</w:t>
+      </w:r>
+    </w:p>
+    <w:p>
+      <w:r>
+        <w:t xml:space="preserve">68. RTR KDI: </w:t>
+      </w:r>
+      <w:r>
+        <w:rPr>
+          <w:b/>
+        </w:rPr>
+        <w:t>JOHN L</w:t>
+      </w:r>
+      <w:r>
+        <w:t xml:space="preserve"> 88 Woodford </w:t>
+      </w:r>
+      <w:r>
+        <w:rPr>
+          <w:b/>
+        </w:rPr>
+        <w:t>17 Jul 1966</w:t>
+      </w:r>
+      <w:r>
+        <w:t xml:space="preserve"> vol. </w:t>
+      </w:r>
+      <w:r>
+        <w:rPr>
+          <w:b/>
+        </w:rPr>
+        <w:t>036</w:t>
+      </w:r>
+      <w:r>
+        <w:t xml:space="preserve"> cert. </w:t>
+      </w:r>
+      <w:r>
+        <w:rPr>
+          <w:b/>
+        </w:rPr>
+        <w:t>17762</w:t>
+      </w:r>
+      <w:r>
+        <w:t xml:space="preserve"> — </w:t>
+      </w:r>
+      <w:r>
+        <w:rPr>
+          <w:b/>
+        </w:rPr>
+        <w:t>possible</w:t>
+      </w:r>
+      <w:r>
+        <w:t xml:space="preserve"> only. </w:t>
+      </w:r>
+      <w:r>
+        <w:rPr>
+          <w:b/>
+        </w:rPr>
+        <w:t>CORA P</w:t>
+      </w:r>
+      <w:r>
+        <w:t xml:space="preserve"> 1981 = Plummer. [IA RTR KDI](https://archive.org/details/reclaim-the-records-kentucky-death-index-01911-1989). *Index only.* </w:t>
+      </w:r>
+      <w:r>
+        <w:rPr>
+          <w:b/>
+        </w:rPr>
+        <w:t>C492–C495</w:t>
+      </w:r>
+      <w:r>
+        <w:t xml:space="preserve"> </w:t>
+      </w:r>
+      <w:r>
+        <w:rPr>
+          <w:b/>
+        </w:rPr>
+        <w:t>S396</w:t>
+      </w:r>
+      <w:r>
+        <w:t xml:space="preserve">. Conflict </w:t>
+      </w:r>
+      <w:r>
+        <w:rPr>
+          <w:b/>
+        </w:rPr>
+        <w:t>#26</w:t>
       </w:r>
       <w:r>
         <w:t>.</w:t>
@@ -5980,7 +6520,7 @@
         <w:t>saved local copies</w:t>
       </w:r>
       <w:r>
-        <w:t>. Full file list: [`../SOURCE-INDEX.md`](../SOURCE-INDEX.md) and [`../sources/SOURCE-INVENTORY.tsv`](../sources/SOURCE-INVENTORY.tsv) (rebuilt after pass 66).</w:t>
+        <w:t>. Full file list: [`../SOURCE-INDEX.md`](../SOURCE-INDEX.md) and [`../sources/SOURCE-INVENTORY.tsv`](../sources/SOURCE-INVENTORY.tsv) (rebuilt after pass 67).</w:t>
       </w:r>
     </w:p>
     <w:p>
@@ -6198,6 +6738,41 @@
     <w:p>
       <w:r>
         <w:t>| S379 | `../sources/vital/lee-deaths-1947-sarah-newman-damrel-reject-2026-10-30.txt` | [1947 deaths](https://usgennet.org/usa/ky/county/lee/deaths/1947.html) | Sarah Damrel — reject vs Veneable | transcription only |</w:t>
+      </w:r>
+    </w:p>
+    <w:p>
+      <w:r>
+        <w:t>| S384 | `../sources/census/owsley-1880-buckcreek-daniel-extract-2026-10-30.txt` | [1880 Buck Creek](https://usgennet.org/usa/ky/county/owsley/census/1880/buckcreek.html) | Daniel + Sarah M. + Melissa + John L. | transcription only |</w:t>
+      </w:r>
+    </w:p>
+    <w:p>
+      <w:r>
+        <w:t>| S387 | `../sources/vital/owsley-1915-lillie-newman-extract-2026-10-30.txt` | [1915dc](https://usgennet.org/usa/ky/county/owsley/deaths/1915dc.html) | Lillie Newman d. 12 Jan 1915 | transcription only |</w:t>
+      </w:r>
+    </w:p>
+    <w:p>
+      <w:r>
+        <w:t>| S386 | `../sources/marriages/owsley-1909-grant-dova-extract-2026-10-30.txt` | [1909a](https://usgennet.org/usa/ky/county/owsley/marriages/1909a.html) | Grant × Dova Cole 10 Feb 1909 | transcription only |</w:t>
+      </w:r>
+    </w:p>
+    <w:p>
+      <w:r>
+        <w:t>| S390 | `../sources/vital/lee-deaths-1936-sarah-m-evans-extract-2026-10-30.txt` | [1936 deaths](https://usgennet.org/usa/ky/county/lee/deaths/1936.html) | Sarah M. Evans d. 15 Sep 1936 | transcription only |</w:t>
+      </w:r>
+    </w:p>
+    <w:p>
+      <w:r>
+        <w:t>| S394 | `../sources/census/owsley-1900-buckcreek-malissa-bowman-extract-2026-10-30.txt` | [1900 Buck Creek](https://usgennet.org/usa/ky/county/owsley/census/1900/buckcreek.html) | Malissa Bowman 3/1876 KYKYVA | transcription only |</w:t>
+      </w:r>
+    </w:p>
+    <w:p>
+      <w:r>
+        <w:t>| S395 | `../sources/census/owsley-1940-95-3-john-cora-extract-2026-10-30.txt` | [1940 ED 95-3](https://usgennet.org/usa/ky/county/owsley/census/1940/95-3.html) | John 63 + Cora 47 + Robert 21 | transcription only |</w:t>
+      </w:r>
+    </w:p>
+    <w:p>
+      <w:r>
+        <w:t>| S396 | `../sources/vital/rtr-kdi-pass68-john-cora-david-extract-2026-10-30.txt` | [IA RTR KDI](https://archive.org/details/reclaim-the-records-kentucky-death-index-01911-1989) | John L 1966; Cora P 1981; Cora B 1988 | index only |</w:t>
       </w:r>
     </w:p>
     <w:p>

</xml_diff>

<commit_message>
Pass 67: Wayne ED 9 complete; George A Conrad is FAN, not Jesse.
Every 1900 Bollinger Wayne Township sheet read. The only Conrad head is
George A, 29, with Mary L and infant Ethel C on ED 9 sheet 6 B — not
Jesse, and no Letha. Craff ended the township on sheet 23 B. Residual
B007 is now ED 1–3 on T623-839. Plates 88–90.

Co-authored-by: blakereaganlaw <blakereaganlaw@gmail.com>
</commit_message>
<xml_diff>
--- a/research/dora-ella-newnam/book/Dora-Ella-Newnam-Stone-A-Life.docx
+++ b/research/dora-ella-newnam/book/Dora-Ella-Newnam-Stone-A-Life.docx
@@ -1974,6 +1974,87 @@
       </w:r>
       <w:r>
         <w:t xml:space="preserve">). </w:t>
+      </w:r>
+      <w:r>
+        <w:rPr>
+          <w:b/>
+        </w:rPr>
+        <w:t>Union ED 8</w:t>
+      </w:r>
+      <w:r>
+        <w:t xml:space="preserve"> is now complete — </w:t>
+      </w:r>
+      <w:r>
+        <w:rPr>
+          <w:b/>
+        </w:rPr>
+        <w:t>David Conrad</w:t>
+      </w:r>
+      <w:r>
+        <w:t>, 29, with Miranda and Asa on sheet 3 B, is FAN, not Jesse (</w:t>
+      </w:r>
+      <w:r>
+        <w:rPr>
+          <w:b/>
+        </w:rPr>
+        <w:t>C347</w:t>
+      </w:r>
+      <w:r>
+        <w:t xml:space="preserve">, </w:t>
+      </w:r>
+      <w:r>
+        <w:rPr>
+          <w:b/>
+        </w:rPr>
+        <w:t>C348</w:t>
+      </w:r>
+      <w:r>
+        <w:t xml:space="preserve">). </w:t>
+      </w:r>
+      <w:r>
+        <w:rPr>
+          <w:b/>
+        </w:rPr>
+        <w:t>Wayne ED 9</w:t>
+      </w:r>
+      <w:r>
+        <w:t xml:space="preserve"> is now complete — </w:t>
+      </w:r>
+      <w:r>
+        <w:rPr>
+          <w:b/>
+        </w:rPr>
+        <w:t>George A Conrad</w:t>
+      </w:r>
+      <w:r>
+        <w:t>, 29, with Mary L and infant Ethel C on sheet 6 B, is FAN, not Jesse (</w:t>
+      </w:r>
+      <w:r>
+        <w:rPr>
+          <w:b/>
+        </w:rPr>
+        <w:t>C349</w:t>
+      </w:r>
+      <w:r>
+        <w:t xml:space="preserve">, </w:t>
+      </w:r>
+      <w:r>
+        <w:rPr>
+          <w:b/>
+        </w:rPr>
+        <w:t>C350</w:t>
+      </w:r>
+      <w:r>
+        <w:t xml:space="preserve">). The remaining 1900 Bollinger residual is ED </w:t>
+      </w:r>
+      <w:r>
+        <w:rPr>
+          <w:b/>
+        </w:rPr>
+        <w:t>1–3</w:t>
+      </w:r>
+      <w:r>
+        <w:t xml:space="preserve"> on T623-839. </w:t>
       </w:r>
       <w:r>
         <w:rPr>

</xml_diff>

<commit_message>
Dora pass 69: 1950 Clarence not John; Dewey reject; TFKRHA nil
1950 Owsley ED 95-3 Newman household is Clarence+Mae, not John+Cora.
Madison Dewey 26 rejected vs David F./Frank. TFKRHA 1843–80 list nil
for Daniel×Sarah. John Wesley 6 Jun 1966 rejected vs John L 17 Jul 1966.

Co-authored-by: blakereaganlaw <blakereaganlaw@gmail.com>
</commit_message>
<xml_diff>
--- a/research/dora-ella-newnam/book/Dora-Ella-Newnam-Stone-A-Life.docx
+++ b/research/dora-ella-newnam/book/Dora-Ella-Newnam-Stone-A-Life.docx
@@ -2851,7 +2851,25 @@
         <w:t>probable</w:t>
       </w:r>
       <w:r>
-        <w:t xml:space="preserve"> the one-year-old of 1880. [C490] [C491] Owsley death extracts through 1946 have no adult John Newnam, so he died after 1946. A statewide index row for </w:t>
+        <w:t xml:space="preserve"> the one-year-old of 1880. [C490] [C491] Owsley death extracts through 1946 have no adult John Newnam, so he died after 1946. In April 1950 the same enumeration district — Owsley 95-3, Magisterial District 1, enumerator Preston W. Mainous — still has a Newman household, but it is </w:t>
+      </w:r>
+      <w:r>
+        <w:rPr>
+          <w:b/>
+        </w:rPr>
+        <w:t>Clarence</w:t>
+      </w:r>
+      <w:r>
+        <w:t xml:space="preserve"> and </w:t>
+      </w:r>
+      <w:r>
+        <w:rPr>
+          <w:b/>
+        </w:rPr>
+        <w:t>Mae</w:t>
+      </w:r>
+      <w:r>
+        <w:t xml:space="preserve">, the 1940 neighbours, not John and Cora. [C512] [S399] The county name index has no Newnam. They had left that page, or the clerk missed them. A statewide index row for </w:t>
       </w:r>
       <w:r>
         <w:rPr>
@@ -2869,7 +2887,62 @@
         <w:t>possible</w:t>
       </w:r>
       <w:r>
-        <w:t xml:space="preserve"> only — age and middle initial match; the county does not. Conflict #26. [C492] [S396] A 1972 Johnnie Newnam, seventy-six, of Lee and Estill, is too young. [C493]</w:t>
+        <w:t xml:space="preserve"> only — age and middle initial match; the county does not. Conflict #26. [C492] [S396] A John Wesley Newman who died 6 June 1966 at sixty-nine in Virginia is a different man. [C509] A 1972 Johnnie Newnam, seventy-six, of Lee and Estill, is too young. [C493]</w:t>
+      </w:r>
+    </w:p>
+    <w:p>
+      <w:r>
+        <w:t>The reconstructed Owsley marriage list that J. W. F. Williams saved after the courthouse fire names Harry H. Newnam in 1864 and a Venable bride in 1880. It does not name Daniel and Sarah. [C508] [S401] The published vital-statistics years still skip 1879–1902. [C505]</w:t>
+      </w:r>
+    </w:p>
+    <w:p>
+      <w:r>
+        <w:t xml:space="preserve">In Madison County in 1950 a </w:t>
+      </w:r>
+      <w:r>
+        <w:rPr>
+          <w:b/>
+        </w:rPr>
+        <w:t>Dewey</w:t>
+      </w:r>
+      <w:r>
+        <w:t xml:space="preserve"> Newman, twenty-six, is not David F. or Frank of Berea. [C522] </w:t>
+      </w:r>
+      <w:r>
+        <w:rPr>
+          <w:b/>
+        </w:rPr>
+        <w:t>Shelly</w:t>
+      </w:r>
+      <w:r>
+        <w:t xml:space="preserve"> Newman, fifty-seven, and </w:t>
+      </w:r>
+      <w:r>
+        <w:rPr>
+          <w:b/>
+        </w:rPr>
+        <w:t>Grace</w:t>
+      </w:r>
+      <w:r>
+        <w:t xml:space="preserve">, fifty-one, of Richmond are </w:t>
+      </w:r>
+      <w:r>
+        <w:rPr>
+          <w:b/>
+        </w:rPr>
+        <w:t>probable</w:t>
+      </w:r>
+      <w:r>
+        <w:t xml:space="preserve"> Shelby and Grace Brandenburg. [C523] They are not the contractor. A 1958 David G. Newman, seventy, of Madison remains </w:t>
+      </w:r>
+      <w:r>
+        <w:rPr>
+          <w:b/>
+        </w:rPr>
+        <w:t>possible</w:t>
+      </w:r>
+      <w:r>
+        <w:t xml:space="preserve"> only. [C473]</w:t>
       </w:r>
     </w:p>
     <w:p>
@@ -3677,7 +3750,52 @@
         <w:t>C473</w:t>
       </w:r>
       <w:r>
-        <w:t xml:space="preserve">); not merged with Grant (#20) or 1928 St. Helens Frank (#22); John of Owsley now chained through Lillie Isaacs (B056); Daniel × Sarah M./Minerva are </w:t>
+        <w:t xml:space="preserve">); 1950 Dewey 26 </w:t>
+      </w:r>
+      <w:r>
+        <w:rPr>
+          <w:b/>
+        </w:rPr>
+        <w:t>rejected</w:t>
+      </w:r>
+      <w:r>
+        <w:t xml:space="preserve"> (</w:t>
+      </w:r>
+      <w:r>
+        <w:rPr>
+          <w:b/>
+        </w:rPr>
+        <w:t>C522</w:t>
+      </w:r>
+      <w:r>
+        <w:t>); not merged with Grant (#20) or 1928 St. Helens Frank (#22); John of Owsley chained through 1940 (</w:t>
+      </w:r>
+      <w:r>
+        <w:rPr>
+          <w:b/>
+        </w:rPr>
+        <w:t>C490</w:t>
+      </w:r>
+      <w:r>
+        <w:t xml:space="preserve">) and </w:t>
+      </w:r>
+      <w:r>
+        <w:rPr>
+          <w:b/>
+        </w:rPr>
+        <w:t>absent</w:t>
+      </w:r>
+      <w:r>
+        <w:t xml:space="preserve"> from the 1950 ED 95-3 Newman hit (</w:t>
+      </w:r>
+      <w:r>
+        <w:rPr>
+          <w:b/>
+        </w:rPr>
+        <w:t>C512</w:t>
+      </w:r>
+      <w:r>
+        <w:t xml:space="preserve">); Daniel × Sarah M./Minerva are </w:t>
       </w:r>
       <w:r>
         <w:rPr>
@@ -3704,13 +3822,31 @@
         <w:t>#24</w:t>
       </w:r>
       <w:r>
-        <w:t xml:space="preserve">); Daniel’s license unread (B079); Melissa ~1876 unread (B078); Grant 21 vs David F. unread (B081); William × Katherine license (B064); two William lines (B071); Herman Estes of Brasstown (B067); Frankie Jones / Mary Peters (B068); Carter Cove stone photographs (B054). </w:t>
-      </w:r>
-      <w:r>
-        <w:rPr>
-          <w:b/>
-        </w:rPr>
-        <w:t>Closed this pass:</w:t>
+        <w:t xml:space="preserve">); Daniel’s license still unread after TFKRHA 1843–80 </w:t>
+      </w:r>
+      <w:r>
+        <w:rPr>
+          <w:b/>
+        </w:rPr>
+        <w:t>nil</w:t>
+      </w:r>
+      <w:r>
+        <w:t xml:space="preserve"> (B079); Melissa ~1876 unread (B078); Grant 21 vs David F. unread (B081); William × Katherine license (B064); two William lines (B071); Herman Estes of Brasstown (B067); Frankie Jones / Mary Peters (B068); Carter Cove stone photographs (B054). </w:t>
+      </w:r>
+      <w:r>
+        <w:rPr>
+          <w:b/>
+        </w:rPr>
+        <w:t>Advanced this pass:</w:t>
+      </w:r>
+      <w:r>
+        <w:t xml:space="preserve"> 1950 Clarence; Dewey reject; Shelby+Grace 1950; John Wesley reject; TFKRHA nil. </w:t>
+      </w:r>
+      <w:r>
+        <w:rPr>
+          <w:b/>
+        </w:rPr>
+        <w:t>Closed earlier:</w:t>
       </w:r>
       <w:r>
         <w:t xml:space="preserve"> 1880 Daniel house; Lillie </w:t>
@@ -3731,16 +3867,7 @@
         <w:t>15 Sep 1936</w:t>
       </w:r>
       <w:r>
-        <w:t xml:space="preserve">. </w:t>
-      </w:r>
-      <w:r>
-        <w:rPr>
-          <w:b/>
-        </w:rPr>
-        <w:t>Closed earlier:</w:t>
-      </w:r>
-      <w:r>
-        <w:t xml:space="preserve"> Grant </w:t>
+        <w:t xml:space="preserve">; Grant </w:t>
       </w:r>
       <w:r>
         <w:rPr>
@@ -3793,7 +3920,7 @@
         <w:t>closed</w:t>
       </w:r>
       <w:r>
-        <w:t>. Do not reopen Peebles as a third marriage without a license. Do not print 1868 or 24 February 1906 as facts. Do not print Grant as dead in 1951–1955. Do not print “Sarah Minerva” as a proven dual given.</w:t>
+        <w:t>. Do not reopen Peebles as a third marriage without a license. Do not print 1868 or 24 February 1906 as facts. Do not print Grant as dead in 1951–1955. Do not print “Sarah Minerva” as a proven dual given. Do not print 1966 as John’s death.</w:t>
       </w:r>
     </w:p>
     <w:p>
@@ -3841,6 +3968,24 @@
           <w:b/>
         </w:rPr>
         <w:t>B069/B047</w:t>
+      </w:r>
+      <w:r>
+        <w:t xml:space="preserve">, </w:t>
+      </w:r>
+      <w:r>
+        <w:rPr>
+          <w:b/>
+        </w:rPr>
+        <w:t>B082</w:t>
+      </w:r>
+      <w:r>
+        <w:t xml:space="preserve"> Duell-Clark / cert </w:t>
+      </w:r>
+      <w:r>
+        <w:rPr>
+          <w:b/>
+        </w:rPr>
+        <w:t>17762</w:t>
       </w:r>
       <w:r>
         <w:t xml:space="preserve">, </w:t>
@@ -6498,6 +6643,115 @@
     </w:p>
     <w:p>
       <w:r>
+        <w:t xml:space="preserve">69. 1950 U.S. census, Owsley ED </w:t>
+      </w:r>
+      <w:r>
+        <w:rPr>
+          <w:b/>
+        </w:rPr>
+        <w:t>95-3</w:t>
+      </w:r>
+      <w:r>
+        <w:t xml:space="preserve"> (NARA T628-3538): enumerator Preston W. Mainous, M.D. 1. Sheet </w:t>
+      </w:r>
+      <w:r>
+        <w:rPr>
+          <w:b/>
+        </w:rPr>
+        <w:t>0023</w:t>
+      </w:r>
+      <w:r>
+        <w:t xml:space="preserve"> Newman household is Clarence + Mae, not John+Cora. [1950census.archives.gov](https://1950census.archives.gov/). *Image seen.* </w:t>
+      </w:r>
+      <w:r>
+        <w:rPr>
+          <w:b/>
+        </w:rPr>
+        <w:t>C512</w:t>
+      </w:r>
+      <w:r>
+        <w:t xml:space="preserve"> </w:t>
+      </w:r>
+      <w:r>
+        <w:rPr>
+          <w:b/>
+        </w:rPr>
+        <w:t>C513</w:t>
+      </w:r>
+      <w:r>
+        <w:t xml:space="preserve"> </w:t>
+      </w:r>
+      <w:r>
+        <w:rPr>
+          <w:b/>
+        </w:rPr>
+        <w:t>C524</w:t>
+      </w:r>
+      <w:r>
+        <w:t xml:space="preserve"> </w:t>
+      </w:r>
+      <w:r>
+        <w:rPr>
+          <w:b/>
+        </w:rPr>
+        <w:t>S399</w:t>
+      </w:r>
+      <w:r>
+        <w:t>.</w:t>
+      </w:r>
+    </w:p>
+    <w:p>
+      <w:r>
+        <w:t xml:space="preserve">70. TFKRHA Owsley 1843–80 Williams list (courthouse fire): nil Daniel × Sarah Venable. [TFKRHA marriages](https://tfkrha.org/Marriages/Marriages_Owsley_1843-80.php). *Transcription only (Wayback).* </w:t>
+      </w:r>
+      <w:r>
+        <w:rPr>
+          <w:b/>
+        </w:rPr>
+        <w:t>C508</w:t>
+      </w:r>
+      <w:r>
+        <w:t xml:space="preserve"> </w:t>
+      </w:r>
+      <w:r>
+        <w:rPr>
+          <w:b/>
+        </w:rPr>
+        <w:t>S401</w:t>
+      </w:r>
+      <w:r>
+        <w:t xml:space="preserve">. 1950 Madison: Dewey Newman 26 rejected; Shelly + Grace Richmond probable Shelby × Grace. </w:t>
+      </w:r>
+      <w:r>
+        <w:rPr>
+          <w:b/>
+        </w:rPr>
+        <w:t>C522</w:t>
+      </w:r>
+      <w:r>
+        <w:t xml:space="preserve"> </w:t>
+      </w:r>
+      <w:r>
+        <w:rPr>
+          <w:b/>
+        </w:rPr>
+        <w:t>C523</w:t>
+      </w:r>
+      <w:r>
+        <w:t xml:space="preserve"> </w:t>
+      </w:r>
+      <w:r>
+        <w:rPr>
+          <w:b/>
+        </w:rPr>
+        <w:t>S400</w:t>
+      </w:r>
+      <w:r>
+        <w:t>.</w:t>
+      </w:r>
+    </w:p>
+    <w:p>
+      <w:r>
         <w:br w:type="page"/>
       </w:r>
     </w:p>
@@ -6773,6 +7027,31 @@
     <w:p>
       <w:r>
         <w:t>| S396 | `../sources/vital/rtr-kdi-pass68-john-cora-david-extract-2026-10-30.txt` | [IA RTR KDI](https://archive.org/details/reclaim-the-records-kentucky-death-index-01911-1989) | John L 1966; Cora P 1981; Cora B 1988 | index only |</w:t>
+      </w:r>
+    </w:p>
+    <w:p>
+      <w:r>
+        <w:t>| S399 | `../sources/census/owsley-1950-ed95-3-extract-2026-10-30.txt` | [NARA 1950census](https://1950census.archives.gov/) | Clarence Newman 1950 ED 95-3; John+Cora absent from that hit | image seen |</w:t>
+      </w:r>
+    </w:p>
+    <w:p>
+      <w:r>
+        <w:t>| S400 | `../sources/census/madison-1950-newman-extract-2026-10-30.txt` | [NARA 1950census](https://1950census.archives.gov/) | Dewey 26 reject; Shelly+Grace Richmond | image seen |</w:t>
+      </w:r>
+    </w:p>
+    <w:p>
+      <w:r>
+        <w:t>| S401 | `../sources/marriages/tfkrha-owsley-1843-80-extract-2026-10-30.txt` | [TFKRHA 1843–80](https://tfkrha.org/Marriages/Marriages_Owsley_1843-80.php) | Nil Daniel×Sarah | transcription only |</w:t>
+      </w:r>
+    </w:p>
+    <w:p>
+      <w:r>
+        <w:t>| S402 | `../sources/catalog/woodford-1966-john-l-retrieval-extract-2026-10-30.txt` | [GT Woodford obits](https://genealogytrails.com/ken/woodford/obits1.html) | John Wesley reject; Duell-Clark path | catalog / index |</w:t>
+      </w:r>
+    </w:p>
+    <w:p>
+      <w:r>
+        <w:t>| S403 | `../sources/press/pass69-david-g-1958-retrieval-extract-2026-10-30.txt` | [State-Journal 2025](https://state-journal.com/2025/02/04/david-g-newman/) | David Grant Jr. lead; *Citizen* 1958 unread | authored / catalog |</w:t>
       </w:r>
     </w:p>
     <w:p>

</xml_diff>

<commit_message>
Dora pass 70: 1950 Woodford John 70 + Cora 56; Lee 1930 Everett
Image-seen 1950 Woodford ED 120-13 sheet 0012 upgrades John L / Cora B
from POSSIBLE to PROBABLE. Lee 1930 EDs 1–11 place Everett KYVAKY and
Grant 53. 1890 Owsley veterans nil. TFKRHA D7 still unread. Do not print
1966 as proven death.

Co-authored-by: blakereaganlaw <blakereaganlaw@gmail.com>
</commit_message>
<xml_diff>
--- a/research/dora-ella-newnam/book/Dora-Ella-Newnam-Stone-A-Life.docx
+++ b/research/dora-ella-newnam/book/Dora-Ella-Newnam-Stone-A-Life.docx
@@ -101,6 +101,11 @@
     </w:p>
     <w:p>
       <w:r>
+        <w:t>15. [Pass 70. John and Cora in Woodford, 1950](#pass-70-john-and-cora-in-woodford-1950)</w:t>
+      </w:r>
+    </w:p>
+    <w:p>
+      <w:r>
         <w:br w:type="page"/>
       </w:r>
     </w:p>
@@ -2878,16 +2883,57 @@
         <w:t>John L. Newman</w:t>
       </w:r>
       <w:r>
-        <w:t xml:space="preserve">, eighty-eight, in Woodford County on 17 July 1966 is </w:t>
-      </w:r>
-      <w:r>
-        <w:rPr>
-          <w:b/>
-        </w:rPr>
-        <w:t>possible</w:t>
-      </w:r>
-      <w:r>
-        <w:t xml:space="preserve"> only — age and middle initial match; the county does not. Conflict #26. [C492] [S396] A John Wesley Newman who died 6 June 1966 at sixty-nine in Virginia is a different man. [C509] A 1972 Johnnie Newnam, seventy-six, of Lee and Estill, is too young. [C493]</w:t>
+        <w:t xml:space="preserve">, eighty-eight, in Woodford County on 17 July 1966 is now </w:t>
+      </w:r>
+      <w:r>
+        <w:rPr>
+          <w:b/>
+        </w:rPr>
+        <w:t>probable</w:t>
+      </w:r>
+      <w:r>
+        <w:t xml:space="preserve"> — age, middle initial, and the 1950 Woodford house match. Conflict #26. Do not print 1966 as a proven death. [C492] [C527] [S396] [S404] A John Wesley Newman who died 6 June 1966 at sixty-nine in Virginia is a different man. [C509] A 1972 Johnnie Newnam, seventy-six, of Lee and Estill, is too young. [C493]</w:t>
+      </w:r>
+    </w:p>
+    <w:p>
+      <w:pPr>
+        <w:pStyle w:val="Heading2"/>
+      </w:pPr>
+      <w:r>
+        <w:t>Pass 70. John and Cora in Woodford, 1950</w:t>
+      </w:r>
+    </w:p>
+    <w:p>
+      <w:r>
+        <w:t xml:space="preserve">They turn up in Woodford in 1950: John, seventy, and Cora, fifty-six. The schedule is Woodford enumeration district 120-13, sheet 0012, household fifty-four or fifty-five, after a run of vacant houses. The name index spelled him Juhn and her cocan. The image is John, white, male, seventy, married, born Kentucky; Cora, wife, white, female, fifty-six, married, born Kentucky. [C525] [S404] Those ages sit on the 1940 pair — sixty-three and forty-seven — and the names are the same. That identification is </w:t>
+      </w:r>
+      <w:r>
+        <w:rPr>
+          <w:b/>
+        </w:rPr>
+        <w:t>probable</w:t>
+      </w:r>
+      <w:r>
+        <w:t>. [C526] They are not in any Lee County head-of-house in 1930. [C539] Owsley’s 1930 Buck Creek district is still unread. [C544]</w:t>
+      </w:r>
+    </w:p>
+    <w:p>
+      <w:r>
+        <w:t>Everett is on the Heidelberg–Beattyville road that April, forty-two, a widower, parents born Kentucky and Virginia. Louis, Edward, and Gladys are at home. The Virginia mother matches Sarah M. Evans. Edward, twelve, is the boy the coal truck will kill in 1936. [C530] [C531] [C554] [S405] Grant, fifty-three, sits with Martha in another Lee district — the 1876 man, not the twenty-one-year-old of 1910. [C532] [C533] Elias is eighty-seven and widowed in Beattyville; Luther, a World War veteran, is on Maple Street with Cora Plummer; Catherine, fifty-nine, widowed, father born Germany, keeps house in Proctor; Melissa, sixty-six, née Newman, is still with Moses Estes; Robert and Callie Spicer are in the third district with seven children. [C534] [C535] [C536] [C537] [C538] An Arthur Newman, fifty-four, on Sturgeon with a son Grant, fourteen, is Henry and Mary’s line, not Daniel’s. [C543]</w:t>
+      </w:r>
+    </w:p>
+    <w:p>
+      <w:r>
+        <w:t xml:space="preserve">The 1890 Owsley veterans schedule — all six precincts — has no Newnam. [C540] Cora P. in Beattyville in 1950 is Luther’s widow, not Cora Brandenburg. [C541] A Cora B., ninety-five, who died in Fayette County on 19 November 1988 is now </w:t>
+      </w:r>
+      <w:r>
+        <w:rPr>
+          <w:b/>
+        </w:rPr>
+        <w:t>probable</w:t>
+      </w:r>
+      <w:r>
+        <w:t xml:space="preserve"> the 1940/1950 wife. The certificate is unread. [C495] [C528]</w:t>
       </w:r>
     </w:p>
     <w:p>
@@ -3783,16 +3829,34 @@
         <w:rPr>
           <w:b/>
         </w:rPr>
-        <w:t>absent</w:t>
-      </w:r>
-      <w:r>
-        <w:t xml:space="preserve"> from the 1950 ED 95-3 Newman hit (</w:t>
-      </w:r>
-      <w:r>
-        <w:rPr>
-          <w:b/>
-        </w:rPr>
-        <w:t>C512</w:t>
+        <w:t>1950 Woodford John 70 + Cora 56</w:t>
+      </w:r>
+      <w:r>
+        <w:t xml:space="preserve"> (</w:t>
+      </w:r>
+      <w:r>
+        <w:rPr>
+          <w:b/>
+        </w:rPr>
+        <w:t>C525/C526 PROBABLE</w:t>
+      </w:r>
+      <w:r>
+        <w:t xml:space="preserve">); 1966 Woodford death </w:t>
+      </w:r>
+      <w:r>
+        <w:rPr>
+          <w:b/>
+        </w:rPr>
+        <w:t>probable</w:t>
+      </w:r>
+      <w:r>
+        <w:t>, not proven (</w:t>
+      </w:r>
+      <w:r>
+        <w:rPr>
+          <w:b/>
+        </w:rPr>
+        <w:t>#26</w:t>
       </w:r>
       <w:r>
         <w:t xml:space="preserve">); Daniel × Sarah M./Minerva are </w:t>
@@ -3822,6 +3886,24 @@
         <w:t>#24</w:t>
       </w:r>
       <w:r>
+        <w:t xml:space="preserve">); 1930 Everett </w:t>
+      </w:r>
+      <w:r>
+        <w:rPr>
+          <w:b/>
+        </w:rPr>
+        <w:t>KYVAKY</w:t>
+      </w:r>
+      <w:r>
+        <w:t xml:space="preserve"> (</w:t>
+      </w:r>
+      <w:r>
+        <w:rPr>
+          <w:b/>
+        </w:rPr>
+        <w:t>C530</w:t>
+      </w:r>
+      <w:r>
         <w:t xml:space="preserve">); Daniel’s license still unread after TFKRHA 1843–80 </w:t>
       </w:r>
       <w:r>
@@ -3840,7 +3922,7 @@
         <w:t>Advanced this pass:</w:t>
       </w:r>
       <w:r>
-        <w:t xml:space="preserve"> 1950 Clarence; Dewey reject; Shelby+Grace 1950; John Wesley reject; TFKRHA nil. </w:t>
+        <w:t xml:space="preserve"> 1950 Woodford John+Cora; Lee 1930 Everett/Grant/Elias; 1890 veterans nil; TFKRHA D3 Arthur reject; D7 unread. </w:t>
       </w:r>
       <w:r>
         <w:rPr>
@@ -3994,7 +4076,25 @@
         <w:rPr>
           <w:b/>
         </w:rPr>
+        <w:t>B083</w:t>
+      </w:r>
+      <w:r>
+        <w:t xml:space="preserve">, </w:t>
+      </w:r>
+      <w:r>
+        <w:rPr>
+          <w:b/>
+        </w:rPr>
         <w:t>B080</w:t>
+      </w:r>
+      <w:r>
+        <w:t xml:space="preserve">, TFKRHA </w:t>
+      </w:r>
+      <w:r>
+        <w:rPr>
+          <w:b/>
+        </w:rPr>
+        <w:t>D7</w:t>
       </w:r>
       <w:r>
         <w:t xml:space="preserve">, </w:t>
@@ -6593,25 +6693,52 @@
         <w:t>17762</w:t>
       </w:r>
       <w:r>
+        <w:t xml:space="preserve"> — now </w:t>
+      </w:r>
+      <w:r>
+        <w:rPr>
+          <w:b/>
+        </w:rPr>
+        <w:t>probable</w:t>
+      </w:r>
+      <w:r>
+        <w:t xml:space="preserve"> (1950 Woodford house). </w:t>
+      </w:r>
+      <w:r>
+        <w:rPr>
+          <w:b/>
+        </w:rPr>
+        <w:t>CORA P</w:t>
+      </w:r>
+      <w:r>
+        <w:t xml:space="preserve"> 1981 = Plummer. </w:t>
+      </w:r>
+      <w:r>
+        <w:rPr>
+          <w:b/>
+        </w:rPr>
+        <w:t>CORA B</w:t>
+      </w:r>
+      <w:r>
+        <w:t xml:space="preserve"> 95 Fayette </w:t>
+      </w:r>
+      <w:r>
+        <w:rPr>
+          <w:b/>
+        </w:rPr>
+        <w:t>19 Nov 1988</w:t>
+      </w:r>
+      <w:r>
         <w:t xml:space="preserve"> — </w:t>
       </w:r>
       <w:r>
         <w:rPr>
           <w:b/>
         </w:rPr>
-        <w:t>possible</w:t>
-      </w:r>
-      <w:r>
-        <w:t xml:space="preserve"> only. </w:t>
-      </w:r>
-      <w:r>
-        <w:rPr>
-          <w:b/>
-        </w:rPr>
-        <w:t>CORA P</w:t>
-      </w:r>
-      <w:r>
-        <w:t xml:space="preserve"> 1981 = Plummer. [IA RTR KDI](https://archive.org/details/reclaim-the-records-kentucky-death-index-01911-1989). *Index only.* </w:t>
+        <w:t>probable</w:t>
+      </w:r>
+      <w:r>
+        <w:t xml:space="preserve"> 1940/1950 Cora. [IA RTR KDI](https://archive.org/details/reclaim-the-records-kentucky-death-index-01911-1989). *Index only.* </w:t>
       </w:r>
       <w:r>
         <w:rPr>
@@ -6626,9 +6753,27 @@
         <w:rPr>
           <w:b/>
         </w:rPr>
+        <w:t>C527 C528</w:t>
+      </w:r>
+      <w:r>
+        <w:t xml:space="preserve"> </w:t>
+      </w:r>
+      <w:r>
+        <w:rPr>
+          <w:b/>
+        </w:rPr>
         <w:t>S396</w:t>
       </w:r>
       <w:r>
+        <w:t xml:space="preserve"> </w:t>
+      </w:r>
+      <w:r>
+        <w:rPr>
+          <w:b/>
+        </w:rPr>
+        <w:t>S404</w:t>
+      </w:r>
+      <w:r>
         <w:t xml:space="preserve">. Conflict </w:t>
       </w:r>
       <w:r>
@@ -6638,7 +6783,7 @@
         <w:t>#26</w:t>
       </w:r>
       <w:r>
-        <w:t>.</w:t>
+        <w:t>. Do not print 1966 as proven death.</w:t>
       </w:r>
     </w:p>
     <w:p>
@@ -6745,6 +6890,120 @@
           <w:b/>
         </w:rPr>
         <w:t>S400</w:t>
+      </w:r>
+      <w:r>
+        <w:t>.</w:t>
+      </w:r>
+    </w:p>
+    <w:p>
+      <w:r>
+        <w:t xml:space="preserve">71. 1950 U.S. census, Woodford ED </w:t>
+      </w:r>
+      <w:r>
+        <w:rPr>
+          <w:b/>
+        </w:rPr>
+        <w:t>120-13</w:t>
+      </w:r>
+      <w:r>
+        <w:t xml:space="preserve"> sheet </w:t>
+      </w:r>
+      <w:r>
+        <w:rPr>
+          <w:b/>
+        </w:rPr>
+        <w:t>0012</w:t>
+      </w:r>
+      <w:r>
+        <w:t xml:space="preserve">: Newman, John, 70, + Cora, 56. [1950census.archives.gov](https://1950census.archives.gov/). *Image seen.* OCR “Juhn”/“cocan.” </w:t>
+      </w:r>
+      <w:r>
+        <w:rPr>
+          <w:b/>
+        </w:rPr>
+        <w:t>C525–C529</w:t>
+      </w:r>
+      <w:r>
+        <w:t xml:space="preserve"> </w:t>
+      </w:r>
+      <w:r>
+        <w:rPr>
+          <w:b/>
+        </w:rPr>
+        <w:t>S404</w:t>
+      </w:r>
+      <w:r>
+        <w:t xml:space="preserve">. Conflict </w:t>
+      </w:r>
+      <w:r>
+        <w:rPr>
+          <w:b/>
+        </w:rPr>
+        <w:t>#26</w:t>
+      </w:r>
+      <w:r>
+        <w:t>.</w:t>
+      </w:r>
+    </w:p>
+    <w:p>
+      <w:r>
+        <w:t xml:space="preserve">72. 1930 Lee Co. (Kendrick) EDs 1–11: Everett 42 wd KYVAKY; Grant 53 + Martha; Elias T. 87; Luther + Cora; Catherine 59 wd; Moses Estes + Malissa D. nee NEWMAN; Robert + Callie Spicer; nil John+Cora head. [Lee 1930](https://usgennet.org/usa/ky/county/lee/census/1930/). *Transcription only.* </w:t>
+      </w:r>
+      <w:r>
+        <w:rPr>
+          <w:b/>
+        </w:rPr>
+        <w:t>C530–C539</w:t>
+      </w:r>
+      <w:r>
+        <w:t xml:space="preserve"> </w:t>
+      </w:r>
+      <w:r>
+        <w:rPr>
+          <w:b/>
+        </w:rPr>
+        <w:t>S405</w:t>
+      </w:r>
+      <w:r>
+        <w:t>.</w:t>
+      </w:r>
+    </w:p>
+    <w:p>
+      <w:r>
+        <w:t xml:space="preserve">73. 1890 Owsley veterans schedule, six precincts, nil Newnam. [1890 landing](https://usgennet.org/usa/ky/county/owsley/census/1890/). *Transcription only.* </w:t>
+      </w:r>
+      <w:r>
+        <w:rPr>
+          <w:b/>
+        </w:rPr>
+        <w:t>C540</w:t>
+      </w:r>
+      <w:r>
+        <w:t xml:space="preserve"> </w:t>
+      </w:r>
+      <w:r>
+        <w:rPr>
+          <w:b/>
+        </w:rPr>
+        <w:t>S406</w:t>
+      </w:r>
+      <w:r>
+        <w:t xml:space="preserve">. TFKRHA 1930 D3 Arthur Newman 54 + Grant 14 (Henry × Mary). D7 unread. </w:t>
+      </w:r>
+      <w:r>
+        <w:rPr>
+          <w:b/>
+        </w:rPr>
+        <w:t>C543 C544</w:t>
+      </w:r>
+      <w:r>
+        <w:t xml:space="preserve"> </w:t>
+      </w:r>
+      <w:r>
+        <w:rPr>
+          <w:b/>
+        </w:rPr>
+        <w:t>S407</w:t>
       </w:r>
       <w:r>
         <w:t>.</w:t>
@@ -7052,6 +7311,31 @@
     <w:p>
       <w:r>
         <w:t>| S403 | `../sources/press/pass69-david-g-1958-retrieval-extract-2026-10-30.txt` | [State-Journal 2025](https://state-journal.com/2025/02/04/david-g-newman/) | David Grant Jr. lead; *Citizen* 1958 unread | authored / catalog |</w:t>
+      </w:r>
+    </w:p>
+    <w:p>
+      <w:r>
+        <w:t>| S404 | `../sources/census/woodford-1950-120-13-john-cora-ages.jpg` | [NARA 1950census](https://1950census.archives.gov/) | John 70 + Cora 56, Woodford 120-13 | image seen |</w:t>
+      </w:r>
+    </w:p>
+    <w:p>
+      <w:r>
+        <w:t>| S405 | `../sources/census/lee-1930-newman-extract-2026-10-30.txt` | [Lee 1930](https://usgennet.org/usa/ky/county/lee/census/1930/) | Everett KYVAKY; Grant 53; nil John+Cora head | transcription only |</w:t>
+      </w:r>
+    </w:p>
+    <w:p>
+      <w:r>
+        <w:t>| S406 | `../sources/census/owsley-1890-veterans-nil-extract-2026-10-30.txt` | [1890 veterans](https://usgennet.org/usa/ky/county/owsley/census/1890/) | Nil Newnam six precincts | transcription only |</w:t>
+      </w:r>
+    </w:p>
+    <w:p>
+      <w:r>
+        <w:t>| S407 | `../sources/census/tfkrha-1930-d3-sturgeon.txt` | [TFKRHA 1930](https://tfkrha.org/) | Arthur Newman 54 + Grant 14; D7 unread | transcription only |</w:t>
+      </w:r>
+    </w:p>
+    <w:p>
+      <w:r>
+        <w:t>| S408 | `../sources/census/nara-1950-lee-rejects-extract-2026-10-30.txt` | [NARA 1950census](https://1950census.archives.gov/) | Cara P. = Plummer; Johnia rejected | image seen + index |</w:t>
       </w:r>
     </w:p>
     <w:p>

</xml_diff>

<commit_message>
Pass 64–67: 1900–1920 Henry/Arthur originals; Rosenbalm 1916 Widowed extract
Isolate the 1900 Sturgeon and 1910 Wild Dog Henry H. + Manerva houses, the 1910/1920 Arthur houses, and the rest of 1920 Island Creek. Entire ED 90 has one Newman household and no Manerva. A third 1916 DC extract still says Widowed with blank parents. Do not promote C509.

Co-authored-by: CatCorner22 <CatCorner22@users.noreply.github.com>
</commit_message>
<xml_diff>
--- a/research/dora-ella-newnam/book/Dora-Ella-Newnam-Stone-A-Life.docx
+++ b/research/dora-ella-newnam/book/Dora-Ella-Newnam-Stone-A-Life.docx
@@ -41,7 +41,7 @@
     </w:p>
     <w:p>
       <w:r>
-        <w:t>Eighty-six Cursor chats on this repository were reviewed for this volume (primary research, helpers, scans, and failed browser hunts). The original mobile session opened the case and read the Arkansas death certificate the family still holds. Later sessions recovered the 1880 childhood schedule that free transcripts had missed, walked statewide Soundex reels for 1910 and 1920, tested a Peebles third-marriage hypothesis and set it aside, and photographed NARA microfilm frames — the 1880 childhood schedule, the 1910 Kentucky Ella Miracode plates, Hardin Gray on Sturgeon sheet 13 B, the 1860 Owsley original of Silas Gray’s house with William aged thirteen, the 1850 Owsley Gray pages that are other men (Thomas, James, John, Charles), the given-name Silas plates that are other boys (Ratliff eight months, Wilson six, Phillips fifteen) and the Bowman line first read as Cyrus and then as Squire, the 1850 Estill Marcus Gray original, Breathitt’s Taulbee infant Silas and Bryant Siras, and Madison’s John Green house with Silas Green aged twenty, the 1850 Owsley Harrison Newman house with an eight-year-old Elias who is probably Dora’s father — a 1932 death extract names Henry Harrison Newnam as that father — and is not merged as proven, the 1860 Booneville original of that house under H.H. Newman with Elias aged eighteen, the 1850 William Newman house of twenty-six on the same page, the 1850 John Newman of sixty born in Tennessee who is not the 1880 John of sixty-nine, and Andrew Mays’s Giles at one month in 1850 and eleven in 1860, the 1870 Proctor original of James Brandenburg’s house, Silas Gray’s Sturgeon original, the 1880 District 59 originals of William next door to John Newnam and of Silas still in the district, the 1900 William Gray dwelling-84 crop, and the Bollinger page a sibling had labelled “Dora E. Stone,” which is Henry C. Rhodes and Dora M. of Missouri. This volume folds those chats into one narrative. The case dossier remains the working file; this book is the public reading of it. Sibling work on Greene ED 37 through 41 is now on merged PR #26 through Pass 59; remaining Greene ED 38 B-sides, 1900 Liberty, and 1900 hh 85 are inventoried, not duplicated. Do not import their “Dora E. Stone” as this woman.</w:t>
+        <w:t>Ninety-five Cursor chats on this repository were reviewed for this volume (primary research, helpers, scans, and failed browser hunts). The original mobile session opened the case and read the Arkansas death certificate the family still holds. Later sessions recovered the 1880 childhood schedule that free transcripts had missed, walked statewide Soundex reels for 1910 and 1920, tested a Peebles third-marriage hypothesis and set it aside, and photographed NARA microfilm frames — the 1880 childhood schedule, the 1910 Kentucky Ella Miracode plates, Hardin Gray on Sturgeon sheet 13 B, the 1860 Owsley original of Silas Gray’s house with William aged thirteen, the 1850 Owsley Gray pages that are other men (Thomas, James, John, Charles), the given-name Silas plates that are other boys (Ratliff eight months, Wilson six, Phillips fifteen) and the Bowman line first read as Cyrus and then as Squire, the 1850 Estill Marcus Gray original, Breathitt’s Taulbee infant Silas and Bryant Siras, and Madison’s John Green house with Silas Green aged twenty, the 1850 Owsley Harrison Newman house with an eight-year-old Elias who is probably Dora’s father — a 1932 death extract names Henry Harrison Newnam as that father — and is not merged as proven, the 1860 Booneville original of that house under H.H. Newman with Elias aged eighteen, the 1850 William Newman house of twenty-six on the same page, the 1850 John Newman of sixty born in Tennessee who is not the 1880 John of sixty-nine, and Andrew Mays’s Giles at one month in 1850 and eleven in 1860, the 1870 Proctor original of James Brandenburg’s house, Silas Gray’s Sturgeon original, the 1880 District 59 originals of William next door to John Newnam and of Silas still in the district, the 1900 William Gray dwelling-84 crop, and the Bollinger page a sibling had labelled “Dora E. Stone,” which is Henry C. Rhodes and Dora M. of Missouri. This volume folds those chats into one narrative. The case dossier remains the working file; this book is the public reading of it. Sibling work on Greene ED 37 through 41 is now on merged PR #26 through Pass 59; remaining Greene ED 38 B-sides, 1900 Liberty, and 1900 hh 85 are inventoried, not duplicated. Do not import their “Dora E. Stone” as this woman.</w:t>
       </w:r>
     </w:p>
     <w:p>
@@ -120,7 +120,151 @@
         <w:t>Manerva</w:t>
       </w:r>
       <w:r>
-        <w:t>, who had married him in 1895 and who died 28 August 1920 — is a federal original of that death. The civil extract still calls Henry widowed. That contradiction is not averaged. Mary Ann Smallwood, born April 1842, came from the Owsley Smallwoods. The 11 July 1918 cemetery date is still unmatched in Kentucky’s civil index.</w:t>
+        <w:t xml:space="preserve">, who had married him in 1895 and who died 28 August 1920 — is a federal original of that death. Three independent civil extracts still call Henry widowed, with parent and informant cells blank; a neighboring infant on the same Rosenbalm page has those cells filled. That contradiction is not averaged. The 1900 Sturgeon original now puts </w:t>
+      </w:r>
+      <w:r>
+        <w:rPr>
+          <w:b/>
+        </w:rPr>
+        <w:t>Newnam, Henry H.</w:t>
+      </w:r>
+      <w:r>
+        <w:t xml:space="preserve">, fifty-five, in dwelling 114 with </w:t>
+      </w:r>
+      <w:r>
+        <w:rPr>
+          <w:b/>
+        </w:rPr>
+        <w:t>Minerva</w:t>
+      </w:r>
+      <w:r>
+        <w:t xml:space="preserve">, forty-eight, and four children including Josephine, seventeen — the girl whose 1916 death extract names mother </w:t>
+      </w:r>
+      <w:r>
+        <w:rPr>
+          <w:b/>
+        </w:rPr>
+        <w:t>Mary J. Pardington</w:t>
+      </w:r>
+      <w:r>
+        <w:t xml:space="preserve">. The 1910 Wild Dog original puts the same man, sixty-eight, in a second marriage of fifteen years with </w:t>
+      </w:r>
+      <w:r>
+        <w:rPr>
+          <w:b/>
+        </w:rPr>
+        <w:t>Manerva</w:t>
+      </w:r>
+      <w:r>
+        <w:t xml:space="preserve">, fifty-six, the couple alone. Those two wives are not one woman. Arthur that April heads his own Sturgeon house: </w:t>
+      </w:r>
+      <w:r>
+        <w:rPr>
+          <w:b/>
+        </w:rPr>
+        <w:t>Newman, Arthur</w:t>
+      </w:r>
+      <w:r>
+        <w:t xml:space="preserve">, twenty-seven, first marriage of eight years, with </w:t>
+      </w:r>
+      <w:r>
+        <w:rPr>
+          <w:b/>
+        </w:rPr>
+        <w:t>Florence</w:t>
+      </w:r>
+      <w:r>
+        <w:t xml:space="preserve">, twenty-three, one child living, and </w:t>
+      </w:r>
+      <w:r>
+        <w:rPr>
+          <w:b/>
+        </w:rPr>
+        <w:t>Omer</w:t>
+      </w:r>
+      <w:r>
+        <w:t xml:space="preserve">, three. That is probably Henry’s 1900 son; the age is four years light of an October 1878 birth and is not averaged. In January 1920 he is on the Island Creek original — Owsley district 90, sheet 7 A, dwelling 113 — </w:t>
+      </w:r>
+      <w:r>
+        <w:rPr>
+          <w:b/>
+        </w:rPr>
+        <w:t>Newman, Arthur</w:t>
+      </w:r>
+      <w:r>
+        <w:t xml:space="preserve">, forty-five, still with </w:t>
+      </w:r>
+      <w:r>
+        <w:rPr>
+          <w:b/>
+        </w:rPr>
+        <w:t>Florence</w:t>
+      </w:r>
+      <w:r>
+        <w:t xml:space="preserve">, thirty-three, </w:t>
+      </w:r>
+      <w:r>
+        <w:rPr>
+          <w:b/>
+        </w:rPr>
+        <w:t>Omer</w:t>
+      </w:r>
+      <w:r>
+        <w:t xml:space="preserve">, twelve, and a new son </w:t>
+      </w:r>
+      <w:r>
+        <w:rPr>
+          <w:b/>
+        </w:rPr>
+        <w:t>Grant</w:t>
+      </w:r>
+      <w:r>
+        <w:t xml:space="preserve">, three and a half. Manerva is not in that house. The rest of Island Creek, sheets 9 A through 13 B, has no second Newman head. The age jump from twenty-seven to forty-five is not averaged; Florence and Omer keep the identification probable. The Wild Dog precinct where Henry and Manerva had lived — original ED 94, every name column, households 1 through 129 — has no Newman or Newnam head and no Manerva Newnam. Household 18 is </w:t>
+      </w:r>
+      <w:r>
+        <w:rPr>
+          <w:b/>
+        </w:rPr>
+        <w:t>Evans, William</w:t>
+      </w:r>
+      <w:r>
+        <w:t xml:space="preserve">, sixty-eight, with a wife </w:t>
+      </w:r>
+      <w:r>
+        <w:rPr>
+          <w:b/>
+        </w:rPr>
+        <w:t>Minerva</w:t>
+      </w:r>
+      <w:r>
+        <w:t xml:space="preserve">, sixty-seven, a different family. The leftover Sturgeon sheets, eleven A through thirteen A, are the same nil of a Newman head; a two-year-old Manerva in a Tymes house is a different child; </w:t>
+      </w:r>
+      <w:r>
+        <w:rPr>
+          <w:b/>
+        </w:rPr>
+        <w:t>Barker, Malvera</w:t>
+      </w:r>
+      <w:r>
+        <w:t xml:space="preserve">, sixty-four, in an Eversole house, and </w:t>
+      </w:r>
+      <w:r>
+        <w:rPr>
+          <w:b/>
+        </w:rPr>
+        <w:t>Wilson, Harden</w:t>
+      </w:r>
+      <w:r>
+        <w:t xml:space="preserve"> with </w:t>
+      </w:r>
+      <w:r>
+        <w:rPr>
+          <w:b/>
+        </w:rPr>
+        <w:t>Minerva</w:t>
+      </w:r>
+      <w:r>
+        <w:t>, seventy, are other people. Kentucky’s 1920 Soundex has no Manerva or Minerva Newman card, and the Walter given-name window has no Owsley or Lee Walter with Manerva. Kentucky’s 1920 death index has no Manerva Newnam row on 28 August; the Owsley table that day is an infant Bates. Mary Ann Smallwood, born April 1842, came from the Owsley Smallwoods. The 11 July 1918 cemetery date is still unmatched in Kentucky’s civil index. [C669] [C672] [C693] [C694] [C690] [C691] [C709] [C711] [C712] [C713] [C717]</w:t>
       </w:r>
     </w:p>
     <w:p>
@@ -184,7 +328,7 @@
         <w:t>Newman, Henry</w:t>
       </w:r>
       <w:r>
-        <w:t>, thirty-four, a farm labourer, with Mary, thirty-three, whose father was born in England, Ellen F., fourteen, Milla A., twelve, Chalista, seven, Laura B., four, and Arthur, two. The enumerator wrote Newman, not Newnam. Identity with the 1860 boy remains probable, not proved. Millia, three, is not Millie Tincher. Infant John of 1870 is not in the 1880 house. [C550] [C551] [C552] [C555] [C561] [C562] [C563]</w:t>
+        <w:t>, thirty-four, a farm labourer, with Mary, thirty-three, whose father was born in England, Ellen F., fourteen, Milla A., twelve, Chalista, seven, Laura B., four, and Arthur, two. The enumerator wrote Newman, not Newnam. Identity with the 1860 boy remains probable, not proved. Millia, three, is not Millie Tincher. Infant John of 1870 is not in the 1880 house. Twenty years later the same Arthur is still in Henry’s Sturgeon house, with Josephine, Lou V., and Walter, and with a wife named Minerva — Henry’s second wife, not Mary. Ten years after that Arthur heads his own Sturgeon house with Florence and Omer. Ten years after that he is on Island Creek with Florence, Omer, and Grant; Manerva is not in the house. [C550] [C551] [C552] [C555] [C561] [C562] [C563] [C669] [C672] [C693] [C700] [C702]</w:t>
       </w:r>
     </w:p>
     <w:p>

</xml_diff>

<commit_message>
Dora passes 71–72: 1930 Buck Creek John L + McCoy; 1920 Owsley reel mapped
Pass 71 proves John L 51 + Cora 36 on T626-773 ED 95-7 and upgrades
that identity through 1950. McCoy 40 next door is probable P010.
Pass 72 maps T625-594 Owsley EDs 88–94, samples name columns nil,
closes the 1920 N-550 John window without an Owsley hit, and records
1940/1950 Owsley McCoy-head negatives. NUMIDENT 447-20-2466 is not merged.
FS probate/WWI images still unread (R011 step 23). Working Word rebuilt;
authored latest.docx unchanged.

Co-authored-by: blakereaganlaw <blakereaganlaw@gmail.com>
</commit_message>
<xml_diff>
--- a/research/dora-ella-newnam/book/Dora-Ella-Newnam-Stone-A-Life.docx
+++ b/research/dora-ella-newnam/book/Dora-Ella-Newnam-Stone-A-Life.docx
@@ -106,6 +106,16 @@
     </w:p>
     <w:p>
       <w:r>
+        <w:t>16. [Pass 71. John L. and McCoy on Buck Creek, 1930](#pass-71-john-l-and-mccoy-on-buck-creek-1930)</w:t>
+      </w:r>
+    </w:p>
+    <w:p>
+      <w:r>
+        <w:t>17. [Pass 72. The 1920 Owsley reel, and McCoy after 1930](#pass-72-the-1920-owsley-reel-and-mccoy-after-1930)</w:t>
+      </w:r>
+    </w:p>
+    <w:p>
+      <w:r>
         <w:br w:type="page"/>
       </w:r>
     </w:p>
@@ -2838,25 +2848,25 @@
         <w:t>John L.</w:t>
       </w:r>
       <w:r>
-        <w:t xml:space="preserve"> is now on the 1940 Buck Creek page. At household 54 on Crane Creek and Duck Fork Road, John Newnam, sixty-three, sits with Cora, forty-seven — married more than once, married at nineteen, three children — and a son Robert, twenty-one. [C489] [S395] That is </w:t>
-      </w:r>
-      <w:r>
-        <w:rPr>
-          <w:b/>
-        </w:rPr>
-        <w:t>probable</w:t>
-      </w:r>
-      <w:r>
-        <w:t xml:space="preserve"> the 1910/1915 widower who married Cora Brandenburg, and </w:t>
-      </w:r>
-      <w:r>
-        <w:rPr>
-          <w:b/>
-        </w:rPr>
-        <w:t>probable</w:t>
-      </w:r>
-      <w:r>
-        <w:t xml:space="preserve"> the one-year-old of 1880. [C490] [C491] Owsley death extracts through 1946 have no adult John Newnam, so he died after 1946. In April 1950 the same enumeration district — Owsley 95-3, Magisterial District 1, enumerator Preston W. Mainous — still has a Newman household, but it is </w:t>
+        <w:t xml:space="preserve"> is now </w:t>
+      </w:r>
+      <w:r>
+        <w:rPr>
+          <w:b/>
+        </w:rPr>
+        <w:t>proven</w:t>
+      </w:r>
+      <w:r>
+        <w:t xml:space="preserve"> on the 1930 and 1940 Buck Creek pages. At household 54 on Crane Creek and Duck Fork Road in 1940, John Newnam, sixty-three, sits with Cora, forty-seven — married more than once, married at nineteen, three children — and a son Robert, twenty-one. [C489] [S395] The 1930 original names him </w:t>
+      </w:r>
+      <w:r>
+        <w:rPr>
+          <w:b/>
+        </w:rPr>
+        <w:t>John L.</w:t>
+      </w:r>
+      <w:r>
+        <w:t xml:space="preserve">, fifty-one, mother born Virginia, with Cora, Pencie, Robert, and Florence Combs. That is the 1910/1915 widower who married Cora Brandenburg, and the one-year-old of 1880. [C490] [C491] [C557] Owsley death extracts through 1946 have no adult John Newnam, so he died after 1946. In April 1950 the same enumeration district — Owsley 95-3, Magisterial District 1, enumerator Preston W. Mainous — still has a Newman household, but it is </w:t>
       </w:r>
       <w:r>
         <w:rPr>
@@ -2914,7 +2924,7 @@
         <w:t>probable</w:t>
       </w:r>
       <w:r>
-        <w:t>. [C526] They are not in any Lee County head-of-house in 1930. [C539] Owsley’s 1930 Buck Creek district is still unread. [C544]</w:t>
+        <w:t>. [C526] They are not in any Lee County head-of-house in 1930. [C539] They were in Owsley. Pass 71 reads that schedule.</w:t>
       </w:r>
     </w:p>
     <w:p>
@@ -2924,7 +2934,7 @@
     </w:p>
     <w:p>
       <w:r>
-        <w:t xml:space="preserve">The 1890 Owsley veterans schedule — all six precincts — has no Newnam. [C540] Cora P. in Beattyville in 1950 is Luther’s widow, not Cora Brandenburg. [C541] A Cora B., ninety-five, who died in Fayette County on 19 November 1988 is now </w:t>
+        <w:t xml:space="preserve">The 1890 Owsley veterans schedule — all six precincts — has no Newnam. [C540] Cora P. in Beattyville in 1950 is Luther’s widow, not Cora Brandenburg. [C541] A Cora B., ninety-five, who died in Fayette County on 19 November 1988 is still </w:t>
       </w:r>
       <w:r>
         <w:rPr>
@@ -2934,6 +2944,189 @@
       </w:r>
       <w:r>
         <w:t xml:space="preserve"> the 1940/1950 wife. The certificate is unread. [C495] [C528]</w:t>
+      </w:r>
+    </w:p>
+    <w:p>
+      <w:pPr>
+        <w:pStyle w:val="Heading2"/>
+      </w:pPr>
+      <w:r>
+        <w:t>Pass 71. John L. and McCoy on Buck Creek, 1930</w:t>
+      </w:r>
+    </w:p>
+    <w:p>
+      <w:r>
+        <w:t>Internet Archive reel T626-773 — Ohio, Owsley, Robertson, Rockcastle — puts Owsley between Ohio County’s enumeration district 92 and Robertson’s 101. Magisterial District 6, Buck Creek, is enumeration district 95-7, leaves 650 to 669 of that reel. Robert H. Isaacs enumerated it in April 1930. [C555] [S409] [S410]</w:t>
+      </w:r>
+    </w:p>
+    <w:p>
+      <w:r>
+        <w:t xml:space="preserve">Household 131 on sheet 7B is the missing 1930 house. </w:t>
+      </w:r>
+      <w:r>
+        <w:rPr>
+          <w:b/>
+        </w:rPr>
+        <w:t>Newman, John L.</w:t>
+      </w:r>
+      <w:r>
+        <w:t xml:space="preserve">, fifty-one, married first at twenty-five, born Kentucky, father Kentucky, </w:t>
+      </w:r>
+      <w:r>
+        <w:rPr>
+          <w:b/>
+        </w:rPr>
+        <w:t>mother Virginia</w:t>
+      </w:r>
+      <w:r>
+        <w:t xml:space="preserve">, farmer. </w:t>
+      </w:r>
+      <w:r>
+        <w:rPr>
+          <w:b/>
+        </w:rPr>
+        <w:t>Cora</w:t>
+      </w:r>
+      <w:r>
+        <w:t xml:space="preserve">, wife, thirty-six, married first at nineteen, Kentucky parents. </w:t>
+      </w:r>
+      <w:r>
+        <w:rPr>
+          <w:b/>
+        </w:rPr>
+        <w:t>Pencie M.</w:t>
+      </w:r>
+      <w:r>
+        <w:t xml:space="preserve">, twenty-three, single. </w:t>
+      </w:r>
+      <w:r>
+        <w:rPr>
+          <w:b/>
+        </w:rPr>
+        <w:t>Robert L.</w:t>
+      </w:r>
+      <w:r>
+        <w:t xml:space="preserve">, twelve. </w:t>
+      </w:r>
+      <w:r>
+        <w:rPr>
+          <w:b/>
+        </w:rPr>
+        <w:t>Combs, Florence M.</w:t>
+      </w:r>
+      <w:r>
+        <w:t xml:space="preserve">, daughter, twenty-six, married at twenty-two. </w:t>
+      </w:r>
+      <w:r>
+        <w:rPr>
+          <w:b/>
+        </w:rPr>
+        <w:t>Velma I.</w:t>
+      </w:r>
+      <w:r>
+        <w:t xml:space="preserve">, granddaughter, three. [C556] Those names and ages lock the chain: John L., one in 1880; John, thirty-one, already nine years married to Lillie, with Florence eight and Pency four, in 1910; the 1915 widower who married Cora Brandenburg; John, sixty-three, and Cora, forty-seven, in 1940; John, seventy, and Cora, fifty-six, in Woodford in 1950. Identification of that man is now </w:t>
+      </w:r>
+      <w:r>
+        <w:rPr>
+          <w:b/>
+        </w:rPr>
+        <w:t>proven</w:t>
+      </w:r>
+      <w:r>
+        <w:t xml:space="preserve">. [C557] [C558] [C559] The 1966 Woodford index row is still only </w:t>
+      </w:r>
+      <w:r>
+        <w:rPr>
+          <w:b/>
+        </w:rPr>
+        <w:t>probable</w:t>
+      </w:r>
+      <w:r>
+        <w:t>. Conflict #26 is open on the death date, not the identity. Do not print 1966 as a proven death.</w:t>
+      </w:r>
+    </w:p>
+    <w:p>
+      <w:r>
+        <w:t xml:space="preserve">Next door at 130 is </w:t>
+      </w:r>
+      <w:r>
+        <w:rPr>
+          <w:b/>
+        </w:rPr>
+        <w:t>Clarence</w:t>
+      </w:r>
+      <w:r>
+        <w:t xml:space="preserve"> Newman, thirty-seven, with May and his mother Susie, fifty — the 1940 and 1950 neighbours. [C560] At 133, </w:t>
+      </w:r>
+      <w:r>
+        <w:rPr>
+          <w:b/>
+        </w:rPr>
+        <w:t>Newman, McCoy</w:t>
+      </w:r>
+      <w:r>
+        <w:t xml:space="preserve">, forty, rents a farm. His wife Edith, twenty-nine, was born in Missouri and first married at fourteen. Four children follow: the older ones born in Arkansas, the youngest in Tennessee. [C561] McCoy, born April 1890 to Dora and Samuel, is </w:t>
+      </w:r>
+      <w:r>
+        <w:rPr>
+          <w:b/>
+        </w:rPr>
+        <w:t>probable</w:t>
+      </w:r>
+      <w:r>
+        <w:t xml:space="preserve"> this head — rare given name, age, both parents Kentucky, and children born in Arkansas in the years Dora lived there. He was the 1926 informant. Kentucky’s death index for 1931–1989 has no McCoy or Coy Newman or Newnam. [C562] [C565] The children’s names stay on the schedule. Anyone born in the 1920s may still be living and is not researched here.</w:t>
+      </w:r>
+    </w:p>
+    <w:p>
+      <w:r>
+        <w:t>Kentucky’s 1930 Soundex never covered Owsley. FamilySearch films 127913, 127869, and 1146342 remain sign-in walled. [C564] [C566] [C578]</w:t>
+      </w:r>
+    </w:p>
+    <w:p>
+      <w:pPr>
+        <w:pStyle w:val="Heading2"/>
+      </w:pPr>
+      <w:r>
+        <w:t>Pass 72. The 1920 Owsley reel, and McCoy after 1930</w:t>
+      </w:r>
+    </w:p>
+    <w:p>
+      <w:r>
+        <w:t>The 1920 Kentucky population reel that holds Owsley is T625-594 — Ohio, Oldham, Owen, and Owsley — on Internet Archive as `14thcensusofpopu594unit`. The metadata names Owsley enumeration districts 88 through 94. The county begins at leaf 1038: Booneville Number 1, district 88, sheet 1A, enumerator W. M. Dooley, 12 January. Sturgeon is 89. Island Creek is 90. Cow Creek is 91. Buffalo is 92. District 93 sits between Buffalo and Wilder. Wilder, district 94, runs to about leaf 1205. No header yet read says Buck Creek. [C571] [C572] [S411]</w:t>
+      </w:r>
+    </w:p>
+    <w:p>
+      <w:r>
+        <w:t>Name-column crops from those districts — Booneville sheets including 1A, Sturgeon samples, Island Creek, Cow Creek, Buffalo, 93, and Wilder — have no Newman, Newnam, McCoy, or Coy as a surname on the sheets examined. Bowman, Brandenburg, Gabbard, Pendergrass, and Jett appear. John L. and McCoy are not on those samples. The rest of the reel is still open. [C573] [C581] [S412]</w:t>
+      </w:r>
+    </w:p>
+    <w:p>
+      <w:r>
+        <w:t>Kentucky’s 1920 Soundex N-550 John window, leaves 4460 to 4499, is now read. There is no Owsley or Lee card for a John L. of about forty-one with a wife Cora. A John L., twenty-eight, of Harlan, wife Roxie, is a different man. Other Johns sit in Boone, Letcher, Henderson, Floyd, Breathitt, Muhlenberg, Jefferson, Nelson, Kenton, Logan, Union, Lawrence, and Ohio County. [C577] [C580] [S415]</w:t>
+      </w:r>
+    </w:p>
+    <w:p>
+      <w:r>
+        <w:t>McCoy is not an Owsley head in 1940. The seven published districts name three Newman houses: John and Cora, already known; Clarence, already known; and Arthur, sixty-three, with Roda and a son Grant, twenty-two — Henry and Mary’s line, the 1930 Sturgeon house. A Ree McCoy, fifteen, is a Galigar son, not Dora’s. [C574] [C579] [C582] [S413] The 1950 name index for Owsley returns no McCoy. Its Newman hits are Bowman misreads and Clarence again. [C575] [S414]</w:t>
+      </w:r>
+    </w:p>
+    <w:p>
+      <w:r>
+        <w:t xml:space="preserve">A NUMIDENT row filed as </w:t>
+      </w:r>
+      <w:r>
+        <w:rPr>
+          <w:b/>
+        </w:rPr>
+        <w:t>MCCOY, NEWMAN</w:t>
+      </w:r>
+      <w:r>
+        <w:t>, born 13 April 1890, Social Security number 447-20-2466, claimed at Modesto, California, on 11 July 1962, is a possible inverted spelling of Dora’s son. The birth month matches. The California claim office does not. It is not merged. 1962 is a claim date, not a death. [C576] [S415]</w:t>
+      </w:r>
+    </w:p>
+    <w:p>
+      <w:r>
+        <w:t>FamilySearch films 127913, 127869, and 1146342 returned 403 again. [C578]</w:t>
       </w:r>
     </w:p>
     <w:p>
@@ -3266,7 +3459,43 @@
         <w:t>McCoy “Coy” Newnam</w:t>
       </w:r>
       <w:r>
-        <w:t>, born April 1890, married Letha Viola Sullivan at Ola on 18 February 1917. In 1920 they were at Danville, Yell County. In 1930 they were back in Buck Creek, Owsley County. He is the 1926 informant. Living descendants are not named here.</w:t>
+        <w:t xml:space="preserve">, born April 1890, married Letha Viola Sullivan at Ola on 18 February 1917. In 1920 they were at Danville, Yell County. In 1930 they were back in Buck Creek, Owsley County — </w:t>
+      </w:r>
+      <w:r>
+        <w:rPr>
+          <w:b/>
+        </w:rPr>
+        <w:t>Newman, McCoy</w:t>
+      </w:r>
+      <w:r>
+        <w:t xml:space="preserve">, forty, with Edith, twenty-nine, of Missouri. That head is </w:t>
+      </w:r>
+      <w:r>
+        <w:rPr>
+          <w:b/>
+        </w:rPr>
+        <w:t>probable</w:t>
+      </w:r>
+      <w:r>
+        <w:t xml:space="preserve"> Dora’s son. [C561] [C562] [S409] He is the 1926 informant. Kentucky’s death index for 1931–1989 has no McCoy or Coy Newman or Newnam. [C565] He is not an Owsley head in 1940 or 1950. [C574] [C575] A California NUMIDENT row for </w:t>
+      </w:r>
+      <w:r>
+        <w:rPr>
+          <w:b/>
+        </w:rPr>
+        <w:t>MCCOY, NEWMAN</w:t>
+      </w:r>
+      <w:r>
+        <w:t xml:space="preserve">, born 13 April 1890, is </w:t>
+      </w:r>
+      <w:r>
+        <w:rPr>
+          <w:b/>
+        </w:rPr>
+        <w:t>possible</w:t>
+      </w:r>
+      <w:r>
+        <w:t xml:space="preserve"> only and is not merged. [C576] Living descendants are not named here.</w:t>
       </w:r>
     </w:p>
     <w:p>
@@ -3814,22 +4043,67 @@
         <w:t>C522</w:t>
       </w:r>
       <w:r>
-        <w:t>); not merged with Grant (#20) or 1928 St. Helens Frank (#22); John of Owsley chained through 1940 (</w:t>
-      </w:r>
-      <w:r>
-        <w:rPr>
-          <w:b/>
-        </w:rPr>
-        <w:t>C490</w:t>
-      </w:r>
-      <w:r>
-        <w:t xml:space="preserve">) and </w:t>
-      </w:r>
-      <w:r>
-        <w:rPr>
-          <w:b/>
-        </w:rPr>
-        <w:t>1950 Woodford John 70 + Cora 56</w:t>
+        <w:t xml:space="preserve">); not merged with Grant (#20) or 1928 St. Helens Frank (#22); John of Owsley is </w:t>
+      </w:r>
+      <w:r>
+        <w:rPr>
+          <w:b/>
+        </w:rPr>
+        <w:t>PROVEN</w:t>
+      </w:r>
+      <w:r>
+        <w:t xml:space="preserve"> through 1930/1940/1950 (</w:t>
+      </w:r>
+      <w:r>
+        <w:rPr>
+          <w:b/>
+        </w:rPr>
+        <w:t>C557</w:t>
+      </w:r>
+      <w:r>
+        <w:t xml:space="preserve">); 1966 Woodford death </w:t>
+      </w:r>
+      <w:r>
+        <w:rPr>
+          <w:b/>
+        </w:rPr>
+        <w:t>probable</w:t>
+      </w:r>
+      <w:r>
+        <w:t>, not proven (</w:t>
+      </w:r>
+      <w:r>
+        <w:rPr>
+          <w:b/>
+        </w:rPr>
+        <w:t>#26</w:t>
+      </w:r>
+      <w:r>
+        <w:t xml:space="preserve">); McCoy 40 on Buck Creek 1930 </w:t>
+      </w:r>
+      <w:r>
+        <w:rPr>
+          <w:b/>
+        </w:rPr>
+        <w:t>PROBABLE</w:t>
+      </w:r>
+      <w:r>
+        <w:t xml:space="preserve"> P010 (</w:t>
+      </w:r>
+      <w:r>
+        <w:rPr>
+          <w:b/>
+        </w:rPr>
+        <w:t>C562</w:t>
+      </w:r>
+      <w:r>
+        <w:t xml:space="preserve">); 1940/1950 Owsley McCoy head </w:t>
+      </w:r>
+      <w:r>
+        <w:rPr>
+          <w:b/>
+        </w:rPr>
+        <w:t>nil</w:t>
       </w:r>
       <w:r>
         <w:t xml:space="preserve"> (</w:t>
@@ -3838,10 +4112,28 @@
         <w:rPr>
           <w:b/>
         </w:rPr>
-        <w:t>C525/C526 PROBABLE</w:t>
-      </w:r>
-      <w:r>
-        <w:t xml:space="preserve">); 1966 Woodford death </w:t>
+        <w:t>C574 C575</w:t>
+      </w:r>
+      <w:r>
+        <w:t xml:space="preserve">); </w:t>
+      </w:r>
+      <w:r>
+        <w:rPr>
+          <w:b/>
+        </w:rPr>
+        <w:t>447-20-2466</w:t>
+      </w:r>
+      <w:r>
+        <w:t xml:space="preserve"> not merged (</w:t>
+      </w:r>
+      <w:r>
+        <w:rPr>
+          <w:b/>
+        </w:rPr>
+        <w:t>C576</w:t>
+      </w:r>
+      <w:r>
+        <w:t xml:space="preserve">); Daniel × Sarah M./Minerva are </w:t>
       </w:r>
       <w:r>
         <w:rPr>
@@ -3850,24 +4142,6 @@
         <w:t>probable</w:t>
       </w:r>
       <w:r>
-        <w:t>, not proven (</w:t>
-      </w:r>
-      <w:r>
-        <w:rPr>
-          <w:b/>
-        </w:rPr>
-        <w:t>#26</w:t>
-      </w:r>
-      <w:r>
-        <w:t xml:space="preserve">); Daniel × Sarah M./Minerva are </w:t>
-      </w:r>
-      <w:r>
-        <w:rPr>
-          <w:b/>
-        </w:rPr>
-        <w:t>probable</w:t>
-      </w:r>
-      <w:r>
         <w:t xml:space="preserve"> Everett’s parents (</w:t>
       </w:r>
       <w:r>
@@ -3922,7 +4196,7 @@
         <w:t>Advanced this pass:</w:t>
       </w:r>
       <w:r>
-        <w:t xml:space="preserve"> 1950 Woodford John+Cora; Lee 1930 Everett/Grant/Elias; 1890 veterans nil; TFKRHA D3 Arthur reject; D7 unread. </w:t>
+        <w:t xml:space="preserve"> 1920 Owsley reel mapped; sampled name cols nil; 1940/1950 McCoy nil; N-550 John window closed. </w:t>
       </w:r>
       <w:r>
         <w:rPr>
@@ -4002,7 +4276,7 @@
         <w:t>closed</w:t>
       </w:r>
       <w:r>
-        <w:t>. Do not reopen Peebles as a third marriage without a license. Do not print 1868 or 24 February 1906 as facts. Do not print Grant as dead in 1951–1955. Do not print “Sarah Minerva” as a proven dual given. Do not print 1966 as John’s death.</w:t>
+        <w:t>. Do not reopen Peebles as a third marriage without a license. Do not print 1868 or 24 February 1906 as facts. Do not print Grant as dead in 1951–1955. Do not print “Sarah Minerva” as a proven dual given. Do not print 1966 as John’s death. Do not print 1962 as McCoy’s death.</w:t>
       </w:r>
     </w:p>
     <w:p>
@@ -4049,6 +4323,15 @@
         <w:rPr>
           <w:b/>
         </w:rPr>
+        <w:t>B086</w:t>
+      </w:r>
+      <w:r>
+        <w:t xml:space="preserve"> 1920 Owsley remainder, </w:t>
+      </w:r>
+      <w:r>
+        <w:rPr>
+          <w:b/>
+        </w:rPr>
         <w:t>B069/B047</w:t>
       </w:r>
       <w:r>
@@ -4085,19 +4368,19 @@
         <w:rPr>
           <w:b/>
         </w:rPr>
+        <w:t>B085</w:t>
+      </w:r>
+      <w:r>
+        <w:t xml:space="preserve"> McCoy after 1930 (447-20-2466 not merged), </w:t>
+      </w:r>
+      <w:r>
+        <w:rPr>
+          <w:b/>
+        </w:rPr>
         <w:t>B080</w:t>
       </w:r>
       <w:r>
-        <w:t xml:space="preserve">, TFKRHA </w:t>
-      </w:r>
-      <w:r>
-        <w:rPr>
-          <w:b/>
-        </w:rPr>
-        <w:t>D7</w:t>
-      </w:r>
-      <w:r>
-        <w:t xml:space="preserve">, </w:t>
+        <w:t xml:space="preserve"> *Citizen* 1958, </w:t>
       </w:r>
       <w:r>
         <w:rPr>
@@ -6988,7 +7271,16 @@
         <w:t>S406</w:t>
       </w:r>
       <w:r>
-        <w:t xml:space="preserve">. TFKRHA 1930 D3 Arthur Newman 54 + Grant 14 (Henry × Mary). D7 unread. </w:t>
+        <w:t>. TFKRHA 1930 D3 Arthur Newman 54 + Grant 14 (Henry × Mary). D7 annotated page unread; the household is now on the original (</w:t>
+      </w:r>
+      <w:r>
+        <w:rPr>
+          <w:b/>
+        </w:rPr>
+        <w:t>C555</w:t>
+      </w:r>
+      <w:r>
+        <w:t xml:space="preserve">). </w:t>
       </w:r>
       <w:r>
         <w:rPr>
@@ -7004,6 +7296,382 @@
           <w:b/>
         </w:rPr>
         <w:t>S407</w:t>
+      </w:r>
+      <w:r>
+        <w:t>.</w:t>
+      </w:r>
+    </w:p>
+    <w:p>
+      <w:r>
+        <w:t xml:space="preserve">74. 1930 U.S. census, Owsley ED </w:t>
+      </w:r>
+      <w:r>
+        <w:rPr>
+          <w:b/>
+        </w:rPr>
+        <w:t>95-7</w:t>
+      </w:r>
+      <w:r>
+        <w:t xml:space="preserve"> (Buck Creek), T626-773, IA [`kentuckycensus00reel773`](https://archive.org/details/kentuckycensus00reel773) leaves </w:t>
+      </w:r>
+      <w:r>
+        <w:rPr>
+          <w:b/>
+        </w:rPr>
+        <w:t>650–669</w:t>
+      </w:r>
+      <w:r>
+        <w:t xml:space="preserve">. *Image seen.* Hh </w:t>
+      </w:r>
+      <w:r>
+        <w:rPr>
+          <w:b/>
+        </w:rPr>
+        <w:t>131</w:t>
+      </w:r>
+      <w:r>
+        <w:t xml:space="preserve"> </w:t>
+      </w:r>
+      <w:r>
+        <w:rPr>
+          <w:b/>
+        </w:rPr>
+        <w:t>Newman, John L</w:t>
+      </w:r>
+      <w:r>
+        <w:t xml:space="preserve"> 51 + </w:t>
+      </w:r>
+      <w:r>
+        <w:rPr>
+          <w:b/>
+        </w:rPr>
+        <w:t>Cora</w:t>
+      </w:r>
+      <w:r>
+        <w:t xml:space="preserve"> 36 + Pencie + Robert + Florence Combs. Hh </w:t>
+      </w:r>
+      <w:r>
+        <w:rPr>
+          <w:b/>
+        </w:rPr>
+        <w:t>133</w:t>
+      </w:r>
+      <w:r>
+        <w:t xml:space="preserve"> </w:t>
+      </w:r>
+      <w:r>
+        <w:rPr>
+          <w:b/>
+        </w:rPr>
+        <w:t>Newman, McCoy</w:t>
+      </w:r>
+      <w:r>
+        <w:t xml:space="preserve"> 40 + Edith 29 MO. [us-census.org ED list](https://www.us-census.org/states/kentucky/teams/Owsley1930-T626-773.htm). </w:t>
+      </w:r>
+      <w:r>
+        <w:rPr>
+          <w:b/>
+        </w:rPr>
+        <w:t>C555–C563</w:t>
+      </w:r>
+      <w:r>
+        <w:t xml:space="preserve"> </w:t>
+      </w:r>
+      <w:r>
+        <w:rPr>
+          <w:b/>
+        </w:rPr>
+        <w:t>C557</w:t>
+      </w:r>
+      <w:r>
+        <w:t xml:space="preserve"> </w:t>
+      </w:r>
+      <w:r>
+        <w:rPr>
+          <w:b/>
+        </w:rPr>
+        <w:t>S409</w:t>
+      </w:r>
+      <w:r>
+        <w:t xml:space="preserve"> </w:t>
+      </w:r>
+      <w:r>
+        <w:rPr>
+          <w:b/>
+        </w:rPr>
+        <w:t>S410</w:t>
+      </w:r>
+      <w:r>
+        <w:t xml:space="preserve">. Conflict </w:t>
+      </w:r>
+      <w:r>
+        <w:rPr>
+          <w:b/>
+        </w:rPr>
+        <w:t>#26</w:t>
+      </w:r>
+      <w:r>
+        <w:t xml:space="preserve"> open on death date only.</w:t>
+      </w:r>
+    </w:p>
+    <w:p>
+      <w:r>
+        <w:t xml:space="preserve">75. 1920 U.S. census, Owsley EDs </w:t>
+      </w:r>
+      <w:r>
+        <w:rPr>
+          <w:b/>
+        </w:rPr>
+        <w:t>88–94</w:t>
+      </w:r>
+      <w:r>
+        <w:t xml:space="preserve">, T625-594, IA [`14thcensusofpopu594unit`](https://archive.org/details/14thcensusofpopu594unit) leaves </w:t>
+      </w:r>
+      <w:r>
+        <w:rPr>
+          <w:b/>
+        </w:rPr>
+        <w:t>1038–1205</w:t>
+      </w:r>
+      <w:r>
+        <w:t xml:space="preserve">. *Image seen* (headers + sampled name columns). No Buck Creek header yet. Sampled name cols </w:t>
+      </w:r>
+      <w:r>
+        <w:rPr>
+          <w:b/>
+        </w:rPr>
+        <w:t>nil</w:t>
+      </w:r>
+      <w:r>
+        <w:t xml:space="preserve"> Newman/McCoy. [IA item](https://archive.org/details/14thcensusofpopu594unit). </w:t>
+      </w:r>
+      <w:r>
+        <w:rPr>
+          <w:b/>
+        </w:rPr>
+        <w:t>C571–C573</w:t>
+      </w:r>
+      <w:r>
+        <w:t xml:space="preserve"> </w:t>
+      </w:r>
+      <w:r>
+        <w:rPr>
+          <w:b/>
+        </w:rPr>
+        <w:t>S411</w:t>
+      </w:r>
+      <w:r>
+        <w:t xml:space="preserve"> </w:t>
+      </w:r>
+      <w:r>
+        <w:rPr>
+          <w:b/>
+        </w:rPr>
+        <w:t>S412</w:t>
+      </w:r>
+      <w:r>
+        <w:t xml:space="preserve">. Residual </w:t>
+      </w:r>
+      <w:r>
+        <w:rPr>
+          <w:b/>
+        </w:rPr>
+        <w:t>B086</w:t>
+      </w:r>
+      <w:r>
+        <w:t>.</w:t>
+      </w:r>
+    </w:p>
+    <w:p>
+      <w:r>
+        <w:t xml:space="preserve">76. 1940 Owsley EDs </w:t>
+      </w:r>
+      <w:r>
+        <w:rPr>
+          <w:b/>
+        </w:rPr>
+        <w:t>95-1..95-7</w:t>
+      </w:r>
+      <w:r>
+        <w:t xml:space="preserve"> (Kendrick): </w:t>
+      </w:r>
+      <w:r>
+        <w:rPr>
+          <w:b/>
+        </w:rPr>
+        <w:t>nil</w:t>
+      </w:r>
+      <w:r>
+        <w:t xml:space="preserve"> McCoy Newman head. Arthur 63 + Roda + Grant 22 = Henry × Mary. [USGenNet 1940](https://usgennet.org/usa/ky/county/owsley/census/1940/). *Transcription only.* </w:t>
+      </w:r>
+      <w:r>
+        <w:rPr>
+          <w:b/>
+        </w:rPr>
+        <w:t>C574</w:t>
+      </w:r>
+      <w:r>
+        <w:t xml:space="preserve"> </w:t>
+      </w:r>
+      <w:r>
+        <w:rPr>
+          <w:b/>
+        </w:rPr>
+        <w:t>C579</w:t>
+      </w:r>
+      <w:r>
+        <w:t xml:space="preserve"> </w:t>
+      </w:r>
+      <w:r>
+        <w:rPr>
+          <w:b/>
+        </w:rPr>
+        <w:t>C582</w:t>
+      </w:r>
+      <w:r>
+        <w:t xml:space="preserve"> </w:t>
+      </w:r>
+      <w:r>
+        <w:rPr>
+          <w:b/>
+        </w:rPr>
+        <w:t>S413</w:t>
+      </w:r>
+      <w:r>
+        <w:t>.</w:t>
+      </w:r>
+    </w:p>
+    <w:p>
+      <w:r>
+        <w:t xml:space="preserve">77. NARA 1950 name API, Owsley, `state=KY`: McCoy </w:t>
+      </w:r>
+      <w:r>
+        <w:rPr>
+          <w:b/>
+        </w:rPr>
+        <w:t>0</w:t>
+      </w:r>
+      <w:r>
+        <w:t xml:space="preserve">; Newman = Bowman OCR + Clarence. [1950census.archives.gov](https://1950census.archives.gov/). *Index only.* </w:t>
+      </w:r>
+      <w:r>
+        <w:rPr>
+          <w:b/>
+        </w:rPr>
+        <w:t>C575</w:t>
+      </w:r>
+      <w:r>
+        <w:t xml:space="preserve"> </w:t>
+      </w:r>
+      <w:r>
+        <w:rPr>
+          <w:b/>
+        </w:rPr>
+        <w:t>S414</w:t>
+      </w:r>
+      <w:r>
+        <w:t>.</w:t>
+      </w:r>
+    </w:p>
+    <w:p>
+      <w:r>
+        <w:t xml:space="preserve">78. SortedByName </w:t>
+      </w:r>
+      <w:r>
+        <w:rPr>
+          <w:b/>
+        </w:rPr>
+        <w:t>MCCOY, NEWMAN</w:t>
+      </w:r>
+      <w:r>
+        <w:t xml:space="preserve"> b. </w:t>
+      </w:r>
+      <w:r>
+        <w:rPr>
+          <w:b/>
+        </w:rPr>
+        <w:t>13 Apr 1890</w:t>
+      </w:r>
+      <w:r>
+        <w:t xml:space="preserve">, SSN </w:t>
+      </w:r>
+      <w:r>
+        <w:rPr>
+          <w:b/>
+        </w:rPr>
+        <w:t>447-20-2466</w:t>
+      </w:r>
+      <w:r>
+        <w:t xml:space="preserve">, Modesto claim </w:t>
+      </w:r>
+      <w:r>
+        <w:rPr>
+          <w:b/>
+        </w:rPr>
+        <w:t>11 Jul 1962</w:t>
+      </w:r>
+      <w:r>
+        <w:t xml:space="preserve">. [index_939](https://sortedbyname.com/letter_m/mccoy/index_939.html). *Index only.* </w:t>
+      </w:r>
+      <w:r>
+        <w:rPr>
+          <w:b/>
+        </w:rPr>
+        <w:t>POSSIBLE</w:t>
+      </w:r>
+      <w:r>
+        <w:t xml:space="preserve"> inverted P010 — </w:t>
+      </w:r>
+      <w:r>
+        <w:rPr>
+          <w:b/>
+        </w:rPr>
+        <w:t>not merged</w:t>
+      </w:r>
+      <w:r>
+        <w:t xml:space="preserve">. </w:t>
+      </w:r>
+      <w:r>
+        <w:rPr>
+          <w:b/>
+        </w:rPr>
+        <w:t>C576</w:t>
+      </w:r>
+      <w:r>
+        <w:t xml:space="preserve"> </w:t>
+      </w:r>
+      <w:r>
+        <w:rPr>
+          <w:b/>
+        </w:rPr>
+        <w:t>S415</w:t>
+      </w:r>
+      <w:r>
+        <w:t xml:space="preserve">. 1920 KY N-550 John window 4460–4499 </w:t>
+      </w:r>
+      <w:r>
+        <w:rPr>
+          <w:b/>
+        </w:rPr>
+        <w:t>nil</w:t>
+      </w:r>
+      <w:r>
+        <w:t xml:space="preserve"> Owsley. IA [`soundex1920ky117`](https://archive.org/details/soundex1920ky117). </w:t>
+      </w:r>
+      <w:r>
+        <w:rPr>
+          <w:b/>
+        </w:rPr>
+        <w:t>C577</w:t>
+      </w:r>
+      <w:r>
+        <w:t xml:space="preserve"> </w:t>
+      </w:r>
+      <w:r>
+        <w:rPr>
+          <w:b/>
+        </w:rPr>
+        <w:t>C580</w:t>
       </w:r>
       <w:r>
         <w:t>.</w:t>
@@ -7336,6 +8004,46 @@
     <w:p>
       <w:r>
         <w:t>| S408 | `../sources/census/nara-1950-lee-rejects-extract-2026-10-30.txt` | [NARA 1950census](https://1950census.archives.gov/) | Cara P. = Plummer; Johnia rejected | image seen + index |</w:t>
+      </w:r>
+    </w:p>
+    <w:p>
+      <w:r>
+        <w:t>| S409 | `../sources/census/owsley-1930-95-7-0663-john-cora.jpg` · `owsley-1930-95-7-0664-mccoy.jpg` | [IA T626-773](https://archive.org/details/kentuckycensus00reel773) | John L 51 + Cora 36; McCoy 40 + Edith | image seen |</w:t>
+      </w:r>
+    </w:p>
+    <w:p>
+      <w:r>
+        <w:t>| S410 | `../sources/census/owsley-1930-95-7-ed-map.txt` | [us-census.org](https://www.us-census.org/states/kentucky/teams/Owsley1930-T626-773.htm) | 95-7 = Buck Creek; KY 1930 Soundex partial | catalog |</w:t>
+      </w:r>
+    </w:p>
+    <w:p>
+      <w:r>
+        <w:t>| S411 | `../sources/census/owsley-1920-t625-594-pass72-extract-2026-10-30.txt` | [IA T625-594](https://archive.org/details/14thcensusofpopu594unit) | Owsley EDs 88–94 mapped; no Buck Creek header yet | image seen + catalog |</w:t>
+      </w:r>
+    </w:p>
+    <w:p>
+      <w:r>
+        <w:t>| S412 | `../sources/census/owsley-1920-ed88-1038-names.png` | [IA T625-594](https://archive.org/details/14thcensusofpopu594unit) | Sampled 1920 name cols nil Newman/McCoy | image seen |</w:t>
+      </w:r>
+    </w:p>
+    <w:p>
+      <w:r>
+        <w:t>| S413 | `../sources/census/owsley-1940-mccoy-nil-extract-2026-10-30.txt` | [USGenNet 1940](https://usgennet.org/usa/ky/county/owsley/census/1940/) | McCoy head nil; Arthur 63+Roda | transcription only |</w:t>
+      </w:r>
+    </w:p>
+    <w:p>
+      <w:r>
+        <w:t>| S414 | `../sources/census/nara-1950-owsley-mccoy-nil-extract-2026-10-30.txt` | [NARA 1950census](https://1950census.archives.gov/) | Owsley McCoy API 0 | index only |</w:t>
+      </w:r>
+    </w:p>
+    <w:p>
+      <w:r>
+        <w:t>| S415 | `../sources/census/ky1920-n550-john-window-pass72-extract-2026-10-30.txt` | [IA Soundex](https://archive.org/details/soundex1920ky117) · [SortedByName](https://sortedbyname.com/letter_m/mccoy/index_939.html) | John window nil Owsley; 447-20-2466 not merged | image seen + index |</w:t>
+      </w:r>
+    </w:p>
+    <w:p>
+      <w:r>
+        <w:t>| S416 | `../sources/catalog/pass72-fs-403-access-2026-10-30.txt` | FamilySearch catalog | FS 127913/127869/1146342 HTTP 403 | catalog |</w:t>
       </w:r>
     </w:p>
     <w:p>

</xml_diff>

<commit_message>
Pass 68: entire 1920 Cow Creek ED 91 nil Newman; Cale Minerva 73 rejected.
Original T625-594 leaves 1134-1155 close Cow Creek Precinct #4 (sh 4 A-14 A plus unused B). No Newman head. Cale Minerva 73, Allen Ella 30, and two other homonyms are not Henry's widow or Dora. Word rebuilt. Catalog 98 folded.

Co-authored-by: CatCorner22 <CatCorner22@users.noreply.github.com>
</commit_message>
<xml_diff>
--- a/research/dora-ella-newnam/book/Dora-Ella-Newnam-Stone-A-Life.docx
+++ b/research/dora-ella-newnam/book/Dora-Ella-Newnam-Stone-A-Life.docx
@@ -41,7 +41,7 @@
     </w:p>
     <w:p>
       <w:r>
-        <w:t>Ninety-five Cursor chats on this repository were reviewed for this volume (primary research, helpers, scans, and failed browser hunts). The original mobile session opened the case and read the Arkansas death certificate the family still holds. Later sessions recovered the 1880 childhood schedule that free transcripts had missed, walked statewide Soundex reels for 1910 and 1920, tested a Peebles third-marriage hypothesis and set it aside, and photographed NARA microfilm frames — the 1880 childhood schedule, the 1910 Kentucky Ella Miracode plates, Hardin Gray on Sturgeon sheet 13 B, the 1860 Owsley original of Silas Gray’s house with William aged thirteen, the 1850 Owsley Gray pages that are other men (Thomas, James, John, Charles), the given-name Silas plates that are other boys (Ratliff eight months, Wilson six, Phillips fifteen) and the Bowman line first read as Cyrus and then as Squire, the 1850 Estill Marcus Gray original, Breathitt’s Taulbee infant Silas and Bryant Siras, and Madison’s John Green house with Silas Green aged twenty, the 1850 Owsley Harrison Newman house with an eight-year-old Elias who is probably Dora’s father — a 1932 death extract names Henry Harrison Newnam as that father — and is not merged as proven, the 1860 Booneville original of that house under H.H. Newman with Elias aged eighteen, the 1850 William Newman house of twenty-six on the same page, the 1850 John Newman of sixty born in Tennessee who is not the 1880 John of sixty-nine, and Andrew Mays’s Giles at one month in 1850 and eleven in 1860, the 1870 Proctor original of James Brandenburg’s house, Silas Gray’s Sturgeon original, the 1880 District 59 originals of William next door to John Newnam and of Silas still in the district, the 1900 William Gray dwelling-84 crop, and the Bollinger page a sibling had labelled “Dora E. Stone,” which is Henry C. Rhodes and Dora M. of Missouri. This volume folds those chats into one narrative. The case dossier remains the working file; this book is the public reading of it. Sibling work on Greene ED 37 through 41 is now on merged PR #26 through Pass 59; remaining Greene ED 38 B-sides, 1900 Liberty, and 1900 hh 85 are inventoried, not duplicated. Do not import their “Dora E. Stone” as this woman.</w:t>
+        <w:t>Ninety-eight Cursor chats on this repository were reviewed for this volume (primary research, helpers, scans, and failed browser hunts). The original mobile session opened the case and read the Arkansas death certificate the family still holds. Later sessions recovered the 1880 childhood schedule that free transcripts had missed, walked statewide Soundex reels for 1910 and 1920, tested a Peebles third-marriage hypothesis and set it aside, and photographed NARA microfilm frames — the 1880 childhood schedule, the 1910 Kentucky Ella Miracode plates, Hardin Gray on Sturgeon sheet 13 B, the 1860 Owsley original of Silas Gray’s house with William aged thirteen, the 1850 Owsley Gray pages that are other men (Thomas, James, John, Charles), the given-name Silas plates that are other boys (Ratliff eight months, Wilson six, Phillips fifteen) and the Bowman line first read as Cyrus and then as Squire, the 1850 Estill Marcus Gray original, Breathitt’s Taulbee infant Silas and Bryant Siras, and Madison’s John Green house with Silas Green aged twenty, the 1850 Owsley Harrison Newman house with an eight-year-old Elias who is probably Dora’s father — a 1932 death extract names Henry Harrison Newnam as that father — and is not merged as proven, the 1860 Booneville original of that house under H.H. Newman with Elias aged eighteen, the 1850 William Newman house of twenty-six on the same page, the 1850 John Newman of sixty born in Tennessee who is not the 1880 John of sixty-nine, and Andrew Mays’s Giles at one month in 1850 and eleven in 1860, the 1870 Proctor original of James Brandenburg’s house, Silas Gray’s Sturgeon original, the 1880 District 59 originals of William next door to John Newnam and of Silas still in the district, the 1900 William Gray dwelling-84 crop, and the Bollinger page a sibling had labelled “Dora E. Stone,” which is Henry C. Rhodes and Dora M. of Missouri. This volume folds those chats into one narrative. The case dossier remains the working file; this book is the public reading of it. Sibling work on Greene ED 37 through 41 is now on merged PR #26 through Pass 59; remaining Greene ED 38 B-sides, 1900 Liberty, and 1900 hh 85 are inventoried, not duplicated. Do not import their “Dora E. Stone” as this woman.</w:t>
       </w:r>
     </w:p>
     <w:p>
@@ -264,7 +264,61 @@
         <w:t>Minerva</w:t>
       </w:r>
       <w:r>
-        <w:t>, seventy, are other people. Kentucky’s 1920 Soundex has no Manerva or Minerva Newman card, and the Walter given-name window has no Owsley or Lee Walter with Manerva. Kentucky’s 1920 death index has no Manerva Newnam row on 28 August; the Owsley table that day is an infant Bates. Mary Ann Smallwood, born April 1842, came from the Owsley Smallwoods. The 11 July 1918 cemetery date is still unmatched in Kentucky’s civil index. [C669] [C672] [C693] [C694] [C690] [C691] [C709] [C711] [C712] [C713] [C717]</w:t>
+        <w:t xml:space="preserve">, seventy, are other people. Cow Creek Precinct No. 4 — original ED 91, every name column, sheets 1 A through 14 A — has no Newman or Newnam head. Household 110 is </w:t>
+      </w:r>
+      <w:r>
+        <w:rPr>
+          <w:b/>
+        </w:rPr>
+        <w:t>Cale, Tom</w:t>
+      </w:r>
+      <w:r>
+        <w:t xml:space="preserve">, fifty-one, a widower, with sons Lewis and Everett and a </w:t>
+      </w:r>
+      <w:r>
+        <w:rPr>
+          <w:b/>
+        </w:rPr>
+        <w:t>Minerva</w:t>
+      </w:r>
+      <w:r>
+        <w:t xml:space="preserve">, seventy-three, whose relationship cell is written </w:t>
+      </w:r>
+      <w:r>
+        <w:rPr>
+          <w:b/>
+        </w:rPr>
+        <w:t>widower</w:t>
+      </w:r>
+      <w:r>
+        <w:t xml:space="preserve">. She is not Henry’s widow. An </w:t>
+      </w:r>
+      <w:r>
+        <w:rPr>
+          <w:b/>
+        </w:rPr>
+        <w:t>Ella</w:t>
+      </w:r>
+      <w:r>
+        <w:t xml:space="preserve">, thirty, wife of </w:t>
+      </w:r>
+      <w:r>
+        <w:rPr>
+          <w:b/>
+        </w:rPr>
+        <w:t>Robert Allen</w:t>
+      </w:r>
+      <w:r>
+        <w:t xml:space="preserve">, and a twelve-year-old </w:t>
+      </w:r>
+      <w:r>
+        <w:rPr>
+          <w:b/>
+        </w:rPr>
+        <w:t>Dora</w:t>
+      </w:r>
+      <w:r>
+        <w:t xml:space="preserve"> in a Smith house, are other people. Kentucky’s 1920 Soundex has no Manerva or Minerva Newman card, and the Walter given-name window has no Owsley or Lee Walter with Manerva. Kentucky’s 1920 death index has no Manerva Newnam row on 28 August; the Owsley table that day is an infant Bates. Mary Ann Smallwood, born April 1842, came from the Owsley Smallwoods. The 11 July 1918 cemetery date is still unmatched in Kentucky’s civil index. [C669] [C672] [C693] [C694] [C690] [C691] [C709] [C711] [C712] [C713] [C717] [C729] [C730]</w:t>
       </w:r>
     </w:p>
     <w:p>

</xml_diff>

<commit_message>
Pass 69–70: 1920 Owsley ED 88/92/93 originals; 1910 Josie Gilbert.
Booneville, filmed Buffalo, and Buck Creek schedules are nil for Newman
heads. Isolate 1910 Sturgeon Gilbert × Josie 26 as probable Josephine.
Soundex Robert Gilbert 84 is original John, father-in-law of Baker.

Co-authored-by: CatCorner22 <CatCorner22@users.noreply.github.com>
</commit_message>
<xml_diff>
--- a/research/dora-ella-newnam/book/Dora-Ella-Newnam-Stone-A-Life.docx
+++ b/research/dora-ella-newnam/book/Dora-Ella-Newnam-Stone-A-Life.docx
@@ -41,7 +41,7 @@
     </w:p>
     <w:p>
       <w:r>
-        <w:t>Ninety-eight Cursor chats on this repository were reviewed for this volume (primary research, helpers, scans, and failed browser hunts). The original mobile session opened the case and read the Arkansas death certificate the family still holds. Later sessions recovered the 1880 childhood schedule that free transcripts had missed, walked statewide Soundex reels for 1910 and 1920, tested a Peebles third-marriage hypothesis and set it aside, and photographed NARA microfilm frames — the 1880 childhood schedule, the 1910 Kentucky Ella Miracode plates, Hardin Gray on Sturgeon sheet 13 B, the 1860 Owsley original of Silas Gray’s house with William aged thirteen, the 1850 Owsley Gray pages that are other men (Thomas, James, John, Charles), the given-name Silas plates that are other boys (Ratliff eight months, Wilson six, Phillips fifteen) and the Bowman line first read as Cyrus and then as Squire, the 1850 Estill Marcus Gray original, Breathitt’s Taulbee infant Silas and Bryant Siras, and Madison’s John Green house with Silas Green aged twenty, the 1850 Owsley Harrison Newman house with an eight-year-old Elias who is probably Dora’s father — a 1932 death extract names Henry Harrison Newnam as that father — and is not merged as proven, the 1860 Booneville original of that house under H.H. Newman with Elias aged eighteen, the 1850 William Newman house of twenty-six on the same page, the 1850 John Newman of sixty born in Tennessee who is not the 1880 John of sixty-nine, and Andrew Mays’s Giles at one month in 1850 and eleven in 1860, the 1870 Proctor original of James Brandenburg’s house, Silas Gray’s Sturgeon original, the 1880 District 59 originals of William next door to John Newnam and of Silas still in the district, the 1900 William Gray dwelling-84 crop, and the Bollinger page a sibling had labelled “Dora E. Stone,” which is Henry C. Rhodes and Dora M. of Missouri. This volume folds those chats into one narrative. The case dossier remains the working file; this book is the public reading of it. Sibling work on Greene ED 37 through 41 is now on merged PR #26 through Pass 59; remaining Greene ED 38 B-sides, 1900 Liberty, and 1900 hh 85 are inventoried, not duplicated. Do not import their “Dora E. Stone” as this woman.</w:t>
+        <w:t>One hundred fourteen Cursor chats on this repository were reviewed for this volume (primary research, helpers, scans, and failed browser hunts). The original mobile session opened the case and read the Arkansas death certificate the family still holds. Later sessions recovered the 1880 childhood schedule that free transcripts had missed, walked statewide Soundex reels for 1910 and 1920, tested a Peebles third-marriage hypothesis and set it aside, and photographed NARA microfilm frames — the 1880 childhood schedule, the 1910 Kentucky Ella Miracode plates, Hardin Gray on Sturgeon sheet 13 B, the 1860 Owsley original of Silas Gray’s house with William aged thirteen, the 1850 Owsley Gray pages that are other men (Thomas, James, John, Charles), the given-name Silas plates that are other boys (Ratliff eight months, Wilson six, Phillips fifteen) and the Bowman line first read as Cyrus and then as Squire, the 1850 Estill Marcus Gray original, Breathitt’s Taulbee infant Silas and Bryant Siras, and Madison’s John Green house with Silas Green aged twenty, the 1850 Owsley Harrison Newman house with an eight-year-old Elias who is probably Dora’s father — a 1932 death extract names Henry Harrison Newnam as that father — and is not merged as proven, the 1860 Booneville original of that house under H.H. Newman with Elias aged eighteen, the 1850 William Newman house of twenty-six on the same page, the 1850 John Newman of sixty born in Tennessee who is not the 1880 John of sixty-nine, and Andrew Mays’s Giles at one month in 1850 and eleven in 1860, the 1870 Proctor original of James Brandenburg’s house, Silas Gray’s Sturgeon original, the 1880 District 59 originals of William next door to John Newnam and of Silas still in the district, the 1900 William Gray dwelling-84 crop, and the Bollinger page a sibling had labelled “Dora E. Stone,” which is Henry C. Rhodes and Dora M. of Missouri, and the 1920 Booneville, Buffalo, and Buck Creek originals with the rejected Taylor, Marcum, Magee, McIntosh, Baker, and McPherson houses, the 1910 Sturgeon Gilbert×Josie house, Lynch’s wife Laura without a Newman on the original, and the Buffalo Baker household whose Soundex card misnamed Gilbert John as Robert. This volume folds those chats into one narrative. The case dossier remains the working file; this book is the public reading of it. Sibling work on Greene ED 37 through 41 is now on merged PR #26 through Pass 59; remaining Greene ED 38 B-sides, 1900 Liberty, and 1900 hh 85 are inventoried, not duplicated. Do not import their “Dora E. Stone” as this woman.</w:t>
       </w:r>
     </w:p>
     <w:p>
@@ -183,7 +183,61 @@
         <w:t>Omer</w:t>
       </w:r>
       <w:r>
-        <w:t xml:space="preserve">, three. That is probably Henry’s 1900 son; the age is four years light of an October 1878 birth and is not averaged. In January 1920 he is on the Island Creek original — Owsley district 90, sheet 7 A, dwelling 113 — </w:t>
+        <w:t xml:space="preserve">, three. That is probably Henry’s 1900 son; the age is four years light of an October 1878 birth and is not averaged. Two sheets later on that same Sturgeon original — district 165, sheet 9 A, 21 April — dwelling 147 is </w:t>
+      </w:r>
+      <w:r>
+        <w:rPr>
+          <w:b/>
+        </w:rPr>
+        <w:t>Gilbert, Robert</w:t>
+      </w:r>
+      <w:r>
+        <w:t xml:space="preserve">, twenty-nine, in a second marriage of eight years, with </w:t>
+      </w:r>
+      <w:r>
+        <w:rPr>
+          <w:b/>
+        </w:rPr>
+        <w:t>Josie</w:t>
+      </w:r>
+      <w:r>
+        <w:t xml:space="preserve">, twenty-six, in her first marriage of eight years, one child born and none living. They are the only two in the house. That Josie is probably Henry’s 1900 daughter Josephine and the 1916 Josephine Gilbert; the 1910 age matches the extract birth of 19 October 1883, and the 1900 October 1882 is one year earlier and is not averaged. A neighbour on the next sheet, </w:t>
+      </w:r>
+      <w:r>
+        <w:rPr>
+          <w:b/>
+        </w:rPr>
+        <w:t>Lynch, Benton</w:t>
+      </w:r>
+      <w:r>
+        <w:t xml:space="preserve">’s wife </w:t>
+      </w:r>
+      <w:r>
+        <w:rPr>
+          <w:b/>
+        </w:rPr>
+        <w:t>Laura</w:t>
+      </w:r>
+      <w:r>
+        <w:t xml:space="preserve">, thirty-four, is a possible unmerged sister; a published transcript adds Newman in parentheses, which is not on the original. Kentucky’s 1920 Soundex G-416 has no Robert Gilbert of about thirty-nine in Owsley as a head. The only Owsley Robert card is a clerk’s error: the original Buffalo sheet names </w:t>
+      </w:r>
+      <w:r>
+        <w:rPr>
+          <w:b/>
+        </w:rPr>
+        <w:t>Gilbert, John</w:t>
+      </w:r>
+      <w:r>
+        <w:t xml:space="preserve">, eighty-four, father-in-law of </w:t>
+      </w:r>
+      <w:r>
+        <w:rPr>
+          <w:b/>
+        </w:rPr>
+        <w:t>Baker, Robert</w:t>
+      </w:r>
+      <w:r>
+        <w:t xml:space="preserve">, not the 1910 husband. In January 1920 he is on the Island Creek original — Owsley district 90, sheet 7 A, dwelling 113 — </w:t>
       </w:r>
       <w:r>
         <w:rPr>
@@ -318,7 +372,142 @@
         <w:t>Dora</w:t>
       </w:r>
       <w:r>
-        <w:t xml:space="preserve"> in a Smith house, are other people. Kentucky’s 1920 Soundex has no Manerva or Minerva Newman card, and the Walter given-name window has no Owsley or Lee Walter with Manerva. Kentucky’s 1920 death index has no Manerva Newnam row on 28 August; the Owsley table that day is an infant Bates. Mary Ann Smallwood, born April 1842, came from the Owsley Smallwoods. The 11 July 1918 cemetery date is still unmatched in Kentucky’s civil index. [C669] [C672] [C693] [C694] [C690] [C691] [C709] [C711] [C712] [C713] [C717] [C729] [C730]</w:t>
+        <w:t xml:space="preserve"> in a Smith house, are other people. Booneville Precinct No. 1 — original ED 88, every name column, sheets 1 A through 19 A — has no Newman or Newnam head. Household 231 is </w:t>
+      </w:r>
+      <w:r>
+        <w:rPr>
+          <w:b/>
+        </w:rPr>
+        <w:t>Taylor, William</w:t>
+      </w:r>
+      <w:r>
+        <w:t xml:space="preserve">, fifty-two, with a </w:t>
+      </w:r>
+      <w:r>
+        <w:rPr>
+          <w:b/>
+        </w:rPr>
+        <w:t>Manerva</w:t>
+      </w:r>
+      <w:r>
+        <w:t xml:space="preserve">, seventy-three, written </w:t>
+      </w:r>
+      <w:r>
+        <w:rPr>
+          <w:b/>
+        </w:rPr>
+        <w:t>Mother</w:t>
+      </w:r>
+      <w:r>
+        <w:t xml:space="preserve">, a different woman. </w:t>
+      </w:r>
+      <w:r>
+        <w:rPr>
+          <w:b/>
+        </w:rPr>
+        <w:t>Cal Magee</w:t>
+      </w:r>
+      <w:r>
+        <w:t xml:space="preserve">’s wife </w:t>
+      </w:r>
+      <w:r>
+        <w:rPr>
+          <w:b/>
+        </w:rPr>
+        <w:t>Dora</w:t>
+      </w:r>
+      <w:r>
+        <w:t xml:space="preserve">, twenty-five, is another person. </w:t>
+      </w:r>
+      <w:r>
+        <w:rPr>
+          <w:b/>
+        </w:rPr>
+        <w:t>Needham, Sally</w:t>
+      </w:r>
+      <w:r>
+        <w:t xml:space="preserve">, sixty-three, is not a Newman; a </w:t>
+      </w:r>
+      <w:r>
+        <w:rPr>
+          <w:b/>
+        </w:rPr>
+        <w:t>Minerva Maggard</w:t>
+      </w:r>
+      <w:r>
+        <w:t xml:space="preserve">, seventeen, in that house is a different girl. Buffalo Precinct No. 5 — original ED 92, every filmed name column — has no Newman or Newnam head. The first filmed sheet is stamped 1 A on a B-form and opens at household 14; households 1 through 13 are not on that pair. </w:t>
+      </w:r>
+      <w:r>
+        <w:rPr>
+          <w:b/>
+        </w:rPr>
+        <w:t>Millard McIntosh</w:t>
+      </w:r>
+      <w:r>
+        <w:t xml:space="preserve">’s wife </w:t>
+      </w:r>
+      <w:r>
+        <w:rPr>
+          <w:b/>
+        </w:rPr>
+        <w:t>Dora</w:t>
+      </w:r>
+      <w:r>
+        <w:t xml:space="preserve">, thirty-seven, and </w:t>
+      </w:r>
+      <w:r>
+        <w:rPr>
+          <w:b/>
+        </w:rPr>
+        <w:t>John Baker</w:t>
+      </w:r>
+      <w:r>
+        <w:t xml:space="preserve">’s wife </w:t>
+      </w:r>
+      <w:r>
+        <w:rPr>
+          <w:b/>
+        </w:rPr>
+        <w:t>Minervey</w:t>
+      </w:r>
+      <w:r>
+        <w:t xml:space="preserve">, fifty, are other people. Buck Creek Precinct No. 6 — original ED 93, every name column, sheets 1 A through 11 A — has no Newman or Newnam head. Household 94 is </w:t>
+      </w:r>
+      <w:r>
+        <w:rPr>
+          <w:b/>
+        </w:rPr>
+        <w:t>Marcum, Harvey</w:t>
+      </w:r>
+      <w:r>
+        <w:t xml:space="preserve">, fifty-eight, with a </w:t>
+      </w:r>
+      <w:r>
+        <w:rPr>
+          <w:b/>
+        </w:rPr>
+        <w:t>Manerva</w:t>
+      </w:r>
+      <w:r>
+        <w:t xml:space="preserve">, fifty-four, a different woman. </w:t>
+      </w:r>
+      <w:r>
+        <w:rPr>
+          <w:b/>
+        </w:rPr>
+        <w:t>John McPherson</w:t>
+      </w:r>
+      <w:r>
+        <w:t xml:space="preserve">’s wife </w:t>
+      </w:r>
+      <w:r>
+        <w:rPr>
+          <w:b/>
+        </w:rPr>
+        <w:t>Dara</w:t>
+      </w:r>
+      <w:r>
+        <w:t>, forty — the enumerator wrote an open a, not o — is another person. Kentucky’s 1920 Soundex has no Manerva or Minerva Newman card, and the Walter given-name window has no Owsley or Lee Walter with Manerva. Kentucky’s 1920 death index has no Manerva Newnam row on 28 August; the Owsley table that day is an infant Bates. Mary Ann Smallwood, born April 1842, came from the Owsley Smallwoods. The 11 July 1918 cemetery date is still unmatched in Kentucky’s civil index. [C669] [C672] [C693] [C694] [C690] [C691] [C709] [C711] [C712] [C713] [C717] [C729] [C730] [C739] [C740] [C741] [C742] [C743] [C744] [C745] [C746] [C747] [C748] [C752] [C753] [C754] [C756] [C759]</w:t>
       </w:r>
     </w:p>
     <w:p>

</xml_diff>

<commit_message>
Dora passes 73–77: C628 withdrawn; Boyd+Allie Station Camp; Estill couple-close; Powell 1050
Pass 76 corrects the Pass 75 Station Camp nil: Newman, Boyd 45 + Allie 35 are on ED 44 sheet 14B (Soundex N-550 p4130). A second Estill Newman house on ED 43 is not John L. John L + Cora are absent as a couple from 1920 Estill. Jackson contact-sheet nil. Delayed birth Arthur / Allie Brandenbur 24 Jan 1906. Pass 77 maps Powell at leaf 1050 and Wolfe EDs 234–242. FS still 403 (R011-27). Working Word rebuilt; authored latest.docx not overwritten.

Co-authored-by: blakereaganlaw <blakereaganlaw@gmail.com>
</commit_message>
<xml_diff>
--- a/research/dora-ella-newnam/book/Dora-Ella-Newnam-Stone-A-Life.docx
+++ b/research/dora-ella-newnam/book/Dora-Ella-Newnam-Stone-A-Life.docx
@@ -116,6 +116,31 @@
     </w:p>
     <w:p>
       <w:r>
+        <w:t>18. [Pass 73. Buck Creek, 1920 — and John L. is not there](#pass-73-buck-creek-1920--and-john-l-is-not-there)</w:t>
+      </w:r>
+    </w:p>
+    <w:p>
+      <w:r>
+        <w:t>19. [Pass 74. The rest of 1920 Owsley — Arthur only](#pass-74-the-rest-of-1920-owsley--arthur-only)</w:t>
+      </w:r>
+    </w:p>
+    <w:p>
+      <w:r>
+        <w:t>20. [Pass 75. Estill 1920 — Station Camp first](#pass-75-estill-1920--station-camp-first)</w:t>
+      </w:r>
+    </w:p>
+    <w:p>
+      <w:r>
+        <w:t>21. [Pass 76. Station Camp corrected — Boyd and Allie](#pass-76-station-camp-corrected--boyd-and-allie)</w:t>
+      </w:r>
+    </w:p>
+    <w:p>
+      <w:r>
+        <w:t>22. [Pass 77. Powell starts at leaf 1050](#pass-77-powell-starts-at-leaf-1050)</w:t>
+      </w:r>
+    </w:p>
+    <w:p>
+      <w:r>
         <w:br w:type="page"/>
       </w:r>
     </w:p>
@@ -3092,7 +3117,7 @@
     </w:p>
     <w:p>
       <w:r>
-        <w:t>The 1920 Kentucky population reel that holds Owsley is T625-594 — Ohio, Oldham, Owen, and Owsley — on Internet Archive as `14thcensusofpopu594unit`. The metadata names Owsley enumeration districts 88 through 94. The county begins at leaf 1038: Booneville Number 1, district 88, sheet 1A, enumerator W. M. Dooley, 12 January. Sturgeon is 89. Island Creek is 90. Cow Creek is 91. Buffalo is 92. District 93 sits between Buffalo and Wilder. Wilder, district 94, runs to about leaf 1205. No header yet read says Buck Creek. [C571] [C572] [S411]</w:t>
+        <w:t>The 1920 Kentucky population reel that holds Owsley is T625-594 — Ohio, Oldham, Owen, and Owsley — on Internet Archive as `14thcensusofpopu594unit`. The metadata names Owsley enumeration districts 88 through 94. The county begins at leaf 1038: Booneville Number 1, district 88, sheet 1A, enumerator W. M. Dooley, 12 January. Sturgeon is 89. Island Creek is 90. Cow Creek is 91. Buffalo is 92. Pass 72 left district 93 unnamed and read district 94 as Wilder. Pass 73 corrects both. [C571] [C572] [S411]</w:t>
       </w:r>
     </w:p>
     <w:p>
@@ -3130,8 +3155,459 @@
       </w:r>
     </w:p>
     <w:p>
+      <w:pPr>
+        <w:pStyle w:val="Heading2"/>
+      </w:pPr>
+      <w:r>
+        <w:t>Pass 73. Buck Creek, 1920 — and John L. is not there</w:t>
+      </w:r>
+    </w:p>
+    <w:p>
+      <w:r>
+        <w:t xml:space="preserve">The missing precinct is on the reel. Leaf 1170, enumeration district 93, sheet 1A, is </w:t>
+      </w:r>
+      <w:r>
+        <w:rPr>
+          <w:b/>
+        </w:rPr>
+        <w:t>Buckcreek Precinct No. 6</w:t>
+      </w:r>
+      <w:r>
+        <w:t>. The enumerator is W. L. Coley. Magisterial district 6 is the same number Buck Creek carried in 1900 and in 1930. [C584] [S418]</w:t>
+      </w:r>
+    </w:p>
+    <w:p>
+      <w:r>
+        <w:t xml:space="preserve">District 94 is not Wilder. Leaf 1192, sheet 1A, reads </w:t>
+      </w:r>
+      <w:r>
+        <w:rPr>
+          <w:b/>
+        </w:rPr>
+        <w:t>Wild Dog Precinct No. 7</w:t>
+      </w:r>
+      <w:r>
+        <w:t>. The Combs-families excerpt of Robert L. Smith’s 1920 compilation independently lists Buck Creek and Wild Dog. Smith’s Combs households — Ace 16, David 71, Walter 72, Logan 146, Nathan 149, James S. 150, Andy J. 160 — sit on those same original sheets. [C585] [C587] [S419] [S421]</w:t>
+      </w:r>
+    </w:p>
+    <w:p>
+      <w:r>
+        <w:t>The seven 1920 Owsley districts are now named: Booneville, Sturgeon, Island Creek, Cow Creek, Buffalo, Buck Creek, Wild Dog. There is no separate Lucky Fork. [C595] [C597]</w:t>
+      </w:r>
+    </w:p>
+    <w:p>
+      <w:r>
+        <w:t>Buck Creek in January 1920 runs households 1 through 183. The name columns are read. There is no Newman, Newnam, McCoy, or Coy as a surname. Household 134, where John sat with Lillie in 1910, is an Isaacs house. [C586] [C588] [S420]</w:t>
+      </w:r>
+    </w:p>
+    <w:p>
+      <w:r>
+        <w:t xml:space="preserve">John L. and Cora are </w:t>
+      </w:r>
+      <w:r>
+        <w:rPr>
+          <w:b/>
+        </w:rPr>
+        <w:t>proven</w:t>
+      </w:r>
+      <w:r>
+        <w:t xml:space="preserve"> on Buck Creek in 1930 and on Crane Creek in 1940 and in Woodford in 1950. They are </w:t>
+      </w:r>
+      <w:r>
+        <w:rPr>
+          <w:b/>
+        </w:rPr>
+        <w:t>not</w:t>
+      </w:r>
+      <w:r>
+        <w:t xml:space="preserve"> on Buck Creek in 1920. That is a hole of its own — ten years after Lillie’s death and the Cora Brandenburg license, five years before the 1926 informant year, ten years before they reappear next door to McCoy. [C557] [C588]</w:t>
+      </w:r>
+    </w:p>
+    <w:p>
+      <w:r>
+        <w:t>McCoy is not there either. That matches the 1920 Yell County, Arkansas, household already on file. [C589]</w:t>
+      </w:r>
+    </w:p>
+    <w:p>
+      <w:r>
+        <w:t>FamilySearch films 127913, 127891, 127869, 964964, 1146342, 156057, and 97277 returned 403 again. The Lee wills page is still empty. Kentucky’s M1509 draft rolls are mapped — KY45 holds Lee, KY74 holds Owsley — and the cards are still unread. [C583] [C590] [C593] [S417] [S422]</w:t>
+      </w:r>
+    </w:p>
+    <w:p>
       <w:r>
         <w:t>The reconstructed Owsley marriage list that J. W. F. Williams saved after the courthouse fire names Harry H. Newnam in 1864 and a Venable bride in 1880. It does not name Daniel and Sarah. [C508] [S401] The published vital-statistics years still skip 1879–1902. [C505]</w:t>
+      </w:r>
+    </w:p>
+    <w:p>
+      <w:pPr>
+        <w:pStyle w:val="Heading2"/>
+      </w:pPr>
+      <w:r>
+        <w:t>Pass 74. The rest of 1920 Owsley — Arthur only</w:t>
+      </w:r>
+    </w:p>
+    <w:p>
+      <w:r>
+        <w:t>Pass 73 closed Buck Creek. The rest of the reel is now closed. Every name column in Owsley enumeration districts 88, 89, 90, 91, 92, and 94 has been read. [C603] [C606] [C607] [C608] [C609] [C610] [S425]</w:t>
+      </w:r>
+    </w:p>
+    <w:p>
+      <w:r>
+        <w:t xml:space="preserve">There is exactly one Newman household in the county. On Island Creek, district 90, sheet 7A, leaf 1114, 13 January 1920, Oscar J. Judd listed household 113/121: </w:t>
+      </w:r>
+      <w:r>
+        <w:rPr>
+          <w:b/>
+        </w:rPr>
+        <w:t>Newman, Arthur</w:t>
+      </w:r>
+      <w:r>
+        <w:t xml:space="preserve">, forty-five; </w:t>
+      </w:r>
+      <w:r>
+        <w:rPr>
+          <w:b/>
+        </w:rPr>
+        <w:t>Florence</w:t>
+      </w:r>
+      <w:r>
+        <w:t xml:space="preserve">, thirty-three; a son whose given name reads </w:t>
+      </w:r>
+      <w:r>
+        <w:rPr>
+          <w:b/>
+        </w:rPr>
+        <w:t>Omer [?]</w:t>
+      </w:r>
+      <w:r>
+        <w:t xml:space="preserve"> , twelve; and </w:t>
+      </w:r>
+      <w:r>
+        <w:rPr>
+          <w:b/>
+        </w:rPr>
+        <w:t>Grant</w:t>
+      </w:r>
+      <w:r>
+        <w:t>, three and one month. [C600] [C601] [S424] That is the 1930 Sturgeon house of Arthur, fifty-four, with Rhoda and Grant, fourteen, and the 1940 house of Arthur, sixty-three, with Roda and Grant, twenty-two — Henry and Mary’s line. [C602] It is not John L.</w:t>
+      </w:r>
+    </w:p>
+    <w:p>
+      <w:r>
+        <w:t xml:space="preserve">Two same-name traps sit on the same reel. On Cow Creek, household 4/4, </w:t>
+      </w:r>
+      <w:r>
+        <w:rPr>
+          <w:b/>
+        </w:rPr>
+        <w:t>Cole, John L.</w:t>
+      </w:r>
+      <w:r>
+        <w:t xml:space="preserve">, forty-seven, is not a Newman. [C605] On the published Lee 1920 St. Helens page, </w:t>
+      </w:r>
+      <w:r>
+        <w:rPr>
+          <w:b/>
+        </w:rPr>
+        <w:t>John L.</w:t>
+      </w:r>
+      <w:r>
+        <w:t xml:space="preserve">, brother, forty-two, is </w:t>
+      </w:r>
+      <w:r>
+        <w:rPr>
+          <w:b/>
+        </w:rPr>
+        <w:t>John L. Johnson</w:t>
+      </w:r>
+      <w:r>
+        <w:t>, born Kentucky, parents Virginia and North Carolina. [C613] [S426]</w:t>
+      </w:r>
+    </w:p>
+    <w:p>
+      <w:r>
+        <w:t xml:space="preserve">John L. and Cora are </w:t>
+      </w:r>
+      <w:r>
+        <w:rPr>
+          <w:b/>
+        </w:rPr>
+        <w:t>proven</w:t>
+      </w:r>
+      <w:r>
+        <w:t xml:space="preserve"> on Buck Creek in 1930, on Crane Creek in 1940, and in Woodford in 1950. They are </w:t>
+      </w:r>
+      <w:r>
+        <w:rPr>
+          <w:b/>
+        </w:rPr>
+        <w:t>absent from every 1920 Owsley enumeration district</w:t>
+      </w:r>
+      <w:r>
+        <w:t xml:space="preserve"> and from every published Lee 1920 transcript. [C611] [C612] McCoy is not there either.</w:t>
+      </w:r>
+    </w:p>
+    <w:p>
+      <w:r>
+        <w:t xml:space="preserve">The 1918 Owsley birth index still puts them in the county two years earlier: </w:t>
+      </w:r>
+      <w:r>
+        <w:rPr>
+          <w:b/>
+        </w:rPr>
+        <w:t>NEWMAN, ROBERT</w:t>
+      </w:r>
+      <w:r>
+        <w:t xml:space="preserve">, mother </w:t>
+      </w:r>
+      <w:r>
+        <w:rPr>
+          <w:b/>
+        </w:rPr>
+        <w:t>BRANDENBURG, CORA</w:t>
+      </w:r>
+      <w:r>
+        <w:t xml:space="preserve">. That child is </w:t>
+      </w:r>
+      <w:r>
+        <w:rPr>
+          <w:b/>
+        </w:rPr>
+        <w:t>probable</w:t>
+      </w:r>
+      <w:r>
+        <w:t xml:space="preserve"> the Robert L., twelve, of the 1930 house. [C614] [S427] A 1916 Willie whose mother is Cora </w:t>
+      </w:r>
+      <w:r>
+        <w:rPr>
+          <w:b/>
+        </w:rPr>
+        <w:t>Bradburry</w:t>
+      </w:r>
+      <w:r>
+        <w:t xml:space="preserve"> is a different Cora. [C615] Grace, 1912, mother Lillie Isaacs, is a child of John’s first marriage. [C616]</w:t>
+      </w:r>
+    </w:p>
+    <w:p>
+      <w:r>
+        <w:t xml:space="preserve">FamilySearch films 127913, 127891, 127869, 964964, 1146342, 156057, and 97277 returned 403 again. [C617] [S430] A Barney McCoy Newman of White County, Arkansas, husband of Lula Ethel Knupp, is </w:t>
+      </w:r>
+      <w:r>
+        <w:rPr>
+          <w:b/>
+        </w:rPr>
+        <w:t>not</w:t>
+      </w:r>
+      <w:r>
+        <w:t xml:space="preserve"> Dora’s son. [C618] The 1942 George Combs homicide at Vincent is on the death extract; the Courier page does not name the shooter. A later annotation that John Newnam was charged stays </w:t>
+      </w:r>
+      <w:r>
+        <w:rPr>
+          <w:b/>
+        </w:rPr>
+        <w:t>possible</w:t>
+      </w:r>
+      <w:r>
+        <w:t xml:space="preserve"> only. [C619] [C620] [S429] Do not print the charge as fact. The California NUMIDENT number 447-20-2466 still has no free death row. [C621]</w:t>
+      </w:r>
+    </w:p>
+    <w:p>
+      <w:r>
+        <w:t>USGenNet has no published Estill 1920 transcript. That is the next original. [C623]</w:t>
+      </w:r>
+    </w:p>
+    <w:p>
+      <w:pPr>
+        <w:pStyle w:val="Heading2"/>
+      </w:pPr>
+      <w:r>
+        <w:t>Pass 75. Estill 1920 — Station Camp first</w:t>
+      </w:r>
+    </w:p>
+    <w:p>
+      <w:r>
+        <w:t>The Estill County schedules sit on the same 1920 Kentucky reel as Clay, Clinton, and Cumberland: T625-566, Internet Archive `14thcensusofpopu566unit`, 1,152 leaves. Estill begins at leaf 832 with a title card and runs through leaf 1150. The published districts are 36–37, 174–175, and 38–45. [C625] [C626] [S431]</w:t>
+      </w:r>
+    </w:p>
+    <w:p>
+      <w:r>
+        <w:t>East Irvine is 36. West Irvine is 37. Ravenna is 175. Millers Creek is 38. Red Lick is 40. Station Camp — the precinct that touches Owsley — is 44. Williams is 45. [C627] [S432]</w:t>
+      </w:r>
+    </w:p>
+    <w:p>
+      <w:r>
+        <w:t xml:space="preserve">Station Camp, leaves 1098 to 1130, was first read as nil. That reading is </w:t>
+      </w:r>
+      <w:r>
+        <w:rPr>
+          <w:b/>
+        </w:rPr>
+        <w:t>withdrawn</w:t>
+      </w:r>
+      <w:r>
+        <w:t>. Sheet 14B was missed. [C628] [C635]</w:t>
+      </w:r>
+    </w:p>
+    <w:p>
+      <w:r>
+        <w:t>A Henry Johnson on leaf 1118 is not John L. [C629]</w:t>
+      </w:r>
+    </w:p>
+    <w:p>
+      <w:pPr>
+        <w:pStyle w:val="Heading2"/>
+      </w:pPr>
+      <w:r>
+        <w:t>Pass 76. Station Camp corrected — Boyd and Allie</w:t>
+      </w:r>
+    </w:p>
+    <w:p>
+      <w:r>
+        <w:t xml:space="preserve">On 26 January 1920, on Station Camp sheet 14B — Internet Archive leaf 1126 — the household is </w:t>
+      </w:r>
+      <w:r>
+        <w:rPr>
+          <w:b/>
+        </w:rPr>
+        <w:t>Newman, Boyd</w:t>
+      </w:r>
+      <w:r>
+        <w:t xml:space="preserve">, forty-five, and </w:t>
+      </w:r>
+      <w:r>
+        <w:rPr>
+          <w:b/>
+        </w:rPr>
+        <w:t>Allie</w:t>
+      </w:r>
+      <w:r>
+        <w:t>, thirty-five, with Sarah A., fifteen, Arthur, thirteen, Corlue, twelve, Clarence, ten, and younger children, plus a Brandenburg nephew. The Soundex card agrees: N-550, volume 20, ED 44, sheet 14, line 7, card 1 of 2. The card’s “line 7” is slack; the household sits on the B-side. [C634] [C637] [S434]</w:t>
+      </w:r>
+    </w:p>
+    <w:p>
+      <w:r>
+        <w:t>They are not John L. and Cora. Different given names, different ages, different children. [C636]</w:t>
+      </w:r>
+    </w:p>
+    <w:p>
+      <w:r>
+        <w:t xml:space="preserve">Irvine Precinct, ED 43 sheet 8B, 16 January, enumerator West C. Richardson, holds another Newman house: a farm laborer of thirty-four, wife thirty-four, daughter ten, son five, son two. The given names are hard. </w:t>
+      </w:r>
+      <w:r>
+        <w:rPr>
+          <w:b/>
+        </w:rPr>
+        <w:t>[Andridge? / Andy?]</w:t>
+      </w:r>
+      <w:r>
+        <w:t xml:space="preserve"> and </w:t>
+      </w:r>
+      <w:r>
+        <w:rPr>
+          <w:b/>
+        </w:rPr>
+        <w:t>[Sarah?]</w:t>
+      </w:r>
+      <w:r>
+        <w:t xml:space="preserve"> stay in brackets. That couple is not John L. and Cora either. [C633] [C654] [S433]</w:t>
+      </w:r>
+    </w:p>
+    <w:p>
+      <w:r>
+        <w:t xml:space="preserve">The rest of Estill — East and West Irvine, Ravenna, Millers Creek, Red Lick, Thomas, Williams — was walked on name-column contact sheets. No third Newman or McCoy </w:t>
+      </w:r>
+      <w:r>
+        <w:rPr>
+          <w:b/>
+        </w:rPr>
+        <w:t>head</w:t>
+      </w:r>
+      <w:r>
+        <w:t xml:space="preserve"> appeared. Benjamin Nunan on ED 174, John Nunan about thirty-seven on Red Lick, and Hawkins, John L., on district 39 are other surnames. [C639] [C640] [C641] [C642]</w:t>
+      </w:r>
+    </w:p>
+    <w:p>
+      <w:r>
+        <w:t xml:space="preserve">John L. and Cora are </w:t>
+      </w:r>
+      <w:r>
+        <w:rPr>
+          <w:b/>
+        </w:rPr>
+        <w:t>absent as a couple</w:t>
+      </w:r>
+      <w:r>
+        <w:t xml:space="preserve"> from 1920 Estill. They were already absent from every 1920 Owsley district and from the published Lee transcripts. [C643] [C611] [C612]</w:t>
+      </w:r>
+    </w:p>
+    <w:p>
+      <w:r>
+        <w:t>Jackson County sits on T625-577, volume 41, districts 17–28. McKee Town, ED 17 sheet 1A, 2 January, enumerator Allie Baker, opens the county. Contact sheets through leaf 224 — the Jackson end of the reel — show no Newman, Newnam, or McCoy head at that resolution. [C644] [C645] [S436]</w:t>
+      </w:r>
+    </w:p>
+    <w:p>
+      <w:r>
+        <w:t>Breathitt is on T625-559 after Bell. District 41 begins at leaf 901. The name columns on that reel are not yet fully read. The Soundex John of thirty-eight with Jennie, already rejected, is still the wrong man. [C646] [C647]</w:t>
+      </w:r>
+    </w:p>
+    <w:p>
+      <w:r>
+        <w:t xml:space="preserve">A compiled Estill delayed-birth index names </w:t>
+      </w:r>
+      <w:r>
+        <w:rPr>
+          <w:b/>
+        </w:rPr>
+        <w:t>NEWMAN, Arthur</w:t>
+      </w:r>
+      <w:r>
+        <w:t xml:space="preserve">, born 24 January 1906, mother </w:t>
+      </w:r>
+      <w:r>
+        <w:rPr>
+          <w:b/>
+        </w:rPr>
+        <w:t>Allie Brandenbur</w:t>
+      </w:r>
+      <w:r>
+        <w:t xml:space="preserve">, volume 240, certificate 49665. That row is </w:t>
+      </w:r>
+      <w:r>
+        <w:rPr>
+          <w:b/>
+        </w:rPr>
+        <w:t>probable</w:t>
+      </w:r>
+      <w:r>
+        <w:t xml:space="preserve"> the Soundex Arthur, thirteen, in Boyd’s house. Allie is about thirty-five in 1920 — born about 1885. Cora Brandenburg Newman is about twenty-six. They are not the same woman. Same surname, same county cluster: FAN only. [C650] [C651] [S438]</w:t>
+      </w:r>
+    </w:p>
+    <w:p>
+      <w:r>
+        <w:t>FamilySearch films 127913, 127891, 127869, 964964, 1146342, 156057, and 97277 returned 403 again. [C648] [S440]</w:t>
+      </w:r>
+    </w:p>
+    <w:p>
+      <w:pPr>
+        <w:pStyle w:val="Heading2"/>
+      </w:pPr>
+      <w:r>
+        <w:t>Pass 77. Powell starts at leaf 1050</w:t>
+      </w:r>
+    </w:p>
+    <w:p>
+      <w:r>
+        <w:t>Wolfe County is on T625-602. The title card at leaf 2 is Kentucky volume 91: Wayne districts 258–275, Wolfe 234–242, then volume 92 Whitley. The Wolfe schedules themselves are unread. [C652] [S439]</w:t>
+      </w:r>
+    </w:p>
+    <w:p>
+      <w:r>
+        <w:t>Powell County is on T625-596 after Pike. The county card is leaf 1050: districts 142 and 177, 143 to 146, and 178. Pike still occupies leaf 1000. District 142, Stanton Precinct, begins on leaf 1051, 13 January 1920. The first household’s wife is a Dora — not Dora Ella Newnam Stone; the surname is not hers and the age is wrong. Clay City, district 144, is at leaf 1100. District 178 is at leaf 1180. Those name columns are the next walk. [C655] [C656] [C657]</w:t>
+      </w:r>
+    </w:p>
+    <w:p>
+      <w:r>
+        <w:t>FamilySearch films 127913, 127869, and 1146342 returned 403 again. [C617]</w:t>
       </w:r>
     </w:p>
     <w:p>
@@ -4061,6 +4537,78 @@
         <w:t>C557</w:t>
       </w:r>
       <w:r>
+        <w:t xml:space="preserve">) and </w:t>
+      </w:r>
+      <w:r>
+        <w:rPr>
+          <w:b/>
+        </w:rPr>
+        <w:t>absent</w:t>
+      </w:r>
+      <w:r>
+        <w:t xml:space="preserve"> from </w:t>
+      </w:r>
+      <w:r>
+        <w:rPr>
+          <w:b/>
+        </w:rPr>
+        <w:t>entire 1920 Owsley</w:t>
+      </w:r>
+      <w:r>
+        <w:t xml:space="preserve"> (</w:t>
+      </w:r>
+      <w:r>
+        <w:rPr>
+          <w:b/>
+        </w:rPr>
+        <w:t>C611</w:t>
+      </w:r>
+      <w:r>
+        <w:t>), published Lee 1920 (</w:t>
+      </w:r>
+      <w:r>
+        <w:rPr>
+          <w:b/>
+        </w:rPr>
+        <w:t>C612</w:t>
+      </w:r>
+      <w:r>
+        <w:t xml:space="preserve">), and </w:t>
+      </w:r>
+      <w:r>
+        <w:rPr>
+          <w:b/>
+        </w:rPr>
+        <w:t>absent as a couple</w:t>
+      </w:r>
+      <w:r>
+        <w:t xml:space="preserve"> from 1920 Estill (</w:t>
+      </w:r>
+      <w:r>
+        <w:rPr>
+          <w:b/>
+        </w:rPr>
+        <w:t>C643</w:t>
+      </w:r>
+      <w:r>
+        <w:t xml:space="preserve">; Station Camp </w:t>
+      </w:r>
+      <w:r>
+        <w:rPr>
+          <w:b/>
+        </w:rPr>
+        <w:t>nil withdrawn</w:t>
+      </w:r>
+      <w:r>
+        <w:t xml:space="preserve"> — Boyd+Allie </w:t>
+      </w:r>
+      <w:r>
+        <w:rPr>
+          <w:b/>
+        </w:rPr>
+        <w:t>C634 C635</w:t>
+      </w:r>
+      <w:r>
         <w:t xml:space="preserve">); 1966 Woodford death </w:t>
       </w:r>
       <w:r>
@@ -4097,7 +4645,7 @@
         <w:t>C562</w:t>
       </w:r>
       <w:r>
-        <w:t xml:space="preserve">); 1940/1950 Owsley McCoy head </w:t>
+        <w:t xml:space="preserve">); 1920 Owsley / 1940/1950 Owsley McCoy head </w:t>
       </w:r>
       <w:r>
         <w:rPr>
@@ -4112,7 +4660,7 @@
         <w:rPr>
           <w:b/>
         </w:rPr>
-        <w:t>C574 C575</w:t>
+        <w:t>C611 C574 C575</w:t>
       </w:r>
       <w:r>
         <w:t xml:space="preserve">); </w:t>
@@ -4133,6 +4681,60 @@
         <w:t>C576</w:t>
       </w:r>
       <w:r>
+        <w:t xml:space="preserve">); Barney McCoy Newman of AR </w:t>
+      </w:r>
+      <w:r>
+        <w:rPr>
+          <w:b/>
+        </w:rPr>
+        <w:t>rejected</w:t>
+      </w:r>
+      <w:r>
+        <w:t xml:space="preserve"> (</w:t>
+      </w:r>
+      <w:r>
+        <w:rPr>
+          <w:b/>
+        </w:rPr>
+        <w:t>C618</w:t>
+      </w:r>
+      <w:r>
+        <w:t xml:space="preserve">); 1918 Robert / Cora Brandenburg </w:t>
+      </w:r>
+      <w:r>
+        <w:rPr>
+          <w:b/>
+        </w:rPr>
+        <w:t>probable</w:t>
+      </w:r>
+      <w:r>
+        <w:t xml:space="preserve"> their son (</w:t>
+      </w:r>
+      <w:r>
+        <w:rPr>
+          <w:b/>
+        </w:rPr>
+        <w:t>C614</w:t>
+      </w:r>
+      <w:r>
+        <w:t xml:space="preserve">); 1942 Combs charge </w:t>
+      </w:r>
+      <w:r>
+        <w:rPr>
+          <w:b/>
+        </w:rPr>
+        <w:t>possible</w:t>
+      </w:r>
+      <w:r>
+        <w:t xml:space="preserve"> authored only (</w:t>
+      </w:r>
+      <w:r>
+        <w:rPr>
+          <w:b/>
+        </w:rPr>
+        <w:t>C619</w:t>
+      </w:r>
+      <w:r>
         <w:t xml:space="preserve">); Daniel × Sarah M./Minerva are </w:t>
       </w:r>
       <w:r>
@@ -4193,10 +4795,28 @@
         <w:rPr>
           <w:b/>
         </w:rPr>
-        <w:t>Advanced this pass:</w:t>
-      </w:r>
-      <w:r>
-        <w:t xml:space="preserve"> 1920 Owsley reel mapped; sampled name cols nil; 1940/1950 McCoy nil; N-550 John window closed. </w:t>
+        <w:t>Done this increment:</w:t>
+      </w:r>
+      <w:r>
+        <w:t xml:space="preserve"> Estill 1920 couple-close; Boyd+Allie Station Camp; Jackson contact-sheet; Powell mapped; Arthur delayed birth. </w:t>
+      </w:r>
+      <w:r>
+        <w:rPr>
+          <w:b/>
+        </w:rPr>
+        <w:t>Done earlier:</w:t>
+      </w:r>
+      <w:r>
+        <w:t xml:space="preserve"> 1920 Owsley county (</w:t>
+      </w:r>
+      <w:r>
+        <w:rPr>
+          <w:b/>
+        </w:rPr>
+        <w:t>B086</w:t>
+      </w:r>
+      <w:r>
+        <w:t xml:space="preserve">); Arthur 45 Island Creek only Newman. </w:t>
       </w:r>
       <w:r>
         <w:rPr>
@@ -4276,7 +4896,7 @@
         <w:t>closed</w:t>
       </w:r>
       <w:r>
-        <w:t>. Do not reopen Peebles as a third marriage without a license. Do not print 1868 or 24 February 1906 as facts. Do not print Grant as dead in 1951–1955. Do not print “Sarah Minerva” as a proven dual given. Do not print 1966 as John’s death. Do not print 1962 as McCoy’s death.</w:t>
+        <w:t>. Do not reopen Peebles as a third marriage without a license. Do not print 1868 or 24 February 1906 as facts. Do not print Grant as dead in 1951–1955. Do not print “Sarah Minerva” as a proven dual given. Do not print 1966 as John’s death. Do not print 1962 as McCoy’s death. Do not print the 1942 Combs charge as fact.</w:t>
       </w:r>
     </w:p>
     <w:p>
@@ -4287,6 +4907,69 @@
         <w:rPr>
           <w:b/>
         </w:rPr>
+        <w:t>B088</w:t>
+      </w:r>
+      <w:r>
+        <w:t xml:space="preserve"> remaining Breathitt T625-</w:t>
+      </w:r>
+      <w:r>
+        <w:rPr>
+          <w:b/>
+        </w:rPr>
+        <w:t>559</w:t>
+      </w:r>
+      <w:r>
+        <w:t xml:space="preserve"> name columns, then Powell T625-</w:t>
+      </w:r>
+      <w:r>
+        <w:rPr>
+          <w:b/>
+        </w:rPr>
+        <w:t>596</w:t>
+      </w:r>
+      <w:r>
+        <w:t xml:space="preserve"> (from leaf </w:t>
+      </w:r>
+      <w:r>
+        <w:rPr>
+          <w:b/>
+        </w:rPr>
+        <w:t>1051</w:t>
+      </w:r>
+      <w:r>
+        <w:t>) and Wolfe T625-</w:t>
+      </w:r>
+      <w:r>
+        <w:rPr>
+          <w:b/>
+        </w:rPr>
+        <w:t>602</w:t>
+      </w:r>
+      <w:r>
+        <w:t xml:space="preserve"> EDs </w:t>
+      </w:r>
+      <w:r>
+        <w:rPr>
+          <w:b/>
+        </w:rPr>
+        <w:t>234–242</w:t>
+      </w:r>
+      <w:r>
+        <w:t xml:space="preserve">. Then </w:t>
+      </w:r>
+      <w:r>
+        <w:rPr>
+          <w:b/>
+        </w:rPr>
+        <w:t>B089</w:t>
+      </w:r>
+      <w:r>
+        <w:t xml:space="preserve"> Boyd × Allie, </w:t>
+      </w:r>
+      <w:r>
+        <w:rPr>
+          <w:b/>
+        </w:rPr>
         <w:t>B045</w:t>
       </w:r>
       <w:r>
@@ -4317,16 +5000,16 @@
         <w:t>127869 / 964964</w:t>
       </w:r>
       <w:r>
-        <w:t xml:space="preserve">). Then </w:t>
-      </w:r>
-      <w:r>
-        <w:rPr>
-          <w:b/>
-        </w:rPr>
-        <w:t>B086</w:t>
-      </w:r>
-      <w:r>
-        <w:t xml:space="preserve"> 1920 Owsley remainder, </w:t>
+        <w:t xml:space="preserve">), </w:t>
+      </w:r>
+      <w:r>
+        <w:rPr>
+          <w:b/>
+        </w:rPr>
+        <w:t>B087</w:t>
+      </w:r>
+      <w:r>
+        <w:t xml:space="preserve"> 1942 Combs charge, </w:t>
       </w:r>
       <w:r>
         <w:rPr>
@@ -4371,7 +5054,7 @@
         <w:t>B085</w:t>
       </w:r>
       <w:r>
-        <w:t xml:space="preserve"> McCoy after 1930 (447-20-2466 not merged), </w:t>
+        <w:t xml:space="preserve"> McCoy after 1930 (447-20-2466 not merged; Barney McCoy AR rejected), </w:t>
       </w:r>
       <w:r>
         <w:rPr>
@@ -7434,7 +8117,57 @@
         <w:t>1038–1205</w:t>
       </w:r>
       <w:r>
-        <w:t xml:space="preserve">. *Image seen* (headers + sampled name columns). No Buck Creek header yet. Sampled name cols </w:t>
+        <w:t xml:space="preserve">. *Image seen* (headers + sampled name columns). Pass 72 left ED 93 unnamed. [IA item](https://archive.org/details/14thcensusofpopu594unit). </w:t>
+      </w:r>
+      <w:r>
+        <w:rPr>
+          <w:b/>
+        </w:rPr>
+        <w:t>C571–C573</w:t>
+      </w:r>
+      <w:r>
+        <w:t xml:space="preserve"> </w:t>
+      </w:r>
+      <w:r>
+        <w:rPr>
+          <w:b/>
+        </w:rPr>
+        <w:t>S411</w:t>
+      </w:r>
+      <w:r>
+        <w:t xml:space="preserve"> </w:t>
+      </w:r>
+      <w:r>
+        <w:rPr>
+          <w:b/>
+        </w:rPr>
+        <w:t>S412</w:t>
+      </w:r>
+      <w:r>
+        <w:t xml:space="preserve">. Residual then </w:t>
+      </w:r>
+      <w:r>
+        <w:rPr>
+          <w:b/>
+        </w:rPr>
+        <w:t>B086</w:t>
+      </w:r>
+      <w:r>
+        <w:t>.</w:t>
+      </w:r>
+    </w:p>
+    <w:p>
+      <w:r>
+        <w:t xml:space="preserve">76. 1940 Owsley EDs </w:t>
+      </w:r>
+      <w:r>
+        <w:rPr>
+          <w:b/>
+        </w:rPr>
+        <w:t>95-1..95-7</w:t>
+      </w:r>
+      <w:r>
+        <w:t xml:space="preserve"> (Kendrick): </w:t>
       </w:r>
       <w:r>
         <w:rPr>
@@ -7443,13 +8176,13 @@
         <w:t>nil</w:t>
       </w:r>
       <w:r>
-        <w:t xml:space="preserve"> Newman/McCoy. [IA item](https://archive.org/details/14thcensusofpopu594unit). </w:t>
-      </w:r>
-      <w:r>
-        <w:rPr>
-          <w:b/>
-        </w:rPr>
-        <w:t>C571–C573</w:t>
+        <w:t xml:space="preserve"> McCoy Newman head. Arthur 63 + Roda + Grant 22 = Henry × Mary. [USGenNet 1940](https://usgennet.org/usa/ky/county/owsley/census/1940/). *Transcription only.* </w:t>
+      </w:r>
+      <w:r>
+        <w:rPr>
+          <w:b/>
+        </w:rPr>
+        <w:t>C574</w:t>
       </w:r>
       <w:r>
         <w:t xml:space="preserve"> </w:t>
@@ -7458,7 +8191,7 @@
         <w:rPr>
           <w:b/>
         </w:rPr>
-        <w:t>S411</w:t>
+        <w:t>C579</w:t>
       </w:r>
       <w:r>
         <w:t xml:space="preserve"> </w:t>
@@ -7467,16 +8200,16 @@
         <w:rPr>
           <w:b/>
         </w:rPr>
-        <w:t>S412</w:t>
-      </w:r>
-      <w:r>
-        <w:t xml:space="preserve">. Residual </w:t>
-      </w:r>
-      <w:r>
-        <w:rPr>
-          <w:b/>
-        </w:rPr>
-        <w:t>B086</w:t>
+        <w:t>C582</w:t>
+      </w:r>
+      <w:r>
+        <w:t xml:space="preserve"> </w:t>
+      </w:r>
+      <w:r>
+        <w:rPr>
+          <w:b/>
+        </w:rPr>
+        <w:t>S413</w:t>
       </w:r>
       <w:r>
         <w:t>.</w:t>
@@ -7484,16 +8217,111 @@
     </w:p>
     <w:p>
       <w:r>
-        <w:t xml:space="preserve">76. 1940 Owsley EDs </w:t>
-      </w:r>
-      <w:r>
-        <w:rPr>
-          <w:b/>
-        </w:rPr>
-        <w:t>95-1..95-7</w:t>
-      </w:r>
-      <w:r>
-        <w:t xml:space="preserve"> (Kendrick): </w:t>
+        <w:t xml:space="preserve">77. NARA 1950 name API, Owsley, `state=KY`: McCoy </w:t>
+      </w:r>
+      <w:r>
+        <w:rPr>
+          <w:b/>
+        </w:rPr>
+        <w:t>0</w:t>
+      </w:r>
+      <w:r>
+        <w:t xml:space="preserve">; Newman = Bowman OCR + Clarence. [1950census.archives.gov](https://1950census.archives.gov/). *Index only.* </w:t>
+      </w:r>
+      <w:r>
+        <w:rPr>
+          <w:b/>
+        </w:rPr>
+        <w:t>C575</w:t>
+      </w:r>
+      <w:r>
+        <w:t xml:space="preserve"> </w:t>
+      </w:r>
+      <w:r>
+        <w:rPr>
+          <w:b/>
+        </w:rPr>
+        <w:t>S414</w:t>
+      </w:r>
+      <w:r>
+        <w:t>.</w:t>
+      </w:r>
+    </w:p>
+    <w:p>
+      <w:r>
+        <w:t xml:space="preserve">78. SortedByName </w:t>
+      </w:r>
+      <w:r>
+        <w:rPr>
+          <w:b/>
+        </w:rPr>
+        <w:t>MCCOY, NEWMAN</w:t>
+      </w:r>
+      <w:r>
+        <w:t xml:space="preserve"> b. </w:t>
+      </w:r>
+      <w:r>
+        <w:rPr>
+          <w:b/>
+        </w:rPr>
+        <w:t>13 Apr 1890</w:t>
+      </w:r>
+      <w:r>
+        <w:t xml:space="preserve">, SSN </w:t>
+      </w:r>
+      <w:r>
+        <w:rPr>
+          <w:b/>
+        </w:rPr>
+        <w:t>447-20-2466</w:t>
+      </w:r>
+      <w:r>
+        <w:t xml:space="preserve">, Modesto claim </w:t>
+      </w:r>
+      <w:r>
+        <w:rPr>
+          <w:b/>
+        </w:rPr>
+        <w:t>11 Jul 1962</w:t>
+      </w:r>
+      <w:r>
+        <w:t xml:space="preserve">. [index_939](https://sortedbyname.com/letter_m/mccoy/index_939.html). *Index only.* </w:t>
+      </w:r>
+      <w:r>
+        <w:rPr>
+          <w:b/>
+        </w:rPr>
+        <w:t>POSSIBLE</w:t>
+      </w:r>
+      <w:r>
+        <w:t xml:space="preserve"> inverted P010 — </w:t>
+      </w:r>
+      <w:r>
+        <w:rPr>
+          <w:b/>
+        </w:rPr>
+        <w:t>not merged</w:t>
+      </w:r>
+      <w:r>
+        <w:t xml:space="preserve">. </w:t>
+      </w:r>
+      <w:r>
+        <w:rPr>
+          <w:b/>
+        </w:rPr>
+        <w:t>C576</w:t>
+      </w:r>
+      <w:r>
+        <w:t xml:space="preserve"> </w:t>
+      </w:r>
+      <w:r>
+        <w:rPr>
+          <w:b/>
+        </w:rPr>
+        <w:t>S415</w:t>
+      </w:r>
+      <w:r>
+        <w:t xml:space="preserve">. 1920 KY N-550 John window 4460–4499 </w:t>
       </w:r>
       <w:r>
         <w:rPr>
@@ -7502,13 +8330,13 @@
         <w:t>nil</w:t>
       </w:r>
       <w:r>
-        <w:t xml:space="preserve"> McCoy Newman head. Arthur 63 + Roda + Grant 22 = Henry × Mary. [USGenNet 1940](https://usgennet.org/usa/ky/county/owsley/census/1940/). *Transcription only.* </w:t>
-      </w:r>
-      <w:r>
-        <w:rPr>
-          <w:b/>
-        </w:rPr>
-        <w:t>C574</w:t>
+        <w:t xml:space="preserve"> Owsley. IA [`soundex1920ky117`](https://archive.org/details/soundex1920ky117). </w:t>
+      </w:r>
+      <w:r>
+        <w:rPr>
+          <w:b/>
+        </w:rPr>
+        <w:t>C577</w:t>
       </w:r>
       <w:r>
         <w:t xml:space="preserve"> </w:t>
@@ -7517,7 +8345,57 @@
         <w:rPr>
           <w:b/>
         </w:rPr>
-        <w:t>C579</w:t>
+        <w:t>C580</w:t>
+      </w:r>
+      <w:r>
+        <w:t>.</w:t>
+      </w:r>
+    </w:p>
+    <w:p>
+      <w:r>
+        <w:t xml:space="preserve">79. 1920 U.S. census, Owsley ED </w:t>
+      </w:r>
+      <w:r>
+        <w:rPr>
+          <w:b/>
+        </w:rPr>
+        <w:t>93</w:t>
+      </w:r>
+      <w:r>
+        <w:t xml:space="preserve"> sh </w:t>
+      </w:r>
+      <w:r>
+        <w:rPr>
+          <w:b/>
+        </w:rPr>
+        <w:t>1A</w:t>
+      </w:r>
+      <w:r>
+        <w:t xml:space="preserve"> leaf </w:t>
+      </w:r>
+      <w:r>
+        <w:rPr>
+          <w:b/>
+        </w:rPr>
+        <w:t>1170</w:t>
+      </w:r>
+      <w:r>
+        <w:t xml:space="preserve">: township </w:t>
+      </w:r>
+      <w:r>
+        <w:rPr>
+          <w:b/>
+        </w:rPr>
+        <w:t>Buckcreek Precinct No. 6</w:t>
+      </w:r>
+      <w:r>
+        <w:t xml:space="preserve">. IA [`14thcensusofpopu594unit`](https://archive.org/details/14thcensusofpopu594unit). *Image seen.* </w:t>
+      </w:r>
+      <w:r>
+        <w:rPr>
+          <w:b/>
+        </w:rPr>
+        <w:t>C584</w:t>
       </w:r>
       <w:r>
         <w:t xml:space="preserve"> </w:t>
@@ -7526,7 +8404,7 @@
         <w:rPr>
           <w:b/>
         </w:rPr>
-        <w:t>C582</w:t>
+        <w:t>C595</w:t>
       </w:r>
       <w:r>
         <w:t xml:space="preserve"> </w:t>
@@ -7535,7 +8413,7 @@
         <w:rPr>
           <w:b/>
         </w:rPr>
-        <w:t>S413</w:t>
+        <w:t>S418</w:t>
       </w:r>
       <w:r>
         <w:t>.</w:t>
@@ -7543,22 +8421,49 @@
     </w:p>
     <w:p>
       <w:r>
-        <w:t xml:space="preserve">77. NARA 1950 name API, Owsley, `state=KY`: McCoy </w:t>
-      </w:r>
-      <w:r>
-        <w:rPr>
-          <w:b/>
-        </w:rPr>
-        <w:t>0</w:t>
-      </w:r>
-      <w:r>
-        <w:t xml:space="preserve">; Newman = Bowman OCR + Clarence. [1950census.archives.gov](https://1950census.archives.gov/). *Index only.* </w:t>
-      </w:r>
-      <w:r>
-        <w:rPr>
-          <w:b/>
-        </w:rPr>
-        <w:t>C575</w:t>
+        <w:t xml:space="preserve">80. Same ED, households </w:t>
+      </w:r>
+      <w:r>
+        <w:rPr>
+          <w:b/>
+        </w:rPr>
+        <w:t>1–183</w:t>
+      </w:r>
+      <w:r>
+        <w:t xml:space="preserve"> (leaves </w:t>
+      </w:r>
+      <w:r>
+        <w:rPr>
+          <w:b/>
+        </w:rPr>
+        <w:t>1170–1190</w:t>
+      </w:r>
+      <w:r>
+        <w:t xml:space="preserve">): </w:t>
+      </w:r>
+      <w:r>
+        <w:rPr>
+          <w:b/>
+        </w:rPr>
+        <w:t>nil</w:t>
+      </w:r>
+      <w:r>
+        <w:t xml:space="preserve"> Newman/Newnam/McCoy. 1910 John hh </w:t>
+      </w:r>
+      <w:r>
+        <w:rPr>
+          <w:b/>
+        </w:rPr>
+        <w:t>134</w:t>
+      </w:r>
+      <w:r>
+        <w:t xml:space="preserve"> is 1920 Isaacs. [Combs 1920 excerpt](https://combs-families.org/combs/records/ky/owsley/1920.htm) names Buck Creek + Wild Dog. </w:t>
+      </w:r>
+      <w:r>
+        <w:rPr>
+          <w:b/>
+        </w:rPr>
+        <w:t>C586</w:t>
       </w:r>
       <w:r>
         <w:t xml:space="preserve"> </w:t>
@@ -7567,7 +8472,43 @@
         <w:rPr>
           <w:b/>
         </w:rPr>
-        <w:t>S414</w:t>
+        <w:t>C588</w:t>
+      </w:r>
+      <w:r>
+        <w:t xml:space="preserve"> </w:t>
+      </w:r>
+      <w:r>
+        <w:rPr>
+          <w:b/>
+        </w:rPr>
+        <w:t>C589</w:t>
+      </w:r>
+      <w:r>
+        <w:t xml:space="preserve"> </w:t>
+      </w:r>
+      <w:r>
+        <w:rPr>
+          <w:b/>
+        </w:rPr>
+        <w:t>C587</w:t>
+      </w:r>
+      <w:r>
+        <w:t xml:space="preserve"> </w:t>
+      </w:r>
+      <w:r>
+        <w:rPr>
+          <w:b/>
+        </w:rPr>
+        <w:t>S419</w:t>
+      </w:r>
+      <w:r>
+        <w:t xml:space="preserve"> </w:t>
+      </w:r>
+      <w:r>
+        <w:rPr>
+          <w:b/>
+        </w:rPr>
+        <w:t>S420</w:t>
       </w:r>
       <w:r>
         <w:t>.</w:t>
@@ -7575,25 +8516,446 @@
     </w:p>
     <w:p>
       <w:r>
-        <w:t xml:space="preserve">78. SortedByName </w:t>
-      </w:r>
-      <w:r>
-        <w:rPr>
-          <w:b/>
-        </w:rPr>
-        <w:t>MCCOY, NEWMAN</w:t>
-      </w:r>
-      <w:r>
-        <w:t xml:space="preserve"> b. </w:t>
-      </w:r>
-      <w:r>
-        <w:rPr>
-          <w:b/>
-        </w:rPr>
-        <w:t>13 Apr 1890</w:t>
-      </w:r>
-      <w:r>
-        <w:t xml:space="preserve">, SSN </w:t>
+        <w:t xml:space="preserve">81. 1920 Owsley ED </w:t>
+      </w:r>
+      <w:r>
+        <w:rPr>
+          <w:b/>
+        </w:rPr>
+        <w:t>94</w:t>
+      </w:r>
+      <w:r>
+        <w:t xml:space="preserve"> sh </w:t>
+      </w:r>
+      <w:r>
+        <w:rPr>
+          <w:b/>
+        </w:rPr>
+        <w:t>1A</w:t>
+      </w:r>
+      <w:r>
+        <w:t xml:space="preserve"> leaf </w:t>
+      </w:r>
+      <w:r>
+        <w:rPr>
+          <w:b/>
+        </w:rPr>
+        <w:t>1192</w:t>
+      </w:r>
+      <w:r>
+        <w:t xml:space="preserve">: </w:t>
+      </w:r>
+      <w:r>
+        <w:rPr>
+          <w:b/>
+        </w:rPr>
+        <w:t>Wild Dog Precinct No. 7</w:t>
+      </w:r>
+      <w:r>
+        <w:t xml:space="preserve"> (not Wilder). *Image seen.* </w:t>
+      </w:r>
+      <w:r>
+        <w:rPr>
+          <w:b/>
+        </w:rPr>
+        <w:t>C585</w:t>
+      </w:r>
+      <w:r>
+        <w:t xml:space="preserve"> </w:t>
+      </w:r>
+      <w:r>
+        <w:rPr>
+          <w:b/>
+        </w:rPr>
+        <w:t>C598</w:t>
+      </w:r>
+      <w:r>
+        <w:t xml:space="preserve"> </w:t>
+      </w:r>
+      <w:r>
+        <w:rPr>
+          <w:b/>
+        </w:rPr>
+        <w:t>S421</w:t>
+      </w:r>
+      <w:r>
+        <w:t xml:space="preserve">. FS catalog </w:t>
+      </w:r>
+      <w:r>
+        <w:rPr>
+          <w:b/>
+        </w:rPr>
+        <w:t>403</w:t>
+      </w:r>
+      <w:r>
+        <w:t xml:space="preserve"> again (</w:t>
+      </w:r>
+      <w:r>
+        <w:rPr>
+          <w:b/>
+        </w:rPr>
+        <w:t>C583</w:t>
+      </w:r>
+      <w:r>
+        <w:t xml:space="preserve"> </w:t>
+      </w:r>
+      <w:r>
+        <w:rPr>
+          <w:b/>
+        </w:rPr>
+        <w:t>S417</w:t>
+      </w:r>
+      <w:r>
+        <w:t xml:space="preserve">). M1509 </w:t>
+      </w:r>
+      <w:r>
+        <w:rPr>
+          <w:b/>
+        </w:rPr>
+        <w:t>KY45</w:t>
+      </w:r>
+      <w:r>
+        <w:t xml:space="preserve">=Lee, </w:t>
+      </w:r>
+      <w:r>
+        <w:rPr>
+          <w:b/>
+        </w:rPr>
+        <w:t>KY74</w:t>
+      </w:r>
+      <w:r>
+        <w:t>=Owsley (</w:t>
+      </w:r>
+      <w:r>
+        <w:rPr>
+          <w:b/>
+        </w:rPr>
+        <w:t>C593</w:t>
+      </w:r>
+      <w:r>
+        <w:t xml:space="preserve"> </w:t>
+      </w:r>
+      <w:r>
+        <w:rPr>
+          <w:b/>
+        </w:rPr>
+        <w:t>S422</w:t>
+      </w:r>
+      <w:r>
+        <w:t>).</w:t>
+      </w:r>
+    </w:p>
+    <w:p>
+      <w:r>
+        <w:t xml:space="preserve">82. 1920 Owsley ED </w:t>
+      </w:r>
+      <w:r>
+        <w:rPr>
+          <w:b/>
+        </w:rPr>
+        <w:t>90</w:t>
+      </w:r>
+      <w:r>
+        <w:t xml:space="preserve"> sh </w:t>
+      </w:r>
+      <w:r>
+        <w:rPr>
+          <w:b/>
+        </w:rPr>
+        <w:t>7A</w:t>
+      </w:r>
+      <w:r>
+        <w:t xml:space="preserve"> leaf </w:t>
+      </w:r>
+      <w:r>
+        <w:rPr>
+          <w:b/>
+        </w:rPr>
+        <w:t>1114</w:t>
+      </w:r>
+      <w:r>
+        <w:t xml:space="preserve"> hh </w:t>
+      </w:r>
+      <w:r>
+        <w:rPr>
+          <w:b/>
+        </w:rPr>
+        <w:t>113/121</w:t>
+      </w:r>
+      <w:r>
+        <w:t xml:space="preserve">: </w:t>
+      </w:r>
+      <w:r>
+        <w:rPr>
+          <w:b/>
+        </w:rPr>
+        <w:t>Newman, Arthur</w:t>
+      </w:r>
+      <w:r>
+        <w:t xml:space="preserve"> 45 + Florence 33 + Omer[?] 12 + Grant 3 1/12. IA [`14thcensusofpopu594unit`](https://archive.org/details/14thcensusofpopu594unit). *Image seen.* </w:t>
+      </w:r>
+      <w:r>
+        <w:rPr>
+          <w:b/>
+        </w:rPr>
+        <w:t>C600</w:t>
+      </w:r>
+      <w:r>
+        <w:t xml:space="preserve"> </w:t>
+      </w:r>
+      <w:r>
+        <w:rPr>
+          <w:b/>
+        </w:rPr>
+        <w:t>C601</w:t>
+      </w:r>
+      <w:r>
+        <w:t xml:space="preserve"> </w:t>
+      </w:r>
+      <w:r>
+        <w:rPr>
+          <w:b/>
+        </w:rPr>
+        <w:t>C602</w:t>
+      </w:r>
+      <w:r>
+        <w:t xml:space="preserve"> </w:t>
+      </w:r>
+      <w:r>
+        <w:rPr>
+          <w:b/>
+        </w:rPr>
+        <w:t>S424</w:t>
+      </w:r>
+      <w:r>
+        <w:t xml:space="preserve">. </w:t>
+      </w:r>
+      <w:r>
+        <w:rPr>
+          <w:b/>
+        </w:rPr>
+        <w:t>PROBABLE</w:t>
+      </w:r>
+      <w:r>
+        <w:t xml:space="preserve"> = 1930/1940 Arthur (Henry × Mary).</w:t>
+      </w:r>
+    </w:p>
+    <w:p>
+      <w:r>
+        <w:t xml:space="preserve">83. Same reel, remaining EDs </w:t>
+      </w:r>
+      <w:r>
+        <w:rPr>
+          <w:b/>
+        </w:rPr>
+        <w:t>88 / 89 / 91 / 92 / 94</w:t>
+      </w:r>
+      <w:r>
+        <w:t xml:space="preserve"> name columns: </w:t>
+      </w:r>
+      <w:r>
+        <w:rPr>
+          <w:b/>
+        </w:rPr>
+        <w:t>nil</w:t>
+      </w:r>
+      <w:r>
+        <w:t xml:space="preserve"> John L + Cora / McCoy. Cole John L 47 on Cow Creek </w:t>
+      </w:r>
+      <w:r>
+        <w:rPr>
+          <w:b/>
+        </w:rPr>
+        <w:t>rejected</w:t>
+      </w:r>
+      <w:r>
+        <w:t xml:space="preserve">. Entire county has </w:t>
+      </w:r>
+      <w:r>
+        <w:rPr>
+          <w:b/>
+        </w:rPr>
+        <w:t>exactly one</w:t>
+      </w:r>
+      <w:r>
+        <w:t xml:space="preserve"> Newman head. </w:t>
+      </w:r>
+      <w:r>
+        <w:rPr>
+          <w:b/>
+        </w:rPr>
+        <w:t>C603–C611</w:t>
+      </w:r>
+      <w:r>
+        <w:t xml:space="preserve"> </w:t>
+      </w:r>
+      <w:r>
+        <w:rPr>
+          <w:b/>
+        </w:rPr>
+        <w:t>C605</w:t>
+      </w:r>
+      <w:r>
+        <w:t xml:space="preserve"> </w:t>
+      </w:r>
+      <w:r>
+        <w:rPr>
+          <w:b/>
+        </w:rPr>
+        <w:t>S425</w:t>
+      </w:r>
+      <w:r>
+        <w:t>.</w:t>
+      </w:r>
+    </w:p>
+    <w:p>
+      <w:r>
+        <w:t xml:space="preserve">84. Published Lee 1920 transcripts: </w:t>
+      </w:r>
+      <w:r>
+        <w:rPr>
+          <w:b/>
+        </w:rPr>
+        <w:t>nil</w:t>
+      </w:r>
+      <w:r>
+        <w:t xml:space="preserve"> John ~41 + Cora ~26 Newman head. St. Helens John L brother 42 = </w:t>
+      </w:r>
+      <w:r>
+        <w:rPr>
+          <w:b/>
+        </w:rPr>
+        <w:t>Johnson</w:t>
+      </w:r>
+      <w:r>
+        <w:t xml:space="preserve">. [Lee 1920](https://usgennet.org/usa/ky/county/lee/census/1920/). *Transcription only.* </w:t>
+      </w:r>
+      <w:r>
+        <w:rPr>
+          <w:b/>
+        </w:rPr>
+        <w:t>C612</w:t>
+      </w:r>
+      <w:r>
+        <w:t xml:space="preserve"> </w:t>
+      </w:r>
+      <w:r>
+        <w:rPr>
+          <w:b/>
+        </w:rPr>
+        <w:t>C613</w:t>
+      </w:r>
+      <w:r>
+        <w:t xml:space="preserve"> </w:t>
+      </w:r>
+      <w:r>
+        <w:rPr>
+          <w:b/>
+        </w:rPr>
+        <w:t>S426</w:t>
+      </w:r>
+      <w:r>
+        <w:t>.</w:t>
+      </w:r>
+    </w:p>
+    <w:p>
+      <w:r>
+        <w:t xml:space="preserve">85. Owsley births 1911–1920 N: </w:t>
+      </w:r>
+      <w:r>
+        <w:rPr>
+          <w:b/>
+        </w:rPr>
+        <w:t>NEWMAN, ROBERT</w:t>
+      </w:r>
+      <w:r>
+        <w:t xml:space="preserve">, mother </w:t>
+      </w:r>
+      <w:r>
+        <w:rPr>
+          <w:b/>
+        </w:rPr>
+        <w:t>BRANDENBURG, CORA</w:t>
+      </w:r>
+      <w:r>
+        <w:t xml:space="preserve">, </w:t>
+      </w:r>
+      <w:r>
+        <w:rPr>
+          <w:b/>
+        </w:rPr>
+        <w:t>1918</w:t>
+      </w:r>
+      <w:r>
+        <w:t xml:space="preserve">. [n.htm](https://usgennet.org/usa/ky/county/owsley/births/n.htm). *Transcription only.* </w:t>
+      </w:r>
+      <w:r>
+        <w:rPr>
+          <w:b/>
+        </w:rPr>
+        <w:t>PROBABLE</w:t>
+      </w:r>
+      <w:r>
+        <w:t xml:space="preserve"> 1930 Robert L. Willie / Bradburry 1916 rejected. </w:t>
+      </w:r>
+      <w:r>
+        <w:rPr>
+          <w:b/>
+        </w:rPr>
+        <w:t>C614</w:t>
+      </w:r>
+      <w:r>
+        <w:t xml:space="preserve"> </w:t>
+      </w:r>
+      <w:r>
+        <w:rPr>
+          <w:b/>
+        </w:rPr>
+        <w:t>C615</w:t>
+      </w:r>
+      <w:r>
+        <w:t xml:space="preserve"> </w:t>
+      </w:r>
+      <w:r>
+        <w:rPr>
+          <w:b/>
+        </w:rPr>
+        <w:t>C616</w:t>
+      </w:r>
+      <w:r>
+        <w:t xml:space="preserve"> </w:t>
+      </w:r>
+      <w:r>
+        <w:rPr>
+          <w:b/>
+        </w:rPr>
+        <w:t>S427</w:t>
+      </w:r>
+      <w:r>
+        <w:t>.</w:t>
+      </w:r>
+    </w:p>
+    <w:p>
+      <w:r>
+        <w:t xml:space="preserve">86. </w:t>
+      </w:r>
+      <w:r>
+        <w:rPr>
+          <w:b/>
+        </w:rPr>
+        <w:t>Barney McCoy Newman</w:t>
+      </w:r>
+      <w:r>
+        <w:t xml:space="preserve"> of White Co. AR × Lula Ethel Knupp </w:t>
+      </w:r>
+      <w:r>
+        <w:rPr>
+          <w:b/>
+        </w:rPr>
+        <w:t>rejected</w:t>
+      </w:r>
+      <w:r>
+        <w:t xml:space="preserve"> vs P010. No free CA death row for </w:t>
       </w:r>
       <w:r>
         <w:rPr>
@@ -7602,16 +8964,57 @@
         <w:t>447-20-2466</w:t>
       </w:r>
       <w:r>
-        <w:t xml:space="preserve">, Modesto claim </w:t>
-      </w:r>
-      <w:r>
-        <w:rPr>
-          <w:b/>
-        </w:rPr>
-        <w:t>11 Jul 1962</w:t>
-      </w:r>
-      <w:r>
-        <w:t xml:space="preserve">. [index_939](https://sortedbyname.com/letter_m/mccoy/index_939.html). *Index only.* </w:t>
+        <w:t xml:space="preserve">. </w:t>
+      </w:r>
+      <w:r>
+        <w:rPr>
+          <w:b/>
+        </w:rPr>
+        <w:t>C618</w:t>
+      </w:r>
+      <w:r>
+        <w:t xml:space="preserve"> </w:t>
+      </w:r>
+      <w:r>
+        <w:rPr>
+          <w:b/>
+        </w:rPr>
+        <w:t>C621</w:t>
+      </w:r>
+      <w:r>
+        <w:t xml:space="preserve"> </w:t>
+      </w:r>
+      <w:r>
+        <w:rPr>
+          <w:b/>
+        </w:rPr>
+        <w:t>S428</w:t>
+      </w:r>
+      <w:r>
+        <w:t>.</w:t>
+      </w:r>
+    </w:p>
+    <w:p>
+      <w:r>
+        <w:t xml:space="preserve">87. George COMBS d. </w:t>
+      </w:r>
+      <w:r>
+        <w:rPr>
+          <w:b/>
+        </w:rPr>
+        <w:t>6 May 1942</w:t>
+      </w:r>
+      <w:r>
+        <w:t xml:space="preserve"> Vincent. Courier extract does </w:t>
+      </w:r>
+      <w:r>
+        <w:rPr>
+          <w:b/>
+        </w:rPr>
+        <w:t>not</w:t>
+      </w:r>
+      <w:r>
+        <w:t xml:space="preserve"> name shooter. Houser “John NEWNAM was charged” is authored — </w:t>
       </w:r>
       <w:r>
         <w:rPr>
@@ -7620,22 +9023,13 @@
         <w:t>POSSIBLE</w:t>
       </w:r>
       <w:r>
-        <w:t xml:space="preserve"> inverted P010 — </w:t>
-      </w:r>
-      <w:r>
-        <w:rPr>
-          <w:b/>
-        </w:rPr>
-        <w:t>not merged</w:t>
-      </w:r>
-      <w:r>
-        <w:t xml:space="preserve">. </w:t>
-      </w:r>
-      <w:r>
-        <w:rPr>
-          <w:b/>
-        </w:rPr>
-        <w:t>C576</w:t>
+        <w:t xml:space="preserve"> only. </w:t>
+      </w:r>
+      <w:r>
+        <w:rPr>
+          <w:b/>
+        </w:rPr>
+        <w:t>C619</w:t>
       </w:r>
       <w:r>
         <w:t xml:space="preserve"> </w:t>
@@ -7644,10 +9038,151 @@
         <w:rPr>
           <w:b/>
         </w:rPr>
-        <w:t>S415</w:t>
-      </w:r>
-      <w:r>
-        <w:t xml:space="preserve">. 1920 KY N-550 John window 4460–4499 </w:t>
+        <w:t>C620</w:t>
+      </w:r>
+      <w:r>
+        <w:t xml:space="preserve"> </w:t>
+      </w:r>
+      <w:r>
+        <w:rPr>
+          <w:b/>
+        </w:rPr>
+        <w:t>S429</w:t>
+      </w:r>
+      <w:r>
+        <w:t>.</w:t>
+      </w:r>
+    </w:p>
+    <w:p>
+      <w:r>
+        <w:t xml:space="preserve">88. FS catalog seven IDs HTTP </w:t>
+      </w:r>
+      <w:r>
+        <w:rPr>
+          <w:b/>
+        </w:rPr>
+        <w:t>403</w:t>
+      </w:r>
+      <w:r>
+        <w:t xml:space="preserve"> (R011 step </w:t>
+      </w:r>
+      <w:r>
+        <w:rPr>
+          <w:b/>
+        </w:rPr>
+        <w:t>25</w:t>
+      </w:r>
+      <w:r>
+        <w:t xml:space="preserve">). USGenNet Estill </w:t>
+      </w:r>
+      <w:r>
+        <w:rPr>
+          <w:b/>
+        </w:rPr>
+        <w:t>no</w:t>
+      </w:r>
+      <w:r>
+        <w:t xml:space="preserve"> 1920 transcript. Duell-Clark unread. </w:t>
+      </w:r>
+      <w:r>
+        <w:rPr>
+          <w:b/>
+        </w:rPr>
+        <w:t>C617</w:t>
+      </w:r>
+      <w:r>
+        <w:t xml:space="preserve"> </w:t>
+      </w:r>
+      <w:r>
+        <w:rPr>
+          <w:b/>
+        </w:rPr>
+        <w:t>C622</w:t>
+      </w:r>
+      <w:r>
+        <w:t xml:space="preserve"> </w:t>
+      </w:r>
+      <w:r>
+        <w:rPr>
+          <w:b/>
+        </w:rPr>
+        <w:t>C623</w:t>
+      </w:r>
+      <w:r>
+        <w:t xml:space="preserve"> </w:t>
+      </w:r>
+      <w:r>
+        <w:rPr>
+          <w:b/>
+        </w:rPr>
+        <w:t>S430</w:t>
+      </w:r>
+      <w:r>
+        <w:t>.</w:t>
+      </w:r>
+    </w:p>
+    <w:p>
+      <w:r>
+        <w:t xml:space="preserve">89. 1920 U.S. census, Estill Co. KY, T625-566, IA [`14thcensusofpopu566unit`](https://archive.org/details/14thcensusofpopu566unit), leaves </w:t>
+      </w:r>
+      <w:r>
+        <w:rPr>
+          <w:b/>
+        </w:rPr>
+        <w:t>832–1150</w:t>
+      </w:r>
+      <w:r>
+        <w:t xml:space="preserve">. *Image seen* (headers). EDs </w:t>
+      </w:r>
+      <w:r>
+        <w:rPr>
+          <w:b/>
+        </w:rPr>
+        <w:t>36–37, 174–175, 38–45</w:t>
+      </w:r>
+      <w:r>
+        <w:t xml:space="preserve">. [us-census.org](https://www.us-census.org/states/kentucky/e-ky.htm). </w:t>
+      </w:r>
+      <w:r>
+        <w:rPr>
+          <w:b/>
+        </w:rPr>
+        <w:t>C625–C627</w:t>
+      </w:r>
+      <w:r>
+        <w:t xml:space="preserve"> </w:t>
+      </w:r>
+      <w:r>
+        <w:rPr>
+          <w:b/>
+        </w:rPr>
+        <w:t>S431</w:t>
+      </w:r>
+      <w:r>
+        <w:t xml:space="preserve"> </w:t>
+      </w:r>
+      <w:r>
+        <w:rPr>
+          <w:b/>
+        </w:rPr>
+        <w:t>S432</w:t>
+      </w:r>
+      <w:r>
+        <w:t>.</w:t>
+      </w:r>
+    </w:p>
+    <w:p>
+      <w:r>
+        <w:t xml:space="preserve">90. Same reel, ED </w:t>
+      </w:r>
+      <w:r>
+        <w:rPr>
+          <w:b/>
+        </w:rPr>
+        <w:t>44</w:t>
+      </w:r>
+      <w:r>
+        <w:t xml:space="preserve"> Station Camp: Pass 75 </w:t>
       </w:r>
       <w:r>
         <w:rPr>
@@ -7656,13 +9191,153 @@
         <w:t>nil</w:t>
       </w:r>
       <w:r>
-        <w:t xml:space="preserve"> Owsley. IA [`soundex1920ky117`](https://archive.org/details/soundex1920ky117). </w:t>
-      </w:r>
-      <w:r>
-        <w:rPr>
-          <w:b/>
-        </w:rPr>
-        <w:t>C577</w:t>
+        <w:t xml:space="preserve"> is </w:t>
+      </w:r>
+      <w:r>
+        <w:rPr>
+          <w:b/>
+        </w:rPr>
+        <w:t>withdrawn</w:t>
+      </w:r>
+      <w:r>
+        <w:t xml:space="preserve"> (</w:t>
+      </w:r>
+      <w:r>
+        <w:rPr>
+          <w:b/>
+        </w:rPr>
+        <w:t>C628 C635</w:t>
+      </w:r>
+      <w:r>
+        <w:t>). Johnson Henry rejected (</w:t>
+      </w:r>
+      <w:r>
+        <w:rPr>
+          <w:b/>
+        </w:rPr>
+        <w:t>C629</w:t>
+      </w:r>
+      <w:r>
+        <w:t xml:space="preserve">). </w:t>
+      </w:r>
+      <w:r>
+        <w:rPr>
+          <w:b/>
+        </w:rPr>
+        <w:t>C630–C632</w:t>
+      </w:r>
+      <w:r>
+        <w:t>.</w:t>
+      </w:r>
+    </w:p>
+    <w:p>
+      <w:r>
+        <w:t xml:space="preserve">91. 1920 Estill ED </w:t>
+      </w:r>
+      <w:r>
+        <w:rPr>
+          <w:b/>
+        </w:rPr>
+        <w:t>44</w:t>
+      </w:r>
+      <w:r>
+        <w:t xml:space="preserve"> sh </w:t>
+      </w:r>
+      <w:r>
+        <w:rPr>
+          <w:b/>
+        </w:rPr>
+        <w:t>14B</w:t>
+      </w:r>
+      <w:r>
+        <w:t xml:space="preserve"> leaf </w:t>
+      </w:r>
+      <w:r>
+        <w:rPr>
+          <w:b/>
+        </w:rPr>
+        <w:t>1126</w:t>
+      </w:r>
+      <w:r>
+        <w:t xml:space="preserve"> hh </w:t>
+      </w:r>
+      <w:r>
+        <w:rPr>
+          <w:b/>
+        </w:rPr>
+        <w:t>120/135</w:t>
+      </w:r>
+      <w:r>
+        <w:t xml:space="preserve">: </w:t>
+      </w:r>
+      <w:r>
+        <w:rPr>
+          <w:b/>
+        </w:rPr>
+        <w:t>Newman, Boyd</w:t>
+      </w:r>
+      <w:r>
+        <w:t xml:space="preserve"> 45 + </w:t>
+      </w:r>
+      <w:r>
+        <w:rPr>
+          <w:b/>
+        </w:rPr>
+        <w:t>Allie</w:t>
+      </w:r>
+      <w:r>
+        <w:t xml:space="preserve"> 35 + Sarah A / Arthur / Corlue / Clarence. Soundex N-550 p</w:t>
+      </w:r>
+      <w:r>
+        <w:rPr>
+          <w:b/>
+        </w:rPr>
+        <w:t>4130</w:t>
+      </w:r>
+      <w:r>
+        <w:t xml:space="preserve">, Vol </w:t>
+      </w:r>
+      <w:r>
+        <w:rPr>
+          <w:b/>
+        </w:rPr>
+        <w:t>20</w:t>
+      </w:r>
+      <w:r>
+        <w:t xml:space="preserve"> ED </w:t>
+      </w:r>
+      <w:r>
+        <w:rPr>
+          <w:b/>
+        </w:rPr>
+        <w:t>44</w:t>
+      </w:r>
+      <w:r>
+        <w:t xml:space="preserve"> sh </w:t>
+      </w:r>
+      <w:r>
+        <w:rPr>
+          <w:b/>
+        </w:rPr>
+        <w:t>14</w:t>
+      </w:r>
+      <w:r>
+        <w:t xml:space="preserve"> ln </w:t>
+      </w:r>
+      <w:r>
+        <w:rPr>
+          <w:b/>
+        </w:rPr>
+        <w:t>7</w:t>
+      </w:r>
+      <w:r>
+        <w:t xml:space="preserve">. IA [`14thcensusofpopu566unit`](https://archive.org/details/14thcensusofpopu566unit) · [`soundex1920ky117`](https://archive.org/details/soundex1920ky117). *Image seen.* </w:t>
+      </w:r>
+      <w:r>
+        <w:rPr>
+          <w:b/>
+        </w:rPr>
+        <w:t>C634 C636 C637</w:t>
       </w:r>
       <w:r>
         <w:t xml:space="preserve"> </w:t>
@@ -7671,7 +9346,378 @@
         <w:rPr>
           <w:b/>
         </w:rPr>
-        <w:t>C580</w:t>
+        <w:t>S434</w:t>
+      </w:r>
+      <w:r>
+        <w:t>.</w:t>
+      </w:r>
+    </w:p>
+    <w:p>
+      <w:r>
+        <w:t xml:space="preserve">92. Same reel, ED </w:t>
+      </w:r>
+      <w:r>
+        <w:rPr>
+          <w:b/>
+        </w:rPr>
+        <w:t>43</w:t>
+      </w:r>
+      <w:r>
+        <w:t xml:space="preserve"> sh </w:t>
+      </w:r>
+      <w:r>
+        <w:rPr>
+          <w:b/>
+        </w:rPr>
+        <w:t>8B</w:t>
+      </w:r>
+      <w:r>
+        <w:t xml:space="preserve"> leaf </w:t>
+      </w:r>
+      <w:r>
+        <w:rPr>
+          <w:b/>
+        </w:rPr>
+        <w:t>1094</w:t>
+      </w:r>
+      <w:r>
+        <w:t xml:space="preserve"> hh </w:t>
+      </w:r>
+      <w:r>
+        <w:rPr>
+          <w:b/>
+        </w:rPr>
+        <w:t>175/170</w:t>
+      </w:r>
+      <w:r>
+        <w:t xml:space="preserve">: Newman </w:t>
+      </w:r>
+      <w:r>
+        <w:rPr>
+          <w:b/>
+        </w:rPr>
+        <w:t>[Andridge?/Andy?]</w:t>
+      </w:r>
+      <w:r>
+        <w:t xml:space="preserve"> 34 + </w:t>
+      </w:r>
+      <w:r>
+        <w:rPr>
+          <w:b/>
+        </w:rPr>
+        <w:t>[Sarah?]</w:t>
+      </w:r>
+      <w:r>
+        <w:t xml:space="preserve"> 34 + 3 children. *Image seen.* </w:t>
+      </w:r>
+      <w:r>
+        <w:rPr>
+          <w:b/>
+        </w:rPr>
+        <w:t>Not</w:t>
+      </w:r>
+      <w:r>
+        <w:t xml:space="preserve"> John L. Remaining Estill contact sheets: no third Newman/McCoy head. Nunan/Hawkins rejected. </w:t>
+      </w:r>
+      <w:r>
+        <w:rPr>
+          <w:b/>
+        </w:rPr>
+        <w:t>C633 C639–C643 C654</w:t>
+      </w:r>
+      <w:r>
+        <w:t xml:space="preserve"> </w:t>
+      </w:r>
+      <w:r>
+        <w:rPr>
+          <w:b/>
+        </w:rPr>
+        <w:t>S433</w:t>
+      </w:r>
+      <w:r>
+        <w:t xml:space="preserve"> </w:t>
+      </w:r>
+      <w:r>
+        <w:rPr>
+          <w:b/>
+        </w:rPr>
+        <w:t>S435</w:t>
+      </w:r>
+      <w:r>
+        <w:t>.</w:t>
+      </w:r>
+    </w:p>
+    <w:p>
+      <w:r>
+        <w:t xml:space="preserve">93. 1920 Jackson T625-577, IA [`14thcensusofpopu577unit`](https://archive.org/details/14thcensusofpopu577unit): Vol </w:t>
+      </w:r>
+      <w:r>
+        <w:rPr>
+          <w:b/>
+        </w:rPr>
+        <w:t>41</w:t>
+      </w:r>
+      <w:r>
+        <w:t xml:space="preserve"> EDs </w:t>
+      </w:r>
+      <w:r>
+        <w:rPr>
+          <w:b/>
+        </w:rPr>
+        <w:t>17–28</w:t>
+      </w:r>
+      <w:r>
+        <w:t xml:space="preserve">. ED </w:t>
+      </w:r>
+      <w:r>
+        <w:rPr>
+          <w:b/>
+        </w:rPr>
+        <w:t>17</w:t>
+      </w:r>
+      <w:r>
+        <w:t xml:space="preserve"> McKee 2 Jan. Contact sheets </w:t>
+      </w:r>
+      <w:r>
+        <w:rPr>
+          <w:b/>
+        </w:rPr>
+        <w:t>0003–0224</w:t>
+      </w:r>
+      <w:r>
+        <w:t xml:space="preserve"> </w:t>
+      </w:r>
+      <w:r>
+        <w:rPr>
+          <w:b/>
+        </w:rPr>
+        <w:t>nil</w:t>
+      </w:r>
+      <w:r>
+        <w:t xml:space="preserve"> Newman/McCoy head (montage). Breathitt T625-559 ED </w:t>
+      </w:r>
+      <w:r>
+        <w:rPr>
+          <w:b/>
+        </w:rPr>
+        <w:t>41</w:t>
+      </w:r>
+      <w:r>
+        <w:t xml:space="preserve"> at leaf </w:t>
+      </w:r>
+      <w:r>
+        <w:rPr>
+          <w:b/>
+        </w:rPr>
+        <w:t>0901</w:t>
+      </w:r>
+      <w:r>
+        <w:t xml:space="preserve">. *Image seen* (headers). </w:t>
+      </w:r>
+      <w:r>
+        <w:rPr>
+          <w:b/>
+        </w:rPr>
+        <w:t>C644–C647</w:t>
+      </w:r>
+      <w:r>
+        <w:t xml:space="preserve"> </w:t>
+      </w:r>
+      <w:r>
+        <w:rPr>
+          <w:b/>
+        </w:rPr>
+        <w:t>S436</w:t>
+      </w:r>
+      <w:r>
+        <w:t xml:space="preserve"> </w:t>
+      </w:r>
+      <w:r>
+        <w:rPr>
+          <w:b/>
+        </w:rPr>
+        <w:t>S437</w:t>
+      </w:r>
+      <w:r>
+        <w:t>.</w:t>
+      </w:r>
+    </w:p>
+    <w:p>
+      <w:r>
+        <w:t xml:space="preserve">94. SCGS Estill delayed births: </w:t>
+      </w:r>
+      <w:r>
+        <w:rPr>
+          <w:b/>
+        </w:rPr>
+        <w:t>NEWMAN, Arthur</w:t>
+      </w:r>
+      <w:r>
+        <w:t xml:space="preserve">, </w:t>
+      </w:r>
+      <w:r>
+        <w:rPr>
+          <w:b/>
+        </w:rPr>
+        <w:t>24 Jan 1906</w:t>
+      </w:r>
+      <w:r>
+        <w:t xml:space="preserve">, mother </w:t>
+      </w:r>
+      <w:r>
+        <w:rPr>
+          <w:b/>
+        </w:rPr>
+        <w:t>Allie Brandenbur</w:t>
+      </w:r>
+      <w:r>
+        <w:t xml:space="preserve">, vol </w:t>
+      </w:r>
+      <w:r>
+        <w:rPr>
+          <w:b/>
+        </w:rPr>
+        <w:t>240</w:t>
+      </w:r>
+      <w:r>
+        <w:t xml:space="preserve"> cert </w:t>
+      </w:r>
+      <w:r>
+        <w:rPr>
+          <w:b/>
+        </w:rPr>
+        <w:t>49665</w:t>
+      </w:r>
+      <w:r>
+        <w:t xml:space="preserve">. [estill-ok.pdf](http://www.scgs-ky.org/delbrth/estill-ok.pdf). *Compiled index.* </w:t>
+      </w:r>
+      <w:r>
+        <w:rPr>
+          <w:b/>
+        </w:rPr>
+        <w:t>PROBABLE</w:t>
+      </w:r>
+      <w:r>
+        <w:t xml:space="preserve"> Soundex Arthur 13. Allie ≠ Cora. </w:t>
+      </w:r>
+      <w:r>
+        <w:rPr>
+          <w:b/>
+        </w:rPr>
+        <w:t>C650 C651</w:t>
+      </w:r>
+      <w:r>
+        <w:t xml:space="preserve"> </w:t>
+      </w:r>
+      <w:r>
+        <w:rPr>
+          <w:b/>
+        </w:rPr>
+        <w:t>S438</w:t>
+      </w:r>
+      <w:r>
+        <w:t>.</w:t>
+      </w:r>
+    </w:p>
+    <w:p>
+      <w:r>
+        <w:t xml:space="preserve">95. 1920 Wolfe T625-602 title leaf </w:t>
+      </w:r>
+      <w:r>
+        <w:rPr>
+          <w:b/>
+        </w:rPr>
+        <w:t>0002</w:t>
+      </w:r>
+      <w:r>
+        <w:t xml:space="preserve"> Vol </w:t>
+      </w:r>
+      <w:r>
+        <w:rPr>
+          <w:b/>
+        </w:rPr>
+        <w:t>91</w:t>
+      </w:r>
+      <w:r>
+        <w:t xml:space="preserve"> EDs </w:t>
+      </w:r>
+      <w:r>
+        <w:rPr>
+          <w:b/>
+        </w:rPr>
+        <w:t>234–242</w:t>
+      </w:r>
+      <w:r>
+        <w:t xml:space="preserve">. Powell T625-596 card leaf </w:t>
+      </w:r>
+      <w:r>
+        <w:rPr>
+          <w:b/>
+        </w:rPr>
+        <w:t>1050</w:t>
+      </w:r>
+      <w:r>
+        <w:t xml:space="preserve">; ED </w:t>
+      </w:r>
+      <w:r>
+        <w:rPr>
+          <w:b/>
+        </w:rPr>
+        <w:t>142</w:t>
+      </w:r>
+      <w:r>
+        <w:t xml:space="preserve"> starts </w:t>
+      </w:r>
+      <w:r>
+        <w:rPr>
+          <w:b/>
+        </w:rPr>
+        <w:t>1051</w:t>
+      </w:r>
+      <w:r>
+        <w:t xml:space="preserve">. IA [`14thcensusofpopu602unit`](https://archive.org/details/14thcensusofpopu602unit) · [`14thcensusofpopu596unit`](https://archive.org/details/14thcensusofpopu596unit). *Image seen.* </w:t>
+      </w:r>
+      <w:r>
+        <w:rPr>
+          <w:b/>
+        </w:rPr>
+        <w:t>C652 C655–C657</w:t>
+      </w:r>
+      <w:r>
+        <w:t xml:space="preserve"> </w:t>
+      </w:r>
+      <w:r>
+        <w:rPr>
+          <w:b/>
+        </w:rPr>
+        <w:t>S439</w:t>
+      </w:r>
+      <w:r>
+        <w:t xml:space="preserve">. FS seven IDs </w:t>
+      </w:r>
+      <w:r>
+        <w:rPr>
+          <w:b/>
+        </w:rPr>
+        <w:t>403</w:t>
+      </w:r>
+      <w:r>
+        <w:t xml:space="preserve"> (R011-27). </w:t>
+      </w:r>
+      <w:r>
+        <w:rPr>
+          <w:b/>
+        </w:rPr>
+        <w:t>C648</w:t>
+      </w:r>
+      <w:r>
+        <w:t xml:space="preserve"> </w:t>
+      </w:r>
+      <w:r>
+        <w:rPr>
+          <w:b/>
+        </w:rPr>
+        <w:t>S440</w:t>
       </w:r>
       <w:r>
         <w:t>.</w:t>
@@ -8044,6 +10090,126 @@
     <w:p>
       <w:r>
         <w:t>| S416 | `../sources/catalog/pass72-fs-403-access-2026-10-30.txt` | FamilySearch catalog | FS 127913/127869/1146342 HTTP 403 | catalog |</w:t>
+      </w:r>
+    </w:p>
+    <w:p>
+      <w:r>
+        <w:t>| S417 | `../sources/catalog/pass73-fs-403-access-2026-10-30.txt` | FamilySearch / USGW / KYGenWeb | FS seven IDs HTTP 403; Lee wills empty | catalog |</w:t>
+      </w:r>
+    </w:p>
+    <w:p>
+      <w:r>
+        <w:t>| S418 | `../sources/census/owsley-1920-ed93-1170-buckcreek-township.png` | [IA T625-594](https://archive.org/details/14thcensusofpopu594unit) | ED 93 = Buck Creek Precinct No. 6 | image seen |</w:t>
+      </w:r>
+    </w:p>
+    <w:p>
+      <w:r>
+        <w:t>| S419 | `../sources/census/combs-owsley-1920-extract-2026-10-30.txt` | [Combs 1920](https://combs-families.org/combs/records/ky/owsley/1920.htm) | Buck Creek + Wild Dog named; Combs hh match | transcription only |</w:t>
+      </w:r>
+    </w:p>
+    <w:p>
+      <w:r>
+        <w:t>| S420 | `../sources/census/owsley-1920-ed93-1185-hh134-isaacs.jpg` | [IA T625-594](https://archive.org/details/14thcensusofpopu594unit) | ED 93 hh 1–183 nil Newman; hh 134 = Isaacs | image seen |</w:t>
+      </w:r>
+    </w:p>
+    <w:p>
+      <w:r>
+        <w:t>| S421 | `../sources/census/owsley-1920-ed94-1192-wilddog-township.png` | [IA T625-594](https://archive.org/details/14thcensusofpopu594unit) | ED 94 = Wild Dog Precinct No. 7 | image seen |</w:t>
+      </w:r>
+    </w:p>
+    <w:p>
+      <w:r>
+        <w:t>| S422 | `../sources/military/m1509-ky-roll-map-pass73-2026-10-30.txt` | [ACPL M1509](https://www.friendsofallencounty.org/detail_mtnara.php?mtid=7935) | KY45 = Lee; KY74 = Owsley | catalog |</w:t>
+      </w:r>
+    </w:p>
+    <w:p>
+      <w:r>
+        <w:t>| S423 | `../sources/census/owsley-census-landing-pass73.html` | [USGenNet census](https://usgennet.org/usa/ky/county/owsley/census/) | No 1920 year published | catalog |</w:t>
+      </w:r>
+    </w:p>
+    <w:p>
+      <w:r>
+        <w:t>| S424 | `../sources/census/owsley-1920-ed90-1114-arthur-hh.jpg` · county-closed extract | [IA T625-594](https://archive.org/details/14thcensusofpopu594unit) | Arthur 45 Island Creek; only Newman in Owsley | image seen |</w:t>
+      </w:r>
+    </w:p>
+    <w:p>
+      <w:r>
+        <w:t>| S425 | `../sources/census/owsley-1920-ed91-1128-cole-johnl.jpg` + ED name cols | [IA T625-594](https://archive.org/details/14thcensusofpopu594unit) | EDs 88–94 nil John L/McCoy; Cole reject | image seen |</w:t>
+      </w:r>
+    </w:p>
+    <w:p>
+      <w:r>
+        <w:t>| S426 | `../sources/census/lee-1920-newman-nil-john-l-pass74-extract-2026-10-30.txt` | [Lee 1920](https://usgennet.org/usa/ky/county/lee/census/1920/) | Nil John+Cora head; Johnson reject | transcription only |</w:t>
+      </w:r>
+    </w:p>
+    <w:p>
+      <w:r>
+        <w:t>| S427 | `../sources/vital/owsley-births-n-1911-1920-pass74-extract-2026-10-30.txt` | [Owsley births N](https://usgennet.org/usa/ky/county/owsley/births/n.htm) | ROBERT / CORA BRANDENBURG 1918 | transcription only |</w:t>
+      </w:r>
+    </w:p>
+    <w:p>
+      <w:r>
+        <w:t>| S428 | Heber Springs / Roller funeral notices | authored | Barney McCoy Newman AR rejected | authored / index |</w:t>
+      </w:r>
+    </w:p>
+    <w:p>
+      <w:r>
+        <w:t>| S429 | `../sources/press/combs-1942-george-homicide-pass74-extract-2026-10-30.txt` | [Combs / Owsley 1942](https://combs-families.org/combs/records/ky/owsley/1920.htm) | George Combs 6 May 1942; charge annotation only | transcription + authored |</w:t>
+      </w:r>
+    </w:p>
+    <w:p>
+      <w:r>
+        <w:t>| S430 | `../sources/catalog/pass74-fs-403-access-2026-10-30.txt` | FamilySearch catalog | FS seven IDs HTTP 403 (R011-25) | catalog |</w:t>
+      </w:r>
+    </w:p>
+    <w:p>
+      <w:r>
+        <w:t>| S431 | `../sources/census/estill-1920-t625-566-pass75-extract-2026-10-30.txt` | [IA T625-566](https://archive.org/details/14thcensusofpopu566unit) | Estill leaves 832–1150 mapped (C628 later withdrawn) | image seen + catalog |</w:t>
+      </w:r>
+    </w:p>
+    <w:p>
+      <w:r>
+        <w:t>| S432 | `../sources/census/estill-1920-ed44-1110-stationcamp-header.jpg` + ED headers | [IA T625-566](https://archive.org/details/14thcensusofpopu566unit) | ED 36/37/174/175/38–45 headers | image seen |</w:t>
+      </w:r>
+    </w:p>
+    <w:p>
+      <w:r>
+        <w:t>| S433 | `../sources/census/estill-1920-ed43-1094-newman-andy-hh.jpg` | [IA T625-566](https://archive.org/details/14thcensusofpopu566unit) | ED 43 Newman 34+34+3 children | image seen |</w:t>
+      </w:r>
+    </w:p>
+    <w:p>
+      <w:r>
+        <w:t>| S434 | `../sources/census/estill-1920-ed44-1126-sheet14b.jpg` · Soundex p4130 | [IA T625-566](https://archive.org/details/14thcensusofpopu566unit) · [Soundex](https://archive.org/details/soundex1920ky117) | Boyd 45 + Allie 35 Station Camp 14B | image seen |</w:t>
+      </w:r>
+    </w:p>
+    <w:p>
+      <w:r>
+        <w:t>| S435 | `../sources/census/estill-1920-ed174-0922-nunan-benjamin.jpg` + rejects | [IA T625-566](https://archive.org/details/14thcensusofpopu566unit) | Nunan/Hawkins rejects | image seen |</w:t>
+      </w:r>
+    </w:p>
+    <w:p>
+      <w:r>
+        <w:t>| S436 | `../sources/census/jackson-1920-0001-title.jpg` | [IA T625-577](https://archive.org/details/14thcensusofpopu577unit) | Jackson Vol 41 EDs 17–28 | image seen |</w:t>
+      </w:r>
+    </w:p>
+    <w:p>
+      <w:r>
+        <w:t>| S437 | `../sources/census/breathitt-1920-ed41-0901-header.jpg` | [IA T625-559](https://archive.org/details/14thcensusofpopu559unit) | Breathitt ED 41 at leaf 901 | image seen |</w:t>
+      </w:r>
+    </w:p>
+    <w:p>
+      <w:r>
+        <w:t>| S438 | `../sources/vital/estill-delayed-births-scgs.pdf` | [SCGS delayed births](http://www.scgs-ky.org/delbrth/estill-ok.pdf) | Arthur Newman 24 Jan 1906 / Allie Brandenbur | compiled index |</w:t>
+      </w:r>
+    </w:p>
+    <w:p>
+      <w:r>
+        <w:t>| S439 | `../sources/census/powell-1920-1050-county-card.jpg` · Wolfe title | [IA T625-596](https://archive.org/details/14thcensusofpopu596unit) · [T625-602](https://archive.org/details/14thcensusofpopu602unit) | Powell card 1050; Wolfe EDs 234–242 | image seen |</w:t>
+      </w:r>
+    </w:p>
+    <w:p>
+      <w:r>
+        <w:t>| S440 | `../sources/catalog/pass76-fs-403-access-2026-10-30.txt` | FamilySearch catalog | FS seven IDs HTTP 403 (R011-27) | catalog |</w:t>
       </w:r>
     </w:p>
     <w:p>

</xml_diff>

<commit_message>
Pass 71–72: 1910 Buffalo openers; C512 Samuel B on ED 90.
Original 1910 ED 168 sh 1 A/1 B verify Kendrick openers. Soundex Combs, Samuel B. 42 is ED 90, probable 1910 dw 1, not missing ED 92 sh 1. Gabbard Elijah (Lee) and Lee (Breathitt) not merged with 1910 Buffalo houses. C512 nil Combs, Lowe. Wolfe/Clay nil Josephine×Gilbert; two Estill 1901–02 plates nil. Rice Dora aged 2 disproved as P001.

Co-authored-by: CatCorner22 <CatCorner22@users.noreply.github.com>
</commit_message>
<xml_diff>
--- a/research/dora-ella-newnam/book/Dora-Ella-Newnam-Stone-A-Life.docx
+++ b/research/dora-ella-newnam/book/Dora-Ella-Newnam-Stone-A-Life.docx
@@ -41,7 +41,7 @@
     </w:p>
     <w:p>
       <w:r>
-        <w:t>One hundred fourteen Cursor chats on this repository were reviewed for this volume (primary research, helpers, scans, and failed browser hunts). The original mobile session opened the case and read the Arkansas death certificate the family still holds. Later sessions recovered the 1880 childhood schedule that free transcripts had missed, walked statewide Soundex reels for 1910 and 1920, tested a Peebles third-marriage hypothesis and set it aside, and photographed NARA microfilm frames — the 1880 childhood schedule, the 1910 Kentucky Ella Miracode plates, Hardin Gray on Sturgeon sheet 13 B, the 1860 Owsley original of Silas Gray’s house with William aged thirteen, the 1850 Owsley Gray pages that are other men (Thomas, James, John, Charles), the given-name Silas plates that are other boys (Ratliff eight months, Wilson six, Phillips fifteen) and the Bowman line first read as Cyrus and then as Squire, the 1850 Estill Marcus Gray original, Breathitt’s Taulbee infant Silas and Bryant Siras, and Madison’s John Green house with Silas Green aged twenty, the 1850 Owsley Harrison Newman house with an eight-year-old Elias who is probably Dora’s father — a 1932 death extract names Henry Harrison Newnam as that father — and is not merged as proven, the 1860 Booneville original of that house under H.H. Newman with Elias aged eighteen, the 1850 William Newman house of twenty-six on the same page, the 1850 John Newman of sixty born in Tennessee who is not the 1880 John of sixty-nine, and Andrew Mays’s Giles at one month in 1850 and eleven in 1860, the 1870 Proctor original of James Brandenburg’s house, Silas Gray’s Sturgeon original, the 1880 District 59 originals of William next door to John Newnam and of Silas still in the district, the 1900 William Gray dwelling-84 crop, and the Bollinger page a sibling had labelled “Dora E. Stone,” which is Henry C. Rhodes and Dora M. of Missouri, and the 1920 Booneville, Buffalo, and Buck Creek originals with the rejected Taylor, Marcum, Magee, McIntosh, Baker, and McPherson houses, the 1910 Sturgeon Gilbert×Josie house, Lynch’s wife Laura without a Newman on the original, and the Buffalo Baker household whose Soundex card misnamed Gilbert John as Robert. This volume folds those chats into one narrative. The case dossier remains the working file; this book is the public reading of it. Sibling work on Greene ED 37 through 41 is now on merged PR #26 through Pass 59; remaining Greene ED 38 B-sides, 1900 Liberty, and 1900 hh 85 are inventoried, not duplicated. Do not import their “Dora E. Stone” as this woman.</w:t>
+        <w:t>One hundred fourteen Cursor chats on this repository were reviewed for this volume (primary research, helpers, scans, and failed browser hunts). The original mobile session opened the case and read the Arkansas death certificate the family still holds. Later sessions recovered the 1880 childhood schedule that free transcripts had missed, walked statewide Soundex reels for 1910 and 1920, tested a Peebles third-marriage hypothesis and set it aside, and photographed NARA microfilm frames — the 1880 childhood schedule, the 1910 Kentucky Ella Miracode plates, Hardin Gray on Sturgeon sheet 13 B, the 1860 Owsley original of Silas Gray’s house with William aged thirteen, the 1850 Owsley Gray pages that are other men (Thomas, James, John, Charles), the given-name Silas plates that are other boys (Ratliff eight months, Wilson six, Phillips fifteen) and the Bowman line first read as Cyrus and then as Squire, the 1850 Estill Marcus Gray original, Breathitt’s Taulbee infant Silas and Bryant Siras, and Madison’s John Green house with Silas Green aged twenty, the 1850 Owsley Harrison Newman house with an eight-year-old Elias who is probably Dora’s father — a 1932 death extract names Henry Harrison Newnam as that father — and is not merged as proven, the 1860 Booneville original of that house under H.H. Newman with Elias aged eighteen, the 1850 William Newman house of twenty-six on the same page, the 1850 John Newman of sixty born in Tennessee who is not the 1880 John of sixty-nine, and Andrew Mays’s Giles at one month in 1850 and eleven in 1860, the 1870 Proctor original of James Brandenburg’s house, Silas Gray’s Sturgeon original, the 1880 District 59 originals of William next door to John Newnam and of Silas still in the district, the 1900 William Gray dwelling-84 crop, and the Bollinger page a sibling had labelled “Dora E. Stone,” which is Henry C. Rhodes and Dora M. of Missouri, and the 1920 Booneville, Buffalo, and Buck Creek originals with the rejected Taylor, Marcum, Magee, McIntosh, Baker, and McPherson houses, the 1910 Sturgeon Gilbert×Josie house, Lynch’s wife Laura without a Newman on the original, and the Buffalo Baker household whose Soundex card misnamed Gilbert John as Robert, the 1910 Buffalo Gilbert, John house next door to Baker, Robert H., and the Soundex Douglas card that shows the clerks indexed filmed Buffalo sheets. This volume folds those chats into one narrative. The case dossier remains the working file; this book is the public reading of it. Sibling work on Greene ED 37 through 41 is now on merged PR #26 through Pass 59; remaining Greene ED 38 B-sides, 1900 Liberty, and 1900 hh 85 are inventoried, not duplicated. Do not import their “Dora E. Stone” as this woman.</w:t>
       </w:r>
     </w:p>
     <w:p>
@@ -237,7 +237,196 @@
         <w:t>Baker, Robert</w:t>
       </w:r>
       <w:r>
-        <w:t xml:space="preserve">, not the 1910 husband. In January 1920 he is on the Island Creek original — Owsley district 90, sheet 7 A, dwelling 113 — </w:t>
+        <w:t xml:space="preserve">, not the 1910 husband. Ten years earlier, on the 1910 Buffalo original — district 168, sheet 5 B — dwelling 76 is </w:t>
+      </w:r>
+      <w:r>
+        <w:rPr>
+          <w:b/>
+        </w:rPr>
+        <w:t>Gilbert, John</w:t>
+      </w:r>
+      <w:r>
+        <w:t xml:space="preserve">, seventy-four, in a second marriage of eighteen years, with </w:t>
+      </w:r>
+      <w:r>
+        <w:rPr>
+          <w:b/>
+        </w:rPr>
+        <w:t>Darkis[?]</w:t>
+      </w:r>
+      <w:r>
+        <w:t xml:space="preserve">, thirty-nine. Next door is </w:t>
+      </w:r>
+      <w:r>
+        <w:rPr>
+          <w:b/>
+        </w:rPr>
+        <w:t>Baker, Robert H.</w:t>
+      </w:r>
+      <w:r>
+        <w:t xml:space="preserve">, thirty-one, with wife </w:t>
+      </w:r>
+      <w:r>
+        <w:rPr>
+          <w:b/>
+        </w:rPr>
+        <w:t>Laura</w:t>
+      </w:r>
+      <w:r>
+        <w:t xml:space="preserve">, twenty-eight. That John is probably the 1920 father-in-law. The Baker wives are not silently merged: Laura versus a diplomatic </w:t>
+      </w:r>
+      <w:r>
+        <w:rPr>
+          <w:b/>
+        </w:rPr>
+        <w:t>Louise[?]</w:t>
+      </w:r>
+      <w:r>
+        <w:t xml:space="preserve">, and thirteen years versus ten. Lee marriage books 4 through 9, Owsley 1903–4 vital statistics, and Jackson’s G and N–P compiled marriages have no Josephine Newnam × Gilbert license. A G-416 card for </w:t>
+      </w:r>
+      <w:r>
+        <w:rPr>
+          <w:b/>
+        </w:rPr>
+        <w:t>Gilbert, Douglas</w:t>
+      </w:r>
+      <w:r>
+        <w:t xml:space="preserve">, seven, of Owsley district 92 sheet 2, shows the clerks indexed the filmed Buffalo sheets; the John given-name window has no Gilbert, John as a head. The 1910 Buffalo opener sheet — district 168, sheet 1 A — is now the original: dwelling 1 is </w:t>
+      </w:r>
+      <w:r>
+        <w:rPr>
+          <w:b/>
+        </w:rPr>
+        <w:t>Combs, Samuel</w:t>
+      </w:r>
+      <w:r>
+        <w:t xml:space="preserve">, thirty-seven, with </w:t>
+      </w:r>
+      <w:r>
+        <w:rPr>
+          <w:b/>
+        </w:rPr>
+        <w:t>Hulda</w:t>
+      </w:r>
+      <w:r>
+        <w:t xml:space="preserve">, thirty-three, </w:t>
+      </w:r>
+      <w:r>
+        <w:rPr>
+          <w:b/>
+        </w:rPr>
+        <w:t>John H.</w:t>
+      </w:r>
+      <w:r>
+        <w:t xml:space="preserve">, fourteen, and </w:t>
+      </w:r>
+      <w:r>
+        <w:rPr>
+          <w:b/>
+        </w:rPr>
+        <w:t>Nancy</w:t>
+      </w:r>
+      <w:r>
+        <w:t xml:space="preserve">, two and two-twelfths. Kentucky’s 1920 Soundex C-512 cards </w:t>
+      </w:r>
+      <w:r>
+        <w:rPr>
+          <w:b/>
+        </w:rPr>
+        <w:t>Combs, Samuel B.</w:t>
+      </w:r>
+      <w:r>
+        <w:t xml:space="preserve">, forty-two, of Owsley district </w:t>
+      </w:r>
+      <w:r>
+        <w:rPr>
+          <w:b/>
+        </w:rPr>
+        <w:t>90</w:t>
+      </w:r>
+      <w:r>
+        <w:t xml:space="preserve">, with Hulda and Nancy eleven — probably that 1910 couple, not a missing district 92 sheet-1 house; Samuel’s age jumps five years, not ten, and is not averaged. </w:t>
+      </w:r>
+      <w:r>
+        <w:rPr>
+          <w:b/>
+        </w:rPr>
+        <w:t>Gabbard, Elijah</w:t>
+      </w:r>
+      <w:r>
+        <w:t xml:space="preserve">, thirty-eight, with </w:t>
+      </w:r>
+      <w:r>
+        <w:rPr>
+          <w:b/>
+        </w:rPr>
+        <w:t>Amy</w:t>
+      </w:r>
+      <w:r>
+        <w:t xml:space="preserve">, and </w:t>
+      </w:r>
+      <w:r>
+        <w:rPr>
+          <w:b/>
+        </w:rPr>
+        <w:t>Gabbard, Lee</w:t>
+      </w:r>
+      <w:r>
+        <w:t xml:space="preserve">, thirty-seven, with </w:t>
+      </w:r>
+      <w:r>
+        <w:rPr>
+          <w:b/>
+        </w:rPr>
+        <w:t>Eliza</w:t>
+      </w:r>
+      <w:r>
+        <w:t xml:space="preserve">, sit in dwellings 5 and 6 on that same 1910 sheet. The 1920 Soundex puts Elijah, forty-one, with </w:t>
+      </w:r>
+      <w:r>
+        <w:rPr>
+          <w:b/>
+        </w:rPr>
+        <w:t>Annie</w:t>
+      </w:r>
+      <w:r>
+        <w:t xml:space="preserve"> in Lee County, and Lee, forty-seven, with </w:t>
+      </w:r>
+      <w:r>
+        <w:rPr>
+          <w:b/>
+        </w:rPr>
+        <w:t>Orlena</w:t>
+      </w:r>
+      <w:r>
+        <w:t xml:space="preserve"> in Breathitt — neither is district 92 sheet 1, and the wives and ages are not silently merged. Sheet 1 B dwelling 10 is </w:t>
+      </w:r>
+      <w:r>
+        <w:rPr>
+          <w:b/>
+        </w:rPr>
+        <w:t>Rice, William E.</w:t>
+      </w:r>
+      <w:r>
+        <w:t xml:space="preserve"> with a daughter </w:t>
+      </w:r>
+      <w:r>
+        <w:rPr>
+          <w:b/>
+        </w:rPr>
+        <w:t>Dora</w:t>
+      </w:r>
+      <w:r>
+        <w:t xml:space="preserve">, two and two-twelfths, who is not this woman. C-512 has no </w:t>
+      </w:r>
+      <w:r>
+        <w:rPr>
+          <w:b/>
+        </w:rPr>
+        <w:t>Combs, Lowe</w:t>
+      </w:r>
+      <w:r>
+        <w:t xml:space="preserve"> card: Louise of Madison and Loya of Boyd sit on consecutive leaves. Wolfe’s 1861–1909 marriage list, Clay’s G and N–Q grooms and G and M–N brides, and two Estill minister-return plates from 1901 and 1902 have no Josephine Newnam × Gilbert license; those Estill plates are eight couples each, not a county-wide search. Breathitt’s marriage pages still did not open. In January 1920 he is on the Island Creek original — Owsley district 90, sheet 7 A, dwelling 113 — </w:t>
       </w:r>
       <w:r>
         <w:rPr>
@@ -507,7 +696,7 @@
         <w:t>Dara</w:t>
       </w:r>
       <w:r>
-        <w:t>, forty — the enumerator wrote an open a, not o — is another person. Kentucky’s 1920 Soundex has no Manerva or Minerva Newman card, and the Walter given-name window has no Owsley or Lee Walter with Manerva. Kentucky’s 1920 death index has no Manerva Newnam row on 28 August; the Owsley table that day is an infant Bates. Mary Ann Smallwood, born April 1842, came from the Owsley Smallwoods. The 11 July 1918 cemetery date is still unmatched in Kentucky’s civil index. [C669] [C672] [C693] [C694] [C690] [C691] [C709] [C711] [C712] [C713] [C717] [C729] [C730] [C739] [C740] [C741] [C742] [C743] [C744] [C745] [C746] [C747] [C748] [C752] [C753] [C754] [C756] [C759]</w:t>
+        <w:t>, forty — the enumerator wrote an open a, not o — is another person. Kentucky’s 1920 Soundex has no Manerva or Minerva Newman card, and the Walter given-name window has no Owsley or Lee Walter with Manerva. Kentucky’s 1920 death index has no Manerva Newnam row on 28 August; the Owsley table that day is an infant Bates. Mary Ann Smallwood, born April 1842, came from the Owsley Smallwoods. The 11 July 1918 cemetery date is still unmatched in Kentucky’s civil index. [C669] [C672] [C693] [C694] [C690] [C691] [C709] [C711] [C712] [C713] [C717] [C729] [C730] [C739] [C740] [C741] [C742] [C743] [C744] [C745] [C746] [C747] [C748] [C752] [C753] [C754] [C756] [C759] [C763] [C765] [C768] [C775] [C776] [C777] [C779] [C780] [C782] [C783] [C784] [C789]</w:t>
       </w:r>
     </w:p>
     <w:p>

</xml_diff>

<commit_message>
Dora passes 78–81: Boyd+Allie 1910 proven; Allie A. original; John+Jennie card
1910 Heidelberg Boyd 38 + Allie 28 is the 1920 Station Camp house (C700).
1900 Boyd boarder and Allie A. hh 41 originals isolated. Floyd 1902 still
not merged (#27). Soundex John 38+Jennie card read and rejected vs John L;
Breathitt ED 52 remapped to leaf 1116. FS films still 403 (R011-31).

Co-authored-by: blakereaganlaw <blakereaganlaw@gmail.com>
</commit_message>
<xml_diff>
--- a/research/dora-ella-newnam/book/Dora-Ella-Newnam-Stone-A-Life.docx
+++ b/research/dora-ella-newnam/book/Dora-Ella-Newnam-Stone-A-Life.docx
@@ -141,6 +141,26 @@
     </w:p>
     <w:p>
       <w:r>
+        <w:t>23. [Pass 78. Powell walked; Boyd of Leighton](#pass-78-powell-walked-boyd-of-leighton)</w:t>
+      </w:r>
+    </w:p>
+    <w:p>
+      <w:r>
+        <w:t>24. [Pass 79. Floyd married Allie in 1902](#pass-79-floyd-married-allie-in-1902)</w:t>
+      </w:r>
+    </w:p>
+    <w:p>
+      <w:r>
+        <w:t>25. [Pass 80. Boyd and Allie in Heidelberg, 1910](#pass-80-boyd-and-allie-in-heidelberg-1910)</w:t>
+      </w:r>
+    </w:p>
+    <w:p>
+      <w:r>
+        <w:t>26. [Pass 81. Allie A. on the original, and the John–Jennie card](#pass-81-allie-a-on-the-original-and-the-johnjennie-card)</w:t>
+      </w:r>
+    </w:p>
+    <w:p>
+      <w:r>
         <w:br w:type="page"/>
       </w:r>
     </w:p>
@@ -3602,12 +3622,587 @@
     </w:p>
     <w:p>
       <w:r>
-        <w:t>Powell County is on T625-596 after Pike. The county card is leaf 1050: districts 142 and 177, 143 to 146, and 178. Pike still occupies leaf 1000. District 142, Stanton Precinct, begins on leaf 1051, 13 January 1920. The first household’s wife is a Dora — not Dora Ella Newnam Stone; the surname is not hers and the age is wrong. Clay City, district 144, is at leaf 1100. District 178 is at leaf 1180. Those name columns are the next walk. [C655] [C656] [C657]</w:t>
-      </w:r>
-    </w:p>
-    <w:p>
-      <w:r>
-        <w:t>FamilySearch films 127913, 127869, and 1146342 returned 403 again. [C617]</w:t>
+        <w:t>Powell County is on T625-596 after Pike. The county card is leaf 1050: districts 142 and 177, 143 to 146, and 178. Pike still occupies leaf 1000. District 142, Stanton Precinct, begins on leaf 1051, 13 January 1920. The first household’s wife is a Dora — not Dora Ella Newnam Stone; the surname is not hers and the age is wrong. Clay City, district 144, is at leaf 1100. District 178 is at leaf 1180. [C655] [C656] [C657]</w:t>
+      </w:r>
+    </w:p>
+    <w:p>
+      <w:pPr>
+        <w:pStyle w:val="Heading2"/>
+      </w:pPr>
+      <w:r>
+        <w:t>Pass 78. Powell walked; Boyd of Leighton</w:t>
+      </w:r>
+    </w:p>
+    <w:p>
+      <w:r>
+        <w:t xml:space="preserve">Powell’s name columns, leaves 1051 to 1201, were walked on contact sheets. No Newman, Newnam, or McCoy head — and no John L. with Cora — appears at that resolution. That is a </w:t>
+      </w:r>
+      <w:r>
+        <w:rPr>
+          <w:b/>
+        </w:rPr>
+        <w:t>probable</w:t>
+      </w:r>
+      <w:r>
+        <w:t xml:space="preserve"> negative, not a line-by-line county close. [C658] [C673] [S441]</w:t>
+      </w:r>
+    </w:p>
+    <w:p>
+      <w:r>
+        <w:t>Wolfe starts on the same reel as Wayne. Wayne is still at leaf 368, Mill Springs, district 268. Wolfe is on the film by leaf 374: Lee City Precinct, Lee City Town. Hazel Green Precinct is leaf 380. Whitley — Williamsburg, district 277 — has begun by leaf 440. Those seventy-three leaves were contact-sheeted. No Newman or McCoy head was identified on the dark montages. [C659] [C660] [S442]</w:t>
+      </w:r>
+    </w:p>
+    <w:p>
+      <w:r>
+        <w:t xml:space="preserve">Breathitt district 52 is Quicksand. Sheet 1A is leaf 1110, 3 January. Sheet 19A is leaf 1128, 17 January. The Soundex card that already rejected John, thirty-eight, with Jennie points at district 52, sheet 19, line 17. Line 17 on sheet 19A is not that couple. The names at that band read </w:t>
+      </w:r>
+      <w:r>
+        <w:rPr>
+          <w:b/>
+        </w:rPr>
+        <w:t>[Hensley? / other], Jesse[?]</w:t>
+      </w:r>
+      <w:r>
+        <w:t xml:space="preserve">, thirty-two, and </w:t>
+      </w:r>
+      <w:r>
+        <w:rPr>
+          <w:b/>
+        </w:rPr>
+        <w:t>Lela</w:t>
+      </w:r>
+      <w:r>
+        <w:t>, thirty-two. The original of the Soundex household is still not isolated. Remaining Breathitt districts are unread. [C661] [C662] [C663] [S443]</w:t>
+      </w:r>
+    </w:p>
+    <w:p>
+      <w:r>
+        <w:t xml:space="preserve">On 22 April 1918 a Station Camp woman died whose certificate — registered 9771 — we now have as a scan. The face reads </w:t>
+      </w:r>
+      <w:r>
+        <w:rPr>
+          <w:b/>
+        </w:rPr>
+        <w:t>[Susananna?] Brandenburg</w:t>
+      </w:r>
+      <w:r>
+        <w:t xml:space="preserve">, born 5 February 1863, father David Mays, mother Serena Richardson. The informant is </w:t>
+      </w:r>
+      <w:r>
+        <w:rPr>
+          <w:b/>
+        </w:rPr>
+        <w:t>Boyd Newman</w:t>
+      </w:r>
+      <w:r>
+        <w:t>, Leighton. The undertaker is Ben Sparkes, also of Leighton. Cause: peritonitis; contributory, a kick in the abdomen by a cow. Burial 24 April. [C664] [S444]</w:t>
+      </w:r>
+    </w:p>
+    <w:p>
+      <w:r>
+        <w:t xml:space="preserve">Boyd Newman of Leighton in 1918 is </w:t>
+      </w:r>
+      <w:r>
+        <w:rPr>
+          <w:b/>
+        </w:rPr>
+        <w:t>probable</w:t>
+      </w:r>
+      <w:r>
+        <w:t xml:space="preserve"> the Station Camp head of 1920: same uncommon name, same precinct cluster, two years apart. The certificate does not name Allie. [C665] Susananna is FAN of Allie Brandenburg Newman — </w:t>
+      </w:r>
+      <w:r>
+        <w:rPr>
+          <w:b/>
+        </w:rPr>
+        <w:t>possible</w:t>
+      </w:r>
+      <w:r>
+        <w:t xml:space="preserve"> mother or mother-in-law, not merged. Allie was about thirty-five in 1920. [C666]</w:t>
+      </w:r>
+    </w:p>
+    <w:p>
+      <w:r>
+        <w:t xml:space="preserve">Kentucky’s statewide death index, 1911–1989, has exactly one </w:t>
+      </w:r>
+      <w:r>
+        <w:rPr>
+          <w:b/>
+        </w:rPr>
+        <w:t>Newman, Boyd</w:t>
+      </w:r>
+      <w:r>
+        <w:t xml:space="preserve">: age 101, Fayette County, 2 December 1976, volume 58, certificate 28501. Age 101 implies a birth about 1875, which matches a man of forty-five in January 1920. </w:t>
+      </w:r>
+      <w:r>
+        <w:rPr>
+          <w:b/>
+        </w:rPr>
+        <w:t>Allie B. Newman</w:t>
+      </w:r>
+      <w:r>
+        <w:t>, 94, died in Fayette on 13 December 1978, volume 64, certificate 31780 — a birth about 1884, which matches Allie at thirty-five in 1920. Other Allie Newman rows fail on age or county. Both certificates are unread. Do not print 1976 as Boyd’s proven death. [C667] [C668] [S445]</w:t>
+      </w:r>
+    </w:p>
+    <w:p>
+      <w:r>
+        <w:t xml:space="preserve">A compiled 2004 Estill obituary names Tracy Newman, seventy-eight, died 18 February, son of </w:t>
+      </w:r>
+      <w:r>
+        <w:rPr>
+          <w:b/>
+        </w:rPr>
+        <w:t>the late Boyd and Allie Brandenburg Newman</w:t>
+      </w:r>
+      <w:r>
+        <w:t>. Living children are withheld. The page text was seen; a live fetch from this machine returned 404. [C669] [S446]</w:t>
+      </w:r>
+    </w:p>
+    <w:p>
+      <w:r>
+        <w:t>FamilySearch films 127913, 127891, 127869, 964964, 1146342, 156057, and 97277 returned 403 again. [C670] [S447]</w:t>
+      </w:r>
+    </w:p>
+    <w:p>
+      <w:pPr>
+        <w:pStyle w:val="Heading2"/>
+      </w:pPr>
+      <w:r>
+        <w:t>Pass 79. Floyd married Allie in 1902</w:t>
+      </w:r>
+    </w:p>
+    <w:p>
+      <w:r>
+        <w:t xml:space="preserve">Lee Marriage Book 6, a compiled USGenNet transcript, has the license we lacked. </w:t>
+      </w:r>
+      <w:r>
+        <w:rPr>
+          <w:b/>
+        </w:rPr>
+        <w:t>Floyd Newnam</w:t>
+      </w:r>
+      <w:r>
+        <w:t xml:space="preserve">, twenty-three, farmer, first marriage, of Lee County, married </w:t>
+      </w:r>
+      <w:r>
+        <w:rPr>
+          <w:b/>
+        </w:rPr>
+        <w:t>Allie A. Brandenburg</w:t>
+      </w:r>
+      <w:r>
+        <w:t xml:space="preserve">, eighteen, first marriage, of Lee County, on 31 July 1902, at “my house,” by A. J. Marcum. The witnesses were Elizabeth Webb and Edna Marcum. That row is </w:t>
+      </w:r>
+      <w:r>
+        <w:rPr>
+          <w:b/>
+        </w:rPr>
+        <w:t>proven</w:t>
+      </w:r>
+      <w:r>
+        <w:t xml:space="preserve"> as a compiled sentence. The register image is unread. [C677] [C678] [S449]</w:t>
+      </w:r>
+    </w:p>
+    <w:p>
+      <w:r>
+        <w:t xml:space="preserve">The same book has </w:t>
+      </w:r>
+      <w:r>
+        <w:rPr>
+          <w:b/>
+        </w:rPr>
+        <w:t>Boyde Newnam</w:t>
+      </w:r>
+      <w:r>
+        <w:t xml:space="preserve"> as a witness on 13 October 1900 at Scott Mays’ house. Books 4, 5, and 7 have no Boyd Newman groom. [C680] [C681] [S450]</w:t>
+      </w:r>
+    </w:p>
+    <w:p>
+      <w:r>
+        <w:t xml:space="preserve">Floyd of 1902 is </w:t>
+      </w:r>
+      <w:r>
+        <w:rPr>
+          <w:b/>
+        </w:rPr>
+        <w:t>not merged</w:t>
+      </w:r>
+      <w:r>
+        <w:t xml:space="preserve"> with Boyd of 1920. The wife’s name, the Lee–Estill cluster, Arthur’s 1906 delayed birth, and Allie’s ages line up. The given names do not — Floyd versus Boyd — and the ages are about four years apart. Under the same-person rule that is a contradiction. </w:t>
+      </w:r>
+      <w:r>
+        <w:rPr>
+          <w:b/>
+        </w:rPr>
+        <w:t>Possible</w:t>
+      </w:r>
+      <w:r>
+        <w:t xml:space="preserve"> only. Do not print Floyd as Boyd. [C679] [#27]</w:t>
+      </w:r>
+    </w:p>
+    <w:p>
+      <w:r>
+        <w:t>Kentucky’s death index, 1939–1989, has no Floyd Newman born about 1879. The only given-name Floyd is Floyd W., sixty-two, Campbell County, 10 August 1971 — born about 1909, rejected. [C682] [S451]</w:t>
+      </w:r>
+    </w:p>
+    <w:p>
+      <w:r>
+        <w:t xml:space="preserve">The 1910 Estill reel is T624-472. Station Camp, district 48, begins at leaf 481, sheet 1A. Sampled sheets through 17A do not isolate a Floyd or Boyd household with Allie. A look-alike on sheet 4B, line 71, is </w:t>
+      </w:r>
+      <w:r>
+        <w:rPr>
+          <w:b/>
+        </w:rPr>
+        <w:t>Pennington, John</w:t>
+      </w:r>
+      <w:r>
+        <w:t>, twenty-seven. Remaining district 48 sheets are unread. [C683] [C684] [C685] [S452] [S453]</w:t>
+      </w:r>
+    </w:p>
+    <w:p>
+      <w:r>
+        <w:t xml:space="preserve">Breathitt’s 1920 name columns, leaves 840 to 1176, were walked on contact sheets. District 41 starts at leaf 896, sheet 1A — not 901, which is sheet 2B. No Newman, Newnam, or McCoy head, and no John L. with Cora, appears at montage resolution. That is a </w:t>
+      </w:r>
+      <w:r>
+        <w:rPr>
+          <w:b/>
+        </w:rPr>
+        <w:t>probable</w:t>
+      </w:r>
+      <w:r>
+        <w:t xml:space="preserve"> negative, not a line-by-line county close. [C688] [C690] [C691] [S454]</w:t>
+      </w:r>
+    </w:p>
+    <w:p>
+      <w:r>
+        <w:t>FamilySearch films 127913, 127891, 127869, 964964, 1146342, 156057, and 97277 returned 403 again. [C694] [S456]</w:t>
+      </w:r>
+    </w:p>
+    <w:p>
+      <w:pPr>
+        <w:pStyle w:val="Heading2"/>
+      </w:pPr>
+      <w:r>
+        <w:t>Pass 80. Boyd and Allie in Heidelberg, 1910</w:t>
+      </w:r>
+    </w:p>
+    <w:p>
+      <w:r>
+        <w:t xml:space="preserve">The 1910 Kentucky Miracode card we lacked is on Internet Archive `soundex1910ky124`, leaf 251. </w:t>
+      </w:r>
+      <w:r>
+        <w:rPr>
+          <w:b/>
+        </w:rPr>
+        <w:t>Newman, Boyd</w:t>
+      </w:r>
+      <w:r>
+        <w:t xml:space="preserve">, of Lee County, volume 33, district 98, visitation 158: wife </w:t>
+      </w:r>
+      <w:r>
+        <w:rPr>
+          <w:b/>
+        </w:rPr>
+        <w:t>Allie</w:t>
+      </w:r>
+      <w:r>
+        <w:t xml:space="preserve">, twenty-six; </w:t>
+      </w:r>
+      <w:r>
+        <w:rPr>
+          <w:b/>
+        </w:rPr>
+        <w:t>Sarah</w:t>
+      </w:r>
+      <w:r>
+        <w:t xml:space="preserve">, six; </w:t>
+      </w:r>
+      <w:r>
+        <w:rPr>
+          <w:b/>
+        </w:rPr>
+        <w:t>Arthur</w:t>
+      </w:r>
+      <w:r>
+        <w:t xml:space="preserve">, four; </w:t>
+      </w:r>
+      <w:r>
+        <w:rPr>
+          <w:b/>
+        </w:rPr>
+        <w:t>Carlos</w:t>
+      </w:r>
+      <w:r>
+        <w:t xml:space="preserve">, three; </w:t>
+      </w:r>
+      <w:r>
+        <w:rPr>
+          <w:b/>
+        </w:rPr>
+        <w:t>Clarence</w:t>
+      </w:r>
+      <w:r>
+        <w:t>, age not recorded. The card says Boyd is twenty-eight. That age is slack. [C697] [C699] [S457]</w:t>
+      </w:r>
+    </w:p>
+    <w:p>
+      <w:r>
+        <w:t xml:space="preserve">The original schedule is Heidelberg precinct, district 98, sheet 8A — leaf 536 of T624-478. Dwelling 157, family 158: </w:t>
+      </w:r>
+      <w:r>
+        <w:rPr>
+          <w:b/>
+        </w:rPr>
+        <w:t>Newman, Boyd</w:t>
+      </w:r>
+      <w:r>
+        <w:t xml:space="preserve">, thirty-eight, married seven years; </w:t>
+      </w:r>
+      <w:r>
+        <w:rPr>
+          <w:b/>
+        </w:rPr>
+        <w:t>Allie</w:t>
+      </w:r>
+      <w:r>
+        <w:t xml:space="preserve">, twenty-eight, four children born and four living; a daughter </w:t>
+      </w:r>
+      <w:r>
+        <w:rPr>
+          <w:b/>
+        </w:rPr>
+        <w:t>S[arah?]</w:t>
+      </w:r>
+      <w:r>
+        <w:t xml:space="preserve">, six; </w:t>
+      </w:r>
+      <w:r>
+        <w:rPr>
+          <w:b/>
+        </w:rPr>
+        <w:t>Arthur</w:t>
+      </w:r>
+      <w:r>
+        <w:t xml:space="preserve">, four; </w:t>
+      </w:r>
+      <w:r>
+        <w:rPr>
+          <w:b/>
+        </w:rPr>
+        <w:t>Carlos</w:t>
+      </w:r>
+      <w:r>
+        <w:t xml:space="preserve">, three; </w:t>
+      </w:r>
+      <w:r>
+        <w:rPr>
+          <w:b/>
+        </w:rPr>
+        <w:t>Clarence</w:t>
+      </w:r>
+      <w:r>
+        <w:t>, one. They are farmers or laborers, all born Kentucky. [C698] [S458]</w:t>
+      </w:r>
+    </w:p>
+    <w:p>
+      <w:r>
+        <w:t xml:space="preserve">Those four children are the 1920 Station Camp children. Carlos is Corlue. The household moved from Heidelberg, Lee County, to Station Camp, Estill County, between April 1910 and the 1918 Leighton informant line. Same wife, same four names, same birth order. </w:t>
+      </w:r>
+      <w:r>
+        <w:rPr>
+          <w:b/>
+        </w:rPr>
+        <w:t>Proven</w:t>
+      </w:r>
+      <w:r>
+        <w:t xml:space="preserve"> one household. They are not John L. and Cora. [C700] [C714] [C716]</w:t>
+      </w:r>
+    </w:p>
+    <w:p>
+      <w:r>
+        <w:t>There is no Floyd Newman head on the 1910 Kentucky N-550 F-window. [C701] [S459]</w:t>
+      </w:r>
+    </w:p>
+    <w:p>
+      <w:r>
+        <w:t xml:space="preserve">On 1 June 1900, on Sturgeon sheet 2B, </w:t>
+      </w:r>
+      <w:r>
+        <w:rPr>
+          <w:b/>
+        </w:rPr>
+        <w:t>Newman, Boyd</w:t>
+      </w:r>
+      <w:r>
+        <w:t xml:space="preserve">, boarder, born March 1878, twenty-two, single, day laborer, lives in Allen Sams’s house — household 27, two doors from a Brandenburg hired hand and in the same precinct as compiled </w:t>
+      </w:r>
+      <w:r>
+        <w:rPr>
+          <w:b/>
+        </w:rPr>
+        <w:t>Allie A. Brandenburg</w:t>
+      </w:r>
+      <w:r>
+        <w:t>, fourteen, daughter of Oliver. [C702] [C703] [C710] [S460] [S461]</w:t>
+      </w:r>
+    </w:p>
+    <w:p>
+      <w:r>
+        <w:t xml:space="preserve">Floyd of 1902 is </w:t>
+      </w:r>
+      <w:r>
+        <w:rPr>
+          <w:b/>
+        </w:rPr>
+        <w:t>still not merged</w:t>
+      </w:r>
+      <w:r>
+        <w:t xml:space="preserve"> with this Boyd. The alignments are stronger: Allie A., the same 1900 precinct, no Floyd head in 1910, children starting about 1904, seven years married by April 1910. The contradictions remain: Floyd versus Boyd, and age twenty-three in 1902 versus thirty-eight in 1910. </w:t>
+      </w:r>
+      <w:r>
+        <w:rPr>
+          <w:b/>
+        </w:rPr>
+        <w:t>Possible</w:t>
+      </w:r>
+      <w:r>
+        <w:t xml:space="preserve"> only. Do not print Floyd as Boyd. [C711] [#27]</w:t>
+      </w:r>
+    </w:p>
+    <w:p>
+      <w:pPr>
+        <w:pStyle w:val="Heading2"/>
+      </w:pPr>
+      <w:r>
+        <w:t>Pass 81. Allie A. on the original, and the John–Jennie card</w:t>
+      </w:r>
+    </w:p>
+    <w:p>
+      <w:r>
+        <w:t xml:space="preserve">The compiled 1900 Allie A. row is now an original. Sturgeon sheet 3A, leaf 937, household 41: </w:t>
+      </w:r>
+      <w:r>
+        <w:rPr>
+          <w:b/>
+        </w:rPr>
+        <w:t>Brandenburgh, Oliver</w:t>
+      </w:r>
+      <w:r>
+        <w:t xml:space="preserve">, June 1861, thirty-eight, married nineteen years; </w:t>
+      </w:r>
+      <w:r>
+        <w:rPr>
+          <w:b/>
+        </w:rPr>
+        <w:t>Susan</w:t>
+      </w:r>
+      <w:r>
+        <w:t xml:space="preserve">, February 1865, thirty-five, nine children born and nine living; </w:t>
+      </w:r>
+      <w:r>
+        <w:rPr>
+          <w:b/>
+        </w:rPr>
+        <w:t>Allie A.</w:t>
+      </w:r>
+      <w:r>
+        <w:t xml:space="preserve">, daughter, November 1885, fourteen; then William B., John S., Maggie, Rhoda, David, Henderson, and Colonel T. That is </w:t>
+      </w:r>
+      <w:r>
+        <w:rPr>
+          <w:b/>
+        </w:rPr>
+        <w:t>proven</w:t>
+      </w:r>
+      <w:r>
+        <w:t xml:space="preserve">. She is </w:t>
+      </w:r>
+      <w:r>
+        <w:rPr>
+          <w:b/>
+        </w:rPr>
+        <w:t>probable</w:t>
+      </w:r>
+      <w:r>
+        <w:t xml:space="preserve"> the 1902 bride. Whether she is Boyd’s 1910 wife still hangs on conflict #27. [C722] [C723] [S467]</w:t>
+      </w:r>
+    </w:p>
+    <w:p>
+      <w:r>
+        <w:t xml:space="preserve">The 1920 Soundex card for John of Breathitt is now readable in full. Newman, John, thirty-eight, volume 4, district 52, sheet 19, line 17: wife </w:t>
+      </w:r>
+      <w:r>
+        <w:rPr>
+          <w:b/>
+        </w:rPr>
+        <w:t>Jennie</w:t>
+      </w:r>
+      <w:r>
+        <w:t xml:space="preserve">, twenty-one; </w:t>
+      </w:r>
+      <w:r>
+        <w:rPr>
+          <w:b/>
+        </w:rPr>
+        <w:t>Virgil</w:t>
+      </w:r>
+      <w:r>
+        <w:t xml:space="preserve">, three; </w:t>
+      </w:r>
+      <w:r>
+        <w:rPr>
+          <w:b/>
+        </w:rPr>
+        <w:t>Freda</w:t>
+      </w:r>
+      <w:r>
+        <w:t xml:space="preserve">, one; </w:t>
+      </w:r>
+      <w:r>
+        <w:rPr>
+          <w:b/>
+        </w:rPr>
+        <w:t>Henry</w:t>
+      </w:r>
+      <w:r>
+        <w:t xml:space="preserve">, fifty-two, father; </w:t>
+      </w:r>
+      <w:r>
+        <w:rPr>
+          <w:b/>
+        </w:rPr>
+        <w:t>Julie</w:t>
+      </w:r>
+      <w:r>
+        <w:t xml:space="preserve">, forty-two, mother. That card is </w:t>
+      </w:r>
+      <w:r>
+        <w:rPr>
+          <w:b/>
+        </w:rPr>
+        <w:t>proven</w:t>
+      </w:r>
+      <w:r>
+        <w:t xml:space="preserve">. He is </w:t>
+      </w:r>
+      <w:r>
+        <w:rPr>
+          <w:b/>
+        </w:rPr>
+        <w:t>not</w:t>
+      </w:r>
+      <w:r>
+        <w:t xml:space="preserve"> John L. of Owsley. [C717] [C730] [S466]</w:t>
+      </w:r>
+    </w:p>
+    <w:p>
+      <w:r>
+        <w:t>District 52 does not start where pass 78 said. Leaf 1110 is district 23, sheet 13A. District 52 starts at leaf 1116, sheet 1A. Leaf 1128 is sheet 7A, not 19A. District 52 has no sheet 19 — district 56 is already on the film by leaf 1144. The Soundex sheet number is slack. The original household is still not isolated. [C718] [C719] [C720] [C721] [C728] [S468]</w:t>
+      </w:r>
+    </w:p>
+    <w:p>
+      <w:r>
+        <w:t>Certificates 28501 and 31780 are still unread. SortedByName has no Boyd Newman page and no Kentucky Floyd born about 1878–79 who belongs here. FamilySearch films returned 403 again. [C706] [C707] [C708] [C709] [S462] [S463]</w:t>
       </w:r>
     </w:p>
     <w:p>
@@ -4573,40 +5168,139 @@
         <w:t>C612</w:t>
       </w:r>
       <w:r>
+        <w:t xml:space="preserve">), </w:t>
+      </w:r>
+      <w:r>
+        <w:rPr>
+          <w:b/>
+        </w:rPr>
+        <w:t>absent as a couple</w:t>
+      </w:r>
+      <w:r>
+        <w:t xml:space="preserve"> from 1920 Estill (</w:t>
+      </w:r>
+      <w:r>
+        <w:rPr>
+          <w:b/>
+        </w:rPr>
+        <w:t>C643</w:t>
+      </w:r>
+      <w:r>
+        <w:t xml:space="preserve">; Station Camp </w:t>
+      </w:r>
+      <w:r>
+        <w:rPr>
+          <w:b/>
+        </w:rPr>
+        <w:t>nil withdrawn</w:t>
+      </w:r>
+      <w:r>
+        <w:t xml:space="preserve"> — Boyd+Allie </w:t>
+      </w:r>
+      <w:r>
+        <w:rPr>
+          <w:b/>
+        </w:rPr>
+        <w:t>C634 C635</w:t>
+      </w:r>
+      <w:r>
         <w:t xml:space="preserve">), and </w:t>
       </w:r>
       <w:r>
         <w:rPr>
           <w:b/>
         </w:rPr>
-        <w:t>absent as a couple</w:t>
-      </w:r>
-      <w:r>
-        <w:t xml:space="preserve"> from 1920 Estill (</w:t>
-      </w:r>
-      <w:r>
-        <w:rPr>
-          <w:b/>
-        </w:rPr>
-        <w:t>C643</w:t>
-      </w:r>
-      <w:r>
-        <w:t xml:space="preserve">; Station Camp </w:t>
-      </w:r>
-      <w:r>
-        <w:rPr>
-          <w:b/>
-        </w:rPr>
-        <w:t>nil withdrawn</w:t>
-      </w:r>
-      <w:r>
-        <w:t xml:space="preserve"> — Boyd+Allie </w:t>
-      </w:r>
-      <w:r>
-        <w:rPr>
-          <w:b/>
-        </w:rPr>
-        <w:t>C634 C635</w:t>
+        <w:t>absent</w:t>
+      </w:r>
+      <w:r>
+        <w:t xml:space="preserve"> Powell/Wolfe contact sheets (</w:t>
+      </w:r>
+      <w:r>
+        <w:rPr>
+          <w:b/>
+        </w:rPr>
+        <w:t>C658 C673</w:t>
+      </w:r>
+      <w:r>
+        <w:t xml:space="preserve">) and Breathitt </w:t>
+      </w:r>
+      <w:r>
+        <w:rPr>
+          <w:b/>
+        </w:rPr>
+        <w:t>0840–1176</w:t>
+      </w:r>
+      <w:r>
+        <w:t xml:space="preserve"> contact sheets (</w:t>
+      </w:r>
+      <w:r>
+        <w:rPr>
+          <w:b/>
+        </w:rPr>
+        <w:t>C690 C691</w:t>
+      </w:r>
+      <w:r>
+        <w:t xml:space="preserve">); </w:t>
+      </w:r>
+      <w:r>
+        <w:rPr>
+          <w:b/>
+        </w:rPr>
+        <w:t>1910 Heidelberg Boyd 38 + Allie 28 + four children = 1920 Station Camp — PROVEN (C700)</w:t>
+      </w:r>
+      <w:r>
+        <w:t xml:space="preserve">; 1900 Boyd boarder </w:t>
+      </w:r>
+      <w:r>
+        <w:rPr>
+          <w:b/>
+        </w:rPr>
+        <w:t>Mar 1878</w:t>
+      </w:r>
+      <w:r>
+        <w:t xml:space="preserve"> </w:t>
+      </w:r>
+      <w:r>
+        <w:rPr>
+          <w:b/>
+        </w:rPr>
+        <w:t>PROVEN (C702)</w:t>
+      </w:r>
+      <w:r>
+        <w:t xml:space="preserve">; 1902 Floyd×Allie license </w:t>
+      </w:r>
+      <w:r>
+        <w:rPr>
+          <w:b/>
+        </w:rPr>
+        <w:t>proven</w:t>
+      </w:r>
+      <w:r>
+        <w:t xml:space="preserve"> as compiled, </w:t>
+      </w:r>
+      <w:r>
+        <w:rPr>
+          <w:b/>
+        </w:rPr>
+        <w:t>still not merged</w:t>
+      </w:r>
+      <w:r>
+        <w:t xml:space="preserve"> with Boyd (</w:t>
+      </w:r>
+      <w:r>
+        <w:rPr>
+          <w:b/>
+        </w:rPr>
+        <w:t>#27</w:t>
+      </w:r>
+      <w:r>
+        <w:t xml:space="preserve">, </w:t>
+      </w:r>
+      <w:r>
+        <w:rPr>
+          <w:b/>
+        </w:rPr>
+        <w:t>C711</w:t>
       </w:r>
       <w:r>
         <w:t xml:space="preserve">); 1966 Woodford death </w:t>
@@ -4780,7 +5474,43 @@
         <w:t>C530</w:t>
       </w:r>
       <w:r>
-        <w:t xml:space="preserve">); Daniel’s license still unread after TFKRHA 1843–80 </w:t>
+        <w:t xml:space="preserve">); 1910 ED </w:t>
+      </w:r>
+      <w:r>
+        <w:rPr>
+          <w:b/>
+        </w:rPr>
+        <w:t>98</w:t>
+      </w:r>
+      <w:r>
+        <w:t xml:space="preserve"> Rissie servant 15 </w:t>
+      </w:r>
+      <w:r>
+        <w:rPr>
+          <w:b/>
+        </w:rPr>
+        <w:t>possible</w:t>
+      </w:r>
+      <w:r>
+        <w:t xml:space="preserve"> P013, </w:t>
+      </w:r>
+      <w:r>
+        <w:rPr>
+          <w:b/>
+        </w:rPr>
+        <w:t>not merged</w:t>
+      </w:r>
+      <w:r>
+        <w:t xml:space="preserve"> (</w:t>
+      </w:r>
+      <w:r>
+        <w:rPr>
+          <w:b/>
+        </w:rPr>
+        <w:t>C713</w:t>
+      </w:r>
+      <w:r>
+        <w:t xml:space="preserve"> / B016); Daniel’s license still unread after TFKRHA 1843–80 </w:t>
       </w:r>
       <w:r>
         <w:rPr>
@@ -4798,7 +5528,7 @@
         <w:t>Done this increment:</w:t>
       </w:r>
       <w:r>
-        <w:t xml:space="preserve"> Estill 1920 couple-close; Boyd+Allie Station Camp; Jackson contact-sheet; Powell mapped; Arthur delayed birth. </w:t>
+        <w:t xml:space="preserve"> 1910 Heidelberg Boyd+Allie original; 1900 Boyd boarder original; Floyd 1910 Soundex nil. </w:t>
       </w:r>
       <w:r>
         <w:rPr>
@@ -4807,7 +5537,7 @@
         <w:t>Done earlier:</w:t>
       </w:r>
       <w:r>
-        <w:t xml:space="preserve"> 1920 Owsley county (</w:t>
+        <w:t xml:space="preserve"> Powell 1051–1201 contact-sheet; Wolfe start mapped; Breathitt ED 52 / 0840–1176; 1918 Boyd informant; Estill 1920 couple-close; Boyd+Allie Station Camp; Jackson contact-sheet; 1920 Owsley county (</w:t>
       </w:r>
       <w:r>
         <w:rPr>
@@ -4816,7 +5546,7 @@
         <w:t>B086</w:t>
       </w:r>
       <w:r>
-        <w:t xml:space="preserve">); Arthur 45 Island Creek only Newman. </w:t>
+        <w:t xml:space="preserve">). </w:t>
       </w:r>
       <w:r>
         <w:rPr>
@@ -4910,52 +5640,52 @@
         <w:t>B088</w:t>
       </w:r>
       <w:r>
-        <w:t xml:space="preserve"> remaining Breathitt T625-</w:t>
-      </w:r>
-      <w:r>
-        <w:rPr>
-          <w:b/>
-        </w:rPr>
-        <w:t>559</w:t>
-      </w:r>
-      <w:r>
-        <w:t xml:space="preserve"> name columns, then Powell T625-</w:t>
-      </w:r>
-      <w:r>
-        <w:rPr>
-          <w:b/>
-        </w:rPr>
-        <w:t>596</w:t>
-      </w:r>
-      <w:r>
-        <w:t xml:space="preserve"> (from leaf </w:t>
-      </w:r>
-      <w:r>
-        <w:rPr>
-          <w:b/>
-        </w:rPr>
-        <w:t>1051</w:t>
-      </w:r>
-      <w:r>
-        <w:t>) and Wolfe T625-</w:t>
-      </w:r>
-      <w:r>
-        <w:rPr>
-          <w:b/>
-        </w:rPr>
-        <w:t>602</w:t>
-      </w:r>
-      <w:r>
-        <w:t xml:space="preserve"> EDs </w:t>
-      </w:r>
-      <w:r>
-        <w:rPr>
-          <w:b/>
-        </w:rPr>
-        <w:t>234–242</w:t>
-      </w:r>
-      <w:r>
-        <w:t xml:space="preserve">. Then </w:t>
+        <w:t xml:space="preserve"> Breathitt full-sheet residuals + John 38+Jennie original (ED </w:t>
+      </w:r>
+      <w:r>
+        <w:rPr>
+          <w:b/>
+        </w:rPr>
+        <w:t>52</w:t>
+      </w:r>
+      <w:r>
+        <w:t xml:space="preserve"> has no sheet 19), Powell/Wolfe full-sheet residuals, </w:t>
+      </w:r>
+      <w:r>
+        <w:rPr>
+          <w:b/>
+        </w:rPr>
+        <w:t>B045</w:t>
+      </w:r>
+      <w:r>
+        <w:t xml:space="preserve"> (FS </w:t>
+      </w:r>
+      <w:r>
+        <w:rPr>
+          <w:b/>
+        </w:rPr>
+        <w:t>127913 / 127891</w:t>
+      </w:r>
+      <w:r>
+        <w:t xml:space="preserve">) and </w:t>
+      </w:r>
+      <w:r>
+        <w:rPr>
+          <w:b/>
+        </w:rPr>
+        <w:t>B061</w:t>
+      </w:r>
+      <w:r>
+        <w:t xml:space="preserve"> (</w:t>
+      </w:r>
+      <w:r>
+        <w:rPr>
+          <w:b/>
+        </w:rPr>
+        <w:t>127869 / 964964</w:t>
+      </w:r>
+      <w:r>
+        <w:t xml:space="preserve">), </w:t>
       </w:r>
       <w:r>
         <w:rPr>
@@ -4964,43 +5694,16 @@
         <w:t>B089</w:t>
       </w:r>
       <w:r>
-        <w:t xml:space="preserve"> Boyd × Allie, </w:t>
-      </w:r>
-      <w:r>
-        <w:rPr>
-          <w:b/>
-        </w:rPr>
-        <w:t>B045</w:t>
-      </w:r>
-      <w:r>
-        <w:t xml:space="preserve"> (FS </w:t>
-      </w:r>
-      <w:r>
-        <w:rPr>
-          <w:b/>
-        </w:rPr>
-        <w:t>127913 / 127891</w:t>
-      </w:r>
-      <w:r>
-        <w:t xml:space="preserve">) and </w:t>
-      </w:r>
-      <w:r>
-        <w:rPr>
-          <w:b/>
-        </w:rPr>
-        <w:t>B061</w:t>
-      </w:r>
-      <w:r>
-        <w:t xml:space="preserve"> (</w:t>
-      </w:r>
-      <w:r>
-        <w:rPr>
-          <w:b/>
-        </w:rPr>
-        <w:t>127869 / 964964</w:t>
-      </w:r>
-      <w:r>
-        <w:t xml:space="preserve">), </w:t>
+        <w:t xml:space="preserve"> residual Book 6 register + certs </w:t>
+      </w:r>
+      <w:r>
+        <w:rPr>
+          <w:b/>
+        </w:rPr>
+        <w:t>28501 / 31780</w:t>
+      </w:r>
+      <w:r>
+        <w:t xml:space="preserve">, </w:t>
       </w:r>
       <w:r>
         <w:rPr>
@@ -5055,6 +5758,15 @@
       </w:r>
       <w:r>
         <w:t xml:space="preserve"> McCoy after 1930 (447-20-2466 not merged; Barney McCoy AR rejected), </w:t>
+      </w:r>
+      <w:r>
+        <w:rPr>
+          <w:b/>
+        </w:rPr>
+        <w:t>B016</w:t>
+      </w:r>
+      <w:r>
+        <w:t xml:space="preserve"> Rissie 15 servant 1910 (not merged), </w:t>
       </w:r>
       <w:r>
         <w:rPr>
@@ -9725,6 +10437,1643 @@
     </w:p>
     <w:p>
       <w:r>
+        <w:t xml:space="preserve">96. Same Powell reel, leaves </w:t>
+      </w:r>
+      <w:r>
+        <w:rPr>
+          <w:b/>
+        </w:rPr>
+        <w:t>1051–1201</w:t>
+      </w:r>
+      <w:r>
+        <w:t xml:space="preserve"> name-column contact sheets: </w:t>
+      </w:r>
+      <w:r>
+        <w:rPr>
+          <w:b/>
+        </w:rPr>
+        <w:t>nil</w:t>
+      </w:r>
+      <w:r>
+        <w:t xml:space="preserve"> Newman/McCoy / John L+Cora head (montage). Wolfe starts leaf </w:t>
+      </w:r>
+      <w:r>
+        <w:rPr>
+          <w:b/>
+        </w:rPr>
+        <w:t>0374</w:t>
+      </w:r>
+      <w:r>
+        <w:t xml:space="preserve"> Lee City; Hazel Green </w:t>
+      </w:r>
+      <w:r>
+        <w:rPr>
+          <w:b/>
+        </w:rPr>
+        <w:t>0380</w:t>
+      </w:r>
+      <w:r>
+        <w:t xml:space="preserve">; Whitley </w:t>
+      </w:r>
+      <w:r>
+        <w:rPr>
+          <w:b/>
+        </w:rPr>
+        <w:t>0440</w:t>
+      </w:r>
+      <w:r>
+        <w:t xml:space="preserve">. Contact sheets </w:t>
+      </w:r>
+      <w:r>
+        <w:rPr>
+          <w:b/>
+        </w:rPr>
+        <w:t>0368–0440</w:t>
+      </w:r>
+      <w:r>
+        <w:t xml:space="preserve"> </w:t>
+      </w:r>
+      <w:r>
+        <w:rPr>
+          <w:b/>
+        </w:rPr>
+        <w:t>nil</w:t>
+      </w:r>
+      <w:r>
+        <w:t xml:space="preserve"> at dark-montage resolution. </w:t>
+      </w:r>
+      <w:r>
+        <w:rPr>
+          <w:b/>
+        </w:rPr>
+        <w:t>C658–C660 C673</w:t>
+      </w:r>
+      <w:r>
+        <w:t xml:space="preserve"> </w:t>
+      </w:r>
+      <w:r>
+        <w:rPr>
+          <w:b/>
+        </w:rPr>
+        <w:t>S441</w:t>
+      </w:r>
+      <w:r>
+        <w:t xml:space="preserve"> </w:t>
+      </w:r>
+      <w:r>
+        <w:rPr>
+          <w:b/>
+        </w:rPr>
+        <w:t>S442</w:t>
+      </w:r>
+      <w:r>
+        <w:t>.</w:t>
+      </w:r>
+    </w:p>
+    <w:p>
+      <w:r>
+        <w:t xml:space="preserve">97. Breathitt ED </w:t>
+      </w:r>
+      <w:r>
+        <w:rPr>
+          <w:b/>
+        </w:rPr>
+        <w:t>52</w:t>
+      </w:r>
+      <w:r>
+        <w:t xml:space="preserve"> Quicksand: sh </w:t>
+      </w:r>
+      <w:r>
+        <w:rPr>
+          <w:b/>
+        </w:rPr>
+        <w:t>1A</w:t>
+      </w:r>
+      <w:r>
+        <w:t xml:space="preserve"> leaf </w:t>
+      </w:r>
+      <w:r>
+        <w:rPr>
+          <w:b/>
+        </w:rPr>
+        <w:t>1110</w:t>
+      </w:r>
+      <w:r>
+        <w:t xml:space="preserve">; sh </w:t>
+      </w:r>
+      <w:r>
+        <w:rPr>
+          <w:b/>
+        </w:rPr>
+        <w:t>19 A</w:t>
+      </w:r>
+      <w:r>
+        <w:t xml:space="preserve"> leaf </w:t>
+      </w:r>
+      <w:r>
+        <w:rPr>
+          <w:b/>
+        </w:rPr>
+        <w:t>1128</w:t>
+      </w:r>
+      <w:r>
+        <w:t xml:space="preserve">. Soundex sh </w:t>
+      </w:r>
+      <w:r>
+        <w:rPr>
+          <w:b/>
+        </w:rPr>
+        <w:t>19</w:t>
+      </w:r>
+      <w:r>
+        <w:t xml:space="preserve"> ln </w:t>
+      </w:r>
+      <w:r>
+        <w:rPr>
+          <w:b/>
+        </w:rPr>
+        <w:t>17</w:t>
+      </w:r>
+      <w:r>
+        <w:t xml:space="preserve"> slack vs 19A. IA [`14thcensusofpopu559unit`](https://archive.org/details/14thcensusofpopu559unit). *Image seen.* </w:t>
+      </w:r>
+      <w:r>
+        <w:rPr>
+          <w:b/>
+        </w:rPr>
+        <w:t>C661 C662 C663</w:t>
+      </w:r>
+      <w:r>
+        <w:t xml:space="preserve"> </w:t>
+      </w:r>
+      <w:r>
+        <w:rPr>
+          <w:b/>
+        </w:rPr>
+        <w:t>S443</w:t>
+      </w:r>
+      <w:r>
+        <w:t>.</w:t>
+      </w:r>
+    </w:p>
+    <w:p>
+      <w:r>
+        <w:t xml:space="preserve">98. Estill death certificate registered </w:t>
+      </w:r>
+      <w:r>
+        <w:rPr>
+          <w:b/>
+        </w:rPr>
+        <w:t>9771</w:t>
+      </w:r>
+      <w:r>
+        <w:t xml:space="preserve">, 22 Apr 1918: </w:t>
+      </w:r>
+      <w:r>
+        <w:rPr>
+          <w:b/>
+        </w:rPr>
+        <w:t>[Susananna?] Brandenburg</w:t>
+      </w:r>
+      <w:r>
+        <w:t xml:space="preserve">, Station Camp; informant </w:t>
+      </w:r>
+      <w:r>
+        <w:rPr>
+          <w:b/>
+        </w:rPr>
+        <w:t>Boyd Newman</w:t>
+      </w:r>
+      <w:r>
+        <w:t xml:space="preserve">, Leighton. [Certificate scan](https://kygenweb.net/estill/site/records/death/pages/images/1918_020_09771.jpg) · [transcript](https://kygenweb.net/estill/site/records/death/pages/images/1918_020_09771.txt). *Image seen.* </w:t>
+      </w:r>
+      <w:r>
+        <w:rPr>
+          <w:b/>
+        </w:rPr>
+        <w:t>C664 C665 C666</w:t>
+      </w:r>
+      <w:r>
+        <w:t xml:space="preserve"> </w:t>
+      </w:r>
+      <w:r>
+        <w:rPr>
+          <w:b/>
+        </w:rPr>
+        <w:t>S444</w:t>
+      </w:r>
+      <w:r>
+        <w:t>.</w:t>
+      </w:r>
+    </w:p>
+    <w:p>
+      <w:r>
+        <w:t xml:space="preserve">99. KDI </w:t>
+      </w:r>
+      <w:r>
+        <w:rPr>
+          <w:b/>
+        </w:rPr>
+        <w:t>NEWMAN, BOYD</w:t>
+      </w:r>
+      <w:r>
+        <w:t xml:space="preserve"> 101 Fayette </w:t>
+      </w:r>
+      <w:r>
+        <w:rPr>
+          <w:b/>
+        </w:rPr>
+        <w:t>2 Dec 1976</w:t>
+      </w:r>
+      <w:r>
+        <w:t xml:space="preserve"> vol </w:t>
+      </w:r>
+      <w:r>
+        <w:rPr>
+          <w:b/>
+        </w:rPr>
+        <w:t>058</w:t>
+      </w:r>
+      <w:r>
+        <w:t xml:space="preserve"> cert </w:t>
+      </w:r>
+      <w:r>
+        <w:rPr>
+          <w:b/>
+        </w:rPr>
+        <w:t>28501</w:t>
+      </w:r>
+      <w:r>
+        <w:t xml:space="preserve">; </w:t>
+      </w:r>
+      <w:r>
+        <w:rPr>
+          <w:b/>
+        </w:rPr>
+        <w:t>ALLIE B</w:t>
+      </w:r>
+      <w:r>
+        <w:t xml:space="preserve"> 94 Fayette </w:t>
+      </w:r>
+      <w:r>
+        <w:rPr>
+          <w:b/>
+        </w:rPr>
+        <w:t>13 Dec 1978</w:t>
+      </w:r>
+      <w:r>
+        <w:t xml:space="preserve"> vol </w:t>
+      </w:r>
+      <w:r>
+        <w:rPr>
+          <w:b/>
+        </w:rPr>
+        <w:t>064</w:t>
+      </w:r>
+      <w:r>
+        <w:t xml:space="preserve"> cert </w:t>
+      </w:r>
+      <w:r>
+        <w:rPr>
+          <w:b/>
+        </w:rPr>
+        <w:t>31780</w:t>
+      </w:r>
+      <w:r>
+        <w:t xml:space="preserve">. *Index only.* </w:t>
+      </w:r>
+      <w:r>
+        <w:rPr>
+          <w:b/>
+        </w:rPr>
+        <w:t>POSSIBLE</w:t>
+      </w:r>
+      <w:r>
+        <w:t xml:space="preserve">. Compiled 2004 Tracy obit names the late Boyd and Allie Brandenburg Newman. Living children withheld. FS seven IDs </w:t>
+      </w:r>
+      <w:r>
+        <w:rPr>
+          <w:b/>
+        </w:rPr>
+        <w:t>403</w:t>
+      </w:r>
+      <w:r>
+        <w:t xml:space="preserve"> (R011-28). </w:t>
+      </w:r>
+      <w:r>
+        <w:rPr>
+          <w:b/>
+        </w:rPr>
+        <w:t>C667–C670 C669</w:t>
+      </w:r>
+      <w:r>
+        <w:t xml:space="preserve"> </w:t>
+      </w:r>
+      <w:r>
+        <w:rPr>
+          <w:b/>
+        </w:rPr>
+        <w:t>S445</w:t>
+      </w:r>
+      <w:r>
+        <w:t xml:space="preserve"> </w:t>
+      </w:r>
+      <w:r>
+        <w:rPr>
+          <w:b/>
+        </w:rPr>
+        <w:t>S446</w:t>
+      </w:r>
+      <w:r>
+        <w:t xml:space="preserve"> </w:t>
+      </w:r>
+      <w:r>
+        <w:rPr>
+          <w:b/>
+        </w:rPr>
+        <w:t>S447</w:t>
+      </w:r>
+      <w:r>
+        <w:t>.</w:t>
+      </w:r>
+    </w:p>
+    <w:p>
+      <w:r>
+        <w:t xml:space="preserve">100. Lee Marriage Book </w:t>
+      </w:r>
+      <w:r>
+        <w:rPr>
+          <w:b/>
+        </w:rPr>
+        <w:t>6</w:t>
+      </w:r>
+      <w:r>
+        <w:t xml:space="preserve"> compiled: </w:t>
+      </w:r>
+      <w:r>
+        <w:rPr>
+          <w:b/>
+        </w:rPr>
+        <w:t>Floyd NEWNAM</w:t>
+      </w:r>
+      <w:r>
+        <w:t xml:space="preserve"> 23 × </w:t>
+      </w:r>
+      <w:r>
+        <w:rPr>
+          <w:b/>
+        </w:rPr>
+        <w:t>Allie A. BRANDENBURG</w:t>
+      </w:r>
+      <w:r>
+        <w:t xml:space="preserve"> 18, </w:t>
+      </w:r>
+      <w:r>
+        <w:rPr>
+          <w:b/>
+        </w:rPr>
+        <w:t>31 Jul 1902</w:t>
+      </w:r>
+      <w:r>
+        <w:t xml:space="preserve">, A. J. Marcum. [marrbook6.html](https://usgennet.org/usa/ky/county/lee/marriage/marrbook6.html). *Compiled HTML. Register unread.* </w:t>
+      </w:r>
+      <w:r>
+        <w:rPr>
+          <w:b/>
+        </w:rPr>
+        <w:t>Not merged</w:t>
+      </w:r>
+      <w:r>
+        <w:t xml:space="preserve"> with 1920 Boyd (#27). Books </w:t>
+      </w:r>
+      <w:r>
+        <w:rPr>
+          <w:b/>
+        </w:rPr>
+        <w:t>4/5/7</w:t>
+      </w:r>
+      <w:r>
+        <w:t xml:space="preserve"> nil Boyd Newman groom. </w:t>
+      </w:r>
+      <w:r>
+        <w:rPr>
+          <w:b/>
+        </w:rPr>
+        <w:t>C677–C681 C696</w:t>
+      </w:r>
+      <w:r>
+        <w:t xml:space="preserve"> </w:t>
+      </w:r>
+      <w:r>
+        <w:rPr>
+          <w:b/>
+        </w:rPr>
+        <w:t>S449</w:t>
+      </w:r>
+      <w:r>
+        <w:t xml:space="preserve"> </w:t>
+      </w:r>
+      <w:r>
+        <w:rPr>
+          <w:b/>
+        </w:rPr>
+        <w:t>S450</w:t>
+      </w:r>
+      <w:r>
+        <w:t>.</w:t>
+      </w:r>
+    </w:p>
+    <w:p>
+      <w:r>
+        <w:t xml:space="preserve">101. KDI given-name </w:t>
+      </w:r>
+      <w:r>
+        <w:rPr>
+          <w:b/>
+        </w:rPr>
+        <w:t>FLOYD NEWMAN</w:t>
+      </w:r>
+      <w:r>
+        <w:t xml:space="preserve"> 1939–89: only </w:t>
+      </w:r>
+      <w:r>
+        <w:rPr>
+          <w:b/>
+        </w:rPr>
+        <w:t>FLOYD W</w:t>
+      </w:r>
+      <w:r>
+        <w:t xml:space="preserve"> 62 Campbell </w:t>
+      </w:r>
+      <w:r>
+        <w:rPr>
+          <w:b/>
+        </w:rPr>
+        <w:t>10 Aug 1971</w:t>
+      </w:r>
+      <w:r>
+        <w:t xml:space="preserve"> — </w:t>
+      </w:r>
+      <w:r>
+        <w:rPr>
+          <w:b/>
+        </w:rPr>
+        <w:t>rejected</w:t>
+      </w:r>
+      <w:r>
+        <w:t xml:space="preserve">. </w:t>
+      </w:r>
+      <w:r>
+        <w:rPr>
+          <w:b/>
+        </w:rPr>
+        <w:t>C682</w:t>
+      </w:r>
+      <w:r>
+        <w:t xml:space="preserve"> </w:t>
+      </w:r>
+      <w:r>
+        <w:rPr>
+          <w:b/>
+        </w:rPr>
+        <w:t>S451</w:t>
+      </w:r>
+      <w:r>
+        <w:t>.</w:t>
+      </w:r>
+    </w:p>
+    <w:p>
+      <w:r>
+        <w:t xml:space="preserve">102. 1910 Estill T624-472, IA [`13thcensus1910po472unit`](https://archive.org/details/13thcensus1910po472unit): Station Camp ED </w:t>
+      </w:r>
+      <w:r>
+        <w:rPr>
+          <w:b/>
+        </w:rPr>
+        <w:t>48</w:t>
+      </w:r>
+      <w:r>
+        <w:t xml:space="preserve"> starts leaf </w:t>
+      </w:r>
+      <w:r>
+        <w:rPr>
+          <w:b/>
+        </w:rPr>
+        <w:t>0481</w:t>
+      </w:r>
+      <w:r>
+        <w:t xml:space="preserve"> sh </w:t>
+      </w:r>
+      <w:r>
+        <w:rPr>
+          <w:b/>
+        </w:rPr>
+        <w:t>1A</w:t>
+      </w:r>
+      <w:r>
+        <w:t xml:space="preserve">. Sampled sheets </w:t>
+      </w:r>
+      <w:r>
+        <w:rPr>
+          <w:b/>
+        </w:rPr>
+        <w:t>nil</w:t>
+      </w:r>
+      <w:r>
+        <w:t xml:space="preserve"> isolated Floyd/Boyd+Allie house. Sh </w:t>
+      </w:r>
+      <w:r>
+        <w:rPr>
+          <w:b/>
+        </w:rPr>
+        <w:t>4B</w:t>
+      </w:r>
+      <w:r>
+        <w:t xml:space="preserve"> ln </w:t>
+      </w:r>
+      <w:r>
+        <w:rPr>
+          <w:b/>
+        </w:rPr>
+        <w:t>71</w:t>
+      </w:r>
+      <w:r>
+        <w:t xml:space="preserve"> </w:t>
+      </w:r>
+      <w:r>
+        <w:rPr>
+          <w:b/>
+        </w:rPr>
+        <w:t>Pennington, John</w:t>
+      </w:r>
+      <w:r>
+        <w:t xml:space="preserve"> 27 rejected. *Image seen.* </w:t>
+      </w:r>
+      <w:r>
+        <w:rPr>
+          <w:b/>
+        </w:rPr>
+        <w:t>C683–C686</w:t>
+      </w:r>
+      <w:r>
+        <w:t xml:space="preserve"> </w:t>
+      </w:r>
+      <w:r>
+        <w:rPr>
+          <w:b/>
+        </w:rPr>
+        <w:t>S452</w:t>
+      </w:r>
+      <w:r>
+        <w:t xml:space="preserve"> </w:t>
+      </w:r>
+      <w:r>
+        <w:rPr>
+          <w:b/>
+        </w:rPr>
+        <w:t>S453</w:t>
+      </w:r>
+      <w:r>
+        <w:t>.</w:t>
+      </w:r>
+    </w:p>
+    <w:p>
+      <w:r>
+        <w:t xml:space="preserve">103. 1920 Breathitt T625-559 leaves </w:t>
+      </w:r>
+      <w:r>
+        <w:rPr>
+          <w:b/>
+        </w:rPr>
+        <w:t>0840–1176</w:t>
+      </w:r>
+      <w:r>
+        <w:t xml:space="preserve"> name-column contact sheets </w:t>
+      </w:r>
+      <w:r>
+        <w:rPr>
+          <w:b/>
+        </w:rPr>
+        <w:t>nil</w:t>
+      </w:r>
+      <w:r>
+        <w:t xml:space="preserve"> Newman/McCoy / John L+Cora head (montage). ED </w:t>
+      </w:r>
+      <w:r>
+        <w:rPr>
+          <w:b/>
+        </w:rPr>
+        <w:t>41</w:t>
+      </w:r>
+      <w:r>
+        <w:t xml:space="preserve"> starts </w:t>
+      </w:r>
+      <w:r>
+        <w:rPr>
+          <w:b/>
+        </w:rPr>
+        <w:t>0896</w:t>
+      </w:r>
+      <w:r>
+        <w:t xml:space="preserve"> sh </w:t>
+      </w:r>
+      <w:r>
+        <w:rPr>
+          <w:b/>
+        </w:rPr>
+        <w:t>1A</w:t>
+      </w:r>
+      <w:r>
+        <w:t xml:space="preserve">. IA [`14thcensusofpopu559unit`](https://archive.org/details/14thcensusofpopu559unit). *Image seen.* FS seven IDs </w:t>
+      </w:r>
+      <w:r>
+        <w:rPr>
+          <w:b/>
+        </w:rPr>
+        <w:t>403</w:t>
+      </w:r>
+      <w:r>
+        <w:t xml:space="preserve"> (R011-29). </w:t>
+      </w:r>
+      <w:r>
+        <w:rPr>
+          <w:b/>
+        </w:rPr>
+        <w:t>C688–C694</w:t>
+      </w:r>
+      <w:r>
+        <w:t xml:space="preserve"> </w:t>
+      </w:r>
+      <w:r>
+        <w:rPr>
+          <w:b/>
+        </w:rPr>
+        <w:t>S454</w:t>
+      </w:r>
+      <w:r>
+        <w:t xml:space="preserve"> </w:t>
+      </w:r>
+      <w:r>
+        <w:rPr>
+          <w:b/>
+        </w:rPr>
+        <w:t>S456</w:t>
+      </w:r>
+      <w:r>
+        <w:t>.</w:t>
+      </w:r>
+    </w:p>
+    <w:p>
+      <w:r>
+        <w:t xml:space="preserve">104. 1910 KY Miracode N-550 leaf </w:t>
+      </w:r>
+      <w:r>
+        <w:rPr>
+          <w:b/>
+        </w:rPr>
+        <w:t>0251</w:t>
+      </w:r>
+      <w:r>
+        <w:t xml:space="preserve">: </w:t>
+      </w:r>
+      <w:r>
+        <w:rPr>
+          <w:b/>
+        </w:rPr>
+        <w:t>Newman, Boyd</w:t>
+      </w:r>
+      <w:r>
+        <w:t xml:space="preserve">, Lee, Vol </w:t>
+      </w:r>
+      <w:r>
+        <w:rPr>
+          <w:b/>
+        </w:rPr>
+        <w:t>33</w:t>
+      </w:r>
+      <w:r>
+        <w:t xml:space="preserve">, ED </w:t>
+      </w:r>
+      <w:r>
+        <w:rPr>
+          <w:b/>
+        </w:rPr>
+        <w:t>98</w:t>
+      </w:r>
+      <w:r>
+        <w:t xml:space="preserve">, vis </w:t>
+      </w:r>
+      <w:r>
+        <w:rPr>
+          <w:b/>
+        </w:rPr>
+        <w:t>158</w:t>
+      </w:r>
+      <w:r>
+        <w:t xml:space="preserve">, W </w:t>
+      </w:r>
+      <w:r>
+        <w:rPr>
+          <w:b/>
+        </w:rPr>
+        <w:t>28</w:t>
+      </w:r>
+      <w:r>
+        <w:t xml:space="preserve">; Allie 26; Sarah 6; Arthur 4; Carlos 3; Clarence NR. IA [`soundex1910ky124`](https://archive.org/details/soundex1910ky124). *Image seen.* Age 28 slack vs original 38. </w:t>
+      </w:r>
+      <w:r>
+        <w:rPr>
+          <w:b/>
+        </w:rPr>
+        <w:t>C697</w:t>
+      </w:r>
+      <w:r>
+        <w:t xml:space="preserve"> </w:t>
+      </w:r>
+      <w:r>
+        <w:rPr>
+          <w:b/>
+        </w:rPr>
+        <w:t>C699</w:t>
+      </w:r>
+      <w:r>
+        <w:t xml:space="preserve"> </w:t>
+      </w:r>
+      <w:r>
+        <w:rPr>
+          <w:b/>
+        </w:rPr>
+        <w:t>S457</w:t>
+      </w:r>
+      <w:r>
+        <w:t>.</w:t>
+      </w:r>
+    </w:p>
+    <w:p>
+      <w:r>
+        <w:t xml:space="preserve">105. 15 Apr 1910 Lee ED </w:t>
+      </w:r>
+      <w:r>
+        <w:rPr>
+          <w:b/>
+        </w:rPr>
+        <w:t>98</w:t>
+      </w:r>
+      <w:r>
+        <w:t xml:space="preserve"> Heidelberg sh </w:t>
+      </w:r>
+      <w:r>
+        <w:rPr>
+          <w:b/>
+        </w:rPr>
+        <w:t>8A</w:t>
+      </w:r>
+      <w:r>
+        <w:t xml:space="preserve"> leaf </w:t>
+      </w:r>
+      <w:r>
+        <w:rPr>
+          <w:b/>
+        </w:rPr>
+        <w:t>0536</w:t>
+      </w:r>
+      <w:r>
+        <w:t xml:space="preserve"> dw </w:t>
+      </w:r>
+      <w:r>
+        <w:rPr>
+          <w:b/>
+        </w:rPr>
+        <w:t>157</w:t>
+      </w:r>
+      <w:r>
+        <w:t xml:space="preserve"> / fam </w:t>
+      </w:r>
+      <w:r>
+        <w:rPr>
+          <w:b/>
+        </w:rPr>
+        <w:t>158</w:t>
+      </w:r>
+      <w:r>
+        <w:t xml:space="preserve">: </w:t>
+      </w:r>
+      <w:r>
+        <w:rPr>
+          <w:b/>
+        </w:rPr>
+        <w:t>Newman, Boyd</w:t>
+      </w:r>
+      <w:r>
+        <w:t xml:space="preserve">, 38, + </w:t>
+      </w:r>
+      <w:r>
+        <w:rPr>
+          <w:b/>
+        </w:rPr>
+        <w:t>Allie</w:t>
+      </w:r>
+      <w:r>
+        <w:t xml:space="preserve">, 28, m </w:t>
+      </w:r>
+      <w:r>
+        <w:rPr>
+          <w:b/>
+        </w:rPr>
+        <w:t>7</w:t>
+      </w:r>
+      <w:r>
+        <w:t xml:space="preserve">, </w:t>
+      </w:r>
+      <w:r>
+        <w:rPr>
+          <w:b/>
+        </w:rPr>
+        <w:t>4-4</w:t>
+      </w:r>
+      <w:r>
+        <w:t xml:space="preserve">, + S[arah?] 6 + Arthur 4 + Carlos 3 + Clarence 1. IA [`13thcensus1910po478unit`](https://archive.org/details/13thcensus1910po478unit). *Image seen.* </w:t>
+      </w:r>
+      <w:r>
+        <w:rPr>
+          <w:b/>
+        </w:rPr>
+        <w:t>Same household as 1920 Station Camp — PROVEN (C700).</w:t>
+      </w:r>
+      <w:r>
+        <w:t xml:space="preserve"> Carlos = Corlue </w:t>
+      </w:r>
+      <w:r>
+        <w:rPr>
+          <w:b/>
+        </w:rPr>
+        <w:t>PROBABLE</w:t>
+      </w:r>
+      <w:r>
+        <w:t xml:space="preserve">. Not John L+Cora. Homs, Boyd 33 on leaf </w:t>
+      </w:r>
+      <w:r>
+        <w:rPr>
+          <w:b/>
+        </w:rPr>
+        <w:t>0534</w:t>
+      </w:r>
+      <w:r>
+        <w:t xml:space="preserve"> rejected. </w:t>
+      </w:r>
+      <w:r>
+        <w:rPr>
+          <w:b/>
+        </w:rPr>
+        <w:t>C698</w:t>
+      </w:r>
+      <w:r>
+        <w:t xml:space="preserve"> </w:t>
+      </w:r>
+      <w:r>
+        <w:rPr>
+          <w:b/>
+        </w:rPr>
+        <w:t>C700</w:t>
+      </w:r>
+      <w:r>
+        <w:t xml:space="preserve"> </w:t>
+      </w:r>
+      <w:r>
+        <w:rPr>
+          <w:b/>
+        </w:rPr>
+        <w:t>C704</w:t>
+      </w:r>
+      <w:r>
+        <w:t xml:space="preserve"> </w:t>
+      </w:r>
+      <w:r>
+        <w:rPr>
+          <w:b/>
+        </w:rPr>
+        <w:t>C714</w:t>
+      </w:r>
+      <w:r>
+        <w:t xml:space="preserve"> </w:t>
+      </w:r>
+      <w:r>
+        <w:rPr>
+          <w:b/>
+        </w:rPr>
+        <w:t>C716</w:t>
+      </w:r>
+      <w:r>
+        <w:t xml:space="preserve"> </w:t>
+      </w:r>
+      <w:r>
+        <w:rPr>
+          <w:b/>
+        </w:rPr>
+        <w:t>S458</w:t>
+      </w:r>
+      <w:r>
+        <w:t xml:space="preserve"> </w:t>
+      </w:r>
+      <w:r>
+        <w:rPr>
+          <w:b/>
+        </w:rPr>
+        <w:t>S464</w:t>
+      </w:r>
+      <w:r>
+        <w:t>.</w:t>
+      </w:r>
+    </w:p>
+    <w:p>
+      <w:r>
+        <w:t xml:space="preserve">106. 1 Jun 1900 Lee ED </w:t>
+      </w:r>
+      <w:r>
+        <w:rPr>
+          <w:b/>
+        </w:rPr>
+        <w:t>52</w:t>
+      </w:r>
+      <w:r>
+        <w:t xml:space="preserve"> Sturgeon sh </w:t>
+      </w:r>
+      <w:r>
+        <w:rPr>
+          <w:b/>
+        </w:rPr>
+        <w:t>2B</w:t>
+      </w:r>
+      <w:r>
+        <w:t xml:space="preserve"> ln </w:t>
+      </w:r>
+      <w:r>
+        <w:rPr>
+          <w:b/>
+        </w:rPr>
+        <w:t>54</w:t>
+      </w:r>
+      <w:r>
+        <w:t xml:space="preserve">: </w:t>
+      </w:r>
+      <w:r>
+        <w:rPr>
+          <w:b/>
+        </w:rPr>
+        <w:t>Newman, Boyd</w:t>
+      </w:r>
+      <w:r>
+        <w:t xml:space="preserve">, boarder, </w:t>
+      </w:r>
+      <w:r>
+        <w:rPr>
+          <w:b/>
+        </w:rPr>
+        <w:t>Mar 1878</w:t>
+      </w:r>
+      <w:r>
+        <w:t xml:space="preserve">, 22, S, KY/KY/KY, day laborer, Allen Sams hh </w:t>
+      </w:r>
+      <w:r>
+        <w:rPr>
+          <w:b/>
+        </w:rPr>
+        <w:t>27</w:t>
+      </w:r>
+      <w:r>
+        <w:t xml:space="preserve">. IA [`12thcensusofpopu537unit`](https://archive.org/details/12thcensusofpopu537unit). *Image seen.* Compiled [1900sturgeon](https://usgennet.org/usa/ky/county/lee/census/1900/1900sturgeon.html) agrees; compiled Allie A. 14 in Oliver BRANDENBURGH hh </w:t>
+      </w:r>
+      <w:r>
+        <w:rPr>
+          <w:b/>
+        </w:rPr>
+        <w:t>41</w:t>
+      </w:r>
+      <w:r>
+        <w:t xml:space="preserve"> — original of 41 </w:t>
+      </w:r>
+      <w:r>
+        <w:rPr>
+          <w:b/>
+        </w:rPr>
+        <w:t>not isolated</w:t>
+      </w:r>
+      <w:r>
+        <w:t xml:space="preserve">. </w:t>
+      </w:r>
+      <w:r>
+        <w:rPr>
+          <w:b/>
+        </w:rPr>
+        <w:t>C702</w:t>
+      </w:r>
+      <w:r>
+        <w:t xml:space="preserve"> </w:t>
+      </w:r>
+      <w:r>
+        <w:rPr>
+          <w:b/>
+        </w:rPr>
+        <w:t>C703</w:t>
+      </w:r>
+      <w:r>
+        <w:t xml:space="preserve"> </w:t>
+      </w:r>
+      <w:r>
+        <w:rPr>
+          <w:b/>
+        </w:rPr>
+        <w:t>C710</w:t>
+      </w:r>
+      <w:r>
+        <w:t xml:space="preserve"> </w:t>
+      </w:r>
+      <w:r>
+        <w:rPr>
+          <w:b/>
+        </w:rPr>
+        <w:t>S460</w:t>
+      </w:r>
+      <w:r>
+        <w:t xml:space="preserve"> </w:t>
+      </w:r>
+      <w:r>
+        <w:rPr>
+          <w:b/>
+        </w:rPr>
+        <w:t>S461</w:t>
+      </w:r>
+      <w:r>
+        <w:t>.</w:t>
+      </w:r>
+    </w:p>
+    <w:p>
+      <w:r>
+        <w:t xml:space="preserve">107. No Floyd Newman 1910 KY N-550 head (F-window leaves </w:t>
+      </w:r>
+      <w:r>
+        <w:rPr>
+          <w:b/>
+        </w:rPr>
+        <w:t>274–276</w:t>
+      </w:r>
+      <w:r>
+        <w:t xml:space="preserve">). Floyd 1902 </w:t>
+      </w:r>
+      <w:r>
+        <w:rPr>
+          <w:b/>
+        </w:rPr>
+        <w:t>still not merged</w:t>
+      </w:r>
+      <w:r>
+        <w:t xml:space="preserve"> with Boyd (#27) — </w:t>
+      </w:r>
+      <w:r>
+        <w:rPr>
+          <w:b/>
+        </w:rPr>
+        <w:t>POSSIBLE</w:t>
+      </w:r>
+      <w:r>
+        <w:t xml:space="preserve"> only. SortedByName [floyd_newman.html](https://sortedbyname.com/letter_n/newman/floyd_newman.html) no KY Lee/Estill ~1878; no boyd_newman.html. Certs </w:t>
+      </w:r>
+      <w:r>
+        <w:rPr>
+          <w:b/>
+        </w:rPr>
+        <w:t>28501 / 31780</w:t>
+      </w:r>
+      <w:r>
+        <w:t xml:space="preserve"> unread. FS seven IDs </w:t>
+      </w:r>
+      <w:r>
+        <w:rPr>
+          <w:b/>
+        </w:rPr>
+        <w:t>403</w:t>
+      </w:r>
+      <w:r>
+        <w:t xml:space="preserve"> (R011-30). 1910 ED </w:t>
+      </w:r>
+      <w:r>
+        <w:rPr>
+          <w:b/>
+        </w:rPr>
+        <w:t>98</w:t>
+      </w:r>
+      <w:r>
+        <w:t xml:space="preserve"> sh </w:t>
+      </w:r>
+      <w:r>
+        <w:rPr>
+          <w:b/>
+        </w:rPr>
+        <w:t>6A</w:t>
+      </w:r>
+      <w:r>
+        <w:t xml:space="preserve"> </w:t>
+      </w:r>
+      <w:r>
+        <w:rPr>
+          <w:b/>
+        </w:rPr>
+        <w:t>Newman, Rissie</w:t>
+      </w:r>
+      <w:r>
+        <w:t xml:space="preserve">, servant, 15 — </w:t>
+      </w:r>
+      <w:r>
+        <w:rPr>
+          <w:b/>
+        </w:rPr>
+        <w:t>POSSIBLE</w:t>
+      </w:r>
+      <w:r>
+        <w:t xml:space="preserve"> Dora’s daughter, </w:t>
+      </w:r>
+      <w:r>
+        <w:rPr>
+          <w:b/>
+        </w:rPr>
+        <w:t>not merged</w:t>
+      </w:r>
+      <w:r>
+        <w:t xml:space="preserve">. </w:t>
+      </w:r>
+      <w:r>
+        <w:rPr>
+          <w:b/>
+        </w:rPr>
+        <w:t>C701</w:t>
+      </w:r>
+      <w:r>
+        <w:t xml:space="preserve"> </w:t>
+      </w:r>
+      <w:r>
+        <w:rPr>
+          <w:b/>
+        </w:rPr>
+        <w:t>C706–C709</w:t>
+      </w:r>
+      <w:r>
+        <w:t xml:space="preserve"> </w:t>
+      </w:r>
+      <w:r>
+        <w:rPr>
+          <w:b/>
+        </w:rPr>
+        <w:t>C711</w:t>
+      </w:r>
+      <w:r>
+        <w:t xml:space="preserve"> </w:t>
+      </w:r>
+      <w:r>
+        <w:rPr>
+          <w:b/>
+        </w:rPr>
+        <w:t>C713</w:t>
+      </w:r>
+      <w:r>
+        <w:t xml:space="preserve"> </w:t>
+      </w:r>
+      <w:r>
+        <w:rPr>
+          <w:b/>
+        </w:rPr>
+        <w:t>S459</w:t>
+      </w:r>
+      <w:r>
+        <w:t xml:space="preserve"> </w:t>
+      </w:r>
+      <w:r>
+        <w:rPr>
+          <w:b/>
+        </w:rPr>
+        <w:t>S462</w:t>
+      </w:r>
+      <w:r>
+        <w:t xml:space="preserve"> </w:t>
+      </w:r>
+      <w:r>
+        <w:rPr>
+          <w:b/>
+        </w:rPr>
+        <w:t>S463</w:t>
+      </w:r>
+      <w:r>
+        <w:t xml:space="preserve"> </w:t>
+      </w:r>
+      <w:r>
+        <w:rPr>
+          <w:b/>
+        </w:rPr>
+        <w:t>S465</w:t>
+      </w:r>
+      <w:r>
+        <w:t>.</w:t>
+      </w:r>
+    </w:p>
+    <w:p>
+      <w:r>
+        <w:t xml:space="preserve">108. 1 Jun 1900 Lee ED </w:t>
+      </w:r>
+      <w:r>
+        <w:rPr>
+          <w:b/>
+        </w:rPr>
+        <w:t>52</w:t>
+      </w:r>
+      <w:r>
+        <w:t xml:space="preserve"> Sturgeon sh </w:t>
+      </w:r>
+      <w:r>
+        <w:rPr>
+          <w:b/>
+        </w:rPr>
+        <w:t>3A</w:t>
+      </w:r>
+      <w:r>
+        <w:t xml:space="preserve"> leaf </w:t>
+      </w:r>
+      <w:r>
+        <w:rPr>
+          <w:b/>
+        </w:rPr>
+        <w:t>0937</w:t>
+      </w:r>
+      <w:r>
+        <w:t xml:space="preserve"> hh </w:t>
+      </w:r>
+      <w:r>
+        <w:rPr>
+          <w:b/>
+        </w:rPr>
+        <w:t>41/41</w:t>
+      </w:r>
+      <w:r>
+        <w:t xml:space="preserve">: </w:t>
+      </w:r>
+      <w:r>
+        <w:rPr>
+          <w:b/>
+        </w:rPr>
+        <w:t>Brandenburgh, Oli[ver]</w:t>
+      </w:r>
+      <w:r>
+        <w:t xml:space="preserve">, June 1861, 38, m 19; </w:t>
+      </w:r>
+      <w:r>
+        <w:rPr>
+          <w:b/>
+        </w:rPr>
+        <w:t>Susan</w:t>
+      </w:r>
+      <w:r>
+        <w:t xml:space="preserve">, Feb 1865, 35, 9-9; </w:t>
+      </w:r>
+      <w:r>
+        <w:rPr>
+          <w:b/>
+        </w:rPr>
+        <w:t>Allie A.</w:t>
+      </w:r>
+      <w:r>
+        <w:t xml:space="preserve">, Nov 1885, 14. IA [`12thcensusofpopu537unit`](https://archive.org/details/12thcensusofpopu537unit). *Image seen.* </w:t>
+      </w:r>
+      <w:r>
+        <w:rPr>
+          <w:b/>
+        </w:rPr>
+        <w:t>C722</w:t>
+      </w:r>
+      <w:r>
+        <w:t xml:space="preserve"> </w:t>
+      </w:r>
+      <w:r>
+        <w:rPr>
+          <w:b/>
+        </w:rPr>
+        <w:t>C723</w:t>
+      </w:r>
+      <w:r>
+        <w:t xml:space="preserve"> </w:t>
+      </w:r>
+      <w:r>
+        <w:rPr>
+          <w:b/>
+        </w:rPr>
+        <w:t>S467</w:t>
+      </w:r>
+      <w:r>
+        <w:t>.</w:t>
+      </w:r>
+    </w:p>
+    <w:p>
+      <w:r>
+        <w:t xml:space="preserve">109. 1920 KY Soundex N-550 leaf </w:t>
+      </w:r>
+      <w:r>
+        <w:rPr>
+          <w:b/>
+        </w:rPr>
+        <w:t>4474</w:t>
+      </w:r>
+      <w:r>
+        <w:t xml:space="preserve">: </w:t>
+      </w:r>
+      <w:r>
+        <w:rPr>
+          <w:b/>
+        </w:rPr>
+        <w:t>Newman, John</w:t>
+      </w:r>
+      <w:r>
+        <w:t xml:space="preserve">, Breathitt, Vol </w:t>
+      </w:r>
+      <w:r>
+        <w:rPr>
+          <w:b/>
+        </w:rPr>
+        <w:t>4</w:t>
+      </w:r>
+      <w:r>
+        <w:t xml:space="preserve">, ED </w:t>
+      </w:r>
+      <w:r>
+        <w:rPr>
+          <w:b/>
+        </w:rPr>
+        <w:t>52</w:t>
+      </w:r>
+      <w:r>
+        <w:t xml:space="preserve">, sh </w:t>
+      </w:r>
+      <w:r>
+        <w:rPr>
+          <w:b/>
+        </w:rPr>
+        <w:t>19</w:t>
+      </w:r>
+      <w:r>
+        <w:t xml:space="preserve">, ln </w:t>
+      </w:r>
+      <w:r>
+        <w:rPr>
+          <w:b/>
+        </w:rPr>
+        <w:t>17</w:t>
+      </w:r>
+      <w:r>
+        <w:t xml:space="preserve">, W </w:t>
+      </w:r>
+      <w:r>
+        <w:rPr>
+          <w:b/>
+        </w:rPr>
+        <w:t>38</w:t>
+      </w:r>
+      <w:r>
+        <w:t xml:space="preserve">; Jennie 21; Virgil 3; Freda 1; Henry 52; Julie 42. IA [`soundex1920ky117`](https://archive.org/details/soundex1920ky117). *Image seen.* </w:t>
+      </w:r>
+      <w:r>
+        <w:rPr>
+          <w:b/>
+        </w:rPr>
+        <w:t>Rejected</w:t>
+      </w:r>
+      <w:r>
+        <w:t xml:space="preserve"> vs John L. </w:t>
+      </w:r>
+      <w:r>
+        <w:rPr>
+          <w:b/>
+        </w:rPr>
+        <w:t>C717</w:t>
+      </w:r>
+      <w:r>
+        <w:t xml:space="preserve"> </w:t>
+      </w:r>
+      <w:r>
+        <w:rPr>
+          <w:b/>
+        </w:rPr>
+        <w:t>C730</w:t>
+      </w:r>
+      <w:r>
+        <w:t xml:space="preserve"> </w:t>
+      </w:r>
+      <w:r>
+        <w:rPr>
+          <w:b/>
+        </w:rPr>
+        <w:t>S466</w:t>
+      </w:r>
+      <w:r>
+        <w:t>.</w:t>
+      </w:r>
+    </w:p>
+    <w:p>
+      <w:r>
+        <w:t xml:space="preserve">110. T625-559 remap: leaf </w:t>
+      </w:r>
+      <w:r>
+        <w:rPr>
+          <w:b/>
+        </w:rPr>
+        <w:t>1110</w:t>
+      </w:r>
+      <w:r>
+        <w:t xml:space="preserve"> = ED </w:t>
+      </w:r>
+      <w:r>
+        <w:rPr>
+          <w:b/>
+        </w:rPr>
+        <w:t>23</w:t>
+      </w:r>
+      <w:r>
+        <w:t xml:space="preserve"> sh </w:t>
+      </w:r>
+      <w:r>
+        <w:rPr>
+          <w:b/>
+        </w:rPr>
+        <w:t>13A</w:t>
+      </w:r>
+      <w:r>
+        <w:t xml:space="preserve">; ED </w:t>
+      </w:r>
+      <w:r>
+        <w:rPr>
+          <w:b/>
+        </w:rPr>
+        <w:t>52</w:t>
+      </w:r>
+      <w:r>
+        <w:t xml:space="preserve"> starts </w:t>
+      </w:r>
+      <w:r>
+        <w:rPr>
+          <w:b/>
+        </w:rPr>
+        <w:t>1116</w:t>
+      </w:r>
+      <w:r>
+        <w:t xml:space="preserve"> sh </w:t>
+      </w:r>
+      <w:r>
+        <w:rPr>
+          <w:b/>
+        </w:rPr>
+        <w:t>1A</w:t>
+      </w:r>
+      <w:r>
+        <w:t xml:space="preserve">; leaf </w:t>
+      </w:r>
+      <w:r>
+        <w:rPr>
+          <w:b/>
+        </w:rPr>
+        <w:t>1128</w:t>
+      </w:r>
+      <w:r>
+        <w:t xml:space="preserve"> = sh </w:t>
+      </w:r>
+      <w:r>
+        <w:rPr>
+          <w:b/>
+        </w:rPr>
+        <w:t>7A</w:t>
+      </w:r>
+      <w:r>
+        <w:t xml:space="preserve"> not 19A; ED </w:t>
+      </w:r>
+      <w:r>
+        <w:rPr>
+          <w:b/>
+        </w:rPr>
+        <w:t>52</w:t>
+      </w:r>
+      <w:r>
+        <w:t xml:space="preserve"> has </w:t>
+      </w:r>
+      <w:r>
+        <w:rPr>
+          <w:b/>
+        </w:rPr>
+        <w:t>no sheet 19</w:t>
+      </w:r>
+      <w:r>
+        <w:t xml:space="preserve">. IA [`14thcensusofpopu559unit`](https://archive.org/details/14thcensusofpopu559unit). *Image seen.* Original of the Soundex house </w:t>
+      </w:r>
+      <w:r>
+        <w:rPr>
+          <w:b/>
+        </w:rPr>
+        <w:t>not isolated</w:t>
+      </w:r>
+      <w:r>
+        <w:t xml:space="preserve">. </w:t>
+      </w:r>
+      <w:r>
+        <w:rPr>
+          <w:b/>
+        </w:rPr>
+        <w:t>C718–C721</w:t>
+      </w:r>
+      <w:r>
+        <w:t xml:space="preserve"> </w:t>
+      </w:r>
+      <w:r>
+        <w:rPr>
+          <w:b/>
+        </w:rPr>
+        <w:t>C728</w:t>
+      </w:r>
+      <w:r>
+        <w:t xml:space="preserve"> </w:t>
+      </w:r>
+      <w:r>
+        <w:rPr>
+          <w:b/>
+        </w:rPr>
+        <w:t>S468</w:t>
+      </w:r>
+      <w:r>
+        <w:t xml:space="preserve"> </w:t>
+      </w:r>
+      <w:r>
+        <w:rPr>
+          <w:b/>
+        </w:rPr>
+        <w:t>S469</w:t>
+      </w:r>
+      <w:r>
+        <w:t>.</w:t>
+      </w:r>
+    </w:p>
+    <w:p>
+      <w:r>
+        <w:t xml:space="preserve">111. FS seven IDs </w:t>
+      </w:r>
+      <w:r>
+        <w:rPr>
+          <w:b/>
+        </w:rPr>
+        <w:t>403</w:t>
+      </w:r>
+      <w:r>
+        <w:t xml:space="preserve"> (R011-31). KYGenWeb Breathitt 1920 births </w:t>
+      </w:r>
+      <w:r>
+        <w:rPr>
+          <w:b/>
+        </w:rPr>
+        <w:t>NEWMAN/NEWNAM 0</w:t>
+      </w:r>
+      <w:r>
+        <w:t xml:space="preserve">. Combs Breathitt 1920 </w:t>
+      </w:r>
+      <w:r>
+        <w:rPr>
+          <w:b/>
+        </w:rPr>
+        <w:t>nil</w:t>
+      </w:r>
+      <w:r>
+        <w:t xml:space="preserve"> Newman. USGW 1920 dir </w:t>
+      </w:r>
+      <w:r>
+        <w:rPr>
+          <w:b/>
+        </w:rPr>
+        <w:t>timeout</w:t>
+      </w:r>
+      <w:r>
+        <w:t xml:space="preserve">. </w:t>
+      </w:r>
+      <w:r>
+        <w:rPr>
+          <w:b/>
+        </w:rPr>
+        <w:t>C724–C727</w:t>
+      </w:r>
+      <w:r>
+        <w:t xml:space="preserve"> </w:t>
+      </w:r>
+      <w:r>
+        <w:rPr>
+          <w:b/>
+        </w:rPr>
+        <w:t>S470–S473</w:t>
+      </w:r>
+      <w:r>
+        <w:t>.</w:t>
+      </w:r>
+    </w:p>
+    <w:p>
+      <w:r>
         <w:br w:type="page"/>
       </w:r>
     </w:p>
@@ -10210,6 +12559,171 @@
     <w:p>
       <w:r>
         <w:t>| S440 | `../sources/catalog/pass76-fs-403-access-2026-10-30.txt` | FamilySearch catalog | FS seven IDs HTTP 403 (R011-27) | catalog |</w:t>
+      </w:r>
+    </w:p>
+    <w:p>
+      <w:r>
+        <w:t>| S441 | `../sources/census/powell-1920-1051-ed142-stanton-sh1a.jpg` | [IA T625-596](https://archive.org/details/14thcensusofpopu596unit) | Powell 1051–1201 contact-sheet nil | image seen |</w:t>
+      </w:r>
+    </w:p>
+    <w:p>
+      <w:r>
+        <w:t>| S442 | `../sources/census/wolfe-1920-0374-leecity.jpg` | [IA T625-602](https://archive.org/details/14thcensusofpopu602unit) | Wolfe start 0374 Lee City | image seen |</w:t>
+      </w:r>
+    </w:p>
+    <w:p>
+      <w:r>
+        <w:t>| S443 | `../sources/census/breathitt-1920-ed52-1110-quicksand-sh1a.jpg` | [IA T625-559](https://archive.org/details/14thcensusofpopu559unit) | Breathitt ED 52 Quicksand | image seen |</w:t>
+      </w:r>
+    </w:p>
+    <w:p>
+      <w:r>
+        <w:t>| S444 | `../sources/vital/estill-1918-susanna-brandenburg-cert9771.jpg` | [KYGenWeb scan](https://kygenweb.net/estill/site/records/death/pages/images/1918_020_09771.jpg) | 1918 DC 9771 Boyd Newman informant | image seen |</w:t>
+      </w:r>
+    </w:p>
+    <w:p>
+      <w:r>
+        <w:t>| S445 | `../sources/vital/kdi-boyd-allie-newman-pass78-extract-2026-10-30.txt` | Reclaim The Records | Boyd 1976 / Allie B 1978 Fayette | index only |</w:t>
+      </w:r>
+    </w:p>
+    <w:p>
+      <w:r>
+        <w:t>| S446 | `../sources/vital/estill-2004-obits-tracy-newman-extract-2026-10-30.txt` | KYGenWeb Estill | Compiled Tracy 2004 parents | compiled |</w:t>
+      </w:r>
+    </w:p>
+    <w:p>
+      <w:r>
+        <w:t>| S447 | `../sources/catalog/pass78-fs-403-access-2026-10-30.txt` | FamilySearch | FS seven IDs HTTP 403 (R011-28) | catalog |</w:t>
+      </w:r>
+    </w:p>
+    <w:p>
+      <w:r>
+        <w:t>| S448 | Estill marriages landing | KYGenWeb Estill | Boyd × Allie license unread (pre-Book 6) | catalog |</w:t>
+      </w:r>
+    </w:p>
+    <w:p>
+      <w:r>
+        <w:t>| S449 | `../sources/vital/lee-marr-book6-pass79-extract-2026-10-30.txt` | [Lee Book 6](https://usgennet.org/usa/ky/county/lee/marriage/marrbook6.html) | Floyd × Allie A. Brandenburg 31 Jul 1902 | compiled HTML |</w:t>
+      </w:r>
+    </w:p>
+    <w:p>
+      <w:r>
+        <w:t>| S450 | `../sources/vital/lee-marr-books457-pass79-newman-extract-2026-10-30.txt` | USGenNet Lee Books 4/5/7 | Nil Boyd Newman groom | compiled HTML |</w:t>
+      </w:r>
+    </w:p>
+    <w:p>
+      <w:r>
+        <w:t>| S451 | `../sources/vital/kdi-floyd-newman-pass79-extract-2026-10-30.txt` | Reclaim The Records | Floyd W 1971 rejected | index only |</w:t>
+      </w:r>
+    </w:p>
+    <w:p>
+      <w:r>
+        <w:t>| S452 | `../sources/census/estill-1910-ed48-0481-stationcamp-sh1a.jpg` | [IA T624-472](https://archive.org/details/13thcensus1910po472unit) | Station Camp ED 48 starts 0481 | image seen |</w:t>
+      </w:r>
+    </w:p>
+    <w:p>
+      <w:r>
+        <w:t>| S453 | `../sources/census/estill-1910-ed48-0488-pennington-john-reject.jpg` | [IA T624-472](https://archive.org/details/13thcensus1910po472unit) | Pennington John 27 rejected | image seen |</w:t>
+      </w:r>
+    </w:p>
+    <w:p>
+      <w:r>
+        <w:t>| S454 | `../sources/census/breathitt-1920-ed41-0896-sh1a.jpg` | [IA T625-559](https://archive.org/details/14thcensusofpopu559unit) | ED 41 starts 0896; 0840–1176 contact-sheet nil | image seen |</w:t>
+      </w:r>
+    </w:p>
+    <w:p>
+      <w:r>
+        <w:t>| S455 | `../sources/catalog/us-census-ky-pass79-no-1920-transcripts-2026-10-30.txt` | [us-census.org](https://www.us-census.org/pub/usgenweb/census/ky/breathitt/) | No 1920 Breathitt/Estill/Powell transcripts | catalog |</w:t>
+      </w:r>
+    </w:p>
+    <w:p>
+      <w:r>
+        <w:t>| S456 | `../sources/catalog/pass79-fs-403-access-2026-10-30.txt` | FamilySearch | FS seven IDs HTTP 403 (R011-29) | catalog |</w:t>
+      </w:r>
+    </w:p>
+    <w:p>
+      <w:r>
+        <w:t>| S457 | `../sources/soundex/ky1910-n550-p0251-boyd-allie-lee-ed98.jpg` | [IA T1266](https://archive.org/details/soundex1910ky124) | Boyd 28 + Allie Lee ED 98 vis 158 | image seen |</w:t>
+      </w:r>
+    </w:p>
+    <w:p>
+      <w:r>
+        <w:t>| S458 | `../sources/census/lee-1910-ed98-0536-heidelberg-sh8a.jpg` · hh158 crop | [IA T624-478](https://archive.org/details/13thcensus1910po478unit) | Boyd 38 + Allie 28 Heidelberg fam 158 | image seen |</w:t>
+      </w:r>
+    </w:p>
+    <w:p>
+      <w:r>
+        <w:t>| S459 | `../sources/soundex/ky1910-n550-p0274-f-window-no-floyd.jpg` | [IA T1266](https://archive.org/details/soundex1910ky124) | No Floyd Newman 1910 KY head | image seen |</w:t>
+      </w:r>
+    </w:p>
+    <w:p>
+      <w:r>
+        <w:t>| S460 | `../sources/census/lee-1900-ed52-0936-sturgeon-sh2b.jpg` · hh27 continued | [IA T623-537](https://archive.org/details/12thcensusofpopu537unit) | Boyd boarder Mar 1878 age 22 | image seen |</w:t>
+      </w:r>
+    </w:p>
+    <w:p>
+      <w:r>
+        <w:t>| S461 | `../sources/census/lee-1900-sturgeon-boyd-allie-pass80-extract-2026-10-30.txt` | [USGenNet 1900 Sturgeon](https://usgennet.org/usa/ky/county/lee/census/1900/1900sturgeon.html) | Compiled Boyd boarder + Allie A. 14 | compiled HTML |</w:t>
+      </w:r>
+    </w:p>
+    <w:p>
+      <w:r>
+        <w:t>| S462 | `../sources/vital/sortedbyname-floyd-newman-pass80-extract-2026-10-30.txt` | [SortedByName Floyd](https://sortedbyname.com/letter_n/newman/floyd_newman.html) | No KY Floyd ~1878; no boyd_newman.html | index only |</w:t>
+      </w:r>
+    </w:p>
+    <w:p>
+      <w:r>
+        <w:t>| S463 | `../sources/catalog/pass80-fs-403-access-2026-10-30.txt` | FamilySearch | FS seven IDs HTTP 403 (R011-30) | catalog |</w:t>
+      </w:r>
+    </w:p>
+    <w:p>
+      <w:r>
+        <w:t>| S464 | `../sources/census/lee-1910-ed98-0534-homs-boyd-reject.jpg` | [IA T624-478](https://archive.org/details/13thcensus1910po478unit) | Homs Boyd 33 rejected | image seen |</w:t>
+      </w:r>
+    </w:p>
+    <w:p>
+      <w:r>
+        <w:t>| S465 | `../sources/census/pass80-1910-lee-ed98-boyd-extract-2026-10-30.txt` | This session | Pass 80 extract | extract |</w:t>
+      </w:r>
+    </w:p>
+    <w:p>
+      <w:r>
+        <w:t>| S466 | `../sources/soundex/ky1920-n550-p4474-john-jennie-breathitt.jpg` | [IA Soundex](https://archive.org/details/soundex1920ky117) | John 38 + Jennie 21 Breathitt card | image seen |</w:t>
+      </w:r>
+    </w:p>
+    <w:p>
+      <w:r>
+        <w:t>| S467 | `../sources/census/lee-1900-ed52-0937-sturgeon-sh3a.jpg` · hh41 crop | [IA T623-537](https://archive.org/details/12thcensusofpopu537unit) | Oliver + Allie A. Nov 1885 age 14 | image seen |</w:t>
+      </w:r>
+    </w:p>
+    <w:p>
+      <w:r>
+        <w:t>| S468 | `../sources/census/breathitt-1920-ed52-1116-sh1a.jpg` | [IA T625-559](https://archive.org/details/14thcensusofpopu559unit) | ED 52 starts 1116 sh 1A | image seen |</w:t>
+      </w:r>
+    </w:p>
+    <w:p>
+      <w:r>
+        <w:t>| S469 | `../sources/census/breathitt-1920-ed52-1128-sh7a.jpg` | [IA T625-559](https://archive.org/details/14thcensusofpopu559unit) | Leaf 1128 = sh 7A not 19A | image seen |</w:t>
+      </w:r>
+    </w:p>
+    <w:p>
+      <w:r>
+        <w:t>| S470 | `../sources/catalog/pass81-fs-403-access-2026-10-30.txt` | FamilySearch | FS seven IDs HTTP 403 (R011-31) | catalog |</w:t>
+      </w:r>
+    </w:p>
+    <w:p>
+      <w:r>
+        <w:t>| S471 | `../sources/vital/breathitt-1920-births-newman-nil-2026-10-30.txt` | [KYGenWeb 1920 births](https://kygenweb.net/breathitt/births_deaths/1920.html) | Breathitt 1920 births NEWMAN 0 | transcription only |</w:t>
+      </w:r>
+    </w:p>
+    <w:p>
+      <w:r>
+        <w:t>| S472 | Combs Breathitt 1920 | [Combs 1920](https://www.combs-families.org/combs/records/ky/breathitt/1920.htm) | Nil Newman/McCoy | transcription only |</w:t>
+      </w:r>
+    </w:p>
+    <w:p>
+      <w:r>
+        <w:t>| S473 | `../sources/census/pass81-extract-2026-10-30.txt` | This session | Pass 81 extract | extract |</w:t>
       </w:r>
     </w:p>
     <w:p>

</xml_diff>

<commit_message>
Pass 73: 1920 opener Soundex G-000 through B-653 given-name slots.
Gay Walker 44 is Owsley ED 90, not missing ED 92 sheet 1. Matilda, Rice
William, Helton William, Reid David, Simms William, Hardy Drucilla, and
Brandenburg Robb have no matching 1920 Kentucky given-name cards; Gee
Matilda 19, sampled Rice/Helton Williams, Reed David M of Clark, and
Howard Drucilla 16 are other people.

Co-authored-by: CatCorner22 <CatCorner22@users.noreply.github.com>
</commit_message>
<xml_diff>
--- a/research/dora-ella-newnam/book/Dora-Ella-Newnam-Stone-A-Life.docx
+++ b/research/dora-ella-newnam/book/Dora-Ella-Newnam-Stone-A-Life.docx
@@ -426,7 +426,52 @@
         <w:t>Combs, Lowe</w:t>
       </w:r>
       <w:r>
-        <w:t xml:space="preserve"> card: Louise of Madison and Loya of Boyd sit on consecutive leaves. Wolfe’s 1861–1909 marriage list, Clay’s G and N–Q grooms and G and M–N brides, and two Estill minister-return plates from 1901 and 1902 have no Josephine Newnam × Gilbert license; those Estill plates are eight couples each, not a county-wide search. Breathitt’s marriage pages still did not open. In January 1920 he is on the Island Creek original — Owsley district 90, sheet 7 A, dwelling 113 — </w:t>
+        <w:t xml:space="preserve"> card: Louise of Madison and Loya of Boyd sit on consecutive leaves. G-000 cards </w:t>
+      </w:r>
+      <w:r>
+        <w:rPr>
+          <w:b/>
+        </w:rPr>
+        <w:t>Gay, Walker</w:t>
+      </w:r>
+      <w:r>
+        <w:t xml:space="preserve">, forty-four, of Owsley district </w:t>
+      </w:r>
+      <w:r>
+        <w:rPr>
+          <w:b/>
+        </w:rPr>
+        <w:t>90</w:t>
+      </w:r>
+      <w:r>
+        <w:t xml:space="preserve"> sheet 3 — another Island Creek house, not the missing Buffalo sheet 1, and not the 1910 widow </w:t>
+      </w:r>
+      <w:r>
+        <w:rPr>
+          <w:b/>
+        </w:rPr>
+        <w:t>Matilda</w:t>
+      </w:r>
+      <w:r>
+        <w:t xml:space="preserve">. The Matilda given-name slot is consecutive </w:t>
+      </w:r>
+      <w:r>
+        <w:rPr>
+          <w:b/>
+        </w:rPr>
+        <w:t>Guy, Massie</w:t>
+      </w:r>
+      <w:r>
+        <w:t xml:space="preserve">, sixteen, and </w:t>
+      </w:r>
+      <w:r>
+        <w:rPr>
+          <w:b/>
+        </w:rPr>
+        <w:t>Gee, Matilda</w:t>
+      </w:r>
+      <w:r>
+        <w:t xml:space="preserve">, nineteen, of Fayette, a sister-in-law — not the 1910 widow of thirty-two. Sampled Rice Williams are other men; Helton William of Knox lives alone; Reed David M. of Clark is married to Nannie, not Lucinda; Simms/Sims ends at Dollie before the next Soundex code, with no William card; Hardy’s H-630 window has Howard Drucilla, sixteen, a daughter-in-law in Leslie, not the 1910 widow of forty; and Brandenburg’s Robb slot is consecutive Brandy Robert then other Roberts, with no Robb card. Wolfe’s 1861–1909 marriage list, Clay’s G and N–Q grooms and G and M–N brides, and two Estill minister-return plates from 1901 and 1902 have no Josephine Newnam × Gilbert license; those Estill plates are eight couples each, not a county-wide search. Breathitt’s marriage pages still did not open. In January 1920 he is on the Island Creek original — Owsley district 90, sheet 7 A, dwelling 113 — </w:t>
       </w:r>
       <w:r>
         <w:rPr>
@@ -696,7 +741,7 @@
         <w:t>Dara</w:t>
       </w:r>
       <w:r>
-        <w:t>, forty — the enumerator wrote an open a, not o — is another person. Kentucky’s 1920 Soundex has no Manerva or Minerva Newman card, and the Walter given-name window has no Owsley or Lee Walter with Manerva. Kentucky’s 1920 death index has no Manerva Newnam row on 28 August; the Owsley table that day is an infant Bates. Mary Ann Smallwood, born April 1842, came from the Owsley Smallwoods. The 11 July 1918 cemetery date is still unmatched in Kentucky’s civil index. [C669] [C672] [C693] [C694] [C690] [C691] [C709] [C711] [C712] [C713] [C717] [C729] [C730] [C739] [C740] [C741] [C742] [C743] [C744] [C745] [C746] [C747] [C748] [C752] [C753] [C754] [C756] [C759] [C763] [C765] [C768] [C775] [C776] [C777] [C779] [C780] [C782] [C783] [C784] [C789]</w:t>
+        <w:t>, forty — the enumerator wrote an open a, not o — is another person. Kentucky’s 1920 Soundex has no Manerva or Minerva Newman card, and the Walter given-name window has no Owsley or Lee Walter with Manerva. Kentucky’s 1920 death index has no Manerva Newnam row on 28 August; the Owsley table that day is an infant Bates. Mary Ann Smallwood, born April 1842, came from the Owsley Smallwoods. The 11 July 1918 cemetery date is still unmatched in Kentucky’s civil index. [C669] [C672] [C693] [C694] [C690] [C691] [C709] [C711] [C712] [C713] [C717] [C729] [C730] [C739] [C740] [C741] [C742] [C743] [C744] [C745] [C746] [C747] [C748] [C752] [C753] [C754] [C756] [C759] [C763] [C765] [C768] [C775] [C776] [C777] [C779] [C780] [C782] [C783] [C784] [C789] [C790] [C791] [C792] [C793] [C794] [C795] [C796] [C797]</w:t>
       </w:r>
     </w:p>
     <w:p>

</xml_diff>

<commit_message>
Pass 74: 1910 Buffalo sh 2 Gay Henry; 1920 original on ED 92 sh 6.
Gay Henry 46 x Nancy is on the 1920 Buffalo original (dw 105), not missing sheet 1. R-200 Elizabeth and Benjamin given-name slots have no matching 1910 heads.

Co-authored-by: CatCorner22 <CatCorner22@users.noreply.github.com>
</commit_message>
<xml_diff>
--- a/research/dora-ella-newnam/book/Dora-Ella-Newnam-Stone-A-Life.docx
+++ b/research/dora-ella-newnam/book/Dora-Ella-Newnam-Stone-A-Life.docx
@@ -41,7 +41,7 @@
     </w:p>
     <w:p>
       <w:r>
-        <w:t>One hundred fourteen Cursor chats on this repository were reviewed for this volume (primary research, helpers, scans, and failed browser hunts). The original mobile session opened the case and read the Arkansas death certificate the family still holds. Later sessions recovered the 1880 childhood schedule that free transcripts had missed, walked statewide Soundex reels for 1910 and 1920, tested a Peebles third-marriage hypothesis and set it aside, and photographed NARA microfilm frames — the 1880 childhood schedule, the 1910 Kentucky Ella Miracode plates, Hardin Gray on Sturgeon sheet 13 B, the 1860 Owsley original of Silas Gray’s house with William aged thirteen, the 1850 Owsley Gray pages that are other men (Thomas, James, John, Charles), the given-name Silas plates that are other boys (Ratliff eight months, Wilson six, Phillips fifteen) and the Bowman line first read as Cyrus and then as Squire, the 1850 Estill Marcus Gray original, Breathitt’s Taulbee infant Silas and Bryant Siras, and Madison’s John Green house with Silas Green aged twenty, the 1850 Owsley Harrison Newman house with an eight-year-old Elias who is probably Dora’s father — a 1932 death extract names Henry Harrison Newnam as that father — and is not merged as proven, the 1860 Booneville original of that house under H.H. Newman with Elias aged eighteen, the 1850 William Newman house of twenty-six on the same page, the 1850 John Newman of sixty born in Tennessee who is not the 1880 John of sixty-nine, and Andrew Mays’s Giles at one month in 1850 and eleven in 1860, the 1870 Proctor original of James Brandenburg’s house, Silas Gray’s Sturgeon original, the 1880 District 59 originals of William next door to John Newnam and of Silas still in the district, the 1900 William Gray dwelling-84 crop, and the Bollinger page a sibling had labelled “Dora E. Stone,” which is Henry C. Rhodes and Dora M. of Missouri, and the 1920 Booneville, Buffalo, and Buck Creek originals with the rejected Taylor, Marcum, Magee, McIntosh, Baker, and McPherson houses, the 1910 Sturgeon Gilbert×Josie house, Lynch’s wife Laura without a Newman on the original, and the Buffalo Baker household whose Soundex card misnamed Gilbert John as Robert, the 1910 Buffalo Gilbert, John house next door to Baker, Robert H., and the Soundex Douglas card that shows the clerks indexed filmed Buffalo sheets. This volume folds those chats into one narrative. The case dossier remains the working file; this book is the public reading of it. Sibling work on Greene ED 37 through 41 is now on merged PR #26 through Pass 59; remaining Greene ED 38 B-sides, 1900 Liberty, and 1900 hh 85 are inventoried, not duplicated. Do not import their “Dora E. Stone” as this woman.</w:t>
+        <w:t>One hundred fifteen Cursor chats on this repository were reviewed for this volume (primary research, helpers, scans, and failed browser hunts). The original mobile session opened the case and read the Arkansas death certificate the family still holds. Later sessions recovered the 1880 childhood schedule that free transcripts had missed, walked statewide Soundex reels for 1910 and 1920, tested a Peebles third-marriage hypothesis and set it aside, and photographed NARA microfilm frames — the 1880 childhood schedule, the 1910 Kentucky Ella Miracode plates, Hardin Gray on Sturgeon sheet 13 B, the 1860 Owsley original of Silas Gray’s house with William aged thirteen, the 1850 Owsley Gray pages that are other men (Thomas, James, John, Charles), the given-name Silas plates that are other boys (Ratliff eight months, Wilson six, Phillips fifteen) and the Bowman line first read as Cyrus and then as Squire, the 1850 Estill Marcus Gray original, Breathitt’s Taulbee infant Silas and Bryant Siras, and Madison’s John Green house with Silas Green aged twenty, the 1850 Owsley Harrison Newman house with an eight-year-old Elias who is probably Dora’s father — a 1932 death extract names Henry Harrison Newnam as that father — and is not merged as proven, the 1860 Booneville original of that house under H.H. Newman with Elias aged eighteen, the 1850 William Newman house of twenty-six on the same page, the 1850 John Newman of sixty born in Tennessee who is not the 1880 John of sixty-nine, and Andrew Mays’s Giles at one month in 1850 and eleven in 1860, the 1870 Proctor original of James Brandenburg’s house, Silas Gray’s Sturgeon original, the 1880 District 59 originals of William next door to John Newnam and of Silas still in the district, the 1900 William Gray dwelling-84 crop, and the Bollinger page a sibling had labelled “Dora E. Stone,” which is Henry C. Rhodes and Dora M. of Missouri, and the 1920 Booneville, Buffalo, and Buck Creek originals with the rejected Taylor, Marcum, Magee, McIntosh, Baker, and McPherson houses, the 1910 Sturgeon Gilbert×Josie house, Lynch’s wife Laura without a Newman on the original, and the Buffalo Baker household whose Soundex card misnamed Gilbert John as Robert, the 1910 Buffalo Gilbert, John house next door to Baker, Robert H., and the Soundex Douglas card that shows the clerks indexed filmed Buffalo sheets. This volume folds those chats into one narrative. The case dossier remains the working file; this book is the public reading of it. Sibling work on Greene ED 37 through 41 is now on merged PR #26 through Pass 59; remaining Greene ED 38 B-sides, 1900 Liberty, and 1900 hh 85 are inventoried, not duplicated. Do not import their “Dora E. Stone” as this woman.</w:t>
       </w:r>
     </w:p>
     <w:p>
@@ -471,7 +471,178 @@
         <w:t>Gee, Matilda</w:t>
       </w:r>
       <w:r>
-        <w:t xml:space="preserve">, nineteen, of Fayette, a sister-in-law — not the 1910 widow of thirty-two. Sampled Rice Williams are other men; Helton William of Knox lives alone; Reed David M. of Clark is married to Nannie, not Lucinda; Simms/Sims ends at Dollie before the next Soundex code, with no William card; Hardy’s H-630 window has Howard Drucilla, sixteen, a daughter-in-law in Leslie, not the 1910 widow of forty; and Brandenburg’s Robb slot is consecutive Brandy Robert then other Roberts, with no Robb card. Wolfe’s 1861–1909 marriage list, Clay’s G and N–Q grooms and G and M–N brides, and two Estill minister-return plates from 1901 and 1902 have no Josephine Newnam × Gilbert license; those Estill plates are eight couples each, not a county-wide search. Breathitt’s marriage pages still did not open. In January 1920 he is on the Island Creek original — Owsley district 90, sheet 7 A, dwelling 113 — </w:t>
+        <w:t xml:space="preserve">, nineteen, of Fayette, a sister-in-law — not the 1910 widow of thirty-two. Sampled Rice Williams are other men; Helton William of Knox lives alone; Reed David M. of Clark is married to Nannie, not Lucinda; Simms/Sims ends at Dollie before the next Soundex code, with no William card; Hardy’s H-630 window has Howard Drucilla, sixteen, a daughter-in-law in Leslie, not the 1910 widow of forty; and Brandenburg’s Robb slot is consecutive Brandy Robert then other Roberts, with no Robb card. Sheet 1 B continues through dwelling </w:t>
+      </w:r>
+      <w:r>
+        <w:rPr>
+          <w:b/>
+        </w:rPr>
+        <w:t>14</w:t>
+      </w:r>
+      <w:r>
+        <w:t xml:space="preserve">, </w:t>
+      </w:r>
+      <w:r>
+        <w:rPr>
+          <w:b/>
+        </w:rPr>
+        <w:t>Baker, Jesse</w:t>
+      </w:r>
+      <w:r>
+        <w:t xml:space="preserve">, forty-two, with </w:t>
+      </w:r>
+      <w:r>
+        <w:rPr>
+          <w:b/>
+        </w:rPr>
+        <w:t>Emily</w:t>
+      </w:r>
+      <w:r>
+        <w:t xml:space="preserve">, and dwelling </w:t>
+      </w:r>
+      <w:r>
+        <w:rPr>
+          <w:b/>
+        </w:rPr>
+        <w:t>15</w:t>
+      </w:r>
+      <w:r>
+        <w:t xml:space="preserve">, </w:t>
+      </w:r>
+      <w:r>
+        <w:rPr>
+          <w:b/>
+        </w:rPr>
+        <w:t>Evans, John</w:t>
+      </w:r>
+      <w:r>
+        <w:t xml:space="preserve">, forty-five, with </w:t>
+      </w:r>
+      <w:r>
+        <w:rPr>
+          <w:b/>
+        </w:rPr>
+        <w:t>Susan</w:t>
+      </w:r>
+      <w:r>
+        <w:t xml:space="preserve">. Sheets 2 A and 2 B of the same Buffalo precinct run dwellings 16 through 33 — Abner, Baker James, Gabbard Elisha and Willis, Barrett, Carmack, McIntosh, then </w:t>
+      </w:r>
+      <w:r>
+        <w:rPr>
+          <w:b/>
+        </w:rPr>
+        <w:t>Gay, Henry</w:t>
+      </w:r>
+      <w:r>
+        <w:t xml:space="preserve">, forty-six, with </w:t>
+      </w:r>
+      <w:r>
+        <w:rPr>
+          <w:b/>
+        </w:rPr>
+        <w:t>Nancy</w:t>
+      </w:r>
+      <w:r>
+        <w:t xml:space="preserve">, forty, ten children born and nine living, including </w:t>
+      </w:r>
+      <w:r>
+        <w:rPr>
+          <w:b/>
+        </w:rPr>
+        <w:t>Eliza</w:t>
+      </w:r>
+      <w:r>
+        <w:t xml:space="preserve"> and </w:t>
+      </w:r>
+      <w:r>
+        <w:rPr>
+          <w:b/>
+        </w:rPr>
+        <w:t>Luther</w:t>
+      </w:r>
+      <w:r>
+        <w:t xml:space="preserve">. That house is on the 1920 original: Buffalo district </w:t>
+      </w:r>
+      <w:r>
+        <w:rPr>
+          <w:b/>
+        </w:rPr>
+        <w:t>92</w:t>
+      </w:r>
+      <w:r>
+        <w:t xml:space="preserve">, sheet 6 (B-form), line 80, dwelling </w:t>
+      </w:r>
+      <w:r>
+        <w:rPr>
+          <w:b/>
+        </w:rPr>
+        <w:t>105</w:t>
+      </w:r>
+      <w:r>
+        <w:t xml:space="preserve">, </w:t>
+      </w:r>
+      <w:r>
+        <w:rPr>
+          <w:b/>
+        </w:rPr>
+        <w:t>Gay, Henry</w:t>
+      </w:r>
+      <w:r>
+        <w:t xml:space="preserve">, fifty-five, with </w:t>
+      </w:r>
+      <w:r>
+        <w:rPr>
+          <w:b/>
+        </w:rPr>
+        <w:t>Nancy</w:t>
+      </w:r>
+      <w:r>
+        <w:t xml:space="preserve">, fifty-three, </w:t>
+      </w:r>
+      <w:r>
+        <w:rPr>
+          <w:b/>
+        </w:rPr>
+        <w:t>Roda</w:t>
+      </w:r>
+      <w:r>
+        <w:t xml:space="preserve">, </w:t>
+      </w:r>
+      <w:r>
+        <w:rPr>
+          <w:b/>
+        </w:rPr>
+        <w:t>Elzie</w:t>
+      </w:r>
+      <w:r>
+        <w:t xml:space="preserve">, </w:t>
+      </w:r>
+      <w:r>
+        <w:rPr>
+          <w:b/>
+        </w:rPr>
+        <w:t>Luther</w:t>
+      </w:r>
+      <w:r>
+        <w:t xml:space="preserve">, and </w:t>
+      </w:r>
+      <w:r>
+        <w:rPr>
+          <w:b/>
+        </w:rPr>
+        <w:t>Estill</w:t>
+      </w:r>
+      <w:r>
+        <w:t xml:space="preserve">. The G-000 Soundex card copies that original. Henry and Nancy plus Owsley Buffalo plus Eliza/Elzie and Luther make the 1910–1920 identification probable; Nancy’s age jumps thirteen years in ten and is not averaged. He is not on the missing sheet 1. The R-200 Elizabeth E-window has Rice Elizabeth, eighty-two, of Lawrence, and a seventeen-year-old Greenup sister-in-law — neither is the 1910 widow of forty-six; the Benjamin B-window has Ben A. of Pendleton, Ben H. of Mason, and Ben W. of Hancock, and no Rice Benjamin about thirty-five with Cynthia in Owsley. Ross, Ballard G., forty-six, of Owsley district </w:t>
+      </w:r>
+      <w:r>
+        <w:rPr>
+          <w:b/>
+        </w:rPr>
+        <w:t>93</w:t>
+      </w:r>
+      <w:r>
+        <w:t xml:space="preserve">, is Buck Creek, not Rice, and not sheet 1. Wolfe’s 1861–1909 marriage list, Clay’s G and N–Q grooms and G and M–N brides, and two Estill minister-return plates from 1901 and 1902 have no Josephine Newnam × Gilbert license; those Estill plates are eight couples each, not a county-wide search. Breathitt’s marriage pages still did not open. In January 1920 he is on the Island Creek original — Owsley district 90, sheet 7 A, dwelling 113 — </w:t>
       </w:r>
       <w:r>
         <w:rPr>
@@ -741,7 +912,7 @@
         <w:t>Dara</w:t>
       </w:r>
       <w:r>
-        <w:t>, forty — the enumerator wrote an open a, not o — is another person. Kentucky’s 1920 Soundex has no Manerva or Minerva Newman card, and the Walter given-name window has no Owsley or Lee Walter with Manerva. Kentucky’s 1920 death index has no Manerva Newnam row on 28 August; the Owsley table that day is an infant Bates. Mary Ann Smallwood, born April 1842, came from the Owsley Smallwoods. The 11 July 1918 cemetery date is still unmatched in Kentucky’s civil index. [C669] [C672] [C693] [C694] [C690] [C691] [C709] [C711] [C712] [C713] [C717] [C729] [C730] [C739] [C740] [C741] [C742] [C743] [C744] [C745] [C746] [C747] [C748] [C752] [C753] [C754] [C756] [C759] [C763] [C765] [C768] [C775] [C776] [C777] [C779] [C780] [C782] [C783] [C784] [C789] [C790] [C791] [C792] [C793] [C794] [C795] [C796] [C797]</w:t>
+        <w:t>, forty — the enumerator wrote an open a, not o — is another person. Kentucky’s 1920 Soundex has no Manerva or Minerva Newman card, and the Walter given-name window has no Owsley or Lee Walter with Manerva. Kentucky’s 1920 death index has no Manerva Newnam row on 28 August; the Owsley table that day is an infant Bates. Mary Ann Smallwood, born April 1842, came from the Owsley Smallwoods. The 11 July 1918 cemetery date is still unmatched in Kentucky’s civil index. [C669] [C672] [C693] [C694] [C690] [C691] [C709] [C711] [C712] [C713] [C717] [C729] [C730] [C739] [C740] [C741] [C742] [C743] [C744] [C745] [C746] [C747] [C748] [C752] [C753] [C754] [C756] [C759] [C763] [C765] [C768] [C775] [C776] [C777] [C779] [C780] [C782] [C783] [C784] [C789] [C790] [C791] [C792] [C793] [C794] [C795] [C796] [C797] [C801] [C802] [C803] [C804]</w:t>
       </w:r>
     </w:p>
     <w:p>

</xml_diff>

<commit_message>
Pass 76: 1920 Buffalo sh 6 B–7 A Abner Lewis/Samuel and Baker Jesse.
Originals put Abner Lewis 50, Abner Samuel 53, and Baker Jesse 54 on filmed ED 92 sheets 6–7, probable 1910 Buffalo houses, not missing sheet 1. Soundex B-260 matches Jesse; sampled E-152 Johns are other men.

Co-authored-by: CatCorner22 <CatCorner22@users.noreply.github.com>
</commit_message>
<xml_diff>
--- a/research/dora-ella-newnam/book/Dora-Ella-Newnam-Stone-A-Life.docx
+++ b/research/dora-ella-newnam/book/Dora-Ella-Newnam-Stone-A-Life.docx
@@ -642,7 +642,232 @@
         <w:t>93</w:t>
       </w:r>
       <w:r>
-        <w:t xml:space="preserve">, is Buck Creek, not Rice, and not sheet 1. Wolfe’s 1861–1909 marriage list, Clay’s G and N–Q grooms and G and M–N brides, and two Estill minister-return plates from 1901 and 1902 have no Josephine Newnam × Gilbert license; those Estill plates are eight couples each, not a county-wide search. Breathitt’s marriage pages still did not open. In January 1920 he is on the Island Creek original — Owsley district 90, sheet 7 A, dwelling 113 — </w:t>
+        <w:t xml:space="preserve">, is Buck Creek, not Rice, and not sheet 1. The same 1920 Buffalo original continues on sheet 6 B, dwelling </w:t>
+      </w:r>
+      <w:r>
+        <w:rPr>
+          <w:b/>
+        </w:rPr>
+        <w:t>113</w:t>
+      </w:r>
+      <w:r>
+        <w:t xml:space="preserve">: </w:t>
+      </w:r>
+      <w:r>
+        <w:rPr>
+          <w:b/>
+        </w:rPr>
+        <w:t>Abner, Lewis</w:t>
+      </w:r>
+      <w:r>
+        <w:t xml:space="preserve">, fifty, with </w:t>
+      </w:r>
+      <w:r>
+        <w:rPr>
+          <w:b/>
+        </w:rPr>
+        <w:t>Susan</w:t>
+      </w:r>
+      <w:r>
+        <w:t xml:space="preserve">, forty-two, </w:t>
+      </w:r>
+      <w:r>
+        <w:rPr>
+          <w:b/>
+        </w:rPr>
+        <w:t>Jesse</w:t>
+      </w:r>
+      <w:r>
+        <w:t xml:space="preserve">, about seventeen, and </w:t>
+      </w:r>
+      <w:r>
+        <w:rPr>
+          <w:b/>
+        </w:rPr>
+        <w:t>Laura</w:t>
+      </w:r>
+      <w:r>
+        <w:t xml:space="preserve">, about sixteen — probably the 1910 dwelling 16 house; Lewis’s age is exact, Susan’s jumps seven years in ten and is not averaged. A third Abner on that sheet, </w:t>
+      </w:r>
+      <w:r>
+        <w:rPr>
+          <w:b/>
+        </w:rPr>
+        <w:t>Casey</w:t>
+      </w:r>
+      <w:r>
+        <w:t xml:space="preserve">, thirty-two, with Sarah, is not merged with Lewis or Samuel. </w:t>
+      </w:r>
+      <w:r>
+        <w:rPr>
+          <w:b/>
+        </w:rPr>
+        <w:t>Barrett, Bruce</w:t>
+      </w:r>
+      <w:r>
+        <w:t xml:space="preserve">, forty-two, with </w:t>
+      </w:r>
+      <w:r>
+        <w:rPr>
+          <w:b/>
+        </w:rPr>
+        <w:t>Anna</w:t>
+      </w:r>
+      <w:r>
+        <w:t xml:space="preserve">, may be the 1910 Barrett, Ben; that stays possible. Sheet 7 A dwelling </w:t>
+      </w:r>
+      <w:r>
+        <w:rPr>
+          <w:b/>
+        </w:rPr>
+        <w:t>117</w:t>
+      </w:r>
+      <w:r>
+        <w:t xml:space="preserve"> is </w:t>
+      </w:r>
+      <w:r>
+        <w:rPr>
+          <w:b/>
+        </w:rPr>
+        <w:t>Abner, Samuel</w:t>
+      </w:r>
+      <w:r>
+        <w:t xml:space="preserve">, fifty-three, with </w:t>
+      </w:r>
+      <w:r>
+        <w:rPr>
+          <w:b/>
+        </w:rPr>
+        <w:t>Maria</w:t>
+      </w:r>
+      <w:r>
+        <w:t xml:space="preserve">, fifty-one — probably the 1910 dwelling 20 house; Samuel’s age is exact, Maria/Mariah jumps eleven years and is not averaged. Dwelling </w:t>
+      </w:r>
+      <w:r>
+        <w:rPr>
+          <w:b/>
+        </w:rPr>
+        <w:t>118</w:t>
+      </w:r>
+      <w:r>
+        <w:t xml:space="preserve">’s </w:t>
+      </w:r>
+      <w:r>
+        <w:rPr>
+          <w:b/>
+        </w:rPr>
+        <w:t>Baker, James</w:t>
+      </w:r>
+      <w:r>
+        <w:t xml:space="preserve">, twenty-nine, with </w:t>
+      </w:r>
+      <w:r>
+        <w:rPr>
+          <w:b/>
+        </w:rPr>
+        <w:t>Dorothy</w:t>
+      </w:r>
+      <w:r>
+        <w:t xml:space="preserve">, seventeen, is not the 1910 James of thirty-five with Caroline. </w:t>
+      </w:r>
+      <w:r>
+        <w:rPr>
+          <w:b/>
+        </w:rPr>
+        <w:t>Gabbard, W.B.</w:t>
+      </w:r>
+      <w:r>
+        <w:t xml:space="preserve">, forty-two, with </w:t>
+      </w:r>
+      <w:r>
+        <w:rPr>
+          <w:b/>
+        </w:rPr>
+        <w:t>Rosa</w:t>
+      </w:r>
+      <w:r>
+        <w:t xml:space="preserve">, thirty-two, may be the 1910 Willis B. with Laura — Melvin ages from one-and-a-half to eleven — but the wife’s given name conflicts, so they are not silently merged. Dwelling </w:t>
+      </w:r>
+      <w:r>
+        <w:rPr>
+          <w:b/>
+        </w:rPr>
+        <w:t>124</w:t>
+      </w:r>
+      <w:r>
+        <w:t xml:space="preserve">, line 34, is </w:t>
+      </w:r>
+      <w:r>
+        <w:rPr>
+          <w:b/>
+        </w:rPr>
+        <w:t>Baker, Jesse</w:t>
+      </w:r>
+      <w:r>
+        <w:t xml:space="preserve">, fifty-four, with </w:t>
+      </w:r>
+      <w:r>
+        <w:rPr>
+          <w:b/>
+        </w:rPr>
+        <w:t>Emily</w:t>
+      </w:r>
+      <w:r>
+        <w:t xml:space="preserve">, fifty-one, </w:t>
+      </w:r>
+      <w:r>
+        <w:rPr>
+          <w:b/>
+        </w:rPr>
+        <w:t>Chester</w:t>
+      </w:r>
+      <w:r>
+        <w:t xml:space="preserve">, twenty-six, </w:t>
+      </w:r>
+      <w:r>
+        <w:rPr>
+          <w:b/>
+        </w:rPr>
+        <w:t>Sarah</w:t>
+      </w:r>
+      <w:r>
+        <w:t xml:space="preserve">, eighteen, </w:t>
+      </w:r>
+      <w:r>
+        <w:rPr>
+          <w:b/>
+        </w:rPr>
+        <w:t>Martha</w:t>
+      </w:r>
+      <w:r>
+        <w:t xml:space="preserve">, sixteen, </w:t>
+      </w:r>
+      <w:r>
+        <w:rPr>
+          <w:b/>
+        </w:rPr>
+        <w:t>Albert</w:t>
+      </w:r>
+      <w:r>
+        <w:t xml:space="preserve">, fourteen, </w:t>
+      </w:r>
+      <w:r>
+        <w:rPr>
+          <w:b/>
+        </w:rPr>
+        <w:t>Pearl</w:t>
+      </w:r>
+      <w:r>
+        <w:t xml:space="preserve">, twelve, and </w:t>
+      </w:r>
+      <w:r>
+        <w:rPr>
+          <w:b/>
+        </w:rPr>
+        <w:t>Lacy</w:t>
+      </w:r>
+      <w:r>
+        <w:t xml:space="preserve">, a daughter-in-law of eighteen. Kentucky’s B-260 Soundex copies that original — volume 76, district 92, sheet 7, line 34 — with the clerk’s spellings Emley and Charley; the original given names are Jesse, Emily, and Chester. Jesse’s age jumps twelve years in ten, Emily’s eleven; those contradictions are disclosed, not averaged. He is not on the missing sheet 1. A neighbouring Baker, Jesse of seventy-two in Owen County lives alone and is another man. Sampled E-152 John cards — Estill thirty-eight with Lula, Daviess a Black man of forty-five with Mary, and others through the Joseph divider — are other men. There is no Evans, John of about fifty-five with Susan on those filmed Buffalo sheets or in the sampled John window. Wolfe’s 1861–1909 marriage list, Clay’s G and N–Q grooms and G and M–N brides, and two Estill minister-return plates from 1901 and 1902 have no Josephine Newnam × Gilbert license; those Estill plates are eight couples each, not a county-wide search. Breathitt’s marriage pages still did not open. In January 1920 he is on the Island Creek original — Owsley district 90, sheet 7 A, dwelling 113 — </w:t>
       </w:r>
       <w:r>
         <w:rPr>
@@ -912,7 +1137,7 @@
         <w:t>Dara</w:t>
       </w:r>
       <w:r>
-        <w:t>, forty — the enumerator wrote an open a, not o — is another person. Kentucky’s 1920 Soundex has no Manerva or Minerva Newman card, and the Walter given-name window has no Owsley or Lee Walter with Manerva. Kentucky’s 1920 death index has no Manerva Newnam row on 28 August; the Owsley table that day is an infant Bates. Mary Ann Smallwood, born April 1842, came from the Owsley Smallwoods. The 11 July 1918 cemetery date is still unmatched in Kentucky’s civil index. [C669] [C672] [C693] [C694] [C690] [C691] [C709] [C711] [C712] [C713] [C717] [C729] [C730] [C739] [C740] [C741] [C742] [C743] [C744] [C745] [C746] [C747] [C748] [C752] [C753] [C754] [C756] [C759] [C763] [C765] [C768] [C775] [C776] [C777] [C779] [C780] [C782] [C783] [C784] [C789] [C790] [C791] [C792] [C793] [C794] [C795] [C796] [C797] [C801] [C802] [C803] [C804]</w:t>
+        <w:t>, forty — the enumerator wrote an open a, not o — is another person. Kentucky’s 1920 Soundex has no Manerva or Minerva Newman card, and the Walter given-name window has no Owsley or Lee Walter with Manerva. Kentucky’s 1920 death index has no Manerva Newnam row on 28 August; the Owsley table that day is an infant Bates. Mary Ann Smallwood, born April 1842, came from the Owsley Smallwoods. The 11 July 1918 cemetery date is still unmatched in Kentucky’s civil index. [C669] [C672] [C693] [C694] [C690] [C691] [C709] [C711] [C712] [C713] [C717] [C729] [C730] [C739] [C740] [C741] [C742] [C743] [C744] [C745] [C746] [C747] [C748] [C752] [C753] [C754] [C756] [C759] [C763] [C765] [C768] [C775] [C776] [C777] [C779] [C780] [C782] [C783] [C784] [C789] [C790] [C791] [C792] [C793] [C794] [C795] [C796] [C797] [C801] [C802] [C803] [C804] [C808] [C809] [C810] [C811] [C812] [C813] [C814] [C818] [C819]</w:t>
       </w:r>
     </w:p>
     <w:p>

</xml_diff>

<commit_message>
Dora passes 86–87: isolate Jackson 39, Bell 25–34, Wolfe 235/236
Pass 86 leftover write-up plus pass 87: Breathitt ED 39 Jackson and ED 40, Powell ED 177, and Bell EDs 25–34 on T625-559. Leaf 720 is Bell ED 34 Clear Creek Precinct 24, not ED 24 (C828 withdrawn). Sampled name columns probable nil Newman/John L+Cora. Wolfe ED 235/236 headers and compiled Clifty/Antioch nil. FS still SPA (R011-37). Working Word rebuilt; authored latest.docx untouched.

Co-authored-by: blakereaganlaw <blakereaganlaw@gmail.com>
</commit_message>
<xml_diff>
--- a/research/dora-ella-newnam/book/Dora-Ella-Newnam-Stone-A-Life.docx
+++ b/research/dora-ella-newnam/book/Dora-Ella-Newnam-Stone-A-Life.docx
@@ -161,6 +161,36 @@
     </w:p>
     <w:p>
       <w:r>
+        <w:t>27. [Pass 82. District 42 sheet 19, and Rissie as a servant](#pass-82-district-42-sheet-19-and-rissie-as-a-servant)</w:t>
+      </w:r>
+    </w:p>
+    <w:p>
+      <w:r>
+        <w:t>28. [Pass 83. The Breathitt film map](#pass-83-the-breathitt-film-map)</w:t>
+      </w:r>
+    </w:p>
+    <w:p>
+      <w:r>
+        <w:t>29. [Pass 84. John and Jennie on George's Branch](#pass-84-john-and-jennie-on-georges-branch)</w:t>
+      </w:r>
+    </w:p>
+    <w:p>
+      <w:r>
+        <w:t>30. [Pass 85. District 55, not 52](#pass-85-district-55-not-52)</w:t>
+      </w:r>
+    </w:p>
+    <w:p>
+      <w:r>
+        <w:t>31. [Pass 86. Jackson is District 39](#pass-86-jackson-is-district-39)</w:t>
+      </w:r>
+    </w:p>
+    <w:p>
+      <w:r>
+        <w:t>32. [Pass 87. District 34 is Clear Creek](#pass-87-district-34-is-clear-creek)</w:t>
+      </w:r>
+    </w:p>
+    <w:p>
+      <w:r>
         <w:br w:type="page"/>
       </w:r>
     </w:p>
@@ -4197,12 +4227,766 @@
     </w:p>
     <w:p>
       <w:r>
-        <w:t>District 52 does not start where pass 78 said. Leaf 1110 is district 23, sheet 13A. District 52 starts at leaf 1116, sheet 1A. Leaf 1128 is sheet 7A, not 19A. District 52 has no sheet 19 — district 56 is already on the film by leaf 1144. The Soundex sheet number is slack. The original household is still not isolated. [C718] [C719] [C720] [C721] [C728] [S468]</w:t>
-      </w:r>
-    </w:p>
-    <w:p>
-      <w:r>
-        <w:t>Certificates 28501 and 31780 are still unread. SortedByName has no Boyd Newman page and no Kentucky Floyd born about 1878–79 who belongs here. FamilySearch films returned 403 again. [C706] [C707] [C708] [C709] [S462] [S463]</w:t>
+        <w:t xml:space="preserve">Pass 81 read leaf 1110 as district 23 and leaf 1116 as the start of district 52, and concluded district 52 had no sheet 19. Pass 84 withdraws those three readings. Leaf 1110 is Breathitt precinct 11, district 53. The George's Branch district 52 — A. W. Noble — has sheet 4 at leaf 1030, sheet 13 at leaf 1048, and </w:t>
+      </w:r>
+      <w:r>
+        <w:rPr>
+          <w:b/>
+        </w:rPr>
+        <w:t>sheet 19A at leaf 1060</w:t>
+      </w:r>
+      <w:r>
+        <w:t>. The original is there. [C718] [C719] [C721] [C728] [C776] [C777] [C780] [S468]</w:t>
+      </w:r>
+    </w:p>
+    <w:p>
+      <w:pPr>
+        <w:pStyle w:val="Heading2"/>
+      </w:pPr>
+      <w:r>
+        <w:t>Pass 82. District 42 sheet 19, and Rissie as a servant</w:t>
+      </w:r>
+    </w:p>
+    <w:p>
+      <w:r>
+        <w:t>Wayback holds the USGenWeb Breathitt 1920 transcripts for districts 45 through 50 — twenty-five files. No Newman, Newnam, Noonan, or McCoy head. Near-hit Virgils and a John L. Combs are other men. [C731] [S474]</w:t>
+      </w:r>
+    </w:p>
+    <w:p>
+      <w:r>
+        <w:t>The film headers on reel 559 were remapped. Leaf 840 is district 42, sheet 17A. Leaf 844 is district 42, sheet 19A. Line 17 on that sheet is a Bach household, not John and Jennie. A 4/5 slip from district 52 to 42 was a fair clerk hypothesis. It fails on the names. [C734] [C735] [C736] [S475]</w:t>
+      </w:r>
+    </w:p>
+    <w:p>
+      <w:r>
+        <w:t xml:space="preserve">Rissie is no longer a compiled ghost. On 15 April 1910, Heidelberg sheet 6A, leaf 532, she is </w:t>
+      </w:r>
+      <w:r>
+        <w:rPr>
+          <w:b/>
+        </w:rPr>
+        <w:t>Newman, Rissie</w:t>
+      </w:r>
+      <w:r>
+        <w:t xml:space="preserve">, servant, fifteen, single, in the house of </w:t>
+      </w:r>
+      <w:r>
+        <w:rPr>
+          <w:b/>
+        </w:rPr>
+        <w:t>Edney, Sam</w:t>
+      </w:r>
+      <w:r>
+        <w:t xml:space="preserve">, thirty-two, and </w:t>
+      </w:r>
+      <w:r>
+        <w:rPr>
+          <w:b/>
+        </w:rPr>
+        <w:t>Emma</w:t>
+      </w:r>
+      <w:r>
+        <w:t xml:space="preserve">, thirty-one, with a daughter Della. That line is </w:t>
+      </w:r>
+      <w:r>
+        <w:rPr>
+          <w:b/>
+        </w:rPr>
+        <w:t>proven</w:t>
+      </w:r>
+      <w:r>
+        <w:t xml:space="preserve">. Age fifteen versus Dora’s Rissa at about twelve or thirteen is slack. They are </w:t>
+      </w:r>
+      <w:r>
+        <w:rPr>
+          <w:b/>
+        </w:rPr>
+        <w:t>not merged</w:t>
+      </w:r>
+      <w:r>
+        <w:t>. [C738] [C760] [S477] [S489]</w:t>
+      </w:r>
+    </w:p>
+    <w:p>
+      <w:r>
+        <w:t xml:space="preserve">The same sheet has </w:t>
+      </w:r>
+      <w:r>
+        <w:rPr>
+          <w:b/>
+        </w:rPr>
+        <w:t>Newman, William</w:t>
+      </w:r>
+      <w:r>
+        <w:t xml:space="preserve">, forty-four, </w:t>
+      </w:r>
+      <w:r>
+        <w:rPr>
+          <w:b/>
+        </w:rPr>
+        <w:t>Martha</w:t>
+      </w:r>
+      <w:r>
+        <w:t xml:space="preserve">, thirty-three, and </w:t>
+      </w:r>
+      <w:r>
+        <w:rPr>
+          <w:b/>
+        </w:rPr>
+        <w:t>Floyd</w:t>
+      </w:r>
+      <w:r>
+        <w:t>, son, six. That Floyd would have been about thirty-one in 1910 if he were the 1902 groom. He is not. [C761]</w:t>
+      </w:r>
+    </w:p>
+    <w:p>
+      <w:r>
+        <w:t xml:space="preserve">Lee’s compiled births give </w:t>
+      </w:r>
+      <w:r>
+        <w:rPr>
+          <w:b/>
+        </w:rPr>
+        <w:t>VIRGIL</w:t>
+      </w:r>
+      <w:r>
+        <w:t xml:space="preserve">, mother Emma Combs, 1912 — rejected against the Soundex son aged three — and </w:t>
+      </w:r>
+      <w:r>
+        <w:rPr>
+          <w:b/>
+        </w:rPr>
+        <w:t>BOYD</w:t>
+      </w:r>
+      <w:r>
+        <w:t xml:space="preserve">, mother Ollie Brandenburg, November 1914, a </w:t>
+      </w:r>
+      <w:r>
+        <w:rPr>
+          <w:b/>
+        </w:rPr>
+        <w:t>possible</w:t>
+      </w:r>
+      <w:r>
+        <w:t xml:space="preserve"> Allie/Ollie child only. [C739] [C740] [S478] Breathitt births 1916–1920 are nil Newman. [C737] [C750]</w:t>
+      </w:r>
+    </w:p>
+    <w:p>
+      <w:pPr>
+        <w:pStyle w:val="Heading2"/>
+      </w:pPr>
+      <w:r>
+        <w:t>Pass 83. The Breathitt film map</w:t>
+      </w:r>
+    </w:p>
+    <w:p>
+      <w:r>
+        <w:t xml:space="preserve">Bell County runs through leaf 788. Breathitt starts at district 41, about leaf 789 — Crockettsville precinct 2, W. Milton, sheet 1B on leaf 790. Districts 39 and 40 were not isolated between those leaves. District 44 starts at leaf 866. The later block that pass 83 called district 52 Quicksand — sheet 1A at 1116 through about sheet 11 — is </w:t>
+      </w:r>
+      <w:r>
+        <w:rPr>
+          <w:b/>
+        </w:rPr>
+        <w:t>district 55</w:t>
+      </w:r>
+      <w:r>
+        <w:t>. District 56 still begins at 1138. [C751] [C754] [C756] [C757] [C791] [C794] [S484] [S505]</w:t>
+      </w:r>
+    </w:p>
+    <w:p>
+      <w:r>
+        <w:t>Powell full sheets at leaves 1060, 1115, and 1195 — districts 142, 144, and 178 — have no Newman head. A Wolfe Hazel Green sample is the same negative, on a dark scan. [C762] [C763] [C764] [C765] [S485] [S486]</w:t>
+      </w:r>
+    </w:p>
+    <w:p>
+      <w:r>
+        <w:t>FamilySearch returned 404, then 403 again. Certificates 28501 and 31780 are still unread. The 1920 Heidelberg compiled Henry, thirty-nine, and Nettie is the 1903 Book 6 couple, not the Soundex Henry, fifty-two. [C766] [C769] [C771]</w:t>
+      </w:r>
+    </w:p>
+    <w:p>
+      <w:pPr>
+        <w:pStyle w:val="Heading2"/>
+      </w:pPr>
+      <w:r>
+        <w:t>Pass 84. John and Jennie on George's Branch</w:t>
+      </w:r>
+    </w:p>
+    <w:p>
+      <w:r>
+        <w:t xml:space="preserve">The Soundex card named a sheet the later Quicksand block does not have. The earlier block does. Leaf 1060 is Breathitt district </w:t>
+      </w:r>
+      <w:r>
+        <w:rPr>
+          <w:b/>
+        </w:rPr>
+        <w:t>52</w:t>
+      </w:r>
+      <w:r>
+        <w:t xml:space="preserve">, </w:t>
+      </w:r>
+      <w:r>
+        <w:rPr>
+          <w:b/>
+        </w:rPr>
+        <w:t>George's Branch precinct 3</w:t>
+      </w:r>
+      <w:r>
+        <w:t xml:space="preserve">, sheet </w:t>
+      </w:r>
+      <w:r>
+        <w:rPr>
+          <w:b/>
+        </w:rPr>
+        <w:t>19A</w:t>
+      </w:r>
+      <w:r>
+        <w:t xml:space="preserve">, 7 February 1920, enumerator A. W. Noble. Line 17, dwelling 315: </w:t>
+      </w:r>
+      <w:r>
+        <w:rPr>
+          <w:b/>
+        </w:rPr>
+        <w:t>Newman, John</w:t>
+      </w:r>
+      <w:r>
+        <w:t xml:space="preserve">, thirty-eight, married; </w:t>
+      </w:r>
+      <w:r>
+        <w:rPr>
+          <w:b/>
+        </w:rPr>
+        <w:t>Jennie</w:t>
+      </w:r>
+      <w:r>
+        <w:t xml:space="preserve">, wife, twenty-one; </w:t>
+      </w:r>
+      <w:r>
+        <w:rPr>
+          <w:b/>
+        </w:rPr>
+        <w:t>Virgil</w:t>
+      </w:r>
+      <w:r>
+        <w:t xml:space="preserve">, son, three; </w:t>
+      </w:r>
+      <w:r>
+        <w:rPr>
+          <w:b/>
+        </w:rPr>
+        <w:t>Fred[i? / Freddie?]</w:t>
+      </w:r>
+      <w:r>
+        <w:t xml:space="preserve">, son, one; </w:t>
+      </w:r>
+      <w:r>
+        <w:rPr>
+          <w:b/>
+        </w:rPr>
+        <w:t>Henry</w:t>
+      </w:r>
+      <w:r>
+        <w:t xml:space="preserve">, father, fifty-two; </w:t>
+      </w:r>
+      <w:r>
+        <w:rPr>
+          <w:b/>
+        </w:rPr>
+        <w:t>Julie</w:t>
+      </w:r>
+      <w:r>
+        <w:t xml:space="preserve">, mother, forty-two. The district box is </w:t>
+      </w:r>
+      <w:r>
+        <w:rPr>
+          <w:b/>
+        </w:rPr>
+        <w:t>52</w:t>
+      </w:r>
+      <w:r>
+        <w:t xml:space="preserve"> / </w:t>
+      </w:r>
+      <w:r>
+        <w:rPr>
+          <w:b/>
+        </w:rPr>
+        <w:t>19 A</w:t>
+      </w:r>
+      <w:r>
+        <w:t xml:space="preserve">. That is </w:t>
+      </w:r>
+      <w:r>
+        <w:rPr>
+          <w:b/>
+        </w:rPr>
+        <w:t>proven</w:t>
+      </w:r>
+      <w:r>
+        <w:t>. It is the Soundex household. [C772] [C773] [C774] [S491] [S492] [S493]</w:t>
+      </w:r>
+    </w:p>
+    <w:p>
+      <w:r>
+        <w:t xml:space="preserve">He is </w:t>
+      </w:r>
+      <w:r>
+        <w:rPr>
+          <w:b/>
+        </w:rPr>
+        <w:t>not</w:t>
+      </w:r>
+      <w:r>
+        <w:t xml:space="preserve"> John L. of Owsley. The wife is Jennie, not Cora. The children are Virgil and Fredi, not Pencie and Robert. Henry and Julie sit in the house. The precinct is George's Branch, Breathitt, not Buck Creek. [C775]</w:t>
+      </w:r>
+    </w:p>
+    <w:p>
+      <w:r>
+        <w:t xml:space="preserve">The same district, same enumerator, is sheet 4 at leaf 1030 and sheet 13 at leaf 1048. District 52 on George's Branch </w:t>
+      </w:r>
+      <w:r>
+        <w:rPr>
+          <w:b/>
+        </w:rPr>
+        <w:t>has</w:t>
+      </w:r>
+      <w:r>
+        <w:t xml:space="preserve"> a sheet 19. The pass-81 claim that it does not is withdrawn. Leaf 1116 is not the start of this district 52. Leaf 1110 is precinct 11, district 53 — not Bell district 23. [C776] [C777] [C780]</w:t>
+      </w:r>
+    </w:p>
+    <w:p>
+      <w:r>
+        <w:t>District 43 is now mapped: precinct 4, Isaac Back, sheet 2A at leaf 854 through a nearly empty sheet 7A at 864, then district 44 at 866. No sheet 19. District 51 is Frozen Creek, sheet 6A at leaf 1020 — not the Soundex house. [C778] [C779] [S496] [S497]</w:t>
+      </w:r>
+    </w:p>
+    <w:p>
+      <w:r>
+        <w:t>Powell Clay City district 143, sheet 1B, and Southfork precinct 4, district 145, sheet 9B, have no Newman head. Wolfe leaf 374 is another dark negative. [C786] [C787] [C788] [S501] [S502]</w:t>
+      </w:r>
+    </w:p>
+    <w:p>
+      <w:r>
+        <w:t>FamilySearch films returned 403 again. Book 6’s register image and certificates 28501 and 31780 are still unread. The 1942 *Courier* extract still names George Combs as the man ambushed and does not name a shooter. Do not print that charge as fact. [C781] [C784] [C785]</w:t>
+      </w:r>
+    </w:p>
+    <w:p>
+      <w:pPr>
+        <w:pStyle w:val="Heading2"/>
+      </w:pPr>
+      <w:r>
+        <w:t>Pass 85. District 55, not 52</w:t>
+      </w:r>
+    </w:p>
+    <w:p>
+      <w:r>
+        <w:t xml:space="preserve">Leaf 1116 was the leftover. The faint box on the contact sheet looked like a 5 and a 2. At 1600 pixels the second digit is another </w:t>
+      </w:r>
+      <w:r>
+        <w:rPr>
+          <w:b/>
+        </w:rPr>
+        <w:t>5</w:t>
+      </w:r>
+      <w:r>
+        <w:t xml:space="preserve">. Supervisor’s district 11, stamp 2552, sheet </w:t>
+      </w:r>
+      <w:r>
+        <w:rPr>
+          <w:b/>
+        </w:rPr>
+        <w:t>1A</w:t>
+      </w:r>
+      <w:r>
+        <w:t xml:space="preserve">. That later block is Breathitt district </w:t>
+      </w:r>
+      <w:r>
+        <w:rPr>
+          <w:b/>
+        </w:rPr>
+        <w:t>55</w:t>
+      </w:r>
+      <w:r>
+        <w:t>, not another district 52. [C791] [S505] [S506]</w:t>
+      </w:r>
+    </w:p>
+    <w:p>
+      <w:r>
+        <w:t xml:space="preserve">The township line is Precinct No. 1[2 or 6], magisterial. Quicksand is precinct 16 in the Combs extract. That identity is </w:t>
+      </w:r>
+      <w:r>
+        <w:rPr>
+          <w:b/>
+        </w:rPr>
+        <w:t>possible</w:t>
+      </w:r>
+      <w:r>
+        <w:t xml:space="preserve"> only. [C792]</w:t>
+      </w:r>
+    </w:p>
+    <w:p>
+      <w:r>
+        <w:t>Leaves 1118, 1120, and 1136 are sheets 2A, 3A, and 11 of the same district. Eleven sheets, then district 56 at 1138. The pass-83 claim that district 52 Quicksand starts at 1116 is withdrawn. [C793] [C794]</w:t>
+      </w:r>
+    </w:p>
+    <w:p>
+      <w:r>
+        <w:t xml:space="preserve">The film junction at 788–789 is district </w:t>
+      </w:r>
+      <w:r>
+        <w:rPr>
+          <w:b/>
+        </w:rPr>
+        <w:t>40</w:t>
+      </w:r>
+      <w:r>
+        <w:t xml:space="preserve"> into district 41, not Bell into Breathitt. Pass 85 read leaf 788 as Bell district 20. The high-resolution box is district </w:t>
+      </w:r>
+      <w:r>
+        <w:rPr>
+          <w:b/>
+        </w:rPr>
+        <w:t>40</w:t>
+      </w:r>
+      <w:r>
+        <w:t>. That earlier label is withdrawn. [C795] [C796] [C819]</w:t>
+      </w:r>
+    </w:p>
+    <w:p>
+      <w:r>
+        <w:t xml:space="preserve">Frozen Creek starts where it should. Leaf 1010 is district 51, precinct 4, sheet 1A. George’s Branch district 52 is still running at leaf 1064 — sheet </w:t>
+      </w:r>
+      <w:r>
+        <w:rPr>
+          <w:b/>
+        </w:rPr>
+        <w:t>21A</w:t>
+      </w:r>
+      <w:r>
+        <w:t xml:space="preserve"> — after the Soundex household on sheet 19A. [C797] [C799]</w:t>
+      </w:r>
+    </w:p>
+    <w:p>
+      <w:r>
+        <w:t xml:space="preserve">Powell’s card said district 144 sat at leaf 1100. The sheet itself is Clay City district </w:t>
+      </w:r>
+      <w:r>
+        <w:rPr>
+          <w:b/>
+        </w:rPr>
+        <w:t>143</w:t>
+      </w:r>
+      <w:r>
+        <w:t xml:space="preserve">, sheet 11B, 4 February, the same Virgil Roadie who took sheet 1B at leaf 1080. That earlier label is withdrawn. Rogers Chapel precinct 3, district 145, sheet 3B, is at leaf 1148. District </w:t>
+      </w:r>
+      <w:r>
+        <w:rPr>
+          <w:b/>
+        </w:rPr>
+        <w:t>146</w:t>
+      </w:r>
+      <w:r>
+        <w:t xml:space="preserve"> starts at leaf 1170, Southfork precinct 4, sheet 1B, 27 January. The name columns on 1100, 1130, and 1170 do not isolate a Newman head. District 177 is isolated in the next pass. Wolfe remains dark on the sampled originals. [C801] [C803] [C804] [C805] [C806] [S510] [S511]</w:t>
+      </w:r>
+    </w:p>
+    <w:p>
+      <w:r>
+        <w:t>FamilySearch returned 403 again — roadblock step 35. Book 6’s compiled page still has Floyd and Allie A. on 31 July 1902. The register image is unread. Certificates 28501 and 31780 are unread. Do not print 1976 or 1978 as proven deaths. [C807] [C809] [C810]</w:t>
+      </w:r>
+    </w:p>
+    <w:p>
+      <w:pPr>
+        <w:pStyle w:val="Heading2"/>
+      </w:pPr>
+      <w:r>
+        <w:t>Pass 86. Jackson is District 39</w:t>
+      </w:r>
+    </w:p>
+    <w:p>
+      <w:r>
+        <w:t xml:space="preserve">The authored tree was right about the number and wrong about where the film put it. Leaf 734 is a white card: </w:t>
+      </w:r>
+      <w:r>
+        <w:rPr>
+          <w:b/>
+        </w:rPr>
+        <w:t>BREATHITT CO. E.D's. 39 to 57 (pt)</w:t>
+      </w:r>
+      <w:r>
+        <w:t xml:space="preserve">. Two leaves earlier — and again just after the card — is sheet </w:t>
+      </w:r>
+      <w:r>
+        <w:rPr>
+          <w:b/>
+        </w:rPr>
+        <w:t>1A</w:t>
+      </w:r>
+      <w:r>
+        <w:t xml:space="preserve"> of district </w:t>
+      </w:r>
+      <w:r>
+        <w:rPr>
+          <w:b/>
+        </w:rPr>
+        <w:t>39</w:t>
+      </w:r>
+      <w:r>
+        <w:t xml:space="preserve">: Precinct 1, incorporated place </w:t>
+      </w:r>
+      <w:r>
+        <w:rPr>
+          <w:b/>
+        </w:rPr>
+        <w:t>Jackson</w:t>
+      </w:r>
+      <w:r>
+        <w:t>, 2 January 1920, Herschel L. Bach. The first household is Mrs. Mancy Back; the son in that house is the enumerator. [C815] [C816] [C829] [S519] [S520]</w:t>
+      </w:r>
+    </w:p>
+    <w:p>
+      <w:r>
+        <w:t xml:space="preserve">The district is still running on 2 February at leaf 768 — sheet </w:t>
+      </w:r>
+      <w:r>
+        <w:rPr>
+          <w:b/>
+        </w:rPr>
+        <w:t>15A</w:t>
+      </w:r>
+      <w:r>
+        <w:t>, same precinct, no incorporated place. That is the Jackson outskirts, not a new district. [C817] [S522]</w:t>
+      </w:r>
+    </w:p>
+    <w:p>
+      <w:r>
+        <w:t xml:space="preserve">District </w:t>
+      </w:r>
+      <w:r>
+        <w:rPr>
+          <w:b/>
+        </w:rPr>
+        <w:t>40</w:t>
+      </w:r>
+      <w:r>
+        <w:t xml:space="preserve"> starts at leaf 769: Precinct 2, Watkins Clay. It is still precinct 2, still Watkins Cloy, at leaf 788 sheet </w:t>
+      </w:r>
+      <w:r>
+        <w:rPr>
+          <w:b/>
+        </w:rPr>
+        <w:t>16</w:t>
+      </w:r>
+      <w:r>
+        <w:t>, 25 February. Then district 41, Crockettsville, at 789. The pass-85 “Bell district 20” reading of leaf 788 is withdrawn. Bell does not have a district 40. [C818] [C819] [S523]</w:t>
+      </w:r>
+    </w:p>
+    <w:p>
+      <w:r>
+        <w:t xml:space="preserve">The name columns on the Jackson first sheet, sheet 3B, sheet 15A, and the first two district-40 sheets, plus a machine pass over sixty-two inverted name-column crops, do not isolate a Newman, Newnam, McCoy, or John L. and Cora head. That is a </w:t>
+      </w:r>
+      <w:r>
+        <w:rPr>
+          <w:b/>
+        </w:rPr>
+        <w:t>probable</w:t>
+      </w:r>
+      <w:r>
+        <w:t xml:space="preserve"> negative, not a line-by-line close. [C820] [C821] [S524]</w:t>
+      </w:r>
+    </w:p>
+    <w:p>
+      <w:r>
+        <w:t xml:space="preserve">Powell district </w:t>
+      </w:r>
+      <w:r>
+        <w:rPr>
+          <w:b/>
+        </w:rPr>
+        <w:t>177</w:t>
+      </w:r>
+      <w:r>
+        <w:t xml:space="preserve"> is not lost. It sits where the county card said it would: after district 142, before Clay City 143. Leaf 1063 is Natural Bridge Precinct 2, district </w:t>
+      </w:r>
+      <w:r>
+        <w:rPr>
+          <w:b/>
+        </w:rPr>
+        <w:t>177</w:t>
+      </w:r>
+      <w:r>
+        <w:t xml:space="preserve">, sheet </w:t>
+      </w:r>
+      <w:r>
+        <w:rPr>
+          <w:b/>
+        </w:rPr>
+        <w:t>1A</w:t>
+      </w:r>
+      <w:r>
+        <w:t xml:space="preserve">, 27 January, Robert H. Conlee. The first house is John W. Preston, thirty-eight, and Nellie. The district runs through sheet </w:t>
+      </w:r>
+      <w:r>
+        <w:rPr>
+          <w:b/>
+        </w:rPr>
+        <w:t>8B</w:t>
+      </w:r>
+      <w:r>
+        <w:t xml:space="preserve"> at leaf 1078. Leaf 1079 is already Clay City district 143, sheet 1A. Sampled name columns there are the same </w:t>
+      </w:r>
+      <w:r>
+        <w:rPr>
+          <w:b/>
+        </w:rPr>
+        <w:t>probable</w:t>
+      </w:r>
+      <w:r>
+        <w:t xml:space="preserve"> nil. [C822] [C823] [C824] [S525] [S526]</w:t>
+      </w:r>
+    </w:p>
+    <w:p>
+      <w:r>
+        <w:t>Wolfe leaf 374 is Lee City, district 234 — still dark. The published Wolfe transcripts for Lee City, Campton, Holly, and the 1920d/f/h files have no Newman, Newnam, or McCoy head. Near-hits are other men: a Newt Lee, Newton hired hands, a John L. King aged eight, a John L. Trent, a John L. Sewell, a Dora L. Hanks. Torrent, Clifty, Antioch, and Hazel Green compiled pages remain. [C825] [C826] [S527] [S528]</w:t>
+      </w:r>
+    </w:p>
+    <w:p>
+      <w:r>
+        <w:t xml:space="preserve">FamilySearch catalog 127913 was an empty shell this pass — roadblock step 36. Certificates 28501 and 31780 are still unread. A Lee delayed-birth index has Clarence Newman, 6 December 1910, mother Allie Brandburg, certificate </w:t>
+      </w:r>
+      <w:r>
+        <w:rPr>
+          <w:b/>
+        </w:rPr>
+        <w:t>49261</w:t>
+      </w:r>
+      <w:r>
+        <w:t xml:space="preserve"> — not those numbers. [C827] [C831] [S529] [S530]</w:t>
+      </w:r>
+    </w:p>
+    <w:p>
+      <w:r>
+        <w:t>Bell districts 25–34 were not isolated between Bell 24 at leaf 720 and the Breathitt card at 734. That gap stays on the backlog. [C828]</w:t>
+      </w:r>
+    </w:p>
+    <w:p>
+      <w:pPr>
+        <w:pStyle w:val="Heading2"/>
+      </w:pPr>
+      <w:r>
+        <w:t>Pass 87. District 34 is Clear Creek</w:t>
+      </w:r>
+    </w:p>
+    <w:p>
+      <w:r>
+        <w:t xml:space="preserve">The gap was a misread. Leaf 720 at 1600 pixels is Bell district </w:t>
+      </w:r>
+      <w:r>
+        <w:rPr>
+          <w:b/>
+        </w:rPr>
+        <w:t>34</w:t>
+      </w:r>
+      <w:r>
+        <w:t xml:space="preserve">, sheet </w:t>
+      </w:r>
+      <w:r>
+        <w:rPr>
+          <w:b/>
+        </w:rPr>
+        <w:t>12A</w:t>
+      </w:r>
+      <w:r>
+        <w:t xml:space="preserve">, 18 February, John Hays. The township line is </w:t>
+      </w:r>
+      <w:r>
+        <w:rPr>
+          <w:b/>
+        </w:rPr>
+        <w:t>Clear Creek Precinct No. 24</w:t>
+      </w:r>
+      <w:r>
+        <w:t xml:space="preserve">. Precinct 24 is not the district number. Leaf 700, which an earlier pass called district 24 sheet 2A, is the same district 34, sheet </w:t>
+      </w:r>
+      <w:r>
+        <w:rPr>
+          <w:b/>
+        </w:rPr>
+        <w:t>2A</w:t>
+      </w:r>
+      <w:r>
+        <w:t xml:space="preserve">. The district starts at leaf 698, sheet </w:t>
+      </w:r>
+      <w:r>
+        <w:rPr>
+          <w:b/>
+        </w:rPr>
+        <w:t>1A</w:t>
+      </w:r>
+      <w:r>
+        <w:t xml:space="preserve">, 9 February. It is still running on 27 February at leaf 731, sheet </w:t>
+      </w:r>
+      <w:r>
+        <w:rPr>
+          <w:b/>
+        </w:rPr>
+        <w:t>17B</w:t>
+      </w:r>
+      <w:r>
+        <w:t>. The next leaf is Breathitt 39. [C833] [C834] [C835] [C836] [S532] [S533] [S534]</w:t>
+      </w:r>
+    </w:p>
+    <w:p>
+      <w:r>
+        <w:t>So districts 25 through 34 are not missing. They sit after district 24 at about leaf 450 and run to the Breathitt card. Middlesboro is 25, 26, and 27 — West End on 27, Ralph Goins. Ingram precinct 2 is 29. Suttly is 33. A blank sheet sits at 660. Districts 28 and 30 were not isolated in the sample. [C838] [C839] [C840] [C841] [C842] [C843] [C844] [C845]</w:t>
+      </w:r>
+    </w:p>
+    <w:p>
+      <w:r>
+        <w:t>The earlier claim that 25–34 were not on this stretch is withdrawn. [C828]</w:t>
+      </w:r>
+    </w:p>
+    <w:p>
+      <w:r>
+        <w:t xml:space="preserve">Sampled name columns on those Bell sheets, and the unread sides of Breathitt 40, do not isolate a Newman, Newnam, McCoy, or John L. and Cora head. That is a </w:t>
+      </w:r>
+      <w:r>
+        <w:rPr>
+          <w:b/>
+        </w:rPr>
+        <w:t>probable</w:t>
+      </w:r>
+      <w:r>
+        <w:t xml:space="preserve"> negative. [C846] [C847] [C848]</w:t>
+      </w:r>
+    </w:p>
+    <w:p>
+      <w:r>
+        <w:t xml:space="preserve">Wolfe leaf 380 at 1600 pixels is Hazel Green, district </w:t>
+      </w:r>
+      <w:r>
+        <w:rPr>
+          <w:b/>
+        </w:rPr>
+        <w:t>235</w:t>
+      </w:r>
+      <w:r>
+        <w:t xml:space="preserve">, 5 January, Stanley M. Ward. Leaf 410 is Campton precinct 3, district </w:t>
+      </w:r>
+      <w:r>
+        <w:rPr>
+          <w:b/>
+        </w:rPr>
+        <w:t>236</w:t>
+      </w:r>
+      <w:r>
+        <w:t>. The published Clifty 241 and Antioch 242 transcripts have no Newman head. A John L. Henry, a Dora Childers, a Dora Roberts, and a Cora King aged six are other people. Lee City’s McCoy, John B., eighty-four, is a McCoy surname. [C849] [C850] [C851] [C852] [C854] [S546] [S548] [S549]</w:t>
+      </w:r>
+    </w:p>
+    <w:p>
+      <w:r>
+        <w:t>FamilySearch 127913 and 127869 were empty shells — roadblock step 37. Book 6 still has Floyd and Allie A. on 31 July 1902 and no Boyd groom. Certificates 28501 and 31780 are still not those numbers. [C855] [C856] [C857]</w:t>
+      </w:r>
+    </w:p>
+    <w:p>
+      <w:r>
+        <w:t>Do not print 1966 or 1976 as proven deaths. Do not print Floyd as Boyd. Do not print 1962 as McCoy’s death. Do not print the 1942 Combs charge as fact.</w:t>
       </w:r>
     </w:p>
     <w:p>
@@ -4644,7 +5428,52 @@
         <w:t>Rissa / Rissie</w:t>
       </w:r>
       <w:r>
-        <w:t>, May 1897. After the 1900 census she does not reappear on the Kentucky child Soundex pass or in Pearl’s 1910 Owsley household. An unsourced WikiTree profile (</w:t>
+        <w:t xml:space="preserve">, May 1897. After the 1900 census she does not reappear on the Kentucky child Soundex pass or in Pearl’s 1910 Owsley household. On 15 April 1910 a </w:t>
+      </w:r>
+      <w:r>
+        <w:rPr>
+          <w:b/>
+        </w:rPr>
+        <w:t>Newman, Rissie</w:t>
+      </w:r>
+      <w:r>
+        <w:t xml:space="preserve">, servant, fifteen, sits in </w:t>
+      </w:r>
+      <w:r>
+        <w:rPr>
+          <w:b/>
+        </w:rPr>
+        <w:t>Edney, Sam</w:t>
+      </w:r>
+      <w:r>
+        <w:t xml:space="preserve">’s Heidelberg house — </w:t>
+      </w:r>
+      <w:r>
+        <w:rPr>
+          <w:b/>
+        </w:rPr>
+        <w:t>proven</w:t>
+      </w:r>
+      <w:r>
+        <w:t xml:space="preserve"> as a line, </w:t>
+      </w:r>
+      <w:r>
+        <w:rPr>
+          <w:b/>
+        </w:rPr>
+        <w:t>possible</w:t>
+      </w:r>
+      <w:r>
+        <w:t xml:space="preserve"> Dora’s daughter, </w:t>
+      </w:r>
+      <w:r>
+        <w:rPr>
+          <w:b/>
+        </w:rPr>
+        <w:t>not merged</w:t>
+      </w:r>
+      <w:r>
+        <w:t xml:space="preserve"> (age slack). [C738] [C760] An unsourced WikiTree profile (</w:t>
       </w:r>
       <w:r>
         <w:rPr>
@@ -5246,6 +6075,24 @@
         <w:rPr>
           <w:b/>
         </w:rPr>
+        <w:t>1920 Breathitt ED 52 George's Branch sh 19A ln 17 Newman John 38 + Jennie 21 ISOLATED and rejected vs John L (C772–C775)</w:t>
+      </w:r>
+      <w:r>
+        <w:t xml:space="preserve">; </w:t>
+      </w:r>
+      <w:r>
+        <w:rPr>
+          <w:b/>
+        </w:rPr>
+        <w:t>leaf 1116 = ED 55 sh 1A (C791)</w:t>
+      </w:r>
+      <w:r>
+        <w:t xml:space="preserve">; </w:t>
+      </w:r>
+      <w:r>
+        <w:rPr>
+          <w:b/>
+        </w:rPr>
         <w:t>1910 Heidelberg Boyd 38 + Allie 28 + four children = 1920 Station Camp — PROVEN (C700)</w:t>
       </w:r>
       <w:r>
@@ -11875,7 +12722,7 @@
     </w:p>
     <w:p>
       <w:r>
-        <w:t xml:space="preserve">110. T625-559 remap: leaf </w:t>
+        <w:t xml:space="preserve">110. T625-559 remap (pass 81): leaf </w:t>
       </w:r>
       <w:r>
         <w:rPr>
@@ -11884,13 +12731,710 @@
         <w:t>1110</w:t>
       </w:r>
       <w:r>
+        <w:t xml:space="preserve"> read as ED </w:t>
+      </w:r>
+      <w:r>
+        <w:rPr>
+          <w:b/>
+        </w:rPr>
+        <w:t>23</w:t>
+      </w:r>
+      <w:r>
+        <w:t xml:space="preserve"> sh </w:t>
+      </w:r>
+      <w:r>
+        <w:rPr>
+          <w:b/>
+        </w:rPr>
+        <w:t>13A</w:t>
+      </w:r>
+      <w:r>
+        <w:t xml:space="preserve">; ED </w:t>
+      </w:r>
+      <w:r>
+        <w:rPr>
+          <w:b/>
+        </w:rPr>
+        <w:t>52</w:t>
+      </w:r>
+      <w:r>
+        <w:t xml:space="preserve"> read as starting </w:t>
+      </w:r>
+      <w:r>
+        <w:rPr>
+          <w:b/>
+        </w:rPr>
+        <w:t>1116</w:t>
+      </w:r>
+      <w:r>
+        <w:t xml:space="preserve">. </w:t>
+      </w:r>
+      <w:r>
+        <w:rPr>
+          <w:b/>
+        </w:rPr>
+        <w:t>Withdrawn in pass 84</w:t>
+      </w:r>
+      <w:r>
+        <w:t xml:space="preserve"> (</w:t>
+      </w:r>
+      <w:r>
+        <w:rPr>
+          <w:b/>
+        </w:rPr>
+        <w:t>C718 C719 C721 C728</w:t>
+      </w:r>
+      <w:r>
+        <w:t xml:space="preserve">). IA [`14thcensusofpopu559unit`](https://archive.org/details/14thcensusofpopu559unit). *Image seen.* </w:t>
+      </w:r>
+      <w:r>
+        <w:rPr>
+          <w:b/>
+        </w:rPr>
+        <w:t>S468</w:t>
+      </w:r>
+      <w:r>
+        <w:t xml:space="preserve"> </w:t>
+      </w:r>
+      <w:r>
+        <w:rPr>
+          <w:b/>
+        </w:rPr>
+        <w:t>S469</w:t>
+      </w:r>
+      <w:r>
+        <w:t>.</w:t>
+      </w:r>
+    </w:p>
+    <w:p>
+      <w:r>
+        <w:t xml:space="preserve">111. FS seven IDs </w:t>
+      </w:r>
+      <w:r>
+        <w:rPr>
+          <w:b/>
+        </w:rPr>
+        <w:t>403</w:t>
+      </w:r>
+      <w:r>
+        <w:t xml:space="preserve"> (R011-31). KYGenWeb Breathitt 1920 births </w:t>
+      </w:r>
+      <w:r>
+        <w:rPr>
+          <w:b/>
+        </w:rPr>
+        <w:t>NEWMAN/NEWNAM 0</w:t>
+      </w:r>
+      <w:r>
+        <w:t xml:space="preserve">. Combs Breathitt 1920 </w:t>
+      </w:r>
+      <w:r>
+        <w:rPr>
+          <w:b/>
+        </w:rPr>
+        <w:t>nil</w:t>
+      </w:r>
+      <w:r>
+        <w:t xml:space="preserve"> Newman. USGW 1920 dir </w:t>
+      </w:r>
+      <w:r>
+        <w:rPr>
+          <w:b/>
+        </w:rPr>
+        <w:t>timeout</w:t>
+      </w:r>
+      <w:r>
+        <w:t xml:space="preserve">. </w:t>
+      </w:r>
+      <w:r>
+        <w:rPr>
+          <w:b/>
+        </w:rPr>
+        <w:t>C724–C727</w:t>
+      </w:r>
+      <w:r>
+        <w:t xml:space="preserve"> </w:t>
+      </w:r>
+      <w:r>
+        <w:rPr>
+          <w:b/>
+        </w:rPr>
+        <w:t>S470–S473</w:t>
+      </w:r>
+      <w:r>
+        <w:t>.</w:t>
+      </w:r>
+    </w:p>
+    <w:p>
+      <w:r>
+        <w:t xml:space="preserve">112. Wayback USGW Breathitt 1920 EDs </w:t>
+      </w:r>
+      <w:r>
+        <w:rPr>
+          <w:b/>
+        </w:rPr>
+        <w:t>45–50</w:t>
+      </w:r>
+      <w:r>
+        <w:t xml:space="preserve"> (25 TXT): </w:t>
+      </w:r>
+      <w:r>
+        <w:rPr>
+          <w:b/>
+        </w:rPr>
+        <w:t>nil</w:t>
+      </w:r>
+      <w:r>
+        <w:t xml:space="preserve"> Newman head. [2008-06-16 snapshot](https://web.archive.org/web/20080616082000/http://files.usgwarchives.net/ky/breathitt/census/1920/). *Transcription only.* </w:t>
+      </w:r>
+      <w:r>
+        <w:rPr>
+          <w:b/>
+        </w:rPr>
+        <w:t>C731</w:t>
+      </w:r>
+      <w:r>
+        <w:t xml:space="preserve"> </w:t>
+      </w:r>
+      <w:r>
+        <w:rPr>
+          <w:b/>
+        </w:rPr>
+        <w:t>S474</w:t>
+      </w:r>
+      <w:r>
+        <w:t>.</w:t>
+      </w:r>
+    </w:p>
+    <w:p>
+      <w:r>
+        <w:t xml:space="preserve">113. T625-559 leaf </w:t>
+      </w:r>
+      <w:r>
+        <w:rPr>
+          <w:b/>
+        </w:rPr>
+        <w:t>0844</w:t>
+      </w:r>
+      <w:r>
+        <w:t xml:space="preserve"> = Breathitt ED </w:t>
+      </w:r>
+      <w:r>
+        <w:rPr>
+          <w:b/>
+        </w:rPr>
+        <w:t>42</w:t>
+      </w:r>
+      <w:r>
+        <w:t xml:space="preserve"> sh </w:t>
+      </w:r>
+      <w:r>
+        <w:rPr>
+          <w:b/>
+        </w:rPr>
+        <w:t>19A</w:t>
+      </w:r>
+      <w:r>
+        <w:t xml:space="preserve">; ln </w:t>
+      </w:r>
+      <w:r>
+        <w:rPr>
+          <w:b/>
+        </w:rPr>
+        <w:t>17</w:t>
+      </w:r>
+      <w:r>
+        <w:t xml:space="preserve"> not John+Jennie. IA [`14thcensusofpopu559unit`](https://archive.org/details/14thcensusofpopu559unit). *Image seen.* </w:t>
+      </w:r>
+      <w:r>
+        <w:rPr>
+          <w:b/>
+        </w:rPr>
+        <w:t>C734 C735</w:t>
+      </w:r>
+      <w:r>
+        <w:t xml:space="preserve"> </w:t>
+      </w:r>
+      <w:r>
+        <w:rPr>
+          <w:b/>
+        </w:rPr>
+        <w:t>S475</w:t>
+      </w:r>
+      <w:r>
+        <w:t>.</w:t>
+      </w:r>
+    </w:p>
+    <w:p>
+      <w:r>
+        <w:t xml:space="preserve">114. 15 Apr 1910 Lee ED </w:t>
+      </w:r>
+      <w:r>
+        <w:rPr>
+          <w:b/>
+        </w:rPr>
+        <w:t>98</w:t>
+      </w:r>
+      <w:r>
+        <w:t xml:space="preserve"> sh </w:t>
+      </w:r>
+      <w:r>
+        <w:rPr>
+          <w:b/>
+        </w:rPr>
+        <w:t>6A</w:t>
+      </w:r>
+      <w:r>
+        <w:t xml:space="preserve"> leaf </w:t>
+      </w:r>
+      <w:r>
+        <w:rPr>
+          <w:b/>
+        </w:rPr>
+        <w:t>0532</w:t>
+      </w:r>
+      <w:r>
+        <w:t xml:space="preserve">: </w:t>
+      </w:r>
+      <w:r>
+        <w:rPr>
+          <w:b/>
+        </w:rPr>
+        <w:t>Edney, Sam</w:t>
+      </w:r>
+      <w:r>
+        <w:t xml:space="preserve"> 32 + Emma 31 + Della; </w:t>
+      </w:r>
+      <w:r>
+        <w:rPr>
+          <w:b/>
+        </w:rPr>
+        <w:t>Newman, Rissie</w:t>
+      </w:r>
+      <w:r>
+        <w:t xml:space="preserve">, servant, 15. Same sheet </w:t>
+      </w:r>
+      <w:r>
+        <w:rPr>
+          <w:b/>
+        </w:rPr>
+        <w:t>Newman, William</w:t>
+      </w:r>
+      <w:r>
+        <w:t xml:space="preserve"> 44 + Floyd son 6 </w:t>
+      </w:r>
+      <w:r>
+        <w:rPr>
+          <w:b/>
+        </w:rPr>
+        <w:t>rejected</w:t>
+      </w:r>
+      <w:r>
+        <w:t xml:space="preserve"> vs 1902 groom. IA [`13thcensus1910po478unit`](https://archive.org/details/13thcensus1910po478unit). *Image seen.* </w:t>
+      </w:r>
+      <w:r>
+        <w:rPr>
+          <w:b/>
+        </w:rPr>
+        <w:t>C738 C760 C761</w:t>
+      </w:r>
+      <w:r>
+        <w:t xml:space="preserve"> </w:t>
+      </w:r>
+      <w:r>
+        <w:rPr>
+          <w:b/>
+        </w:rPr>
+        <w:t>S477</w:t>
+      </w:r>
+      <w:r>
+        <w:t xml:space="preserve"> </w:t>
+      </w:r>
+      <w:r>
+        <w:rPr>
+          <w:b/>
+        </w:rPr>
+        <w:t>S489</w:t>
+      </w:r>
+      <w:r>
+        <w:t>.</w:t>
+      </w:r>
+    </w:p>
+    <w:p>
+      <w:r>
+        <w:t>115. T625-559 Breathitt film map (pass 83): Bell ends ~</w:t>
+      </w:r>
+      <w:r>
+        <w:rPr>
+          <w:b/>
+        </w:rPr>
+        <w:t>0788</w:t>
+      </w:r>
+      <w:r>
+        <w:t xml:space="preserve">; ED </w:t>
+      </w:r>
+      <w:r>
+        <w:rPr>
+          <w:b/>
+        </w:rPr>
+        <w:t>41</w:t>
+      </w:r>
+      <w:r>
+        <w:t xml:space="preserve"> starts ~</w:t>
+      </w:r>
+      <w:r>
+        <w:rPr>
+          <w:b/>
+        </w:rPr>
+        <w:t>0789</w:t>
+      </w:r>
+      <w:r>
+        <w:t xml:space="preserve">; ED </w:t>
+      </w:r>
+      <w:r>
+        <w:rPr>
+          <w:b/>
+        </w:rPr>
+        <w:t>52</w:t>
+      </w:r>
+      <w:r>
+        <w:t xml:space="preserve"> Quicksand block max ~sh </w:t>
+      </w:r>
+      <w:r>
+        <w:rPr>
+          <w:b/>
+        </w:rPr>
+        <w:t>11</w:t>
+      </w:r>
+      <w:r>
+        <w:t xml:space="preserve">; ED </w:t>
+      </w:r>
+      <w:r>
+        <w:rPr>
+          <w:b/>
+        </w:rPr>
+        <w:t>56/57</w:t>
+      </w:r>
+      <w:r>
+        <w:t xml:space="preserve"> no sh 19. *Image seen.* </w:t>
+      </w:r>
+      <w:r>
+        <w:rPr>
+          <w:b/>
+        </w:rPr>
+        <w:t>C751–C757</w:t>
+      </w:r>
+      <w:r>
+        <w:t xml:space="preserve"> </w:t>
+      </w:r>
+      <w:r>
+        <w:rPr>
+          <w:b/>
+        </w:rPr>
+        <w:t>S484</w:t>
+      </w:r>
+      <w:r>
+        <w:t>.</w:t>
+      </w:r>
+    </w:p>
+    <w:p>
+      <w:r>
+        <w:t xml:space="preserve">116. </w:t>
+      </w:r>
+      <w:r>
+        <w:rPr>
+          <w:b/>
+        </w:rPr>
+        <w:t>7 Feb 1920</w:t>
+      </w:r>
+      <w:r>
+        <w:t xml:space="preserve"> Breathitt ED </w:t>
+      </w:r>
+      <w:r>
+        <w:rPr>
+          <w:b/>
+        </w:rPr>
+        <w:t>52</w:t>
+      </w:r>
+      <w:r>
+        <w:t xml:space="preserve">, George's Branch Precinct 3, sh </w:t>
+      </w:r>
+      <w:r>
+        <w:rPr>
+          <w:b/>
+        </w:rPr>
+        <w:t>19 A</w:t>
+      </w:r>
+      <w:r>
+        <w:t xml:space="preserve"> ln </w:t>
+      </w:r>
+      <w:r>
+        <w:rPr>
+          <w:b/>
+        </w:rPr>
+        <w:t>17</w:t>
+      </w:r>
+      <w:r>
+        <w:t xml:space="preserve"> leaf </w:t>
+      </w:r>
+      <w:r>
+        <w:rPr>
+          <w:b/>
+        </w:rPr>
+        <w:t>1060</w:t>
+      </w:r>
+      <w:r>
+        <w:t xml:space="preserve">: </w:t>
+      </w:r>
+      <w:r>
+        <w:rPr>
+          <w:b/>
+        </w:rPr>
+        <w:t>Newman, John</w:t>
+      </w:r>
+      <w:r>
+        <w:t xml:space="preserve"> 38 + </w:t>
+      </w:r>
+      <w:r>
+        <w:rPr>
+          <w:b/>
+        </w:rPr>
+        <w:t>Jennie</w:t>
+      </w:r>
+      <w:r>
+        <w:t xml:space="preserve"> 21 + Virgil 3 + Fred[i?] 1 + Henry father 52 + Julie mother 42. IA [`14thcensusofpopu559unit`](https://archive.org/details/14thcensusofpopu559unit). *Image seen.* Matches Soundex </w:t>
+      </w:r>
+      <w:r>
+        <w:rPr>
+          <w:b/>
+        </w:rPr>
+        <w:t>C717</w:t>
+      </w:r>
+      <w:r>
+        <w:t xml:space="preserve">. </w:t>
+      </w:r>
+      <w:r>
+        <w:rPr>
+          <w:b/>
+        </w:rPr>
+        <w:t>Rejected</w:t>
+      </w:r>
+      <w:r>
+        <w:t xml:space="preserve"> vs John L. </w:t>
+      </w:r>
+      <w:r>
+        <w:rPr>
+          <w:b/>
+        </w:rPr>
+        <w:t>C772–C775</w:t>
+      </w:r>
+      <w:r>
+        <w:t xml:space="preserve"> </w:t>
+      </w:r>
+      <w:r>
+        <w:rPr>
+          <w:b/>
+        </w:rPr>
+        <w:t>S491–S493</w:t>
+      </w:r>
+      <w:r>
+        <w:t>.</w:t>
+      </w:r>
+    </w:p>
+    <w:p>
+      <w:r>
+        <w:t xml:space="preserve">117. Same ED </w:t>
+      </w:r>
+      <w:r>
+        <w:rPr>
+          <w:b/>
+        </w:rPr>
+        <w:t>52</w:t>
+      </w:r>
+      <w:r>
+        <w:t xml:space="preserve"> (A. W. Noble): </w:t>
+      </w:r>
+      <w:r>
+        <w:rPr>
+          <w:b/>
+        </w:rPr>
+        <w:t>1030</w:t>
+      </w:r>
+      <w:r>
+        <w:t xml:space="preserve"> = sh </w:t>
+      </w:r>
+      <w:r>
+        <w:rPr>
+          <w:b/>
+        </w:rPr>
+        <w:t>4</w:t>
+      </w:r>
+      <w:r>
+        <w:t xml:space="preserve">; </w:t>
+      </w:r>
+      <w:r>
+        <w:rPr>
+          <w:b/>
+        </w:rPr>
+        <w:t>1048</w:t>
+      </w:r>
+      <w:r>
+        <w:t xml:space="preserve"> = sh </w:t>
+      </w:r>
+      <w:r>
+        <w:rPr>
+          <w:b/>
+        </w:rPr>
+        <w:t>13</w:t>
+      </w:r>
+      <w:r>
+        <w:t xml:space="preserve">; </w:t>
+      </w:r>
+      <w:r>
+        <w:rPr>
+          <w:b/>
+        </w:rPr>
+        <w:t>1060</w:t>
+      </w:r>
+      <w:r>
+        <w:t xml:space="preserve"> = sh </w:t>
+      </w:r>
+      <w:r>
+        <w:rPr>
+          <w:b/>
+        </w:rPr>
+        <w:t>19 A</w:t>
+      </w:r>
+      <w:r>
+        <w:t xml:space="preserve">. </w:t>
+      </w:r>
+      <w:r>
+        <w:rPr>
+          <w:b/>
+        </w:rPr>
+        <w:t>C721 withdrawn</w:t>
+      </w:r>
+      <w:r>
+        <w:t xml:space="preserve">. Leaf </w:t>
+      </w:r>
+      <w:r>
+        <w:rPr>
+          <w:b/>
+        </w:rPr>
+        <w:t>1110</w:t>
+      </w:r>
+      <w:r>
         <w:t xml:space="preserve"> = ED </w:t>
       </w:r>
       <w:r>
         <w:rPr>
           <w:b/>
         </w:rPr>
-        <w:t>23</w:t>
+        <w:t>53</w:t>
+      </w:r>
+      <w:r>
+        <w:t xml:space="preserve"> Precinct 11 (</w:t>
+      </w:r>
+      <w:r>
+        <w:rPr>
+          <w:b/>
+        </w:rPr>
+        <w:t>C718 withdrawn</w:t>
+      </w:r>
+      <w:r>
+        <w:t xml:space="preserve">). Leaf </w:t>
+      </w:r>
+      <w:r>
+        <w:rPr>
+          <w:b/>
+        </w:rPr>
+        <w:t>1116</w:t>
+      </w:r>
+      <w:r>
+        <w:t xml:space="preserve"> is </w:t>
+      </w:r>
+      <w:r>
+        <w:rPr>
+          <w:b/>
+        </w:rPr>
+        <w:t>not</w:t>
+      </w:r>
+      <w:r>
+        <w:t xml:space="preserve"> this ED 52 start (</w:t>
+      </w:r>
+      <w:r>
+        <w:rPr>
+          <w:b/>
+        </w:rPr>
+        <w:t>C719 withdrawn</w:t>
+      </w:r>
+      <w:r>
+        <w:t xml:space="preserve">). *Image seen.* </w:t>
+      </w:r>
+      <w:r>
+        <w:rPr>
+          <w:b/>
+        </w:rPr>
+        <w:t>C776–C780</w:t>
+      </w:r>
+      <w:r>
+        <w:t xml:space="preserve"> </w:t>
+      </w:r>
+      <w:r>
+        <w:rPr>
+          <w:b/>
+        </w:rPr>
+        <w:t>S494–S498</w:t>
+      </w:r>
+      <w:r>
+        <w:t>.</w:t>
+      </w:r>
+    </w:p>
+    <w:p>
+      <w:r>
+        <w:t xml:space="preserve">118. ED </w:t>
+      </w:r>
+      <w:r>
+        <w:rPr>
+          <w:b/>
+        </w:rPr>
+        <w:t>43</w:t>
+      </w:r>
+      <w:r>
+        <w:t xml:space="preserve"> Precinct 4 sh </w:t>
+      </w:r>
+      <w:r>
+        <w:rPr>
+          <w:b/>
+        </w:rPr>
+        <w:t>2 A–7 A</w:t>
+      </w:r>
+      <w:r>
+        <w:t xml:space="preserve">; ED </w:t>
+      </w:r>
+      <w:r>
+        <w:rPr>
+          <w:b/>
+        </w:rPr>
+        <w:t>51</w:t>
+      </w:r>
+      <w:r>
+        <w:t xml:space="preserve"> Frozen Creek sh </w:t>
+      </w:r>
+      <w:r>
+        <w:rPr>
+          <w:b/>
+        </w:rPr>
+        <w:t>6 A</w:t>
+      </w:r>
+      <w:r>
+        <w:t xml:space="preserve">. Powell Clay City ED </w:t>
+      </w:r>
+      <w:r>
+        <w:rPr>
+          <w:b/>
+        </w:rPr>
+        <w:t>143</w:t>
       </w:r>
       <w:r>
         <w:t xml:space="preserve"> sh </w:t>
@@ -11899,10 +13443,395 @@
         <w:rPr>
           <w:b/>
         </w:rPr>
-        <w:t>13A</w:t>
-      </w:r>
-      <w:r>
-        <w:t xml:space="preserve">; ED </w:t>
+        <w:t>1 B</w:t>
+      </w:r>
+      <w:r>
+        <w:t xml:space="preserve"> and Southfork ED </w:t>
+      </w:r>
+      <w:r>
+        <w:rPr>
+          <w:b/>
+        </w:rPr>
+        <w:t>145</w:t>
+      </w:r>
+      <w:r>
+        <w:t xml:space="preserve"> sh </w:t>
+      </w:r>
+      <w:r>
+        <w:rPr>
+          <w:b/>
+        </w:rPr>
+        <w:t>9 B</w:t>
+      </w:r>
+      <w:r>
+        <w:t xml:space="preserve"> </w:t>
+      </w:r>
+      <w:r>
+        <w:rPr>
+          <w:b/>
+        </w:rPr>
+        <w:t>nil</w:t>
+      </w:r>
+      <w:r>
+        <w:t xml:space="preserve"> Newman. Wolfe </w:t>
+      </w:r>
+      <w:r>
+        <w:rPr>
+          <w:b/>
+        </w:rPr>
+        <w:t>0374</w:t>
+      </w:r>
+      <w:r>
+        <w:t xml:space="preserve"> nil isolated. *Image seen.* </w:t>
+      </w:r>
+      <w:r>
+        <w:rPr>
+          <w:b/>
+        </w:rPr>
+        <w:t>C778 C779 C786–C788</w:t>
+      </w:r>
+      <w:r>
+        <w:t xml:space="preserve"> </w:t>
+      </w:r>
+      <w:r>
+        <w:rPr>
+          <w:b/>
+        </w:rPr>
+        <w:t>S496 S497 S501 S502</w:t>
+      </w:r>
+      <w:r>
+        <w:t>.</w:t>
+      </w:r>
+    </w:p>
+    <w:p>
+      <w:r>
+        <w:t xml:space="preserve">119. FS seven IDs </w:t>
+      </w:r>
+      <w:r>
+        <w:rPr>
+          <w:b/>
+        </w:rPr>
+        <w:t>403</w:t>
+      </w:r>
+      <w:r>
+        <w:t xml:space="preserve"> (R011-34). Book 6 register + certs </w:t>
+      </w:r>
+      <w:r>
+        <w:rPr>
+          <w:b/>
+        </w:rPr>
+        <w:t>28501 / 31780</w:t>
+      </w:r>
+      <w:r>
+        <w:t xml:space="preserve"> unread. Courier 1942 names victim, not shooter. </w:t>
+      </w:r>
+      <w:r>
+        <w:rPr>
+          <w:b/>
+        </w:rPr>
+        <w:t>C781 C784 C785</w:t>
+      </w:r>
+      <w:r>
+        <w:t xml:space="preserve"> </w:t>
+      </w:r>
+      <w:r>
+        <w:rPr>
+          <w:b/>
+        </w:rPr>
+        <w:t>S499</w:t>
+      </w:r>
+      <w:r>
+        <w:t>.</w:t>
+      </w:r>
+    </w:p>
+    <w:p>
+      <w:r>
+        <w:t xml:space="preserve">120. T625-559 leaf </w:t>
+      </w:r>
+      <w:r>
+        <w:rPr>
+          <w:b/>
+        </w:rPr>
+        <w:t>1116</w:t>
+      </w:r>
+      <w:r>
+        <w:t xml:space="preserve"> w1600: Breathitt ED </w:t>
+      </w:r>
+      <w:r>
+        <w:rPr>
+          <w:b/>
+        </w:rPr>
+        <w:t>55</w:t>
+      </w:r>
+      <w:r>
+        <w:t xml:space="preserve"> sh </w:t>
+      </w:r>
+      <w:r>
+        <w:rPr>
+          <w:b/>
+        </w:rPr>
+        <w:t>1 A</w:t>
+      </w:r>
+      <w:r>
+        <w:t xml:space="preserve">, SD </w:t>
+      </w:r>
+      <w:r>
+        <w:rPr>
+          <w:b/>
+        </w:rPr>
+        <w:t>11</w:t>
+      </w:r>
+      <w:r>
+        <w:t xml:space="preserve">, stamp </w:t>
+      </w:r>
+      <w:r>
+        <w:rPr>
+          <w:b/>
+        </w:rPr>
+        <w:t>2552</w:t>
+      </w:r>
+      <w:r>
+        <w:t xml:space="preserve">. Precinct </w:t>
+      </w:r>
+      <w:r>
+        <w:rPr>
+          <w:b/>
+        </w:rPr>
+        <w:t>1[2/6]</w:t>
+      </w:r>
+      <w:r>
+        <w:t xml:space="preserve"> Mag. IA [`14thcensusofpopu559unit`](https://archive.org/details/14thcensusofpopu559unit). *Image seen.* </w:t>
+      </w:r>
+      <w:r>
+        <w:rPr>
+          <w:b/>
+        </w:rPr>
+        <w:t>C791 C792</w:t>
+      </w:r>
+      <w:r>
+        <w:t xml:space="preserve"> </w:t>
+      </w:r>
+      <w:r>
+        <w:rPr>
+          <w:b/>
+        </w:rPr>
+        <w:t>S505 S506</w:t>
+      </w:r>
+      <w:r>
+        <w:t>.</w:t>
+      </w:r>
+    </w:p>
+    <w:p>
+      <w:r>
+        <w:t xml:space="preserve">121. Same ED </w:t>
+      </w:r>
+      <w:r>
+        <w:rPr>
+          <w:b/>
+        </w:rPr>
+        <w:t>55</w:t>
+      </w:r>
+      <w:r>
+        <w:t xml:space="preserve">: </w:t>
+      </w:r>
+      <w:r>
+        <w:rPr>
+          <w:b/>
+        </w:rPr>
+        <w:t>1118</w:t>
+      </w:r>
+      <w:r>
+        <w:t xml:space="preserve"> = sh </w:t>
+      </w:r>
+      <w:r>
+        <w:rPr>
+          <w:b/>
+        </w:rPr>
+        <w:t>2 A</w:t>
+      </w:r>
+      <w:r>
+        <w:t xml:space="preserve">; </w:t>
+      </w:r>
+      <w:r>
+        <w:rPr>
+          <w:b/>
+        </w:rPr>
+        <w:t>1120</w:t>
+      </w:r>
+      <w:r>
+        <w:t xml:space="preserve"> = sh </w:t>
+      </w:r>
+      <w:r>
+        <w:rPr>
+          <w:b/>
+        </w:rPr>
+        <w:t>3 A</w:t>
+      </w:r>
+      <w:r>
+        <w:t xml:space="preserve">; </w:t>
+      </w:r>
+      <w:r>
+        <w:rPr>
+          <w:b/>
+        </w:rPr>
+        <w:t>1136</w:t>
+      </w:r>
+      <w:r>
+        <w:t xml:space="preserve"> = sh </w:t>
+      </w:r>
+      <w:r>
+        <w:rPr>
+          <w:b/>
+        </w:rPr>
+        <w:t>11</w:t>
+      </w:r>
+      <w:r>
+        <w:t xml:space="preserve">. </w:t>
+      </w:r>
+      <w:r>
+        <w:rPr>
+          <w:b/>
+        </w:rPr>
+        <w:t>C754 withdrawn</w:t>
+      </w:r>
+      <w:r>
+        <w:t xml:space="preserve">. *Image seen.* </w:t>
+      </w:r>
+      <w:r>
+        <w:rPr>
+          <w:b/>
+        </w:rPr>
+        <w:t>C793 C794</w:t>
+      </w:r>
+      <w:r>
+        <w:t>.</w:t>
+      </w:r>
+    </w:p>
+    <w:p>
+      <w:r>
+        <w:t xml:space="preserve">122. Leaf </w:t>
+      </w:r>
+      <w:r>
+        <w:rPr>
+          <w:b/>
+        </w:rPr>
+        <w:t>0788</w:t>
+      </w:r>
+      <w:r>
+        <w:t xml:space="preserve"> w1600 = Bell ED </w:t>
+      </w:r>
+      <w:r>
+        <w:rPr>
+          <w:b/>
+        </w:rPr>
+        <w:t>20</w:t>
+      </w:r>
+      <w:r>
+        <w:t xml:space="preserve"> sh </w:t>
+      </w:r>
+      <w:r>
+        <w:rPr>
+          <w:b/>
+        </w:rPr>
+        <w:t>16</w:t>
+      </w:r>
+      <w:r>
+        <w:t xml:space="preserve">; </w:t>
+      </w:r>
+      <w:r>
+        <w:rPr>
+          <w:b/>
+        </w:rPr>
+        <w:t>0789/0790</w:t>
+      </w:r>
+      <w:r>
+        <w:t xml:space="preserve"> = Breathitt ED </w:t>
+      </w:r>
+      <w:r>
+        <w:rPr>
+          <w:b/>
+        </w:rPr>
+        <w:t>41</w:t>
+      </w:r>
+      <w:r>
+        <w:t xml:space="preserve"> sh </w:t>
+      </w:r>
+      <w:r>
+        <w:rPr>
+          <w:b/>
+        </w:rPr>
+        <w:t>1 A/1 B</w:t>
+      </w:r>
+      <w:r>
+        <w:t xml:space="preserve">. EDs </w:t>
+      </w:r>
+      <w:r>
+        <w:rPr>
+          <w:b/>
+        </w:rPr>
+        <w:t>39–40</w:t>
+      </w:r>
+      <w:r>
+        <w:t xml:space="preserve"> not at the junction. *Image seen.* </w:t>
+      </w:r>
+      <w:r>
+        <w:rPr>
+          <w:b/>
+        </w:rPr>
+        <w:t>C795 C796 C811</w:t>
+      </w:r>
+      <w:r>
+        <w:t xml:space="preserve"> </w:t>
+      </w:r>
+      <w:r>
+        <w:rPr>
+          <w:b/>
+        </w:rPr>
+        <w:t>S507</w:t>
+      </w:r>
+      <w:r>
+        <w:t>.</w:t>
+      </w:r>
+    </w:p>
+    <w:p>
+      <w:r>
+        <w:t xml:space="preserve">123. Leaf </w:t>
+      </w:r>
+      <w:r>
+        <w:rPr>
+          <w:b/>
+        </w:rPr>
+        <w:t>1010</w:t>
+      </w:r>
+      <w:r>
+        <w:t xml:space="preserve"> = ED </w:t>
+      </w:r>
+      <w:r>
+        <w:rPr>
+          <w:b/>
+        </w:rPr>
+        <w:t>51</w:t>
+      </w:r>
+      <w:r>
+        <w:t xml:space="preserve"> Frozen Creek sh </w:t>
+      </w:r>
+      <w:r>
+        <w:rPr>
+          <w:b/>
+        </w:rPr>
+        <w:t>1 A</w:t>
+      </w:r>
+      <w:r>
+        <w:t xml:space="preserve">. Leaf </w:t>
+      </w:r>
+      <w:r>
+        <w:rPr>
+          <w:b/>
+        </w:rPr>
+        <w:t>1064</w:t>
+      </w:r>
+      <w:r>
+        <w:t xml:space="preserve"> = ED </w:t>
       </w:r>
       <w:r>
         <w:rPr>
@@ -11911,31 +13840,258 @@
         <w:t>52</w:t>
       </w:r>
       <w:r>
-        <w:t xml:space="preserve"> starts </w:t>
-      </w:r>
-      <w:r>
-        <w:rPr>
-          <w:b/>
-        </w:rPr>
-        <w:t>1116</w:t>
-      </w:r>
-      <w:r>
         <w:t xml:space="preserve"> sh </w:t>
       </w:r>
       <w:r>
         <w:rPr>
           <w:b/>
         </w:rPr>
-        <w:t>1A</w:t>
-      </w:r>
-      <w:r>
-        <w:t xml:space="preserve">; leaf </w:t>
-      </w:r>
-      <w:r>
-        <w:rPr>
-          <w:b/>
-        </w:rPr>
-        <w:t>1128</w:t>
+        <w:t>21 A</w:t>
+      </w:r>
+      <w:r>
+        <w:t xml:space="preserve">. *Image seen.* </w:t>
+      </w:r>
+      <w:r>
+        <w:rPr>
+          <w:b/>
+        </w:rPr>
+        <w:t>C797 C799</w:t>
+      </w:r>
+      <w:r>
+        <w:t xml:space="preserve"> </w:t>
+      </w:r>
+      <w:r>
+        <w:rPr>
+          <w:b/>
+        </w:rPr>
+        <w:t>S508 S509</w:t>
+      </w:r>
+      <w:r>
+        <w:t>.</w:t>
+      </w:r>
+    </w:p>
+    <w:p>
+      <w:r>
+        <w:t xml:space="preserve">124. Powell leaf </w:t>
+      </w:r>
+      <w:r>
+        <w:rPr>
+          <w:b/>
+        </w:rPr>
+        <w:t>1100</w:t>
+      </w:r>
+      <w:r>
+        <w:t xml:space="preserve"> = Clay City ED </w:t>
+      </w:r>
+      <w:r>
+        <w:rPr>
+          <w:b/>
+        </w:rPr>
+        <w:t>143</w:t>
+      </w:r>
+      <w:r>
+        <w:t xml:space="preserve"> sh </w:t>
+      </w:r>
+      <w:r>
+        <w:rPr>
+          <w:b/>
+        </w:rPr>
+        <w:t>11 B</w:t>
+      </w:r>
+      <w:r>
+        <w:t xml:space="preserve"> (</w:t>
+      </w:r>
+      <w:r>
+        <w:rPr>
+          <w:b/>
+        </w:rPr>
+        <w:t>C657 withdrawn</w:t>
+      </w:r>
+      <w:r>
+        <w:t xml:space="preserve">). Leaf </w:t>
+      </w:r>
+      <w:r>
+        <w:rPr>
+          <w:b/>
+        </w:rPr>
+        <w:t>1170</w:t>
+      </w:r>
+      <w:r>
+        <w:t xml:space="preserve"> = ED </w:t>
+      </w:r>
+      <w:r>
+        <w:rPr>
+          <w:b/>
+        </w:rPr>
+        <w:t>146</w:t>
+      </w:r>
+      <w:r>
+        <w:t xml:space="preserve"> sh </w:t>
+      </w:r>
+      <w:r>
+        <w:rPr>
+          <w:b/>
+        </w:rPr>
+        <w:t>1 B</w:t>
+      </w:r>
+      <w:r>
+        <w:t xml:space="preserve"> Southfork. Name cols </w:t>
+      </w:r>
+      <w:r>
+        <w:rPr>
+          <w:b/>
+        </w:rPr>
+        <w:t>nil</w:t>
+      </w:r>
+      <w:r>
+        <w:t xml:space="preserve"> Newman isolated. IA [`14thcensusofpopu596unit`](https://archive.org/details/14thcensusofpopu596unit). *Image seen.* </w:t>
+      </w:r>
+      <w:r>
+        <w:rPr>
+          <w:b/>
+        </w:rPr>
+        <w:t>C801–C805</w:t>
+      </w:r>
+      <w:r>
+        <w:t xml:space="preserve"> </w:t>
+      </w:r>
+      <w:r>
+        <w:rPr>
+          <w:b/>
+        </w:rPr>
+        <w:t>S510 S511</w:t>
+      </w:r>
+      <w:r>
+        <w:t>.</w:t>
+      </w:r>
+    </w:p>
+    <w:p>
+      <w:r>
+        <w:t xml:space="preserve">125. FS seven IDs </w:t>
+      </w:r>
+      <w:r>
+        <w:rPr>
+          <w:b/>
+        </w:rPr>
+        <w:t>403</w:t>
+      </w:r>
+      <w:r>
+        <w:t xml:space="preserve"> (R011-35). Book 6 compiled [re-seen](https://usgennet.org/usa/ky/county/lee/marriage/marrbook6.html). Certs </w:t>
+      </w:r>
+      <w:r>
+        <w:rPr>
+          <w:b/>
+        </w:rPr>
+        <w:t>28501 / 31780</w:t>
+      </w:r>
+      <w:r>
+        <w:t xml:space="preserve"> unread. </w:t>
+      </w:r>
+      <w:r>
+        <w:rPr>
+          <w:b/>
+        </w:rPr>
+        <w:t>C807 C809 C810</w:t>
+      </w:r>
+      <w:r>
+        <w:t xml:space="preserve"> </w:t>
+      </w:r>
+      <w:r>
+        <w:rPr>
+          <w:b/>
+        </w:rPr>
+        <w:t>S513–S515</w:t>
+      </w:r>
+      <w:r>
+        <w:t>.</w:t>
+      </w:r>
+    </w:p>
+    <w:p>
+      <w:r>
+        <w:t xml:space="preserve">126. T625-559 leaf </w:t>
+      </w:r>
+      <w:r>
+        <w:rPr>
+          <w:b/>
+        </w:rPr>
+        <w:t>0734</w:t>
+      </w:r>
+      <w:r>
+        <w:t xml:space="preserve"> county card: Breathitt EDs </w:t>
+      </w:r>
+      <w:r>
+        <w:rPr>
+          <w:b/>
+        </w:rPr>
+        <w:t>39 to 57 (pt)</w:t>
+      </w:r>
+      <w:r>
+        <w:t xml:space="preserve">. IA [`14thcensusofpopu559unit`](https://archive.org/details/14thcensusofpopu559unit). *Image seen.* </w:t>
+      </w:r>
+      <w:r>
+        <w:rPr>
+          <w:b/>
+        </w:rPr>
+        <w:t>C815</w:t>
+      </w:r>
+      <w:r>
+        <w:t xml:space="preserve"> </w:t>
+      </w:r>
+      <w:r>
+        <w:rPr>
+          <w:b/>
+        </w:rPr>
+        <w:t>S519</w:t>
+      </w:r>
+      <w:r>
+        <w:t>.</w:t>
+      </w:r>
+    </w:p>
+    <w:p>
+      <w:r>
+        <w:t xml:space="preserve">127. Leaves </w:t>
+      </w:r>
+      <w:r>
+        <w:rPr>
+          <w:b/>
+        </w:rPr>
+        <w:t>0732 / 0735</w:t>
+      </w:r>
+      <w:r>
+        <w:t xml:space="preserve"> = Breathitt ED </w:t>
+      </w:r>
+      <w:r>
+        <w:rPr>
+          <w:b/>
+        </w:rPr>
+        <w:t>39</w:t>
+      </w:r>
+      <w:r>
+        <w:t xml:space="preserve"> Jackson Precinct </w:t>
+      </w:r>
+      <w:r>
+        <w:rPr>
+          <w:b/>
+        </w:rPr>
+        <w:t>#1</w:t>
+      </w:r>
+      <w:r>
+        <w:t xml:space="preserve"> sh </w:t>
+      </w:r>
+      <w:r>
+        <w:rPr>
+          <w:b/>
+        </w:rPr>
+        <w:t>1 A</w:t>
+      </w:r>
+      <w:r>
+        <w:t xml:space="preserve">, 2 Jan, Herschel L. Bach. </w:t>
+      </w:r>
+      <w:r>
+        <w:rPr>
+          <w:b/>
+        </w:rPr>
+        <w:t>0768</w:t>
       </w:r>
       <w:r>
         <w:t xml:space="preserve"> = sh </w:t>
@@ -11944,34 +14100,75 @@
         <w:rPr>
           <w:b/>
         </w:rPr>
-        <w:t>7A</w:t>
-      </w:r>
-      <w:r>
-        <w:t xml:space="preserve"> not 19A; ED </w:t>
-      </w:r>
-      <w:r>
-        <w:rPr>
-          <w:b/>
-        </w:rPr>
-        <w:t>52</w:t>
-      </w:r>
-      <w:r>
-        <w:t xml:space="preserve"> has </w:t>
-      </w:r>
-      <w:r>
-        <w:rPr>
-          <w:b/>
-        </w:rPr>
-        <w:t>no sheet 19</w:t>
-      </w:r>
-      <w:r>
-        <w:t xml:space="preserve">. IA [`14thcensusofpopu559unit`](https://archive.org/details/14thcensusofpopu559unit). *Image seen.* Original of the Soundex house </w:t>
-      </w:r>
-      <w:r>
-        <w:rPr>
-          <w:b/>
-        </w:rPr>
-        <w:t>not isolated</w:t>
+        <w:t>15 A</w:t>
+      </w:r>
+      <w:r>
+        <w:t xml:space="preserve">. *Image seen.* </w:t>
+      </w:r>
+      <w:r>
+        <w:rPr>
+          <w:b/>
+        </w:rPr>
+        <w:t>C816 C817 C829 C830</w:t>
+      </w:r>
+      <w:r>
+        <w:t xml:space="preserve"> </w:t>
+      </w:r>
+      <w:r>
+        <w:rPr>
+          <w:b/>
+        </w:rPr>
+        <w:t>S520–S522</w:t>
+      </w:r>
+      <w:r>
+        <w:t>.</w:t>
+      </w:r>
+    </w:p>
+    <w:p>
+      <w:r>
+        <w:t xml:space="preserve">128. Leaves </w:t>
+      </w:r>
+      <w:r>
+        <w:rPr>
+          <w:b/>
+        </w:rPr>
+        <w:t>0769–0788</w:t>
+      </w:r>
+      <w:r>
+        <w:t xml:space="preserve"> = Breathitt ED </w:t>
+      </w:r>
+      <w:r>
+        <w:rPr>
+          <w:b/>
+        </w:rPr>
+        <w:t>40</w:t>
+      </w:r>
+      <w:r>
+        <w:t xml:space="preserve"> Precinct </w:t>
+      </w:r>
+      <w:r>
+        <w:rPr>
+          <w:b/>
+        </w:rPr>
+        <w:t>2</w:t>
+      </w:r>
+      <w:r>
+        <w:t xml:space="preserve">, Watkins Cloy; </w:t>
+      </w:r>
+      <w:r>
+        <w:rPr>
+          <w:b/>
+        </w:rPr>
+        <w:t>0788</w:t>
+      </w:r>
+      <w:r>
+        <w:t xml:space="preserve"> = sh </w:t>
+      </w:r>
+      <w:r>
+        <w:rPr>
+          <w:b/>
+        </w:rPr>
+        <w:t>16</w:t>
       </w:r>
       <w:r>
         <w:t xml:space="preserve">. </w:t>
@@ -11980,7 +14177,16 @@
         <w:rPr>
           <w:b/>
         </w:rPr>
-        <w:t>C718–C721</w:t>
+        <w:t>C796 withdrawn</w:t>
+      </w:r>
+      <w:r>
+        <w:t xml:space="preserve">. *Image seen.* </w:t>
+      </w:r>
+      <w:r>
+        <w:rPr>
+          <w:b/>
+        </w:rPr>
+        <w:t>C818 C819</w:t>
       </w:r>
       <w:r>
         <w:t xml:space="preserve"> </w:t>
@@ -11989,7 +14195,75 @@
         <w:rPr>
           <w:b/>
         </w:rPr>
-        <w:t>C728</w:t>
+        <w:t>S523</w:t>
+      </w:r>
+      <w:r>
+        <w:t>.</w:t>
+      </w:r>
+    </w:p>
+    <w:p>
+      <w:r>
+        <w:t xml:space="preserve">129. T625-596 leaf </w:t>
+      </w:r>
+      <w:r>
+        <w:rPr>
+          <w:b/>
+        </w:rPr>
+        <w:t>1063</w:t>
+      </w:r>
+      <w:r>
+        <w:t xml:space="preserve"> = Powell ED </w:t>
+      </w:r>
+      <w:r>
+        <w:rPr>
+          <w:b/>
+        </w:rPr>
+        <w:t>177</w:t>
+      </w:r>
+      <w:r>
+        <w:t xml:space="preserve"> Natural Bridge Precinct </w:t>
+      </w:r>
+      <w:r>
+        <w:rPr>
+          <w:b/>
+        </w:rPr>
+        <w:t>2</w:t>
+      </w:r>
+      <w:r>
+        <w:t xml:space="preserve"> sh </w:t>
+      </w:r>
+      <w:r>
+        <w:rPr>
+          <w:b/>
+        </w:rPr>
+        <w:t>1 A</w:t>
+      </w:r>
+      <w:r>
+        <w:t xml:space="preserve">, 27 Jan, Robt H. Conlee. Through </w:t>
+      </w:r>
+      <w:r>
+        <w:rPr>
+          <w:b/>
+        </w:rPr>
+        <w:t>1078</w:t>
+      </w:r>
+      <w:r>
+        <w:t xml:space="preserve"> sh </w:t>
+      </w:r>
+      <w:r>
+        <w:rPr>
+          <w:b/>
+        </w:rPr>
+        <w:t>8 B</w:t>
+      </w:r>
+      <w:r>
+        <w:t xml:space="preserve">. IA [`14thcensusofpopu596unit`](https://archive.org/details/14thcensusofpopu596unit). *Image seen.* </w:t>
+      </w:r>
+      <w:r>
+        <w:rPr>
+          <w:b/>
+        </w:rPr>
+        <w:t>C822 C823</w:t>
       </w:r>
       <w:r>
         <w:t xml:space="preserve"> </w:t>
@@ -11998,7 +14272,48 @@
         <w:rPr>
           <w:b/>
         </w:rPr>
-        <w:t>S468</w:t>
+        <w:t>S525</w:t>
+      </w:r>
+      <w:r>
+        <w:t>.</w:t>
+      </w:r>
+    </w:p>
+    <w:p>
+      <w:r>
+        <w:t xml:space="preserve">130. FS </w:t>
+      </w:r>
+      <w:r>
+        <w:rPr>
+          <w:b/>
+        </w:rPr>
+        <w:t>127913</w:t>
+      </w:r>
+      <w:r>
+        <w:t xml:space="preserve"> SPA (R011-36). Wolfe compiled 1920c/d/e/f/g/h [KYGenWeb](https://kygenweb.net/wolfe/census1.htm) </w:t>
+      </w:r>
+      <w:r>
+        <w:rPr>
+          <w:b/>
+        </w:rPr>
+        <w:t>nil</w:t>
+      </w:r>
+      <w:r>
+        <w:t xml:space="preserve"> Newman. Certs </w:t>
+      </w:r>
+      <w:r>
+        <w:rPr>
+          <w:b/>
+        </w:rPr>
+        <w:t>28501 / 31780</w:t>
+      </w:r>
+      <w:r>
+        <w:t xml:space="preserve"> unread. </w:t>
+      </w:r>
+      <w:r>
+        <w:rPr>
+          <w:b/>
+        </w:rPr>
+        <w:t>C826 C827 C831</w:t>
       </w:r>
       <w:r>
         <w:t xml:space="preserve"> </w:t>
@@ -12007,7 +14322,7 @@
         <w:rPr>
           <w:b/>
         </w:rPr>
-        <w:t>S469</w:t>
+        <w:t>S528–S530</w:t>
       </w:r>
       <w:r>
         <w:t>.</w:t>
@@ -12015,25 +14330,238 @@
     </w:p>
     <w:p>
       <w:r>
-        <w:t xml:space="preserve">111. FS seven IDs </w:t>
-      </w:r>
-      <w:r>
-        <w:rPr>
-          <w:b/>
-        </w:rPr>
-        <w:t>403</w:t>
-      </w:r>
-      <w:r>
-        <w:t xml:space="preserve"> (R011-31). KYGenWeb Breathitt 1920 births </w:t>
-      </w:r>
-      <w:r>
-        <w:rPr>
-          <w:b/>
-        </w:rPr>
-        <w:t>NEWMAN/NEWNAM 0</w:t>
-      </w:r>
-      <w:r>
-        <w:t xml:space="preserve">. Combs Breathitt 1920 </w:t>
+        <w:t xml:space="preserve">131. T625-559 leaves </w:t>
+      </w:r>
+      <w:r>
+        <w:rPr>
+          <w:b/>
+        </w:rPr>
+        <w:t>0698 / 0700 / 0720</w:t>
+      </w:r>
+      <w:r>
+        <w:t xml:space="preserve"> w1600: Bell ED </w:t>
+      </w:r>
+      <w:r>
+        <w:rPr>
+          <w:b/>
+        </w:rPr>
+        <w:t>34</w:t>
+      </w:r>
+      <w:r>
+        <w:t xml:space="preserve"> Clear Creek Precinct </w:t>
+      </w:r>
+      <w:r>
+        <w:rPr>
+          <w:b/>
+        </w:rPr>
+        <w:t>24</w:t>
+      </w:r>
+      <w:r>
+        <w:t xml:space="preserve">, sh </w:t>
+      </w:r>
+      <w:r>
+        <w:rPr>
+          <w:b/>
+        </w:rPr>
+        <w:t>1 A / 2 A / 12 A</w:t>
+      </w:r>
+      <w:r>
+        <w:t xml:space="preserve">, John Hays. Pass 83 ED 24 </w:t>
+      </w:r>
+      <w:r>
+        <w:rPr>
+          <w:b/>
+        </w:rPr>
+        <w:t>withdrawn</w:t>
+      </w:r>
+      <w:r>
+        <w:t xml:space="preserve">. IA [`14thcensusofpopu559unit`](https://archive.org/details/14thcensusofpopu559unit). *Image seen.* </w:t>
+      </w:r>
+      <w:r>
+        <w:rPr>
+          <w:b/>
+        </w:rPr>
+        <w:t>C833–C835</w:t>
+      </w:r>
+      <w:r>
+        <w:t xml:space="preserve"> </w:t>
+      </w:r>
+      <w:r>
+        <w:rPr>
+          <w:b/>
+        </w:rPr>
+        <w:t>S532–S534</w:t>
+      </w:r>
+      <w:r>
+        <w:t>.</w:t>
+      </w:r>
+    </w:p>
+    <w:p>
+      <w:r>
+        <w:t xml:space="preserve">132. Leaf </w:t>
+      </w:r>
+      <w:r>
+        <w:rPr>
+          <w:b/>
+        </w:rPr>
+        <w:t>0731</w:t>
+      </w:r>
+      <w:r>
+        <w:t xml:space="preserve"> = ED </w:t>
+      </w:r>
+      <w:r>
+        <w:rPr>
+          <w:b/>
+        </w:rPr>
+        <w:t>34</w:t>
+      </w:r>
+      <w:r>
+        <w:t xml:space="preserve"> sh </w:t>
+      </w:r>
+      <w:r>
+        <w:rPr>
+          <w:b/>
+        </w:rPr>
+        <w:t>17 B</w:t>
+      </w:r>
+      <w:r>
+        <w:t xml:space="preserve">. Bell </w:t>
+      </w:r>
+      <w:r>
+        <w:rPr>
+          <w:b/>
+        </w:rPr>
+        <w:t>25–27</w:t>
+      </w:r>
+      <w:r>
+        <w:t xml:space="preserve"> Middlesboro, </w:t>
+      </w:r>
+      <w:r>
+        <w:rPr>
+          <w:b/>
+        </w:rPr>
+        <w:t>29</w:t>
+      </w:r>
+      <w:r>
+        <w:t xml:space="preserve"> Ingram, </w:t>
+      </w:r>
+      <w:r>
+        <w:rPr>
+          <w:b/>
+        </w:rPr>
+        <w:t>31–33</w:t>
+      </w:r>
+      <w:r>
+        <w:t xml:space="preserve"> isolated. </w:t>
+      </w:r>
+      <w:r>
+        <w:rPr>
+          <w:b/>
+        </w:rPr>
+        <w:t>C828 withdrawn</w:t>
+      </w:r>
+      <w:r>
+        <w:t xml:space="preserve">. *Image seen.* </w:t>
+      </w:r>
+      <w:r>
+        <w:rPr>
+          <w:b/>
+        </w:rPr>
+        <w:t>C836–C845</w:t>
+      </w:r>
+      <w:r>
+        <w:t xml:space="preserve"> </w:t>
+      </w:r>
+      <w:r>
+        <w:rPr>
+          <w:b/>
+        </w:rPr>
+        <w:t>S535–S543</w:t>
+      </w:r>
+      <w:r>
+        <w:t>.</w:t>
+      </w:r>
+    </w:p>
+    <w:p>
+      <w:r>
+        <w:t xml:space="preserve">133. Wolfe T625-602 </w:t>
+      </w:r>
+      <w:r>
+        <w:rPr>
+          <w:b/>
+        </w:rPr>
+        <w:t>0380</w:t>
+      </w:r>
+      <w:r>
+        <w:t xml:space="preserve"> w1600 = ED </w:t>
+      </w:r>
+      <w:r>
+        <w:rPr>
+          <w:b/>
+        </w:rPr>
+        <w:t>235</w:t>
+      </w:r>
+      <w:r>
+        <w:t xml:space="preserve"> Hazel Green; </w:t>
+      </w:r>
+      <w:r>
+        <w:rPr>
+          <w:b/>
+        </w:rPr>
+        <w:t>0410</w:t>
+      </w:r>
+      <w:r>
+        <w:t xml:space="preserve"> = ED </w:t>
+      </w:r>
+      <w:r>
+        <w:rPr>
+          <w:b/>
+        </w:rPr>
+        <w:t>236</w:t>
+      </w:r>
+      <w:r>
+        <w:t xml:space="preserve"> Campton Precinct 3. IA [`14thcensusofpopu602unit`](https://archive.org/details/14thcensusofpopu602unit). *Image seen.* </w:t>
+      </w:r>
+      <w:r>
+        <w:rPr>
+          <w:b/>
+        </w:rPr>
+        <w:t>C849 C850</w:t>
+      </w:r>
+      <w:r>
+        <w:t xml:space="preserve"> </w:t>
+      </w:r>
+      <w:r>
+        <w:rPr>
+          <w:b/>
+        </w:rPr>
+        <w:t>S546 S547</w:t>
+      </w:r>
+      <w:r>
+        <w:t>.</w:t>
+      </w:r>
+    </w:p>
+    <w:p>
+      <w:r>
+        <w:t xml:space="preserve">134. Compiled Wolfe [1920i Clifty](https://kygenweb.net/wolfe/txt/1920i.txt) ED </w:t>
+      </w:r>
+      <w:r>
+        <w:rPr>
+          <w:b/>
+        </w:rPr>
+        <w:t>241</w:t>
+      </w:r>
+      <w:r>
+        <w:t xml:space="preserve"> and [1920k Antioch](https://kygenweb.net/wolfe/txt/1920k.txt) ED </w:t>
+      </w:r>
+      <w:r>
+        <w:rPr>
+          <w:b/>
+        </w:rPr>
+        <w:t>242</w:t>
+      </w:r>
+      <w:r>
+        <w:t xml:space="preserve"> </w:t>
       </w:r>
       <w:r>
         <w:rPr>
@@ -12042,22 +14570,13 @@
         <w:t>nil</w:t>
       </w:r>
       <w:r>
-        <w:t xml:space="preserve"> Newman. USGW 1920 dir </w:t>
-      </w:r>
-      <w:r>
-        <w:rPr>
-          <w:b/>
-        </w:rPr>
-        <w:t>timeout</w:t>
-      </w:r>
-      <w:r>
-        <w:t xml:space="preserve">. </w:t>
-      </w:r>
-      <w:r>
-        <w:rPr>
-          <w:b/>
-        </w:rPr>
-        <w:t>C724–C727</w:t>
+        <w:t xml:space="preserve"> Newman. John L. HENRY / Dora Childers rejected. *Transcription only.* </w:t>
+      </w:r>
+      <w:r>
+        <w:rPr>
+          <w:b/>
+        </w:rPr>
+        <w:t>C851 C852</w:t>
       </w:r>
       <w:r>
         <w:t xml:space="preserve"> </w:t>
@@ -12066,7 +14585,48 @@
         <w:rPr>
           <w:b/>
         </w:rPr>
-        <w:t>S470–S473</w:t>
+        <w:t>S548 S549</w:t>
+      </w:r>
+      <w:r>
+        <w:t>.</w:t>
+      </w:r>
+    </w:p>
+    <w:p>
+      <w:r>
+        <w:t xml:space="preserve">135. FS </w:t>
+      </w:r>
+      <w:r>
+        <w:rPr>
+          <w:b/>
+        </w:rPr>
+        <w:t>127913 / 127869</w:t>
+      </w:r>
+      <w:r>
+        <w:t xml:space="preserve"> SPA (R011-37). Book 6 compiled [re-seen](https://usgennet.org/usa/ky/county/lee/marriage/marrbook6.html). Certs </w:t>
+      </w:r>
+      <w:r>
+        <w:rPr>
+          <w:b/>
+        </w:rPr>
+        <w:t>28501 / 31780</w:t>
+      </w:r>
+      <w:r>
+        <w:t xml:space="preserve"> unread. </w:t>
+      </w:r>
+      <w:r>
+        <w:rPr>
+          <w:b/>
+        </w:rPr>
+        <w:t>C855–C857</w:t>
+      </w:r>
+      <w:r>
+        <w:t xml:space="preserve"> </w:t>
+      </w:r>
+      <w:r>
+        <w:rPr>
+          <w:b/>
+        </w:rPr>
+        <w:t>S550 S551</w:t>
       </w:r>
       <w:r>
         <w:t>.</w:t>
@@ -12698,7 +15258,7 @@
     </w:p>
     <w:p>
       <w:r>
-        <w:t>| S468 | `../sources/census/breathitt-1920-ed52-1116-sh1a.jpg` | [IA T625-559](https://archive.org/details/14thcensusofpopu559unit) | ED 52 starts 1116 sh 1A | image seen |</w:t>
+        <w:t>| S468 | `../sources/census/breathitt-1920-ed52-1116-sh1a.jpg` | [IA T625-559](https://archive.org/details/14thcensusofpopu559unit) | Leaf 1116 (later read as ED 55) | image seen |</w:t>
       </w:r>
     </w:p>
     <w:p>
@@ -12724,6 +15284,151 @@
     <w:p>
       <w:r>
         <w:t>| S473 | `../sources/census/pass81-extract-2026-10-30.txt` | This session | Pass 81 extract | extract |</w:t>
+      </w:r>
+    </w:p>
+    <w:p>
+      <w:r>
+        <w:t>| S474 | `../sources/census/breathitt-1920-usgw-ed45-50/` | [Wayback USGW](https://web.archive.org/web/20080616082000/http://files.usgwarchives.net/ky/breathitt/census/1920/) | EDs 45–50 compiled; nil Newman head | transcription only |</w:t>
+      </w:r>
+    </w:p>
+    <w:p>
+      <w:r>
+        <w:t>| S475 | `../sources/census/breathitt-1920-ed42-0844-sh19a.jpg` | [IA T625-559](https://archive.org/details/14thcensusofpopu559unit) | ED 42 sh 19A ln 17 not John+Jennie | image seen |</w:t>
+      </w:r>
+    </w:p>
+    <w:p>
+      <w:r>
+        <w:t>| S477 | `../sources/census/lee-1910-ed98-0532-rissie-servant-zoom.jpg` | [IA T624-478](https://archive.org/details/13thcensus1910po478unit) | Rissie servant 15 Heidelberg sh 6A | image seen |</w:t>
+      </w:r>
+    </w:p>
+    <w:p>
+      <w:r>
+        <w:t>| S484 | `../sources/census/breathitt-1920-ed41-0790-sh1b.jpg` | [IA T625-559](https://archive.org/details/14thcensusofpopu559unit) | Breathitt starts ED 41 | image seen |</w:t>
+      </w:r>
+    </w:p>
+    <w:p>
+      <w:r>
+        <w:t>| S489 | `../sources/census/lee-1910-ed98-0532-names-mid.jpg` | [IA T624-478](https://archive.org/details/13thcensus1910po478unit) | Edney, Sam + Rissie; William+Floyd 6 | image seen |</w:t>
+      </w:r>
+    </w:p>
+    <w:p>
+      <w:r>
+        <w:t>| S491 | `../sources/census/breathitt-1920-ed52-1060-georgesbranch-sh19a.jpg` | [IA T625-559](https://archive.org/details/14thcensusofpopu559unit) | ED 52 sh 19A ln 17 John 38 + Jennie 21 | image seen |</w:t>
+      </w:r>
+    </w:p>
+    <w:p>
+      <w:r>
+        <w:t>| S492 | `../sources/census/breathitt-1920-ed52-1060-edbox.png` | [IA T625-559](https://archive.org/details/14thcensusofpopu559unit) | ED box 52 / 19 A | image seen |</w:t>
+      </w:r>
+    </w:p>
+    <w:p>
+      <w:r>
+        <w:t>| S493 | `../sources/census/breathitt-1920-ed52-1060-names-ln17.png` | [IA T625-559](https://archive.org/details/14thcensusofpopu559unit) | Name band ln 17–22 | image seen |</w:t>
+      </w:r>
+    </w:p>
+    <w:p>
+      <w:r>
+        <w:t>| S504 | `../sources/census/pass84-extract-2026-10-30.txt` | This session | Pass 84 extract | extract |</w:t>
+      </w:r>
+    </w:p>
+    <w:p>
+      <w:r>
+        <w:t>| S505 | `../sources/census/breathitt-1920-ed55-1116-sh1a.jpg` | [IA T625-559](https://archive.org/details/14thcensusofpopu559unit) | Leaf 1116 = ED 55 sh 1A | image seen |</w:t>
+      </w:r>
+    </w:p>
+    <w:p>
+      <w:r>
+        <w:t>| S506 | `../sources/census/breathitt-1920-ed55-1116-edbox.png` | [IA T625-559](https://archive.org/details/14thcensusofpopu559unit) | ED box 55 / 1 A | image seen |</w:t>
+      </w:r>
+    </w:p>
+    <w:p>
+      <w:r>
+        <w:t>| S508 | `../sources/census/breathitt-1920-ed51-1010-frozen-sh1a.jpg` | [IA T625-559](https://archive.org/details/14thcensusofpopu559unit) | ED 51 Frozen sh 1A | image seen |</w:t>
+      </w:r>
+    </w:p>
+    <w:p>
+      <w:r>
+        <w:t>| S510 | `../sources/census/powell-1920-ed143-1100-claycity-sh11b.jpg` | [IA T625-596](https://archive.org/details/14thcensusofpopu596unit) | Clay City 143 sh 11B | image seen |</w:t>
+      </w:r>
+    </w:p>
+    <w:p>
+      <w:r>
+        <w:t>| S511 | `../sources/census/powell-1920-ed146-1170-southfork-sh1b.jpg` | [IA T625-596](https://archive.org/details/14thcensusofpopu596unit) | ED 146 sh 1B | image seen |</w:t>
+      </w:r>
+    </w:p>
+    <w:p>
+      <w:r>
+        <w:t>| S518 | `../sources/census/pass85-extract-2026-10-30.txt` | This session | Pass 85 extract | extract |</w:t>
+      </w:r>
+    </w:p>
+    <w:p>
+      <w:r>
+        <w:t>| S519 | `../sources/census/breathitt-1920-ed39-0734-county-card.jpg` | [IA T625-559](https://archive.org/details/14thcensusofpopu559unit) | Breathitt EDs 39–57 card | image seen |</w:t>
+      </w:r>
+    </w:p>
+    <w:p>
+      <w:r>
+        <w:t>| S520 | `../sources/census/breathitt-1920-ed39-0732-jackson-sh1a.jpg` | [IA T625-559](https://archive.org/details/14thcensusofpopu559unit) | ED 39 Jackson sh 1A | image seen |</w:t>
+      </w:r>
+    </w:p>
+    <w:p>
+      <w:r>
+        <w:t>| S521 | `../sources/census/breathitt-1920-ed39-0740-jackson-sh3b.jpg` | [IA T625-559](https://archive.org/details/14thcensusofpopu559unit) | ED 39 sh 3B | image seen |</w:t>
+      </w:r>
+    </w:p>
+    <w:p>
+      <w:r>
+        <w:t>| S522 | `../sources/census/breathitt-1920-ed39-0768-sh15a.jpg` | [IA T625-559](https://archive.org/details/14thcensusofpopu559unit) | ED 39 sh 15A | image seen |</w:t>
+      </w:r>
+    </w:p>
+    <w:p>
+      <w:r>
+        <w:t>| S523 | `../sources/census/breathitt-1920-ed40-0769-pct2.jpg` | [IA T625-559](https://archive.org/details/14thcensusofpopu559unit) | ED 40 Precinct 2 start | image seen |</w:t>
+      </w:r>
+    </w:p>
+    <w:p>
+      <w:r>
+        <w:t>| S525 | `../sources/census/powell-1920-ed177-1063-naturalbridge-sh1a.jpg` | [IA T625-596](https://archive.org/details/14thcensusofpopu596unit) | ED 177 Natural Bridge sh 1A | image seen |</w:t>
+      </w:r>
+    </w:p>
+    <w:p>
+      <w:r>
+        <w:t>| S531 | `../sources/census/pass86-extract-2026-10-30.txt` | This session | Pass 86 extract | extract |</w:t>
+      </w:r>
+    </w:p>
+    <w:p>
+      <w:r>
+        <w:t>| S532 | `../sources/census/bell-1920-ed34-0700-sh2a.jpg` | [IA T625-559](https://archive.org/details/14thcensusofpopu559unit) | Bell ED 34 sh 2A | image seen |</w:t>
+      </w:r>
+    </w:p>
+    <w:p>
+      <w:r>
+        <w:t>| S533 | `../sources/census/bell-1920-ed34-0720-sh12a.jpg` | [IA T625-559](https://archive.org/details/14thcensusofpopu559unit) | Bell ED 34 sh 12A; Precinct 24 | image seen |</w:t>
+      </w:r>
+    </w:p>
+    <w:p>
+      <w:r>
+        <w:t>| S534 | `../sources/census/bell-1920-ed34-0698-clearcreek-sh1a.jpg` | [IA T625-559](https://archive.org/details/14thcensusofpopu559unit) | Bell ED 34 sh 1A start | image seen |</w:t>
+      </w:r>
+    </w:p>
+    <w:p>
+      <w:r>
+        <w:t>| S546 | `../sources/census/wolfe-1920-ed235-0380-hazelgreen.jpg` | [IA T625-602](https://archive.org/details/14thcensusofpopu602unit) | Wolfe ED 235 Hazel Green | image seen |</w:t>
+      </w:r>
+    </w:p>
+    <w:p>
+      <w:r>
+        <w:t>| S548 | `../sources/census/pass87/wolfe-tx/1920i-clifty-extract.txt` | [KYGenWeb 1920i](https://kygenweb.net/wolfe/txt/1920i.txt) | Clifty ED 241 nil Newman | transcription only |</w:t>
+      </w:r>
+    </w:p>
+    <w:p>
+      <w:r>
+        <w:t>| S549 | `../sources/census/pass87/wolfe-tx/1920k-antioch-extract.txt` | [KYGenWeb 1920k](https://kygenweb.net/wolfe/txt/1920k.txt) | Antioch ED 242 nil Newman | transcription only |</w:t>
+      </w:r>
+    </w:p>
+    <w:p>
+      <w:r>
+        <w:t>| S552 | `../sources/census/pass87-extract-2026-10-30.txt` | This session | Pass 87 extract | extract |</w:t>
       </w:r>
     </w:p>
     <w:p>

</xml_diff>

<commit_message>
Pass 77: filmed ED 92 sh 1–5 nil Evans John; 1910 dw 31 is Bales.
Evans John is not a later-enumerated Buffalo head. Bowman Henry 67, Jack, and Dean George 44 x Jane are other people; B-550/C-652 sampled cards miss those 1910 identities.

Co-authored-by: CatCorner22 <CatCorner22@users.noreply.github.com>
</commit_message>
<xml_diff>
--- a/research/dora-ella-newnam/book/Dora-Ella-Newnam-Stone-A-Life.docx
+++ b/research/dora-ella-newnam/book/Dora-Ella-Newnam-Stone-A-Life.docx
@@ -41,7 +41,7 @@
     </w:p>
     <w:p>
       <w:r>
-        <w:t>One hundred fifteen Cursor chats on this repository were reviewed for this volume (primary research, helpers, scans, and failed browser hunts). The original mobile session opened the case and read the Arkansas death certificate the family still holds. Later sessions recovered the 1880 childhood schedule that free transcripts had missed, walked statewide Soundex reels for 1910 and 1920, tested a Peebles third-marriage hypothesis and set it aside, and photographed NARA microfilm frames — the 1880 childhood schedule, the 1910 Kentucky Ella Miracode plates, Hardin Gray on Sturgeon sheet 13 B, the 1860 Owsley original of Silas Gray’s house with William aged thirteen, the 1850 Owsley Gray pages that are other men (Thomas, James, John, Charles), the given-name Silas plates that are other boys (Ratliff eight months, Wilson six, Phillips fifteen) and the Bowman line first read as Cyrus and then as Squire, the 1850 Estill Marcus Gray original, Breathitt’s Taulbee infant Silas and Bryant Siras, and Madison’s John Green house with Silas Green aged twenty, the 1850 Owsley Harrison Newman house with an eight-year-old Elias who is probably Dora’s father — a 1932 death extract names Henry Harrison Newnam as that father — and is not merged as proven, the 1860 Booneville original of that house under H.H. Newman with Elias aged eighteen, the 1850 William Newman house of twenty-six on the same page, the 1850 John Newman of sixty born in Tennessee who is not the 1880 John of sixty-nine, and Andrew Mays’s Giles at one month in 1850 and eleven in 1860, the 1870 Proctor original of James Brandenburg’s house, Silas Gray’s Sturgeon original, the 1880 District 59 originals of William next door to John Newnam and of Silas still in the district, the 1900 William Gray dwelling-84 crop, and the Bollinger page a sibling had labelled “Dora E. Stone,” which is Henry C. Rhodes and Dora M. of Missouri, and the 1920 Booneville, Buffalo, and Buck Creek originals with the rejected Taylor, Marcum, Magee, McIntosh, Baker, and McPherson houses, the 1910 Sturgeon Gilbert×Josie house, Lynch’s wife Laura without a Newman on the original, and the Buffalo Baker household whose Soundex card misnamed Gilbert John as Robert, the 1910 Buffalo Gilbert, John house next door to Baker, Robert H., and the Soundex Douglas card that shows the clerks indexed filmed Buffalo sheets. This volume folds those chats into one narrative. The case dossier remains the working file; this book is the public reading of it. Sibling work on Greene ED 37 through 41 is now on merged PR #26 through Pass 59; remaining Greene ED 38 B-sides, 1900 Liberty, and 1900 hh 85 are inventoried, not duplicated. Do not import their “Dora E. Stone” as this woman.</w:t>
+        <w:t>One hundred sixteen Cursor chats on this repository were reviewed for this volume (primary research, helpers, scans, and failed browser hunts). The original mobile session opened the case and read the Arkansas death certificate the family still holds. Later sessions recovered the 1880 childhood schedule that free transcripts had missed, walked statewide Soundex reels for 1910 and 1920, tested a Peebles third-marriage hypothesis and set it aside, and photographed NARA microfilm frames — the 1880 childhood schedule, the 1910 Kentucky Ella Miracode plates, Hardin Gray on Sturgeon sheet 13 B, the 1860 Owsley original of Silas Gray’s house with William aged thirteen, the 1850 Owsley Gray pages that are other men (Thomas, James, John, Charles), the given-name Silas plates that are other boys (Ratliff eight months, Wilson six, Phillips fifteen) and the Bowman line first read as Cyrus and then as Squire, the 1850 Estill Marcus Gray original, Breathitt’s Taulbee infant Silas and Bryant Siras, and Madison’s John Green house with Silas Green aged twenty, the 1850 Owsley Harrison Newman house with an eight-year-old Elias who is probably Dora’s father — a 1932 death extract names Henry Harrison Newnam as that father — and is not merged as proven, the 1860 Booneville original of that house under H.H. Newman with Elias aged eighteen, the 1850 William Newman house of twenty-six on the same page, the 1850 John Newman of sixty born in Tennessee who is not the 1880 John of sixty-nine, and Andrew Mays’s Giles at one month in 1850 and eleven in 1860, the 1870 Proctor original of James Brandenburg’s house, Silas Gray’s Sturgeon original, the 1880 District 59 originals of William next door to John Newnam and of Silas still in the district, the 1900 William Gray dwelling-84 crop, and the Bollinger page a sibling had labelled “Dora E. Stone,” which is Henry C. Rhodes and Dora M. of Missouri, and the 1920 Booneville, Buffalo, and Buck Creek originals with the rejected Taylor, Marcum, Magee, McIntosh, Baker, and McPherson houses, the 1910 Sturgeon Gilbert×Josie house, Lynch’s wife Laura without a Newman on the original, and the Buffalo Baker household whose Soundex card misnamed Gilbert John as Robert, the 1910 Buffalo Gilbert, John house next door to Baker, Robert H., and the Soundex Douglas card that shows the clerks indexed filmed Buffalo sheets, the 1910 Buffalo Bales house first read as Bowman, and the 1920 Bowman Henry, Jack, and Dean George originals that are other people. This volume folds those chats into one narrative. The case dossier remains the working file; this book is the public reading of it. Sibling work on Greene ED 37 through 41 is now on merged PR #26 through Pass 59; remaining Greene ED 38 B-sides, 1900 Liberty, and 1900 hh 85 are inventoried, not duplicated. Do not import their “Dora E. Stone” as this woman.</w:t>
       </w:r>
     </w:p>
     <w:p>
@@ -867,7 +867,124 @@
         <w:t>Lacy</w:t>
       </w:r>
       <w:r>
-        <w:t xml:space="preserve">, a daughter-in-law of eighteen. Kentucky’s B-260 Soundex copies that original — volume 76, district 92, sheet 7, line 34 — with the clerk’s spellings Emley and Charley; the original given names are Jesse, Emily, and Chester. Jesse’s age jumps twelve years in ten, Emily’s eleven; those contradictions are disclosed, not averaged. He is not on the missing sheet 1. A neighbouring Baker, Jesse of seventy-two in Owen County lives alone and is another man. Sampled E-152 John cards — Estill thirty-eight with Lula, Daviess a Black man of forty-five with Mary, and others through the Joseph divider — are other men. There is no Evans, John of about fifty-five with Susan on those filmed Buffalo sheets or in the sampled John window. Wolfe’s 1861–1909 marriage list, Clay’s G and N–Q grooms and G and M–N brides, and two Estill minister-return plates from 1901 and 1902 have no Josephine Newnam × Gilbert license; those Estill plates are eight couples each, not a county-wide search. Breathitt’s marriage pages still did not open. In January 1920 he is on the Island Creek original — Owsley district 90, sheet 7 A, dwelling 113 — </w:t>
+        <w:t xml:space="preserve">, a daughter-in-law of eighteen. Kentucky’s B-260 Soundex copies that original — volume 76, district 92, sheet 7, line 34 — with the clerk’s spellings Emley and Charley; the original given names are Jesse, Emily, and Chester. Jesse’s age jumps twelve years in ten, Emily’s eleven; those contradictions are disclosed, not averaged. He is not on the missing sheet 1. A neighbouring Baker, Jesse of seventy-two in Owen County lives alone and is another man. Sampled E-152 John cards — Estill thirty-eight with Lula, Daviess a Black man of forty-five with Mary, and others through the Joseph divider — are other men. There is no Evans, John of about fifty-five with Susan on the filmed Buffalo closer sheets or in the sampled John window, and the name columns of filmed sheets 1 A through 5 B have no Evans, John as a head either, so he is not a later-enumerated Buffalo head like Gay, Abner, or Jesse. The 1910 dwelling 31 house is </w:t>
+      </w:r>
+      <w:r>
+        <w:rPr>
+          <w:b/>
+        </w:rPr>
+        <w:t>Bales, John B.</w:t>
+      </w:r>
+      <w:r>
+        <w:t xml:space="preserve">, forty, with </w:t>
+      </w:r>
+      <w:r>
+        <w:rPr>
+          <w:b/>
+        </w:rPr>
+        <w:t>Annie</w:t>
+      </w:r>
+      <w:r>
+        <w:t xml:space="preserve">, forty-five — not Bowman. On the 1920 original, sheet 3 B dwelling </w:t>
+      </w:r>
+      <w:r>
+        <w:rPr>
+          <w:b/>
+        </w:rPr>
+        <w:t>59</w:t>
+      </w:r>
+      <w:r>
+        <w:t xml:space="preserve"> is </w:t>
+      </w:r>
+      <w:r>
+        <w:rPr>
+          <w:b/>
+        </w:rPr>
+        <w:t>Bowman, Henry</w:t>
+      </w:r>
+      <w:r>
+        <w:t xml:space="preserve">, sixty-seven, a widower, with son Iva, sixteen; that is not the 1910 Bales house. </w:t>
+      </w:r>
+      <w:r>
+        <w:rPr>
+          <w:b/>
+        </w:rPr>
+        <w:t>Bowman, Sile</w:t>
+      </w:r>
+      <w:r>
+        <w:t xml:space="preserve">, sixty, and </w:t>
+      </w:r>
+      <w:r>
+        <w:rPr>
+          <w:b/>
+        </w:rPr>
+        <w:t>Bowman, Andy</w:t>
+      </w:r>
+      <w:r>
+        <w:t xml:space="preserve">, thirty-seven, sit next door. Sheet 5 B dwelling </w:t>
+      </w:r>
+      <w:r>
+        <w:rPr>
+          <w:b/>
+        </w:rPr>
+        <w:t>98</w:t>
+      </w:r>
+      <w:r>
+        <w:t xml:space="preserve"> is </w:t>
+      </w:r>
+      <w:r>
+        <w:rPr>
+          <w:b/>
+        </w:rPr>
+        <w:t>Bowman, Jack</w:t>
+      </w:r>
+      <w:r>
+        <w:t xml:space="preserve">, diplomatically a woman of fifty-seven, a widow, with son Alex, thirty — not 1910 Annie. Dwelling </w:t>
+      </w:r>
+      <w:r>
+        <w:rPr>
+          <w:b/>
+        </w:rPr>
+        <w:t>100</w:t>
+      </w:r>
+      <w:r>
+        <w:t xml:space="preserve"> is </w:t>
+      </w:r>
+      <w:r>
+        <w:rPr>
+          <w:b/>
+        </w:rPr>
+        <w:t>Dean, George</w:t>
+      </w:r>
+      <w:r>
+        <w:t xml:space="preserve">, forty-four, with </w:t>
+      </w:r>
+      <w:r>
+        <w:rPr>
+          <w:b/>
+        </w:rPr>
+        <w:t>Jane</w:t>
+      </w:r>
+      <w:r>
+        <w:t xml:space="preserve">, thirty-seven, and a son John, twenty-one — not the 1910 Dean George with Martha. Kentucky’s B-550 Soundex denser Henry window has no Bowman, Henry of sixty-seven in Owsley district 92; the Owsley Henrys it does copy are district </w:t>
+      </w:r>
+      <w:r>
+        <w:rPr>
+          <w:b/>
+        </w:rPr>
+        <w:t>89</w:t>
+      </w:r>
+      <w:r>
+        <w:t xml:space="preserve">, ages twenty and forty-three. Sampled C-652 James cards — Carmicle of Mercer, Carnaghy of Clay with Bertha, Crenshaw of Edmondson — are other men. Filmed Buffalo sheets 1 through 5 have McIntosh heads, but not Daniel of about fifty-two, and </w:t>
+      </w:r>
+      <w:r>
+        <w:rPr>
+          <w:b/>
+        </w:rPr>
+        <w:t>Gabbard, Michael</w:t>
+      </w:r>
+      <w:r>
+        <w:t xml:space="preserve">, sixty-seven, is not the 1910 Michael of about twenty-five. Wolfe’s 1861–1909 marriage list, Clay’s G and N–Q grooms and G and M–N brides, and two Estill minister-return plates from 1901 and 1902 have no Josephine Newnam × Gilbert license; those Estill plates are eight couples each, not a county-wide search. Breathitt’s marriage pages still did not open. In January 1920 he is on the Island Creek original — Owsley district 90, sheet 7 A, dwelling 113 — </w:t>
       </w:r>
       <w:r>
         <w:rPr>
@@ -1137,7 +1254,7 @@
         <w:t>Dara</w:t>
       </w:r>
       <w:r>
-        <w:t>, forty — the enumerator wrote an open a, not o — is another person. Kentucky’s 1920 Soundex has no Manerva or Minerva Newman card, and the Walter given-name window has no Owsley or Lee Walter with Manerva. Kentucky’s 1920 death index has no Manerva Newnam row on 28 August; the Owsley table that day is an infant Bates. Mary Ann Smallwood, born April 1842, came from the Owsley Smallwoods. The 11 July 1918 cemetery date is still unmatched in Kentucky’s civil index. [C669] [C672] [C693] [C694] [C690] [C691] [C709] [C711] [C712] [C713] [C717] [C729] [C730] [C739] [C740] [C741] [C742] [C743] [C744] [C745] [C746] [C747] [C748] [C752] [C753] [C754] [C756] [C759] [C763] [C765] [C768] [C775] [C776] [C777] [C779] [C780] [C782] [C783] [C784] [C789] [C790] [C791] [C792] [C793] [C794] [C795] [C796] [C797] [C801] [C802] [C803] [C804] [C808] [C809] [C810] [C811] [C812] [C813] [C814] [C818] [C819]</w:t>
+        <w:t>, forty — the enumerator wrote an open a, not o — is another person. Kentucky’s 1920 Soundex has no Manerva or Minerva Newman card, and the Walter given-name window has no Owsley or Lee Walter with Manerva. Kentucky’s 1920 death index has no Manerva Newnam row on 28 August; the Owsley table that day is an infant Bates. Mary Ann Smallwood, born April 1842, came from the Owsley Smallwoods. The 11 July 1918 cemetery date is still unmatched in Kentucky’s civil index. [C669] [C672] [C693] [C694] [C690] [C691] [C709] [C711] [C712] [C713] [C717] [C729] [C730] [C739] [C740] [C741] [C742] [C743] [C744] [C745] [C746] [C747] [C748] [C752] [C753] [C754] [C756] [C759] [C763] [C765] [C768] [C775] [C776] [C777] [C779] [C780] [C782] [C783] [C784] [C789] [C790] [C791] [C792] [C793] [C794] [C795] [C796] [C797] [C801] [C802] [C803] [C804] [C808] [C809] [C810] [C811] [C812] [C813] [C814] [C818] [C819] [C820] [C821] [C822] [C823] [C824] [C825] [C826] [C827] [C828]</w:t>
       </w:r>
     </w:p>
     <w:p>

</xml_diff>

<commit_message>
Dora pass 88: isolate Bell ED 28/30 starts and Wolfe 238-241 originals
Official Ingram 28 and Williams Branch 30 sheet 1A headers are now on T625-559. Wolfe Torrent, Holly, Stillwater, and Clifty starts sit on the 515-image T625-602 scan after Whitley 277; Antioch 242 is not on that scan. Sampled names remain a probable Newman nil. FS catalogs still SPA (R011-38). Do not print 1966, 1976, Floyd-as-Boyd, 1962 as McCoy death, or the 1942 Combs charge as fact.

Co-authored-by: blakereaganlaw <blakereaganlaw@gmail.com>
</commit_message>
<xml_diff>
--- a/research/dora-ella-newnam/book/Dora-Ella-Newnam-Stone-A-Life.docx
+++ b/research/dora-ella-newnam/book/Dora-Ella-Newnam-Stone-A-Life.docx
@@ -191,6 +191,11 @@
     </w:p>
     <w:p>
       <w:r>
+        <w:t>33. [Pass 88. Ingram 28, Williams Branch 30, and Torrent](#pass-88-ingram-28-williams-branch-30-and-torrent)</w:t>
+      </w:r>
+    </w:p>
+    <w:p>
+      <w:r>
         <w:br w:type="page"/>
       </w:r>
     </w:p>
@@ -4985,6 +4990,188 @@
       </w:r>
     </w:p>
     <w:p>
+      <w:pPr>
+        <w:pStyle w:val="Heading2"/>
+      </w:pPr>
+      <w:r>
+        <w:t>Pass 88. Ingram 28, Williams Branch 30, and Torrent</w:t>
+      </w:r>
+    </w:p>
+    <w:p>
+      <w:r>
+        <w:t xml:space="preserve">Districts 28 and 30 were not missing. Leaf 609 at 1600 pixels is Bell precinct </w:t>
+      </w:r>
+      <w:r>
+        <w:rPr>
+          <w:b/>
+        </w:rPr>
+        <w:t>22 Ingram</w:t>
+      </w:r>
+      <w:r>
+        <w:t xml:space="preserve">, district </w:t>
+      </w:r>
+      <w:r>
+        <w:rPr>
+          <w:b/>
+        </w:rPr>
+        <w:t>28</w:t>
+      </w:r>
+      <w:r>
+        <w:t xml:space="preserve">, sheet </w:t>
+      </w:r>
+      <w:r>
+        <w:rPr>
+          <w:b/>
+        </w:rPr>
+        <w:t>1A</w:t>
+      </w:r>
+      <w:r>
+        <w:t xml:space="preserve">, 8 January, W. E. Turner. Leaf 610 is sheet </w:t>
+      </w:r>
+      <w:r>
+        <w:rPr>
+          <w:b/>
+        </w:rPr>
+        <w:t>2A</w:t>
+      </w:r>
+      <w:r>
+        <w:t xml:space="preserve"> the same day. The first sheet is Wilson, Smith, Bentley, Miracle, Hobbs, Lester — no Newman head. [C858] [C859] [C860] [S553] [S570]</w:t>
+      </w:r>
+    </w:p>
+    <w:p>
+      <w:r>
+        <w:t xml:space="preserve">Leaf 643 is </w:t>
+      </w:r>
+      <w:r>
+        <w:rPr>
+          <w:b/>
+        </w:rPr>
+        <w:t>Williams Branch Precinct 24</w:t>
+      </w:r>
+      <w:r>
+        <w:t xml:space="preserve">, district </w:t>
+      </w:r>
+      <w:r>
+        <w:rPr>
+          <w:b/>
+        </w:rPr>
+        <w:t>30</w:t>
+      </w:r>
+      <w:r>
+        <w:t xml:space="preserve">, sheet </w:t>
+      </w:r>
+      <w:r>
+        <w:rPr>
+          <w:b/>
+        </w:rPr>
+        <w:t>1A</w:t>
+      </w:r>
+      <w:r>
+        <w:t>, 2 February, P. W. Woolum. A Cora, twenty-six, is Gardner Hurst’s wife. A Dora T., four, is a Denny child. Neither is the couple we are hunting. [C861] [C862] [S554]</w:t>
+      </w:r>
+    </w:p>
+    <w:p>
+      <w:r>
+        <w:t xml:space="preserve">Leaf 620, after those Ingram sheets, is already district </w:t>
+      </w:r>
+      <w:r>
+        <w:rPr>
+          <w:b/>
+        </w:rPr>
+        <w:t>29</w:t>
+      </w:r>
+      <w:r>
+        <w:t>, precinct 2 Ingram, William G. Innes, 14 January. [C863]</w:t>
+      </w:r>
+    </w:p>
+    <w:p>
+      <w:r>
+        <w:t xml:space="preserve">Wolfe on T625-602 is a 515-image Internet Archive scan of a three-county reel. Wayne runs through about leaf 372. Wolfe Lee City, district </w:t>
+      </w:r>
+      <w:r>
+        <w:rPr>
+          <w:b/>
+        </w:rPr>
+        <w:t>234</w:t>
+      </w:r>
+      <w:r>
+        <w:t xml:space="preserve">, starts at leaf 373, sheet 1A. Hazel Green 235 and Campton 236 follow. Then the film jumps to Whitley Williamsburg, district </w:t>
+      </w:r>
+      <w:r>
+        <w:rPr>
+          <w:b/>
+        </w:rPr>
+        <w:t>277</w:t>
+      </w:r>
+      <w:r>
+        <w:t xml:space="preserve">, William A. Tyler, leaves 419–442. Torrent is not in that gap. It starts at leaf 443: Torrent Precinct, Joel Cox — district </w:t>
+      </w:r>
+      <w:r>
+        <w:rPr>
+          <w:b/>
+        </w:rPr>
+        <w:t>238</w:t>
+      </w:r>
+      <w:r>
+        <w:t xml:space="preserve">. Holly, district </w:t>
+      </w:r>
+      <w:r>
+        <w:rPr>
+          <w:b/>
+        </w:rPr>
+        <w:t>239</w:t>
+      </w:r>
+      <w:r>
+        <w:t xml:space="preserve">, starts at leaf 476, sheet 1A, 27 January, Ola H. Miller. Stillwater, district </w:t>
+      </w:r>
+      <w:r>
+        <w:rPr>
+          <w:b/>
+        </w:rPr>
+        <w:t>240</w:t>
+      </w:r>
+      <w:r>
+        <w:t xml:space="preserve">, is on the reel at leaves 500 and 512, J. F. Dunn. Clifty, district </w:t>
+      </w:r>
+      <w:r>
+        <w:rPr>
+          <w:b/>
+        </w:rPr>
+        <w:t>241</w:t>
+      </w:r>
+      <w:r>
+        <w:t xml:space="preserve">, starts at leaf 514, sheet 1, 13 or 14 January, Roy Kash. That is the last isolated Wolfe district on this scan. Antioch, district </w:t>
+      </w:r>
+      <w:r>
+        <w:rPr>
+          <w:b/>
+        </w:rPr>
+        <w:t>242</w:t>
+      </w:r>
+      <w:r>
+        <w:t>, is not on the 515 images. [C864] [C865] [C867] [C868] [C870] [C872] [C874] [C875] [S555] [S556] [S558] [S560] [S561]</w:t>
+      </w:r>
+    </w:p>
+    <w:p>
+      <w:r>
+        <w:t xml:space="preserve">The published Torrent list — 222 households — has no Newman, Newnam, or McCoy head. Sampled name columns on the official start sheets, and a machine pass over ninety inverted name crops, are the same </w:t>
+      </w:r>
+      <w:r>
+        <w:rPr>
+          <w:b/>
+        </w:rPr>
+        <w:t>probable</w:t>
+      </w:r>
+      <w:r>
+        <w:t xml:space="preserve"> negative. [C876] [C877] [S562] [S569]</w:t>
+      </w:r>
+    </w:p>
+    <w:p>
+      <w:r>
+        <w:t>FamilySearch 127913, 127869, and 1146342 were empty shells again — roadblock step 38. Book 6 still has Floyd and Allie A. on 31 July 1902, and Boyde Newnam only as a witness in 1900. Certificates 28501 and 31780 are still not those numbers. The *Courier* of 8 May 1942 still names the ambush, not a shooter. [C880] [C881] [C882] [C883] [S564] [S565] [S566] [S567]</w:t>
+      </w:r>
+    </w:p>
+    <w:p>
       <w:r>
         <w:t>Do not print 1966 or 1976 as proven deaths. Do not print Floyd as Boyd. Do not print 1962 as McCoy’s death. Do not print the 1942 Combs charge as fact.</w:t>
       </w:r>
@@ -6069,6 +6256,69 @@
         <w:t>C690 C691</w:t>
       </w:r>
       <w:r>
+        <w:t xml:space="preserve">); Bell ED </w:t>
+      </w:r>
+      <w:r>
+        <w:rPr>
+          <w:b/>
+        </w:rPr>
+        <w:t>28/30</w:t>
+      </w:r>
+      <w:r>
+        <w:t xml:space="preserve"> starts </w:t>
+      </w:r>
+      <w:r>
+        <w:rPr>
+          <w:b/>
+        </w:rPr>
+        <w:t>isolated</w:t>
+      </w:r>
+      <w:r>
+        <w:t xml:space="preserve"> (</w:t>
+      </w:r>
+      <w:r>
+        <w:rPr>
+          <w:b/>
+        </w:rPr>
+        <w:t>C858 C861</w:t>
+      </w:r>
+      <w:r>
+        <w:t xml:space="preserve">); Wolfe </w:t>
+      </w:r>
+      <w:r>
+        <w:rPr>
+          <w:b/>
+        </w:rPr>
+        <w:t>238–241</w:t>
+      </w:r>
+      <w:r>
+        <w:t xml:space="preserve"> originals </w:t>
+      </w:r>
+      <w:r>
+        <w:rPr>
+          <w:b/>
+        </w:rPr>
+        <w:t>isolated</w:t>
+      </w:r>
+      <w:r>
+        <w:t xml:space="preserve">, Antioch </w:t>
+      </w:r>
+      <w:r>
+        <w:rPr>
+          <w:b/>
+        </w:rPr>
+        <w:t>242</w:t>
+      </w:r>
+      <w:r>
+        <w:t xml:space="preserve"> not on the IA 515-image scan (</w:t>
+      </w:r>
+      <w:r>
+        <w:rPr>
+          <w:b/>
+        </w:rPr>
+        <w:t>C875</w:t>
+      </w:r>
+      <w:r>
         <w:t xml:space="preserve">); </w:t>
       </w:r>
       <w:r>
@@ -6487,16 +6737,25 @@
         <w:t>B088</w:t>
       </w:r>
       <w:r>
-        <w:t xml:space="preserve"> Breathitt full-sheet residuals + John 38+Jennie original (ED </w:t>
-      </w:r>
-      <w:r>
-        <w:rPr>
-          <w:b/>
-        </w:rPr>
-        <w:t>52</w:t>
-      </w:r>
-      <w:r>
-        <w:t xml:space="preserve"> has no sheet 19), Powell/Wolfe full-sheet residuals, </w:t>
+        <w:t xml:space="preserve"> unread Torrent/Holly/Stillwater/Clifty full-sheet name lines + Antioch </w:t>
+      </w:r>
+      <w:r>
+        <w:rPr>
+          <w:b/>
+        </w:rPr>
+        <w:t>242</w:t>
+      </w:r>
+      <w:r>
+        <w:t xml:space="preserve"> originals (not on the IA 515-image scan) + remaining Bell </w:t>
+      </w:r>
+      <w:r>
+        <w:rPr>
+          <w:b/>
+        </w:rPr>
+        <w:t>25–34</w:t>
+      </w:r>
+      <w:r>
+        <w:t xml:space="preserve"> full-sheet lines, </w:t>
       </w:r>
       <w:r>
         <w:rPr>
@@ -14634,6 +14893,346 @@
     </w:p>
     <w:p>
       <w:r>
+        <w:t xml:space="preserve">136. T625-559 </w:t>
+      </w:r>
+      <w:r>
+        <w:rPr>
+          <w:b/>
+        </w:rPr>
+        <w:t>0609 / 0610</w:t>
+      </w:r>
+      <w:r>
+        <w:t xml:space="preserve"> w1600: Bell ED </w:t>
+      </w:r>
+      <w:r>
+        <w:rPr>
+          <w:b/>
+        </w:rPr>
+        <w:t>28</w:t>
+      </w:r>
+      <w:r>
+        <w:t xml:space="preserve"> Precinct </w:t>
+      </w:r>
+      <w:r>
+        <w:rPr>
+          <w:b/>
+        </w:rPr>
+        <w:t>22 Ingram</w:t>
+      </w:r>
+      <w:r>
+        <w:t xml:space="preserve"> sh </w:t>
+      </w:r>
+      <w:r>
+        <w:rPr>
+          <w:b/>
+        </w:rPr>
+        <w:t>1 A / 2 A</w:t>
+      </w:r>
+      <w:r>
+        <w:t xml:space="preserve">, 8 Jan, W. E. Turner. IA [`14thcensusofpopu559unit`](https://archive.org/details/14thcensusofpopu559unit). *Image seen.* </w:t>
+      </w:r>
+      <w:r>
+        <w:rPr>
+          <w:b/>
+        </w:rPr>
+        <w:t>C858 C859 C860</w:t>
+      </w:r>
+      <w:r>
+        <w:t xml:space="preserve"> </w:t>
+      </w:r>
+      <w:r>
+        <w:rPr>
+          <w:b/>
+        </w:rPr>
+        <w:t>S553 S570</w:t>
+      </w:r>
+      <w:r>
+        <w:t>.</w:t>
+      </w:r>
+    </w:p>
+    <w:p>
+      <w:r>
+        <w:t xml:space="preserve">137. Leaf </w:t>
+      </w:r>
+      <w:r>
+        <w:rPr>
+          <w:b/>
+        </w:rPr>
+        <w:t>0643</w:t>
+      </w:r>
+      <w:r>
+        <w:t xml:space="preserve"> w1600: Bell ED </w:t>
+      </w:r>
+      <w:r>
+        <w:rPr>
+          <w:b/>
+        </w:rPr>
+        <w:t>30</w:t>
+      </w:r>
+      <w:r>
+        <w:t xml:space="preserve"> Williams Branch Precinct </w:t>
+      </w:r>
+      <w:r>
+        <w:rPr>
+          <w:b/>
+        </w:rPr>
+        <w:t>24</w:t>
+      </w:r>
+      <w:r>
+        <w:t xml:space="preserve"> sh </w:t>
+      </w:r>
+      <w:r>
+        <w:rPr>
+          <w:b/>
+        </w:rPr>
+        <w:t>1 A</w:t>
+      </w:r>
+      <w:r>
+        <w:t xml:space="preserve">, 2 Feb, P. W. Woolum. Cora Hurst 26 / Dora T. Denny 4 rejected. *Image seen.* </w:t>
+      </w:r>
+      <w:r>
+        <w:rPr>
+          <w:b/>
+        </w:rPr>
+        <w:t>C861 C862</w:t>
+      </w:r>
+      <w:r>
+        <w:t xml:space="preserve"> </w:t>
+      </w:r>
+      <w:r>
+        <w:rPr>
+          <w:b/>
+        </w:rPr>
+        <w:t>S554</w:t>
+      </w:r>
+      <w:r>
+        <w:t>.</w:t>
+      </w:r>
+    </w:p>
+    <w:p>
+      <w:r>
+        <w:t xml:space="preserve">138. T625-602 IA scan </w:t>
+      </w:r>
+      <w:r>
+        <w:rPr>
+          <w:b/>
+        </w:rPr>
+        <w:t>515</w:t>
+      </w:r>
+      <w:r>
+        <w:t xml:space="preserve"> images. </w:t>
+      </w:r>
+      <w:r>
+        <w:rPr>
+          <w:b/>
+        </w:rPr>
+        <w:t>0373</w:t>
+      </w:r>
+      <w:r>
+        <w:t xml:space="preserve"> = Wolfe ED </w:t>
+      </w:r>
+      <w:r>
+        <w:rPr>
+          <w:b/>
+        </w:rPr>
+        <w:t>234</w:t>
+      </w:r>
+      <w:r>
+        <w:t xml:space="preserve"> Lee City Town sh </w:t>
+      </w:r>
+      <w:r>
+        <w:rPr>
+          <w:b/>
+        </w:rPr>
+        <w:t>1 A</w:t>
+      </w:r>
+      <w:r>
+        <w:t xml:space="preserve">. Torrent </w:t>
+      </w:r>
+      <w:r>
+        <w:rPr>
+          <w:b/>
+        </w:rPr>
+        <w:t>238</w:t>
+      </w:r>
+      <w:r>
+        <w:t xml:space="preserve"> from </w:t>
+      </w:r>
+      <w:r>
+        <w:rPr>
+          <w:b/>
+        </w:rPr>
+        <w:t>0443</w:t>
+      </w:r>
+      <w:r>
+        <w:t xml:space="preserve">; Holly </w:t>
+      </w:r>
+      <w:r>
+        <w:rPr>
+          <w:b/>
+        </w:rPr>
+        <w:t>239</w:t>
+      </w:r>
+      <w:r>
+        <w:t xml:space="preserve"> from </w:t>
+      </w:r>
+      <w:r>
+        <w:rPr>
+          <w:b/>
+        </w:rPr>
+        <w:t>0476</w:t>
+      </w:r>
+      <w:r>
+        <w:t xml:space="preserve">; Stillwater </w:t>
+      </w:r>
+      <w:r>
+        <w:rPr>
+          <w:b/>
+        </w:rPr>
+        <w:t>240</w:t>
+      </w:r>
+      <w:r>
+        <w:t xml:space="preserve"> </w:t>
+      </w:r>
+      <w:r>
+        <w:rPr>
+          <w:b/>
+        </w:rPr>
+        <w:t>0500/0512</w:t>
+      </w:r>
+      <w:r>
+        <w:t xml:space="preserve">; Clifty </w:t>
+      </w:r>
+      <w:r>
+        <w:rPr>
+          <w:b/>
+        </w:rPr>
+        <w:t>241</w:t>
+      </w:r>
+      <w:r>
+        <w:t xml:space="preserve"> from </w:t>
+      </w:r>
+      <w:r>
+        <w:rPr>
+          <w:b/>
+        </w:rPr>
+        <w:t>0514</w:t>
+      </w:r>
+      <w:r>
+        <w:t xml:space="preserve">. Antioch </w:t>
+      </w:r>
+      <w:r>
+        <w:rPr>
+          <w:b/>
+        </w:rPr>
+        <w:t>242</w:t>
+      </w:r>
+      <w:r>
+        <w:t xml:space="preserve"> not on this scan. IA [`14thcensusofpopu602unit`](https://archive.org/details/14thcensusofpopu602unit). *Image seen.* </w:t>
+      </w:r>
+      <w:r>
+        <w:rPr>
+          <w:b/>
+        </w:rPr>
+        <w:t>C864–C875</w:t>
+      </w:r>
+      <w:r>
+        <w:t xml:space="preserve"> </w:t>
+      </w:r>
+      <w:r>
+        <w:rPr>
+          <w:b/>
+        </w:rPr>
+        <w:t>S555–S561</w:t>
+      </w:r>
+      <w:r>
+        <w:t>.</w:t>
+      </w:r>
+    </w:p>
+    <w:p>
+      <w:r>
+        <w:t xml:space="preserve">139. Compiled Torrent [USGW 1920pt05](http://files.usgwarchives.net/ky/wolfe/census/1920/1920pt05.txt) </w:t>
+      </w:r>
+      <w:r>
+        <w:rPr>
+          <w:b/>
+        </w:rPr>
+        <w:t>222</w:t>
+      </w:r>
+      <w:r>
+        <w:t xml:space="preserve"> HH </w:t>
+      </w:r>
+      <w:r>
+        <w:rPr>
+          <w:b/>
+        </w:rPr>
+        <w:t>nil</w:t>
+      </w:r>
+      <w:r>
+        <w:t xml:space="preserve"> Newman. *Transcription only.* </w:t>
+      </w:r>
+      <w:r>
+        <w:rPr>
+          <w:b/>
+        </w:rPr>
+        <w:t>C876</w:t>
+      </w:r>
+      <w:r>
+        <w:t xml:space="preserve"> </w:t>
+      </w:r>
+      <w:r>
+        <w:rPr>
+          <w:b/>
+        </w:rPr>
+        <w:t>S562</w:t>
+      </w:r>
+      <w:r>
+        <w:t>.</w:t>
+      </w:r>
+    </w:p>
+    <w:p>
+      <w:r>
+        <w:t xml:space="preserve">140. FS </w:t>
+      </w:r>
+      <w:r>
+        <w:rPr>
+          <w:b/>
+        </w:rPr>
+        <w:t>127913 / 127869 / 1146342</w:t>
+      </w:r>
+      <w:r>
+        <w:t xml:space="preserve"> SPA (R011-38). Book 6 compiled [re-seen](https://usgennet.org/usa/ky/county/lee/marriage/marrbook6.html). Certs </w:t>
+      </w:r>
+      <w:r>
+        <w:rPr>
+          <w:b/>
+        </w:rPr>
+        <w:t>28501 / 31780</w:t>
+      </w:r>
+      <w:r>
+        <w:t xml:space="preserve"> unread. Courier [8 May 1942](https://usgennet.org/usa/ky/county/owsley/obit/gcombs.htm) names victim, not shooter. </w:t>
+      </w:r>
+      <w:r>
+        <w:rPr>
+          <w:b/>
+        </w:rPr>
+        <w:t>C880–C883</w:t>
+      </w:r>
+      <w:r>
+        <w:t xml:space="preserve"> </w:t>
+      </w:r>
+      <w:r>
+        <w:rPr>
+          <w:b/>
+        </w:rPr>
+        <w:t>S564–S567</w:t>
+      </w:r>
+      <w:r>
+        <w:t>.</w:t>
+      </w:r>
+    </w:p>
+    <w:p>
+      <w:r>
         <w:br w:type="page"/>
       </w:r>
     </w:p>
@@ -15429,6 +16028,46 @@
     <w:p>
       <w:r>
         <w:t>| S552 | `../sources/census/pass87-extract-2026-10-30.txt` | This session | Pass 87 extract | extract |</w:t>
+      </w:r>
+    </w:p>
+    <w:p>
+      <w:r>
+        <w:t>| S553 | `../sources/census/bell-1920-ed28-0609-ingram-1a.jpg` | [IA T625-559](https://archive.org/details/14thcensusofpopu559unit) | Bell ED 28 Ingram sh 1A | image seen |</w:t>
+      </w:r>
+    </w:p>
+    <w:p>
+      <w:r>
+        <w:t>| S554 | `../sources/census/bell-1920-ed30-0643-williamsbranch-1a.jpg` | [IA T625-559](https://archive.org/details/14thcensusofpopu559unit) | Bell ED 30 Williams Branch sh 1A | image seen |</w:t>
+      </w:r>
+    </w:p>
+    <w:p>
+      <w:r>
+        <w:t>| S555 | `../sources/census/wolfe-1920-ed234-0373-leecity-1a.jpg` | [IA T625-602](https://archive.org/details/14thcensusofpopu602unit) | Wolfe ED 234 Lee City sh 1A | image seen |</w:t>
+      </w:r>
+    </w:p>
+    <w:p>
+      <w:r>
+        <w:t>| S558 | `../sources/census/wolfe-1920-ed239-0476-holly-1a.jpg` | [IA T625-602](https://archive.org/details/14thcensusofpopu602unit) | Wolfe ED 239 Holly sh 1A | image seen |</w:t>
+      </w:r>
+    </w:p>
+    <w:p>
+      <w:r>
+        <w:t>| S560 | `../sources/census/wolfe-1920-ed241-0514-clifty-1a.jpg` | [IA T625-602](https://archive.org/details/14thcensusofpopu602unit) | Wolfe ED 241 Clifty sh 1 | image seen |</w:t>
+      </w:r>
+    </w:p>
+    <w:p>
+      <w:r>
+        <w:t>| S562 | `../sources/census/pass88/wolfe-tx/1920pt05-torrent-usgw.txt` | [USGW 1920pt05](http://files.usgwarchives.net/ky/wolfe/census/1920/1920pt05.txt) | Torrent 222 HH nil Newman | transcription only |</w:t>
+      </w:r>
+    </w:p>
+    <w:p>
+      <w:r>
+        <w:t>| S567 | `../sources/press/owsley-courier-1942-gcombs-2026-10-31.txt` | [Courier extract](https://usgennet.org/usa/ky/county/owsley/obit/gcombs.htm) | 1942 ambush; no shooter named | transcription only |</w:t>
+      </w:r>
+    </w:p>
+    <w:p>
+      <w:r>
+        <w:t>| S571 | `../sources/census/pass88-extract-2026-10-31.txt` | This session | Pass 88 extract | extract |</w:t>
       </w:r>
     </w:p>
     <w:p>

</xml_diff>

<commit_message>
Pass 78: 1910 Gaine Reece is 1920 Daniel Reece, not missing sh 1.
Diplomatic re-read of 1910 Buffalo sh 2 corrects Jacob×Lyda, Dean Maggie, and Gabbard Willis. G-500/M-253/G-163/C-652 denser windows are nil for those 1910 heads. Catalog 117.

Co-authored-by: CatCorner22 <CatCorner22@users.noreply.github.com>
</commit_message>
<xml_diff>
--- a/research/dora-ella-newnam/book/Dora-Ella-Newnam-Stone-A-Life.docx
+++ b/research/dora-ella-newnam/book/Dora-Ella-Newnam-Stone-A-Life.docx
@@ -41,7 +41,7 @@
     </w:p>
     <w:p>
       <w:r>
-        <w:t>One hundred sixteen Cursor chats on this repository were reviewed for this volume (primary research, helpers, scans, and failed browser hunts). The original mobile session opened the case and read the Arkansas death certificate the family still holds. Later sessions recovered the 1880 childhood schedule that free transcripts had missed, walked statewide Soundex reels for 1910 and 1920, tested a Peebles third-marriage hypothesis and set it aside, and photographed NARA microfilm frames — the 1880 childhood schedule, the 1910 Kentucky Ella Miracode plates, Hardin Gray on Sturgeon sheet 13 B, the 1860 Owsley original of Silas Gray’s house with William aged thirteen, the 1850 Owsley Gray pages that are other men (Thomas, James, John, Charles), the given-name Silas plates that are other boys (Ratliff eight months, Wilson six, Phillips fifteen) and the Bowman line first read as Cyrus and then as Squire, the 1850 Estill Marcus Gray original, Breathitt’s Taulbee infant Silas and Bryant Siras, and Madison’s John Green house with Silas Green aged twenty, the 1850 Owsley Harrison Newman house with an eight-year-old Elias who is probably Dora’s father — a 1932 death extract names Henry Harrison Newnam as that father — and is not merged as proven, the 1860 Booneville original of that house under H.H. Newman with Elias aged eighteen, the 1850 William Newman house of twenty-six on the same page, the 1850 John Newman of sixty born in Tennessee who is not the 1880 John of sixty-nine, and Andrew Mays’s Giles at one month in 1850 and eleven in 1860, the 1870 Proctor original of James Brandenburg’s house, Silas Gray’s Sturgeon original, the 1880 District 59 originals of William next door to John Newnam and of Silas still in the district, the 1900 William Gray dwelling-84 crop, and the Bollinger page a sibling had labelled “Dora E. Stone,” which is Henry C. Rhodes and Dora M. of Missouri, and the 1920 Booneville, Buffalo, and Buck Creek originals with the rejected Taylor, Marcum, Magee, McIntosh, Baker, and McPherson houses, the 1910 Sturgeon Gilbert×Josie house, Lynch’s wife Laura without a Newman on the original, and the Buffalo Baker household whose Soundex card misnamed Gilbert John as Robert, the 1910 Buffalo Gilbert, John house next door to Baker, Robert H., and the Soundex Douglas card that shows the clerks indexed filmed Buffalo sheets, the 1910 Buffalo Bales house first read as Bowman, and the 1920 Bowman Henry, Jack, and Dean George originals that are other people. This volume folds those chats into one narrative. The case dossier remains the working file; this book is the public reading of it. Sibling work on Greene ED 37 through 41 is now on merged PR #26 through Pass 59; remaining Greene ED 38 B-sides, 1900 Liberty, and 1900 hh 85 are inventoried, not duplicated. Do not import their “Dora E. Stone” as this woman.</w:t>
+        <w:t>One hundred seventeen Cursor chats on this repository were reviewed for this volume (primary research, helpers, scans, and failed browser hunts). The original mobile session opened the case and read the Arkansas death certificate the family still holds. Later sessions recovered the 1880 childhood schedule that free transcripts had missed, walked statewide Soundex reels for 1910 and 1920, tested a Peebles third-marriage hypothesis and set it aside, and photographed NARA microfilm frames — the 1880 childhood schedule, the 1910 Kentucky Ella Miracode plates, Hardin Gray on Sturgeon sheet 13 B, the 1860 Owsley original of Silas Gray’s house with William aged thirteen, the 1850 Owsley Gray pages that are other men (Thomas, James, John, Charles), the given-name Silas plates that are other boys (Ratliff eight months, Wilson six, Phillips fifteen) and the Bowman line first read as Cyrus and then as Squire, the 1850 Estill Marcus Gray original, Breathitt’s Taulbee infant Silas and Bryant Siras, and Madison’s John Green house with Silas Green aged twenty, the 1850 Owsley Harrison Newman house with an eight-year-old Elias who is probably Dora’s father — a 1932 death extract names Henry Harrison Newnam as that father — and is not merged as proven, the 1860 Booneville original of that house under H.H. Newman with Elias aged eighteen, the 1850 William Newman house of twenty-six on the same page, the 1850 John Newman of sixty born in Tennessee who is not the 1880 John of sixty-nine, and Andrew Mays’s Giles at one month in 1850 and eleven in 1860, the 1870 Proctor original of James Brandenburg’s house, Silas Gray’s Sturgeon original, the 1880 District 59 originals of William next door to John Newnam and of Silas still in the district, the 1900 William Gray dwelling-84 crop, and the Bollinger page a sibling had labelled “Dora E. Stone,” which is Henry C. Rhodes and Dora M. of Missouri, and the 1920 Booneville, Buffalo, and Buck Creek originals with the rejected Taylor, Marcum, Magee, McIntosh, Baker, and McPherson houses, the 1910 Sturgeon Gilbert×Josie house, Lynch’s wife Laura without a Newman on the original, and the Buffalo Baker household whose Soundex card misnamed Gilbert John as Robert, the 1910 Buffalo Gilbert, John house next door to Baker, Robert H., and the Soundex Douglas card that shows the clerks indexed filmed Buffalo sheets, the 1910 Buffalo Bales house first read as Bowman, and the 1920 Bowman Henry, Jack, and Dean George originals that are other people. This volume folds those chats into one narrative. The case dossier remains the working file; this book is the public reading of it. Sibling work on Greene ED 37 through 41 is now on merged PR #26 through Pass 59; remaining Greene ED 38 B-sides, 1900 Liberty, and 1900 hh 85 are inventoried, not duplicated. Do not import their “Dora E. Stone” as this woman.</w:t>
       </w:r>
     </w:p>
     <w:p>
@@ -633,7 +633,61 @@
         <w:t>Estill</w:t>
       </w:r>
       <w:r>
-        <w:t xml:space="preserve">. The G-000 Soundex card copies that original. Henry and Nancy plus Owsley Buffalo plus Eliza/Elzie and Luther make the 1910–1920 identification probable; Nancy’s age jumps thirteen years in ten and is not averaged. He is not on the missing sheet 1. The R-200 Elizabeth E-window has Rice Elizabeth, eighty-two, of Lawrence, and a seventeen-year-old Greenup sister-in-law — neither is the 1910 widow of forty-six; the Benjamin B-window has Ben A. of Pendleton, Ben H. of Mason, and Ben W. of Hancock, and no Rice Benjamin about thirty-five with Cynthia in Owsley. Ross, Ballard G., forty-six, of Owsley district </w:t>
+        <w:t xml:space="preserve">. The G-000 Soundex card copies that original. Henry and Nancy plus Owsley Buffalo plus Eliza/Elzie and Luther make the 1910–1920 identification probable; Nancy’s age jumps thirteen years in ten and is not averaged. He is not on the missing sheet 1. Next door on that same sheet, dwelling </w:t>
+      </w:r>
+      <w:r>
+        <w:rPr>
+          <w:b/>
+        </w:rPr>
+        <w:t>106</w:t>
+      </w:r>
+      <w:r>
+        <w:t xml:space="preserve">, is </w:t>
+      </w:r>
+      <w:r>
+        <w:rPr>
+          <w:b/>
+        </w:rPr>
+        <w:t>Daniel, Reece</w:t>
+      </w:r>
+      <w:r>
+        <w:t xml:space="preserve">, thirty-eight, with </w:t>
+      </w:r>
+      <w:r>
+        <w:rPr>
+          <w:b/>
+        </w:rPr>
+        <w:t>Lula</w:t>
+      </w:r>
+      <w:r>
+        <w:t xml:space="preserve">, twenty-eight, and </w:t>
+      </w:r>
+      <w:r>
+        <w:rPr>
+          <w:b/>
+        </w:rPr>
+        <w:t>Bessie</w:t>
+      </w:r>
+      <w:r>
+        <w:t xml:space="preserve">, ten — probably the 1910 dwelling 27 house whose head was written </w:t>
+      </w:r>
+      <w:r>
+        <w:rPr>
+          <w:b/>
+        </w:rPr>
+        <w:t>Gaine[?], Reece</w:t>
+      </w:r>
+      <w:r>
+        <w:t xml:space="preserve">, twenty-six, and whose wife line was written in full </w:t>
+      </w:r>
+      <w:r>
+        <w:rPr>
+          <w:b/>
+        </w:rPr>
+        <w:t>Daniel, Linda</w:t>
+      </w:r>
+      <w:r>
+        <w:t xml:space="preserve">, nineteen, with infant Bessie. The given name Reece, daughter Bessie (four months to ten years), Buffalo neighbor Gay Henry, and the 1910 wife surname Daniel are the identifiers; the head surname Gaine versus Daniel, Reece aging twelve years in ten, and Linda versus Lula aging nine are disclosed and not averaged. Kentucky’s G-500 Soundex has no Reece Gaine of about thirty-six in Owsley; that miss is expected if the true surname is Daniel. The R-200 Elizabeth E-window has Rice Elizabeth, eighty-two, of Lawrence, and a seventeen-year-old Greenup sister-in-law — neither is the 1910 widow of forty-six; the Benjamin B-window has Ben A. of Pendleton, Ben H. of Mason, and Ben W. of Hancock, and no Rice Benjamin about thirty-five with Cynthia in Owsley. Ross, Ballard G., forty-six, of Owsley district </w:t>
       </w:r>
       <w:r>
         <w:rPr>
@@ -984,7 +1038,34 @@
         <w:t>Gabbard, Michael</w:t>
       </w:r>
       <w:r>
-        <w:t xml:space="preserve">, sixty-seven, is not the 1910 Michael of about twenty-five. Wolfe’s 1861–1909 marriage list, Clay’s G and N–Q grooms and G and M–N brides, and two Estill minister-return plates from 1901 and 1902 have no Josephine Newnam × Gilbert license; those Estill plates are eight couples each, not a county-wide search. Breathitt’s marriage pages still did not open. In January 1920 he is on the Island Creek original — Owsley district 90, sheet 7 A, dwelling 113 — </w:t>
+        <w:t xml:space="preserve">, sixty-seven, is not the 1910 Michael of about twenty-five. Kentucky’s M-253 denser Daniel window has no McIntosh, Daniel of about fifty-two in Owsley; a continuation card names Lecy and Donie, not the 1910 Buffalo children, and a Knox Daniel of twenty-three is another man. G-163 has no Willis of about forty with Jane and Sudie, and no Michael of about thirty-five with Addie; Mellie, fifteen, of Owsley district 94 is a step-daughter in another house. Remaining C-652 James cards — Crank of Jackson, aged fourteen, Crenshaw of Louisville, aged twenty-six — are other men. The 1910 sheet 2 re-read corrects Jacob’s wife to </w:t>
+      </w:r>
+      <w:r>
+        <w:rPr>
+          <w:b/>
+        </w:rPr>
+        <w:t>Lyda</w:t>
+      </w:r>
+      <w:r>
+        <w:t xml:space="preserve">, seventy-seven, Dean’s widow to </w:t>
+      </w:r>
+      <w:r>
+        <w:rPr>
+          <w:b/>
+        </w:rPr>
+        <w:t>Maggie</w:t>
+      </w:r>
+      <w:r>
+        <w:t xml:space="preserve">, sixty-five, and Gabbard dwelling 33 to </w:t>
+      </w:r>
+      <w:r>
+        <w:rPr>
+          <w:b/>
+        </w:rPr>
+        <w:t>Willis</w:t>
+      </w:r>
+      <w:r>
+        <w:t xml:space="preserve">, not Lewis. Wolfe’s 1861–1909 marriage list, Clay’s G and N–Q grooms and G and M–N brides, and two Estill minister-return plates from 1901 and 1902 have no Josephine Newnam × Gilbert license; those Estill plates are eight couples each, not a county-wide search. Breathitt’s marriage pages still did not open. In January 1920 he is on the Island Creek original — Owsley district 90, sheet 7 A, dwelling 113 — </w:t>
       </w:r>
       <w:r>
         <w:rPr>

</xml_diff>

<commit_message>
Dora pass 89: close Torrent/Holly/Stillwater on T625-602
Read every Wolfe leaf 0443–0514 on the 515-image IA scan. Torrent 238 ends at 0471; Holly 239 official start is 0472 (pass 88 0476 start withdrawn) and ends at 0486; Stillwater 240 starts at 0488. Clifty after sheet 1 and Antioch 242 are not on this scan. Bell ED 30 closes at 0659; ED 28 is not closed at 0619 (0621 is still sheet 7A). FS catalog IDs remain SPA (R011-39). Working Word rebuilt; authored latest.docx not overwritten.

Co-authored-by: blakereaganlaw <blakereaganlaw@gmail.com>
</commit_message>
<xml_diff>
--- a/research/dora-ella-newnam/book/Dora-Ella-Newnam-Stone-A-Life.docx
+++ b/research/dora-ella-newnam/book/Dora-Ella-Newnam-Stone-A-Life.docx
@@ -196,6 +196,11 @@
     </w:p>
     <w:p>
       <w:r>
+        <w:t>34. [Pass 89. Holly starts at 472, and two Bell districts close](#pass-89-holly-starts-at-472-and-two-bell-districts-close)</w:t>
+      </w:r>
+    </w:p>
+    <w:p>
+      <w:r>
         <w:br w:type="page"/>
       </w:r>
     </w:p>
@@ -5177,6 +5182,163 @@
       </w:r>
     </w:p>
     <w:p>
+      <w:pPr>
+        <w:pStyle w:val="Heading2"/>
+      </w:pPr>
+      <w:r>
+        <w:t>Pass 89. Holly starts at 472, and two Bell districts close</w:t>
+      </w:r>
+    </w:p>
+    <w:p>
+      <w:r>
+        <w:t>Pass 88 isolated the official starts. This pass read every remaining name line on those four Wolfe districts that sit on the 515-image Internet Archive scan, and closed two Bell districts.</w:t>
+      </w:r>
+    </w:p>
+    <w:p>
+      <w:r>
+        <w:t xml:space="preserve">Torrent, district </w:t>
+      </w:r>
+      <w:r>
+        <w:rPr>
+          <w:b/>
+        </w:rPr>
+        <w:t>238</w:t>
+      </w:r>
+      <w:r>
+        <w:t>, runs leaves 443 through 471. Leaf 471 is leftover lines only, 31 January, Joel Cox — the official Torrent end on this scan. Sampled names are Wells, Brooks, Miller, Johnson, Trent, Nickell, Bond, Pelfrey. No Newman head. [C886] [C894] [S573] [S574]</w:t>
+      </w:r>
+    </w:p>
+    <w:p>
+      <w:r>
+        <w:t xml:space="preserve">Holly does not start at leaf 476. Leaf </w:t>
+      </w:r>
+      <w:r>
+        <w:rPr>
+          <w:b/>
+        </w:rPr>
+        <w:t>472</w:t>
+      </w:r>
+      <w:r>
+        <w:t xml:space="preserve"> is Magisterial District No 5 Holly, district </w:t>
+      </w:r>
+      <w:r>
+        <w:rPr>
+          <w:b/>
+        </w:rPr>
+        <w:t>239</w:t>
+      </w:r>
+      <w:r>
+        <w:t>, 2 January, Ola H. Miller. That is the official start. Leaf 476, dated 27 January, is a later Holly sheet. The pass 88 “official start” label on 476 is withdrawn. [C887] [C870] [S575]</w:t>
+      </w:r>
+    </w:p>
+    <w:p>
+      <w:r>
+        <w:t>Leaf 486, 19 January, ends the district. The enumerator wrote “Here ends the enumeration of Magisterial District No 5 Holly.” Leaf 487 is unused. [C888] [C889] [S576] [S577]</w:t>
+      </w:r>
+    </w:p>
+    <w:p>
+      <w:r>
+        <w:t xml:space="preserve">Stillwater, district </w:t>
+      </w:r>
+      <w:r>
+        <w:rPr>
+          <w:b/>
+        </w:rPr>
+        <w:t>240</w:t>
+      </w:r>
+      <w:r>
+        <w:t xml:space="preserve">, starts at leaf </w:t>
+      </w:r>
+      <w:r>
+        <w:rPr>
+          <w:b/>
+        </w:rPr>
+        <w:t>488</w:t>
+      </w:r>
+      <w:r>
+        <w:t>, 2 January — not at the mid-district samples on 500 and 512. Leaf 513 is unused. [C890] [C891] [S578] [S579]</w:t>
+      </w:r>
+    </w:p>
+    <w:p>
+      <w:r>
+        <w:t xml:space="preserve">Clifty, district </w:t>
+      </w:r>
+      <w:r>
+        <w:rPr>
+          <w:b/>
+        </w:rPr>
+        <w:t>241</w:t>
+      </w:r>
+      <w:r>
+        <w:t xml:space="preserve">, is still only sheet 1 on this scan: leaf 514, Roy Kash, households matching the published first ten — Layne, Campbell, Center, Heizer, Creech, Ross, Culbertson. The published Clifty list has about ninety-two households. The rest, and all of Antioch district </w:t>
+      </w:r>
+      <w:r>
+        <w:rPr>
+          <w:b/>
+        </w:rPr>
+        <w:t>242</w:t>
+      </w:r>
+      <w:r>
+        <w:t>, are not on the 515 images. A machine pass over every Wolfe leaf 443–514 found no Newman token. The published Holly, Stillwater, Clifty, and Antioch lists are the same negative. John L. Hollon, John L. Henry, John L. Camble, and the various Dora and Cora given-names on those lists are already rejected. [C892] [C893] [C896] [C900] [S580] [S581] [S586]</w:t>
+      </w:r>
+    </w:p>
+    <w:p>
+      <w:r>
+        <w:t xml:space="preserve">Bell district </w:t>
+      </w:r>
+      <w:r>
+        <w:rPr>
+          <w:b/>
+        </w:rPr>
+        <w:t>28</w:t>
+      </w:r>
+      <w:r>
+        <w:t xml:space="preserve">, Ingram Precinct 22, is </w:t>
+      </w:r>
+      <w:r>
+        <w:rPr>
+          <w:b/>
+        </w:rPr>
+        <w:t>not</w:t>
+      </w:r>
+      <w:r>
+        <w:t xml:space="preserve"> closed at leaf 619. Turner’s sheet 6A on that leaf is Pursifull, Fuson, Barnett, Goodin, Mason — no Newman. Leaf 621 is still district 28, sheet 7A, 14 January, W. G. Innes. A machine pass over leaves 620–642 found no Newman token. [C897] [C906] [C909] [S582] [S592]</w:t>
+      </w:r>
+    </w:p>
+    <w:p>
+      <w:r>
+        <w:t xml:space="preserve">Bell district </w:t>
+      </w:r>
+      <w:r>
+        <w:rPr>
+          <w:b/>
+        </w:rPr>
+        <w:t>30</w:t>
+      </w:r>
+      <w:r>
+        <w:t xml:space="preserve">, Williams Branch Precinct 24, is complete — leaves 643 through 659. Sheet 7A, 23 February, P. W. Woolum, ends with the enumerator’s own words: “Here ends the enumeration of Williams Branch Precinct 24.” Miracle, Yeary, Simpson. No Newman. Leaf 660 is unused. Leaf 661 is already Dorothy Precinct 26, district </w:t>
+      </w:r>
+      <w:r>
+        <w:rPr>
+          <w:b/>
+        </w:rPr>
+        <w:t>31</w:t>
+      </w:r>
+      <w:r>
+        <w:t>, sheet 1A, 2 February, John H. Lee. [C898] [C899] [S583] [S584] [S585]</w:t>
+      </w:r>
+    </w:p>
+    <w:p>
+      <w:r>
+        <w:t>FamilySearch 127913, 127869, and 1146342 were empty shells again — roadblock step 39. Book 6 still has Floyd and Allie A. on 31 July 1902, and Boyde Newnam only as a witness in 1900. Certificates 28501 and 31780 are still not those numbers. Woodford’s free obituary index has Mrs. Alice Ashmore Newman and not John L. in 1966. [C901] [C902] [C903] [C904] [S587] [S588] [S589] [S590]</w:t>
+      </w:r>
+    </w:p>
+    <w:p>
+      <w:r>
+        <w:t>Do not print 1966 or 1976 as proven deaths. Do not print Floyd as Boyd. Do not print 1962 as McCoy’s death. Do not print the 1942 Combs charge as fact.</w:t>
+      </w:r>
+    </w:p>
+    <w:p>
       <w:r>
         <w:t xml:space="preserve">In Madison County in 1950 a </w:t>
       </w:r>
@@ -6262,16 +6424,115 @@
         <w:rPr>
           <w:b/>
         </w:rPr>
-        <w:t>28/30</w:t>
-      </w:r>
-      <w:r>
-        <w:t xml:space="preserve"> starts </w:t>
-      </w:r>
-      <w:r>
-        <w:rPr>
-          <w:b/>
-        </w:rPr>
-        <w:t>isolated</w:t>
+        <w:t>28</w:t>
+      </w:r>
+      <w:r>
+        <w:t xml:space="preserve"> Turner sheets </w:t>
+      </w:r>
+      <w:r>
+        <w:rPr>
+          <w:b/>
+        </w:rPr>
+        <w:t>PROBABLE</w:t>
+      </w:r>
+      <w:r>
+        <w:t xml:space="preserve"> nil (</w:t>
+      </w:r>
+      <w:r>
+        <w:rPr>
+          <w:b/>
+        </w:rPr>
+        <w:t>C897</w:t>
+      </w:r>
+      <w:r>
+        <w:t xml:space="preserve">; full-ED close withdrawn </w:t>
+      </w:r>
+      <w:r>
+        <w:rPr>
+          <w:b/>
+        </w:rPr>
+        <w:t>C909</w:t>
+      </w:r>
+      <w:r>
+        <w:t xml:space="preserve">); ED </w:t>
+      </w:r>
+      <w:r>
+        <w:rPr>
+          <w:b/>
+        </w:rPr>
+        <w:t>30</w:t>
+      </w:r>
+      <w:r>
+        <w:t xml:space="preserve"> </w:t>
+      </w:r>
+      <w:r>
+        <w:rPr>
+          <w:b/>
+        </w:rPr>
+        <w:t>COMPLETE</w:t>
+      </w:r>
+      <w:r>
+        <w:t xml:space="preserve"> and </w:t>
+      </w:r>
+      <w:r>
+        <w:rPr>
+          <w:b/>
+        </w:rPr>
+        <w:t>PROBABLE</w:t>
+      </w:r>
+      <w:r>
+        <w:t xml:space="preserve"> nil (</w:t>
+      </w:r>
+      <w:r>
+        <w:rPr>
+          <w:b/>
+        </w:rPr>
+        <w:t>C898</w:t>
+      </w:r>
+      <w:r>
+        <w:t xml:space="preserve">); Wolfe Torrent </w:t>
+      </w:r>
+      <w:r>
+        <w:rPr>
+          <w:b/>
+        </w:rPr>
+        <w:t>238</w:t>
+      </w:r>
+      <w:r>
+        <w:t xml:space="preserve"> </w:t>
+      </w:r>
+      <w:r>
+        <w:rPr>
+          <w:b/>
+        </w:rPr>
+        <w:t>0443–0471</w:t>
+      </w:r>
+      <w:r>
+        <w:t xml:space="preserve"> closed; Holly </w:t>
+      </w:r>
+      <w:r>
+        <w:rPr>
+          <w:b/>
+        </w:rPr>
+        <w:t>239</w:t>
+      </w:r>
+      <w:r>
+        <w:t xml:space="preserve"> start </w:t>
+      </w:r>
+      <w:r>
+        <w:rPr>
+          <w:b/>
+        </w:rPr>
+        <w:t>0472</w:t>
+      </w:r>
+      <w:r>
+        <w:t xml:space="preserve"> / end </w:t>
+      </w:r>
+      <w:r>
+        <w:rPr>
+          <w:b/>
+        </w:rPr>
+        <w:t>0486</w:t>
       </w:r>
       <w:r>
         <w:t xml:space="preserve"> (</w:t>
@@ -6280,28 +6541,46 @@
         <w:rPr>
           <w:b/>
         </w:rPr>
-        <w:t>C858 C861</w:t>
-      </w:r>
-      <w:r>
-        <w:t xml:space="preserve">); Wolfe </w:t>
-      </w:r>
-      <w:r>
-        <w:rPr>
-          <w:b/>
-        </w:rPr>
-        <w:t>238–241</w:t>
-      </w:r>
-      <w:r>
-        <w:t xml:space="preserve"> originals </w:t>
-      </w:r>
-      <w:r>
-        <w:rPr>
-          <w:b/>
-        </w:rPr>
-        <w:t>isolated</w:t>
-      </w:r>
-      <w:r>
-        <w:t xml:space="preserve">, Antioch </w:t>
+        <w:t>C870</w:t>
+      </w:r>
+      <w:r>
+        <w:t xml:space="preserve"> start withdrawn); Stillwater </w:t>
+      </w:r>
+      <w:r>
+        <w:rPr>
+          <w:b/>
+        </w:rPr>
+        <w:t>240</w:t>
+      </w:r>
+      <w:r>
+        <w:t xml:space="preserve"> start </w:t>
+      </w:r>
+      <w:r>
+        <w:rPr>
+          <w:b/>
+        </w:rPr>
+        <w:t>0488</w:t>
+      </w:r>
+      <w:r>
+        <w:t xml:space="preserve">; Clifty </w:t>
+      </w:r>
+      <w:r>
+        <w:rPr>
+          <w:b/>
+        </w:rPr>
+        <w:t>241</w:t>
+      </w:r>
+      <w:r>
+        <w:t xml:space="preserve"> sh </w:t>
+      </w:r>
+      <w:r>
+        <w:rPr>
+          <w:b/>
+        </w:rPr>
+        <w:t>1</w:t>
+      </w:r>
+      <w:r>
+        <w:t xml:space="preserve"> only; Antioch </w:t>
       </w:r>
       <w:r>
         <w:rPr>
@@ -6316,10 +6595,19 @@
         <w:rPr>
           <w:b/>
         </w:rPr>
-        <w:t>C875</w:t>
-      </w:r>
-      <w:r>
-        <w:t xml:space="preserve">); </w:t>
+        <w:t>C892</w:t>
+      </w:r>
+      <w:r>
+        <w:t xml:space="preserve">); remaining Bell </w:t>
+      </w:r>
+      <w:r>
+        <w:rPr>
+          <w:b/>
+        </w:rPr>
+        <w:t>25–27 / 29 / 31–34</w:t>
+      </w:r>
+      <w:r>
+        <w:t xml:space="preserve"> unread; </w:t>
       </w:r>
       <w:r>
         <w:rPr>
@@ -6737,7 +7025,7 @@
         <w:t>B088</w:t>
       </w:r>
       <w:r>
-        <w:t xml:space="preserve"> unread Torrent/Holly/Stillwater/Clifty full-sheet name lines + Antioch </w:t>
+        <w:t xml:space="preserve"> remaining Clifty after sheet 1 + Antioch </w:t>
       </w:r>
       <w:r>
         <w:rPr>
@@ -6752,7 +7040,7 @@
         <w:rPr>
           <w:b/>
         </w:rPr>
-        <w:t>25–34</w:t>
+        <w:t>25–27 / 29 / 31–34</w:t>
       </w:r>
       <w:r>
         <w:t xml:space="preserve"> full-sheet lines, </w:t>
@@ -15233,6 +15521,441 @@
     </w:p>
     <w:p>
       <w:r>
+        <w:t xml:space="preserve">141. T625-602 every leaf </w:t>
+      </w:r>
+      <w:r>
+        <w:rPr>
+          <w:b/>
+        </w:rPr>
+        <w:t>0443–0471</w:t>
+      </w:r>
+      <w:r>
+        <w:t xml:space="preserve"> w1200: Torrent ED </w:t>
+      </w:r>
+      <w:r>
+        <w:rPr>
+          <w:b/>
+        </w:rPr>
+        <w:t>238</w:t>
+      </w:r>
+      <w:r>
+        <w:t xml:space="preserve"> closed; </w:t>
+      </w:r>
+      <w:r>
+        <w:rPr>
+          <w:b/>
+        </w:rPr>
+        <w:t>0471</w:t>
+      </w:r>
+      <w:r>
+        <w:t xml:space="preserve"> leftover 31 Jan Joel Cox. IA [`14thcensusofpopu602unit`](https://archive.org/details/14thcensusofpopu602unit). *Image seen.* </w:t>
+      </w:r>
+      <w:r>
+        <w:rPr>
+          <w:b/>
+        </w:rPr>
+        <w:t>C886 C894</w:t>
+      </w:r>
+      <w:r>
+        <w:t xml:space="preserve"> </w:t>
+      </w:r>
+      <w:r>
+        <w:rPr>
+          <w:b/>
+        </w:rPr>
+        <w:t>S573 S574</w:t>
+      </w:r>
+      <w:r>
+        <w:t>.</w:t>
+      </w:r>
+    </w:p>
+    <w:p>
+      <w:r>
+        <w:t xml:space="preserve">142. Leaf </w:t>
+      </w:r>
+      <w:r>
+        <w:rPr>
+          <w:b/>
+        </w:rPr>
+        <w:t>0472</w:t>
+      </w:r>
+      <w:r>
+        <w:t xml:space="preserve"> w1200: Holly ED </w:t>
+      </w:r>
+      <w:r>
+        <w:rPr>
+          <w:b/>
+        </w:rPr>
+        <w:t>239</w:t>
+      </w:r>
+      <w:r>
+        <w:t xml:space="preserve"> official start 2 Jan Ola H. Miller. </w:t>
+      </w:r>
+      <w:r>
+        <w:rPr>
+          <w:b/>
+        </w:rPr>
+        <w:t>C870</w:t>
+      </w:r>
+      <w:r>
+        <w:t xml:space="preserve"> start withdrawn. *Image seen.* </w:t>
+      </w:r>
+      <w:r>
+        <w:rPr>
+          <w:b/>
+        </w:rPr>
+        <w:t>C887</w:t>
+      </w:r>
+      <w:r>
+        <w:t xml:space="preserve"> </w:t>
+      </w:r>
+      <w:r>
+        <w:rPr>
+          <w:b/>
+        </w:rPr>
+        <w:t>S575</w:t>
+      </w:r>
+      <w:r>
+        <w:t>.</w:t>
+      </w:r>
+    </w:p>
+    <w:p>
+      <w:r>
+        <w:t xml:space="preserve">143. Leaf </w:t>
+      </w:r>
+      <w:r>
+        <w:rPr>
+          <w:b/>
+        </w:rPr>
+        <w:t>0486</w:t>
+      </w:r>
+      <w:r>
+        <w:t xml:space="preserve">: “Here ends … Magisterial District No 5 Holly.” </w:t>
+      </w:r>
+      <w:r>
+        <w:rPr>
+          <w:b/>
+        </w:rPr>
+        <w:t>0487</w:t>
+      </w:r>
+      <w:r>
+        <w:t xml:space="preserve"> unused. </w:t>
+      </w:r>
+      <w:r>
+        <w:rPr>
+          <w:b/>
+        </w:rPr>
+        <w:t>0488</w:t>
+      </w:r>
+      <w:r>
+        <w:t xml:space="preserve"> = Stillwater ED </w:t>
+      </w:r>
+      <w:r>
+        <w:rPr>
+          <w:b/>
+        </w:rPr>
+        <w:t>240</w:t>
+      </w:r>
+      <w:r>
+        <w:t xml:space="preserve"> official start. </w:t>
+      </w:r>
+      <w:r>
+        <w:rPr>
+          <w:b/>
+        </w:rPr>
+        <w:t>0513</w:t>
+      </w:r>
+      <w:r>
+        <w:t xml:space="preserve"> unused. *Image seen.* </w:t>
+      </w:r>
+      <w:r>
+        <w:rPr>
+          <w:b/>
+        </w:rPr>
+        <w:t>C888–C891</w:t>
+      </w:r>
+      <w:r>
+        <w:t xml:space="preserve"> </w:t>
+      </w:r>
+      <w:r>
+        <w:rPr>
+          <w:b/>
+        </w:rPr>
+        <w:t>S576–S579</w:t>
+      </w:r>
+      <w:r>
+        <w:t>.</w:t>
+      </w:r>
+    </w:p>
+    <w:p>
+      <w:r>
+        <w:t xml:space="preserve">144. Leaf </w:t>
+      </w:r>
+      <w:r>
+        <w:rPr>
+          <w:b/>
+        </w:rPr>
+        <w:t>0514</w:t>
+      </w:r>
+      <w:r>
+        <w:t xml:space="preserve"> = Clifty ED </w:t>
+      </w:r>
+      <w:r>
+        <w:rPr>
+          <w:b/>
+        </w:rPr>
+        <w:t>241</w:t>
+      </w:r>
+      <w:r>
+        <w:t xml:space="preserve"> sh </w:t>
+      </w:r>
+      <w:r>
+        <w:rPr>
+          <w:b/>
+        </w:rPr>
+        <w:t>1</w:t>
+      </w:r>
+      <w:r>
+        <w:t xml:space="preserve">, last populated Wolfe image. </w:t>
+      </w:r>
+      <w:r>
+        <w:rPr>
+          <w:b/>
+        </w:rPr>
+        <w:t>0515</w:t>
+      </w:r>
+      <w:r>
+        <w:t xml:space="preserve"> does not exist. Remaining Clifty + Antioch </w:t>
+      </w:r>
+      <w:r>
+        <w:rPr>
+          <w:b/>
+        </w:rPr>
+        <w:t>242</w:t>
+      </w:r>
+      <w:r>
+        <w:t xml:space="preserve"> not on this scan. Compiled [1920g/h/i/k](https://kygenweb.net/wolfe/census1.htm) </w:t>
+      </w:r>
+      <w:r>
+        <w:rPr>
+          <w:b/>
+        </w:rPr>
+        <w:t>nil</w:t>
+      </w:r>
+      <w:r>
+        <w:t xml:space="preserve"> Newman. *Image seen / transcription only.* </w:t>
+      </w:r>
+      <w:r>
+        <w:rPr>
+          <w:b/>
+        </w:rPr>
+        <w:t>C892 C896 C900</w:t>
+      </w:r>
+      <w:r>
+        <w:t xml:space="preserve"> </w:t>
+      </w:r>
+      <w:r>
+        <w:rPr>
+          <w:b/>
+        </w:rPr>
+        <w:t>S580 S581</w:t>
+      </w:r>
+      <w:r>
+        <w:t>.</w:t>
+      </w:r>
+    </w:p>
+    <w:p>
+      <w:r>
+        <w:t xml:space="preserve">145. T625-559 ED </w:t>
+      </w:r>
+      <w:r>
+        <w:rPr>
+          <w:b/>
+        </w:rPr>
+        <w:t>28</w:t>
+      </w:r>
+      <w:r>
+        <w:t xml:space="preserve"> Turner sheets </w:t>
+      </w:r>
+      <w:r>
+        <w:rPr>
+          <w:b/>
+        </w:rPr>
+        <w:t>0609–0619</w:t>
+      </w:r>
+      <w:r>
+        <w:t xml:space="preserve">; </w:t>
+      </w:r>
+      <w:r>
+        <w:rPr>
+          <w:b/>
+        </w:rPr>
+        <w:t>0619</w:t>
+      </w:r>
+      <w:r>
+        <w:t xml:space="preserve"> sh </w:t>
+      </w:r>
+      <w:r>
+        <w:rPr>
+          <w:b/>
+        </w:rPr>
+        <w:t>6 A</w:t>
+      </w:r>
+      <w:r>
+        <w:t xml:space="preserve"> 12 Jan. </w:t>
+      </w:r>
+      <w:r>
+        <w:rPr>
+          <w:b/>
+        </w:rPr>
+        <w:t>0621</w:t>
+      </w:r>
+      <w:r>
+        <w:t xml:space="preserve"> still ED </w:t>
+      </w:r>
+      <w:r>
+        <w:rPr>
+          <w:b/>
+        </w:rPr>
+        <w:t>28</w:t>
+      </w:r>
+      <w:r>
+        <w:t xml:space="preserve"> sh </w:t>
+      </w:r>
+      <w:r>
+        <w:rPr>
+          <w:b/>
+        </w:rPr>
+        <w:t>7 A</w:t>
+      </w:r>
+      <w:r>
+        <w:t xml:space="preserve"> (</w:t>
+      </w:r>
+      <w:r>
+        <w:rPr>
+          <w:b/>
+        </w:rPr>
+        <w:t>C897</w:t>
+      </w:r>
+      <w:r>
+        <w:t xml:space="preserve"> full-ED close withdrawn). ED </w:t>
+      </w:r>
+      <w:r>
+        <w:rPr>
+          <w:b/>
+        </w:rPr>
+        <w:t>30</w:t>
+      </w:r>
+      <w:r>
+        <w:t xml:space="preserve"> </w:t>
+      </w:r>
+      <w:r>
+        <w:rPr>
+          <w:b/>
+        </w:rPr>
+        <w:t>0643–0659</w:t>
+      </w:r>
+      <w:r>
+        <w:t xml:space="preserve"> complete; </w:t>
+      </w:r>
+      <w:r>
+        <w:rPr>
+          <w:b/>
+        </w:rPr>
+        <w:t>0659</w:t>
+      </w:r>
+      <w:r>
+        <w:t xml:space="preserve"> “Here ends … Williams Branch Precinct 24.” </w:t>
+      </w:r>
+      <w:r>
+        <w:rPr>
+          <w:b/>
+        </w:rPr>
+        <w:t>0661</w:t>
+      </w:r>
+      <w:r>
+        <w:t xml:space="preserve"> = ED </w:t>
+      </w:r>
+      <w:r>
+        <w:rPr>
+          <w:b/>
+        </w:rPr>
+        <w:t>31</w:t>
+      </w:r>
+      <w:r>
+        <w:t xml:space="preserve"> Dorothy sh </w:t>
+      </w:r>
+      <w:r>
+        <w:rPr>
+          <w:b/>
+        </w:rPr>
+        <w:t>1 A</w:t>
+      </w:r>
+      <w:r>
+        <w:t xml:space="preserve">. IA [`14thcensusofpopu559unit`](https://archive.org/details/14thcensusofpopu559unit). *Image seen.* </w:t>
+      </w:r>
+      <w:r>
+        <w:rPr>
+          <w:b/>
+        </w:rPr>
+        <w:t>C897–C899 C909</w:t>
+      </w:r>
+      <w:r>
+        <w:t xml:space="preserve"> </w:t>
+      </w:r>
+      <w:r>
+        <w:rPr>
+          <w:b/>
+        </w:rPr>
+        <w:t>S582–S585 S592</w:t>
+      </w:r>
+      <w:r>
+        <w:t>.</w:t>
+      </w:r>
+    </w:p>
+    <w:p>
+      <w:r>
+        <w:t xml:space="preserve">146. FS </w:t>
+      </w:r>
+      <w:r>
+        <w:rPr>
+          <w:b/>
+        </w:rPr>
+        <w:t>127913 / 127869 / 1146342</w:t>
+      </w:r>
+      <w:r>
+        <w:t xml:space="preserve"> SPA (R011-39). Book 6 compiled [re-seen](https://usgennet.org/usa/ky/county/lee/marriage/marrbook6.html). Certs </w:t>
+      </w:r>
+      <w:r>
+        <w:rPr>
+          <w:b/>
+        </w:rPr>
+        <w:t>28501 / 31780</w:t>
+      </w:r>
+      <w:r>
+        <w:t xml:space="preserve"> unread. Woodford [GT obits](https://genealogytrails.com/ken/woodford/obits.html) only Alice Ashmore Newman. </w:t>
+      </w:r>
+      <w:r>
+        <w:rPr>
+          <w:b/>
+        </w:rPr>
+        <w:t>C901–C904</w:t>
+      </w:r>
+      <w:r>
+        <w:t xml:space="preserve"> </w:t>
+      </w:r>
+      <w:r>
+        <w:rPr>
+          <w:b/>
+        </w:rPr>
+        <w:t>S587–S590</w:t>
+      </w:r>
+      <w:r>
+        <w:t>.</w:t>
+      </w:r>
+    </w:p>
+    <w:p>
+      <w:r>
         <w:br w:type="page"/>
       </w:r>
     </w:p>
@@ -16068,6 +16791,66 @@
     <w:p>
       <w:r>
         <w:t>| S571 | `../sources/census/pass88-extract-2026-10-31.txt` | This session | Pass 88 extract | extract |</w:t>
+      </w:r>
+    </w:p>
+    <w:p>
+      <w:r>
+        <w:t>| S573 | `../sources/census/wolfe-1920-ed238-0443-torrent-pass89.jpg` | [IA T625-602](https://archive.org/details/14thcensusofpopu602unit) | Torrent ED 238 start | image seen |</w:t>
+      </w:r>
+    </w:p>
+    <w:p>
+      <w:r>
+        <w:t>| S575 | `../sources/census/wolfe-1920-ed239-0472-holly-start-pass89.jpg` | [IA T625-602](https://archive.org/details/14thcensusofpopu602unit) | Holly ED 239 official start 2 Jan | image seen |</w:t>
+      </w:r>
+    </w:p>
+    <w:p>
+      <w:r>
+        <w:t>| S576 | `../sources/census/wolfe-1920-ed239-0486-holly-end-pass89.jpg` | [IA T625-602](https://archive.org/details/14thcensusofpopu602unit) | Holly official end | image seen |</w:t>
+      </w:r>
+    </w:p>
+    <w:p>
+      <w:r>
+        <w:t>| S578 | `../sources/census/wolfe-1920-ed240-0488-stillwater-start-pass89.jpg` | [IA T625-602](https://archive.org/details/14thcensusofpopu602unit) | Stillwater ED 240 official start | image seen |</w:t>
+      </w:r>
+    </w:p>
+    <w:p>
+      <w:r>
+        <w:t>| S580 | `../sources/census/wolfe-1920-ed241-0514-clifty-1-pass89.jpg` | [IA T625-602](https://archive.org/details/14thcensusofpopu602unit) | Clifty ED 241 sh 1 last Wolfe image | image seen |</w:t>
+      </w:r>
+    </w:p>
+    <w:p>
+      <w:r>
+        <w:t>| S581 | `../sources/census/pass89/wolfe-tx/` 1920g/h/i/k | [KYGenWeb Wolfe](https://kygenweb.net/wolfe/census1.htm) | Compiled Holly/Stillwater/Clifty/Antioch nil Newman | transcription only |</w:t>
+      </w:r>
+    </w:p>
+    <w:p>
+      <w:r>
+        <w:t>| S582 | `../sources/census/bell-1920-ed28-0619-ingram-6a-pass89.jpg` | [IA T625-559](https://archive.org/details/14thcensusofpopu559unit) | Bell ED 28 sh 6A; ED complete | image seen |</w:t>
+      </w:r>
+    </w:p>
+    <w:p>
+      <w:r>
+        <w:t>| S583 | `../sources/census/bell-1920-ed30-0659-end-pass89.jpg` | [IA T625-559](https://archive.org/details/14thcensusofpopu559unit) | Williams Branch official end | image seen |</w:t>
+      </w:r>
+    </w:p>
+    <w:p>
+      <w:r>
+        <w:t>| S585 | `../sources/census/bell-1920-ed31-0661-dorothy-1a-pass89.jpg` | [IA T625-559](https://archive.org/details/14thcensusofpopu559unit) | Bell ED 31 Dorothy sh 1A | image seen |</w:t>
+      </w:r>
+    </w:p>
+    <w:p>
+      <w:r>
+        <w:t>| S587 | `../sources/catalog/fs-127913-pass89.html` | [FS 127913](https://www.familysearch.org/search/catalog/127913) | R011-39 SPA | catalog |</w:t>
+      </w:r>
+    </w:p>
+    <w:p>
+      <w:r>
+        <w:t>| S590 | `../sources/press/woodford-gt-obits-pass89.html` | [GT Woodford](https://genealogytrails.com/ken/woodford/obits.html) | Only Alice Ashmore Newman | index only |</w:t>
+      </w:r>
+    </w:p>
+    <w:p>
+      <w:r>
+        <w:t>| S591 | `../sources/census/pass89-extract-2026-10-31.txt` | This session | Pass 89 extract | extract |</w:t>
       </w:r>
     </w:p>
     <w:p>

</xml_diff>

<commit_message>
Pass 79: Soundex Evans John W 54 Owsley is original Edmonds, not 1910 Buffalo.
Hard Rule 6 on E-152 leaf 1511; densified Susan window nil; Josephine neighboring-county substitutes still nil.

Co-authored-by: CatCorner22 <CatCorner22@users.noreply.github.com>
</commit_message>
<xml_diff>
--- a/research/dora-ella-newnam/book/Dora-Ella-Newnam-Stone-A-Life.docx
+++ b/research/dora-ella-newnam/book/Dora-Ella-Newnam-Stone-A-Life.docx
@@ -41,7 +41,7 @@
     </w:p>
     <w:p>
       <w:r>
-        <w:t>One hundred seventeen Cursor chats on this repository were reviewed for this volume (primary research, helpers, scans, and failed browser hunts). The original mobile session opened the case and read the Arkansas death certificate the family still holds. Later sessions recovered the 1880 childhood schedule that free transcripts had missed, walked statewide Soundex reels for 1910 and 1920, tested a Peebles third-marriage hypothesis and set it aside, and photographed NARA microfilm frames — the 1880 childhood schedule, the 1910 Kentucky Ella Miracode plates, Hardin Gray on Sturgeon sheet 13 B, the 1860 Owsley original of Silas Gray’s house with William aged thirteen, the 1850 Owsley Gray pages that are other men (Thomas, James, John, Charles), the given-name Silas plates that are other boys (Ratliff eight months, Wilson six, Phillips fifteen) and the Bowman line first read as Cyrus and then as Squire, the 1850 Estill Marcus Gray original, Breathitt’s Taulbee infant Silas and Bryant Siras, and Madison’s John Green house with Silas Green aged twenty, the 1850 Owsley Harrison Newman house with an eight-year-old Elias who is probably Dora’s father — a 1932 death extract names Henry Harrison Newnam as that father — and is not merged as proven, the 1860 Booneville original of that house under H.H. Newman with Elias aged eighteen, the 1850 William Newman house of twenty-six on the same page, the 1850 John Newman of sixty born in Tennessee who is not the 1880 John of sixty-nine, and Andrew Mays’s Giles at one month in 1850 and eleven in 1860, the 1870 Proctor original of James Brandenburg’s house, Silas Gray’s Sturgeon original, the 1880 District 59 originals of William next door to John Newnam and of Silas still in the district, the 1900 William Gray dwelling-84 crop, and the Bollinger page a sibling had labelled “Dora E. Stone,” which is Henry C. Rhodes and Dora M. of Missouri, and the 1920 Booneville, Buffalo, and Buck Creek originals with the rejected Taylor, Marcum, Magee, McIntosh, Baker, and McPherson houses, the 1910 Sturgeon Gilbert×Josie house, Lynch’s wife Laura without a Newman on the original, and the Buffalo Baker household whose Soundex card misnamed Gilbert John as Robert, the 1910 Buffalo Gilbert, John house next door to Baker, Robert H., and the Soundex Douglas card that shows the clerks indexed filmed Buffalo sheets, the 1910 Buffalo Bales house first read as Bowman, and the 1920 Bowman Henry, Jack, and Dean George originals that are other people. This volume folds those chats into one narrative. The case dossier remains the working file; this book is the public reading of it. Sibling work on Greene ED 37 through 41 is now on merged PR #26 through Pass 59; remaining Greene ED 38 B-sides, 1900 Liberty, and 1900 hh 85 are inventoried, not duplicated. Do not import their “Dora E. Stone” as this woman.</w:t>
+        <w:t>One hundred eighteen Cursor chats on this repository were reviewed for this volume (primary research, helpers, scans, and failed browser hunts). The original mobile session opened the case and read the Arkansas death certificate the family still holds. Later sessions recovered the 1880 childhood schedule that free transcripts had missed, walked statewide Soundex reels for 1910 and 1920, tested a Peebles third-marriage hypothesis and set it aside, and photographed NARA microfilm frames — the 1880 childhood schedule, the 1910 Kentucky Ella Miracode plates, Hardin Gray on Sturgeon sheet 13 B, the 1860 Owsley original of Silas Gray’s house with William aged thirteen, the 1850 Owsley Gray pages that are other men (Thomas, James, John, Charles), the given-name Silas plates that are other boys (Ratliff eight months, Wilson six, Phillips fifteen) and the Bowman line first read as Cyrus and then as Squire, the 1850 Estill Marcus Gray original, Breathitt’s Taulbee infant Silas and Bryant Siras, and Madison’s John Green house with Silas Green aged twenty, the 1850 Owsley Harrison Newman house with an eight-year-old Elias who is probably Dora’s father — a 1932 death extract names Henry Harrison Newnam as that father — and is not merged as proven, the 1860 Booneville original of that house under H.H. Newman with Elias aged eighteen, the 1850 William Newman house of twenty-six on the same page, the 1850 John Newman of sixty born in Tennessee who is not the 1880 John of sixty-nine, and Andrew Mays’s Giles at one month in 1850 and eleven in 1860, the 1870 Proctor original of James Brandenburg’s house, Silas Gray’s Sturgeon original, the 1880 District 59 originals of William next door to John Newnam and of Silas still in the district, the 1900 William Gray dwelling-84 crop, and the Bollinger page a sibling had labelled “Dora E. Stone,” which is Henry C. Rhodes and Dora M. of Missouri, and the 1920 Booneville, Buffalo, and Buck Creek originals with the rejected Taylor, Marcum, Magee, McIntosh, Baker, and McPherson houses, the 1910 Sturgeon Gilbert×Josie house, Lynch’s wife Laura without a Newman on the original, and the Buffalo Baker household whose Soundex card misnamed Gilbert John as Robert, the 1910 Buffalo Gilbert, John house next door to Baker, Robert H., and the Soundex Douglas card that shows the clerks indexed filmed Buffalo sheets, the 1910 Buffalo Bales house first read as Bowman, and the 1920 Bowman Henry, Jack, and Dean George originals that are other people. This volume folds those chats into one narrative. The case dossier remains the working file; this book is the public reading of it. Sibling work on Greene ED 37 through 41 is now on merged PR #26 through Pass 59; remaining Greene ED 38 B-sides, 1900 Liberty, and 1900 hh 85 are inventoried, not duplicated. Do not import their “Dora E. Stone” as this woman.</w:t>
       </w:r>
     </w:p>
     <w:p>
@@ -921,7 +921,34 @@
         <w:t>Lacy</w:t>
       </w:r>
       <w:r>
-        <w:t xml:space="preserve">, a daughter-in-law of eighteen. Kentucky’s B-260 Soundex copies that original — volume 76, district 92, sheet 7, line 34 — with the clerk’s spellings Emley and Charley; the original given names are Jesse, Emily, and Chester. Jesse’s age jumps twelve years in ten, Emily’s eleven; those contradictions are disclosed, not averaged. He is not on the missing sheet 1. A neighbouring Baker, Jesse of seventy-two in Owen County lives alone and is another man. Sampled E-152 John cards — Estill thirty-eight with Lula, Daviess a Black man of forty-five with Mary, and others through the Joseph divider — are other men. There is no Evans, John of about fifty-five with Susan on the filmed Buffalo closer sheets or in the sampled John window, and the name columns of filmed sheets 1 A through 5 B have no Evans, John as a head either, so he is not a later-enumerated Buffalo head like Gay, Abner, or Jesse. The 1910 dwelling 31 house is </w:t>
+        <w:t xml:space="preserve">, a daughter-in-law of eighteen. Kentucky’s B-260 Soundex copies that original — volume 76, district 92, sheet 7, line 34 — with the clerk’s spellings Emley and Charley; the original given names are Jesse, Emily, and Chester. Jesse’s age jumps twelve years in ten, Emily’s eleven; those contradictions are disclosed, not averaged. He is not on the missing sheet 1. A neighbouring Baker, Jesse of seventy-two in Owen County lives alone and is another man. Sampled E-152 John cards — Estill thirty-eight with Lula, Daviess a Black man of forty-five with Mary, and others through the Joseph divider — are other men. There is no Evans, John of about fifty-five with Susan on the filmed Buffalo closer sheets or in the sampled John window, and the name columns of filmed sheets 1 A through 5 B have no Evans, John as a head either, so he is not a later-enumerated Buffalo head like Gay, Abner, or Jesse. A denser leftover of even E-152 John leaves does contain one Owsley-labelled card — leaf 1511, Evans, John W., fifty-four, district 88, sheet 1, line 72, with Cassel, nineteen, and Molly, eighteen — but the original Booneville sheet is </w:t>
+      </w:r>
+      <w:r>
+        <w:rPr>
+          <w:b/>
+        </w:rPr>
+        <w:t>Edmonds, John W.</w:t>
+      </w:r>
+      <w:r>
+        <w:t xml:space="preserve">, fifty-four, single, with nephew </w:t>
+      </w:r>
+      <w:r>
+        <w:rPr>
+          <w:b/>
+        </w:rPr>
+        <w:t>Carielee</w:t>
+      </w:r>
+      <w:r>
+        <w:t xml:space="preserve">, nineteen, and niece </w:t>
+      </w:r>
+      <w:r>
+        <w:rPr>
+          <w:b/>
+        </w:rPr>
+        <w:t>Molly</w:t>
+      </w:r>
+      <w:r>
+        <w:t xml:space="preserve">, eighteen. The Soundex clerk misread Edmonds as Evans. He is not the 1910 Buffalo couple. Another card writes Owsley for a John of fifty-nine with Alice, but cites volume 93, district 300, which is not an Owsley district (those are 88–94). The densified Susan given-name slot has no Evans, Susan of about thirty-nine in Owsley: the only Susans are Eubanks eighty-three in Pulaski, Eubank seventy-seven in Owen, and Effinger eighty-one in Fulton, and Evans Susie of Louisville and Lexington is another woman. Owsley death extracts for 1911–1920 have no matching John Evans decedent; a 1914 drowning indexed in a web search as Evans is John Neeley. Josephine Newnam’s about-1902 Gilbert license remains unseen in further neighbouring-county substitutes (Harlan 1900–02, Leslie 1900–01 and 1903–04, Knott Book 2A 1902–03, Madison compiled, Magoffin N, Powell volunteer notes); Rockcastle’s compiled G and N files end in 1900. Breathitt marriages are still unopened. The 1910 dwelling 31 house is </w:t>
       </w:r>
       <w:r>
         <w:rPr>

</xml_diff>

<commit_message>
Dora pass 90: close Bell 25/28/29 and Estill 33-7
Official Ingramtown, Excelcia, and Middlesboro ends close three Bell
districts; C863/C907 withdrawn. Station Camp North 33-7 is empty of
Boyd+Allie. Antioch/Clifty remainder still not on a free IA scan
(R011-40). Clerk path Tyler Phillips locked. Working Word rebuilt;
authored latest.docx SHA 78cdcf44 unchanged.

Co-authored-by: blakereaganlaw <blakereaganlaw@gmail.com>
</commit_message>
<xml_diff>
--- a/research/dora-ella-newnam/book/Dora-Ella-Newnam-Stone-A-Life.docx
+++ b/research/dora-ella-newnam/book/Dora-Ella-Newnam-Stone-A-Life.docx
@@ -201,6 +201,11 @@
     </w:p>
     <w:p>
       <w:r>
+        <w:t>35. [Pass 90. Ingramtown ends, Excelcia closes, and Station Camp North is empty](#pass-90-ingramtown-ends-excelcia-closes-and-station-camp-north-is-empty)</w:t>
+      </w:r>
+    </w:p>
+    <w:p>
+      <w:r>
         <w:br w:type="page"/>
       </w:r>
     </w:p>
@@ -5339,6 +5344,589 @@
       </w:r>
     </w:p>
     <w:p>
+      <w:pPr>
+        <w:pStyle w:val="Heading2"/>
+      </w:pPr>
+      <w:r>
+        <w:t>Pass 90. Ingramtown ends, Excelcia closes, and Station Camp North is empty</w:t>
+      </w:r>
+    </w:p>
+    <w:p>
+      <w:r>
+        <w:t>Pass 89 left Bell district 28 open after leaf 619 and still called leaf 620 a later precinct. The higher-resolution sheets settle both.</w:t>
+      </w:r>
+    </w:p>
+    <w:p>
+      <w:r>
+        <w:t xml:space="preserve">Leaf </w:t>
+      </w:r>
+      <w:r>
+        <w:rPr>
+          <w:b/>
+        </w:rPr>
+        <w:t>620</w:t>
+      </w:r>
+      <w:r>
+        <w:t xml:space="preserve"> is still Precinct 22 Ingramtown, district </w:t>
+      </w:r>
+      <w:r>
+        <w:rPr>
+          <w:b/>
+        </w:rPr>
+        <w:t>28</w:t>
+      </w:r>
+      <w:r>
+        <w:t xml:space="preserve">, sheet </w:t>
+      </w:r>
+      <w:r>
+        <w:rPr>
+          <w:b/>
+        </w:rPr>
+        <w:t>6B</w:t>
+      </w:r>
+      <w:r>
+        <w:t>, W. E. Turner. Robbins, Bennett, Hurst, Fuson. The pass 88 reading “district 29, Precinct 2 Ingram, William G. Innes” is withdrawn. [C911] [C863] [S596]</w:t>
+      </w:r>
+    </w:p>
+    <w:p>
+      <w:r>
+        <w:t xml:space="preserve">Leaf </w:t>
+      </w:r>
+      <w:r>
+        <w:rPr>
+          <w:b/>
+        </w:rPr>
+        <w:t>628</w:t>
+      </w:r>
+      <w:r>
+        <w:t xml:space="preserve">, 23 January, is Turner’s sheet </w:t>
+      </w:r>
+      <w:r>
+        <w:rPr>
+          <w:b/>
+        </w:rPr>
+        <w:t>10B</w:t>
+      </w:r>
+      <w:r>
+        <w:t xml:space="preserve">. He wrote the close himself: “Here ends the enumeration of Precinct 22 Ingramtown.” Hearst, Campbell, Bentley. No Newman. District </w:t>
+      </w:r>
+      <w:r>
+        <w:rPr>
+          <w:b/>
+        </w:rPr>
+        <w:t>28</w:t>
+      </w:r>
+      <w:r>
+        <w:t xml:space="preserve"> is complete, leaves 609–628. The premature 619 close is withdrawn. [C910] [C897] [S595]</w:t>
+      </w:r>
+    </w:p>
+    <w:p>
+      <w:r>
+        <w:t xml:space="preserve">District </w:t>
+      </w:r>
+      <w:r>
+        <w:rPr>
+          <w:b/>
+        </w:rPr>
+        <w:t>29</w:t>
+      </w:r>
+      <w:r>
+        <w:t xml:space="preserve"> is not Ingram. Leaf </w:t>
+      </w:r>
+      <w:r>
+        <w:rPr>
+          <w:b/>
+        </w:rPr>
+        <w:t>629</w:t>
+      </w:r>
+      <w:r>
+        <w:t xml:space="preserve"> is Excelcia Precinct </w:t>
+      </w:r>
+      <w:r>
+        <w:rPr>
+          <w:b/>
+        </w:rPr>
+        <w:t>23</w:t>
+      </w:r>
+      <w:r>
+        <w:t xml:space="preserve">, sheet </w:t>
+      </w:r>
+      <w:r>
+        <w:rPr>
+          <w:b/>
+        </w:rPr>
+        <w:t>1A</w:t>
+      </w:r>
+      <w:r>
+        <w:t xml:space="preserve">, 2 January, Robert W. Barnett — the official start. Leaf </w:t>
+      </w:r>
+      <w:r>
+        <w:rPr>
+          <w:b/>
+        </w:rPr>
+        <w:t>642</w:t>
+      </w:r>
+      <w:r>
+        <w:t xml:space="preserve">, 22 January, sheet </w:t>
+      </w:r>
+      <w:r>
+        <w:rPr>
+          <w:b/>
+        </w:rPr>
+        <w:t>7B</w:t>
+      </w:r>
+      <w:r>
+        <w:t xml:space="preserve">, is the official end: “Here ends the enumeration of Excelcia Precinct 23.” One household on that last sheet is a farmer, about forty-nine, and a wife </w:t>
+      </w:r>
+      <w:r>
+        <w:rPr>
+          <w:b/>
+        </w:rPr>
+        <w:t>Cora</w:t>
+      </w:r>
+      <w:r>
+        <w:t>, forty-one. She is not Cora Brandenburg Newman. [C912] [C907] [C930] [S597] [S598]</w:t>
+      </w:r>
+    </w:p>
+    <w:p>
+      <w:r>
+        <w:t xml:space="preserve">District </w:t>
+      </w:r>
+      <w:r>
+        <w:rPr>
+          <w:b/>
+        </w:rPr>
+        <w:t>25</w:t>
+      </w:r>
+      <w:r>
+        <w:t xml:space="preserve"> is Middlesboro Precinct </w:t>
+      </w:r>
+      <w:r>
+        <w:rPr>
+          <w:b/>
+        </w:rPr>
+        <w:t>19</w:t>
+      </w:r>
+      <w:r>
+        <w:t xml:space="preserve">. Leaf </w:t>
+      </w:r>
+      <w:r>
+        <w:rPr>
+          <w:b/>
+        </w:rPr>
+        <w:t>471</w:t>
+      </w:r>
+      <w:r>
+        <w:t xml:space="preserve">, 7 January, Robert C. Maddox, sheet </w:t>
+      </w:r>
+      <w:r>
+        <w:rPr>
+          <w:b/>
+        </w:rPr>
+        <w:t>1A</w:t>
+      </w:r>
+      <w:r>
+        <w:t xml:space="preserve">, is the official start. Leaf </w:t>
+      </w:r>
+      <w:r>
+        <w:rPr>
+          <w:b/>
+        </w:rPr>
+        <w:t>515</w:t>
+      </w:r>
+      <w:r>
+        <w:t xml:space="preserve">, 2 February, sheet </w:t>
+      </w:r>
+      <w:r>
+        <w:rPr>
+          <w:b/>
+        </w:rPr>
+        <w:t>23A</w:t>
+      </w:r>
+      <w:r>
+        <w:t>, ends it: “Here ends the enumeration of Precinct 19 of Middlesboro City.” No Newman on the start or end. [C913] [S599] [S600]</w:t>
+      </w:r>
+    </w:p>
+    <w:p>
+      <w:r>
+        <w:t xml:space="preserve">Leaf </w:t>
+      </w:r>
+      <w:r>
+        <w:rPr>
+          <w:b/>
+        </w:rPr>
+        <w:t>518</w:t>
+      </w:r>
+      <w:r>
+        <w:t xml:space="preserve"> is already South Side Precinct </w:t>
+      </w:r>
+      <w:r>
+        <w:rPr>
+          <w:b/>
+        </w:rPr>
+        <w:t>20</w:t>
+      </w:r>
+      <w:r>
+        <w:t xml:space="preserve">, district </w:t>
+      </w:r>
+      <w:r>
+        <w:rPr>
+          <w:b/>
+        </w:rPr>
+        <w:t>26</w:t>
+      </w:r>
+      <w:r>
+        <w:t xml:space="preserve">, sheet </w:t>
+      </w:r>
+      <w:r>
+        <w:rPr>
+          <w:b/>
+        </w:rPr>
+        <w:t>1B</w:t>
+      </w:r>
+      <w:r>
+        <w:t xml:space="preserve">, 3 February, Ralph Goins. The official start is sheet 1A at leaf </w:t>
+      </w:r>
+      <w:r>
+        <w:rPr>
+          <w:b/>
+        </w:rPr>
+        <w:t>517</w:t>
+      </w:r>
+      <w:r>
+        <w:t xml:space="preserve">. Dorothy district </w:t>
+      </w:r>
+      <w:r>
+        <w:rPr>
+          <w:b/>
+        </w:rPr>
+        <w:t>31</w:t>
+      </w:r>
+      <w:r>
+        <w:t xml:space="preserve"> and Clear Creek district </w:t>
+      </w:r>
+      <w:r>
+        <w:rPr>
+          <w:b/>
+        </w:rPr>
+        <w:t>34</w:t>
+      </w:r>
+      <w:r>
+        <w:t xml:space="preserve"> starts were re-seen; their first-sheet names are not Newman. A machine pass over every Bell leaf 450–731 — 282 sheets — found no newman, newnam, noonan, or mccoy token. That is an assist only. Combined with the official ends, districts </w:t>
+      </w:r>
+      <w:r>
+        <w:rPr>
+          <w:b/>
+        </w:rPr>
+        <w:t>25</w:t>
+      </w:r>
+      <w:r>
+        <w:t xml:space="preserve">, </w:t>
+      </w:r>
+      <w:r>
+        <w:rPr>
+          <w:b/>
+        </w:rPr>
+        <w:t>28</w:t>
+      </w:r>
+      <w:r>
+        <w:t xml:space="preserve">, </w:t>
+      </w:r>
+      <w:r>
+        <w:rPr>
+          <w:b/>
+        </w:rPr>
+        <w:t>29</w:t>
+      </w:r>
+      <w:r>
+        <w:t xml:space="preserve">, and </w:t>
+      </w:r>
+      <w:r>
+        <w:rPr>
+          <w:b/>
+        </w:rPr>
+        <w:t>30</w:t>
+      </w:r>
+      <w:r>
+        <w:t xml:space="preserve"> are </w:t>
+      </w:r>
+      <w:r>
+        <w:rPr>
+          <w:b/>
+        </w:rPr>
+        <w:t>probable</w:t>
+      </w:r>
+      <w:r>
+        <w:t xml:space="preserve"> entire-district name negatives. Remaining visual name lines are districts </w:t>
+      </w:r>
+      <w:r>
+        <w:rPr>
+          <w:b/>
+        </w:rPr>
+        <w:t>26</w:t>
+      </w:r>
+      <w:r>
+        <w:t xml:space="preserve">, </w:t>
+      </w:r>
+      <w:r>
+        <w:rPr>
+          <w:b/>
+        </w:rPr>
+        <w:t>27</w:t>
+      </w:r>
+      <w:r>
+        <w:t xml:space="preserve">, and </w:t>
+      </w:r>
+      <w:r>
+        <w:rPr>
+          <w:b/>
+        </w:rPr>
+        <w:t>31–34</w:t>
+      </w:r>
+      <w:r>
+        <w:t>. [C914] [C915] [C932] [S601] [S602]</w:t>
+      </w:r>
+    </w:p>
+    <w:p>
+      <w:r>
+        <w:t xml:space="preserve">Antioch district </w:t>
+      </w:r>
+      <w:r>
+        <w:rPr>
+          <w:b/>
+        </w:rPr>
+        <w:t>242</w:t>
+      </w:r>
+      <w:r>
+        <w:t xml:space="preserve"> and the rest of Clifty after sheet 1 are still not on a free Internet Archive scan. FamilySearch 127913, 127869, 1146342, and 546788 were empty shells again — roadblock step 40. The published Clifty and Antioch lists were re-read: no Newman, Newnam, Noonan, Nunan, or McCoy. John L. Henry, John L. Hollon, Dora Childers, Dora Roberts, Cora Banks, and Cora King stay rejected. [C916] [C917] [C908] [S603] [S604] [S605]</w:t>
+      </w:r>
+    </w:p>
+    <w:p>
+      <w:r>
+        <w:t xml:space="preserve">Station Camp in 1930 splits. The published Estill index covers only Irvine districts </w:t>
+      </w:r>
+      <w:r>
+        <w:rPr>
+          <w:b/>
+        </w:rPr>
+        <w:t>33-1</w:t>
+      </w:r>
+      <w:r>
+        <w:t xml:space="preserve"> through </w:t>
+      </w:r>
+      <w:r>
+        <w:rPr>
+          <w:b/>
+        </w:rPr>
+        <w:t>33-4</w:t>
+      </w:r>
+      <w:r>
+        <w:t xml:space="preserve">. Fred Newman, thirty-five, with Earca and five children, sits in Irvine </w:t>
+      </w:r>
+      <w:r>
+        <w:rPr>
+          <w:b/>
+        </w:rPr>
+        <w:t>33-2</w:t>
+      </w:r>
+      <w:r>
+        <w:t xml:space="preserve"> — </w:t>
+      </w:r>
+      <w:r>
+        <w:rPr>
+          <w:b/>
+        </w:rPr>
+        <w:t>probable</w:t>
+      </w:r>
+      <w:r>
+        <w:t xml:space="preserve"> Luther’s brother. Herbert, twenty-nine, Virginia-born, with Edith, is rejected against John L. No Boyd, Allie, John L, Cora Newman, or McCoy appears in that published band. Station Camp </w:t>
+      </w:r>
+      <w:r>
+        <w:rPr>
+          <w:b/>
+        </w:rPr>
+        <w:t>33-7</w:t>
+      </w:r>
+      <w:r>
+        <w:t xml:space="preserve"> and </w:t>
+      </w:r>
+      <w:r>
+        <w:rPr>
+          <w:b/>
+        </w:rPr>
+        <w:t>33-8</w:t>
+      </w:r>
+      <w:r>
+        <w:t xml:space="preserve"> are unpublished. [C918] [S606] [S607]</w:t>
+      </w:r>
+    </w:p>
+    <w:p>
+      <w:r>
+        <w:t xml:space="preserve">Station Camp North, district </w:t>
+      </w:r>
+      <w:r>
+        <w:rPr>
+          <w:b/>
+        </w:rPr>
+        <w:t>33-7</w:t>
+      </w:r>
+      <w:r>
+        <w:t xml:space="preserve">, is complete on reel 742: leaves </w:t>
+      </w:r>
+      <w:r>
+        <w:rPr>
+          <w:b/>
+        </w:rPr>
+        <w:t>793–819</w:t>
+      </w:r>
+      <w:r>
+        <w:t xml:space="preserve">. Leaf </w:t>
+      </w:r>
+      <w:r>
+        <w:rPr>
+          <w:b/>
+        </w:rPr>
+        <w:t>793</w:t>
+      </w:r>
+      <w:r>
+        <w:t xml:space="preserve">, 2 April, Matilda N. Cole, sheet </w:t>
+      </w:r>
+      <w:r>
+        <w:rPr>
+          <w:b/>
+        </w:rPr>
+        <w:t>1A</w:t>
+      </w:r>
+      <w:r>
+        <w:t xml:space="preserve">, is the official start. Leaf </w:t>
+      </w:r>
+      <w:r>
+        <w:rPr>
+          <w:b/>
+        </w:rPr>
+        <w:t>819</w:t>
+      </w:r>
+      <w:r>
+        <w:t xml:space="preserve">, 26 April, sheet </w:t>
+      </w:r>
+      <w:r>
+        <w:rPr>
+          <w:b/>
+        </w:rPr>
+        <w:t>14A</w:t>
+      </w:r>
+      <w:r>
+        <w:t xml:space="preserve">, is a short end sheet — Willine, Witt Hobart. Mid samples on 794, 800, 816, and 818 are Elliott, Tackett, Spicer, Jenkins, Rose — no Newman head. A machine pass over leaves 788–858 found no boyd, allie, newman, or mccoy token. Boyd and Allie are </w:t>
+      </w:r>
+      <w:r>
+        <w:rPr>
+          <w:b/>
+        </w:rPr>
+        <w:t>absent</w:t>
+      </w:r>
+      <w:r>
+        <w:t xml:space="preserve"> from 1930 Station Camp North. [C919] [C920] [C921] [S608] [S609] [S610]</w:t>
+      </w:r>
+    </w:p>
+    <w:p>
+      <w:r>
+        <w:t xml:space="preserve">District </w:t>
+      </w:r>
+      <w:r>
+        <w:rPr>
+          <w:b/>
+        </w:rPr>
+        <w:t>33-8</w:t>
+      </w:r>
+      <w:r>
+        <w:t xml:space="preserve">, Station Camp South, is not in the 750–900 band. That stretch holds Millers Creek East </w:t>
+      </w:r>
+      <w:r>
+        <w:rPr>
+          <w:b/>
+        </w:rPr>
+        <w:t>33-14</w:t>
+      </w:r>
+      <w:r>
+        <w:t xml:space="preserve">, Millers Creek West </w:t>
+      </w:r>
+      <w:r>
+        <w:rPr>
+          <w:b/>
+        </w:rPr>
+        <w:t>33-6</w:t>
+      </w:r>
+      <w:r>
+        <w:t xml:space="preserve">, Red Lick East </w:t>
+      </w:r>
+      <w:r>
+        <w:rPr>
+          <w:b/>
+        </w:rPr>
+        <w:t>33-10</w:t>
+      </w:r>
+      <w:r>
+        <w:t xml:space="preserve">, Riddell &amp; Thomas </w:t>
+      </w:r>
+      <w:r>
+        <w:rPr>
+          <w:b/>
+        </w:rPr>
+        <w:t>33-11</w:t>
+      </w:r>
+      <w:r>
+        <w:t xml:space="preserve">, and Forks West </w:t>
+      </w:r>
+      <w:r>
+        <w:rPr>
+          <w:b/>
+        </w:rPr>
+        <w:t>33-12</w:t>
+      </w:r>
+      <w:r>
+        <w:t>. Residual: after leaf 900, and any unread 650–749. [C922] [C931] [S611]</w:t>
+      </w:r>
+    </w:p>
+    <w:p>
+      <w:r>
+        <w:t>The Lee wills directory still names only Elizabeth Newnam and Mary F. Newnam Tincher. Internet Archive has no Samuel will. The retrieval path if FamilySearch stays walled is the Lee Circuit Court clerk, Tyler Phillips, 606-464-8400, second floor. [C924] [C925] [C928] [S613] [S614] [S615]</w:t>
+      </w:r>
+    </w:p>
+    <w:p>
+      <w:r>
+        <w:t xml:space="preserve">Genealogy Trails’ Lee draft-card page is 452 kilobytes. Letter </w:t>
+      </w:r>
+      <w:r>
+        <w:rPr>
+          <w:b/>
+        </w:rPr>
+        <w:t>N</w:t>
+      </w:r>
+      <w:r>
+        <w:t xml:space="preserve"> has no table. Published letters have no Newman or McCoy. That is not a full-county N negative. [C923] [S612]</w:t>
+      </w:r>
+    </w:p>
+    <w:p>
+      <w:r>
+        <w:t>Woodford’s free obituary index is still only Alice Ashmore Newman. Certificate 17762 is unread. Do not print 1966 as fact. [C904]</w:t>
+      </w:r>
+    </w:p>
+    <w:p>
+      <w:r>
+        <w:t>A Rissie Dishman Beaty of Overton County, Tennessee, 1887–1926, is the wrong woman — no Newnam, Stamper, or Pelfrey identifier. Skip living Pelfrey survivors. [C927] [S617]</w:t>
+      </w:r>
+    </w:p>
+    <w:p>
+      <w:r>
+        <w:t>Madison County’s 1920 reel, T625-590, is live on Internet Archive — 1,170 images — and is not yet browsed for Frank of Berea. [C926] [S616]</w:t>
+      </w:r>
+    </w:p>
+    <w:p>
+      <w:r>
+        <w:t>Do not print 1966 or 1976 as proven deaths. Do not print Floyd as Boyd. Do not print 1962 as McCoy’s death. Do not print the 1942 Combs charge as fact.</w:t>
+      </w:r>
+    </w:p>
+    <w:p>
       <w:r>
         <w:t xml:space="preserve">In Madison County in 1950 a </w:t>
       </w:r>
@@ -5822,7 +6410,16 @@
         <w:t>not merged</w:t>
       </w:r>
       <w:r>
-        <w:t xml:space="preserve"> (age slack). [C738] [C760] An unsourced WikiTree profile (</w:t>
+        <w:t xml:space="preserve"> (age slack). [C738] [C760] A Rissie Dishman Beaty of Overton County, Tennessee (1887–1926) is </w:t>
+      </w:r>
+      <w:r>
+        <w:rPr>
+          <w:b/>
+        </w:rPr>
+        <w:t>rejected</w:t>
+      </w:r>
+      <w:r>
+        <w:t>. [C927] An unsourced WikiTree profile (</w:t>
       </w:r>
       <w:r>
         <w:rPr>
@@ -6424,10 +7021,100 @@
         <w:rPr>
           <w:b/>
         </w:rPr>
-        <w:t>28</w:t>
-      </w:r>
-      <w:r>
-        <w:t xml:space="preserve"> Turner sheets </w:t>
+        <w:t>25 COMPLETE</w:t>
+      </w:r>
+      <w:r>
+        <w:t xml:space="preserve"> (</w:t>
+      </w:r>
+      <w:r>
+        <w:rPr>
+          <w:b/>
+        </w:rPr>
+        <w:t>C913</w:t>
+      </w:r>
+      <w:r>
+        <w:t xml:space="preserve">); ED </w:t>
+      </w:r>
+      <w:r>
+        <w:rPr>
+          <w:b/>
+        </w:rPr>
+        <w:t>28 COMPLETE</w:t>
+      </w:r>
+      <w:r>
+        <w:t xml:space="preserve"> </w:t>
+      </w:r>
+      <w:r>
+        <w:rPr>
+          <w:b/>
+        </w:rPr>
+        <w:t>0609–0628</w:t>
+      </w:r>
+      <w:r>
+        <w:t xml:space="preserve"> (</w:t>
+      </w:r>
+      <w:r>
+        <w:rPr>
+          <w:b/>
+        </w:rPr>
+        <w:t>C910</w:t>
+      </w:r>
+      <w:r>
+        <w:t xml:space="preserve">; </w:t>
+      </w:r>
+      <w:r>
+        <w:rPr>
+          <w:b/>
+        </w:rPr>
+        <w:t>C863/C897/C909</w:t>
+      </w:r>
+      <w:r>
+        <w:t xml:space="preserve"> withdrawn); ED </w:t>
+      </w:r>
+      <w:r>
+        <w:rPr>
+          <w:b/>
+        </w:rPr>
+        <w:t>29 COMPLETE</w:t>
+      </w:r>
+      <w:r>
+        <w:t xml:space="preserve"> Excelcia </w:t>
+      </w:r>
+      <w:r>
+        <w:rPr>
+          <w:b/>
+        </w:rPr>
+        <w:t>23</w:t>
+      </w:r>
+      <w:r>
+        <w:t xml:space="preserve"> (</w:t>
+      </w:r>
+      <w:r>
+        <w:rPr>
+          <w:b/>
+        </w:rPr>
+        <w:t>C912</w:t>
+      </w:r>
+      <w:r>
+        <w:t xml:space="preserve">); ED </w:t>
+      </w:r>
+      <w:r>
+        <w:rPr>
+          <w:b/>
+        </w:rPr>
+        <w:t>30</w:t>
+      </w:r>
+      <w:r>
+        <w:t xml:space="preserve"> </w:t>
+      </w:r>
+      <w:r>
+        <w:rPr>
+          <w:b/>
+        </w:rPr>
+        <w:t>COMPLETE</w:t>
+      </w:r>
+      <w:r>
+        <w:t xml:space="preserve"> and </w:t>
       </w:r>
       <w:r>
         <w:rPr>
@@ -6442,25 +7129,16 @@
         <w:rPr>
           <w:b/>
         </w:rPr>
-        <w:t>C897</w:t>
-      </w:r>
-      <w:r>
-        <w:t xml:space="preserve">; full-ED close withdrawn </w:t>
-      </w:r>
-      <w:r>
-        <w:rPr>
-          <w:b/>
-        </w:rPr>
-        <w:t>C909</w:t>
-      </w:r>
-      <w:r>
-        <w:t xml:space="preserve">); ED </w:t>
-      </w:r>
-      <w:r>
-        <w:rPr>
-          <w:b/>
-        </w:rPr>
-        <w:t>30</w:t>
+        <w:t>C898</w:t>
+      </w:r>
+      <w:r>
+        <w:t xml:space="preserve">); Wolfe Torrent </w:t>
+      </w:r>
+      <w:r>
+        <w:rPr>
+          <w:b/>
+        </w:rPr>
+        <w:t>238</w:t>
       </w:r>
       <w:r>
         <w:t xml:space="preserve"> </w:t>
@@ -6469,42 +7147,6 @@
         <w:rPr>
           <w:b/>
         </w:rPr>
-        <w:t>COMPLETE</w:t>
-      </w:r>
-      <w:r>
-        <w:t xml:space="preserve"> and </w:t>
-      </w:r>
-      <w:r>
-        <w:rPr>
-          <w:b/>
-        </w:rPr>
-        <w:t>PROBABLE</w:t>
-      </w:r>
-      <w:r>
-        <w:t xml:space="preserve"> nil (</w:t>
-      </w:r>
-      <w:r>
-        <w:rPr>
-          <w:b/>
-        </w:rPr>
-        <w:t>C898</w:t>
-      </w:r>
-      <w:r>
-        <w:t xml:space="preserve">); Wolfe Torrent </w:t>
-      </w:r>
-      <w:r>
-        <w:rPr>
-          <w:b/>
-        </w:rPr>
-        <w:t>238</w:t>
-      </w:r>
-      <w:r>
-        <w:t xml:space="preserve"> </w:t>
-      </w:r>
-      <w:r>
-        <w:rPr>
-          <w:b/>
-        </w:rPr>
         <w:t>0443–0471</w:t>
       </w:r>
       <w:r>
@@ -6604,10 +7246,55 @@
         <w:rPr>
           <w:b/>
         </w:rPr>
-        <w:t>25–27 / 29 / 31–34</w:t>
-      </w:r>
-      <w:r>
-        <w:t xml:space="preserve"> unread; </w:t>
+        <w:t>26 / 27 / 31–34</w:t>
+      </w:r>
+      <w:r>
+        <w:t xml:space="preserve"> visual name lines; 1930 Station Camp North </w:t>
+      </w:r>
+      <w:r>
+        <w:rPr>
+          <w:b/>
+        </w:rPr>
+        <w:t>33-7 COMPLETE</w:t>
+      </w:r>
+      <w:r>
+        <w:t xml:space="preserve"> — Boyd+Allie </w:t>
+      </w:r>
+      <w:r>
+        <w:rPr>
+          <w:b/>
+        </w:rPr>
+        <w:t>absent</w:t>
+      </w:r>
+      <w:r>
+        <w:t xml:space="preserve"> (</w:t>
+      </w:r>
+      <w:r>
+        <w:rPr>
+          <w:b/>
+        </w:rPr>
+        <w:t>C919–C921</w:t>
+      </w:r>
+      <w:r>
+        <w:t xml:space="preserve">); </w:t>
+      </w:r>
+      <w:r>
+        <w:rPr>
+          <w:b/>
+        </w:rPr>
+        <w:t>33-8</w:t>
+      </w:r>
+      <w:r>
+        <w:t xml:space="preserve"> not isolated (</w:t>
+      </w:r>
+      <w:r>
+        <w:rPr>
+          <w:b/>
+        </w:rPr>
+        <w:t>C922</w:t>
+      </w:r>
+      <w:r>
+        <w:t xml:space="preserve">); </w:t>
       </w:r>
       <w:r>
         <w:rPr>
@@ -7022,10 +7709,37 @@
         <w:rPr>
           <w:b/>
         </w:rPr>
+        <w:t>B089</w:t>
+      </w:r>
+      <w:r>
+        <w:t xml:space="preserve"> Estill </w:t>
+      </w:r>
+      <w:r>
+        <w:rPr>
+          <w:b/>
+        </w:rPr>
+        <w:t>33-8</w:t>
+      </w:r>
+      <w:r>
+        <w:t xml:space="preserve"> Station Camp South originals (not in reel 742 </w:t>
+      </w:r>
+      <w:r>
+        <w:rPr>
+          <w:b/>
+        </w:rPr>
+        <w:t>0750–0900</w:t>
+      </w:r>
+      <w:r>
+        <w:t xml:space="preserve">), then </w:t>
+      </w:r>
+      <w:r>
+        <w:rPr>
+          <w:b/>
+        </w:rPr>
         <w:t>B088</w:t>
       </w:r>
       <w:r>
-        <w:t xml:space="preserve"> remaining Clifty after sheet 1 + Antioch </w:t>
+        <w:t xml:space="preserve"> Antioch </w:t>
       </w:r>
       <w:r>
         <w:rPr>
@@ -7034,16 +7748,16 @@
         <w:t>242</w:t>
       </w:r>
       <w:r>
-        <w:t xml:space="preserve"> originals (not on the IA 515-image scan) + remaining Bell </w:t>
-      </w:r>
-      <w:r>
-        <w:rPr>
-          <w:b/>
-        </w:rPr>
-        <w:t>25–27 / 29 / 31–34</w:t>
-      </w:r>
-      <w:r>
-        <w:t xml:space="preserve"> full-sheet lines, </w:t>
+        <w:t xml:space="preserve"> + remaining Clifty after sheet 1 + remaining Bell </w:t>
+      </w:r>
+      <w:r>
+        <w:rPr>
+          <w:b/>
+        </w:rPr>
+        <w:t>26 / 27 / 31–34</w:t>
+      </w:r>
+      <w:r>
+        <w:t xml:space="preserve"> visual name lines, </w:t>
       </w:r>
       <w:r>
         <w:rPr>
@@ -7079,25 +7793,16 @@
         <w:t>127869 / 964964</w:t>
       </w:r>
       <w:r>
+        <w:t xml:space="preserve">, clerk </w:t>
+      </w:r>
+      <w:r>
+        <w:rPr>
+          <w:b/>
+        </w:rPr>
+        <w:t>Tyler Phillips</w:t>
+      </w:r>
+      <w:r>
         <w:t xml:space="preserve">), </w:t>
-      </w:r>
-      <w:r>
-        <w:rPr>
-          <w:b/>
-        </w:rPr>
-        <w:t>B089</w:t>
-      </w:r>
-      <w:r>
-        <w:t xml:space="preserve"> residual Book 6 register + certs </w:t>
-      </w:r>
-      <w:r>
-        <w:rPr>
-          <w:b/>
-        </w:rPr>
-        <w:t>28501 / 31780</w:t>
-      </w:r>
-      <w:r>
-        <w:t xml:space="preserve">, </w:t>
       </w:r>
       <w:r>
         <w:rPr>
@@ -15956,6 +16661,396 @@
     </w:p>
     <w:p>
       <w:r>
+        <w:t xml:space="preserve">147. T625-559 </w:t>
+      </w:r>
+      <w:r>
+        <w:rPr>
+          <w:b/>
+        </w:rPr>
+        <w:t>0620 / 0628</w:t>
+      </w:r>
+      <w:r>
+        <w:t xml:space="preserve"> w1200: Precinct </w:t>
+      </w:r>
+      <w:r>
+        <w:rPr>
+          <w:b/>
+        </w:rPr>
+        <w:t>22 Ingramtown</w:t>
+      </w:r>
+      <w:r>
+        <w:t xml:space="preserve">, ED </w:t>
+      </w:r>
+      <w:r>
+        <w:rPr>
+          <w:b/>
+        </w:rPr>
+        <w:t>28</w:t>
+      </w:r>
+      <w:r>
+        <w:t xml:space="preserve">, sh </w:t>
+      </w:r>
+      <w:r>
+        <w:rPr>
+          <w:b/>
+        </w:rPr>
+        <w:t>6 B / 10 B</w:t>
+      </w:r>
+      <w:r>
+        <w:t xml:space="preserve">. Official end 23 Jan: “Here ends … Precinct 22 Ingramtown.” </w:t>
+      </w:r>
+      <w:r>
+        <w:rPr>
+          <w:b/>
+        </w:rPr>
+        <w:t>C863</w:t>
+      </w:r>
+      <w:r>
+        <w:t xml:space="preserve"> withdrawn. IA [`14thcensusofpopu559unit`](https://archive.org/details/14thcensusofpopu559unit). *Image seen.* </w:t>
+      </w:r>
+      <w:r>
+        <w:rPr>
+          <w:b/>
+        </w:rPr>
+        <w:t>C910 C911</w:t>
+      </w:r>
+      <w:r>
+        <w:t xml:space="preserve"> </w:t>
+      </w:r>
+      <w:r>
+        <w:rPr>
+          <w:b/>
+        </w:rPr>
+        <w:t>S595 S596</w:t>
+      </w:r>
+      <w:r>
+        <w:t>.</w:t>
+      </w:r>
+    </w:p>
+    <w:p>
+      <w:r>
+        <w:t xml:space="preserve">148. </w:t>
+      </w:r>
+      <w:r>
+        <w:rPr>
+          <w:b/>
+        </w:rPr>
+        <w:t>0629 / 0642</w:t>
+      </w:r>
+      <w:r>
+        <w:t xml:space="preserve"> w1200: Excelcia Precinct </w:t>
+      </w:r>
+      <w:r>
+        <w:rPr>
+          <w:b/>
+        </w:rPr>
+        <w:t>23</w:t>
+      </w:r>
+      <w:r>
+        <w:t xml:space="preserve">, ED </w:t>
+      </w:r>
+      <w:r>
+        <w:rPr>
+          <w:b/>
+        </w:rPr>
+        <w:t>29</w:t>
+      </w:r>
+      <w:r>
+        <w:t xml:space="preserve">, official start 2 Jan / official end 22 Jan. </w:t>
+      </w:r>
+      <w:r>
+        <w:rPr>
+          <w:b/>
+        </w:rPr>
+        <w:t>C907</w:t>
+      </w:r>
+      <w:r>
+        <w:t xml:space="preserve"> withdrawn. Cora 41 </w:t>
+      </w:r>
+      <w:r>
+        <w:rPr>
+          <w:b/>
+        </w:rPr>
+        <w:t>rejected</w:t>
+      </w:r>
+      <w:r>
+        <w:t xml:space="preserve">. *Image seen.* </w:t>
+      </w:r>
+      <w:r>
+        <w:rPr>
+          <w:b/>
+        </w:rPr>
+        <w:t>C912 C930</w:t>
+      </w:r>
+      <w:r>
+        <w:t xml:space="preserve"> </w:t>
+      </w:r>
+      <w:r>
+        <w:rPr>
+          <w:b/>
+        </w:rPr>
+        <w:t>S597 S598</w:t>
+      </w:r>
+      <w:r>
+        <w:t>.</w:t>
+      </w:r>
+    </w:p>
+    <w:p>
+      <w:r>
+        <w:t xml:space="preserve">149. </w:t>
+      </w:r>
+      <w:r>
+        <w:rPr>
+          <w:b/>
+        </w:rPr>
+        <w:t>0471 / 0515</w:t>
+      </w:r>
+      <w:r>
+        <w:t xml:space="preserve">: Middlesboro Precinct </w:t>
+      </w:r>
+      <w:r>
+        <w:rPr>
+          <w:b/>
+        </w:rPr>
+        <w:t>19</w:t>
+      </w:r>
+      <w:r>
+        <w:t xml:space="preserve">, ED </w:t>
+      </w:r>
+      <w:r>
+        <w:rPr>
+          <w:b/>
+        </w:rPr>
+        <w:t>25</w:t>
+      </w:r>
+      <w:r>
+        <w:t xml:space="preserve">, official start 7 Jan / official end 2 Feb. </w:t>
+      </w:r>
+      <w:r>
+        <w:rPr>
+          <w:b/>
+        </w:rPr>
+        <w:t>0518</w:t>
+      </w:r>
+      <w:r>
+        <w:t xml:space="preserve"> = South Side Precinct </w:t>
+      </w:r>
+      <w:r>
+        <w:rPr>
+          <w:b/>
+        </w:rPr>
+        <w:t>20</w:t>
+      </w:r>
+      <w:r>
+        <w:t xml:space="preserve"> ED </w:t>
+      </w:r>
+      <w:r>
+        <w:rPr>
+          <w:b/>
+        </w:rPr>
+        <w:t>26</w:t>
+      </w:r>
+      <w:r>
+        <w:t xml:space="preserve"> sh </w:t>
+      </w:r>
+      <w:r>
+        <w:rPr>
+          <w:b/>
+        </w:rPr>
+        <w:t>1 B</w:t>
+      </w:r>
+      <w:r>
+        <w:t xml:space="preserve">. Tesseract </w:t>
+      </w:r>
+      <w:r>
+        <w:rPr>
+          <w:b/>
+        </w:rPr>
+        <w:t>282</w:t>
+      </w:r>
+      <w:r>
+        <w:t xml:space="preserve"> Bell sheets </w:t>
+      </w:r>
+      <w:r>
+        <w:rPr>
+          <w:b/>
+        </w:rPr>
+        <w:t>nil</w:t>
+      </w:r>
+      <w:r>
+        <w:t xml:space="preserve"> Newman tokens. *Image seen / OCR draft.* </w:t>
+      </w:r>
+      <w:r>
+        <w:rPr>
+          <w:b/>
+        </w:rPr>
+        <w:t>C913–C915 C932</w:t>
+      </w:r>
+      <w:r>
+        <w:t xml:space="preserve"> </w:t>
+      </w:r>
+      <w:r>
+        <w:rPr>
+          <w:b/>
+        </w:rPr>
+        <w:t>S599–S602</w:t>
+      </w:r>
+      <w:r>
+        <w:t>.</w:t>
+      </w:r>
+    </w:p>
+    <w:p>
+      <w:r>
+        <w:t xml:space="preserve">150. Compiled [1920i Clifty](https://kygenweb.net/wolfe/txt/1920i.txt) + [1920k Antioch](https://kygenweb.net/wolfe/txt/1920k.txt) re-seen </w:t>
+      </w:r>
+      <w:r>
+        <w:rPr>
+          <w:b/>
+        </w:rPr>
+        <w:t>nil</w:t>
+      </w:r>
+      <w:r>
+        <w:t xml:space="preserve"> Newman. FS SPA (R011-40). IA [`14thcensusofpopu0602unit`](https://archive.org/details/14thcensusofpopu0602unit) still empty. *Transcription only / catalog.* </w:t>
+      </w:r>
+      <w:r>
+        <w:rPr>
+          <w:b/>
+        </w:rPr>
+        <w:t>C916 C917 C908</w:t>
+      </w:r>
+      <w:r>
+        <w:t xml:space="preserve"> </w:t>
+      </w:r>
+      <w:r>
+        <w:rPr>
+          <w:b/>
+        </w:rPr>
+        <w:t>S603–S605 S620</w:t>
+      </w:r>
+      <w:r>
+        <w:t>.</w:t>
+      </w:r>
+    </w:p>
+    <w:p>
+      <w:r>
+        <w:t xml:space="preserve">151. Estill 1930 published index [33-1–33-4](https://www.us-census.org/pub/usgenweb/census/ky/estill/1930/_indx-m-q.txt) Fred/Herbert only. Reel 742 </w:t>
+      </w:r>
+      <w:r>
+        <w:rPr>
+          <w:b/>
+        </w:rPr>
+        <w:t>0793–0819</w:t>
+      </w:r>
+      <w:r>
+        <w:t xml:space="preserve"> = </w:t>
+      </w:r>
+      <w:r>
+        <w:rPr>
+          <w:b/>
+        </w:rPr>
+        <w:t>33-7</w:t>
+      </w:r>
+      <w:r>
+        <w:t xml:space="preserve"> Station Camp North complete; Boyd+Allie </w:t>
+      </w:r>
+      <w:r>
+        <w:rPr>
+          <w:b/>
+        </w:rPr>
+        <w:t>absent</w:t>
+      </w:r>
+      <w:r>
+        <w:t xml:space="preserve">. </w:t>
+      </w:r>
+      <w:r>
+        <w:rPr>
+          <w:b/>
+        </w:rPr>
+        <w:t>33-8</w:t>
+      </w:r>
+      <w:r>
+        <w:t xml:space="preserve"> not in </w:t>
+      </w:r>
+      <w:r>
+        <w:rPr>
+          <w:b/>
+        </w:rPr>
+        <w:t>0750–0900</w:t>
+      </w:r>
+      <w:r>
+        <w:t xml:space="preserve">. IA [`kentuckycensus00reel742`](https://archive.org/details/kentuckycensus00reel742). *Image seen / transcription only.* </w:t>
+      </w:r>
+      <w:r>
+        <w:rPr>
+          <w:b/>
+        </w:rPr>
+        <w:t>C918–C922</w:t>
+      </w:r>
+      <w:r>
+        <w:t xml:space="preserve"> </w:t>
+      </w:r>
+      <w:r>
+        <w:rPr>
+          <w:b/>
+        </w:rPr>
+        <w:t>S606–S611</w:t>
+      </w:r>
+      <w:r>
+        <w:t>.</w:t>
+      </w:r>
+    </w:p>
+    <w:p>
+      <w:r>
+        <w:t xml:space="preserve">152. USGenNet [Lee wills](http://www.usgennet.org/usa/ky/county/lee/wills/) Elizabeth + Mary F. only. [KY Courts Lee](https://kycourts.gov/Courts/County-Information/Pages/Lee.aspx) clerk Tyler Phillips </w:t>
+      </w:r>
+      <w:r>
+        <w:rPr>
+          <w:b/>
+        </w:rPr>
+        <w:t>606-464-8400</w:t>
+      </w:r>
+      <w:r>
+        <w:t xml:space="preserve">. GT [wwi_draft_cards.html](https://genealogytrails.com/ken/lee/wwi_draft_cards.html) </w:t>
+      </w:r>
+      <w:r>
+        <w:rPr>
+          <w:b/>
+        </w:rPr>
+        <w:t>N</w:t>
+      </w:r>
+      <w:r>
+        <w:t xml:space="preserve"> table unpublished. Rissie Dishman Beaty </w:t>
+      </w:r>
+      <w:r>
+        <w:rPr>
+          <w:b/>
+        </w:rPr>
+        <w:t>rejected</w:t>
+      </w:r>
+      <w:r>
+        <w:t xml:space="preserve">. Madison T625-590 live, unread. </w:t>
+      </w:r>
+      <w:r>
+        <w:rPr>
+          <w:b/>
+        </w:rPr>
+        <w:t>C923–C928</w:t>
+      </w:r>
+      <w:r>
+        <w:t xml:space="preserve"> </w:t>
+      </w:r>
+      <w:r>
+        <w:rPr>
+          <w:b/>
+        </w:rPr>
+        <w:t>S612–S617</w:t>
+      </w:r>
+      <w:r>
+        <w:t>.</w:t>
+      </w:r>
+    </w:p>
+    <w:p>
+      <w:r>
         <w:br w:type="page"/>
       </w:r>
     </w:p>
@@ -16825,7 +17920,7 @@
     </w:p>
     <w:p>
       <w:r>
-        <w:t>| S582 | `../sources/census/bell-1920-ed28-0619-ingram-6a-pass89.jpg` | [IA T625-559](https://archive.org/details/14thcensusofpopu559unit) | Bell ED 28 sh 6A; ED complete | image seen |</w:t>
+        <w:t>| S582 | `../sources/census/bell-1920-ed28-0619-ingram-6a-pass89.jpg` | [IA T625-559](https://archive.org/details/14thcensusofpopu559unit) | Bell ED 28 sh 6A; full-ED close later at 0628 | image seen |</w:t>
       </w:r>
     </w:p>
     <w:p>
@@ -16851,6 +17946,86 @@
     <w:p>
       <w:r>
         <w:t>| S591 | `../sources/census/pass89-extract-2026-10-31.txt` | This session | Pass 89 extract | extract |</w:t>
+      </w:r>
+    </w:p>
+    <w:p>
+      <w:r>
+        <w:t>| S595 | `../sources/census/bell-1920-ed28-0628-ingram-end-pass90.jpg` | [IA T625-559](https://archive.org/details/14thcensusofpopu559unit) | ED 28 official Ingramtown end | image seen |</w:t>
+      </w:r>
+    </w:p>
+    <w:p>
+      <w:r>
+        <w:t>| S596 | `../sources/census/bell-1920-ed28-0620-ingram-6b-pass90.jpg` | [IA T625-559](https://archive.org/details/14thcensusofpopu559unit) | ED 28 sh 6B; C863 withdrawn | image seen |</w:t>
+      </w:r>
+    </w:p>
+    <w:p>
+      <w:r>
+        <w:t>| S597 | `../sources/census/bell-1920-ed29-0629-excelcia-1a-pass90.jpg` | [IA T625-559](https://archive.org/details/14thcensusofpopu559unit) | ED 29 Excelcia official start | image seen |</w:t>
+      </w:r>
+    </w:p>
+    <w:p>
+      <w:r>
+        <w:t>| S598 | `../sources/census/bell-1920-ed29-0642-excelcia-end-pass90.jpg` | [IA T625-559](https://archive.org/details/14thcensusofpopu559unit) | ED 29 official end; Cora 41 reject | image seen |</w:t>
+      </w:r>
+    </w:p>
+    <w:p>
+      <w:r>
+        <w:t>| S599 | `../sources/census/bell-1920-ed25-0471-middlesboro-1a-pass90.jpg` | [IA T625-559](https://archive.org/details/14thcensusofpopu559unit) | ED 25 Middlesboro official start | image seen |</w:t>
+      </w:r>
+    </w:p>
+    <w:p>
+      <w:r>
+        <w:t>| S600 | `../sources/census/bell-1920-ed25-0515-end-pass90.jpg` | [IA T625-559](https://archive.org/details/14thcensusofpopu559unit) | ED 25 official end | image seen |</w:t>
+      </w:r>
+    </w:p>
+    <w:p>
+      <w:r>
+        <w:t>| S602 | `../sources/census/pass90/bell-ocr.txt` | [IA T625-559](https://archive.org/details/14thcensusofpopu559unit) | 282 Bell sheets nil Newman tokens | OCR draft |</w:t>
+      </w:r>
+    </w:p>
+    <w:p>
+      <w:r>
+        <w:t>| S604 | `../sources/census/pass90/1920i-clifty-pass90.txt` | [KYGenWeb 1920i](https://kygenweb.net/wolfe/txt/1920i.txt) | Clifty compiled nil Newman | transcription only |</w:t>
+      </w:r>
+    </w:p>
+    <w:p>
+      <w:r>
+        <w:t>| S605 | `../sources/census/pass90/1920k-antioch-pass90.txt` | [KYGenWeb 1920k](https://kygenweb.net/wolfe/txt/1920k.txt) | Antioch compiled nil Newman | transcription only |</w:t>
+      </w:r>
+    </w:p>
+    <w:p>
+      <w:r>
+        <w:t>| S606 | `../sources/census/pass90/estill1930/_indx-m-q.txt` | [US-Census.org Estill 1930](https://www.us-census.org/pub/usgenweb/census/ky/estill/1930/_indx-m-q.txt) | Fred/Herbert Irvine; nil Boyd | transcription only |</w:t>
+      </w:r>
+    </w:p>
+    <w:p>
+      <w:r>
+        <w:t>| S608 | `../sources/census/estill-1930-ed337-0793-stationcamp-1a-pass90.jpg` | [IA T626-742](https://archive.org/details/kentuckycensus00reel742) | 33-7 official start | image seen |</w:t>
+      </w:r>
+    </w:p>
+    <w:p>
+      <w:r>
+        <w:t>| S609 | `../sources/census/estill-1930-ed337-0819-stationcamp-end-pass90.jpg` | [IA T626-742](https://archive.org/details/kentuckycensus00reel742) | 33-7 official-looking end | image seen |</w:t>
+      </w:r>
+    </w:p>
+    <w:p>
+      <w:r>
+        <w:t>| S612 | `../sources/military/gt-lee-wwi-draft-cards-pass90.html` | [GT Lee WWI](https://genealogytrails.com/ken/lee/wwi_draft_cards.html) | N table unpublished | transcription only |</w:t>
+      </w:r>
+    </w:p>
+    <w:p>
+      <w:r>
+        <w:t>| S613 | `../sources/catalog/usgennet-lee-wills-dir-pass90.html` | [USGenNet Lee wills](http://www.usgennet.org/usa/ky/county/lee/wills/) | Elizabeth + Mary F. only | transcription only |</w:t>
+      </w:r>
+    </w:p>
+    <w:p>
+      <w:r>
+        <w:t>| S614 | `../sources/catalog/kycourts-lee-pass90.html` | [KY Courts Lee](https://kycourts.gov/Courts/County-Information/Pages/Lee.aspx) | Clerk Tyler Phillips 606-464-8400 | catalog |</w:t>
+      </w:r>
+    </w:p>
+    <w:p>
+      <w:r>
+        <w:t>| S619 | `../sources/census/pass90-extract-2026-10-31.txt` | This session | Pass 90 extract | extract |</w:t>
       </w:r>
     </w:p>
     <w:p>

</xml_diff>

<commit_message>
Pass 91–93: close Estill 33-8 gap, Bell 25–34, Berea 76-16/76-17
Inventory leftover pass-90/91/92 catalog and census plates into SOURCE-INDEX.
B089: Estill 33-8/33-9 absent from IA T626-742; 33-7 Station Camp North closed.
B088: Bell 1920 EDs 25–34 complete on T625-559; Antioch 242 still not free.
B055: 1920 Berea Town ED 103 complete; 1930 76-16 and Glade 76-17 complete.
Residual: Madison T626-769 Glade 76-18/76-19. Do not declare research complete.

Co-authored-by: blakereaganlaw <blakereaganlaw@gmail.com>
</commit_message>
<xml_diff>
--- a/research/dora-ella-newnam/book/Dora-Ella-Newnam-Stone-A-Life.docx
+++ b/research/dora-ella-newnam/book/Dora-Ella-Newnam-Stone-A-Life.docx
@@ -206,6 +206,21 @@
     </w:p>
     <w:p>
       <w:r>
+        <w:t>36. [Pass 91. Station Camp South is missing, and every Bell district closes](#pass-91-station-camp-south-is-missing-and-every-bell-district-closes)</w:t>
+      </w:r>
+    </w:p>
+    <w:p>
+      <w:r>
+        <w:t>37. [Pass 92. Berea Town in 1920, and the 1930 Madison reel](#pass-92-berea-town-in-1920-and-the-1930-madison-reel)</w:t>
+      </w:r>
+    </w:p>
+    <w:p>
+      <w:r>
+        <w:t>38. [Pass 93. Berea Town in 1930, and Glade North](#pass-93-berea-town-in-1930-and-glade-north)</w:t>
+      </w:r>
+    </w:p>
+    <w:p>
+      <w:r>
         <w:br w:type="page"/>
       </w:r>
     </w:p>
@@ -5927,6 +5942,1146 @@
       </w:r>
     </w:p>
     <w:p>
+      <w:pPr>
+        <w:pStyle w:val="Heading2"/>
+      </w:pPr>
+      <w:r>
+        <w:t>Pass 91. Station Camp South is missing, and every Bell district closes</w:t>
+      </w:r>
+    </w:p>
+    <w:p>
+      <w:r>
+        <w:t xml:space="preserve">Pass 90 left Station Camp South, district </w:t>
+      </w:r>
+      <w:r>
+        <w:rPr>
+          <w:b/>
+        </w:rPr>
+        <w:t>33-8</w:t>
+      </w:r>
+      <w:r>
+        <w:t>, as a residual after leaf 900, and still owed official ends for Bell districts 26, 27, and 31–34.</w:t>
+      </w:r>
+    </w:p>
+    <w:p>
+      <w:r>
+        <w:t xml:space="preserve">Leaf </w:t>
+      </w:r>
+      <w:r>
+        <w:rPr>
+          <w:b/>
+        </w:rPr>
+        <w:t>821</w:t>
+      </w:r>
+      <w:r>
+        <w:t xml:space="preserve">, at higher resolution, is not 33-8. It is Red Lick East, district </w:t>
+      </w:r>
+      <w:r>
+        <w:rPr>
+          <w:b/>
+        </w:rPr>
+        <w:t>33-10</w:t>
+      </w:r>
+      <w:r>
+        <w:t xml:space="preserve">, sheet </w:t>
+      </w:r>
+      <w:r>
+        <w:rPr>
+          <w:b/>
+        </w:rPr>
+        <w:t>1A</w:t>
+      </w:r>
+      <w:r>
+        <w:t xml:space="preserve">, stamped </w:t>
+      </w:r>
+      <w:r>
+        <w:rPr>
+          <w:b/>
+        </w:rPr>
+        <w:t>117</w:t>
+      </w:r>
+      <w:r>
+        <w:t xml:space="preserve">, 2 April 1930, Robert E. Tye. Thrasher, Rose, Ingram. Leaf </w:t>
+      </w:r>
+      <w:r>
+        <w:rPr>
+          <w:b/>
+        </w:rPr>
+        <w:t>820</w:t>
+      </w:r>
+      <w:r>
+        <w:t xml:space="preserve"> is unused. The stamped page numbers jump from </w:t>
+      </w:r>
+      <w:r>
+        <w:rPr>
+          <w:b/>
+        </w:rPr>
+        <w:t>094A</w:t>
+      </w:r>
+      <w:r>
+        <w:t xml:space="preserve"> — the last Station Camp North sheet — to </w:t>
+      </w:r>
+      <w:r>
+        <w:rPr>
+          <w:b/>
+        </w:rPr>
+        <w:t>117A</w:t>
+      </w:r>
+      <w:r>
+        <w:t xml:space="preserve">. Districts </w:t>
+      </w:r>
+      <w:r>
+        <w:rPr>
+          <w:b/>
+        </w:rPr>
+        <w:t>33-8</w:t>
+      </w:r>
+      <w:r>
+        <w:t xml:space="preserve"> (095A–102B) and </w:t>
+      </w:r>
+      <w:r>
+        <w:rPr>
+          <w:b/>
+        </w:rPr>
+        <w:t>33-9</w:t>
+      </w:r>
+      <w:r>
+        <w:t xml:space="preserve"> (103A–116A) are </w:t>
+      </w:r>
+      <w:r>
+        <w:rPr>
+          <w:b/>
+        </w:rPr>
+        <w:t>absent</w:t>
+      </w:r>
+      <w:r>
+        <w:t xml:space="preserve"> from this Internet Archive scan of reel 742. [C933] [C934] [C935] [S621] [S622] [S623]</w:t>
+      </w:r>
+    </w:p>
+    <w:p>
+      <w:r>
+        <w:t xml:space="preserve">The unread 650–749 band is not the missing South. Leaf </w:t>
+      </w:r>
+      <w:r>
+        <w:rPr>
+          <w:b/>
+        </w:rPr>
+        <w:t>650</w:t>
+      </w:r>
+      <w:r>
+        <w:t xml:space="preserve"> is Irvine City South, district </w:t>
+      </w:r>
+      <w:r>
+        <w:rPr>
+          <w:b/>
+        </w:rPr>
+        <w:t>33-2</w:t>
+      </w:r>
+      <w:r>
+        <w:t xml:space="preserve">, sheet 16B, stamped 41. Leaf </w:t>
+      </w:r>
+      <w:r>
+        <w:rPr>
+          <w:b/>
+        </w:rPr>
+        <w:t>746</w:t>
+      </w:r>
+      <w:r>
+        <w:t xml:space="preserve"> is Millers Creek West, district </w:t>
+      </w:r>
+      <w:r>
+        <w:rPr>
+          <w:b/>
+        </w:rPr>
+        <w:t>33-6</w:t>
+      </w:r>
+      <w:r>
+        <w:t xml:space="preserve">, sheet 14B, stamped 79. Leaf </w:t>
+      </w:r>
+      <w:r>
+        <w:rPr>
+          <w:b/>
+        </w:rPr>
+        <w:t>747</w:t>
+      </w:r>
+      <w:r>
+        <w:t xml:space="preserve"> is Millers Creek East, district </w:t>
+      </w:r>
+      <w:r>
+        <w:rPr>
+          <w:b/>
+        </w:rPr>
+        <w:t>33-14</w:t>
+      </w:r>
+      <w:r>
+        <w:t>, sheet 1A, stamped 80, Charley H. Patrick. [C936] [C937] [S625] [S626] [S627]</w:t>
+      </w:r>
+    </w:p>
+    <w:p>
+      <w:r>
+        <w:t xml:space="preserve">After leaf 900 the reel finishes Forks, not Station Camp. Leaves </w:t>
+      </w:r>
+      <w:r>
+        <w:rPr>
+          <w:b/>
+        </w:rPr>
+        <w:t>901–924</w:t>
+      </w:r>
+      <w:r>
+        <w:t xml:space="preserve"> are Forks West, district </w:t>
+      </w:r>
+      <w:r>
+        <w:rPr>
+          <w:b/>
+        </w:rPr>
+        <w:t>33-12</w:t>
+      </w:r>
+      <w:r>
+        <w:t xml:space="preserve">. Sheet 14B, Houston J. Tuttle: “Here ends the Enumeration of Magisterial District No 33-12 Forks District.” Leaf </w:t>
+      </w:r>
+      <w:r>
+        <w:rPr>
+          <w:b/>
+        </w:rPr>
+        <w:t>925</w:t>
+      </w:r>
+      <w:r>
+        <w:t xml:space="preserve"> is Forks East, district </w:t>
+      </w:r>
+      <w:r>
+        <w:rPr>
+          <w:b/>
+        </w:rPr>
+        <w:t>33-13</w:t>
+      </w:r>
+      <w:r>
+        <w:t xml:space="preserve">, sheet 1A, stamped 169. Leaf </w:t>
+      </w:r>
+      <w:r>
+        <w:rPr>
+          <w:b/>
+        </w:rPr>
+        <w:t>937</w:t>
+      </w:r>
+      <w:r>
+        <w:t xml:space="preserve"> is the county poor farm — no Newman. Leaf </w:t>
+      </w:r>
+      <w:r>
+        <w:rPr>
+          <w:b/>
+        </w:rPr>
+        <w:t>945</w:t>
+      </w:r>
+      <w:r>
+        <w:t xml:space="preserve">, 17 April, sheet 11A, stamped 179, is the last populated Estill sheet. Leaf </w:t>
+      </w:r>
+      <w:r>
+        <w:rPr>
+          <w:b/>
+        </w:rPr>
+        <w:t>947</w:t>
+      </w:r>
+      <w:r>
+        <w:t xml:space="preserve"> is already the Grant County card, districts </w:t>
+      </w:r>
+      <w:r>
+        <w:rPr>
+          <w:b/>
+        </w:rPr>
+        <w:t>41-1</w:t>
+      </w:r>
+      <w:r>
+        <w:t xml:space="preserve"> through </w:t>
+      </w:r>
+      <w:r>
+        <w:rPr>
+          <w:b/>
+        </w:rPr>
+        <w:t>41-12</w:t>
+      </w:r>
+      <w:r>
+        <w:t>. Estill on this scan is complete without 33-8 or 33-9. [C938] [C939] [C940] [C953] [S628] [S629] [S630] [S647] [S624]</w:t>
+      </w:r>
+    </w:p>
+    <w:p>
+      <w:r>
+        <w:t xml:space="preserve">A compiled 1940 Estill substitute names Fred in Irvine and a Hendrix line in Red Lick — a carpenter about sixty-five, Sarah E., John Beverly, Melvina, James Beverly — </w:t>
+      </w:r>
+      <w:r>
+        <w:rPr>
+          <w:b/>
+        </w:rPr>
+        <w:t>rejected</w:t>
+      </w:r>
+      <w:r>
+        <w:t xml:space="preserve"> against Boyd and Allie. The 1950 Estill name API has three Newnam sheets and zero Newman; none is Boyd. Station Camp 1940 remains unpublished. [C941] [C945] [C955] [S631] [S637] [S650]</w:t>
+      </w:r>
+    </w:p>
+    <w:p>
+      <w:r>
+        <w:t xml:space="preserve">Bell closes. South Side Precinct 20, district </w:t>
+      </w:r>
+      <w:r>
+        <w:rPr>
+          <w:b/>
+        </w:rPr>
+        <w:t>26</w:t>
+      </w:r>
+      <w:r>
+        <w:t xml:space="preserve">, is complete, leaves </w:t>
+      </w:r>
+      <w:r>
+        <w:rPr>
+          <w:b/>
+        </w:rPr>
+        <w:t>517–559</w:t>
+      </w:r>
+      <w:r>
+        <w:t xml:space="preserve">. Ralph Goins began on 3 February, sheet 1A. Sheet 22A: “Here ends the enumeration of South Side Precinct Middlesboro City.” West End Precinct 21, district </w:t>
+      </w:r>
+      <w:r>
+        <w:rPr>
+          <w:b/>
+        </w:rPr>
+        <w:t>27</w:t>
+      </w:r>
+      <w:r>
+        <w:t xml:space="preserve">, is complete, leaves </w:t>
+      </w:r>
+      <w:r>
+        <w:rPr>
+          <w:b/>
+        </w:rPr>
+        <w:t>561–606</w:t>
+      </w:r>
+      <w:r>
+        <w:t>. The official end, 4 March, sheet 23B, is Marsee — George fifty-eight, Mary fifty-three, Fannie twenty-three — not a Newman. Leaf 560 is unused. Leaf 608 is the card for Bell districts 28–34. [C942] [C943] [C944] [S632] [S633] [S634] [S635] [S636]</w:t>
+      </w:r>
+    </w:p>
+    <w:p>
+      <w:r>
+        <w:t xml:space="preserve">Dorothy Precinct 26, district </w:t>
+      </w:r>
+      <w:r>
+        <w:rPr>
+          <w:b/>
+        </w:rPr>
+        <w:t>31</w:t>
+      </w:r>
+      <w:r>
+        <w:t xml:space="preserve">, is complete, leaves </w:t>
+      </w:r>
+      <w:r>
+        <w:rPr>
+          <w:b/>
+        </w:rPr>
+        <w:t>661–674</w:t>
+      </w:r>
+      <w:r>
+        <w:t xml:space="preserve">. John H. Lee, 2–13 February. “Here ends the enumeration of Precinct 26 Dorothy.” Hoskins, Miracle, Thompson. Ferndale Precinct 27, district </w:t>
+      </w:r>
+      <w:r>
+        <w:rPr>
+          <w:b/>
+        </w:rPr>
+        <w:t>32</w:t>
+      </w:r>
+      <w:r>
+        <w:t xml:space="preserve">, is complete, leaves </w:t>
+      </w:r>
+      <w:r>
+        <w:rPr>
+          <w:b/>
+        </w:rPr>
+        <w:t>675–685</w:t>
+      </w:r>
+      <w:r>
+        <w:t xml:space="preserve">. William T. Gibbons, 3–13 February. Suttly, district </w:t>
+      </w:r>
+      <w:r>
+        <w:rPr>
+          <w:b/>
+        </w:rPr>
+        <w:t>33</w:t>
+      </w:r>
+      <w:r>
+        <w:t xml:space="preserve">, is complete, leaves </w:t>
+      </w:r>
+      <w:r>
+        <w:rPr>
+          <w:b/>
+        </w:rPr>
+        <w:t>686–696</w:t>
+      </w:r>
+      <w:r>
+        <w:t xml:space="preserve">. John W. Faulkner, 16–21 February: “This completes the enumeration of Suttly Precinct.” Leaf 697 is unused. District </w:t>
+      </w:r>
+      <w:r>
+        <w:rPr>
+          <w:b/>
+        </w:rPr>
+        <w:t>34</w:t>
+      </w:r>
+      <w:r>
+        <w:t xml:space="preserve"> was already closed. Every Bell district 25 through 34 now has an official start and an official end on Internet Archive T625-559. Combined with the 282-sheet machine pass, that is a </w:t>
+      </w:r>
+      <w:r>
+        <w:rPr>
+          <w:b/>
+        </w:rPr>
+        <w:t>probable</w:t>
+      </w:r>
+      <w:r>
+        <w:t xml:space="preserve"> entire-Bell name negative for Newman, Newnam, Noonan, and McCoy. The leftover-close list is withdrawn. [C949] [C950] [C951] [C952] [C932] [S642] [S643] [S644] [S645] [S646]</w:t>
+      </w:r>
+    </w:p>
+    <w:p>
+      <w:r>
+        <w:t>Antioch 242 is still not on a free scan. Identifier `14thcensusofpopu1602unit` is 1920 Pennsylvania, Mercer County — 1,173 images — not a Wolfe remainder. `15thcensus1742unit` is 1930 North Dakota. FamilySearch 127913, 127869, and 1146342 were empty shells again — roadblock step 41. Do not re-ask the clerk. [C947] [C946] [S639] [S638]</w:t>
+      </w:r>
+    </w:p>
+    <w:p>
+      <w:r>
+        <w:t xml:space="preserve">Madison County’s 1920 reel, T625-590, is now mapped: 1,170 images; districts 89–113 on the title card; Richmond 99; Bear Valley 101; Berea Town Precinct 16, district </w:t>
+      </w:r>
+      <w:r>
+        <w:rPr>
+          <w:b/>
+        </w:rPr>
+        <w:t>103</w:t>
+      </w:r>
+      <w:r>
+        <w:t xml:space="preserve">, isolated around leaves 320–340; a Berea College sheet in district </w:t>
+      </w:r>
+      <w:r>
+        <w:rPr>
+          <w:b/>
+        </w:rPr>
+        <w:t>102</w:t>
+      </w:r>
+      <w:r>
+        <w:t xml:space="preserve"> at leaf 350; Poosey 110; Marshall later. Sampled Berea name columns — sheets 2B, 7B, 12B, and the college 17B — have no Frank or David F. Newnam head. Residual: the remaining 102/103 lines. [C948] [C954] [S640] [S641] [S648] [S649]</w:t>
+      </w:r>
+    </w:p>
+    <w:p>
+      <w:r>
+        <w:t xml:space="preserve">John 38 and Jennie on George’s Branch stay </w:t>
+      </w:r>
+      <w:r>
+        <w:rPr>
+          <w:b/>
+        </w:rPr>
+        <w:t>rejected</w:t>
+      </w:r>
+      <w:r>
+        <w:t xml:space="preserve"> against John L. Floyd is still </w:t>
+      </w:r>
+      <w:r>
+        <w:rPr>
+          <w:b/>
+        </w:rPr>
+        <w:t>not merged</w:t>
+      </w:r>
+      <w:r>
+        <w:t xml:space="preserve"> with Boyd. Do not print 1966 or 1976 as proven deaths. Do not print Floyd as Boyd. Do not print 1962 as McCoy’s death. Do not print the 1942 Combs charge as fact. [C956]</w:t>
+      </w:r>
+    </w:p>
+    <w:p>
+      <w:pPr>
+        <w:pStyle w:val="Heading2"/>
+      </w:pPr>
+      <w:r>
+        <w:t>Pass 92. Berea Town in 1920, and the 1930 Madison reel</w:t>
+      </w:r>
+    </w:p>
+    <w:p>
+      <w:r>
+        <w:t>The remaining Berea Town lines on the 1920 reel close.</w:t>
+      </w:r>
+    </w:p>
+    <w:p>
+      <w:r>
+        <w:t xml:space="preserve">Leaf </w:t>
+      </w:r>
+      <w:r>
+        <w:rPr>
+          <w:b/>
+        </w:rPr>
+        <w:t>316</w:t>
+      </w:r>
+      <w:r>
+        <w:t xml:space="preserve"> is unused. Leaf </w:t>
+      </w:r>
+      <w:r>
+        <w:rPr>
+          <w:b/>
+        </w:rPr>
+        <w:t>317</w:t>
+      </w:r>
+      <w:r>
+        <w:t xml:space="preserve">, 2 January 1920, Henry C. Combs, is Precinct 16 Berea Town, district </w:t>
+      </w:r>
+      <w:r>
+        <w:rPr>
+          <w:b/>
+        </w:rPr>
+        <w:t>103</w:t>
+      </w:r>
+      <w:r>
+        <w:t xml:space="preserve">, sheet </w:t>
+      </w:r>
+      <w:r>
+        <w:rPr>
+          <w:b/>
+        </w:rPr>
+        <w:t>1A</w:t>
+      </w:r>
+      <w:r>
+        <w:t xml:space="preserve"> — the official start. Clark, Toleson, Reed, Richmond, Shearer, Hall. No Newman. No Frank. [C957] [C958] [S652] [S653]</w:t>
+      </w:r>
+    </w:p>
+    <w:p>
+      <w:r>
+        <w:t xml:space="preserve">Leaf </w:t>
+      </w:r>
+      <w:r>
+        <w:rPr>
+          <w:b/>
+        </w:rPr>
+        <w:t>348</w:t>
+      </w:r>
+      <w:r>
+        <w:t xml:space="preserve">, 17 January, is sheet </w:t>
+      </w:r>
+      <w:r>
+        <w:rPr>
+          <w:b/>
+        </w:rPr>
+        <w:t>16B</w:t>
+      </w:r>
+      <w:r>
+        <w:t xml:space="preserve">, a short last town sheet. The enumerator wrote “None.” Martin, Bowles, Eagle, Thacker, Flannery. District </w:t>
+      </w:r>
+      <w:r>
+        <w:rPr>
+          <w:b/>
+        </w:rPr>
+        <w:t>103</w:t>
+      </w:r>
+      <w:r>
+        <w:t xml:space="preserve"> town is complete, leaves </w:t>
+      </w:r>
+      <w:r>
+        <w:rPr>
+          <w:b/>
+        </w:rPr>
+        <w:t>317–348</w:t>
+      </w:r>
+      <w:r>
+        <w:t>. [C959] [S654]</w:t>
+      </w:r>
+    </w:p>
+    <w:p>
+      <w:r>
+        <w:t xml:space="preserve">Leaf </w:t>
+      </w:r>
+      <w:r>
+        <w:rPr>
+          <w:b/>
+        </w:rPr>
+        <w:t>349</w:t>
+      </w:r>
+      <w:r>
+        <w:t xml:space="preserve"> is not more town houses. It is the institution sheet: Berea College Academy &amp; Workers, sheet </w:t>
+      </w:r>
+      <w:r>
+        <w:rPr>
+          <w:b/>
+        </w:rPr>
+        <w:t>17A</w:t>
+      </w:r>
+      <w:r>
+        <w:t xml:space="preserve">, 16 January, still Combs. Students and workers. No Frank head. Leaf </w:t>
+      </w:r>
+      <w:r>
+        <w:rPr>
+          <w:b/>
+        </w:rPr>
+        <w:t>350</w:t>
+      </w:r>
+      <w:r>
+        <w:t xml:space="preserve"> is district </w:t>
+      </w:r>
+      <w:r>
+        <w:rPr>
+          <w:b/>
+        </w:rPr>
+        <w:t>102</w:t>
+      </w:r>
+      <w:r>
+        <w:t xml:space="preserve">, sheet </w:t>
+      </w:r>
+      <w:r>
+        <w:rPr>
+          <w:b/>
+        </w:rPr>
+        <w:t>17B</w:t>
+      </w:r>
+      <w:r>
+        <w:t xml:space="preserve">, 17 January — a short college end. Leaf </w:t>
+      </w:r>
+      <w:r>
+        <w:rPr>
+          <w:b/>
+        </w:rPr>
+        <w:t>351</w:t>
+      </w:r>
+      <w:r>
+        <w:t xml:space="preserve"> is already Glade Creek Precinct, district </w:t>
+      </w:r>
+      <w:r>
+        <w:rPr>
+          <w:b/>
+        </w:rPr>
+        <w:t>104</w:t>
+      </w:r>
+      <w:r>
+        <w:t xml:space="preserve">, sheet </w:t>
+      </w:r>
+      <w:r>
+        <w:rPr>
+          <w:b/>
+        </w:rPr>
+        <w:t>1A</w:t>
+      </w:r>
+      <w:r>
+        <w:t xml:space="preserve">, 2 January, Carl R. Todd. Farmers, Daugherty, Walker. Leaf </w:t>
+      </w:r>
+      <w:r>
+        <w:rPr>
+          <w:b/>
+        </w:rPr>
+        <w:t>360</w:t>
+      </w:r>
+      <w:r>
+        <w:t xml:space="preserve"> is Glade Creek sheet 5B, Ballinger, 10 January. No Newman. [C960] [C961] [C962] [C970] [S655] [S656] [S657]</w:t>
+      </w:r>
+    </w:p>
+    <w:p>
+      <w:r>
+        <w:t xml:space="preserve">A machine pass over the name columns of leaves 314–352 — thirty-nine sheets — found no newman, newnam, newnarn, noonan, nunan, or mccoy token. One OCR “Frank” on leaf </w:t>
+      </w:r>
+      <w:r>
+        <w:rPr>
+          <w:b/>
+        </w:rPr>
+        <w:t>324</w:t>
+      </w:r>
+      <w:r>
+        <w:t xml:space="preserve"> is a false token: the sheet is Trosper, Hatfield, Morgan, Harrison, Johnson, Ledford. Combined with the official start and end, district </w:t>
+      </w:r>
+      <w:r>
+        <w:rPr>
+          <w:b/>
+        </w:rPr>
+        <w:t>103</w:t>
+      </w:r>
+      <w:r>
+        <w:t xml:space="preserve"> is a </w:t>
+      </w:r>
+      <w:r>
+        <w:rPr>
+          <w:b/>
+        </w:rPr>
+        <w:t>probable</w:t>
+      </w:r>
+      <w:r>
+        <w:t xml:space="preserve"> entire-district name negative for Frank or David F. Newnam. The leftover 102/103 visual-line residual is closed on the town district. The two college sheets were sampled only. [C963] [C964] [S658]</w:t>
+      </w:r>
+    </w:p>
+    <w:p>
+      <w:r>
+        <w:t>The 1950 Madison name API has zero Newnam sheets. The thirteen Newman sheets are Dewey, twenty-six (already rejected), Shelly and Grace in Richmond (already probable Shelby × Grace), Hiram, William, and other given names — not a Frank contractor. [C965] [S659]</w:t>
+      </w:r>
+    </w:p>
+    <w:p>
+      <w:r>
+        <w:t>FamilySearch 127913, 127869, and 1146342 were empty shells again — roadblock step 42. An Internet Archive search for a Wolfe 1920 Antioch remainder returned zero items. The published Estill 1930 directory still stops at Irvine 33-1 through 33-4; 33-8 remains unpublished. [C966] [C967] [C968] [S660] [S661] [S667]</w:t>
+      </w:r>
+    </w:p>
+    <w:p>
+      <w:r>
+        <w:t xml:space="preserve">The 1930 Madison reel is live. Internet Archive `kentuckycensus00reel769` — T626-769 — has 1,137 images. The title card lists Madison districts </w:t>
+      </w:r>
+      <w:r>
+        <w:rPr>
+          <w:b/>
+        </w:rPr>
+        <w:t>76-1</w:t>
+      </w:r>
+      <w:r>
+        <w:t xml:space="preserve"> through </w:t>
+      </w:r>
+      <w:r>
+        <w:rPr>
+          <w:b/>
+        </w:rPr>
+        <w:t>76-24</w:t>
+      </w:r>
+      <w:r>
+        <w:t xml:space="preserve"> complete, then Marion and Martin. Leaf </w:t>
+      </w:r>
+      <w:r>
+        <w:rPr>
+          <w:b/>
+        </w:rPr>
+        <w:t>5</w:t>
+      </w:r>
+      <w:r>
+        <w:t xml:space="preserve"> is already Richmond City, district </w:t>
+      </w:r>
+      <w:r>
+        <w:rPr>
+          <w:b/>
+        </w:rPr>
+        <w:t>76-1</w:t>
+      </w:r>
+      <w:r>
+        <w:t xml:space="preserve">. The published district list puts Berea Town at </w:t>
+      </w:r>
+      <w:r>
+        <w:rPr>
+          <w:b/>
+        </w:rPr>
+        <w:t>76-16</w:t>
+      </w:r>
+      <w:r>
+        <w:t xml:space="preserve">, with Berea College as the institution, and Glade around it at </w:t>
+      </w:r>
+      <w:r>
+        <w:rPr>
+          <w:b/>
+        </w:rPr>
+        <w:t>76-17</w:t>
+      </w:r>
+      <w:r>
+        <w:t xml:space="preserve"> through </w:t>
+      </w:r>
+      <w:r>
+        <w:rPr>
+          <w:b/>
+        </w:rPr>
+        <w:t>76-19</w:t>
+      </w:r>
+      <w:r>
+        <w:t>. Those Berea sheets were not yet read when this pass closed. [C969] [S662] [S663]</w:t>
+      </w:r>
+    </w:p>
+    <w:p>
+      <w:r>
+        <w:t xml:space="preserve">John 38 and Jennie stay </w:t>
+      </w:r>
+      <w:r>
+        <w:rPr>
+          <w:b/>
+        </w:rPr>
+        <w:t>rejected</w:t>
+      </w:r>
+      <w:r>
+        <w:t xml:space="preserve">. Floyd is still </w:t>
+      </w:r>
+      <w:r>
+        <w:rPr>
+          <w:b/>
+        </w:rPr>
+        <w:t>not merged</w:t>
+      </w:r>
+      <w:r>
+        <w:t xml:space="preserve"> with Boyd. The 0324 OCR Frank is </w:t>
+      </w:r>
+      <w:r>
+        <w:rPr>
+          <w:b/>
+        </w:rPr>
+        <w:t>rejected</w:t>
+      </w:r>
+      <w:r>
+        <w:t>. Do not print 1966 or 1976 as proven deaths. Do not print Floyd as Boyd. Do not print 1962 as McCoy’s death. Do not print the 1942 Combs charge as fact. [C971]</w:t>
+      </w:r>
+    </w:p>
+    <w:p>
+      <w:pPr>
+        <w:pStyle w:val="Heading2"/>
+      </w:pPr>
+      <w:r>
+        <w:t>Pass 93. Berea Town in 1930, and Glade North</w:t>
+      </w:r>
+    </w:p>
+    <w:p>
+      <w:r>
+        <w:t xml:space="preserve">The published 1930 Madison district list puts Berea Town at </w:t>
+      </w:r>
+      <w:r>
+        <w:rPr>
+          <w:b/>
+        </w:rPr>
+        <w:t>76-16</w:t>
+      </w:r>
+      <w:r>
+        <w:t xml:space="preserve">, with Berea College as the institution, and Glade around it at </w:t>
+      </w:r>
+      <w:r>
+        <w:rPr>
+          <w:b/>
+        </w:rPr>
+        <w:t>76-17</w:t>
+      </w:r>
+      <w:r>
+        <w:t xml:space="preserve"> through </w:t>
+      </w:r>
+      <w:r>
+        <w:rPr>
+          <w:b/>
+        </w:rPr>
+        <w:t>76-19</w:t>
+      </w:r>
+      <w:r>
+        <w:t>. The reel is walked to those sheets. [C981] [S676]</w:t>
+      </w:r>
+    </w:p>
+    <w:p>
+      <w:r>
+        <w:t xml:space="preserve">Leaf </w:t>
+      </w:r>
+      <w:r>
+        <w:rPr>
+          <w:b/>
+        </w:rPr>
+        <w:t>338</w:t>
+      </w:r>
+      <w:r>
+        <w:t xml:space="preserve"> is still Yates, district </w:t>
+      </w:r>
+      <w:r>
+        <w:rPr>
+          <w:b/>
+        </w:rPr>
+        <w:t>76-15</w:t>
+      </w:r>
+      <w:r>
+        <w:t xml:space="preserve">, sheet 9A, 22 April, S. P. Powell — a short last Yates sheet. Leaf </w:t>
+      </w:r>
+      <w:r>
+        <w:rPr>
+          <w:b/>
+        </w:rPr>
+        <w:t>339</w:t>
+      </w:r>
+      <w:r>
+        <w:t xml:space="preserve"> is unused. Leaf </w:t>
+      </w:r>
+      <w:r>
+        <w:rPr>
+          <w:b/>
+        </w:rPr>
+        <w:t>340</w:t>
+      </w:r>
+      <w:r>
+        <w:t xml:space="preserve">, 2 April, J. A. Baker, is incorporated Berea, Magisterial District 6, district </w:t>
+      </w:r>
+      <w:r>
+        <w:rPr>
+          <w:b/>
+        </w:rPr>
+        <w:t>76-16</w:t>
+      </w:r>
+      <w:r>
+        <w:t xml:space="preserve">, sheet </w:t>
+      </w:r>
+      <w:r>
+        <w:rPr>
+          <w:b/>
+        </w:rPr>
+        <w:t>1A</w:t>
+      </w:r>
+      <w:r>
+        <w:t xml:space="preserve"> — the official start. The first dwellings are a miller and a manager. No Newman. No Frank. [C974] [C973] [C972] [S670] [S669] [S668]</w:t>
+      </w:r>
+    </w:p>
+    <w:p>
+      <w:r>
+        <w:t xml:space="preserve">Mid samples agree. Sheet </w:t>
+      </w:r>
+      <w:r>
+        <w:rPr>
+          <w:b/>
+        </w:rPr>
+        <w:t>6A</w:t>
+      </w:r>
+      <w:r>
+        <w:t xml:space="preserve">, 7 April, is Gooch, Blount, Wilson, Anderson. Sheet </w:t>
+      </w:r>
+      <w:r>
+        <w:rPr>
+          <w:b/>
+        </w:rPr>
+        <w:t>11A</w:t>
+      </w:r>
+      <w:r>
+        <w:t xml:space="preserve">, 16 April, has a </w:t>
+      </w:r>
+      <w:r>
+        <w:rPr>
+          <w:b/>
+        </w:rPr>
+        <w:t>French, Eugene</w:t>
+      </w:r>
+      <w:r>
+        <w:t xml:space="preserve"> — not Frank Newman. [C980] [S674]</w:t>
+      </w:r>
+    </w:p>
+    <w:p>
+      <w:r>
+        <w:t xml:space="preserve">The later sheets take in the college. Leaf </w:t>
+      </w:r>
+      <w:r>
+        <w:rPr>
+          <w:b/>
+        </w:rPr>
+        <w:t>376</w:t>
+      </w:r>
+      <w:r>
+        <w:t xml:space="preserve">, 24 April, is Berea City, institution Berea College, sheet </w:t>
+      </w:r>
+      <w:r>
+        <w:rPr>
+          <w:b/>
+        </w:rPr>
+        <w:t>19A</w:t>
+      </w:r>
+      <w:r>
+        <w:t xml:space="preserve">. Holder, Miller, Freeman, Jones — students and workers. Leaf </w:t>
+      </w:r>
+      <w:r>
+        <w:rPr>
+          <w:b/>
+        </w:rPr>
+        <w:t>377</w:t>
+      </w:r>
+      <w:r>
+        <w:t xml:space="preserve"> is unused. District </w:t>
+      </w:r>
+      <w:r>
+        <w:rPr>
+          <w:b/>
+        </w:rPr>
+        <w:t>76-16</w:t>
+      </w:r>
+      <w:r>
+        <w:t xml:space="preserve"> is complete, leaves </w:t>
+      </w:r>
+      <w:r>
+        <w:rPr>
+          <w:b/>
+        </w:rPr>
+        <w:t>340–376</w:t>
+      </w:r>
+      <w:r>
+        <w:t xml:space="preserve">. A machine pass over forty-four name columns in that band found no newman, newnam, frank, david, grant, or mccoy token. Combined with the official start and end, district </w:t>
+      </w:r>
+      <w:r>
+        <w:rPr>
+          <w:b/>
+        </w:rPr>
+        <w:t>76-16</w:t>
+      </w:r>
+      <w:r>
+        <w:t xml:space="preserve"> is a </w:t>
+      </w:r>
+      <w:r>
+        <w:rPr>
+          <w:b/>
+        </w:rPr>
+        <w:t>probable</w:t>
+      </w:r>
+      <w:r>
+        <w:t xml:space="preserve"> entire-district name-negative for Frank, David F., and Grant Newnam. [C975] [C976] [C977] [C979] [C980] [S671] [S672] [S675]</w:t>
+      </w:r>
+    </w:p>
+    <w:p>
+      <w:r>
+        <w:t xml:space="preserve">Leaf </w:t>
+      </w:r>
+      <w:r>
+        <w:rPr>
+          <w:b/>
+        </w:rPr>
+        <w:t>378</w:t>
+      </w:r>
+      <w:r>
+        <w:t xml:space="preserve">, 14 April, Leon Lewis, is already Glade, Magisterial District 6, district </w:t>
+      </w:r>
+      <w:r>
+        <w:rPr>
+          <w:b/>
+        </w:rPr>
+        <w:t>76-17</w:t>
+      </w:r>
+      <w:r>
+        <w:t xml:space="preserve">, sheet </w:t>
+      </w:r>
+      <w:r>
+        <w:rPr>
+          <w:b/>
+        </w:rPr>
+        <w:t>1A</w:t>
+      </w:r>
+      <w:r>
+        <w:t xml:space="preserve"> — the official start. Farmers: Barnette, Richardson, Jennings. Leaf </w:t>
+      </w:r>
+      <w:r>
+        <w:rPr>
+          <w:b/>
+        </w:rPr>
+        <w:t>392</w:t>
+      </w:r>
+      <w:r>
+        <w:t xml:space="preserve">, 3 May, sheet </w:t>
+      </w:r>
+      <w:r>
+        <w:rPr>
+          <w:b/>
+        </w:rPr>
+        <w:t>8A</w:t>
+      </w:r>
+      <w:r>
+        <w:t xml:space="preserve">, is a short last Glade North sheet. Leaf </w:t>
+      </w:r>
+      <w:r>
+        <w:rPr>
+          <w:b/>
+        </w:rPr>
+        <w:t>393</w:t>
+      </w:r>
+      <w:r>
+        <w:t xml:space="preserve"> is unused. District </w:t>
+      </w:r>
+      <w:r>
+        <w:rPr>
+          <w:b/>
+        </w:rPr>
+        <w:t>76-17</w:t>
+      </w:r>
+      <w:r>
+        <w:t xml:space="preserve"> is complete, leaves </w:t>
+      </w:r>
+      <w:r>
+        <w:rPr>
+          <w:b/>
+        </w:rPr>
+        <w:t>378–392</w:t>
+      </w:r>
+      <w:r>
+        <w:t xml:space="preserve">. One surname on that last sheet may read Coy or Cox; it is </w:t>
+      </w:r>
+      <w:r>
+        <w:rPr>
+          <w:b/>
+        </w:rPr>
+        <w:t>not merged</w:t>
+      </w:r>
+      <w:r>
+        <w:t xml:space="preserve"> with McCoy Newnam of Buck Creek. [C978] [C984] [C985] [S673] [S679]</w:t>
+      </w:r>
+    </w:p>
+    <w:p>
+      <w:r>
+        <w:t xml:space="preserve">Leaf </w:t>
+      </w:r>
+      <w:r>
+        <w:rPr>
+          <w:b/>
+        </w:rPr>
+        <w:t>394</w:t>
+      </w:r>
+      <w:r>
+        <w:t xml:space="preserve">, 2 April, W. D. Daniel, is Glade excluding Berea Town, district </w:t>
+      </w:r>
+      <w:r>
+        <w:rPr>
+          <w:b/>
+        </w:rPr>
+        <w:t>76-18</w:t>
+      </w:r>
+      <w:r>
+        <w:t xml:space="preserve">, sheet </w:t>
+      </w:r>
+      <w:r>
+        <w:rPr>
+          <w:b/>
+        </w:rPr>
+        <w:t>1A</w:t>
+      </w:r>
+      <w:r>
+        <w:t xml:space="preserve"> — the official start. Blanton. Residual: the rest of </w:t>
+      </w:r>
+      <w:r>
+        <w:rPr>
+          <w:b/>
+        </w:rPr>
+        <w:t>76-18</w:t>
+      </w:r>
+      <w:r>
+        <w:t xml:space="preserve"> and </w:t>
+      </w:r>
+      <w:r>
+        <w:rPr>
+          <w:b/>
+        </w:rPr>
+        <w:t>76-19</w:t>
+      </w:r>
+      <w:r>
+        <w:t>. [C986] [S680]</w:t>
+      </w:r>
+    </w:p>
+    <w:p>
+      <w:r>
+        <w:t>FamilySearch 127913, 127869, and 1146342 were empty shells again — roadblock step 43. Internet Archive has no second Estill 1930 Station Camp item and no Wolfe Antioch remainder. Do not re-ask the clerk. [C982] [C983] [S677] [S678]</w:t>
+      </w:r>
+    </w:p>
+    <w:p>
+      <w:r>
+        <w:t xml:space="preserve">John 38 and Jennie stay </w:t>
+      </w:r>
+      <w:r>
+        <w:rPr>
+          <w:b/>
+        </w:rPr>
+        <w:t>rejected</w:t>
+      </w:r>
+      <w:r>
+        <w:t xml:space="preserve">. Floyd is still </w:t>
+      </w:r>
+      <w:r>
+        <w:rPr>
+          <w:b/>
+        </w:rPr>
+        <w:t>not merged</w:t>
+      </w:r>
+      <w:r>
+        <w:t xml:space="preserve"> with Boyd. French Eugene is </w:t>
+      </w:r>
+      <w:r>
+        <w:rPr>
+          <w:b/>
+        </w:rPr>
+        <w:t>rejected</w:t>
+      </w:r>
+      <w:r>
+        <w:t xml:space="preserve"> against Frank. Do not print 1966 or 1976 as proven deaths. Do not print Floyd as Boyd. Do not print 1962 as McCoy’s death. Do not print the 1942 Combs charge as fact. [C987]</w:t>
+      </w:r>
+    </w:p>
+    <w:p>
       <w:r>
         <w:t xml:space="preserve">In Madison County in 1950 a </w:t>
       </w:r>
@@ -6889,7 +8044,178 @@
         <w:t>C522</w:t>
       </w:r>
       <w:r>
-        <w:t xml:space="preserve">); not merged with Grant (#20) or 1928 St. Helens Frank (#22); John of Owsley is </w:t>
+        <w:t xml:space="preserve">); 1950 Madison Newnam API </w:t>
+      </w:r>
+      <w:r>
+        <w:rPr>
+          <w:b/>
+        </w:rPr>
+        <w:t>0</w:t>
+      </w:r>
+      <w:r>
+        <w:t xml:space="preserve"> / Newman </w:t>
+      </w:r>
+      <w:r>
+        <w:rPr>
+          <w:b/>
+        </w:rPr>
+        <w:t>13</w:t>
+      </w:r>
+      <w:r>
+        <w:t xml:space="preserve"> no Frank (</w:t>
+      </w:r>
+      <w:r>
+        <w:rPr>
+          <w:b/>
+        </w:rPr>
+        <w:t>C965</w:t>
+      </w:r>
+      <w:r>
+        <w:t xml:space="preserve">); 1920 Berea Town ED </w:t>
+      </w:r>
+      <w:r>
+        <w:rPr>
+          <w:b/>
+        </w:rPr>
+        <w:t>103 COMPLETE</w:t>
+      </w:r>
+      <w:r>
+        <w:t xml:space="preserve"> </w:t>
+      </w:r>
+      <w:r>
+        <w:rPr>
+          <w:b/>
+        </w:rPr>
+        <w:t>0317–0348</w:t>
+      </w:r>
+      <w:r>
+        <w:t xml:space="preserve"> and </w:t>
+      </w:r>
+      <w:r>
+        <w:rPr>
+          <w:b/>
+        </w:rPr>
+        <w:t>PROBABLE</w:t>
+      </w:r>
+      <w:r>
+        <w:t xml:space="preserve"> entire-ED name-negative (</w:t>
+      </w:r>
+      <w:r>
+        <w:rPr>
+          <w:b/>
+        </w:rPr>
+        <w:t>C957–C964</w:t>
+      </w:r>
+      <w:r>
+        <w:t xml:space="preserve">); college </w:t>
+      </w:r>
+      <w:r>
+        <w:rPr>
+          <w:b/>
+        </w:rPr>
+        <w:t>0349–0350</w:t>
+      </w:r>
+      <w:r>
+        <w:t xml:space="preserve"> sampled </w:t>
+      </w:r>
+      <w:r>
+        <w:rPr>
+          <w:b/>
+        </w:rPr>
+        <w:t>nil</w:t>
+      </w:r>
+      <w:r>
+        <w:t xml:space="preserve">; 1930 Madison T626-769 </w:t>
+      </w:r>
+      <w:r>
+        <w:rPr>
+          <w:b/>
+        </w:rPr>
+        <w:t>mapped</w:t>
+      </w:r>
+      <w:r>
+        <w:t xml:space="preserve"> (</w:t>
+      </w:r>
+      <w:r>
+        <w:rPr>
+          <w:b/>
+        </w:rPr>
+        <w:t>C969</w:t>
+      </w:r>
+      <w:r>
+        <w:t xml:space="preserve">); Berea Town </w:t>
+      </w:r>
+      <w:r>
+        <w:rPr>
+          <w:b/>
+        </w:rPr>
+        <w:t>76-16 COMPLETE</w:t>
+      </w:r>
+      <w:r>
+        <w:t xml:space="preserve"> </w:t>
+      </w:r>
+      <w:r>
+        <w:rPr>
+          <w:b/>
+        </w:rPr>
+        <w:t>0340–0376</w:t>
+      </w:r>
+      <w:r>
+        <w:t xml:space="preserve"> </w:t>
+      </w:r>
+      <w:r>
+        <w:rPr>
+          <w:b/>
+        </w:rPr>
+        <w:t>PROBABLE</w:t>
+      </w:r>
+      <w:r>
+        <w:t xml:space="preserve"> entire-ED name-negative (</w:t>
+      </w:r>
+      <w:r>
+        <w:rPr>
+          <w:b/>
+        </w:rPr>
+        <w:t>C972–C980</w:t>
+      </w:r>
+      <w:r>
+        <w:t xml:space="preserve">); Glade North </w:t>
+      </w:r>
+      <w:r>
+        <w:rPr>
+          <w:b/>
+        </w:rPr>
+        <w:t>76-17 COMPLETE</w:t>
+      </w:r>
+      <w:r>
+        <w:t xml:space="preserve"> </w:t>
+      </w:r>
+      <w:r>
+        <w:rPr>
+          <w:b/>
+        </w:rPr>
+        <w:t>0378–0392</w:t>
+      </w:r>
+      <w:r>
+        <w:t xml:space="preserve"> (</w:t>
+      </w:r>
+      <w:r>
+        <w:rPr>
+          <w:b/>
+        </w:rPr>
+        <w:t>C985</w:t>
+      </w:r>
+      <w:r>
+        <w:t xml:space="preserve">); residual Glade </w:t>
+      </w:r>
+      <w:r>
+        <w:rPr>
+          <w:b/>
+        </w:rPr>
+        <w:t>76-18 / 76-19</w:t>
+      </w:r>
+      <w:r>
+        <w:t xml:space="preserve">; not merged with Grant (#20) or 1928 St. Helens Frank (#22); John of Owsley is </w:t>
       </w:r>
       <w:r>
         <w:rPr>
@@ -7015,13 +8341,85 @@
         <w:t>C690 C691</w:t>
       </w:r>
       <w:r>
-        <w:t xml:space="preserve">); Bell ED </w:t>
-      </w:r>
-      <w:r>
-        <w:rPr>
-          <w:b/>
-        </w:rPr>
-        <w:t>25 COMPLETE</w:t>
+        <w:t xml:space="preserve">); Bell </w:t>
+      </w:r>
+      <w:r>
+        <w:rPr>
+          <w:b/>
+        </w:rPr>
+        <w:t>25–34 ALL COMPLETE</w:t>
+      </w:r>
+      <w:r>
+        <w:t xml:space="preserve"> on IA T625-559 (</w:t>
+      </w:r>
+      <w:r>
+        <w:rPr>
+          <w:b/>
+        </w:rPr>
+        <w:t>C942 C943 C949–C952</w:t>
+      </w:r>
+      <w:r>
+        <w:t xml:space="preserve">; </w:t>
+      </w:r>
+      <w:r>
+        <w:rPr>
+          <w:b/>
+        </w:rPr>
+        <w:t>C932 withdrawn</w:t>
+      </w:r>
+      <w:r>
+        <w:t xml:space="preserve">); </w:t>
+      </w:r>
+      <w:r>
+        <w:rPr>
+          <w:b/>
+        </w:rPr>
+        <w:t>PROBABLE</w:t>
+      </w:r>
+      <w:r>
+        <w:t xml:space="preserve"> entire-Bell name negative; Wolfe Torrent </w:t>
+      </w:r>
+      <w:r>
+        <w:rPr>
+          <w:b/>
+        </w:rPr>
+        <w:t>238</w:t>
+      </w:r>
+      <w:r>
+        <w:t xml:space="preserve"> </w:t>
+      </w:r>
+      <w:r>
+        <w:rPr>
+          <w:b/>
+        </w:rPr>
+        <w:t>0443–0471</w:t>
+      </w:r>
+      <w:r>
+        <w:t xml:space="preserve"> closed; Holly </w:t>
+      </w:r>
+      <w:r>
+        <w:rPr>
+          <w:b/>
+        </w:rPr>
+        <w:t>239</w:t>
+      </w:r>
+      <w:r>
+        <w:t xml:space="preserve"> start </w:t>
+      </w:r>
+      <w:r>
+        <w:rPr>
+          <w:b/>
+        </w:rPr>
+        <w:t>0472</w:t>
+      </w:r>
+      <w:r>
+        <w:t xml:space="preserve"> / end </w:t>
+      </w:r>
+      <w:r>
+        <w:rPr>
+          <w:b/>
+        </w:rPr>
+        <w:t>0486</w:t>
       </w:r>
       <w:r>
         <w:t xml:space="preserve"> (</w:t>
@@ -7030,16 +8428,178 @@
         <w:rPr>
           <w:b/>
         </w:rPr>
-        <w:t>C913</w:t>
-      </w:r>
-      <w:r>
-        <w:t xml:space="preserve">); ED </w:t>
-      </w:r>
-      <w:r>
-        <w:rPr>
-          <w:b/>
-        </w:rPr>
-        <w:t>28 COMPLETE</w:t>
+        <w:t>C870</w:t>
+      </w:r>
+      <w:r>
+        <w:t xml:space="preserve"> start withdrawn); Stillwater </w:t>
+      </w:r>
+      <w:r>
+        <w:rPr>
+          <w:b/>
+        </w:rPr>
+        <w:t>240</w:t>
+      </w:r>
+      <w:r>
+        <w:t xml:space="preserve"> start </w:t>
+      </w:r>
+      <w:r>
+        <w:rPr>
+          <w:b/>
+        </w:rPr>
+        <w:t>0488</w:t>
+      </w:r>
+      <w:r>
+        <w:t xml:space="preserve">; Clifty </w:t>
+      </w:r>
+      <w:r>
+        <w:rPr>
+          <w:b/>
+        </w:rPr>
+        <w:t>241</w:t>
+      </w:r>
+      <w:r>
+        <w:t xml:space="preserve"> sh </w:t>
+      </w:r>
+      <w:r>
+        <w:rPr>
+          <w:b/>
+        </w:rPr>
+        <w:t>1</w:t>
+      </w:r>
+      <w:r>
+        <w:t xml:space="preserve"> only; Antioch </w:t>
+      </w:r>
+      <w:r>
+        <w:rPr>
+          <w:b/>
+        </w:rPr>
+        <w:t>242</w:t>
+      </w:r>
+      <w:r>
+        <w:t xml:space="preserve"> not on the IA 515-image scan (`1602` = PA Mercer, </w:t>
+      </w:r>
+      <w:r>
+        <w:rPr>
+          <w:b/>
+        </w:rPr>
+        <w:t>C947</w:t>
+      </w:r>
+      <w:r>
+        <w:t xml:space="preserve">); 1930 Station Camp North </w:t>
+      </w:r>
+      <w:r>
+        <w:rPr>
+          <w:b/>
+        </w:rPr>
+        <w:t>33-7 COMPLETE</w:t>
+      </w:r>
+      <w:r>
+        <w:t xml:space="preserve"> — Boyd+Allie </w:t>
+      </w:r>
+      <w:r>
+        <w:rPr>
+          <w:b/>
+        </w:rPr>
+        <w:t>absent</w:t>
+      </w:r>
+      <w:r>
+        <w:t xml:space="preserve"> (</w:t>
+      </w:r>
+      <w:r>
+        <w:rPr>
+          <w:b/>
+        </w:rPr>
+        <w:t>C919–C921</w:t>
+      </w:r>
+      <w:r>
+        <w:t xml:space="preserve">); </w:t>
+      </w:r>
+      <w:r>
+        <w:rPr>
+          <w:b/>
+        </w:rPr>
+        <w:t>33-8 / 33-9 ABSENT</w:t>
+      </w:r>
+      <w:r>
+        <w:t xml:space="preserve"> from IA T626-742 (stamped </w:t>
+      </w:r>
+      <w:r>
+        <w:rPr>
+          <w:b/>
+        </w:rPr>
+        <w:t>094A→117A</w:t>
+      </w:r>
+      <w:r>
+        <w:t xml:space="preserve">; Estill ends </w:t>
+      </w:r>
+      <w:r>
+        <w:rPr>
+          <w:b/>
+        </w:rPr>
+        <w:t>0947</w:t>
+      </w:r>
+      <w:r>
+        <w:t xml:space="preserve"> Grant card) (</w:t>
+      </w:r>
+      <w:r>
+        <w:rPr>
+          <w:b/>
+        </w:rPr>
+        <w:t>C935 C940</w:t>
+      </w:r>
+      <w:r>
+        <w:t xml:space="preserve">); </w:t>
+      </w:r>
+      <w:r>
+        <w:rPr>
+          <w:b/>
+        </w:rPr>
+        <w:t>0650–0749 ≠ 33-8</w:t>
+      </w:r>
+      <w:r>
+        <w:t xml:space="preserve"> (</w:t>
+      </w:r>
+      <w:r>
+        <w:rPr>
+          <w:b/>
+        </w:rPr>
+        <w:t>C936</w:t>
+      </w:r>
+      <w:r>
+        <w:t xml:space="preserve">); </w:t>
+      </w:r>
+      <w:r>
+        <w:rPr>
+          <w:b/>
+        </w:rPr>
+        <w:t>1920 Breathitt ED 52 George's Branch sh 19A ln 17 Newman John 38 + Jennie 21 ISOLATED and rejected vs John L (C772–C775)</w:t>
+      </w:r>
+      <w:r>
+        <w:t xml:space="preserve">; </w:t>
+      </w:r>
+      <w:r>
+        <w:rPr>
+          <w:b/>
+        </w:rPr>
+        <w:t>leaf 1116 = ED 55 sh 1A (C791)</w:t>
+      </w:r>
+      <w:r>
+        <w:t xml:space="preserve">; </w:t>
+      </w:r>
+      <w:r>
+        <w:rPr>
+          <w:b/>
+        </w:rPr>
+        <w:t>1910 Heidelberg Boyd 38 + Allie 28 + four children = 1920 Station Camp — PROVEN (C700)</w:t>
+      </w:r>
+      <w:r>
+        <w:t xml:space="preserve">; 1900 Boyd boarder </w:t>
+      </w:r>
+      <w:r>
+        <w:rPr>
+          <w:b/>
+        </w:rPr>
+        <w:t>Mar 1878</w:t>
       </w:r>
       <w:r>
         <w:t xml:space="preserve"> </w:t>
@@ -7048,7 +8608,106 @@
         <w:rPr>
           <w:b/>
         </w:rPr>
-        <w:t>0609–0628</w:t>
+        <w:t>PROVEN (C702)</w:t>
+      </w:r>
+      <w:r>
+        <w:t xml:space="preserve">; 1902 Floyd×Allie license </w:t>
+      </w:r>
+      <w:r>
+        <w:rPr>
+          <w:b/>
+        </w:rPr>
+        <w:t>proven</w:t>
+      </w:r>
+      <w:r>
+        <w:t xml:space="preserve"> as compiled, </w:t>
+      </w:r>
+      <w:r>
+        <w:rPr>
+          <w:b/>
+        </w:rPr>
+        <w:t>still not merged</w:t>
+      </w:r>
+      <w:r>
+        <w:t xml:space="preserve"> with Boyd (</w:t>
+      </w:r>
+      <w:r>
+        <w:rPr>
+          <w:b/>
+        </w:rPr>
+        <w:t>#27</w:t>
+      </w:r>
+      <w:r>
+        <w:t xml:space="preserve">, </w:t>
+      </w:r>
+      <w:r>
+        <w:rPr>
+          <w:b/>
+        </w:rPr>
+        <w:t>C711</w:t>
+      </w:r>
+      <w:r>
+        <w:t xml:space="preserve">); 1940 compiled / 1950 Hendrix line </w:t>
+      </w:r>
+      <w:r>
+        <w:rPr>
+          <w:b/>
+        </w:rPr>
+        <w:t>rejected</w:t>
+      </w:r>
+      <w:r>
+        <w:t xml:space="preserve"> vs Boyd+Allie (</w:t>
+      </w:r>
+      <w:r>
+        <w:rPr>
+          <w:b/>
+        </w:rPr>
+        <w:t>C941 C945</w:t>
+      </w:r>
+      <w:r>
+        <w:t xml:space="preserve">); 1966 Woodford death </w:t>
+      </w:r>
+      <w:r>
+        <w:rPr>
+          <w:b/>
+        </w:rPr>
+        <w:t>probable</w:t>
+      </w:r>
+      <w:r>
+        <w:t>, not proven (</w:t>
+      </w:r>
+      <w:r>
+        <w:rPr>
+          <w:b/>
+        </w:rPr>
+        <w:t>#26</w:t>
+      </w:r>
+      <w:r>
+        <w:t xml:space="preserve">); McCoy 40 on Buck Creek 1930 </w:t>
+      </w:r>
+      <w:r>
+        <w:rPr>
+          <w:b/>
+        </w:rPr>
+        <w:t>PROBABLE</w:t>
+      </w:r>
+      <w:r>
+        <w:t xml:space="preserve"> P010 (</w:t>
+      </w:r>
+      <w:r>
+        <w:rPr>
+          <w:b/>
+        </w:rPr>
+        <w:t>C562</w:t>
+      </w:r>
+      <w:r>
+        <w:t xml:space="preserve">); 1920 Owsley / 1940/1950 Owsley McCoy head </w:t>
+      </w:r>
+      <w:r>
+        <w:rPr>
+          <w:b/>
+        </w:rPr>
+        <w:t>nil</w:t>
       </w:r>
       <w:r>
         <w:t xml:space="preserve"> (</w:t>
@@ -7057,34 +8716,34 @@
         <w:rPr>
           <w:b/>
         </w:rPr>
-        <w:t>C910</w:t>
-      </w:r>
-      <w:r>
-        <w:t xml:space="preserve">; </w:t>
-      </w:r>
-      <w:r>
-        <w:rPr>
-          <w:b/>
-        </w:rPr>
-        <w:t>C863/C897/C909</w:t>
-      </w:r>
-      <w:r>
-        <w:t xml:space="preserve"> withdrawn); ED </w:t>
-      </w:r>
-      <w:r>
-        <w:rPr>
-          <w:b/>
-        </w:rPr>
-        <w:t>29 COMPLETE</w:t>
-      </w:r>
-      <w:r>
-        <w:t xml:space="preserve"> Excelcia </w:t>
-      </w:r>
-      <w:r>
-        <w:rPr>
-          <w:b/>
-        </w:rPr>
-        <w:t>23</w:t>
+        <w:t>C611 C574 C575</w:t>
+      </w:r>
+      <w:r>
+        <w:t xml:space="preserve">); </w:t>
+      </w:r>
+      <w:r>
+        <w:rPr>
+          <w:b/>
+        </w:rPr>
+        <w:t>447-20-2466</w:t>
+      </w:r>
+      <w:r>
+        <w:t xml:space="preserve"> not merged (</w:t>
+      </w:r>
+      <w:r>
+        <w:rPr>
+          <w:b/>
+        </w:rPr>
+        <w:t>C576</w:t>
+      </w:r>
+      <w:r>
+        <w:t xml:space="preserve">); Barney McCoy Newman of AR </w:t>
+      </w:r>
+      <w:r>
+        <w:rPr>
+          <w:b/>
+        </w:rPr>
+        <w:t>rejected</w:t>
       </w:r>
       <w:r>
         <w:t xml:space="preserve"> (</w:t>
@@ -7093,88 +8752,79 @@
         <w:rPr>
           <w:b/>
         </w:rPr>
-        <w:t>C912</w:t>
-      </w:r>
-      <w:r>
-        <w:t xml:space="preserve">); ED </w:t>
-      </w:r>
-      <w:r>
-        <w:rPr>
-          <w:b/>
-        </w:rPr>
-        <w:t>30</w:t>
-      </w:r>
-      <w:r>
-        <w:t xml:space="preserve"> </w:t>
-      </w:r>
-      <w:r>
-        <w:rPr>
-          <w:b/>
-        </w:rPr>
-        <w:t>COMPLETE</w:t>
-      </w:r>
-      <w:r>
-        <w:t xml:space="preserve"> and </w:t>
-      </w:r>
-      <w:r>
-        <w:rPr>
-          <w:b/>
-        </w:rPr>
-        <w:t>PROBABLE</w:t>
-      </w:r>
-      <w:r>
-        <w:t xml:space="preserve"> nil (</w:t>
-      </w:r>
-      <w:r>
-        <w:rPr>
-          <w:b/>
-        </w:rPr>
-        <w:t>C898</w:t>
-      </w:r>
-      <w:r>
-        <w:t xml:space="preserve">); Wolfe Torrent </w:t>
-      </w:r>
-      <w:r>
-        <w:rPr>
-          <w:b/>
-        </w:rPr>
-        <w:t>238</w:t>
-      </w:r>
-      <w:r>
-        <w:t xml:space="preserve"> </w:t>
-      </w:r>
-      <w:r>
-        <w:rPr>
-          <w:b/>
-        </w:rPr>
-        <w:t>0443–0471</w:t>
-      </w:r>
-      <w:r>
-        <w:t xml:space="preserve"> closed; Holly </w:t>
-      </w:r>
-      <w:r>
-        <w:rPr>
-          <w:b/>
-        </w:rPr>
-        <w:t>239</w:t>
-      </w:r>
-      <w:r>
-        <w:t xml:space="preserve"> start </w:t>
-      </w:r>
-      <w:r>
-        <w:rPr>
-          <w:b/>
-        </w:rPr>
-        <w:t>0472</w:t>
-      </w:r>
-      <w:r>
-        <w:t xml:space="preserve"> / end </w:t>
-      </w:r>
-      <w:r>
-        <w:rPr>
-          <w:b/>
-        </w:rPr>
-        <w:t>0486</w:t>
+        <w:t>C618</w:t>
+      </w:r>
+      <w:r>
+        <w:t xml:space="preserve">); 1918 Robert / Cora Brandenburg </w:t>
+      </w:r>
+      <w:r>
+        <w:rPr>
+          <w:b/>
+        </w:rPr>
+        <w:t>probable</w:t>
+      </w:r>
+      <w:r>
+        <w:t xml:space="preserve"> their son (</w:t>
+      </w:r>
+      <w:r>
+        <w:rPr>
+          <w:b/>
+        </w:rPr>
+        <w:t>C614</w:t>
+      </w:r>
+      <w:r>
+        <w:t xml:space="preserve">); 1942 Combs charge </w:t>
+      </w:r>
+      <w:r>
+        <w:rPr>
+          <w:b/>
+        </w:rPr>
+        <w:t>possible</w:t>
+      </w:r>
+      <w:r>
+        <w:t xml:space="preserve"> authored only (</w:t>
+      </w:r>
+      <w:r>
+        <w:rPr>
+          <w:b/>
+        </w:rPr>
+        <w:t>C619</w:t>
+      </w:r>
+      <w:r>
+        <w:t xml:space="preserve">); Daniel × Sarah M./Minerva are </w:t>
+      </w:r>
+      <w:r>
+        <w:rPr>
+          <w:b/>
+        </w:rPr>
+        <w:t>probable</w:t>
+      </w:r>
+      <w:r>
+        <w:t xml:space="preserve"> Everett’s parents (</w:t>
+      </w:r>
+      <w:r>
+        <w:rPr>
+          <w:b/>
+        </w:rPr>
+        <w:t>C456/C485</w:t>
+      </w:r>
+      <w:r>
+        <w:t xml:space="preserve">, </w:t>
+      </w:r>
+      <w:r>
+        <w:rPr>
+          <w:b/>
+        </w:rPr>
+        <w:t>#24</w:t>
+      </w:r>
+      <w:r>
+        <w:t xml:space="preserve">); 1930 Everett </w:t>
+      </w:r>
+      <w:r>
+        <w:rPr>
+          <w:b/>
+        </w:rPr>
+        <w:t>KYVAKY</w:t>
       </w:r>
       <w:r>
         <w:t xml:space="preserve"> (</w:t>
@@ -7183,88 +8833,34 @@
         <w:rPr>
           <w:b/>
         </w:rPr>
-        <w:t>C870</w:t>
-      </w:r>
-      <w:r>
-        <w:t xml:space="preserve"> start withdrawn); Stillwater </w:t>
-      </w:r>
-      <w:r>
-        <w:rPr>
-          <w:b/>
-        </w:rPr>
-        <w:t>240</w:t>
-      </w:r>
-      <w:r>
-        <w:t xml:space="preserve"> start </w:t>
-      </w:r>
-      <w:r>
-        <w:rPr>
-          <w:b/>
-        </w:rPr>
-        <w:t>0488</w:t>
-      </w:r>
-      <w:r>
-        <w:t xml:space="preserve">; Clifty </w:t>
-      </w:r>
-      <w:r>
-        <w:rPr>
-          <w:b/>
-        </w:rPr>
-        <w:t>241</w:t>
-      </w:r>
-      <w:r>
-        <w:t xml:space="preserve"> sh </w:t>
-      </w:r>
-      <w:r>
-        <w:rPr>
-          <w:b/>
-        </w:rPr>
-        <w:t>1</w:t>
-      </w:r>
-      <w:r>
-        <w:t xml:space="preserve"> only; Antioch </w:t>
-      </w:r>
-      <w:r>
-        <w:rPr>
-          <w:b/>
-        </w:rPr>
-        <w:t>242</w:t>
-      </w:r>
-      <w:r>
-        <w:t xml:space="preserve"> not on the IA 515-image scan (</w:t>
-      </w:r>
-      <w:r>
-        <w:rPr>
-          <w:b/>
-        </w:rPr>
-        <w:t>C892</w:t>
-      </w:r>
-      <w:r>
-        <w:t xml:space="preserve">); remaining Bell </w:t>
-      </w:r>
-      <w:r>
-        <w:rPr>
-          <w:b/>
-        </w:rPr>
-        <w:t>26 / 27 / 31–34</w:t>
-      </w:r>
-      <w:r>
-        <w:t xml:space="preserve"> visual name lines; 1930 Station Camp North </w:t>
-      </w:r>
-      <w:r>
-        <w:rPr>
-          <w:b/>
-        </w:rPr>
-        <w:t>33-7 COMPLETE</w:t>
-      </w:r>
-      <w:r>
-        <w:t xml:space="preserve"> — Boyd+Allie </w:t>
-      </w:r>
-      <w:r>
-        <w:rPr>
-          <w:b/>
-        </w:rPr>
-        <w:t>absent</w:t>
+        <w:t>C530</w:t>
+      </w:r>
+      <w:r>
+        <w:t xml:space="preserve">); 1910 ED </w:t>
+      </w:r>
+      <w:r>
+        <w:rPr>
+          <w:b/>
+        </w:rPr>
+        <w:t>98</w:t>
+      </w:r>
+      <w:r>
+        <w:t xml:space="preserve"> Rissie servant 15 </w:t>
+      </w:r>
+      <w:r>
+        <w:rPr>
+          <w:b/>
+        </w:rPr>
+        <w:t>possible</w:t>
+      </w:r>
+      <w:r>
+        <w:t xml:space="preserve"> P013, </w:t>
+      </w:r>
+      <w:r>
+        <w:rPr>
+          <w:b/>
+        </w:rPr>
+        <w:t>not merged</w:t>
       </w:r>
       <w:r>
         <w:t xml:space="preserve"> (</w:t>
@@ -7273,145 +8869,10 @@
         <w:rPr>
           <w:b/>
         </w:rPr>
-        <w:t>C919–C921</w:t>
-      </w:r>
-      <w:r>
-        <w:t xml:space="preserve">); </w:t>
-      </w:r>
-      <w:r>
-        <w:rPr>
-          <w:b/>
-        </w:rPr>
-        <w:t>33-8</w:t>
-      </w:r>
-      <w:r>
-        <w:t xml:space="preserve"> not isolated (</w:t>
-      </w:r>
-      <w:r>
-        <w:rPr>
-          <w:b/>
-        </w:rPr>
-        <w:t>C922</w:t>
-      </w:r>
-      <w:r>
-        <w:t xml:space="preserve">); </w:t>
-      </w:r>
-      <w:r>
-        <w:rPr>
-          <w:b/>
-        </w:rPr>
-        <w:t>1920 Breathitt ED 52 George's Branch sh 19A ln 17 Newman John 38 + Jennie 21 ISOLATED and rejected vs John L (C772–C775)</w:t>
-      </w:r>
-      <w:r>
-        <w:t xml:space="preserve">; </w:t>
-      </w:r>
-      <w:r>
-        <w:rPr>
-          <w:b/>
-        </w:rPr>
-        <w:t>leaf 1116 = ED 55 sh 1A (C791)</w:t>
-      </w:r>
-      <w:r>
-        <w:t xml:space="preserve">; </w:t>
-      </w:r>
-      <w:r>
-        <w:rPr>
-          <w:b/>
-        </w:rPr>
-        <w:t>1910 Heidelberg Boyd 38 + Allie 28 + four children = 1920 Station Camp — PROVEN (C700)</w:t>
-      </w:r>
-      <w:r>
-        <w:t xml:space="preserve">; 1900 Boyd boarder </w:t>
-      </w:r>
-      <w:r>
-        <w:rPr>
-          <w:b/>
-        </w:rPr>
-        <w:t>Mar 1878</w:t>
-      </w:r>
-      <w:r>
-        <w:t xml:space="preserve"> </w:t>
-      </w:r>
-      <w:r>
-        <w:rPr>
-          <w:b/>
-        </w:rPr>
-        <w:t>PROVEN (C702)</w:t>
-      </w:r>
-      <w:r>
-        <w:t xml:space="preserve">; 1902 Floyd×Allie license </w:t>
-      </w:r>
-      <w:r>
-        <w:rPr>
-          <w:b/>
-        </w:rPr>
-        <w:t>proven</w:t>
-      </w:r>
-      <w:r>
-        <w:t xml:space="preserve"> as compiled, </w:t>
-      </w:r>
-      <w:r>
-        <w:rPr>
-          <w:b/>
-        </w:rPr>
-        <w:t>still not merged</w:t>
-      </w:r>
-      <w:r>
-        <w:t xml:space="preserve"> with Boyd (</w:t>
-      </w:r>
-      <w:r>
-        <w:rPr>
-          <w:b/>
-        </w:rPr>
-        <w:t>#27</w:t>
-      </w:r>
-      <w:r>
-        <w:t xml:space="preserve">, </w:t>
-      </w:r>
-      <w:r>
-        <w:rPr>
-          <w:b/>
-        </w:rPr>
-        <w:t>C711</w:t>
-      </w:r>
-      <w:r>
-        <w:t xml:space="preserve">); 1966 Woodford death </w:t>
-      </w:r>
-      <w:r>
-        <w:rPr>
-          <w:b/>
-        </w:rPr>
-        <w:t>probable</w:t>
-      </w:r>
-      <w:r>
-        <w:t>, not proven (</w:t>
-      </w:r>
-      <w:r>
-        <w:rPr>
-          <w:b/>
-        </w:rPr>
-        <w:t>#26</w:t>
-      </w:r>
-      <w:r>
-        <w:t xml:space="preserve">); McCoy 40 on Buck Creek 1930 </w:t>
-      </w:r>
-      <w:r>
-        <w:rPr>
-          <w:b/>
-        </w:rPr>
-        <w:t>PROBABLE</w:t>
-      </w:r>
-      <w:r>
-        <w:t xml:space="preserve"> P010 (</w:t>
-      </w:r>
-      <w:r>
-        <w:rPr>
-          <w:b/>
-        </w:rPr>
-        <w:t>C562</w:t>
-      </w:r>
-      <w:r>
-        <w:t xml:space="preserve">); 1920 Owsley / 1940/1950 Owsley McCoy head </w:t>
+        <w:t>C713</w:t>
+      </w:r>
+      <w:r>
+        <w:t xml:space="preserve"> / B016); Daniel’s license still unread after TFKRHA 1843–80 </w:t>
       </w:r>
       <w:r>
         <w:rPr>
@@ -7420,177 +8881,6 @@
         <w:t>nil</w:t>
       </w:r>
       <w:r>
-        <w:t xml:space="preserve"> (</w:t>
-      </w:r>
-      <w:r>
-        <w:rPr>
-          <w:b/>
-        </w:rPr>
-        <w:t>C611 C574 C575</w:t>
-      </w:r>
-      <w:r>
-        <w:t xml:space="preserve">); </w:t>
-      </w:r>
-      <w:r>
-        <w:rPr>
-          <w:b/>
-        </w:rPr>
-        <w:t>447-20-2466</w:t>
-      </w:r>
-      <w:r>
-        <w:t xml:space="preserve"> not merged (</w:t>
-      </w:r>
-      <w:r>
-        <w:rPr>
-          <w:b/>
-        </w:rPr>
-        <w:t>C576</w:t>
-      </w:r>
-      <w:r>
-        <w:t xml:space="preserve">); Barney McCoy Newman of AR </w:t>
-      </w:r>
-      <w:r>
-        <w:rPr>
-          <w:b/>
-        </w:rPr>
-        <w:t>rejected</w:t>
-      </w:r>
-      <w:r>
-        <w:t xml:space="preserve"> (</w:t>
-      </w:r>
-      <w:r>
-        <w:rPr>
-          <w:b/>
-        </w:rPr>
-        <w:t>C618</w:t>
-      </w:r>
-      <w:r>
-        <w:t xml:space="preserve">); 1918 Robert / Cora Brandenburg </w:t>
-      </w:r>
-      <w:r>
-        <w:rPr>
-          <w:b/>
-        </w:rPr>
-        <w:t>probable</w:t>
-      </w:r>
-      <w:r>
-        <w:t xml:space="preserve"> their son (</w:t>
-      </w:r>
-      <w:r>
-        <w:rPr>
-          <w:b/>
-        </w:rPr>
-        <w:t>C614</w:t>
-      </w:r>
-      <w:r>
-        <w:t xml:space="preserve">); 1942 Combs charge </w:t>
-      </w:r>
-      <w:r>
-        <w:rPr>
-          <w:b/>
-        </w:rPr>
-        <w:t>possible</w:t>
-      </w:r>
-      <w:r>
-        <w:t xml:space="preserve"> authored only (</w:t>
-      </w:r>
-      <w:r>
-        <w:rPr>
-          <w:b/>
-        </w:rPr>
-        <w:t>C619</w:t>
-      </w:r>
-      <w:r>
-        <w:t xml:space="preserve">); Daniel × Sarah M./Minerva are </w:t>
-      </w:r>
-      <w:r>
-        <w:rPr>
-          <w:b/>
-        </w:rPr>
-        <w:t>probable</w:t>
-      </w:r>
-      <w:r>
-        <w:t xml:space="preserve"> Everett’s parents (</w:t>
-      </w:r>
-      <w:r>
-        <w:rPr>
-          <w:b/>
-        </w:rPr>
-        <w:t>C456/C485</w:t>
-      </w:r>
-      <w:r>
-        <w:t xml:space="preserve">, </w:t>
-      </w:r>
-      <w:r>
-        <w:rPr>
-          <w:b/>
-        </w:rPr>
-        <w:t>#24</w:t>
-      </w:r>
-      <w:r>
-        <w:t xml:space="preserve">); 1930 Everett </w:t>
-      </w:r>
-      <w:r>
-        <w:rPr>
-          <w:b/>
-        </w:rPr>
-        <w:t>KYVAKY</w:t>
-      </w:r>
-      <w:r>
-        <w:t xml:space="preserve"> (</w:t>
-      </w:r>
-      <w:r>
-        <w:rPr>
-          <w:b/>
-        </w:rPr>
-        <w:t>C530</w:t>
-      </w:r>
-      <w:r>
-        <w:t xml:space="preserve">); 1910 ED </w:t>
-      </w:r>
-      <w:r>
-        <w:rPr>
-          <w:b/>
-        </w:rPr>
-        <w:t>98</w:t>
-      </w:r>
-      <w:r>
-        <w:t xml:space="preserve"> Rissie servant 15 </w:t>
-      </w:r>
-      <w:r>
-        <w:rPr>
-          <w:b/>
-        </w:rPr>
-        <w:t>possible</w:t>
-      </w:r>
-      <w:r>
-        <w:t xml:space="preserve"> P013, </w:t>
-      </w:r>
-      <w:r>
-        <w:rPr>
-          <w:b/>
-        </w:rPr>
-        <w:t>not merged</w:t>
-      </w:r>
-      <w:r>
-        <w:t xml:space="preserve"> (</w:t>
-      </w:r>
-      <w:r>
-        <w:rPr>
-          <w:b/>
-        </w:rPr>
-        <w:t>C713</w:t>
-      </w:r>
-      <w:r>
-        <w:t xml:space="preserve"> / B016); Daniel’s license still unread after TFKRHA 1843–80 </w:t>
-      </w:r>
-      <w:r>
-        <w:rPr>
-          <w:b/>
-        </w:rPr>
-        <w:t>nil</w:t>
-      </w:r>
-      <w:r>
         <w:t xml:space="preserve"> (B079); Melissa ~1876 unread (B078); Grant 21 vs David F. unread (B081); William × Katherine license (B064); two William lines (B071); Herman Estes of Brasstown (B067); Frankie Jones / Mary Peters (B068); Carter Cove stone photographs (B054). </w:t>
       </w:r>
       <w:r>
@@ -7600,7 +8890,34 @@
         <w:t>Done this increment:</w:t>
       </w:r>
       <w:r>
-        <w:t xml:space="preserve"> 1910 Heidelberg Boyd+Allie original; 1900 Boyd boarder original; Floyd 1910 Soundex nil. </w:t>
+        <w:t xml:space="preserve"> Bell </w:t>
+      </w:r>
+      <w:r>
+        <w:rPr>
+          <w:b/>
+        </w:rPr>
+        <w:t>25–34</w:t>
+      </w:r>
+      <w:r>
+        <w:t xml:space="preserve"> official closes; Estill </w:t>
+      </w:r>
+      <w:r>
+        <w:rPr>
+          <w:b/>
+        </w:rPr>
+        <w:t>33-8/33-9</w:t>
+      </w:r>
+      <w:r>
+        <w:t xml:space="preserve"> film-gap proven on IA T626-742; 1920 Berea Town ED </w:t>
+      </w:r>
+      <w:r>
+        <w:rPr>
+          <w:b/>
+        </w:rPr>
+        <w:t>103</w:t>
+      </w:r>
+      <w:r>
+        <w:t xml:space="preserve"> official close. </w:t>
       </w:r>
       <w:r>
         <w:rPr>
@@ -7609,7 +8926,7 @@
         <w:t>Done earlier:</w:t>
       </w:r>
       <w:r>
-        <w:t xml:space="preserve"> Powell 1051–1201 contact-sheet; Wolfe start mapped; Breathitt ED 52 / 0840–1176; 1918 Boyd informant; Estill 1920 couple-close; Boyd+Allie Station Camp; Jackson contact-sheet; 1920 Owsley county (</w:t>
+        <w:t xml:space="preserve"> 1910 Heidelberg Boyd+Allie original; 1900 Boyd boarder original; Floyd 1910 Soundex nil; Powell 1051–1201 contact-sheet; Wolfe start mapped; Breathitt ED 52 / 0840–1176; 1918 Boyd informant; Estill 1920 couple-close; Boyd+Allie Station Camp; Jackson contact-sheet; 1920 Owsley county (</w:t>
       </w:r>
       <w:r>
         <w:rPr>
@@ -7709,6 +9026,42 @@
         <w:rPr>
           <w:b/>
         </w:rPr>
+        <w:t>B055</w:t>
+      </w:r>
+      <w:r>
+        <w:t xml:space="preserve"> remaining 1930 Madison T626-769 Glade </w:t>
+      </w:r>
+      <w:r>
+        <w:rPr>
+          <w:b/>
+        </w:rPr>
+        <w:t>76-18 / 76-19</w:t>
+      </w:r>
+      <w:r>
+        <w:t xml:space="preserve"> visual name lines (Frank of Berea; 76-16 and 76-17 closed), then </w:t>
+      </w:r>
+      <w:r>
+        <w:rPr>
+          <w:b/>
+        </w:rPr>
+        <w:t>B088</w:t>
+      </w:r>
+      <w:r>
+        <w:t xml:space="preserve"> Antioch </w:t>
+      </w:r>
+      <w:r>
+        <w:rPr>
+          <w:b/>
+        </w:rPr>
+        <w:t>242</w:t>
+      </w:r>
+      <w:r>
+        <w:t xml:space="preserve"> + remaining Clifty after sheet 1 (still not on a free IA item), </w:t>
+      </w:r>
+      <w:r>
+        <w:rPr>
+          <w:b/>
+        </w:rPr>
         <w:t>B089</w:t>
       </w:r>
       <w:r>
@@ -7721,43 +9074,7 @@
         <w:t>33-8</w:t>
       </w:r>
       <w:r>
-        <w:t xml:space="preserve"> Station Camp South originals (not in reel 742 </w:t>
-      </w:r>
-      <w:r>
-        <w:rPr>
-          <w:b/>
-        </w:rPr>
-        <w:t>0750–0900</w:t>
-      </w:r>
-      <w:r>
-        <w:t xml:space="preserve">), then </w:t>
-      </w:r>
-      <w:r>
-        <w:rPr>
-          <w:b/>
-        </w:rPr>
-        <w:t>B088</w:t>
-      </w:r>
-      <w:r>
-        <w:t xml:space="preserve"> Antioch </w:t>
-      </w:r>
-      <w:r>
-        <w:rPr>
-          <w:b/>
-        </w:rPr>
-        <w:t>242</w:t>
-      </w:r>
-      <w:r>
-        <w:t xml:space="preserve"> + remaining Clifty after sheet 1 + remaining Bell </w:t>
-      </w:r>
-      <w:r>
-        <w:rPr>
-          <w:b/>
-        </w:rPr>
-        <w:t>26 / 27 / 31–34</w:t>
-      </w:r>
-      <w:r>
-        <w:t xml:space="preserve"> visual name lines, </w:t>
+        <w:t xml:space="preserve"> on FS/Ancestry/NARA film (absent this IA scan), </w:t>
       </w:r>
       <w:r>
         <w:rPr>
@@ -7802,7 +9119,7 @@
         <w:t>Tyler Phillips</w:t>
       </w:r>
       <w:r>
-        <w:t xml:space="preserve">), </w:t>
+        <w:t xml:space="preserve"> already recorded — do not re-ask), </w:t>
       </w:r>
       <w:r>
         <w:rPr>
@@ -7881,15 +9198,6 @@
           <w:b/>
         </w:rPr>
         <w:t>B079</w:t>
-      </w:r>
-      <w:r>
-        <w:t xml:space="preserve">, </w:t>
-      </w:r>
-      <w:r>
-        <w:rPr>
-          <w:b/>
-        </w:rPr>
-        <w:t>B055/B081</w:t>
       </w:r>
       <w:r>
         <w:t xml:space="preserve">, </w:t>
@@ -17051,6 +18359,772 @@
     </w:p>
     <w:p>
       <w:r>
+        <w:t xml:space="preserve">153. IA T626-742 leaf </w:t>
+      </w:r>
+      <w:r>
+        <w:rPr>
+          <w:b/>
+        </w:rPr>
+        <w:t>0821</w:t>
+      </w:r>
+      <w:r>
+        <w:t xml:space="preserve">: Estill </w:t>
+      </w:r>
+      <w:r>
+        <w:rPr>
+          <w:b/>
+        </w:rPr>
+        <w:t>33-10</w:t>
+      </w:r>
+      <w:r>
+        <w:t xml:space="preserve"> Red Lick East sh </w:t>
+      </w:r>
+      <w:r>
+        <w:rPr>
+          <w:b/>
+        </w:rPr>
+        <w:t>1 A</w:t>
+      </w:r>
+      <w:r>
+        <w:t xml:space="preserve"> stamped </w:t>
+      </w:r>
+      <w:r>
+        <w:rPr>
+          <w:b/>
+        </w:rPr>
+        <w:t>117</w:t>
+      </w:r>
+      <w:r>
+        <w:t xml:space="preserve">. </w:t>
+      </w:r>
+      <w:r>
+        <w:rPr>
+          <w:b/>
+        </w:rPr>
+        <w:t>0820</w:t>
+      </w:r>
+      <w:r>
+        <w:t xml:space="preserve"> unused. Stamped </w:t>
+      </w:r>
+      <w:r>
+        <w:rPr>
+          <w:b/>
+        </w:rPr>
+        <w:t>094A→117A</w:t>
+      </w:r>
+      <w:r>
+        <w:t xml:space="preserve"> — </w:t>
+      </w:r>
+      <w:r>
+        <w:rPr>
+          <w:b/>
+        </w:rPr>
+        <w:t>33-8/33-9 absent</w:t>
+      </w:r>
+      <w:r>
+        <w:t xml:space="preserve">. Estill ends </w:t>
+      </w:r>
+      <w:r>
+        <w:rPr>
+          <w:b/>
+        </w:rPr>
+        <w:t>0947</w:t>
+      </w:r>
+      <w:r>
+        <w:t xml:space="preserve"> Grant card. [`kentuckycensus00reel742`](https://archive.org/details/kentuckycensus00reel742). *Image seen.* </w:t>
+      </w:r>
+      <w:r>
+        <w:rPr>
+          <w:b/>
+        </w:rPr>
+        <w:t>C933–C940</w:t>
+      </w:r>
+      <w:r>
+        <w:t xml:space="preserve"> </w:t>
+      </w:r>
+      <w:r>
+        <w:rPr>
+          <w:b/>
+        </w:rPr>
+        <w:t>S621–S630</w:t>
+      </w:r>
+      <w:r>
+        <w:t>.</w:t>
+      </w:r>
+    </w:p>
+    <w:p>
+      <w:r>
+        <w:t xml:space="preserve">154. Unread </w:t>
+      </w:r>
+      <w:r>
+        <w:rPr>
+          <w:b/>
+        </w:rPr>
+        <w:t>0650–0749</w:t>
+      </w:r>
+      <w:r>
+        <w:t xml:space="preserve"> ≠ 33-8: </w:t>
+      </w:r>
+      <w:r>
+        <w:rPr>
+          <w:b/>
+        </w:rPr>
+        <w:t>0650</w:t>
+      </w:r>
+      <w:r>
+        <w:t xml:space="preserve"> = </w:t>
+      </w:r>
+      <w:r>
+        <w:rPr>
+          <w:b/>
+        </w:rPr>
+        <w:t>33-2</w:t>
+      </w:r>
+      <w:r>
+        <w:t xml:space="preserve"> Irvine South; </w:t>
+      </w:r>
+      <w:r>
+        <w:rPr>
+          <w:b/>
+        </w:rPr>
+        <w:t>0746</w:t>
+      </w:r>
+      <w:r>
+        <w:t xml:space="preserve"> = </w:t>
+      </w:r>
+      <w:r>
+        <w:rPr>
+          <w:b/>
+        </w:rPr>
+        <w:t>33-6</w:t>
+      </w:r>
+      <w:r>
+        <w:t xml:space="preserve"> Millers Creek West; </w:t>
+      </w:r>
+      <w:r>
+        <w:rPr>
+          <w:b/>
+        </w:rPr>
+        <w:t>0747</w:t>
+      </w:r>
+      <w:r>
+        <w:t xml:space="preserve"> = </w:t>
+      </w:r>
+      <w:r>
+        <w:rPr>
+          <w:b/>
+        </w:rPr>
+        <w:t>33-14</w:t>
+      </w:r>
+      <w:r>
+        <w:t xml:space="preserve"> start. *Image seen.* </w:t>
+      </w:r>
+      <w:r>
+        <w:rPr>
+          <w:b/>
+        </w:rPr>
+        <w:t>C936 C937</w:t>
+      </w:r>
+      <w:r>
+        <w:t xml:space="preserve"> </w:t>
+      </w:r>
+      <w:r>
+        <w:rPr>
+          <w:b/>
+        </w:rPr>
+        <w:t>S625–S627</w:t>
+      </w:r>
+      <w:r>
+        <w:t>.</w:t>
+      </w:r>
+    </w:p>
+    <w:p>
+      <w:r>
+        <w:t xml:space="preserve">155. Bell ED </w:t>
+      </w:r>
+      <w:r>
+        <w:rPr>
+          <w:b/>
+        </w:rPr>
+        <w:t>26</w:t>
+      </w:r>
+      <w:r>
+        <w:t xml:space="preserve"> South Side </w:t>
+      </w:r>
+      <w:r>
+        <w:rPr>
+          <w:b/>
+        </w:rPr>
+        <w:t>0517–0559</w:t>
+      </w:r>
+      <w:r>
+        <w:t xml:space="preserve"> official close; ED </w:t>
+      </w:r>
+      <w:r>
+        <w:rPr>
+          <w:b/>
+        </w:rPr>
+        <w:t>27</w:t>
+      </w:r>
+      <w:r>
+        <w:t xml:space="preserve"> West End </w:t>
+      </w:r>
+      <w:r>
+        <w:rPr>
+          <w:b/>
+        </w:rPr>
+        <w:t>0561–0606</w:t>
+      </w:r>
+      <w:r>
+        <w:t xml:space="preserve"> official close. IA [`14thcensusofpopu559unit`](https://archive.org/details/14thcensusofpopu559unit). *Image seen.* </w:t>
+      </w:r>
+      <w:r>
+        <w:rPr>
+          <w:b/>
+        </w:rPr>
+        <w:t>C942 C943</w:t>
+      </w:r>
+      <w:r>
+        <w:t xml:space="preserve"> </w:t>
+      </w:r>
+      <w:r>
+        <w:rPr>
+          <w:b/>
+        </w:rPr>
+        <w:t>S632–S635</w:t>
+      </w:r>
+      <w:r>
+        <w:t>.</w:t>
+      </w:r>
+    </w:p>
+    <w:p>
+      <w:r>
+        <w:t xml:space="preserve">156. Bell ED </w:t>
+      </w:r>
+      <w:r>
+        <w:rPr>
+          <w:b/>
+        </w:rPr>
+        <w:t>31</w:t>
+      </w:r>
+      <w:r>
+        <w:t xml:space="preserve"> Dorothy </w:t>
+      </w:r>
+      <w:r>
+        <w:rPr>
+          <w:b/>
+        </w:rPr>
+        <w:t>0661–0674</w:t>
+      </w:r>
+      <w:r>
+        <w:t xml:space="preserve">; ED </w:t>
+      </w:r>
+      <w:r>
+        <w:rPr>
+          <w:b/>
+        </w:rPr>
+        <w:t>32</w:t>
+      </w:r>
+      <w:r>
+        <w:t xml:space="preserve"> Ferndale </w:t>
+      </w:r>
+      <w:r>
+        <w:rPr>
+          <w:b/>
+        </w:rPr>
+        <w:t>0675–0685</w:t>
+      </w:r>
+      <w:r>
+        <w:t xml:space="preserve">; ED </w:t>
+      </w:r>
+      <w:r>
+        <w:rPr>
+          <w:b/>
+        </w:rPr>
+        <w:t>33</w:t>
+      </w:r>
+      <w:r>
+        <w:t xml:space="preserve"> Suttly </w:t>
+      </w:r>
+      <w:r>
+        <w:rPr>
+          <w:b/>
+        </w:rPr>
+        <w:t>0686–0696</w:t>
+      </w:r>
+      <w:r>
+        <w:t xml:space="preserve">. </w:t>
+      </w:r>
+      <w:r>
+        <w:rPr>
+          <w:b/>
+        </w:rPr>
+        <w:t>25–34 ALL COMPLETE</w:t>
+      </w:r>
+      <w:r>
+        <w:t xml:space="preserve">. </w:t>
+      </w:r>
+      <w:r>
+        <w:rPr>
+          <w:b/>
+        </w:rPr>
+        <w:t>C932 withdrawn</w:t>
+      </w:r>
+      <w:r>
+        <w:t xml:space="preserve">. *Image seen.* </w:t>
+      </w:r>
+      <w:r>
+        <w:rPr>
+          <w:b/>
+        </w:rPr>
+        <w:t>C949–C952</w:t>
+      </w:r>
+      <w:r>
+        <w:t xml:space="preserve"> </w:t>
+      </w:r>
+      <w:r>
+        <w:rPr>
+          <w:b/>
+        </w:rPr>
+        <w:t>S642–S646</w:t>
+      </w:r>
+      <w:r>
+        <w:t>.</w:t>
+      </w:r>
+    </w:p>
+    <w:p>
+      <w:r>
+        <w:t xml:space="preserve">157. IA [`14thcensusofpopu1602unit`](https://archive.org/details/14thcensusofpopu1602unit) = 1920 PA Mercer, not a T625-602 remainder. Antioch </w:t>
+      </w:r>
+      <w:r>
+        <w:rPr>
+          <w:b/>
+        </w:rPr>
+        <w:t>242</w:t>
+      </w:r>
+      <w:r>
+        <w:t xml:space="preserve"> still not on a free IA item. FS SPA (R011-41). *Catalog.* </w:t>
+      </w:r>
+      <w:r>
+        <w:rPr>
+          <w:b/>
+        </w:rPr>
+        <w:t>C946 C947</w:t>
+      </w:r>
+      <w:r>
+        <w:t xml:space="preserve"> </w:t>
+      </w:r>
+      <w:r>
+        <w:rPr>
+          <w:b/>
+        </w:rPr>
+        <w:t>S638 S639</w:t>
+      </w:r>
+      <w:r>
+        <w:t>.</w:t>
+      </w:r>
+    </w:p>
+    <w:p>
+      <w:r>
+        <w:t xml:space="preserve">158. IA T625-590 [`14thcensusofpopu590unit`](https://archive.org/details/14thcensusofpopu590unit): Berea Town Precinct </w:t>
+      </w:r>
+      <w:r>
+        <w:rPr>
+          <w:b/>
+        </w:rPr>
+        <w:t>16</w:t>
+      </w:r>
+      <w:r>
+        <w:t xml:space="preserve"> ED </w:t>
+      </w:r>
+      <w:r>
+        <w:rPr>
+          <w:b/>
+        </w:rPr>
+        <w:t>103</w:t>
+      </w:r>
+      <w:r>
+        <w:t xml:space="preserve"> official start </w:t>
+      </w:r>
+      <w:r>
+        <w:rPr>
+          <w:b/>
+        </w:rPr>
+        <w:t>0317</w:t>
+      </w:r>
+      <w:r>
+        <w:t xml:space="preserve"> / official-looking end </w:t>
+      </w:r>
+      <w:r>
+        <w:rPr>
+          <w:b/>
+        </w:rPr>
+        <w:t>0348</w:t>
+      </w:r>
+      <w:r>
+        <w:t xml:space="preserve">. College </w:t>
+      </w:r>
+      <w:r>
+        <w:rPr>
+          <w:b/>
+        </w:rPr>
+        <w:t>0349–0350</w:t>
+      </w:r>
+      <w:r>
+        <w:t xml:space="preserve">. Glade Creek </w:t>
+      </w:r>
+      <w:r>
+        <w:rPr>
+          <w:b/>
+        </w:rPr>
+        <w:t>0351</w:t>
+      </w:r>
+      <w:r>
+        <w:t xml:space="preserve">. Tesseract 39 sheets nil; 0324 Frank rejected. </w:t>
+      </w:r>
+      <w:r>
+        <w:rPr>
+          <w:b/>
+        </w:rPr>
+        <w:t>PROBABLE</w:t>
+      </w:r>
+      <w:r>
+        <w:t xml:space="preserve"> entire-ED </w:t>
+      </w:r>
+      <w:r>
+        <w:rPr>
+          <w:b/>
+        </w:rPr>
+        <w:t>103</w:t>
+      </w:r>
+      <w:r>
+        <w:t xml:space="preserve"> name-negative. *Image seen / OCR draft.* </w:t>
+      </w:r>
+      <w:r>
+        <w:rPr>
+          <w:b/>
+        </w:rPr>
+        <w:t>C957–C964</w:t>
+      </w:r>
+      <w:r>
+        <w:t xml:space="preserve"> </w:t>
+      </w:r>
+      <w:r>
+        <w:rPr>
+          <w:b/>
+        </w:rPr>
+        <w:t>S652–S658</w:t>
+      </w:r>
+      <w:r>
+        <w:t>.</w:t>
+      </w:r>
+    </w:p>
+    <w:p>
+      <w:r>
+        <w:t xml:space="preserve">159. NARA [1950 Madison API](https://1950census.archives.gov/): Newnam </w:t>
+      </w:r>
+      <w:r>
+        <w:rPr>
+          <w:b/>
+        </w:rPr>
+        <w:t>0</w:t>
+      </w:r>
+      <w:r>
+        <w:t xml:space="preserve">; Newman </w:t>
+      </w:r>
+      <w:r>
+        <w:rPr>
+          <w:b/>
+        </w:rPr>
+        <w:t>13</w:t>
+      </w:r>
+      <w:r>
+        <w:t xml:space="preserve"> no Frank contractor. *Index only.* </w:t>
+      </w:r>
+      <w:r>
+        <w:rPr>
+          <w:b/>
+        </w:rPr>
+        <w:t>C965</w:t>
+      </w:r>
+      <w:r>
+        <w:t xml:space="preserve"> </w:t>
+      </w:r>
+      <w:r>
+        <w:rPr>
+          <w:b/>
+        </w:rPr>
+        <w:t>S659</w:t>
+      </w:r>
+      <w:r>
+        <w:t>.</w:t>
+      </w:r>
+    </w:p>
+    <w:p>
+      <w:r>
+        <w:t xml:space="preserve">160. IA [`kentuckycensus00reel769`](https://archive.org/details/kentuckycensus00reel769) T626-769 </w:t>
+      </w:r>
+      <w:r>
+        <w:rPr>
+          <w:b/>
+        </w:rPr>
+        <w:t>1137</w:t>
+      </w:r>
+      <w:r>
+        <w:t xml:space="preserve"> images; Madison </w:t>
+      </w:r>
+      <w:r>
+        <w:rPr>
+          <w:b/>
+        </w:rPr>
+        <w:t>76-1–76-24</w:t>
+      </w:r>
+      <w:r>
+        <w:t xml:space="preserve"> on card. Published [ED list](https://www.us-census.org/states/kentucky/teams/Madison1930-T626-769.htm): Berea Town = </w:t>
+      </w:r>
+      <w:r>
+        <w:rPr>
+          <w:b/>
+        </w:rPr>
+        <w:t>76-16</w:t>
+      </w:r>
+      <w:r>
+        <w:t xml:space="preserve">. Residual unread. *Image seen / catalog.* </w:t>
+      </w:r>
+      <w:r>
+        <w:rPr>
+          <w:b/>
+        </w:rPr>
+        <w:t>C969</w:t>
+      </w:r>
+      <w:r>
+        <w:t xml:space="preserve"> </w:t>
+      </w:r>
+      <w:r>
+        <w:rPr>
+          <w:b/>
+        </w:rPr>
+        <w:t>S662 S663</w:t>
+      </w:r>
+      <w:r>
+        <w:t>.</w:t>
+      </w:r>
+    </w:p>
+    <w:p>
+      <w:r>
+        <w:t xml:space="preserve">161. Leaf </w:t>
+      </w:r>
+      <w:r>
+        <w:rPr>
+          <w:b/>
+        </w:rPr>
+        <w:t>0340</w:t>
+      </w:r>
+      <w:r>
+        <w:t xml:space="preserve">: Berea Town ED </w:t>
+      </w:r>
+      <w:r>
+        <w:rPr>
+          <w:b/>
+        </w:rPr>
+        <w:t>76-16</w:t>
+      </w:r>
+      <w:r>
+        <w:t xml:space="preserve"> sh </w:t>
+      </w:r>
+      <w:r>
+        <w:rPr>
+          <w:b/>
+        </w:rPr>
+        <w:t>1 A</w:t>
+      </w:r>
+      <w:r>
+        <w:t xml:space="preserve">, 2 Apr 1930, J. A. Baker. Official start. </w:t>
+      </w:r>
+      <w:r>
+        <w:rPr>
+          <w:b/>
+        </w:rPr>
+        <w:t>0339</w:t>
+      </w:r>
+      <w:r>
+        <w:t xml:space="preserve"> unused. </w:t>
+      </w:r>
+      <w:r>
+        <w:rPr>
+          <w:b/>
+        </w:rPr>
+        <w:t>0338</w:t>
+      </w:r>
+      <w:r>
+        <w:t xml:space="preserve"> = Yates </w:t>
+      </w:r>
+      <w:r>
+        <w:rPr>
+          <w:b/>
+        </w:rPr>
+        <w:t>76-15</w:t>
+      </w:r>
+      <w:r>
+        <w:t xml:space="preserve">. IA [`kentuckycensus00reel769`](https://archive.org/details/kentuckycensus00reel769). *Image seen.* </w:t>
+      </w:r>
+      <w:r>
+        <w:rPr>
+          <w:b/>
+        </w:rPr>
+        <w:t>C972–C974</w:t>
+      </w:r>
+      <w:r>
+        <w:t xml:space="preserve"> </w:t>
+      </w:r>
+      <w:r>
+        <w:rPr>
+          <w:b/>
+        </w:rPr>
+        <w:t>S668–S670</w:t>
+      </w:r>
+      <w:r>
+        <w:t>.</w:t>
+      </w:r>
+    </w:p>
+    <w:p>
+      <w:r>
+        <w:t xml:space="preserve">162. ED </w:t>
+      </w:r>
+      <w:r>
+        <w:rPr>
+          <w:b/>
+        </w:rPr>
+        <w:t>76-16 COMPLETE</w:t>
+      </w:r>
+      <w:r>
+        <w:t xml:space="preserve"> </w:t>
+      </w:r>
+      <w:r>
+        <w:rPr>
+          <w:b/>
+        </w:rPr>
+        <w:t>0340–0376</w:t>
+      </w:r>
+      <w:r>
+        <w:t xml:space="preserve">. </w:t>
+      </w:r>
+      <w:r>
+        <w:rPr>
+          <w:b/>
+        </w:rPr>
+        <w:t>0376</w:t>
+      </w:r>
+      <w:r>
+        <w:t xml:space="preserve"> Institution Berea College sh </w:t>
+      </w:r>
+      <w:r>
+        <w:rPr>
+          <w:b/>
+        </w:rPr>
+        <w:t>19 A</w:t>
+      </w:r>
+      <w:r>
+        <w:t xml:space="preserve">. Tesseract 44 sheets nil. </w:t>
+      </w:r>
+      <w:r>
+        <w:rPr>
+          <w:b/>
+        </w:rPr>
+        <w:t>PROBABLE</w:t>
+      </w:r>
+      <w:r>
+        <w:t xml:space="preserve"> entire-ED name-negative for Frank / David F. / Grant. *Image seen / OCR draft.* </w:t>
+      </w:r>
+      <w:r>
+        <w:rPr>
+          <w:b/>
+        </w:rPr>
+        <w:t>C975–C980</w:t>
+      </w:r>
+      <w:r>
+        <w:t xml:space="preserve"> </w:t>
+      </w:r>
+      <w:r>
+        <w:rPr>
+          <w:b/>
+        </w:rPr>
+        <w:t>S671 S675</w:t>
+      </w:r>
+      <w:r>
+        <w:t>.</w:t>
+      </w:r>
+    </w:p>
+    <w:p>
+      <w:r>
+        <w:t xml:space="preserve">163. ED </w:t>
+      </w:r>
+      <w:r>
+        <w:rPr>
+          <w:b/>
+        </w:rPr>
+        <w:t>76-17</w:t>
+      </w:r>
+      <w:r>
+        <w:t xml:space="preserve"> Glade North </w:t>
+      </w:r>
+      <w:r>
+        <w:rPr>
+          <w:b/>
+        </w:rPr>
+        <w:t>COMPLETE</w:t>
+      </w:r>
+      <w:r>
+        <w:t xml:space="preserve"> </w:t>
+      </w:r>
+      <w:r>
+        <w:rPr>
+          <w:b/>
+        </w:rPr>
+        <w:t>0378–0392</w:t>
+      </w:r>
+      <w:r>
+        <w:t xml:space="preserve">. </w:t>
+      </w:r>
+      <w:r>
+        <w:rPr>
+          <w:b/>
+        </w:rPr>
+        <w:t>0394</w:t>
+      </w:r>
+      <w:r>
+        <w:t xml:space="preserve"> = </w:t>
+      </w:r>
+      <w:r>
+        <w:rPr>
+          <w:b/>
+        </w:rPr>
+        <w:t>76-18</w:t>
+      </w:r>
+      <w:r>
+        <w:t xml:space="preserve"> official start. [ED list](https://www.us-census.org/states/kentucky/teams/Madison1930-T626-769.htm). *Image seen / catalog.* </w:t>
+      </w:r>
+      <w:r>
+        <w:rPr>
+          <w:b/>
+        </w:rPr>
+        <w:t>C978 C981 C984–C986</w:t>
+      </w:r>
+      <w:r>
+        <w:t xml:space="preserve"> </w:t>
+      </w:r>
+      <w:r>
+        <w:rPr>
+          <w:b/>
+        </w:rPr>
+        <w:t>S673 S676 S679 S680</w:t>
+      </w:r>
+      <w:r>
+        <w:t>.</w:t>
+      </w:r>
+    </w:p>
+    <w:p>
+      <w:r>
         <w:br w:type="page"/>
       </w:r>
     </w:p>
@@ -18026,6 +20100,111 @@
     <w:p>
       <w:r>
         <w:t>| S619 | `../sources/census/pass90-extract-2026-10-31.txt` | This session | Pass 90 extract | extract |</w:t>
+      </w:r>
+    </w:p>
+    <w:p>
+      <w:r>
+        <w:t>| S621 | `../sources/census/estill-1930-ed3310-0821-redlick-1a-pass91.jpg` | [IA T626-742](https://archive.org/details/kentuckycensus00reel742) | 33-10 Red Lick East sh 1A stamped 117 | image seen |</w:t>
+      </w:r>
+    </w:p>
+    <w:p>
+      <w:r>
+        <w:t>| S623 | `../sources/census/estill-1930-ed337-0819-end-w1200-pass91.jpg` | [IA T626-742](https://archive.org/details/kentuckycensus00reel742) | 33-7 end stamped 094A | image seen |</w:t>
+      </w:r>
+    </w:p>
+    <w:p>
+      <w:r>
+        <w:t>| S624 | `../sources/census/estill-1930-grant-card-0947-pass91.jpg` | [IA T626-742](https://archive.org/details/kentuckycensus00reel742) | Grant card; Estill ends without 33-8 | image seen |</w:t>
+      </w:r>
+    </w:p>
+    <w:p>
+      <w:r>
+        <w:t>| S632 | `../sources/census/bell-1920-ed26-0517-southside-1a-pass91.jpg` | [IA T625-559](https://archive.org/details/14thcensusofpopu559unit) | ED 26 official start | image seen |</w:t>
+      </w:r>
+    </w:p>
+    <w:p>
+      <w:r>
+        <w:t>| S633 | `../sources/census/bell-1920-ed26-0559-end-pass91.jpg` | [IA T625-559](https://archive.org/details/14thcensusofpopu559unit) | ED 26 official end | image seen |</w:t>
+      </w:r>
+    </w:p>
+    <w:p>
+      <w:r>
+        <w:t>| S642 | `../sources/census/bell-1920-ed31-0674-dorothy-end-pass91.jpg` | [IA T625-559](https://archive.org/details/14thcensusofpopu559unit) | ED 31 Dorothy official end | image seen |</w:t>
+      </w:r>
+    </w:p>
+    <w:p>
+      <w:r>
+        <w:t>| S651 | `../sources/census/pass91-extract-2026-10-31.txt` | This session | Pass 91 extract | extract |</w:t>
+      </w:r>
+    </w:p>
+    <w:p>
+      <w:r>
+        <w:t>| S652 | `../sources/census/madison-1920-ed103-0317-berea-1a-pass92.jpg` | [IA T625-590](https://archive.org/details/14thcensusofpopu590unit) | ED 103 Berea Town official start | image seen |</w:t>
+      </w:r>
+    </w:p>
+    <w:p>
+      <w:r>
+        <w:t>| S654 | `../sources/census/madison-1920-ed103-0348-berea-16b-end-pass92.jpg` | [IA T625-590](https://archive.org/details/14thcensusofpopu590unit) | ED 103 town official-looking end | image seen |</w:t>
+      </w:r>
+    </w:p>
+    <w:p>
+      <w:r>
+        <w:t>| S655 | `../sources/census/madison-1920-ed102-0349-college-17a-pass92.jpg` | [IA T625-590](https://archive.org/details/14thcensusofpopu590unit) | Berea College Academy sh 17A | image seen |</w:t>
+      </w:r>
+    </w:p>
+    <w:p>
+      <w:r>
+        <w:t>| S657 | `../sources/census/madison-1920-ed104-0351-gladecreek-1a-pass92.jpg` | [IA T625-590](https://archive.org/details/14thcensusofpopu590unit) | ED 104 Glade Creek start | image seen |</w:t>
+      </w:r>
+    </w:p>
+    <w:p>
+      <w:r>
+        <w:t>| S662 | `../sources/catalog/ia-kentuckycensus00reel769-pass92.json` | [IA T626-769](https://archive.org/details/kentuckycensus00reel769) | 1137 images; Madison 76-1–76-24 | catalog |</w:t>
+      </w:r>
+    </w:p>
+    <w:p>
+      <w:r>
+        <w:t>| S663 | `../sources/census/madison-1930-t626-769-card-pass92.jpg` | [IA T626-769](https://archive.org/details/kentuckycensus00reel769) | Madison 76-1–76-24 on card | image seen |</w:t>
+      </w:r>
+    </w:p>
+    <w:p>
+      <w:r>
+        <w:t>| S664 | `../sources/census/pass92-extract-2026-10-31.txt` | This session | Pass 92 extract | extract |</w:t>
+      </w:r>
+    </w:p>
+    <w:p>
+      <w:r>
+        <w:t>| S668 | `../sources/census/madison-1930-ed7616-0340-berea-1a-pass93.jpg` | [IA T626-769](https://archive.org/details/kentuckycensus00reel769) | ED 76-16 Berea Town official start | image seen |</w:t>
+      </w:r>
+    </w:p>
+    <w:p>
+      <w:r>
+        <w:t>| S671 | `../sources/census/madison-1930-ed7616-0376-college-19a-end-pass93.jpg` | [IA T626-769](https://archive.org/details/kentuckycensus00reel769) | ED 76-16 college last populated | image seen |</w:t>
+      </w:r>
+    </w:p>
+    <w:p>
+      <w:r>
+        <w:t>| S673 | `../sources/census/madison-1930-ed7617-0378-glade-1a-pass93.jpg` | [IA T626-769](https://archive.org/details/kentuckycensus00reel769) | ED 76-17 Glade official start | image seen |</w:t>
+      </w:r>
+    </w:p>
+    <w:p>
+      <w:r>
+        <w:t>| S676 | `../sources/catalog/uscensus-madison-1930-pass93.html` | [us-census.org](https://www.us-census.org/states/kentucky/teams/Madison1930-T626-769.htm) | 76-16 = Berea Town | catalog |</w:t>
+      </w:r>
+    </w:p>
+    <w:p>
+      <w:r>
+        <w:t>| S679 | `../sources/census/madison-1930-ed7617-0392-glade-8a-end-pass93.jpg` | [IA T626-769](https://archive.org/details/kentuckycensus00reel769) | ED 76-17 official-looking end | image seen |</w:t>
+      </w:r>
+    </w:p>
+    <w:p>
+      <w:r>
+        <w:t>| S680 | `../sources/census/madison-1930-ed7618-0394-glade-1a-pass93.jpg` | [IA T626-769](https://archive.org/details/kentuckycensus00reel769) | ED 76-18 official start | image seen |</w:t>
+      </w:r>
+    </w:p>
+    <w:p>
+      <w:r>
+        <w:t>| S682 | `../sources/census/pass93-extract-2026-10-31.txt` | This session | Pass 93 extract | extract |</w:t>
       </w:r>
     </w:p>
     <w:p>

</xml_diff>

<commit_message>
Pass 94: close Madison 1930 Glade 76-18 and 76-19
B055: T626-769 Glade SW 76-18 complete 0394–0429; Glade SE 76-19 complete
0430–0465. Probable entire-ED name-negatives for Frank/David F./Grant Newnam.
0412 given-name Frank rejected. Residual Madison DC / Berea Citizen.
FS SPA R011-44. Antioch 242 and Estill 33-8 still not free. Do not declare complete.

Co-authored-by: blakereaganlaw <blakereaganlaw@gmail.com>
</commit_message>
<xml_diff>
--- a/research/dora-ella-newnam/book/Dora-Ella-Newnam-Stone-A-Life.docx
+++ b/research/dora-ella-newnam/book/Dora-Ella-Newnam-Stone-A-Life.docx
@@ -221,6 +221,11 @@
     </w:p>
     <w:p>
       <w:r>
+        <w:t>39. [Pass 94. Glade Southwest and Glade Southeast](#pass-94-glade-southwest-and-glade-southeast)</w:t>
+      </w:r>
+    </w:p>
+    <w:p>
+      <w:r>
         <w:br w:type="page"/>
       </w:r>
     </w:p>
@@ -7082,6 +7087,442 @@
       </w:r>
     </w:p>
     <w:p>
+      <w:pPr>
+        <w:pStyle w:val="Heading2"/>
+      </w:pPr>
+      <w:r>
+        <w:t>Pass 94. Glade Southwest and Glade Southeast</w:t>
+      </w:r>
+    </w:p>
+    <w:p>
+      <w:r>
+        <w:t>The leftover Glade districts on the same 1930 Madison reel close.</w:t>
+      </w:r>
+    </w:p>
+    <w:p>
+      <w:r>
+        <w:t xml:space="preserve">Leaf </w:t>
+      </w:r>
+      <w:r>
+        <w:rPr>
+          <w:b/>
+        </w:rPr>
+        <w:t>394</w:t>
+      </w:r>
+      <w:r>
+        <w:t xml:space="preserve"> was already the official start of district </w:t>
+      </w:r>
+      <w:r>
+        <w:rPr>
+          <w:b/>
+        </w:rPr>
+        <w:t>76-18</w:t>
+      </w:r>
+      <w:r>
+        <w:t xml:space="preserve"> — Magisterial District 6, Glade, excluding Berea Town, sheet </w:t>
+      </w:r>
+      <w:r>
+        <w:rPr>
+          <w:b/>
+        </w:rPr>
+        <w:t>1A</w:t>
+      </w:r>
+      <w:r>
+        <w:t>, 2 April, W. D. Daniel. Blanton. [C986] [S680]</w:t>
+      </w:r>
+    </w:p>
+    <w:p>
+      <w:r>
+        <w:t xml:space="preserve">The district runs eighteen sheets. Leaf </w:t>
+      </w:r>
+      <w:r>
+        <w:rPr>
+          <w:b/>
+        </w:rPr>
+        <w:t>400</w:t>
+      </w:r>
+      <w:r>
+        <w:t xml:space="preserve"> is sheet </w:t>
+      </w:r>
+      <w:r>
+        <w:rPr>
+          <w:b/>
+        </w:rPr>
+        <w:t>4A</w:t>
+      </w:r>
+      <w:r>
+        <w:t xml:space="preserve">, 7 April. Leaf </w:t>
+      </w:r>
+      <w:r>
+        <w:rPr>
+          <w:b/>
+        </w:rPr>
+        <w:t>412</w:t>
+      </w:r>
+      <w:r>
+        <w:t xml:space="preserve">, 15 April, sheet </w:t>
+      </w:r>
+      <w:r>
+        <w:rPr>
+          <w:b/>
+        </w:rPr>
+        <w:t>10A</w:t>
+      </w:r>
+      <w:r>
+        <w:t xml:space="preserve">, has a given-name </w:t>
+      </w:r>
+      <w:r>
+        <w:rPr>
+          <w:b/>
+        </w:rPr>
+        <w:t>Frank</w:t>
+      </w:r>
+      <w:r>
+        <w:t xml:space="preserve"> in a farm household that is not Newman — rejected against the contractor. Leaf </w:t>
+      </w:r>
+      <w:r>
+        <w:rPr>
+          <w:b/>
+        </w:rPr>
+        <w:t>415</w:t>
+      </w:r>
+      <w:r>
+        <w:t xml:space="preserve"> is sheet </w:t>
+      </w:r>
+      <w:r>
+        <w:rPr>
+          <w:b/>
+        </w:rPr>
+        <w:t>11B</w:t>
+      </w:r>
+      <w:r>
+        <w:t xml:space="preserve">, 17 April, Lakes and Pigg. Leaf </w:t>
+      </w:r>
+      <w:r>
+        <w:rPr>
+          <w:b/>
+        </w:rPr>
+        <w:t>428</w:t>
+      </w:r>
+      <w:r>
+        <w:t xml:space="preserve">, 26 April, is sheet </w:t>
+      </w:r>
+      <w:r>
+        <w:rPr>
+          <w:b/>
+        </w:rPr>
+        <w:t>18A</w:t>
+      </w:r>
+      <w:r>
+        <w:t xml:space="preserve">. Leaf </w:t>
+      </w:r>
+      <w:r>
+        <w:rPr>
+          <w:b/>
+        </w:rPr>
+        <w:t>429</w:t>
+      </w:r>
+      <w:r>
+        <w:t xml:space="preserve"> is sheet </w:t>
+      </w:r>
+      <w:r>
+        <w:rPr>
+          <w:b/>
+        </w:rPr>
+        <w:t>18B</w:t>
+      </w:r>
+      <w:r>
+        <w:t xml:space="preserve">, a short last sheet — the official end. District </w:t>
+      </w:r>
+      <w:r>
+        <w:rPr>
+          <w:b/>
+        </w:rPr>
+        <w:t>76-18</w:t>
+      </w:r>
+      <w:r>
+        <w:t xml:space="preserve"> is complete, leaves </w:t>
+      </w:r>
+      <w:r>
+        <w:rPr>
+          <w:b/>
+        </w:rPr>
+        <w:t>394–429</w:t>
+      </w:r>
+      <w:r>
+        <w:t>. [C988] [C989] [C990] [C992] [C1000] [S683] [S684] [S694]</w:t>
+      </w:r>
+    </w:p>
+    <w:p>
+      <w:r>
+        <w:t xml:space="preserve">A machine pass over those thirty-six name columns found two “coy” tokens. Both are form-line garbage. Combined with the official start and end, district </w:t>
+      </w:r>
+      <w:r>
+        <w:rPr>
+          <w:b/>
+        </w:rPr>
+        <w:t>76-18</w:t>
+      </w:r>
+      <w:r>
+        <w:t xml:space="preserve"> is a </w:t>
+      </w:r>
+      <w:r>
+        <w:rPr>
+          <w:b/>
+        </w:rPr>
+        <w:t>probable</w:t>
+      </w:r>
+      <w:r>
+        <w:t xml:space="preserve"> entire-district name-negative for Frank, David F., and Grant Newnam. [C991] [C993] [S688]</w:t>
+      </w:r>
+    </w:p>
+    <w:p>
+      <w:r>
+        <w:t xml:space="preserve">Leaf </w:t>
+      </w:r>
+      <w:r>
+        <w:rPr>
+          <w:b/>
+        </w:rPr>
+        <w:t>430</w:t>
+      </w:r>
+      <w:r>
+        <w:t xml:space="preserve">, 5 April, W. G. Blanton, is already Glade Southeast, district </w:t>
+      </w:r>
+      <w:r>
+        <w:rPr>
+          <w:b/>
+        </w:rPr>
+        <w:t>76-19</w:t>
+      </w:r>
+      <w:r>
+        <w:t xml:space="preserve">, sheet </w:t>
+      </w:r>
+      <w:r>
+        <w:rPr>
+          <w:b/>
+        </w:rPr>
+        <w:t>1A</w:t>
+      </w:r>
+      <w:r>
+        <w:t xml:space="preserve"> — the official start. Farmers. Leaf </w:t>
+      </w:r>
+      <w:r>
+        <w:rPr>
+          <w:b/>
+        </w:rPr>
+        <w:t>450</w:t>
+      </w:r>
+      <w:r>
+        <w:t xml:space="preserve"> is sheet </w:t>
+      </w:r>
+      <w:r>
+        <w:rPr>
+          <w:b/>
+        </w:rPr>
+        <w:t>11A</w:t>
+      </w:r>
+      <w:r>
+        <w:t xml:space="preserve">, 13 April, Vanmeter. Leaf </w:t>
+      </w:r>
+      <w:r>
+        <w:rPr>
+          <w:b/>
+        </w:rPr>
+        <w:t>460</w:t>
+      </w:r>
+      <w:r>
+        <w:t xml:space="preserve"> is sheet </w:t>
+      </w:r>
+      <w:r>
+        <w:rPr>
+          <w:b/>
+        </w:rPr>
+        <w:t>16A</w:t>
+      </w:r>
+      <w:r>
+        <w:t xml:space="preserve">, 14 April. Leaf </w:t>
+      </w:r>
+      <w:r>
+        <w:rPr>
+          <w:b/>
+        </w:rPr>
+        <w:t>465</w:t>
+      </w:r>
+      <w:r>
+        <w:t xml:space="preserve">, 23 April, is sheet </w:t>
+      </w:r>
+      <w:r>
+        <w:rPr>
+          <w:b/>
+        </w:rPr>
+        <w:t>18B</w:t>
+      </w:r>
+      <w:r>
+        <w:t xml:space="preserve">, a short last sheet — the official end. Leaf </w:t>
+      </w:r>
+      <w:r>
+        <w:rPr>
+          <w:b/>
+        </w:rPr>
+        <w:t>466</w:t>
+      </w:r>
+      <w:r>
+        <w:t xml:space="preserve"> is already Kirksville, Magisterial District 7, district </w:t>
+      </w:r>
+      <w:r>
+        <w:rPr>
+          <w:b/>
+        </w:rPr>
+        <w:t>76-20</w:t>
+      </w:r>
+      <w:r>
+        <w:t xml:space="preserve">, sheet </w:t>
+      </w:r>
+      <w:r>
+        <w:rPr>
+          <w:b/>
+        </w:rPr>
+        <w:t>1A</w:t>
+      </w:r>
+      <w:r>
+        <w:t xml:space="preserve">, 2 April, Miss Martha Henderson. District </w:t>
+      </w:r>
+      <w:r>
+        <w:rPr>
+          <w:b/>
+        </w:rPr>
+        <w:t>76-19</w:t>
+      </w:r>
+      <w:r>
+        <w:t xml:space="preserve"> is complete, leaves </w:t>
+      </w:r>
+      <w:r>
+        <w:rPr>
+          <w:b/>
+        </w:rPr>
+        <w:t>430–465</w:t>
+      </w:r>
+      <w:r>
+        <w:t>. [C994] [C995] [C996] [C997] [C1000] [S685] [S686] [S687]</w:t>
+      </w:r>
+    </w:p>
+    <w:p>
+      <w:r>
+        <w:t xml:space="preserve">A machine pass over those thirty-six name columns found no newman, newnam, frank, david, grant, mccoy, or boyd token. Combined with the official start and end, district </w:t>
+      </w:r>
+      <w:r>
+        <w:rPr>
+          <w:b/>
+        </w:rPr>
+        <w:t>76-19</w:t>
+      </w:r>
+      <w:r>
+        <w:t xml:space="preserve"> is a </w:t>
+      </w:r>
+      <w:r>
+        <w:rPr>
+          <w:b/>
+        </w:rPr>
+        <w:t>probable</w:t>
+      </w:r>
+      <w:r>
+        <w:t xml:space="preserve"> entire-district name-negative for Frank, David F., and Grant Newnam. [C998] [C999] [S689]</w:t>
+      </w:r>
+    </w:p>
+    <w:p>
+      <w:r>
+        <w:t xml:space="preserve">The published list agrees: </w:t>
+      </w:r>
+      <w:r>
+        <w:rPr>
+          <w:b/>
+        </w:rPr>
+        <w:t>76-18</w:t>
+      </w:r>
+      <w:r>
+        <w:t xml:space="preserve"> is Glade Southwest excluding Berea Town; </w:t>
+      </w:r>
+      <w:r>
+        <w:rPr>
+          <w:b/>
+        </w:rPr>
+        <w:t>76-19</w:t>
+      </w:r>
+      <w:r>
+        <w:t xml:space="preserve"> is Glade Southeast; </w:t>
+      </w:r>
+      <w:r>
+        <w:rPr>
+          <w:b/>
+        </w:rPr>
+        <w:t>76-20</w:t>
+      </w:r>
+      <w:r>
+        <w:t xml:space="preserve"> is Kirksville Northeast. [C981] [S690]</w:t>
+      </w:r>
+    </w:p>
+    <w:p>
+      <w:r>
+        <w:t xml:space="preserve">Berea Town and the three Glade districts around it — </w:t>
+      </w:r>
+      <w:r>
+        <w:rPr>
+          <w:b/>
+        </w:rPr>
+        <w:t>76-16</w:t>
+      </w:r>
+      <w:r>
+        <w:t xml:space="preserve"> through </w:t>
+      </w:r>
+      <w:r>
+        <w:rPr>
+          <w:b/>
+        </w:rPr>
+        <w:t>76-19</w:t>
+      </w:r>
+      <w:r>
+        <w:t xml:space="preserve"> — are now walked on this free reel. Residual for Frank of Berea is a Madison death certificate or a *Berea Citizen* notice, not another 1930 Glade sheet. [C1007]</w:t>
+      </w:r>
+    </w:p>
+    <w:p>
+      <w:r>
+        <w:t>FamilySearch 127913, 127869, and 1146342 were empty shells again — roadblock step 44. Internet Archive has no Wolfe Antioch remainder and no Station Camp South supplement. A search for “Dora Stone” 1926 and “Frank Newnam” of Berea returned zero items. The *Citizen* calendar and Duell-Clark host did not open. Do not re-ask the clerk. [C1001] [C1002] [C1003] [C1004] [C1005] [C1006] [S691] [S692] [S693]</w:t>
+      </w:r>
+    </w:p>
+    <w:p>
+      <w:r>
+        <w:t xml:space="preserve">John 38 and Jennie stay </w:t>
+      </w:r>
+      <w:r>
+        <w:rPr>
+          <w:b/>
+        </w:rPr>
+        <w:t>rejected</w:t>
+      </w:r>
+      <w:r>
+        <w:t xml:space="preserve">. Floyd is still </w:t>
+      </w:r>
+      <w:r>
+        <w:rPr>
+          <w:b/>
+        </w:rPr>
+        <w:t>not merged</w:t>
+      </w:r>
+      <w:r>
+        <w:t xml:space="preserve"> with Boyd. The 0412 given-name Frank is </w:t>
+      </w:r>
+      <w:r>
+        <w:rPr>
+          <w:b/>
+        </w:rPr>
+        <w:t>rejected</w:t>
+      </w:r>
+      <w:r>
+        <w:t>. Do not print 1966 or 1976 as proven deaths. Do not print Floyd as Boyd. Do not print 1962 as McCoy’s death. Do not print the 1942 Combs charge as fact. [C1007]</w:t>
+      </w:r>
+    </w:p>
+    <w:p>
       <w:r>
         <w:t xml:space="preserve">In Madison County in 1950 a </w:t>
       </w:r>
@@ -8206,16 +8647,61 @@
         <w:t>C985</w:t>
       </w:r>
       <w:r>
-        <w:t xml:space="preserve">); residual Glade </w:t>
-      </w:r>
-      <w:r>
-        <w:rPr>
-          <w:b/>
-        </w:rPr>
-        <w:t>76-18 / 76-19</w:t>
-      </w:r>
-      <w:r>
-        <w:t xml:space="preserve">; not merged with Grant (#20) or 1928 St. Helens Frank (#22); John of Owsley is </w:t>
+        <w:t xml:space="preserve">); Glade SW </w:t>
+      </w:r>
+      <w:r>
+        <w:rPr>
+          <w:b/>
+        </w:rPr>
+        <w:t>76-18 COMPLETE</w:t>
+      </w:r>
+      <w:r>
+        <w:t xml:space="preserve"> </w:t>
+      </w:r>
+      <w:r>
+        <w:rPr>
+          <w:b/>
+        </w:rPr>
+        <w:t>0394–0429</w:t>
+      </w:r>
+      <w:r>
+        <w:t xml:space="preserve"> (</w:t>
+      </w:r>
+      <w:r>
+        <w:rPr>
+          <w:b/>
+        </w:rPr>
+        <w:t>C990 C993</w:t>
+      </w:r>
+      <w:r>
+        <w:t xml:space="preserve">); Glade SE </w:t>
+      </w:r>
+      <w:r>
+        <w:rPr>
+          <w:b/>
+        </w:rPr>
+        <w:t>76-19 COMPLETE</w:t>
+      </w:r>
+      <w:r>
+        <w:t xml:space="preserve"> </w:t>
+      </w:r>
+      <w:r>
+        <w:rPr>
+          <w:b/>
+        </w:rPr>
+        <w:t>0430–0465</w:t>
+      </w:r>
+      <w:r>
+        <w:t xml:space="preserve"> (</w:t>
+      </w:r>
+      <w:r>
+        <w:rPr>
+          <w:b/>
+        </w:rPr>
+        <w:t>C997 C999</w:t>
+      </w:r>
+      <w:r>
+        <w:t xml:space="preserve">); residual Madison DC / *Citizen*; not merged with Grant (#20) or 1928 St. Helens Frank (#22); John of Owsley is </w:t>
       </w:r>
       <w:r>
         <w:rPr>
@@ -9026,24 +9512,6 @@
         <w:rPr>
           <w:b/>
         </w:rPr>
-        <w:t>B055</w:t>
-      </w:r>
-      <w:r>
-        <w:t xml:space="preserve"> remaining 1930 Madison T626-769 Glade </w:t>
-      </w:r>
-      <w:r>
-        <w:rPr>
-          <w:b/>
-        </w:rPr>
-        <w:t>76-18 / 76-19</w:t>
-      </w:r>
-      <w:r>
-        <w:t xml:space="preserve"> visual name lines (Frank of Berea; 76-16 and 76-17 closed), then </w:t>
-      </w:r>
-      <w:r>
-        <w:rPr>
-          <w:b/>
-        </w:rPr>
         <w:t>B088</w:t>
       </w:r>
       <w:r>
@@ -9188,10 +9656,19 @@
         <w:rPr>
           <w:b/>
         </w:rPr>
-        <w:t>B080</w:t>
-      </w:r>
-      <w:r>
-        <w:t xml:space="preserve"> *Citizen* 1958, </w:t>
+        <w:t>B055/B080</w:t>
+      </w:r>
+      <w:r>
+        <w:t xml:space="preserve"> Madison DC / *Citizen* 1958 (1930 Berea/Glade </w:t>
+      </w:r>
+      <w:r>
+        <w:rPr>
+          <w:b/>
+        </w:rPr>
+        <w:t>76-16–76-19</w:t>
+      </w:r>
+      <w:r>
+        <w:t xml:space="preserve"> closed), </w:t>
       </w:r>
       <w:r>
         <w:rPr>
@@ -19125,6 +19602,255 @@
     </w:p>
     <w:p>
       <w:r>
+        <w:t xml:space="preserve">164. ED </w:t>
+      </w:r>
+      <w:r>
+        <w:rPr>
+          <w:b/>
+        </w:rPr>
+        <w:t>76-18</w:t>
+      </w:r>
+      <w:r>
+        <w:t xml:space="preserve"> Glade SW excl. Berea </w:t>
+      </w:r>
+      <w:r>
+        <w:rPr>
+          <w:b/>
+        </w:rPr>
+        <w:t>COMPLETE</w:t>
+      </w:r>
+      <w:r>
+        <w:t xml:space="preserve"> </w:t>
+      </w:r>
+      <w:r>
+        <w:rPr>
+          <w:b/>
+        </w:rPr>
+        <w:t>0394–0429</w:t>
+      </w:r>
+      <w:r>
+        <w:t xml:space="preserve">. </w:t>
+      </w:r>
+      <w:r>
+        <w:rPr>
+          <w:b/>
+        </w:rPr>
+        <w:t>0429</w:t>
+      </w:r>
+      <w:r>
+        <w:t xml:space="preserve"> sh </w:t>
+      </w:r>
+      <w:r>
+        <w:rPr>
+          <w:b/>
+        </w:rPr>
+        <w:t>18 B</w:t>
+      </w:r>
+      <w:r>
+        <w:t xml:space="preserve"> short official end. Tesseract 36 sheets; 0412 given-name Frank </w:t>
+      </w:r>
+      <w:r>
+        <w:rPr>
+          <w:b/>
+        </w:rPr>
+        <w:t>rejected</w:t>
+      </w:r>
+      <w:r>
+        <w:t xml:space="preserve">. </w:t>
+      </w:r>
+      <w:r>
+        <w:rPr>
+          <w:b/>
+        </w:rPr>
+        <w:t>PROBABLE</w:t>
+      </w:r>
+      <w:r>
+        <w:t xml:space="preserve"> entire-ED name-negative. IA [`kentuckycensus00reel769`](https://archive.org/details/kentuckycensus00reel769). *Image seen / OCR draft.* </w:t>
+      </w:r>
+      <w:r>
+        <w:rPr>
+          <w:b/>
+        </w:rPr>
+        <w:t>C988–C993</w:t>
+      </w:r>
+      <w:r>
+        <w:t xml:space="preserve"> </w:t>
+      </w:r>
+      <w:r>
+        <w:rPr>
+          <w:b/>
+        </w:rPr>
+        <w:t>S683 S684 S688 S694</w:t>
+      </w:r>
+      <w:r>
+        <w:t>.</w:t>
+      </w:r>
+    </w:p>
+    <w:p>
+      <w:r>
+        <w:t xml:space="preserve">165. ED </w:t>
+      </w:r>
+      <w:r>
+        <w:rPr>
+          <w:b/>
+        </w:rPr>
+        <w:t>76-19</w:t>
+      </w:r>
+      <w:r>
+        <w:t xml:space="preserve"> Glade SE </w:t>
+      </w:r>
+      <w:r>
+        <w:rPr>
+          <w:b/>
+        </w:rPr>
+        <w:t>COMPLETE</w:t>
+      </w:r>
+      <w:r>
+        <w:t xml:space="preserve"> </w:t>
+      </w:r>
+      <w:r>
+        <w:rPr>
+          <w:b/>
+        </w:rPr>
+        <w:t>0430–0465</w:t>
+      </w:r>
+      <w:r>
+        <w:t xml:space="preserve">. </w:t>
+      </w:r>
+      <w:r>
+        <w:rPr>
+          <w:b/>
+        </w:rPr>
+        <w:t>0465</w:t>
+      </w:r>
+      <w:r>
+        <w:t xml:space="preserve"> sh </w:t>
+      </w:r>
+      <w:r>
+        <w:rPr>
+          <w:b/>
+        </w:rPr>
+        <w:t>18 B</w:t>
+      </w:r>
+      <w:r>
+        <w:t xml:space="preserve"> short official end. </w:t>
+      </w:r>
+      <w:r>
+        <w:rPr>
+          <w:b/>
+        </w:rPr>
+        <w:t>0466</w:t>
+      </w:r>
+      <w:r>
+        <w:t xml:space="preserve"> = Kirksville </w:t>
+      </w:r>
+      <w:r>
+        <w:rPr>
+          <w:b/>
+        </w:rPr>
+        <w:t>76-20</w:t>
+      </w:r>
+      <w:r>
+        <w:t xml:space="preserve"> sh </w:t>
+      </w:r>
+      <w:r>
+        <w:rPr>
+          <w:b/>
+        </w:rPr>
+        <w:t>1 A</w:t>
+      </w:r>
+      <w:r>
+        <w:t xml:space="preserve">. Tesseract 36 sheets nil. </w:t>
+      </w:r>
+      <w:r>
+        <w:rPr>
+          <w:b/>
+        </w:rPr>
+        <w:t>PROBABLE</w:t>
+      </w:r>
+      <w:r>
+        <w:t xml:space="preserve"> entire-ED name-negative. *Image seen / OCR draft.* </w:t>
+      </w:r>
+      <w:r>
+        <w:rPr>
+          <w:b/>
+        </w:rPr>
+        <w:t>C994–C999</w:t>
+      </w:r>
+      <w:r>
+        <w:t xml:space="preserve"> </w:t>
+      </w:r>
+      <w:r>
+        <w:rPr>
+          <w:b/>
+        </w:rPr>
+        <w:t>S685–S689</w:t>
+      </w:r>
+      <w:r>
+        <w:t>.</w:t>
+      </w:r>
+    </w:p>
+    <w:p>
+      <w:r>
+        <w:t xml:space="preserve">166. [ED list](https://www.us-census.org/states/kentucky/teams/Madison1930-T626-769.htm) </w:t>
+      </w:r>
+      <w:r>
+        <w:rPr>
+          <w:b/>
+        </w:rPr>
+        <w:t>76-18</w:t>
+      </w:r>
+      <w:r>
+        <w:t xml:space="preserve"> SW / </w:t>
+      </w:r>
+      <w:r>
+        <w:rPr>
+          <w:b/>
+        </w:rPr>
+        <w:t>76-19</w:t>
+      </w:r>
+      <w:r>
+        <w:t xml:space="preserve"> SE / </w:t>
+      </w:r>
+      <w:r>
+        <w:rPr>
+          <w:b/>
+        </w:rPr>
+        <w:t>76-20</w:t>
+      </w:r>
+      <w:r>
+        <w:t xml:space="preserve"> Kirksville. FS SPA (R011-44). IA Solr Antioch / Dora Stone 1926 / Frank Berea </w:t>
+      </w:r>
+      <w:r>
+        <w:rPr>
+          <w:b/>
+        </w:rPr>
+        <w:t>0</w:t>
+      </w:r>
+      <w:r>
+        <w:t xml:space="preserve">. *Catalog.* </w:t>
+      </w:r>
+      <w:r>
+        <w:rPr>
+          <w:b/>
+        </w:rPr>
+        <w:t>C1001–C1006</w:t>
+      </w:r>
+      <w:r>
+        <w:t xml:space="preserve"> </w:t>
+      </w:r>
+      <w:r>
+        <w:rPr>
+          <w:b/>
+        </w:rPr>
+        <w:t>S690–S693</w:t>
+      </w:r>
+      <w:r>
+        <w:t>.</w:t>
+      </w:r>
+    </w:p>
+    <w:p>
+      <w:r>
         <w:br w:type="page"/>
       </w:r>
     </w:p>
@@ -20205,6 +20931,51 @@
     <w:p>
       <w:r>
         <w:t>| S682 | `../sources/census/pass93-extract-2026-10-31.txt` | This session | Pass 93 extract | extract |</w:t>
+      </w:r>
+    </w:p>
+    <w:p>
+      <w:r>
+        <w:t>| S683 | `../sources/census/madison-1930-ed7618-0429-18b-end-pass94.jpg` | [IA T626-769](https://archive.org/details/kentuckycensus00reel769) | ED 76-18 official end | image seen |</w:t>
+      </w:r>
+    </w:p>
+    <w:p>
+      <w:r>
+        <w:t>| S685 | `../sources/census/madison-1930-ed7619-0430-1a-pass94.jpg` | [IA T626-769](https://archive.org/details/kentuckycensus00reel769) | ED 76-19 official start | image seen |</w:t>
+      </w:r>
+    </w:p>
+    <w:p>
+      <w:r>
+        <w:t>| S686 | `../sources/census/madison-1930-ed7619-0465-18b-end-pass94.jpg` | [IA T626-769](https://archive.org/details/kentuckycensus00reel769) | ED 76-19 official end | image seen |</w:t>
+      </w:r>
+    </w:p>
+    <w:p>
+      <w:r>
+        <w:t>| S687 | `../sources/census/madison-1930-ed7620-0466-kirksville-1a-pass94.jpg` | [IA T626-769](https://archive.org/details/kentuckycensus00reel769) | ED 76-20 Kirksville next-ED start | image seen |</w:t>
+      </w:r>
+    </w:p>
+    <w:p>
+      <w:r>
+        <w:t>| S688 | `../sources/census/pass94/glade18-ocr.txt` | [IA T626-769](https://archive.org/details/kentuckycensus00reel769) | 36-sheet OCR; 2 false coy tokens | OCR draft |</w:t>
+      </w:r>
+    </w:p>
+    <w:p>
+      <w:r>
+        <w:t>| S689 | `../sources/census/pass94/glade19-ocr.txt` | [IA T626-769](https://archive.org/details/kentuckycensus00reel769) | 36-sheet OCR nil newman/frank/grant | OCR draft |</w:t>
+      </w:r>
+    </w:p>
+    <w:p>
+      <w:r>
+        <w:t>| S690 | `../sources/catalog/uscensus-madison-1930-pass94.html` | [us-census.org](https://www.us-census.org/states/kentucky/teams/Madison1930-T626-769.htm) | 76-18 SW / 76-19 SE | catalog |</w:t>
+      </w:r>
+    </w:p>
+    <w:p>
+      <w:r>
+        <w:t>| S694 | `../sources/census/madison-1930-ed7618-0412-10a-frank-reject-pass94.jpg` | [IA T626-769](https://archive.org/details/kentuckycensus00reel769) | Given-name Frank rejected | image seen |</w:t>
+      </w:r>
+    </w:p>
+    <w:p>
+      <w:r>
+        <w:t>| S699 | `../sources/census/pass94-extract-2026-10-31.txt` | This session | Pass 94 extract | extract |</w:t>
       </w:r>
     </w:p>
     <w:p>

</xml_diff>

<commit_message>
Pass 100: prove 1950 Estill Fred+Era; reject remaining Lee/Madison Newman adults
Cite passes 95–100 in the HTML book (TOC, plates, endnotes 201–217, source appendix through S834). Estill 1950 ED 33-1 household 14 Newnam, Fred 55 + Era R 52 + Dorothy J 19 is the 1940 Irvine couple (PROVEN) and probable Fred L. of 1961. Harding/Vertie and remaining Lee/Madison 1950 Newman adults rejected versus Boyd, John L, and Frank the contractor. Antioch 242 and Estill 33-8 still not on a free scan. Rebuild working Word only.

Co-authored-by: blakereaganlaw <blakereaganlaw@gmail.com>
</commit_message>
<xml_diff>
--- a/research/dora-ella-newnam/book/Dora-Ella-Newnam-Stone-A-Life.docx
+++ b/research/dora-ella-newnam/book/Dora-Ella-Newnam-Stone-A-Life.docx
@@ -226,6 +226,36 @@
     </w:p>
     <w:p>
       <w:r>
+        <w:t>40. [Pass 95. Reel 603 is Louisiana, and 743 is Fayette](#pass-95-reel-603-is-louisiana-and-743-is-fayette)</w:t>
+      </w:r>
+    </w:p>
+    <w:p>
+      <w:r>
+        <w:t>41. [Pass 96. The rest of compiled Wolfe, and the Citizen ends in 1922](#pass-96-the-rest-of-compiled-wolfe-and-the-citizen-ends-in-1922)</w:t>
+      </w:r>
+    </w:p>
+    <w:p>
+      <w:r>
+        <w:t>42. [Pass 97. Luther in Beattyville, Grant in Heidelberg, and the map rolls](#pass-97-luther-in-beattyville-grant-in-heidelberg-and-the-map-rolls)</w:t>
+      </w:r>
+    </w:p>
+    <w:p>
+      <w:r>
+        <w:t>43. [Pass 98. Cora Plummer’s house, and Foxtown is Jackson](#pass-98-cora-plummers-house-and-foxtown-is-jackson)</w:t>
+      </w:r>
+    </w:p>
+    <w:p>
+      <w:r>
+        <w:t>44. [Pass 99. Lee County in 1950, and Martha is not Grant’s widow](#pass-99-lee-county-in-1950-and-martha-is-not-grants-widow)</w:t>
+      </w:r>
+    </w:p>
+    <w:p>
+      <w:r>
+        <w:t>45. [Pass 100. Fred and Era in Irvine, and Madison is empty](#pass-100-fred-and-era-in-irvine-and-madison-is-empty)</w:t>
+      </w:r>
+    </w:p>
+    <w:p>
+      <w:r>
         <w:br w:type="page"/>
       </w:r>
     </w:p>
@@ -7523,6 +7553,1258 @@
       </w:r>
     </w:p>
     <w:p>
+      <w:pPr>
+        <w:pStyle w:val="Heading2"/>
+      </w:pPr>
+      <w:r>
+        <w:t>Pass 95. Reel 603 is Louisiana, and 743 is Fayette</w:t>
+      </w:r>
+    </w:p>
+    <w:p>
+      <w:r>
+        <w:t>The next Internet Archive identifier after Kentucky T625-602 is not the missing Wolfe remainder. `14thcensusofpopu603unit` is the 1920 Louisiana census by parishes — 1,122 images. [C1008] [S701] Reel 602 itself is still 515 images and still ends on Clifty precinct 241, sheet 1. Antioch 242 and the rest of Clifty are not on that free scan. [C1009] [S702]</w:t>
+      </w:r>
+    </w:p>
+    <w:p>
+      <w:r>
+        <w:t xml:space="preserve">Two remaining compiled Wolfe 1920 files are now read. Campton Town and country, Ninth District, enumeration district </w:t>
+      </w:r>
+      <w:r>
+        <w:rPr>
+          <w:b/>
+        </w:rPr>
+        <w:t>236</w:t>
+      </w:r>
+      <w:r>
+        <w:t xml:space="preserve">, households 1–205, enumerator W. H. Drake, January 1920 — no Newman, Newnam, Noonan, Nunan, or McCoy. [C1010] [S703] Campton Precinct 3 — households through about 154 — is the same nil. [C1011] [S704] The LDSGenealogy Wolfe landing lists compiled parts 1 (Ninth District), 2 (Lee City), 3 (Hazel Green), 4 (Campton 3), 5 (Torrent), and 7 (Stillwater). It does not list an Antioch or Clifty compiled file. Ancestry and MyHeritage 1920 pointers there stay paywalled. [C1012] [S705] Published compiled Wolfe 1920, as far as those parts go, is a </w:t>
+      </w:r>
+      <w:r>
+        <w:rPr>
+          <w:b/>
+        </w:rPr>
+        <w:t>probable</w:t>
+      </w:r>
+      <w:r>
+        <w:t xml:space="preserve"> name-negative for John L. and Cora. The originals for Antioch 242 and the rest of Clifty remain unread. [C1030]</w:t>
+      </w:r>
+    </w:p>
+    <w:p>
+      <w:r>
+        <w:t xml:space="preserve">The next 1930 Kentucky reel after Estill’s 742 is not the missing Station Camp South. Reel 743’s title card is Kentucky volumes 25 and 26, </w:t>
+      </w:r>
+      <w:r>
+        <w:rPr>
+          <w:b/>
+        </w:rPr>
+        <w:t>Fayette County</w:t>
+      </w:r>
+      <w:r>
+        <w:t xml:space="preserve"> — districts 34-1 through 34-26 and 34-41–42. [C1014] [S706] The county card says the same. [C1015] [S707] Leaf 4 is already Lexington City, district </w:t>
+      </w:r>
+      <w:r>
+        <w:rPr>
+          <w:b/>
+        </w:rPr>
+        <w:t>34-1</w:t>
+      </w:r>
+      <w:r>
+        <w:t xml:space="preserve">, sheet </w:t>
+      </w:r>
+      <w:r>
+        <w:rPr>
+          <w:b/>
+        </w:rPr>
+        <w:t>1A</w:t>
+      </w:r>
+      <w:r>
+        <w:t xml:space="preserve">, 2 April 1930. [C1016] [S708] Internet Archive’s container list agrees: reel 742 holds Daviess 30-34–50, Edmonson, Estill, and Grant; reel 743 holds Fayette. 987 images. [C1017] [S709] The published Estill 1930 team page still marks Station Camp South </w:t>
+      </w:r>
+      <w:r>
+        <w:rPr>
+          <w:b/>
+        </w:rPr>
+        <w:t>33-8</w:t>
+      </w:r>
+      <w:r>
+        <w:t xml:space="preserve"> as stamped </w:t>
+      </w:r>
+      <w:r>
+        <w:rPr>
+          <w:b/>
+        </w:rPr>
+        <w:t>095A–102B</w:t>
+      </w:r>
+      <w:r>
+        <w:t xml:space="preserve">, unpublished, and Red Lick West </w:t>
+      </w:r>
+      <w:r>
+        <w:rPr>
+          <w:b/>
+        </w:rPr>
+        <w:t>33-9</w:t>
+      </w:r>
+      <w:r>
+        <w:t xml:space="preserve"> as </w:t>
+      </w:r>
+      <w:r>
+        <w:rPr>
+          <w:b/>
+        </w:rPr>
+        <w:t>103A–116A</w:t>
+      </w:r>
+      <w:r>
+        <w:t>, unpublished. [C1018] [S710]</w:t>
+      </w:r>
+    </w:p>
+    <w:p>
+      <w:r>
+        <w:t>FamilySearch 127913, 127869, and 1146342 were empty shells again — about 855 bytes — roadblock step 45. Do not re-ask the clerk. [C1013] [S711]</w:t>
+      </w:r>
+    </w:p>
+    <w:p>
+      <w:r>
+        <w:t>Samuel P. still has no published will. An Internet Archive search for a Lee County Newnam will returned zero items. [C1019] [S712] The USGenNet wills landing is a 404. The index still names Jane Steele Newman, Elizabeth Newnam, and F. Newnam Tincher — not Samuel P. [C1020] [S713]</w:t>
+      </w:r>
+    </w:p>
+    <w:p>
+      <w:r>
+        <w:t xml:space="preserve">The official National Archives M1509 pamphlet now maps the Kentucky draft-card rolls. </w:t>
+      </w:r>
+      <w:r>
+        <w:rPr>
+          <w:b/>
+        </w:rPr>
+        <w:t>KY45</w:t>
+      </w:r>
+      <w:r>
+        <w:t xml:space="preserve"> is Lawrence K–Z, </w:t>
+      </w:r>
+      <w:r>
+        <w:rPr>
+          <w:b/>
+        </w:rPr>
+        <w:t>Lee A–Z</w:t>
+      </w:r>
+      <w:r>
+        <w:t xml:space="preserve">, and Leslie A–Z. </w:t>
+      </w:r>
+      <w:r>
+        <w:rPr>
+          <w:b/>
+        </w:rPr>
+        <w:t>KY74</w:t>
+      </w:r>
+      <w:r>
+        <w:t xml:space="preserve"> is Oldham, Owen, and </w:t>
+      </w:r>
+      <w:r>
+        <w:rPr>
+          <w:b/>
+        </w:rPr>
+        <w:t>Owsley A–Z</w:t>
+      </w:r>
+      <w:r>
+        <w:t xml:space="preserve">. </w:t>
+      </w:r>
+      <w:r>
+        <w:rPr>
+          <w:b/>
+        </w:rPr>
+        <w:t>KY24</w:t>
+      </w:r>
+      <w:r>
+        <w:t xml:space="preserve"> is Edmonson T–Z, Elliott, </w:t>
+      </w:r>
+      <w:r>
+        <w:rPr>
+          <w:b/>
+        </w:rPr>
+        <w:t>Estill A–Z</w:t>
+      </w:r>
+      <w:r>
+        <w:t xml:space="preserve">, and Fayette A–E. </w:t>
+      </w:r>
+      <w:r>
+        <w:rPr>
+          <w:b/>
+        </w:rPr>
+        <w:t>KY64</w:t>
+      </w:r>
+      <w:r>
+        <w:t xml:space="preserve"> is Madison N–Z. </w:t>
+      </w:r>
+      <w:r>
+        <w:rPr>
+          <w:b/>
+        </w:rPr>
+        <w:t>KY90</w:t>
+      </w:r>
+      <w:r>
+        <w:t xml:space="preserve"> is Wolfe C–Z and </w:t>
+      </w:r>
+      <w:r>
+        <w:rPr>
+          <w:b/>
+        </w:rPr>
+        <w:t>Woodford A–Z</w:t>
+      </w:r>
+      <w:r>
+        <w:t>. The cards themselves have not been read. [C1021] [S714] Internet Archive has no M1509 Kentucky item. Genealogy Trails’ Lee N table is still unpublished. [C1022] [S715]</w:t>
+      </w:r>
+    </w:p>
+    <w:p>
+      <w:r>
+        <w:t>A search for Duell-Clark funeral volumes returned six unrelated books — John Donne, a 1690 sermon, a 1668 poem titled *The duell of the stags*. [C1023] [S716] The Woodford obituaries page is a Wix shell with no names. Chronicling America and SortedByName returned Cloudflare challenges. [C1024] [C1025] [S717]</w:t>
+      </w:r>
+    </w:p>
+    <w:p>
+      <w:r>
+        <w:t>Berea College’s finding aid for record group 12/12.12 is the sharper path for Frank of Berea and for David G. Newman of 19 June 1958. *The Citizen* runs through June 1958 on Hutchins Library microfilm and in print. After June 1958 the paper is *The Berea Citizen*. The print run 1899–1983 is incomplete — 1963 is missing. The 19 June 1958 page has not been read. [C1026] [S718]</w:t>
+      </w:r>
+    </w:p>
+    <w:p>
+      <w:r>
+        <w:t xml:space="preserve">John 38 and Jennie stay </w:t>
+      </w:r>
+      <w:r>
+        <w:rPr>
+          <w:b/>
+        </w:rPr>
+        <w:t>rejected</w:t>
+      </w:r>
+      <w:r>
+        <w:t xml:space="preserve">. Floyd is still </w:t>
+      </w:r>
+      <w:r>
+        <w:rPr>
+          <w:b/>
+        </w:rPr>
+        <w:t>not merged</w:t>
+      </w:r>
+      <w:r>
+        <w:t xml:space="preserve"> with Boyd. Do not print 1966 or 1976 as proven deaths. Do not print Floyd as Boyd. Do not print 1962 as McCoy’s death. Do not print the 1942 Combs charge as fact. [C1028]</w:t>
+      </w:r>
+    </w:p>
+    <w:p>
+      <w:pPr>
+        <w:pStyle w:val="Heading2"/>
+      </w:pPr>
+      <w:r>
+        <w:t>Pass 96. The rest of compiled Wolfe, and the Citizen ends in 1922</w:t>
+      </w:r>
+    </w:p>
+    <w:p>
+      <w:r>
+        <w:t xml:space="preserve">Kentucky GenWeb’s Wolfe 1920 landing lists letter files </w:t>
+      </w:r>
+      <w:r>
+        <w:rPr>
+          <w:b/>
+        </w:rPr>
+        <w:t>a, c, d, e, f, g, h, i, k</w:t>
+      </w:r>
+      <w:r>
+        <w:t xml:space="preserve">. Files </w:t>
+      </w:r>
+      <w:r>
+        <w:rPr>
+          <w:b/>
+        </w:rPr>
+        <w:t>b</w:t>
+      </w:r>
+      <w:r>
+        <w:t xml:space="preserve"> and </w:t>
+      </w:r>
+      <w:r>
+        <w:rPr>
+          <w:b/>
+        </w:rPr>
+        <w:t>j</w:t>
+      </w:r>
+      <w:r>
+        <w:t xml:space="preserve"> return 404 — those names were never on the landing. [C1031] [S722]</w:t>
+      </w:r>
+    </w:p>
+    <w:p>
+      <w:r>
+        <w:t xml:space="preserve">Three remaining compiled parts close as name-negatives. Lee City, enumeration district </w:t>
+      </w:r>
+      <w:r>
+        <w:rPr>
+          <w:b/>
+        </w:rPr>
+        <w:t>234</w:t>
+      </w:r>
+      <w:r>
+        <w:t xml:space="preserve"> — no Newman, Newnam, Noonan, or Nunan. Household 79 is John B. McCoy, eighty-four, with Nina, fifty-five — rejected against McCoy Newman. [C1032] [S724] Hazel Green </w:t>
+      </w:r>
+      <w:r>
+        <w:rPr>
+          <w:b/>
+        </w:rPr>
+        <w:t>235</w:t>
+      </w:r>
+      <w:r>
+        <w:t xml:space="preserve"> is the same nil. [C1033] [S725] Torrent </w:t>
+      </w:r>
+      <w:r>
+        <w:rPr>
+          <w:b/>
+        </w:rPr>
+        <w:t>238</w:t>
+      </w:r>
+      <w:r>
+        <w:t xml:space="preserve"> is the same nil. [C1034] [S726] Campton Precinct 3, re-fetched, still has no Newman and prints no district number. It is the only compiled file between districts </w:t>
+      </w:r>
+      <w:r>
+        <w:rPr>
+          <w:b/>
+        </w:rPr>
+        <w:t>236</w:t>
+      </w:r>
+      <w:r>
+        <w:t xml:space="preserve"> and </w:t>
+      </w:r>
+      <w:r>
+        <w:rPr>
+          <w:b/>
+        </w:rPr>
+        <w:t>238</w:t>
+      </w:r>
+      <w:r>
+        <w:t xml:space="preserve"> without a number — </w:t>
+      </w:r>
+      <w:r>
+        <w:rPr>
+          <w:b/>
+        </w:rPr>
+        <w:t>probable</w:t>
+      </w:r>
+      <w:r>
+        <w:t xml:space="preserve"> the missing district </w:t>
+      </w:r>
+      <w:r>
+        <w:rPr>
+          <w:b/>
+        </w:rPr>
+        <w:t>237</w:t>
+      </w:r>
+      <w:r>
+        <w:t xml:space="preserve">. [C1035] [S727] Every *listed* Wolfe 1920 letter file is now retrieved. The published compiled set is a </w:t>
+      </w:r>
+      <w:r>
+        <w:rPr>
+          <w:b/>
+        </w:rPr>
+        <w:t>probable</w:t>
+      </w:r>
+      <w:r>
+        <w:t xml:space="preserve"> county-level name-negative for John L. and Cora. The originals for Antioch 242 and the rest of Clifty remain unread. [C1036]</w:t>
+      </w:r>
+    </w:p>
+    <w:p>
+      <w:r>
+        <w:t xml:space="preserve">Internet Archive’s “Census descriptions… 1830–1950” items are California only. [C1037] [S728] The official National Archives T1224 pamphlet puts 1930 descriptions on rolls </w:t>
+      </w:r>
+      <w:r>
+        <w:rPr>
+          <w:b/>
+        </w:rPr>
+        <w:t>61–90</w:t>
+      </w:r>
+      <w:r>
+        <w:t xml:space="preserve">. Roll </w:t>
+      </w:r>
+      <w:r>
+        <w:rPr>
+          <w:b/>
+        </w:rPr>
+        <w:t>69</w:t>
+      </w:r>
+      <w:r>
+        <w:t xml:space="preserve"> is Kansas and Kentucky. [C1038] [S729] The published Estill team page now names district </w:t>
+      </w:r>
+      <w:r>
+        <w:rPr>
+          <w:b/>
+        </w:rPr>
+        <w:t>33-8</w:t>
+      </w:r>
+      <w:r>
+        <w:t xml:space="preserve"> as Magisterial District 3, Station Camp, South Part — stamps </w:t>
+      </w:r>
+      <w:r>
+        <w:rPr>
+          <w:b/>
+        </w:rPr>
+        <w:t>095A–102B</w:t>
+      </w:r>
+      <w:r>
+        <w:t xml:space="preserve"> still unpublished. [C1039] [S731]</w:t>
+      </w:r>
+    </w:p>
+    <w:p>
+      <w:r>
+        <w:t xml:space="preserve">A 1940 compiled pass on Estill is the other-pass evidence. Irvine has </w:t>
+      </w:r>
+      <w:r>
+        <w:rPr>
+          <w:b/>
+        </w:rPr>
+        <w:t>Fred</w:t>
+      </w:r>
+      <w:r>
+        <w:t xml:space="preserve">, about 1895, and </w:t>
+      </w:r>
+      <w:r>
+        <w:rPr>
+          <w:b/>
+        </w:rPr>
+        <w:t>Era</w:t>
+      </w:r>
+      <w:r>
+        <w:t xml:space="preserve">, about 1898, Newnam — </w:t>
+      </w:r>
+      <w:r>
+        <w:rPr>
+          <w:b/>
+        </w:rPr>
+        <w:t>probable</w:t>
+      </w:r>
+      <w:r>
+        <w:t xml:space="preserve"> Fred L. of Irvine, already identified. [C1041] [C387] [S732] Red Lick has Hendrix, about 1885, with Sarah E. — </w:t>
+      </w:r>
+      <w:r>
+        <w:rPr>
+          <w:b/>
+        </w:rPr>
+        <w:t>not</w:t>
+      </w:r>
+      <w:r>
+        <w:t xml:space="preserve"> Boyd. [C1042] [S733] Forks, Riddleland, Miller Creek, and Ravenna have no Newman. [C1043] Station Camp 1940 is unpublished. [C1044] Internet Archive has no Kentucky T627 item. [C1050]</w:t>
+      </w:r>
+    </w:p>
+    <w:p>
+      <w:r>
+        <w:t>FamilySearch 127913, 127869, and 1146342 were empty shells again — roadblock step 46. Do not re-ask the clerk. [C1040] [S741]</w:t>
+      </w:r>
+    </w:p>
+    <w:p>
+      <w:r>
+        <w:t xml:space="preserve">The Library of Congress item record for *The Citizen* of Berea is sharper than the finding aid on one point. The paper is digitized — 1,228 issues — but the last digitized issue is </w:t>
+      </w:r>
+      <w:r>
+        <w:rPr>
+          <w:b/>
+        </w:rPr>
+        <w:t>28 December 1922</w:t>
+      </w:r>
+      <w:r>
+        <w:t>, not June 1958. The title note still says the paper ran to 26 June 1958. *The Berea Citizen*, LCCN sn85052075, is not digitized at all. Hutchins remains the June 1958 path. [C1048] [C1049] [C1026] [S736] [S737]</w:t>
+      </w:r>
+    </w:p>
+    <w:p>
+      <w:r>
+        <w:t xml:space="preserve">LDSGenealogy’s FamilySearch pointer for Duell-Clark funeral volumes is catalog </w:t>
+      </w:r>
+      <w:r>
+        <w:rPr>
+          <w:b/>
+        </w:rPr>
+        <w:t>1006308</w:t>
+      </w:r>
+      <w:r>
+        <w:t>. Volume II, 1958–1978, is the 1966 window. Images unread. Do not print 1966 as fact. [C1045] [S738]</w:t>
+      </w:r>
+    </w:p>
+    <w:p>
+      <w:r>
+        <w:t>Genealogy Trails’ Estill and Owsley military landings have pensions, 1890 veterans, World War II, Vietnam — and no World War I draft-card page. [C1046] [C1047]</w:t>
+      </w:r>
+    </w:p>
+    <w:p>
+      <w:r>
+        <w:t xml:space="preserve">John 38 and Jennie stay </w:t>
+      </w:r>
+      <w:r>
+        <w:rPr>
+          <w:b/>
+        </w:rPr>
+        <w:t>rejected</w:t>
+      </w:r>
+      <w:r>
+        <w:t xml:space="preserve">. Floyd is still </w:t>
+      </w:r>
+      <w:r>
+        <w:rPr>
+          <w:b/>
+        </w:rPr>
+        <w:t>not merged</w:t>
+      </w:r>
+      <w:r>
+        <w:t xml:space="preserve"> with Boyd. Hendrix is </w:t>
+      </w:r>
+      <w:r>
+        <w:rPr>
+          <w:b/>
+        </w:rPr>
+        <w:t>not</w:t>
+      </w:r>
+      <w:r>
+        <w:t xml:space="preserve"> Boyd. Fred and Era are </w:t>
+      </w:r>
+      <w:r>
+        <w:rPr>
+          <w:b/>
+        </w:rPr>
+        <w:t>probable</w:t>
+      </w:r>
+      <w:r>
+        <w:t xml:space="preserve"> the 1961 Irvine couple. Do not print 1966 or 1976 as proven deaths. Do not print Floyd as Boyd. Do not print 1962 as McCoy’s death. Do not print the 1942 Combs charge as fact. [C1054]</w:t>
+      </w:r>
+    </w:p>
+    <w:p>
+      <w:pPr>
+        <w:pStyle w:val="Heading2"/>
+      </w:pPr>
+      <w:r>
+        <w:t>Pass 97. Luther in Beattyville, Grant in Heidelberg, and the map rolls</w:t>
+      </w:r>
+    </w:p>
+    <w:p>
+      <w:r>
+        <w:t xml:space="preserve">The National Archives’ official 1930 enumeration-district map pamphlet now names the Kentucky rolls. </w:t>
+      </w:r>
+      <w:r>
+        <w:rPr>
+          <w:b/>
+        </w:rPr>
+        <w:t>M1930 roll 22</w:t>
+      </w:r>
+      <w:r>
+        <w:t xml:space="preserve"> is Adair through Henderson — Estill is on that roll. </w:t>
+      </w:r>
+      <w:r>
+        <w:rPr>
+          <w:b/>
+        </w:rPr>
+        <w:t>Roll 23</w:t>
+      </w:r>
+      <w:r>
+        <w:t xml:space="preserve"> is Henry through Woodford — Lee, Madison, Owsley, Wolfe, and Woodford. The maps have not been read. Internet Archive has no free scan of those films. [C1056] [C1057] [S745] [S770]</w:t>
+      </w:r>
+    </w:p>
+    <w:p>
+      <w:r>
+        <w:t xml:space="preserve">Four published Madison 1940 compiled indexes are now read. Richmond, Kirksville, Million, and Union-in-Madison have no Newman or Newnam. Berea and Glade compiled pages are unpublished. Combined, Frank of Berea is </w:t>
+      </w:r>
+      <w:r>
+        <w:rPr>
+          <w:b/>
+        </w:rPr>
+        <w:t>absent</w:t>
+      </w:r>
+      <w:r>
+        <w:t xml:space="preserve"> from the *published* Madison 1940 precinct indexes. [C1058] [C1059] [C1060] [C1061] [C1062] [S747] [S748] [S749] [S750]</w:t>
+      </w:r>
+    </w:p>
+    <w:p>
+      <w:r>
+        <w:t xml:space="preserve">Lee County’s 1940 compiled pages are the household find. Beattyville has </w:t>
+      </w:r>
+      <w:r>
+        <w:rPr>
+          <w:b/>
+        </w:rPr>
+        <w:t>Newman, Luther</w:t>
+      </w:r>
+      <w:r>
+        <w:t xml:space="preserve">, about 1891, and </w:t>
+      </w:r>
+      <w:r>
+        <w:rPr>
+          <w:b/>
+        </w:rPr>
+        <w:t>Cora</w:t>
+      </w:r>
+      <w:r>
+        <w:t xml:space="preserve">, about 1894, with children — younger names withheld. That is </w:t>
+      </w:r>
+      <w:r>
+        <w:rPr>
+          <w:b/>
+        </w:rPr>
+        <w:t>probable</w:t>
+      </w:r>
+      <w:r>
+        <w:t xml:space="preserve"> Rev. Luther Newnam and Cora Plummer, still living five years before his 1945 death. It is </w:t>
+      </w:r>
+      <w:r>
+        <w:rPr>
+          <w:b/>
+        </w:rPr>
+        <w:t>not</w:t>
+      </w:r>
+      <w:r>
+        <w:t xml:space="preserve"> John L. and Cora Brandenburg, who were in Owsley that April. It is </w:t>
+      </w:r>
+      <w:r>
+        <w:rPr>
+          <w:b/>
+        </w:rPr>
+        <w:t>not</w:t>
+      </w:r>
+      <w:r>
+        <w:t xml:space="preserve"> the contractor of Berea. [C1063] [C305] [S752]</w:t>
+      </w:r>
+    </w:p>
+    <w:p>
+      <w:r>
+        <w:t xml:space="preserve">Heidelberg has </w:t>
+      </w:r>
+      <w:r>
+        <w:rPr>
+          <w:b/>
+        </w:rPr>
+        <w:t>Newman, Grand</w:t>
+      </w:r>
+      <w:r>
+        <w:t xml:space="preserve">, about 1878, and </w:t>
+      </w:r>
+      <w:r>
+        <w:rPr>
+          <w:b/>
+        </w:rPr>
+        <w:t>Martha</w:t>
+      </w:r>
+      <w:r>
+        <w:t xml:space="preserve">, about 1882 or 1884. Ages and place make that </w:t>
+      </w:r>
+      <w:r>
+        <w:rPr>
+          <w:b/>
+        </w:rPr>
+        <w:t>probable</w:t>
+      </w:r>
+      <w:r>
+        <w:t xml:space="preserve"> Grant of Lee — the 1899/1920/1970 man — still at Heidelberg. </w:t>
+      </w:r>
+      <w:r>
+        <w:rPr>
+          <w:b/>
+        </w:rPr>
+        <w:t>Kate</w:t>
+      </w:r>
+      <w:r>
+        <w:t xml:space="preserve">, about 1871, is </w:t>
+      </w:r>
+      <w:r>
+        <w:rPr>
+          <w:b/>
+        </w:rPr>
+        <w:t>probable</w:t>
+      </w:r>
+      <w:r>
+        <w:t xml:space="preserve"> Katherine Sternberg Newnam, who died the next year. </w:t>
+      </w:r>
+      <w:r>
+        <w:rPr>
+          <w:b/>
+        </w:rPr>
+        <w:t>Johnnie</w:t>
+      </w:r>
+      <w:r>
+        <w:t>, about 1896, is too young for John L. There is no Boyd, no Allie, no Frank contractor about 1889, no McCoy. Younger names withheld. [C1064] [C378] [C384] [S753]</w:t>
+      </w:r>
+    </w:p>
+    <w:p>
+      <w:r>
+        <w:t>Saint Helens has only Mary J. Newman, about 1856 — rejected on age. New Virginia has no Newman. Combined, the published Lee 1940 precincts do not place Boyd and Allie, Frank of Berea, John L. and Cora as a couple, or McCoy. [C1065] [C1066] [C1067] [C1079] [S754] [S755]</w:t>
+      </w:r>
+    </w:p>
+    <w:p>
+      <w:r>
+        <w:t xml:space="preserve">The 1950 Fayette name index is twenty-two Newman hits and three Newnam hits. Violet L., Rolland, Marshall, James W., Eugene, Edward, Henry, Mary A. — </w:t>
+      </w:r>
+      <w:r>
+        <w:rPr>
+          <w:b/>
+        </w:rPr>
+        <w:t>no Boyd, no Allie</w:t>
+      </w:r>
+      <w:r>
+        <w:t xml:space="preserve">. They are </w:t>
+      </w:r>
+      <w:r>
+        <w:rPr>
+          <w:b/>
+        </w:rPr>
+        <w:t>absent</w:t>
+      </w:r>
+      <w:r>
+        <w:t xml:space="preserve"> Fayette in 1950 as Newman or Newnam. Do not print 1976 as a proven death. [C1068] [S756]</w:t>
+      </w:r>
+    </w:p>
+    <w:p>
+      <w:r>
+        <w:t xml:space="preserve">The Library of Congress item record for *The Yell County Journal* of Ola, 1925–1934, LCCN sn90050035, is </w:t>
+      </w:r>
+      <w:r>
+        <w:rPr>
+          <w:b/>
+        </w:rPr>
+        <w:t>not digitized</w:t>
+      </w:r>
+      <w:r>
+        <w:t>. Holdings sit at the Arkansas Historical Commission on microfilm. Internet Archive has none of those 1925–1927 issues. The *Dardanelle Post-Dispatch* remains not digitized. [C1069] [C1070] [S757] [S758]</w:t>
+      </w:r>
+    </w:p>
+    <w:p>
+      <w:r>
+        <w:t>Woodford County Historical Society’s books page is now a live list, not an empty shell. *Duell-Clark Funeral Chapel, 1958–1978* is ten dollars. SNAC adds the Kentucky Historical Society microform for 1957–1969 at the Martin F. Schmidt Research Library. Images unread. Do not print 1966 as fact. [C1071] [C1072] [S759] [S760]</w:t>
+      </w:r>
+    </w:p>
+    <w:p>
+      <w:r>
+        <w:t>A WorldCat pointer for Combs, Parsons &amp; Collins Funeral Home obituaries in Richmond is the new Madison retrieval path for Frank and for David G. of 1958. Unread. [C1073] [S761] Kentucky GenWeb’s Madison obituaries landing has no Newman decedent. Genealogy Trails’ Madison list is nineteenth-century names only. [C1074] [C1075] [S762]</w:t>
+      </w:r>
+    </w:p>
+    <w:p>
+      <w:r>
+        <w:t>FamilySearch 127913 and 1006308 were empty shells again — roadblock step 47. The county wikis returned 403. Do not re-ask the clerk. [C1076] [C1077] [S763] [S764]</w:t>
+      </w:r>
+    </w:p>
+    <w:p>
+      <w:r>
+        <w:t xml:space="preserve">John 38 and Jennie stay </w:t>
+      </w:r>
+      <w:r>
+        <w:rPr>
+          <w:b/>
+        </w:rPr>
+        <w:t>rejected</w:t>
+      </w:r>
+      <w:r>
+        <w:t xml:space="preserve">. Floyd is still </w:t>
+      </w:r>
+      <w:r>
+        <w:rPr>
+          <w:b/>
+        </w:rPr>
+        <w:t>not merged</w:t>
+      </w:r>
+      <w:r>
+        <w:t xml:space="preserve"> with Boyd. Hendrix is </w:t>
+      </w:r>
+      <w:r>
+        <w:rPr>
+          <w:b/>
+        </w:rPr>
+        <w:t>not</w:t>
+      </w:r>
+      <w:r>
+        <w:t xml:space="preserve"> Boyd. Grand of Heidelberg is </w:t>
+      </w:r>
+      <w:r>
+        <w:rPr>
+          <w:b/>
+        </w:rPr>
+        <w:t>probable</w:t>
+      </w:r>
+      <w:r>
+        <w:t xml:space="preserve"> Grant. Luther and Cora of Beattyville are </w:t>
+      </w:r>
+      <w:r>
+        <w:rPr>
+          <w:b/>
+        </w:rPr>
+        <w:t>probable</w:t>
+      </w:r>
+      <w:r>
+        <w:t xml:space="preserve"> the 1945 minister. Do not print 1966 or 1976 as proven deaths. Do not print Floyd as Boyd. Do not print 1962 as McCoy’s death. Do not print the 1942 Combs charge as fact. [C1078]</w:t>
+      </w:r>
+    </w:p>
+    <w:p>
+      <w:pPr>
+        <w:pStyle w:val="Heading2"/>
+      </w:pPr>
+      <w:r>
+        <w:t>Pass 98. Cora Plummer’s house, and Foxtown is Jackson</w:t>
+      </w:r>
+    </w:p>
+    <w:p>
+      <w:r>
+        <w:t>Internet Archive’s Kentucky T625-602 scan is still 515 images. A search for another identifier — `14thcensusofpopu*602*`, or a title with Fourteenth or 14th plus Wolfe, Antioch, or Clifty — returned rolls already walked. Antioch 242 and the rest of Clifty are still not on a free scan. [C1081] [S771]</w:t>
+      </w:r>
+    </w:p>
+    <w:p>
+      <w:r>
+        <w:t>A 1940 compiled pass on the remaining free precincts is the other-pass evidence. Stillwater in Wolfe has only Mae Newman, about 1905 — not John, Cora, Boyd, Allie, or McCoy. [C1082] [S772] Wolfe County in 1950 has zero Newman and zero Newnam. [C1083] [S773]</w:t>
+      </w:r>
+    </w:p>
+    <w:p>
+      <w:r>
+        <w:t xml:space="preserve">Woodford’s free 1940 compiled pages are Midway and Market House. Midway has no Newman. [C1084] [S774] Market House has Hubert Newman, about 1878, and Orie, about 1888. That is </w:t>
+      </w:r>
+      <w:r>
+        <w:rPr>
+          <w:b/>
+        </w:rPr>
+        <w:t>not</w:t>
+      </w:r>
+      <w:r>
+        <w:t xml:space="preserve"> John L. and Cora. John L. was in Owsley that April, proven. [C1085] [S775] Versailles is unpublished. [C1093]</w:t>
+      </w:r>
+    </w:p>
+    <w:p>
+      <w:r>
+        <w:t xml:space="preserve">A page titled Foxtown is </w:t>
+      </w:r>
+      <w:r>
+        <w:rPr>
+          <w:b/>
+        </w:rPr>
+        <w:t>Jackson County</w:t>
+      </w:r>
+      <w:r>
+        <w:t xml:space="preserve">, not Madison. It has Newman, Shelby, about 1893, and Grace, about 1898 — </w:t>
+      </w:r>
+      <w:r>
+        <w:rPr>
+          <w:b/>
+        </w:rPr>
+        <w:t>probable</w:t>
+      </w:r>
+      <w:r>
+        <w:t xml:space="preserve"> the 1913 Lee couple and the 1950 Richmond pair. They are </w:t>
+      </w:r>
+      <w:r>
+        <w:rPr>
+          <w:b/>
+        </w:rPr>
+        <w:t>not</w:t>
+      </w:r>
+      <w:r>
+        <w:t xml:space="preserve"> Frank the contractor. An Allie Brandenburg, about 1875, on the same page is </w:t>
+      </w:r>
+      <w:r>
+        <w:rPr>
+          <w:b/>
+        </w:rPr>
+        <w:t>not</w:t>
+      </w:r>
+      <w:r>
+        <w:t xml:space="preserve"> Boyd’s Allie of about 1885. [C1087] [C1088] [S777] Paint Lick is </w:t>
+      </w:r>
+      <w:r>
+        <w:rPr>
+          <w:b/>
+        </w:rPr>
+        <w:t>Garrard</w:t>
+      </w:r>
+      <w:r>
+        <w:t>, not Madison, and has no Newman. [C1086] [S776]</w:t>
+      </w:r>
+    </w:p>
+    <w:p>
+      <w:r>
+        <w:t xml:space="preserve">The 1950 Lee plates are the household find. Beattyville district 65-1, sheet 20, household 198: Newman, Luther D., twenty-eight, Kentucky, head, and Cora P., twenty-eight, wife. One younger child is withheld. That couple is </w:t>
+      </w:r>
+      <w:r>
+        <w:rPr>
+          <w:b/>
+        </w:rPr>
+        <w:t>not</w:t>
+      </w:r>
+      <w:r>
+        <w:t xml:space="preserve"> Rev. Luther, born 1891, dead in 1945. [C1089] [S778] The next sheet, household 196: Newman, Cora P., fifty-six, head, widow, with Charlie Plummer, fifty-five, brother. Name plus Plummer brother plus Beattyville plus widow after 1945 make her </w:t>
+      </w:r>
+      <w:r>
+        <w:rPr>
+          <w:b/>
+        </w:rPr>
+        <w:t>proven</w:t>
+      </w:r>
+      <w:r>
+        <w:t xml:space="preserve"> Cora Plummer Newnam, the minister’s widow. [C1090] [C1108] [S779] [S797]</w:t>
+      </w:r>
+    </w:p>
+    <w:p>
+      <w:r>
+        <w:t xml:space="preserve">FamilySearch 127913, 127869, 1146342, and 1006308 were empty shells again — roadblock step 48. LDSGenealogy’s pointer for Estill newspaper abstracts, 1913–February 1946, is FamilySearch catalog </w:t>
+      </w:r>
+      <w:r>
+        <w:rPr>
+          <w:b/>
+        </w:rPr>
+        <w:t>520482</w:t>
+      </w:r>
+      <w:r>
+        <w:t>. Images unread. Do not re-ask the clerk. [C1094] [C1095] [S783] [S784]</w:t>
+      </w:r>
+    </w:p>
+    <w:p>
+      <w:r>
+        <w:t xml:space="preserve">John 38 and Jennie stay </w:t>
+      </w:r>
+      <w:r>
+        <w:rPr>
+          <w:b/>
+        </w:rPr>
+        <w:t>rejected</w:t>
+      </w:r>
+      <w:r>
+        <w:t xml:space="preserve">. Floyd is still </w:t>
+      </w:r>
+      <w:r>
+        <w:rPr>
+          <w:b/>
+        </w:rPr>
+        <w:t>not merged</w:t>
+      </w:r>
+      <w:r>
+        <w:t xml:space="preserve"> with Boyd. Hubert and Orie are </w:t>
+      </w:r>
+      <w:r>
+        <w:rPr>
+          <w:b/>
+        </w:rPr>
+        <w:t>not</w:t>
+      </w:r>
+      <w:r>
+        <w:t xml:space="preserve"> John L. Luther D., twenty-eight, is </w:t>
+      </w:r>
+      <w:r>
+        <w:rPr>
+          <w:b/>
+        </w:rPr>
+        <w:t>not</w:t>
+      </w:r>
+      <w:r>
+        <w:t xml:space="preserve"> the 1945 minister. Shelby and Grace of Foxtown are </w:t>
+      </w:r>
+      <w:r>
+        <w:rPr>
+          <w:b/>
+        </w:rPr>
+        <w:t>probable</w:t>
+      </w:r>
+      <w:r>
+        <w:t xml:space="preserve"> the 1913 couple. Do not print 1966 or 1976 as proven deaths. Do not print Floyd as Boyd. Do not print 1962 as McCoy’s death. Do not print the 1942 Combs charge as fact. [C1099]</w:t>
+      </w:r>
+    </w:p>
+    <w:p>
+      <w:pPr>
+        <w:pStyle w:val="Heading2"/>
+      </w:pPr>
+      <w:r>
+        <w:t>Pass 99. Lee County in 1950, and Martha is not Grant’s widow</w:t>
+      </w:r>
+    </w:p>
+    <w:p>
+      <w:r>
+        <w:t>The 1950 Lee name index is seven Newman hits and four Newnam hits. None is McCoy. None is Frank the contractor. None is John L. and Cora — they are in Woodford. None is Boyd and Allie. [C1100] [S789] Owsley is three Newman hits: two Bowman OCR false hits and Clarence, thirty-eight, already rejected as John L. Newnam zero. McCoy as a given name, zero. [C1101] [C1109] [S790] [S798] Jackson is one Newman. Powell is zero. McCoy in Lee is zero. [C1102] [S791]</w:t>
+      </w:r>
+    </w:p>
+    <w:p>
+      <w:r>
+        <w:t xml:space="preserve">The plates close the names. Beattyville sheet 10, household 75: Newman, Thomas Ray, twenty-seven, and Ruth, nineteen. </w:t>
+      </w:r>
+      <w:r>
+        <w:rPr>
+          <w:b/>
+        </w:rPr>
+        <w:t>Rejected</w:t>
+      </w:r>
+      <w:r>
+        <w:t xml:space="preserve"> against John H. of 1899, Frank of about 1889, and Rev. Luther. [C1103] [S792] District 65-13, sheet 2, household 7: Newnam, Martha, fifty-one, widow. Grant’s Martha Brandenburg would have been about sixty-eight that April and died 18 February 1951. This widow is </w:t>
+      </w:r>
+      <w:r>
+        <w:rPr>
+          <w:b/>
+        </w:rPr>
+        <w:t>not</w:t>
+      </w:r>
+      <w:r>
+        <w:t xml:space="preserve"> her. [C1104] [S793] The same district, sheet 11, household 77: Newnam, Johnia, fifty-four, and Hazel, fifty. That is </w:t>
+      </w:r>
+      <w:r>
+        <w:rPr>
+          <w:b/>
+        </w:rPr>
+        <w:t>probable</w:t>
+      </w:r>
+      <w:r>
+        <w:t xml:space="preserve"> the 1940 Heidelberg Johnnie of about 1896 — and </w:t>
+      </w:r>
+      <w:r>
+        <w:rPr>
+          <w:b/>
+        </w:rPr>
+        <w:t>not</w:t>
+      </w:r>
+      <w:r>
+        <w:t xml:space="preserve"> John L., seventy, in Woodford. [C1105] [S794] District 65-12, sheet 21: Newnam, Dillard, forty-seven, and Ola; William, twenty, next door. </w:t>
+      </w:r>
+      <w:r>
+        <w:rPr>
+          <w:b/>
+        </w:rPr>
+        <w:t>Rejected</w:t>
+      </w:r>
+      <w:r>
+        <w:t xml:space="preserve"> against John L., Frank, and Boyd. [C1106] [S795] Jackson district 55-6, sheet 24, has only a sample-line Newman, Bonnie, sixteen. Shelby and Grace are in Madison. Frank is not there. [C1107] [S796]</w:t>
+      </w:r>
+    </w:p>
+    <w:p>
+      <w:r>
+        <w:t xml:space="preserve">The remaining free Jackson 1940 compiled pages are McKee, Cavanaugh, Horse Lick, Pondcreek, and Sturgeen — no Newman. Clover Bottom has Clinton H., about 1910, and Gladys, about 1906 — </w:t>
+      </w:r>
+      <w:r>
+        <w:rPr>
+          <w:b/>
+        </w:rPr>
+        <w:t>not</w:t>
+      </w:r>
+      <w:r>
+        <w:t xml:space="preserve"> Frank and </w:t>
+      </w:r>
+      <w:r>
+        <w:rPr>
+          <w:b/>
+        </w:rPr>
+        <w:t>not</w:t>
+      </w:r>
+      <w:r>
+        <w:t xml:space="preserve"> Shelby and Grace. [C1110] [S799] A page titled Alcorn is </w:t>
+      </w:r>
+      <w:r>
+        <w:rPr>
+          <w:b/>
+        </w:rPr>
+        <w:t>Greenup</w:t>
+      </w:r>
+      <w:r>
+        <w:t xml:space="preserve">. A page titled Lost Creek is </w:t>
+      </w:r>
+      <w:r>
+        <w:rPr>
+          <w:b/>
+        </w:rPr>
+        <w:t>Perry</w:t>
+      </w:r>
+      <w:r>
+        <w:t>. Do not misfile them. [C1111] [S800] Stanton in Powell has no Newman. [C1112] [S801]</w:t>
+      </w:r>
+    </w:p>
+    <w:p>
+      <w:r>
+        <w:t xml:space="preserve">Wolfe’s compiled 1920g Holly, 1920h Stillwater, 1920i Clifty, and 1920k Antioch were fetched again. No Newman, Newnam, Noonan, Nunan, or McCoy. The published compiled set stays a </w:t>
+      </w:r>
+      <w:r>
+        <w:rPr>
+          <w:b/>
+        </w:rPr>
+        <w:t>probable</w:t>
+      </w:r>
+      <w:r>
+        <w:t xml:space="preserve"> county-level name-negative. The originals for Antioch 242 and the rest of Clifty remain unread. [C1113] [S802]</w:t>
+      </w:r>
+    </w:p>
+    <w:p>
+      <w:r>
+        <w:t>FamilySearch 127913, 127869, 1146342, 520482, and 1006308 returned 403 — roadblock step 49. Genealogy Trails’ Estill and Owsley military pages still have no World War I draft table. Do not re-ask the clerk. [C1115] [C1116] [S804] [S805]</w:t>
+      </w:r>
+    </w:p>
+    <w:p>
+      <w:r>
+        <w:t xml:space="preserve">John 38 and Jennie stay </w:t>
+      </w:r>
+      <w:r>
+        <w:rPr>
+          <w:b/>
+        </w:rPr>
+        <w:t>rejected</w:t>
+      </w:r>
+      <w:r>
+        <w:t xml:space="preserve">. Floyd is still </w:t>
+      </w:r>
+      <w:r>
+        <w:rPr>
+          <w:b/>
+        </w:rPr>
+        <w:t>not merged</w:t>
+      </w:r>
+      <w:r>
+        <w:t xml:space="preserve"> with Boyd. Cora P., fifty-six, with Charlie Plummer beside her, is </w:t>
+      </w:r>
+      <w:r>
+        <w:rPr>
+          <w:b/>
+        </w:rPr>
+        <w:t>proven</w:t>
+      </w:r>
+      <w:r>
+        <w:t xml:space="preserve"> the minister’s widow. Martha, fifty-one, is </w:t>
+      </w:r>
+      <w:r>
+        <w:rPr>
+          <w:b/>
+        </w:rPr>
+        <w:t>not</w:t>
+      </w:r>
+      <w:r>
+        <w:t xml:space="preserve"> Grant’s widow. Johnia, fifty-four, is </w:t>
+      </w:r>
+      <w:r>
+        <w:rPr>
+          <w:b/>
+        </w:rPr>
+        <w:t>not</w:t>
+      </w:r>
+      <w:r>
+        <w:t xml:space="preserve"> John L. Do not print 1966 or 1976 as proven deaths. Do not print Floyd as Boyd. Do not print 1962 as McCoy’s death. Do not print the 1942 Combs charge as fact. [C1118]</w:t>
+      </w:r>
+    </w:p>
+    <w:p>
+      <w:pPr>
+        <w:pStyle w:val="Heading2"/>
+      </w:pPr>
+      <w:r>
+        <w:t>Pass 100. Fred and Era in Irvine, and Madison is empty</w:t>
+      </w:r>
+    </w:p>
+    <w:p>
+      <w:r>
+        <w:t>Internet Archive’s Kentucky T625-602 scan is still 515 images. A search for another identifier — `*602*`, or a title with Fourteenth or 14th plus Wolfe, Antioch, or Clifty — returned only that reel and Pennsylvania Mercer 1602. Antioch 242 and the rest of Clifty are still not on a free scan. The compiled Wolfe landing still lists 1920k as Antioch 242. The us-census.org Wolfe 1920 directory is a 404. [C1119] [C1120] [S808] [S809]</w:t>
+      </w:r>
+    </w:p>
+    <w:p>
+      <w:r>
+        <w:t xml:space="preserve">The other-pass evidence is visual, not a header. Estill district 33-1, Irvine, National Archives 1950 image 0003, form sheet 2, 1 April 1950, household 14: Newnam, Fred, fifty-five, married, Kentucky, head; Era R, fifty-two, married, Kentucky, wife; Dorothy J, nineteen, never married, Kentucky, daughter. Ages imply about 1895, 1898, and 1931. That is the same 1940 Irvine compiled couple. It is </w:t>
+      </w:r>
+      <w:r>
+        <w:rPr>
+          <w:b/>
+        </w:rPr>
+        <w:t>proven</w:t>
+      </w:r>
+      <w:r>
+        <w:t xml:space="preserve">. Against Fred L. Newman, who died 14 June 1961 in Estill at sixty-six, the pair of names plus Irvine plus the age step make the identification </w:t>
+      </w:r>
+      <w:r>
+        <w:rPr>
+          <w:b/>
+        </w:rPr>
+        <w:t>probable</w:t>
+      </w:r>
+      <w:r>
+        <w:t>. He is not Boyd. He is not Frank. [C1122] [C1123] [C1041] [C387] [S811]</w:t>
+      </w:r>
+    </w:p>
+    <w:p>
+      <w:r>
+        <w:t>Two other Estill 1950 households fail the same-person test against Boyd and Allie. District 33-13, sheet 21, household 155: Newnam, Harding, sixty-five, and Sarah, sixty-four, with son John B, thirty-three. Harding would have been born about 1885; Boyd would have been about seventy-five. Sarah is not Allie. Next door, Melvina, twenty-eight, separated, is not Allie, Cora, or Frank. District 33-6, sheet 8, household 76: Vertie, forty-one, with James B, twenty, born Ohio — rejected. [C1124] [C1125] [C1126] [S812] [S813]</w:t>
+      </w:r>
+    </w:p>
+    <w:p>
+      <w:r>
+        <w:t>The remaining Lee 1950 Newman hits close as rejects. An API “Nerman” on district 65-2 sheet 10 is a fourteen-year-old grandson in a Spence house — an OCR false hit. District 65-12 has Elen, sixty-six, a female head; Charles, thirty-four, with Wayne, twenty-five; Been, forty-six, with Etta, forty-nine; Grenvy, thirty-six; and another Charles, twenty-four, with Betty L, eighteen. None is John L, seventy, in Woodford, or Frank, about sixty-one, or Boyd, about seventy-five. [C1127] [C1128] [C1129] [C1130] [C1131] [S814] [S815] [S816] [S817] [S818]</w:t>
+      </w:r>
+    </w:p>
+    <w:p>
+      <w:r>
+        <w:t xml:space="preserve">Madison’s remaining adult Newman males are the same story for Frank the contractor. William, forty-eight, with Addie, forty-two; Zelma, a forty-eight-year-old divorced lodger; Hiram D, thirty-six; W M, a twenty-year-old lodger; Lee, a nineteen-year-old helper; Vivian, a ten-year-old granddaughter. Combined with Dewey, twenty-six, already rejected, and Shelly and Grace of Richmond, already identified, no remaining name-index adult male is Frank of about sixty-one. That is a </w:t>
+      </w:r>
+      <w:r>
+        <w:rPr>
+          <w:b/>
+        </w:rPr>
+        <w:t>probable</w:t>
+      </w:r>
+      <w:r>
+        <w:t xml:space="preserve"> Madison 1950 name-index negative for the contractor. [C1132] [C1133] [C1134] [C1135] [C1136] [C1137] [C1138] [S819] [S820] [S821] [S822] [S823] [S824]</w:t>
+      </w:r>
+    </w:p>
+    <w:p>
+      <w:r>
+        <w:t>Station Camp South is still missing. The published Estill 1930 index still has only Fred and Earca, and Herbert and Edith, in Irvine. District 33-8, stamped 095A–102B, is still unpublished. District 33-5, Irvine South, 060A–065A, is also unpublished — a new catalog detail, not a substitute for 33-8. The official National Archives M1930 pamphlet still maps Estill to roll 22 and Lee, Madison, Owsley, Wolfe, and Woodford to roll 23. Internet Archive has no free scan. [C1139] [C1140] [C1141] [S825] [S826] [S827]</w:t>
+      </w:r>
+    </w:p>
+    <w:p>
+      <w:r>
+        <w:t>FamilySearch 127913, 127869, 1146342, 520482, and 1006308 returned 403 — roadblock step 50. Genealogy Trails still has no World War I draft table for Estill or Owsley. Woodford County Historical Society still lists Duell-Clark, 1958–1978, at ten dollars. Do not re-ask the clerk. Do not print 1966 as fact. [C1121] [C1143] [C1144] [S810] [S829] [S830]</w:t>
+      </w:r>
+    </w:p>
+    <w:p>
+      <w:r>
+        <w:t xml:space="preserve">John 38 and Jennie stay </w:t>
+      </w:r>
+      <w:r>
+        <w:rPr>
+          <w:b/>
+        </w:rPr>
+        <w:t>rejected</w:t>
+      </w:r>
+      <w:r>
+        <w:t xml:space="preserve">. Floyd is still </w:t>
+      </w:r>
+      <w:r>
+        <w:rPr>
+          <w:b/>
+        </w:rPr>
+        <w:t>not merged</w:t>
+      </w:r>
+      <w:r>
+        <w:t xml:space="preserve"> with Boyd. Fred and Era are </w:t>
+      </w:r>
+      <w:r>
+        <w:rPr>
+          <w:b/>
+        </w:rPr>
+        <w:t>proven</w:t>
+      </w:r>
+      <w:r>
+        <w:t xml:space="preserve"> the 1940 Irvine couple and </w:t>
+      </w:r>
+      <w:r>
+        <w:rPr>
+          <w:b/>
+        </w:rPr>
+        <w:t>probable</w:t>
+      </w:r>
+      <w:r>
+        <w:t xml:space="preserve"> the 1961 Irvine man. Harding and Vertie are </w:t>
+      </w:r>
+      <w:r>
+        <w:rPr>
+          <w:b/>
+        </w:rPr>
+        <w:t>not</w:t>
+      </w:r>
+      <w:r>
+        <w:t xml:space="preserve"> Boyd and Allie. The remaining Lee and Madison Newman adults are </w:t>
+      </w:r>
+      <w:r>
+        <w:rPr>
+          <w:b/>
+        </w:rPr>
+        <w:t>not</w:t>
+      </w:r>
+      <w:r>
+        <w:t xml:space="preserve"> Frank. Cora P., fifty-six, with Charlie Plummer beside her, is still </w:t>
+      </w:r>
+      <w:r>
+        <w:rPr>
+          <w:b/>
+        </w:rPr>
+        <w:t>proven</w:t>
+      </w:r>
+      <w:r>
+        <w:t xml:space="preserve"> the minister’s widow. Do not print 1966 or 1976 as proven deaths. Do not print Floyd as Boyd. Do not print 1962 as McCoy’s death. Do not print the 1942 Combs charge as fact. [C1148]</w:t>
+      </w:r>
+    </w:p>
+    <w:p>
       <w:r>
         <w:t xml:space="preserve">In Madison County in 1950 a </w:t>
       </w:r>
@@ -8098,7 +9380,34 @@
         <w:t>John Newnam</w:t>
       </w:r>
       <w:r>
-        <w:t>, age twenty-five in 1917, son of John and Serilda — rejected. [C239] Genealogy Trails’ Lee County WWI draft transcript (1,126 cards) lists no Newnam, Newman, or McCoy registrant; other men born in 1899 appear on the September 1918 Beattyville board, but not John under that surname. [C240] [C241] [S248] A cross-border free transcript pass (Owsley, Estill, Arkansas Perry/Yell, Knox KYGenWeb, Missouri Digital Heritage WWI biographies) also returned no Newnam/Newman draft row. [C242] [S249] NARA M1509 / FamilySearch card images have not been read in this case.</w:t>
+        <w:t xml:space="preserve">, age twenty-five in 1917, son of John and Serilda — rejected. [C239] Genealogy Trails’ Lee County WWI draft transcript (1,126 cards) lists no Newnam, Newman, or McCoy registrant; other men born in 1899 appear on the September 1918 Beattyville board, but not John under that surname. [C240] [C241] [S248] A cross-border free transcript pass (Owsley, Estill, Arkansas Perry/Yell, Knox KYGenWeb, Missouri Digital Heritage WWI biographies) also returned no Newnam/Newman draft row. [C242] [S249] The official National Archives M1509 pamphlet now maps Lee to </w:t>
+      </w:r>
+      <w:r>
+        <w:rPr>
+          <w:b/>
+        </w:rPr>
+        <w:t>KY45</w:t>
+      </w:r>
+      <w:r>
+        <w:t xml:space="preserve">, Owsley to </w:t>
+      </w:r>
+      <w:r>
+        <w:rPr>
+          <w:b/>
+        </w:rPr>
+        <w:t>KY74</w:t>
+      </w:r>
+      <w:r>
+        <w:t xml:space="preserve">, and Estill to </w:t>
+      </w:r>
+      <w:r>
+        <w:rPr>
+          <w:b/>
+        </w:rPr>
+        <w:t>KY24</w:t>
+      </w:r>
+      <w:r>
+        <w:t>. The cards themselves have not been read. [C1021]</w:t>
       </w:r>
     </w:p>
     <w:p>
@@ -8399,16 +9708,52 @@
         <w:t>B047 / B069:</w:t>
       </w:r>
       <w:r>
-        <w:t xml:space="preserve"> M1509 </w:t>
-      </w:r>
-      <w:r>
-        <w:rPr>
-          <w:b/>
-        </w:rPr>
-        <w:t>KY45/24/74</w:t>
-      </w:r>
-      <w:r>
-        <w:t xml:space="preserve"> and FS </w:t>
+        <w:t xml:space="preserve"> Official M1509 pamphlet locks </w:t>
+      </w:r>
+      <w:r>
+        <w:rPr>
+          <w:b/>
+        </w:rPr>
+        <w:t>KY45</w:t>
+      </w:r>
+      <w:r>
+        <w:t xml:space="preserve"> Lee / </w:t>
+      </w:r>
+      <w:r>
+        <w:rPr>
+          <w:b/>
+        </w:rPr>
+        <w:t>KY74</w:t>
+      </w:r>
+      <w:r>
+        <w:t xml:space="preserve"> Owsley / </w:t>
+      </w:r>
+      <w:r>
+        <w:rPr>
+          <w:b/>
+        </w:rPr>
+        <w:t>KY24</w:t>
+      </w:r>
+      <w:r>
+        <w:t xml:space="preserve"> Estill / </w:t>
+      </w:r>
+      <w:r>
+        <w:rPr>
+          <w:b/>
+        </w:rPr>
+        <w:t>KY64</w:t>
+      </w:r>
+      <w:r>
+        <w:t xml:space="preserve"> Madison N–Z / </w:t>
+      </w:r>
+      <w:r>
+        <w:rPr>
+          <w:b/>
+        </w:rPr>
+        <w:t>KY90</w:t>
+      </w:r>
+      <w:r>
+        <w:t xml:space="preserve"> Wolfe+Woodford. [C1021] Cards and FS </w:t>
       </w:r>
       <w:r>
         <w:rPr>
@@ -8417,16 +9762,7 @@
         <w:t>1146342</w:t>
       </w:r>
       <w:r>
-        <w:t xml:space="preserve"> Lee WWI cards unread. Estill WWI page empty; GT Estill/Owsley </w:t>
-      </w:r>
-      <w:r>
-        <w:rPr>
-          <w:b/>
-        </w:rPr>
-        <w:t>404</w:t>
-      </w:r>
-      <w:r>
-        <w:t>. [C367]</w:t>
+        <w:t xml:space="preserve"> unread. GT Lee N table unpublished. [C1022]</w:t>
       </w:r>
     </w:p>
     <w:p>
@@ -9524,7 +10860,25 @@
         <w:t>242</w:t>
       </w:r>
       <w:r>
-        <w:t xml:space="preserve"> + remaining Clifty after sheet 1 (still not on a free IA item), </w:t>
+        <w:t xml:space="preserve"> + remaining Clifty after sheet 1 (NARA/FS/Ancestry T625-602 remainder — still not on a free IA item; compiled Wolfe letter files including </w:t>
+      </w:r>
+      <w:r>
+        <w:rPr>
+          <w:b/>
+        </w:rPr>
+        <w:t>1920g/h/i/k</w:t>
+      </w:r>
+      <w:r>
+        <w:t xml:space="preserve"> remain a </w:t>
+      </w:r>
+      <w:r>
+        <w:rPr>
+          <w:b/>
+        </w:rPr>
+        <w:t>probable</w:t>
+      </w:r>
+      <w:r>
+        <w:t xml:space="preserve"> county-level name-negative), </w:t>
       </w:r>
       <w:r>
         <w:rPr>
@@ -9542,7 +10896,52 @@
         <w:t>33-8</w:t>
       </w:r>
       <w:r>
-        <w:t xml:space="preserve"> on FS/Ancestry/NARA film (absent this IA scan), </w:t>
+        <w:t xml:space="preserve"> on FS/Ancestry/NARA film (absent IA 742; </w:t>
+      </w:r>
+      <w:r>
+        <w:rPr>
+          <w:b/>
+        </w:rPr>
+        <w:t>743</w:t>
+      </w:r>
+      <w:r>
+        <w:t xml:space="preserve"> is Fayette; stamped </w:t>
+      </w:r>
+      <w:r>
+        <w:rPr>
+          <w:b/>
+        </w:rPr>
+        <w:t>095A–102B</w:t>
+      </w:r>
+      <w:r>
+        <w:t xml:space="preserve"> unpublished; </w:t>
+      </w:r>
+      <w:r>
+        <w:rPr>
+          <w:b/>
+        </w:rPr>
+        <w:t>33-5</w:t>
+      </w:r>
+      <w:r>
+        <w:t xml:space="preserve"> also unpublished) + M1930 roll </w:t>
+      </w:r>
+      <w:r>
+        <w:rPr>
+          <w:b/>
+        </w:rPr>
+        <w:t>22</w:t>
+      </w:r>
+      <w:r>
+        <w:t xml:space="preserve"> map + FS </w:t>
+      </w:r>
+      <w:r>
+        <w:rPr>
+          <w:b/>
+        </w:rPr>
+        <w:t>520482</w:t>
+      </w:r>
+      <w:r>
+        <w:t xml:space="preserve">, </w:t>
       </w:r>
       <w:r>
         <w:rPr>
@@ -9605,22 +11004,40 @@
         <w:t>B069/B047</w:t>
       </w:r>
       <w:r>
+        <w:t xml:space="preserve"> M1509 </w:t>
+      </w:r>
+      <w:r>
+        <w:rPr>
+          <w:b/>
+        </w:rPr>
+        <w:t>KY45</w:t>
+      </w:r>
+      <w:r>
+        <w:t xml:space="preserve"> cards, </w:t>
+      </w:r>
+      <w:r>
+        <w:rPr>
+          <w:b/>
+        </w:rPr>
+        <w:t>B082</w:t>
+      </w:r>
+      <w:r>
+        <w:t xml:space="preserve"> Duell-Clark volumes / KHS 1957–1969 / cert </w:t>
+      </w:r>
+      <w:r>
+        <w:rPr>
+          <w:b/>
+        </w:rPr>
+        <w:t>17762</w:t>
+      </w:r>
+      <w:r>
         <w:t xml:space="preserve">, </w:t>
       </w:r>
       <w:r>
         <w:rPr>
           <w:b/>
         </w:rPr>
-        <w:t>B082</w:t>
-      </w:r>
-      <w:r>
-        <w:t xml:space="preserve"> Duell-Clark / cert </w:t>
-      </w:r>
-      <w:r>
-        <w:rPr>
-          <w:b/>
-        </w:rPr>
-        <w:t>17762</w:t>
+        <w:t>B083</w:t>
       </w:r>
       <w:r>
         <w:t xml:space="preserve">, </w:t>
@@ -9629,7 +11046,79 @@
         <w:rPr>
           <w:b/>
         </w:rPr>
-        <w:t>B083</w:t>
+        <w:t>B085</w:t>
+      </w:r>
+      <w:r>
+        <w:t xml:space="preserve"> McCoy after 1930 (1950 Owsley/Lee/Estill/Wolfe McCoy API </w:t>
+      </w:r>
+      <w:r>
+        <w:rPr>
+          <w:b/>
+        </w:rPr>
+        <w:t>0</w:t>
+      </w:r>
+      <w:r>
+        <w:t xml:space="preserve">; 447-20-2466 not merged; Barney McCoy AR rejected), </w:t>
+      </w:r>
+      <w:r>
+        <w:rPr>
+          <w:b/>
+        </w:rPr>
+        <w:t>B016</w:t>
+      </w:r>
+      <w:r>
+        <w:t xml:space="preserve"> Rissie 15 servant 1910 (not merged), </w:t>
+      </w:r>
+      <w:r>
+        <w:rPr>
+          <w:b/>
+        </w:rPr>
+        <w:t>B055/B080</w:t>
+      </w:r>
+      <w:r>
+        <w:t xml:space="preserve"> Madison DC / Hutchins *Citizen* June 1958 / unpublished Berea 1940 / Combs funeral (1930 Berea/Glade </w:t>
+      </w:r>
+      <w:r>
+        <w:rPr>
+          <w:b/>
+        </w:rPr>
+        <w:t>76-16–76-19</w:t>
+      </w:r>
+      <w:r>
+        <w:t xml:space="preserve"> closed; 1940 published Madison precincts </w:t>
+      </w:r>
+      <w:r>
+        <w:rPr>
+          <w:b/>
+        </w:rPr>
+        <w:t>nil</w:t>
+      </w:r>
+      <w:r>
+        <w:t xml:space="preserve">; remaining Madison 1950 adult Newman males </w:t>
+      </w:r>
+      <w:r>
+        <w:rPr>
+          <w:b/>
+        </w:rPr>
+        <w:t>rejected</w:t>
+      </w:r>
+      <w:r>
+        <w:t xml:space="preserve">; CA *Citizen* ends </w:t>
+      </w:r>
+      <w:r>
+        <w:rPr>
+          <w:b/>
+        </w:rPr>
+        <w:t>28 Dec 1922</w:t>
+      </w:r>
+      <w:r>
+        <w:t xml:space="preserve">), </w:t>
+      </w:r>
+      <w:r>
+        <w:rPr>
+          <w:b/>
+        </w:rPr>
+        <w:t>B079</w:t>
       </w:r>
       <w:r>
         <w:t xml:space="preserve">, </w:t>
@@ -9638,55 +11127,19 @@
         <w:rPr>
           <w:b/>
         </w:rPr>
-        <w:t>B085</w:t>
-      </w:r>
-      <w:r>
-        <w:t xml:space="preserve"> McCoy after 1930 (447-20-2466 not merged; Barney McCoy AR rejected), </w:t>
-      </w:r>
-      <w:r>
-        <w:rPr>
-          <w:b/>
-        </w:rPr>
-        <w:t>B016</w:t>
-      </w:r>
-      <w:r>
-        <w:t xml:space="preserve"> Rissie 15 servant 1910 (not merged), </w:t>
-      </w:r>
-      <w:r>
-        <w:rPr>
-          <w:b/>
-        </w:rPr>
-        <w:t>B055/B080</w:t>
-      </w:r>
-      <w:r>
-        <w:t xml:space="preserve"> Madison DC / *Citizen* 1958 (1930 Berea/Glade </w:t>
-      </w:r>
-      <w:r>
-        <w:rPr>
-          <w:b/>
-        </w:rPr>
-        <w:t>76-16–76-19</w:t>
-      </w:r>
-      <w:r>
-        <w:t xml:space="preserve"> closed), </w:t>
-      </w:r>
-      <w:r>
-        <w:rPr>
-          <w:b/>
-        </w:rPr>
-        <w:t>B079</w:t>
-      </w:r>
-      <w:r>
-        <w:t xml:space="preserve">, </w:t>
-      </w:r>
-      <w:r>
-        <w:rPr>
-          <w:b/>
-        </w:rPr>
         <w:t>B049/B058</w:t>
       </w:r>
       <w:r>
-        <w:t>.</w:t>
+        <w:t xml:space="preserve"> (*Yell County Journal* </w:t>
+      </w:r>
+      <w:r>
+        <w:rPr>
+          <w:b/>
+        </w:rPr>
+        <w:t>sn90050035</w:t>
+      </w:r>
+      <w:r>
+        <w:t xml:space="preserve"> not digitized).</w:t>
       </w:r>
     </w:p>
     <w:p>
@@ -19851,6 +21304,1711 @@
     </w:p>
     <w:p>
       <w:r>
+        <w:t xml:space="preserve">167. IA [`14thcensusofpopu603unit`](https://archive.org/details/14thcensusofpopu603unit) = Louisiana 1920, </w:t>
+      </w:r>
+      <w:r>
+        <w:rPr>
+          <w:b/>
+        </w:rPr>
+        <w:t>1122</w:t>
+      </w:r>
+      <w:r>
+        <w:t xml:space="preserve"> images — not KY Wolfe. [`14thcensusofpopu602unit`](https://archive.org/details/14thcensusofpopu602unit) still </w:t>
+      </w:r>
+      <w:r>
+        <w:rPr>
+          <w:b/>
+        </w:rPr>
+        <w:t>515</w:t>
+      </w:r>
+      <w:r>
+        <w:t xml:space="preserve"> images. *Catalog.* </w:t>
+      </w:r>
+      <w:r>
+        <w:rPr>
+          <w:b/>
+        </w:rPr>
+        <w:t>C1008 C1009</w:t>
+      </w:r>
+      <w:r>
+        <w:t xml:space="preserve"> </w:t>
+      </w:r>
+      <w:r>
+        <w:rPr>
+          <w:b/>
+        </w:rPr>
+        <w:t>S701 S702</w:t>
+      </w:r>
+      <w:r>
+        <w:t>.</w:t>
+      </w:r>
+    </w:p>
+    <w:p>
+      <w:r>
+        <w:t xml:space="preserve">168. Compiled Wolfe 1920a Campton ED </w:t>
+      </w:r>
+      <w:r>
+        <w:rPr>
+          <w:b/>
+        </w:rPr>
+        <w:t>236</w:t>
+      </w:r>
+      <w:r>
+        <w:t xml:space="preserve"> hh </w:t>
+      </w:r>
+      <w:r>
+        <w:rPr>
+          <w:b/>
+        </w:rPr>
+        <w:t>1–205</w:t>
+      </w:r>
+      <w:r>
+        <w:t xml:space="preserve"> and 1920e Campton Precinct </w:t>
+      </w:r>
+      <w:r>
+        <w:rPr>
+          <w:b/>
+        </w:rPr>
+        <w:t>3</w:t>
+      </w:r>
+      <w:r>
+        <w:t xml:space="preserve"> hh ~</w:t>
+      </w:r>
+      <w:r>
+        <w:rPr>
+          <w:b/>
+        </w:rPr>
+        <w:t>1–154</w:t>
+      </w:r>
+      <w:r>
+        <w:t xml:space="preserve"> (Carole Bays). [LDS Wolfe census](https://ldsgenealogy.com/KY/Wolfe-County-Census-Records.htm). *Transcription only.* </w:t>
+      </w:r>
+      <w:r>
+        <w:rPr>
+          <w:b/>
+        </w:rPr>
+        <w:t>C1010 C1011 C1012 C1030</w:t>
+      </w:r>
+      <w:r>
+        <w:t xml:space="preserve"> </w:t>
+      </w:r>
+      <w:r>
+        <w:rPr>
+          <w:b/>
+        </w:rPr>
+        <w:t>S703–S705</w:t>
+      </w:r>
+      <w:r>
+        <w:t>.</w:t>
+      </w:r>
+    </w:p>
+    <w:p>
+      <w:r>
+        <w:t xml:space="preserve">169. IA [`kentuckycensus00reel743`](https://archive.org/details/kentuckycensus00reel743) title + Fayette card + Lexington ED </w:t>
+      </w:r>
+      <w:r>
+        <w:rPr>
+          <w:b/>
+        </w:rPr>
+        <w:t>34-1</w:t>
+      </w:r>
+      <w:r>
+        <w:t xml:space="preserve"> sh </w:t>
+      </w:r>
+      <w:r>
+        <w:rPr>
+          <w:b/>
+        </w:rPr>
+        <w:t>1 A</w:t>
+      </w:r>
+      <w:r>
+        <w:t xml:space="preserve">, 2 Apr 1930. Reel </w:t>
+      </w:r>
+      <w:r>
+        <w:rPr>
+          <w:b/>
+        </w:rPr>
+        <w:t>743</w:t>
+      </w:r>
+      <w:r>
+        <w:t xml:space="preserve"> is Fayette, not Estill </w:t>
+      </w:r>
+      <w:r>
+        <w:rPr>
+          <w:b/>
+        </w:rPr>
+        <w:t>33-8</w:t>
+      </w:r>
+      <w:r>
+        <w:t xml:space="preserve">. *Image seen.* </w:t>
+      </w:r>
+      <w:r>
+        <w:rPr>
+          <w:b/>
+        </w:rPr>
+        <w:t>C1014–C1017</w:t>
+      </w:r>
+      <w:r>
+        <w:t xml:space="preserve"> </w:t>
+      </w:r>
+      <w:r>
+        <w:rPr>
+          <w:b/>
+        </w:rPr>
+        <w:t>S706–S709</w:t>
+      </w:r>
+      <w:r>
+        <w:t>.</w:t>
+      </w:r>
+    </w:p>
+    <w:p>
+      <w:r>
+        <w:t xml:space="preserve">170. [Estill 1930 `_partial.txt`](https://www.us-census.org/pub/usgenweb/census/ky/estill/1930/_partial.txt): </w:t>
+      </w:r>
+      <w:r>
+        <w:rPr>
+          <w:b/>
+        </w:rPr>
+        <w:t>33-8</w:t>
+      </w:r>
+      <w:r>
+        <w:t xml:space="preserve"> Station Camp South stamped </w:t>
+      </w:r>
+      <w:r>
+        <w:rPr>
+          <w:b/>
+        </w:rPr>
+        <w:t>095A–102B</w:t>
+      </w:r>
+      <w:r>
+        <w:t xml:space="preserve"> unpublished. *Catalog.* </w:t>
+      </w:r>
+      <w:r>
+        <w:rPr>
+          <w:b/>
+        </w:rPr>
+        <w:t>C1018</w:t>
+      </w:r>
+      <w:r>
+        <w:t xml:space="preserve"> </w:t>
+      </w:r>
+      <w:r>
+        <w:rPr>
+          <w:b/>
+        </w:rPr>
+        <w:t>S710</w:t>
+      </w:r>
+      <w:r>
+        <w:t>.</w:t>
+      </w:r>
+    </w:p>
+    <w:p>
+      <w:r>
+        <w:t xml:space="preserve">171. Official NARA [M1509 pamphlet](https://www.archives.gov/research/military/ww1/draft-registration): </w:t>
+      </w:r>
+      <w:r>
+        <w:rPr>
+          <w:b/>
+        </w:rPr>
+        <w:t>KY45</w:t>
+      </w:r>
+      <w:r>
+        <w:t xml:space="preserve"> Lee A–Z; </w:t>
+      </w:r>
+      <w:r>
+        <w:rPr>
+          <w:b/>
+        </w:rPr>
+        <w:t>KY74</w:t>
+      </w:r>
+      <w:r>
+        <w:t xml:space="preserve"> Owsley A–Z; </w:t>
+      </w:r>
+      <w:r>
+        <w:rPr>
+          <w:b/>
+        </w:rPr>
+        <w:t>KY24</w:t>
+      </w:r>
+      <w:r>
+        <w:t xml:space="preserve"> Estill A–Z; </w:t>
+      </w:r>
+      <w:r>
+        <w:rPr>
+          <w:b/>
+        </w:rPr>
+        <w:t>KY64</w:t>
+      </w:r>
+      <w:r>
+        <w:t xml:space="preserve"> Madison N–Z; </w:t>
+      </w:r>
+      <w:r>
+        <w:rPr>
+          <w:b/>
+        </w:rPr>
+        <w:t>KY90</w:t>
+      </w:r>
+      <w:r>
+        <w:t xml:space="preserve"> Wolfe C–Z + Woodford A–Z. Cards unread. *Pamphlet.* </w:t>
+      </w:r>
+      <w:r>
+        <w:rPr>
+          <w:b/>
+        </w:rPr>
+        <w:t>C1021</w:t>
+      </w:r>
+      <w:r>
+        <w:t xml:space="preserve"> </w:t>
+      </w:r>
+      <w:r>
+        <w:rPr>
+          <w:b/>
+        </w:rPr>
+        <w:t>S714</w:t>
+      </w:r>
+      <w:r>
+        <w:t>.</w:t>
+      </w:r>
+    </w:p>
+    <w:p>
+      <w:r>
+        <w:t xml:space="preserve">172. [Berea archives RG 12/12.12](https://bereaarchives.libraryhost.com/repositories/2/resources/128): *The Citizen* through June 1958 on Hutchins microfilm; renamed *Berea Citizen* after June 1958. FS SPA (R011-45). *Finding aid / catalog.* </w:t>
+      </w:r>
+      <w:r>
+        <w:rPr>
+          <w:b/>
+        </w:rPr>
+        <w:t>C1013 C1026</w:t>
+      </w:r>
+      <w:r>
+        <w:t xml:space="preserve"> </w:t>
+      </w:r>
+      <w:r>
+        <w:rPr>
+          <w:b/>
+        </w:rPr>
+        <w:t>S711 S718</w:t>
+      </w:r>
+      <w:r>
+        <w:t>.</w:t>
+      </w:r>
+    </w:p>
+    <w:p>
+      <w:r>
+        <w:t xml:space="preserve">173. Compiled Wolfe [1920c Lee City ED 234](https://kygenweb.net/wolfe/txt/1920c.txt), [1920d Hazel Green 235](https://kygenweb.net/wolfe/txt/1920d.txt), [1920f Torrent 238](https://kygenweb.net/wolfe/txt/1920f.txt) </w:t>
+      </w:r>
+      <w:r>
+        <w:rPr>
+          <w:b/>
+        </w:rPr>
+        <w:t>nil</w:t>
+      </w:r>
+      <w:r>
+        <w:t xml:space="preserve"> Newman. 1920e Campton 3 </w:t>
+      </w:r>
+      <w:r>
+        <w:rPr>
+          <w:b/>
+        </w:rPr>
+        <w:t>PROBABLE</w:t>
+      </w:r>
+      <w:r>
+        <w:t xml:space="preserve"> ED </w:t>
+      </w:r>
+      <w:r>
+        <w:rPr>
+          <w:b/>
+        </w:rPr>
+        <w:t>237</w:t>
+      </w:r>
+      <w:r>
+        <w:t xml:space="preserve">. Landing has no </w:t>
+      </w:r>
+      <w:r>
+        <w:rPr>
+          <w:b/>
+        </w:rPr>
+        <w:t>1920b/j</w:t>
+      </w:r>
+      <w:r>
+        <w:t xml:space="preserve">. *Transcription only.* </w:t>
+      </w:r>
+      <w:r>
+        <w:rPr>
+          <w:b/>
+        </w:rPr>
+        <w:t>C1031–C1036</w:t>
+      </w:r>
+      <w:r>
+        <w:t xml:space="preserve"> </w:t>
+      </w:r>
+      <w:r>
+        <w:rPr>
+          <w:b/>
+        </w:rPr>
+        <w:t>S722–S727</w:t>
+      </w:r>
+      <w:r>
+        <w:t>.</w:t>
+      </w:r>
+    </w:p>
+    <w:p>
+      <w:r>
+        <w:t xml:space="preserve">174. Official NARA [T1224 pamphlet](https://www.archives.gov/files/research/microfilm/t1224.pdf): 1930 descriptions rolls </w:t>
+      </w:r>
+      <w:r>
+        <w:rPr>
+          <w:b/>
+        </w:rPr>
+        <w:t>61–90</w:t>
+      </w:r>
+      <w:r>
+        <w:t xml:space="preserve">; roll </w:t>
+      </w:r>
+      <w:r>
+        <w:rPr>
+          <w:b/>
+        </w:rPr>
+        <w:t>69</w:t>
+      </w:r>
+      <w:r>
+        <w:t xml:space="preserve"> = Kansas + Kentucky. [Estill 1930 team](https://www.us-census.org/states/kentucky/teams/Estill1930-T626-742.htm): </w:t>
+      </w:r>
+      <w:r>
+        <w:rPr>
+          <w:b/>
+        </w:rPr>
+        <w:t>33-8</w:t>
+      </w:r>
+      <w:r>
+        <w:t xml:space="preserve"> = Dist. 3 Station Camp South Part. *Pamphlet / catalog.* </w:t>
+      </w:r>
+      <w:r>
+        <w:rPr>
+          <w:b/>
+        </w:rPr>
+        <w:t>C1037–C1039</w:t>
+      </w:r>
+      <w:r>
+        <w:t xml:space="preserve"> </w:t>
+      </w:r>
+      <w:r>
+        <w:rPr>
+          <w:b/>
+        </w:rPr>
+        <w:t>S728–S731</w:t>
+      </w:r>
+      <w:r>
+        <w:t>.</w:t>
+      </w:r>
+    </w:p>
+    <w:p>
+      <w:r>
+        <w:t xml:space="preserve">175. LDS 1940 [Irvine](https://ldsgenealogy.com/KY/1940-Census-Irvine-KY.htm) Fred ~1895 + Era ~1898 </w:t>
+      </w:r>
+      <w:r>
+        <w:rPr>
+          <w:b/>
+        </w:rPr>
+        <w:t>PROBABLE</w:t>
+      </w:r>
+      <w:r>
+        <w:t xml:space="preserve"> C387. [Red Lick](https://ldsgenealogy.com/KY/1940-Census-Red-Lick-KY.htm) Hendrix ~1885 </w:t>
+      </w:r>
+      <w:r>
+        <w:rPr>
+          <w:b/>
+        </w:rPr>
+        <w:t>rejected</w:t>
+      </w:r>
+      <w:r>
+        <w:t xml:space="preserve"> vs Boyd. Four precincts nil. Station Camp unpublished. *Index only.* </w:t>
+      </w:r>
+      <w:r>
+        <w:rPr>
+          <w:b/>
+        </w:rPr>
+        <w:t>C1041–C1044</w:t>
+      </w:r>
+      <w:r>
+        <w:t xml:space="preserve"> </w:t>
+      </w:r>
+      <w:r>
+        <w:rPr>
+          <w:b/>
+        </w:rPr>
+        <w:t>S732–S735</w:t>
+      </w:r>
+      <w:r>
+        <w:t>.</w:t>
+      </w:r>
+    </w:p>
+    <w:p>
+      <w:r>
+        <w:t xml:space="preserve">176. LOC [*Citizen* sn85052076](https://www.loc.gov/item/sn85052076/): last digitized issue </w:t>
+      </w:r>
+      <w:r>
+        <w:rPr>
+          <w:b/>
+        </w:rPr>
+        <w:t>28 Dec 1922</w:t>
+      </w:r>
+      <w:r>
+        <w:t xml:space="preserve">. [*Berea Citizen* sn85052075](https://www.loc.gov/item/sn85052075/) not digitized. LDS FHL2 Duell-Clark → FS </w:t>
+      </w:r>
+      <w:r>
+        <w:rPr>
+          <w:b/>
+        </w:rPr>
+        <w:t>1006308</w:t>
+      </w:r>
+      <w:r>
+        <w:t xml:space="preserve">. FS SPA (R011-46). *Catalog.* </w:t>
+      </w:r>
+      <w:r>
+        <w:rPr>
+          <w:b/>
+        </w:rPr>
+        <w:t>C1040 C1045 C1048 C1049</w:t>
+      </w:r>
+      <w:r>
+        <w:t xml:space="preserve"> </w:t>
+      </w:r>
+      <w:r>
+        <w:rPr>
+          <w:b/>
+        </w:rPr>
+        <w:t>S736–S738 S741</w:t>
+      </w:r>
+      <w:r>
+        <w:t>.</w:t>
+      </w:r>
+    </w:p>
+    <w:p>
+      <w:r>
+        <w:t xml:space="preserve">177. Official NARA [M1930 ED maps](https://www.archives.gov/research/census/1930/enumeration-districts-maps.html): roll </w:t>
+      </w:r>
+      <w:r>
+        <w:rPr>
+          <w:b/>
+        </w:rPr>
+        <w:t>22</w:t>
+      </w:r>
+      <w:r>
+        <w:t xml:space="preserve"> = KY Adair–Henderson (</w:t>
+      </w:r>
+      <w:r>
+        <w:rPr>
+          <w:b/>
+        </w:rPr>
+        <w:t>Estill</w:t>
+      </w:r>
+      <w:r>
+        <w:t xml:space="preserve">); roll </w:t>
+      </w:r>
+      <w:r>
+        <w:rPr>
+          <w:b/>
+        </w:rPr>
+        <w:t>23</w:t>
+      </w:r>
+      <w:r>
+        <w:t xml:space="preserve"> = KY Henry–Woodford (</w:t>
+      </w:r>
+      <w:r>
+        <w:rPr>
+          <w:b/>
+        </w:rPr>
+        <w:t>Lee, Madison, Owsley, Wolfe, Woodford</w:t>
+      </w:r>
+      <w:r>
+        <w:t xml:space="preserve">). Maps unread. *Pamphlet.* </w:t>
+      </w:r>
+      <w:r>
+        <w:rPr>
+          <w:b/>
+        </w:rPr>
+        <w:t>C1056</w:t>
+      </w:r>
+      <w:r>
+        <w:t xml:space="preserve"> </w:t>
+      </w:r>
+      <w:r>
+        <w:rPr>
+          <w:b/>
+        </w:rPr>
+        <w:t>S745 S770</w:t>
+      </w:r>
+      <w:r>
+        <w:t>.</w:t>
+      </w:r>
+    </w:p>
+    <w:p>
+      <w:r>
+        <w:t xml:space="preserve">178. LDS 1940 [Richmond](https://ldsgenealogy.com/KY/1940-Census-Richmond-KY.htm) / [Kirksville](https://ldsgenealogy.com/KY/1940-Census-Kirksville-KY.htm) / [Million](https://ldsgenealogy.com/KY/1940-Census-Million-KY.htm) / [Union](https://ldsgenealogy.com/KY/1940-Census-Union-in-Madison-County-KY.htm) </w:t>
+      </w:r>
+      <w:r>
+        <w:rPr>
+          <w:b/>
+        </w:rPr>
+        <w:t>nil</w:t>
+      </w:r>
+      <w:r>
+        <w:t xml:space="preserve"> Newman. Berea/Glade unpublished. *Index only / catalog.* </w:t>
+      </w:r>
+      <w:r>
+        <w:rPr>
+          <w:b/>
+        </w:rPr>
+        <w:t>C1058–C1062</w:t>
+      </w:r>
+      <w:r>
+        <w:t xml:space="preserve"> </w:t>
+      </w:r>
+      <w:r>
+        <w:rPr>
+          <w:b/>
+        </w:rPr>
+        <w:t>S747–S751</w:t>
+      </w:r>
+      <w:r>
+        <w:t>.</w:t>
+      </w:r>
+    </w:p>
+    <w:p>
+      <w:r>
+        <w:t xml:space="preserve">179. LDS 1940 [Beattyville](https://ldsgenealogy.com/KY/1940-Census-Beattyville-KY.htm) Luther ~1891 + Cora ~1894 </w:t>
+      </w:r>
+      <w:r>
+        <w:rPr>
+          <w:b/>
+        </w:rPr>
+        <w:t>PROBABLE</w:t>
+      </w:r>
+      <w:r>
+        <w:t xml:space="preserve"> C305. [Heidelberg](https://ldsgenealogy.com/KY/1940-Census-Heidelberg-KY.htm) Grand ~1878 + Martha </w:t>
+      </w:r>
+      <w:r>
+        <w:rPr>
+          <w:b/>
+        </w:rPr>
+        <w:t>PROBABLE</w:t>
+      </w:r>
+      <w:r>
+        <w:t xml:space="preserve"> Grant C378. Saint Helens Mary J ~1856 </w:t>
+      </w:r>
+      <w:r>
+        <w:rPr>
+          <w:b/>
+        </w:rPr>
+        <w:t>rejected</w:t>
+      </w:r>
+      <w:r>
+        <w:t xml:space="preserve">. New Virginia nil. *Index only.* </w:t>
+      </w:r>
+      <w:r>
+        <w:rPr>
+          <w:b/>
+        </w:rPr>
+        <w:t>C1063–C1067 C1079</w:t>
+      </w:r>
+      <w:r>
+        <w:t xml:space="preserve"> </w:t>
+      </w:r>
+      <w:r>
+        <w:rPr>
+          <w:b/>
+        </w:rPr>
+        <w:t>S752–S755</w:t>
+      </w:r>
+      <w:r>
+        <w:t>.</w:t>
+      </w:r>
+    </w:p>
+    <w:p>
+      <w:r>
+        <w:t xml:space="preserve">180. NARA [1950 Fayette Newman API](https://1950census.archives.gov/): total </w:t>
+      </w:r>
+      <w:r>
+        <w:rPr>
+          <w:b/>
+        </w:rPr>
+        <w:t>22</w:t>
+      </w:r>
+      <w:r>
+        <w:t xml:space="preserve"> / Newnam </w:t>
+      </w:r>
+      <w:r>
+        <w:rPr>
+          <w:b/>
+        </w:rPr>
+        <w:t>3</w:t>
+      </w:r>
+      <w:r>
+        <w:t xml:space="preserve"> — no Boyd/Allie. LOC [*Yell County Journal* sn90050035](https://www.loc.gov/item/sn90050035/) </w:t>
+      </w:r>
+      <w:r>
+        <w:rPr>
+          <w:b/>
+        </w:rPr>
+        <w:t>not</w:t>
+      </w:r>
+      <w:r>
+        <w:t xml:space="preserve"> digitized. WCHS [Duell-Clark 1958–1978](https://www.woodfordcountykyhistoricalsociety.com/booksandpublications) $10. FS SPA (R011-47). *Index / catalog.* </w:t>
+      </w:r>
+      <w:r>
+        <w:rPr>
+          <w:b/>
+        </w:rPr>
+        <w:t>C1068 C1069 C1071 C1076</w:t>
+      </w:r>
+      <w:r>
+        <w:t xml:space="preserve"> </w:t>
+      </w:r>
+      <w:r>
+        <w:rPr>
+          <w:b/>
+        </w:rPr>
+        <w:t>S756 S757 S759 S763</w:t>
+      </w:r>
+      <w:r>
+        <w:t>.</w:t>
+      </w:r>
+    </w:p>
+    <w:p>
+      <w:r>
+        <w:t xml:space="preserve">181. IA [`14thcensusofpopu602unit`](https://archive.org/details/14thcensusofpopu602unit) still </w:t>
+      </w:r>
+      <w:r>
+        <w:rPr>
+          <w:b/>
+        </w:rPr>
+        <w:t>515</w:t>
+      </w:r>
+      <w:r>
+        <w:t xml:space="preserve"> images; Solr no remainder item. LDS 1940 [Stillwater](https://ldsgenealogy.com/KY/1940-Census-Stillwater-KY.htm) Mae ~1905 only. NARA 1950 Wolfe 0/0. *Catalog / index only.* </w:t>
+      </w:r>
+      <w:r>
+        <w:rPr>
+          <w:b/>
+        </w:rPr>
+        <w:t>C1081–C1083</w:t>
+      </w:r>
+      <w:r>
+        <w:t xml:space="preserve"> </w:t>
+      </w:r>
+      <w:r>
+        <w:rPr>
+          <w:b/>
+        </w:rPr>
+        <w:t>S771–S773</w:t>
+      </w:r>
+      <w:r>
+        <w:t>.</w:t>
+      </w:r>
+    </w:p>
+    <w:p>
+      <w:r>
+        <w:t xml:space="preserve">182. LDS 1940 [Midway](https://ldsgenealogy.com/KY/1940-Census-Midway-KY.htm) nil. [Market House](https://ldsgenealogy.com/KY/1940-Census-Market-House-KY.htm) Hubert ~1878 + Orie ~1888 </w:t>
+      </w:r>
+      <w:r>
+        <w:rPr>
+          <w:b/>
+        </w:rPr>
+        <w:t>rejected</w:t>
+      </w:r>
+      <w:r>
+        <w:t xml:space="preserve"> vs John L. [Foxtown](https://ldsgenealogy.com/KY/1940-Census-Foxtown-KY.htm) is </w:t>
+      </w:r>
+      <w:r>
+        <w:rPr>
+          <w:b/>
+        </w:rPr>
+        <w:t>Jackson</w:t>
+      </w:r>
+      <w:r>
+        <w:t xml:space="preserve">: Shelby ~1893 + Grace ~1898 </w:t>
+      </w:r>
+      <w:r>
+        <w:rPr>
+          <w:b/>
+        </w:rPr>
+        <w:t>PROBABLE</w:t>
+      </w:r>
+      <w:r>
+        <w:t xml:space="preserve"> C309. Paint Lick is </w:t>
+      </w:r>
+      <w:r>
+        <w:rPr>
+          <w:b/>
+        </w:rPr>
+        <w:t>Garrard</w:t>
+      </w:r>
+      <w:r>
+        <w:t xml:space="preserve">. *Index only.* </w:t>
+      </w:r>
+      <w:r>
+        <w:rPr>
+          <w:b/>
+        </w:rPr>
+        <w:t>C1084–C1088</w:t>
+      </w:r>
+      <w:r>
+        <w:t xml:space="preserve"> </w:t>
+      </w:r>
+      <w:r>
+        <w:rPr>
+          <w:b/>
+        </w:rPr>
+        <w:t>S774–S777</w:t>
+      </w:r>
+      <w:r>
+        <w:t>.</w:t>
+      </w:r>
+    </w:p>
+    <w:p>
+      <w:r>
+        <w:t xml:space="preserve">183. 1950 Lee ED </w:t>
+      </w:r>
+      <w:r>
+        <w:rPr>
+          <w:b/>
+        </w:rPr>
+        <w:t>65-1</w:t>
+      </w:r>
+      <w:r>
+        <w:t xml:space="preserve"> sh </w:t>
+      </w:r>
+      <w:r>
+        <w:rPr>
+          <w:b/>
+        </w:rPr>
+        <w:t>0020</w:t>
+      </w:r>
+      <w:r>
+        <w:t xml:space="preserve"> hh </w:t>
+      </w:r>
+      <w:r>
+        <w:rPr>
+          <w:b/>
+        </w:rPr>
+        <w:t>198</w:t>
+      </w:r>
+      <w:r>
+        <w:t xml:space="preserve"> Luther D. </w:t>
+      </w:r>
+      <w:r>
+        <w:rPr>
+          <w:b/>
+        </w:rPr>
+        <w:t>28</w:t>
+      </w:r>
+      <w:r>
+        <w:t xml:space="preserve"> + Cora P. </w:t>
+      </w:r>
+      <w:r>
+        <w:rPr>
+          <w:b/>
+        </w:rPr>
+        <w:t>28</w:t>
+      </w:r>
+      <w:r>
+        <w:t xml:space="preserve"> </w:t>
+      </w:r>
+      <w:r>
+        <w:rPr>
+          <w:b/>
+        </w:rPr>
+        <w:t>rejected</w:t>
+      </w:r>
+      <w:r>
+        <w:t xml:space="preserve"> vs C305. sh </w:t>
+      </w:r>
+      <w:r>
+        <w:rPr>
+          <w:b/>
+        </w:rPr>
+        <w:t>0021</w:t>
+      </w:r>
+      <w:r>
+        <w:t xml:space="preserve"> hh </w:t>
+      </w:r>
+      <w:r>
+        <w:rPr>
+          <w:b/>
+        </w:rPr>
+        <w:t>196</w:t>
+      </w:r>
+      <w:r>
+        <w:t xml:space="preserve"> Cora P. </w:t>
+      </w:r>
+      <w:r>
+        <w:rPr>
+          <w:b/>
+        </w:rPr>
+        <w:t>56</w:t>
+      </w:r>
+      <w:r>
+        <w:t xml:space="preserve"> widow + [Charlie Plummer brother </w:t>
+      </w:r>
+      <w:r>
+        <w:rPr>
+          <w:b/>
+        </w:rPr>
+        <w:t>55</w:t>
+      </w:r>
+      <w:r>
+        <w:t xml:space="preserve">](https://1950census.archives.gov/) </w:t>
+      </w:r>
+      <w:r>
+        <w:rPr>
+          <w:b/>
+        </w:rPr>
+        <w:t>PROVEN</w:t>
+      </w:r>
+      <w:r>
+        <w:t xml:space="preserve"> Cora Plummer widow. *Image seen.* </w:t>
+      </w:r>
+      <w:r>
+        <w:rPr>
+          <w:b/>
+        </w:rPr>
+        <w:t>C1089 C1090 C1108</w:t>
+      </w:r>
+      <w:r>
+        <w:t xml:space="preserve"> </w:t>
+      </w:r>
+      <w:r>
+        <w:rPr>
+          <w:b/>
+        </w:rPr>
+        <w:t>S778 S779 S797</w:t>
+      </w:r>
+      <w:r>
+        <w:t>.</w:t>
+      </w:r>
+    </w:p>
+    <w:p>
+      <w:r>
+        <w:t xml:space="preserve">184. FS SPA (R011-48). LDS FHL2 Estill abstracts → FS [520482](https://www.familysearch.org/search/catalog/520482) unread. AHGP/us-census: </w:t>
+      </w:r>
+      <w:r>
+        <w:rPr>
+          <w:b/>
+        </w:rPr>
+        <w:t>33-8</w:t>
+      </w:r>
+      <w:r>
+        <w:t xml:space="preserve"> on T626-742 reel; IA scan still missing. *Catalog.* </w:t>
+      </w:r>
+      <w:r>
+        <w:rPr>
+          <w:b/>
+        </w:rPr>
+        <w:t>C1094–C1096</w:t>
+      </w:r>
+      <w:r>
+        <w:t xml:space="preserve"> </w:t>
+      </w:r>
+      <w:r>
+        <w:rPr>
+          <w:b/>
+        </w:rPr>
+        <w:t>S783–S785</w:t>
+      </w:r>
+      <w:r>
+        <w:t>.</w:t>
+      </w:r>
+    </w:p>
+    <w:p>
+      <w:r>
+        <w:t xml:space="preserve">185. NARA [1950 Lee Newman API](https://1950census.archives.gov/): </w:t>
+      </w:r>
+      <w:r>
+        <w:rPr>
+          <w:b/>
+        </w:rPr>
+        <w:t>7</w:t>
+      </w:r>
+      <w:r>
+        <w:t xml:space="preserve"> / Newnam </w:t>
+      </w:r>
+      <w:r>
+        <w:rPr>
+          <w:b/>
+        </w:rPr>
+        <w:t>4</w:t>
+      </w:r>
+      <w:r>
+        <w:t xml:space="preserve"> — no McCoy/Frank/John L/Boyd. Owsley McCoy </w:t>
+      </w:r>
+      <w:r>
+        <w:rPr>
+          <w:b/>
+        </w:rPr>
+        <w:t>0</w:t>
+      </w:r>
+      <w:r>
+        <w:t xml:space="preserve">; Clarence </w:t>
+      </w:r>
+      <w:r>
+        <w:rPr>
+          <w:b/>
+        </w:rPr>
+        <w:t>38</w:t>
+      </w:r>
+      <w:r>
+        <w:t xml:space="preserve"> reconfirm. Lee </w:t>
+      </w:r>
+      <w:r>
+        <w:rPr>
+          <w:b/>
+        </w:rPr>
+        <w:t>65-1</w:t>
+      </w:r>
+      <w:r>
+        <w:t xml:space="preserve"> sh </w:t>
+      </w:r>
+      <w:r>
+        <w:rPr>
+          <w:b/>
+        </w:rPr>
+        <w:t>0010</w:t>
+      </w:r>
+      <w:r>
+        <w:t xml:space="preserve"> Thomas Ray </w:t>
+      </w:r>
+      <w:r>
+        <w:rPr>
+          <w:b/>
+        </w:rPr>
+        <w:t>27</w:t>
+      </w:r>
+      <w:r>
+        <w:t xml:space="preserve"> </w:t>
+      </w:r>
+      <w:r>
+        <w:rPr>
+          <w:b/>
+        </w:rPr>
+        <w:t>rejected</w:t>
+      </w:r>
+      <w:r>
+        <w:t xml:space="preserve">; </w:t>
+      </w:r>
+      <w:r>
+        <w:rPr>
+          <w:b/>
+        </w:rPr>
+        <w:t>65-13</w:t>
+      </w:r>
+      <w:r>
+        <w:t xml:space="preserve"> Martha </w:t>
+      </w:r>
+      <w:r>
+        <w:rPr>
+          <w:b/>
+        </w:rPr>
+        <w:t>51</w:t>
+      </w:r>
+      <w:r>
+        <w:t xml:space="preserve"> wd </w:t>
+      </w:r>
+      <w:r>
+        <w:rPr>
+          <w:b/>
+        </w:rPr>
+        <w:t>rejected</w:t>
+      </w:r>
+      <w:r>
+        <w:t xml:space="preserve"> vs Grant’s widow; Johnia </w:t>
+      </w:r>
+      <w:r>
+        <w:rPr>
+          <w:b/>
+        </w:rPr>
+        <w:t>54</w:t>
+      </w:r>
+      <w:r>
+        <w:t xml:space="preserve"> </w:t>
+      </w:r>
+      <w:r>
+        <w:rPr>
+          <w:b/>
+        </w:rPr>
+        <w:t>rejected</w:t>
+      </w:r>
+      <w:r>
+        <w:t xml:space="preserve"> vs John L; </w:t>
+      </w:r>
+      <w:r>
+        <w:rPr>
+          <w:b/>
+        </w:rPr>
+        <w:t>65-12</w:t>
+      </w:r>
+      <w:r>
+        <w:t xml:space="preserve"> Dillard </w:t>
+      </w:r>
+      <w:r>
+        <w:rPr>
+          <w:b/>
+        </w:rPr>
+        <w:t>47</w:t>
+      </w:r>
+      <w:r>
+        <w:t xml:space="preserve"> </w:t>
+      </w:r>
+      <w:r>
+        <w:rPr>
+          <w:b/>
+        </w:rPr>
+        <w:t>rejected</w:t>
+      </w:r>
+      <w:r>
+        <w:t xml:space="preserve">; Jackson </w:t>
+      </w:r>
+      <w:r>
+        <w:rPr>
+          <w:b/>
+        </w:rPr>
+        <w:t>55-6</w:t>
+      </w:r>
+      <w:r>
+        <w:t xml:space="preserve"> Bonnie </w:t>
+      </w:r>
+      <w:r>
+        <w:rPr>
+          <w:b/>
+        </w:rPr>
+        <w:t>16</w:t>
+      </w:r>
+      <w:r>
+        <w:t xml:space="preserve"> sample. *Image seen / index.* </w:t>
+      </w:r>
+      <w:r>
+        <w:rPr>
+          <w:b/>
+        </w:rPr>
+        <w:t>C1100–C1107 C1109</w:t>
+      </w:r>
+      <w:r>
+        <w:t xml:space="preserve"> </w:t>
+      </w:r>
+      <w:r>
+        <w:rPr>
+          <w:b/>
+        </w:rPr>
+        <w:t>S789–S796 S798</w:t>
+      </w:r>
+      <w:r>
+        <w:t>.</w:t>
+      </w:r>
+    </w:p>
+    <w:p>
+      <w:r>
+        <w:t xml:space="preserve">186. LDS 1940 Jackson remaining [McKee](https://ldsgenealogy.com/KY/1940-Census-McKee-KY.htm) / Cavanaugh / Horse Lick / Pondcreek / Sturgeen </w:t>
+      </w:r>
+      <w:r>
+        <w:rPr>
+          <w:b/>
+        </w:rPr>
+        <w:t>nil</w:t>
+      </w:r>
+      <w:r>
+        <w:t xml:space="preserve">. [Clover Bottom](https://ldsgenealogy.com/KY/1940-Census-Clover-Bottom-KY.htm) Clinton H ~1910 + Gladys ~1906 </w:t>
+      </w:r>
+      <w:r>
+        <w:rPr>
+          <w:b/>
+        </w:rPr>
+        <w:t>rejected</w:t>
+      </w:r>
+      <w:r>
+        <w:t xml:space="preserve">. Alcorn = Greenup; Lost Creek = Perry. KYGenWeb [1920g/h/i/k](https://kygenweb.net/wolfe/census1.htm) </w:t>
+      </w:r>
+      <w:r>
+        <w:rPr>
+          <w:b/>
+        </w:rPr>
+        <w:t>nil</w:t>
+      </w:r>
+      <w:r>
+        <w:t xml:space="preserve">. FS </w:t>
+      </w:r>
+      <w:r>
+        <w:rPr>
+          <w:b/>
+        </w:rPr>
+        <w:t>403</w:t>
+      </w:r>
+      <w:r>
+        <w:t xml:space="preserve"> (R011-49). *Index / transcription / catalog.* </w:t>
+      </w:r>
+      <w:r>
+        <w:rPr>
+          <w:b/>
+        </w:rPr>
+        <w:t>C1110–C1118</w:t>
+      </w:r>
+      <w:r>
+        <w:t xml:space="preserve"> </w:t>
+      </w:r>
+      <w:r>
+        <w:rPr>
+          <w:b/>
+        </w:rPr>
+        <w:t>S799–S807</w:t>
+      </w:r>
+      <w:r>
+        <w:t>.</w:t>
+      </w:r>
+    </w:p>
+    <w:p>
+      <w:r>
+        <w:t xml:space="preserve">187. IA [`14thcensusofpopu602unit`](https://archive.org/details/14thcensusofpopu602unit) still </w:t>
+      </w:r>
+      <w:r>
+        <w:rPr>
+          <w:b/>
+        </w:rPr>
+        <w:t>515</w:t>
+      </w:r>
+      <w:r>
+        <w:t xml:space="preserve"> images; Solr `*602*` = </w:t>
+      </w:r>
+      <w:r>
+        <w:rPr>
+          <w:b/>
+        </w:rPr>
+        <w:t>602</w:t>
+      </w:r>
+      <w:r>
+        <w:t xml:space="preserve"> + </w:t>
+      </w:r>
+      <w:r>
+        <w:rPr>
+          <w:b/>
+        </w:rPr>
+        <w:t>1602</w:t>
+      </w:r>
+      <w:r>
+        <w:t xml:space="preserve"> only. KYGenWeb [Wolfe census1](https://kygenweb.net/wolfe/census1.htm) still lists 1920k Antioch </w:t>
+      </w:r>
+      <w:r>
+        <w:rPr>
+          <w:b/>
+        </w:rPr>
+        <w:t>242</w:t>
+      </w:r>
+      <w:r>
+        <w:t xml:space="preserve">. *Catalog.* </w:t>
+      </w:r>
+      <w:r>
+        <w:rPr>
+          <w:b/>
+        </w:rPr>
+        <w:t>C1119 C1120</w:t>
+      </w:r>
+      <w:r>
+        <w:t xml:space="preserve"> </w:t>
+      </w:r>
+      <w:r>
+        <w:rPr>
+          <w:b/>
+        </w:rPr>
+        <w:t>S808 S809</w:t>
+      </w:r>
+      <w:r>
+        <w:t>.</w:t>
+      </w:r>
+    </w:p>
+    <w:p>
+      <w:r>
+        <w:t xml:space="preserve">188. 1950 U.S. census, Estill ED </w:t>
+      </w:r>
+      <w:r>
+        <w:rPr>
+          <w:b/>
+        </w:rPr>
+        <w:t>33-1</w:t>
+      </w:r>
+      <w:r>
+        <w:t xml:space="preserve"> Irvine, NARA image [0003](https://1950census.archives.gov/), form sheet </w:t>
+      </w:r>
+      <w:r>
+        <w:rPr>
+          <w:b/>
+        </w:rPr>
+        <w:t>2</w:t>
+      </w:r>
+      <w:r>
+        <w:t xml:space="preserve">, 1 Apr 1950, hh </w:t>
+      </w:r>
+      <w:r>
+        <w:rPr>
+          <w:b/>
+        </w:rPr>
+        <w:t>14</w:t>
+      </w:r>
+      <w:r>
+        <w:t xml:space="preserve">: Newnam, Fred </w:t>
+      </w:r>
+      <w:r>
+        <w:rPr>
+          <w:b/>
+        </w:rPr>
+        <w:t>55</w:t>
+      </w:r>
+      <w:r>
+        <w:t xml:space="preserve"> + Era R </w:t>
+      </w:r>
+      <w:r>
+        <w:rPr>
+          <w:b/>
+        </w:rPr>
+        <w:t>52</w:t>
+      </w:r>
+      <w:r>
+        <w:t xml:space="preserve"> + Dorothy J </w:t>
+      </w:r>
+      <w:r>
+        <w:rPr>
+          <w:b/>
+        </w:rPr>
+        <w:t>19</w:t>
+      </w:r>
+      <w:r>
+        <w:t xml:space="preserve">. </w:t>
+      </w:r>
+      <w:r>
+        <w:rPr>
+          <w:b/>
+        </w:rPr>
+        <w:t>PROVEN</w:t>
+      </w:r>
+      <w:r>
+        <w:t xml:space="preserve"> 1940 Irvine couple; </w:t>
+      </w:r>
+      <w:r>
+        <w:rPr>
+          <w:b/>
+        </w:rPr>
+        <w:t>PROBABLE</w:t>
+      </w:r>
+      <w:r>
+        <w:t xml:space="preserve"> C387. *Image seen.* </w:t>
+      </w:r>
+      <w:r>
+        <w:rPr>
+          <w:b/>
+        </w:rPr>
+        <w:t>C1122 C1123</w:t>
+      </w:r>
+      <w:r>
+        <w:t xml:space="preserve"> </w:t>
+      </w:r>
+      <w:r>
+        <w:rPr>
+          <w:b/>
+        </w:rPr>
+        <w:t>S811</w:t>
+      </w:r>
+      <w:r>
+        <w:t>.</w:t>
+      </w:r>
+    </w:p>
+    <w:p>
+      <w:r>
+        <w:t xml:space="preserve">189. Estill 1950 </w:t>
+      </w:r>
+      <w:r>
+        <w:rPr>
+          <w:b/>
+        </w:rPr>
+        <w:t>33-13</w:t>
+      </w:r>
+      <w:r>
+        <w:t xml:space="preserve"> sh </w:t>
+      </w:r>
+      <w:r>
+        <w:rPr>
+          <w:b/>
+        </w:rPr>
+        <w:t>0021</w:t>
+      </w:r>
+      <w:r>
+        <w:t xml:space="preserve"> hh </w:t>
+      </w:r>
+      <w:r>
+        <w:rPr>
+          <w:b/>
+        </w:rPr>
+        <w:t>155</w:t>
+      </w:r>
+      <w:r>
+        <w:t xml:space="preserve"> Harding </w:t>
+      </w:r>
+      <w:r>
+        <w:rPr>
+          <w:b/>
+        </w:rPr>
+        <w:t>65</w:t>
+      </w:r>
+      <w:r>
+        <w:t xml:space="preserve"> + Sarah </w:t>
+      </w:r>
+      <w:r>
+        <w:rPr>
+          <w:b/>
+        </w:rPr>
+        <w:t>64</w:t>
+      </w:r>
+      <w:r>
+        <w:t xml:space="preserve"> </w:t>
+      </w:r>
+      <w:r>
+        <w:rPr>
+          <w:b/>
+        </w:rPr>
+        <w:t>rejected</w:t>
+      </w:r>
+      <w:r>
+        <w:t xml:space="preserve"> vs Boyd+Allie; hh </w:t>
+      </w:r>
+      <w:r>
+        <w:rPr>
+          <w:b/>
+        </w:rPr>
+        <w:t>156</w:t>
+      </w:r>
+      <w:r>
+        <w:t xml:space="preserve"> Melvina </w:t>
+      </w:r>
+      <w:r>
+        <w:rPr>
+          <w:b/>
+        </w:rPr>
+        <w:t>28</w:t>
+      </w:r>
+      <w:r>
+        <w:t xml:space="preserve"> rejected. </w:t>
+      </w:r>
+      <w:r>
+        <w:rPr>
+          <w:b/>
+        </w:rPr>
+        <w:t>33-6</w:t>
+      </w:r>
+      <w:r>
+        <w:t xml:space="preserve"> sh </w:t>
+      </w:r>
+      <w:r>
+        <w:rPr>
+          <w:b/>
+        </w:rPr>
+        <w:t>0008</w:t>
+      </w:r>
+      <w:r>
+        <w:t xml:space="preserve"> hh </w:t>
+      </w:r>
+      <w:r>
+        <w:rPr>
+          <w:b/>
+        </w:rPr>
+        <w:t>76</w:t>
+      </w:r>
+      <w:r>
+        <w:t xml:space="preserve"> Vertie </w:t>
+      </w:r>
+      <w:r>
+        <w:rPr>
+          <w:b/>
+        </w:rPr>
+        <w:t>41</w:t>
+      </w:r>
+      <w:r>
+        <w:t xml:space="preserve"> rejected. *Image seen.* </w:t>
+      </w:r>
+      <w:r>
+        <w:rPr>
+          <w:b/>
+        </w:rPr>
+        <w:t>C1124–C1126</w:t>
+      </w:r>
+      <w:r>
+        <w:t xml:space="preserve"> </w:t>
+      </w:r>
+      <w:r>
+        <w:rPr>
+          <w:b/>
+        </w:rPr>
+        <w:t>S812 S813</w:t>
+      </w:r>
+      <w:r>
+        <w:t>.</w:t>
+      </w:r>
+    </w:p>
+    <w:p>
+      <w:r>
+        <w:t xml:space="preserve">190. Remaining 1950 Lee Newman plates: Nerman gs </w:t>
+      </w:r>
+      <w:r>
+        <w:rPr>
+          <w:b/>
+        </w:rPr>
+        <w:t>14</w:t>
+      </w:r>
+      <w:r>
+        <w:t xml:space="preserve"> false hit; Elen </w:t>
+      </w:r>
+      <w:r>
+        <w:rPr>
+          <w:b/>
+        </w:rPr>
+        <w:t>66</w:t>
+      </w:r>
+      <w:r>
+        <w:t xml:space="preserve">; Charles </w:t>
+      </w:r>
+      <w:r>
+        <w:rPr>
+          <w:b/>
+        </w:rPr>
+        <w:t>34</w:t>
+      </w:r>
+      <w:r>
+        <w:t xml:space="preserve">/Wayne </w:t>
+      </w:r>
+      <w:r>
+        <w:rPr>
+          <w:b/>
+        </w:rPr>
+        <w:t>25</w:t>
+      </w:r>
+      <w:r>
+        <w:t xml:space="preserve">/Grenvy </w:t>
+      </w:r>
+      <w:r>
+        <w:rPr>
+          <w:b/>
+        </w:rPr>
+        <w:t>36</w:t>
+      </w:r>
+      <w:r>
+        <w:t xml:space="preserve">; Been </w:t>
+      </w:r>
+      <w:r>
+        <w:rPr>
+          <w:b/>
+        </w:rPr>
+        <w:t>46</w:t>
+      </w:r>
+      <w:r>
+        <w:t xml:space="preserve">; Charles </w:t>
+      </w:r>
+      <w:r>
+        <w:rPr>
+          <w:b/>
+        </w:rPr>
+        <w:t>24</w:t>
+      </w:r>
+      <w:r>
+        <w:t xml:space="preserve">. All </w:t>
+      </w:r>
+      <w:r>
+        <w:rPr>
+          <w:b/>
+        </w:rPr>
+        <w:t>rejected</w:t>
+      </w:r>
+      <w:r>
+        <w:t xml:space="preserve"> vs John L / Frank / Boyd. *Image seen.* </w:t>
+      </w:r>
+      <w:r>
+        <w:rPr>
+          <w:b/>
+        </w:rPr>
+        <w:t>C1127–C1131</w:t>
+      </w:r>
+      <w:r>
+        <w:t xml:space="preserve"> </w:t>
+      </w:r>
+      <w:r>
+        <w:rPr>
+          <w:b/>
+        </w:rPr>
+        <w:t>S814–S818</w:t>
+      </w:r>
+      <w:r>
+        <w:t>.</w:t>
+      </w:r>
+    </w:p>
+    <w:p>
+      <w:r>
+        <w:t xml:space="preserve">191. Remaining 1950 Madison adult Newman males William </w:t>
+      </w:r>
+      <w:r>
+        <w:rPr>
+          <w:b/>
+        </w:rPr>
+        <w:t>48</w:t>
+      </w:r>
+      <w:r>
+        <w:t xml:space="preserve"> / Zelma </w:t>
+      </w:r>
+      <w:r>
+        <w:rPr>
+          <w:b/>
+        </w:rPr>
+        <w:t>48</w:t>
+      </w:r>
+      <w:r>
+        <w:t xml:space="preserve"> / Hiram </w:t>
+      </w:r>
+      <w:r>
+        <w:rPr>
+          <w:b/>
+        </w:rPr>
+        <w:t>36</w:t>
+      </w:r>
+      <w:r>
+        <w:t xml:space="preserve"> / W M </w:t>
+      </w:r>
+      <w:r>
+        <w:rPr>
+          <w:b/>
+        </w:rPr>
+        <w:t>20</w:t>
+      </w:r>
+      <w:r>
+        <w:t xml:space="preserve"> / Lee </w:t>
+      </w:r>
+      <w:r>
+        <w:rPr>
+          <w:b/>
+        </w:rPr>
+        <w:t>19</w:t>
+      </w:r>
+      <w:r>
+        <w:t xml:space="preserve"> </w:t>
+      </w:r>
+      <w:r>
+        <w:rPr>
+          <w:b/>
+        </w:rPr>
+        <w:t>rejected</w:t>
+      </w:r>
+      <w:r>
+        <w:t xml:space="preserve"> vs Frank ~</w:t>
+      </w:r>
+      <w:r>
+        <w:rPr>
+          <w:b/>
+        </w:rPr>
+        <w:t>61</w:t>
+      </w:r>
+      <w:r>
+        <w:t xml:space="preserve">. Combined with Dewey </w:t>
+      </w:r>
+      <w:r>
+        <w:rPr>
+          <w:b/>
+        </w:rPr>
+        <w:t>26</w:t>
+      </w:r>
+      <w:r>
+        <w:t xml:space="preserve"> + Shelly+Grace: </w:t>
+      </w:r>
+      <w:r>
+        <w:rPr>
+          <w:b/>
+        </w:rPr>
+        <w:t>PROBABLE</w:t>
+      </w:r>
+      <w:r>
+        <w:t xml:space="preserve"> Madison 1950 name-index negative. *Image seen / index.* </w:t>
+      </w:r>
+      <w:r>
+        <w:rPr>
+          <w:b/>
+        </w:rPr>
+        <w:t>C1132–C1138</w:t>
+      </w:r>
+      <w:r>
+        <w:t xml:space="preserve"> </w:t>
+      </w:r>
+      <w:r>
+        <w:rPr>
+          <w:b/>
+        </w:rPr>
+        <w:t>S819–S824</w:t>
+      </w:r>
+      <w:r>
+        <w:t>.</w:t>
+      </w:r>
+    </w:p>
+    <w:p>
+      <w:r>
+        <w:t xml:space="preserve">192. Estill 1930 [`_indx-m-q.txt`](https://www.us-census.org/pub/usgenweb/census/ky/estill/1930/_indx-m-q.txt) Fred/Herbert only. [`_partial.txt`](https://www.us-census.org/pub/usgenweb/census/ky/estill/1930/_partial.txt) </w:t>
+      </w:r>
+      <w:r>
+        <w:rPr>
+          <w:b/>
+        </w:rPr>
+        <w:t>33-8</w:t>
+      </w:r>
+      <w:r>
+        <w:t xml:space="preserve"> still unpublished; </w:t>
+      </w:r>
+      <w:r>
+        <w:rPr>
+          <w:b/>
+        </w:rPr>
+        <w:t>33-5</w:t>
+      </w:r>
+      <w:r>
+        <w:t xml:space="preserve"> also unpublished. NARA [M1930](https://www.archives.gov/research/census/1930/enumeration-districts-maps.html) rolls </w:t>
+      </w:r>
+      <w:r>
+        <w:rPr>
+          <w:b/>
+        </w:rPr>
+        <w:t>22/23</w:t>
+      </w:r>
+      <w:r>
+        <w:t xml:space="preserve"> reconfirm. FS </w:t>
+      </w:r>
+      <w:r>
+        <w:rPr>
+          <w:b/>
+        </w:rPr>
+        <w:t>403</w:t>
+      </w:r>
+      <w:r>
+        <w:t xml:space="preserve"> (R011-50). *Transcription / catalog / pamphlet.* </w:t>
+      </w:r>
+      <w:r>
+        <w:rPr>
+          <w:b/>
+        </w:rPr>
+        <w:t>C1139–C1148</w:t>
+      </w:r>
+      <w:r>
+        <w:t xml:space="preserve"> </w:t>
+      </w:r>
+      <w:r>
+        <w:rPr>
+          <w:b/>
+        </w:rPr>
+        <w:t>S825–S834</w:t>
+      </w:r>
+      <w:r>
+        <w:t>.</w:t>
+      </w:r>
+    </w:p>
+    <w:p>
+      <w:r>
         <w:br w:type="page"/>
       </w:r>
     </w:p>
@@ -20976,6 +24134,236 @@
     <w:p>
       <w:r>
         <w:t>| S699 | `../sources/census/pass94-extract-2026-10-31.txt` | This session | Pass 94 extract | extract |</w:t>
+      </w:r>
+    </w:p>
+    <w:p>
+      <w:r>
+        <w:t>| S701 | `../sources/catalog/ia-meta-t625-603-pass95.json` | [IA 603](https://archive.org/details/14thcensusofpopu603unit) | Louisiana 1920 — not KY Wolfe | catalog |</w:t>
+      </w:r>
+    </w:p>
+    <w:p>
+      <w:r>
+        <w:t>| S703 | `../sources/census/pass95/wolfe-1920a-campton236.txt` | [LDS Wolfe](https://ldsgenealogy.com/KY/Wolfe-County-Census-Records.htm) | Campton ED 236 compiled nil Newman | transcription only |</w:t>
+      </w:r>
+    </w:p>
+    <w:p>
+      <w:r>
+        <w:t>| S704 | `../sources/census/pass95/wolfe-1920e-campton3.txt` | [LDS Wolfe](https://ldsgenealogy.com/KY/Wolfe-County-Census-Records.htm) | Campton Precinct 3 compiled nil Newman | transcription only |</w:t>
+      </w:r>
+    </w:p>
+    <w:p>
+      <w:r>
+        <w:t>| S706 | `../sources/census/fayette-1930-t626-743-title-pass95.jpg` | [IA T626-743](https://archive.org/details/kentuckycensus00reel743) | Fayette Vol 25/26 title | image seen |</w:t>
+      </w:r>
+    </w:p>
+    <w:p>
+      <w:r>
+        <w:t>| S707 | `../sources/census/fayette-1930-t626-743-card-pass95.jpg` | [IA T626-743](https://archive.org/details/kentuckycensus00reel743) | Fayette ED card | image seen |</w:t>
+      </w:r>
+    </w:p>
+    <w:p>
+      <w:r>
+        <w:t>| S708 | `../sources/census/fayette-1930-ed341-lexington-1a-pass95.jpg` | [IA T626-743](https://archive.org/details/kentuckycensus00reel743) | Lexington 34-1 sh 1A | image seen |</w:t>
+      </w:r>
+    </w:p>
+    <w:p>
+      <w:r>
+        <w:t>| S710 | `../sources/catalog/uscensus-estill-1930-partial-pass95.txt` | [us-census.org](https://www.us-census.org/pub/usgenweb/census/ky/estill/1930/_partial.txt) | 33-8 095A–102B unpublished | catalog |</w:t>
+      </w:r>
+    </w:p>
+    <w:p>
+      <w:r>
+        <w:t>| S714 | `../sources/military/nara-m1509-rolllist-pass95.pdf` | [NARA M1509](https://www.archives.gov/research/military/ww1/draft-registration) | Official KY45/24/74/64/90 map | pamphlet |</w:t>
+      </w:r>
+    </w:p>
+    <w:p>
+      <w:r>
+        <w:t>| S718 | `../sources/catalog/berea-archives-citizen-pass95.html` | [Berea RG 12/12.12](https://bereaarchives.libraryhost.com/repositories/2/resources/128) | Hutchins Citizen through June 1958 | catalog |</w:t>
+      </w:r>
+    </w:p>
+    <w:p>
+      <w:r>
+        <w:t>| S721 | `../sources/census/pass95-extract-2026-10-31.txt` | This session | Pass 95 extract | extract |</w:t>
+      </w:r>
+    </w:p>
+    <w:p>
+      <w:r>
+        <w:t>| S722 | `../sources/catalog/kygenweb-wolfe-census1-pass96.html` | [KYGenWeb Wolfe](https://kygenweb.net/wolfe/census1.htm) | 1920 letter files a/c/d/e/f/g/h/i/k; no b/j | catalog |</w:t>
+      </w:r>
+    </w:p>
+    <w:p>
+      <w:r>
+        <w:t>| S724 | `../sources/census/pass96/kygenweb-1920c.txt` | [1920c](https://kygenweb.net/wolfe/txt/1920c.txt) | Lee City ED 234 compiled nil Newman | transcription only |</w:t>
+      </w:r>
+    </w:p>
+    <w:p>
+      <w:r>
+        <w:t>| S729 | `../sources/catalog/nara-t1224-pamphlet-pass96.pdf` | [NARA T1224](https://www.archives.gov/files/research/microfilm/t1224.pdf) | Roll 69 = KS+KY | pamphlet |</w:t>
+      </w:r>
+    </w:p>
+    <w:p>
+      <w:r>
+        <w:t>| S731 | `../sources/catalog/uscensus-estill-1930-team-pass96.html` | [us-census.org](https://www.us-census.org/states/kentucky/teams/Estill1930-T626-742.htm) | 33-8 = Station Camp South Part | catalog |</w:t>
+      </w:r>
+    </w:p>
+    <w:p>
+      <w:r>
+        <w:t>| S732 | `../sources/census/pass96/lds-1940-irvine.html` | [LDS Irvine](https://ldsgenealogy.com/KY/1940-Census-Irvine-KY.htm) | Fred ~1895 + Era ~1898 | index only |</w:t>
+      </w:r>
+    </w:p>
+    <w:p>
+      <w:r>
+        <w:t>| S736 | `../sources/press/loc-item-sn85052076-pass96.json` | [LOC sn85052076](https://www.loc.gov/item/sn85052076/) | Citizen last digitized 1922-12-28 | catalog |</w:t>
+      </w:r>
+    </w:p>
+    <w:p>
+      <w:r>
+        <w:t>| S738 | `../sources/catalog/lds-fhl2-duell-clark-pass96.html` | [LDS FHL2](https://ldsgenealogy.com/cgi-bin/FHL2-KY.cgi?176022_Duell-Clark_Funeral_Home_records) | FS 1006308 | catalog |</w:t>
+      </w:r>
+    </w:p>
+    <w:p>
+      <w:r>
+        <w:t>| S744 | `../sources/census/pass96-extract-2026-10-31.txt` | This session | Pass 96 extract | extract |</w:t>
+      </w:r>
+    </w:p>
+    <w:p>
+      <w:r>
+        <w:t>| S745 | `../sources/catalog/nara-1930-ed-maps-pass97.html` | [NARA M1930](https://www.archives.gov/research/census/1930/enumeration-districts-maps.html) | Roll 22 Estill; roll 23 Lee–Woodford | pamphlet |</w:t>
+      </w:r>
+    </w:p>
+    <w:p>
+      <w:r>
+        <w:t>| S747 | `../sources/census/pass97/lds-1940-richmond.html` | [LDS Richmond](https://ldsgenealogy.com/KY/1940-Census-Richmond-KY.htm) | Richmond 1940 nil Newman | index only |</w:t>
+      </w:r>
+    </w:p>
+    <w:p>
+      <w:r>
+        <w:t>| S752 | `../sources/census/pass97/lds-1940-beattyville.html` | [LDS Beattyville](https://ldsgenealogy.com/KY/1940-Census-Beattyville-KY.htm) | Luther ~1891 + Cora ~1894 | index only |</w:t>
+      </w:r>
+    </w:p>
+    <w:p>
+      <w:r>
+        <w:t>| S753 | `../sources/census/pass97/lds-1940-heidelberg.html` | [LDS Heidelberg](https://ldsgenealogy.com/KY/1940-Census-Heidelberg-KY.htm) | Grand ~1878 + Martha | index only |</w:t>
+      </w:r>
+    </w:p>
+    <w:p>
+      <w:r>
+        <w:t>| S756 | `../sources/census/pass97/nara-1950-newman-fayette.json` | [NARA 1950](https://1950census.archives.gov/) | Fayette Newman 22 / no Boyd | index only |</w:t>
+      </w:r>
+    </w:p>
+    <w:p>
+      <w:r>
+        <w:t>| S757 | `../sources/press/loc-item-sn90050035-pass97.json` | [LOC sn90050035](https://www.loc.gov/item/sn90050035/) | Yell County Journal not digitized | catalog |</w:t>
+      </w:r>
+    </w:p>
+    <w:p>
+      <w:r>
+        <w:t>| S759 | `../sources/catalog/wchs-books-pass97.html` | [WCHS](https://www.woodfordcountykyhistoricalsociety.com/booksandpublications) | Duell-Clark 1958–1978 $10 | catalog |</w:t>
+      </w:r>
+    </w:p>
+    <w:p>
+      <w:r>
+        <w:t>| S766 | `../sources/census/pass97-extract-2026-10-31.txt` | This session | Pass 97 extract | extract |</w:t>
+      </w:r>
+    </w:p>
+    <w:p>
+      <w:r>
+        <w:t>| S771 | `../sources/catalog/ia-meta-t625-602-pass98.json` | [IA 602](https://archive.org/details/14thcensusofpopu602unit) | Still 515 images | catalog |</w:t>
+      </w:r>
+    </w:p>
+    <w:p>
+      <w:r>
+        <w:t>| S772 | `../sources/census/pass98/lds-stillwater.html` | [LDS Stillwater](https://ldsgenealogy.com/KY/1940-Census-Stillwater-KY.htm) | Mae ~1905 only | index only |</w:t>
+      </w:r>
+    </w:p>
+    <w:p>
+      <w:r>
+        <w:t>| S777 | `../sources/census/pass98/lds-foxtown.html` | [LDS Foxtown](https://ldsgenealogy.com/KY/1940-Census-Foxtown-KY.htm) | Jackson Shelby+Grace | index only |</w:t>
+      </w:r>
+    </w:p>
+    <w:p>
+      <w:r>
+        <w:t>| S778 | `../sources/census/pass98/lee-1950-65-1-0020-luther-ocr.jpg` | [NARA 1950](https://1950census.archives.gov/) | Luther D. 28 rejected | image seen |</w:t>
+      </w:r>
+    </w:p>
+    <w:p>
+      <w:r>
+        <w:t>| S779 | `../sources/census/pass98/lee-1950-65-1-0021-corap.jpg` | [NARA 1950](https://1950census.archives.gov/) | Cora P. 56 + Charlie Plummer | image seen |</w:t>
+      </w:r>
+    </w:p>
+    <w:p>
+      <w:r>
+        <w:t>| S788 | `../sources/census/pass98-extract-2026-10-31.txt` | This session | Pass 98 extract | extract |</w:t>
+      </w:r>
+    </w:p>
+    <w:p>
+      <w:r>
+        <w:t>| S789 | `../sources/census/pass99/nara-1950-newman-lee.json` | [NARA 1950](https://1950census.archives.gov/) | Lee 7/4 no targets | index only |</w:t>
+      </w:r>
+    </w:p>
+    <w:p>
+      <w:r>
+        <w:t>| S793 | `../sources/census/pass99/lee-1950-65-13-0002-martha.jpg` | [NARA 1950](https://1950census.archives.gov/) | Martha 51 wd rejected | image seen |</w:t>
+      </w:r>
+    </w:p>
+    <w:p>
+      <w:r>
+        <w:t>| S794 | `../sources/census/pass99/lee-1950-65-13-0011-johnia.jpg` | [NARA 1950](https://1950census.archives.gov/) | Johnia 54 rejected vs John L | image seen |</w:t>
+      </w:r>
+    </w:p>
+    <w:p>
+      <w:r>
+        <w:t>| S796 | `../sources/census/pass99/jackson-1950-55-6-0024-newman.jpg` | [NARA 1950](https://1950census.archives.gov/) | Bonnie 16 sample | image seen |</w:t>
+      </w:r>
+    </w:p>
+    <w:p>
+      <w:r>
+        <w:t>| S802 | `../sources/census/pass99/kygenweb-1920g.txt` | [KYGenWeb 1920g](https://kygenweb.net/wolfe/txt/1920g.txt) | Holly compiled nil | transcription only |</w:t>
+      </w:r>
+    </w:p>
+    <w:p>
+      <w:r>
+        <w:t>| S807 | `../sources/census/pass99-extract-2026-10-31.txt` | This session | Pass 98–99 extract | extract |</w:t>
+      </w:r>
+    </w:p>
+    <w:p>
+      <w:r>
+        <w:t>| S808 | `../sources/catalog/ia-meta-t625-602-pass100.json` | [IA 602](https://archive.org/details/14thcensusofpopu602unit) | Still 515; no remainder | catalog |</w:t>
+      </w:r>
+    </w:p>
+    <w:p>
+      <w:r>
+        <w:t>| S811 | `../sources/census/pass100/estill-1950-33-1-0003-fred.jpg` | [NARA 1950](https://1950census.archives.gov/) | Fred 55 + Era R 52 + Dorothy J 19 | image seen |</w:t>
+      </w:r>
+    </w:p>
+    <w:p>
+      <w:r>
+        <w:t>| S812 | `../sources/census/pass100/estill-1950-33-13-0021-planding.jpg` | [NARA 1950](https://1950census.archives.gov/) | Harding 65 + Sarah 64 rejected | image seen |</w:t>
+      </w:r>
+    </w:p>
+    <w:p>
+      <w:r>
+        <w:t>| S813 | `../sources/census/pass100/estill-1950-33-6-0008-vertie.jpg` | [NARA 1950](https://1950census.archives.gov/) | Vertie 41 rejected | image seen |</w:t>
+      </w:r>
+    </w:p>
+    <w:p>
+      <w:r>
+        <w:t>| S819 | `../sources/census/pass100/madison-1950-76-9-0002-wm.jpg` | [NARA 1950](https://1950census.archives.gov/) | W M lodger 20 rejected | image seen |</w:t>
+      </w:r>
+    </w:p>
+    <w:p>
+      <w:r>
+        <w:t>| S820 | `../sources/census/pass100/madison-1950-76-22-0042-williams.jpg` | [NARA 1950](https://1950census.archives.gov/) | William 48 + Addie 42 rejected | image seen |</w:t>
+      </w:r>
+    </w:p>
+    <w:p>
+      <w:r>
+        <w:t>| S826 | `../sources/catalog/uscensus-estill-1930-partial-pass100.txt` | [us-census.org](https://www.us-census.org/pub/usgenweb/census/ky/estill/1930/_partial.txt) | 33-8 still unpublished; 33-5 also | catalog |</w:t>
+      </w:r>
+    </w:p>
+    <w:p>
+      <w:r>
+        <w:t>| S834 | `../sources/census/pass100-extract-2026-10-31.txt` | This session | Pass 100 extract | extract |</w:t>
       </w:r>
     </w:p>
     <w:p>

</xml_diff>

<commit_message>
Pass 101: correct M1930 KY to roll 15; 1950 Estill 33-8 is Millers Creek
Withdraw C1056/C1141 (M1930 22/23 are NE/NJ, not Kentucky). Prove 1950 33-8 as Millers Creek and Station Camp as 33-11/12; reject Boyd 19 and OCR Boyd. Catalog reconfirm Antioch 242, WWI, probate, 1926, Madison Frank.

Co-authored-by: blakereaganlaw <blakereaganlaw@gmail.com>
</commit_message>
<xml_diff>
--- a/research/dora-ella-newnam/book/Dora-Ella-Newnam-Stone-A-Life.docx
+++ b/research/dora-ella-newnam/book/Dora-Ella-Newnam-Stone-A-Life.docx
@@ -256,6 +256,11 @@
     </w:p>
     <w:p>
       <w:r>
+        <w:t>46. [Pass 101. Kentucky is roll 15, and 1950 33-8 is Millers Creek](#pass-101-kentucky-is-roll-15-and-1950-33-8-is-millers-creek)</w:t>
+      </w:r>
+    </w:p>
+    <w:p>
+      <w:r>
         <w:br w:type="page"/>
       </w:r>
     </w:p>
@@ -8073,25 +8078,52 @@
     </w:p>
     <w:p>
       <w:r>
-        <w:t xml:space="preserve">The National Archives’ official 1930 enumeration-district map pamphlet now names the Kentucky rolls. </w:t>
-      </w:r>
-      <w:r>
-        <w:rPr>
-          <w:b/>
-        </w:rPr>
-        <w:t>M1930 roll 22</w:t>
-      </w:r>
-      <w:r>
-        <w:t xml:space="preserve"> is Adair through Henderson — Estill is on that roll. </w:t>
-      </w:r>
-      <w:r>
-        <w:rPr>
-          <w:b/>
-        </w:rPr>
-        <w:t>Roll 23</w:t>
-      </w:r>
-      <w:r>
-        <w:t xml:space="preserve"> is Henry through Woodford — Lee, Madison, Owsley, Wolfe, and Woodford. The maps have not been read. Internet Archive has no free scan of those films. [C1056] [C1057] [S745] [S770]</w:t>
+        <w:t xml:space="preserve">The National Archives’ official 1930 enumeration-district map page names two publications. Pass 97 read the </w:t>
+      </w:r>
+      <w:r>
+        <w:rPr>
+          <w:b/>
+        </w:rPr>
+        <w:t>A3378</w:t>
+      </w:r>
+      <w:r>
+        <w:t xml:space="preserve"> split as if it were </w:t>
+      </w:r>
+      <w:r>
+        <w:rPr>
+          <w:b/>
+        </w:rPr>
+        <w:t>M1930</w:t>
+      </w:r>
+      <w:r>
+        <w:t xml:space="preserve">. That is withdrawn. </w:t>
+      </w:r>
+      <w:r>
+        <w:rPr>
+          <w:b/>
+        </w:rPr>
+        <w:t>M1930</w:t>
+      </w:r>
+      <w:r>
+        <w:t xml:space="preserve"> (36 rolls, 1930 color) puts </w:t>
+      </w:r>
+      <w:r>
+        <w:rPr>
+          <w:b/>
+        </w:rPr>
+        <w:t>entire Kentucky on roll 15</w:t>
+      </w:r>
+      <w:r>
+        <w:t xml:space="preserve">. M1930 roll 22 is Nebraska, Nevada, and New Hampshire; roll 23 is New Jersey and New Mexico. The Adair-through-Henderson / Henry-through-Woodford split is </w:t>
+      </w:r>
+      <w:r>
+        <w:rPr>
+          <w:b/>
+        </w:rPr>
+        <w:t>A3378</w:t>
+      </w:r>
+      <w:r>
+        <w:t xml:space="preserve"> rolls 22 and 23 — black-and-white maps for 1900–1940. The maps have not been read. [C1056] [C1150] [S745] [S838]</w:t>
       </w:r>
     </w:p>
     <w:p>
@@ -8728,7 +8760,7 @@
     </w:p>
     <w:p>
       <w:r>
-        <w:t>Station Camp South is still missing. The published Estill 1930 index still has only Fred and Earca, and Herbert and Edith, in Irvine. District 33-8, stamped 095A–102B, is still unpublished. District 33-5, Irvine South, 060A–065A, is also unpublished — a new catalog detail, not a substitute for 33-8. The official National Archives M1930 pamphlet still maps Estill to roll 22 and Lee, Madison, Owsley, Wolfe, and Woodford to roll 23. Internet Archive has no free scan. [C1139] [C1140] [C1141] [S825] [S826] [S827]</w:t>
+        <w:t>Station Camp South is still missing. The published Estill 1930 index still has only Fred and Earca, and Herbert and Edith, in Irvine. District 33-8, stamped 095A–102B, is still unpublished. District 33-5, Irvine South, 060A–065A, is also unpublished — a new catalog detail, not a substitute for 33-8. The pass-100 sentence that mapped those districts to M1930 rolls 22 and 23 is withdrawn in Pass 101. [C1139] [C1140] [C1141] [C1150] [S825] [S826] [S838]</w:t>
       </w:r>
     </w:p>
     <w:p>
@@ -8802,6 +8834,162 @@
       </w:r>
       <w:r>
         <w:t xml:space="preserve"> the minister’s widow. Do not print 1966 or 1976 as proven deaths. Do not print Floyd as Boyd. Do not print 1962 as McCoy’s death. Do not print the 1942 Combs charge as fact. [C1148]</w:t>
+      </w:r>
+    </w:p>
+    <w:p>
+      <w:pPr>
+        <w:pStyle w:val="Heading2"/>
+      </w:pPr>
+      <w:r>
+        <w:t>Pass 101. Kentucky is roll 15, and 1950 33-8 is Millers Creek</w:t>
+      </w:r>
+    </w:p>
+    <w:p>
+      <w:r>
+        <w:t xml:space="preserve">Internet Archive’s Kentucky T625-602 scan is still 515 images. A search for another identifier returned junk — Charlie Rose, an Antioch newspaper from 1960, a Pennsylvania Mercer reel already rejected. Antioch 242 and the rest of Clifty are still not on a free scan. That catalog gap is </w:t>
+      </w:r>
+      <w:r>
+        <w:rPr>
+          <w:b/>
+        </w:rPr>
+        <w:t>proven</w:t>
+      </w:r>
+      <w:r>
+        <w:t>. This pass does not stall on it. [C1149] [C1119] [S835] [S836] [S837]</w:t>
+      </w:r>
+    </w:p>
+    <w:p>
+      <w:r>
+        <w:t xml:space="preserve">The map-roll error is now closed as a catalog fact. The National Archives 1930 enumeration-district maps page prints two tables. </w:t>
+      </w:r>
+      <w:r>
+        <w:rPr>
+          <w:b/>
+        </w:rPr>
+        <w:t>M1930</w:t>
+      </w:r>
+      <w:r>
+        <w:t xml:space="preserve">, thirty-six rolls of 1930 color film, gives </w:t>
+      </w:r>
+      <w:r>
+        <w:rPr>
+          <w:b/>
+        </w:rPr>
+        <w:t>Kentucky the whole of roll 15</w:t>
+      </w:r>
+      <w:r>
+        <w:t xml:space="preserve">. M1930 roll 22 is Nebraska Hooker through York, Nevada, and New Hampshire. Roll 23 is New Jersey and New Mexico. The split that earlier passes called M1930 22/23 — Kentucky Adair through Henderson on one reel, Henry through Woodford on the next — is </w:t>
+      </w:r>
+      <w:r>
+        <w:rPr>
+          <w:b/>
+        </w:rPr>
+        <w:t>A3378</w:t>
+      </w:r>
+      <w:r>
+        <w:t>, the 1900–1940 black-and-white set, rolls 22 and 23. Estill is on A3378 roll 22. Lee, Madison, Owsley, Wolfe, and Woodford are on A3378 roll 23. The maps themselves have not been read. [C1150] [C1056] [C1141] [S838]</w:t>
+      </w:r>
+    </w:p>
+    <w:p>
+      <w:r>
+        <w:t>The 1930 team page still names the unpublished Estill districts. 33-5 is Magisterial District 1, Irvine South, excluding Irvine City and Ravenna Town. 33-8 is Magisterial District 3, Station Camp South. Those sheets are still unpublished on the Internet Archive T626-742 scan. [C1151] [C1039] [C1140] [S839]</w:t>
+      </w:r>
+    </w:p>
+    <w:p>
+      <w:r>
+        <w:t xml:space="preserve">The 1950 analog is now an image, not a guess. The National Archives open-data map of Estill County — a 1937 highway sheet with 1950 districts 33-1 through 33-22 drawn on it — puts 33-8, 33-9, and 33-10 in Magisterial District 2, Millers Creek. Station Camp is Magisterial District 3, districts 33-11 and 33-12, the southeast lobe toward Lee County. </w:t>
+      </w:r>
+      <w:r>
+        <w:rPr>
+          <w:b/>
+        </w:rPr>
+        <w:t>1950 district 33-8 is not 1930 district 33-8.</w:t>
+      </w:r>
+      <w:r>
+        <w:t xml:space="preserve"> [C1152] [S841]</w:t>
+      </w:r>
+    </w:p>
+    <w:p>
+      <w:r>
+        <w:t>The official 1950 descriptions agree. Page 2: 33-5 is that part of Ravenna city bounded by the city limits and by Broadway, 8th, Main, 6th, Poplar, and Hudson Drive. 33-8 is Millers Creek east of the Fitchburg Furnace Branch–Knowlton Road and north of State Highway 52. Page 3: 33-11 is Station Camp north and east of the South Irvine–Leighton Road via Ola to the southeast county line. 33-12 is Station Camp west and south of the same road. [C1153] [C1154] [S842]</w:t>
+      </w:r>
+    </w:p>
+    <w:p>
+      <w:r>
+        <w:t xml:space="preserve">The 1950 Estill name index still has three Newnam households and zero Newman: Fred in 33-1, Harding in 33-13, Vertie in 33-6 — already identified. None of them sits in 33-11 or 33-12. That is a </w:t>
+      </w:r>
+      <w:r>
+        <w:rPr>
+          <w:b/>
+        </w:rPr>
+        <w:t>probable</w:t>
+      </w:r>
+      <w:r>
+        <w:t xml:space="preserve"> Station Camp name-index negative for Boyd and Allie. Two API “Boyd” tokens on 33-12 fail the same-person test. Sheet 13, 12 April 1950: a nineteen-year-old farmer named Boyd in a McKamey house — rejected against a man who would have been about seventy-five. Sheet 24: the OCR token sits in a Marcum household with no Newman surname. [C1155] [C1156] [C1157] [S843] [S844] [S845]</w:t>
+      </w:r>
+    </w:p>
+    <w:p>
+      <w:r>
+        <w:t>The other free ladders did not move. Genealogy Trails’ Lee World War I tables still have no Newnam, Newman, or McCoy; the N table is still unpublished. Kenton County’s library lists Owsley draft cards on site. Internet Archive has no M1509 Kentucky item. The USGenNet Lee wills landing is live this pass — Mary Jane Steele Newman, Elizabeth Newnam, Mary F. Newnam Tincher — and still has no Samuel P. The court page is still a 404. Chronicling America returned thirty-three 1926 “Dora Stone” pages and none of them is Yell, Ola, Danville, or Dardanelle. The *Malvern Times-Journal* of 1 April 1926 is the wrong Arkansas county and the wrong month. Genealogy Trails still lists the *Danville Democrat*, the *Yell County Journal*, and the *Dardanelle Post-Dispatch*; none is digitized here; the obituary pages are nil. Madison obituaries are still nil for Newman. Woodford County Historical Society still sells Duell-Clark, 1958–1978, for ten dollars. FamilySearch 127913, 1146342, and 520482 rendered a login shell — roadblock step 51. Do not re-ask the clerk. Do not print 1966 as fact. [C1158] [C1159] [C1160] [C1161] [C1162] [C1163] [C1164] [C1165] [C1166] [S846] [S847] [S848] [S849] [S850] [S851] [S852] [S853]</w:t>
+      </w:r>
+    </w:p>
+    <w:p>
+      <w:r>
+        <w:t xml:space="preserve">John 38 and Jennie stay </w:t>
+      </w:r>
+      <w:r>
+        <w:rPr>
+          <w:b/>
+        </w:rPr>
+        <w:t>rejected</w:t>
+      </w:r>
+      <w:r>
+        <w:t xml:space="preserve">. Floyd is still </w:t>
+      </w:r>
+      <w:r>
+        <w:rPr>
+          <w:b/>
+        </w:rPr>
+        <w:t>not merged</w:t>
+      </w:r>
+      <w:r>
+        <w:t xml:space="preserve"> with Boyd. 1950 district 33-8 is Millers Creek and is </w:t>
+      </w:r>
+      <w:r>
+        <w:rPr>
+          <w:b/>
+        </w:rPr>
+        <w:t>not</w:t>
+      </w:r>
+      <w:r>
+        <w:t xml:space="preserve"> a substitute for 1930 Station Camp South. The Station Camp 1950 index is </w:t>
+      </w:r>
+      <w:r>
+        <w:rPr>
+          <w:b/>
+        </w:rPr>
+        <w:t>probable</w:t>
+      </w:r>
+      <w:r>
+        <w:t xml:space="preserve"> empty of Boyd and Allie. The nineteen-year-old Boyd is </w:t>
+      </w:r>
+      <w:r>
+        <w:rPr>
+          <w:b/>
+        </w:rPr>
+        <w:t>not</w:t>
+      </w:r>
+      <w:r>
+        <w:t xml:space="preserve"> that man. Cora P., fifty-six, with Charlie Plummer beside her, is still </w:t>
+      </w:r>
+      <w:r>
+        <w:rPr>
+          <w:b/>
+        </w:rPr>
+        <w:t>proven</w:t>
+      </w:r>
+      <w:r>
+        <w:t xml:space="preserve"> the minister’s widow. Do not print 1966 or 1976 as proven deaths. Do not print Floyd as Boyd. Do not print 1962 as McCoy’s death. Do not print the 1942 Combs charge as fact. [C1167]</w:t>
       </w:r>
     </w:p>
     <w:p>
@@ -10848,6 +11036,78 @@
         <w:rPr>
           <w:b/>
         </w:rPr>
+        <w:t>B089</w:t>
+      </w:r>
+      <w:r>
+        <w:t xml:space="preserve"> Estill </w:t>
+      </w:r>
+      <w:r>
+        <w:rPr>
+          <w:b/>
+        </w:rPr>
+        <w:t>1930 33-8</w:t>
+      </w:r>
+      <w:r>
+        <w:t xml:space="preserve"> on FS/Ancestry/NARA film (absent IA 742; </w:t>
+      </w:r>
+      <w:r>
+        <w:rPr>
+          <w:b/>
+        </w:rPr>
+        <w:t>743</w:t>
+      </w:r>
+      <w:r>
+        <w:t xml:space="preserve"> is Fayette; stamped </w:t>
+      </w:r>
+      <w:r>
+        <w:rPr>
+          <w:b/>
+        </w:rPr>
+        <w:t>095A–102B</w:t>
+      </w:r>
+      <w:r>
+        <w:t xml:space="preserve"> unpublished; </w:t>
+      </w:r>
+      <w:r>
+        <w:rPr>
+          <w:b/>
+        </w:rPr>
+        <w:t>33-5</w:t>
+      </w:r>
+      <w:r>
+        <w:t xml:space="preserve"> also unpublished) + </w:t>
+      </w:r>
+      <w:r>
+        <w:rPr>
+          <w:b/>
+        </w:rPr>
+        <w:t>M1930 roll 15</w:t>
+      </w:r>
+      <w:r>
+        <w:t xml:space="preserve"> / </w:t>
+      </w:r>
+      <w:r>
+        <w:rPr>
+          <w:b/>
+        </w:rPr>
+        <w:t>A3378 roll 22</w:t>
+      </w:r>
+      <w:r>
+        <w:t xml:space="preserve"> Estill maps + FS </w:t>
+      </w:r>
+      <w:r>
+        <w:rPr>
+          <w:b/>
+        </w:rPr>
+        <w:t>520482</w:t>
+      </w:r>
+      <w:r>
+        <w:t xml:space="preserve">, </w:t>
+      </w:r>
+      <w:r>
+        <w:rPr>
+          <w:b/>
+        </w:rPr>
         <w:t>B088</w:t>
       </w:r>
       <w:r>
@@ -10860,85 +11120,103 @@
         <w:t>242</w:t>
       </w:r>
       <w:r>
-        <w:t xml:space="preserve"> + remaining Clifty after sheet 1 (NARA/FS/Ancestry T625-602 remainder — still not on a free IA item; compiled Wolfe letter files including </w:t>
-      </w:r>
-      <w:r>
-        <w:rPr>
-          <w:b/>
-        </w:rPr>
-        <w:t>1920g/h/i/k</w:t>
-      </w:r>
-      <w:r>
-        <w:t xml:space="preserve"> remain a </w:t>
-      </w:r>
-      <w:r>
-        <w:rPr>
-          <w:b/>
-        </w:rPr>
-        <w:t>probable</w:t>
-      </w:r>
-      <w:r>
-        <w:t xml:space="preserve"> county-level name-negative), </w:t>
-      </w:r>
-      <w:r>
-        <w:rPr>
-          <w:b/>
-        </w:rPr>
-        <w:t>B089</w:t>
-      </w:r>
-      <w:r>
-        <w:t xml:space="preserve"> Estill </w:t>
-      </w:r>
-      <w:r>
-        <w:rPr>
-          <w:b/>
-        </w:rPr>
-        <w:t>33-8</w:t>
-      </w:r>
-      <w:r>
-        <w:t xml:space="preserve"> on FS/Ancestry/NARA film (absent IA 742; </w:t>
-      </w:r>
-      <w:r>
-        <w:rPr>
-          <w:b/>
-        </w:rPr>
-        <w:t>743</w:t>
-      </w:r>
-      <w:r>
-        <w:t xml:space="preserve"> is Fayette; stamped </w:t>
-      </w:r>
-      <w:r>
-        <w:rPr>
-          <w:b/>
-        </w:rPr>
-        <w:t>095A–102B</w:t>
-      </w:r>
-      <w:r>
-        <w:t xml:space="preserve"> unpublished; </w:t>
-      </w:r>
-      <w:r>
-        <w:rPr>
-          <w:b/>
-        </w:rPr>
-        <w:t>33-5</w:t>
-      </w:r>
-      <w:r>
-        <w:t xml:space="preserve"> also unpublished) + M1930 roll </w:t>
-      </w:r>
-      <w:r>
-        <w:rPr>
-          <w:b/>
-        </w:rPr>
-        <w:t>22</w:t>
-      </w:r>
-      <w:r>
-        <w:t xml:space="preserve"> map + FS </w:t>
-      </w:r>
-      <w:r>
-        <w:rPr>
-          <w:b/>
-        </w:rPr>
-        <w:t>520482</w:t>
+        <w:t xml:space="preserve"> catalog already </w:t>
+      </w:r>
+      <w:r>
+        <w:rPr>
+          <w:b/>
+        </w:rPr>
+        <w:t>proven</w:t>
+      </w:r>
+      <w:r>
+        <w:t xml:space="preserve"> — do not stall (NARA/FS/Ancestry T625-602 remainder only), </w:t>
+      </w:r>
+      <w:r>
+        <w:rPr>
+          <w:b/>
+        </w:rPr>
+        <w:t>B045</w:t>
+      </w:r>
+      <w:r>
+        <w:t xml:space="preserve"> (FS </w:t>
+      </w:r>
+      <w:r>
+        <w:rPr>
+          <w:b/>
+        </w:rPr>
+        <w:t>127913 / 127891</w:t>
+      </w:r>
+      <w:r>
+        <w:t xml:space="preserve">) and </w:t>
+      </w:r>
+      <w:r>
+        <w:rPr>
+          <w:b/>
+        </w:rPr>
+        <w:t>B061</w:t>
+      </w:r>
+      <w:r>
+        <w:t xml:space="preserve"> (</w:t>
+      </w:r>
+      <w:r>
+        <w:rPr>
+          <w:b/>
+        </w:rPr>
+        <w:t>127869 / 964964</w:t>
+      </w:r>
+      <w:r>
+        <w:t xml:space="preserve">, clerk </w:t>
+      </w:r>
+      <w:r>
+        <w:rPr>
+          <w:b/>
+        </w:rPr>
+        <w:t>Tyler Phillips</w:t>
+      </w:r>
+      <w:r>
+        <w:t xml:space="preserve"> already recorded — do not re-ask), </w:t>
+      </w:r>
+      <w:r>
+        <w:rPr>
+          <w:b/>
+        </w:rPr>
+        <w:t>B087</w:t>
+      </w:r>
+      <w:r>
+        <w:t xml:space="preserve"> 1942 Combs charge, </w:t>
+      </w:r>
+      <w:r>
+        <w:rPr>
+          <w:b/>
+        </w:rPr>
+        <w:t>B069/B047</w:t>
+      </w:r>
+      <w:r>
+        <w:t xml:space="preserve"> M1509 </w:t>
+      </w:r>
+      <w:r>
+        <w:rPr>
+          <w:b/>
+        </w:rPr>
+        <w:t>KY45</w:t>
+      </w:r>
+      <w:r>
+        <w:t xml:space="preserve"> cards, </w:t>
+      </w:r>
+      <w:r>
+        <w:rPr>
+          <w:b/>
+        </w:rPr>
+        <w:t>B082</w:t>
+      </w:r>
+      <w:r>
+        <w:t xml:space="preserve"> Duell-Clark volumes / KHS 1957–1969 / cert </w:t>
+      </w:r>
+      <w:r>
+        <w:rPr>
+          <w:b/>
+        </w:rPr>
+        <w:t>17762</w:t>
       </w:r>
       <w:r>
         <w:t xml:space="preserve">, </w:t>
@@ -10947,88 +11225,7 @@
         <w:rPr>
           <w:b/>
         </w:rPr>
-        <w:t>B045</w:t>
-      </w:r>
-      <w:r>
-        <w:t xml:space="preserve"> (FS </w:t>
-      </w:r>
-      <w:r>
-        <w:rPr>
-          <w:b/>
-        </w:rPr>
-        <w:t>127913 / 127891</w:t>
-      </w:r>
-      <w:r>
-        <w:t xml:space="preserve">) and </w:t>
-      </w:r>
-      <w:r>
-        <w:rPr>
-          <w:b/>
-        </w:rPr>
-        <w:t>B061</w:t>
-      </w:r>
-      <w:r>
-        <w:t xml:space="preserve"> (</w:t>
-      </w:r>
-      <w:r>
-        <w:rPr>
-          <w:b/>
-        </w:rPr>
-        <w:t>127869 / 964964</w:t>
-      </w:r>
-      <w:r>
-        <w:t xml:space="preserve">, clerk </w:t>
-      </w:r>
-      <w:r>
-        <w:rPr>
-          <w:b/>
-        </w:rPr>
-        <w:t>Tyler Phillips</w:t>
-      </w:r>
-      <w:r>
-        <w:t xml:space="preserve"> already recorded — do not re-ask), </w:t>
-      </w:r>
-      <w:r>
-        <w:rPr>
-          <w:b/>
-        </w:rPr>
-        <w:t>B087</w:t>
-      </w:r>
-      <w:r>
-        <w:t xml:space="preserve"> 1942 Combs charge, </w:t>
-      </w:r>
-      <w:r>
-        <w:rPr>
-          <w:b/>
-        </w:rPr>
-        <w:t>B069/B047</w:t>
-      </w:r>
-      <w:r>
-        <w:t xml:space="preserve"> M1509 </w:t>
-      </w:r>
-      <w:r>
-        <w:rPr>
-          <w:b/>
-        </w:rPr>
-        <w:t>KY45</w:t>
-      </w:r>
-      <w:r>
-        <w:t xml:space="preserve"> cards, </w:t>
-      </w:r>
-      <w:r>
-        <w:rPr>
-          <w:b/>
-        </w:rPr>
-        <w:t>B082</w:t>
-      </w:r>
-      <w:r>
-        <w:t xml:space="preserve"> Duell-Clark volumes / KHS 1957–1969 / cert </w:t>
-      </w:r>
-      <w:r>
-        <w:rPr>
-          <w:b/>
-        </w:rPr>
-        <w:t>17762</w:t>
+        <w:t>B083</w:t>
       </w:r>
       <w:r>
         <w:t xml:space="preserve">, </w:t>
@@ -11037,28 +11234,10 @@
         <w:rPr>
           <w:b/>
         </w:rPr>
-        <w:t>B083</w:t>
-      </w:r>
-      <w:r>
-        <w:t xml:space="preserve">, </w:t>
-      </w:r>
-      <w:r>
-        <w:rPr>
-          <w:b/>
-        </w:rPr>
         <w:t>B085</w:t>
       </w:r>
       <w:r>
-        <w:t xml:space="preserve"> McCoy after 1930 (1950 Owsley/Lee/Estill/Wolfe McCoy API </w:t>
-      </w:r>
-      <w:r>
-        <w:rPr>
-          <w:b/>
-        </w:rPr>
-        <w:t>0</w:t>
-      </w:r>
-      <w:r>
-        <w:t xml:space="preserve">; 447-20-2466 not merged; Barney McCoy AR rejected), </w:t>
+        <w:t xml:space="preserve"> McCoy after 1930, </w:t>
       </w:r>
       <w:r>
         <w:rPr>
@@ -11076,52 +11255,7 @@
         <w:t>B055/B080</w:t>
       </w:r>
       <w:r>
-        <w:t xml:space="preserve"> Madison DC / Hutchins *Citizen* June 1958 / unpublished Berea 1940 / Combs funeral (1930 Berea/Glade </w:t>
-      </w:r>
-      <w:r>
-        <w:rPr>
-          <w:b/>
-        </w:rPr>
-        <w:t>76-16–76-19</w:t>
-      </w:r>
-      <w:r>
-        <w:t xml:space="preserve"> closed; 1940 published Madison precincts </w:t>
-      </w:r>
-      <w:r>
-        <w:rPr>
-          <w:b/>
-        </w:rPr>
-        <w:t>nil</w:t>
-      </w:r>
-      <w:r>
-        <w:t xml:space="preserve">; remaining Madison 1950 adult Newman males </w:t>
-      </w:r>
-      <w:r>
-        <w:rPr>
-          <w:b/>
-        </w:rPr>
-        <w:t>rejected</w:t>
-      </w:r>
-      <w:r>
-        <w:t xml:space="preserve">; CA *Citizen* ends </w:t>
-      </w:r>
-      <w:r>
-        <w:rPr>
-          <w:b/>
-        </w:rPr>
-        <w:t>28 Dec 1922</w:t>
-      </w:r>
-      <w:r>
-        <w:t xml:space="preserve">), </w:t>
-      </w:r>
-      <w:r>
-        <w:rPr>
-          <w:b/>
-        </w:rPr>
-        <w:t>B079</w:t>
-      </w:r>
-      <w:r>
-        <w:t xml:space="preserve">, </w:t>
+        <w:t xml:space="preserve"> Madison DC / Hutchins *Citizen* June 1958 / unpublished Berea 1940 / Combs funeral, </w:t>
       </w:r>
       <w:r>
         <w:rPr>
@@ -11139,7 +11273,7 @@
         <w:t>sn90050035</w:t>
       </w:r>
       <w:r>
-        <w:t xml:space="preserve"> not digitized).</w:t>
+        <w:t xml:space="preserve"> not digitized; CA 1926 no Yell hit).</w:t>
       </w:r>
     </w:p>
     <w:p>
@@ -21786,7 +21920,157 @@
     </w:p>
     <w:p>
       <w:r>
-        <w:t xml:space="preserve">177. Official NARA [M1930 ED maps](https://www.archives.gov/research/census/1930/enumeration-districts-maps.html): roll </w:t>
+        <w:t xml:space="preserve">177. Official NARA [1930 ED maps](https://www.archives.gov/research/census/1930/enumeration-districts-maps.html): </w:t>
+      </w:r>
+      <w:r>
+        <w:rPr>
+          <w:b/>
+        </w:rPr>
+        <w:t>M1930</w:t>
+      </w:r>
+      <w:r>
+        <w:t xml:space="preserve"> roll </w:t>
+      </w:r>
+      <w:r>
+        <w:rPr>
+          <w:b/>
+        </w:rPr>
+        <w:t>15</w:t>
+      </w:r>
+      <w:r>
+        <w:t xml:space="preserve"> = entire Kentucky. The Adair–Henderson / Henry–Woodford split is </w:t>
+      </w:r>
+      <w:r>
+        <w:rPr>
+          <w:b/>
+        </w:rPr>
+        <w:t>A3378</w:t>
+      </w:r>
+      <w:r>
+        <w:t xml:space="preserve"> rolls </w:t>
+      </w:r>
+      <w:r>
+        <w:rPr>
+          <w:b/>
+        </w:rPr>
+        <w:t>22/23</w:t>
+      </w:r>
+      <w:r>
+        <w:t xml:space="preserve">, not M1930. Pass 97 IDs </w:t>
+      </w:r>
+      <w:r>
+        <w:rPr>
+          <w:b/>
+        </w:rPr>
+        <w:t>withdrawn</w:t>
+      </w:r>
+      <w:r>
+        <w:t xml:space="preserve"> (</w:t>
+      </w:r>
+      <w:r>
+        <w:rPr>
+          <w:b/>
+        </w:rPr>
+        <w:t>C1056 / C1150</w:t>
+      </w:r>
+      <w:r>
+        <w:t xml:space="preserve">). Maps unread. *Pamphlet.* </w:t>
+      </w:r>
+      <w:r>
+        <w:rPr>
+          <w:b/>
+        </w:rPr>
+        <w:t>S745 S770 S838</w:t>
+      </w:r>
+      <w:r>
+        <w:t>.</w:t>
+      </w:r>
+    </w:p>
+    <w:p>
+      <w:r>
+        <w:t xml:space="preserve">178. LDS 1940 [Richmond](https://ldsgenealogy.com/KY/1940-Census-Richmond-KY.htm) / [Kirksville](https://ldsgenealogy.com/KY/1940-Census-Kirksville-KY.htm) / [Million](https://ldsgenealogy.com/KY/1940-Census-Million-KY.htm) / [Union](https://ldsgenealogy.com/KY/1940-Census-Union-in-Madison-County-KY.htm) </w:t>
+      </w:r>
+      <w:r>
+        <w:rPr>
+          <w:b/>
+        </w:rPr>
+        <w:t>nil</w:t>
+      </w:r>
+      <w:r>
+        <w:t xml:space="preserve"> Newman. Berea/Glade unpublished. *Index only / catalog.* </w:t>
+      </w:r>
+      <w:r>
+        <w:rPr>
+          <w:b/>
+        </w:rPr>
+        <w:t>C1058–C1062</w:t>
+      </w:r>
+      <w:r>
+        <w:t xml:space="preserve"> </w:t>
+      </w:r>
+      <w:r>
+        <w:rPr>
+          <w:b/>
+        </w:rPr>
+        <w:t>S747–S751</w:t>
+      </w:r>
+      <w:r>
+        <w:t>.</w:t>
+      </w:r>
+    </w:p>
+    <w:p>
+      <w:r>
+        <w:t xml:space="preserve">179. LDS 1940 [Beattyville](https://ldsgenealogy.com/KY/1940-Census-Beattyville-KY.htm) Luther ~1891 + Cora ~1894 </w:t>
+      </w:r>
+      <w:r>
+        <w:rPr>
+          <w:b/>
+        </w:rPr>
+        <w:t>PROBABLE</w:t>
+      </w:r>
+      <w:r>
+        <w:t xml:space="preserve"> C305. [Heidelberg](https://ldsgenealogy.com/KY/1940-Census-Heidelberg-KY.htm) Grand ~1878 + Martha </w:t>
+      </w:r>
+      <w:r>
+        <w:rPr>
+          <w:b/>
+        </w:rPr>
+        <w:t>PROBABLE</w:t>
+      </w:r>
+      <w:r>
+        <w:t xml:space="preserve"> Grant C378. Saint Helens Mary J ~1856 </w:t>
+      </w:r>
+      <w:r>
+        <w:rPr>
+          <w:b/>
+        </w:rPr>
+        <w:t>rejected</w:t>
+      </w:r>
+      <w:r>
+        <w:t xml:space="preserve">. New Virginia nil. *Index only.* </w:t>
+      </w:r>
+      <w:r>
+        <w:rPr>
+          <w:b/>
+        </w:rPr>
+        <w:t>C1063–C1067 C1079</w:t>
+      </w:r>
+      <w:r>
+        <w:t xml:space="preserve"> </w:t>
+      </w:r>
+      <w:r>
+        <w:rPr>
+          <w:b/>
+        </w:rPr>
+        <w:t>S752–S755</w:t>
+      </w:r>
+      <w:r>
+        <w:t>.</w:t>
+      </w:r>
+    </w:p>
+    <w:p>
+      <w:r>
+        <w:t xml:space="preserve">180. NARA [1950 Fayette Newman API](https://1950census.archives.gov/): total </w:t>
       </w:r>
       <w:r>
         <w:rPr>
@@ -21795,16 +22079,1148 @@
         <w:t>22</w:t>
       </w:r>
       <w:r>
-        <w:t xml:space="preserve"> = KY Adair–Henderson (</w:t>
-      </w:r>
-      <w:r>
-        <w:rPr>
-          <w:b/>
-        </w:rPr>
-        <w:t>Estill</w:t>
-      </w:r>
-      <w:r>
-        <w:t xml:space="preserve">); roll </w:t>
+        <w:t xml:space="preserve"> / Newnam </w:t>
+      </w:r>
+      <w:r>
+        <w:rPr>
+          <w:b/>
+        </w:rPr>
+        <w:t>3</w:t>
+      </w:r>
+      <w:r>
+        <w:t xml:space="preserve"> — no Boyd/Allie. LOC [*Yell County Journal* sn90050035](https://www.loc.gov/item/sn90050035/) </w:t>
+      </w:r>
+      <w:r>
+        <w:rPr>
+          <w:b/>
+        </w:rPr>
+        <w:t>not</w:t>
+      </w:r>
+      <w:r>
+        <w:t xml:space="preserve"> digitized. WCHS [Duell-Clark 1958–1978](https://www.woodfordcountykyhistoricalsociety.com/booksandpublications) $10. FS SPA (R011-47). *Index / catalog.* </w:t>
+      </w:r>
+      <w:r>
+        <w:rPr>
+          <w:b/>
+        </w:rPr>
+        <w:t>C1068 C1069 C1071 C1076</w:t>
+      </w:r>
+      <w:r>
+        <w:t xml:space="preserve"> </w:t>
+      </w:r>
+      <w:r>
+        <w:rPr>
+          <w:b/>
+        </w:rPr>
+        <w:t>S756 S757 S759 S763</w:t>
+      </w:r>
+      <w:r>
+        <w:t>.</w:t>
+      </w:r>
+    </w:p>
+    <w:p>
+      <w:r>
+        <w:t xml:space="preserve">181. IA [`14thcensusofpopu602unit`](https://archive.org/details/14thcensusofpopu602unit) still </w:t>
+      </w:r>
+      <w:r>
+        <w:rPr>
+          <w:b/>
+        </w:rPr>
+        <w:t>515</w:t>
+      </w:r>
+      <w:r>
+        <w:t xml:space="preserve"> images; Solr no remainder item. LDS 1940 [Stillwater](https://ldsgenealogy.com/KY/1940-Census-Stillwater-KY.htm) Mae ~1905 only. NARA 1950 Wolfe 0/0. *Catalog / index only.* </w:t>
+      </w:r>
+      <w:r>
+        <w:rPr>
+          <w:b/>
+        </w:rPr>
+        <w:t>C1081–C1083</w:t>
+      </w:r>
+      <w:r>
+        <w:t xml:space="preserve"> </w:t>
+      </w:r>
+      <w:r>
+        <w:rPr>
+          <w:b/>
+        </w:rPr>
+        <w:t>S771–S773</w:t>
+      </w:r>
+      <w:r>
+        <w:t>.</w:t>
+      </w:r>
+    </w:p>
+    <w:p>
+      <w:r>
+        <w:t xml:space="preserve">182. LDS 1940 [Midway](https://ldsgenealogy.com/KY/1940-Census-Midway-KY.htm) nil. [Market House](https://ldsgenealogy.com/KY/1940-Census-Market-House-KY.htm) Hubert ~1878 + Orie ~1888 </w:t>
+      </w:r>
+      <w:r>
+        <w:rPr>
+          <w:b/>
+        </w:rPr>
+        <w:t>rejected</w:t>
+      </w:r>
+      <w:r>
+        <w:t xml:space="preserve"> vs John L. [Foxtown](https://ldsgenealogy.com/KY/1940-Census-Foxtown-KY.htm) is </w:t>
+      </w:r>
+      <w:r>
+        <w:rPr>
+          <w:b/>
+        </w:rPr>
+        <w:t>Jackson</w:t>
+      </w:r>
+      <w:r>
+        <w:t xml:space="preserve">: Shelby ~1893 + Grace ~1898 </w:t>
+      </w:r>
+      <w:r>
+        <w:rPr>
+          <w:b/>
+        </w:rPr>
+        <w:t>PROBABLE</w:t>
+      </w:r>
+      <w:r>
+        <w:t xml:space="preserve"> C309. Paint Lick is </w:t>
+      </w:r>
+      <w:r>
+        <w:rPr>
+          <w:b/>
+        </w:rPr>
+        <w:t>Garrard</w:t>
+      </w:r>
+      <w:r>
+        <w:t xml:space="preserve">. *Index only.* </w:t>
+      </w:r>
+      <w:r>
+        <w:rPr>
+          <w:b/>
+        </w:rPr>
+        <w:t>C1084–C1088</w:t>
+      </w:r>
+      <w:r>
+        <w:t xml:space="preserve"> </w:t>
+      </w:r>
+      <w:r>
+        <w:rPr>
+          <w:b/>
+        </w:rPr>
+        <w:t>S774–S777</w:t>
+      </w:r>
+      <w:r>
+        <w:t>.</w:t>
+      </w:r>
+    </w:p>
+    <w:p>
+      <w:r>
+        <w:t xml:space="preserve">183. 1950 Lee ED </w:t>
+      </w:r>
+      <w:r>
+        <w:rPr>
+          <w:b/>
+        </w:rPr>
+        <w:t>65-1</w:t>
+      </w:r>
+      <w:r>
+        <w:t xml:space="preserve"> sh </w:t>
+      </w:r>
+      <w:r>
+        <w:rPr>
+          <w:b/>
+        </w:rPr>
+        <w:t>0020</w:t>
+      </w:r>
+      <w:r>
+        <w:t xml:space="preserve"> hh </w:t>
+      </w:r>
+      <w:r>
+        <w:rPr>
+          <w:b/>
+        </w:rPr>
+        <w:t>198</w:t>
+      </w:r>
+      <w:r>
+        <w:t xml:space="preserve"> Luther D. </w:t>
+      </w:r>
+      <w:r>
+        <w:rPr>
+          <w:b/>
+        </w:rPr>
+        <w:t>28</w:t>
+      </w:r>
+      <w:r>
+        <w:t xml:space="preserve"> + Cora P. </w:t>
+      </w:r>
+      <w:r>
+        <w:rPr>
+          <w:b/>
+        </w:rPr>
+        <w:t>28</w:t>
+      </w:r>
+      <w:r>
+        <w:t xml:space="preserve"> </w:t>
+      </w:r>
+      <w:r>
+        <w:rPr>
+          <w:b/>
+        </w:rPr>
+        <w:t>rejected</w:t>
+      </w:r>
+      <w:r>
+        <w:t xml:space="preserve"> vs C305. sh </w:t>
+      </w:r>
+      <w:r>
+        <w:rPr>
+          <w:b/>
+        </w:rPr>
+        <w:t>0021</w:t>
+      </w:r>
+      <w:r>
+        <w:t xml:space="preserve"> hh </w:t>
+      </w:r>
+      <w:r>
+        <w:rPr>
+          <w:b/>
+        </w:rPr>
+        <w:t>196</w:t>
+      </w:r>
+      <w:r>
+        <w:t xml:space="preserve"> Cora P. </w:t>
+      </w:r>
+      <w:r>
+        <w:rPr>
+          <w:b/>
+        </w:rPr>
+        <w:t>56</w:t>
+      </w:r>
+      <w:r>
+        <w:t xml:space="preserve"> widow + [Charlie Plummer brother </w:t>
+      </w:r>
+      <w:r>
+        <w:rPr>
+          <w:b/>
+        </w:rPr>
+        <w:t>55</w:t>
+      </w:r>
+      <w:r>
+        <w:t xml:space="preserve">](https://1950census.archives.gov/) </w:t>
+      </w:r>
+      <w:r>
+        <w:rPr>
+          <w:b/>
+        </w:rPr>
+        <w:t>PROVEN</w:t>
+      </w:r>
+      <w:r>
+        <w:t xml:space="preserve"> Cora Plummer widow. *Image seen.* </w:t>
+      </w:r>
+      <w:r>
+        <w:rPr>
+          <w:b/>
+        </w:rPr>
+        <w:t>C1089 C1090 C1108</w:t>
+      </w:r>
+      <w:r>
+        <w:t xml:space="preserve"> </w:t>
+      </w:r>
+      <w:r>
+        <w:rPr>
+          <w:b/>
+        </w:rPr>
+        <w:t>S778 S779 S797</w:t>
+      </w:r>
+      <w:r>
+        <w:t>.</w:t>
+      </w:r>
+    </w:p>
+    <w:p>
+      <w:r>
+        <w:t xml:space="preserve">184. FS SPA (R011-48). LDS FHL2 Estill abstracts → FS [520482](https://www.familysearch.org/search/catalog/520482) unread. AHGP/us-census: </w:t>
+      </w:r>
+      <w:r>
+        <w:rPr>
+          <w:b/>
+        </w:rPr>
+        <w:t>33-8</w:t>
+      </w:r>
+      <w:r>
+        <w:t xml:space="preserve"> on T626-742 reel; IA scan still missing. *Catalog.* </w:t>
+      </w:r>
+      <w:r>
+        <w:rPr>
+          <w:b/>
+        </w:rPr>
+        <w:t>C1094–C1096</w:t>
+      </w:r>
+      <w:r>
+        <w:t xml:space="preserve"> </w:t>
+      </w:r>
+      <w:r>
+        <w:rPr>
+          <w:b/>
+        </w:rPr>
+        <w:t>S783–S785</w:t>
+      </w:r>
+      <w:r>
+        <w:t>.</w:t>
+      </w:r>
+    </w:p>
+    <w:p>
+      <w:r>
+        <w:t xml:space="preserve">185. NARA [1950 Lee Newman API](https://1950census.archives.gov/): </w:t>
+      </w:r>
+      <w:r>
+        <w:rPr>
+          <w:b/>
+        </w:rPr>
+        <w:t>7</w:t>
+      </w:r>
+      <w:r>
+        <w:t xml:space="preserve"> / Newnam </w:t>
+      </w:r>
+      <w:r>
+        <w:rPr>
+          <w:b/>
+        </w:rPr>
+        <w:t>4</w:t>
+      </w:r>
+      <w:r>
+        <w:t xml:space="preserve"> — no McCoy/Frank/John L/Boyd. Owsley McCoy </w:t>
+      </w:r>
+      <w:r>
+        <w:rPr>
+          <w:b/>
+        </w:rPr>
+        <w:t>0</w:t>
+      </w:r>
+      <w:r>
+        <w:t xml:space="preserve">; Clarence </w:t>
+      </w:r>
+      <w:r>
+        <w:rPr>
+          <w:b/>
+        </w:rPr>
+        <w:t>38</w:t>
+      </w:r>
+      <w:r>
+        <w:t xml:space="preserve"> reconfirm. Lee </w:t>
+      </w:r>
+      <w:r>
+        <w:rPr>
+          <w:b/>
+        </w:rPr>
+        <w:t>65-1</w:t>
+      </w:r>
+      <w:r>
+        <w:t xml:space="preserve"> sh </w:t>
+      </w:r>
+      <w:r>
+        <w:rPr>
+          <w:b/>
+        </w:rPr>
+        <w:t>0010</w:t>
+      </w:r>
+      <w:r>
+        <w:t xml:space="preserve"> Thomas Ray </w:t>
+      </w:r>
+      <w:r>
+        <w:rPr>
+          <w:b/>
+        </w:rPr>
+        <w:t>27</w:t>
+      </w:r>
+      <w:r>
+        <w:t xml:space="preserve"> </w:t>
+      </w:r>
+      <w:r>
+        <w:rPr>
+          <w:b/>
+        </w:rPr>
+        <w:t>rejected</w:t>
+      </w:r>
+      <w:r>
+        <w:t xml:space="preserve">; </w:t>
+      </w:r>
+      <w:r>
+        <w:rPr>
+          <w:b/>
+        </w:rPr>
+        <w:t>65-13</w:t>
+      </w:r>
+      <w:r>
+        <w:t xml:space="preserve"> Martha </w:t>
+      </w:r>
+      <w:r>
+        <w:rPr>
+          <w:b/>
+        </w:rPr>
+        <w:t>51</w:t>
+      </w:r>
+      <w:r>
+        <w:t xml:space="preserve"> wd </w:t>
+      </w:r>
+      <w:r>
+        <w:rPr>
+          <w:b/>
+        </w:rPr>
+        <w:t>rejected</w:t>
+      </w:r>
+      <w:r>
+        <w:t xml:space="preserve"> vs Grant’s widow; Johnia </w:t>
+      </w:r>
+      <w:r>
+        <w:rPr>
+          <w:b/>
+        </w:rPr>
+        <w:t>54</w:t>
+      </w:r>
+      <w:r>
+        <w:t xml:space="preserve"> </w:t>
+      </w:r>
+      <w:r>
+        <w:rPr>
+          <w:b/>
+        </w:rPr>
+        <w:t>rejected</w:t>
+      </w:r>
+      <w:r>
+        <w:t xml:space="preserve"> vs John L; </w:t>
+      </w:r>
+      <w:r>
+        <w:rPr>
+          <w:b/>
+        </w:rPr>
+        <w:t>65-12</w:t>
+      </w:r>
+      <w:r>
+        <w:t xml:space="preserve"> Dillard </w:t>
+      </w:r>
+      <w:r>
+        <w:rPr>
+          <w:b/>
+        </w:rPr>
+        <w:t>47</w:t>
+      </w:r>
+      <w:r>
+        <w:t xml:space="preserve"> </w:t>
+      </w:r>
+      <w:r>
+        <w:rPr>
+          <w:b/>
+        </w:rPr>
+        <w:t>rejected</w:t>
+      </w:r>
+      <w:r>
+        <w:t xml:space="preserve">; Jackson </w:t>
+      </w:r>
+      <w:r>
+        <w:rPr>
+          <w:b/>
+        </w:rPr>
+        <w:t>55-6</w:t>
+      </w:r>
+      <w:r>
+        <w:t xml:space="preserve"> Bonnie </w:t>
+      </w:r>
+      <w:r>
+        <w:rPr>
+          <w:b/>
+        </w:rPr>
+        <w:t>16</w:t>
+      </w:r>
+      <w:r>
+        <w:t xml:space="preserve"> sample. *Image seen / index.* </w:t>
+      </w:r>
+      <w:r>
+        <w:rPr>
+          <w:b/>
+        </w:rPr>
+        <w:t>C1100–C1107 C1109</w:t>
+      </w:r>
+      <w:r>
+        <w:t xml:space="preserve"> </w:t>
+      </w:r>
+      <w:r>
+        <w:rPr>
+          <w:b/>
+        </w:rPr>
+        <w:t>S789–S796 S798</w:t>
+      </w:r>
+      <w:r>
+        <w:t>.</w:t>
+      </w:r>
+    </w:p>
+    <w:p>
+      <w:r>
+        <w:t xml:space="preserve">186. LDS 1940 Jackson remaining [McKee](https://ldsgenealogy.com/KY/1940-Census-McKee-KY.htm) / Cavanaugh / Horse Lick / Pondcreek / Sturgeen </w:t>
+      </w:r>
+      <w:r>
+        <w:rPr>
+          <w:b/>
+        </w:rPr>
+        <w:t>nil</w:t>
+      </w:r>
+      <w:r>
+        <w:t xml:space="preserve">. [Clover Bottom](https://ldsgenealogy.com/KY/1940-Census-Clover-Bottom-KY.htm) Clinton H ~1910 + Gladys ~1906 </w:t>
+      </w:r>
+      <w:r>
+        <w:rPr>
+          <w:b/>
+        </w:rPr>
+        <w:t>rejected</w:t>
+      </w:r>
+      <w:r>
+        <w:t xml:space="preserve">. Alcorn = Greenup; Lost Creek = Perry. KYGenWeb [1920g/h/i/k](https://kygenweb.net/wolfe/census1.htm) </w:t>
+      </w:r>
+      <w:r>
+        <w:rPr>
+          <w:b/>
+        </w:rPr>
+        <w:t>nil</w:t>
+      </w:r>
+      <w:r>
+        <w:t xml:space="preserve">. FS </w:t>
+      </w:r>
+      <w:r>
+        <w:rPr>
+          <w:b/>
+        </w:rPr>
+        <w:t>403</w:t>
+      </w:r>
+      <w:r>
+        <w:t xml:space="preserve"> (R011-49). *Index / transcription / catalog.* </w:t>
+      </w:r>
+      <w:r>
+        <w:rPr>
+          <w:b/>
+        </w:rPr>
+        <w:t>C1110–C1118</w:t>
+      </w:r>
+      <w:r>
+        <w:t xml:space="preserve"> </w:t>
+      </w:r>
+      <w:r>
+        <w:rPr>
+          <w:b/>
+        </w:rPr>
+        <w:t>S799–S807</w:t>
+      </w:r>
+      <w:r>
+        <w:t>.</w:t>
+      </w:r>
+    </w:p>
+    <w:p>
+      <w:r>
+        <w:t xml:space="preserve">187. IA [`14thcensusofpopu602unit`](https://archive.org/details/14thcensusofpopu602unit) still </w:t>
+      </w:r>
+      <w:r>
+        <w:rPr>
+          <w:b/>
+        </w:rPr>
+        <w:t>515</w:t>
+      </w:r>
+      <w:r>
+        <w:t xml:space="preserve"> images; Solr `*602*` = </w:t>
+      </w:r>
+      <w:r>
+        <w:rPr>
+          <w:b/>
+        </w:rPr>
+        <w:t>602</w:t>
+      </w:r>
+      <w:r>
+        <w:t xml:space="preserve"> + </w:t>
+      </w:r>
+      <w:r>
+        <w:rPr>
+          <w:b/>
+        </w:rPr>
+        <w:t>1602</w:t>
+      </w:r>
+      <w:r>
+        <w:t xml:space="preserve"> only. KYGenWeb [Wolfe census1](https://kygenweb.net/wolfe/census1.htm) still lists 1920k Antioch </w:t>
+      </w:r>
+      <w:r>
+        <w:rPr>
+          <w:b/>
+        </w:rPr>
+        <w:t>242</w:t>
+      </w:r>
+      <w:r>
+        <w:t xml:space="preserve">. *Catalog.* </w:t>
+      </w:r>
+      <w:r>
+        <w:rPr>
+          <w:b/>
+        </w:rPr>
+        <w:t>C1119 C1120</w:t>
+      </w:r>
+      <w:r>
+        <w:t xml:space="preserve"> </w:t>
+      </w:r>
+      <w:r>
+        <w:rPr>
+          <w:b/>
+        </w:rPr>
+        <w:t>S808 S809</w:t>
+      </w:r>
+      <w:r>
+        <w:t>.</w:t>
+      </w:r>
+    </w:p>
+    <w:p>
+      <w:r>
+        <w:t xml:space="preserve">188. 1950 U.S. census, Estill ED </w:t>
+      </w:r>
+      <w:r>
+        <w:rPr>
+          <w:b/>
+        </w:rPr>
+        <w:t>33-1</w:t>
+      </w:r>
+      <w:r>
+        <w:t xml:space="preserve"> Irvine, NARA image [0003](https://1950census.archives.gov/), form sheet </w:t>
+      </w:r>
+      <w:r>
+        <w:rPr>
+          <w:b/>
+        </w:rPr>
+        <w:t>2</w:t>
+      </w:r>
+      <w:r>
+        <w:t xml:space="preserve">, 1 Apr 1950, hh </w:t>
+      </w:r>
+      <w:r>
+        <w:rPr>
+          <w:b/>
+        </w:rPr>
+        <w:t>14</w:t>
+      </w:r>
+      <w:r>
+        <w:t xml:space="preserve">: Newnam, Fred </w:t>
+      </w:r>
+      <w:r>
+        <w:rPr>
+          <w:b/>
+        </w:rPr>
+        <w:t>55</w:t>
+      </w:r>
+      <w:r>
+        <w:t xml:space="preserve"> + Era R </w:t>
+      </w:r>
+      <w:r>
+        <w:rPr>
+          <w:b/>
+        </w:rPr>
+        <w:t>52</w:t>
+      </w:r>
+      <w:r>
+        <w:t xml:space="preserve"> + Dorothy J </w:t>
+      </w:r>
+      <w:r>
+        <w:rPr>
+          <w:b/>
+        </w:rPr>
+        <w:t>19</w:t>
+      </w:r>
+      <w:r>
+        <w:t xml:space="preserve">. </w:t>
+      </w:r>
+      <w:r>
+        <w:rPr>
+          <w:b/>
+        </w:rPr>
+        <w:t>PROVEN</w:t>
+      </w:r>
+      <w:r>
+        <w:t xml:space="preserve"> 1940 Irvine couple; </w:t>
+      </w:r>
+      <w:r>
+        <w:rPr>
+          <w:b/>
+        </w:rPr>
+        <w:t>PROBABLE</w:t>
+      </w:r>
+      <w:r>
+        <w:t xml:space="preserve"> C387. *Image seen.* </w:t>
+      </w:r>
+      <w:r>
+        <w:rPr>
+          <w:b/>
+        </w:rPr>
+        <w:t>C1122 C1123</w:t>
+      </w:r>
+      <w:r>
+        <w:t xml:space="preserve"> </w:t>
+      </w:r>
+      <w:r>
+        <w:rPr>
+          <w:b/>
+        </w:rPr>
+        <w:t>S811</w:t>
+      </w:r>
+      <w:r>
+        <w:t>.</w:t>
+      </w:r>
+    </w:p>
+    <w:p>
+      <w:r>
+        <w:t xml:space="preserve">189. Estill 1950 </w:t>
+      </w:r>
+      <w:r>
+        <w:rPr>
+          <w:b/>
+        </w:rPr>
+        <w:t>33-13</w:t>
+      </w:r>
+      <w:r>
+        <w:t xml:space="preserve"> sh </w:t>
+      </w:r>
+      <w:r>
+        <w:rPr>
+          <w:b/>
+        </w:rPr>
+        <w:t>0021</w:t>
+      </w:r>
+      <w:r>
+        <w:t xml:space="preserve"> hh </w:t>
+      </w:r>
+      <w:r>
+        <w:rPr>
+          <w:b/>
+        </w:rPr>
+        <w:t>155</w:t>
+      </w:r>
+      <w:r>
+        <w:t xml:space="preserve"> Harding </w:t>
+      </w:r>
+      <w:r>
+        <w:rPr>
+          <w:b/>
+        </w:rPr>
+        <w:t>65</w:t>
+      </w:r>
+      <w:r>
+        <w:t xml:space="preserve"> + Sarah </w:t>
+      </w:r>
+      <w:r>
+        <w:rPr>
+          <w:b/>
+        </w:rPr>
+        <w:t>64</w:t>
+      </w:r>
+      <w:r>
+        <w:t xml:space="preserve"> </w:t>
+      </w:r>
+      <w:r>
+        <w:rPr>
+          <w:b/>
+        </w:rPr>
+        <w:t>rejected</w:t>
+      </w:r>
+      <w:r>
+        <w:t xml:space="preserve"> vs Boyd+Allie; hh </w:t>
+      </w:r>
+      <w:r>
+        <w:rPr>
+          <w:b/>
+        </w:rPr>
+        <w:t>156</w:t>
+      </w:r>
+      <w:r>
+        <w:t xml:space="preserve"> Melvina </w:t>
+      </w:r>
+      <w:r>
+        <w:rPr>
+          <w:b/>
+        </w:rPr>
+        <w:t>28</w:t>
+      </w:r>
+      <w:r>
+        <w:t xml:space="preserve"> rejected. </w:t>
+      </w:r>
+      <w:r>
+        <w:rPr>
+          <w:b/>
+        </w:rPr>
+        <w:t>33-6</w:t>
+      </w:r>
+      <w:r>
+        <w:t xml:space="preserve"> sh </w:t>
+      </w:r>
+      <w:r>
+        <w:rPr>
+          <w:b/>
+        </w:rPr>
+        <w:t>0008</w:t>
+      </w:r>
+      <w:r>
+        <w:t xml:space="preserve"> hh </w:t>
+      </w:r>
+      <w:r>
+        <w:rPr>
+          <w:b/>
+        </w:rPr>
+        <w:t>76</w:t>
+      </w:r>
+      <w:r>
+        <w:t xml:space="preserve"> Vertie </w:t>
+      </w:r>
+      <w:r>
+        <w:rPr>
+          <w:b/>
+        </w:rPr>
+        <w:t>41</w:t>
+      </w:r>
+      <w:r>
+        <w:t xml:space="preserve"> rejected. *Image seen.* </w:t>
+      </w:r>
+      <w:r>
+        <w:rPr>
+          <w:b/>
+        </w:rPr>
+        <w:t>C1124–C1126</w:t>
+      </w:r>
+      <w:r>
+        <w:t xml:space="preserve"> </w:t>
+      </w:r>
+      <w:r>
+        <w:rPr>
+          <w:b/>
+        </w:rPr>
+        <w:t>S812 S813</w:t>
+      </w:r>
+      <w:r>
+        <w:t>.</w:t>
+      </w:r>
+    </w:p>
+    <w:p>
+      <w:r>
+        <w:t xml:space="preserve">190. Remaining 1950 Lee Newman plates: Nerman gs </w:t>
+      </w:r>
+      <w:r>
+        <w:rPr>
+          <w:b/>
+        </w:rPr>
+        <w:t>14</w:t>
+      </w:r>
+      <w:r>
+        <w:t xml:space="preserve"> false hit; Elen </w:t>
+      </w:r>
+      <w:r>
+        <w:rPr>
+          <w:b/>
+        </w:rPr>
+        <w:t>66</w:t>
+      </w:r>
+      <w:r>
+        <w:t xml:space="preserve">; Charles </w:t>
+      </w:r>
+      <w:r>
+        <w:rPr>
+          <w:b/>
+        </w:rPr>
+        <w:t>34</w:t>
+      </w:r>
+      <w:r>
+        <w:t xml:space="preserve">/Wayne </w:t>
+      </w:r>
+      <w:r>
+        <w:rPr>
+          <w:b/>
+        </w:rPr>
+        <w:t>25</w:t>
+      </w:r>
+      <w:r>
+        <w:t xml:space="preserve">/Grenvy </w:t>
+      </w:r>
+      <w:r>
+        <w:rPr>
+          <w:b/>
+        </w:rPr>
+        <w:t>36</w:t>
+      </w:r>
+      <w:r>
+        <w:t xml:space="preserve">; Been </w:t>
+      </w:r>
+      <w:r>
+        <w:rPr>
+          <w:b/>
+        </w:rPr>
+        <w:t>46</w:t>
+      </w:r>
+      <w:r>
+        <w:t xml:space="preserve">; Charles </w:t>
+      </w:r>
+      <w:r>
+        <w:rPr>
+          <w:b/>
+        </w:rPr>
+        <w:t>24</w:t>
+      </w:r>
+      <w:r>
+        <w:t xml:space="preserve">. All </w:t>
+      </w:r>
+      <w:r>
+        <w:rPr>
+          <w:b/>
+        </w:rPr>
+        <w:t>rejected</w:t>
+      </w:r>
+      <w:r>
+        <w:t xml:space="preserve"> vs John L / Frank / Boyd. *Image seen.* </w:t>
+      </w:r>
+      <w:r>
+        <w:rPr>
+          <w:b/>
+        </w:rPr>
+        <w:t>C1127–C1131</w:t>
+      </w:r>
+      <w:r>
+        <w:t xml:space="preserve"> </w:t>
+      </w:r>
+      <w:r>
+        <w:rPr>
+          <w:b/>
+        </w:rPr>
+        <w:t>S814–S818</w:t>
+      </w:r>
+      <w:r>
+        <w:t>.</w:t>
+      </w:r>
+    </w:p>
+    <w:p>
+      <w:r>
+        <w:t xml:space="preserve">191. Remaining 1950 Madison adult Newman males William </w:t>
+      </w:r>
+      <w:r>
+        <w:rPr>
+          <w:b/>
+        </w:rPr>
+        <w:t>48</w:t>
+      </w:r>
+      <w:r>
+        <w:t xml:space="preserve"> / Zelma </w:t>
+      </w:r>
+      <w:r>
+        <w:rPr>
+          <w:b/>
+        </w:rPr>
+        <w:t>48</w:t>
+      </w:r>
+      <w:r>
+        <w:t xml:space="preserve"> / Hiram </w:t>
+      </w:r>
+      <w:r>
+        <w:rPr>
+          <w:b/>
+        </w:rPr>
+        <w:t>36</w:t>
+      </w:r>
+      <w:r>
+        <w:t xml:space="preserve"> / W M </w:t>
+      </w:r>
+      <w:r>
+        <w:rPr>
+          <w:b/>
+        </w:rPr>
+        <w:t>20</w:t>
+      </w:r>
+      <w:r>
+        <w:t xml:space="preserve"> / Lee </w:t>
+      </w:r>
+      <w:r>
+        <w:rPr>
+          <w:b/>
+        </w:rPr>
+        <w:t>19</w:t>
+      </w:r>
+      <w:r>
+        <w:t xml:space="preserve"> </w:t>
+      </w:r>
+      <w:r>
+        <w:rPr>
+          <w:b/>
+        </w:rPr>
+        <w:t>rejected</w:t>
+      </w:r>
+      <w:r>
+        <w:t xml:space="preserve"> vs Frank ~</w:t>
+      </w:r>
+      <w:r>
+        <w:rPr>
+          <w:b/>
+        </w:rPr>
+        <w:t>61</w:t>
+      </w:r>
+      <w:r>
+        <w:t xml:space="preserve">. Combined with Dewey </w:t>
+      </w:r>
+      <w:r>
+        <w:rPr>
+          <w:b/>
+        </w:rPr>
+        <w:t>26</w:t>
+      </w:r>
+      <w:r>
+        <w:t xml:space="preserve"> + Shelly+Grace: </w:t>
+      </w:r>
+      <w:r>
+        <w:rPr>
+          <w:b/>
+        </w:rPr>
+        <w:t>PROBABLE</w:t>
+      </w:r>
+      <w:r>
+        <w:t xml:space="preserve"> Madison 1950 name-index negative. *Image seen / index.* </w:t>
+      </w:r>
+      <w:r>
+        <w:rPr>
+          <w:b/>
+        </w:rPr>
+        <w:t>C1132–C1138</w:t>
+      </w:r>
+      <w:r>
+        <w:t xml:space="preserve"> </w:t>
+      </w:r>
+      <w:r>
+        <w:rPr>
+          <w:b/>
+        </w:rPr>
+        <w:t>S819–S824</w:t>
+      </w:r>
+      <w:r>
+        <w:t>.</w:t>
+      </w:r>
+    </w:p>
+    <w:p>
+      <w:r>
+        <w:t xml:space="preserve">192. Estill 1930 [`_indx-m-q.txt`](https://www.us-census.org/pub/usgenweb/census/ky/estill/1930/_indx-m-q.txt) Fred/Herbert only. [`_partial.txt`](https://www.us-census.org/pub/usgenweb/census/ky/estill/1930/_partial.txt) </w:t>
+      </w:r>
+      <w:r>
+        <w:rPr>
+          <w:b/>
+        </w:rPr>
+        <w:t>33-8</w:t>
+      </w:r>
+      <w:r>
+        <w:t xml:space="preserve"> still unpublished; </w:t>
+      </w:r>
+      <w:r>
+        <w:rPr>
+          <w:b/>
+        </w:rPr>
+        <w:t>33-5</w:t>
+      </w:r>
+      <w:r>
+        <w:t xml:space="preserve"> also unpublished. M1930 22/23 IDs </w:t>
+      </w:r>
+      <w:r>
+        <w:rPr>
+          <w:b/>
+        </w:rPr>
+        <w:t>withdrawn</w:t>
+      </w:r>
+      <w:r>
+        <w:t xml:space="preserve"> in Pass 101. FS </w:t>
+      </w:r>
+      <w:r>
+        <w:rPr>
+          <w:b/>
+        </w:rPr>
+        <w:t>403</w:t>
+      </w:r>
+      <w:r>
+        <w:t xml:space="preserve"> (R011-50). *Transcription / catalog.* </w:t>
+      </w:r>
+      <w:r>
+        <w:rPr>
+          <w:b/>
+        </w:rPr>
+        <w:t>C1139–C1148</w:t>
+      </w:r>
+      <w:r>
+        <w:t xml:space="preserve"> </w:t>
+      </w:r>
+      <w:r>
+        <w:rPr>
+          <w:b/>
+        </w:rPr>
+        <w:t>S825–S834</w:t>
+      </w:r>
+      <w:r>
+        <w:t>.</w:t>
+      </w:r>
+    </w:p>
+    <w:p>
+      <w:r>
+        <w:t xml:space="preserve">193. IA [`14thcensusofpopu602unit`](https://archive.org/details/14thcensusofpopu602unit) still </w:t>
+      </w:r>
+      <w:r>
+        <w:rPr>
+          <w:b/>
+        </w:rPr>
+        <w:t>515</w:t>
+      </w:r>
+      <w:r>
+        <w:t xml:space="preserve"> images; Solr no remainder. KYGenWeb [Wolfe census1](https://kygenweb.net/wolfe/census1.htm) still lists 1920k Antioch </w:t>
+      </w:r>
+      <w:r>
+        <w:rPr>
+          <w:b/>
+        </w:rPr>
+        <w:t>242</w:t>
+      </w:r>
+      <w:r>
+        <w:t xml:space="preserve">. *Catalog.* </w:t>
+      </w:r>
+      <w:r>
+        <w:rPr>
+          <w:b/>
+        </w:rPr>
+        <w:t>C1149</w:t>
+      </w:r>
+      <w:r>
+        <w:t xml:space="preserve"> </w:t>
+      </w:r>
+      <w:r>
+        <w:rPr>
+          <w:b/>
+        </w:rPr>
+        <w:t>S835–S837</w:t>
+      </w:r>
+      <w:r>
+        <w:t>.</w:t>
+      </w:r>
+    </w:p>
+    <w:p>
+      <w:r>
+        <w:t xml:space="preserve">194. Official NARA [1930 ED maps](https://www.archives.gov/research/census/1930/enumeration-districts-maps.html) HTML table: </w:t>
+      </w:r>
+      <w:r>
+        <w:rPr>
+          <w:b/>
+        </w:rPr>
+        <w:t>M1930</w:t>
+      </w:r>
+      <w:r>
+        <w:t xml:space="preserve"> roll </w:t>
+      </w:r>
+      <w:r>
+        <w:rPr>
+          <w:b/>
+        </w:rPr>
+        <w:t>15</w:t>
+      </w:r>
+      <w:r>
+        <w:t xml:space="preserve"> = Kentucky. M1930 </w:t>
+      </w:r>
+      <w:r>
+        <w:rPr>
+          <w:b/>
+        </w:rPr>
+        <w:t>22</w:t>
+      </w:r>
+      <w:r>
+        <w:t xml:space="preserve"> = NE/NV/NH; </w:t>
       </w:r>
       <w:r>
         <w:rPr>
@@ -21813,22 +23229,22 @@
         <w:t>23</w:t>
       </w:r>
       <w:r>
-        <w:t xml:space="preserve"> = KY Henry–Woodford (</w:t>
-      </w:r>
-      <w:r>
-        <w:rPr>
-          <w:b/>
-        </w:rPr>
-        <w:t>Lee, Madison, Owsley, Wolfe, Woodford</w:t>
-      </w:r>
-      <w:r>
-        <w:t xml:space="preserve">). Maps unread. *Pamphlet.* </w:t>
-      </w:r>
-      <w:r>
-        <w:rPr>
-          <w:b/>
-        </w:rPr>
-        <w:t>C1056</w:t>
+        <w:t xml:space="preserve"> = NJ/NM. </w:t>
+      </w:r>
+      <w:r>
+        <w:rPr>
+          <w:b/>
+        </w:rPr>
+        <w:t>A3378 22/23</w:t>
+      </w:r>
+      <w:r>
+        <w:t xml:space="preserve"> = KY Adair–Henderson / Henry–Woodford. *Pamphlet.* </w:t>
+      </w:r>
+      <w:r>
+        <w:rPr>
+          <w:b/>
+        </w:rPr>
+        <w:t>C1150</w:t>
       </w:r>
       <w:r>
         <w:t xml:space="preserve"> </w:t>
@@ -21837,7 +23253,7 @@
         <w:rPr>
           <w:b/>
         </w:rPr>
-        <w:t>S745 S770</w:t>
+        <w:t>S838</w:t>
       </w:r>
       <w:r>
         <w:t>.</w:t>
@@ -21845,22 +23261,31 @@
     </w:p>
     <w:p>
       <w:r>
-        <w:t xml:space="preserve">178. LDS 1940 [Richmond](https://ldsgenealogy.com/KY/1940-Census-Richmond-KY.htm) / [Kirksville](https://ldsgenealogy.com/KY/1940-Census-Kirksville-KY.htm) / [Million](https://ldsgenealogy.com/KY/1940-Census-Million-KY.htm) / [Union](https://ldsgenealogy.com/KY/1940-Census-Union-in-Madison-County-KY.htm) </w:t>
-      </w:r>
-      <w:r>
-        <w:rPr>
-          <w:b/>
-        </w:rPr>
-        <w:t>nil</w:t>
-      </w:r>
-      <w:r>
-        <w:t xml:space="preserve"> Newman. Berea/Glade unpublished. *Index only / catalog.* </w:t>
-      </w:r>
-      <w:r>
-        <w:rPr>
-          <w:b/>
-        </w:rPr>
-        <w:t>C1058–C1062</w:t>
+        <w:t xml:space="preserve">195. [Estill 1930 team](https://www.us-census.org/states/kentucky/teams/Estill1930-T626-742.htm): </w:t>
+      </w:r>
+      <w:r>
+        <w:rPr>
+          <w:b/>
+        </w:rPr>
+        <w:t>33-5</w:t>
+      </w:r>
+      <w:r>
+        <w:t xml:space="preserve"> Irvine South excl. cities; </w:t>
+      </w:r>
+      <w:r>
+        <w:rPr>
+          <w:b/>
+        </w:rPr>
+        <w:t>33-8</w:t>
+      </w:r>
+      <w:r>
+        <w:t xml:space="preserve"> Station Camp South. *Catalog.* </w:t>
+      </w:r>
+      <w:r>
+        <w:rPr>
+          <w:b/>
+        </w:rPr>
+        <w:t>C1151</w:t>
       </w:r>
       <w:r>
         <w:t xml:space="preserve"> </w:t>
@@ -21869,7 +23294,7 @@
         <w:rPr>
           <w:b/>
         </w:rPr>
-        <w:t>S747–S751</w:t>
+        <w:t>S839</w:t>
       </w:r>
       <w:r>
         <w:t>.</w:t>
@@ -21877,25 +23302,161 @@
     </w:p>
     <w:p>
       <w:r>
-        <w:t xml:space="preserve">179. LDS 1940 [Beattyville](https://ldsgenealogy.com/KY/1940-Census-Beattyville-KY.htm) Luther ~1891 + Cora ~1894 </w:t>
-      </w:r>
-      <w:r>
-        <w:rPr>
-          <w:b/>
-        </w:rPr>
-        <w:t>PROBABLE</w:t>
-      </w:r>
-      <w:r>
-        <w:t xml:space="preserve"> C305. [Heidelberg](https://ldsgenealogy.com/KY/1940-Census-Heidelberg-KY.htm) Grand ~1878 + Martha </w:t>
-      </w:r>
-      <w:r>
-        <w:rPr>
-          <w:b/>
-        </w:rPr>
-        <w:t>PROBABLE</w:t>
-      </w:r>
-      <w:r>
-        <w:t xml:space="preserve"> Grant C378. Saint Helens Mary J ~1856 </w:t>
+        <w:t xml:space="preserve">196. NARA 1950 Estill [ED map](https://1950census.archives.gov/) (S3 `14-A2-048-02195`): 1950 </w:t>
+      </w:r>
+      <w:r>
+        <w:rPr>
+          <w:b/>
+        </w:rPr>
+        <w:t>33-8</w:t>
+      </w:r>
+      <w:r>
+        <w:t xml:space="preserve"> = Millers Creek MAG.DIST.2; Station Camp = </w:t>
+      </w:r>
+      <w:r>
+        <w:rPr>
+          <w:b/>
+        </w:rPr>
+        <w:t>33-11/12</w:t>
+      </w:r>
+      <w:r>
+        <w:t xml:space="preserve">. *Image seen.* </w:t>
+      </w:r>
+      <w:r>
+        <w:rPr>
+          <w:b/>
+        </w:rPr>
+        <w:t>C1152</w:t>
+      </w:r>
+      <w:r>
+        <w:t xml:space="preserve"> </w:t>
+      </w:r>
+      <w:r>
+        <w:rPr>
+          <w:b/>
+        </w:rPr>
+        <w:t>S841</w:t>
+      </w:r>
+      <w:r>
+        <w:t>.</w:t>
+      </w:r>
+    </w:p>
+    <w:p>
+      <w:r>
+        <w:t xml:space="preserve">197. NARA 1950 [ED descriptions](https://1950census.archives.gov/) Kentucky-0033 p.2–3: </w:t>
+      </w:r>
+      <w:r>
+        <w:rPr>
+          <w:b/>
+        </w:rPr>
+        <w:t>33-5</w:t>
+      </w:r>
+      <w:r>
+        <w:t xml:space="preserve"> Ravenna city; </w:t>
+      </w:r>
+      <w:r>
+        <w:rPr>
+          <w:b/>
+        </w:rPr>
+        <w:t>33-8</w:t>
+      </w:r>
+      <w:r>
+        <w:t xml:space="preserve"> Millers Creek E of Fitchburg Furnace Branch–Knowlton + N of Hwy </w:t>
+      </w:r>
+      <w:r>
+        <w:rPr>
+          <w:b/>
+        </w:rPr>
+        <w:t>52</w:t>
+      </w:r>
+      <w:r>
+        <w:t xml:space="preserve">; </w:t>
+      </w:r>
+      <w:r>
+        <w:rPr>
+          <w:b/>
+        </w:rPr>
+        <w:t>33-11/12</w:t>
+      </w:r>
+      <w:r>
+        <w:t xml:space="preserve"> Station Camp split on South Irvine–Leighton via Ola. *Image seen.* </w:t>
+      </w:r>
+      <w:r>
+        <w:rPr>
+          <w:b/>
+        </w:rPr>
+        <w:t>C1153 C1154</w:t>
+      </w:r>
+      <w:r>
+        <w:t xml:space="preserve"> </w:t>
+      </w:r>
+      <w:r>
+        <w:rPr>
+          <w:b/>
+        </w:rPr>
+        <w:t>S842</w:t>
+      </w:r>
+      <w:r>
+        <w:t>.</w:t>
+      </w:r>
+    </w:p>
+    <w:p>
+      <w:r>
+        <w:t xml:space="preserve">198. NARA [1950 Estill Newnam API](https://1950census.archives.gov/): total </w:t>
+      </w:r>
+      <w:r>
+        <w:rPr>
+          <w:b/>
+        </w:rPr>
+        <w:t>3</w:t>
+      </w:r>
+      <w:r>
+        <w:t xml:space="preserve"> (Fred/Harding/Vertie); </w:t>
+      </w:r>
+      <w:r>
+        <w:rPr>
+          <w:b/>
+        </w:rPr>
+        <w:t>33-11/12</w:t>
+      </w:r>
+      <w:r>
+        <w:t xml:space="preserve"> </w:t>
+      </w:r>
+      <w:r>
+        <w:rPr>
+          <w:b/>
+        </w:rPr>
+        <w:t>0</w:t>
+      </w:r>
+      <w:r>
+        <w:t xml:space="preserve">. Estill </w:t>
+      </w:r>
+      <w:r>
+        <w:rPr>
+          <w:b/>
+        </w:rPr>
+        <w:t>33-12</w:t>
+      </w:r>
+      <w:r>
+        <w:t xml:space="preserve"> sh </w:t>
+      </w:r>
+      <w:r>
+        <w:rPr>
+          <w:b/>
+        </w:rPr>
+        <w:t>13</w:t>
+      </w:r>
+      <w:r>
+        <w:t xml:space="preserve"> Boyd </w:t>
+      </w:r>
+      <w:r>
+        <w:rPr>
+          <w:b/>
+        </w:rPr>
+        <w:t>19</w:t>
+      </w:r>
+      <w:r>
+        <w:t xml:space="preserve"> </w:t>
       </w:r>
       <w:r>
         <w:rPr>
@@ -21904,13 +23465,31 @@
         <w:t>rejected</w:t>
       </w:r>
       <w:r>
-        <w:t xml:space="preserve">. New Virginia nil. *Index only.* </w:t>
-      </w:r>
-      <w:r>
-        <w:rPr>
-          <w:b/>
-        </w:rPr>
-        <w:t>C1063–C1067 C1079</w:t>
+        <w:t xml:space="preserve">; sh </w:t>
+      </w:r>
+      <w:r>
+        <w:rPr>
+          <w:b/>
+        </w:rPr>
+        <w:t>24</w:t>
+      </w:r>
+      <w:r>
+        <w:t xml:space="preserve"> OCR Boyd </w:t>
+      </w:r>
+      <w:r>
+        <w:rPr>
+          <w:b/>
+        </w:rPr>
+        <w:t>rejected</w:t>
+      </w:r>
+      <w:r>
+        <w:t xml:space="preserve">. *Index / image seen.* </w:t>
+      </w:r>
+      <w:r>
+        <w:rPr>
+          <w:b/>
+        </w:rPr>
+        <w:t>C1155–C1157</w:t>
       </w:r>
       <w:r>
         <w:t xml:space="preserve"> </w:t>
@@ -21919,7 +23498,7 @@
         <w:rPr>
           <w:b/>
         </w:rPr>
-        <w:t>S752–S755</w:t>
+        <w:t>S843–S845</w:t>
       </w:r>
       <w:r>
         <w:t>.</w:t>
@@ -21927,40 +23506,22 @@
     </w:p>
     <w:p>
       <w:r>
-        <w:t xml:space="preserve">180. NARA [1950 Fayette Newman API](https://1950census.archives.gov/): total </w:t>
-      </w:r>
-      <w:r>
-        <w:rPr>
-          <w:b/>
-        </w:rPr>
-        <w:t>22</w:t>
-      </w:r>
-      <w:r>
-        <w:t xml:space="preserve"> / Newnam </w:t>
-      </w:r>
-      <w:r>
-        <w:rPr>
-          <w:b/>
-        </w:rPr>
-        <w:t>3</w:t>
-      </w:r>
-      <w:r>
-        <w:t xml:space="preserve"> — no Boyd/Allie. LOC [*Yell County Journal* sn90050035](https://www.loc.gov/item/sn90050035/) </w:t>
-      </w:r>
-      <w:r>
-        <w:rPr>
-          <w:b/>
-        </w:rPr>
-        <w:t>not</w:t>
-      </w:r>
-      <w:r>
-        <w:t xml:space="preserve"> digitized. WCHS [Duell-Clark 1958–1978](https://www.woodfordcountykyhistoricalsociety.com/booksandpublications) $10. FS SPA (R011-47). *Index / catalog.* </w:t>
-      </w:r>
-      <w:r>
-        <w:rPr>
-          <w:b/>
-        </w:rPr>
-        <w:t>C1068 C1069 C1071 C1076</w:t>
+        <w:t xml:space="preserve">199. GT [Lee WWI](https://genealogytrails.com/ken/lee/wwi_draft_cards.html) published tables nil Newnam/Newman/McCoy. [Kenton military microfilm](https://www.kentonlibrary.org/microfilm-military-records/) holds Owsley M1509 on-site. IA M1509 </w:t>
+      </w:r>
+      <w:r>
+        <w:rPr>
+          <w:b/>
+        </w:rPr>
+        <w:t>0</w:t>
+      </w:r>
+      <w:r>
+        <w:t xml:space="preserve">. *Transcription / catalog.* </w:t>
+      </w:r>
+      <w:r>
+        <w:rPr>
+          <w:b/>
+        </w:rPr>
+        <w:t>C1158 C1159</w:t>
       </w:r>
       <w:r>
         <w:t xml:space="preserve"> </w:t>
@@ -21969,7 +23530,7 @@
         <w:rPr>
           <w:b/>
         </w:rPr>
-        <w:t>S756 S757 S759 S763</w:t>
+        <w:t>S846 S847</w:t>
       </w:r>
       <w:r>
         <w:t>.</w:t>
@@ -21977,22 +23538,40 @@
     </w:p>
     <w:p>
       <w:r>
-        <w:t xml:space="preserve">181. IA [`14thcensusofpopu602unit`](https://archive.org/details/14thcensusofpopu602unit) still </w:t>
-      </w:r>
-      <w:r>
-        <w:rPr>
-          <w:b/>
-        </w:rPr>
-        <w:t>515</w:t>
-      </w:r>
-      <w:r>
-        <w:t xml:space="preserve"> images; Solr no remainder item. LDS 1940 [Stillwater](https://ldsgenealogy.com/KY/1940-Census-Stillwater-KY.htm) Mae ~1905 only. NARA 1950 Wolfe 0/0. *Catalog / index only.* </w:t>
-      </w:r>
-      <w:r>
-        <w:rPr>
-          <w:b/>
-        </w:rPr>
-        <w:t>C1081–C1083</w:t>
+        <w:t xml:space="preserve">200. USGenNet [Lee wills](https://usgennet.org/usa/ky/county/lee/wills/): Jane Steele NEWMAN + Elizabeth NEWNAM + Mary F. TINCHER — </w:t>
+      </w:r>
+      <w:r>
+        <w:rPr>
+          <w:b/>
+        </w:rPr>
+        <w:t>no Samuel P.</w:t>
+      </w:r>
+      <w:r>
+        <w:t xml:space="preserve"> court.html </w:t>
+      </w:r>
+      <w:r>
+        <w:rPr>
+          <w:b/>
+        </w:rPr>
+        <w:t>404</w:t>
+      </w:r>
+      <w:r>
+        <w:t xml:space="preserve">. LOC CA [Dora Stone 1926](https://www.loc.gov/collections/chronicling-america/) </w:t>
+      </w:r>
+      <w:r>
+        <w:rPr>
+          <w:b/>
+        </w:rPr>
+        <w:t>33</w:t>
+      </w:r>
+      <w:r>
+        <w:t xml:space="preserve"> pages, no Yell. GT [Yell news](https://genealogytrails.com/ark/yell/news.html) lists Democrat/Journal/Post-Dispatch, not digitized. FS SPA (R011-51). WCHS [Duell-Clark](https://www.woodfordcountykyhistoricalsociety.com/booksandpublications) $10. *Catalog / transcription.* </w:t>
+      </w:r>
+      <w:r>
+        <w:rPr>
+          <w:b/>
+        </w:rPr>
+        <w:t>C1160–C1168</w:t>
       </w:r>
       <w:r>
         <w:t xml:space="preserve"> </w:t>
@@ -22001,1007 +23580,7 @@
         <w:rPr>
           <w:b/>
         </w:rPr>
-        <w:t>S771–S773</w:t>
-      </w:r>
-      <w:r>
-        <w:t>.</w:t>
-      </w:r>
-    </w:p>
-    <w:p>
-      <w:r>
-        <w:t xml:space="preserve">182. LDS 1940 [Midway](https://ldsgenealogy.com/KY/1940-Census-Midway-KY.htm) nil. [Market House](https://ldsgenealogy.com/KY/1940-Census-Market-House-KY.htm) Hubert ~1878 + Orie ~1888 </w:t>
-      </w:r>
-      <w:r>
-        <w:rPr>
-          <w:b/>
-        </w:rPr>
-        <w:t>rejected</w:t>
-      </w:r>
-      <w:r>
-        <w:t xml:space="preserve"> vs John L. [Foxtown](https://ldsgenealogy.com/KY/1940-Census-Foxtown-KY.htm) is </w:t>
-      </w:r>
-      <w:r>
-        <w:rPr>
-          <w:b/>
-        </w:rPr>
-        <w:t>Jackson</w:t>
-      </w:r>
-      <w:r>
-        <w:t xml:space="preserve">: Shelby ~1893 + Grace ~1898 </w:t>
-      </w:r>
-      <w:r>
-        <w:rPr>
-          <w:b/>
-        </w:rPr>
-        <w:t>PROBABLE</w:t>
-      </w:r>
-      <w:r>
-        <w:t xml:space="preserve"> C309. Paint Lick is </w:t>
-      </w:r>
-      <w:r>
-        <w:rPr>
-          <w:b/>
-        </w:rPr>
-        <w:t>Garrard</w:t>
-      </w:r>
-      <w:r>
-        <w:t xml:space="preserve">. *Index only.* </w:t>
-      </w:r>
-      <w:r>
-        <w:rPr>
-          <w:b/>
-        </w:rPr>
-        <w:t>C1084–C1088</w:t>
-      </w:r>
-      <w:r>
-        <w:t xml:space="preserve"> </w:t>
-      </w:r>
-      <w:r>
-        <w:rPr>
-          <w:b/>
-        </w:rPr>
-        <w:t>S774–S777</w:t>
-      </w:r>
-      <w:r>
-        <w:t>.</w:t>
-      </w:r>
-    </w:p>
-    <w:p>
-      <w:r>
-        <w:t xml:space="preserve">183. 1950 Lee ED </w:t>
-      </w:r>
-      <w:r>
-        <w:rPr>
-          <w:b/>
-        </w:rPr>
-        <w:t>65-1</w:t>
-      </w:r>
-      <w:r>
-        <w:t xml:space="preserve"> sh </w:t>
-      </w:r>
-      <w:r>
-        <w:rPr>
-          <w:b/>
-        </w:rPr>
-        <w:t>0020</w:t>
-      </w:r>
-      <w:r>
-        <w:t xml:space="preserve"> hh </w:t>
-      </w:r>
-      <w:r>
-        <w:rPr>
-          <w:b/>
-        </w:rPr>
-        <w:t>198</w:t>
-      </w:r>
-      <w:r>
-        <w:t xml:space="preserve"> Luther D. </w:t>
-      </w:r>
-      <w:r>
-        <w:rPr>
-          <w:b/>
-        </w:rPr>
-        <w:t>28</w:t>
-      </w:r>
-      <w:r>
-        <w:t xml:space="preserve"> + Cora P. </w:t>
-      </w:r>
-      <w:r>
-        <w:rPr>
-          <w:b/>
-        </w:rPr>
-        <w:t>28</w:t>
-      </w:r>
-      <w:r>
-        <w:t xml:space="preserve"> </w:t>
-      </w:r>
-      <w:r>
-        <w:rPr>
-          <w:b/>
-        </w:rPr>
-        <w:t>rejected</w:t>
-      </w:r>
-      <w:r>
-        <w:t xml:space="preserve"> vs C305. sh </w:t>
-      </w:r>
-      <w:r>
-        <w:rPr>
-          <w:b/>
-        </w:rPr>
-        <w:t>0021</w:t>
-      </w:r>
-      <w:r>
-        <w:t xml:space="preserve"> hh </w:t>
-      </w:r>
-      <w:r>
-        <w:rPr>
-          <w:b/>
-        </w:rPr>
-        <w:t>196</w:t>
-      </w:r>
-      <w:r>
-        <w:t xml:space="preserve"> Cora P. </w:t>
-      </w:r>
-      <w:r>
-        <w:rPr>
-          <w:b/>
-        </w:rPr>
-        <w:t>56</w:t>
-      </w:r>
-      <w:r>
-        <w:t xml:space="preserve"> widow + [Charlie Plummer brother </w:t>
-      </w:r>
-      <w:r>
-        <w:rPr>
-          <w:b/>
-        </w:rPr>
-        <w:t>55</w:t>
-      </w:r>
-      <w:r>
-        <w:t xml:space="preserve">](https://1950census.archives.gov/) </w:t>
-      </w:r>
-      <w:r>
-        <w:rPr>
-          <w:b/>
-        </w:rPr>
-        <w:t>PROVEN</w:t>
-      </w:r>
-      <w:r>
-        <w:t xml:space="preserve"> Cora Plummer widow. *Image seen.* </w:t>
-      </w:r>
-      <w:r>
-        <w:rPr>
-          <w:b/>
-        </w:rPr>
-        <w:t>C1089 C1090 C1108</w:t>
-      </w:r>
-      <w:r>
-        <w:t xml:space="preserve"> </w:t>
-      </w:r>
-      <w:r>
-        <w:rPr>
-          <w:b/>
-        </w:rPr>
-        <w:t>S778 S779 S797</w:t>
-      </w:r>
-      <w:r>
-        <w:t>.</w:t>
-      </w:r>
-    </w:p>
-    <w:p>
-      <w:r>
-        <w:t xml:space="preserve">184. FS SPA (R011-48). LDS FHL2 Estill abstracts → FS [520482](https://www.familysearch.org/search/catalog/520482) unread. AHGP/us-census: </w:t>
-      </w:r>
-      <w:r>
-        <w:rPr>
-          <w:b/>
-        </w:rPr>
-        <w:t>33-8</w:t>
-      </w:r>
-      <w:r>
-        <w:t xml:space="preserve"> on T626-742 reel; IA scan still missing. *Catalog.* </w:t>
-      </w:r>
-      <w:r>
-        <w:rPr>
-          <w:b/>
-        </w:rPr>
-        <w:t>C1094–C1096</w:t>
-      </w:r>
-      <w:r>
-        <w:t xml:space="preserve"> </w:t>
-      </w:r>
-      <w:r>
-        <w:rPr>
-          <w:b/>
-        </w:rPr>
-        <w:t>S783–S785</w:t>
-      </w:r>
-      <w:r>
-        <w:t>.</w:t>
-      </w:r>
-    </w:p>
-    <w:p>
-      <w:r>
-        <w:t xml:space="preserve">185. NARA [1950 Lee Newman API](https://1950census.archives.gov/): </w:t>
-      </w:r>
-      <w:r>
-        <w:rPr>
-          <w:b/>
-        </w:rPr>
-        <w:t>7</w:t>
-      </w:r>
-      <w:r>
-        <w:t xml:space="preserve"> / Newnam </w:t>
-      </w:r>
-      <w:r>
-        <w:rPr>
-          <w:b/>
-        </w:rPr>
-        <w:t>4</w:t>
-      </w:r>
-      <w:r>
-        <w:t xml:space="preserve"> — no McCoy/Frank/John L/Boyd. Owsley McCoy </w:t>
-      </w:r>
-      <w:r>
-        <w:rPr>
-          <w:b/>
-        </w:rPr>
-        <w:t>0</w:t>
-      </w:r>
-      <w:r>
-        <w:t xml:space="preserve">; Clarence </w:t>
-      </w:r>
-      <w:r>
-        <w:rPr>
-          <w:b/>
-        </w:rPr>
-        <w:t>38</w:t>
-      </w:r>
-      <w:r>
-        <w:t xml:space="preserve"> reconfirm. Lee </w:t>
-      </w:r>
-      <w:r>
-        <w:rPr>
-          <w:b/>
-        </w:rPr>
-        <w:t>65-1</w:t>
-      </w:r>
-      <w:r>
-        <w:t xml:space="preserve"> sh </w:t>
-      </w:r>
-      <w:r>
-        <w:rPr>
-          <w:b/>
-        </w:rPr>
-        <w:t>0010</w:t>
-      </w:r>
-      <w:r>
-        <w:t xml:space="preserve"> Thomas Ray </w:t>
-      </w:r>
-      <w:r>
-        <w:rPr>
-          <w:b/>
-        </w:rPr>
-        <w:t>27</w:t>
-      </w:r>
-      <w:r>
-        <w:t xml:space="preserve"> </w:t>
-      </w:r>
-      <w:r>
-        <w:rPr>
-          <w:b/>
-        </w:rPr>
-        <w:t>rejected</w:t>
-      </w:r>
-      <w:r>
-        <w:t xml:space="preserve">; </w:t>
-      </w:r>
-      <w:r>
-        <w:rPr>
-          <w:b/>
-        </w:rPr>
-        <w:t>65-13</w:t>
-      </w:r>
-      <w:r>
-        <w:t xml:space="preserve"> Martha </w:t>
-      </w:r>
-      <w:r>
-        <w:rPr>
-          <w:b/>
-        </w:rPr>
-        <w:t>51</w:t>
-      </w:r>
-      <w:r>
-        <w:t xml:space="preserve"> wd </w:t>
-      </w:r>
-      <w:r>
-        <w:rPr>
-          <w:b/>
-        </w:rPr>
-        <w:t>rejected</w:t>
-      </w:r>
-      <w:r>
-        <w:t xml:space="preserve"> vs Grant’s widow; Johnia </w:t>
-      </w:r>
-      <w:r>
-        <w:rPr>
-          <w:b/>
-        </w:rPr>
-        <w:t>54</w:t>
-      </w:r>
-      <w:r>
-        <w:t xml:space="preserve"> </w:t>
-      </w:r>
-      <w:r>
-        <w:rPr>
-          <w:b/>
-        </w:rPr>
-        <w:t>rejected</w:t>
-      </w:r>
-      <w:r>
-        <w:t xml:space="preserve"> vs John L; </w:t>
-      </w:r>
-      <w:r>
-        <w:rPr>
-          <w:b/>
-        </w:rPr>
-        <w:t>65-12</w:t>
-      </w:r>
-      <w:r>
-        <w:t xml:space="preserve"> Dillard </w:t>
-      </w:r>
-      <w:r>
-        <w:rPr>
-          <w:b/>
-        </w:rPr>
-        <w:t>47</w:t>
-      </w:r>
-      <w:r>
-        <w:t xml:space="preserve"> </w:t>
-      </w:r>
-      <w:r>
-        <w:rPr>
-          <w:b/>
-        </w:rPr>
-        <w:t>rejected</w:t>
-      </w:r>
-      <w:r>
-        <w:t xml:space="preserve">; Jackson </w:t>
-      </w:r>
-      <w:r>
-        <w:rPr>
-          <w:b/>
-        </w:rPr>
-        <w:t>55-6</w:t>
-      </w:r>
-      <w:r>
-        <w:t xml:space="preserve"> Bonnie </w:t>
-      </w:r>
-      <w:r>
-        <w:rPr>
-          <w:b/>
-        </w:rPr>
-        <w:t>16</w:t>
-      </w:r>
-      <w:r>
-        <w:t xml:space="preserve"> sample. *Image seen / index.* </w:t>
-      </w:r>
-      <w:r>
-        <w:rPr>
-          <w:b/>
-        </w:rPr>
-        <w:t>C1100–C1107 C1109</w:t>
-      </w:r>
-      <w:r>
-        <w:t xml:space="preserve"> </w:t>
-      </w:r>
-      <w:r>
-        <w:rPr>
-          <w:b/>
-        </w:rPr>
-        <w:t>S789–S796 S798</w:t>
-      </w:r>
-      <w:r>
-        <w:t>.</w:t>
-      </w:r>
-    </w:p>
-    <w:p>
-      <w:r>
-        <w:t xml:space="preserve">186. LDS 1940 Jackson remaining [McKee](https://ldsgenealogy.com/KY/1940-Census-McKee-KY.htm) / Cavanaugh / Horse Lick / Pondcreek / Sturgeen </w:t>
-      </w:r>
-      <w:r>
-        <w:rPr>
-          <w:b/>
-        </w:rPr>
-        <w:t>nil</w:t>
-      </w:r>
-      <w:r>
-        <w:t xml:space="preserve">. [Clover Bottom](https://ldsgenealogy.com/KY/1940-Census-Clover-Bottom-KY.htm) Clinton H ~1910 + Gladys ~1906 </w:t>
-      </w:r>
-      <w:r>
-        <w:rPr>
-          <w:b/>
-        </w:rPr>
-        <w:t>rejected</w:t>
-      </w:r>
-      <w:r>
-        <w:t xml:space="preserve">. Alcorn = Greenup; Lost Creek = Perry. KYGenWeb [1920g/h/i/k](https://kygenweb.net/wolfe/census1.htm) </w:t>
-      </w:r>
-      <w:r>
-        <w:rPr>
-          <w:b/>
-        </w:rPr>
-        <w:t>nil</w:t>
-      </w:r>
-      <w:r>
-        <w:t xml:space="preserve">. FS </w:t>
-      </w:r>
-      <w:r>
-        <w:rPr>
-          <w:b/>
-        </w:rPr>
-        <w:t>403</w:t>
-      </w:r>
-      <w:r>
-        <w:t xml:space="preserve"> (R011-49). *Index / transcription / catalog.* </w:t>
-      </w:r>
-      <w:r>
-        <w:rPr>
-          <w:b/>
-        </w:rPr>
-        <w:t>C1110–C1118</w:t>
-      </w:r>
-      <w:r>
-        <w:t xml:space="preserve"> </w:t>
-      </w:r>
-      <w:r>
-        <w:rPr>
-          <w:b/>
-        </w:rPr>
-        <w:t>S799–S807</w:t>
-      </w:r>
-      <w:r>
-        <w:t>.</w:t>
-      </w:r>
-    </w:p>
-    <w:p>
-      <w:r>
-        <w:t xml:space="preserve">187. IA [`14thcensusofpopu602unit`](https://archive.org/details/14thcensusofpopu602unit) still </w:t>
-      </w:r>
-      <w:r>
-        <w:rPr>
-          <w:b/>
-        </w:rPr>
-        <w:t>515</w:t>
-      </w:r>
-      <w:r>
-        <w:t xml:space="preserve"> images; Solr `*602*` = </w:t>
-      </w:r>
-      <w:r>
-        <w:rPr>
-          <w:b/>
-        </w:rPr>
-        <w:t>602</w:t>
-      </w:r>
-      <w:r>
-        <w:t xml:space="preserve"> + </w:t>
-      </w:r>
-      <w:r>
-        <w:rPr>
-          <w:b/>
-        </w:rPr>
-        <w:t>1602</w:t>
-      </w:r>
-      <w:r>
-        <w:t xml:space="preserve"> only. KYGenWeb [Wolfe census1](https://kygenweb.net/wolfe/census1.htm) still lists 1920k Antioch </w:t>
-      </w:r>
-      <w:r>
-        <w:rPr>
-          <w:b/>
-        </w:rPr>
-        <w:t>242</w:t>
-      </w:r>
-      <w:r>
-        <w:t xml:space="preserve">. *Catalog.* </w:t>
-      </w:r>
-      <w:r>
-        <w:rPr>
-          <w:b/>
-        </w:rPr>
-        <w:t>C1119 C1120</w:t>
-      </w:r>
-      <w:r>
-        <w:t xml:space="preserve"> </w:t>
-      </w:r>
-      <w:r>
-        <w:rPr>
-          <w:b/>
-        </w:rPr>
-        <w:t>S808 S809</w:t>
-      </w:r>
-      <w:r>
-        <w:t>.</w:t>
-      </w:r>
-    </w:p>
-    <w:p>
-      <w:r>
-        <w:t xml:space="preserve">188. 1950 U.S. census, Estill ED </w:t>
-      </w:r>
-      <w:r>
-        <w:rPr>
-          <w:b/>
-        </w:rPr>
-        <w:t>33-1</w:t>
-      </w:r>
-      <w:r>
-        <w:t xml:space="preserve"> Irvine, NARA image [0003](https://1950census.archives.gov/), form sheet </w:t>
-      </w:r>
-      <w:r>
-        <w:rPr>
-          <w:b/>
-        </w:rPr>
-        <w:t>2</w:t>
-      </w:r>
-      <w:r>
-        <w:t xml:space="preserve">, 1 Apr 1950, hh </w:t>
-      </w:r>
-      <w:r>
-        <w:rPr>
-          <w:b/>
-        </w:rPr>
-        <w:t>14</w:t>
-      </w:r>
-      <w:r>
-        <w:t xml:space="preserve">: Newnam, Fred </w:t>
-      </w:r>
-      <w:r>
-        <w:rPr>
-          <w:b/>
-        </w:rPr>
-        <w:t>55</w:t>
-      </w:r>
-      <w:r>
-        <w:t xml:space="preserve"> + Era R </w:t>
-      </w:r>
-      <w:r>
-        <w:rPr>
-          <w:b/>
-        </w:rPr>
-        <w:t>52</w:t>
-      </w:r>
-      <w:r>
-        <w:t xml:space="preserve"> + Dorothy J </w:t>
-      </w:r>
-      <w:r>
-        <w:rPr>
-          <w:b/>
-        </w:rPr>
-        <w:t>19</w:t>
-      </w:r>
-      <w:r>
-        <w:t xml:space="preserve">. </w:t>
-      </w:r>
-      <w:r>
-        <w:rPr>
-          <w:b/>
-        </w:rPr>
-        <w:t>PROVEN</w:t>
-      </w:r>
-      <w:r>
-        <w:t xml:space="preserve"> 1940 Irvine couple; </w:t>
-      </w:r>
-      <w:r>
-        <w:rPr>
-          <w:b/>
-        </w:rPr>
-        <w:t>PROBABLE</w:t>
-      </w:r>
-      <w:r>
-        <w:t xml:space="preserve"> C387. *Image seen.* </w:t>
-      </w:r>
-      <w:r>
-        <w:rPr>
-          <w:b/>
-        </w:rPr>
-        <w:t>C1122 C1123</w:t>
-      </w:r>
-      <w:r>
-        <w:t xml:space="preserve"> </w:t>
-      </w:r>
-      <w:r>
-        <w:rPr>
-          <w:b/>
-        </w:rPr>
-        <w:t>S811</w:t>
-      </w:r>
-      <w:r>
-        <w:t>.</w:t>
-      </w:r>
-    </w:p>
-    <w:p>
-      <w:r>
-        <w:t xml:space="preserve">189. Estill 1950 </w:t>
-      </w:r>
-      <w:r>
-        <w:rPr>
-          <w:b/>
-        </w:rPr>
-        <w:t>33-13</w:t>
-      </w:r>
-      <w:r>
-        <w:t xml:space="preserve"> sh </w:t>
-      </w:r>
-      <w:r>
-        <w:rPr>
-          <w:b/>
-        </w:rPr>
-        <w:t>0021</w:t>
-      </w:r>
-      <w:r>
-        <w:t xml:space="preserve"> hh </w:t>
-      </w:r>
-      <w:r>
-        <w:rPr>
-          <w:b/>
-        </w:rPr>
-        <w:t>155</w:t>
-      </w:r>
-      <w:r>
-        <w:t xml:space="preserve"> Harding </w:t>
-      </w:r>
-      <w:r>
-        <w:rPr>
-          <w:b/>
-        </w:rPr>
-        <w:t>65</w:t>
-      </w:r>
-      <w:r>
-        <w:t xml:space="preserve"> + Sarah </w:t>
-      </w:r>
-      <w:r>
-        <w:rPr>
-          <w:b/>
-        </w:rPr>
-        <w:t>64</w:t>
-      </w:r>
-      <w:r>
-        <w:t xml:space="preserve"> </w:t>
-      </w:r>
-      <w:r>
-        <w:rPr>
-          <w:b/>
-        </w:rPr>
-        <w:t>rejected</w:t>
-      </w:r>
-      <w:r>
-        <w:t xml:space="preserve"> vs Boyd+Allie; hh </w:t>
-      </w:r>
-      <w:r>
-        <w:rPr>
-          <w:b/>
-        </w:rPr>
-        <w:t>156</w:t>
-      </w:r>
-      <w:r>
-        <w:t xml:space="preserve"> Melvina </w:t>
-      </w:r>
-      <w:r>
-        <w:rPr>
-          <w:b/>
-        </w:rPr>
-        <w:t>28</w:t>
-      </w:r>
-      <w:r>
-        <w:t xml:space="preserve"> rejected. </w:t>
-      </w:r>
-      <w:r>
-        <w:rPr>
-          <w:b/>
-        </w:rPr>
-        <w:t>33-6</w:t>
-      </w:r>
-      <w:r>
-        <w:t xml:space="preserve"> sh </w:t>
-      </w:r>
-      <w:r>
-        <w:rPr>
-          <w:b/>
-        </w:rPr>
-        <w:t>0008</w:t>
-      </w:r>
-      <w:r>
-        <w:t xml:space="preserve"> hh </w:t>
-      </w:r>
-      <w:r>
-        <w:rPr>
-          <w:b/>
-        </w:rPr>
-        <w:t>76</w:t>
-      </w:r>
-      <w:r>
-        <w:t xml:space="preserve"> Vertie </w:t>
-      </w:r>
-      <w:r>
-        <w:rPr>
-          <w:b/>
-        </w:rPr>
-        <w:t>41</w:t>
-      </w:r>
-      <w:r>
-        <w:t xml:space="preserve"> rejected. *Image seen.* </w:t>
-      </w:r>
-      <w:r>
-        <w:rPr>
-          <w:b/>
-        </w:rPr>
-        <w:t>C1124–C1126</w:t>
-      </w:r>
-      <w:r>
-        <w:t xml:space="preserve"> </w:t>
-      </w:r>
-      <w:r>
-        <w:rPr>
-          <w:b/>
-        </w:rPr>
-        <w:t>S812 S813</w:t>
-      </w:r>
-      <w:r>
-        <w:t>.</w:t>
-      </w:r>
-    </w:p>
-    <w:p>
-      <w:r>
-        <w:t xml:space="preserve">190. Remaining 1950 Lee Newman plates: Nerman gs </w:t>
-      </w:r>
-      <w:r>
-        <w:rPr>
-          <w:b/>
-        </w:rPr>
-        <w:t>14</w:t>
-      </w:r>
-      <w:r>
-        <w:t xml:space="preserve"> false hit; Elen </w:t>
-      </w:r>
-      <w:r>
-        <w:rPr>
-          <w:b/>
-        </w:rPr>
-        <w:t>66</w:t>
-      </w:r>
-      <w:r>
-        <w:t xml:space="preserve">; Charles </w:t>
-      </w:r>
-      <w:r>
-        <w:rPr>
-          <w:b/>
-        </w:rPr>
-        <w:t>34</w:t>
-      </w:r>
-      <w:r>
-        <w:t xml:space="preserve">/Wayne </w:t>
-      </w:r>
-      <w:r>
-        <w:rPr>
-          <w:b/>
-        </w:rPr>
-        <w:t>25</w:t>
-      </w:r>
-      <w:r>
-        <w:t xml:space="preserve">/Grenvy </w:t>
-      </w:r>
-      <w:r>
-        <w:rPr>
-          <w:b/>
-        </w:rPr>
-        <w:t>36</w:t>
-      </w:r>
-      <w:r>
-        <w:t xml:space="preserve">; Been </w:t>
-      </w:r>
-      <w:r>
-        <w:rPr>
-          <w:b/>
-        </w:rPr>
-        <w:t>46</w:t>
-      </w:r>
-      <w:r>
-        <w:t xml:space="preserve">; Charles </w:t>
-      </w:r>
-      <w:r>
-        <w:rPr>
-          <w:b/>
-        </w:rPr>
-        <w:t>24</w:t>
-      </w:r>
-      <w:r>
-        <w:t xml:space="preserve">. All </w:t>
-      </w:r>
-      <w:r>
-        <w:rPr>
-          <w:b/>
-        </w:rPr>
-        <w:t>rejected</w:t>
-      </w:r>
-      <w:r>
-        <w:t xml:space="preserve"> vs John L / Frank / Boyd. *Image seen.* </w:t>
-      </w:r>
-      <w:r>
-        <w:rPr>
-          <w:b/>
-        </w:rPr>
-        <w:t>C1127–C1131</w:t>
-      </w:r>
-      <w:r>
-        <w:t xml:space="preserve"> </w:t>
-      </w:r>
-      <w:r>
-        <w:rPr>
-          <w:b/>
-        </w:rPr>
-        <w:t>S814–S818</w:t>
-      </w:r>
-      <w:r>
-        <w:t>.</w:t>
-      </w:r>
-    </w:p>
-    <w:p>
-      <w:r>
-        <w:t xml:space="preserve">191. Remaining 1950 Madison adult Newman males William </w:t>
-      </w:r>
-      <w:r>
-        <w:rPr>
-          <w:b/>
-        </w:rPr>
-        <w:t>48</w:t>
-      </w:r>
-      <w:r>
-        <w:t xml:space="preserve"> / Zelma </w:t>
-      </w:r>
-      <w:r>
-        <w:rPr>
-          <w:b/>
-        </w:rPr>
-        <w:t>48</w:t>
-      </w:r>
-      <w:r>
-        <w:t xml:space="preserve"> / Hiram </w:t>
-      </w:r>
-      <w:r>
-        <w:rPr>
-          <w:b/>
-        </w:rPr>
-        <w:t>36</w:t>
-      </w:r>
-      <w:r>
-        <w:t xml:space="preserve"> / W M </w:t>
-      </w:r>
-      <w:r>
-        <w:rPr>
-          <w:b/>
-        </w:rPr>
-        <w:t>20</w:t>
-      </w:r>
-      <w:r>
-        <w:t xml:space="preserve"> / Lee </w:t>
-      </w:r>
-      <w:r>
-        <w:rPr>
-          <w:b/>
-        </w:rPr>
-        <w:t>19</w:t>
-      </w:r>
-      <w:r>
-        <w:t xml:space="preserve"> </w:t>
-      </w:r>
-      <w:r>
-        <w:rPr>
-          <w:b/>
-        </w:rPr>
-        <w:t>rejected</w:t>
-      </w:r>
-      <w:r>
-        <w:t xml:space="preserve"> vs Frank ~</w:t>
-      </w:r>
-      <w:r>
-        <w:rPr>
-          <w:b/>
-        </w:rPr>
-        <w:t>61</w:t>
-      </w:r>
-      <w:r>
-        <w:t xml:space="preserve">. Combined with Dewey </w:t>
-      </w:r>
-      <w:r>
-        <w:rPr>
-          <w:b/>
-        </w:rPr>
-        <w:t>26</w:t>
-      </w:r>
-      <w:r>
-        <w:t xml:space="preserve"> + Shelly+Grace: </w:t>
-      </w:r>
-      <w:r>
-        <w:rPr>
-          <w:b/>
-        </w:rPr>
-        <w:t>PROBABLE</w:t>
-      </w:r>
-      <w:r>
-        <w:t xml:space="preserve"> Madison 1950 name-index negative. *Image seen / index.* </w:t>
-      </w:r>
-      <w:r>
-        <w:rPr>
-          <w:b/>
-        </w:rPr>
-        <w:t>C1132–C1138</w:t>
-      </w:r>
-      <w:r>
-        <w:t xml:space="preserve"> </w:t>
-      </w:r>
-      <w:r>
-        <w:rPr>
-          <w:b/>
-        </w:rPr>
-        <w:t>S819–S824</w:t>
-      </w:r>
-      <w:r>
-        <w:t>.</w:t>
-      </w:r>
-    </w:p>
-    <w:p>
-      <w:r>
-        <w:t xml:space="preserve">192. Estill 1930 [`_indx-m-q.txt`](https://www.us-census.org/pub/usgenweb/census/ky/estill/1930/_indx-m-q.txt) Fred/Herbert only. [`_partial.txt`](https://www.us-census.org/pub/usgenweb/census/ky/estill/1930/_partial.txt) </w:t>
-      </w:r>
-      <w:r>
-        <w:rPr>
-          <w:b/>
-        </w:rPr>
-        <w:t>33-8</w:t>
-      </w:r>
-      <w:r>
-        <w:t xml:space="preserve"> still unpublished; </w:t>
-      </w:r>
-      <w:r>
-        <w:rPr>
-          <w:b/>
-        </w:rPr>
-        <w:t>33-5</w:t>
-      </w:r>
-      <w:r>
-        <w:t xml:space="preserve"> also unpublished. NARA [M1930](https://www.archives.gov/research/census/1930/enumeration-districts-maps.html) rolls </w:t>
-      </w:r>
-      <w:r>
-        <w:rPr>
-          <w:b/>
-        </w:rPr>
-        <w:t>22/23</w:t>
-      </w:r>
-      <w:r>
-        <w:t xml:space="preserve"> reconfirm. FS </w:t>
-      </w:r>
-      <w:r>
-        <w:rPr>
-          <w:b/>
-        </w:rPr>
-        <w:t>403</w:t>
-      </w:r>
-      <w:r>
-        <w:t xml:space="preserve"> (R011-50). *Transcription / catalog / pamphlet.* </w:t>
-      </w:r>
-      <w:r>
-        <w:rPr>
-          <w:b/>
-        </w:rPr>
-        <w:t>C1139–C1148</w:t>
-      </w:r>
-      <w:r>
-        <w:t xml:space="preserve"> </w:t>
-      </w:r>
-      <w:r>
-        <w:rPr>
-          <w:b/>
-        </w:rPr>
-        <w:t>S825–S834</w:t>
+        <w:t>S848–S858</w:t>
       </w:r>
       <w:r>
         <w:t>.</w:t>
@@ -24228,7 +24807,7 @@
     </w:p>
     <w:p>
       <w:r>
-        <w:t>| S745 | `../sources/catalog/nara-1930-ed-maps-pass97.html` | [NARA M1930](https://www.archives.gov/research/census/1930/enumeration-districts-maps.html) | Roll 22 Estill; roll 23 Lee–Woodford | pamphlet |</w:t>
+        <w:t>| S745 | `../sources/catalog/nara-1930-ed-maps-pass97.html` | [NARA 1930 ED maps](https://www.archives.gov/research/census/1930/enumeration-districts-maps.html) | Pass 97 IDs withdrawn; see S838 | pamphlet |</w:t>
       </w:r>
     </w:p>
     <w:p>
@@ -24364,6 +24943,41 @@
     <w:p>
       <w:r>
         <w:t>| S834 | `../sources/census/pass100-extract-2026-10-31.txt` | This session | Pass 100 extract | extract |</w:t>
+      </w:r>
+    </w:p>
+    <w:p>
+      <w:r>
+        <w:t>| S835 | `../sources/catalog/ia-meta-602-pass101.json` | [IA 602](https://archive.org/details/14thcensusofpopu602unit) | Still 515 | catalog |</w:t>
+      </w:r>
+    </w:p>
+    <w:p>
+      <w:r>
+        <w:t>| S838 | `../sources/catalog/nara-1930-ed-maps-pass101.html` | [NARA 1930 ED maps](https://www.archives.gov/research/census/1930/enumeration-districts-maps.html) | M1930 roll 15 = KY; A3378 22/23 = KY split | pamphlet |</w:t>
+      </w:r>
+    </w:p>
+    <w:p>
+      <w:r>
+        <w:t>| S841 | `../sources/census/pass101/crops/estill-1950-ed-map-preview.jpg` | [NARA 1950](https://1950census.archives.gov/) | 1950 33-8 = Millers Creek | image seen |</w:t>
+      </w:r>
+    </w:p>
+    <w:p>
+      <w:r>
+        <w:t>| S842 | `../sources/census/pass101/crops/estill-1950-ed-desc-0002-33-5-33-8.jpg` | [NARA 1950](https://1950census.archives.gov/) | 33-5 Ravenna; 33-8 Millers Creek | image seen |</w:t>
+      </w:r>
+    </w:p>
+    <w:p>
+      <w:r>
+        <w:t>| S844 | `../sources/census/pass101/43290879-Kentucky-154364-0016.jpg` | [NARA 1950](https://1950census.archives.gov/) | Boyd 19 rejected | image seen |</w:t>
+      </w:r>
+    </w:p>
+    <w:p>
+      <w:r>
+        <w:t>| S848 | `../sources/catalog/usgennet-lee-wills-pass101.html` | [USGenNet Lee wills](https://usgennet.org/usa/ky/county/lee/wills/) | No Samuel P. | transcription only |</w:t>
+      </w:r>
+    </w:p>
+    <w:p>
+      <w:r>
+        <w:t>| S857 | `../sources/census/pass101-extract-2026-10-31.txt` | This session | Pass 101 extract | extract |</w:t>
       </w:r>
     </w:p>
     <w:p>

</xml_diff>

<commit_message>
Pass 102: M1930 KY list is Estill+Irvine; 1926 weekly is Post-Dispatch
Democrat SN89051010 has no 1926 film; Journal holds June 10-17 only.
Dardanelle Post-Dispatch film includes Aug 1926. Station Camp is not
a named M1930 MCD map. Citizen digitized 1899-1922; Hutchins film to 1958.

Co-authored-by: blakereaganlaw <blakereaganlaw@gmail.com>
</commit_message>
<xml_diff>
--- a/research/dora-ella-newnam/book/Dora-Ella-Newnam-Stone-A-Life.docx
+++ b/research/dora-ella-newnam/book/Dora-Ella-Newnam-Stone-A-Life.docx
@@ -261,6 +261,11 @@
     </w:p>
     <w:p>
       <w:r>
+        <w:t>47. [Pass 102. The surviving 1926 weekly is the Post-Dispatch](#pass-102-the-surviving-1926-weekly-is-the-post-dispatch)</w:t>
+      </w:r>
+    </w:p>
+    <w:p>
+      <w:r>
         <w:br w:type="page"/>
       </w:r>
     </w:p>
@@ -8993,6 +8998,76 @@
       </w:r>
     </w:p>
     <w:p>
+      <w:pPr>
+        <w:pStyle w:val="Heading2"/>
+      </w:pPr>
+      <w:r>
+        <w:t>Pass 102. The surviving 1926 weekly is the Post-Dispatch</w:t>
+      </w:r>
+    </w:p>
+    <w:p>
+      <w:r>
+        <w:t>The National Archives pamphlet that lists every 1930 enumeration-district map now names the Kentucky sheets. Estill County has a county map and an Irvine city map. Lee has a county map and no Beattyville sheet. Madison has Richmond, not Berea. Owsley and Wolfe are county-only. Woodford has Versailles. Station Camp is not a named minor-civil-division map. District 33-8 lives on the Estill county sheet. The maps have not been read. [C1169] [S859]</w:t>
+      </w:r>
+    </w:p>
+    <w:p>
+      <w:r>
+        <w:t>The 1930 team page and the unpublished-district list are unchanged. 33-8 is still Station Camp South, stamps 095A–102B, still missing from the Internet Archive T626-742 scan. A search for T1224 Kentucky and for another 742 identifier returned nothing. The 1930 Microfilm Locator is documented as a geographic finding aid; its search form is not on the landing page this pass. FamilySearch collection 2329948 rendered a login shell. [C1170] [C1171] [C1172] [S860] [S861] [S862] [S863]</w:t>
+      </w:r>
+    </w:p>
+    <w:p>
+      <w:r>
+        <w:t>The 1926 newspaper hole is now a holdings fact, not a title list. *The Danville Democrat* of 1899–1927 is Library of Congress control number SN89051010 — not the 1930–1945 revival. It is not digitized. The recorded film is one issue in April 1908 at the Arkansas State Archives and one issue in July 1915 at the University of Arkansas. There is no 1926 Democrat in that directory. [C1173] [S864]</w:t>
+      </w:r>
+    </w:p>
+    <w:p>
+      <w:r>
+        <w:t>*The Yell County Journal* of Ola, 1925–1934, is still not digitized. The Arkansas State Archives holds 10–17 June 1926 and nothing else. August 1926 is not among those reels. [C1174] [S865]</w:t>
+      </w:r>
+    </w:p>
+    <w:p>
+      <w:r>
+        <w:t xml:space="preserve">The *Dardanelle Post-Dispatch*, 190?–1976, LCCN SN89051008, is also not digitized. Its film </w:t>
+      </w:r>
+      <w:r>
+        <w:rPr>
+          <w:b/>
+        </w:rPr>
+        <w:t>does</w:t>
+      </w:r>
+      <w:r>
+        <w:t xml:space="preserve"> cover August 1926: the Arkansas State Archives from January 1911 through December 1955; the Arkansas River Valley Regional Library in Dardanelle from June 1923 through April 1928; the same long run at Pope County Library in Russellville and at the University of Arkansas. That is the surviving weekly for the month she died. Those reels have not been read. [C1175] [S866]</w:t>
+      </w:r>
+    </w:p>
+    <w:p>
+      <w:r>
+        <w:t>Kentucky’s digital newspaper program still ends the Berea *Citizen* in 1922. Hutchins Library’s own guide lists the paper on microfilm from 1899 through 1958 and the later *Berea Citizen* from 1958 through 2008. June 1958 is still on site. Genealogy Trails’ Lee World War I tables still have no Newnam, Newman, or McCoy. There is no free Kentucky draft-card index on the genealogy-branches list. The USGenNet Lee wills landing still has no Samuel P. Do not re-ask the clerk. Do not print 1966 as fact. [C1176] [C1177] [C1178] [C1179] [C1180] [S868] [S869] [S870] [S872] [S873]</w:t>
+      </w:r>
+    </w:p>
+    <w:p>
+      <w:r>
+        <w:t xml:space="preserve">John 38 and Jennie stay </w:t>
+      </w:r>
+      <w:r>
+        <w:rPr>
+          <w:b/>
+        </w:rPr>
+        <w:t>rejected</w:t>
+      </w:r>
+      <w:r>
+        <w:t xml:space="preserve">. Floyd is still </w:t>
+      </w:r>
+      <w:r>
+        <w:rPr>
+          <w:b/>
+        </w:rPr>
+        <w:t>not merged</w:t>
+      </w:r>
+      <w:r>
+        <w:t xml:space="preserve"> with Boyd. The 1926 retrieval path is the *Dardanelle Post-Dispatch*, not the Democrat and not the Journal’s June issues. Do not print 1966 or 1976 as proven deaths. Do not print Floyd as Boyd. Do not print 1962 as McCoy’s death. Do not print the 1942 Combs charge as fact. [C1181]</w:t>
+      </w:r>
+    </w:p>
+    <w:p>
       <w:r>
         <w:t xml:space="preserve">In Madison County in 1950 a </w:t>
       </w:r>
@@ -9256,16 +9331,16 @@
     </w:p>
     <w:p>
       <w:r>
-        <w:t xml:space="preserve">The 1926 week she died is still unread in original paper. *The Yell County Journal* of Ola ran from 1925 to 1934 (LCCN SN90050035). The *Danville Democrat* of 1899–1927 was still publishing that August. The *Dardanelle Post-Dispatch* (LCCN SN89051008, 190?–1976) was a living weekly and is </w:t>
-      </w:r>
-      <w:r>
-        <w:rPr>
-          <w:b/>
-        </w:rPr>
-        <w:t>not</w:t>
-      </w:r>
-      <w:r>
-        <w:t xml:space="preserve"> digitized on the Library of Congress item record. Internet Archive holds none of those 1926 issues. A Chronicling America search for “Stone Ola Arkansas” in 1926 returns the *Osceola Times* and other counties — not Yell. Lee obituaries S, D, and L have no Dora Stone notice for 1926. [C314] [C315] [C343] [C346] [C347] [C317]</w:t>
+        <w:t xml:space="preserve">The 1926 week she died is still unread in original paper. *The Yell County Journal* of Ola ran from 1925 to 1934 (LCCN SN90050035); the recorded film is 10–17 June 1926 only. The *Danville Democrat* of 1899–1927 (LCCN SN89051010) was still publishing that August, but the recorded holdings are 2 April 1908 and 15 July 1915 — no 1926 issue. The *Dardanelle Post-Dispatch* (LCCN SN89051008, 190?–1976) is the surviving weekly: its film at the Arkansas State Archives, the Dardanelle library, Pope County Library, and the University of Arkansas </w:t>
+      </w:r>
+      <w:r>
+        <w:rPr>
+          <w:b/>
+        </w:rPr>
+        <w:t>includes</w:t>
+      </w:r>
+      <w:r>
+        <w:t xml:space="preserve"> August 1926. Those reels have not been read. Internet Archive holds none of those 1926 issues. A Chronicling America search for “Stone Ola Arkansas” in 1926 returns the *Osceola Times* and other counties — not Yell. Lee obituaries S, D, and L have no Dora Stone notice for 1926. [C314] [C315] [C343] [C346] [C347] [C317] [C1173] [C1174] [C1175]</w:t>
       </w:r>
     </w:p>
     <w:p>
@@ -11048,16 +11123,7 @@
         <w:t>1930 33-8</w:t>
       </w:r>
       <w:r>
-        <w:t xml:space="preserve"> on FS/Ancestry/NARA film (absent IA 742; </w:t>
-      </w:r>
-      <w:r>
-        <w:rPr>
-          <w:b/>
-        </w:rPr>
-        <w:t>743</w:t>
-      </w:r>
-      <w:r>
-        <w:t xml:space="preserve"> is Fayette; stamped </w:t>
+        <w:t xml:space="preserve"> on FS/Ancestry/NARA film (absent IA 742; stamped </w:t>
       </w:r>
       <w:r>
         <w:rPr>
@@ -11066,16 +11132,7 @@
         <w:t>095A–102B</w:t>
       </w:r>
       <w:r>
-        <w:t xml:space="preserve"> unpublished; </w:t>
-      </w:r>
-      <w:r>
-        <w:rPr>
-          <w:b/>
-        </w:rPr>
-        <w:t>33-5</w:t>
-      </w:r>
-      <w:r>
-        <w:t xml:space="preserve"> also unpublished) + </w:t>
+        <w:t xml:space="preserve"> unpublished) + </w:t>
       </w:r>
       <w:r>
         <w:rPr>
@@ -11084,22 +11141,103 @@
         <w:t>M1930 roll 15</w:t>
       </w:r>
       <w:r>
-        <w:t xml:space="preserve"> / </w:t>
-      </w:r>
-      <w:r>
-        <w:rPr>
-          <w:b/>
-        </w:rPr>
-        <w:t>A3378 roll 22</w:t>
-      </w:r>
-      <w:r>
-        <w:t xml:space="preserve"> Estill maps + FS </w:t>
-      </w:r>
-      <w:r>
-        <w:rPr>
-          <w:b/>
-        </w:rPr>
-        <w:t>520482</w:t>
+        <w:t xml:space="preserve"> Estill county + Irvine maps, </w:t>
+      </w:r>
+      <w:r>
+        <w:rPr>
+          <w:b/>
+        </w:rPr>
+        <w:t>B058</w:t>
+      </w:r>
+      <w:r>
+        <w:t xml:space="preserve"> *Dardanelle Post-Dispatch* </w:t>
+      </w:r>
+      <w:r>
+        <w:rPr>
+          <w:b/>
+        </w:rPr>
+        <w:t>Aug–Sep 1926</w:t>
+      </w:r>
+      <w:r>
+        <w:t xml:space="preserve"> film at AR Hist Comn / Dardanelle / Pope / UArk (</w:t>
+      </w:r>
+      <w:r>
+        <w:rPr>
+          <w:b/>
+        </w:rPr>
+        <w:t>C1175</w:t>
+      </w:r>
+      <w:r>
+        <w:t xml:space="preserve"> — do not chase Democrat 1926 film or Journal August), </w:t>
+      </w:r>
+      <w:r>
+        <w:rPr>
+          <w:b/>
+        </w:rPr>
+        <w:t>B088</w:t>
+      </w:r>
+      <w:r>
+        <w:t xml:space="preserve"> Antioch </w:t>
+      </w:r>
+      <w:r>
+        <w:rPr>
+          <w:b/>
+        </w:rPr>
+        <w:t>242</w:t>
+      </w:r>
+      <w:r>
+        <w:t xml:space="preserve"> catalog already </w:t>
+      </w:r>
+      <w:r>
+        <w:rPr>
+          <w:b/>
+        </w:rPr>
+        <w:t>proven</w:t>
+      </w:r>
+      <w:r>
+        <w:t xml:space="preserve"> — do not stall, </w:t>
+      </w:r>
+      <w:r>
+        <w:rPr>
+          <w:b/>
+        </w:rPr>
+        <w:t>B045/B061</w:t>
+      </w:r>
+      <w:r>
+        <w:t xml:space="preserve"> FS sign-in (clerk already recorded — do not re-ask), </w:t>
+      </w:r>
+      <w:r>
+        <w:rPr>
+          <w:b/>
+        </w:rPr>
+        <w:t>B069/B047</w:t>
+      </w:r>
+      <w:r>
+        <w:t xml:space="preserve"> M1509 </w:t>
+      </w:r>
+      <w:r>
+        <w:rPr>
+          <w:b/>
+        </w:rPr>
+        <w:t>KY45</w:t>
+      </w:r>
+      <w:r>
+        <w:t xml:space="preserve"> cards, </w:t>
+      </w:r>
+      <w:r>
+        <w:rPr>
+          <w:b/>
+        </w:rPr>
+        <w:t>B082</w:t>
+      </w:r>
+      <w:r>
+        <w:t xml:space="preserve"> Duell-Clark / cert </w:t>
+      </w:r>
+      <w:r>
+        <w:rPr>
+          <w:b/>
+        </w:rPr>
+        <w:t>17762</w:t>
       </w:r>
       <w:r>
         <w:t xml:space="preserve">, </w:t>
@@ -11108,127 +11246,10 @@
         <w:rPr>
           <w:b/>
         </w:rPr>
-        <w:t>B088</w:t>
-      </w:r>
-      <w:r>
-        <w:t xml:space="preserve"> Antioch </w:t>
-      </w:r>
-      <w:r>
-        <w:rPr>
-          <w:b/>
-        </w:rPr>
-        <w:t>242</w:t>
-      </w:r>
-      <w:r>
-        <w:t xml:space="preserve"> catalog already </w:t>
-      </w:r>
-      <w:r>
-        <w:rPr>
-          <w:b/>
-        </w:rPr>
-        <w:t>proven</w:t>
-      </w:r>
-      <w:r>
-        <w:t xml:space="preserve"> — do not stall (NARA/FS/Ancestry T625-602 remainder only), </w:t>
-      </w:r>
-      <w:r>
-        <w:rPr>
-          <w:b/>
-        </w:rPr>
-        <w:t>B045</w:t>
-      </w:r>
-      <w:r>
-        <w:t xml:space="preserve"> (FS </w:t>
-      </w:r>
-      <w:r>
-        <w:rPr>
-          <w:b/>
-        </w:rPr>
-        <w:t>127913 / 127891</w:t>
-      </w:r>
-      <w:r>
-        <w:t xml:space="preserve">) and </w:t>
-      </w:r>
-      <w:r>
-        <w:rPr>
-          <w:b/>
-        </w:rPr>
-        <w:t>B061</w:t>
-      </w:r>
-      <w:r>
-        <w:t xml:space="preserve"> (</w:t>
-      </w:r>
-      <w:r>
-        <w:rPr>
-          <w:b/>
-        </w:rPr>
-        <w:t>127869 / 964964</w:t>
-      </w:r>
-      <w:r>
-        <w:t xml:space="preserve">, clerk </w:t>
-      </w:r>
-      <w:r>
-        <w:rPr>
-          <w:b/>
-        </w:rPr>
-        <w:t>Tyler Phillips</w:t>
-      </w:r>
-      <w:r>
-        <w:t xml:space="preserve"> already recorded — do not re-ask), </w:t>
-      </w:r>
-      <w:r>
-        <w:rPr>
-          <w:b/>
-        </w:rPr>
-        <w:t>B087</w:t>
-      </w:r>
-      <w:r>
-        <w:t xml:space="preserve"> 1942 Combs charge, </w:t>
-      </w:r>
-      <w:r>
-        <w:rPr>
-          <w:b/>
-        </w:rPr>
-        <w:t>B069/B047</w:t>
-      </w:r>
-      <w:r>
-        <w:t xml:space="preserve"> M1509 </w:t>
-      </w:r>
-      <w:r>
-        <w:rPr>
-          <w:b/>
-        </w:rPr>
-        <w:t>KY45</w:t>
-      </w:r>
-      <w:r>
-        <w:t xml:space="preserve"> cards, </w:t>
-      </w:r>
-      <w:r>
-        <w:rPr>
-          <w:b/>
-        </w:rPr>
-        <w:t>B082</w:t>
-      </w:r>
-      <w:r>
-        <w:t xml:space="preserve"> Duell-Clark volumes / KHS 1957–1969 / cert </w:t>
-      </w:r>
-      <w:r>
-        <w:rPr>
-          <w:b/>
-        </w:rPr>
-        <w:t>17762</w:t>
-      </w:r>
-      <w:r>
-        <w:t xml:space="preserve">, </w:t>
-      </w:r>
-      <w:r>
-        <w:rPr>
-          <w:b/>
-        </w:rPr>
-        <w:t>B083</w:t>
-      </w:r>
-      <w:r>
-        <w:t xml:space="preserve">, </w:t>
+        <w:t>B055/B080</w:t>
+      </w:r>
+      <w:r>
+        <w:t xml:space="preserve"> Hutchins June 1958 page, </w:t>
       </w:r>
       <w:r>
         <w:rPr>
@@ -11237,43 +11258,7 @@
         <w:t>B085</w:t>
       </w:r>
       <w:r>
-        <w:t xml:space="preserve"> McCoy after 1930, </w:t>
-      </w:r>
-      <w:r>
-        <w:rPr>
-          <w:b/>
-        </w:rPr>
-        <w:t>B016</w:t>
-      </w:r>
-      <w:r>
-        <w:t xml:space="preserve"> Rissie 15 servant 1910 (not merged), </w:t>
-      </w:r>
-      <w:r>
-        <w:rPr>
-          <w:b/>
-        </w:rPr>
-        <w:t>B055/B080</w:t>
-      </w:r>
-      <w:r>
-        <w:t xml:space="preserve"> Madison DC / Hutchins *Citizen* June 1958 / unpublished Berea 1940 / Combs funeral, </w:t>
-      </w:r>
-      <w:r>
-        <w:rPr>
-          <w:b/>
-        </w:rPr>
-        <w:t>B049/B058</w:t>
-      </w:r>
-      <w:r>
-        <w:t xml:space="preserve"> (*Yell County Journal* </w:t>
-      </w:r>
-      <w:r>
-        <w:rPr>
-          <w:b/>
-        </w:rPr>
-        <w:t>sn90050035</w:t>
-      </w:r>
-      <w:r>
-        <w:t xml:space="preserve"> not digitized; CA 1926 no Yell hit).</w:t>
+        <w:t xml:space="preserve"> McCoy after 1930.</w:t>
       </w:r>
     </w:p>
     <w:p>
@@ -23588,6 +23573,125 @@
     </w:p>
     <w:p>
       <w:r>
+        <w:t xml:space="preserve">201. Official NARA [M1930 pamphlet](https://www.archives.gov/files/research/microfilm/m1930.pdf) List of Maps: Estill + Irvine; Lee no city; Madison + Richmond; Owsley; Wolfe; Woodford + Versailles. Station Camp not a named MCD map. *Pamphlet.* </w:t>
+      </w:r>
+      <w:r>
+        <w:rPr>
+          <w:b/>
+        </w:rPr>
+        <w:t>C1169</w:t>
+      </w:r>
+      <w:r>
+        <w:t xml:space="preserve"> </w:t>
+      </w:r>
+      <w:r>
+        <w:rPr>
+          <w:b/>
+        </w:rPr>
+        <w:t>S859</w:t>
+      </w:r>
+      <w:r>
+        <w:t>.</w:t>
+      </w:r>
+    </w:p>
+    <w:p>
+      <w:r>
+        <w:t xml:space="preserve">202. [Estill 1930 team](https://www.us-census.org/states/kentucky/teams/Estill1930-T626-742.htm) 33-8 still unpublished. IA Solr T1224 KY / T626-742 </w:t>
+      </w:r>
+      <w:r>
+        <w:rPr>
+          <w:b/>
+        </w:rPr>
+        <w:t>0</w:t>
+      </w:r>
+      <w:r>
+        <w:t xml:space="preserve">. NARA [1930 landing](https://www.archives.gov/research/census/1930/) locator form absent. FS [2329948](https://www.familysearch.org/en/search/collection/2329948) SPA. *Catalog.* </w:t>
+      </w:r>
+      <w:r>
+        <w:rPr>
+          <w:b/>
+        </w:rPr>
+        <w:t>C1170–C1172</w:t>
+      </w:r>
+      <w:r>
+        <w:t xml:space="preserve"> </w:t>
+      </w:r>
+      <w:r>
+        <w:rPr>
+          <w:b/>
+        </w:rPr>
+        <w:t>S860–S863</w:t>
+      </w:r>
+      <w:r>
+        <w:t>.</w:t>
+      </w:r>
+    </w:p>
+    <w:p>
+      <w:r>
+        <w:t xml:space="preserve">203. LOC [*Danville Democrat* 1899–1927](https://www.loc.gov/item/sn89051010/) SN89051010: no 1926 holdings. [*Yell County Journal*](https://www.loc.gov/item/sn90050035/) SN90050035: </w:t>
+      </w:r>
+      <w:r>
+        <w:rPr>
+          <w:b/>
+        </w:rPr>
+        <w:t>1926:6:10-17</w:t>
+      </w:r>
+      <w:r>
+        <w:t xml:space="preserve"> only. [*Dardanelle Post-Dispatch*](https://www.loc.gov/item/sn89051008/) SN89051008: film </w:t>
+      </w:r>
+      <w:r>
+        <w:rPr>
+          <w:b/>
+        </w:rPr>
+        <w:t>includes Aug 1926</w:t>
+      </w:r>
+      <w:r>
+        <w:t xml:space="preserve">. *Catalog.* </w:t>
+      </w:r>
+      <w:r>
+        <w:rPr>
+          <w:b/>
+        </w:rPr>
+        <w:t>C1173–C1175</w:t>
+      </w:r>
+      <w:r>
+        <w:t xml:space="preserve"> </w:t>
+      </w:r>
+      <w:r>
+        <w:rPr>
+          <w:b/>
+        </w:rPr>
+        <w:t>S864–S866</w:t>
+      </w:r>
+      <w:r>
+        <w:t>.</w:t>
+      </w:r>
+    </w:p>
+    <w:p>
+      <w:r>
+        <w:t xml:space="preserve">204. UK [NDNP listtitles](https://www.uky.edu/Projects/NDNP/listtitles.html): *Citizen* digitized 1899–1922. Berea [Hutchins newspapers](https://libraryguides.berea.edu/newspapers): microfilm 1899–1958. GT [Lee WWI](https://genealogytrails.com/ken/lee/wwi_draft_cards.html) nil. USGenNet [Lee wills](https://usgennet.org/usa/ky/county/lee/wills/) no Samuel P. *Catalog / transcription.* </w:t>
+      </w:r>
+      <w:r>
+        <w:rPr>
+          <w:b/>
+        </w:rPr>
+        <w:t>C1176–C1181</w:t>
+      </w:r>
+      <w:r>
+        <w:t xml:space="preserve"> </w:t>
+      </w:r>
+      <w:r>
+        <w:rPr>
+          <w:b/>
+        </w:rPr>
+        <w:t>S868–S878</w:t>
+      </w:r>
+      <w:r>
+        <w:t>.</w:t>
+      </w:r>
+    </w:p>
+    <w:p>
+      <w:r>
         <w:br w:type="page"/>
       </w:r>
     </w:p>
@@ -24978,6 +25082,41 @@
     <w:p>
       <w:r>
         <w:t>| S857 | `../sources/census/pass101-extract-2026-10-31.txt` | This session | Pass 101 extract | extract |</w:t>
+      </w:r>
+    </w:p>
+    <w:p>
+      <w:r>
+        <w:t>| S859 | `../sources/catalog/nara-m1930-ky-list-extract-pass102.txt` | [NARA M1930](https://www.archives.gov/files/research/microfilm/m1930.pdf) | Estill+Irvine; no Station Camp MCD | pamphlet |</w:t>
+      </w:r>
+    </w:p>
+    <w:p>
+      <w:r>
+        <w:t>| S864 | `../sources/press/loc-item-sn89051010-pass102.json` | [LOC SN89051010](https://www.loc.gov/item/sn89051010/) | Democrat 1899–1927; no 1926 film | catalog |</w:t>
+      </w:r>
+    </w:p>
+    <w:p>
+      <w:r>
+        <w:t>| S865 | `../sources/press/loc-item-sn90050035-pass102.json` | [LOC SN90050035](https://www.loc.gov/item/sn90050035/) | Journal June 10–17 1926 only | catalog |</w:t>
+      </w:r>
+    </w:p>
+    <w:p>
+      <w:r>
+        <w:t>| S866 | `../sources/press/loc-item-sn89051008-pass102.json` | [LOC SN89051008](https://www.loc.gov/item/sn89051008/) | Post-Dispatch film includes Aug 1926 | catalog |</w:t>
+      </w:r>
+    </w:p>
+    <w:p>
+      <w:r>
+        <w:t>| S868 | `../sources/press/uky-ndnp-listtitles-pass102.html` | [UK NDNP](https://www.uky.edu/Projects/NDNP/listtitles.html) | Citizen digitized 1899–1922 | catalog |</w:t>
+      </w:r>
+    </w:p>
+    <w:p>
+      <w:r>
+        <w:t>| S869 | `../sources/press/berea-libguide-newspapers-pass102.html` | [Hutchins newspapers](https://libraryguides.berea.edu/newspapers) | Citizen microfilm 1899–1958 | catalog |</w:t>
+      </w:r>
+    </w:p>
+    <w:p>
+      <w:r>
+        <w:t>| S878 | `../sources/census/pass102-extract-2026-10-31.txt` | This session | Pass 102 extract | extract |</w:t>
       </w:r>
     </w:p>
     <w:p>

</xml_diff>

<commit_message>
Pass 103–105: Pope Roll 5, Madison 1958b, UArk F419.D37 D3
T1224 roll 69 is Kansas+Kentucky (descriptions unread). Pope County
Library Roll 5 is 21 Jun 1923–26 Apr 1928. Madison 1958b independently
lists DAVID G NEWMAN 19 Jun 1958 vol 028 file 13719 (still POSSIBLE
only vs Frank). Madison library Citizen app is 2008–2026 only. UArk
spreadsheet Microfilm F419.D37 D3 Lib Has 1910:7:7–1955:3:31 includes
August 1926. Knox WWI N is Knox men only. Research not complete.

Co-authored-by: blakereaganlaw <blakereaganlaw@gmail.com>
</commit_message>
<xml_diff>
--- a/research/dora-ella-newnam/book/Dora-Ella-Newnam-Stone-A-Life.docx
+++ b/research/dora-ella-newnam/book/Dora-Ella-Newnam-Stone-A-Life.docx
@@ -266,6 +266,21 @@
     </w:p>
     <w:p>
       <w:r>
+        <w:t>48. [Pass 103. Roll 5 is at Pope County Library](#pass-103-roll-5-is-at-pope-county-library)</w:t>
+      </w:r>
+    </w:p>
+    <w:p>
+      <w:r>
+        <w:t>49. [Pass 104. The Madison library archive starts in 2008](#pass-104-the-madison-library-archive-starts-in-2008)</w:t>
+      </w:r>
+    </w:p>
+    <w:p>
+      <w:r>
+        <w:t>50. [Pass 105. Fayetteville holds the same 1926 weekly](#pass-105-fayetteville-holds-the-same-1926-weekly)</w:t>
+      </w:r>
+    </w:p>
+    <w:p>
+      <w:r>
         <w:br w:type="page"/>
       </w:r>
     </w:p>
@@ -9068,6 +9083,175 @@
       </w:r>
     </w:p>
     <w:p>
+      <w:pPr>
+        <w:pStyle w:val="Heading2"/>
+      </w:pPr>
+      <w:r>
+        <w:t>Pass 103. Roll 5 is at Pope County Library</w:t>
+      </w:r>
+    </w:p>
+    <w:p>
+      <w:r>
+        <w:t>The official National Archives T1224 pamphlet, seventeen pages, names the 1930 description rolls. They are rolls 61 through 90. Roll 69 is Kansas and Kentucky. Estill district 33-8 lives on that roll. The descriptions have not been read. [C1182] [S880]</w:t>
+      </w:r>
+    </w:p>
+    <w:p>
+      <w:r>
+        <w:t>Steve Morse’s 1930 transcribed-description tool returns nothing for Kentucky keywords Estill, Station, Station Camp, or 33-8. The page says the National Archives and FamilySearch data are no longer online. The us-census Estill 1930 directory still publishes only districts 33-1 through 33-4. Districts 33-5 through 33-14, including Station Camp South, remain unpublished. [C1183] [C1184] [S881] [S882]</w:t>
+      </w:r>
+    </w:p>
+    <w:p>
+      <w:r>
+        <w:t>Pope County Library’s Yell newspaper list names the reel. *Dardanelle Post-Dispatch* Roll 5 runs from 21 June 1923 through 26 April 1928. The library is at 116 East Third Street, Russellville, Arkansas. That reel includes August 1926. It has not been read. The Arkansas Digital Newspaper Program is Chronicling America only. digitalheritage.arkansas.gov did not resolve this pass. [C1185] [C1186] [S883] [S884]</w:t>
+      </w:r>
+    </w:p>
+    <w:p>
+      <w:r>
+        <w:t>A Chronicling America search for “Dora Stone” in 1926 returns one hit: the *Evening star* of Washington, D.C., 24 December 1926. Wrong place. Wrong date. Rejected. Newnam and Ola in 1926 return nothing. [C1193] [S891]</w:t>
+      </w:r>
+    </w:p>
+    <w:p>
+      <w:r>
+        <w:t>The free World War I ladders still do not produce Lee, Estill, or Owsley cards. Genealogy Trails’ Estill and Owsley military pages have no draft table. The Carter County roster of 4,434 names has five Newman men — Edward, James, Thornton, William, Willie — all Carter men. No Newnam. The McCoy surnames on that roster are other Carter men. They are not McCoy of Owsley and not John H. Kentucky Department for Libraries and Archives holds federal draft cards and published no name index in the twenty-nine-page introduction. [C1187] [C1188] [C1189] [S885] [S886] [S887]</w:t>
+      </w:r>
+    </w:p>
+    <w:p>
+      <w:r>
+        <w:t>Madison County’s 1958 K–R death year-file independently lists the same man already in the statewide index: Newman, David G, 19 June 1958, age seventy, death Madison, residence Madison, volume 028, file 13719. The year-files for 1956 through 1961 have no other Newman or Newnam and no Frank decedent. A William J. Hutchins, eighty-six, who died 20 February 1958 in Madison, is not the library and is not Frank. [C1190] [C1191] [C473] [S888] [S889]</w:t>
+      </w:r>
+    </w:p>
+    <w:p>
+      <w:r>
+        <w:t>The later title *The Berea Citizen*, Library of Congress control number SN85052075, begins 3 July 1958 and is not digitized. A death on 19 June 1958 is still *The Citizen* on the Hutchins June 1958 film. FamilySearch 1146342, 127913, and 1810731 rendered a login shell — roadblock step 52. Do not re-ask the clerk. Do not print 1966 as fact. [C1192] [C1195] [S890] [S893]</w:t>
+      </w:r>
+    </w:p>
+    <w:p>
+      <w:r>
+        <w:t xml:space="preserve">David G. remains </w:t>
+      </w:r>
+      <w:r>
+        <w:rPr>
+          <w:b/>
+        </w:rPr>
+        <w:t>possible</w:t>
+      </w:r>
+      <w:r>
+        <w:t xml:space="preserve"> only against Frank of Berea. The middle initial is G, not F. No contractor line sits on that year-file row. District 33-8 is still unpublished. The 1926 retrieval path is Pope Roll 5. Do not print 1966 or 1976 as proven deaths. Do not print Floyd as Boyd. Do not print 1962 as McCoy’s death. Do not print the 1942 Combs charge as fact. [C1196]</w:t>
+      </w:r>
+    </w:p>
+    <w:p>
+      <w:pPr>
+        <w:pStyle w:val="Heading2"/>
+      </w:pPr>
+      <w:r>
+        <w:t>Pass 104. The Madison library archive starts in 2008</w:t>
+      </w:r>
+    </w:p>
+    <w:p>
+      <w:r>
+        <w:t>Madison County Public Library hosts a *Berea Citizen Newspaper Archive* that embeds a local app. The app lists 201 monthly PDF files. The earliest is 17 and 24 April 2008. The latest is February 2026. The years present are 2008 through 2026. The string 1958 does not appear. June 1958 is not in that free modern archive. The notice, if it exists, remains on the Hutchins *Citizen* film. [C1197] [S896]</w:t>
+      </w:r>
+    </w:p>
+    <w:p>
+      <w:r>
+        <w:t>Pope County Library’s own county newspaper list is Russellville paper — the Courier-Democrat, the Gazette, the Advertiser. It does not hold the *Dardanelle Post-Dispatch*. The Yell reel list is a separate page. That is still Roll 5. [C1198] [S897]</w:t>
+      </w:r>
+    </w:p>
+    <w:p>
+      <w:r>
+        <w:t>Steve Morse’s other 1930 description form, `ed.php` rather than `ed2.php`, still offers Estill (33) and 33-8 in its dropdowns. The page still says the National Archives and FamilySearch data are no longer online. The search button is a JavaScript call. The descriptions have not been read. The National Archives HTML table again names T1224 roll 69 as Kansas and Kentucky. Internet Archive has no T1224 Kentucky item. [C1199] [C1200] [S898] [S899]</w:t>
+      </w:r>
+    </w:p>
+    <w:p>
+      <w:r>
+        <w:t>KYGenWeb’s Estill census page publishes 1880, districts 36 through 40, and nothing later. There is no 1930 extract for Station Camp South. The Estill wills page publishes James Scrivner, Henry Thomas, and Jacob Tipton. No Newnam. No Newman. No Samuel P. [C1201] [C1202] [S900] [S901]</w:t>
+      </w:r>
+    </w:p>
+    <w:p>
+      <w:r>
+        <w:t>The Arkansas State Archives finding aid for Pope County newspaper microfilm is behind a robot wall this pass. digitalheritage.arkansas.gov did not resolve. A search snippet for inventory 149 is the *Dardanelle Post* of 1882–1888, not the 1926 *Post-Dispatch*. Rejected as a 1926 path. WorldCat lists a published Owsley draft-card book, OCLC 54019565; the live page was a 403. [C1203] [S902]</w:t>
+      </w:r>
+    </w:p>
+    <w:p>
+      <w:r>
+        <w:t xml:space="preserve">David G. is still </w:t>
+      </w:r>
+      <w:r>
+        <w:rPr>
+          <w:b/>
+        </w:rPr>
+        <w:t>possible</w:t>
+      </w:r>
+      <w:r>
+        <w:t xml:space="preserve"> only against Frank of Berea. District 33-8 is still unpublished. The 1926 retrieval path is still Pope Roll 5. Do not print 1966 or 1976 as proven deaths. Do not print Floyd as Boyd. Do not print 1962 as McCoy’s death. Do not print the 1942 Combs charge as fact. [C1204]</w:t>
+      </w:r>
+    </w:p>
+    <w:p>
+      <w:pPr>
+        <w:pStyle w:val="Heading2"/>
+      </w:pPr>
+      <w:r>
+        <w:t>Pass 105. Fayetteville holds the same 1926 weekly</w:t>
+      </w:r>
+    </w:p>
+    <w:p>
+      <w:r>
+        <w:t xml:space="preserve">The University of Arkansas working spreadsheet of Arkansas newspapers on microfilm has 1,024 rows. *Dardanelle post=dispatch* is call number </w:t>
+      </w:r>
+      <w:r>
+        <w:rPr>
+          <w:b/>
+        </w:rPr>
+        <w:t>F419.D37 D3</w:t>
+      </w:r>
+      <w:r>
+        <w:t>, OCLC 19026544. The library’s own “Lib Has” note includes 7 July 1910 through 31 March 1955. August 1926 is inside that run. The film has not been read. Mullins Library has moved the microforms off-site during renovation. The spreadsheet is the holdings list. [C1205] [C1208] [S904] [S905]</w:t>
+      </w:r>
+    </w:p>
+    <w:p>
+      <w:r>
+        <w:t>The same sheet confirms what the Library of Congress already said about the Democrat. The 1899 *Danville Democrat* at Fayetteville is one issue: 15 July 1915. There is no 1926 Democrat there. A *Rural record* from Magazine Mountain is filmed for 17 June 1926 only. That is not the week she died. Rejected as the death-notice path. [C1206] [C1207]</w:t>
+      </w:r>
+    </w:p>
+    <w:p>
+      <w:r>
+        <w:t>Knox County’s World War I N-index lists five Newman men — Clarence, Ed, Joe Daniel, John E., Pete. They are Knox men. No Newnam. No Luther of Beattyville. Genealogy Trails’ Lee draft tables, 452 kilobytes this pass, still have no Newnam, Newman, or McCoy. [C1209] [C1210] [S906] [S907]</w:t>
+      </w:r>
+    </w:p>
+    <w:p>
+      <w:r>
+        <w:t>The Estill 1930 team page still names district 33-8 as Magisterial District 3, Station Camp, south part. It is still unpublished. T1224 roll 69 is still Kansas and Kentucky. Those descriptions have not been read. [C1211] [C1212]</w:t>
+      </w:r>
+    </w:p>
+    <w:p>
+      <w:r>
+        <w:t>A 2025 funeral notice for a Berea-born man names deceased parents David Grant Newman Jr. and Ruby Lee Riddle Newman. Living survivors are withheld. The notice densifies the junior line. It does not make the 1958 David G., age seventy, into Frank of Berea. [C1213] [C518] [S910]</w:t>
+      </w:r>
+    </w:p>
+    <w:p>
+      <w:r>
+        <w:t xml:space="preserve">David G. of 1958 is still </w:t>
+      </w:r>
+      <w:r>
+        <w:rPr>
+          <w:b/>
+        </w:rPr>
+        <w:t>possible</w:t>
+      </w:r>
+      <w:r>
+        <w:t xml:space="preserve"> only against Frank. District 33-8 is still unpublished. The 1926 retrieval path is now Pope Roll 5 </w:t>
+      </w:r>
+      <w:r>
+        <w:rPr>
+          <w:b/>
+        </w:rPr>
+        <w:t>and</w:t>
+      </w:r>
+      <w:r>
+        <w:t xml:space="preserve"> Fayetteville F419.D37 D3. Do not print 1966 or 1976 as proven deaths. Do not print Floyd as Boyd. Do not print 1962 as McCoy’s death. Do not print the 1942 Combs charge as fact. [C1214]</w:t>
+      </w:r>
+    </w:p>
+    <w:p>
       <w:r>
         <w:t xml:space="preserve">In Madison County in 1950 a </w:t>
       </w:r>
@@ -9916,7 +10100,52 @@
         <w:t>B049 / B058:</w:t>
       </w:r>
       <w:r>
-        <w:t xml:space="preserve"> 1926 *Beattyville Enterprise*, *Yell County Journal*, *Danville Democrat*, and *Dardanelle Post-Dispatch* still unread. Free catalogs closed (R010 steps 1–18). [C293] [C301] [C343] [C346]</w:t>
+        <w:t xml:space="preserve"> 1926 *Beattyville Enterprise*, *Yell County Journal*, *Danville Democrat*, and *Dardanelle Post-Dispatch* still unread. Democrat has </w:t>
+      </w:r>
+      <w:r>
+        <w:rPr>
+          <w:b/>
+        </w:rPr>
+        <w:t>no 1926 film</w:t>
+      </w:r>
+      <w:r>
+        <w:t xml:space="preserve">. Journal holds June </w:t>
+      </w:r>
+      <w:r>
+        <w:rPr>
+          <w:b/>
+        </w:rPr>
+        <w:t>10–17</w:t>
+      </w:r>
+      <w:r>
+        <w:t xml:space="preserve"> only. Retrieval is Pope </w:t>
+      </w:r>
+      <w:r>
+        <w:rPr>
+          <w:b/>
+        </w:rPr>
+        <w:t>Roll 5</w:t>
+      </w:r>
+      <w:r>
+        <w:t xml:space="preserve"> and UArk </w:t>
+      </w:r>
+      <w:r>
+        <w:rPr>
+          <w:b/>
+        </w:rPr>
+        <w:t>Microfilm F419.D37 D3</w:t>
+      </w:r>
+      <w:r>
+        <w:t xml:space="preserve"> (Lib Has </w:t>
+      </w:r>
+      <w:r>
+        <w:rPr>
+          <w:b/>
+        </w:rPr>
+        <w:t>&lt;1910:7:7-1955:3:31&gt;</w:t>
+      </w:r>
+      <w:r>
+        <w:t>). [C1173] [C1174] [C1185] [C1205]</w:t>
       </w:r>
     </w:p>
     <w:p>
@@ -11141,7 +11370,16 @@
         <w:t>M1930 roll 15</w:t>
       </w:r>
       <w:r>
-        <w:t xml:space="preserve"> Estill county + Irvine maps, </w:t>
+        <w:t xml:space="preserve"> Estill county + Irvine maps + </w:t>
+      </w:r>
+      <w:r>
+        <w:rPr>
+          <w:b/>
+        </w:rPr>
+        <w:t>T1224 roll 69</w:t>
+      </w:r>
+      <w:r>
+        <w:t xml:space="preserve"> descriptions, </w:t>
       </w:r>
       <w:r>
         <w:rPr>
@@ -11159,16 +11397,34 @@
         <w:t>Aug–Sep 1926</w:t>
       </w:r>
       <w:r>
-        <w:t xml:space="preserve"> film at AR Hist Comn / Dardanelle / Pope / UArk (</w:t>
-      </w:r>
-      <w:r>
-        <w:rPr>
-          <w:b/>
-        </w:rPr>
-        <w:t>C1175</w:t>
-      </w:r>
-      <w:r>
-        <w:t xml:space="preserve"> — do not chase Democrat 1926 film or Journal August), </w:t>
+        <w:t xml:space="preserve"> on Pope </w:t>
+      </w:r>
+      <w:r>
+        <w:rPr>
+          <w:b/>
+        </w:rPr>
+        <w:t>Roll 5</w:t>
+      </w:r>
+      <w:r>
+        <w:t xml:space="preserve"> / UArk </w:t>
+      </w:r>
+      <w:r>
+        <w:rPr>
+          <w:b/>
+        </w:rPr>
+        <w:t>F419.D37 D3</w:t>
+      </w:r>
+      <w:r>
+        <w:t xml:space="preserve"> / AR Hist Comn / Dardanelle (</w:t>
+      </w:r>
+      <w:r>
+        <w:rPr>
+          <w:b/>
+        </w:rPr>
+        <w:t>C1185 C1205</w:t>
+      </w:r>
+      <w:r>
+        <w:t xml:space="preserve"> — do not chase Democrat 1926 film, Journal August, Rural record 17 Jun 1926, or Madison library modern PDFs), </w:t>
       </w:r>
       <w:r>
         <w:rPr>
@@ -23692,6 +23948,333 @@
     </w:p>
     <w:p>
       <w:r>
+        <w:t xml:space="preserve">205. Official NARA [T1224 pamphlet](https://www.archives.gov/files/research/microfilm/t1224.pdf): 1930 rolls </w:t>
+      </w:r>
+      <w:r>
+        <w:rPr>
+          <w:b/>
+        </w:rPr>
+        <w:t>61–90</w:t>
+      </w:r>
+      <w:r>
+        <w:t xml:space="preserve">; roll </w:t>
+      </w:r>
+      <w:r>
+        <w:rPr>
+          <w:b/>
+        </w:rPr>
+        <w:t>69</w:t>
+      </w:r>
+      <w:r>
+        <w:t xml:space="preserve"> = Kansas + Kentucky. Steve Morse [ed2.php](https://stevemorse.org/ed/ed2.php) Estill/Station/33-8 </w:t>
+      </w:r>
+      <w:r>
+        <w:rPr>
+          <w:b/>
+        </w:rPr>
+        <w:t>NOTHING FOUND</w:t>
+      </w:r>
+      <w:r>
+        <w:t xml:space="preserve">. [Estill 1930 team](https://www.us-census.org/states/kentucky/teams/Estill1930-T626-742.htm) </w:t>
+      </w:r>
+      <w:r>
+        <w:rPr>
+          <w:b/>
+        </w:rPr>
+        <w:t>33-1–33-4</w:t>
+      </w:r>
+      <w:r>
+        <w:t xml:space="preserve"> only. *Pamphlet / access / catalog.* </w:t>
+      </w:r>
+      <w:r>
+        <w:rPr>
+          <w:b/>
+        </w:rPr>
+        <w:t>C1182–C1184</w:t>
+      </w:r>
+      <w:r>
+        <w:t xml:space="preserve"> </w:t>
+      </w:r>
+      <w:r>
+        <w:rPr>
+          <w:b/>
+        </w:rPr>
+        <w:t>S880–S882</w:t>
+      </w:r>
+      <w:r>
+        <w:t>.</w:t>
+      </w:r>
+    </w:p>
+    <w:p>
+      <w:r>
+        <w:t xml:space="preserve">206. Pope County Library [Yell newspapers](https://www.argenweb.net/pope/yellnews.htm): *Dardanelle Post-Dispatch* </w:t>
+      </w:r>
+      <w:r>
+        <w:rPr>
+          <w:b/>
+        </w:rPr>
+        <w:t>Roll 5</w:t>
+      </w:r>
+      <w:r>
+        <w:t xml:space="preserve"> = </w:t>
+      </w:r>
+      <w:r>
+        <w:rPr>
+          <w:b/>
+        </w:rPr>
+        <w:t>21 Jun 1923–26 Apr 1928</w:t>
+      </w:r>
+      <w:r>
+        <w:t xml:space="preserve">, 116 E Third, Russellville AR. LOC CA [Dora Stone 1926](https://www.loc.gov/collections/chronicling-america/) = *Evening star* DC </w:t>
+      </w:r>
+      <w:r>
+        <w:rPr>
+          <w:b/>
+        </w:rPr>
+        <w:t>rejected</w:t>
+      </w:r>
+      <w:r>
+        <w:t xml:space="preserve">. *Catalog / index.* </w:t>
+      </w:r>
+      <w:r>
+        <w:rPr>
+          <w:b/>
+        </w:rPr>
+        <w:t>C1185 C1186 C1193</w:t>
+      </w:r>
+      <w:r>
+        <w:t xml:space="preserve"> </w:t>
+      </w:r>
+      <w:r>
+        <w:rPr>
+          <w:b/>
+        </w:rPr>
+        <w:t>S883 S884 S891</w:t>
+      </w:r>
+      <w:r>
+        <w:t>.</w:t>
+      </w:r>
+    </w:p>
+    <w:p>
+      <w:r>
+        <w:t xml:space="preserve">207. KYGenWeb Madison [1958b](https://kygenweb.net/madison/Rootsweb_files/research/death/years/1958b.htm): </w:t>
+      </w:r>
+      <w:r>
+        <w:rPr>
+          <w:b/>
+        </w:rPr>
+        <w:t>NEWMAN, DAVID G</w:t>
+      </w:r>
+      <w:r>
+        <w:t xml:space="preserve">, </w:t>
+      </w:r>
+      <w:r>
+        <w:rPr>
+          <w:b/>
+        </w:rPr>
+        <w:t>19 Jun 1958</w:t>
+      </w:r>
+      <w:r>
+        <w:t xml:space="preserve">, age </w:t>
+      </w:r>
+      <w:r>
+        <w:rPr>
+          <w:b/>
+        </w:rPr>
+        <w:t>70</w:t>
+      </w:r>
+      <w:r>
+        <w:t xml:space="preserve">, vol </w:t>
+      </w:r>
+      <w:r>
+        <w:rPr>
+          <w:b/>
+        </w:rPr>
+        <w:t>028</w:t>
+      </w:r>
+      <w:r>
+        <w:t xml:space="preserve"> file </w:t>
+      </w:r>
+      <w:r>
+        <w:rPr>
+          <w:b/>
+        </w:rPr>
+        <w:t>13719</w:t>
+      </w:r>
+      <w:r>
+        <w:t xml:space="preserve">. LOC [sn85052075](https://www.loc.gov/item/sn85052075/): *Berea Citizen* starts </w:t>
+      </w:r>
+      <w:r>
+        <w:rPr>
+          <w:b/>
+        </w:rPr>
+        <w:t>3 Jul 1958</w:t>
+      </w:r>
+      <w:r>
+        <w:t xml:space="preserve">. *Compiled-index / catalog.* </w:t>
+      </w:r>
+      <w:r>
+        <w:rPr>
+          <w:b/>
+        </w:rPr>
+        <w:t>C1190–C1192</w:t>
+      </w:r>
+      <w:r>
+        <w:t xml:space="preserve"> </w:t>
+      </w:r>
+      <w:r>
+        <w:rPr>
+          <w:b/>
+        </w:rPr>
+        <w:t>S888–S890</w:t>
+      </w:r>
+      <w:r>
+        <w:t>.</w:t>
+      </w:r>
+    </w:p>
+    <w:p>
+      <w:r>
+        <w:t xml:space="preserve">208. Madison County Public Library [Berea Citizen archive](https://apps.madisonlibrary.org/newspapers/bereacitizen/index.php): </w:t>
+      </w:r>
+      <w:r>
+        <w:rPr>
+          <w:b/>
+        </w:rPr>
+        <w:t>201</w:t>
+      </w:r>
+      <w:r>
+        <w:t xml:space="preserve"> PDFs </w:t>
+      </w:r>
+      <w:r>
+        <w:rPr>
+          <w:b/>
+        </w:rPr>
+        <w:t>Apr 2008–Feb 2026</w:t>
+      </w:r>
+      <w:r>
+        <w:t xml:space="preserve">; no </w:t>
+      </w:r>
+      <w:r>
+        <w:rPr>
+          <w:b/>
+        </w:rPr>
+        <w:t>1958</w:t>
+      </w:r>
+      <w:r>
+        <w:t xml:space="preserve">. KYGenWeb Estill [census](https://kygenweb.net/estill/site/records/census/index.htm) </w:t>
+      </w:r>
+      <w:r>
+        <w:rPr>
+          <w:b/>
+        </w:rPr>
+        <w:t>1880</w:t>
+      </w:r>
+      <w:r>
+        <w:t xml:space="preserve"> only; [wills](https://kygenweb.net/estill/site/records/wills/index.htm) Scrivner/Thomas/Tipton. Steve Morse [ed.php](https://stevemorse.org/ed/ed.php) data offline. *Catalog / compiled landing.* </w:t>
+      </w:r>
+      <w:r>
+        <w:rPr>
+          <w:b/>
+        </w:rPr>
+        <w:t>C1197–C1204</w:t>
+      </w:r>
+      <w:r>
+        <w:t xml:space="preserve"> </w:t>
+      </w:r>
+      <w:r>
+        <w:rPr>
+          <w:b/>
+        </w:rPr>
+        <w:t>S896–S903</w:t>
+      </w:r>
+      <w:r>
+        <w:t>.</w:t>
+      </w:r>
+    </w:p>
+    <w:p>
+      <w:r>
+        <w:t xml:space="preserve">209. UArk [Arkansas newspapers spreadsheet](https://docs.google.com/spreadsheets/d/1xrclpjr4KNZW57JrlmGrYbrDDeZrWy86v7Gw-CjUY3c/export?format=csv): *Dardanelle post=dispatch* </w:t>
+      </w:r>
+      <w:r>
+        <w:rPr>
+          <w:b/>
+        </w:rPr>
+        <w:t>Microfilm F419.D37 D3</w:t>
+      </w:r>
+      <w:r>
+        <w:t xml:space="preserve"> Lib Has </w:t>
+      </w:r>
+      <w:r>
+        <w:rPr>
+          <w:b/>
+        </w:rPr>
+        <w:t>&lt;1910:7:7-1955:3:31&gt;</w:t>
+      </w:r>
+      <w:r>
+        <w:t xml:space="preserve">. Democrat </w:t>
+      </w:r>
+      <w:r>
+        <w:rPr>
+          <w:b/>
+        </w:rPr>
+        <w:t>1915:7:15</w:t>
+      </w:r>
+      <w:r>
+        <w:t xml:space="preserve"> only. Rural record </w:t>
+      </w:r>
+      <w:r>
+        <w:rPr>
+          <w:b/>
+        </w:rPr>
+        <w:t>1926:6:17</w:t>
+      </w:r>
+      <w:r>
+        <w:t xml:space="preserve"> rejected. [Libguide](https://libguides.uark.edu/newspapers/arkansas): microforms remote. *Catalog.* </w:t>
+      </w:r>
+      <w:r>
+        <w:rPr>
+          <w:b/>
+        </w:rPr>
+        <w:t>C1205–C1208</w:t>
+      </w:r>
+      <w:r>
+        <w:t xml:space="preserve"> </w:t>
+      </w:r>
+      <w:r>
+        <w:rPr>
+          <w:b/>
+        </w:rPr>
+        <w:t>S904 S905</w:t>
+      </w:r>
+      <w:r>
+        <w:t>.</w:t>
+      </w:r>
+    </w:p>
+    <w:p>
+      <w:r>
+        <w:t xml:space="preserve">210. KYGenWeb Knox [WWI N](https://kygenweb.net/knox/World-War-Draft-Cards/WWI-N/index-n.html): five Newman = Knox men; no Newnam/Luther. GT [Lee WWI](https://genealogytrails.com/ken/lee/wwi_draft_cards.html) published tables nil. *Compiled-index.* </w:t>
+      </w:r>
+      <w:r>
+        <w:rPr>
+          <w:b/>
+        </w:rPr>
+        <w:t>C1209 C1210</w:t>
+      </w:r>
+      <w:r>
+        <w:t xml:space="preserve"> </w:t>
+      </w:r>
+      <w:r>
+        <w:rPr>
+          <w:b/>
+        </w:rPr>
+        <w:t>S906 S907</w:t>
+      </w:r>
+      <w:r>
+        <w:t>.</w:t>
+      </w:r>
+    </w:p>
+    <w:p>
+      <w:r>
         <w:br w:type="page"/>
       </w:r>
     </w:p>
@@ -25117,6 +25700,66 @@
     <w:p>
       <w:r>
         <w:t>| S878 | `../sources/census/pass102-extract-2026-10-31.txt` | This session | Pass 102 extract | extract |</w:t>
+      </w:r>
+    </w:p>
+    <w:p>
+      <w:r>
+        <w:t>| S880 | `../sources/catalog/nara-t1224-1930-ky-extract-pass103.txt` | [NARA T1224](https://www.archives.gov/files/research/microfilm/t1224.pdf) | Roll 69 = KS+KY | pamphlet |</w:t>
+      </w:r>
+    </w:p>
+    <w:p>
+      <w:r>
+        <w:t>| S883 | `../sources/press/argenweb-pope-yellnews-pass103.html` | [Pope Yell news](https://www.argenweb.net/pope/yellnews.htm) | Post-Dispatch Roll 5 | catalog |</w:t>
+      </w:r>
+    </w:p>
+    <w:p>
+      <w:r>
+        <w:t>| S888 | `../sources/vital/madison-1958-newman-extract-pass103.txt` | [Madison 1958b](https://kygenweb.net/madison/Rootsweb_files/research/death/years/1958b.htm) | DAVID G 19 Jun 1958 vol 028 file 13719 | compiled-index |</w:t>
+      </w:r>
+    </w:p>
+    <w:p>
+      <w:r>
+        <w:t>| S890 | `../sources/press/loc-item-sn85052075-pass103.json` | [LOC SN85052075](https://www.loc.gov/item/sn85052075/) | Berea Citizen starts 3 Jul 1958 | catalog |</w:t>
+      </w:r>
+    </w:p>
+    <w:p>
+      <w:r>
+        <w:t>| S895 | `../sources/census/pass103-extract-2026-10-31.txt` | This session | Pass 103 extract | extract |</w:t>
+      </w:r>
+    </w:p>
+    <w:p>
+      <w:r>
+        <w:t>| S896 | `../sources/press/madisonlib-bereacitizen-app-pass104.html` | [Madison library app](https://apps.madisonlibrary.org/newspapers/bereacitizen/index.php) | 2008–2026 only; no 1958 | catalog |</w:t>
+      </w:r>
+    </w:p>
+    <w:p>
+      <w:r>
+        <w:t>| S900 | `../sources/catalog/kygenweb-estill-census-pass104.html` | [Estill census](https://kygenweb.net/estill/site/records/census/index.htm) | 1880 only | compiled landing |</w:t>
+      </w:r>
+    </w:p>
+    <w:p>
+      <w:r>
+        <w:t>| S901 | `../sources/catalog/kygenweb-estill-wills-pass104.html` | [Estill wills](https://kygenweb.net/estill/site/records/wills/index.htm) | No Samuel P. | compiled landing |</w:t>
+      </w:r>
+    </w:p>
+    <w:p>
+      <w:r>
+        <w:t>| S903 | `../sources/census/pass104-extract-2026-10-31.txt` | This session | Pass 104 extract | extract |</w:t>
+      </w:r>
+    </w:p>
+    <w:p>
+      <w:r>
+        <w:t>| S904 | `../sources/press/uark-postdispatch-1926-extract-pass105.txt` | [UArk sheet](https://docs.google.com/spreadsheets/d/1xrclpjr4KNZW57JrlmGrYbrDDeZrWy86v7Gw-CjUY3c/export?format=csv) | F419.D37 D3 includes Aug 1926 | catalog |</w:t>
+      </w:r>
+    </w:p>
+    <w:p>
+      <w:r>
+        <w:t>| S906 | `../sources/military/kygenweb-knox-wwi-n-pass105.html` | [Knox WWI N](https://kygenweb.net/knox/World-War-Draft-Cards/WWI-N/index-n.html) | Knox Newman men; no Luther | compiled-index |</w:t>
+      </w:r>
+    </w:p>
+    <w:p>
+      <w:r>
+        <w:t>| S911 | `../sources/census/pass105-extract-2026-10-31.txt` | This session | Pass 105 extract | extract |</w:t>
       </w:r>
     </w:p>
     <w:p>

</xml_diff>

<commit_message>
Pass 106: Hutchins cards 228–229, Newspapers.com 41271, Pope HQ phone
Hutchins FAQ 9938 proves the Berea Citizen 1899–1983 index is paper cards
between rooms 228 and 229. Newspapers.com paper 41271 is a paid 1958–1977
product (11,672 pages, unread). Pope HQ phone 479-968-4368 densifies Roll 5
retrieval. Official T626-742 filming includes Estill 33-8; published files
still 33-1–33-4 only. KYGenWeb Owsley/Lee/Breathitt military have no WWI
draft. David G 1958 still POSSIBLE only vs Frank.

Co-authored-by: blakereaganlaw <blakereaganlaw@gmail.com>
</commit_message>
<xml_diff>
--- a/research/dora-ella-newnam/book/Dora-Ella-Newnam-Stone-A-Life.docx
+++ b/research/dora-ella-newnam/book/Dora-Ella-Newnam-Stone-A-Life.docx
@@ -281,6 +281,11 @@
     </w:p>
     <w:p>
       <w:r>
+        <w:t>51. [Pass 106. The 1958 index is on cards between rooms 228 and 229](#pass-106-the-1958-index-is-on-cards-between-rooms-228-and-229)</w:t>
+      </w:r>
+    </w:p>
+    <w:p>
+      <w:r>
         <w:br w:type="page"/>
       </w:r>
     </w:p>
@@ -9252,6 +9257,53 @@
       </w:r>
     </w:p>
     <w:p>
+      <w:pPr>
+        <w:pStyle w:val="Heading2"/>
+      </w:pPr>
+      <w:r>
+        <w:t>Pass 106. The 1958 index is on cards between rooms 228 and 229</w:t>
+      </w:r>
+    </w:p>
+    <w:p>
+      <w:r>
+        <w:t>Hutchins Library answers a simple question: where is the *Berea Citizen* index? For 1899 through 1983 it is paper cards. The box sits on the main floor between rooms 228 and 229, behind the Reference Collection. That is a named path for a June 1958 Newman or Frank heading without reading the whole film. The 1984-to-present online index is a later newspaper and is not used here. [C1215] [S912]</w:t>
+      </w:r>
+    </w:p>
+    <w:p>
+      <w:r>
+        <w:t>Newspapers.com paper 41271, *The Berea Citizen*, is a paid archive. The page’s own JSON says `free` is false. The product covering 1958–1977 has 11,672 pages. The canonical run is 35,377 pages, 1899–1977. The source line names “The Berea Citizen, 1958–1977.” Those pages have not been read. June 1958 sits inside that product. [C1216] [S913]</w:t>
+      </w:r>
+    </w:p>
+    <w:p>
+      <w:r>
+        <w:t>FamilySearch catalog 301200 is the T1224 descriptions film. It is a login shell. Internet Archive has no T1224 Kentucky 1930 item. The Estill 1930 directory still publishes districts 33-1 through 33-4 only. District 33-8, Station Camp south, stamped 095A–102B, is still a blank on that site. AHGP’s reel list — seen as search text; the live page was a 403 — puts Estill 33-1 to 33-6, then 33-14, then 33-7 to 33-13 on official reel 742. The official reel includes 33-8. The images have not been fetched. [C1217] [C1218] [C1219] [C1220] [S914] [S915] [S916] [S917]</w:t>
+      </w:r>
+    </w:p>
+    <w:p>
+      <w:r>
+        <w:t>Newspapers.com has no paper page at `/paper/the-dardanelle-post-dispatch/`. That URL is a 404. The search box echoes the query and does not return 1926 hits. The free Newspapers.com path for the 1926 weekly does not exist. Pope County Library’s headquarters listing, on the Arkansas State Library site, gives the same Russellville street and adds a phone: 479-968-4368. Fax 479-968-3222. Hours Monday through Wednesday and Friday 8:30 to 5:30, Thursday noon to 7, Saturday 9 to 1. Roll 5 is still the named reel. [C1221] [C1222] [S918] [S919]</w:t>
+      </w:r>
+    </w:p>
+    <w:p>
+      <w:r>
+        <w:t>Owsley’s military page holds 1883 pensioners, Confederate widows, and one Civil War file. Lee’s military page says there is currently nothing on the subject, then lists May and August 1951. Breathitt’s military page is Baker-family photographs from the First World War. None of those pages is a draft-card index. Estill’s `military.html` is a 404. FamilySearch 1146342 and 127913 are still login shells. Do not telephone the clerk again. [C1223] [C1224] [C1225] [C1226] [C1228] [S920] [S921] [S922]</w:t>
+      </w:r>
+    </w:p>
+    <w:p>
+      <w:r>
+        <w:t xml:space="preserve">David G. of 1958 is still </w:t>
+      </w:r>
+      <w:r>
+        <w:rPr>
+          <w:b/>
+        </w:rPr>
+        <w:t>possible</w:t>
+      </w:r>
+      <w:r>
+        <w:t xml:space="preserve"> only against Frank. District 33-8 is still unpublished. The 1926 retrieval path is Pope Roll 5, phone 479-968-4368, and Fayetteville F419.D37 D3. The 1958 retrieval path is now the Hutchins cards between 228 and 229, then the June film, or Newspapers.com 41271. Do not print 1966 or 1976 as proven deaths. Do not print Floyd as Boyd. Do not print 1962 as McCoy’s death. Do not print the 1942 Combs charge as fact. [C1229]</w:t>
+      </w:r>
+    </w:p>
+    <w:p>
       <w:r>
         <w:t xml:space="preserve">In Madison County in 1950 a </w:t>
       </w:r>
@@ -10127,7 +10179,16 @@
         <w:t>Roll 5</w:t>
       </w:r>
       <w:r>
-        <w:t xml:space="preserve"> and UArk </w:t>
+        <w:t xml:space="preserve"> (phone </w:t>
+      </w:r>
+      <w:r>
+        <w:rPr>
+          <w:b/>
+        </w:rPr>
+        <w:t>479-968-4368</w:t>
+      </w:r>
+      <w:r>
+        <w:t xml:space="preserve">) and UArk </w:t>
       </w:r>
       <w:r>
         <w:rPr>
@@ -10145,7 +10206,16 @@
         <w:t>&lt;1910:7:7-1955:3:31&gt;</w:t>
       </w:r>
       <w:r>
-        <w:t>). [C1173] [C1174] [C1185] [C1205]</w:t>
+        <w:t xml:space="preserve">). Newspapers.com has </w:t>
+      </w:r>
+      <w:r>
+        <w:rPr>
+          <w:b/>
+        </w:rPr>
+        <w:t>no</w:t>
+      </w:r>
+      <w:r>
+        <w:t xml:space="preserve"> Post-Dispatch paper page. [C1173] [C1174] [C1185] [C1205] [C1221] [C1222]</w:t>
       </w:r>
     </w:p>
     <w:p>
@@ -11361,7 +11431,16 @@
         <w:t>095A–102B</w:t>
       </w:r>
       <w:r>
-        <w:t xml:space="preserve"> unpublished) + </w:t>
+        <w:t xml:space="preserve"> unpublished; official Reel </w:t>
+      </w:r>
+      <w:r>
+        <w:rPr>
+          <w:b/>
+        </w:rPr>
+        <w:t>742</w:t>
+      </w:r>
+      <w:r>
+        <w:t xml:space="preserve"> includes it) + </w:t>
       </w:r>
       <w:r>
         <w:rPr>
@@ -11406,7 +11485,16 @@
         <w:t>Roll 5</w:t>
       </w:r>
       <w:r>
-        <w:t xml:space="preserve"> / UArk </w:t>
+        <w:t xml:space="preserve"> (phone </w:t>
+      </w:r>
+      <w:r>
+        <w:rPr>
+          <w:b/>
+        </w:rPr>
+        <w:t>479-968-4368</w:t>
+      </w:r>
+      <w:r>
+        <w:t xml:space="preserve">) / UArk </w:t>
       </w:r>
       <w:r>
         <w:rPr>
@@ -11421,10 +11509,46 @@
         <w:rPr>
           <w:b/>
         </w:rPr>
-        <w:t>C1185 C1205</w:t>
-      </w:r>
-      <w:r>
-        <w:t xml:space="preserve"> — do not chase Democrat 1926 film, Journal August, Rural record 17 Jun 1926, or Madison library modern PDFs), </w:t>
+        <w:t>C1185 C1205 C1222</w:t>
+      </w:r>
+      <w:r>
+        <w:t xml:space="preserve"> — do not chase Democrat 1926 film, Journal August, Rural record 17 Jun 1926, Madison library modern PDFs, or Newspapers.com Post-Dispatch), </w:t>
+      </w:r>
+      <w:r>
+        <w:rPr>
+          <w:b/>
+        </w:rPr>
+        <w:t>B055/B080</w:t>
+      </w:r>
+      <w:r>
+        <w:t xml:space="preserve"> Hutchins cards </w:t>
+      </w:r>
+      <w:r>
+        <w:rPr>
+          <w:b/>
+        </w:rPr>
+        <w:t>228–229</w:t>
+      </w:r>
+      <w:r>
+        <w:t xml:space="preserve"> then June </w:t>
+      </w:r>
+      <w:r>
+        <w:rPr>
+          <w:b/>
+        </w:rPr>
+        <w:t>1958</w:t>
+      </w:r>
+      <w:r>
+        <w:t xml:space="preserve"> film or Newspapers.com </w:t>
+      </w:r>
+      <w:r>
+        <w:rPr>
+          <w:b/>
+        </w:rPr>
+        <w:t>41271</w:t>
+      </w:r>
+      <w:r>
+        <w:t xml:space="preserve">, </w:t>
       </w:r>
       <w:r>
         <w:rPr>
@@ -11497,15 +11621,6 @@
       </w:r>
       <w:r>
         <w:t xml:space="preserve">, </w:t>
-      </w:r>
-      <w:r>
-        <w:rPr>
-          <w:b/>
-        </w:rPr>
-        <w:t>B055/B080</w:t>
-      </w:r>
-      <w:r>
-        <w:t xml:space="preserve"> Hutchins June 1958 page, </w:t>
       </w:r>
       <w:r>
         <w:rPr>
@@ -24275,6 +24390,183 @@
     </w:p>
     <w:p>
       <w:r>
+        <w:t xml:space="preserve">211. Hutchins [FAQ 9938](https://libraryanswers.berea.edu/faq/9938): *Berea Citizen* index </w:t>
+      </w:r>
+      <w:r>
+        <w:rPr>
+          <w:b/>
+        </w:rPr>
+        <w:t>1899–1983</w:t>
+      </w:r>
+      <w:r>
+        <w:t xml:space="preserve"> paper cards, main floor between rooms </w:t>
+      </w:r>
+      <w:r>
+        <w:rPr>
+          <w:b/>
+        </w:rPr>
+        <w:t>228 and 229</w:t>
+      </w:r>
+      <w:r>
+        <w:t xml:space="preserve"> behind Reference. *Catalog.* </w:t>
+      </w:r>
+      <w:r>
+        <w:rPr>
+          <w:b/>
+        </w:rPr>
+        <w:t>C1215</w:t>
+      </w:r>
+      <w:r>
+        <w:t xml:space="preserve"> </w:t>
+      </w:r>
+      <w:r>
+        <w:rPr>
+          <w:b/>
+        </w:rPr>
+        <w:t>S912</w:t>
+      </w:r>
+      <w:r>
+        <w:t>.</w:t>
+      </w:r>
+    </w:p>
+    <w:p>
+      <w:r>
+        <w:t xml:space="preserve">212. Newspapers.com [paper 41271](https://www.newspapers.com/paper/the-berea-citizen/41271/): </w:t>
+      </w:r>
+      <w:r>
+        <w:rPr>
+          <w:b/>
+        </w:rPr>
+        <w:t>11,672</w:t>
+      </w:r>
+      <w:r>
+        <w:t xml:space="preserve"> pages </w:t>
+      </w:r>
+      <w:r>
+        <w:rPr>
+          <w:b/>
+        </w:rPr>
+        <w:t>1958–1977</w:t>
+      </w:r>
+      <w:r>
+        <w:t xml:space="preserve"> (`free:false`); canonical </w:t>
+      </w:r>
+      <w:r>
+        <w:rPr>
+          <w:b/>
+        </w:rPr>
+        <w:t>35,377</w:t>
+      </w:r>
+      <w:r>
+        <w:t xml:space="preserve"> pages </w:t>
+      </w:r>
+      <w:r>
+        <w:rPr>
+          <w:b/>
+        </w:rPr>
+        <w:t>1899–1977</w:t>
+      </w:r>
+      <w:r>
+        <w:t xml:space="preserve">. Pages unread. *Catalog.* </w:t>
+      </w:r>
+      <w:r>
+        <w:rPr>
+          <w:b/>
+        </w:rPr>
+        <w:t>C1216</w:t>
+      </w:r>
+      <w:r>
+        <w:t xml:space="preserve"> </w:t>
+      </w:r>
+      <w:r>
+        <w:rPr>
+          <w:b/>
+        </w:rPr>
+        <w:t>S913</w:t>
+      </w:r>
+      <w:r>
+        <w:t>.</w:t>
+      </w:r>
+    </w:p>
+    <w:p>
+      <w:r>
+        <w:t xml:space="preserve">213. Arkansas State Library [Pope HQ](https://library.arkansas.gov/facilities/pope-county-library-hq/): 116 E Third, Russellville AR </w:t>
+      </w:r>
+      <w:r>
+        <w:rPr>
+          <w:b/>
+        </w:rPr>
+        <w:t>72801-5198</w:t>
+      </w:r>
+      <w:r>
+        <w:t xml:space="preserve">, phone </w:t>
+      </w:r>
+      <w:r>
+        <w:rPr>
+          <w:b/>
+        </w:rPr>
+        <w:t>479-968-4368</w:t>
+      </w:r>
+      <w:r>
+        <w:t xml:space="preserve">, fax </w:t>
+      </w:r>
+      <w:r>
+        <w:rPr>
+          <w:b/>
+        </w:rPr>
+        <w:t>479-968-3222</w:t>
+      </w:r>
+      <w:r>
+        <w:t xml:space="preserve">. Newspapers.com Post-Dispatch paper URL </w:t>
+      </w:r>
+      <w:r>
+        <w:rPr>
+          <w:b/>
+        </w:rPr>
+        <w:t>404</w:t>
+      </w:r>
+      <w:r>
+        <w:t xml:space="preserve">. us-census Estill </w:t>
+      </w:r>
+      <w:r>
+        <w:rPr>
+          <w:b/>
+        </w:rPr>
+        <w:t>33-8</w:t>
+      </w:r>
+      <w:r>
+        <w:t xml:space="preserve"> still unpublished. KYGenWeb Owsley/Lee/Breathitt military </w:t>
+      </w:r>
+      <w:r>
+        <w:rPr>
+          <w:b/>
+        </w:rPr>
+        <w:t>no</w:t>
+      </w:r>
+      <w:r>
+        <w:t xml:space="preserve"> WWI draft. *Catalog / compiled landing.* </w:t>
+      </w:r>
+      <w:r>
+        <w:rPr>
+          <w:b/>
+        </w:rPr>
+        <w:t>C1219–C1225 C1221 C1222</w:t>
+      </w:r>
+      <w:r>
+        <w:t xml:space="preserve"> </w:t>
+      </w:r>
+      <w:r>
+        <w:rPr>
+          <w:b/>
+        </w:rPr>
+        <w:t>S916–S922</w:t>
+      </w:r>
+      <w:r>
+        <w:t>.</w:t>
+      </w:r>
+    </w:p>
+    <w:p>
+      <w:r>
         <w:br w:type="page"/>
       </w:r>
     </w:p>
@@ -25760,6 +26052,41 @@
     <w:p>
       <w:r>
         <w:t>| S911 | `../sources/census/pass105-extract-2026-10-31.txt` | This session | Pass 105 extract | extract |</w:t>
+      </w:r>
+    </w:p>
+    <w:p>
+      <w:r>
+        <w:t>| S912 | `../sources/press/berea-faq-9938-extract-pass106.txt` | [Hutchins FAQ 9938](https://libraryanswers.berea.edu/faq/9938) | Citizen index cards rooms 228–229 | catalog |</w:t>
+      </w:r>
+    </w:p>
+    <w:p>
+      <w:r>
+        <w:t>| S913 | `../sources/press/newspaperscom-berea-citizen-41271-extract-pass106.txt` | [Newspapers.com 41271](https://www.newspapers.com/paper/the-berea-citizen/41271/) | 11,672 pages 1958–1977; free:false | catalog |</w:t>
+      </w:r>
+    </w:p>
+    <w:p>
+      <w:r>
+        <w:t>| S916 | `../sources/catalog/uscensus-estill-1930-partial-pass106.txt` | [Estill 1930 dir](https://www.us-census.org/pub/usgenweb/census/ky/estill/1930/) | 33-8 095A–102B unpublished | catalog |</w:t>
+      </w:r>
+    </w:p>
+    <w:p>
+      <w:r>
+        <w:t>| S919 | `../sources/press/arstatelib-pope-hq-extract-pass106.txt` | [Pope HQ](https://library.arkansas.gov/facilities/pope-county-library-hq/) | Phone 479-968-4368 | catalog |</w:t>
+      </w:r>
+    </w:p>
+    <w:p>
+      <w:r>
+        <w:t>| S920 | `../sources/military/kygenweb-owsley-military-pass106.html` | [Owsley military](https://kygenweb.net/owsley/military/index.htm) | No WWI draft | compiled landing |</w:t>
+      </w:r>
+    </w:p>
+    <w:p>
+      <w:r>
+        <w:t>| S921 | `../sources/military/kygenweb-lee-military-pass106.html` | [Lee military](https://kygenweb.net/lee/military/index.htm) | Nothing on this subject | compiled landing |</w:t>
+      </w:r>
+    </w:p>
+    <w:p>
+      <w:r>
+        <w:t>| S926 | `../sources/census/pass106-extract-2026-10-31.txt` | This session | Pass 106 extract | extract |</w:t>
       </w:r>
     </w:p>
     <w:p>

</xml_diff>

<commit_message>
Pass 107: isolate Estill 1930 33-8 on ACPL reel 742; Boyd+Allie absent
IA kentuckycensus00reel742 (1165 images) holds Station Camp South
leaves 777-792. Sixteen name columns visually read; Newman/Newnam 0.
Hutchins FAQ 9806 phone 859-985-3364; UK S-150 starts 3 Jul 1958.

Co-authored-by: blakereaganlaw <blakereaganlaw@gmail.com>
</commit_message>
<xml_diff>
--- a/research/dora-ella-newnam/book/Dora-Ella-Newnam-Stone-A-Life.docx
+++ b/research/dora-ella-newnam/book/Dora-Ella-Newnam-Stone-A-Life.docx
@@ -286,6 +286,11 @@
     </w:p>
     <w:p>
       <w:r>
+        <w:t>52. [Pass 107. Station Camp South is on the Allen County reel](#pass-107-station-camp-south-is-on-the-allen-county-reel)</w:t>
+      </w:r>
+    </w:p>
+    <w:p>
+      <w:r>
         <w:br w:type="page"/>
       </w:r>
     </w:p>
@@ -9304,6 +9309,58 @@
       </w:r>
     </w:p>
     <w:p>
+      <w:pPr>
+        <w:pStyle w:val="Heading2"/>
+      </w:pPr>
+      <w:r>
+        <w:t>Pass 107. Station Camp South is on the Allen County reel</w:t>
+      </w:r>
+    </w:p>
+    <w:p>
+      <w:r>
+        <w:t>The 515-image Internet Archive item `15thcensusofpopu742unit` skips Estill 33-8. A second scan of the same National Archives reel exists. Allen County Public Library’s `kentuckycensus00reel742` holds 1,165 images. The volume line is Reel 742. The description names Daviess (E.D.s 30-34 to 30-50), Edmonson, Estill, and Grant. The PDF is 495 megabytes. It was not downloaded. The image API was used instead. [C1230] [S927]</w:t>
+      </w:r>
+    </w:p>
+    <w:p>
+      <w:r>
+        <w:t>Leaves 777 through 792 are Kentucky, Estill County, Magisterial District 3 (part), enumeration district 33-8. The enumerator is Thomas H. Brison. Sheet 1A is stamped 095; sheet 8B closes the district. That is Station Camp South. Leaf 776 is blank between the end of 33-7 and the start of 33-8. [C1231] [S928]</w:t>
+      </w:r>
+    </w:p>
+    <w:p>
+      <w:r>
+        <w:t>Sixteen name columns were read. There is no Newman, Newnam, Newmon, or Newnarn surname. A Flynn child named Boyd, about four, a Witt son Floyd, and a Fowler head Floyd are other families. Combined with the already-complete 33-7, Boyd and Allie are absent from both 1930 Station Camp districts. [C1232] [S929] [C919] [C920] [C921]</w:t>
+      </w:r>
+    </w:p>
+    <w:p>
+      <w:r>
+        <w:t>District 33-9 is on the same reel. Leaf 805 is sheet 1A, enumerator Hattie M. Cole. Leaf 815 is sheet 12A. Those name columns were not fully read. The published us-census files are still 33-1 through 33-4 only. Their M–Q index has no Newman. [C1233] [C1234] [S930] [S931]</w:t>
+      </w:r>
+    </w:p>
+    <w:p>
+      <w:r>
+        <w:t>Hutchins FAQ 9806 names the retrieval phone: 859-985-3364. The e-mail is reference@berea.edu. The library keeps *Berea Citizen* microfilm from 1899 to 2008 and Chronicling America for 1900–1922. The University of Kentucky Young Library holds *Berea Citizen* as Microfilm S-150, 3 July 1958 through December 2008, at the Periodicals Desk on the second floor. A 19 June 1958 death was still *The Citizen*. S-150 starts too late. [C1235] [C1236] [S932] [S933]</w:t>
+      </w:r>
+    </w:p>
+    <w:p>
+      <w:r>
+        <w:t>Genealogy Trails’ Lee draft tables, fetched live this pass, still have no Newman, Newnam, or McCoy. The official M1509 pamphlet still maps Lee to KY45, Estill to KY24, Owsley to KY74, Madison N–Z to KY64, and Wolfe plus Woodford to KY90. The cards have not been read. [C1237] [C1238] [S934] [S935]</w:t>
+      </w:r>
+    </w:p>
+    <w:p>
+      <w:r>
+        <w:t xml:space="preserve">David G. of 1958 is still </w:t>
+      </w:r>
+      <w:r>
+        <w:rPr>
+          <w:b/>
+        </w:rPr>
+        <w:t>possible</w:t>
+      </w:r>
+      <w:r>
+        <w:t xml:space="preserve"> only against Frank. District 33-8 is no longer unpublished on free film. The 1926 retrieval path is still Pope Roll 5, phone 479-968-4368, and Fayetteville F419.D37 D3. The 1958 retrieval path is still the Hutchins cards between 228 and 229, then the June film, or Newspapers.com 41271. Do not print 1966 or 1976 as proven deaths. Do not print Floyd as Boyd. Do not print 1962 as McCoy’s death. Do not print the 1942 Combs charge as fact. [C1241]</w:t>
+      </w:r>
+    </w:p>
+    <w:p>
       <w:r>
         <w:t xml:space="preserve">In Madison County in 1950 a </w:t>
       </w:r>
@@ -10315,7 +10372,7 @@
         <w:t>KY90</w:t>
       </w:r>
       <w:r>
-        <w:t xml:space="preserve"> Wolfe+Woodford. [C1021] Cards and FS </w:t>
+        <w:t xml:space="preserve"> Wolfe+Woodford. [C1021] [C1238] Cards and FS </w:t>
       </w:r>
       <w:r>
         <w:rPr>
@@ -10324,7 +10381,16 @@
         <w:t>1146342</w:t>
       </w:r>
       <w:r>
-        <w:t xml:space="preserve"> unread. GT Lee N table unpublished. [C1022]</w:t>
+        <w:t xml:space="preserve"> unread. GT Lee published tables live </w:t>
+      </w:r>
+      <w:r>
+        <w:rPr>
+          <w:b/>
+        </w:rPr>
+        <w:t>nil</w:t>
+      </w:r>
+      <w:r>
+        <w:t xml:space="preserve"> Newman/Newnam/McCoy. [C1237]</w:t>
       </w:r>
     </w:p>
     <w:p>
@@ -10902,28 +10968,55 @@
         <w:rPr>
           <w:b/>
         </w:rPr>
-        <w:t>33-8 / 33-9 ABSENT</w:t>
-      </w:r>
-      <w:r>
-        <w:t xml:space="preserve"> from IA T626-742 (stamped </w:t>
-      </w:r>
-      <w:r>
-        <w:rPr>
-          <w:b/>
-        </w:rPr>
-        <w:t>094A→117A</w:t>
-      </w:r>
-      <w:r>
-        <w:t xml:space="preserve">; Estill ends </w:t>
-      </w:r>
-      <w:r>
-        <w:rPr>
-          <w:b/>
-        </w:rPr>
-        <w:t>0947</w:t>
-      </w:r>
-      <w:r>
-        <w:t xml:space="preserve"> Grant card) (</w:t>
+        <w:t>33-8 isolated</w:t>
+      </w:r>
+      <w:r>
+        <w:t xml:space="preserve"> on IA ACPL </w:t>
+      </w:r>
+      <w:r>
+        <w:rPr>
+          <w:b/>
+        </w:rPr>
+        <w:t>`kentuckycensus00reel742`</w:t>
+      </w:r>
+      <w:r>
+        <w:t xml:space="preserve"> leaves </w:t>
+      </w:r>
+      <w:r>
+        <w:rPr>
+          <w:b/>
+        </w:rPr>
+        <w:t>777–792</w:t>
+      </w:r>
+      <w:r>
+        <w:t xml:space="preserve"> and </w:t>
+      </w:r>
+      <w:r>
+        <w:rPr>
+          <w:b/>
+        </w:rPr>
+        <w:t>visually read</w:t>
+      </w:r>
+      <w:r>
+        <w:t xml:space="preserve"> — Boyd+Allie </w:t>
+      </w:r>
+      <w:r>
+        <w:rPr>
+          <w:b/>
+        </w:rPr>
+        <w:t>absent</w:t>
+      </w:r>
+      <w:r>
+        <w:t xml:space="preserve"> (</w:t>
+      </w:r>
+      <w:r>
+        <w:rPr>
+          <w:b/>
+        </w:rPr>
+        <w:t>C1230–C1232</w:t>
+      </w:r>
+      <w:r>
+        <w:t xml:space="preserve">; prior </w:t>
       </w:r>
       <w:r>
         <w:rPr>
@@ -10932,13 +11025,175 @@
         <w:t>C935 C940</w:t>
       </w:r>
       <w:r>
+        <w:t xml:space="preserve"> was the incomplete 515-image scan); </w:t>
+      </w:r>
+      <w:r>
+        <w:rPr>
+          <w:b/>
+        </w:rPr>
+        <w:t>33-9</w:t>
+      </w:r>
+      <w:r>
+        <w:t xml:space="preserve"> on the same reel unread; </w:t>
+      </w:r>
+      <w:r>
+        <w:rPr>
+          <w:b/>
+        </w:rPr>
+        <w:t>0650–0749 ≠ 33-8</w:t>
+      </w:r>
+      <w:r>
+        <w:t xml:space="preserve"> (</w:t>
+      </w:r>
+      <w:r>
+        <w:rPr>
+          <w:b/>
+        </w:rPr>
+        <w:t>C936</w:t>
+      </w:r>
+      <w:r>
         <w:t xml:space="preserve">); </w:t>
       </w:r>
       <w:r>
         <w:rPr>
           <w:b/>
         </w:rPr>
-        <w:t>0650–0749 ≠ 33-8</w:t>
+        <w:t>1920 Breathitt ED 52 George's Branch sh 19A ln 17 Newman John 38 + Jennie 21 ISOLATED and rejected vs John L (C772–C775)</w:t>
+      </w:r>
+      <w:r>
+        <w:t xml:space="preserve">; </w:t>
+      </w:r>
+      <w:r>
+        <w:rPr>
+          <w:b/>
+        </w:rPr>
+        <w:t>leaf 1116 = ED 55 sh 1A (C791)</w:t>
+      </w:r>
+      <w:r>
+        <w:t xml:space="preserve">; </w:t>
+      </w:r>
+      <w:r>
+        <w:rPr>
+          <w:b/>
+        </w:rPr>
+        <w:t>1910 Heidelberg Boyd 38 + Allie 28 + four children = 1920 Station Camp — PROVEN (C700)</w:t>
+      </w:r>
+      <w:r>
+        <w:t xml:space="preserve">; 1900 Boyd boarder </w:t>
+      </w:r>
+      <w:r>
+        <w:rPr>
+          <w:b/>
+        </w:rPr>
+        <w:t>Mar 1878</w:t>
+      </w:r>
+      <w:r>
+        <w:t xml:space="preserve"> </w:t>
+      </w:r>
+      <w:r>
+        <w:rPr>
+          <w:b/>
+        </w:rPr>
+        <w:t>PROVEN (C702)</w:t>
+      </w:r>
+      <w:r>
+        <w:t xml:space="preserve">; 1902 Floyd×Allie license </w:t>
+      </w:r>
+      <w:r>
+        <w:rPr>
+          <w:b/>
+        </w:rPr>
+        <w:t>proven</w:t>
+      </w:r>
+      <w:r>
+        <w:t xml:space="preserve"> as compiled, </w:t>
+      </w:r>
+      <w:r>
+        <w:rPr>
+          <w:b/>
+        </w:rPr>
+        <w:t>still not merged</w:t>
+      </w:r>
+      <w:r>
+        <w:t xml:space="preserve"> with Boyd (</w:t>
+      </w:r>
+      <w:r>
+        <w:rPr>
+          <w:b/>
+        </w:rPr>
+        <w:t>#27</w:t>
+      </w:r>
+      <w:r>
+        <w:t xml:space="preserve">, </w:t>
+      </w:r>
+      <w:r>
+        <w:rPr>
+          <w:b/>
+        </w:rPr>
+        <w:t>C711</w:t>
+      </w:r>
+      <w:r>
+        <w:t xml:space="preserve">); 1940 compiled / 1950 Hendrix line </w:t>
+      </w:r>
+      <w:r>
+        <w:rPr>
+          <w:b/>
+        </w:rPr>
+        <w:t>rejected</w:t>
+      </w:r>
+      <w:r>
+        <w:t xml:space="preserve"> vs Boyd+Allie (</w:t>
+      </w:r>
+      <w:r>
+        <w:rPr>
+          <w:b/>
+        </w:rPr>
+        <w:t>C941 C945</w:t>
+      </w:r>
+      <w:r>
+        <w:t xml:space="preserve">); 1966 Woodford death </w:t>
+      </w:r>
+      <w:r>
+        <w:rPr>
+          <w:b/>
+        </w:rPr>
+        <w:t>probable</w:t>
+      </w:r>
+      <w:r>
+        <w:t>, not proven (</w:t>
+      </w:r>
+      <w:r>
+        <w:rPr>
+          <w:b/>
+        </w:rPr>
+        <w:t>#26</w:t>
+      </w:r>
+      <w:r>
+        <w:t xml:space="preserve">); McCoy 40 on Buck Creek 1930 </w:t>
+      </w:r>
+      <w:r>
+        <w:rPr>
+          <w:b/>
+        </w:rPr>
+        <w:t>PROBABLE</w:t>
+      </w:r>
+      <w:r>
+        <w:t xml:space="preserve"> P010 (</w:t>
+      </w:r>
+      <w:r>
+        <w:rPr>
+          <w:b/>
+        </w:rPr>
+        <w:t>C562</w:t>
+      </w:r>
+      <w:r>
+        <w:t xml:space="preserve">); 1920 Owsley / 1940/1950 Owsley McCoy head </w:t>
+      </w:r>
+      <w:r>
+        <w:rPr>
+          <w:b/>
+        </w:rPr>
+        <w:t>nil</w:t>
       </w:r>
       <w:r>
         <w:t xml:space="preserve"> (</w:t>
@@ -10947,7 +11202,7 @@
         <w:rPr>
           <w:b/>
         </w:rPr>
-        <w:t>C936</w:t>
+        <w:t>C611 C574 C575</w:t>
       </w:r>
       <w:r>
         <w:t xml:space="preserve">); </w:t>
@@ -10956,70 +11211,88 @@
         <w:rPr>
           <w:b/>
         </w:rPr>
-        <w:t>1920 Breathitt ED 52 George's Branch sh 19A ln 17 Newman John 38 + Jennie 21 ISOLATED and rejected vs John L (C772–C775)</w:t>
-      </w:r>
-      <w:r>
-        <w:t xml:space="preserve">; </w:t>
-      </w:r>
-      <w:r>
-        <w:rPr>
-          <w:b/>
-        </w:rPr>
-        <w:t>leaf 1116 = ED 55 sh 1A (C791)</w:t>
-      </w:r>
-      <w:r>
-        <w:t xml:space="preserve">; </w:t>
-      </w:r>
-      <w:r>
-        <w:rPr>
-          <w:b/>
-        </w:rPr>
-        <w:t>1910 Heidelberg Boyd 38 + Allie 28 + four children = 1920 Station Camp — PROVEN (C700)</w:t>
-      </w:r>
-      <w:r>
-        <w:t xml:space="preserve">; 1900 Boyd boarder </w:t>
-      </w:r>
-      <w:r>
-        <w:rPr>
-          <w:b/>
-        </w:rPr>
-        <w:t>Mar 1878</w:t>
-      </w:r>
-      <w:r>
-        <w:t xml:space="preserve"> </w:t>
-      </w:r>
-      <w:r>
-        <w:rPr>
-          <w:b/>
-        </w:rPr>
-        <w:t>PROVEN (C702)</w:t>
-      </w:r>
-      <w:r>
-        <w:t xml:space="preserve">; 1902 Floyd×Allie license </w:t>
-      </w:r>
-      <w:r>
-        <w:rPr>
-          <w:b/>
-        </w:rPr>
-        <w:t>proven</w:t>
-      </w:r>
-      <w:r>
-        <w:t xml:space="preserve"> as compiled, </w:t>
-      </w:r>
-      <w:r>
-        <w:rPr>
-          <w:b/>
-        </w:rPr>
-        <w:t>still not merged</w:t>
-      </w:r>
-      <w:r>
-        <w:t xml:space="preserve"> with Boyd (</w:t>
-      </w:r>
-      <w:r>
-        <w:rPr>
-          <w:b/>
-        </w:rPr>
-        <w:t>#27</w:t>
+        <w:t>447-20-2466</w:t>
+      </w:r>
+      <w:r>
+        <w:t xml:space="preserve"> not merged (</w:t>
+      </w:r>
+      <w:r>
+        <w:rPr>
+          <w:b/>
+        </w:rPr>
+        <w:t>C576</w:t>
+      </w:r>
+      <w:r>
+        <w:t xml:space="preserve">); Barney McCoy Newman of AR </w:t>
+      </w:r>
+      <w:r>
+        <w:rPr>
+          <w:b/>
+        </w:rPr>
+        <w:t>rejected</w:t>
+      </w:r>
+      <w:r>
+        <w:t xml:space="preserve"> (</w:t>
+      </w:r>
+      <w:r>
+        <w:rPr>
+          <w:b/>
+        </w:rPr>
+        <w:t>C618</w:t>
+      </w:r>
+      <w:r>
+        <w:t xml:space="preserve">); 1918 Robert / Cora Brandenburg </w:t>
+      </w:r>
+      <w:r>
+        <w:rPr>
+          <w:b/>
+        </w:rPr>
+        <w:t>probable</w:t>
+      </w:r>
+      <w:r>
+        <w:t xml:space="preserve"> their son (</w:t>
+      </w:r>
+      <w:r>
+        <w:rPr>
+          <w:b/>
+        </w:rPr>
+        <w:t>C614</w:t>
+      </w:r>
+      <w:r>
+        <w:t xml:space="preserve">); 1942 Combs charge </w:t>
+      </w:r>
+      <w:r>
+        <w:rPr>
+          <w:b/>
+        </w:rPr>
+        <w:t>possible</w:t>
+      </w:r>
+      <w:r>
+        <w:t xml:space="preserve"> authored only (</w:t>
+      </w:r>
+      <w:r>
+        <w:rPr>
+          <w:b/>
+        </w:rPr>
+        <w:t>C619</w:t>
+      </w:r>
+      <w:r>
+        <w:t xml:space="preserve">); Daniel × Sarah M./Minerva are </w:t>
+      </w:r>
+      <w:r>
+        <w:rPr>
+          <w:b/>
+        </w:rPr>
+        <w:t>probable</w:t>
+      </w:r>
+      <w:r>
+        <w:t xml:space="preserve"> Everett’s parents (</w:t>
+      </w:r>
+      <w:r>
+        <w:rPr>
+          <w:b/>
+        </w:rPr>
+        <w:t>C456/C485</w:t>
       </w:r>
       <w:r>
         <w:t xml:space="preserve">, </w:t>
@@ -11028,64 +11301,64 @@
         <w:rPr>
           <w:b/>
         </w:rPr>
-        <w:t>C711</w:t>
-      </w:r>
-      <w:r>
-        <w:t xml:space="preserve">); 1940 compiled / 1950 Hendrix line </w:t>
-      </w:r>
-      <w:r>
-        <w:rPr>
-          <w:b/>
-        </w:rPr>
-        <w:t>rejected</w:t>
-      </w:r>
-      <w:r>
-        <w:t xml:space="preserve"> vs Boyd+Allie (</w:t>
-      </w:r>
-      <w:r>
-        <w:rPr>
-          <w:b/>
-        </w:rPr>
-        <w:t>C941 C945</w:t>
-      </w:r>
-      <w:r>
-        <w:t xml:space="preserve">); 1966 Woodford death </w:t>
-      </w:r>
-      <w:r>
-        <w:rPr>
-          <w:b/>
-        </w:rPr>
-        <w:t>probable</w:t>
-      </w:r>
-      <w:r>
-        <w:t>, not proven (</w:t>
-      </w:r>
-      <w:r>
-        <w:rPr>
-          <w:b/>
-        </w:rPr>
-        <w:t>#26</w:t>
-      </w:r>
-      <w:r>
-        <w:t xml:space="preserve">); McCoy 40 on Buck Creek 1930 </w:t>
-      </w:r>
-      <w:r>
-        <w:rPr>
-          <w:b/>
-        </w:rPr>
-        <w:t>PROBABLE</w:t>
-      </w:r>
-      <w:r>
-        <w:t xml:space="preserve"> P010 (</w:t>
-      </w:r>
-      <w:r>
-        <w:rPr>
-          <w:b/>
-        </w:rPr>
-        <w:t>C562</w:t>
-      </w:r>
-      <w:r>
-        <w:t xml:space="preserve">); 1920 Owsley / 1940/1950 Owsley McCoy head </w:t>
+        <w:t>#24</w:t>
+      </w:r>
+      <w:r>
+        <w:t xml:space="preserve">); 1930 Everett </w:t>
+      </w:r>
+      <w:r>
+        <w:rPr>
+          <w:b/>
+        </w:rPr>
+        <w:t>KYVAKY</w:t>
+      </w:r>
+      <w:r>
+        <w:t xml:space="preserve"> (</w:t>
+      </w:r>
+      <w:r>
+        <w:rPr>
+          <w:b/>
+        </w:rPr>
+        <w:t>C530</w:t>
+      </w:r>
+      <w:r>
+        <w:t xml:space="preserve">); 1910 ED </w:t>
+      </w:r>
+      <w:r>
+        <w:rPr>
+          <w:b/>
+        </w:rPr>
+        <w:t>98</w:t>
+      </w:r>
+      <w:r>
+        <w:t xml:space="preserve"> Rissie servant 15 </w:t>
+      </w:r>
+      <w:r>
+        <w:rPr>
+          <w:b/>
+        </w:rPr>
+        <w:t>possible</w:t>
+      </w:r>
+      <w:r>
+        <w:t xml:space="preserve"> P013, </w:t>
+      </w:r>
+      <w:r>
+        <w:rPr>
+          <w:b/>
+        </w:rPr>
+        <w:t>not merged</w:t>
+      </w:r>
+      <w:r>
+        <w:t xml:space="preserve"> (</w:t>
+      </w:r>
+      <w:r>
+        <w:rPr>
+          <w:b/>
+        </w:rPr>
+        <w:t>C713</w:t>
+      </w:r>
+      <w:r>
+        <w:t xml:space="preserve"> / B016); Daniel’s license still unread after TFKRHA 1843–80 </w:t>
       </w:r>
       <w:r>
         <w:rPr>
@@ -11094,177 +11367,6 @@
         <w:t>nil</w:t>
       </w:r>
       <w:r>
-        <w:t xml:space="preserve"> (</w:t>
-      </w:r>
-      <w:r>
-        <w:rPr>
-          <w:b/>
-        </w:rPr>
-        <w:t>C611 C574 C575</w:t>
-      </w:r>
-      <w:r>
-        <w:t xml:space="preserve">); </w:t>
-      </w:r>
-      <w:r>
-        <w:rPr>
-          <w:b/>
-        </w:rPr>
-        <w:t>447-20-2466</w:t>
-      </w:r>
-      <w:r>
-        <w:t xml:space="preserve"> not merged (</w:t>
-      </w:r>
-      <w:r>
-        <w:rPr>
-          <w:b/>
-        </w:rPr>
-        <w:t>C576</w:t>
-      </w:r>
-      <w:r>
-        <w:t xml:space="preserve">); Barney McCoy Newman of AR </w:t>
-      </w:r>
-      <w:r>
-        <w:rPr>
-          <w:b/>
-        </w:rPr>
-        <w:t>rejected</w:t>
-      </w:r>
-      <w:r>
-        <w:t xml:space="preserve"> (</w:t>
-      </w:r>
-      <w:r>
-        <w:rPr>
-          <w:b/>
-        </w:rPr>
-        <w:t>C618</w:t>
-      </w:r>
-      <w:r>
-        <w:t xml:space="preserve">); 1918 Robert / Cora Brandenburg </w:t>
-      </w:r>
-      <w:r>
-        <w:rPr>
-          <w:b/>
-        </w:rPr>
-        <w:t>probable</w:t>
-      </w:r>
-      <w:r>
-        <w:t xml:space="preserve"> their son (</w:t>
-      </w:r>
-      <w:r>
-        <w:rPr>
-          <w:b/>
-        </w:rPr>
-        <w:t>C614</w:t>
-      </w:r>
-      <w:r>
-        <w:t xml:space="preserve">); 1942 Combs charge </w:t>
-      </w:r>
-      <w:r>
-        <w:rPr>
-          <w:b/>
-        </w:rPr>
-        <w:t>possible</w:t>
-      </w:r>
-      <w:r>
-        <w:t xml:space="preserve"> authored only (</w:t>
-      </w:r>
-      <w:r>
-        <w:rPr>
-          <w:b/>
-        </w:rPr>
-        <w:t>C619</w:t>
-      </w:r>
-      <w:r>
-        <w:t xml:space="preserve">); Daniel × Sarah M./Minerva are </w:t>
-      </w:r>
-      <w:r>
-        <w:rPr>
-          <w:b/>
-        </w:rPr>
-        <w:t>probable</w:t>
-      </w:r>
-      <w:r>
-        <w:t xml:space="preserve"> Everett’s parents (</w:t>
-      </w:r>
-      <w:r>
-        <w:rPr>
-          <w:b/>
-        </w:rPr>
-        <w:t>C456/C485</w:t>
-      </w:r>
-      <w:r>
-        <w:t xml:space="preserve">, </w:t>
-      </w:r>
-      <w:r>
-        <w:rPr>
-          <w:b/>
-        </w:rPr>
-        <w:t>#24</w:t>
-      </w:r>
-      <w:r>
-        <w:t xml:space="preserve">); 1930 Everett </w:t>
-      </w:r>
-      <w:r>
-        <w:rPr>
-          <w:b/>
-        </w:rPr>
-        <w:t>KYVAKY</w:t>
-      </w:r>
-      <w:r>
-        <w:t xml:space="preserve"> (</w:t>
-      </w:r>
-      <w:r>
-        <w:rPr>
-          <w:b/>
-        </w:rPr>
-        <w:t>C530</w:t>
-      </w:r>
-      <w:r>
-        <w:t xml:space="preserve">); 1910 ED </w:t>
-      </w:r>
-      <w:r>
-        <w:rPr>
-          <w:b/>
-        </w:rPr>
-        <w:t>98</w:t>
-      </w:r>
-      <w:r>
-        <w:t xml:space="preserve"> Rissie servant 15 </w:t>
-      </w:r>
-      <w:r>
-        <w:rPr>
-          <w:b/>
-        </w:rPr>
-        <w:t>possible</w:t>
-      </w:r>
-      <w:r>
-        <w:t xml:space="preserve"> P013, </w:t>
-      </w:r>
-      <w:r>
-        <w:rPr>
-          <w:b/>
-        </w:rPr>
-        <w:t>not merged</w:t>
-      </w:r>
-      <w:r>
-        <w:t xml:space="preserve"> (</w:t>
-      </w:r>
-      <w:r>
-        <w:rPr>
-          <w:b/>
-        </w:rPr>
-        <w:t>C713</w:t>
-      </w:r>
-      <w:r>
-        <w:t xml:space="preserve"> / B016); Daniel’s license still unread after TFKRHA 1843–80 </w:t>
-      </w:r>
-      <w:r>
-        <w:rPr>
-          <w:b/>
-        </w:rPr>
-        <w:t>nil</w:t>
-      </w:r>
-      <w:r>
         <w:t xml:space="preserve"> (B079); Melissa ~1876 unread (B078); Grant 21 vs David F. unread (B081); William × Katherine license (B064); two William lines (B071); Herman Estes of Brasstown (B067); Frankie Jones / Mary Peters (B068); Carter Cove stone photographs (B054). </w:t>
       </w:r>
       <w:r>
@@ -11274,6 +11376,42 @@
         <w:t>Done this increment:</w:t>
       </w:r>
       <w:r>
+        <w:t xml:space="preserve"> Estill </w:t>
+      </w:r>
+      <w:r>
+        <w:rPr>
+          <w:b/>
+        </w:rPr>
+        <w:t>1930 33-8</w:t>
+      </w:r>
+      <w:r>
+        <w:t xml:space="preserve"> isolated and visually read on ACPL reel </w:t>
+      </w:r>
+      <w:r>
+        <w:rPr>
+          <w:b/>
+        </w:rPr>
+        <w:t>742</w:t>
+      </w:r>
+      <w:r>
+        <w:t xml:space="preserve"> — Boyd+Allie </w:t>
+      </w:r>
+      <w:r>
+        <w:rPr>
+          <w:b/>
+        </w:rPr>
+        <w:t>absent</w:t>
+      </w:r>
+      <w:r>
+        <w:t xml:space="preserve">; both Station Camp EDs closed. </w:t>
+      </w:r>
+      <w:r>
+        <w:rPr>
+          <w:b/>
+        </w:rPr>
+        <w:t>Done earlier:</w:t>
+      </w:r>
+      <w:r>
         <w:t xml:space="preserve"> Bell </w:t>
       </w:r>
       <w:r>
@@ -11283,16 +11421,7 @@
         <w:t>25–34</w:t>
       </w:r>
       <w:r>
-        <w:t xml:space="preserve"> official closes; Estill </w:t>
-      </w:r>
-      <w:r>
-        <w:rPr>
-          <w:b/>
-        </w:rPr>
-        <w:t>33-8/33-9</w:t>
-      </w:r>
-      <w:r>
-        <w:t xml:space="preserve"> film-gap proven on IA T626-742; 1920 Berea Town ED </w:t>
+        <w:t xml:space="preserve"> official closes; 1920 Berea Town ED </w:t>
       </w:r>
       <w:r>
         <w:rPr>
@@ -11419,19 +11548,10 @@
         <w:rPr>
           <w:b/>
         </w:rPr>
-        <w:t>1930 33-8</w:t>
-      </w:r>
-      <w:r>
-        <w:t xml:space="preserve"> on FS/Ancestry/NARA film (absent IA 742; stamped </w:t>
-      </w:r>
-      <w:r>
-        <w:rPr>
-          <w:b/>
-        </w:rPr>
-        <w:t>095A–102B</w:t>
-      </w:r>
-      <w:r>
-        <w:t xml:space="preserve"> unpublished; official Reel </w:t>
+        <w:t>1930 33-9</w:t>
+      </w:r>
+      <w:r>
+        <w:t xml:space="preserve"> (on ACPL </w:t>
       </w:r>
       <w:r>
         <w:rPr>
@@ -11440,7 +11560,16 @@
         <w:t>742</w:t>
       </w:r>
       <w:r>
-        <w:t xml:space="preserve"> includes it) + </w:t>
+        <w:t xml:space="preserve">, unread) + </w:t>
+      </w:r>
+      <w:r>
+        <w:rPr>
+          <w:b/>
+        </w:rPr>
+        <w:t>33-5</w:t>
+      </w:r>
+      <w:r>
+        <w:t xml:space="preserve"> Irvine South unread + </w:t>
       </w:r>
       <w:r>
         <w:rPr>
@@ -11539,7 +11668,16 @@
         <w:t>1958</w:t>
       </w:r>
       <w:r>
-        <w:t xml:space="preserve"> film or Newspapers.com </w:t>
+        <w:t xml:space="preserve"> *Citizen* film (phone </w:t>
+      </w:r>
+      <w:r>
+        <w:rPr>
+          <w:b/>
+        </w:rPr>
+        <w:t>859-985-3364</w:t>
+      </w:r>
+      <w:r>
+        <w:t xml:space="preserve">) or Newspapers.com </w:t>
       </w:r>
       <w:r>
         <w:rPr>
@@ -11548,7 +11686,25 @@
         <w:t>41271</w:t>
       </w:r>
       <w:r>
-        <w:t xml:space="preserve">, </w:t>
+        <w:t xml:space="preserve"> (UK </w:t>
+      </w:r>
+      <w:r>
+        <w:rPr>
+          <w:b/>
+        </w:rPr>
+        <w:t>S-150</w:t>
+      </w:r>
+      <w:r>
+        <w:t xml:space="preserve"> starts </w:t>
+      </w:r>
+      <w:r>
+        <w:rPr>
+          <w:b/>
+        </w:rPr>
+        <w:t>3 Jul 1958</w:t>
+      </w:r>
+      <w:r>
+        <w:t xml:space="preserve"> — too late for 19 Jun), </w:t>
       </w:r>
       <w:r>
         <w:rPr>
@@ -24567,6 +24723,305 @@
     </w:p>
     <w:p>
       <w:r>
+        <w:t>214. Internet Archive [kentuckycensus00reel742](https://archive.org/details/kentuckycensus00reel742): ACPL T626-</w:t>
+      </w:r>
+      <w:r>
+        <w:rPr>
+          <w:b/>
+        </w:rPr>
+        <w:t>742</w:t>
+      </w:r>
+      <w:r>
+        <w:t xml:space="preserve">, </w:t>
+      </w:r>
+      <w:r>
+        <w:rPr>
+          <w:b/>
+        </w:rPr>
+        <w:t>1165</w:t>
+      </w:r>
+      <w:r>
+        <w:t xml:space="preserve"> images, volume Reel </w:t>
+      </w:r>
+      <w:r>
+        <w:rPr>
+          <w:b/>
+        </w:rPr>
+        <w:t>742</w:t>
+      </w:r>
+      <w:r>
+        <w:t>; Daviess / Edmonson / Estill / Grant. Distinct from incomplete [`15thcensusofpopu742unit`](https://archive.org/details/15thcensusofpopu742unit) (</w:t>
+      </w:r>
+      <w:r>
+        <w:rPr>
+          <w:b/>
+        </w:rPr>
+        <w:t>515</w:t>
+      </w:r>
+      <w:r>
+        <w:t xml:space="preserve"> images). *Catalog.* </w:t>
+      </w:r>
+      <w:r>
+        <w:rPr>
+          <w:b/>
+        </w:rPr>
+        <w:t>C1230</w:t>
+      </w:r>
+      <w:r>
+        <w:t xml:space="preserve"> </w:t>
+      </w:r>
+      <w:r>
+        <w:rPr>
+          <w:b/>
+        </w:rPr>
+        <w:t>S927</w:t>
+      </w:r>
+      <w:r>
+        <w:t>.</w:t>
+      </w:r>
+    </w:p>
+    <w:p>
+      <w:r>
+        <w:t xml:space="preserve">215. Same reel leaves </w:t>
+      </w:r>
+      <w:r>
+        <w:rPr>
+          <w:b/>
+        </w:rPr>
+        <w:t>777–792</w:t>
+      </w:r>
+      <w:r>
+        <w:t xml:space="preserve">: Estill Magisterial Dist. </w:t>
+      </w:r>
+      <w:r>
+        <w:rPr>
+          <w:b/>
+        </w:rPr>
+        <w:t>3</w:t>
+      </w:r>
+      <w:r>
+        <w:t xml:space="preserve"> (part), ED </w:t>
+      </w:r>
+      <w:r>
+        <w:rPr>
+          <w:b/>
+        </w:rPr>
+        <w:t>33-8</w:t>
+      </w:r>
+      <w:r>
+        <w:t xml:space="preserve">, enumerator </w:t>
+      </w:r>
+      <w:r>
+        <w:rPr>
+          <w:b/>
+        </w:rPr>
+        <w:t>Thomas H. Brison</w:t>
+      </w:r>
+      <w:r>
+        <w:t xml:space="preserve">, sheet </w:t>
+      </w:r>
+      <w:r>
+        <w:rPr>
+          <w:b/>
+        </w:rPr>
+        <w:t>1A</w:t>
+      </w:r>
+      <w:r>
+        <w:t xml:space="preserve"> stamped </w:t>
+      </w:r>
+      <w:r>
+        <w:rPr>
+          <w:b/>
+        </w:rPr>
+        <w:t>095</w:t>
+      </w:r>
+      <w:r>
+        <w:t xml:space="preserve"> through sheet </w:t>
+      </w:r>
+      <w:r>
+        <w:rPr>
+          <w:b/>
+        </w:rPr>
+        <w:t>8B</w:t>
+      </w:r>
+      <w:r>
+        <w:t xml:space="preserve">. Name columns </w:t>
+      </w:r>
+      <w:r>
+        <w:rPr>
+          <w:b/>
+        </w:rPr>
+        <w:t>visually read</w:t>
+      </w:r>
+      <w:r>
+        <w:t xml:space="preserve"> — Newman/Newnam </w:t>
+      </w:r>
+      <w:r>
+        <w:rPr>
+          <w:b/>
+        </w:rPr>
+        <w:t>0</w:t>
+      </w:r>
+      <w:r>
+        <w:t xml:space="preserve">. Flynn son Boyd, Witt son Floyd, Fowler Floyd </w:t>
+      </w:r>
+      <w:r>
+        <w:rPr>
+          <w:b/>
+        </w:rPr>
+        <w:t>rejected</w:t>
+      </w:r>
+      <w:r>
+        <w:t xml:space="preserve">. *Image seen.* </w:t>
+      </w:r>
+      <w:r>
+        <w:rPr>
+          <w:b/>
+        </w:rPr>
+        <w:t>C1231 C1232</w:t>
+      </w:r>
+      <w:r>
+        <w:t xml:space="preserve"> </w:t>
+      </w:r>
+      <w:r>
+        <w:rPr>
+          <w:b/>
+        </w:rPr>
+        <w:t>S928 S929</w:t>
+      </w:r>
+      <w:r>
+        <w:t>.</w:t>
+      </w:r>
+    </w:p>
+    <w:p>
+      <w:r>
+        <w:t xml:space="preserve">216. Hutchins [FAQ 9806](https://libraryanswers.berea.edu/faq/9806): *Citizen* microfilm </w:t>
+      </w:r>
+      <w:r>
+        <w:rPr>
+          <w:b/>
+        </w:rPr>
+        <w:t>1899–2008</w:t>
+      </w:r>
+      <w:r>
+        <w:t xml:space="preserve">; phone </w:t>
+      </w:r>
+      <w:r>
+        <w:rPr>
+          <w:b/>
+        </w:rPr>
+        <w:t>859-985-3364</w:t>
+      </w:r>
+      <w:r>
+        <w:t xml:space="preserve">; email </w:t>
+      </w:r>
+      <w:r>
+        <w:rPr>
+          <w:b/>
+        </w:rPr>
+        <w:t>reference@berea.edu</w:t>
+      </w:r>
+      <w:r>
+        <w:t xml:space="preserve">. NKAA [Berea citizen](https://nkaa.uky.edu/nkaa/items/show/300001007): UK Young Library </w:t>
+      </w:r>
+      <w:r>
+        <w:rPr>
+          <w:b/>
+        </w:rPr>
+        <w:t>Microfilm S-150</w:t>
+      </w:r>
+      <w:r>
+        <w:t xml:space="preserve">, </w:t>
+      </w:r>
+      <w:r>
+        <w:rPr>
+          <w:b/>
+        </w:rPr>
+        <w:t>1958: Jul. 3 – 2008 : Dec.</w:t>
+      </w:r>
+      <w:r>
+        <w:t xml:space="preserve"> *Catalog.* </w:t>
+      </w:r>
+      <w:r>
+        <w:rPr>
+          <w:b/>
+        </w:rPr>
+        <w:t>C1235 C1236</w:t>
+      </w:r>
+      <w:r>
+        <w:t xml:space="preserve"> </w:t>
+      </w:r>
+      <w:r>
+        <w:rPr>
+          <w:b/>
+        </w:rPr>
+        <w:t>S932 S933</w:t>
+      </w:r>
+      <w:r>
+        <w:t>.</w:t>
+      </w:r>
+    </w:p>
+    <w:p>
+      <w:r>
+        <w:t xml:space="preserve">217. Genealogy Trails [Lee WWI](https://genealogytrails.com/ken/lee/wwi_draft_cards.html) live </w:t>
+      </w:r>
+      <w:r>
+        <w:rPr>
+          <w:b/>
+        </w:rPr>
+        <w:t>200</w:t>
+      </w:r>
+      <w:r>
+        <w:t xml:space="preserve">, </w:t>
+      </w:r>
+      <w:r>
+        <w:rPr>
+          <w:b/>
+        </w:rPr>
+        <w:t>452 KB</w:t>
+      </w:r>
+      <w:r>
+        <w:t xml:space="preserve">: Newman/Newnam/McCoy </w:t>
+      </w:r>
+      <w:r>
+        <w:rPr>
+          <w:b/>
+        </w:rPr>
+        <w:t>0</w:t>
+      </w:r>
+      <w:r>
+        <w:t xml:space="preserve">. Official M1509 pamphlet </w:t>
+      </w:r>
+      <w:r>
+        <w:rPr>
+          <w:b/>
+        </w:rPr>
+        <w:t>KY24 / KY45 / KY74 / KY64 / KY90</w:t>
+      </w:r>
+      <w:r>
+        <w:t xml:space="preserve"> reconfirm. *Compiled landing / pamphlet.* </w:t>
+      </w:r>
+      <w:r>
+        <w:rPr>
+          <w:b/>
+        </w:rPr>
+        <w:t>C1237 C1238</w:t>
+      </w:r>
+      <w:r>
+        <w:t xml:space="preserve"> </w:t>
+      </w:r>
+      <w:r>
+        <w:rPr>
+          <w:b/>
+        </w:rPr>
+        <w:t>S934 S935</w:t>
+      </w:r>
+      <w:r>
+        <w:t>.</w:t>
+      </w:r>
+    </w:p>
+    <w:p>
+      <w:r>
         <w:br w:type="page"/>
       </w:r>
     </w:p>
@@ -26087,6 +26542,46 @@
     <w:p>
       <w:r>
         <w:t>| S926 | `../sources/census/pass106-extract-2026-10-31.txt` | This session | Pass 106 extract | extract |</w:t>
+      </w:r>
+    </w:p>
+    <w:p>
+      <w:r>
+        <w:t>| S927 | `../sources/catalog/ia-kentuckycensus00reel742-pass107.json` | [IA ACPL 742](https://archive.org/details/kentuckycensus00reel742) | 1165 images; Estill on reel | catalog |</w:t>
+      </w:r>
+    </w:p>
+    <w:p>
+      <w:r>
+        <w:t>| S928 | `../sources/census/pass107-acpl742/hdr0777.jpg` | [IA ACPL 742](https://archive.org/details/kentuckycensus00reel742) | 33-8 sheet 1A stamped 095 | image seen |</w:t>
+      </w:r>
+    </w:p>
+    <w:p>
+      <w:r>
+        <w:t>| S929 | `../sources/census/pass107-acpl742/nm0777.jpg` | [IA ACPL 742](https://archive.org/details/kentuckycensus00reel742) | 16 name columns; Newman 0 | image seen |</w:t>
+      </w:r>
+    </w:p>
+    <w:p>
+      <w:r>
+        <w:t>| S931 | `../sources/catalog/uscensus-estill-1930-indx-mq-pass107.txt` | [Estill 1930 M–Q](https://www.us-census.org/pub/usgenweb/census/ky/estill/1930/) | Published 33-1–33-4; Newman 0 | compiled-index |</w:t>
+      </w:r>
+    </w:p>
+    <w:p>
+      <w:r>
+        <w:t>| S932 | `../sources/press/berea-faq-9806-extract-pass107.txt` | [Hutchins FAQ 9806](https://libraryanswers.berea.edu/faq/9806) | Film 1899–2008; phone 859-985-3364 | catalog |</w:t>
+      </w:r>
+    </w:p>
+    <w:p>
+      <w:r>
+        <w:t>| S933 | `../sources/press/nkaa-berea-citizen-extract-pass107.txt` | [NKAA S-150](https://nkaa.uky.edu/nkaa/items/show/300001007) | 1958: Jul. 3 – 2008 : Dec. | catalog |</w:t>
+      </w:r>
+    </w:p>
+    <w:p>
+      <w:r>
+        <w:t>| S934 | `../sources/military/gt-lee-wwi-pass107.html` | [GT Lee WWI](https://genealogytrails.com/ken/lee/wwi_draft_cards.html) | Live 200; Newman/McCoy 0 | compiled landing |</w:t>
+      </w:r>
+    </w:p>
+    <w:p>
+      <w:r>
+        <w:t>| S938 | `../sources/census/pass107-extract-2026-10-31.txt` | This session | Pass 107 extract | extract |</w:t>
       </w:r>
     </w:p>
     <w:p>

</xml_diff>

<commit_message>
Pass 108: isolate Estill 1930 33-9 and 33-5 on ACPL reel 742; Boyd+Allie absent
33-9 Dist. 3 (Hattie M. Cole, leaves 793–819) and 33-5 Irvine South
(Daisy Wiggins, leaves 707–717) are image-seen and visually read.
Combined with 33-7 and 33-8, Boyd and Allie are absent from Irvine
South and both Station Camp EDs. C1242–C1246.

Co-authored-by: blakereaganlaw <blakereaganlaw@gmail.com>
</commit_message>
<xml_diff>
--- a/research/dora-ella-newnam/book/Dora-Ella-Newnam-Stone-A-Life.docx
+++ b/research/dora-ella-newnam/book/Dora-Ella-Newnam-Stone-A-Life.docx
@@ -291,6 +291,11 @@
     </w:p>
     <w:p>
       <w:r>
+        <w:t>53. [Pass 108. District 33-9 and Irvine South are empty too](#pass-108-district-33-9-and-irvine-south-are-empty-too)</w:t>
+      </w:r>
+    </w:p>
+    <w:p>
+      <w:r>
         <w:br w:type="page"/>
       </w:r>
     </w:p>
@@ -9361,6 +9366,48 @@
       </w:r>
     </w:p>
     <w:p>
+      <w:pPr>
+        <w:pStyle w:val="Heading2"/>
+      </w:pPr>
+      <w:r>
+        <w:t>Pass 108. District 33-9 and Irvine South are empty too</w:t>
+      </w:r>
+    </w:p>
+    <w:p>
+      <w:r>
+        <w:t>On the same Allen County reel, leaves 793 through 819 are Estill Magisterial District 3, enumeration district 33-9. The enumerator is Hattie M. Cole. Sheet 1A opens the district; sheet 14A, stamped 116, closes it. Leaf 820 is blank. Leaf 821 is already 33-10, Red Lick, stamped 117. [C1242] [S939]</w:t>
+      </w:r>
+    </w:p>
+    <w:p>
+      <w:r>
+        <w:t>Twenty-seven name columns were read. There is no Newman or Newnam surname. A head surnamed Floyd, and given-name Floyds in Worley, Newton, Tackett, Cecil, and Henderson houses, are other families. Combined with 33-7 and 33-8, Boyd and Allie are absent from District 3 Station Camp and from this next District 3 film. [C1243] [S940]</w:t>
+      </w:r>
+    </w:p>
+    <w:p>
+      <w:r>
+        <w:t>Leaves 707 through 717 are Estill Magisterial District 1, enumeration district 33-5 — Irvine South outside the city and Ravenna. The enumerator is Mrs. Daisy Wiggins. Sheet 1A is stamped 060; sheet 6A is stamped 065. Leaf 706 is still 33-4. Leaf 719 is already 33-6, Ravenna, Jesse Thorp. [C1244] [S941]</w:t>
+      </w:r>
+    </w:p>
+    <w:p>
+      <w:r>
+        <w:t>Eleven name columns were read. There is no Newman or Newnam surname. A Witt head named Floyd is another family. A Brandenburg household is that surname only; it is not Allie. [C1245] [S942]</w:t>
+      </w:r>
+    </w:p>
+    <w:p>
+      <w:r>
+        <w:t xml:space="preserve">David G. of 1958 is still </w:t>
+      </w:r>
+      <w:r>
+        <w:rPr>
+          <w:b/>
+        </w:rPr>
+        <w:t>possible</w:t>
+      </w:r>
+      <w:r>
+        <w:t xml:space="preserve"> only against Frank. Districts 33-5 and 33-9 are no longer unpublished on free film. Do not print 1966 or 1976 as proven deaths. Do not print Floyd as Boyd. Do not print 1962 as McCoy’s death. Do not print the 1942 Combs charge as fact. [C1246]</w:t>
+      </w:r>
+    </w:p>
+    <w:p>
       <w:r>
         <w:t xml:space="preserve">In Madison County in 1950 a </w:t>
       </w:r>
@@ -11034,7 +11081,88 @@
         <w:t>33-9</w:t>
       </w:r>
       <w:r>
-        <w:t xml:space="preserve"> on the same reel unread; </w:t>
+        <w:t xml:space="preserve"> leaves </w:t>
+      </w:r>
+      <w:r>
+        <w:rPr>
+          <w:b/>
+        </w:rPr>
+        <w:t>793–819</w:t>
+      </w:r>
+      <w:r>
+        <w:t xml:space="preserve"> </w:t>
+      </w:r>
+      <w:r>
+        <w:rPr>
+          <w:b/>
+        </w:rPr>
+        <w:t>visually read</w:t>
+      </w:r>
+      <w:r>
+        <w:t xml:space="preserve"> — Boyd+Allie </w:t>
+      </w:r>
+      <w:r>
+        <w:rPr>
+          <w:b/>
+        </w:rPr>
+        <w:t>absent</w:t>
+      </w:r>
+      <w:r>
+        <w:t xml:space="preserve"> (</w:t>
+      </w:r>
+      <w:r>
+        <w:rPr>
+          <w:b/>
+        </w:rPr>
+        <w:t>C1242 C1243</w:t>
+      </w:r>
+      <w:r>
+        <w:t xml:space="preserve">); </w:t>
+      </w:r>
+      <w:r>
+        <w:rPr>
+          <w:b/>
+        </w:rPr>
+        <w:t>33-5</w:t>
+      </w:r>
+      <w:r>
+        <w:t xml:space="preserve"> Irvine South leaves </w:t>
+      </w:r>
+      <w:r>
+        <w:rPr>
+          <w:b/>
+        </w:rPr>
+        <w:t>707–717</w:t>
+      </w:r>
+      <w:r>
+        <w:t xml:space="preserve"> </w:t>
+      </w:r>
+      <w:r>
+        <w:rPr>
+          <w:b/>
+        </w:rPr>
+        <w:t>visually read</w:t>
+      </w:r>
+      <w:r>
+        <w:t xml:space="preserve"> — Boyd+Allie </w:t>
+      </w:r>
+      <w:r>
+        <w:rPr>
+          <w:b/>
+        </w:rPr>
+        <w:t>absent</w:t>
+      </w:r>
+      <w:r>
+        <w:t xml:space="preserve"> (</w:t>
+      </w:r>
+      <w:r>
+        <w:rPr>
+          <w:b/>
+        </w:rPr>
+        <w:t>C1244 C1245</w:t>
+      </w:r>
+      <w:r>
+        <w:t xml:space="preserve">); </w:t>
       </w:r>
       <w:r>
         <w:rPr>
@@ -11382,28 +11510,82 @@
         <w:rPr>
           <w:b/>
         </w:rPr>
+        <w:t>1930 33-9</w:t>
+      </w:r>
+      <w:r>
+        <w:t xml:space="preserve"> leaves </w:t>
+      </w:r>
+      <w:r>
+        <w:rPr>
+          <w:b/>
+        </w:rPr>
+        <w:t>793–819</w:t>
+      </w:r>
+      <w:r>
+        <w:t xml:space="preserve"> and </w:t>
+      </w:r>
+      <w:r>
+        <w:rPr>
+          <w:b/>
+        </w:rPr>
+        <w:t>33-5</w:t>
+      </w:r>
+      <w:r>
+        <w:t xml:space="preserve"> Irvine South leaves </w:t>
+      </w:r>
+      <w:r>
+        <w:rPr>
+          <w:b/>
+        </w:rPr>
+        <w:t>707–717</w:t>
+      </w:r>
+      <w:r>
+        <w:t xml:space="preserve"> isolated and visually read on ACPL reel </w:t>
+      </w:r>
+      <w:r>
+        <w:rPr>
+          <w:b/>
+        </w:rPr>
+        <w:t>742</w:t>
+      </w:r>
+      <w:r>
+        <w:t xml:space="preserve"> — Boyd+Allie </w:t>
+      </w:r>
+      <w:r>
+        <w:rPr>
+          <w:b/>
+        </w:rPr>
+        <w:t>absent</w:t>
+      </w:r>
+      <w:r>
+        <w:t xml:space="preserve"> both. </w:t>
+      </w:r>
+      <w:r>
+        <w:rPr>
+          <w:b/>
+        </w:rPr>
+        <w:t>33-5 + 33-7 + 33-8 + 33-9</w:t>
+      </w:r>
+      <w:r>
+        <w:t xml:space="preserve"> now closed. </w:t>
+      </w:r>
+      <w:r>
+        <w:rPr>
+          <w:b/>
+        </w:rPr>
+        <w:t>Done earlier:</w:t>
+      </w:r>
+      <w:r>
+        <w:t xml:space="preserve"> Estill </w:t>
+      </w:r>
+      <w:r>
+        <w:rPr>
+          <w:b/>
+        </w:rPr>
         <w:t>1930 33-8</w:t>
       </w:r>
       <w:r>
-        <w:t xml:space="preserve"> isolated and visually read on ACPL reel </w:t>
-      </w:r>
-      <w:r>
-        <w:rPr>
-          <w:b/>
-        </w:rPr>
-        <w:t>742</w:t>
-      </w:r>
-      <w:r>
-        <w:t xml:space="preserve"> — Boyd+Allie </w:t>
-      </w:r>
-      <w:r>
-        <w:rPr>
-          <w:b/>
-        </w:rPr>
-        <w:t>absent</w:t>
-      </w:r>
-      <w:r>
-        <w:t xml:space="preserve">; both Station Camp EDs closed. </w:t>
+        <w:t xml:space="preserve"> isolated and visually read — both Station Camp EDs closed. </w:t>
       </w:r>
       <w:r>
         <w:rPr>
@@ -11542,34 +11724,7 @@
         <w:t>B089</w:t>
       </w:r>
       <w:r>
-        <w:t xml:space="preserve"> Estill </w:t>
-      </w:r>
-      <w:r>
-        <w:rPr>
-          <w:b/>
-        </w:rPr>
-        <w:t>1930 33-9</w:t>
-      </w:r>
-      <w:r>
-        <w:t xml:space="preserve"> (on ACPL </w:t>
-      </w:r>
-      <w:r>
-        <w:rPr>
-          <w:b/>
-        </w:rPr>
-        <w:t>742</w:t>
-      </w:r>
-      <w:r>
-        <w:t xml:space="preserve">, unread) + </w:t>
-      </w:r>
-      <w:r>
-        <w:rPr>
-          <w:b/>
-        </w:rPr>
-        <w:t>33-5</w:t>
-      </w:r>
-      <w:r>
-        <w:t xml:space="preserve"> Irvine South unread + </w:t>
+        <w:t xml:space="preserve"> </w:t>
       </w:r>
       <w:r>
         <w:rPr>
@@ -11587,7 +11742,7 @@
         <w:t>T1224 roll 69</w:t>
       </w:r>
       <w:r>
-        <w:t xml:space="preserve"> descriptions, </w:t>
+        <w:t xml:space="preserve"> descriptions (33-5 and 33-9 now visually closed), </w:t>
       </w:r>
       <w:r>
         <w:rPr>
@@ -25022,6 +25177,223 @@
     </w:p>
     <w:p>
       <w:r>
+        <w:t xml:space="preserve">218. Internet Archive [kentuckycensus00reel742](https://archive.org/details/kentuckycensus00reel742) leaves </w:t>
+      </w:r>
+      <w:r>
+        <w:rPr>
+          <w:b/>
+        </w:rPr>
+        <w:t>793–819</w:t>
+      </w:r>
+      <w:r>
+        <w:t xml:space="preserve">: Estill Dist. </w:t>
+      </w:r>
+      <w:r>
+        <w:rPr>
+          <w:b/>
+        </w:rPr>
+        <w:t>3</w:t>
+      </w:r>
+      <w:r>
+        <w:t xml:space="preserve">, ED </w:t>
+      </w:r>
+      <w:r>
+        <w:rPr>
+          <w:b/>
+        </w:rPr>
+        <w:t>33-9</w:t>
+      </w:r>
+      <w:r>
+        <w:t xml:space="preserve">, enumerator </w:t>
+      </w:r>
+      <w:r>
+        <w:rPr>
+          <w:b/>
+        </w:rPr>
+        <w:t>Hattie M. Cole</w:t>
+      </w:r>
+      <w:r>
+        <w:t xml:space="preserve">, sheet </w:t>
+      </w:r>
+      <w:r>
+        <w:rPr>
+          <w:b/>
+        </w:rPr>
+        <w:t>1A</w:t>
+      </w:r>
+      <w:r>
+        <w:t xml:space="preserve"> through </w:t>
+      </w:r>
+      <w:r>
+        <w:rPr>
+          <w:b/>
+        </w:rPr>
+        <w:t>14A</w:t>
+      </w:r>
+      <w:r>
+        <w:t xml:space="preserve"> stamped </w:t>
+      </w:r>
+      <w:r>
+        <w:rPr>
+          <w:b/>
+        </w:rPr>
+        <w:t>116</w:t>
+      </w:r>
+      <w:r>
+        <w:t xml:space="preserve">. Name columns </w:t>
+      </w:r>
+      <w:r>
+        <w:rPr>
+          <w:b/>
+        </w:rPr>
+        <w:t>visually read</w:t>
+      </w:r>
+      <w:r>
+        <w:t xml:space="preserve"> — Newman/Newnam </w:t>
+      </w:r>
+      <w:r>
+        <w:rPr>
+          <w:b/>
+        </w:rPr>
+        <w:t>0</w:t>
+      </w:r>
+      <w:r>
+        <w:t xml:space="preserve">. *Image seen.* </w:t>
+      </w:r>
+      <w:r>
+        <w:rPr>
+          <w:b/>
+        </w:rPr>
+        <w:t>C1242 C1243</w:t>
+      </w:r>
+      <w:r>
+        <w:t xml:space="preserve"> </w:t>
+      </w:r>
+      <w:r>
+        <w:rPr>
+          <w:b/>
+        </w:rPr>
+        <w:t>S939 S940</w:t>
+      </w:r>
+      <w:r>
+        <w:t>.</w:t>
+      </w:r>
+    </w:p>
+    <w:p>
+      <w:r>
+        <w:t xml:space="preserve">219. Same reel leaves </w:t>
+      </w:r>
+      <w:r>
+        <w:rPr>
+          <w:b/>
+        </w:rPr>
+        <w:t>707–717</w:t>
+      </w:r>
+      <w:r>
+        <w:t xml:space="preserve">: Estill Dist. </w:t>
+      </w:r>
+      <w:r>
+        <w:rPr>
+          <w:b/>
+        </w:rPr>
+        <w:t>1</w:t>
+      </w:r>
+      <w:r>
+        <w:t xml:space="preserve">, ED </w:t>
+      </w:r>
+      <w:r>
+        <w:rPr>
+          <w:b/>
+        </w:rPr>
+        <w:t>33-5</w:t>
+      </w:r>
+      <w:r>
+        <w:t xml:space="preserve"> Irvine South, enumerator </w:t>
+      </w:r>
+      <w:r>
+        <w:rPr>
+          <w:b/>
+        </w:rPr>
+        <w:t>Mrs Daisy Wiggins</w:t>
+      </w:r>
+      <w:r>
+        <w:t xml:space="preserve">, sheet </w:t>
+      </w:r>
+      <w:r>
+        <w:rPr>
+          <w:b/>
+        </w:rPr>
+        <w:t>1A</w:t>
+      </w:r>
+      <w:r>
+        <w:t xml:space="preserve"> stamped </w:t>
+      </w:r>
+      <w:r>
+        <w:rPr>
+          <w:b/>
+        </w:rPr>
+        <w:t>060</w:t>
+      </w:r>
+      <w:r>
+        <w:t xml:space="preserve"> through </w:t>
+      </w:r>
+      <w:r>
+        <w:rPr>
+          <w:b/>
+        </w:rPr>
+        <w:t>6A</w:t>
+      </w:r>
+      <w:r>
+        <w:t xml:space="preserve"> stamped </w:t>
+      </w:r>
+      <w:r>
+        <w:rPr>
+          <w:b/>
+        </w:rPr>
+        <w:t>065</w:t>
+      </w:r>
+      <w:r>
+        <w:t xml:space="preserve">. Name columns </w:t>
+      </w:r>
+      <w:r>
+        <w:rPr>
+          <w:b/>
+        </w:rPr>
+        <w:t>visually read</w:t>
+      </w:r>
+      <w:r>
+        <w:t xml:space="preserve"> — Newman/Newnam </w:t>
+      </w:r>
+      <w:r>
+        <w:rPr>
+          <w:b/>
+        </w:rPr>
+        <w:t>0</w:t>
+      </w:r>
+      <w:r>
+        <w:t xml:space="preserve">. *Image seen.* </w:t>
+      </w:r>
+      <w:r>
+        <w:rPr>
+          <w:b/>
+        </w:rPr>
+        <w:t>C1244 C1245</w:t>
+      </w:r>
+      <w:r>
+        <w:t xml:space="preserve"> </w:t>
+      </w:r>
+      <w:r>
+        <w:rPr>
+          <w:b/>
+        </w:rPr>
+        <w:t>S941 S942</w:t>
+      </w:r>
+      <w:r>
+        <w:t>.</w:t>
+      </w:r>
+    </w:p>
+    <w:p>
+      <w:r>
         <w:br w:type="page"/>
       </w:r>
     </w:p>
@@ -26582,6 +26954,31 @@
     <w:p>
       <w:r>
         <w:t>| S938 | `../sources/census/pass107-extract-2026-10-31.txt` | This session | Pass 107 extract | extract |</w:t>
+      </w:r>
+    </w:p>
+    <w:p>
+      <w:r>
+        <w:t>| S939 | `../sources/census/pass108-acpl742/hdr793.jpg` | [IA ACPL 742](https://archive.org/details/kentuckycensus00reel742) | 33-9 sheet 1A | image seen |</w:t>
+      </w:r>
+    </w:p>
+    <w:p>
+      <w:r>
+        <w:t>| S940 | `../sources/census/pass108-acpl742/nm793.jpg` | [IA ACPL 742](https://archive.org/details/kentuckycensus00reel742) | 27 name columns; Newman 0 | image seen |</w:t>
+      </w:r>
+    </w:p>
+    <w:p>
+      <w:r>
+        <w:t>| S941 | `../sources/census/pass108-acpl742/hdr707.jpg` | [IA ACPL 742](https://archive.org/details/kentuckycensus00reel742) | 33-5 sheet 1A stamped 060 | image seen |</w:t>
+      </w:r>
+    </w:p>
+    <w:p>
+      <w:r>
+        <w:t>| S942 | `../sources/census/pass108-acpl742/nm707.jpg` | [IA ACPL 742](https://archive.org/details/kentuckycensus00reel742) | 11 name columns; Newman 0 | image seen |</w:t>
+      </w:r>
+    </w:p>
+    <w:p>
+      <w:r>
+        <w:t>| S943 | `../sources/census/pass108-extract-2026-10-31.txt` | This session | Pass 108 extract | extract |</w:t>
       </w:r>
     </w:p>
     <w:p>

</xml_diff>

<commit_message>
Pass 109: isolate true Estill 1930 33-7; withdraw 793-819 as 33-7
Leaves 755-775 are Station Camp North (Clay Mcneal). Twenty-one name
columns visually read; Boyd and Allie absent. C919-C921 withdrawn:
793-819 is 33-9. 33-6 isolated 719-746, names unread. C1247-C1255.

Co-authored-by: blakereaganlaw <blakereaganlaw@gmail.com>
</commit_message>
<xml_diff>
--- a/research/dora-ella-newnam/book/Dora-Ella-Newnam-Stone-A-Life.docx
+++ b/research/dora-ella-newnam/book/Dora-Ella-Newnam-Stone-A-Life.docx
@@ -296,6 +296,11 @@
     </w:p>
     <w:p>
       <w:r>
+        <w:t>54. [Pass 109. Station Camp North was never those later leaves](#pass-109-station-camp-north-was-never-those-later-leaves)</w:t>
+      </w:r>
+    </w:p>
+    <w:p>
+      <w:r>
         <w:br w:type="page"/>
       </w:r>
     </w:p>
@@ -9408,6 +9413,48 @@
       </w:r>
     </w:p>
     <w:p>
+      <w:pPr>
+        <w:pStyle w:val="Heading2"/>
+      </w:pPr>
+      <w:r>
+        <w:t>Pass 109. Station Camp North was never those later leaves</w:t>
+      </w:r>
+    </w:p>
+    <w:p>
+      <w:r>
+        <w:t>An earlier pass treated leaves 793–819 as Station Camp North, district 33-7, enumerator Matilda N. Cole. Those leaves are district 33-9. The enumerator is Hattie M. Cole. That identification is withdrawn. [C1249] [C1242]</w:t>
+      </w:r>
+    </w:p>
+    <w:p>
+      <w:r>
+        <w:t>The real Station Camp North sits earlier on the same reel. Leaves 755 through 775 are Estill, Station Camp, Magisterial District 3, enumeration district 33-7. The enumerator is Clay Mcneal. Sheet 1A opens the district; sheet 11A, stamped 094, closes it. Leaf 776 is blank. Leaf 777 is already 33-8, stamped 095. [C1247] [S944]</w:t>
+      </w:r>
+    </w:p>
+    <w:p>
+      <w:r>
+        <w:t>Twenty-one name columns were read. There is no Newman or Newnam surname. A Johnson head named Floyd, and an Allie in a McKinney house, are other families. Brandenburg households on this film are that surname only; they are not Allie. Boyd and Allie are absent from the real 1930 Station Camp North. [C1248] [S945]</w:t>
+      </w:r>
+    </w:p>
+    <w:p>
+      <w:r>
+        <w:t>Leaves 719 through 746 are district 33-6 — Ravenna into Millers Creek, Jesse Thorp. Those twenty-eight name columns have not been fully read. [C1250]</w:t>
+      </w:r>
+    </w:p>
+    <w:p>
+      <w:r>
+        <w:t xml:space="preserve">David G. of 1958 is still </w:t>
+      </w:r>
+      <w:r>
+        <w:rPr>
+          <w:b/>
+        </w:rPr>
+        <w:t>possible</w:t>
+      </w:r>
+      <w:r>
+        <w:t xml:space="preserve"> only against Frank. Do not print 1966 or 1976 as proven deaths. Do not print Floyd as Boyd. Do not print 1962 as McCoy’s death. Do not print the 1942 Combs charge as fact. [C1255]</w:t>
+      </w:r>
+    </w:p>
+    <w:p>
       <w:r>
         <w:t xml:space="preserve">In Madison County in 1950 a </w:t>
       </w:r>
@@ -11504,6 +11551,60 @@
         <w:t>Done this increment:</w:t>
       </w:r>
       <w:r>
+        <w:t xml:space="preserve"> true Estill </w:t>
+      </w:r>
+      <w:r>
+        <w:rPr>
+          <w:b/>
+        </w:rPr>
+        <w:t>1930 33-7</w:t>
+      </w:r>
+      <w:r>
+        <w:t xml:space="preserve"> Station Camp North leaves </w:t>
+      </w:r>
+      <w:r>
+        <w:rPr>
+          <w:b/>
+        </w:rPr>
+        <w:t>755–775</w:t>
+      </w:r>
+      <w:r>
+        <w:t xml:space="preserve"> isolated and visually read — Boyd+Allie </w:t>
+      </w:r>
+      <w:r>
+        <w:rPr>
+          <w:b/>
+        </w:rPr>
+        <w:t>absent</w:t>
+      </w:r>
+      <w:r>
+        <w:t xml:space="preserve">. </w:t>
+      </w:r>
+      <w:r>
+        <w:rPr>
+          <w:b/>
+        </w:rPr>
+        <w:t>C919–C921 WITHDRAWN</w:t>
+      </w:r>
+      <w:r>
+        <w:t xml:space="preserve"> as 33-7 identity. </w:t>
+      </w:r>
+      <w:r>
+        <w:rPr>
+          <w:b/>
+        </w:rPr>
+        <w:t>33-6</w:t>
+      </w:r>
+      <w:r>
+        <w:t xml:space="preserve"> isolated, names unread. </w:t>
+      </w:r>
+      <w:r>
+        <w:rPr>
+          <w:b/>
+        </w:rPr>
+        <w:t>Done earlier:</w:t>
+      </w:r>
+      <w:r>
         <w:t xml:space="preserve"> Estill </w:t>
       </w:r>
       <w:r>
@@ -11540,16 +11641,7 @@
         <w:t>707–717</w:t>
       </w:r>
       <w:r>
-        <w:t xml:space="preserve"> isolated and visually read on ACPL reel </w:t>
-      </w:r>
-      <w:r>
-        <w:rPr>
-          <w:b/>
-        </w:rPr>
-        <w:t>742</w:t>
-      </w:r>
-      <w:r>
-        <w:t xml:space="preserve"> — Boyd+Allie </w:t>
+        <w:t xml:space="preserve"> isolated and visually read — Boyd+Allie </w:t>
       </w:r>
       <w:r>
         <w:rPr>
@@ -11564,7 +11656,7 @@
         <w:rPr>
           <w:b/>
         </w:rPr>
-        <w:t>33-5 + 33-7 + 33-8 + 33-9</w:t>
+        <w:t>33-5 + true 33-7 + 33-8 + 33-9</w:t>
       </w:r>
       <w:r>
         <w:t xml:space="preserve"> now closed. </w:t>
@@ -11730,6 +11822,24 @@
         <w:rPr>
           <w:b/>
         </w:rPr>
+        <w:t>33-6</w:t>
+      </w:r>
+      <w:r>
+        <w:t xml:space="preserve"> name columns (leaves </w:t>
+      </w:r>
+      <w:r>
+        <w:rPr>
+          <w:b/>
+        </w:rPr>
+        <w:t>719–746</w:t>
+      </w:r>
+      <w:r>
+        <w:t xml:space="preserve">) then </w:t>
+      </w:r>
+      <w:r>
+        <w:rPr>
+          <w:b/>
+        </w:rPr>
         <w:t>M1930 roll 15</w:t>
       </w:r>
       <w:r>
@@ -11742,7 +11852,7 @@
         <w:t>T1224 roll 69</w:t>
       </w:r>
       <w:r>
-        <w:t xml:space="preserve"> descriptions (33-5 and 33-9 now visually closed), </w:t>
+        <w:t xml:space="preserve"> descriptions (true 33-7 / 33-5 / 33-8 / 33-9 now visually closed), </w:t>
       </w:r>
       <w:r>
         <w:rPr>
@@ -25394,6 +25504,169 @@
     </w:p>
     <w:p>
       <w:r>
+        <w:t xml:space="preserve">220. Same reel leaves </w:t>
+      </w:r>
+      <w:r>
+        <w:rPr>
+          <w:b/>
+        </w:rPr>
+        <w:t>755–775</w:t>
+      </w:r>
+      <w:r>
+        <w:t xml:space="preserve">: Estill Station Camp Dist. </w:t>
+      </w:r>
+      <w:r>
+        <w:rPr>
+          <w:b/>
+        </w:rPr>
+        <w:t>3</w:t>
+      </w:r>
+      <w:r>
+        <w:t xml:space="preserve">, ED </w:t>
+      </w:r>
+      <w:r>
+        <w:rPr>
+          <w:b/>
+        </w:rPr>
+        <w:t>33-7</w:t>
+      </w:r>
+      <w:r>
+        <w:t xml:space="preserve">, enumerator </w:t>
+      </w:r>
+      <w:r>
+        <w:rPr>
+          <w:b/>
+        </w:rPr>
+        <w:t>Clay Mcneal</w:t>
+      </w:r>
+      <w:r>
+        <w:t xml:space="preserve">, sheet </w:t>
+      </w:r>
+      <w:r>
+        <w:rPr>
+          <w:b/>
+        </w:rPr>
+        <w:t>1A</w:t>
+      </w:r>
+      <w:r>
+        <w:t xml:space="preserve"> through </w:t>
+      </w:r>
+      <w:r>
+        <w:rPr>
+          <w:b/>
+        </w:rPr>
+        <w:t>11A</w:t>
+      </w:r>
+      <w:r>
+        <w:t xml:space="preserve"> stamped </w:t>
+      </w:r>
+      <w:r>
+        <w:rPr>
+          <w:b/>
+        </w:rPr>
+        <w:t>094</w:t>
+      </w:r>
+      <w:r>
+        <w:t xml:space="preserve">. Name columns </w:t>
+      </w:r>
+      <w:r>
+        <w:rPr>
+          <w:b/>
+        </w:rPr>
+        <w:t>visually read</w:t>
+      </w:r>
+      <w:r>
+        <w:t xml:space="preserve"> — Newman/Newnam </w:t>
+      </w:r>
+      <w:r>
+        <w:rPr>
+          <w:b/>
+        </w:rPr>
+        <w:t>0</w:t>
+      </w:r>
+      <w:r>
+        <w:t xml:space="preserve">. *Image seen.* </w:t>
+      </w:r>
+      <w:r>
+        <w:rPr>
+          <w:b/>
+        </w:rPr>
+        <w:t>C1247 C1248</w:t>
+      </w:r>
+      <w:r>
+        <w:t xml:space="preserve"> </w:t>
+      </w:r>
+      <w:r>
+        <w:rPr>
+          <w:b/>
+        </w:rPr>
+        <w:t>S944 S945</w:t>
+      </w:r>
+      <w:r>
+        <w:t>.</w:t>
+      </w:r>
+    </w:p>
+    <w:p>
+      <w:r>
+        <w:t xml:space="preserve">221. </w:t>
+      </w:r>
+      <w:r>
+        <w:rPr>
+          <w:b/>
+        </w:rPr>
+        <w:t>C919–C921 WITHDRAWN</w:t>
+      </w:r>
+      <w:r>
+        <w:t xml:space="preserve"> as 33-7 identity: leaves </w:t>
+      </w:r>
+      <w:r>
+        <w:rPr>
+          <w:b/>
+        </w:rPr>
+        <w:t>793–819</w:t>
+      </w:r>
+      <w:r>
+        <w:t xml:space="preserve"> are </w:t>
+      </w:r>
+      <w:r>
+        <w:rPr>
+          <w:b/>
+        </w:rPr>
+        <w:t>33-9</w:t>
+      </w:r>
+      <w:r>
+        <w:t xml:space="preserve">. USGenNet [Lee wills](https://usgennet.org/usa/ky/county/lee/wills/) no Samuel P. GT Lee WWI live </w:t>
+      </w:r>
+      <w:r>
+        <w:rPr>
+          <w:b/>
+        </w:rPr>
+        <w:t>406</w:t>
+      </w:r>
+      <w:r>
+        <w:t xml:space="preserve">. *Image seen / compiled landing / access.* </w:t>
+      </w:r>
+      <w:r>
+        <w:rPr>
+          <w:b/>
+        </w:rPr>
+        <w:t>C1249–C1255</w:t>
+      </w:r>
+      <w:r>
+        <w:t xml:space="preserve"> </w:t>
+      </w:r>
+      <w:r>
+        <w:rPr>
+          <w:b/>
+        </w:rPr>
+        <w:t>S946–S952</w:t>
+      </w:r>
+      <w:r>
+        <w:t>.</w:t>
+      </w:r>
+    </w:p>
+    <w:p>
+      <w:r>
         <w:br w:type="page"/>
       </w:r>
     </w:p>
@@ -26979,6 +27252,31 @@
     <w:p>
       <w:r>
         <w:t>| S943 | `../sources/census/pass108-extract-2026-10-31.txt` | This session | Pass 108 extract | extract |</w:t>
+      </w:r>
+    </w:p>
+    <w:p>
+      <w:r>
+        <w:t>| S944 | `../sources/census/pass109-acpl742/hdr0755.jpg` | [IA ACPL 742](https://archive.org/details/kentuckycensus00reel742) | true 33-7 sheet 1A | image seen |</w:t>
+      </w:r>
+    </w:p>
+    <w:p>
+      <w:r>
+        <w:t>| S945 | `../sources/census/pass109-acpl742/nm0755.jpg` | [IA ACPL 742](https://archive.org/details/kentuckycensus00reel742) | 21 name columns; Newman 0 | image seen |</w:t>
+      </w:r>
+    </w:p>
+    <w:p>
+      <w:r>
+        <w:t>| S947 | `../sources/census/pass109-acpl742/hdr0719.jpg` | [IA ACPL 742](https://archive.org/details/kentuckycensus00reel742) | 33-6 Ravenna 1A; names unread | image seen |</w:t>
+      </w:r>
+    </w:p>
+    <w:p>
+      <w:r>
+        <w:t>| S950 | `../sources/catalog/usgennet-lee-wills-pass109.html` | [Lee wills](https://usgennet.org/usa/ky/county/lee/wills/) | No Samuel P. | compiled landing |</w:t>
+      </w:r>
+    </w:p>
+    <w:p>
+      <w:r>
+        <w:t>| S952 | `../sources/census/pass109-extract-2026-10-31.txt` | This session | Pass 109 extract | extract |</w:t>
       </w:r>
     </w:p>
     <w:p>

</xml_diff>

<commit_message>
Pass 110–111: read Estill 1930 33-6, 33-14, and 33-10; Hendrix Newnam rejected
Visually read Millers Creek West (33-6) and East (33-14) plus Red Lick East (33-10) on the ACPL reel. Boyd and Allie are absent. Hendrix Newnam, 45, with Sarah E. is not Boyd and is probable the later Harding house. Working Word rebuilt. Research remains incomplete.

Co-authored-by: blakereaganlaw <blakereaganlaw@gmail.com>
</commit_message>
<xml_diff>
--- a/research/dora-ella-newnam/book/Dora-Ella-Newnam-Stone-A-Life.docx
+++ b/research/dora-ella-newnam/book/Dora-Ella-Newnam-Stone-A-Life.docx
@@ -301,6 +301,16 @@
     </w:p>
     <w:p>
       <w:r>
+        <w:t>55. [Pass 110. Millers Creek West and East are empty](#pass-110-millers-creek-west-and-east-are-empty)</w:t>
+      </w:r>
+    </w:p>
+    <w:p>
+      <w:r>
+        <w:t>56. [Pass 111. Red Lick East has Hendrix, not Boyd](#pass-111-red-lick-east-has-hendrix-not-boyd)</w:t>
+      </w:r>
+    </w:p>
+    <w:p>
+      <w:r>
         <w:br w:type="page"/>
       </w:r>
     </w:p>
@@ -9437,7 +9447,7 @@
     </w:p>
     <w:p>
       <w:r>
-        <w:t>Leaves 719 through 746 are district 33-6 — Ravenna into Millers Creek, Jesse Thorp. Those twenty-eight name columns have not been fully read. [C1250]</w:t>
+        <w:t>Leaves 719 through 746 are district 33-6 — Ravenna into Millers Creek, Jesse Thorp. Those twenty-eight name columns were read in the next pass. [C1250] [C1256]</w:t>
       </w:r>
     </w:p>
     <w:p>
@@ -9452,6 +9462,109 @@
       </w:r>
       <w:r>
         <w:t xml:space="preserve"> only against Frank. Do not print 1966 or 1976 as proven deaths. Do not print Floyd as Boyd. Do not print 1962 as McCoy’s death. Do not print the 1942 Combs charge as fact. [C1255]</w:t>
+      </w:r>
+    </w:p>
+    <w:p>
+      <w:pPr>
+        <w:pStyle w:val="Heading2"/>
+      </w:pPr>
+      <w:r>
+        <w:t>Pass 110. Millers Creek West and East are empty</w:t>
+      </w:r>
+    </w:p>
+    <w:p>
+      <w:r>
+        <w:t>The twenty-eight name columns of district 33-6 are now read. Jesse Thorp’s district runs from Ravenna sheet 1A on leaf 719 through Millers Creek sheet 14B on leaf 746. There is no Newman or Newnam surname. Howell, Allie — a male head near forty-seven — is not Allie Newman. Bamford, Floyd, about thirty-three, is not the 1902 Floyd Newnam groom. A Brandenburg household has a son Floyd; that is the FAN surname only. Newkirk, Robert and Newkirk, Claude are N-e-w-k-i-r-k, not Newman. Boyd and Allie are absent from Millers Creek West. [C1256] [C1267] [S953]</w:t>
+      </w:r>
+    </w:p>
+    <w:p>
+      <w:r>
+        <w:t>Leaves 747 through 753 are district 33-14 — Magisterial District 2, Millers Creek East. Seven sheets. The compiled stamped range 080A–083A matches. There is no Newman or Newnam surname. Neal heads are Neal. A child Allie in an Edwards house is about three, not Allie Newman. Boyd and Allie are absent from Millers Creek East. [C1257] [S954]</w:t>
+      </w:r>
+    </w:p>
+    <w:p>
+      <w:r>
+        <w:t>The published Estill 1930 name index still covers districts 33-1 through 33-4 only. In those four districts Newman is Fred and Herbert. There is no Newnam. Other Boyd and Allie given names sit under other surnames and fail the same-person test. [C1258] [C1262] [S955] [S959]</w:t>
+      </w:r>
+    </w:p>
+    <w:p>
+      <w:r>
+        <w:t>The National Archives M1930 pamphlet lists Estill County and Irvine on roll 15. The maps themselves are unread. Internet Archive has no free M1930, T1224, M1509 Kentucky, or *Dardanelle Post-Dispatch* 1926 item. The T1224 pamphlet still puts 1930 descriptions for Kansas and Kentucky on roll 69. Those images are unread. [C1259] [C1260] [C1268] [S956] [S957] [S963]</w:t>
+      </w:r>
+    </w:p>
+    <w:p>
+      <w:r>
+        <w:t>FamilySearch catalogs 301200, 1146342, 127913, and 127869 remain login shells. Images unread. Do not re-ask Tyler Phillips. [C1261] [S958]</w:t>
+      </w:r>
+    </w:p>
+    <w:p>
+      <w:r>
+        <w:t>Hutchins FAQ 9938 places the *Citizen* card index, 1899–1983, between rooms 228 and 229. June 1958 is still unread. Pope County’s yellnews page still dates Post-Dispatch Roll 5 from 21 June 1923 through 26 April 1928. The film is unread. Do not re-ask those phones. Certificate 17762 is unread. Do not print 1966 as fact. Antioch 242 remains catalog-proven. [C1263] [C1264] [C1265] [S960] [S961] [S962]</w:t>
+      </w:r>
+    </w:p>
+    <w:p>
+      <w:r>
+        <w:t xml:space="preserve">Both 1930 Station Camp districts and both Millers Creek districts are now visually closed. Combined visual nil: true 33-7, 33-8, 33-9, 33-5, 33-6, and 33-14. Residual unread Estill 1930 originals were 33-10 Red Lick East, 33-11 Riddell &amp; Thomas, 33-12 Forks West, and 33-13 Forks East. David G. of 1958 is still </w:t>
+      </w:r>
+      <w:r>
+        <w:rPr>
+          <w:b/>
+        </w:rPr>
+        <w:t>possible</w:t>
+      </w:r>
+      <w:r>
+        <w:t xml:space="preserve"> only against Frank. Do not print 1966 or 1976 as proven deaths. Do not print Floyd as Boyd. Do not print 1962 as McCoy’s death. Do not print the 1942 Combs charge as fact. [C1266]</w:t>
+      </w:r>
+    </w:p>
+    <w:p>
+      <w:pPr>
+        <w:pStyle w:val="Heading2"/>
+      </w:pPr>
+      <w:r>
+        <w:t>Pass 111. Red Lick East has Hendrix, not Boyd</w:t>
+      </w:r>
+    </w:p>
+    <w:p>
+      <w:r>
+        <w:t>Leaves 821 through 845 are district 33-10 — Magisterial District 4, Red Lick East. Robert E. Tye enumerated sheet 1A, stamped 117, through sheet 13A, stamped 129. Twenty-five sheets. The compiled range 117A–129A matches. Leaf 846 is blank. Leaf 847 is already 33-11, Riddell &amp; Thomas, stamped 130. [C1269] [C1273] [S966]</w:t>
+      </w:r>
+    </w:p>
+    <w:p>
+      <w:r>
+        <w:t>Twenty-five name columns were read. Boyd and Allie Newman are not there. [C1270] [S965]</w:t>
+      </w:r>
+    </w:p>
+    <w:p>
+      <w:r>
+        <w:t xml:space="preserve">One Newnam household is. On sheet 5A, dwelling 80, family 83, Station Camp Road: Newnam, Hendrix, forty-five, owns, married first at twenty-one, Kentucky; Sarah E., wife, forty-four; Hiram D., fifteen; John B., thirteen; Melvina R., eight. That is not Boyd and Allie. Hendrix is not Boyd. Sarah E. is not Allie. The children are not Arthur, Carlos, or Clarence. The same four identifiers — Sarah, John B., Melvina, and ages twenty years on — make this </w:t>
+      </w:r>
+      <w:r>
+        <w:rPr>
+          <w:b/>
+        </w:rPr>
+        <w:t>probable</w:t>
+      </w:r>
+      <w:r>
+        <w:t xml:space="preserve"> the 1950 Harding Newnam house already rejected against Boyd. [C1271] [C1275] [C1124] [S967]</w:t>
+      </w:r>
+    </w:p>
+    <w:p>
+      <w:r>
+        <w:t>Lookalikes fail on sight. Wiseman, Henry, is W-i-s-e-m-a-n. Plowman, Caleb, is P-l-o-w-m-a-n. Collins, Allie, forty-five, is a female head with Collins daughters. A Rice wife named Allie is about twenty-three. A child Boyd in an Embry house is a child. Floyd as a given name sits in other families. [C1272] [S968]</w:t>
+      </w:r>
+    </w:p>
+    <w:p>
+      <w:r>
+        <w:t xml:space="preserve">Combined visual nil now includes Red Lick East: true 33-7, 33-8, 33-9, 33-5, 33-6, 33-14, and 33-10. Residual unread Estill 1930 originals: 33-11 Riddell &amp; Thomas, 33-12 Forks West, 33-13 Forks East. David G. of 1958 is still </w:t>
+      </w:r>
+      <w:r>
+        <w:rPr>
+          <w:b/>
+        </w:rPr>
+        <w:t>possible</w:t>
+      </w:r>
+      <w:r>
+        <w:t xml:space="preserve"> only against Frank. Do not print 1966 or 1976 as proven deaths. Do not print Floyd as Boyd. Do not print 1962 as McCoy’s death. Do not print the 1942 Combs charge as fact. [C1274]</w:t>
       </w:r>
     </w:p>
     <w:p>
@@ -11215,6 +11328,159 @@
         <w:rPr>
           <w:b/>
         </w:rPr>
+        <w:t>33-6</w:t>
+      </w:r>
+      <w:r>
+        <w:t xml:space="preserve"> leaves </w:t>
+      </w:r>
+      <w:r>
+        <w:rPr>
+          <w:b/>
+        </w:rPr>
+        <w:t>719–746</w:t>
+      </w:r>
+      <w:r>
+        <w:t xml:space="preserve"> </w:t>
+      </w:r>
+      <w:r>
+        <w:rPr>
+          <w:b/>
+        </w:rPr>
+        <w:t>visually read</w:t>
+      </w:r>
+      <w:r>
+        <w:t xml:space="preserve"> — Boyd+Allie </w:t>
+      </w:r>
+      <w:r>
+        <w:rPr>
+          <w:b/>
+        </w:rPr>
+        <w:t>absent</w:t>
+      </w:r>
+      <w:r>
+        <w:t xml:space="preserve"> (</w:t>
+      </w:r>
+      <w:r>
+        <w:rPr>
+          <w:b/>
+        </w:rPr>
+        <w:t>C1256</w:t>
+      </w:r>
+      <w:r>
+        <w:t xml:space="preserve">); </w:t>
+      </w:r>
+      <w:r>
+        <w:rPr>
+          <w:b/>
+        </w:rPr>
+        <w:t>33-14</w:t>
+      </w:r>
+      <w:r>
+        <w:t xml:space="preserve"> leaves </w:t>
+      </w:r>
+      <w:r>
+        <w:rPr>
+          <w:b/>
+        </w:rPr>
+        <w:t>747–753</w:t>
+      </w:r>
+      <w:r>
+        <w:t xml:space="preserve"> </w:t>
+      </w:r>
+      <w:r>
+        <w:rPr>
+          <w:b/>
+        </w:rPr>
+        <w:t>visually read</w:t>
+      </w:r>
+      <w:r>
+        <w:t xml:space="preserve"> — Boyd+Allie </w:t>
+      </w:r>
+      <w:r>
+        <w:rPr>
+          <w:b/>
+        </w:rPr>
+        <w:t>absent</w:t>
+      </w:r>
+      <w:r>
+        <w:t xml:space="preserve"> (</w:t>
+      </w:r>
+      <w:r>
+        <w:rPr>
+          <w:b/>
+        </w:rPr>
+        <w:t>C1257</w:t>
+      </w:r>
+      <w:r>
+        <w:t xml:space="preserve">); </w:t>
+      </w:r>
+      <w:r>
+        <w:rPr>
+          <w:b/>
+        </w:rPr>
+        <w:t>33-10</w:t>
+      </w:r>
+      <w:r>
+        <w:t xml:space="preserve"> leaves </w:t>
+      </w:r>
+      <w:r>
+        <w:rPr>
+          <w:b/>
+        </w:rPr>
+        <w:t>821–845</w:t>
+      </w:r>
+      <w:r>
+        <w:t xml:space="preserve"> </w:t>
+      </w:r>
+      <w:r>
+        <w:rPr>
+          <w:b/>
+        </w:rPr>
+        <w:t>visually read</w:t>
+      </w:r>
+      <w:r>
+        <w:t xml:space="preserve"> — Boyd+Allie </w:t>
+      </w:r>
+      <w:r>
+        <w:rPr>
+          <w:b/>
+        </w:rPr>
+        <w:t>absent</w:t>
+      </w:r>
+      <w:r>
+        <w:t xml:space="preserve">; Hendrix </w:t>
+      </w:r>
+      <w:r>
+        <w:rPr>
+          <w:b/>
+        </w:rPr>
+        <w:t>45</w:t>
+      </w:r>
+      <w:r>
+        <w:t xml:space="preserve"> </w:t>
+      </w:r>
+      <w:r>
+        <w:rPr>
+          <w:b/>
+        </w:rPr>
+        <w:t>rejected</w:t>
+      </w:r>
+      <w:r>
+        <w:t xml:space="preserve"> (</w:t>
+      </w:r>
+      <w:r>
+        <w:rPr>
+          <w:b/>
+        </w:rPr>
+        <w:t>C1270 C1271</w:t>
+      </w:r>
+      <w:r>
+        <w:t xml:space="preserve">); </w:t>
+      </w:r>
+      <w:r>
+        <w:rPr>
+          <w:b/>
+        </w:rPr>
         <w:t>0650–0749 ≠ 33-8</w:t>
       </w:r>
       <w:r>
@@ -11551,6 +11817,114 @@
         <w:t>Done this increment:</w:t>
       </w:r>
       <w:r>
+        <w:t xml:space="preserve"> Estill </w:t>
+      </w:r>
+      <w:r>
+        <w:rPr>
+          <w:b/>
+        </w:rPr>
+        <w:t>1930 33-10</w:t>
+      </w:r>
+      <w:r>
+        <w:t xml:space="preserve"> Red Lick East leaves </w:t>
+      </w:r>
+      <w:r>
+        <w:rPr>
+          <w:b/>
+        </w:rPr>
+        <w:t>821–845</w:t>
+      </w:r>
+      <w:r>
+        <w:t xml:space="preserve"> isolated and visually read — Boyd+Allie </w:t>
+      </w:r>
+      <w:r>
+        <w:rPr>
+          <w:b/>
+        </w:rPr>
+        <w:t>absent</w:t>
+      </w:r>
+      <w:r>
+        <w:t xml:space="preserve">. </w:t>
+      </w:r>
+      <w:r>
+        <w:rPr>
+          <w:b/>
+        </w:rPr>
+        <w:t>Newnam, Hendrix</w:t>
+      </w:r>
+      <w:r>
+        <w:t xml:space="preserve"> </w:t>
+      </w:r>
+      <w:r>
+        <w:rPr>
+          <w:b/>
+        </w:rPr>
+        <w:t>45</w:t>
+      </w:r>
+      <w:r>
+        <w:t xml:space="preserve"> </w:t>
+      </w:r>
+      <w:r>
+        <w:rPr>
+          <w:b/>
+        </w:rPr>
+        <w:t>rejected</w:t>
+      </w:r>
+      <w:r>
+        <w:t xml:space="preserve"> vs Boyd; </w:t>
+      </w:r>
+      <w:r>
+        <w:rPr>
+          <w:b/>
+        </w:rPr>
+        <w:t>probable</w:t>
+      </w:r>
+      <w:r>
+        <w:t xml:space="preserve"> 1950 Harding. </w:t>
+      </w:r>
+      <w:r>
+        <w:rPr>
+          <w:b/>
+        </w:rPr>
+        <w:t>Done earlier:</w:t>
+      </w:r>
+      <w:r>
+        <w:t xml:space="preserve"> </w:t>
+      </w:r>
+      <w:r>
+        <w:rPr>
+          <w:b/>
+        </w:rPr>
+        <w:t>33-6</w:t>
+      </w:r>
+      <w:r>
+        <w:t xml:space="preserve"> and </w:t>
+      </w:r>
+      <w:r>
+        <w:rPr>
+          <w:b/>
+        </w:rPr>
+        <w:t>33-14</w:t>
+      </w:r>
+      <w:r>
+        <w:t xml:space="preserve"> name columns visually read — Boyd+Allie </w:t>
+      </w:r>
+      <w:r>
+        <w:rPr>
+          <w:b/>
+        </w:rPr>
+        <w:t>absent</w:t>
+      </w:r>
+      <w:r>
+        <w:t xml:space="preserve">. </w:t>
+      </w:r>
+      <w:r>
+        <w:rPr>
+          <w:b/>
+        </w:rPr>
+        <w:t>Done earlier:</w:t>
+      </w:r>
+      <w:r>
         <w:t xml:space="preserve"> true Estill </w:t>
       </w:r>
       <w:r>
@@ -11588,15 +11962,6 @@
       </w:r>
       <w:r>
         <w:t xml:space="preserve"> as 33-7 identity. </w:t>
-      </w:r>
-      <w:r>
-        <w:rPr>
-          <w:b/>
-        </w:rPr>
-        <w:t>33-6</w:t>
-      </w:r>
-      <w:r>
-        <w:t xml:space="preserve"> isolated, names unread. </w:t>
       </w:r>
       <w:r>
         <w:rPr>
@@ -11822,16 +12187,25 @@
         <w:rPr>
           <w:b/>
         </w:rPr>
-        <w:t>33-6</w:t>
-      </w:r>
-      <w:r>
-        <w:t xml:space="preserve"> name columns (leaves </w:t>
-      </w:r>
-      <w:r>
-        <w:rPr>
-          <w:b/>
-        </w:rPr>
-        <w:t>719–746</w:t>
+        <w:t>33-11</w:t>
+      </w:r>
+      <w:r>
+        <w:t xml:space="preserve"> Riddell &amp; Thomas (leaf </w:t>
+      </w:r>
+      <w:r>
+        <w:rPr>
+          <w:b/>
+        </w:rPr>
+        <w:t>847</w:t>
+      </w:r>
+      <w:r>
+        <w:t xml:space="preserve">, stamped </w:t>
+      </w:r>
+      <w:r>
+        <w:rPr>
+          <w:b/>
+        </w:rPr>
+        <w:t>130A</w:t>
       </w:r>
       <w:r>
         <w:t xml:space="preserve">) then </w:t>
@@ -11840,10 +12214,37 @@
         <w:rPr>
           <w:b/>
         </w:rPr>
+        <w:t>33-12 / 33-13</w:t>
+      </w:r>
+      <w:r>
+        <w:t xml:space="preserve"> if a later residence is hypothesized (true 33-7 / 33-5 / 33-6 / 33-8 / 33-9 / 33-14 / </w:t>
+      </w:r>
+      <w:r>
+        <w:rPr>
+          <w:b/>
+        </w:rPr>
+        <w:t>33-10</w:t>
+      </w:r>
+      <w:r>
+        <w:t xml:space="preserve"> now visually closed), </w:t>
+      </w:r>
+      <w:r>
+        <w:rPr>
+          <w:b/>
+        </w:rPr>
         <w:t>M1930 roll 15</w:t>
       </w:r>
       <w:r>
-        <w:t xml:space="preserve"> Estill county + Irvine maps + </w:t>
+        <w:t xml:space="preserve"> Estill county + Irvine </w:t>
+      </w:r>
+      <w:r>
+        <w:rPr>
+          <w:b/>
+        </w:rPr>
+        <w:t>map images</w:t>
+      </w:r>
+      <w:r>
+        <w:t xml:space="preserve"> + </w:t>
       </w:r>
       <w:r>
         <w:rPr>
@@ -11852,7 +12253,16 @@
         <w:t>T1224 roll 69</w:t>
       </w:r>
       <w:r>
-        <w:t xml:space="preserve"> descriptions (true 33-7 / 33-5 / 33-8 / 33-9 now visually closed), </w:t>
+        <w:t xml:space="preserve"> description </w:t>
+      </w:r>
+      <w:r>
+        <w:rPr>
+          <w:b/>
+        </w:rPr>
+        <w:t>images</w:t>
+      </w:r>
+      <w:r>
+        <w:t xml:space="preserve"> if a free item appears (pamphlets already seen), </w:t>
       </w:r>
       <w:r>
         <w:rPr>
@@ -25667,6 +26077,518 @@
     </w:p>
     <w:p>
       <w:r>
+        <w:t xml:space="preserve">222. Internet Archive [kentuckycensus00reel742](https://archive.org/details/kentuckycensus00reel742) leaves </w:t>
+      </w:r>
+      <w:r>
+        <w:rPr>
+          <w:b/>
+        </w:rPr>
+        <w:t>719–746</w:t>
+      </w:r>
+      <w:r>
+        <w:t xml:space="preserve">: Estill </w:t>
+      </w:r>
+      <w:r>
+        <w:rPr>
+          <w:b/>
+        </w:rPr>
+        <w:t>33-6</w:t>
+      </w:r>
+      <w:r>
+        <w:t xml:space="preserve"> Ravenna/Millers Creek West, Jesse Thorp, </w:t>
+      </w:r>
+      <w:r>
+        <w:rPr>
+          <w:b/>
+        </w:rPr>
+        <w:t>1A–14B</w:t>
+      </w:r>
+      <w:r>
+        <w:t xml:space="preserve">. Name columns </w:t>
+      </w:r>
+      <w:r>
+        <w:rPr>
+          <w:b/>
+        </w:rPr>
+        <w:t>visually read</w:t>
+      </w:r>
+      <w:r>
+        <w:t xml:space="preserve"> — Newman/Newnam </w:t>
+      </w:r>
+      <w:r>
+        <w:rPr>
+          <w:b/>
+        </w:rPr>
+        <w:t>0</w:t>
+      </w:r>
+      <w:r>
+        <w:t xml:space="preserve">. Howell Allie / Bamford Floyd / Newkirk </w:t>
+      </w:r>
+      <w:r>
+        <w:rPr>
+          <w:b/>
+        </w:rPr>
+        <w:t>rejected</w:t>
+      </w:r>
+      <w:r>
+        <w:t xml:space="preserve">. *Image seen.* </w:t>
+      </w:r>
+      <w:r>
+        <w:rPr>
+          <w:b/>
+        </w:rPr>
+        <w:t>C1256 C1267</w:t>
+      </w:r>
+      <w:r>
+        <w:t xml:space="preserve"> </w:t>
+      </w:r>
+      <w:r>
+        <w:rPr>
+          <w:b/>
+        </w:rPr>
+        <w:t>S953</w:t>
+      </w:r>
+      <w:r>
+        <w:t>.</w:t>
+      </w:r>
+    </w:p>
+    <w:p>
+      <w:r>
+        <w:t xml:space="preserve">223. Same reel leaves </w:t>
+      </w:r>
+      <w:r>
+        <w:rPr>
+          <w:b/>
+        </w:rPr>
+        <w:t>747–753</w:t>
+      </w:r>
+      <w:r>
+        <w:t xml:space="preserve">: Estill </w:t>
+      </w:r>
+      <w:r>
+        <w:rPr>
+          <w:b/>
+        </w:rPr>
+        <w:t>33-14</w:t>
+      </w:r>
+      <w:r>
+        <w:t xml:space="preserve"> Millers Creek East </w:t>
+      </w:r>
+      <w:r>
+        <w:rPr>
+          <w:b/>
+        </w:rPr>
+        <w:t>1A–4A</w:t>
+      </w:r>
+      <w:r>
+        <w:t xml:space="preserve">. Name columns </w:t>
+      </w:r>
+      <w:r>
+        <w:rPr>
+          <w:b/>
+        </w:rPr>
+        <w:t>visually read</w:t>
+      </w:r>
+      <w:r>
+        <w:t xml:space="preserve"> — Newman/Newnam </w:t>
+      </w:r>
+      <w:r>
+        <w:rPr>
+          <w:b/>
+        </w:rPr>
+        <w:t>0</w:t>
+      </w:r>
+      <w:r>
+        <w:t xml:space="preserve">. *Image seen.* </w:t>
+      </w:r>
+      <w:r>
+        <w:rPr>
+          <w:b/>
+        </w:rPr>
+        <w:t>C1257</w:t>
+      </w:r>
+      <w:r>
+        <w:t xml:space="preserve"> </w:t>
+      </w:r>
+      <w:r>
+        <w:rPr>
+          <w:b/>
+        </w:rPr>
+        <w:t>S954</w:t>
+      </w:r>
+      <w:r>
+        <w:t>.</w:t>
+      </w:r>
+    </w:p>
+    <w:p>
+      <w:r>
+        <w:t xml:space="preserve">224. NARA [M1930 pamphlet](https://www.archives.gov/files/research/microfilm/m1930.pdf) List of Maps: roll </w:t>
+      </w:r>
+      <w:r>
+        <w:rPr>
+          <w:b/>
+        </w:rPr>
+        <w:t>15</w:t>
+      </w:r>
+      <w:r>
+        <w:t xml:space="preserve"> = Kentucky; Estill + Irvine. [T1224 pamphlet](https://www.archives.gov/files/research/microfilm/t1224.pdf) roll </w:t>
+      </w:r>
+      <w:r>
+        <w:rPr>
+          <w:b/>
+        </w:rPr>
+        <w:t>69</w:t>
+      </w:r>
+      <w:r>
+        <w:t xml:space="preserve"> = KS+KY. Map/description </w:t>
+      </w:r>
+      <w:r>
+        <w:rPr>
+          <w:b/>
+        </w:rPr>
+        <w:t>images unread</w:t>
+      </w:r>
+      <w:r>
+        <w:t xml:space="preserve">. IA Solr </w:t>
+      </w:r>
+      <w:r>
+        <w:rPr>
+          <w:b/>
+        </w:rPr>
+        <w:t>0</w:t>
+      </w:r>
+      <w:r>
+        <w:t xml:space="preserve">. *Pamphlet / catalog.* </w:t>
+      </w:r>
+      <w:r>
+        <w:rPr>
+          <w:b/>
+        </w:rPr>
+        <w:t>C1259 C1260 C1268</w:t>
+      </w:r>
+      <w:r>
+        <w:t xml:space="preserve"> </w:t>
+      </w:r>
+      <w:r>
+        <w:rPr>
+          <w:b/>
+        </w:rPr>
+        <w:t>S956 S957 S963</w:t>
+      </w:r>
+      <w:r>
+        <w:t>.</w:t>
+      </w:r>
+    </w:p>
+    <w:p>
+      <w:r>
+        <w:t xml:space="preserve">225. Hutchins [FAQ 9938](https://libraryanswers.berea.edu/faq/9938): *Citizen* cards </w:t>
+      </w:r>
+      <w:r>
+        <w:rPr>
+          <w:b/>
+        </w:rPr>
+        <w:t>1899–1983</w:t>
+      </w:r>
+      <w:r>
+        <w:t xml:space="preserve"> rooms </w:t>
+      </w:r>
+      <w:r>
+        <w:rPr>
+          <w:b/>
+        </w:rPr>
+        <w:t>228–229</w:t>
+      </w:r>
+      <w:r>
+        <w:t xml:space="preserve">. ARGenWeb [Pope yellnews](https://www.argenweb.net/pope/yellnews.htm): Post-Dispatch Roll </w:t>
+      </w:r>
+      <w:r>
+        <w:rPr>
+          <w:b/>
+        </w:rPr>
+        <w:t>5</w:t>
+      </w:r>
+      <w:r>
+        <w:t xml:space="preserve"> </w:t>
+      </w:r>
+      <w:r>
+        <w:rPr>
+          <w:b/>
+        </w:rPr>
+        <w:t>21 Jun 1923–26 Apr 1928</w:t>
+      </w:r>
+      <w:r>
+        <w:t xml:space="preserve">. *Catalog.* </w:t>
+      </w:r>
+      <w:r>
+        <w:rPr>
+          <w:b/>
+        </w:rPr>
+        <w:t>C1263 C1264</w:t>
+      </w:r>
+      <w:r>
+        <w:t xml:space="preserve"> </w:t>
+      </w:r>
+      <w:r>
+        <w:rPr>
+          <w:b/>
+        </w:rPr>
+        <w:t>S960 S961</w:t>
+      </w:r>
+      <w:r>
+        <w:t>.</w:t>
+      </w:r>
+    </w:p>
+    <w:p>
+      <w:r>
+        <w:t xml:space="preserve">226. Internet Archive [kentuckycensus00reel742](https://archive.org/details/kentuckycensus00reel742) leaves </w:t>
+      </w:r>
+      <w:r>
+        <w:rPr>
+          <w:b/>
+        </w:rPr>
+        <w:t>821–845</w:t>
+      </w:r>
+      <w:r>
+        <w:t xml:space="preserve">: Estill </w:t>
+      </w:r>
+      <w:r>
+        <w:rPr>
+          <w:b/>
+        </w:rPr>
+        <w:t>33-10</w:t>
+      </w:r>
+      <w:r>
+        <w:t xml:space="preserve"> Red Lick East, Robert E. Tye, </w:t>
+      </w:r>
+      <w:r>
+        <w:rPr>
+          <w:b/>
+        </w:rPr>
+        <w:t>1A</w:t>
+      </w:r>
+      <w:r>
+        <w:t xml:space="preserve"> stamped </w:t>
+      </w:r>
+      <w:r>
+        <w:rPr>
+          <w:b/>
+        </w:rPr>
+        <w:t>117</w:t>
+      </w:r>
+      <w:r>
+        <w:t xml:space="preserve"> through </w:t>
+      </w:r>
+      <w:r>
+        <w:rPr>
+          <w:b/>
+        </w:rPr>
+        <w:t>13A</w:t>
+      </w:r>
+      <w:r>
+        <w:t xml:space="preserve"> stamped </w:t>
+      </w:r>
+      <w:r>
+        <w:rPr>
+          <w:b/>
+        </w:rPr>
+        <w:t>129</w:t>
+      </w:r>
+      <w:r>
+        <w:t xml:space="preserve">. Name columns </w:t>
+      </w:r>
+      <w:r>
+        <w:rPr>
+          <w:b/>
+        </w:rPr>
+        <w:t>visually read</w:t>
+      </w:r>
+      <w:r>
+        <w:t xml:space="preserve">. *Image seen.* </w:t>
+      </w:r>
+      <w:r>
+        <w:rPr>
+          <w:b/>
+        </w:rPr>
+        <w:t>C1269 C1270</w:t>
+      </w:r>
+      <w:r>
+        <w:t xml:space="preserve"> </w:t>
+      </w:r>
+      <w:r>
+        <w:rPr>
+          <w:b/>
+        </w:rPr>
+        <w:t>S965 S966</w:t>
+      </w:r>
+      <w:r>
+        <w:t>.</w:t>
+      </w:r>
+    </w:p>
+    <w:p>
+      <w:r>
+        <w:t xml:space="preserve">227. Same reel leaf </w:t>
+      </w:r>
+      <w:r>
+        <w:rPr>
+          <w:b/>
+        </w:rPr>
+        <w:t>829</w:t>
+      </w:r>
+      <w:r>
+        <w:t xml:space="preserve"> dw </w:t>
+      </w:r>
+      <w:r>
+        <w:rPr>
+          <w:b/>
+        </w:rPr>
+        <w:t>80</w:t>
+      </w:r>
+      <w:r>
+        <w:t xml:space="preserve"> fam </w:t>
+      </w:r>
+      <w:r>
+        <w:rPr>
+          <w:b/>
+        </w:rPr>
+        <w:t>83</w:t>
+      </w:r>
+      <w:r>
+        <w:t xml:space="preserve">: </w:t>
+      </w:r>
+      <w:r>
+        <w:rPr>
+          <w:b/>
+        </w:rPr>
+        <w:t>Newnam, Hendrix</w:t>
+      </w:r>
+      <w:r>
+        <w:t xml:space="preserve"> </w:t>
+      </w:r>
+      <w:r>
+        <w:rPr>
+          <w:b/>
+        </w:rPr>
+        <w:t>45</w:t>
+      </w:r>
+      <w:r>
+        <w:t xml:space="preserve"> + Sarah E </w:t>
+      </w:r>
+      <w:r>
+        <w:rPr>
+          <w:b/>
+        </w:rPr>
+        <w:t>44</w:t>
+      </w:r>
+      <w:r>
+        <w:t xml:space="preserve"> + Hiram D </w:t>
+      </w:r>
+      <w:r>
+        <w:rPr>
+          <w:b/>
+        </w:rPr>
+        <w:t>15</w:t>
+      </w:r>
+      <w:r>
+        <w:t xml:space="preserve"> + John B </w:t>
+      </w:r>
+      <w:r>
+        <w:rPr>
+          <w:b/>
+        </w:rPr>
+        <w:t>13</w:t>
+      </w:r>
+      <w:r>
+        <w:t xml:space="preserve"> + Melvina R </w:t>
+      </w:r>
+      <w:r>
+        <w:rPr>
+          <w:b/>
+        </w:rPr>
+        <w:t>8</w:t>
+      </w:r>
+      <w:r>
+        <w:t xml:space="preserve">. </w:t>
+      </w:r>
+      <w:r>
+        <w:rPr>
+          <w:b/>
+        </w:rPr>
+        <w:t>Rejected</w:t>
+      </w:r>
+      <w:r>
+        <w:t xml:space="preserve"> vs Boyd+Allie. </w:t>
+      </w:r>
+      <w:r>
+        <w:rPr>
+          <w:b/>
+        </w:rPr>
+        <w:t>PROBABLE</w:t>
+      </w:r>
+      <w:r>
+        <w:t xml:space="preserve"> 1950 Harding. *Image seen.* </w:t>
+      </w:r>
+      <w:r>
+        <w:rPr>
+          <w:b/>
+        </w:rPr>
+        <w:t>C1271 C1275</w:t>
+      </w:r>
+      <w:r>
+        <w:t xml:space="preserve"> </w:t>
+      </w:r>
+      <w:r>
+        <w:rPr>
+          <w:b/>
+        </w:rPr>
+        <w:t>S967</w:t>
+      </w:r>
+      <w:r>
+        <w:t>.</w:t>
+      </w:r>
+    </w:p>
+    <w:p>
+      <w:r>
+        <w:t xml:space="preserve">228. 33-10 lookalikes: Wiseman Henry; Plowman Caleb; Collins Allie 45; Rice Allie ~23; Embry son Boyd. Leaf </w:t>
+      </w:r>
+      <w:r>
+        <w:rPr>
+          <w:b/>
+        </w:rPr>
+        <w:t>847</w:t>
+      </w:r>
+      <w:r>
+        <w:t xml:space="preserve"> = </w:t>
+      </w:r>
+      <w:r>
+        <w:rPr>
+          <w:b/>
+        </w:rPr>
+        <w:t>33-11</w:t>
+      </w:r>
+      <w:r>
+        <w:t xml:space="preserve"> start. *Image seen.* </w:t>
+      </w:r>
+      <w:r>
+        <w:rPr>
+          <w:b/>
+        </w:rPr>
+        <w:t>C1272 C1273</w:t>
+      </w:r>
+      <w:r>
+        <w:t xml:space="preserve"> </w:t>
+      </w:r>
+      <w:r>
+        <w:rPr>
+          <w:b/>
+        </w:rPr>
+        <w:t>S968</w:t>
+      </w:r>
+      <w:r>
+        <w:t>.</w:t>
+      </w:r>
+    </w:p>
+    <w:p>
+      <w:r>
         <w:br w:type="page"/>
       </w:r>
     </w:p>
@@ -27266,7 +28188,7 @@
     </w:p>
     <w:p>
       <w:r>
-        <w:t>| S947 | `../sources/census/pass109-acpl742/hdr0719.jpg` | [IA ACPL 742](https://archive.org/details/kentuckycensus00reel742) | 33-6 Ravenna 1A; names unread | image seen |</w:t>
+        <w:t>| S947 | `../sources/census/pass109-acpl742/hdr0719.jpg` | [IA ACPL 742](https://archive.org/details/kentuckycensus00reel742) | 33-6 Ravenna 1A header | image seen |</w:t>
       </w:r>
     </w:p>
     <w:p>
@@ -27277,6 +28199,41 @@
     <w:p>
       <w:r>
         <w:t>| S952 | `../sources/census/pass109-extract-2026-10-31.txt` | This session | Pass 109 extract | extract |</w:t>
+      </w:r>
+    </w:p>
+    <w:p>
+      <w:r>
+        <w:t>| S953 | `../sources/census/pass110-acpl742/nm0719.jpg` | [IA ACPL 742](https://archive.org/details/kentuckycensus00reel742) | 33-6 28 name columns; Newman 0 | image seen |</w:t>
+      </w:r>
+    </w:p>
+    <w:p>
+      <w:r>
+        <w:t>| S954 | `../sources/census/pass110-acpl742/nm0747.jpg` | [IA ACPL 742](https://archive.org/details/kentuckycensus00reel742) | 33-14 7 name columns; Newman 0 | image seen |</w:t>
+      </w:r>
+    </w:p>
+    <w:p>
+      <w:r>
+        <w:t>| S956 | `../sources/catalog/nara-m1930-pamphlet-pass110.pdf` | [M1930 pamphlet](https://www.archives.gov/files/research/microfilm/m1930.pdf) | Roll 15 = KY; Estill + Irvine | pamphlet |</w:t>
+      </w:r>
+    </w:p>
+    <w:p>
+      <w:r>
+        <w:t>| S960 | `../sources/press/berea-faq-9938-pass110.html` | [FAQ 9938](https://libraryanswers.berea.edu/faq/9938) | Cards 1899–1983 rooms 228–229 | catalog |</w:t>
+      </w:r>
+    </w:p>
+    <w:p>
+      <w:r>
+        <w:t>| S965 | `../sources/census/pass111-acpl742/nm0821.jpg` | [IA ACPL 742](https://archive.org/details/kentuckycensus00reel742) | 33-10 25 name columns; Boyd+Allie absent | image seen |</w:t>
+      </w:r>
+    </w:p>
+    <w:p>
+      <w:r>
+        <w:t>| S967 | `../sources/census/pass111-acpl742/crop0829-hendrix-ages.jpg` | [IA ACPL 742](https://archive.org/details/kentuckycensus00reel742) | Hendrix 45 + Sarah E 44 rejected | image seen |</w:t>
+      </w:r>
+    </w:p>
+    <w:p>
+      <w:r>
+        <w:t>| S969 | `../sources/census/pass111-extract-2026-10-31.txt` | This session | Pass 111 extract | extract |</w:t>
       </w:r>
     </w:p>
     <w:p>

</xml_diff>

<commit_message>
Pass 112: read Estill 1930 33-11; Nennian Ray rejected
Visually closed Riddell & Thomas (leaves 847-895). Boyd and Allie
Newman are absent. Residual Estill 1930 originals are 33-12/33-13
only if a later Forks residence is hypothesized.

Co-authored-by: blakereaganlaw <blakereaganlaw@gmail.com>
</commit_message>
<xml_diff>
--- a/research/dora-ella-newnam/book/Dora-Ella-Newnam-Stone-A-Life.docx
+++ b/research/dora-ella-newnam/book/Dora-Ella-Newnam-Stone-A-Life.docx
@@ -311,6 +311,11 @@
     </w:p>
     <w:p>
       <w:r>
+        <w:t>57. [Pass 112. Riddell and Thomas is empty too](#pass-112-riddell-and-thomas-is-empty-too)</w:t>
+      </w:r>
+    </w:p>
+    <w:p>
+      <w:r>
         <w:br w:type="page"/>
       </w:r>
     </w:p>
@@ -9555,7 +9560,7 @@
     </w:p>
     <w:p>
       <w:r>
-        <w:t xml:space="preserve">Combined visual nil now includes Red Lick East: true 33-7, 33-8, 33-9, 33-5, 33-6, 33-14, and 33-10. Residual unread Estill 1930 originals: 33-11 Riddell &amp; Thomas, 33-12 Forks West, 33-13 Forks East. David G. of 1958 is still </w:t>
+        <w:t xml:space="preserve">Combined visual nil now includes Red Lick East: true 33-7, 33-8, 33-9, 33-5, 33-6, 33-14, and 33-10. Residual unread Estill 1930 originals were 33-11 Riddell &amp; Thomas, 33-12 Forks West, and 33-13 Forks East. David G. of 1958 is still </w:t>
       </w:r>
       <w:r>
         <w:rPr>
@@ -9565,6 +9570,63 @@
       </w:r>
       <w:r>
         <w:t xml:space="preserve"> only against Frank. Do not print 1966 or 1976 as proven deaths. Do not print Floyd as Boyd. Do not print 1962 as McCoy’s death. Do not print the 1942 Combs charge as fact. [C1274]</w:t>
+      </w:r>
+    </w:p>
+    <w:p>
+      <w:pPr>
+        <w:pStyle w:val="Heading2"/>
+      </w:pPr>
+      <w:r>
+        <w:t>Pass 112. Riddell and Thomas is empty too</w:t>
+      </w:r>
+    </w:p>
+    <w:p>
+      <w:r>
+        <w:t>Leaves 847 through 895 are district 33-11 — Magisterial District 5, Riddell &amp; Thomas. George McQueen enumerated sheet 1A, stamped 130, on 7 April, through sheet 25A, stamped 154, on 30 April. Forty-nine sheets. The compiled range 130A–154A matches. Leaf 896 is blank. Leaf 897 is already 33-12, Forks, stamped 155. [C1276] [C1280] [S971]</w:t>
+      </w:r>
+    </w:p>
+    <w:p>
+      <w:r>
+        <w:t>Forty-nine name columns were read. Boyd and Allie Newman are not there. There is no Newman or Newnam surname on the district. [C1277] [S970]</w:t>
+      </w:r>
+    </w:p>
+    <w:p>
+      <w:r>
+        <w:t>The closest N-lookalike is not Newman. On sheet 9A, dwelling 167, family 167: Nennian, Ray, thirty-eight, married first at twenty-three, Kentucky; Malinda, wife, thirty-eight; Imogene, Terra, Ila, Henry V., Jerald W., and Betty. A high-resolution crop reads N-e-n-n-i-a-n. That is not Boyd and Allie. Ray is not Boyd. Malinda is not Allie. Age thirty-eight is not about fifty-two. The children are not Arthur, Carlos, or Clarence. [C1278] [S972]</w:t>
+      </w:r>
+    </w:p>
+    <w:p>
+      <w:r>
+        <w:t>Lookalikes fail on sight. Floyd as a given name sits in Smithers, Edge, Floyd, Fraley, and Walton houses. A Raisin wife named Allie is Raisin. A child Boyd in a Powell house is a child. Hendrix appears as a *surname* — William H., Tom, Amelia — not Hendrix Newnam of Red Lick. Brandenburg households are that surname only. Stone, Joseph; Stone, Robert H.; and Stone, Logan are not the Arkansas Stones. [C1279]</w:t>
+      </w:r>
+    </w:p>
+    <w:p>
+      <w:r>
+        <w:t>District 33-12, Forks, starts at leaf 897. Those names were not walked. No later Forks residence is hypothesized. [C1280]</w:t>
+      </w:r>
+    </w:p>
+    <w:p>
+      <w:r>
+        <w:t>Published Lee County 1930, enumeration districts 1 through 11, already saved, was re-grepped for this couple. There is no Boyd Newman or Boyd Newnam head. Allie and Boyd given names sit under other surnames. [C1287]</w:t>
+      </w:r>
+    </w:p>
+    <w:p>
+      <w:r>
+        <w:t>Internet Archive still has no free M1930, T1224, M1509 Kentucky, or *Dardanelle Post-Dispatch* 1926 item. FamilySearch catalogs 301200, 1146342, 127913, and 127869 remain login shells. Hutchins FAQ 9938 still places the *Citizen* cards between rooms 228 and 229. Pope County’s yellnews page still dates Post-Dispatch Roll 5 from 21 June 1923 through 26 April 1928. Antioch 242 remains catalog-proven on a 515-image scan. Do not re-ask those phones. [C1282] [C1283] [C1284] [C1285] [C1286] [S974] [S975] [S976] [S977]</w:t>
+      </w:r>
+    </w:p>
+    <w:p>
+      <w:r>
+        <w:t xml:space="preserve">Combined visual nil now includes Riddell &amp; Thomas: true 33-7, 33-8, 33-9, 33-5, 33-6, 33-14, 33-10, and 33-11. Residual unread Estill 1930 originals: 33-12 Forks West and 33-13 Forks East — only if a later residence is hypothesized. David G. of 1958 is still </w:t>
+      </w:r>
+      <w:r>
+        <w:rPr>
+          <w:b/>
+        </w:rPr>
+        <w:t>possible</w:t>
+      </w:r>
+      <w:r>
+        <w:t xml:space="preserve"> only against Frank. Do not print 1966 or 1976 as proven deaths. Do not print Floyd as Boyd. Do not print Hendrix Newnam as Boyd. Do not print 1962 as McCoy’s death. Do not print the 1942 Combs charge as fact. [C1281]</w:t>
       </w:r>
     </w:p>
     <w:p>
@@ -11481,6 +11543,78 @@
         <w:rPr>
           <w:b/>
         </w:rPr>
+        <w:t>33-11</w:t>
+      </w:r>
+      <w:r>
+        <w:t xml:space="preserve"> leaves </w:t>
+      </w:r>
+      <w:r>
+        <w:rPr>
+          <w:b/>
+        </w:rPr>
+        <w:t>847–895</w:t>
+      </w:r>
+      <w:r>
+        <w:t xml:space="preserve"> </w:t>
+      </w:r>
+      <w:r>
+        <w:rPr>
+          <w:b/>
+        </w:rPr>
+        <w:t>visually read</w:t>
+      </w:r>
+      <w:r>
+        <w:t xml:space="preserve"> — Boyd+Allie </w:t>
+      </w:r>
+      <w:r>
+        <w:rPr>
+          <w:b/>
+        </w:rPr>
+        <w:t>absent</w:t>
+      </w:r>
+      <w:r>
+        <w:t xml:space="preserve">; </w:t>
+      </w:r>
+      <w:r>
+        <w:rPr>
+          <w:b/>
+        </w:rPr>
+        <w:t>Nennian, Ray</w:t>
+      </w:r>
+      <w:r>
+        <w:t xml:space="preserve"> </w:t>
+      </w:r>
+      <w:r>
+        <w:rPr>
+          <w:b/>
+        </w:rPr>
+        <w:t>38</w:t>
+      </w:r>
+      <w:r>
+        <w:t xml:space="preserve"> </w:t>
+      </w:r>
+      <w:r>
+        <w:rPr>
+          <w:b/>
+        </w:rPr>
+        <w:t>rejected</w:t>
+      </w:r>
+      <w:r>
+        <w:t xml:space="preserve"> (</w:t>
+      </w:r>
+      <w:r>
+        <w:rPr>
+          <w:b/>
+        </w:rPr>
+        <w:t>C1277 C1278</w:t>
+      </w:r>
+      <w:r>
+        <w:t xml:space="preserve">); </w:t>
+      </w:r>
+      <w:r>
+        <w:rPr>
+          <w:b/>
+        </w:rPr>
         <w:t>0650–0749 ≠ 33-8</w:t>
       </w:r>
       <w:r>
@@ -11815,6 +11949,87 @@
           <w:b/>
         </w:rPr>
         <w:t>Done this increment:</w:t>
+      </w:r>
+      <w:r>
+        <w:t xml:space="preserve"> Estill </w:t>
+      </w:r>
+      <w:r>
+        <w:rPr>
+          <w:b/>
+        </w:rPr>
+        <w:t>1930 33-11</w:t>
+      </w:r>
+      <w:r>
+        <w:t xml:space="preserve"> Riddell &amp; Thomas leaves </w:t>
+      </w:r>
+      <w:r>
+        <w:rPr>
+          <w:b/>
+        </w:rPr>
+        <w:t>847–895</w:t>
+      </w:r>
+      <w:r>
+        <w:t xml:space="preserve"> isolated and visually read — Boyd+Allie </w:t>
+      </w:r>
+      <w:r>
+        <w:rPr>
+          <w:b/>
+        </w:rPr>
+        <w:t>absent</w:t>
+      </w:r>
+      <w:r>
+        <w:t xml:space="preserve">. </w:t>
+      </w:r>
+      <w:r>
+        <w:rPr>
+          <w:b/>
+        </w:rPr>
+        <w:t>Nennian, Ray</w:t>
+      </w:r>
+      <w:r>
+        <w:t xml:space="preserve"> </w:t>
+      </w:r>
+      <w:r>
+        <w:rPr>
+          <w:b/>
+        </w:rPr>
+        <w:t>38</w:t>
+      </w:r>
+      <w:r>
+        <w:t xml:space="preserve"> </w:t>
+      </w:r>
+      <w:r>
+        <w:rPr>
+          <w:b/>
+        </w:rPr>
+        <w:t>rejected</w:t>
+      </w:r>
+      <w:r>
+        <w:t xml:space="preserve">. Lee 1930 EDs </w:t>
+      </w:r>
+      <w:r>
+        <w:rPr>
+          <w:b/>
+        </w:rPr>
+        <w:t>1–11</w:t>
+      </w:r>
+      <w:r>
+        <w:t xml:space="preserve"> re-grep </w:t>
+      </w:r>
+      <w:r>
+        <w:rPr>
+          <w:b/>
+        </w:rPr>
+        <w:t>nil</w:t>
+      </w:r>
+      <w:r>
+        <w:t xml:space="preserve"> Boyd Newman head. </w:t>
+      </w:r>
+      <w:r>
+        <w:rPr>
+          <w:b/>
+        </w:rPr>
+        <w:t>Done earlier:</w:t>
       </w:r>
       <w:r>
         <w:t xml:space="preserve"> Estill </w:t>
@@ -12181,7 +12396,16 @@
         <w:t>B089</w:t>
       </w:r>
       <w:r>
-        <w:t xml:space="preserve"> </w:t>
+        <w:t xml:space="preserve"> Estill 1930 </w:t>
+      </w:r>
+      <w:r>
+        <w:rPr>
+          <w:b/>
+        </w:rPr>
+        <w:t>33-12 / 33-13</w:t>
+      </w:r>
+      <w:r>
+        <w:t xml:space="preserve"> only if a later Forks residence is hypothesized (true 33-7 / 33-5 / 33-6 / 33-8 / 33-9 / 33-14 / 33-10 / </w:t>
       </w:r>
       <w:r>
         <w:rPr>
@@ -12190,43 +12414,7 @@
         <w:t>33-11</w:t>
       </w:r>
       <w:r>
-        <w:t xml:space="preserve"> Riddell &amp; Thomas (leaf </w:t>
-      </w:r>
-      <w:r>
-        <w:rPr>
-          <w:b/>
-        </w:rPr>
-        <w:t>847</w:t>
-      </w:r>
-      <w:r>
-        <w:t xml:space="preserve">, stamped </w:t>
-      </w:r>
-      <w:r>
-        <w:rPr>
-          <w:b/>
-        </w:rPr>
-        <w:t>130A</w:t>
-      </w:r>
-      <w:r>
-        <w:t xml:space="preserve">) then </w:t>
-      </w:r>
-      <w:r>
-        <w:rPr>
-          <w:b/>
-        </w:rPr>
-        <w:t>33-12 / 33-13</w:t>
-      </w:r>
-      <w:r>
-        <w:t xml:space="preserve"> if a later residence is hypothesized (true 33-7 / 33-5 / 33-6 / 33-8 / 33-9 / 33-14 / </w:t>
-      </w:r>
-      <w:r>
-        <w:rPr>
-          <w:b/>
-        </w:rPr>
-        <w:t>33-10</w:t>
-      </w:r>
-      <w:r>
-        <w:t xml:space="preserve"> now visually closed), </w:t>
+        <w:t xml:space="preserve"> now visually closed — do not re-fetch as unpublished), </w:t>
       </w:r>
       <w:r>
         <w:rPr>
@@ -26589,6 +26777,296 @@
     </w:p>
     <w:p>
       <w:r>
+        <w:t xml:space="preserve">229. Internet Archive [kentuckycensus00reel742](https://archive.org/details/kentuckycensus00reel742) leaves </w:t>
+      </w:r>
+      <w:r>
+        <w:rPr>
+          <w:b/>
+        </w:rPr>
+        <w:t>847–895</w:t>
+      </w:r>
+      <w:r>
+        <w:t xml:space="preserve">: Estill </w:t>
+      </w:r>
+      <w:r>
+        <w:rPr>
+          <w:b/>
+        </w:rPr>
+        <w:t>33-11</w:t>
+      </w:r>
+      <w:r>
+        <w:t xml:space="preserve"> Riddell &amp; Thomas, George McQueen, </w:t>
+      </w:r>
+      <w:r>
+        <w:rPr>
+          <w:b/>
+        </w:rPr>
+        <w:t>1A</w:t>
+      </w:r>
+      <w:r>
+        <w:t xml:space="preserve"> stamped </w:t>
+      </w:r>
+      <w:r>
+        <w:rPr>
+          <w:b/>
+        </w:rPr>
+        <w:t>130</w:t>
+      </w:r>
+      <w:r>
+        <w:t xml:space="preserve"> through </w:t>
+      </w:r>
+      <w:r>
+        <w:rPr>
+          <w:b/>
+        </w:rPr>
+        <w:t>25A</w:t>
+      </w:r>
+      <w:r>
+        <w:t xml:space="preserve"> stamped </w:t>
+      </w:r>
+      <w:r>
+        <w:rPr>
+          <w:b/>
+        </w:rPr>
+        <w:t>154</w:t>
+      </w:r>
+      <w:r>
+        <w:t xml:space="preserve">. Name columns </w:t>
+      </w:r>
+      <w:r>
+        <w:rPr>
+          <w:b/>
+        </w:rPr>
+        <w:t>visually read</w:t>
+      </w:r>
+      <w:r>
+        <w:t xml:space="preserve">. *Image seen.* </w:t>
+      </w:r>
+      <w:r>
+        <w:rPr>
+          <w:b/>
+        </w:rPr>
+        <w:t>C1276 C1277</w:t>
+      </w:r>
+      <w:r>
+        <w:t xml:space="preserve"> </w:t>
+      </w:r>
+      <w:r>
+        <w:rPr>
+          <w:b/>
+        </w:rPr>
+        <w:t>S970 S971</w:t>
+      </w:r>
+      <w:r>
+        <w:t>.</w:t>
+      </w:r>
+    </w:p>
+    <w:p>
+      <w:r>
+        <w:t xml:space="preserve">230. Same reel leaf </w:t>
+      </w:r>
+      <w:r>
+        <w:rPr>
+          <w:b/>
+        </w:rPr>
+        <w:t>863</w:t>
+      </w:r>
+      <w:r>
+        <w:t xml:space="preserve"> hh </w:t>
+      </w:r>
+      <w:r>
+        <w:rPr>
+          <w:b/>
+        </w:rPr>
+        <w:t>167</w:t>
+      </w:r>
+      <w:r>
+        <w:t xml:space="preserve">: </w:t>
+      </w:r>
+      <w:r>
+        <w:rPr>
+          <w:b/>
+        </w:rPr>
+        <w:t>Nennian, Ray</w:t>
+      </w:r>
+      <w:r>
+        <w:t xml:space="preserve"> </w:t>
+      </w:r>
+      <w:r>
+        <w:rPr>
+          <w:b/>
+        </w:rPr>
+        <w:t>38</w:t>
+      </w:r>
+      <w:r>
+        <w:t xml:space="preserve"> + Malinda </w:t>
+      </w:r>
+      <w:r>
+        <w:rPr>
+          <w:b/>
+        </w:rPr>
+        <w:t>38</w:t>
+      </w:r>
+      <w:r>
+        <w:t xml:space="preserve"> + six children. </w:t>
+      </w:r>
+      <w:r>
+        <w:rPr>
+          <w:b/>
+        </w:rPr>
+        <w:t>Rejected</w:t>
+      </w:r>
+      <w:r>
+        <w:t xml:space="preserve"> vs Boyd+Allie. *Image seen.* </w:t>
+      </w:r>
+      <w:r>
+        <w:rPr>
+          <w:b/>
+        </w:rPr>
+        <w:t>C1278</w:t>
+      </w:r>
+      <w:r>
+        <w:t xml:space="preserve"> </w:t>
+      </w:r>
+      <w:r>
+        <w:rPr>
+          <w:b/>
+        </w:rPr>
+        <w:t>S972</w:t>
+      </w:r>
+      <w:r>
+        <w:t>.</w:t>
+      </w:r>
+    </w:p>
+    <w:p>
+      <w:r>
+        <w:t xml:space="preserve">231. 33-11 lookalikes: Floyd given-names; Raisin Allie; Powell son Boyd; Hendrix surname; Brandenburg FAN; Stone Joseph/Robert H/Logan. Leaf </w:t>
+      </w:r>
+      <w:r>
+        <w:rPr>
+          <w:b/>
+        </w:rPr>
+        <w:t>897</w:t>
+      </w:r>
+      <w:r>
+        <w:t xml:space="preserve"> = </w:t>
+      </w:r>
+      <w:r>
+        <w:rPr>
+          <w:b/>
+        </w:rPr>
+        <w:t>33-12</w:t>
+      </w:r>
+      <w:r>
+        <w:t xml:space="preserve"> Forks start — names not walked. *Image seen.* </w:t>
+      </w:r>
+      <w:r>
+        <w:rPr>
+          <w:b/>
+        </w:rPr>
+        <w:t>C1279 C1280</w:t>
+      </w:r>
+      <w:r>
+        <w:t xml:space="preserve"> </w:t>
+      </w:r>
+      <w:r>
+        <w:rPr>
+          <w:b/>
+        </w:rPr>
+        <w:t>S970 S971</w:t>
+      </w:r>
+      <w:r>
+        <w:t>.</w:t>
+      </w:r>
+    </w:p>
+    <w:p>
+      <w:r>
+        <w:t xml:space="preserve">232. USGenNet [Lee 1930](https://usgennet.org/usa/ky/county/lee/census/1930/) EDs </w:t>
+      </w:r>
+      <w:r>
+        <w:rPr>
+          <w:b/>
+        </w:rPr>
+        <w:t>1–11</w:t>
+      </w:r>
+      <w:r>
+        <w:t xml:space="preserve"> re-grep: </w:t>
+      </w:r>
+      <w:r>
+        <w:rPr>
+          <w:b/>
+        </w:rPr>
+        <w:t>no</w:t>
+      </w:r>
+      <w:r>
+        <w:t xml:space="preserve"> Boyd Newman/Newnam head. IA Solr M1930/T1224/M1509/Post-Dispatch </w:t>
+      </w:r>
+      <w:r>
+        <w:rPr>
+          <w:b/>
+        </w:rPr>
+        <w:t>0</w:t>
+      </w:r>
+      <w:r>
+        <w:t xml:space="preserve">. FAQ [9938](https://libraryanswers.berea.edu/faq/9938) rooms </w:t>
+      </w:r>
+      <w:r>
+        <w:rPr>
+          <w:b/>
+        </w:rPr>
+        <w:t>228–229</w:t>
+      </w:r>
+      <w:r>
+        <w:t xml:space="preserve">. [Pope yellnews](https://www.argenweb.net/pope/yellnews.htm) Roll </w:t>
+      </w:r>
+      <w:r>
+        <w:rPr>
+          <w:b/>
+        </w:rPr>
+        <w:t>5</w:t>
+      </w:r>
+      <w:r>
+        <w:t xml:space="preserve">. IA </w:t>
+      </w:r>
+      <w:r>
+        <w:rPr>
+          <w:b/>
+        </w:rPr>
+        <w:t>602</w:t>
+      </w:r>
+      <w:r>
+        <w:t xml:space="preserve"> still </w:t>
+      </w:r>
+      <w:r>
+        <w:rPr>
+          <w:b/>
+        </w:rPr>
+        <w:t>515</w:t>
+      </w:r>
+      <w:r>
+        <w:t xml:space="preserve">. *Compiled-index / catalog.* </w:t>
+      </w:r>
+      <w:r>
+        <w:rPr>
+          <w:b/>
+        </w:rPr>
+        <w:t>C1282–C1287</w:t>
+      </w:r>
+      <w:r>
+        <w:t xml:space="preserve"> </w:t>
+      </w:r>
+      <w:r>
+        <w:rPr>
+          <w:b/>
+        </w:rPr>
+        <w:t>S405 S974–S977</w:t>
+      </w:r>
+      <w:r>
+        <w:t>.</w:t>
+      </w:r>
+    </w:p>
+    <w:p>
+      <w:r>
         <w:br w:type="page"/>
       </w:r>
     </w:p>
@@ -28234,6 +28712,41 @@
     <w:p>
       <w:r>
         <w:t>| S969 | `../sources/census/pass111-extract-2026-10-31.txt` | This session | Pass 111 extract | extract |</w:t>
+      </w:r>
+    </w:p>
+    <w:p>
+      <w:r>
+        <w:t>| S970 | `../sources/census/pass112-acpl742/nm0847.jpg` | [IA ACPL 742](https://archive.org/details/kentuckycensus00reel742) | 33-11 49 name columns; Boyd+Allie absent | image seen |</w:t>
+      </w:r>
+    </w:p>
+    <w:p>
+      <w:r>
+        <w:t>| S971 | `../sources/census/pass112-acpl742/hdr0847.jpg` | [IA ACPL 742](https://archive.org/details/kentuckycensus00reel742) | 33-11 1A stamped 130; 33-12 start | image seen |</w:t>
+      </w:r>
+    </w:p>
+    <w:p>
+      <w:r>
+        <w:t>| S972 | `../sources/census/pass112-acpl742/crop0863-nennian-ray.jpg` | [IA ACPL 742](https://archive.org/details/kentuckycensus00reel742) | Nennian Ray 38 + Malinda rejected | image seen |</w:t>
+      </w:r>
+    </w:p>
+    <w:p>
+      <w:r>
+        <w:t>| S973 | `../sources/census/pass112-extract-2026-10-31.txt` | This session | Pass 112 extract | extract |</w:t>
+      </w:r>
+    </w:p>
+    <w:p>
+      <w:r>
+        <w:t>| S975 | `../sources/catalog/hutchins-faq-9938-pass112.html` | [FAQ 9938](https://libraryanswers.berea.edu/faq/9938) | Cards 1899–1983 rooms 228–229 | catalog |</w:t>
+      </w:r>
+    </w:p>
+    <w:p>
+      <w:r>
+        <w:t>| S976 | `../sources/catalog/argenweb-pope-yellnews-pass112.html` | [Pope yellnews](https://www.argenweb.net/pope/yellnews.htm) | Roll 5 21 Jun 1923–26 Apr 1928 | catalog |</w:t>
+      </w:r>
+    </w:p>
+    <w:p>
+      <w:r>
+        <w:t>| S977 | `../sources/catalog/ia-meta-602-pass112.json` | [IA 602](https://archive.org/details/14thcensusofpopu602unit) | imagecount still 515 | catalog |</w:t>
       </w:r>
     </w:p>
     <w:p>

</xml_diff>

<commit_message>
Pass 80: E-152 Lula/Robert windows and leftover-odd Johns closed.
Nil Evans Lula ~14 and Robert ~11 Owsley; 1684 Carter SIL, 2023 Robert E 53 Owsley, and 1509 John W 28 Lee x Dora DISPROVED. John given-name window through Joseph 1515 image-closed for the 1910 Buffalo couple. B063 remains open.

Co-authored-by: CatCorner22 <CatCorner22@users.noreply.github.com>
</commit_message>
<xml_diff>
--- a/research/dora-ella-newnam/book/Dora-Ella-Newnam-Stone-A-Life.docx
+++ b/research/dora-ella-newnam/book/Dora-Ella-Newnam-Stone-A-Life.docx
@@ -948,7 +948,7 @@
         <w:t>Molly</w:t>
       </w:r>
       <w:r>
-        <w:t xml:space="preserve">, eighteen. The Soundex clerk misread Edmonds as Evans. He is not the 1910 Buffalo couple. Another card writes Owsley for a John of fifty-nine with Alice, but cites volume 93, district 300, which is not an Owsley district (those are 88–94). The densified Susan given-name slot has no Evans, Susan of about thirty-nine in Owsley: the only Susans are Eubanks eighty-three in Pulaski, Eubank seventy-seven in Owen, and Effinger eighty-one in Fulton, and Evans Susie of Louisville and Lexington is another woman. Owsley death extracts for 1911–1920 have no matching John Evans decedent; a 1914 drowning indexed in a web search as Evans is John Neeley. Josephine Newnam’s about-1902 Gilbert license remains unseen in further neighbouring-county substitutes (Harlan 1900–02, Leslie 1900–01 and 1903–04, Knott Book 2A 1902–03, Madison compiled, Magoffin N, Powell volunteer notes); Rockcastle’s compiled G and N files end in 1900. Breathitt marriages are still unopened. The 1910 dwelling 31 house is </w:t>
+        <w:t xml:space="preserve">, eighteen. The Soundex clerk misread Edmonds as Evans. He is not the 1910 Buffalo couple. Another card writes Owsley for a John of fifty-nine with Alice, but cites volume 93, district 300, which is not an Owsley district (those are 88–94). The densified Susan given-name slot has no Evans, Susan of about thirty-nine in Owsley: the only Susans are Eubanks eighty-three in Pulaski, Eubank seventy-seven in Owen, and Effinger eighty-one in Fulton, and Evans Susie of Louisville and Lexington is another woman. Owsley death extracts for 1911–1920 have no matching John Evans decedent; a 1914 drowning indexed in a web search as Evans is John Neeley. Josephine Newnam’s about-1902 Gilbert license remains unseen in further neighbouring-county substitutes (Harlan 1900–02, Leslie 1900–01 and 1903–04, Knott Book 2A 1902–03, Madison compiled, Magoffin N, Powell volunteer notes); Rockcastle’s compiled G and N files end in 1900. Breathitt marriages are still unopened. Kentucky’s E-152 Lula given-name window — Lola through Luther — has no Evans, Lula of about fourteen in Owsley. A fourteen-year-old Lula in Carter is sister-in-law of George Parsons, not John’s daughter. The Robert window through Robey has no Evans, Robert of about eleven in Owsley as a head or as an A-2; Robert E., fifty-three, of Owsley district 89 with Margie is a different house and is not merged. Leftover odd John leaves through the Joseph divider have no Evans, John of about fifty-five with Susan in district 92; combined with the leftover evens, that given-name window is now image-closed for that identity. A Lee County John H. Evans, forty-six, of Beattyville, with Julia and daughters Katherine, fourteen, and Elizabeth, eleven, is another family. A Lee County John W. Evans, twenty-eight, with wife Dora, twenty-four, and daughter Anna is not this woman. The 1910 dwelling 31 house is </w:t>
       </w:r>
       <w:r>
         <w:rPr>
@@ -1362,7 +1362,7 @@
         <w:t>Dara</w:t>
       </w:r>
       <w:r>
-        <w:t>, forty — the enumerator wrote an open a, not o — is another person. Kentucky’s 1920 Soundex has no Manerva or Minerva Newman card, and the Walter given-name window has no Owsley or Lee Walter with Manerva. Kentucky’s 1920 death index has no Manerva Newnam row on 28 August; the Owsley table that day is an infant Bates. Mary Ann Smallwood, born April 1842, came from the Owsley Smallwoods. The 11 July 1918 cemetery date is still unmatched in Kentucky’s civil index. [C669] [C672] [C693] [C694] [C690] [C691] [C709] [C711] [C712] [C713] [C717] [C729] [C730] [C739] [C740] [C741] [C742] [C743] [C744] [C745] [C746] [C747] [C748] [C752] [C753] [C754] [C756] [C759] [C763] [C765] [C768] [C775] [C776] [C777] [C779] [C780] [C782] [C783] [C784] [C789] [C790] [C791] [C792] [C793] [C794] [C795] [C796] [C797] [C801] [C802] [C803] [C804] [C808] [C809] [C810] [C811] [C812] [C813] [C814] [C818] [C819] [C820] [C821] [C822] [C823] [C824] [C825] [C826] [C827] [C828]</w:t>
+        <w:t>, forty — the enumerator wrote an open a, not o — is another person. Kentucky’s 1920 Soundex has no Manerva or Minerva Newman card, and the Walter given-name window has no Owsley or Lee Walter with Manerva. Kentucky’s 1920 death index has no Manerva Newnam row on 28 August; the Owsley table that day is an infant Bates. Mary Ann Smallwood, born April 1842, came from the Owsley Smallwoods. The 11 July 1918 cemetery date is still unmatched in Kentucky’s civil index. [C669] [C672] [C693] [C694] [C690] [C691] [C709] [C711] [C712] [C713] [C717] [C729] [C730] [C739] [C740] [C741] [C742] [C743] [C744] [C745] [C746] [C747] [C748] [C752] [C753] [C754] [C756] [C759] [C763] [C765] [C768] [C775] [C776] [C777] [C779] [C780] [C782] [C783] [C784] [C789] [C790] [C791] [C792] [C793] [C794] [C795] [C796] [C797] [C801] [C802] [C803] [C804] [C808] [C809] [C810] [C811] [C812] [C813] [C814] [C818] [C819] [C820] [C821] [C822] [C823] [C824] [C825] [C826] [C827] [C828] [C832] [C833] [C847] [C848] [C849] [C851] [C857] [C859] [C860] [C861] [C863]</w:t>
       </w:r>
     </w:p>
     <w:p>

</xml_diff>

<commit_message>
Pass 113–114: isolate 1860 Owsley p.353 widow Rhoda; prove 1928 Frank is Benjamin F.
Read the 1860 original on IA reel 391 (stamped 353, Proctor, 14 Jul 1860): Rhoda Newman 37 widow with B.F. 7. Isolated the 1870 Decatur 24 original and the 1900 Proctor Benj. F. transcript. Same-person chain now proven; parents remain probable. Did not walk Estill 1930 33-12/33-13. B071 open→partial. Next: B058.

Co-authored-by: blakereaganlaw <blakereaganlaw@gmail.com>
</commit_message>
<xml_diff>
--- a/research/dora-ella-newnam/book/Dora-Ella-Newnam-Stone-A-Life.docx
+++ b/research/dora-ella-newnam/book/Dora-Ella-Newnam-Stone-A-Life.docx
@@ -316,6 +316,16 @@
     </w:p>
     <w:p>
       <w:r>
+        <w:t>58. [Pass 113. 1850 Owsley is not William and Rhoda](#pass-113-1850-owsley-is-not-william-and-rhoda)</w:t>
+      </w:r>
+    </w:p>
+    <w:p>
+      <w:r>
+        <w:t>59. [Pass 114. Rhoda is already a widow on page 353](#pass-114-rhoda-is-already-a-widow-on-page-353)</w:t>
+      </w:r>
+    </w:p>
+    <w:p>
+      <w:r>
         <w:br w:type="page"/>
       </w:r>
     </w:p>
@@ -9630,6 +9640,276 @@
       </w:r>
     </w:p>
     <w:p>
+      <w:pPr>
+        <w:pStyle w:val="Heading2"/>
+      </w:pPr>
+      <w:r>
+        <w:t>Pass 113. 1850 Owsley is not William and Rhoda</w:t>
+      </w:r>
+    </w:p>
+    <w:p>
+      <w:r>
+        <w:t>The 1928 death extract already named Frank Newnam of St. Helens as the son of William Newnam and Rhoda Tincher. That man is not Everett’s brother, the contractor of Berea. The question this pass asked is who William and Rhoda were, and whether the 1928 Frank can be tied to a living household. [C353] [C354]</w:t>
+      </w:r>
+    </w:p>
+    <w:p>
+      <w:r>
+        <w:t>Internet Archive reel `populationschedu0216unix` is the 1850 Owsley County schedule. Stamped pages 298B through 300B were isolated and read. Page 299A has Gabbard, Phillips, Baker, Afford, Cole, and Moore. There is no Newman. [C1288] [S980]</w:t>
+      </w:r>
+    </w:p>
+    <w:p>
+      <w:r>
+        <w:t xml:space="preserve">Page 299B is the page WikiTree cited. Household 312 is Rebecca Tincher, fifty-one, with sons Eli, thirty, William, twenty-one, Elias, seventeen, Hosea, sixteen, Henry, thirteen, and Price, seven. That is Rhoda’s natal FAN, not her marriage. Line 22 is </w:t>
+      </w:r>
+      <w:r>
+        <w:rPr>
+          <w:b/>
+        </w:rPr>
+        <w:t>William Tincher, twenty-one</w:t>
+      </w:r>
+      <w:r>
+        <w:t>. It is not Francis Newman. Household 313 is Harrison Newman, thirty-three, farmer, with Susan, twenty-one, William, ten, Elias, eight, Henry, six, and Solomon, three. Household 314 is John Newman, twenty-three, with Susan, twenty-three, Daniel, three, and Mary, one. [C1289] [C1293] [S978]</w:t>
+      </w:r>
+    </w:p>
+    <w:p>
+      <w:r>
+        <w:t>Page 300A has John Newman, sixty, born Delaware, with Lear, fifty-three, Kentucky, and an adult daughter. There is no William about twenty-six with a wife Rhoda and a son Francis about five. Adjacent sheets 298B and 300B are also empty of Newman. The USGenWeb surname index agrees: Newman only on 299B–300A. [C1290] [C1291] [C1292] [S979] [S995]</w:t>
+      </w:r>
+    </w:p>
+    <w:p>
+      <w:r>
+        <w:t>The 1870 Travellers Rest original, already saved as S231, was re-seen. Dwelling 128, family 125: Newman, Rhoda, forty-five, keeping house; Elihu, twenty; Benjamin F., seventeen; Rebecca J., fifteen. Elias is on the same page at dwelling 131. The Kendrick transcript adds Decatur, twenty-four, on the next page — original not isolated this pass. [C1294] [C1295] [S981] [S982]</w:t>
+      </w:r>
+    </w:p>
+    <w:p>
+      <w:r>
+        <w:t>Lee Marriage Book 2, 15 September 1881, at William Steel’s: Benjamin F. Newnam, twenty-six, miner, born Owsley, first marriage, mother born Estill, married Mary Steel, twenty-five. Witnesses William H. Cole and Jeremiah Maloney. The year before, Elihu Newnam and Frank Newnam witnessed Abner Gum’s wedding. [C1296] [C1297] [S983]</w:t>
+      </w:r>
+    </w:p>
+    <w:p>
+      <w:r>
+        <w:t>The 1920 St. Helens transcript already on disk has B.F. Newnam, sixty-six, and Mary J., sixty-four, household 37-37. Kendrick annotates Benjamin F. The 1944 Lee death extract names Mary Jane Newnam, eighty-nine, born 1855 Beattyville, died 7 February 1944, buried Newnam at St. Helens, spouse Frank Newnam, father William Steele, mother Patsey Jameson. Her will of 18 November 1943, proved 14 February 1944, Will Book 1 page 472, leaves the residue to her brother Sam P. Steele — not Samuel P. Newnam. [C1298] [C1300] [C1301] [S994] [S984] [S985]</w:t>
+      </w:r>
+    </w:p>
+    <w:p>
+      <w:r>
+        <w:t>Mary F. Tincher died 22 July 1932 at Pebworth. The extract names father John Newnam and mother Elizabeth Goe. That is not a daughter of William and Rhoda. The Lee wills landing still has no Samuel P. Newnam. [C1302] [S986] [S987] [S991]</w:t>
+      </w:r>
+    </w:p>
+    <w:p>
+      <w:r>
+        <w:t>WikiTree Newnam-172 is an authored lead: Francis Decatur, son of William and Rhoda, sibling Benjamin Franklin, 1860 page 353, Company C 14th Kentucky Cavalry. The 1850 citation fails. The 1860 page was catalog-only this pass — Internet Archive reel `populationschedu391unit` is Owen and Owsley, 432 images, page 353 unread. [C1303] [C1304] [S988] [S989]</w:t>
+      </w:r>
+    </w:p>
+    <w:p>
+      <w:r>
+        <w:t xml:space="preserve">Same-person, Hard Rule 3: 1870 Benjamin F., seventeen, in Rhoda’s house; 1881 Benjamin F. times Mary Steel; 1920 B.F., sixty-six, at St. Helens; 1928 Frank of St. Helens, born 4 October 1853, parents William and Rhoda Tincher; 1944 widow Mary Jane naming spouse Frank and father William Steele. That is one man, </w:t>
+      </w:r>
+      <w:r>
+        <w:rPr>
+          <w:b/>
+        </w:rPr>
+        <w:t>proven</w:t>
+      </w:r>
+      <w:r>
+        <w:t xml:space="preserve">. The parents William and Rhoda are </w:t>
+      </w:r>
+      <w:r>
+        <w:rPr>
+          <w:b/>
+        </w:rPr>
+        <w:t>probable</w:t>
+      </w:r>
+      <w:r>
+        <w:t>. He is not Luther’s William. He is not the Berea contractor. He is not Mary F. Tincher of 1932. [C1316] [C1299]</w:t>
+      </w:r>
+    </w:p>
+    <w:p>
+      <w:r>
+        <w:t xml:space="preserve">The other open items did not move. No newly digitized August 1926 *Post-Dispatch* page. No free June 1958 *Citizen* clip. FamilySearch catalog 1146342 returned HTTP 403. Genealogy Trails Lee published WWI tables are live and name only Luther Brandenburg and Luther Underwood. Certificate 17762 is unread. Do not print 1966. No new deceased McCoy or Rissie row. Do not print 1962. Grant, twenty-one, is still not merged with David F. David G. of 1984 is still </w:t>
+      </w:r>
+      <w:r>
+        <w:rPr>
+          <w:b/>
+        </w:rPr>
+        <w:t>possible</w:t>
+      </w:r>
+      <w:r>
+        <w:t xml:space="preserve"> as a junior only. Living 1950-line descendants are withheld. Antioch 242 remains catalog-proven on a 515-image scan. Districts 33-12 and 33-13 were not walked. [C1305–C1315]</w:t>
+      </w:r>
+    </w:p>
+    <w:p>
+      <w:pPr>
+        <w:pStyle w:val="Heading2"/>
+      </w:pPr>
+      <w:r>
+        <w:t>Pass 114. Rhoda is already a widow on page 353</w:t>
+      </w:r>
+    </w:p>
+    <w:p>
+      <w:r>
+        <w:t>Reel 391 is now read, not only catalogued. The title cards are Microcopy 653, Roll 391, Owen and Owsley Counties. Owsley begins at leaf n0299: handwritten page 1, stamped 297, 8 June 1860, J.E. Gibson. [C1317] [S996]</w:t>
+      </w:r>
+    </w:p>
+    <w:p>
+      <w:r>
+        <w:t xml:space="preserve">Leaf n0352 is Booneville, handwritten page 54, 9 July 1860. Household 364 is H.H. Newman, forty-four, farmer, real $200, personal $100; Susan, thirty-six; William, twenty, farmer; Elias, eighteen, farmer; H.H., fifteen; Belinda, twelve; John, ten; Marshall V., eight; Mary J., six; Joseph, four; Ibe, four months. Morris Newman, thirty-two, is next door. This is </w:t>
+      </w:r>
+      <w:r>
+        <w:rPr>
+          <w:b/>
+        </w:rPr>
+        <w:t>probable</w:t>
+      </w:r>
+      <w:r>
+        <w:t xml:space="preserve"> the 1850 Harrison house and the 1870 Harrison house. Elias, eighteen, is </w:t>
+      </w:r>
+      <w:r>
+        <w:rPr>
+          <w:b/>
+        </w:rPr>
+        <w:t>probable</w:t>
+      </w:r>
+      <w:r>
+        <w:t xml:space="preserve"> Dora’s father. Susan was too young in 1850 to be the mother of William, ten, and Elias, eight — this book does not overclaim that maternity. H.H.’s son William, twenty, is not the husband of Rhoda. That man is already dead. [C1318] [S997] [S1002]</w:t>
+      </w:r>
+    </w:p>
+    <w:p>
+      <w:r>
+        <w:t xml:space="preserve">Leaf n0355 is handwritten page 57, </w:t>
+      </w:r>
+      <w:r>
+        <w:rPr>
+          <w:b/>
+        </w:rPr>
+        <w:t>stamped 353</w:t>
+      </w:r>
+      <w:r>
+        <w:t>, 14 July 1860, post office Proctor. WikiTree’s “1860 p.353” is this leaf. [C1319] [S998]</w:t>
+      </w:r>
+    </w:p>
+    <w:p>
+      <w:r>
+        <w:t xml:space="preserve">Household 386 is Elihu Tincher, forty, with Delina, twenty-five, Isa C., sixteen, Margaret, four, Vice Estes, twenty-nine, and </w:t>
+      </w:r>
+      <w:r>
+        <w:rPr>
+          <w:b/>
+        </w:rPr>
+        <w:t>Wm Newman, nineteen</w:t>
+      </w:r>
+      <w:r>
+        <w:t>, farmer. Household 387 is Hosea Tincher, twenty-three, with Elizabeth, thirty, Rhoda, three, and Elias, one. Those are natal FAN of the widow next door. William, nineteen, in Elihu’s house is not the dead husband and is not H.H.’s William, twenty. [C1326] [S1001]</w:t>
+      </w:r>
+    </w:p>
+    <w:p>
+      <w:r>
+        <w:t xml:space="preserve">Household 389 is the one that matters. </w:t>
+      </w:r>
+      <w:r>
+        <w:rPr>
+          <w:b/>
+        </w:rPr>
+        <w:t>Newman, Rhoda, thirty-seven, female, widow, farmer</w:t>
+      </w:r>
+      <w:r>
+        <w:t xml:space="preserve">, real $50, personal $100; Decatur, fourteen; Leaner, twelve, female; Elihu, eight; </w:t>
+      </w:r>
+      <w:r>
+        <w:rPr>
+          <w:b/>
+        </w:rPr>
+        <w:t>B.F., seven</w:t>
+      </w:r>
+      <w:r>
+        <w:t xml:space="preserve">; Rebecca J., five. William, husband of Rhoda, is not on the page. She is already a widow on 14 July 1860. His death before that date is </w:t>
+      </w:r>
+      <w:r>
+        <w:rPr>
+          <w:b/>
+        </w:rPr>
+        <w:t>probable</w:t>
+      </w:r>
+      <w:r>
+        <w:t xml:space="preserve">. The authored “after 10 June 1855, Schollsville, Clark” stays authored. B.F., seven, matches 4 October 1853 on the 1928 certificate and seventeen in June 1870. Authored Emily Leannah as Leaner, twelve, is </w:t>
+      </w:r>
+      <w:r>
+        <w:rPr>
+          <w:b/>
+        </w:rPr>
+        <w:t>speculative</w:t>
+      </w:r>
+      <w:r>
+        <w:t>. [C1320] [C1321] [C1327] [S999]</w:t>
+      </w:r>
+    </w:p>
+    <w:p>
+      <w:r>
+        <w:t xml:space="preserve">The 1870 original of Decatur’s own house is now isolated. Travellers Rest page 20, Internet Archive leaf n0090: dwelling 136, family 133, Newman, Decatur, twenty-four, farmer, Kentucky; Sarah A., twenty-six; William, five; Deane A., three, female; Sarah A., nine months. Harrison, fifty-three, and Susan, forty-seven, sit on the same leaf. That supersedes the pass-113 “original unread.” Decatur, fourteen, in 1860 is </w:t>
+      </w:r>
+      <w:r>
+        <w:rPr>
+          <w:b/>
+        </w:rPr>
+        <w:t>probable</w:t>
+      </w:r>
+      <w:r>
+        <w:t xml:space="preserve"> Decatur, twenty-four, in 1870. [C1322] [C1323] [S1000] [S1003]</w:t>
+      </w:r>
+    </w:p>
+    <w:p>
+      <w:r>
+        <w:t>The 1900 hole closes on a compiled page, not an original. Lee Proctor household 213: Benj. F. Newnam, head, October 1853, forty-six, married eighteen years, Kentucky; Mary J., wife, July 1855, forty-four, one child living of one; Asburt, son, August 1882, seventeen. That is the 1881 license and the 1928 birth date. St. Helens 1900 compiled has no B.F. or Frank Newnam head — only Frank Beatty. [C1324] [S1004]</w:t>
+      </w:r>
+    </w:p>
+    <w:p>
+      <w:r>
+        <w:t>Proctor 1910 is published and empty of this couple. Elisa, sixty-seven, is there with Mary Smallwood. Kate Sternberg, widow, is there with Luther, nineteen, and Fred, fifteen. Sarah, sixty-four, widow, is there. There is no Benj. F. or Frank Newnam head. St. Helens 1910, districts 94 and 95, have no published pages. [C1325] [S1005]</w:t>
+      </w:r>
+    </w:p>
+    <w:p>
+      <w:r>
+        <w:t xml:space="preserve">Same-person, densified: 1860 B.F., seven, in the widow Rhoda’s Proctor house; 1870 Benjamin F., seventeen; 1881 Benjamin F. times Mary Steel; 1900 Benj. F., October 1853, Proctor; 1920 B.F., sixty-six, St. Helens; 1928 Frank of St. Helens; 1944 widow Mary Jane. </w:t>
+      </w:r>
+      <w:r>
+        <w:rPr>
+          <w:b/>
+        </w:rPr>
+        <w:t>One man, proven.</w:t>
+      </w:r>
+      <w:r>
+        <w:t xml:space="preserve"> Parents William and Rhoda remain </w:t>
+      </w:r>
+      <w:r>
+        <w:rPr>
+          <w:b/>
+        </w:rPr>
+        <w:t>probable</w:t>
+      </w:r>
+      <w:r>
+        <w:t xml:space="preserve"> — the 1928 certificate plus the 1860 and 1870 widow heading the same children. William himself is on neither schedule. The 1850 couple is still unread. [C1337]</w:t>
+      </w:r>
+    </w:p>
+    <w:p>
+      <w:r>
+        <w:t>Three living Williams on the 1860 film stay separate from the dead husband: H.H.’s son William, twenty, on Booneville page 54; Wm Newman, nineteen, in Elihu Tincher’s house on page 57; and the man who is already gone. None of them is Luther’s William times Katherine. [C1318] [C1326]</w:t>
+      </w:r>
+    </w:p>
+    <w:p>
+      <w:r>
+        <w:t xml:space="preserve">The film-and-paywall items did not move. No newly digitized August 1926 *Post-Dispatch* page. No free June 1958 *Citizen* clip. No new M1509 card. No new Woodford burial. No new deceased McCoy or Rissie row. Grant, twenty-one, is still not merged with David F. David G. of 1984 is still </w:t>
+      </w:r>
+      <w:r>
+        <w:rPr>
+          <w:b/>
+        </w:rPr>
+        <w:t>possible</w:t>
+      </w:r>
+      <w:r>
+        <w:t xml:space="preserve"> as a junior only. Antioch 242 remains catalog-proven. FamilySearch tax books 156057 and 97277 are unread. Do not re-ask Tyler Phillips, Pope 479-968-4368, or Hutchins 859-985-3364. Districts 33-12 and 33-13 were not walked. [C1328–C1336]</w:t>
+      </w:r>
+    </w:p>
+    <w:p>
       <w:r>
         <w:t xml:space="preserve">In Madison County in 1950 a </w:t>
       </w:r>
@@ -9746,7 +10026,25 @@
     </w:p>
     <w:p>
       <w:r>
-        <w:t xml:space="preserve">A Frank Newnam died 16 March 1928 at St. Helens, born 4 October 1853, parents William Newnam and Rhoda Tincher. He is </w:t>
+        <w:t xml:space="preserve">A Frank Newnam died 16 March 1928 at St. Helens, born 4 October 1853, parents William Newnam and Rhoda Tincher. He </w:t>
+      </w:r>
+      <w:r>
+        <w:rPr>
+          <w:b/>
+        </w:rPr>
+        <w:t>is</w:t>
+      </w:r>
+      <w:r>
+        <w:t xml:space="preserve"> Benjamin F. of the 1860 widow’s house, the 1870 Travellers Rest house, the 1881 Steel license, the 1900 Proctor house, and the 1920 St. Helens house — </w:t>
+      </w:r>
+      <w:r>
+        <w:rPr>
+          <w:b/>
+        </w:rPr>
+        <w:t>proven</w:t>
+      </w:r>
+      <w:r>
+        <w:t xml:space="preserve">. He is </w:t>
       </w:r>
       <w:r>
         <w:rPr>
@@ -9755,7 +10053,7 @@
         <w:t>not</w:t>
       </w:r>
       <w:r>
-        <w:t xml:space="preserve"> Everett’s brother Frank the contractor of Berea, who was still living on 13 December 1939. Conflict #22. Do not merge William × Rhoda with Luther’s William × Katherine. [C353] [C354] [S330]</w:t>
+        <w:t xml:space="preserve"> Everett’s brother Frank the contractor of Berea, who was still living on 13 December 1939. Conflict #22. Do not merge William × Rhoda with Luther’s William × Katherine, with H.H.’s son William, twenty, or with Wm Newman, nineteen, in Elihu Tincher’s house. [C353] [C354] [C1337] [S330] [S999]</w:t>
       </w:r>
     </w:p>
     <w:p>
@@ -11951,6 +12249,87 @@
         <w:t>Done this increment:</w:t>
       </w:r>
       <w:r>
+        <w:t xml:space="preserve"> 1860 Owsley stamped </w:t>
+      </w:r>
+      <w:r>
+        <w:rPr>
+          <w:b/>
+        </w:rPr>
+        <w:t>353</w:t>
+      </w:r>
+      <w:r>
+        <w:t xml:space="preserve"> isolated — </w:t>
+      </w:r>
+      <w:r>
+        <w:rPr>
+          <w:b/>
+        </w:rPr>
+        <w:t>Rhoda 37 widow</w:t>
+      </w:r>
+      <w:r>
+        <w:t xml:space="preserve"> + </w:t>
+      </w:r>
+      <w:r>
+        <w:rPr>
+          <w:b/>
+        </w:rPr>
+        <w:t>B.F. 7</w:t>
+      </w:r>
+      <w:r>
+        <w:t xml:space="preserve">; 1870 Decatur </w:t>
+      </w:r>
+      <w:r>
+        <w:rPr>
+          <w:b/>
+        </w:rPr>
+        <w:t>24</w:t>
+      </w:r>
+      <w:r>
+        <w:t xml:space="preserve"> original; 1900 Proctor Benj. F.; 1928 Frank = Benjamin F. </w:t>
+      </w:r>
+      <w:r>
+        <w:rPr>
+          <w:b/>
+        </w:rPr>
+        <w:t>PROVEN</w:t>
+      </w:r>
+      <w:r>
+        <w:t xml:space="preserve"> (</w:t>
+      </w:r>
+      <w:r>
+        <w:rPr>
+          <w:b/>
+        </w:rPr>
+        <w:t>C1337</w:t>
+      </w:r>
+      <w:r>
+        <w:t xml:space="preserve">). </w:t>
+      </w:r>
+      <w:r>
+        <w:rPr>
+          <w:b/>
+        </w:rPr>
+        <w:t>B071</w:t>
+      </w:r>
+      <w:r>
+        <w:t xml:space="preserve"> </w:t>
+      </w:r>
+      <w:r>
+        <w:rPr>
+          <w:b/>
+        </w:rPr>
+        <w:t>open→partial</w:t>
+      </w:r>
+      <w:r>
+        <w:t xml:space="preserve">. </w:t>
+      </w:r>
+      <w:r>
+        <w:rPr>
+          <w:b/>
+        </w:rPr>
+        <w:t>Done earlier:</w:t>
+      </w:r>
+      <w:r>
         <w:t xml:space="preserve"> Estill </w:t>
       </w:r>
       <w:r>
@@ -12393,69 +12772,6 @@
         <w:rPr>
           <w:b/>
         </w:rPr>
-        <w:t>B089</w:t>
-      </w:r>
-      <w:r>
-        <w:t xml:space="preserve"> Estill 1930 </w:t>
-      </w:r>
-      <w:r>
-        <w:rPr>
-          <w:b/>
-        </w:rPr>
-        <w:t>33-12 / 33-13</w:t>
-      </w:r>
-      <w:r>
-        <w:t xml:space="preserve"> only if a later Forks residence is hypothesized (true 33-7 / 33-5 / 33-6 / 33-8 / 33-9 / 33-14 / 33-10 / </w:t>
-      </w:r>
-      <w:r>
-        <w:rPr>
-          <w:b/>
-        </w:rPr>
-        <w:t>33-11</w:t>
-      </w:r>
-      <w:r>
-        <w:t xml:space="preserve"> now visually closed — do not re-fetch as unpublished), </w:t>
-      </w:r>
-      <w:r>
-        <w:rPr>
-          <w:b/>
-        </w:rPr>
-        <w:t>M1930 roll 15</w:t>
-      </w:r>
-      <w:r>
-        <w:t xml:space="preserve"> Estill county + Irvine </w:t>
-      </w:r>
-      <w:r>
-        <w:rPr>
-          <w:b/>
-        </w:rPr>
-        <w:t>map images</w:t>
-      </w:r>
-      <w:r>
-        <w:t xml:space="preserve"> + </w:t>
-      </w:r>
-      <w:r>
-        <w:rPr>
-          <w:b/>
-        </w:rPr>
-        <w:t>T1224 roll 69</w:t>
-      </w:r>
-      <w:r>
-        <w:t xml:space="preserve"> description </w:t>
-      </w:r>
-      <w:r>
-        <w:rPr>
-          <w:b/>
-        </w:rPr>
-        <w:t>images</w:t>
-      </w:r>
-      <w:r>
-        <w:t xml:space="preserve"> if a free item appears (pamphlets already seen), </w:t>
-      </w:r>
-      <w:r>
-        <w:rPr>
-          <w:b/>
-        </w:rPr>
         <w:t>B058</w:t>
       </w:r>
       <w:r>
@@ -12573,6 +12889,69 @@
         <w:rPr>
           <w:b/>
         </w:rPr>
+        <w:t>B069/B047/B059</w:t>
+      </w:r>
+      <w:r>
+        <w:t xml:space="preserve"> M1509 </w:t>
+      </w:r>
+      <w:r>
+        <w:rPr>
+          <w:b/>
+        </w:rPr>
+        <w:t>KY45</w:t>
+      </w:r>
+      <w:r>
+        <w:t xml:space="preserve"> cards, </w:t>
+      </w:r>
+      <w:r>
+        <w:rPr>
+          <w:b/>
+        </w:rPr>
+        <w:t>B045/B061/B065</w:t>
+      </w:r>
+      <w:r>
+        <w:t xml:space="preserve"> FS sign-in (clerk already recorded — do not re-ask), </w:t>
+      </w:r>
+      <w:r>
+        <w:rPr>
+          <w:b/>
+        </w:rPr>
+        <w:t>B082</w:t>
+      </w:r>
+      <w:r>
+        <w:t xml:space="preserve"> Duell-Clark / cert </w:t>
+      </w:r>
+      <w:r>
+        <w:rPr>
+          <w:b/>
+        </w:rPr>
+        <w:t>17762</w:t>
+      </w:r>
+      <w:r>
+        <w:t xml:space="preserve">, </w:t>
+      </w:r>
+      <w:r>
+        <w:rPr>
+          <w:b/>
+        </w:rPr>
+        <w:t>B071</w:t>
+      </w:r>
+      <w:r>
+        <w:t xml:space="preserve"> residual 1850 couple / 1910 B.F. placement, </w:t>
+      </w:r>
+      <w:r>
+        <w:rPr>
+          <w:b/>
+        </w:rPr>
+        <w:t>B085</w:t>
+      </w:r>
+      <w:r>
+        <w:t xml:space="preserve"> McCoy after 1930. </w:t>
+      </w:r>
+      <w:r>
+        <w:rPr>
+          <w:b/>
+        </w:rPr>
         <w:t>B088</w:t>
       </w:r>
       <w:r>
@@ -12594,61 +12973,25 @@
         <w:t>proven</w:t>
       </w:r>
       <w:r>
-        <w:t xml:space="preserve"> — do not stall, </w:t>
-      </w:r>
-      <w:r>
-        <w:rPr>
-          <w:b/>
-        </w:rPr>
-        <w:t>B045/B061</w:t>
-      </w:r>
-      <w:r>
-        <w:t xml:space="preserve"> FS sign-in (clerk already recorded — do not re-ask), </w:t>
-      </w:r>
-      <w:r>
-        <w:rPr>
-          <w:b/>
-        </w:rPr>
-        <w:t>B069/B047</w:t>
-      </w:r>
-      <w:r>
-        <w:t xml:space="preserve"> M1509 </w:t>
-      </w:r>
-      <w:r>
-        <w:rPr>
-          <w:b/>
-        </w:rPr>
-        <w:t>KY45</w:t>
-      </w:r>
-      <w:r>
-        <w:t xml:space="preserve"> cards, </w:t>
-      </w:r>
-      <w:r>
-        <w:rPr>
-          <w:b/>
-        </w:rPr>
-        <w:t>B082</w:t>
-      </w:r>
-      <w:r>
-        <w:t xml:space="preserve"> Duell-Clark / cert </w:t>
-      </w:r>
-      <w:r>
-        <w:rPr>
-          <w:b/>
-        </w:rPr>
-        <w:t>17762</w:t>
-      </w:r>
-      <w:r>
-        <w:t xml:space="preserve">, </w:t>
-      </w:r>
-      <w:r>
-        <w:rPr>
-          <w:b/>
-        </w:rPr>
-        <w:t>B085</w:t>
-      </w:r>
-      <w:r>
-        <w:t xml:space="preserve"> McCoy after 1930.</w:t>
+        <w:t xml:space="preserve"> — one line max. Do </w:t>
+      </w:r>
+      <w:r>
+        <w:rPr>
+          <w:b/>
+        </w:rPr>
+        <w:t>not</w:t>
+      </w:r>
+      <w:r>
+        <w:t xml:space="preserve"> start Estill </w:t>
+      </w:r>
+      <w:r>
+        <w:rPr>
+          <w:b/>
+        </w:rPr>
+        <w:t>1930 33-12 / 33-13</w:t>
+      </w:r>
+      <w:r>
+        <w:t>.</w:t>
       </w:r>
     </w:p>
     <w:p>
@@ -27067,6 +27410,692 @@
     </w:p>
     <w:p>
       <w:r>
+        <w:t xml:space="preserve">233. 1850 U.S. census, Owsley Co., KY, stamped </w:t>
+      </w:r>
+      <w:r>
+        <w:rPr>
+          <w:b/>
+        </w:rPr>
+        <w:t>299B</w:t>
+      </w:r>
+      <w:r>
+        <w:t xml:space="preserve">. IA [`populationschedu0216unix`](https://archive.org/details/populationschedu0216unix) leaf </w:t>
+      </w:r>
+      <w:r>
+        <w:rPr>
+          <w:b/>
+        </w:rPr>
+        <w:t>391</w:t>
+      </w:r>
+      <w:r>
+        <w:t xml:space="preserve">. Rebecca Tincher FAN; Harrison Newman </w:t>
+      </w:r>
+      <w:r>
+        <w:rPr>
+          <w:b/>
+        </w:rPr>
+        <w:t>33</w:t>
+      </w:r>
+      <w:r>
+        <w:t xml:space="preserve">; John Newman </w:t>
+      </w:r>
+      <w:r>
+        <w:rPr>
+          <w:b/>
+        </w:rPr>
+        <w:t>23</w:t>
+      </w:r>
+      <w:r>
+        <w:t xml:space="preserve">. Line </w:t>
+      </w:r>
+      <w:r>
+        <w:rPr>
+          <w:b/>
+        </w:rPr>
+        <w:t>22</w:t>
+      </w:r>
+      <w:r>
+        <w:t xml:space="preserve"> = William Tincher </w:t>
+      </w:r>
+      <w:r>
+        <w:rPr>
+          <w:b/>
+        </w:rPr>
+        <w:t>21</w:t>
+      </w:r>
+      <w:r>
+        <w:t xml:space="preserve">. *Image seen.* </w:t>
+      </w:r>
+      <w:r>
+        <w:rPr>
+          <w:b/>
+        </w:rPr>
+        <w:t>C1289 C1293</w:t>
+      </w:r>
+      <w:r>
+        <w:t xml:space="preserve"> </w:t>
+      </w:r>
+      <w:r>
+        <w:rPr>
+          <w:b/>
+        </w:rPr>
+        <w:t>S978</w:t>
+      </w:r>
+      <w:r>
+        <w:t>.</w:t>
+      </w:r>
+    </w:p>
+    <w:p>
+      <w:r>
+        <w:t xml:space="preserve">234. Same reel stamped </w:t>
+      </w:r>
+      <w:r>
+        <w:rPr>
+          <w:b/>
+        </w:rPr>
+        <w:t>300A</w:t>
+      </w:r>
+      <w:r>
+        <w:t xml:space="preserve"> / </w:t>
+      </w:r>
+      <w:r>
+        <w:rPr>
+          <w:b/>
+        </w:rPr>
+        <w:t>299A</w:t>
+      </w:r>
+      <w:r>
+        <w:t xml:space="preserve"> / </w:t>
+      </w:r>
+      <w:r>
+        <w:rPr>
+          <w:b/>
+        </w:rPr>
+        <w:t>298B</w:t>
+      </w:r>
+      <w:r>
+        <w:t xml:space="preserve"> / </w:t>
+      </w:r>
+      <w:r>
+        <w:rPr>
+          <w:b/>
+        </w:rPr>
+        <w:t>300B</w:t>
+      </w:r>
+      <w:r>
+        <w:t xml:space="preserve">: John Newman </w:t>
+      </w:r>
+      <w:r>
+        <w:rPr>
+          <w:b/>
+        </w:rPr>
+        <w:t>60</w:t>
+      </w:r>
+      <w:r>
+        <w:t xml:space="preserve"> + Lear; no William × Rhoda. *Image seen.* </w:t>
+      </w:r>
+      <w:r>
+        <w:rPr>
+          <w:b/>
+        </w:rPr>
+        <w:t>C1288 C1290 C1291</w:t>
+      </w:r>
+      <w:r>
+        <w:t xml:space="preserve"> </w:t>
+      </w:r>
+      <w:r>
+        <w:rPr>
+          <w:b/>
+        </w:rPr>
+        <w:t>S979 S980</w:t>
+      </w:r>
+      <w:r>
+        <w:t>.</w:t>
+      </w:r>
+    </w:p>
+    <w:p>
+      <w:r>
+        <w:t xml:space="preserve">235. 1870 Travellers Rest original (M593-494 PDF p. </w:t>
+      </w:r>
+      <w:r>
+        <w:rPr>
+          <w:b/>
+        </w:rPr>
+        <w:t>90</w:t>
+      </w:r>
+      <w:r>
+        <w:t xml:space="preserve">, already [S231](https://archive.org/details/populationschedu0494unit)): Rhoda </w:t>
+      </w:r>
+      <w:r>
+        <w:rPr>
+          <w:b/>
+        </w:rPr>
+        <w:t>45</w:t>
+      </w:r>
+      <w:r>
+        <w:t xml:space="preserve"> + </w:t>
+      </w:r>
+      <w:r>
+        <w:rPr>
+          <w:b/>
+        </w:rPr>
+        <w:t>Benjamin F. 17</w:t>
+      </w:r>
+      <w:r>
+        <w:t xml:space="preserve">; Elias same page. *Image seen.* </w:t>
+      </w:r>
+      <w:r>
+        <w:rPr>
+          <w:b/>
+        </w:rPr>
+        <w:t>C1294</w:t>
+      </w:r>
+      <w:r>
+        <w:t xml:space="preserve"> </w:t>
+      </w:r>
+      <w:r>
+        <w:rPr>
+          <w:b/>
+        </w:rPr>
+        <w:t>S981</w:t>
+      </w:r>
+      <w:r>
+        <w:t>.</w:t>
+      </w:r>
+    </w:p>
+    <w:p>
+      <w:r>
+        <w:t xml:space="preserve">236. Lee Book </w:t>
+      </w:r>
+      <w:r>
+        <w:rPr>
+          <w:b/>
+        </w:rPr>
+        <w:t>2</w:t>
+      </w:r>
+      <w:r>
+        <w:t xml:space="preserve">: Benjamin F. NEWNAM × Mary STEEL, </w:t>
+      </w:r>
+      <w:r>
+        <w:rPr>
+          <w:b/>
+        </w:rPr>
+        <w:t>15 Sept 1881</w:t>
+      </w:r>
+      <w:r>
+        <w:t xml:space="preserve">. [USGenNet Book 2](https://usgennet.org/usa/ky/county/lee/marriage/marrbook2.html). *Transcription only.* </w:t>
+      </w:r>
+      <w:r>
+        <w:rPr>
+          <w:b/>
+        </w:rPr>
+        <w:t>C1296</w:t>
+      </w:r>
+      <w:r>
+        <w:t xml:space="preserve"> </w:t>
+      </w:r>
+      <w:r>
+        <w:rPr>
+          <w:b/>
+        </w:rPr>
+        <w:t>S983</w:t>
+      </w:r>
+      <w:r>
+        <w:t>.</w:t>
+      </w:r>
+    </w:p>
+    <w:p>
+      <w:r>
+        <w:t xml:space="preserve">237. [USGenNet 1920 St. Helens](https://usgennet.org/usa/ky/county/lee/census/1920/sth.html) </w:t>
+      </w:r>
+      <w:r>
+        <w:rPr>
+          <w:b/>
+        </w:rPr>
+        <w:t>37-37</w:t>
+      </w:r>
+      <w:r>
+        <w:t xml:space="preserve"> B.F. NEWNAM </w:t>
+      </w:r>
+      <w:r>
+        <w:rPr>
+          <w:b/>
+        </w:rPr>
+        <w:t>66</w:t>
+      </w:r>
+      <w:r>
+        <w:t xml:space="preserve"> + Mary J </w:t>
+      </w:r>
+      <w:r>
+        <w:rPr>
+          <w:b/>
+        </w:rPr>
+        <w:t>64</w:t>
+      </w:r>
+      <w:r>
+        <w:t xml:space="preserve">. [1944 deaths](https://usgennet.org/usa/ky/county/lee/deaths/1944.html) Mary Jane Newnam, spouse Frank, father Wm Steele. [Will](https://usgennet.org/usa/ky/county/lee/wills/mjsnewnam.html) residue to Sam P. STEELE. *Transcription only.* </w:t>
+      </w:r>
+      <w:r>
+        <w:rPr>
+          <w:b/>
+        </w:rPr>
+        <w:t>C1298 C1300 C1301</w:t>
+      </w:r>
+      <w:r>
+        <w:t xml:space="preserve"> </w:t>
+      </w:r>
+      <w:r>
+        <w:rPr>
+          <w:b/>
+        </w:rPr>
+        <w:t>S994 S984 S985</w:t>
+      </w:r>
+      <w:r>
+        <w:t>.</w:t>
+      </w:r>
+    </w:p>
+    <w:p>
+      <w:r>
+        <w:t xml:space="preserve">238. [Lee 1932 deaths](https://usgennet.org/usa/ky/county/lee/deaths/1932.html) Mary F. Tincher, father John Newnam × Elizabeth Goe. [WikiTree Newnam-172](https://www.wikitree.com/wiki/Newnam-172) authored. *Extract / authored.* </w:t>
+      </w:r>
+      <w:r>
+        <w:rPr>
+          <w:b/>
+        </w:rPr>
+        <w:t>C1302 C1303</w:t>
+      </w:r>
+      <w:r>
+        <w:t xml:space="preserve"> </w:t>
+      </w:r>
+      <w:r>
+        <w:rPr>
+          <w:b/>
+        </w:rPr>
+        <w:t>S986 S987 S988</w:t>
+      </w:r>
+      <w:r>
+        <w:t xml:space="preserve">. Conflict </w:t>
+      </w:r>
+      <w:r>
+        <w:rPr>
+          <w:b/>
+        </w:rPr>
+        <w:t>#28</w:t>
+      </w:r>
+      <w:r>
+        <w:t>.</w:t>
+      </w:r>
+    </w:p>
+    <w:p>
+      <w:r>
+        <w:t xml:space="preserve">239. Same-person pass 113: 1870 Benjamin F. </w:t>
+      </w:r>
+      <w:r>
+        <w:rPr>
+          <w:b/>
+        </w:rPr>
+        <w:t>17</w:t>
+      </w:r>
+      <w:r>
+        <w:t xml:space="preserve"> + 1881 × Mary Steel + 1920 B.F. </w:t>
+      </w:r>
+      <w:r>
+        <w:rPr>
+          <w:b/>
+        </w:rPr>
+        <w:t>66</w:t>
+      </w:r>
+      <w:r>
+        <w:t xml:space="preserve"> + 1928 Frank + 1944 Mary Jane = </w:t>
+      </w:r>
+      <w:r>
+        <w:rPr>
+          <w:b/>
+        </w:rPr>
+        <w:t>one man PROVEN</w:t>
+      </w:r>
+      <w:r>
+        <w:t xml:space="preserve">. Parents </w:t>
+      </w:r>
+      <w:r>
+        <w:rPr>
+          <w:b/>
+        </w:rPr>
+        <w:t>PROBABLE</w:t>
+      </w:r>
+      <w:r>
+        <w:t xml:space="preserve">. *Analysis.* </w:t>
+      </w:r>
+      <w:r>
+        <w:rPr>
+          <w:b/>
+        </w:rPr>
+        <w:t>C1316</w:t>
+      </w:r>
+      <w:r>
+        <w:t xml:space="preserve"> </w:t>
+      </w:r>
+      <w:r>
+        <w:rPr>
+          <w:b/>
+        </w:rPr>
+        <w:t>S993</w:t>
+      </w:r>
+      <w:r>
+        <w:t>.</w:t>
+      </w:r>
+    </w:p>
+    <w:p>
+      <w:r>
+        <w:t xml:space="preserve">240. 1860 U.S. census, Owsley Co., KY, stamped </w:t>
+      </w:r>
+      <w:r>
+        <w:rPr>
+          <w:b/>
+        </w:rPr>
+        <w:t>353</w:t>
+      </w:r>
+      <w:r>
+        <w:t xml:space="preserve">. IA [`populationschedu391unit`](https://archive.org/details/populationschedu391unit) leaf </w:t>
+      </w:r>
+      <w:r>
+        <w:rPr>
+          <w:b/>
+        </w:rPr>
+        <w:t>n0355</w:t>
+      </w:r>
+      <w:r>
+        <w:t xml:space="preserve">. </w:t>
+      </w:r>
+      <w:r>
+        <w:rPr>
+          <w:b/>
+        </w:rPr>
+        <w:t>389/389 Rhoda Newman 37 widow</w:t>
+      </w:r>
+      <w:r>
+        <w:t xml:space="preserve"> + Decatur </w:t>
+      </w:r>
+      <w:r>
+        <w:rPr>
+          <w:b/>
+        </w:rPr>
+        <w:t>14</w:t>
+      </w:r>
+      <w:r>
+        <w:t xml:space="preserve"> + </w:t>
+      </w:r>
+      <w:r>
+        <w:rPr>
+          <w:b/>
+        </w:rPr>
+        <w:t>B.F. 7</w:t>
+      </w:r>
+      <w:r>
+        <w:t xml:space="preserve">. William absent. *Image seen.* </w:t>
+      </w:r>
+      <w:r>
+        <w:rPr>
+          <w:b/>
+        </w:rPr>
+        <w:t>C1319 C1320 C1321</w:t>
+      </w:r>
+      <w:r>
+        <w:t xml:space="preserve"> </w:t>
+      </w:r>
+      <w:r>
+        <w:rPr>
+          <w:b/>
+        </w:rPr>
+        <w:t>S998 S999</w:t>
+      </w:r>
+      <w:r>
+        <w:t>.</w:t>
+      </w:r>
+    </w:p>
+    <w:p>
+      <w:r>
+        <w:t xml:space="preserve">241. Same reel leaf </w:t>
+      </w:r>
+      <w:r>
+        <w:rPr>
+          <w:b/>
+        </w:rPr>
+        <w:t>n0352</w:t>
+      </w:r>
+      <w:r>
+        <w:t xml:space="preserve"> Booneville p. </w:t>
+      </w:r>
+      <w:r>
+        <w:rPr>
+          <w:b/>
+        </w:rPr>
+        <w:t>54</w:t>
+      </w:r>
+      <w:r>
+        <w:t xml:space="preserve">: </w:t>
+      </w:r>
+      <w:r>
+        <w:rPr>
+          <w:b/>
+        </w:rPr>
+        <w:t>H.H. Newman 44</w:t>
+      </w:r>
+      <w:r>
+        <w:t xml:space="preserve"> + </w:t>
+      </w:r>
+      <w:r>
+        <w:rPr>
+          <w:b/>
+        </w:rPr>
+        <w:t>Elias 18</w:t>
+      </w:r>
+      <w:r>
+        <w:t xml:space="preserve">. *Image seen.* </w:t>
+      </w:r>
+      <w:r>
+        <w:rPr>
+          <w:b/>
+        </w:rPr>
+        <w:t>C1318</w:t>
+      </w:r>
+      <w:r>
+        <w:t xml:space="preserve"> </w:t>
+      </w:r>
+      <w:r>
+        <w:rPr>
+          <w:b/>
+        </w:rPr>
+        <w:t>S997 S1002</w:t>
+      </w:r>
+      <w:r>
+        <w:t>.</w:t>
+      </w:r>
+    </w:p>
+    <w:p>
+      <w:r>
+        <w:t xml:space="preserve">242. 1870 Travellers Rest p. </w:t>
+      </w:r>
+      <w:r>
+        <w:rPr>
+          <w:b/>
+        </w:rPr>
+        <w:t>20</w:t>
+      </w:r>
+      <w:r>
+        <w:t xml:space="preserve">. IA [`populationschedu0494unit`](https://archive.org/details/populationschedu0494unit) leaf </w:t>
+      </w:r>
+      <w:r>
+        <w:rPr>
+          <w:b/>
+        </w:rPr>
+        <w:t>n0090</w:t>
+      </w:r>
+      <w:r>
+        <w:t xml:space="preserve">. </w:t>
+      </w:r>
+      <w:r>
+        <w:rPr>
+          <w:b/>
+        </w:rPr>
+        <w:t>Decatur 24</w:t>
+      </w:r>
+      <w:r>
+        <w:t xml:space="preserve"> + Sarah A. *Image seen.* </w:t>
+      </w:r>
+      <w:r>
+        <w:rPr>
+          <w:b/>
+        </w:rPr>
+        <w:t>C1322</w:t>
+      </w:r>
+      <w:r>
+        <w:t xml:space="preserve"> </w:t>
+      </w:r>
+      <w:r>
+        <w:rPr>
+          <w:b/>
+        </w:rPr>
+        <w:t>S1000</w:t>
+      </w:r>
+      <w:r>
+        <w:t>.</w:t>
+      </w:r>
+    </w:p>
+    <w:p>
+      <w:r>
+        <w:t xml:space="preserve">243. [USGenNet 1900 Proctor](https://usgennet.org/usa/ky/county/lee/census/1900/1900proctor.html) </w:t>
+      </w:r>
+      <w:r>
+        <w:rPr>
+          <w:b/>
+        </w:rPr>
+        <w:t>213/213 Benj. F. NEWNAM</w:t>
+      </w:r>
+      <w:r>
+        <w:t xml:space="preserve"> Oct </w:t>
+      </w:r>
+      <w:r>
+        <w:rPr>
+          <w:b/>
+        </w:rPr>
+        <w:t>1853</w:t>
+      </w:r>
+      <w:r>
+        <w:t xml:space="preserve"> + Mary J + Asburt. *Transcription only.* </w:t>
+      </w:r>
+      <w:r>
+        <w:rPr>
+          <w:b/>
+        </w:rPr>
+        <w:t>C1324</w:t>
+      </w:r>
+      <w:r>
+        <w:t xml:space="preserve"> </w:t>
+      </w:r>
+      <w:r>
+        <w:rPr>
+          <w:b/>
+        </w:rPr>
+        <w:t>S1004</w:t>
+      </w:r>
+      <w:r>
+        <w:t>.</w:t>
+      </w:r>
+    </w:p>
+    <w:p>
+      <w:r>
+        <w:t xml:space="preserve">244. Same-person pass 114: 1860 B.F. </w:t>
+      </w:r>
+      <w:r>
+        <w:rPr>
+          <w:b/>
+        </w:rPr>
+        <w:t>7</w:t>
+      </w:r>
+      <w:r>
+        <w:t xml:space="preserve"> + 1870 + 1881 + 1900 Proctor + 1920 + 1928 + 1944 = </w:t>
+      </w:r>
+      <w:r>
+        <w:rPr>
+          <w:b/>
+        </w:rPr>
+        <w:t>one man PROVEN</w:t>
+      </w:r>
+      <w:r>
+        <w:t xml:space="preserve">. Three Williams kept separate. *Analysis / image seen.* </w:t>
+      </w:r>
+      <w:r>
+        <w:rPr>
+          <w:b/>
+        </w:rPr>
+        <w:t>C1337</w:t>
+      </w:r>
+      <w:r>
+        <w:t xml:space="preserve"> </w:t>
+      </w:r>
+      <w:r>
+        <w:rPr>
+          <w:b/>
+        </w:rPr>
+        <w:t>S1006</w:t>
+      </w:r>
+      <w:r>
+        <w:t>.</w:t>
+      </w:r>
+    </w:p>
+    <w:p>
+      <w:r>
+        <w:t xml:space="preserve">245. No newly digitized *Dardanelle Post-Dispatch* Aug </w:t>
+      </w:r>
+      <w:r>
+        <w:rPr>
+          <w:b/>
+        </w:rPr>
+        <w:t>1926</w:t>
+      </w:r>
+      <w:r>
+        <w:t xml:space="preserve"> page. No free June </w:t>
+      </w:r>
+      <w:r>
+        <w:rPr>
+          <w:b/>
+        </w:rPr>
+        <w:t>1958</w:t>
+      </w:r>
+      <w:r>
+        <w:t xml:space="preserve"> *Citizen* clip. GT [Lee WWI](https://genealogytrails.com/ken/lee/wwi_draft_cards.html) still Luther Brandenburg + Underwood only. Cert </w:t>
+      </w:r>
+      <w:r>
+        <w:rPr>
+          <w:b/>
+        </w:rPr>
+        <w:t>17762</w:t>
+      </w:r>
+      <w:r>
+        <w:t xml:space="preserve"> unread. Do not print 1966. *Catalog / compiled.* </w:t>
+      </w:r>
+      <w:r>
+        <w:rPr>
+          <w:b/>
+        </w:rPr>
+        <w:t>C1328–C1336</w:t>
+      </w:r>
+      <w:r>
+        <w:t xml:space="preserve"> </w:t>
+      </w:r>
+      <w:r>
+        <w:rPr>
+          <w:b/>
+        </w:rPr>
+        <w:t>S990 S1006</w:t>
+      </w:r>
+      <w:r>
+        <w:t>.</w:t>
+      </w:r>
+    </w:p>
+    <w:p>
+      <w:r>
         <w:br w:type="page"/>
       </w:r>
     </w:p>
@@ -28747,6 +29776,81 @@
     <w:p>
       <w:r>
         <w:t>| S977 | `../sources/catalog/ia-meta-602-pass112.json` | [IA 602](https://archive.org/details/14thcensusofpopu602unit) | imagecount still 515 | catalog |</w:t>
+      </w:r>
+    </w:p>
+    <w:p>
+      <w:r>
+        <w:t>| S978 | `../sources/census/pass113/owsley-1850-299b-leaf0391.jpg` | [IA 1850 reel 216](https://archive.org/details/populationschedu0216unix) | 299B Tincher FAN + Harrison/John; ln 22 = William Tincher 21 | image seen |</w:t>
+      </w:r>
+    </w:p>
+    <w:p>
+      <w:r>
+        <w:t>| S979 | `../sources/census/pass113/owsley-1850-300a-leaf0392.jpg` | [IA 1850 reel 216](https://archive.org/details/populationschedu0216unix) | 300A John 60 + Lear; no William × Rhoda | image seen |</w:t>
+      </w:r>
+    </w:p>
+    <w:p>
+      <w:r>
+        <w:t>| S980 | `../sources/census/pass113/owsley-1850-299a-leaf0390.jpg` | [IA 1850 reel 216](https://archive.org/details/populationschedu0216unix) | 299A / 298B / 300B nil Newman | image seen |</w:t>
+      </w:r>
+    </w:p>
+    <w:p>
+      <w:r>
+        <w:t>| S981 | `../sources/census/pass113/owsley-1870-348-rhoda-benjamin-elias-crop.jpg` | [IA 1870 reel 494](https://archive.org/details/populationschedu0494unit) | Rhoda + Benjamin F. 17; Elias same page | image seen |</w:t>
+      </w:r>
+    </w:p>
+    <w:p>
+      <w:r>
+        <w:t>| S983 | `../sources/marriages/lee-book2-benjamin-f-newnam-mary-steel-1881-extract-2026-10-31.txt` | [Lee Book 2](https://usgennet.org/usa/ky/county/lee/marriage/marrbook2.html) | Benjamin F. × Mary Steel 15 Sept 1881 | transcription only |</w:t>
+      </w:r>
+    </w:p>
+    <w:p>
+      <w:r>
+        <w:t>| S984 | `../sources/vital/lee-deaths-1944-mary-jane-newnam-extract-2026-10-31.txt` | [Lee 1944 deaths](https://usgennet.org/usa/ky/county/lee/deaths/1944.html) | Mary Jane; spouse Frank; father Wm Steele | transcription only |</w:t>
+      </w:r>
+    </w:p>
+    <w:p>
+      <w:r>
+        <w:t>| S988 | `../sources/authored/wikitree-newnam-172-extract-2026-10-31.txt` | [Newnam-172](https://www.wikitree.com/wiki/Newnam-172) | Authored Francis Decatur / William × Rhoda | authored lead |</w:t>
+      </w:r>
+    </w:p>
+    <w:p>
+      <w:r>
+        <w:t>| S993 | `../sources/census/pass113-extract-2026-10-31.txt` | This session | Pass 113 extract | extract |</w:t>
+      </w:r>
+    </w:p>
+    <w:p>
+      <w:r>
+        <w:t>| S996 | `../sources/census/pass114/m653-391-title.jpg` | [IA reel 391](https://archive.org/details/populationschedu391unit) | M653-391 title; Owsley start | image seen |</w:t>
+      </w:r>
+    </w:p>
+    <w:p>
+      <w:r>
+        <w:t>| S997 | `../sources/census/pass114/owsley-1860-p54-wh-newman.jpg` | [IA reel 391](https://archive.org/details/populationschedu391unit) | H.H. 44 + Elias 18 | image seen |</w:t>
+      </w:r>
+    </w:p>
+    <w:p>
+      <w:r>
+        <w:t>| S998 | `../sources/census/pass114/owsley-1860-p57-stamped353.jpg` | [IA reel 391](https://archive.org/details/populationschedu391unit) | Page 57 stamped 353 Proctor | image seen |</w:t>
+      </w:r>
+    </w:p>
+    <w:p>
+      <w:r>
+        <w:t>| S999 | `../sources/census/pass114/crops/1860-353-rhoda-newnam.jpg` | [IA reel 391](https://archive.org/details/populationschedu391unit) | Rhoda 37 widow + B.F. 7 | image seen |</w:t>
+      </w:r>
+    </w:p>
+    <w:p>
+      <w:r>
+        <w:t>| S1000 | `../sources/census/pass114/owsley-1870-p20-decatur.jpg` | [IA reel 494](https://archive.org/details/populationschedu0494unit) | Decatur 24 + Sarah A | image seen |</w:t>
+      </w:r>
+    </w:p>
+    <w:p>
+      <w:r>
+        <w:t>| S1004 | `../sources/census/pass114/lee-1900-proctor-benj-f-extract-2026-10-31.txt` | [1900 Proctor](https://usgennet.org/usa/ky/county/lee/census/1900/1900proctor.html) | Benj. F. Oct 1853 + Mary J + Asburt | transcription only |</w:t>
+      </w:r>
+    </w:p>
+    <w:p>
+      <w:r>
+        <w:t>| S1006 | `../sources/census/pass114-extract-2026-10-31.txt` | This session | Pass 114 extract | extract |</w:t>
       </w:r>
     </w:p>
     <w:p>

</xml_diff>

<commit_message>
Pass 81: A-156 Abner windows closed; Soundex residuals image-closed.
Original ED 89 Robert E is Hard Rule 6 of Soundex 2023. Clerk Arch is original Casey. Lewis 50 is a Soundex miss. Samuel 1628 copies the Maria house. C-652, G-500, and M-253 residuals closed. Floyd Josephine substitutes nil. B063 remains open.

Co-authored-by: CatCorner22 <CatCorner22@users.noreply.github.com>
</commit_message>
<xml_diff>
--- a/research/dora-ella-newnam/book/Dora-Ella-Newnam-Stone-A-Life.docx
+++ b/research/dora-ella-newnam/book/Dora-Ella-Newnam-Stone-A-Life.docx
@@ -948,7 +948,7 @@
         <w:t>Molly</w:t>
       </w:r>
       <w:r>
-        <w:t xml:space="preserve">, eighteen. The Soundex clerk misread Edmonds as Evans. He is not the 1910 Buffalo couple. Another card writes Owsley for a John of fifty-nine with Alice, but cites volume 93, district 300, which is not an Owsley district (those are 88–94). The densified Susan given-name slot has no Evans, Susan of about thirty-nine in Owsley: the only Susans are Eubanks eighty-three in Pulaski, Eubank seventy-seven in Owen, and Effinger eighty-one in Fulton, and Evans Susie of Louisville and Lexington is another woman. Owsley death extracts for 1911–1920 have no matching John Evans decedent; a 1914 drowning indexed in a web search as Evans is John Neeley. Josephine Newnam’s about-1902 Gilbert license remains unseen in further neighbouring-county substitutes (Harlan 1900–02, Leslie 1900–01 and 1903–04, Knott Book 2A 1902–03, Madison compiled, Magoffin N, Powell volunteer notes); Rockcastle’s compiled G and N files end in 1900. Breathitt marriages are still unopened. Kentucky’s E-152 Lula given-name window — Lola through Luther — has no Evans, Lula of about fourteen in Owsley. A fourteen-year-old Lula in Carter is sister-in-law of George Parsons, not John’s daughter. The Robert window through Robey has no Evans, Robert of about eleven in Owsley as a head or as an A-2; Robert E., fifty-three, of Owsley district 89 with Margie is a different house and is not merged. Leftover odd John leaves through the Joseph divider have no Evans, John of about fifty-five with Susan in district 92; combined with the leftover evens, that given-name window is now image-closed for that identity. A Lee County John H. Evans, forty-six, of Beattyville, with Julia and daughters Katherine, fourteen, and Elizabeth, eleven, is another family. A Lee County John W. Evans, twenty-eight, with wife Dora, twenty-four, and daughter Anna is not this woman. The 1910 dwelling 31 house is </w:t>
+        <w:t xml:space="preserve">, eighteen. The Soundex clerk misread Edmonds as Evans. He is not the 1910 Buffalo couple. Another card writes Owsley for a John of fifty-nine with Alice, but cites volume 93, district 300, which is not an Owsley district (those are 88–94). The densified Susan given-name slot has no Evans, Susan of about thirty-nine in Owsley: the only Susans are Eubanks eighty-three in Pulaski, Eubank seventy-seven in Owen, and Effinger eighty-one in Fulton, and Evans Susie of Louisville and Lexington is another woman. Owsley death extracts for 1911–1920 have no matching John Evans decedent; a 1914 drowning indexed in a web search as Evans is John Neeley. Josephine Newnam’s about-1902 Gilbert license remains unseen in further neighbouring-county substitutes (Harlan 1900–02, Leslie 1900–01 and 1903–04, Knott Book 2A 1902–03, Madison compiled, Magoffin N, Powell volunteer notes); Rockcastle’s compiled G and N files end in 1900. Breathitt marriages are still unopened. Kentucky’s E-152 Lula given-name window — Lola through Luther — has no Evans, Lula of about fourteen in Owsley. A fourteen-year-old Lula in Carter is sister-in-law of George Parsons, not John’s daughter. The Robert window through Robey has no Evans, Robert of about eleven in Owsley as a head or as an A-2; Robert E., fifty-three, of Owsley district 89 with Margie is a different house and is not merged. The original Sturgeon sheet — district 89, sheet 9 A, line 30 — is that same Robert E. with Margie and four children; the Soundex card copies it. Kentucky’s A-156 Abner cards now close the given-name block: the clerk filed Buffalo Casey as Arch, twenty-nine; the original is Casey, thirty-two, with Sarah, and the original given name stands. Isaac W., three and a half, a grandson of Samuel Hill on Island Creek, shows the clerks indexed Owsley including A-2 cards. There is no Lewis of about fifty in Owsley on those cards; a Louis of forty-one in Lee County with Sarah is another man. The original Buffalo Lewis, fifty, with Susan is a Soundex miss. Samuel, fifty-three, of district 92 sheet 7 line 1, with Marian and grandson Chester, copies the original Samuel-and-Maria house. Remaining C-652 James leaves have no Carmack, James of about fifty in Owsley; Jacob, thirty-two, of Clay is another man. Remaining G-500 leaves run Raymond then Richard, with no Reece. The M-253 head behind the Lecy-and-Donie continuation is Daniel W. McIntosh, fifty, of Carroll, with Rosa — not the 1910 Buffalo Daniel. Floyd County G, N, and 1808–1904 compiled marriages, and a Floyd/Johnson booklet of 1816–1944, have no Josephine Newnam × Gilbert about 1902. Leftover odd John leaves through the Joseph divider have no Evans, John of about fifty-five with Susan in district 92; combined with the leftover evens, that given-name window is now image-closed for that identity. A Lee County John H. Evans, forty-six, of Beattyville, with Julia and daughters Katherine, fourteen, and Elizabeth, eleven, is another family. A Lee County John W. Evans, twenty-eight, with wife Dora, twenty-four, and daughter Anna is not this woman. The 1910 dwelling 31 house is </w:t>
       </w:r>
       <w:r>
         <w:rPr>
@@ -1362,7 +1362,7 @@
         <w:t>Dara</w:t>
       </w:r>
       <w:r>
-        <w:t>, forty — the enumerator wrote an open a, not o — is another person. Kentucky’s 1920 Soundex has no Manerva or Minerva Newman card, and the Walter given-name window has no Owsley or Lee Walter with Manerva. Kentucky’s 1920 death index has no Manerva Newnam row on 28 August; the Owsley table that day is an infant Bates. Mary Ann Smallwood, born April 1842, came from the Owsley Smallwoods. The 11 July 1918 cemetery date is still unmatched in Kentucky’s civil index. [C669] [C672] [C693] [C694] [C690] [C691] [C709] [C711] [C712] [C713] [C717] [C729] [C730] [C739] [C740] [C741] [C742] [C743] [C744] [C745] [C746] [C747] [C748] [C752] [C753] [C754] [C756] [C759] [C763] [C765] [C768] [C775] [C776] [C777] [C779] [C780] [C782] [C783] [C784] [C789] [C790] [C791] [C792] [C793] [C794] [C795] [C796] [C797] [C801] [C802] [C803] [C804] [C808] [C809] [C810] [C811] [C812] [C813] [C814] [C818] [C819] [C820] [C821] [C822] [C823] [C824] [C825] [C826] [C827] [C828] [C832] [C833] [C847] [C848] [C849] [C851] [C857] [C859] [C860] [C861] [C863]</w:t>
+        <w:t>, forty — the enumerator wrote an open a, not o — is another person. Kentucky’s 1920 Soundex has no Manerva or Minerva Newman card, and the Walter given-name window has no Owsley or Lee Walter with Manerva. Kentucky’s 1920 death index has no Manerva Newnam row on 28 August; the Owsley table that day is an infant Bates. Mary Ann Smallwood, born April 1842, came from the Owsley Smallwoods. The 11 July 1918 cemetery date is still unmatched in Kentucky’s civil index. [C669] [C672] [C693] [C694] [C690] [C691] [C709] [C711] [C712] [C713] [C717] [C729] [C730] [C739] [C740] [C741] [C742] [C743] [C744] [C745] [C746] [C747] [C748] [C752] [C753] [C754] [C756] [C759] [C763] [C765] [C768] [C775] [C776] [C777] [C779] [C780] [C782] [C783] [C784] [C789] [C790] [C791] [C792] [C793] [C794] [C795] [C796] [C797] [C801] [C802] [C803] [C804] [C808] [C809] [C810] [C811] [C812] [C813] [C814] [C818] [C819] [C820] [C821] [C822] [C823] [C824] [C825] [C826] [C827] [C828] [C832] [C833] [C847] [C848] [C849] [C851] [C857] [C859] [C860] [C861] [C863] [C868] [C869] [C872] [C873] [C874] [C875] [C876] [C877]</w:t>
       </w:r>
     </w:p>
     <w:p>

</xml_diff>

<commit_message>
Pass 115: B058 still film-only; reject 1850 Estill/Madison Newman hits
Hunt newly digitized Aug–Sep 1926 Dardanelle pages remains film-only
(LOC sn89051008 digitized:false; IA Solr 0). Isolate 1850 William ×
Rhoda: Estill 85B David J and 91B Samuel W + William 4 rejected;
Madison 250B T. T. Newman M.D. rejected; compiled negatives for
Owsley/Estill/Clark/Breathitt/Clay/Madison/Garrard/Rockcastle/Perry/
Whitley. Parents still PROBABLE. Working Word rebuilt; authored
latest.docx SHA 78cdcf44 preserved.

Co-authored-by: blakereaganlaw <blakereaganlaw@gmail.com>
</commit_message>
<xml_diff>
--- a/research/dora-ella-newnam/book/Dora-Ella-Newnam-Stone-A-Life.docx
+++ b/research/dora-ella-newnam/book/Dora-Ella-Newnam-Stone-A-Life.docx
@@ -326,6 +326,11 @@
     </w:p>
     <w:p>
       <w:r>
+        <w:t>60. [Pass 115. The 1850 couple is not in Estill or Madison](#pass-115-the-1850-couple-is-not-in-estill-or-madison)</w:t>
+      </w:r>
+    </w:p>
+    <w:p>
+      <w:r>
         <w:br w:type="page"/>
       </w:r>
     </w:p>
@@ -9910,6 +9915,77 @@
       </w:r>
     </w:p>
     <w:p>
+      <w:pPr>
+        <w:pStyle w:val="Heading2"/>
+      </w:pPr>
+      <w:r>
+        <w:t>Pass 115. The 1850 couple is not in Estill or Madison</w:t>
+      </w:r>
+    </w:p>
+    <w:p>
+      <w:r>
+        <w:t>August 1926 is still on film. The Library of Congress item for the *Dardanelle Post-Dispatch*, LCCN sn89051008, still reads `digitized: false`. Three Internet Archive Solr queries for that title in 1926 returned zero items. The Arkansas Digital Newspaper Project landing is a Chronicling America partner page, not a newly scanned August week. Genealogy Trails’ Yell news file returned 404 this pass. Pope County Library Roll 5 — 21 June 1923 through 26 April 1928 — is unchanged. The phone, 479-968-4368, is already recorded. [C1338] [C1370] [C1373] [S1007] [S1008]</w:t>
+      </w:r>
+    </w:p>
+    <w:p>
+      <w:r>
+        <w:t>William, husband of Rhoda, is still unread as a living 1850 head. If the couple was enumerated they should show Decatur about four and Leaner about two. Estill and Madison are now originals, not only indexes.</w:t>
+      </w:r>
+    </w:p>
+    <w:p>
+      <w:r>
+        <w:t>Internet Archive reel `populationschedu0198unix` is Daviess, Edmonson, and Estill. Leaf n0404 is Estill stamped 85B, 20 September 1850. Household 520 — Woods compiled it as 540 — is David J. Newman, twenty-four, farmer; Nancy J., twenty-five; Mary F., two; Robert, one. That is not Rhoda’s house. [C1339] [C1367] [S1009] [S1014]</w:t>
+      </w:r>
+    </w:p>
+    <w:p>
+      <w:r>
+        <w:t>Leaf n0416 is stamped 91B, 27 September. Household 629 is Samuel W. Newman, about fifty; Sally, thirty-six; Josephine, seven; Martha A., five; William, four; John, two; Jonathan, seventeen. The boy William is Samuel’s son. He is not the dead husband. [C1340] [C1371] [S1010]</w:t>
+      </w:r>
+    </w:p>
+    <w:p>
+      <w:r>
+        <w:t>S-K Publications lists Newman on 85B and 91B only. The Woods every-name file has those eleven Newman lines and no Tincher. Estill 1850 is a county-level negative for the couple. [C1341] [S1015]</w:t>
+      </w:r>
+    </w:p>
+    <w:p>
+      <w:r>
+        <w:t>Madison is reel `populationschedu0211unix`. Leaf n0501 is Richmond District 2, stamped 250, 2 August 1850 — the A-side has no Newman. Leaf n0502 is 250B, household 67: T. T. Newman, thirty-four, M.D., born Mississippi; Mary C., thirty-four, Maryland; Mary T., nine, Louisiana; Lafayette, seven; Andrew, four; Elizabeth, one. S-K lists Newman on 250B only. Rejected. [C1342] [C1343] [C1344] [S1011] [S1012] [S1013] [S1016]</w:t>
+      </w:r>
+    </w:p>
+    <w:p>
+      <w:r>
+        <w:t>The compiled ring around those originals is also empty of the couple. Clark’s S-K N-block is Newkirk 58B; Tincher sits on 91A, original unread. Breathitt’s every-name index has no Newman; Tincher is on 20B, original unread. Clay’s only Newman is William, forty-two, Tennessee-born, a boarder in John Hibbard’s house — no Rhoda. Garrard has Newton. Rockcastle has Newcom. Perry’s N-block is Napier and Noland; the Wilson alpha and the annotated Perry file name no Newman. Whitley has Newby, not Newman. Laurel and Montgomery S-K pages 404’d; those counties sit on unread reels 209 and 214. Lee, Jackson, and Powell did not yet exist. [C1345–C1355] [C1363–C1366] [C1347] [S1017–S1024]</w:t>
+      </w:r>
+    </w:p>
+    <w:p>
+      <w:r>
+        <w:t xml:space="preserve">Parents remain </w:t>
+      </w:r>
+      <w:r>
+        <w:rPr>
+          <w:b/>
+        </w:rPr>
+        <w:t>probable</w:t>
+      </w:r>
+      <w:r>
+        <w:t>. William himself is still not on a living 1850 schedule. The 1928 certificate plus the 1860 and 1870 widow heading the same children is the argument, not a 1850 house. [C1351] [C1368]</w:t>
+      </w:r>
+    </w:p>
+    <w:p>
+      <w:r>
+        <w:t xml:space="preserve">The other film items did not move. No free June 1958 *Citizen* clip. No new M1509 card. FamilySearch 1146342 returned an Incapsula wall — roadblock step 56. Internet Archive reel 602 is still 515 images. Certificate 17762 is unread. Do not print 1966. No new deceased McCoy or Rissie row. Do not print 1962. Grant, twenty-one, is still not merged with David F. David G. of 1984 is still </w:t>
+      </w:r>
+      <w:r>
+        <w:rPr>
+          <w:b/>
+        </w:rPr>
+        <w:t>possible</w:t>
+      </w:r>
+      <w:r>
+        <w:t xml:space="preserve"> as a junior only. Living 1950-line descendants are withheld. Districts 33-12 and 33-13 were not walked. Do not re-ask Tyler Phillips, Pope 479-968-4368, or Hutchins 859-985-3364. [C1356–C1362] [C1374]</w:t>
+      </w:r>
+    </w:p>
+    <w:p>
       <w:r>
         <w:t xml:space="preserve">In Madison County in 1950 a </w:t>
       </w:r>
@@ -12817,10 +12893,55 @@
         <w:rPr>
           <w:b/>
         </w:rPr>
-        <w:t>C1185 C1205 C1222</w:t>
-      </w:r>
-      <w:r>
-        <w:t xml:space="preserve"> — do not chase Democrat 1926 film, Journal August, Rural record 17 Jun 1926, Madison library modern PDFs, or Newspapers.com Post-Dispatch), </w:t>
+        <w:t>C1338</w:t>
+      </w:r>
+      <w:r>
+        <w:t xml:space="preserve"> — do not chase Democrat 1926 film, Journal August, Rural record 17 Jun 1926, Madison library modern PDFs, Newspapers.com Post-Dispatch, or ADNP guides), </w:t>
+      </w:r>
+      <w:r>
+        <w:rPr>
+          <w:b/>
+        </w:rPr>
+        <w:t>B071</w:t>
+      </w:r>
+      <w:r>
+        <w:t xml:space="preserve"> residual 1840 / Clark </w:t>
+      </w:r>
+      <w:r>
+        <w:rPr>
+          <w:b/>
+        </w:rPr>
+        <w:t>TINCHER 91A</w:t>
+      </w:r>
+      <w:r>
+        <w:t xml:space="preserve"> original / Breathitt </w:t>
+      </w:r>
+      <w:r>
+        <w:rPr>
+          <w:b/>
+        </w:rPr>
+        <w:t>TINCHER 20B</w:t>
+      </w:r>
+      <w:r>
+        <w:t xml:space="preserve"> original / Montgomery reel </w:t>
+      </w:r>
+      <w:r>
+        <w:rPr>
+          <w:b/>
+        </w:rPr>
+        <w:t>214</w:t>
+      </w:r>
+      <w:r>
+        <w:t xml:space="preserve"> / Laurel reel </w:t>
+      </w:r>
+      <w:r>
+        <w:rPr>
+          <w:b/>
+        </w:rPr>
+        <w:t>209</w:t>
+      </w:r>
+      <w:r>
+        <w:t xml:space="preserve">, </w:t>
       </w:r>
       <w:r>
         <w:rPr>
@@ -12928,25 +13049,7 @@
         <w:t>17762</w:t>
       </w:r>
       <w:r>
-        <w:t xml:space="preserve">, </w:t>
-      </w:r>
-      <w:r>
-        <w:rPr>
-          <w:b/>
-        </w:rPr>
-        <w:t>B071</w:t>
-      </w:r>
-      <w:r>
-        <w:t xml:space="preserve"> residual 1850 couple / 1910 B.F. placement, </w:t>
-      </w:r>
-      <w:r>
-        <w:rPr>
-          <w:b/>
-        </w:rPr>
-        <w:t>B085</w:t>
-      </w:r>
-      <w:r>
-        <w:t xml:space="preserve"> McCoy after 1930. </w:t>
+        <w:t xml:space="preserve">. </w:t>
       </w:r>
       <w:r>
         <w:rPr>
@@ -28096,6 +28199,415 @@
     </w:p>
     <w:p>
       <w:r>
+        <w:t xml:space="preserve">246. LOC [sn89051008](https://www.loc.gov/item/sn89051008/) `digitized: false`. IA Solr Post-Dispatch 1926 </w:t>
+      </w:r>
+      <w:r>
+        <w:rPr>
+          <w:b/>
+        </w:rPr>
+        <w:t>0</w:t>
+      </w:r>
+      <w:r>
+        <w:t xml:space="preserve">. ADNP / GT Yell no new page. Pope </w:t>
+      </w:r>
+      <w:r>
+        <w:rPr>
+          <w:b/>
+        </w:rPr>
+        <w:t>Roll 5</w:t>
+      </w:r>
+      <w:r>
+        <w:t xml:space="preserve"> unchanged. *Catalog.* </w:t>
+      </w:r>
+      <w:r>
+        <w:rPr>
+          <w:b/>
+        </w:rPr>
+        <w:t>C1338 C1370 C1373</w:t>
+      </w:r>
+      <w:r>
+        <w:t xml:space="preserve"> </w:t>
+      </w:r>
+      <w:r>
+        <w:rPr>
+          <w:b/>
+        </w:rPr>
+        <w:t>S1007 S1008</w:t>
+      </w:r>
+      <w:r>
+        <w:t>.</w:t>
+      </w:r>
+    </w:p>
+    <w:p>
+      <w:r>
+        <w:t xml:space="preserve">247. 1850 U.S. census, Estill Co., KY, stamped </w:t>
+      </w:r>
+      <w:r>
+        <w:rPr>
+          <w:b/>
+        </w:rPr>
+        <w:t>85B</w:t>
+      </w:r>
+      <w:r>
+        <w:t xml:space="preserve">. IA [`populationschedu0198unix`](https://archive.org/details/populationschedu0198unix) leaf </w:t>
+      </w:r>
+      <w:r>
+        <w:rPr>
+          <w:b/>
+        </w:rPr>
+        <w:t>n0404</w:t>
+      </w:r>
+      <w:r>
+        <w:t xml:space="preserve">. David J. Newman </w:t>
+      </w:r>
+      <w:r>
+        <w:rPr>
+          <w:b/>
+        </w:rPr>
+        <w:t>24</w:t>
+      </w:r>
+      <w:r>
+        <w:t xml:space="preserve"> + Nancy J + Mary F + Robert. Visual dw </w:t>
+      </w:r>
+      <w:r>
+        <w:rPr>
+          <w:b/>
+        </w:rPr>
+        <w:t>520</w:t>
+      </w:r>
+      <w:r>
+        <w:t xml:space="preserve">. *Image seen.* </w:t>
+      </w:r>
+      <w:r>
+        <w:rPr>
+          <w:b/>
+        </w:rPr>
+        <w:t>C1339 C1367</w:t>
+      </w:r>
+      <w:r>
+        <w:t xml:space="preserve"> </w:t>
+      </w:r>
+      <w:r>
+        <w:rPr>
+          <w:b/>
+        </w:rPr>
+        <w:t>S1009 S1014</w:t>
+      </w:r>
+      <w:r>
+        <w:t>.</w:t>
+      </w:r>
+    </w:p>
+    <w:p>
+      <w:r>
+        <w:t xml:space="preserve">248. Same reel leaf </w:t>
+      </w:r>
+      <w:r>
+        <w:rPr>
+          <w:b/>
+        </w:rPr>
+        <w:t>n0416</w:t>
+      </w:r>
+      <w:r>
+        <w:t xml:space="preserve"> stamped </w:t>
+      </w:r>
+      <w:r>
+        <w:rPr>
+          <w:b/>
+        </w:rPr>
+        <w:t>91B</w:t>
+      </w:r>
+      <w:r>
+        <w:t>: Samuel W. Newman ~</w:t>
+      </w:r>
+      <w:r>
+        <w:rPr>
+          <w:b/>
+        </w:rPr>
+        <w:t>50</w:t>
+      </w:r>
+      <w:r>
+        <w:t xml:space="preserve"> + Sally + </w:t>
+      </w:r>
+      <w:r>
+        <w:rPr>
+          <w:b/>
+        </w:rPr>
+        <w:t>William 4</w:t>
+      </w:r>
+      <w:r>
+        <w:t xml:space="preserve">. *Image seen.* </w:t>
+      </w:r>
+      <w:r>
+        <w:rPr>
+          <w:b/>
+        </w:rPr>
+        <w:t>C1340 C1371</w:t>
+      </w:r>
+      <w:r>
+        <w:t xml:space="preserve"> </w:t>
+      </w:r>
+      <w:r>
+        <w:rPr>
+          <w:b/>
+        </w:rPr>
+        <w:t>S1010</w:t>
+      </w:r>
+      <w:r>
+        <w:t>.</w:t>
+      </w:r>
+    </w:p>
+    <w:p>
+      <w:r>
+        <w:t xml:space="preserve">249. [S-K Estill 1850](https://www.skcensus.com/1850-census-index-estill-county-kentucky/) NEWMAN </w:t>
+      </w:r>
+      <w:r>
+        <w:rPr>
+          <w:b/>
+        </w:rPr>
+        <w:t>85B, 91B</w:t>
+      </w:r>
+      <w:r>
+        <w:t xml:space="preserve"> only. Woods </w:t>
+      </w:r>
+      <w:r>
+        <w:rPr>
+          <w:b/>
+        </w:rPr>
+        <w:t>no Tincher</w:t>
+      </w:r>
+      <w:r>
+        <w:t xml:space="preserve">. *Index / transcription.* </w:t>
+      </w:r>
+      <w:r>
+        <w:rPr>
+          <w:b/>
+        </w:rPr>
+        <w:t>C1341</w:t>
+      </w:r>
+      <w:r>
+        <w:t xml:space="preserve"> </w:t>
+      </w:r>
+      <w:r>
+        <w:rPr>
+          <w:b/>
+        </w:rPr>
+        <w:t>S1015 S1014</w:t>
+      </w:r>
+      <w:r>
+        <w:t>.</w:t>
+      </w:r>
+    </w:p>
+    <w:p>
+      <w:r>
+        <w:t xml:space="preserve">250. 1850 U.S. census, Madison Co., KY, Richmond Dist 2 stamped </w:t>
+      </w:r>
+      <w:r>
+        <w:rPr>
+          <w:b/>
+        </w:rPr>
+        <w:t>250</w:t>
+      </w:r>
+      <w:r>
+        <w:t xml:space="preserve">. IA [`populationschedu0211unix`](https://archive.org/details/populationschedu0211unix) leaves </w:t>
+      </w:r>
+      <w:r>
+        <w:rPr>
+          <w:b/>
+        </w:rPr>
+        <w:t>n0501 / n0502</w:t>
+      </w:r>
+      <w:r>
+        <w:t xml:space="preserve">. </w:t>
+      </w:r>
+      <w:r>
+        <w:rPr>
+          <w:b/>
+        </w:rPr>
+        <w:t>67/67 T. T. Newman 34 M.D.</w:t>
+      </w:r>
+      <w:r>
+        <w:t xml:space="preserve"> *Image seen.* </w:t>
+      </w:r>
+      <w:r>
+        <w:rPr>
+          <w:b/>
+        </w:rPr>
+        <w:t>C1342 C1343 C1344</w:t>
+      </w:r>
+      <w:r>
+        <w:t xml:space="preserve"> </w:t>
+      </w:r>
+      <w:r>
+        <w:rPr>
+          <w:b/>
+        </w:rPr>
+        <w:t>S1011 S1012 S1013 S1016</w:t>
+      </w:r>
+      <w:r>
+        <w:t>.</w:t>
+      </w:r>
+    </w:p>
+    <w:p>
+      <w:r>
+        <w:t xml:space="preserve">251. Compiled 1850 negatives: [S-K Clark](https://www.skcensus.com/1850-census-index-clark-county-kentucky/) NEWKIRK / TINCHER </w:t>
+      </w:r>
+      <w:r>
+        <w:rPr>
+          <w:b/>
+        </w:rPr>
+        <w:t>91A</w:t>
+      </w:r>
+      <w:r>
+        <w:t xml:space="preserve">; Breathitt every-name nil Newman; Clay William </w:t>
+      </w:r>
+      <w:r>
+        <w:rPr>
+          <w:b/>
+        </w:rPr>
+        <w:t>42</w:t>
+      </w:r>
+      <w:r>
+        <w:t xml:space="preserve"> Tn.; Garrard NEWTON; Rockcastle NEWCOM; Perry NAPIER/NOLAND; Whitley NEWBY. *Index / transcription.* </w:t>
+      </w:r>
+      <w:r>
+        <w:rPr>
+          <w:b/>
+        </w:rPr>
+        <w:t>C1345–C1355</w:t>
+      </w:r>
+      <w:r>
+        <w:t xml:space="preserve"> </w:t>
+      </w:r>
+      <w:r>
+        <w:rPr>
+          <w:b/>
+        </w:rPr>
+        <w:t>S1017–S1024</w:t>
+      </w:r>
+      <w:r>
+        <w:t>.</w:t>
+      </w:r>
+    </w:p>
+    <w:p>
+      <w:r>
+        <w:t xml:space="preserve">252. Parents William × Rhoda still </w:t>
+      </w:r>
+      <w:r>
+        <w:rPr>
+          <w:b/>
+        </w:rPr>
+        <w:t>PROBABLE</w:t>
+      </w:r>
+      <w:r>
+        <w:t xml:space="preserve">. Couple systematically excluded from the walked 1850 counties. Lee / Jackson / Powell 1850 </w:t>
+      </w:r>
+      <w:r>
+        <w:rPr>
+          <w:b/>
+        </w:rPr>
+        <w:t>n/a</w:t>
+      </w:r>
+      <w:r>
+        <w:t xml:space="preserve">. *Analysis / catalog.* </w:t>
+      </w:r>
+      <w:r>
+        <w:rPr>
+          <w:b/>
+        </w:rPr>
+        <w:t>C1351 C1365 C1366 C1368 C1369</w:t>
+      </w:r>
+      <w:r>
+        <w:t xml:space="preserve"> </w:t>
+      </w:r>
+      <w:r>
+        <w:rPr>
+          <w:b/>
+        </w:rPr>
+        <w:t>S1025 S1026 S1030</w:t>
+      </w:r>
+      <w:r>
+        <w:t>.</w:t>
+      </w:r>
+    </w:p>
+    <w:p>
+      <w:r>
+        <w:t xml:space="preserve">253. No free June </w:t>
+      </w:r>
+      <w:r>
+        <w:rPr>
+          <w:b/>
+        </w:rPr>
+        <w:t>1958</w:t>
+      </w:r>
+      <w:r>
+        <w:t xml:space="preserve"> *Citizen*. IA Solr M1509 </w:t>
+      </w:r>
+      <w:r>
+        <w:rPr>
+          <w:b/>
+        </w:rPr>
+        <w:t>0</w:t>
+      </w:r>
+      <w:r>
+        <w:t xml:space="preserve">. FS </w:t>
+      </w:r>
+      <w:r>
+        <w:rPr>
+          <w:b/>
+        </w:rPr>
+        <w:t>1146342</w:t>
+      </w:r>
+      <w:r>
+        <w:t xml:space="preserve"> SPA. IA </w:t>
+      </w:r>
+      <w:r>
+        <w:rPr>
+          <w:b/>
+        </w:rPr>
+        <w:t>602</w:t>
+      </w:r>
+      <w:r>
+        <w:t xml:space="preserve"> still </w:t>
+      </w:r>
+      <w:r>
+        <w:rPr>
+          <w:b/>
+        </w:rPr>
+        <w:t>515</w:t>
+      </w:r>
+      <w:r>
+        <w:t xml:space="preserve">. Cert </w:t>
+      </w:r>
+      <w:r>
+        <w:rPr>
+          <w:b/>
+        </w:rPr>
+        <w:t>17762</w:t>
+      </w:r>
+      <w:r>
+        <w:t xml:space="preserve"> unread. Do not print 1966 or 1962. *Catalog.* </w:t>
+      </w:r>
+      <w:r>
+        <w:rPr>
+          <w:b/>
+        </w:rPr>
+        <w:t>C1356–C1362 C1374</w:t>
+      </w:r>
+      <w:r>
+        <w:t xml:space="preserve"> </w:t>
+      </w:r>
+      <w:r>
+        <w:rPr>
+          <w:b/>
+        </w:rPr>
+        <w:t>S1027–S1030</w:t>
+      </w:r>
+      <w:r>
+        <w:t>.</w:t>
+      </w:r>
+    </w:p>
+    <w:p>
+      <w:r>
         <w:br w:type="page"/>
       </w:r>
     </w:p>
@@ -29851,6 +30363,61 @@
     <w:p>
       <w:r>
         <w:t>| S1006 | `../sources/census/pass114-extract-2026-10-31.txt` | This session | Pass 114 extract | extract |</w:t>
+      </w:r>
+    </w:p>
+    <w:p>
+      <w:r>
+        <w:t>| S1007 | `../sources/press/loc-item-sn89051008-pass115.json` | [LOC sn89051008](https://www.loc.gov/item/sn89051008/) | digitized false; Aug 1926 on film | catalog |</w:t>
+      </w:r>
+    </w:p>
+    <w:p>
+      <w:r>
+        <w:t>| S1008 | `../sources/catalog/ia-solr-postdispatch-1926-pass115.json` | IA Solr | Post-Dispatch 1926 0 | index only |</w:t>
+      </w:r>
+    </w:p>
+    <w:p>
+      <w:r>
+        <w:t>| S1009 | `../sources/census/pass115/estill-1850-85b-david-j-newman.jpg` | [IA 1850 reel 198](https://archive.org/details/populationschedu0198unix) | Estill 85B David J reject | image seen |</w:t>
+      </w:r>
+    </w:p>
+    <w:p>
+      <w:r>
+        <w:t>| S1010 | `../sources/census/pass115/estill-1850-91b-samuel-w-newman.jpg` | [IA 1850 reel 198](https://archive.org/details/populationschedu0198unix) | Estill 91B Samuel W + William 4 | image seen |</w:t>
+      </w:r>
+    </w:p>
+    <w:p>
+      <w:r>
+        <w:t>| S1011 | `../sources/census/pass115/madison-1850-250a-richmond.jpg` | [IA 1850 reel 211](https://archive.org/details/populationschedu0211unix) | Madison 250A no Newman | image seen |</w:t>
+      </w:r>
+    </w:p>
+    <w:p>
+      <w:r>
+        <w:t>| S1012 | `../sources/census/pass115/madison-1850-250b-tt-newman.jpg` | [IA 1850 reel 211](https://archive.org/details/populationschedu0211unix) | Madison 250B T. T. M.D. | image seen |</w:t>
+      </w:r>
+    </w:p>
+    <w:p>
+      <w:r>
+        <w:t>| S1013 | `../sources/census/pass115/madison-1850-250b-hh67-newman-crop.jpg` | [IA 1850 reel 211](https://archive.org/details/populationschedu0211unix) | hh 67 crop | image seen |</w:t>
+      </w:r>
+    </w:p>
+    <w:p>
+      <w:r>
+        <w:t>| S1015 | `../sources/census/pass115/sk-estill-1850.html` | [S-K Estill](https://www.skcensus.com/1850-census-index-estill-county-kentucky/) | NEWMAN 85B, 91B | index only |</w:t>
+      </w:r>
+    </w:p>
+    <w:p>
+      <w:r>
+        <w:t>| S1016 | `../sources/census/pass115/sk-madison-1850.html` | [S-K Madison](https://www.skcensus.com/1850-census-index-madison-county-kentucky/) | NEWMAN 250B | index only |</w:t>
+      </w:r>
+    </w:p>
+    <w:p>
+      <w:r>
+        <w:t>| S1020 | `../sources/census/pass115/clay-1850-william-newman-extract.txt` | [Clay 50index](http://www.usgwarchives.net/ky/clay/census/50index.pdf) | William 42 Tn. reject | index only |</w:t>
+      </w:r>
+    </w:p>
+    <w:p>
+      <w:r>
+        <w:t>| S1030 | `../sources/census/pass115-extract-2026-10-31.txt` | This session | Pass 115 extract | extract |</w:t>
       </w:r>
     </w:p>
     <w:p>

</xml_diff>

<commit_message>
Pass 82: G-416 Louis window closed; original Colwell Loyd 10.
Co-authored-by: CatCorner22 <CatCorner22@users.noreply.github.com>
</commit_message>
<xml_diff>
--- a/research/dora-ella-newnam/book/Dora-Ella-Newnam-Stone-A-Life.docx
+++ b/research/dora-ella-newnam/book/Dora-Ella-Newnam-Stone-A-Life.docx
@@ -41,7 +41,7 @@
     </w:p>
     <w:p>
       <w:r>
-        <w:t>One hundred eighteen Cursor chats on this repository were reviewed for this volume (primary research, helpers, scans, and failed browser hunts). The original mobile session opened the case and read the Arkansas death certificate the family still holds. Later sessions recovered the 1880 childhood schedule that free transcripts had missed, walked statewide Soundex reels for 1910 and 1920, tested a Peebles third-marriage hypothesis and set it aside, and photographed NARA microfilm frames — the 1880 childhood schedule, the 1910 Kentucky Ella Miracode plates, Hardin Gray on Sturgeon sheet 13 B, the 1860 Owsley original of Silas Gray’s house with William aged thirteen, the 1850 Owsley Gray pages that are other men (Thomas, James, John, Charles), the given-name Silas plates that are other boys (Ratliff eight months, Wilson six, Phillips fifteen) and the Bowman line first read as Cyrus and then as Squire, the 1850 Estill Marcus Gray original, Breathitt’s Taulbee infant Silas and Bryant Siras, and Madison’s John Green house with Silas Green aged twenty, the 1850 Owsley Harrison Newman house with an eight-year-old Elias who is probably Dora’s father — a 1932 death extract names Henry Harrison Newnam as that father — and is not merged as proven, the 1860 Booneville original of that house under H.H. Newman with Elias aged eighteen, the 1850 William Newman house of twenty-six on the same page, the 1850 John Newman of sixty born in Tennessee who is not the 1880 John of sixty-nine, and Andrew Mays’s Giles at one month in 1850 and eleven in 1860, the 1870 Proctor original of James Brandenburg’s house, Silas Gray’s Sturgeon original, the 1880 District 59 originals of William next door to John Newnam and of Silas still in the district, the 1900 William Gray dwelling-84 crop, and the Bollinger page a sibling had labelled “Dora E. Stone,” which is Henry C. Rhodes and Dora M. of Missouri, and the 1920 Booneville, Buffalo, and Buck Creek originals with the rejected Taylor, Marcum, Magee, McIntosh, Baker, and McPherson houses, the 1910 Sturgeon Gilbert×Josie house, Lynch’s wife Laura without a Newman on the original, and the Buffalo Baker household whose Soundex card misnamed Gilbert John as Robert, the 1910 Buffalo Gilbert, John house next door to Baker, Robert H., and the Soundex Douglas card that shows the clerks indexed filmed Buffalo sheets, the 1910 Buffalo Bales house first read as Bowman, and the 1920 Bowman Henry, Jack, and Dean George originals that are other people. This volume folds those chats into one narrative. The case dossier remains the working file; this book is the public reading of it. Sibling work on Greene ED 37 through 41 is now on merged PR #26 through Pass 59; remaining Greene ED 38 B-sides, 1900 Liberty, and 1900 hh 85 are inventoried, not duplicated. Do not import their “Dora E. Stone” as this woman.</w:t>
+        <w:t>One hundred thirty-nine Cursor chats on this repository were reviewed for this volume (primary research, helpers, scans, and failed browser hunts). The original mobile session opened the case and read the Arkansas death certificate the family still holds. Later sessions recovered the 1880 childhood schedule that free transcripts had missed, walked statewide Soundex reels for 1910 and 1920, tested a Peebles third-marriage hypothesis and set it aside, and photographed NARA microfilm frames — the 1880 childhood schedule, the 1910 Kentucky Ella Miracode plates, Hardin Gray on Sturgeon sheet 13 B, the 1860 Owsley original of Silas Gray’s house with William aged thirteen, the 1850 Owsley Gray pages that are other men (Thomas, James, John, Charles), the given-name Silas plates that are other boys (Ratliff eight months, Wilson six, Phillips fifteen) and the Bowman line first read as Cyrus and then as Squire, the 1850 Estill Marcus Gray original, Breathitt’s Taulbee infant Silas and Bryant Siras, and Madison’s John Green house with Silas Green aged twenty, the 1850 Owsley Harrison Newman house with an eight-year-old Elias who is probably Dora’s father — a 1932 death extract names Henry Harrison Newnam as that father — and is not merged as proven, the 1860 Booneville original of that house under H.H. Newman with Elias aged eighteen, the 1850 William Newman house of twenty-six on the same page, the 1850 John Newman of sixty born in Tennessee who is not the 1880 John of sixty-nine, and Andrew Mays’s Giles at one month in 1850 and eleven in 1860, the 1870 Proctor original of James Brandenburg’s house, Silas Gray’s Sturgeon original, the 1880 District 59 originals of William next door to John Newnam and of Silas still in the district, the 1900 William Gray dwelling-84 crop, and the Bollinger page a sibling had labelled “Dora E. Stone,” which is Henry C. Rhodes and Dora M. of Missouri, and the 1920 Booneville, Buffalo, and Buck Creek originals with the rejected Taylor, Marcum, Magee, McIntosh, Baker, and McPherson houses, the 1910 Sturgeon Gilbert×Josie house, Lynch’s wife Laura without a Newman on the original, and the Buffalo Baker household whose Soundex card misnamed Gilbert John as Robert, the 1910 Buffalo Gilbert, John house next door to Baker, Robert H., and the Soundex Douglas card that shows the clerks indexed filmed Buffalo sheets, the 1910 Buffalo Bales house first read as Bowman, and the 1920 Bowman Henry, Jack, and Dean George originals that are other people. This volume folds those chats into one narrative. The case dossier remains the working file; this book is the public reading of it. Sibling work on Greene ED 37 through 41 is now on merged PR #26 through Pass 59; remaining Greene ED 38 B-sides, 1900 Liberty, and 1900 hh 85 are inventoried, not duplicated. Do not import their “Dora E. Stone” as this woman.</w:t>
       </w:r>
     </w:p>
     <w:p>
@@ -948,7 +948,61 @@
         <w:t>Molly</w:t>
       </w:r>
       <w:r>
-        <w:t xml:space="preserve">, eighteen. The Soundex clerk misread Edmonds as Evans. He is not the 1910 Buffalo couple. Another card writes Owsley for a John of fifty-nine with Alice, but cites volume 93, district 300, which is not an Owsley district (those are 88–94). The densified Susan given-name slot has no Evans, Susan of about thirty-nine in Owsley: the only Susans are Eubanks eighty-three in Pulaski, Eubank seventy-seven in Owen, and Effinger eighty-one in Fulton, and Evans Susie of Louisville and Lexington is another woman. Owsley death extracts for 1911–1920 have no matching John Evans decedent; a 1914 drowning indexed in a web search as Evans is John Neeley. Josephine Newnam’s about-1902 Gilbert license remains unseen in further neighbouring-county substitutes (Harlan 1900–02, Leslie 1900–01 and 1903–04, Knott Book 2A 1902–03, Madison compiled, Magoffin N, Powell volunteer notes); Rockcastle’s compiled G and N files end in 1900. Breathitt marriages are still unopened. Kentucky’s E-152 Lula given-name window — Lola through Luther — has no Evans, Lula of about fourteen in Owsley. A fourteen-year-old Lula in Carter is sister-in-law of George Parsons, not John’s daughter. The Robert window through Robey has no Evans, Robert of about eleven in Owsley as a head or as an A-2; Robert E., fifty-three, of Owsley district 89 with Margie is a different house and is not merged. The original Sturgeon sheet — district 89, sheet 9 A, line 30 — is that same Robert E. with Margie and four children; the Soundex card copies it. Kentucky’s A-156 Abner cards now close the given-name block: the clerk filed Buffalo Casey as Arch, twenty-nine; the original is Casey, thirty-two, with Sarah, and the original given name stands. Isaac W., three and a half, a grandson of Samuel Hill on Island Creek, shows the clerks indexed Owsley including A-2 cards. There is no Lewis of about fifty in Owsley on those cards; a Louis of forty-one in Lee County with Sarah is another man. The original Buffalo Lewis, fifty, with Susan is a Soundex miss. Samuel, fifty-three, of district 92 sheet 7 line 1, with Marian and grandson Chester, copies the original Samuel-and-Maria house. Remaining C-652 James leaves have no Carmack, James of about fifty in Owsley; Jacob, thirty-two, of Clay is another man. Remaining G-500 leaves run Raymond then Richard, with no Reece. The M-253 head behind the Lecy-and-Donie continuation is Daniel W. McIntosh, fifty, of Carroll, with Rosa — not the 1910 Buffalo Daniel. Floyd County G, N, and 1808–1904 compiled marriages, and a Floyd/Johnson booklet of 1816–1944, have no Josephine Newnam × Gilbert about 1902. Leftover odd John leaves through the Joseph divider have no Evans, John of about fifty-five with Susan in district 92; combined with the leftover evens, that given-name window is now image-closed for that identity. A Lee County John H. Evans, forty-six, of Beattyville, with Julia and daughters Katherine, fourteen, and Elizabeth, eleven, is another family. A Lee County John W. Evans, twenty-eight, with wife Dora, twenty-four, and daughter Anna is not this woman. The 1910 dwelling 31 house is </w:t>
+        <w:t xml:space="preserve">, eighteen. The Soundex clerk misread Edmonds as Evans. He is not the 1910 Buffalo couple. Another card writes Owsley for a John of fifty-nine with Alice, but cites volume 93, district 300, which is not an Owsley district (those are 88–94). The densified Susan given-name slot has no Evans, Susan of about thirty-nine in Owsley: the only Susans are Eubanks eighty-three in Pulaski, Eubank seventy-seven in Owen, and Effinger eighty-one in Fulton, and Evans Susie of Louisville and Lexington is another woman. Owsley death extracts for 1911–1920 have no matching John Evans decedent; a 1914 drowning indexed in a web search as Evans is John Neeley. Josephine Newnam’s about-1902 Gilbert license remains unseen in further neighbouring-county substitutes (Harlan 1900–02, Leslie 1900–01 and 1903–04, Knott Book 2A 1902–03, Madison compiled, Magoffin N, Powell volunteer notes); Rockcastle’s compiled G and N files end in 1900. Breathitt marriages are still unopened. Kentucky’s E-152 Lula given-name window — Lola through Luther — has no Evans, Lula of about fourteen in Owsley. A fourteen-year-old Lula in Carter is sister-in-law of George Parsons, not John’s daughter. The Robert window through Robey has no Evans, Robert of about eleven in Owsley as a head or as an A-2; Robert E., fifty-three, of Owsley district 89 with Margie is a different house and is not merged. The original Sturgeon sheet — district 89, sheet 9 A, line 30 — is that same Robert E. with Margie and four children; the Soundex card copies it. Kentucky’s A-156 Abner cards now close the given-name block: the clerk filed Buffalo Casey as Arch, twenty-nine; the original is Casey, thirty-two, with Sarah, and the original given name stands. Isaac W., three and a half, a grandson of Samuel Hill on Island Creek, shows the clerks indexed Owsley including A-2 cards. There is no Lewis of about fifty in Owsley on those cards; a Louis of forty-one in Lee County with Sarah is another man. The original Buffalo Lewis, fifty, with Susan is a Soundex miss. Samuel, fifty-three, of district 92 sheet 7 line 1, with Marian and grandson Chester, copies the original Samuel-and-Maria house. Remaining C-652 James leaves have no Carmack, James of about fifty in Owsley; Jacob, thirty-two, of Clay is another man. Remaining G-500 leaves run Raymond then Richard, with no Reece. The M-253 head behind the Lecy-and-Donie continuation is Daniel W. McIntosh, fifty, of Carroll, with Rosa — not the 1910 Buffalo Daniel. Floyd County G, N, and 1808–1904 compiled marriages, and a Floyd/Johnson booklet of 1816–1944, have no Josephine Newnam × Gilbert about 1902. Letcher 1902, Bell, Martin, Pike, and Rowan remaining substitutes have no Josephine Newnam × Gilbert about 1902. Kentucky’s G-416 Louis window has no Gilbert, Lewis or Louis of about sixty-seven in Owsley as a head. Loue I., sixty-nine, of Cumberland with Carey, and Louis H., nineteen, of Jefferson with Willie, are other people. The original Buffalo Gilbert Lewis, sixty-seven, remains a Soundex miss. Soundex Loyd, sixteen, of district 92 sheet 2 is original </w:t>
+      </w:r>
+      <w:r>
+        <w:rPr>
+          <w:b/>
+        </w:rPr>
+        <w:t>Gilbert, Loyd</w:t>
+      </w:r>
+      <w:r>
+        <w:t xml:space="preserve">, ten, a step-son in </w:t>
+      </w:r>
+      <w:r>
+        <w:rPr>
+          <w:b/>
+        </w:rPr>
+        <w:t>Colwell, William</w:t>
+      </w:r>
+      <w:r>
+        <w:t xml:space="preserve">’s house, with </w:t>
+      </w:r>
+      <w:r>
+        <w:rPr>
+          <w:b/>
+        </w:rPr>
+        <w:t>Douglas</w:t>
+      </w:r>
+      <w:r>
+        <w:t xml:space="preserve">, seven — the clerk’s age sixteen and line 59 yield to the original. A Baker Hubert daughter </w:t>
+      </w:r>
+      <w:r>
+        <w:rPr>
+          <w:b/>
+        </w:rPr>
+        <w:t>Dora</w:t>
+      </w:r>
+      <w:r>
+        <w:t xml:space="preserve">, twenty-one, on that same sheet is not this woman. An Owsley 1920 death extract names </w:t>
+      </w:r>
+      <w:r>
+        <w:rPr>
+          <w:b/>
+        </w:rPr>
+        <w:t>GILBERT, John</w:t>
+      </w:r>
+      <w:r>
+        <w:t xml:space="preserve">, eighty-five, born 10 July 1835 in Perry, parents Isaac Gilbert and Rebecka Gabbard — probably the 1910 dwelling 76 / 1920 father-in-law, who died after the January census. A 1913 </w:t>
+      </w:r>
+      <w:r>
+        <w:rPr>
+          <w:b/>
+        </w:rPr>
+        <w:t>GILBERT, John Robert</w:t>
+      </w:r>
+      <w:r>
+        <w:t xml:space="preserve">, seventy-two, son of Abijah, is another man. Leftover odd John leaves through the Joseph divider have no Evans, John of about fifty-five with Susan in district 92; combined with the leftover evens, that given-name window is now image-closed for that identity. A Lee County John H. Evans, forty-six, of Beattyville, with Julia and daughters Katherine, fourteen, and Elizabeth, eleven, is another family. A Lee County John W. Evans, twenty-eight, with wife Dora, twenty-four, and daughter Anna is not this woman. The 1910 dwelling 31 house is </w:t>
       </w:r>
       <w:r>
         <w:rPr>
@@ -1362,7 +1416,7 @@
         <w:t>Dara</w:t>
       </w:r>
       <w:r>
-        <w:t>, forty — the enumerator wrote an open a, not o — is another person. Kentucky’s 1920 Soundex has no Manerva or Minerva Newman card, and the Walter given-name window has no Owsley or Lee Walter with Manerva. Kentucky’s 1920 death index has no Manerva Newnam row on 28 August; the Owsley table that day is an infant Bates. Mary Ann Smallwood, born April 1842, came from the Owsley Smallwoods. The 11 July 1918 cemetery date is still unmatched in Kentucky’s civil index. [C669] [C672] [C693] [C694] [C690] [C691] [C709] [C711] [C712] [C713] [C717] [C729] [C730] [C739] [C740] [C741] [C742] [C743] [C744] [C745] [C746] [C747] [C748] [C752] [C753] [C754] [C756] [C759] [C763] [C765] [C768] [C775] [C776] [C777] [C779] [C780] [C782] [C783] [C784] [C789] [C790] [C791] [C792] [C793] [C794] [C795] [C796] [C797] [C801] [C802] [C803] [C804] [C808] [C809] [C810] [C811] [C812] [C813] [C814] [C818] [C819] [C820] [C821] [C822] [C823] [C824] [C825] [C826] [C827] [C828] [C832] [C833] [C847] [C848] [C849] [C851] [C857] [C859] [C860] [C861] [C863] [C868] [C869] [C872] [C873] [C874] [C875] [C876] [C877]</w:t>
+        <w:t>, forty — the enumerator wrote an open a, not o — is another person. Kentucky’s 1920 Soundex has no Manerva or Minerva Newman card, and the Walter given-name window has no Owsley or Lee Walter with Manerva. Kentucky’s 1920 death index has no Manerva Newnam row on 28 August; the Owsley table that day is an infant Bates. Mary Ann Smallwood, born April 1842, came from the Owsley Smallwoods. The 11 July 1918 cemetery date is still unmatched in Kentucky’s civil index. [C669] [C672] [C693] [C694] [C690] [C691] [C709] [C711] [C712] [C713] [C717] [C729] [C730] [C739] [C740] [C741] [C742] [C743] [C744] [C745] [C746] [C747] [C748] [C752] [C753] [C754] [C756] [C759] [C763] [C765] [C768] [C775] [C776] [C777] [C779] [C780] [C782] [C783] [C784] [C789] [C790] [C791] [C792] [C793] [C794] [C795] [C796] [C797] [C801] [C802] [C803] [C804] [C808] [C809] [C810] [C811] [C812] [C813] [C814] [C818] [C819] [C820] [C821] [C822] [C823] [C824] [C825] [C826] [C827] [C828] [C832] [C833] [C847] [C848] [C849] [C851] [C857] [C859] [C860] [C861] [C863] [C868] [C869] [C872] [C873] [C874] [C875] [C876] [C877] [C880] [C881] [C882] [C883] [C884] [C887] [C888]</w:t>
       </w:r>
     </w:p>
     <w:p>

</xml_diff>

<commit_message>
Pass 83: G-416 Lewis window closed; Johnson Josephine nil.
Co-authored-by: CatCorner22 <CatCorner22@users.noreply.github.com>
</commit_message>
<xml_diff>
--- a/research/dora-ella-newnam/book/Dora-Ella-Newnam-Stone-A-Life.docx
+++ b/research/dora-ella-newnam/book/Dora-Ella-Newnam-Stone-A-Life.docx
@@ -41,7 +41,7 @@
     </w:p>
     <w:p>
       <w:r>
-        <w:t>One hundred thirty-nine Cursor chats on this repository were reviewed for this volume (primary research, helpers, scans, and failed browser hunts). The original mobile session opened the case and read the Arkansas death certificate the family still holds. Later sessions recovered the 1880 childhood schedule that free transcripts had missed, walked statewide Soundex reels for 1910 and 1920, tested a Peebles third-marriage hypothesis and set it aside, and photographed NARA microfilm frames — the 1880 childhood schedule, the 1910 Kentucky Ella Miracode plates, Hardin Gray on Sturgeon sheet 13 B, the 1860 Owsley original of Silas Gray’s house with William aged thirteen, the 1850 Owsley Gray pages that are other men (Thomas, James, John, Charles), the given-name Silas plates that are other boys (Ratliff eight months, Wilson six, Phillips fifteen) and the Bowman line first read as Cyrus and then as Squire, the 1850 Estill Marcus Gray original, Breathitt’s Taulbee infant Silas and Bryant Siras, and Madison’s John Green house with Silas Green aged twenty, the 1850 Owsley Harrison Newman house with an eight-year-old Elias who is probably Dora’s father — a 1932 death extract names Henry Harrison Newnam as that father — and is not merged as proven, the 1860 Booneville original of that house under H.H. Newman with Elias aged eighteen, the 1850 William Newman house of twenty-six on the same page, the 1850 John Newman of sixty born in Tennessee who is not the 1880 John of sixty-nine, and Andrew Mays’s Giles at one month in 1850 and eleven in 1860, the 1870 Proctor original of James Brandenburg’s house, Silas Gray’s Sturgeon original, the 1880 District 59 originals of William next door to John Newnam and of Silas still in the district, the 1900 William Gray dwelling-84 crop, and the Bollinger page a sibling had labelled “Dora E. Stone,” which is Henry C. Rhodes and Dora M. of Missouri, and the 1920 Booneville, Buffalo, and Buck Creek originals with the rejected Taylor, Marcum, Magee, McIntosh, Baker, and McPherson houses, the 1910 Sturgeon Gilbert×Josie house, Lynch’s wife Laura without a Newman on the original, and the Buffalo Baker household whose Soundex card misnamed Gilbert John as Robert, the 1910 Buffalo Gilbert, John house next door to Baker, Robert H., and the Soundex Douglas card that shows the clerks indexed filmed Buffalo sheets, the 1910 Buffalo Bales house first read as Bowman, and the 1920 Bowman Henry, Jack, and Dean George originals that are other people. This volume folds those chats into one narrative. The case dossier remains the working file; this book is the public reading of it. Sibling work on Greene ED 37 through 41 is now on merged PR #26 through Pass 59; remaining Greene ED 38 B-sides, 1900 Liberty, and 1900 hh 85 are inventoried, not duplicated. Do not import their “Dora E. Stone” as this woman.</w:t>
+        <w:t>One hundred forty-one Cursor chats on this repository were reviewed for this volume (primary research, helpers, scans, and failed browser hunts). The original mobile session opened the case and read the Arkansas death certificate the family still holds. Later sessions recovered the 1880 childhood schedule that free transcripts had missed, walked statewide Soundex reels for 1910 and 1920, tested a Peebles third-marriage hypothesis and set it aside, and photographed NARA microfilm frames — the 1880 childhood schedule, the 1910 Kentucky Ella Miracode plates, Hardin Gray on Sturgeon sheet 13 B, the 1860 Owsley original of Silas Gray’s house with William aged thirteen, the 1850 Owsley Gray pages that are other men (Thomas, James, John, Charles), the given-name Silas plates that are other boys (Ratliff eight months, Wilson six, Phillips fifteen) and the Bowman line first read as Cyrus and then as Squire, the 1850 Estill Marcus Gray original, Breathitt’s Taulbee infant Silas and Bryant Siras, and Madison’s John Green house with Silas Green aged twenty, the 1850 Owsley Harrison Newman house with an eight-year-old Elias who is probably Dora’s father — a 1932 death extract names Henry Harrison Newnam as that father — and is not merged as proven, the 1860 Booneville original of that house under H.H. Newman with Elias aged eighteen, the 1850 William Newman house of twenty-six on the same page, the 1850 John Newman of sixty born in Tennessee who is not the 1880 John of sixty-nine, and Andrew Mays’s Giles at one month in 1850 and eleven in 1860, the 1870 Proctor original of James Brandenburg’s house, Silas Gray’s Sturgeon original, the 1880 District 59 originals of William next door to John Newnam and of Silas still in the district, the 1900 William Gray dwelling-84 crop, and the Bollinger page a sibling had labelled “Dora E. Stone,” which is Henry C. Rhodes and Dora M. of Missouri, and the 1920 Booneville, Buffalo, and Buck Creek originals with the rejected Taylor, Marcum, Magee, McIntosh, Baker, and McPherson houses, the 1910 Sturgeon Gilbert×Josie house, Lynch’s wife Laura without a Newman on the original, and the Buffalo Baker household whose Soundex card misnamed Gilbert John as Robert, the 1910 Buffalo Gilbert, John house next door to Baker, Robert H., and the Soundex Douglas card that shows the clerks indexed filmed Buffalo sheets, the 1910 Buffalo Bales house first read as Bowman, and the 1920 Bowman Henry, Jack, and Dean George originals that are other people. This volume folds those chats into one narrative. The case dossier remains the working file; this book is the public reading of it. Sibling work on Greene ED 37 through 41 is now on merged PR #26 through Pass 59; remaining Greene ED 38 B-sides, 1900 Liberty, and 1900 hh 85 are inventoried, not duplicated. Do not import their “Dora E. Stone” as this woman.</w:t>
       </w:r>
     </w:p>
     <w:p>
@@ -948,7 +948,7 @@
         <w:t>Molly</w:t>
       </w:r>
       <w:r>
-        <w:t xml:space="preserve">, eighteen. The Soundex clerk misread Edmonds as Evans. He is not the 1910 Buffalo couple. Another card writes Owsley for a John of fifty-nine with Alice, but cites volume 93, district 300, which is not an Owsley district (those are 88–94). The densified Susan given-name slot has no Evans, Susan of about thirty-nine in Owsley: the only Susans are Eubanks eighty-three in Pulaski, Eubank seventy-seven in Owen, and Effinger eighty-one in Fulton, and Evans Susie of Louisville and Lexington is another woman. Owsley death extracts for 1911–1920 have no matching John Evans decedent; a 1914 drowning indexed in a web search as Evans is John Neeley. Josephine Newnam’s about-1902 Gilbert license remains unseen in further neighbouring-county substitutes (Harlan 1900–02, Leslie 1900–01 and 1903–04, Knott Book 2A 1902–03, Madison compiled, Magoffin N, Powell volunteer notes); Rockcastle’s compiled G and N files end in 1900. Breathitt marriages are still unopened. Kentucky’s E-152 Lula given-name window — Lola through Luther — has no Evans, Lula of about fourteen in Owsley. A fourteen-year-old Lula in Carter is sister-in-law of George Parsons, not John’s daughter. The Robert window through Robey has no Evans, Robert of about eleven in Owsley as a head or as an A-2; Robert E., fifty-three, of Owsley district 89 with Margie is a different house and is not merged. The original Sturgeon sheet — district 89, sheet 9 A, line 30 — is that same Robert E. with Margie and four children; the Soundex card copies it. Kentucky’s A-156 Abner cards now close the given-name block: the clerk filed Buffalo Casey as Arch, twenty-nine; the original is Casey, thirty-two, with Sarah, and the original given name stands. Isaac W., three and a half, a grandson of Samuel Hill on Island Creek, shows the clerks indexed Owsley including A-2 cards. There is no Lewis of about fifty in Owsley on those cards; a Louis of forty-one in Lee County with Sarah is another man. The original Buffalo Lewis, fifty, with Susan is a Soundex miss. Samuel, fifty-three, of district 92 sheet 7 line 1, with Marian and grandson Chester, copies the original Samuel-and-Maria house. Remaining C-652 James leaves have no Carmack, James of about fifty in Owsley; Jacob, thirty-two, of Clay is another man. Remaining G-500 leaves run Raymond then Richard, with no Reece. The M-253 head behind the Lecy-and-Donie continuation is Daniel W. McIntosh, fifty, of Carroll, with Rosa — not the 1910 Buffalo Daniel. Floyd County G, N, and 1808–1904 compiled marriages, and a Floyd/Johnson booklet of 1816–1944, have no Josephine Newnam × Gilbert about 1902. Letcher 1902, Bell, Martin, Pike, and Rowan remaining substitutes have no Josephine Newnam × Gilbert about 1902. Kentucky’s G-416 Louis window has no Gilbert, Lewis or Louis of about sixty-seven in Owsley as a head. Loue I., sixty-nine, of Cumberland with Carey, and Louis H., nineteen, of Jefferson with Willie, are other people. The original Buffalo Gilbert Lewis, sixty-seven, remains a Soundex miss. Soundex Loyd, sixteen, of district 92 sheet 2 is original </w:t>
+        <w:t xml:space="preserve">, eighteen. The Soundex clerk misread Edmonds as Evans. He is not the 1910 Buffalo couple. Another card writes Owsley for a John of fifty-nine with Alice, but cites volume 93, district 300, which is not an Owsley district (those are 88–94). The densified Susan given-name slot has no Evans, Susan of about thirty-nine in Owsley: the only Susans are Eubanks eighty-three in Pulaski, Eubank seventy-seven in Owen, and Effinger eighty-one in Fulton, and Evans Susie of Louisville and Lexington is another woman. Owsley death extracts for 1911–1920 have no matching John Evans decedent; a 1914 drowning indexed in a web search as Evans is John Neeley. Josephine Newnam’s about-1902 Gilbert license remains unseen in further neighbouring-county substitutes (Harlan 1900–02, Leslie 1900–01 and 1903–04, Knott Book 2A 1902–03, Madison compiled, Magoffin N, Powell volunteer notes); Rockcastle’s compiled G and N files end in 1900. Breathitt marriages are still unopened. Kentucky’s E-152 Lula given-name window — Lola through Luther — has no Evans, Lula of about fourteen in Owsley. A fourteen-year-old Lula in Carter is sister-in-law of George Parsons, not John’s daughter. The Robert window through Robey has no Evans, Robert of about eleven in Owsley as a head or as an A-2; Robert E., fifty-three, of Owsley district 89 with Margie is a different house and is not merged. The original Sturgeon sheet — district 89, sheet 9 A, line 30 — is that same Robert E. with Margie and four children; the Soundex card copies it. Kentucky’s A-156 Abner cards now close the given-name block: the clerk filed Buffalo Casey as Arch, twenty-nine; the original is Casey, thirty-two, with Sarah, and the original given name stands. Isaac W., three and a half, a grandson of Samuel Hill on Island Creek, shows the clerks indexed Owsley including A-2 cards. There is no Lewis of about fifty in Owsley on those cards; a Louis of forty-one in Lee County with Sarah is another man. The original Buffalo Lewis, fifty, with Susan is a Soundex miss. Samuel, fifty-three, of district 92 sheet 7 line 1, with Marian and grandson Chester, copies the original Samuel-and-Maria house. Remaining C-652 James leaves have no Carmack, James of about fifty in Owsley; Jacob, thirty-two, of Clay is another man. Remaining G-500 leaves run Raymond then Richard, with no Reece. The M-253 head behind the Lecy-and-Donie continuation is Daniel W. McIntosh, fifty, of Carroll, with Rosa — not the 1910 Buffalo Daniel. Floyd County G, N, and 1808–1904 compiled marriages, and a Floyd/Johnson booklet of 1816–1944, have no Josephine Newnam × Gilbert about 1902. Letcher 1902, Bell, Martin, Pike, and Rowan remaining substitutes have no Josephine Newnam × Gilbert about 1902. Johnson County’s 1900–01, 1902, and 1903 compiled lists have no Josephine Newnam × Gilbert; a Josie Robertson who married Joseph Brown on 1 November 1900 and a Josie Sweeney who married Henry Sweeney on 20 July 1900 are other brides. Magoffin, Laurel, Whitley, Pulaski, and Clay marriage landings did not open. Kentucky’s G-416 Louis window has no Gilbert, Lewis or Louis of about sixty-seven in Owsley as a head. Loue I., sixty-nine, of Cumberland with Carey, and Louis H., nineteen, of Jefferson with Willie, are other people. The denser Lewis given-name leaves are the same nil: Lewis, fifty-five, a sister in a Harlan Napier house, and Lewis H., fifty-three, of Jefferson with Annie C., are other people. Combined with the Louis window, that given-name block is now image-closed. The original Buffalo Gilbert Lewis, sixty-seven, remains a Soundex miss. Soundex Loyd, sixteen, of district 92 sheet 2 is original </w:t>
       </w:r>
       <w:r>
         <w:rPr>
@@ -1416,7 +1416,7 @@
         <w:t>Dara</w:t>
       </w:r>
       <w:r>
-        <w:t>, forty — the enumerator wrote an open a, not o — is another person. Kentucky’s 1920 Soundex has no Manerva or Minerva Newman card, and the Walter given-name window has no Owsley or Lee Walter with Manerva. Kentucky’s 1920 death index has no Manerva Newnam row on 28 August; the Owsley table that day is an infant Bates. Mary Ann Smallwood, born April 1842, came from the Owsley Smallwoods. The 11 July 1918 cemetery date is still unmatched in Kentucky’s civil index. [C669] [C672] [C693] [C694] [C690] [C691] [C709] [C711] [C712] [C713] [C717] [C729] [C730] [C739] [C740] [C741] [C742] [C743] [C744] [C745] [C746] [C747] [C748] [C752] [C753] [C754] [C756] [C759] [C763] [C765] [C768] [C775] [C776] [C777] [C779] [C780] [C782] [C783] [C784] [C789] [C790] [C791] [C792] [C793] [C794] [C795] [C796] [C797] [C801] [C802] [C803] [C804] [C808] [C809] [C810] [C811] [C812] [C813] [C814] [C818] [C819] [C820] [C821] [C822] [C823] [C824] [C825] [C826] [C827] [C828] [C832] [C833] [C847] [C848] [C849] [C851] [C857] [C859] [C860] [C861] [C863] [C868] [C869] [C872] [C873] [C874] [C875] [C876] [C877] [C880] [C881] [C882] [C883] [C884] [C887] [C888]</w:t>
+        <w:t>, forty — the enumerator wrote an open a, not o — is another person. Kentucky’s 1920 Soundex has no Manerva or Minerva Newman card, and the Walter given-name window has no Owsley or Lee Walter with Manerva. Kentucky’s 1920 death index has no Manerva Newnam row on 28 August; the Owsley table that day is an infant Bates. Mary Ann Smallwood, born April 1842, came from the Owsley Smallwoods. The 11 July 1918 cemetery date is still unmatched in Kentucky’s civil index. [C669] [C672] [C693] [C694] [C690] [C691] [C709] [C711] [C712] [C713] [C717] [C729] [C730] [C739] [C740] [C741] [C742] [C743] [C744] [C745] [C746] [C747] [C748] [C752] [C753] [C754] [C756] [C759] [C763] [C765] [C768] [C775] [C776] [C777] [C779] [C780] [C782] [C783] [C784] [C789] [C790] [C791] [C792] [C793] [C794] [C795] [C796] [C797] [C801] [C802] [C803] [C804] [C808] [C809] [C810] [C811] [C812] [C813] [C814] [C818] [C819] [C820] [C821] [C822] [C823] [C824] [C825] [C826] [C827] [C828] [C832] [C833] [C847] [C848] [C849] [C851] [C857] [C859] [C860] [C861] [C863] [C868] [C869] [C872] [C873] [C874] [C875] [C876] [C877] [C880] [C881] [C882] [C883] [C884] [C887] [C888] [C892] [C893] [C894] [C896]</w:t>
       </w:r>
     </w:p>
     <w:p>

</xml_diff>

<commit_message>
Pass 116: isolate Clark 91A and Breathitt 20B; map 1840 Clark/Clay/Estill
Reject William Tincher 63 (Clark 91A) and Wm. Tincher 45 + Matilda (Breathitt 20B). Isolate 1840 Clark certificate, Clay start, Estill window, and Estill p.68 (nil Newman). Laurel 209 / Montgomery 214 N-surnames still unwalked. B058 still film-only.

Co-authored-by: blakereaganlaw <blakereaganlaw@gmail.com>
</commit_message>
<xml_diff>
--- a/research/dora-ella-newnam/book/Dora-Ella-Newnam-Stone-A-Life.docx
+++ b/research/dora-ella-newnam/book/Dora-Ella-Newnam-Stone-A-Life.docx
@@ -331,6 +331,11 @@
     </w:p>
     <w:p>
       <w:r>
+        <w:t>61. [Pass 116. Clark 91A and Breathitt 20B are other Tinchers](#pass-116-clark-91a-and-breathitt-20b-are-other-tinchers)</w:t>
+      </w:r>
+    </w:p>
+    <w:p>
+      <w:r>
         <w:br w:type="page"/>
       </w:r>
     </w:p>
@@ -9986,6 +9991,91 @@
       </w:r>
     </w:p>
     <w:p>
+      <w:pPr>
+        <w:pStyle w:val="Heading2"/>
+      </w:pPr>
+      <w:r>
+        <w:t>Pass 116. Clark 91A and Breathitt 20B are other Tinchers</w:t>
+      </w:r>
+    </w:p>
+    <w:p>
+      <w:r>
+        <w:t>August 1926 is still on film. The Library of Congress item for the *Dardanelle Post-Dispatch*, LCCN sn89051008, still reads `digitized: false` on three fetches this pass. Internet Archive Solr for that title in 1926 returned zero items again. Pope County Library Roll 5 is unchanged. The phone, 479-968-4368, is already recorded. [C1375] [S1031] [S1032]</w:t>
+      </w:r>
+    </w:p>
+    <w:p>
+      <w:r>
+        <w:t>Clark’s S-K Tincher page is no longer unread. Internet Archive reel `populationschedu0196unix` leaf n0606 is Clark District 1, stamped 91, 15 September 1850, Thomas McKinney assistant marshal. Household 615 is William Tincher, sixty-three, occupation none; Elizabeth Boyer, thirty-one; W. R. E. Tincher, twenty-seven, laborer; Sarah, twenty-two; Samuel, two (sex written F); Catharine Boyer, ten; William, seven; Mary A., five. Neighbors are Hiram Brumagen, Stephen B. Lewis, and Eddie Bean — the S-K 91A cluster. That is not Rhoda’s house. No Newman sits hidden under the Tincher surname on that page. District 2’s stamped 91 is a different sheet. [C1376] [C1378] [C1380] [S1033]</w:t>
+      </w:r>
+    </w:p>
+    <w:p>
+      <w:r>
+        <w:t>Breathitt’s S-K 20B is likewise an original now. Reel `populationschedu0193unix` leaf n0234 is District 1, stamped 20, 27 July 1850; the verso, n0235, is 28 July, John Hargis. Household 46 is Wm. Tincher, forty-five, farmer, five hundred dollars, born Tennessee, with Matilda, forty, also Tennessee. Household 47 is James, twenty-three; Elias, twenty-one; Joseph, sixteen; Thomas, eleven; Martha, eight. Nicholas Bowman is next door. Rejected. A later District 1 page also stamped 20 is not this sheet. [C1377] [C1379] [C1381] [S1034]</w:t>
+      </w:r>
+    </w:p>
+    <w:p>
+      <w:r>
+        <w:t xml:space="preserve">The 1840 hunt has one isolated original. Montgomery’s S-K index puts Tincher on page 295 and has no Newman — the N-block is Nelson, Northcut, and Oldham. Internet Archive reel `populationsc18400120unit` carries two leaves per stamped page. Page 295 names sit on leaf n0128; the verso is n0129. The names match the S-K companions (Barrow, Bays). One head reads John Fletcher or John Tincher — T and F slacken in that hand. The given name is </w:t>
+      </w:r>
+      <w:r>
+        <w:rPr>
+          <w:b/>
+        </w:rPr>
+        <w:t>possible</w:t>
+      </w:r>
+      <w:r>
+        <w:t xml:space="preserve"> John only. Owsley did not exist in 1840. Madison’s S-K is Newby and Newland. Laurel and Breathitt S-K pages have no Newman or Tincher. Clark, Estill, and Clay S-K slugs 404’d. Two name leaves on reel 108 were sampled; they are not a county walk. [C1382–C1389] [C1402] [S1035–S1040] [S1049]</w:t>
+      </w:r>
+    </w:p>
+    <w:p>
+      <w:r>
+        <w:t>Clark’s 1840 county end is now an original. Reel 108 leaf n0083 is the Clark County, Kentucky, certificate: ten thousand seven hundred fifty-four persons, 27 October 1840, Francis Jackson. Clay starts on n0091 — the left margin says Clay County. Three Clay name pages (n0091, n0095, n0099) were read: Johnson, Valentine, Hubbard, Maggard, Hibbard. No Newman or Tincher on those three. The county is not finished. [C1403] [C1404] [S1054] [S1055]</w:t>
+      </w:r>
+    </w:p>
+    <w:p>
+      <w:r>
+        <w:t>Estill sits on reel 109 between Daviess and Edmonson. Leaf n0097’s verso header reads Estill County. The window is about n0090–n0155. Edmonson’s certificate is n0186 (W. Edwards, 4 November 1840). Fayette is already Andrew M. McCalla and Lexington by n0202. Fishergenes hosts one Estill page — stamped 68 — with Valentine R. Ward, the Todds, Halls, and Frazier. No Newman or Tincher on that spread. Sampled Estill leaves name Witt and Parke, not Newman. The county walk is not complete. [C1405] [C1406] [C1407] [C1408] [C1409] [S1056] [S1057] [S1058]</w:t>
+      </w:r>
+    </w:p>
+    <w:p>
+      <w:r>
+        <w:t>Laurel 1850 is on reel 209. Leaf n0331 is Laurel, 1 September 1850. Every third name column from n0331 through n0391 was read: Jones, Brock, Noe, Foreman, Hensley, Roberts — no Newman or Tincher on those samples. Montgomery 1850 is on reel 214. District 1 starts near n0061; District 2, 27 July, is n0093, stamped 46. Every third name column from n0061 through n0133 was read: Thompson, Fitzgerald, Roberts, Stewart, Conley, Lawrence, Ballard — no Newman or Tincher on those samples. Both counties remain unwalked for N-surnames. Remaining name columns in those windows are now cropped. Extra samples (Laurel n0345 Jones/Jackson; n0363 Summers/Parker; Montgomery n0087 Tracey/Holley; n0111 Estep/Ingraham) still have no Newman or Tincher. Both S-K 1850 slugs 404’d. [C1392] [C1393] [C1411] [C1412] [S1041] [S1042]</w:t>
+      </w:r>
+    </w:p>
+    <w:p>
+      <w:r>
+        <w:t>No free license for William Newman and Rhoda Tincher appeared. The authored 1845 date is unused. H. H. Newman and Belinda Tincher, 27 February 1840 in Estill, stay a different couple. [C1390] [C1391] [S1043]</w:t>
+      </w:r>
+    </w:p>
+    <w:p>
+      <w:r>
+        <w:t xml:space="preserve">Parents remain </w:t>
+      </w:r>
+      <w:r>
+        <w:rPr>
+          <w:b/>
+        </w:rPr>
+        <w:t>probable</w:t>
+      </w:r>
+      <w:r>
+        <w:t>. William himself is still not on a living 1850 schedule. [C1394] [C1351]</w:t>
+      </w:r>
+    </w:p>
+    <w:p>
+      <w:r>
+        <w:t xml:space="preserve">The other film items did not move. No free June 1958 *Citizen* clip. No new M1509 card. FamilySearch 1146342 returned 404 — roadblock step 57. Internet Archive reel 602 is still 515 images. USGenNet Lee wills, live this pass, still name Jane Steele Newman, Elizabeth Newnam, and Mary F. Newnam Tincher — not Samuel P. Certificate 17762 is unread. Do not print 1966. No new deceased McCoy or Rissie row. Do not print 1962. Grant, twenty-one, is still not merged with David F. David G. of 1984 is still </w:t>
+      </w:r>
+      <w:r>
+        <w:rPr>
+          <w:b/>
+        </w:rPr>
+        <w:t>possible</w:t>
+      </w:r>
+      <w:r>
+        <w:t xml:space="preserve"> as a junior only. Living 1950-line descendants are withheld. Districts 33-12 and 33-13 were not walked. Do not re-ask Tyler Phillips, Pope 479-968-4368, or Hutchins 859-985-3364. [C1395–C1401] [S1044–S1048]</w:t>
+      </w:r>
+    </w:p>
+    <w:p>
       <w:r>
         <w:t xml:space="preserve">In Madison County in 1950 a </w:t>
       </w:r>
@@ -12893,7 +12983,7 @@
         <w:rPr>
           <w:b/>
         </w:rPr>
-        <w:t>C1338</w:t>
+        <w:t>C1375 C1414</w:t>
       </w:r>
       <w:r>
         <w:t xml:space="preserve"> — do not chase Democrat 1926 film, Journal August, Rural record 17 Jun 1926, Madison library modern PDFs, Newspapers.com Post-Dispatch, or ADNP guides), </w:t>
@@ -12905,25 +12995,16 @@
         <w:t>B071</w:t>
       </w:r>
       <w:r>
-        <w:t xml:space="preserve"> residual 1840 / Clark </w:t>
-      </w:r>
-      <w:r>
-        <w:rPr>
-          <w:b/>
-        </w:rPr>
-        <w:t>TINCHER 91A</w:t>
-      </w:r>
-      <w:r>
-        <w:t xml:space="preserve"> original / Breathitt </w:t>
-      </w:r>
-      <w:r>
-        <w:rPr>
-          <w:b/>
-        </w:rPr>
-        <w:t>TINCHER 20B</w:t>
-      </w:r>
-      <w:r>
-        <w:t xml:space="preserve"> original / Montgomery reel </w:t>
+        <w:t xml:space="preserve"> residual Laurel </w:t>
+      </w:r>
+      <w:r>
+        <w:rPr>
+          <w:b/>
+        </w:rPr>
+        <w:t>209</w:t>
+      </w:r>
+      <w:r>
+        <w:t xml:space="preserve"> / Montgomery </w:t>
       </w:r>
       <w:r>
         <w:rPr>
@@ -12932,16 +13013,16 @@
         <w:t>214</w:t>
       </w:r>
       <w:r>
-        <w:t xml:space="preserve"> / Laurel reel </w:t>
-      </w:r>
-      <w:r>
-        <w:rPr>
-          <w:b/>
-        </w:rPr>
-        <w:t>209</w:t>
-      </w:r>
-      <w:r>
-        <w:t xml:space="preserve">, </w:t>
+        <w:t xml:space="preserve"> remaining N-surname walk / 1840 Estill remaining name columns (window n0090–n0155; county start isolated </w:t>
+      </w:r>
+      <w:r>
+        <w:rPr>
+          <w:b/>
+        </w:rPr>
+        <w:t>C1407</w:t>
+      </w:r>
+      <w:r>
+        <w:t xml:space="preserve">) / 1840 Clay remaining after n0099 / 1840 Clark names n0005–n0081 not fully walked / marriage William × Rhoda, </w:t>
       </w:r>
       <w:r>
         <w:rPr>
@@ -28608,6 +28689,656 @@
     </w:p>
     <w:p>
       <w:r>
+        <w:t xml:space="preserve">254. LOC sn89051008 `digitized: false` (pass 116 / 116e / 116f). IA Solr Post-Dispatch 1926 </w:t>
+      </w:r>
+      <w:r>
+        <w:rPr>
+          <w:b/>
+        </w:rPr>
+        <w:t>0</w:t>
+      </w:r>
+      <w:r>
+        <w:t xml:space="preserve">. Film unread. [LOC item](https://www.loc.gov/item/sn89051008/). *Catalog.* </w:t>
+      </w:r>
+      <w:r>
+        <w:rPr>
+          <w:b/>
+        </w:rPr>
+        <w:t>C1375</w:t>
+      </w:r>
+      <w:r>
+        <w:t xml:space="preserve"> </w:t>
+      </w:r>
+      <w:r>
+        <w:rPr>
+          <w:b/>
+        </w:rPr>
+        <w:t>S1031 S1032</w:t>
+      </w:r>
+      <w:r>
+        <w:t>.</w:t>
+      </w:r>
+    </w:p>
+    <w:p>
+      <w:r>
+        <w:t xml:space="preserve">255. 1850 U.S. census, Clark County, Kentucky, Dist. 1, stamped </w:t>
+      </w:r>
+      <w:r>
+        <w:rPr>
+          <w:b/>
+        </w:rPr>
+        <w:t>91</w:t>
+      </w:r>
+      <w:r>
+        <w:t xml:space="preserve">, 15 Sep 1850, hh </w:t>
+      </w:r>
+      <w:r>
+        <w:rPr>
+          <w:b/>
+        </w:rPr>
+        <w:t>615</w:t>
+      </w:r>
+      <w:r>
+        <w:t xml:space="preserve">: William Tincher </w:t>
+      </w:r>
+      <w:r>
+        <w:rPr>
+          <w:b/>
+        </w:rPr>
+        <w:t>63</w:t>
+      </w:r>
+      <w:r>
+        <w:t xml:space="preserve"> + Elizabeth Boyer. NARA M432-196; IA [`populationschedu0196unix`](https://archive.org/details/populationschedu0196unix) n0606. *Image seen.* </w:t>
+      </w:r>
+      <w:r>
+        <w:rPr>
+          <w:b/>
+        </w:rPr>
+        <w:t>REJECT.</w:t>
+      </w:r>
+      <w:r>
+        <w:t xml:space="preserve"> </w:t>
+      </w:r>
+      <w:r>
+        <w:rPr>
+          <w:b/>
+        </w:rPr>
+        <w:t>C1376 C1378 C1380</w:t>
+      </w:r>
+      <w:r>
+        <w:t xml:space="preserve"> </w:t>
+      </w:r>
+      <w:r>
+        <w:rPr>
+          <w:b/>
+        </w:rPr>
+        <w:t>S1033</w:t>
+      </w:r>
+      <w:r>
+        <w:t>.</w:t>
+      </w:r>
+    </w:p>
+    <w:p>
+      <w:r>
+        <w:t xml:space="preserve">256. 1850 U.S. census, Breathitt County, Kentucky, Dist. 1, </w:t>
+      </w:r>
+      <w:r>
+        <w:rPr>
+          <w:b/>
+        </w:rPr>
+        <w:t>20B</w:t>
+      </w:r>
+      <w:r>
+        <w:t xml:space="preserve">, 27–28 Jul 1850, hh </w:t>
+      </w:r>
+      <w:r>
+        <w:rPr>
+          <w:b/>
+        </w:rPr>
+        <w:t>46</w:t>
+      </w:r>
+      <w:r>
+        <w:t xml:space="preserve">: Wm. Tincher </w:t>
+      </w:r>
+      <w:r>
+        <w:rPr>
+          <w:b/>
+        </w:rPr>
+        <w:t>45</w:t>
+      </w:r>
+      <w:r>
+        <w:t xml:space="preserve"> + Matilda, Tennessee. NARA M432-193; IA [`populationschedu0193unix`](https://archive.org/details/populationschedu0193unix) n0235. *Image seen.* </w:t>
+      </w:r>
+      <w:r>
+        <w:rPr>
+          <w:b/>
+        </w:rPr>
+        <w:t>REJECT.</w:t>
+      </w:r>
+      <w:r>
+        <w:t xml:space="preserve"> </w:t>
+      </w:r>
+      <w:r>
+        <w:rPr>
+          <w:b/>
+        </w:rPr>
+        <w:t>C1377 C1379 C1381</w:t>
+      </w:r>
+      <w:r>
+        <w:t xml:space="preserve"> </w:t>
+      </w:r>
+      <w:r>
+        <w:rPr>
+          <w:b/>
+        </w:rPr>
+        <w:t>S1034</w:t>
+      </w:r>
+      <w:r>
+        <w:t>.</w:t>
+      </w:r>
+    </w:p>
+    <w:p>
+      <w:r>
+        <w:t xml:space="preserve">257. 1840 Montgomery S-K </w:t>
+      </w:r>
+      <w:r>
+        <w:rPr>
+          <w:b/>
+        </w:rPr>
+        <w:t>TINCHER 295</w:t>
+      </w:r>
+      <w:r>
+        <w:t xml:space="preserve">; N = NELSON/NORTHCUT/OLDHAM. Original n0128 *image seen*. Given </w:t>
+      </w:r>
+      <w:r>
+        <w:rPr>
+          <w:b/>
+        </w:rPr>
+        <w:t>POSSIBLE</w:t>
+      </w:r>
+      <w:r>
+        <w:t xml:space="preserve"> John (T/F slack). [S-K Montgomery 1840](https://www.skcensus.com/1840-census-index-montgomery-county-kentucky/). IA [`populationsc18400120unit`](https://archive.org/details/populationsc18400120unit). </w:t>
+      </w:r>
+      <w:r>
+        <w:rPr>
+          <w:b/>
+        </w:rPr>
+        <w:t>C1385 C1386</w:t>
+      </w:r>
+      <w:r>
+        <w:t xml:space="preserve"> </w:t>
+      </w:r>
+      <w:r>
+        <w:rPr>
+          <w:b/>
+        </w:rPr>
+        <w:t>S1035 S1039</w:t>
+      </w:r>
+      <w:r>
+        <w:t>.</w:t>
+      </w:r>
+    </w:p>
+    <w:p>
+      <w:r>
+        <w:t xml:space="preserve">258. 1840 compiled: Madison NEWBY/NEWLAND; Laurel and Breathitt </w:t>
+      </w:r>
+      <w:r>
+        <w:rPr>
+          <w:b/>
+        </w:rPr>
+        <w:t>nil</w:t>
+      </w:r>
+      <w:r>
+        <w:t xml:space="preserve"> Newman/Tincher. Clark/Estill/Clay S-K </w:t>
+      </w:r>
+      <w:r>
+        <w:rPr>
+          <w:b/>
+        </w:rPr>
+        <w:t>404</w:t>
+      </w:r>
+      <w:r>
+        <w:t xml:space="preserve">. Owsley </w:t>
+      </w:r>
+      <w:r>
+        <w:rPr>
+          <w:b/>
+        </w:rPr>
+        <w:t>n/a</w:t>
+      </w:r>
+      <w:r>
+        <w:t xml:space="preserve">. *Index / catalog.* </w:t>
+      </w:r>
+      <w:r>
+        <w:rPr>
+          <w:b/>
+        </w:rPr>
+        <w:t>C1382–C1384 C1387–C1389 C1402</w:t>
+      </w:r>
+      <w:r>
+        <w:t xml:space="preserve"> </w:t>
+      </w:r>
+      <w:r>
+        <w:rPr>
+          <w:b/>
+        </w:rPr>
+        <w:t>S1036–S1038 S1040 S1049</w:t>
+      </w:r>
+      <w:r>
+        <w:t>.</w:t>
+      </w:r>
+    </w:p>
+    <w:p>
+      <w:r>
+        <w:t xml:space="preserve">259. Laurel 1850 reel </w:t>
+      </w:r>
+      <w:r>
+        <w:rPr>
+          <w:b/>
+        </w:rPr>
+        <w:t>209</w:t>
+      </w:r>
+      <w:r>
+        <w:t xml:space="preserve"> and Montgomery 1850 reel </w:t>
+      </w:r>
+      <w:r>
+        <w:rPr>
+          <w:b/>
+        </w:rPr>
+        <w:t>214</w:t>
+      </w:r>
+      <w:r>
+        <w:t xml:space="preserve"> sampled; N not fully walked. No free William × Rhoda license. Parents still </w:t>
+      </w:r>
+      <w:r>
+        <w:rPr>
+          <w:b/>
+        </w:rPr>
+        <w:t>PROBABLE</w:t>
+      </w:r>
+      <w:r>
+        <w:t xml:space="preserve">. *Image seen / negative.* </w:t>
+      </w:r>
+      <w:r>
+        <w:rPr>
+          <w:b/>
+        </w:rPr>
+        <w:t>C1390–C1394</w:t>
+      </w:r>
+      <w:r>
+        <w:t xml:space="preserve"> </w:t>
+      </w:r>
+      <w:r>
+        <w:rPr>
+          <w:b/>
+        </w:rPr>
+        <w:t>S1041–S1043 S1048</w:t>
+      </w:r>
+      <w:r>
+        <w:t>.</w:t>
+      </w:r>
+    </w:p>
+    <w:p>
+      <w:r>
+        <w:t xml:space="preserve">260. No free June </w:t>
+      </w:r>
+      <w:r>
+        <w:rPr>
+          <w:b/>
+        </w:rPr>
+        <w:t>1958</w:t>
+      </w:r>
+      <w:r>
+        <w:t xml:space="preserve"> *Citizen*. IA Solr M1509 </w:t>
+      </w:r>
+      <w:r>
+        <w:rPr>
+          <w:b/>
+        </w:rPr>
+        <w:t>0</w:t>
+      </w:r>
+      <w:r>
+        <w:t xml:space="preserve">. FS </w:t>
+      </w:r>
+      <w:r>
+        <w:rPr>
+          <w:b/>
+        </w:rPr>
+        <w:t>1146342</w:t>
+      </w:r>
+      <w:r>
+        <w:t xml:space="preserve"> </w:t>
+      </w:r>
+      <w:r>
+        <w:rPr>
+          <w:b/>
+        </w:rPr>
+        <w:t>404</w:t>
+      </w:r>
+      <w:r>
+        <w:t xml:space="preserve">. IA </w:t>
+      </w:r>
+      <w:r>
+        <w:rPr>
+          <w:b/>
+        </w:rPr>
+        <w:t>602</w:t>
+      </w:r>
+      <w:r>
+        <w:t xml:space="preserve"> still </w:t>
+      </w:r>
+      <w:r>
+        <w:rPr>
+          <w:b/>
+        </w:rPr>
+        <w:t>515</w:t>
+      </w:r>
+      <w:r>
+        <w:t xml:space="preserve">. USGenNet wills Jane Steele / Elizabeth / Mary F. — no Samuel P. Cert </w:t>
+      </w:r>
+      <w:r>
+        <w:rPr>
+          <w:b/>
+        </w:rPr>
+        <w:t>17762</w:t>
+      </w:r>
+      <w:r>
+        <w:t xml:space="preserve"> unread. Do not print 1966 or 1962. *Catalog.* </w:t>
+      </w:r>
+      <w:r>
+        <w:rPr>
+          <w:b/>
+        </w:rPr>
+        <w:t>C1395–C1401</w:t>
+      </w:r>
+      <w:r>
+        <w:t xml:space="preserve"> </w:t>
+      </w:r>
+      <w:r>
+        <w:rPr>
+          <w:b/>
+        </w:rPr>
+        <w:t>S1044–S1048</w:t>
+      </w:r>
+      <w:r>
+        <w:t>.</w:t>
+      </w:r>
+    </w:p>
+    <w:p>
+      <w:r>
+        <w:t xml:space="preserve">261. 1840 U.S. census, Clark County, Kentucky, county certificate. IA [`populationsc18400108unit`](https://archive.org/details/populationsc18400108unit) n0083. </w:t>
+      </w:r>
+      <w:r>
+        <w:rPr>
+          <w:b/>
+        </w:rPr>
+        <w:t>10,754</w:t>
+      </w:r>
+      <w:r>
+        <w:t xml:space="preserve"> persons; </w:t>
+      </w:r>
+      <w:r>
+        <w:rPr>
+          <w:b/>
+        </w:rPr>
+        <w:t>27 Oct 1840</w:t>
+      </w:r>
+      <w:r>
+        <w:t xml:space="preserve">; Francis Jackson. *Image seen.* </w:t>
+      </w:r>
+      <w:r>
+        <w:rPr>
+          <w:b/>
+        </w:rPr>
+        <w:t>C1403</w:t>
+      </w:r>
+      <w:r>
+        <w:t xml:space="preserve"> </w:t>
+      </w:r>
+      <w:r>
+        <w:rPr>
+          <w:b/>
+        </w:rPr>
+        <w:t>S1054</w:t>
+      </w:r>
+      <w:r>
+        <w:t>.</w:t>
+      </w:r>
+    </w:p>
+    <w:p>
+      <w:r>
+        <w:t xml:space="preserve">262. 1840 U.S. census, Clay County, Kentucky, start. Same reel n0091 left margin </w:t>
+      </w:r>
+      <w:r>
+        <w:rPr>
+          <w:b/>
+        </w:rPr>
+        <w:t>Clay County</w:t>
+      </w:r>
+      <w:r>
+        <w:t xml:space="preserve">. Sampled name pages </w:t>
+      </w:r>
+      <w:r>
+        <w:rPr>
+          <w:b/>
+        </w:rPr>
+        <w:t>nil</w:t>
+      </w:r>
+      <w:r>
+        <w:t xml:space="preserve"> Newman/Tincher. *Image seen.* </w:t>
+      </w:r>
+      <w:r>
+        <w:rPr>
+          <w:b/>
+        </w:rPr>
+        <w:t>C1404</w:t>
+      </w:r>
+      <w:r>
+        <w:t xml:space="preserve"> </w:t>
+      </w:r>
+      <w:r>
+        <w:rPr>
+          <w:b/>
+        </w:rPr>
+        <w:t>S1055</w:t>
+      </w:r>
+      <w:r>
+        <w:t>.</w:t>
+      </w:r>
+    </w:p>
+    <w:p>
+      <w:r>
+        <w:t xml:space="preserve">263. 1840 U.S. census, Edmonson County, Kentucky, certificate. IA [`populationsc18400109unit`](https://archive.org/details/populationsc18400109unit) n0186. </w:t>
+      </w:r>
+      <w:r>
+        <w:rPr>
+          <w:b/>
+        </w:rPr>
+        <w:t>W. Edwards</w:t>
+      </w:r>
+      <w:r>
+        <w:t xml:space="preserve">, 4 Nov 1840. *Image seen.* </w:t>
+      </w:r>
+      <w:r>
+        <w:rPr>
+          <w:b/>
+        </w:rPr>
+        <w:t>C1405</w:t>
+      </w:r>
+      <w:r>
+        <w:t xml:space="preserve"> </w:t>
+      </w:r>
+      <w:r>
+        <w:rPr>
+          <w:b/>
+        </w:rPr>
+        <w:t>S1056</w:t>
+      </w:r>
+      <w:r>
+        <w:t>.</w:t>
+      </w:r>
+    </w:p>
+    <w:p>
+      <w:r>
+        <w:t xml:space="preserve">264. 1840 Estill window: reel 109 n0097 header </w:t>
+      </w:r>
+      <w:r>
+        <w:rPr>
+          <w:b/>
+        </w:rPr>
+        <w:t>Estill County</w:t>
+      </w:r>
+      <w:r>
+        <w:t xml:space="preserve">. [fishergenes Estill p.68](https://fishergenes.com/documents/census/1840/KY/Estill/1840%20-%20Estill%2068.jpg) </w:t>
+      </w:r>
+      <w:r>
+        <w:rPr>
+          <w:b/>
+        </w:rPr>
+        <w:t>nil</w:t>
+      </w:r>
+      <w:r>
+        <w:t xml:space="preserve"> Newman/Tincher. County not complete. *Image seen.* </w:t>
+      </w:r>
+      <w:r>
+        <w:rPr>
+          <w:b/>
+        </w:rPr>
+        <w:t>C1407 C1408 C1409</w:t>
+      </w:r>
+      <w:r>
+        <w:t xml:space="preserve"> </w:t>
+      </w:r>
+      <w:r>
+        <w:rPr>
+          <w:b/>
+        </w:rPr>
+        <w:t>S1057 S1058</w:t>
+      </w:r>
+      <w:r>
+        <w:t>.</w:t>
+      </w:r>
+    </w:p>
+    <w:p>
+      <w:r>
+        <w:t xml:space="preserve">265. Laurel 1850 remaining name columns (leaves </w:t>
+      </w:r>
+      <w:r>
+        <w:rPr>
+          <w:b/>
+        </w:rPr>
+        <w:t>330–395</w:t>
+      </w:r>
+      <w:r>
+        <w:t xml:space="preserve">) and Montgomery 1850 remaining name columns (leaves </w:t>
+      </w:r>
+      <w:r>
+        <w:rPr>
+          <w:b/>
+        </w:rPr>
+        <w:t>60–140</w:t>
+      </w:r>
+      <w:r>
+        <w:t xml:space="preserve">) cropped; extra samples </w:t>
+      </w:r>
+      <w:r>
+        <w:rPr>
+          <w:b/>
+        </w:rPr>
+        <w:t>nil</w:t>
+      </w:r>
+      <w:r>
+        <w:t xml:space="preserve"> Newman/Tincher. N not fully walked. *Image seen.* </w:t>
+      </w:r>
+      <w:r>
+        <w:rPr>
+          <w:b/>
+        </w:rPr>
+        <w:t>C1411 C1412</w:t>
+      </w:r>
+      <w:r>
+        <w:t xml:space="preserve"> </w:t>
+      </w:r>
+      <w:r>
+        <w:rPr>
+          <w:b/>
+        </w:rPr>
+        <w:t>S1041 S1042</w:t>
+      </w:r>
+      <w:r>
+        <w:t>.</w:t>
+      </w:r>
+    </w:p>
+    <w:p>
+      <w:r>
+        <w:t xml:space="preserve">266. LOC sn89051008 still `digitized: false`. IA </w:t>
+      </w:r>
+      <w:r>
+        <w:rPr>
+          <w:b/>
+        </w:rPr>
+        <w:t>602</w:t>
+      </w:r>
+      <w:r>
+        <w:t xml:space="preserve"> still </w:t>
+      </w:r>
+      <w:r>
+        <w:rPr>
+          <w:b/>
+        </w:rPr>
+        <w:t>515</w:t>
+      </w:r>
+      <w:r>
+        <w:t xml:space="preserve">. FS </w:t>
+      </w:r>
+      <w:r>
+        <w:rPr>
+          <w:b/>
+        </w:rPr>
+        <w:t>1146342</w:t>
+      </w:r>
+      <w:r>
+        <w:t xml:space="preserve"> </w:t>
+      </w:r>
+      <w:r>
+        <w:rPr>
+          <w:b/>
+        </w:rPr>
+        <w:t>404</w:t>
+      </w:r>
+      <w:r>
+        <w:t xml:space="preserve">. Parents still </w:t>
+      </w:r>
+      <w:r>
+        <w:rPr>
+          <w:b/>
+        </w:rPr>
+        <w:t>PROBABLE</w:t>
+      </w:r>
+      <w:r>
+        <w:t xml:space="preserve">. *Catalog.* </w:t>
+      </w:r>
+      <w:r>
+        <w:rPr>
+          <w:b/>
+        </w:rPr>
+        <w:t>C1414 C1415 C1416</w:t>
+      </w:r>
+      <w:r>
+        <w:t xml:space="preserve"> </w:t>
+      </w:r>
+      <w:r>
+        <w:rPr>
+          <w:b/>
+        </w:rPr>
+        <w:t>S1050 S1060 S1061</w:t>
+      </w:r>
+      <w:r>
+        <w:t>.</w:t>
+      </w:r>
+    </w:p>
+    <w:p>
+      <w:r>
         <w:br w:type="page"/>
       </w:r>
     </w:p>
@@ -30418,6 +31149,86 @@
     <w:p>
       <w:r>
         <w:t>| S1030 | `../sources/census/pass115-extract-2026-10-31.txt` | This session | Pass 115 extract | extract |</w:t>
+      </w:r>
+    </w:p>
+    <w:p>
+      <w:r>
+        <w:t>| S1031 | `../sources/press/loc-item-sn89051008-pass116f.json` | [LOC sn89051008](https://www.loc.gov/item/sn89051008/) | digitized false ×3 this pass | catalog |</w:t>
+      </w:r>
+    </w:p>
+    <w:p>
+      <w:r>
+        <w:t>| S1032 | `../sources/catalog/ia-solr-postdispatch-1926-pass116f.json` | IA Solr | Post-Dispatch 1926 0 | index only |</w:t>
+      </w:r>
+    </w:p>
+    <w:p>
+      <w:r>
+        <w:t>| S1033 | `../sources/census/pass116/clark196/n0606-tincher-hh615-crop.jpg` | [IA 1850 reel 196](https://archive.org/details/populationschedu0196unix) | Clark 91A William Tincher 63 reject | image seen |</w:t>
+      </w:r>
+    </w:p>
+    <w:p>
+      <w:r>
+        <w:t>| S1034 | `../sources/census/pass116/breathitt193/n0235-tincher-hh46-crop.jpg` | [IA 1850 reel 193](https://archive.org/details/populationschedu0193unix) | Breathitt 20B Wm. Tincher 45 + Matilda reject | image seen |</w:t>
+      </w:r>
+    </w:p>
+    <w:p>
+      <w:r>
+        <w:t>| S1035 | `../sources/census/pass116/sk-montgomery-1840.html` | [S-K Montgomery 1840](https://www.skcensus.com/1840-census-index-montgomery-county-kentucky/) | TINCHER 295; no Newman | index only |</w:t>
+      </w:r>
+    </w:p>
+    <w:p>
+      <w:r>
+        <w:t>| S1039 | `../sources/census/pass116/ky1840-120/n0128-names-pass116f-enhance.jpg` | [IA 1840 reel 120](https://archive.org/details/populationsc18400120unit) | Montgomery 295 names | image seen |</w:t>
+      </w:r>
+    </w:p>
+    <w:p>
+      <w:r>
+        <w:t>| S1041 | `../sources/census/pass116/laurel209/n0331-header-pass116f.jpg` | [IA 1850 reel 209](https://archive.org/details/populationschedu0209unix) | Laurel 1850 header | image seen |</w:t>
+      </w:r>
+    </w:p>
+    <w:p>
+      <w:r>
+        <w:t>| S1042 | `../sources/census/pass116/mont214/n0061-header-pass116f.jpg` | [IA 1850 reel 214](https://archive.org/details/populationschedu0214unix) | Montgomery Dist 1 header | image seen |</w:t>
+      </w:r>
+    </w:p>
+    <w:p>
+      <w:r>
+        <w:t>| S1044 | `../sources/catalog/usgennet-lee-wills-pass116f.html` | [USGenNet Lee wills](https://usgennet.org/usa/ky/county/lee/wills/) | Jane Steele / Elizabeth / Mary F.; no Samuel P. | transcription only |</w:t>
+      </w:r>
+    </w:p>
+    <w:p>
+      <w:r>
+        <w:t>| S1045 | `../sources/catalog/ia-602-meta-pass116f.json` | [IA 602](https://archive.org/details/14thcensusofpopu602unit) | imagecount 515 | catalog |</w:t>
+      </w:r>
+    </w:p>
+    <w:p>
+      <w:r>
+        <w:t>| S1048 | `../sources/census/pass116-extract-2026-10-31.txt` | This session | Pass 116 extract | extract |</w:t>
+      </w:r>
+    </w:p>
+    <w:p>
+      <w:r>
+        <w:t>| S1054 | `../sources/census/pass116/ky1840-108/n0083-clark-cert-crop.jpg` | [IA 1840 reel 108](https://archive.org/details/populationsc18400108unit) | Clark 1840 certificate | image seen |</w:t>
+      </w:r>
+    </w:p>
+    <w:p>
+      <w:r>
+        <w:t>| S1055 | `../sources/census/pass116/ky1840-108/n0091-clay-names-crop.jpg` | [IA 1840 reel 108](https://archive.org/details/populationsc18400108unit) | Clay 1840 start | image seen |</w:t>
+      </w:r>
+    </w:p>
+    <w:p>
+      <w:r>
+        <w:t>| S1056 | `../sources/census/pass116/ky1840-109/n0186-edmonson-cert-crop.jpg` | [IA 1840 reel 109](https://archive.org/details/populationsc18400109unit) | Edmonson 1840 certificate | image seen |</w:t>
+      </w:r>
+    </w:p>
+    <w:p>
+      <w:r>
+        <w:t>| S1057 | `../sources/census/pass116/ky1840-109/n0097-w1100.jpg` | [IA 1840 reel 109](https://archive.org/details/populationsc18400109unit) | Estill County header | image seen |</w:t>
+      </w:r>
+    </w:p>
+    <w:p>
+      <w:r>
+        <w:t>| S1058 | `../sources/census/pass116/estill1840-fishergenes-p68-names-enhance.jpg` | [fishergenes Estill p.68](https://fishergenes.com/documents/census/1840/KY/Estill/1840%20-%20Estill%2068.jpg) | Estill p.68 names | image seen |</w:t>
       </w:r>
     </w:p>
     <w:p>

</xml_diff>

<commit_message>
Pass 84: Dean George × Martha original; Elisha/Jerry Hard Rule 6.
Co-authored-by: CatCorner22 <CatCorner22@users.noreply.github.com>
</commit_message>
<xml_diff>
--- a/research/dora-ella-newnam/book/Dora-Ella-Newnam-Stone-A-Life.docx
+++ b/research/dora-ella-newnam/book/Dora-Ella-Newnam-Stone-A-Life.docx
@@ -41,7 +41,7 @@
     </w:p>
     <w:p>
       <w:r>
-        <w:t>One hundred forty-one Cursor chats on this repository were reviewed for this volume (primary research, helpers, scans, and failed browser hunts). The original mobile session opened the case and read the Arkansas death certificate the family still holds. Later sessions recovered the 1880 childhood schedule that free transcripts had missed, walked statewide Soundex reels for 1910 and 1920, tested a Peebles third-marriage hypothesis and set it aside, and photographed NARA microfilm frames — the 1880 childhood schedule, the 1910 Kentucky Ella Miracode plates, Hardin Gray on Sturgeon sheet 13 B, the 1860 Owsley original of Silas Gray’s house with William aged thirteen, the 1850 Owsley Gray pages that are other men (Thomas, James, John, Charles), the given-name Silas plates that are other boys (Ratliff eight months, Wilson six, Phillips fifteen) and the Bowman line first read as Cyrus and then as Squire, the 1850 Estill Marcus Gray original, Breathitt’s Taulbee infant Silas and Bryant Siras, and Madison’s John Green house with Silas Green aged twenty, the 1850 Owsley Harrison Newman house with an eight-year-old Elias who is probably Dora’s father — a 1932 death extract names Henry Harrison Newnam as that father — and is not merged as proven, the 1860 Booneville original of that house under H.H. Newman with Elias aged eighteen, the 1850 William Newman house of twenty-six on the same page, the 1850 John Newman of sixty born in Tennessee who is not the 1880 John of sixty-nine, and Andrew Mays’s Giles at one month in 1850 and eleven in 1860, the 1870 Proctor original of James Brandenburg’s house, Silas Gray’s Sturgeon original, the 1880 District 59 originals of William next door to John Newnam and of Silas still in the district, the 1900 William Gray dwelling-84 crop, and the Bollinger page a sibling had labelled “Dora E. Stone,” which is Henry C. Rhodes and Dora M. of Missouri, and the 1920 Booneville, Buffalo, and Buck Creek originals with the rejected Taylor, Marcum, Magee, McIntosh, Baker, and McPherson houses, the 1910 Sturgeon Gilbert×Josie house, Lynch’s wife Laura without a Newman on the original, and the Buffalo Baker household whose Soundex card misnamed Gilbert John as Robert, the 1910 Buffalo Gilbert, John house next door to Baker, Robert H., and the Soundex Douglas card that shows the clerks indexed filmed Buffalo sheets, the 1910 Buffalo Bales house first read as Bowman, and the 1920 Bowman Henry, Jack, and Dean George originals that are other people. This volume folds those chats into one narrative. The case dossier remains the working file; this book is the public reading of it. Sibling work on Greene ED 37 through 41 is now on merged PR #26 through Pass 59; remaining Greene ED 38 B-sides, 1900 Liberty, and 1900 hh 85 are inventoried, not duplicated. Do not import their “Dora E. Stone” as this woman.</w:t>
+        <w:t>One hundred forty-one Cursor chats on this repository were reviewed for this volume (primary research, helpers, scans, and failed browser hunts). The original mobile session opened the case and read the Arkansas death certificate the family still holds. Later sessions recovered the 1880 childhood schedule that free transcripts had missed, walked statewide Soundex reels for 1910 and 1920, tested a Peebles third-marriage hypothesis and set it aside, and photographed NARA microfilm frames — the 1880 childhood schedule, the 1910 Kentucky Ella Miracode plates, Hardin Gray on Sturgeon sheet 13 B, the 1860 Owsley original of Silas Gray’s house with William aged thirteen, the 1850 Owsley Gray pages that are other men (Thomas, James, John, Charles), the given-name Silas plates that are other boys (Ratliff eight months, Wilson six, Phillips fifteen) and the Bowman line first read as Cyrus and then as Squire, the 1850 Estill Marcus Gray original, Breathitt’s Taulbee infant Silas and Bryant Siras, and Madison’s John Green house with Silas Green aged twenty, the 1850 Owsley Harrison Newman house with an eight-year-old Elias who is probably Dora’s father — a 1932 death extract names Henry Harrison Newnam as that father — and is not merged as proven, the 1860 Booneville original of that house under H.H. Newman with Elias aged eighteen, the 1850 William Newman house of twenty-six on the same page, the 1850 John Newman of sixty born in Tennessee who is not the 1880 John of sixty-nine, and Andrew Mays’s Giles at one month in 1850 and eleven in 1860, the 1870 Proctor original of James Brandenburg’s house, Silas Gray’s Sturgeon original, the 1880 District 59 originals of William next door to John Newnam and of Silas still in the district, the 1900 William Gray dwelling-84 crop, and the Bollinger page a sibling had labelled “Dora E. Stone,” which is Henry C. Rhodes and Dora M. of Missouri, and the 1920 Booneville, Buffalo, and Buck Creek originals with the rejected Taylor, Marcum, Magee, McIntosh, Baker, and McPherson houses, the 1910 Sturgeon Gilbert×Josie house, Lynch’s wife Laura without a Newman on the original, and the Buffalo Baker household whose Soundex card misnamed Gilbert John as Robert, the 1910 Buffalo Gilbert, John house next door to Baker, Robert H., and the Soundex Douglas card that shows the clerks indexed filmed Buffalo sheets, the 1910 Buffalo Bales house first read as Bowman, and the 1920 Bowman Henry, Jack, and Dean George × Jane originals that are other people, and the filmed Buffalo Dean George × Martha house that is probably the 1910 couple. This volume folds those chats into one narrative. The case dossier remains the working file; this book is the public reading of it. Sibling work on Greene ED 37 through 41 is now on merged PR #26 through Pass 59; remaining Greene ED 38 B-sides, 1900 Liberty, and 1900 hh 85 are inventoried, not duplicated. Do not import their “Dora E. Stone” as this woman.</w:t>
       </w:r>
     </w:p>
     <w:p>
@@ -687,7 +687,88 @@
         <w:t>Daniel, Linda</w:t>
       </w:r>
       <w:r>
-        <w:t xml:space="preserve">, nineteen, with infant Bessie. The given name Reece, daughter Bessie (four months to ten years), Buffalo neighbor Gay Henry, and the 1910 wife surname Daniel are the identifiers; the head surname Gaine versus Daniel, Reece aging twelve years in ten, and Linda versus Lula aging nine are disclosed and not averaged. Kentucky’s G-500 Soundex has no Reece Gaine of about thirty-six in Owsley; that miss is expected if the true surname is Daniel. The R-200 Elizabeth E-window has Rice Elizabeth, eighty-two, of Lawrence, and a seventeen-year-old Greenup sister-in-law — neither is the 1910 widow of forty-six; the Benjamin B-window has Ben A. of Pendleton, Ben H. of Mason, and Ben W. of Hancock, and no Rice Benjamin about thirty-five with Cynthia in Owsley. Ross, Ballard G., forty-six, of Owsley district </w:t>
+        <w:t xml:space="preserve">, nineteen, with infant Bessie. The given name Reece, daughter Bessie (four months to ten years), Buffalo neighbor Gay Henry, and the 1910 wife surname Daniel are the identifiers; the head surname Gaine versus Daniel, Reece aging twelve years in ten, and Linda versus Lula aging nine are disclosed and not averaged. Kentucky’s G-500 Soundex has no Reece Gaine of about thirty-six in Owsley; that miss is expected if the true surname is Daniel. Next door again, dwelling </w:t>
+      </w:r>
+      <w:r>
+        <w:rPr>
+          <w:b/>
+        </w:rPr>
+        <w:t>107</w:t>
+      </w:r>
+      <w:r>
+        <w:t xml:space="preserve">, is </w:t>
+      </w:r>
+      <w:r>
+        <w:rPr>
+          <w:b/>
+        </w:rPr>
+        <w:t>Dean, George</w:t>
+      </w:r>
+      <w:r>
+        <w:t xml:space="preserve">, about forty-three, with </w:t>
+      </w:r>
+      <w:r>
+        <w:rPr>
+          <w:b/>
+        </w:rPr>
+        <w:t>Martha</w:t>
+      </w:r>
+      <w:r>
+        <w:t xml:space="preserve">, forty, </w:t>
+      </w:r>
+      <w:r>
+        <w:rPr>
+          <w:b/>
+        </w:rPr>
+        <w:t>Mella</w:t>
+      </w:r>
+      <w:r>
+        <w:t xml:space="preserve">, seventeen, </w:t>
+      </w:r>
+      <w:r>
+        <w:rPr>
+          <w:b/>
+        </w:rPr>
+        <w:t>Lillie</w:t>
+      </w:r>
+      <w:r>
+        <w:t xml:space="preserve">, ten, </w:t>
+      </w:r>
+      <w:r>
+        <w:rPr>
+          <w:b/>
+        </w:rPr>
+        <w:t>Earl</w:t>
+      </w:r>
+      <w:r>
+        <w:t xml:space="preserve">, four, </w:t>
+      </w:r>
+      <w:r>
+        <w:rPr>
+          <w:b/>
+        </w:rPr>
+        <w:t>Odd</w:t>
+      </w:r>
+      <w:r>
+        <w:t xml:space="preserve">, twelve, and </w:t>
+      </w:r>
+      <w:r>
+        <w:rPr>
+          <w:b/>
+        </w:rPr>
+        <w:t>Hazel</w:t>
+      </w:r>
+      <w:r>
+        <w:t xml:space="preserve">, about two — probably the 1910 dwelling 29 house of George, thirty-two, and Martha, thirty, with Mellie seven and Odd three. Head age jumps eleven years in ten and is not averaged. He is not on the missing sheet 1. Kentucky’s D-500 Soundex copies that original — volume 76, district 92, sheet 6, line 93. A second Dean, George, forty-four, with Jane on sheet 5 B is another couple. Soundex “Gabbard, Elisha, forty” on sheet 2 line 33 is original </w:t>
+      </w:r>
+      <w:r>
+        <w:rPr>
+          <w:b/>
+        </w:rPr>
+        <w:t>Gilbert, Chester</w:t>
+      </w:r>
+      <w:r>
+        <w:t xml:space="preserve">, about thirty-two, with Sarah, Woodrow, and Maggie. Soundex “Baker, Jerry, forty-two” on sheet 2 line 22 is original Baker granddaughter thirteen in Lee and Lucy’s house. The R-200 Elizabeth E-window has Rice Elizabeth, eighty-two, of Lawrence, and a seventeen-year-old Greenup sister-in-law — neither is the 1910 widow of forty-six; the Benjamin B-window has Ben A. of Pendleton, Ben H. of Mason, and Ben W. of Hancock, and no Rice Benjamin about thirty-five with Cynthia in Owsley. Ross, Ballard G., forty-six, of Owsley district </w:t>
       </w:r>
       <w:r>
         <w:rPr>

</xml_diff>

<commit_message>
Pass 85: Barrett Ben every-leaf closed; Bent 24 Booneville Hard Rule 6.
Soundex B-630 2326–2424 image-closes the Ben slot. The two Barrett, Ben
heads (18 Franklin; 60 Livingston) and Booneville Bent 24 × Mary are
DISPROVED as 1910 Buffalo Ben 32. Catalog 145.

Co-authored-by: CatCorner22 <CatCorner22@users.noreply.github.com>
</commit_message>
<xml_diff>
--- a/research/dora-ella-newnam/book/Dora-Ella-Newnam-Stone-A-Life.docx
+++ b/research/dora-ella-newnam/book/Dora-Ella-Newnam-Stone-A-Life.docx
@@ -41,7 +41,7 @@
     </w:p>
     <w:p>
       <w:r>
-        <w:t>One hundred forty-one Cursor chats on this repository were reviewed for this volume (primary research, helpers, scans, and failed browser hunts). The original mobile session opened the case and read the Arkansas death certificate the family still holds. Later sessions recovered the 1880 childhood schedule that free transcripts had missed, walked statewide Soundex reels for 1910 and 1920, tested a Peebles third-marriage hypothesis and set it aside, and photographed NARA microfilm frames — the 1880 childhood schedule, the 1910 Kentucky Ella Miracode plates, Hardin Gray on Sturgeon sheet 13 B, the 1860 Owsley original of Silas Gray’s house with William aged thirteen, the 1850 Owsley Gray pages that are other men (Thomas, James, John, Charles), the given-name Silas plates that are other boys (Ratliff eight months, Wilson six, Phillips fifteen) and the Bowman line first read as Cyrus and then as Squire, the 1850 Estill Marcus Gray original, Breathitt’s Taulbee infant Silas and Bryant Siras, and Madison’s John Green house with Silas Green aged twenty, the 1850 Owsley Harrison Newman house with an eight-year-old Elias who is probably Dora’s father — a 1932 death extract names Henry Harrison Newnam as that father — and is not merged as proven, the 1860 Booneville original of that house under H.H. Newman with Elias aged eighteen, the 1850 William Newman house of twenty-six on the same page, the 1850 John Newman of sixty born in Tennessee who is not the 1880 John of sixty-nine, and Andrew Mays’s Giles at one month in 1850 and eleven in 1860, the 1870 Proctor original of James Brandenburg’s house, Silas Gray’s Sturgeon original, the 1880 District 59 originals of William next door to John Newnam and of Silas still in the district, the 1900 William Gray dwelling-84 crop, and the Bollinger page a sibling had labelled “Dora E. Stone,” which is Henry C. Rhodes and Dora M. of Missouri, and the 1920 Booneville, Buffalo, and Buck Creek originals with the rejected Taylor, Marcum, Magee, McIntosh, Baker, and McPherson houses, the 1910 Sturgeon Gilbert×Josie house, Lynch’s wife Laura without a Newman on the original, and the Buffalo Baker household whose Soundex card misnamed Gilbert John as Robert, the 1910 Buffalo Gilbert, John house next door to Baker, Robert H., and the Soundex Douglas card that shows the clerks indexed filmed Buffalo sheets, the 1910 Buffalo Bales house first read as Bowman, and the 1920 Bowman Henry, Jack, and Dean George × Jane originals that are other people, and the filmed Buffalo Dean George × Martha house that is probably the 1910 couple. This volume folds those chats into one narrative. The case dossier remains the working file; this book is the public reading of it. Sibling work on Greene ED 37 through 41 is now on merged PR #26 through Pass 59; remaining Greene ED 38 B-sides, 1900 Liberty, and 1900 hh 85 are inventoried, not duplicated. Do not import their “Dora E. Stone” as this woman.</w:t>
+        <w:t>One hundred forty-five Cursor chats on this repository were reviewed for this volume (primary research, helpers, scans, and failed browser hunts). The original mobile session opened the case and read the Arkansas death certificate the family still holds. Later sessions recovered the 1880 childhood schedule that free transcripts had missed, walked statewide Soundex reels for 1910 and 1920, tested a Peebles third-marriage hypothesis and set it aside, and photographed NARA microfilm frames — the 1880 childhood schedule, the 1910 Kentucky Ella Miracode plates, Hardin Gray on Sturgeon sheet 13 B, the 1860 Owsley original of Silas Gray’s house with William aged thirteen, the 1850 Owsley Gray pages that are other men (Thomas, James, John, Charles), the given-name Silas plates that are other boys (Ratliff eight months, Wilson six, Phillips fifteen) and the Bowman line first read as Cyrus and then as Squire, the 1850 Estill Marcus Gray original, Breathitt’s Taulbee infant Silas and Bryant Siras, and Madison’s John Green house with Silas Green aged twenty, the 1850 Owsley Harrison Newman house with an eight-year-old Elias who is probably Dora’s father — a 1932 death extract names Henry Harrison Newnam as that father — and is not merged as proven, the 1860 Booneville original of that house under H.H. Newman with Elias aged eighteen, the 1850 William Newman house of twenty-six on the same page, the 1850 John Newman of sixty born in Tennessee who is not the 1880 John of sixty-nine, and Andrew Mays’s Giles at one month in 1850 and eleven in 1860, the 1870 Proctor original of James Brandenburg’s house, Silas Gray’s Sturgeon original, the 1880 District 59 originals of William next door to John Newnam and of Silas still in the district, the 1900 William Gray dwelling-84 crop, and the Bollinger page a sibling had labelled “Dora E. Stone,” which is Henry C. Rhodes and Dora M. of Missouri, and the 1920 Booneville, Buffalo, and Buck Creek originals with the rejected Taylor, Marcum, Magee, McIntosh, Baker, and McPherson houses, the 1910 Sturgeon Gilbert×Josie house, Lynch’s wife Laura without a Newman on the original, and the Buffalo Baker household whose Soundex card misnamed Gilbert John as Robert, the 1910 Buffalo Gilbert, John house next door to Baker, Robert H., and the Soundex Douglas card that shows the clerks indexed filmed Buffalo sheets, the 1910 Buffalo Bales house first read as Bowman, and the 1920 Bowman Henry, Jack, and Dean George × Jane originals that are other people, and the filmed Buffalo Dean George × Martha house that is probably the 1910 couple, and Kentucky’s B-630 Barrett Ben given-name slot now every-leaf closed — the two Barrett, Ben heads are eighteen in Franklin and sixty in Livingston, and Owsley Barrett, Bent, twenty-four, is a Booneville house with Mary, Maybe, and Stanley, not the 1910 Buffalo Ben. This volume folds those chats into one narrative. The case dossier remains the working file; this book is the public reading of it. Sibling work on Greene ED 37 through 41 is now on merged PR #26 through Pass 59; remaining Greene ED 38 B-sides, 1900 Liberty, and 1900 hh 85 are inventoried, not duplicated. Do not import their “Dora E. Stone” as this woman.</w:t>
       </w:r>
     </w:p>
     <w:p>
@@ -849,7 +849,7 @@
         <w:t>Anna</w:t>
       </w:r>
       <w:r>
-        <w:t xml:space="preserve">, may be the 1910 Barrett, Ben; that stays possible. Sheet 7 A dwelling </w:t>
+        <w:t xml:space="preserve">, may be the 1910 Barrett, Ben; that stays possible. Kentucky’s B-630 Ben slot is now every-leaf closed: neither Barrett Ben card is that couple, and Booneville Bent, twenty-four, with Mary is another house. Sheet 7 A dwelling </w:t>
       </w:r>
       <w:r>
         <w:rPr>

</xml_diff>

<commit_message>
Pass 117: close remaining B071 N-walks; reconfirm 1926 film.
Laurel 1850, Montgomery 1850, Estill 1840 window, and Clay 1840
name columns walked nil for William × Rhoda. Parents stay probable.
Post-Dispatch still not digitized. Working Word rebuilt.

Co-authored-by: blakereaganlaw <blakereaganlaw@gmail.com>
</commit_message>
<xml_diff>
--- a/research/dora-ella-newnam/book/Dora-Ella-Newnam-Stone-A-Life.docx
+++ b/research/dora-ella-newnam/book/Dora-Ella-Newnam-Stone-A-Life.docx
@@ -336,6 +336,11 @@
     </w:p>
     <w:p>
       <w:r>
+        <w:t>62. [Pass 117. The remaining name columns are empty](#pass-117-the-remaining-name-columns-are-empty)</w:t>
+      </w:r>
+    </w:p>
+    <w:p>
+      <w:r>
         <w:br w:type="page"/>
       </w:r>
     </w:p>
@@ -10076,6 +10081,81 @@
       </w:r>
     </w:p>
     <w:p>
+      <w:pPr>
+        <w:pStyle w:val="Heading2"/>
+      </w:pPr>
+      <w:r>
+        <w:t>Pass 117. The remaining name columns are empty</w:t>
+      </w:r>
+    </w:p>
+    <w:p>
+      <w:r>
+        <w:t>August 1926 is still on film. The Library of Congress item for the *Dardanelle Post-Dispatch*, LCCN sn89051008, still reads `item.digitized: false`. Internet Archive Solr for that title in 1926 returned zero items again. Pope County Library Roll 5 is unchanged. The phone, 479-968-4368, is already recorded. [C1417] [S1062] [S1063]</w:t>
+      </w:r>
+    </w:p>
+    <w:p>
+      <w:r>
+        <w:t>Laurel 1850 is finished on reel 209. Name columns from leaf n0331 through n0381 were walked: Jones, Brock, Noe, Foreman, Hensley, Roberts, Bennett, Jackson, Lee, Weaver. Noe is not Newman. Leaf n0381 is still Laurel — 9 October 1850, D. Buford. Leaf n0382 is Lawrence: 20 July 1850, John T. Harris, assistant marshal, stamped 59. [C1418] [S1064]</w:t>
+      </w:r>
+    </w:p>
+    <w:p>
+      <w:r>
+        <w:t>Montgomery 1850 is finished on reel 214. Name columns from District 1 near n0061 through District 2 at n0171 were walked: Thompson, Fitzgerald, Roberts, Stewart, Conley, Lawrence, Ballard. Leaf n0171 is still Montgomery District 2 — 6 September 1850, Charles E. Foley, stamped 85. Leaf n0173 is Morgan: 21 July 1850, L. P. Turner. [C1419] [S1065]</w:t>
+      </w:r>
+    </w:p>
+    <w:p>
+      <w:r>
+        <w:t>Estill 1840, names on the even leaves, is finished in the isolated window. Leaves n0092 through n0144 were walked. Leaf n0138 is the fishergenes page 68 already read. Leaf n0146 is the Estill certificate: John H. Recastle, about 3 October 1840. One possible Newman sits on n0092 — Abner, given name reasonably clear, surname slack. He is not William. A Henaman on n0114 is rejected. [C1420] [C1421] [C1422] [S1066] [S1067] [S1068]</w:t>
+      </w:r>
+    </w:p>
+    <w:p>
+      <w:r>
+        <w:t>Clay 1840 after n0099 is finished. Odd name leaves through n0133 were walked. Leaf n0135 is the recapitulation of Clay County, pages 1 through 23. The next county is Clinton. No Newman or Tincher. [C1423] [S1069]</w:t>
+      </w:r>
+    </w:p>
+    <w:p>
+      <w:r>
+        <w:t>No free license for William Newman and Rhoda Tincher appeared. H. H. Newman and Belinda Tincher, 27 February 1840 in Estill, stay a different couple. [C1424]</w:t>
+      </w:r>
+    </w:p>
+    <w:p>
+      <w:r>
+        <w:t xml:space="preserve">Parents remain </w:t>
+      </w:r>
+      <w:r>
+        <w:rPr>
+          <w:b/>
+        </w:rPr>
+        <w:t>probable</w:t>
+      </w:r>
+      <w:r>
+        <w:t xml:space="preserve">. William himself is still not on a living 1850 schedule. The 1860 widow Rhoda with B. F., seven, is still </w:t>
+      </w:r>
+      <w:r>
+        <w:rPr>
+          <w:b/>
+        </w:rPr>
+        <w:t>proven</w:t>
+      </w:r>
+      <w:r>
+        <w:t>. Conflict #28 stands. [C1425]</w:t>
+      </w:r>
+    </w:p>
+    <w:p>
+      <w:r>
+        <w:t xml:space="preserve">The other film items did not move. Hutchins FAQ 9938 returned 404. No free June 1958 *Citizen* clip. No new M1509 card. FamilySearch 1146342 is still a sign-in wall — roadblock step 59. Internet Archive reel 602 is still 515 images. USGenNet Lee wills, live this pass, still name Jane Steele Newman, Elizabeth Newnam, and Mary F. Newnam Tincher — not Samuel P. Certificate 17762 is unread. Do not print 1966. No new deceased McCoy or Rissie row. Do not print 1962. Grant, twenty-one, is still not merged with David F. David G. of 1984 is still </w:t>
+      </w:r>
+      <w:r>
+        <w:rPr>
+          <w:b/>
+        </w:rPr>
+        <w:t>possible</w:t>
+      </w:r>
+      <w:r>
+        <w:t xml:space="preserve"> as a junior only. Living 1950-line descendants are withheld. Districts 33-12 and 33-13 were not walked. Do not re-ask Tyler Phillips, Pope 479-968-4368, or Hutchins 859-985-3364. [C1426–C1431] [S1070–S1076]</w:t>
+      </w:r>
+    </w:p>
+    <w:p>
       <w:r>
         <w:t xml:space="preserve">In Madison County in 1950 a </w:t>
       </w:r>
@@ -12415,6 +12495,78 @@
         <w:t>Done this increment:</w:t>
       </w:r>
       <w:r>
+        <w:t xml:space="preserve"> Laurel </w:t>
+      </w:r>
+      <w:r>
+        <w:rPr>
+          <w:b/>
+        </w:rPr>
+        <w:t>209</w:t>
+      </w:r>
+      <w:r>
+        <w:t xml:space="preserve"> / Montgomery </w:t>
+      </w:r>
+      <w:r>
+        <w:rPr>
+          <w:b/>
+        </w:rPr>
+        <w:t>214</w:t>
+      </w:r>
+      <w:r>
+        <w:t xml:space="preserve"> remaining N-walks </w:t>
+      </w:r>
+      <w:r>
+        <w:rPr>
+          <w:b/>
+        </w:rPr>
+        <w:t>CLOSED</w:t>
+      </w:r>
+      <w:r>
+        <w:t xml:space="preserve">; Estill 1840 window </w:t>
+      </w:r>
+      <w:r>
+        <w:rPr>
+          <w:b/>
+        </w:rPr>
+        <w:t>CLOSED</w:t>
+      </w:r>
+      <w:r>
+        <w:t xml:space="preserve">; Clay 1840 after n0099 </w:t>
+      </w:r>
+      <w:r>
+        <w:rPr>
+          <w:b/>
+        </w:rPr>
+        <w:t>CLOSED</w:t>
+      </w:r>
+      <w:r>
+        <w:t xml:space="preserve">. </w:t>
+      </w:r>
+      <w:r>
+        <w:rPr>
+          <w:b/>
+        </w:rPr>
+        <w:t>POSSIBLE</w:t>
+      </w:r>
+      <w:r>
+        <w:t xml:space="preserve"> Abner Newman n0092. Parents still </w:t>
+      </w:r>
+      <w:r>
+        <w:rPr>
+          <w:b/>
+        </w:rPr>
+        <w:t>PROBABLE</w:t>
+      </w:r>
+      <w:r>
+        <w:t xml:space="preserve">. </w:t>
+      </w:r>
+      <w:r>
+        <w:rPr>
+          <w:b/>
+        </w:rPr>
+        <w:t>Done earlier:</w:t>
+      </w:r>
+      <w:r>
         <w:t xml:space="preserve"> 1860 Owsley stamped </w:t>
       </w:r>
       <w:r>
@@ -12983,7 +13135,7 @@
         <w:rPr>
           <w:b/>
         </w:rPr>
-        <w:t>C1375 C1414</w:t>
+        <w:t>C1417</w:t>
       </w:r>
       <w:r>
         <w:t xml:space="preserve"> — do not chase Democrat 1926 film, Journal August, Rural record 17 Jun 1926, Madison library modern PDFs, Newspapers.com Post-Dispatch, or ADNP guides), </w:t>
@@ -12995,7 +13147,7 @@
         <w:t>B071</w:t>
       </w:r>
       <w:r>
-        <w:t xml:space="preserve"> residual Laurel </w:t>
+        <w:t xml:space="preserve"> residual 1850 couple as a living head / 1840 Clark names n0005–n0081 / marriage William × Rhoda (Laurel </w:t>
       </w:r>
       <w:r>
         <w:rPr>
@@ -13013,16 +13165,16 @@
         <w:t>214</w:t>
       </w:r>
       <w:r>
-        <w:t xml:space="preserve"> remaining N-surname walk / 1840 Estill remaining name columns (window n0090–n0155; county start isolated </w:t>
-      </w:r>
-      <w:r>
-        <w:rPr>
-          <w:b/>
-        </w:rPr>
-        <w:t>C1407</w:t>
-      </w:r>
-      <w:r>
-        <w:t xml:space="preserve">) / 1840 Clay remaining after n0099 / 1840 Clark names n0005–n0081 not fully walked / marriage William × Rhoda, </w:t>
+        <w:t xml:space="preserve"> / Estill 1840 window / Clay 1840 </w:t>
+      </w:r>
+      <w:r>
+        <w:rPr>
+          <w:b/>
+        </w:rPr>
+        <w:t>closed</w:t>
+      </w:r>
+      <w:r>
+        <w:t xml:space="preserve"> this pass), </w:t>
       </w:r>
       <w:r>
         <w:rPr>
@@ -13040,7 +13192,25 @@
         <w:t>228–229</w:t>
       </w:r>
       <w:r>
-        <w:t xml:space="preserve"> then June </w:t>
+        <w:t xml:space="preserve"> (FAQ </w:t>
+      </w:r>
+      <w:r>
+        <w:rPr>
+          <w:b/>
+        </w:rPr>
+        <w:t>9938</w:t>
+      </w:r>
+      <w:r>
+        <w:t xml:space="preserve"> now </w:t>
+      </w:r>
+      <w:r>
+        <w:rPr>
+          <w:b/>
+        </w:rPr>
+        <w:t>404</w:t>
+      </w:r>
+      <w:r>
+        <w:t xml:space="preserve">) then June </w:t>
       </w:r>
       <w:r>
         <w:rPr>
@@ -29339,6 +29509,374 @@
     </w:p>
     <w:p>
       <w:r>
+        <w:t xml:space="preserve">267. LOC [sn89051008](https://www.loc.gov/item/sn89051008/) `item.digitized: false`. IA Solr Post-Dispatch 1926 </w:t>
+      </w:r>
+      <w:r>
+        <w:rPr>
+          <w:b/>
+        </w:rPr>
+        <w:t>0</w:t>
+      </w:r>
+      <w:r>
+        <w:t xml:space="preserve">. Film unread. *Catalog.* </w:t>
+      </w:r>
+      <w:r>
+        <w:rPr>
+          <w:b/>
+        </w:rPr>
+        <w:t>C1417</w:t>
+      </w:r>
+      <w:r>
+        <w:t xml:space="preserve"> </w:t>
+      </w:r>
+      <w:r>
+        <w:rPr>
+          <w:b/>
+        </w:rPr>
+        <w:t>S1062 S1063</w:t>
+      </w:r>
+      <w:r>
+        <w:t>.</w:t>
+      </w:r>
+    </w:p>
+    <w:p>
+      <w:r>
+        <w:t xml:space="preserve">268. 1850 U.S. census, Laurel County, Kentucky. IA [`populationschedu0209unix`](https://archive.org/details/populationschedu0209unix) n0331–n0381 name columns </w:t>
+      </w:r>
+      <w:r>
+        <w:rPr>
+          <w:b/>
+        </w:rPr>
+        <w:t>visually</w:t>
+      </w:r>
+      <w:r>
+        <w:t xml:space="preserve"> read — </w:t>
+      </w:r>
+      <w:r>
+        <w:rPr>
+          <w:b/>
+        </w:rPr>
+        <w:t>nil</w:t>
+      </w:r>
+      <w:r>
+        <w:t xml:space="preserve"> Newman/Tincher. n0382 </w:t>
+      </w:r>
+      <w:r>
+        <w:rPr>
+          <w:b/>
+        </w:rPr>
+        <w:t>LAWRENCE</w:t>
+      </w:r>
+      <w:r>
+        <w:t xml:space="preserve">, 20 July 1850, John T. Harris. *Image seen.* </w:t>
+      </w:r>
+      <w:r>
+        <w:rPr>
+          <w:b/>
+        </w:rPr>
+        <w:t>C1418</w:t>
+      </w:r>
+      <w:r>
+        <w:t xml:space="preserve"> </w:t>
+      </w:r>
+      <w:r>
+        <w:rPr>
+          <w:b/>
+        </w:rPr>
+        <w:t>S1064</w:t>
+      </w:r>
+      <w:r>
+        <w:t>.</w:t>
+      </w:r>
+    </w:p>
+    <w:p>
+      <w:r>
+        <w:t xml:space="preserve">269. 1850 U.S. census, Montgomery County, Kentucky. IA [`populationschedu0214unix`](https://archive.org/details/populationschedu0214unix) n0061–n0171 name columns </w:t>
+      </w:r>
+      <w:r>
+        <w:rPr>
+          <w:b/>
+        </w:rPr>
+        <w:t>visually</w:t>
+      </w:r>
+      <w:r>
+        <w:t xml:space="preserve"> read — </w:t>
+      </w:r>
+      <w:r>
+        <w:rPr>
+          <w:b/>
+        </w:rPr>
+        <w:t>nil</w:t>
+      </w:r>
+      <w:r>
+        <w:t xml:space="preserve"> Newman/Tincher. n0173 </w:t>
+      </w:r>
+      <w:r>
+        <w:rPr>
+          <w:b/>
+        </w:rPr>
+        <w:t>MORGAN</w:t>
+      </w:r>
+      <w:r>
+        <w:t xml:space="preserve">, L. P. Turner. *Image seen.* </w:t>
+      </w:r>
+      <w:r>
+        <w:rPr>
+          <w:b/>
+        </w:rPr>
+        <w:t>C1419</w:t>
+      </w:r>
+      <w:r>
+        <w:t xml:space="preserve"> </w:t>
+      </w:r>
+      <w:r>
+        <w:rPr>
+          <w:b/>
+        </w:rPr>
+        <w:t>S1065</w:t>
+      </w:r>
+      <w:r>
+        <w:t>.</w:t>
+      </w:r>
+    </w:p>
+    <w:p>
+      <w:r>
+        <w:t xml:space="preserve">270. 1840 U.S. census, Estill County, Kentucky. IA [`populationsc18400109unit`](https://archive.org/details/populationsc18400109unit) even leaves n0092–n0144. n0146 </w:t>
+      </w:r>
+      <w:r>
+        <w:rPr>
+          <w:b/>
+        </w:rPr>
+        <w:t>John H Recastle</w:t>
+      </w:r>
+      <w:r>
+        <w:t xml:space="preserve"> certificate. </w:t>
+      </w:r>
+      <w:r>
+        <w:rPr>
+          <w:b/>
+        </w:rPr>
+        <w:t>POSSIBLE</w:t>
+      </w:r>
+      <w:r>
+        <w:t xml:space="preserve"> Abner Newman n0092 </w:t>
+      </w:r>
+      <w:r>
+        <w:rPr>
+          <w:b/>
+        </w:rPr>
+        <w:t>NOT</w:t>
+      </w:r>
+      <w:r>
+        <w:t xml:space="preserve"> William. Henaman n0114 </w:t>
+      </w:r>
+      <w:r>
+        <w:rPr>
+          <w:b/>
+        </w:rPr>
+        <w:t>REJECT</w:t>
+      </w:r>
+      <w:r>
+        <w:t xml:space="preserve">. *Image seen.* </w:t>
+      </w:r>
+      <w:r>
+        <w:rPr>
+          <w:b/>
+        </w:rPr>
+        <w:t>C1420 C1421 C1422</w:t>
+      </w:r>
+      <w:r>
+        <w:t xml:space="preserve"> </w:t>
+      </w:r>
+      <w:r>
+        <w:rPr>
+          <w:b/>
+        </w:rPr>
+        <w:t>S1066 S1067 S1068</w:t>
+      </w:r>
+      <w:r>
+        <w:t>.</w:t>
+      </w:r>
+    </w:p>
+    <w:p>
+      <w:r>
+        <w:t xml:space="preserve">271. 1840 U.S. census, Clay County, Kentucky. IA [`populationsc18400108unit`](https://archive.org/details/populationsc18400108unit) odd leaves after n0099 through n0135 Recapitulation of Clay County pages </w:t>
+      </w:r>
+      <w:r>
+        <w:rPr>
+          <w:b/>
+        </w:rPr>
+        <w:t>1–23</w:t>
+      </w:r>
+      <w:r>
+        <w:t xml:space="preserve">. *Image seen.* </w:t>
+      </w:r>
+      <w:r>
+        <w:rPr>
+          <w:b/>
+        </w:rPr>
+        <w:t>C1423</w:t>
+      </w:r>
+      <w:r>
+        <w:t xml:space="preserve"> </w:t>
+      </w:r>
+      <w:r>
+        <w:rPr>
+          <w:b/>
+        </w:rPr>
+        <w:t>S1069</w:t>
+      </w:r>
+      <w:r>
+        <w:t>.</w:t>
+      </w:r>
+    </w:p>
+    <w:p>
+      <w:r>
+        <w:t xml:space="preserve">272. No free William × Rhoda license. Parents still </w:t>
+      </w:r>
+      <w:r>
+        <w:rPr>
+          <w:b/>
+        </w:rPr>
+        <w:t>PROBABLE</w:t>
+      </w:r>
+      <w:r>
+        <w:t xml:space="preserve">. 1860 Rhoda widow + B.F. </w:t>
+      </w:r>
+      <w:r>
+        <w:rPr>
+          <w:b/>
+        </w:rPr>
+        <w:t>7</w:t>
+      </w:r>
+      <w:r>
+        <w:t xml:space="preserve"> </w:t>
+      </w:r>
+      <w:r>
+        <w:rPr>
+          <w:b/>
+        </w:rPr>
+        <w:t>PROVEN</w:t>
+      </w:r>
+      <w:r>
+        <w:t xml:space="preserve">. #28 stands. *Negative / analysis.* </w:t>
+      </w:r>
+      <w:r>
+        <w:rPr>
+          <w:b/>
+        </w:rPr>
+        <w:t>C1424 C1425</w:t>
+      </w:r>
+      <w:r>
+        <w:t xml:space="preserve"> </w:t>
+      </w:r>
+      <w:r>
+        <w:rPr>
+          <w:b/>
+        </w:rPr>
+        <w:t>S1076</w:t>
+      </w:r>
+      <w:r>
+        <w:t>.</w:t>
+      </w:r>
+    </w:p>
+    <w:p>
+      <w:r>
+        <w:t xml:space="preserve">273. No free June </w:t>
+      </w:r>
+      <w:r>
+        <w:rPr>
+          <w:b/>
+        </w:rPr>
+        <w:t>1958</w:t>
+      </w:r>
+      <w:r>
+        <w:t xml:space="preserve"> *Citizen*. FAQ </w:t>
+      </w:r>
+      <w:r>
+        <w:rPr>
+          <w:b/>
+        </w:rPr>
+        <w:t>9938</w:t>
+      </w:r>
+      <w:r>
+        <w:t xml:space="preserve"> </w:t>
+      </w:r>
+      <w:r>
+        <w:rPr>
+          <w:b/>
+        </w:rPr>
+        <w:t>404</w:t>
+      </w:r>
+      <w:r>
+        <w:t xml:space="preserve">. IA Solr M1509 </w:t>
+      </w:r>
+      <w:r>
+        <w:rPr>
+          <w:b/>
+        </w:rPr>
+        <w:t>0</w:t>
+      </w:r>
+      <w:r>
+        <w:t xml:space="preserve">. FS </w:t>
+      </w:r>
+      <w:r>
+        <w:rPr>
+          <w:b/>
+        </w:rPr>
+        <w:t>1146342</w:t>
+      </w:r>
+      <w:r>
+        <w:t xml:space="preserve"> SPA. IA </w:t>
+      </w:r>
+      <w:r>
+        <w:rPr>
+          <w:b/>
+        </w:rPr>
+        <w:t>602</w:t>
+      </w:r>
+      <w:r>
+        <w:t xml:space="preserve"> still </w:t>
+      </w:r>
+      <w:r>
+        <w:rPr>
+          <w:b/>
+        </w:rPr>
+        <w:t>515</w:t>
+      </w:r>
+      <w:r>
+        <w:t xml:space="preserve">. USGenNet wills Jane Steele / Elizabeth / Mary F. — no Samuel P. Cert </w:t>
+      </w:r>
+      <w:r>
+        <w:rPr>
+          <w:b/>
+        </w:rPr>
+        <w:t>17762</w:t>
+      </w:r>
+      <w:r>
+        <w:t xml:space="preserve"> unread. Do not print 1966 or 1962. *Catalog.* </w:t>
+      </w:r>
+      <w:r>
+        <w:rPr>
+          <w:b/>
+        </w:rPr>
+        <w:t>C1426–C1431</w:t>
+      </w:r>
+      <w:r>
+        <w:t xml:space="preserve"> </w:t>
+      </w:r>
+      <w:r>
+        <w:rPr>
+          <w:b/>
+        </w:rPr>
+        <w:t>S1070–S1075</w:t>
+      </w:r>
+      <w:r>
+        <w:t>.</w:t>
+      </w:r>
+    </w:p>
+    <w:p>
+      <w:r>
         <w:br w:type="page"/>
       </w:r>
     </w:p>
@@ -31229,6 +31767,56 @@
     <w:p>
       <w:r>
         <w:t>| S1058 | `../sources/census/pass116/estill1840-fishergenes-p68-names-enhance.jpg` | [fishergenes Estill p.68](https://fishergenes.com/documents/census/1840/KY/Estill/1840%20-%20Estill%2068.jpg) | Estill p.68 names | image seen |</w:t>
+      </w:r>
+    </w:p>
+    <w:p>
+      <w:r>
+        <w:t>| S1062 | `../sources/press/loc-item-sn89051008-pass117.json` | [LOC sn89051008](https://www.loc.gov/item/sn89051008/) | item.digitized false | catalog |</w:t>
+      </w:r>
+    </w:p>
+    <w:p>
+      <w:r>
+        <w:t>| S1064 | `../sources/census/pass117/keyplates/laurel-n0381-header.jpg` | [IA 1850 reel 209](https://archive.org/details/populationschedu0209unix) | Laurel ends; Lawrence begins | image seen |</w:t>
+      </w:r>
+    </w:p>
+    <w:p>
+      <w:r>
+        <w:t>| S1065 | `../sources/census/pass117/keyplates/mont-n0171-header.jpg` | [IA 1850 reel 214](https://archive.org/details/populationschedu0214unix) | Montgomery ends; Morgan begins | image seen |</w:t>
+      </w:r>
+    </w:p>
+    <w:p>
+      <w:r>
+        <w:t>| S1066 | `../sources/census/pass117/keyplates/estill1840-n0146-cert.jpg` | [IA 1840 reel 109](https://archive.org/details/populationsc18400109unit) | Estill Recastle certificate | image seen |</w:t>
+      </w:r>
+    </w:p>
+    <w:p>
+      <w:r>
+        <w:t>| S1067 | `../sources/census/pass117/estill1840/crops/n0092-abner-tight0.jpg` | [IA 1840 reel 109](https://archive.org/details/populationsc18400109unit) | POSSIBLE Abner Newman | image seen |</w:t>
+      </w:r>
+    </w:p>
+    <w:p>
+      <w:r>
+        <w:t>| S1068 | `../sources/census/pass117/estill1840/crops/n0114-henaman-tight.jpg` | [IA 1840 reel 109](https://archive.org/details/populationsc18400109unit) | Henaman reject | image seen |</w:t>
+      </w:r>
+    </w:p>
+    <w:p>
+      <w:r>
+        <w:t>| S1069 | `../sources/census/pass117/keyplates/clay1840-n0135-recap.jpg` | [IA 1840 reel 108](https://archive.org/details/populationsc18400108unit) | Clay recapitulation | image seen |</w:t>
+      </w:r>
+    </w:p>
+    <w:p>
+      <w:r>
+        <w:t>| S1070 | `../sources/catalog/usgennet-lee-wills-pass117.html` | [USGenNet Lee wills](https://usgennet.org/usa/ky/county/lee/wills/) | Jane Steele / Elizabeth / Mary F.; no Samuel P. | transcription only |</w:t>
+      </w:r>
+    </w:p>
+    <w:p>
+      <w:r>
+        <w:t>| S1071 | `../sources/catalog/ia-602-meta-pass117.json` | [IA 602](https://archive.org/details/14thcensusofpopu602unit) | imagecount 515 | catalog |</w:t>
+      </w:r>
+    </w:p>
+    <w:p>
+      <w:r>
+        <w:t>| S1076 | `../sources/census/pass117-extract-2026-10-31.txt` | This session | Pass 117 extract | extract |</w:t>
       </w:r>
     </w:p>
     <w:p>

</xml_diff>

<commit_message>
Pass 86: Barrett Bruce Soundex 2451 copies original dw 115.
Every-leaf B-630 2425–2480 image-closed. Lottie corrected; Billy 22 is dw 116, not merged. Board Bruce 40 Muhlenberg disproved. C819 stays POSSIBLE vs 1910 Ben.

Co-authored-by: CatCorner22 <CatCorner22@users.noreply.github.com>
</commit_message>
<xml_diff>
--- a/research/dora-ella-newnam/book/Dora-Ella-Newnam-Stone-A-Life.docx
+++ b/research/dora-ella-newnam/book/Dora-Ella-Newnam-Stone-A-Life.docx
@@ -41,7 +41,7 @@
     </w:p>
     <w:p>
       <w:r>
-        <w:t>One hundred forty-five Cursor chats on this repository were reviewed for this volume (primary research, helpers, scans, and failed browser hunts). The original mobile session opened the case and read the Arkansas death certificate the family still holds. Later sessions recovered the 1880 childhood schedule that free transcripts had missed, walked statewide Soundex reels for 1910 and 1920, tested a Peebles third-marriage hypothesis and set it aside, and photographed NARA microfilm frames — the 1880 childhood schedule, the 1910 Kentucky Ella Miracode plates, Hardin Gray on Sturgeon sheet 13 B, the 1860 Owsley original of Silas Gray’s house with William aged thirteen, the 1850 Owsley Gray pages that are other men (Thomas, James, John, Charles), the given-name Silas plates that are other boys (Ratliff eight months, Wilson six, Phillips fifteen) and the Bowman line first read as Cyrus and then as Squire, the 1850 Estill Marcus Gray original, Breathitt’s Taulbee infant Silas and Bryant Siras, and Madison’s John Green house with Silas Green aged twenty, the 1850 Owsley Harrison Newman house with an eight-year-old Elias who is probably Dora’s father — a 1932 death extract names Henry Harrison Newnam as that father — and is not merged as proven, the 1860 Booneville original of that house under H.H. Newman with Elias aged eighteen, the 1850 William Newman house of twenty-six on the same page, the 1850 John Newman of sixty born in Tennessee who is not the 1880 John of sixty-nine, and Andrew Mays’s Giles at one month in 1850 and eleven in 1860, the 1870 Proctor original of James Brandenburg’s house, Silas Gray’s Sturgeon original, the 1880 District 59 originals of William next door to John Newnam and of Silas still in the district, the 1900 William Gray dwelling-84 crop, and the Bollinger page a sibling had labelled “Dora E. Stone,” which is Henry C. Rhodes and Dora M. of Missouri, and the 1920 Booneville, Buffalo, and Buck Creek originals with the rejected Taylor, Marcum, Magee, McIntosh, Baker, and McPherson houses, the 1910 Sturgeon Gilbert×Josie house, Lynch’s wife Laura without a Newman on the original, and the Buffalo Baker household whose Soundex card misnamed Gilbert John as Robert, the 1910 Buffalo Gilbert, John house next door to Baker, Robert H., and the Soundex Douglas card that shows the clerks indexed filmed Buffalo sheets, the 1910 Buffalo Bales house first read as Bowman, and the 1920 Bowman Henry, Jack, and Dean George × Jane originals that are other people, and the filmed Buffalo Dean George × Martha house that is probably the 1910 couple, and Kentucky’s B-630 Barrett Ben given-name slot now every-leaf closed — the two Barrett, Ben heads are eighteen in Franklin and sixty in Livingston, and Owsley Barrett, Bent, twenty-four, is a Booneville house with Mary, Maybe, and Stanley, not the 1910 Buffalo Ben. This volume folds those chats into one narrative. The case dossier remains the working file; this book is the public reading of it. Sibling work on Greene ED 37 through 41 is now on merged PR #26 through Pass 59; remaining Greene ED 38 B-sides, 1900 Liberty, and 1900 hh 85 are inventoried, not duplicated. Do not import their “Dora E. Stone” as this woman.</w:t>
+        <w:t>One hundred forty-six Cursor chats on this repository were reviewed for this volume (primary research, helpers, scans, and failed browser hunts). The original mobile session opened the case and read the Arkansas death certificate the family still holds. Later sessions recovered the 1880 childhood schedule that free transcripts had missed, walked statewide Soundex reels for 1910 and 1920, tested a Peebles third-marriage hypothesis and set it aside, and photographed NARA microfilm frames — the 1880 childhood schedule, the 1910 Kentucky Ella Miracode plates, Hardin Gray on Sturgeon sheet 13 B, the 1860 Owsley original of Silas Gray’s house with William aged thirteen, the 1850 Owsley Gray pages that are other men (Thomas, James, John, Charles), the given-name Silas plates that are other boys (Ratliff eight months, Wilson six, Phillips fifteen) and the Bowman line first read as Cyrus and then as Squire, the 1850 Estill Marcus Gray original, Breathitt’s Taulbee infant Silas and Bryant Siras, and Madison’s John Green house with Silas Green aged twenty, the 1850 Owsley Harrison Newman house with an eight-year-old Elias who is probably Dora’s father — a 1932 death extract names Henry Harrison Newnam as that father — and is not merged as proven, the 1860 Booneville original of that house under H.H. Newman with Elias aged eighteen, the 1850 William Newman house of twenty-six on the same page, the 1850 John Newman of sixty born in Tennessee who is not the 1880 John of sixty-nine, and Andrew Mays’s Giles at one month in 1850 and eleven in 1860, the 1870 Proctor original of James Brandenburg’s house, Silas Gray’s Sturgeon original, the 1880 District 59 originals of William next door to John Newnam and of Silas still in the district, the 1900 William Gray dwelling-84 crop, and the Bollinger page a sibling had labelled “Dora E. Stone,” which is Henry C. Rhodes and Dora M. of Missouri, and the 1920 Booneville, Buffalo, and Buck Creek originals with the rejected Taylor, Marcum, Magee, McIntosh, Baker, and McPherson houses, the 1910 Sturgeon Gilbert×Josie house, Lynch’s wife Laura without a Newman on the original, and the Buffalo Baker household whose Soundex card misnamed Gilbert John as Robert, the 1910 Buffalo Gilbert, John house next door to Baker, Robert H., and the Soundex Douglas card that shows the clerks indexed filmed Buffalo sheets, the 1910 Buffalo Bales house first read as Bowman, and the 1920 Bowman Henry, Jack, and Dean George × Jane originals that are other people, and the filmed Buffalo Dean George × Martha house that is probably the 1910 couple, and Kentucky’s B-630 Barrett Ben given-name slot now every-leaf closed — the two Barrett, Ben heads are eighteen in Franklin and sixty in Livingston, and Owsley Barrett, Bent, twenty-four, is a Booneville house with Mary, Maybe, and Stanley, not the 1910 Buffalo Ben — and Kentucky’s B-630 Barrett Bruce given-name slot now every-leaf closed as well: card 2451 copies the original Buffalo Bruce house, Billy twenty-two is the next dwelling, and Board Bruce of Muhlenberg is another man. This volume folds those chats into one narrative. The case dossier remains the working file; this book is the public reading of it. Sibling work on Greene ED 37 through 41 is now on merged PR #26 through Pass 59; remaining Greene ED 38 B-sides, 1900 Liberty, and 1900 hh 85 are inventoried, not duplicated. Do not import their “Dora E. Stone” as this woman.</w:t>
       </w:r>
     </w:p>
     <w:p>
@@ -849,7 +849,7 @@
         <w:t>Anna</w:t>
       </w:r>
       <w:r>
-        <w:t xml:space="preserve">, may be the 1910 Barrett, Ben; that stays possible. Kentucky’s B-630 Ben slot is now every-leaf closed: neither Barrett Ben card is that couple, and Booneville Bent, twenty-four, with Mary is another house. Sheet 7 A dwelling </w:t>
+        <w:t xml:space="preserve">, may be the 1910 Barrett, Ben; that stays possible. Kentucky’s Soundex B-630 now copies that original — card 2451, Owsley district 92 sheet 6 line 40, with continuation Lotty — so Bruce is no longer a Soundex miss. Pass 76’s “Sallie” daughter is Lottie. Barrett, Billy, twenty-two, is the next house, dwelling 116, and is not merged. Board, Bruce, forty, of Muhlenberg is another man. Kentucky’s B-630 Ben slot is now every-leaf closed: neither Barrett Ben card is that couple, and Booneville Bent, twenty-four, with Mary is another house. The Bruce given-name slot 2425–2480 is likewise image-closed. Sheet 7 A dwelling </w:t>
       </w:r>
       <w:r>
         <w:rPr>

</xml_diff>

<commit_message>
Pass 87: Barrett John Soundex closed; Beard 71 Island Creek Hard Rule 6.
Every-leaf B-630 3540–3780 is image-closed: nil Barrett, John ~75 as an
Owsley ED 92 head. Madison 71 / Lee 56 / remaining Barrett Johns disproved.
Soundex 3632 copies original ED 90 Beard, John (not 1910 Barrett John).
Catalog 149. B063 remains open.

Co-authored-by: CatCorner22 <CatCorner22@users.noreply.github.com>
</commit_message>
<xml_diff>
--- a/research/dora-ella-newnam/book/Dora-Ella-Newnam-Stone-A-Life.docx
+++ b/research/dora-ella-newnam/book/Dora-Ella-Newnam-Stone-A-Life.docx
@@ -41,7 +41,7 @@
     </w:p>
     <w:p>
       <w:r>
-        <w:t>One hundred forty-six Cursor chats on this repository were reviewed for this volume (primary research, helpers, scans, and failed browser hunts). The original mobile session opened the case and read the Arkansas death certificate the family still holds. Later sessions recovered the 1880 childhood schedule that free transcripts had missed, walked statewide Soundex reels for 1910 and 1920, tested a Peebles third-marriage hypothesis and set it aside, and photographed NARA microfilm frames — the 1880 childhood schedule, the 1910 Kentucky Ella Miracode plates, Hardin Gray on Sturgeon sheet 13 B, the 1860 Owsley original of Silas Gray’s house with William aged thirteen, the 1850 Owsley Gray pages that are other men (Thomas, James, John, Charles), the given-name Silas plates that are other boys (Ratliff eight months, Wilson six, Phillips fifteen) and the Bowman line first read as Cyrus and then as Squire, the 1850 Estill Marcus Gray original, Breathitt’s Taulbee infant Silas and Bryant Siras, and Madison’s John Green house with Silas Green aged twenty, the 1850 Owsley Harrison Newman house with an eight-year-old Elias who is probably Dora’s father — a 1932 death extract names Henry Harrison Newnam as that father — and is not merged as proven, the 1860 Booneville original of that house under H.H. Newman with Elias aged eighteen, the 1850 William Newman house of twenty-six on the same page, the 1850 John Newman of sixty born in Tennessee who is not the 1880 John of sixty-nine, and Andrew Mays’s Giles at one month in 1850 and eleven in 1860, the 1870 Proctor original of James Brandenburg’s house, Silas Gray’s Sturgeon original, the 1880 District 59 originals of William next door to John Newnam and of Silas still in the district, the 1900 William Gray dwelling-84 crop, and the Bollinger page a sibling had labelled “Dora E. Stone,” which is Henry C. Rhodes and Dora M. of Missouri, and the 1920 Booneville, Buffalo, and Buck Creek originals with the rejected Taylor, Marcum, Magee, McIntosh, Baker, and McPherson houses, the 1910 Sturgeon Gilbert×Josie house, Lynch’s wife Laura without a Newman on the original, and the Buffalo Baker household whose Soundex card misnamed Gilbert John as Robert, the 1910 Buffalo Gilbert, John house next door to Baker, Robert H., and the Soundex Douglas card that shows the clerks indexed filmed Buffalo sheets, the 1910 Buffalo Bales house first read as Bowman, and the 1920 Bowman Henry, Jack, and Dean George × Jane originals that are other people, and the filmed Buffalo Dean George × Martha house that is probably the 1910 couple, and Kentucky’s B-630 Barrett Ben given-name slot now every-leaf closed — the two Barrett, Ben heads are eighteen in Franklin and sixty in Livingston, and Owsley Barrett, Bent, twenty-four, is a Booneville house with Mary, Maybe, and Stanley, not the 1910 Buffalo Ben — and Kentucky’s B-630 Barrett Bruce given-name slot now every-leaf closed as well: card 2451 copies the original Buffalo Bruce house, Billy twenty-two is the next dwelling, and Board Bruce of Muhlenberg is another man. This volume folds those chats into one narrative. The case dossier remains the working file; this book is the public reading of it. Sibling work on Greene ED 37 through 41 is now on merged PR #26 through Pass 59; remaining Greene ED 38 B-sides, 1900 Liberty, and 1900 hh 85 are inventoried, not duplicated. Do not import their “Dora E. Stone” as this woman.</w:t>
+        <w:t>One hundred forty-nine Cursor chats on this repository were reviewed for this volume (primary research, helpers, scans, and failed browser hunts). The original mobile session opened the case and read the Arkansas death certificate the family still holds. Later sessions recovered the 1880 childhood schedule that free transcripts had missed, walked statewide Soundex reels for 1910 and 1920, tested a Peebles third-marriage hypothesis and set it aside, and photographed NARA microfilm frames — the 1880 childhood schedule, the 1910 Kentucky Ella Miracode plates, Hardin Gray on Sturgeon sheet 13 B, the 1860 Owsley original of Silas Gray’s house with William aged thirteen, the 1850 Owsley Gray pages that are other men (Thomas, James, John, Charles), the given-name Silas plates that are other boys (Ratliff eight months, Wilson six, Phillips fifteen) and the Bowman line first read as Cyrus and then as Squire, the 1850 Estill Marcus Gray original, Breathitt’s Taulbee infant Silas and Bryant Siras, and Madison’s John Green house with Silas Green aged twenty, the 1850 Owsley Harrison Newman house with an eight-year-old Elias who is probably Dora’s father — a 1932 death extract names Henry Harrison Newnam as that father — and is not merged as proven, the 1860 Booneville original of that house under H.H. Newman with Elias aged eighteen, the 1850 William Newman house of twenty-six on the same page, the 1850 John Newman of sixty born in Tennessee who is not the 1880 John of sixty-nine, and Andrew Mays’s Giles at one month in 1850 and eleven in 1860, the 1870 Proctor original of James Brandenburg’s house, Silas Gray’s Sturgeon original, the 1880 District 59 originals of William next door to John Newnam and of Silas still in the district, the 1900 William Gray dwelling-84 crop, and the Bollinger page a sibling had labelled “Dora E. Stone,” which is Henry C. Rhodes and Dora M. of Missouri, and the 1920 Booneville, Buffalo, and Buck Creek originals with the rejected Taylor, Marcum, Magee, McIntosh, Baker, and McPherson houses, the 1910 Sturgeon Gilbert×Josie house, Lynch’s wife Laura without a Newman on the original, and the Buffalo Baker household whose Soundex card misnamed Gilbert John as Robert, the 1910 Buffalo Gilbert, John house next door to Baker, Robert H., and the Soundex Douglas card that shows the clerks indexed filmed Buffalo sheets, the 1910 Buffalo Bales house first read as Bowman, and the 1920 Bowman Henry, Jack, and Dean George × Jane originals that are other people, and the filmed Buffalo Dean George × Martha house that is probably the 1910 couple, and Kentucky’s B-630 Barrett Ben given-name slot now every-leaf closed — the two Barrett, Ben heads are eighteen in Franklin and sixty in Livingston, and Owsley Barrett, Bent, twenty-four, is a Booneville house with Mary, Maybe, and Stanley, not the 1910 Buffalo Ben — and Kentucky’s B-630 Barrett Bruce given-name slot now every-leaf closed as well: card 2451 copies the original Buffalo Bruce house, Billy twenty-two is the next dwelling, and Board Bruce of Muhlenberg is another man, and Kentucky’s B-630 Barrett John given-name slot now every-leaf closed: there is no Barrett, John of about seventy-five in Owsley district 92 as a head, Madison John seventy-one with grandson Sam and Lee County John fifty-six with Hershel are other men, and Soundex Beard, John, seventy-one, of Owsley district 90 copies the original Island Creek house of Beard, John, Virginia-born, with Margruy[?] and Herbert, not the 1910 Buffalo Barrett John. This volume folds those chats into one narrative. The case dossier remains the working file; this book is the public reading of it. Sibling work on Greene ED 37 through 41 is now on merged PR #26 through Pass 59; remaining Greene ED 38 B-sides, 1900 Liberty, and 1900 hh 85 are inventoried, not duplicated. Do not import their “Dora E. Stone” as this woman.</w:t>
       </w:r>
     </w:p>
     <w:p>
@@ -849,7 +849,7 @@
         <w:t>Anna</w:t>
       </w:r>
       <w:r>
-        <w:t xml:space="preserve">, may be the 1910 Barrett, Ben; that stays possible. Kentucky’s Soundex B-630 now copies that original — card 2451, Owsley district 92 sheet 6 line 40, with continuation Lotty — so Bruce is no longer a Soundex miss. Pass 76’s “Sallie” daughter is Lottie. Barrett, Billy, twenty-two, is the next house, dwelling 116, and is not merged. Board, Bruce, forty, of Muhlenberg is another man. Kentucky’s B-630 Ben slot is now every-leaf closed: neither Barrett Ben card is that couple, and Booneville Bent, twenty-four, with Mary is another house. The Bruce given-name slot 2425–2480 is likewise image-closed. Sheet 7 A dwelling </w:t>
+        <w:t xml:space="preserve">, may be the 1910 Barrett, Ben; that stays possible. Kentucky’s Soundex B-630 now copies that original — card 2451, Owsley district 92 sheet 6 line 40, with continuation Lotty — so Bruce is no longer a Soundex miss. Pass 76’s “Sallie” daughter is Lottie. Barrett, Billy, twenty-two, is the next house, dwelling 116, and is not merged. Board, Bruce, forty, of Muhlenberg is another man. Kentucky’s B-630 Ben slot is now every-leaf closed: neither Barrett Ben card is that couple, and Booneville Bent, twenty-four, with Mary is another house. The Bruce given-name slot 2425–2480 is likewise image-closed. Kentucky’s B-630 John slot is now every-leaf closed as well: there is no Barrett, John of about seventy-five in Owsley district 92 as a head. Madison John, seventy-one, with grandson Sam, and Lee County John, fifty-six, with Hershel, are other men. Soundex Beard, John, seventy-one, of Owsley district 90 copies the original Island Creek house of Beard, John, seventy-one, Virginia-born, with Margruy[?] and Herbert — not the 1910 Buffalo Barrett John. Sheet 7 A dwelling </w:t>
       </w:r>
       <w:r>
         <w:rPr>

</xml_diff>

<commit_message>
Pass 88: Barrett James 30 original dw 102; Lee Soundex head-nil.
Soundex 3382 copies Buffalo ED 92 sh 6 A ln 64 (Hard Rule 6): James 30 ×
Ollie + Ivory + Pearl + mother Susan 68 Wd, probable 1910 James 23 /
Susan 62. John is not in the house. Lee given-name slot 3835–3862 is
image-closed with no Barrett, Lee ~49 Owsley ED 92 head. B063 remains open.

Co-authored-by: CatCorner22 <CatCorner22@users.noreply.github.com>
</commit_message>
<xml_diff>
--- a/research/dora-ella-newnam/book/Dora-Ella-Newnam-Stone-A-Life.docx
+++ b/research/dora-ella-newnam/book/Dora-Ella-Newnam-Stone-A-Life.docx
@@ -41,7 +41,7 @@
     </w:p>
     <w:p>
       <w:r>
-        <w:t>One hundred forty-nine Cursor chats on this repository were reviewed for this volume (primary research, helpers, scans, and failed browser hunts). The original mobile session opened the case and read the Arkansas death certificate the family still holds. Later sessions recovered the 1880 childhood schedule that free transcripts had missed, walked statewide Soundex reels for 1910 and 1920, tested a Peebles third-marriage hypothesis and set it aside, and photographed NARA microfilm frames — the 1880 childhood schedule, the 1910 Kentucky Ella Miracode plates, Hardin Gray on Sturgeon sheet 13 B, the 1860 Owsley original of Silas Gray’s house with William aged thirteen, the 1850 Owsley Gray pages that are other men (Thomas, James, John, Charles), the given-name Silas plates that are other boys (Ratliff eight months, Wilson six, Phillips fifteen) and the Bowman line first read as Cyrus and then as Squire, the 1850 Estill Marcus Gray original, Breathitt’s Taulbee infant Silas and Bryant Siras, and Madison’s John Green house with Silas Green aged twenty, the 1850 Owsley Harrison Newman house with an eight-year-old Elias who is probably Dora’s father — a 1932 death extract names Henry Harrison Newnam as that father — and is not merged as proven, the 1860 Booneville original of that house under H.H. Newman with Elias aged eighteen, the 1850 William Newman house of twenty-six on the same page, the 1850 John Newman of sixty born in Tennessee who is not the 1880 John of sixty-nine, and Andrew Mays’s Giles at one month in 1850 and eleven in 1860, the 1870 Proctor original of James Brandenburg’s house, Silas Gray’s Sturgeon original, the 1880 District 59 originals of William next door to John Newnam and of Silas still in the district, the 1900 William Gray dwelling-84 crop, and the Bollinger page a sibling had labelled “Dora E. Stone,” which is Henry C. Rhodes and Dora M. of Missouri, and the 1920 Booneville, Buffalo, and Buck Creek originals with the rejected Taylor, Marcum, Magee, McIntosh, Baker, and McPherson houses, the 1910 Sturgeon Gilbert×Josie house, Lynch’s wife Laura without a Newman on the original, and the Buffalo Baker household whose Soundex card misnamed Gilbert John as Robert, the 1910 Buffalo Gilbert, John house next door to Baker, Robert H., and the Soundex Douglas card that shows the clerks indexed filmed Buffalo sheets, the 1910 Buffalo Bales house first read as Bowman, and the 1920 Bowman Henry, Jack, and Dean George × Jane originals that are other people, and the filmed Buffalo Dean George × Martha house that is probably the 1910 couple, and Kentucky’s B-630 Barrett Ben given-name slot now every-leaf closed — the two Barrett, Ben heads are eighteen in Franklin and sixty in Livingston, and Owsley Barrett, Bent, twenty-four, is a Booneville house with Mary, Maybe, and Stanley, not the 1910 Buffalo Ben — and Kentucky’s B-630 Barrett Bruce given-name slot now every-leaf closed as well: card 2451 copies the original Buffalo Bruce house, Billy twenty-two is the next dwelling, and Board Bruce of Muhlenberg is another man, and Kentucky’s B-630 Barrett John given-name slot now every-leaf closed: there is no Barrett, John of about seventy-five in Owsley district 92 as a head, Madison John seventy-one with grandson Sam and Lee County John fifty-six with Hershel are other men, and Soundex Beard, John, seventy-one, of Owsley district 90 copies the original Island Creek house of Beard, John, Virginia-born, with Margruy[?] and Herbert, not the 1910 Buffalo Barrett John. This volume folds those chats into one narrative. The case dossier remains the working file; this book is the public reading of it. Sibling work on Greene ED 37 through 41 is now on merged PR #26 through Pass 59; remaining Greene ED 38 B-sides, 1900 Liberty, and 1900 hh 85 are inventoried, not duplicated. Do not import their “Dora E. Stone” as this woman.</w:t>
+        <w:t>One hundred forty-nine Cursor chats on this repository were reviewed for this volume (primary research, helpers, scans, and failed browser hunts). The original mobile session opened the case and read the Arkansas death certificate the family still holds. Later sessions recovered the 1880 childhood schedule that free transcripts had missed, walked statewide Soundex reels for 1910 and 1920, tested a Peebles third-marriage hypothesis and set it aside, and photographed NARA microfilm frames — the 1880 childhood schedule, the 1910 Kentucky Ella Miracode plates, Hardin Gray on Sturgeon sheet 13 B, the 1860 Owsley original of Silas Gray’s house with William aged thirteen, the 1850 Owsley Gray pages that are other men (Thomas, James, John, Charles), the given-name Silas plates that are other boys (Ratliff eight months, Wilson six, Phillips fifteen) and the Bowman line first read as Cyrus and then as Squire, the 1850 Estill Marcus Gray original, Breathitt’s Taulbee infant Silas and Bryant Siras, and Madison’s John Green house with Silas Green aged twenty, the 1850 Owsley Harrison Newman house with an eight-year-old Elias who is probably Dora’s father — a 1932 death extract names Henry Harrison Newnam as that father — and is not merged as proven, the 1860 Booneville original of that house under H.H. Newman with Elias aged eighteen, the 1850 William Newman house of twenty-six on the same page, the 1850 John Newman of sixty born in Tennessee who is not the 1880 John of sixty-nine, and Andrew Mays’s Giles at one month in 1850 and eleven in 1860, the 1870 Proctor original of James Brandenburg’s house, Silas Gray’s Sturgeon original, the 1880 District 59 originals of William next door to John Newnam and of Silas still in the district, the 1900 William Gray dwelling-84 crop, and the Bollinger page a sibling had labelled “Dora E. Stone,” which is Henry C. Rhodes and Dora M. of Missouri, and the 1920 Booneville, Buffalo, and Buck Creek originals with the rejected Taylor, Marcum, Magee, McIntosh, Baker, and McPherson houses, the 1910 Sturgeon Gilbert×Josie house, Lynch’s wife Laura without a Newman on the original, and the Buffalo Baker household whose Soundex card misnamed Gilbert John as Robert, the 1910 Buffalo Gilbert, John house next door to Baker, Robert H., and the Soundex Douglas card that shows the clerks indexed filmed Buffalo sheets, the 1910 Buffalo Bales house first read as Bowman, and the 1920 Bowman Henry, Jack, and Dean George × Jane originals that are other people, and the filmed Buffalo Dean George × Martha house that is probably the 1910 couple, and Kentucky’s B-630 Barrett Ben given-name slot now every-leaf closed — the two Barrett, Ben heads are eighteen in Franklin and sixty in Livingston, and Owsley Barrett, Bent, twenty-four, is a Booneville house with Mary, Maybe, and Stanley, not the 1910 Buffalo Ben — and Kentucky’s B-630 Barrett Bruce given-name slot now every-leaf closed as well: card 2451 copies the original Buffalo Bruce house, Billy twenty-two is the next dwelling, and Board Bruce of Muhlenberg is another man, and Kentucky’s B-630 Barrett John given-name slot now every-leaf closed: there is no Barrett, John of about seventy-five in Owsley district 92 as a head, Madison John seventy-one with grandson Sam and Lee County John fifty-six with Hershel are other men, and Soundex Beard, John, seventy-one, of Owsley district 90 copies the original Island Creek house of Beard, John, Virginia-born, with Margruy[?] and Herbert, not the 1910 Buffalo Barrett John, and Kentucky’s B-630 Barrett James given-name slot now every-leaf closed as a hit: original Buffalo dwelling 102 is Barrett, James, thirty, with Ollie, Ivory, Pearl, and mother Susan, sixty-eight, a widow — probably the 1910 James twenty-three and Susan sixty-two — and John is not in that house, and the Lee given-name slot is now every-leaf closed with no Barrett, Lee of about forty-nine in Owsley district 92 as a head. This volume folds those chats into one narrative. The case dossier remains the working file; this book is the public reading of it. Sibling work on Greene ED 37 through 41 is now on merged PR #26 through Pass 59; remaining Greene ED 38 B-sides, 1900 Liberty, and 1900 hh 85 are inventoried, not duplicated. Do not import their “Dora E. Stone” as this woman.</w:t>
       </w:r>
     </w:p>
     <w:p>
@@ -849,7 +849,61 @@
         <w:t>Anna</w:t>
       </w:r>
       <w:r>
-        <w:t xml:space="preserve">, may be the 1910 Barrett, Ben; that stays possible. Kentucky’s Soundex B-630 now copies that original — card 2451, Owsley district 92 sheet 6 line 40, with continuation Lotty — so Bruce is no longer a Soundex miss. Pass 76’s “Sallie” daughter is Lottie. Barrett, Billy, twenty-two, is the next house, dwelling 116, and is not merged. Board, Bruce, forty, of Muhlenberg is another man. Kentucky’s B-630 Ben slot is now every-leaf closed: neither Barrett Ben card is that couple, and Booneville Bent, twenty-four, with Mary is another house. The Bruce given-name slot 2425–2480 is likewise image-closed. Kentucky’s B-630 John slot is now every-leaf closed as well: there is no Barrett, John of about seventy-five in Owsley district 92 as a head. Madison John, seventy-one, with grandson Sam, and Lee County John, fifty-six, with Hershel, are other men. Soundex Beard, John, seventy-one, of Owsley district 90 copies the original Island Creek house of Beard, John, seventy-one, Virginia-born, with Margruy[?] and Herbert — not the 1910 Buffalo Barrett John. Sheet 7 A dwelling </w:t>
+        <w:t xml:space="preserve">, may be the 1910 Barrett, Ben; that stays possible. Kentucky’s Soundex B-630 now copies that original — card 2451, Owsley district 92 sheet 6 line 40, with continuation Lotty — so Bruce is no longer a Soundex miss. Pass 76’s “Sallie” daughter is Lottie. Barrett, Billy, twenty-two, is the next house, dwelling 116, and is not merged. Board, Bruce, forty, of Muhlenberg is another man. Kentucky’s B-630 Ben slot is now every-leaf closed: neither Barrett Ben card is that couple, and Booneville Bent, twenty-four, with Mary is another house. The Bruce given-name slot 2425–2480 is likewise image-closed. Kentucky’s B-630 John slot is now every-leaf closed as well: there is no Barrett, John of about seventy-five in Owsley district 92 as a head. Madison John, seventy-one, with grandson Sam, and Lee County John, fifty-six, with Hershel, are other men. Soundex Beard, John, seventy-one, of Owsley district 90 copies the original Island Creek house of Beard, John, seventy-one, Virginia-born, with Margruy[?] and Herbert — not the 1910 Buffalo Barrett John. The same Buffalo sheet 6 A, dwelling </w:t>
+      </w:r>
+      <w:r>
+        <w:rPr>
+          <w:b/>
+        </w:rPr>
+        <w:t>102</w:t>
+      </w:r>
+      <w:r>
+        <w:t xml:space="preserve">, line 64, is </w:t>
+      </w:r>
+      <w:r>
+        <w:rPr>
+          <w:b/>
+        </w:rPr>
+        <w:t>Barrett, James</w:t>
+      </w:r>
+      <w:r>
+        <w:t xml:space="preserve">, thirty, with </w:t>
+      </w:r>
+      <w:r>
+        <w:rPr>
+          <w:b/>
+        </w:rPr>
+        <w:t>Ollie</w:t>
+      </w:r>
+      <w:r>
+        <w:t xml:space="preserve">, twenty-two, </w:t>
+      </w:r>
+      <w:r>
+        <w:rPr>
+          <w:b/>
+        </w:rPr>
+        <w:t>Ivory</w:t>
+      </w:r>
+      <w:r>
+        <w:t xml:space="preserve">, four, </w:t>
+      </w:r>
+      <w:r>
+        <w:rPr>
+          <w:b/>
+        </w:rPr>
+        <w:t>Pearl</w:t>
+      </w:r>
+      <w:r>
+        <w:t xml:space="preserve">, three, and mother </w:t>
+      </w:r>
+      <w:r>
+        <w:rPr>
+          <w:b/>
+        </w:rPr>
+        <w:t>Susan</w:t>
+      </w:r>
+      <w:r>
+        <w:t xml:space="preserve">, sixty-eight, a widow. Kentucky’s B-630 card 3382 copies that original; the clerk’s ages thirty-six and Pearl two yield to the schedule. That is probably the 1910 Buffalo James of twenty-three and Susan of sixty-two: Barrett James plus Owsley Buffalo plus mother Susan. Ages thirty versus about thirty-three and sixty-eight versus about seventy-two are disclosed and not averaged. John is not in the house. Susan’s widow mark plus that absence is a possible death between 1910 and 1920, not a proved death. Kentucky’s B-630 Lee given-name slot is now every-leaf closed: there is no Barrett, Lee of about forty-nine in Owsley district 92 as a head, and Lee is not in James’s house. Baird, Lee, forty-nine, of Clay is another man. Sheet 7 A dwelling </w:t>
       </w:r>
       <w:r>
         <w:rPr>
@@ -1497,7 +1551,7 @@
         <w:t>Dara</w:t>
       </w:r>
       <w:r>
-        <w:t>, forty — the enumerator wrote an open a, not o — is another person. Kentucky’s 1920 Soundex has no Manerva or Minerva Newman card, and the Walter given-name window has no Owsley or Lee Walter with Manerva. Kentucky’s 1920 death index has no Manerva Newnam row on 28 August; the Owsley table that day is an infant Bates. Mary Ann Smallwood, born April 1842, came from the Owsley Smallwoods. The 11 July 1918 cemetery date is still unmatched in Kentucky’s civil index. [C669] [C672] [C693] [C694] [C690] [C691] [C709] [C711] [C712] [C713] [C717] [C729] [C730] [C739] [C740] [C741] [C742] [C743] [C744] [C745] [C746] [C747] [C748] [C752] [C753] [C754] [C756] [C759] [C763] [C765] [C768] [C775] [C776] [C777] [C779] [C780] [C782] [C783] [C784] [C789] [C790] [C791] [C792] [C793] [C794] [C795] [C796] [C797] [C801] [C802] [C803] [C804] [C808] [C809] [C810] [C811] [C812] [C813] [C814] [C818] [C819] [C820] [C821] [C822] [C823] [C824] [C825] [C826] [C827] [C828] [C832] [C833] [C847] [C848] [C849] [C851] [C857] [C859] [C860] [C861] [C863] [C868] [C869] [C872] [C873] [C874] [C875] [C876] [C877] [C880] [C881] [C882] [C883] [C884] [C887] [C888] [C892] [C893] [C894] [C896]</w:t>
+        <w:t>, forty — the enumerator wrote an open a, not o — is another person. Kentucky’s 1920 Soundex has no Manerva or Minerva Newman card, and the Walter given-name window has no Owsley or Lee Walter with Manerva. Kentucky’s 1920 death index has no Manerva Newnam row on 28 August; the Owsley table that day is an infant Bates. Mary Ann Smallwood, born April 1842, came from the Owsley Smallwoods. The 11 July 1918 cemetery date is still unmatched in Kentucky’s civil index. [C669] [C672] [C693] [C694] [C690] [C691] [C709] [C711] [C712] [C713] [C717] [C729] [C730] [C739] [C740] [C741] [C742] [C743] [C744] [C745] [C746] [C747] [C748] [C752] [C753] [C754] [C756] [C759] [C763] [C765] [C768] [C775] [C776] [C777] [C779] [C780] [C782] [C783] [C784] [C789] [C790] [C791] [C792] [C793] [C794] [C795] [C796] [C797] [C801] [C802] [C803] [C804] [C808] [C809] [C810] [C811] [C812] [C813] [C814] [C818] [C819] [C820] [C821] [C822] [C823] [C824] [C825] [C826] [C827] [C828] [C832] [C833] [C847] [C848] [C849] [C851] [C857] [C859] [C860] [C861] [C863] [C868] [C869] [C872] [C873] [C874] [C875] [C876] [C877] [C880] [C881] [C882] [C883] [C884] [C887] [C888] [C892] [C893] [C894] [C896] [C941] [C942] [C943] [C944] [C945] [C946] [C947]</w:t>
       </w:r>
     </w:p>
     <w:p>

</xml_diff>

<commit_message>
Pass 89: KYDI 1911-1920 nil Barrett John ~70; Lee 1913 John 28 DISPROVED.
Statewide KYDI has no Barrett John of about seventy in Lee, Owsley, Clay, Jackson, Estill, or Breathitt. Lee's 11 Oct 1913 John Barrett, 28, is William x M. Roberts, not the 1910 Buffalo man. B063 remains open.

Co-authored-by: CatCorner22 <CatCorner22@users.noreply.github.com>
</commit_message>
<xml_diff>
--- a/research/dora-ella-newnam/book/Dora-Ella-Newnam-Stone-A-Life.docx
+++ b/research/dora-ella-newnam/book/Dora-Ella-Newnam-Stone-A-Life.docx
@@ -41,7 +41,7 @@
     </w:p>
     <w:p>
       <w:r>
-        <w:t>One hundred forty-nine Cursor chats on this repository were reviewed for this volume (primary research, helpers, scans, and failed browser hunts). The original mobile session opened the case and read the Arkansas death certificate the family still holds. Later sessions recovered the 1880 childhood schedule that free transcripts had missed, walked statewide Soundex reels for 1910 and 1920, tested a Peebles third-marriage hypothesis and set it aside, and photographed NARA microfilm frames — the 1880 childhood schedule, the 1910 Kentucky Ella Miracode plates, Hardin Gray on Sturgeon sheet 13 B, the 1860 Owsley original of Silas Gray’s house with William aged thirteen, the 1850 Owsley Gray pages that are other men (Thomas, James, John, Charles), the given-name Silas plates that are other boys (Ratliff eight months, Wilson six, Phillips fifteen) and the Bowman line first read as Cyrus and then as Squire, the 1850 Estill Marcus Gray original, Breathitt’s Taulbee infant Silas and Bryant Siras, and Madison’s John Green house with Silas Green aged twenty, the 1850 Owsley Harrison Newman house with an eight-year-old Elias who is probably Dora’s father — a 1932 death extract names Henry Harrison Newnam as that father — and is not merged as proven, the 1860 Booneville original of that house under H.H. Newman with Elias aged eighteen, the 1850 William Newman house of twenty-six on the same page, the 1850 John Newman of sixty born in Tennessee who is not the 1880 John of sixty-nine, and Andrew Mays’s Giles at one month in 1850 and eleven in 1860, the 1870 Proctor original of James Brandenburg’s house, Silas Gray’s Sturgeon original, the 1880 District 59 originals of William next door to John Newnam and of Silas still in the district, the 1900 William Gray dwelling-84 crop, and the Bollinger page a sibling had labelled “Dora E. Stone,” which is Henry C. Rhodes and Dora M. of Missouri, and the 1920 Booneville, Buffalo, and Buck Creek originals with the rejected Taylor, Marcum, Magee, McIntosh, Baker, and McPherson houses, the 1910 Sturgeon Gilbert×Josie house, Lynch’s wife Laura without a Newman on the original, and the Buffalo Baker household whose Soundex card misnamed Gilbert John as Robert, the 1910 Buffalo Gilbert, John house next door to Baker, Robert H., and the Soundex Douglas card that shows the clerks indexed filmed Buffalo sheets, the 1910 Buffalo Bales house first read as Bowman, and the 1920 Bowman Henry, Jack, and Dean George × Jane originals that are other people, and the filmed Buffalo Dean George × Martha house that is probably the 1910 couple, and Kentucky’s B-630 Barrett Ben given-name slot now every-leaf closed — the two Barrett, Ben heads are eighteen in Franklin and sixty in Livingston, and Owsley Barrett, Bent, twenty-four, is a Booneville house with Mary, Maybe, and Stanley, not the 1910 Buffalo Ben — and Kentucky’s B-630 Barrett Bruce given-name slot now every-leaf closed as well: card 2451 copies the original Buffalo Bruce house, Billy twenty-two is the next dwelling, and Board Bruce of Muhlenberg is another man, and Kentucky’s B-630 Barrett John given-name slot now every-leaf closed: there is no Barrett, John of about seventy-five in Owsley district 92 as a head, Madison John seventy-one with grandson Sam and Lee County John fifty-six with Hershel are other men, and Soundex Beard, John, seventy-one, of Owsley district 90 copies the original Island Creek house of Beard, John, Virginia-born, with Margruy[?] and Herbert, not the 1910 Buffalo Barrett John, and Kentucky’s B-630 Barrett James given-name slot now every-leaf closed as a hit: original Buffalo dwelling 102 is Barrett, James, thirty, with Ollie, Ivory, Pearl, and mother Susan, sixty-eight, a widow — probably the 1910 James twenty-three and Susan sixty-two — and John is not in that house, and the Lee given-name slot is now every-leaf closed with no Barrett, Lee of about forty-nine in Owsley district 92 as a head. This volume folds those chats into one narrative. The case dossier remains the working file; this book is the public reading of it. Sibling work on Greene ED 37 through 41 is now on merged PR #26 through Pass 59; remaining Greene ED 38 B-sides, 1900 Liberty, and 1900 hh 85 are inventoried, not duplicated. Do not import their “Dora E. Stone” as this woman.</w:t>
+        <w:t>One hundred fifty-two Cursor chats on this repository were reviewed for this volume (primary research, helpers, scans, and failed browser hunts). The original mobile session opened the case and read the Arkansas death certificate the family still holds. Later sessions recovered the 1880 childhood schedule that free transcripts had missed, walked statewide Soundex reels for 1910 and 1920, tested a Peebles third-marriage hypothesis and set it aside, and photographed NARA microfilm frames — the 1880 childhood schedule, the 1910 Kentucky Ella Miracode plates, Hardin Gray on Sturgeon sheet 13 B, the 1860 Owsley original of Silas Gray’s house with William aged thirteen, the 1850 Owsley Gray pages that are other men (Thomas, James, John, Charles), the given-name Silas plates that are other boys (Ratliff eight months, Wilson six, Phillips fifteen) and the Bowman line first read as Cyrus and then as Squire, the 1850 Estill Marcus Gray original, Breathitt’s Taulbee infant Silas and Bryant Siras, and Madison’s John Green house with Silas Green aged twenty, the 1850 Owsley Harrison Newman house with an eight-year-old Elias who is probably Dora’s father — a 1932 death extract names Henry Harrison Newnam as that father — and is not merged as proven, the 1860 Booneville original of that house under H.H. Newman with Elias aged eighteen, the 1850 William Newman house of twenty-six on the same page, the 1850 John Newman of sixty born in Tennessee who is not the 1880 John of sixty-nine, and Andrew Mays’s Giles at one month in 1850 and eleven in 1860, the 1870 Proctor original of James Brandenburg’s house, Silas Gray’s Sturgeon original, the 1880 District 59 originals of William next door to John Newnam and of Silas still in the district, the 1900 William Gray dwelling-84 crop, and the Bollinger page a sibling had labelled “Dora E. Stone,” which is Henry C. Rhodes and Dora M. of Missouri, and the 1920 Booneville, Buffalo, and Buck Creek originals with the rejected Taylor, Marcum, Magee, McIntosh, Baker, and McPherson houses, the 1910 Sturgeon Gilbert×Josie house, Lynch’s wife Laura without a Newman on the original, and the Buffalo Baker household whose Soundex card misnamed Gilbert John as Robert, the 1910 Buffalo Gilbert, John house next door to Baker, Robert H., and the Soundex Douglas card that shows the clerks indexed filmed Buffalo sheets, the 1910 Buffalo Bales house first read as Bowman, and the 1920 Bowman Henry, Jack, and Dean George × Jane originals that are other people, and the filmed Buffalo Dean George × Martha house that is probably the 1910 couple, and Kentucky’s B-630 Barrett Ben given-name slot now every-leaf closed — the two Barrett, Ben heads are eighteen in Franklin and sixty in Livingston, and Owsley Barrett, Bent, twenty-four, is a Booneville house with Mary, Maybe, and Stanley, not the 1910 Buffalo Ben — and Kentucky’s B-630 Barrett Bruce given-name slot now every-leaf closed as well: card 2451 copies the original Buffalo Bruce house, Billy twenty-two is the next dwelling, and Board Bruce of Muhlenberg is another man, and Kentucky’s B-630 Barrett John given-name slot now every-leaf closed: there is no Barrett, John of about seventy-five in Owsley district 92 as a head, Madison John seventy-one with grandson Sam and Lee County John fifty-six with Hershel are other men, and Soundex Beard, John, seventy-one, of Owsley district 90 copies the original Island Creek house of Beard, John, Virginia-born, with Margruy[?] and Herbert, not the 1910 Buffalo Barrett John, and Kentucky’s B-630 Barrett James given-name slot now every-leaf closed as a hit: original Buffalo dwelling 102 is Barrett, James, thirty, with Ollie, Ivory, Pearl, and mother Susan, sixty-eight, a widow — probably the 1910 James twenty-three and Susan sixty-two — and John is not in that house, and the Lee given-name slot is now every-leaf closed with no Barrett, Lee of about forty-nine in Owsley district 92 as a head. Statewide Kentucky death index 1911–1920 has no Barrett, John of about seventy in Lee, Owsley, Clay, Jackson, Estill, or Breathitt; Lee’s 1913 John Barrett, twenty-eight, is William and M. Roberts’s son, not the 1910 man. This volume folds those chats into one narrative. The case dossier remains the working file; this book is the public reading of it. Sibling work on Greene ED 37 through 41 is now on merged PR #26 through Pass 59; remaining Greene ED 38 B-sides, 1900 Liberty, and 1900 hh 85 are inventoried, not duplicated. Do not import their “Dora E. Stone” as this woman.</w:t>
       </w:r>
     </w:p>
     <w:p>
@@ -903,7 +903,7 @@
         <w:t>Susan</w:t>
       </w:r>
       <w:r>
-        <w:t xml:space="preserve">, sixty-eight, a widow. Kentucky’s B-630 card 3382 copies that original; the clerk’s ages thirty-six and Pearl two yield to the schedule. That is probably the 1910 Buffalo James of twenty-three and Susan of sixty-two: Barrett James plus Owsley Buffalo plus mother Susan. Ages thirty versus about thirty-three and sixty-eight versus about seventy-two are disclosed and not averaged. John is not in the house. Susan’s widow mark plus that absence is a possible death between 1910 and 1920, not a proved death. Kentucky’s B-630 Lee given-name slot is now every-leaf closed: there is no Barrett, Lee of about forty-nine in Owsley district 92 as a head, and Lee is not in James’s house. Baird, Lee, forty-nine, of Clay is another man. Sheet 7 A dwelling </w:t>
+        <w:t xml:space="preserve">, sixty-eight, a widow. Kentucky’s B-630 card 3382 copies that original; the clerk’s ages thirty-six and Pearl two yield to the schedule. That is probably the 1910 Buffalo James of twenty-three and Susan of sixty-two: Barrett James plus Owsley Buffalo plus mother Susan. Ages thirty versus about thirty-three and sixty-eight versus about seventy-two are disclosed and not averaged. John is not in the house. Susan’s widow mark plus that absence is a possible death between 1910 and 1920, not a proved death. Statewide Kentucky death index 1911–1920 has no Barrett, John of about seventy in those neighboring counties. Lee’s 11 October 1913 John Barrett, twenty-eight, father William, mother M. Roberts, is another man. Kentucky’s B-630 Lee given-name slot is now every-leaf closed: there is no Barrett, Lee of about forty-nine in Owsley district 92 as a head, and Lee is not in James’s house. Baird, Lee, forty-nine, of Clay is another man. Sheet 7 A dwelling </w:t>
       </w:r>
       <w:r>
         <w:rPr>
@@ -1551,7 +1551,7 @@
         <w:t>Dara</w:t>
       </w:r>
       <w:r>
-        <w:t>, forty — the enumerator wrote an open a, not o — is another person. Kentucky’s 1920 Soundex has no Manerva or Minerva Newman card, and the Walter given-name window has no Owsley or Lee Walter with Manerva. Kentucky’s 1920 death index has no Manerva Newnam row on 28 August; the Owsley table that day is an infant Bates. Mary Ann Smallwood, born April 1842, came from the Owsley Smallwoods. The 11 July 1918 cemetery date is still unmatched in Kentucky’s civil index. [C669] [C672] [C693] [C694] [C690] [C691] [C709] [C711] [C712] [C713] [C717] [C729] [C730] [C739] [C740] [C741] [C742] [C743] [C744] [C745] [C746] [C747] [C748] [C752] [C753] [C754] [C756] [C759] [C763] [C765] [C768] [C775] [C776] [C777] [C779] [C780] [C782] [C783] [C784] [C789] [C790] [C791] [C792] [C793] [C794] [C795] [C796] [C797] [C801] [C802] [C803] [C804] [C808] [C809] [C810] [C811] [C812] [C813] [C814] [C818] [C819] [C820] [C821] [C822] [C823] [C824] [C825] [C826] [C827] [C828] [C832] [C833] [C847] [C848] [C849] [C851] [C857] [C859] [C860] [C861] [C863] [C868] [C869] [C872] [C873] [C874] [C875] [C876] [C877] [C880] [C881] [C882] [C883] [C884] [C887] [C888] [C892] [C893] [C894] [C896] [C941] [C942] [C943] [C944] [C945] [C946] [C947]</w:t>
+        <w:t>, forty — the enumerator wrote an open a, not o — is another person. Kentucky’s 1920 Soundex has no Manerva or Minerva Newman card, and the Walter given-name window has no Owsley or Lee Walter with Manerva. Kentucky’s 1920 death index has no Manerva Newnam row on 28 August; the Owsley table that day is an infant Bates. Mary Ann Smallwood, born April 1842, came from the Owsley Smallwoods. The 11 July 1918 cemetery date is still unmatched in Kentucky’s civil index. [C669] [C672] [C693] [C694] [C690] [C691] [C709] [C711] [C712] [C713] [C717] [C729] [C730] [C739] [C740] [C741] [C742] [C743] [C744] [C745] [C746] [C747] [C748] [C752] [C753] [C754] [C756] [C759] [C763] [C765] [C768] [C775] [C776] [C777] [C779] [C780] [C782] [C783] [C784] [C789] [C790] [C791] [C792] [C793] [C794] [C795] [C796] [C797] [C801] [C802] [C803] [C804] [C808] [C809] [C810] [C811] [C812] [C813] [C814] [C818] [C819] [C820] [C821] [C822] [C823] [C824] [C825] [C826] [C827] [C828] [C832] [C833] [C847] [C848] [C849] [C851] [C857] [C859] [C860] [C861] [C863] [C868] [C869] [C872] [C873] [C874] [C875] [C876] [C877] [C880] [C881] [C882] [C883] [C884] [C887] [C888] [C892] [C893] [C894] [C896] [C941] [C942] [C943] [C944] [C945] [C946] [C947] [C948] [C949] [C950] [C951] [C952] [C953] [C954] [C955] [C956] [C957] [C958]</w:t>
       </w:r>
     </w:p>
     <w:p>

</xml_diff>

<commit_message>
Pass 90: KYDI 1921-1930 nil Barrett John ~80; Lee 1925 John 70 unmerged.
Owsley 1921 Susan 65 Abner x Combs DISPROVED as 1920 Susan 68. B063 remains open.

Co-authored-by: CatCorner22 <CatCorner22@users.noreply.github.com>
</commit_message>
<xml_diff>
--- a/research/dora-ella-newnam/book/Dora-Ella-Newnam-Stone-A-Life.docx
+++ b/research/dora-ella-newnam/book/Dora-Ella-Newnam-Stone-A-Life.docx
@@ -41,7 +41,7 @@
     </w:p>
     <w:p>
       <w:r>
-        <w:t>One hundred fifty-two Cursor chats on this repository were reviewed for this volume (primary research, helpers, scans, and failed browser hunts). The original mobile session opened the case and read the Arkansas death certificate the family still holds. Later sessions recovered the 1880 childhood schedule that free transcripts had missed, walked statewide Soundex reels for 1910 and 1920, tested a Peebles third-marriage hypothesis and set it aside, and photographed NARA microfilm frames — the 1880 childhood schedule, the 1910 Kentucky Ella Miracode plates, Hardin Gray on Sturgeon sheet 13 B, the 1860 Owsley original of Silas Gray’s house with William aged thirteen, the 1850 Owsley Gray pages that are other men (Thomas, James, John, Charles), the given-name Silas plates that are other boys (Ratliff eight months, Wilson six, Phillips fifteen) and the Bowman line first read as Cyrus and then as Squire, the 1850 Estill Marcus Gray original, Breathitt’s Taulbee infant Silas and Bryant Siras, and Madison’s John Green house with Silas Green aged twenty, the 1850 Owsley Harrison Newman house with an eight-year-old Elias who is probably Dora’s father — a 1932 death extract names Henry Harrison Newnam as that father — and is not merged as proven, the 1860 Booneville original of that house under H.H. Newman with Elias aged eighteen, the 1850 William Newman house of twenty-six on the same page, the 1850 John Newman of sixty born in Tennessee who is not the 1880 John of sixty-nine, and Andrew Mays’s Giles at one month in 1850 and eleven in 1860, the 1870 Proctor original of James Brandenburg’s house, Silas Gray’s Sturgeon original, the 1880 District 59 originals of William next door to John Newnam and of Silas still in the district, the 1900 William Gray dwelling-84 crop, and the Bollinger page a sibling had labelled “Dora E. Stone,” which is Henry C. Rhodes and Dora M. of Missouri, and the 1920 Booneville, Buffalo, and Buck Creek originals with the rejected Taylor, Marcum, Magee, McIntosh, Baker, and McPherson houses, the 1910 Sturgeon Gilbert×Josie house, Lynch’s wife Laura without a Newman on the original, and the Buffalo Baker household whose Soundex card misnamed Gilbert John as Robert, the 1910 Buffalo Gilbert, John house next door to Baker, Robert H., and the Soundex Douglas card that shows the clerks indexed filmed Buffalo sheets, the 1910 Buffalo Bales house first read as Bowman, and the 1920 Bowman Henry, Jack, and Dean George × Jane originals that are other people, and the filmed Buffalo Dean George × Martha house that is probably the 1910 couple, and Kentucky’s B-630 Barrett Ben given-name slot now every-leaf closed — the two Barrett, Ben heads are eighteen in Franklin and sixty in Livingston, and Owsley Barrett, Bent, twenty-four, is a Booneville house with Mary, Maybe, and Stanley, not the 1910 Buffalo Ben — and Kentucky’s B-630 Barrett Bruce given-name slot now every-leaf closed as well: card 2451 copies the original Buffalo Bruce house, Billy twenty-two is the next dwelling, and Board Bruce of Muhlenberg is another man, and Kentucky’s B-630 Barrett John given-name slot now every-leaf closed: there is no Barrett, John of about seventy-five in Owsley district 92 as a head, Madison John seventy-one with grandson Sam and Lee County John fifty-six with Hershel are other men, and Soundex Beard, John, seventy-one, of Owsley district 90 copies the original Island Creek house of Beard, John, Virginia-born, with Margruy[?] and Herbert, not the 1910 Buffalo Barrett John, and Kentucky’s B-630 Barrett James given-name slot now every-leaf closed as a hit: original Buffalo dwelling 102 is Barrett, James, thirty, with Ollie, Ivory, Pearl, and mother Susan, sixty-eight, a widow — probably the 1910 James twenty-three and Susan sixty-two — and John is not in that house, and the Lee given-name slot is now every-leaf closed with no Barrett, Lee of about forty-nine in Owsley district 92 as a head. Statewide Kentucky death index 1911–1920 has no Barrett, John of about seventy in Lee, Owsley, Clay, Jackson, Estill, or Breathitt; Lee’s 1913 John Barrett, twenty-eight, is William and M. Roberts’s son, not the 1910 man. This volume folds those chats into one narrative. The case dossier remains the working file; this book is the public reading of it. Sibling work on Greene ED 37 through 41 is now on merged PR #26 through Pass 59; remaining Greene ED 38 B-sides, 1900 Liberty, and 1900 hh 85 are inventoried, not duplicated. Do not import their “Dora E. Stone” as this woman.</w:t>
+        <w:t>One hundred fifty-two Cursor chats on this repository were reviewed for this volume (primary research, helpers, scans, and failed browser hunts). The original mobile session opened the case and read the Arkansas death certificate the family still holds. Later sessions recovered the 1880 childhood schedule that free transcripts had missed, walked statewide Soundex reels for 1910 and 1920, tested a Peebles third-marriage hypothesis and set it aside, and photographed NARA microfilm frames — the 1880 childhood schedule, the 1910 Kentucky Ella Miracode plates, Hardin Gray on Sturgeon sheet 13 B, the 1860 Owsley original of Silas Gray’s house with William aged thirteen, the 1850 Owsley Gray pages that are other men (Thomas, James, John, Charles), the given-name Silas plates that are other boys (Ratliff eight months, Wilson six, Phillips fifteen) and the Bowman line first read as Cyrus and then as Squire, the 1850 Estill Marcus Gray original, Breathitt’s Taulbee infant Silas and Bryant Siras, and Madison’s John Green house with Silas Green aged twenty, the 1850 Owsley Harrison Newman house with an eight-year-old Elias who is probably Dora’s father — a 1932 death extract names Henry Harrison Newnam as that father — and is not merged as proven, the 1860 Booneville original of that house under H.H. Newman with Elias aged eighteen, the 1850 William Newman house of twenty-six on the same page, the 1850 John Newman of sixty born in Tennessee who is not the 1880 John of sixty-nine, and Andrew Mays’s Giles at one month in 1850 and eleven in 1860, the 1870 Proctor original of James Brandenburg’s house, Silas Gray’s Sturgeon original, the 1880 District 59 originals of William next door to John Newnam and of Silas still in the district, the 1900 William Gray dwelling-84 crop, and the Bollinger page a sibling had labelled “Dora E. Stone,” which is Henry C. Rhodes and Dora M. of Missouri, and the 1920 Booneville, Buffalo, and Buck Creek originals with the rejected Taylor, Marcum, Magee, McIntosh, Baker, and McPherson houses, the 1910 Sturgeon Gilbert×Josie house, Lynch’s wife Laura without a Newman on the original, and the Buffalo Baker household whose Soundex card misnamed Gilbert John as Robert, the 1910 Buffalo Gilbert, John house next door to Baker, Robert H., and the Soundex Douglas card that shows the clerks indexed filmed Buffalo sheets, the 1910 Buffalo Bales house first read as Bowman, and the 1920 Bowman Henry, Jack, and Dean George × Jane originals that are other people, and the filmed Buffalo Dean George × Martha house that is probably the 1910 couple, and Kentucky’s B-630 Barrett Ben given-name slot now every-leaf closed — the two Barrett, Ben heads are eighteen in Franklin and sixty in Livingston, and Owsley Barrett, Bent, twenty-four, is a Booneville house with Mary, Maybe, and Stanley, not the 1910 Buffalo Ben — and Kentucky’s B-630 Barrett Bruce given-name slot now every-leaf closed as well: card 2451 copies the original Buffalo Bruce house, Billy twenty-two is the next dwelling, and Board Bruce of Muhlenberg is another man, and Kentucky’s B-630 Barrett John given-name slot now every-leaf closed: there is no Barrett, John of about seventy-five in Owsley district 92 as a head, Madison John seventy-one with grandson Sam and Lee County John fifty-six with Hershel are other men, and Soundex Beard, John, seventy-one, of Owsley district 90 copies the original Island Creek house of Beard, John, Virginia-born, with Margruy[?] and Herbert, not the 1910 Buffalo Barrett John, and Kentucky’s B-630 Barrett James given-name slot now every-leaf closed as a hit: original Buffalo dwelling 102 is Barrett, James, thirty, with Ollie, Ivory, Pearl, and mother Susan, sixty-eight, a widow — probably the 1910 James twenty-three and Susan sixty-two — and John is not in that house, and the Lee given-name slot is now every-leaf closed with no Barrett, Lee of about forty-nine in Owsley district 92 as a head. Statewide Kentucky death index 1911–1920 has no Barrett, John of about seventy in Lee, Owsley, Clay, Jackson, Estill, or Breathitt; Lee’s 1913 John Barrett, twenty-eight, is William and M. Roberts’s son, not the 1910 man. Statewide Kentucky death index 1921–1930 still has no Barrett, John of about eighty in those neighboring counties except Lee’s 12 April 1925 John Barrett, about seventy, at Beattyville, parents blank, who is not merged. Owsley’s 4 February 1921 Susan Barrett, sixty-five, daughter of Lacy Abner and Sintha Combs, is not James’s mother sixty-eight. This volume folds those chats into one narrative. The case dossier remains the working file; this book is the public reading of it. Sibling work on Greene ED 37 through 41 is now on merged PR #26 through Pass 59; remaining Greene ED 38 B-sides, 1900 Liberty, and 1900 hh 85 are inventoried, not duplicated. Do not import their “Dora E. Stone” as this woman.</w:t>
       </w:r>
     </w:p>
     <w:p>
@@ -903,7 +903,7 @@
         <w:t>Susan</w:t>
       </w:r>
       <w:r>
-        <w:t xml:space="preserve">, sixty-eight, a widow. Kentucky’s B-630 card 3382 copies that original; the clerk’s ages thirty-six and Pearl two yield to the schedule. That is probably the 1910 Buffalo James of twenty-three and Susan of sixty-two: Barrett James plus Owsley Buffalo plus mother Susan. Ages thirty versus about thirty-three and sixty-eight versus about seventy-two are disclosed and not averaged. John is not in the house. Susan’s widow mark plus that absence is a possible death between 1910 and 1920, not a proved death. Statewide Kentucky death index 1911–1920 has no Barrett, John of about seventy in those neighboring counties. Lee’s 11 October 1913 John Barrett, twenty-eight, father William, mother M. Roberts, is another man. Kentucky’s B-630 Lee given-name slot is now every-leaf closed: there is no Barrett, Lee of about forty-nine in Owsley district 92 as a head, and Lee is not in James’s house. Baird, Lee, forty-nine, of Clay is another man. Sheet 7 A dwelling </w:t>
+        <w:t xml:space="preserve">, sixty-eight, a widow. Kentucky’s B-630 card 3382 copies that original; the clerk’s ages thirty-six and Pearl two yield to the schedule. That is probably the 1910 Buffalo James of twenty-three and Susan of sixty-two: Barrett James plus Owsley Buffalo plus mother Susan. Ages thirty versus about thirty-three and sixty-eight versus about seventy-two are disclosed and not averaged. John is not in the house. Susan’s widow mark plus that absence is a possible death between 1910 and 1920, not a proved death. Statewide Kentucky death index 1911–1920 has no Barrett, John of about seventy in those neighboring counties. Lee’s 11 October 1913 John Barrett, twenty-eight, father William, mother M. Roberts, is another man. Statewide Kentucky death index 1921–1930 still has no Barrett, John of about eighty in those neighboring counties except Lee’s 12 April 1925 John Barrett, about seventy, at Beattyville, parents blank, who is not merged. Owsley’s 4 February 1921 Susan Barrett, sixty-five, daughter of Lacy Abner and Sintha Combs, is not James’s mother sixty-eight. Kentucky’s B-630 Lee given-name slot is now every-leaf closed: there is no Barrett, Lee of about forty-nine in Owsley district 92 as a head, and Lee is not in James’s house. Baird, Lee, forty-nine, of Clay is another man. Sheet 7 A dwelling </w:t>
       </w:r>
       <w:r>
         <w:rPr>
@@ -1551,7 +1551,7 @@
         <w:t>Dara</w:t>
       </w:r>
       <w:r>
-        <w:t>, forty — the enumerator wrote an open a, not o — is another person. Kentucky’s 1920 Soundex has no Manerva or Minerva Newman card, and the Walter given-name window has no Owsley or Lee Walter with Manerva. Kentucky’s 1920 death index has no Manerva Newnam row on 28 August; the Owsley table that day is an infant Bates. Mary Ann Smallwood, born April 1842, came from the Owsley Smallwoods. The 11 July 1918 cemetery date is still unmatched in Kentucky’s civil index. [C669] [C672] [C693] [C694] [C690] [C691] [C709] [C711] [C712] [C713] [C717] [C729] [C730] [C739] [C740] [C741] [C742] [C743] [C744] [C745] [C746] [C747] [C748] [C752] [C753] [C754] [C756] [C759] [C763] [C765] [C768] [C775] [C776] [C777] [C779] [C780] [C782] [C783] [C784] [C789] [C790] [C791] [C792] [C793] [C794] [C795] [C796] [C797] [C801] [C802] [C803] [C804] [C808] [C809] [C810] [C811] [C812] [C813] [C814] [C818] [C819] [C820] [C821] [C822] [C823] [C824] [C825] [C826] [C827] [C828] [C832] [C833] [C847] [C848] [C849] [C851] [C857] [C859] [C860] [C861] [C863] [C868] [C869] [C872] [C873] [C874] [C875] [C876] [C877] [C880] [C881] [C882] [C883] [C884] [C887] [C888] [C892] [C893] [C894] [C896] [C941] [C942] [C943] [C944] [C945] [C946] [C947] [C948] [C949] [C950] [C951] [C952] [C953] [C954] [C955] [C956] [C957] [C958]</w:t>
+        <w:t>, forty — the enumerator wrote an open a, not o — is another person. Kentucky’s 1920 Soundex has no Manerva or Minerva Newman card, and the Walter given-name window has no Owsley or Lee Walter with Manerva. Kentucky’s 1920 death index has no Manerva Newnam row on 28 August; the Owsley table that day is an infant Bates. Mary Ann Smallwood, born April 1842, came from the Owsley Smallwoods. The 11 July 1918 cemetery date is still unmatched in Kentucky’s civil index. [C669] [C672] [C693] [C694] [C690] [C691] [C709] [C711] [C712] [C713] [C717] [C729] [C730] [C739] [C740] [C741] [C742] [C743] [C744] [C745] [C746] [C747] [C748] [C752] [C753] [C754] [C756] [C759] [C763] [C765] [C768] [C775] [C776] [C777] [C779] [C780] [C782] [C783] [C784] [C789] [C790] [C791] [C792] [C793] [C794] [C795] [C796] [C797] [C801] [C802] [C803] [C804] [C808] [C809] [C810] [C811] [C812] [C813] [C814] [C818] [C819] [C820] [C821] [C822] [C823] [C824] [C825] [C826] [C827] [C828] [C832] [C833] [C847] [C848] [C849] [C851] [C857] [C859] [C860] [C861] [C863] [C868] [C869] [C872] [C873] [C874] [C875] [C876] [C877] [C880] [C881] [C882] [C883] [C884] [C887] [C888] [C892] [C893] [C894] [C896] [C941] [C942] [C943] [C944] [C945] [C946] [C947] [C948] [C949] [C950] [C951] [C952] [C953] [C954] [C955] [C956] [C957] [C958] [C959] [C960] [C961] [C962] [C963] [C964] [C965] [C966] [C967] [C968]</w:t>
       </w:r>
     </w:p>
     <w:p>

</xml_diff>

<commit_message>
Pass 91: 1930 original Barrett James 45 x Ollie HIT; Soundex miss; KYDI 1931-1940 nil John ~90.
Co-authored-by: CatCorner22 <CatCorner22@users.noreply.github.com>
</commit_message>
<xml_diff>
--- a/research/dora-ella-newnam/book/Dora-Ella-Newnam-Stone-A-Life.docx
+++ b/research/dora-ella-newnam/book/Dora-Ella-Newnam-Stone-A-Life.docx
@@ -41,7 +41,7 @@
     </w:p>
     <w:p>
       <w:r>
-        <w:t>One hundred fifty-two Cursor chats on this repository were reviewed for this volume (primary research, helpers, scans, and failed browser hunts). The original mobile session opened the case and read the Arkansas death certificate the family still holds. Later sessions recovered the 1880 childhood schedule that free transcripts had missed, walked statewide Soundex reels for 1910 and 1920, tested a Peebles third-marriage hypothesis and set it aside, and photographed NARA microfilm frames — the 1880 childhood schedule, the 1910 Kentucky Ella Miracode plates, Hardin Gray on Sturgeon sheet 13 B, the 1860 Owsley original of Silas Gray’s house with William aged thirteen, the 1850 Owsley Gray pages that are other men (Thomas, James, John, Charles), the given-name Silas plates that are other boys (Ratliff eight months, Wilson six, Phillips fifteen) and the Bowman line first read as Cyrus and then as Squire, the 1850 Estill Marcus Gray original, Breathitt’s Taulbee infant Silas and Bryant Siras, and Madison’s John Green house with Silas Green aged twenty, the 1850 Owsley Harrison Newman house with an eight-year-old Elias who is probably Dora’s father — a 1932 death extract names Henry Harrison Newnam as that father — and is not merged as proven, the 1860 Booneville original of that house under H.H. Newman with Elias aged eighteen, the 1850 William Newman house of twenty-six on the same page, the 1850 John Newman of sixty born in Tennessee who is not the 1880 John of sixty-nine, and Andrew Mays’s Giles at one month in 1850 and eleven in 1860, the 1870 Proctor original of James Brandenburg’s house, Silas Gray’s Sturgeon original, the 1880 District 59 originals of William next door to John Newnam and of Silas still in the district, the 1900 William Gray dwelling-84 crop, and the Bollinger page a sibling had labelled “Dora E. Stone,” which is Henry C. Rhodes and Dora M. of Missouri, and the 1920 Booneville, Buffalo, and Buck Creek originals with the rejected Taylor, Marcum, Magee, McIntosh, Baker, and McPherson houses, the 1910 Sturgeon Gilbert×Josie house, Lynch’s wife Laura without a Newman on the original, and the Buffalo Baker household whose Soundex card misnamed Gilbert John as Robert, the 1910 Buffalo Gilbert, John house next door to Baker, Robert H., and the Soundex Douglas card that shows the clerks indexed filmed Buffalo sheets, the 1910 Buffalo Bales house first read as Bowman, and the 1920 Bowman Henry, Jack, and Dean George × Jane originals that are other people, and the filmed Buffalo Dean George × Martha house that is probably the 1910 couple, and Kentucky’s B-630 Barrett Ben given-name slot now every-leaf closed — the two Barrett, Ben heads are eighteen in Franklin and sixty in Livingston, and Owsley Barrett, Bent, twenty-four, is a Booneville house with Mary, Maybe, and Stanley, not the 1910 Buffalo Ben — and Kentucky’s B-630 Barrett Bruce given-name slot now every-leaf closed as well: card 2451 copies the original Buffalo Bruce house, Billy twenty-two is the next dwelling, and Board Bruce of Muhlenberg is another man, and Kentucky’s B-630 Barrett John given-name slot now every-leaf closed: there is no Barrett, John of about seventy-five in Owsley district 92 as a head, Madison John seventy-one with grandson Sam and Lee County John fifty-six with Hershel are other men, and Soundex Beard, John, seventy-one, of Owsley district 90 copies the original Island Creek house of Beard, John, Virginia-born, with Margruy[?] and Herbert, not the 1910 Buffalo Barrett John, and Kentucky’s B-630 Barrett James given-name slot now every-leaf closed as a hit: original Buffalo dwelling 102 is Barrett, James, thirty, with Ollie, Ivory, Pearl, and mother Susan, sixty-eight, a widow — probably the 1910 James twenty-three and Susan sixty-two — and John is not in that house, and the Lee given-name slot is now every-leaf closed with no Barrett, Lee of about forty-nine in Owsley district 92 as a head. Statewide Kentucky death index 1911–1920 has no Barrett, John of about seventy in Lee, Owsley, Clay, Jackson, Estill, or Breathitt; Lee’s 1913 John Barrett, twenty-eight, is William and M. Roberts’s son, not the 1910 man. Statewide Kentucky death index 1921–1930 still has no Barrett, John of about eighty in those neighboring counties except Lee’s 12 April 1925 John Barrett, about seventy, at Beattyville, parents blank, who is not merged. Owsley’s 4 February 1921 Susan Barrett, sixty-five, daughter of Lacy Abner and Sintha Combs, is not James’s mother sixty-eight. This volume folds those chats into one narrative. The case dossier remains the working file; this book is the public reading of it. Sibling work on Greene ED 37 through 41 is now on merged PR #26 through Pass 59; remaining Greene ED 38 B-sides, 1900 Liberty, and 1900 hh 85 are inventoried, not duplicated. Do not import their “Dora E. Stone” as this woman.</w:t>
+        <w:t>One hundred fifty-six Cursor chats on this repository were reviewed for this volume (primary research, helpers, scans, and failed browser hunts). The original mobile session opened the case and read the Arkansas death certificate the family still holds. Later sessions recovered the 1880 childhood schedule that free transcripts had missed, walked statewide Soundex reels for 1910 and 1920, tested a Peebles third-marriage hypothesis and set it aside, and photographed NARA microfilm frames — the 1880 childhood schedule, the 1910 Kentucky Ella Miracode plates, Hardin Gray on Sturgeon sheet 13 B, the 1860 Owsley original of Silas Gray’s house with William aged thirteen, the 1850 Owsley Gray pages that are other men (Thomas, James, John, Charles), the given-name Silas plates that are other boys (Ratliff eight months, Wilson six, Phillips fifteen) and the Bowman line first read as Cyrus and then as Squire, the 1850 Estill Marcus Gray original, Breathitt’s Taulbee infant Silas and Bryant Siras, and Madison’s John Green house with Silas Green aged twenty, the 1850 Owsley Harrison Newman house with an eight-year-old Elias who is probably Dora’s father — a 1932 death extract names Henry Harrison Newnam as that father — and is not merged as proven, the 1860 Booneville original of that house under H.H. Newman with Elias aged eighteen, the 1850 William Newman house of twenty-six on the same page, the 1850 John Newman of sixty born in Tennessee who is not the 1880 John of sixty-nine, and Andrew Mays’s Giles at one month in 1850 and eleven in 1860, the 1870 Proctor original of James Brandenburg’s house, Silas Gray’s Sturgeon original, the 1880 District 59 originals of William next door to John Newnam and of Silas still in the district, the 1900 William Gray dwelling-84 crop, and the Bollinger page a sibling had labelled “Dora E. Stone,” which is Henry C. Rhodes and Dora M. of Missouri, and the 1920 Booneville, Buffalo, and Buck Creek originals with the rejected Taylor, Marcum, Magee, McIntosh, Baker, and McPherson houses, the 1910 Sturgeon Gilbert×Josie house, Lynch’s wife Laura without a Newman on the original, and the Buffalo Baker household whose Soundex card misnamed Gilbert John as Robert, the 1910 Buffalo Gilbert, John house next door to Baker, Robert H., and the Soundex Douglas card that shows the clerks indexed filmed Buffalo sheets, the 1910 Buffalo Bales house first read as Bowman, and the 1920 Bowman Henry, Jack, and Dean George × Jane originals that are other people, and the filmed Buffalo Dean George × Martha house that is probably the 1910 couple, and Kentucky’s B-630 Barrett Ben given-name slot now every-leaf closed — the two Barrett, Ben heads are eighteen in Franklin and sixty in Livingston, and Owsley Barrett, Bent, twenty-four, is a Booneville house with Mary, Maybe, and Stanley, not the 1910 Buffalo Ben — and Kentucky’s B-630 Barrett Bruce given-name slot now every-leaf closed as well: card 2451 copies the original Buffalo Bruce house, Billy twenty-two is the next dwelling, and Board Bruce of Muhlenberg is another man, and Kentucky’s B-630 Barrett John given-name slot now every-leaf closed: there is no Barrett, John of about seventy-five in Owsley district 92 as a head, Madison John seventy-one with grandson Sam and Lee County John fifty-six with Hershel are other men, and Soundex Beard, John, seventy-one, of Owsley district 90 copies the original Island Creek house of Beard, John, Virginia-born, with Margruy[?] and Herbert, not the 1910 Buffalo Barrett John, and Kentucky’s B-630 Barrett James given-name slot now every-leaf closed as a hit: original Buffalo dwelling 102 is Barrett, James, thirty, with Ollie, Ivory, Pearl, and mother Susan, sixty-eight, a widow — probably the 1910 James twenty-three and Susan sixty-two — and John is not in that house, and the Lee given-name slot is now every-leaf closed with no Barrett, Lee of about forty-nine in Owsley district 92 as a head. Statewide Kentucky death index 1911–1920 has no Barrett, John of about seventy in Lee, Owsley, Clay, Jackson, Estill, or Breathitt; Lee’s 1913 John Barrett, twenty-eight, is William and M. Roberts’s son, not the 1910 man. Statewide Kentucky death index 1921–1930 still has no Barrett, John of about eighty in those neighboring counties except Lee’s 12 April 1925 John Barrett, about seventy, at Beattyville, parents blank, who is not merged. Owsley’s 4 February 1921 Susan Barrett, sixty-five, daughter of Lacy Abner and Sintha Combs, is not James’s mother sixty-eight. The 12 April 1930 original Buffalo schedule — district 95-6, sheet 6 A, dwelling 92 — is Barrett, James, forty-five, with Ollie, thirty-four, Minnie, Pearl thirteen, Virgie, Martha, and Horton; that is probably the 1920 house, and Soundex B-630 missed it. John and Susan are not in the house and are not Barrett heads in that entire Buffalo district. Statewide Kentucky death index 1931–1940 has no Barrett, John of about ninety in those neighboring counties; a 1937 John Barrett, eighty-nine, of Nicholas County, is not merged. The 1940 Owsley HTML has no James of about fifty with Ollie; James sixty with Martha is another couple. This volume folds those chats into one narrative. The case dossier remains the working file; this book is the public reading of it. Sibling work on Greene ED 37 through 41 is now on merged PR #26 through Pass 59; remaining Greene ED 38 B-sides, 1900 Liberty, and 1900 hh 85 are inventoried, not duplicated. Do not import their “Dora E. Stone” as this woman.</w:t>
       </w:r>
     </w:p>
     <w:p>
@@ -903,7 +903,7 @@
         <w:t>Susan</w:t>
       </w:r>
       <w:r>
-        <w:t xml:space="preserve">, sixty-eight, a widow. Kentucky’s B-630 card 3382 copies that original; the clerk’s ages thirty-six and Pearl two yield to the schedule. That is probably the 1910 Buffalo James of twenty-three and Susan of sixty-two: Barrett James plus Owsley Buffalo plus mother Susan. Ages thirty versus about thirty-three and sixty-eight versus about seventy-two are disclosed and not averaged. John is not in the house. Susan’s widow mark plus that absence is a possible death between 1910 and 1920, not a proved death. Statewide Kentucky death index 1911–1920 has no Barrett, John of about seventy in those neighboring counties. Lee’s 11 October 1913 John Barrett, twenty-eight, father William, mother M. Roberts, is another man. Statewide Kentucky death index 1921–1930 still has no Barrett, John of about eighty in those neighboring counties except Lee’s 12 April 1925 John Barrett, about seventy, at Beattyville, parents blank, who is not merged. Owsley’s 4 February 1921 Susan Barrett, sixty-five, daughter of Lacy Abner and Sintha Combs, is not James’s mother sixty-eight. Kentucky’s B-630 Lee given-name slot is now every-leaf closed: there is no Barrett, Lee of about forty-nine in Owsley district 92 as a head, and Lee is not in James’s house. Baird, Lee, forty-nine, of Clay is another man. Sheet 7 A dwelling </w:t>
+        <w:t xml:space="preserve">, sixty-eight, a widow. Kentucky’s B-630 card 3382 copies that original; the clerk’s ages thirty-six and Pearl two yield to the schedule. That is probably the 1910 Buffalo James of twenty-three and Susan of sixty-two: Barrett James plus Owsley Buffalo plus mother Susan. Ages thirty versus about thirty-three and sixty-eight versus about seventy-two are disclosed and not averaged. John is not in the house. Susan’s widow mark plus that absence is a possible death between 1910 and 1920, not a proved death. Statewide Kentucky death index 1911–1920 has no Barrett, John of about seventy in those neighboring counties. Lee’s 11 October 1913 John Barrett, twenty-eight, father William, mother M. Roberts, is another man. Statewide Kentucky death index 1921–1930 still has no Barrett, John of about eighty in those neighboring counties except Lee’s 12 April 1925 John Barrett, about seventy, at Beattyville, parents blank, who is not merged. Owsley’s 4 February 1921 Susan Barrett, sixty-five, daughter of Lacy Abner and Sintha Combs, is not James’s mother sixty-eight. The 12 April 1930 original Buffalo schedule — district 95-6, sheet 6 A, dwelling 92 — is Barrett, James, forty-five, with Ollie, thirty-four, Minnie fifteen, Pearl thirteen, Virgie nine, Martha five, and Horton three. That is probably the 1920 house: Barrett James with Ollie, Buffalo, and Pearl three to thirteen. Soundex B-630 missed it. James thirty to forty-five is plus fifteen in ten and is not averaged; Ivory versus Minnie is not merged; 1920 Pearl as a son versus 1930 Pearl as a daughter is disclosed. John and Susan are not in the house and are not Barrett heads in that entire Buffalo district. Statewide Kentucky death index 1931–1940 has no Barrett, John of about ninety in those neighboring counties; a 2 October 1937 John Barrett, eighty-nine, of Nicholas County, is not merged. The 1940 Owsley HTML has no James of about fifty with Ollie; James sixty with Martha is another couple. A 1933 Owsley James Barrett, thirty-four, son of Dan and Nancy Ann Bowles, is another man. Kentucky’s B-630 Lee given-name slot is now every-leaf closed: there is no Barrett, Lee of about forty-nine in Owsley district 92 as a head, and Lee is not in James’s house. Baird, Lee, forty-nine, of Clay is another man. Sheet 7 A dwelling </w:t>
       </w:r>
       <w:r>
         <w:rPr>
@@ -1551,7 +1551,7 @@
         <w:t>Dara</w:t>
       </w:r>
       <w:r>
-        <w:t>, forty — the enumerator wrote an open a, not o — is another person. Kentucky’s 1920 Soundex has no Manerva or Minerva Newman card, and the Walter given-name window has no Owsley or Lee Walter with Manerva. Kentucky’s 1920 death index has no Manerva Newnam row on 28 August; the Owsley table that day is an infant Bates. Mary Ann Smallwood, born April 1842, came from the Owsley Smallwoods. The 11 July 1918 cemetery date is still unmatched in Kentucky’s civil index. [C669] [C672] [C693] [C694] [C690] [C691] [C709] [C711] [C712] [C713] [C717] [C729] [C730] [C739] [C740] [C741] [C742] [C743] [C744] [C745] [C746] [C747] [C748] [C752] [C753] [C754] [C756] [C759] [C763] [C765] [C768] [C775] [C776] [C777] [C779] [C780] [C782] [C783] [C784] [C789] [C790] [C791] [C792] [C793] [C794] [C795] [C796] [C797] [C801] [C802] [C803] [C804] [C808] [C809] [C810] [C811] [C812] [C813] [C814] [C818] [C819] [C820] [C821] [C822] [C823] [C824] [C825] [C826] [C827] [C828] [C832] [C833] [C847] [C848] [C849] [C851] [C857] [C859] [C860] [C861] [C863] [C868] [C869] [C872] [C873] [C874] [C875] [C876] [C877] [C880] [C881] [C882] [C883] [C884] [C887] [C888] [C892] [C893] [C894] [C896] [C941] [C942] [C943] [C944] [C945] [C946] [C947] [C948] [C949] [C950] [C951] [C952] [C953] [C954] [C955] [C956] [C957] [C958] [C959] [C960] [C961] [C962] [C963] [C964] [C965] [C966] [C967] [C968]</w:t>
+        <w:t>, forty — the enumerator wrote an open a, not o — is another person. Kentucky’s 1920 Soundex has no Manerva or Minerva Newman card, and the Walter given-name window has no Owsley or Lee Walter with Manerva. Kentucky’s 1920 death index has no Manerva Newnam row on 28 August; the Owsley table that day is an infant Bates. Mary Ann Smallwood, born April 1842, came from the Owsley Smallwoods. The 11 July 1918 cemetery date is still unmatched in Kentucky’s civil index. [C669] [C672] [C693] [C694] [C690] [C691] [C709] [C711] [C712] [C713] [C717] [C729] [C730] [C739] [C740] [C741] [C742] [C743] [C744] [C745] [C746] [C747] [C748] [C752] [C753] [C754] [C756] [C759] [C763] [C765] [C768] [C775] [C776] [C777] [C779] [C780] [C782] [C783] [C784] [C789] [C790] [C791] [C792] [C793] [C794] [C795] [C796] [C797] [C801] [C802] [C803] [C804] [C808] [C809] [C810] [C811] [C812] [C813] [C814] [C818] [C819] [C820] [C821] [C822] [C823] [C824] [C825] [C826] [C827] [C828] [C832] [C833] [C847] [C848] [C849] [C851] [C857] [C859] [C860] [C861] [C863] [C868] [C869] [C872] [C873] [C874] [C875] [C876] [C877] [C880] [C881] [C882] [C883] [C884] [C887] [C888] [C892] [C893] [C894] [C896] [C941] [C942] [C943] [C944] [C945] [C946] [C947] [C948] [C949] [C950] [C951] [C952] [C953] [C954] [C955] [C956] [C957] [C958] [C959] [C960] [C961] [C962] [C963] [C964] [C965] [C966] [C967] [C968] [C969] [C970] [C971] [C972] [C973] [C974] [C975] [C976] [C977] [C978] [C979] [C980] [C981] [C982] [C983] [C984]</w:t>
       </w:r>
     </w:p>
     <w:p>

</xml_diff>

<commit_message>
Pass 123-124: close Pulaski Newman, Bath TINCHER, Fleming Dist 1.
Pulaski 1850 Andy I / Edward / Will I originals REJECT. Bath 6A-7A
Tincher households image-seen REJECT; county closed. Fleming Dist 1
John 55 / John 78 and Thomas 40 originals REJECT. Lawrence / Nicholas /
Boyle / Wayne compiled closed. Parents of 1928 Frank still PROBABLE.

Co-authored-by: blakereaganlaw <blakereaganlaw@gmail.com>
</commit_message>
<xml_diff>
--- a/research/dora-ella-newnam/book/Dora-Ella-Newnam-Stone-A-Life.docx
+++ b/research/dora-ella-newnam/book/Dora-Ella-Newnam-Stone-A-Life.docx
@@ -341,6 +341,41 @@
     </w:p>
     <w:p>
       <w:r>
+        <w:t>63. [Pass 118. Clark’s names end at the county total](#pass-118-clarks-names-end-at-the-county-total)</w:t>
+      </w:r>
+    </w:p>
+    <w:p>
+      <w:r>
+        <w:t>64. [Pass 119. Morgan’s index has no Newman](#pass-119-morgans-index-has-no-newman)</w:t>
+      </w:r>
+    </w:p>
+    <w:p>
+      <w:r>
+        <w:t>65. [Pass 120. Knox remaining, Floyd, Pike, and Harlan](#pass-120-knox-remaining-floyd-pike-and-harlan)</w:t>
+      </w:r>
+    </w:p>
+    <w:p>
+      <w:r>
+        <w:t>66. [Pass 121. Clay household 54 is a Tennessee boarder](#pass-121-clay-household-54-is-a-tennessee-boarder)</w:t>
+      </w:r>
+    </w:p>
+    <w:p>
+      <w:r>
+        <w:t>67. [Pass 122. Letcher’s every-name list has no Newman](#pass-122-letchers-every-name-list-has-no-newman)</w:t>
+      </w:r>
+    </w:p>
+    <w:p>
+      <w:r>
+        <w:t>68. [Pass 123. Pulaski’s three Newman heads are other men](#pass-123-pulaskis-three-newman-heads-are-other-men)</w:t>
+      </w:r>
+    </w:p>
+    <w:p>
+      <w:r>
+        <w:t>69. [Pass 124. Bath Tincher and Fleming Newman are other households](#pass-124-bath-tincher-and-fleming-newman-are-other-households)</w:t>
+      </w:r>
+    </w:p>
+    <w:p>
+      <w:r>
         <w:br w:type="page"/>
       </w:r>
     </w:p>
@@ -10156,6 +10191,156 @@
       </w:r>
     </w:p>
     <w:p>
+      <w:pPr>
+        <w:pStyle w:val="Heading2"/>
+      </w:pPr>
+      <w:r>
+        <w:t>Pass 118. Clark’s names end at the county total</w:t>
+      </w:r>
+    </w:p>
+    <w:p>
+      <w:r>
+        <w:t>August 1926 is still on film. The Library of Congress item for the *Dardanelle Post-Dispatch*, LCCN sn89051008, still reads `item.digitized: false`. Internet Archive Solr for that title in 1926 returned zero items again. Pope County Library Roll 5 is unchanged. The phone, 479-968-4368, is already recorded. [C1432] [S1077] [S1078]</w:t>
+      </w:r>
+    </w:p>
+    <w:p>
+      <w:r>
+        <w:t>Clark 1840 names are finished. Odd leaves n0005 through n0081 were walked: Haggard, Hampton, Bush, Quisenberry, Combs, Judy, Flynn. No Newman or Tincher head. Leaf n0081 closes with the county total for Winchester. The certificate remains n0083. [C1433] [C1434] [S1079] [S1080]</w:t>
+      </w:r>
+    </w:p>
+    <w:p>
+      <w:r>
+        <w:t>Owsley 1850 after the Newman cluster is finished. Name columns from n0394 through n0432 were walked. Leaf n0431 is still Owsley — 27 September 1850, Luther Broaddus. Leaf n0433 is Pendleton District 2: 27 August 1850, William Taylor. [C1435] [S1081] [S1082]</w:t>
+      </w:r>
+    </w:p>
+    <w:p>
+      <w:r>
+        <w:t>The S-K Tincher page at stamped 309 is now an original. Household 132 is Thomas Tincher, twenty-two, farmer, $215, Kentucky, with Margaret and a house of younger Tinchers. There is no William, no Rhoda about twenty-seven, no Decatur, no infant B. F. Rejected. The compiled index still lists Newman only on 299B–300A. [C1436] [C1437] [S1083] [S1084]</w:t>
+      </w:r>
+    </w:p>
+    <w:p>
+      <w:r>
+        <w:t>Knox 1850 on reel 209 is isolated from n0006 (W. W. Pope, 27 July) through Barbourville at n0158 (2 October). Morgan 1850 on reel 214 is isolated from n0174 (L. P. Turner) through n0351; n0352 is Muhlenberg. Montage samples on both counties show no Newman head. The full name-column walks remain. [C1438] [C1439] [S1086] [S1087]</w:t>
+      </w:r>
+    </w:p>
+    <w:p>
+      <w:r>
+        <w:t>No free license for William Newman and Rhoda Tincher appeared. H. H. Newman and Belinda Tincher, 27 February 1840 in Estill, stay a different couple. [C1440]</w:t>
+      </w:r>
+    </w:p>
+    <w:p>
+      <w:r>
+        <w:t xml:space="preserve">Parents remain </w:t>
+      </w:r>
+      <w:r>
+        <w:rPr>
+          <w:b/>
+        </w:rPr>
+        <w:t>probable</w:t>
+      </w:r>
+      <w:r>
+        <w:t xml:space="preserve">. William himself is still not on a living 1850 schedule. The 1860 widow Rhoda with B. F., seven, is still </w:t>
+      </w:r>
+      <w:r>
+        <w:rPr>
+          <w:b/>
+        </w:rPr>
+        <w:t>proven</w:t>
+      </w:r>
+      <w:r>
+        <w:t>. Conflict #28 stands. [C1441]</w:t>
+      </w:r>
+    </w:p>
+    <w:p>
+      <w:r>
+        <w:t xml:space="preserve">The other film items did not move. Hutchins FAQ 9938 is live again at libraryanswers.berea.edu: the 1899–1983 *Citizen* cards sit between rooms 228 and 229. The libraryguides path is still 404. No free June 1958 *Citizen* clip. No new M1509 card. FamilySearch 1146342, 127913, and 156057 returned 404 — roadblock step 60. Internet Archive reel 602 is still 515 images. USGenNet Lee wills, live this pass, still name Jane Steele Newman, Elizabeth Newnam, and Mary F. Newnam Tincher — not Samuel P. Certificate 17762 is unread. Do not print 1966. No new deceased McCoy or Rissie row. Do not print 1962. Grant, twenty-one, is still not merged with David F. David G. of 1984 is still </w:t>
+      </w:r>
+      <w:r>
+        <w:rPr>
+          <w:b/>
+        </w:rPr>
+        <w:t>possible</w:t>
+      </w:r>
+      <w:r>
+        <w:t xml:space="preserve"> as a junior only. Living 1950-line descendants are withheld. Districts 33-12 and 33-13 were not walked. Do not re-ask Tyler Phillips, Pope 479-968-4368, or Hutchins 859-985-3364. [C1442–C1450] [S1088–S1092]</w:t>
+      </w:r>
+    </w:p>
+    <w:p>
+      <w:pPr>
+        <w:pStyle w:val="Heading2"/>
+      </w:pPr>
+      <w:r>
+        <w:t>Pass 119. Morgan’s index has no Newman</w:t>
+      </w:r>
+    </w:p>
+    <w:p>
+      <w:r>
+        <w:t>August 1926 is still on film. The Library of Congress item for the *Dardanelle Post-Dispatch*, LCCN sn89051008, still reads `item.digitized: false`. Internet Archive Solr for that title in 1926 returned zero items again. Pope County Library Roll 5 is unchanged. The phone, 479-968-4368, is already recorded. [C1451] [S1093] [S1094]</w:t>
+      </w:r>
+    </w:p>
+    <w:p>
+      <w:r>
+        <w:t>Knox 1850 starts one leaf earlier than the last isolate. Leaf n0005 is Knox — 27 July 1850, W. W. Pope. Leaf n0158 is Barbourville, still Knox, 2 October. Leaf n0159 is a blank divider. Leaf n0160 is Larue: Hamilton District, 3 August 1850, J. H. Hamlin. Larue was not walked. [C1452] [C1453] [S1095] [S1096] [S1097]</w:t>
+      </w:r>
+    </w:p>
+    <w:p>
+      <w:r>
+        <w:t>Name columns from n0005 through n0158 are on disk. Machine reads (page and household-head crops) found no newman, newnam, or tincher token. Original name columns were read at n0006, n0012, n0024, n0032, n0040, n0048, n0056, n0064, n0072, n0080, n0088, n0096, n0104, n0112, n0120, n0136, n0144, and n0158: Bryant, Tye, Ingram, Farmer, Hopper, Barton, Haynes, Stewart, Disney, Helton, Taylor. No Newman or Tincher head on those leaves. The unread leaves between the samples remain. [C1454] [S1098] [S1099]</w:t>
+      </w:r>
+    </w:p>
+    <w:p>
+      <w:r>
+        <w:t>Morgan 1850 is finished. KYGenWeb’s 1850 surname index — a Word file extracted from the live county page — lists Needham, Nickell, Noble, and Norman under N. There is no Newman, no Newnam, no Tincher. “Newton” in the household files is a given name: Newton P. Reed, a lawyer, and children named Newton. [C1455] [C1456] [S1100] [S1101]</w:t>
+      </w:r>
+    </w:p>
+    <w:p>
+      <w:r>
+        <w:t>Leaf n0351 is the last Morgan sheet on the reel: Willis Williamson, then the assistant marshal’s certificate for the county of Morgan, November 1850. Leaf n0352 is Muhlenberg District 1. [C1457] [C1458] [S1102] [S1103]</w:t>
+      </w:r>
+    </w:p>
+    <w:p>
+      <w:r>
+        <w:t>No free license for William Newman and Rhoda Tincher appeared. An authored 1845 tree row was not used. H. H. Newman and Belinda Tincher, 27 February 1840 in Estill, stay a different couple. [C1459]</w:t>
+      </w:r>
+    </w:p>
+    <w:p>
+      <w:r>
+        <w:t xml:space="preserve">Parents remain </w:t>
+      </w:r>
+      <w:r>
+        <w:rPr>
+          <w:b/>
+        </w:rPr>
+        <w:t>probable</w:t>
+      </w:r>
+      <w:r>
+        <w:t xml:space="preserve">. William himself is still not on a living 1850 schedule. The 1860 widow Rhoda with B. F., seven, is still </w:t>
+      </w:r>
+      <w:r>
+        <w:rPr>
+          <w:b/>
+        </w:rPr>
+        <w:t>proven</w:t>
+      </w:r>
+      <w:r>
+        <w:t>. Conflict #28 stands. [C1460]</w:t>
+      </w:r>
+    </w:p>
+    <w:p>
+      <w:r>
+        <w:t xml:space="preserve">The other film items did not move. Hutchins FAQ 9938 is live at libraryanswers.berea.edu: the 1899–1983 *Citizen* cards sit between rooms 228 and 229. No free June 1958 *Citizen* clip. No new M1509 card. FamilySearch 1146342, 127913, and 156057 returned 404 — roadblock step 61. Internet Archive reel 602 is still 515 images. USGenNet Lee wills, live this pass, still name Jane Steele Newman, Elizabeth Newnam, and Mary F. Newnam Tincher — not Samuel P. Certificate 17762 is unread. Do not print 1966. No new deceased McCoy or Rissie row. Do not print 1962. Grant, twenty-one, is still not merged with David F. David G. of 1984 is still </w:t>
+      </w:r>
+      <w:r>
+        <w:rPr>
+          <w:b/>
+        </w:rPr>
+        <w:t>possible</w:t>
+      </w:r>
+      <w:r>
+        <w:t xml:space="preserve"> as a junior only. Living 1950-line descendants are withheld. Districts 33-12 and 33-13 were not walked. Do not re-ask Tyler Phillips, Pope 479-968-4368, or Hutchins 859-985-3364. [C1461–C1470] [S1106–S1110]</w:t>
+      </w:r>
+    </w:p>
+    <w:p>
       <w:r>
         <w:t xml:space="preserve">In Madison County in 1950 a </w:t>
       </w:r>
@@ -10475,6 +10660,428 @@
     <w:p>
       <w:r>
         <w:br w:type="page"/>
+      </w:r>
+    </w:p>
+    <w:p>
+      <w:pPr>
+        <w:pStyle w:val="Heading2"/>
+      </w:pPr>
+      <w:r>
+        <w:t>Pass 120. Knox remaining, Floyd, Pike, and Harlan</w:t>
+      </w:r>
+    </w:p>
+    <w:p>
+      <w:r>
+        <w:t>August 1926 is still on film. The Library of Congress item for the *Dardanelle Post-Dispatch*, LCCN sn89051008, still reads `item.digitized: false`. Internet Archive Solr for that title in 1926 returned zero items again. Pope County Library Roll 5 is unchanged. The phone, 479-968-4368, is already recorded. [C1471] [S1111] [S1112]</w:t>
+      </w:r>
+    </w:p>
+    <w:p>
+      <w:r>
+        <w:t>Knox 1850 name columns from n0005 through n0158 are finished. Seventy-seven two-up strips were read. First and last leaves were re-read. Machine tokens found no newman, newnam, or tincher. Leaf n0158 is Barbourville, still Knox. Leaf n0160 is Larue. Larue was not walked. [C1472] [C1473] [S1113] [S1114]</w:t>
+      </w:r>
+    </w:p>
+    <w:p>
+      <w:r>
+        <w:t>Floyd 1850 is finished on the compiled family-name index. N runs Neal through Nusom. T has no Tincher. Leaf n0003 isolates the county start: 20 July 1850, David Cooley, Daniel Steel, fifty-nine, physician, Stokes, North Carolina. Later samples reach Barren and Franklin. Not every-line original. [C1474] [C1475] [C1477] [S1115] [S1116]</w:t>
+      </w:r>
+    </w:p>
+    <w:p>
+      <w:r>
+        <w:t>Pike and Harlan close on S-K compiled indexes. Pike N is New, Newsom, Nichols, Nunery. Harlan N is Nance through Nunn, with Tinsley under T. Neither county has Newman or Tincher. Internet Archive reel 206 is Jefferson / Louisville — not Harlan. [C1480] [C1481] [C1482] [C1483] [S1120] [S1122]</w:t>
+      </w:r>
+    </w:p>
+    <w:p>
+      <w:r>
+        <w:t xml:space="preserve">No free license for William Newman and Rhoda Tincher appeared. Parents remain </w:t>
+      </w:r>
+      <w:r>
+        <w:rPr>
+          <w:b/>
+        </w:rPr>
+        <w:t>probable</w:t>
+      </w:r>
+      <w:r>
+        <w:t xml:space="preserve">. The 1860 widow Rhoda with B. F., seven, is still </w:t>
+      </w:r>
+      <w:r>
+        <w:rPr>
+          <w:b/>
+        </w:rPr>
+        <w:t>proven</w:t>
+      </w:r>
+      <w:r>
+        <w:t>. Conflict #28 stands. [C1484] [C1485]</w:t>
+      </w:r>
+    </w:p>
+    <w:p>
+      <w:r>
+        <w:t xml:space="preserve">The other film items did not move. Hutchins FAQ 9938 is live at libraryanswers.berea.edu. FamilySearch 1146342, 127913, and 156057 returned Incapsula 403 — roadblock step 62. Internet Archive reel 602 is still 515 images. USGenNet Lee wills still name Jane Steele Newman, Elizabeth Newnam, and Mary F. Newnam Tincher — not Samuel P. Do not print 1966. Do not print 1962. Grant, twenty-one, is still not merged with David F. David G. of 1984 is still </w:t>
+      </w:r>
+      <w:r>
+        <w:rPr>
+          <w:b/>
+        </w:rPr>
+        <w:t>possible</w:t>
+      </w:r>
+      <w:r>
+        <w:t xml:space="preserve"> as a junior only. Districts 33-12 and 33-13 were not walked. [C1486–C1490] [S1124–S1130]</w:t>
+      </w:r>
+    </w:p>
+    <w:p>
+      <w:pPr>
+        <w:pStyle w:val="Heading2"/>
+      </w:pPr>
+      <w:r>
+        <w:t>Pass 121. Clay household 54 is a Tennessee boarder</w:t>
+      </w:r>
+    </w:p>
+    <w:p>
+      <w:r>
+        <w:t xml:space="preserve">Clay 1850 household 54 is now an original. Leaf n0009 is stamped 299, 26 July 1850, Herschel White. John Hibbard, seventy-five, Virginia, farmer, $600, sits with Margaret, seventy-one, three Hibbard and Davis children, and </w:t>
+      </w:r>
+      <w:r>
+        <w:rPr>
+          <w:b/>
+        </w:rPr>
+        <w:t>William Newman, forty-two, male, Tennessee</w:t>
+      </w:r>
+      <w:r>
+        <w:t>. There is no Rhoda. There is no Decatur. There is no Leaner. Rejected against William × Rhoda. The earlier compiled reject is now image-seen. [C1491] [C1492] [S1131] [S1132] [S1133]</w:t>
+      </w:r>
+    </w:p>
+    <w:p>
+      <w:r>
+        <w:t xml:space="preserve">Parents remain </w:t>
+      </w:r>
+      <w:r>
+        <w:rPr>
+          <w:b/>
+        </w:rPr>
+        <w:t>probable</w:t>
+      </w:r>
+      <w:r>
+        <w:t>. The 1850 couple is still unread as a living head. Conflict #28 stands. Districts 33-12 and 33-13 were not walked. [C1493] [C1494] [C1495] [S1135]</w:t>
+      </w:r>
+    </w:p>
+    <w:p>
+      <w:pPr>
+        <w:pStyle w:val="Heading2"/>
+      </w:pPr>
+      <w:r>
+        <w:t>Pass 122. Letcher’s every-name list has no Newman</w:t>
+      </w:r>
+    </w:p>
+    <w:p>
+      <w:r>
+        <w:t>August 1926 is still on film. The Library of Congress item still reads `item.digitized: false`. Internet Archive Solr for 1926 returned zero items. Pope County Library Roll 5 is unchanged. The phone is already recorded. [C1496] [S1136] [S1137]</w:t>
+      </w:r>
+    </w:p>
+    <w:p>
+      <w:r>
+        <w:t>Letcher 1850 is finished. A 2013 Wayback copy of the RootsWeb every-name index lists 2,509 names on pages 125a–155b. Under N the names are Nicholas, Niece, and NS. Under T they are Taylor, Thacker, Thomas, and Tyre. There is no Newman, no Newnam, and no Tincher. [C1497] [S1138]</w:t>
+      </w:r>
+    </w:p>
+    <w:p>
+      <w:r>
+        <w:t>The original isolate matches that page range. Leaf n0531 is the last Lawrence sheet: 2 October 1850, J. W. Haws, Elizabeth Flannery, four. Leaf n0532 is Letcher District 2: 23 August 1850, P. H. Collier, stamped 125. Leaf n0560 is still District 2, 13 September, stamped 139, Martha Day, eighteen. Leaf n0590 is the first district, 30 August, J. M. Burns. The reel ends at n0591, a MICROCOPY 432 target. Not every-line original of fifty-nine pages. [C1498] [C1499] [C1500] [C1501] [S1139] [S1140] [S1141] [S1142]</w:t>
+      </w:r>
+    </w:p>
+    <w:p>
+      <w:r>
+        <w:t>Johnson 1850 closes on the S-K compiled index: Nelson, Nibert, Nichell, Nott. No Newman. No Tincher. Reel 208 leaf n0005 is Jessamine, not Johnson. [C1502] [S1143] [S1144]</w:t>
+      </w:r>
+    </w:p>
+    <w:p>
+      <w:r>
+        <w:t>Estill, Breathitt, and Madison S-K pages were re-read. They still show only the Newman and Tincher households already rejected on the originals. [C1503] [C1504] [C1505] [S1145] [S1146] [S1147]</w:t>
+      </w:r>
+    </w:p>
+    <w:p>
+      <w:r>
+        <w:t xml:space="preserve">No free license for William Newman and Rhoda Tincher appeared. Parents remain </w:t>
+      </w:r>
+      <w:r>
+        <w:rPr>
+          <w:b/>
+        </w:rPr>
+        <w:t>probable</w:t>
+      </w:r>
+      <w:r>
+        <w:t xml:space="preserve">. William himself is still not on a living 1850 schedule. The 1860 widow Rhoda with B. F., seven, is still </w:t>
+      </w:r>
+      <w:r>
+        <w:rPr>
+          <w:b/>
+        </w:rPr>
+        <w:t>proven</w:t>
+      </w:r>
+      <w:r>
+        <w:t xml:space="preserve">. Conflict #28 stands. Abner Newman on Estill 1840 n0092 stays </w:t>
+      </w:r>
+      <w:r>
+        <w:rPr>
+          <w:b/>
+        </w:rPr>
+        <w:t>possible</w:t>
+      </w:r>
+      <w:r>
+        <w:t xml:space="preserve"> only. [C1506] [C1507] [S1155]</w:t>
+      </w:r>
+    </w:p>
+    <w:p>
+      <w:r>
+        <w:t xml:space="preserve">The other film items did not move. Genealogy Trails Lee WWI tables are live and still name Luther Brandenburg and Underwood only. FamilySearch 1146342, 127913, and 156057 returned Incapsula 403 — roadblock step 63. USGenNet Lee wills still omit Samuel P. Hutchins FAQ 9938 is live. Reel 602 is still 515 images. Do not print 1966. Do not print 1962. Grant, twenty-one, is still not merged with David F. David G. of 1984 is still </w:t>
+      </w:r>
+      <w:r>
+        <w:rPr>
+          <w:b/>
+        </w:rPr>
+        <w:t>possible</w:t>
+      </w:r>
+      <w:r>
+        <w:t xml:space="preserve"> as a junior only. Living 1950-line descendants are withheld. Districts 33-12 and 33-13 were not walked. Do not re-ask Tyler Phillips, Pope 479-968-4368, or Hutchins 859-985-3364. [C1508–C1515] [S1149–S1155]</w:t>
+      </w:r>
+    </w:p>
+    <w:p>
+      <w:pPr>
+        <w:pStyle w:val="Heading2"/>
+      </w:pPr>
+      <w:r>
+        <w:t>Pass 123. Pulaski’s three Newman heads are other men</w:t>
+      </w:r>
+    </w:p>
+    <w:p>
+      <w:r>
+        <w:t>August 1926 is still on film. The Library of Congress item still reads `item.digitized: false`. Internet Archive Solr for 1926 returned zero items. The phone is already recorded. [C1516] [S1156] [S1157]</w:t>
+      </w:r>
+    </w:p>
+    <w:p>
+      <w:r>
+        <w:t xml:space="preserve">Lawrence 1850 closes on David May’s compiled list. Households 1–500 have no Newman or Tincher. Household 653 is Henry Newman, forty-four, a German blacksmith, with Agnus of Ireland — </w:t>
+      </w:r>
+      <w:r>
+        <w:rPr>
+          <w:b/>
+        </w:rPr>
+        <w:t>rejected</w:t>
+      </w:r>
+      <w:r>
+        <w:t xml:space="preserve">. Household 820 is Reynolds Newman, forty-five, of North Carolina, with Malinda and a son William, twelve — </w:t>
+      </w:r>
+      <w:r>
+        <w:rPr>
+          <w:b/>
+        </w:rPr>
+        <w:t>rejected</w:t>
+      </w:r>
+      <w:r>
+        <w:t>. The 1850 tax list names Reynolds only. [C1517] [C1518] [C1519] [C1520] [S1158] [S1159] [S1160]</w:t>
+      </w:r>
+    </w:p>
+    <w:p>
+      <w:r>
+        <w:t xml:space="preserve">Nicholas, Boyle, and Wayne close on S-K compiled N-windows. None of those counties lists Newman or Tincher. Wayne’s </w:t>
+      </w:r>
+      <w:r>
+        <w:rPr>
+          <w:b/>
+        </w:rPr>
+        <w:t>NEW</w:t>
+      </w:r>
+      <w:r>
+        <w:t xml:space="preserve"> is not Newman. [C1521] [C1522] [C1523] [S1161] [S1162] [S1163]</w:t>
+      </w:r>
+    </w:p>
+    <w:p>
+      <w:r>
+        <w:t xml:space="preserve">Pulaski is finished on the originals. The county historical society book indexes NEWMAN at pages 26, 27, and 78 only. Leaf n0157, 16 August 1850, stamped 27, is Andy I. Newman, forty-one, a North Carolina blacksmith, with Mary and seven children including a son William, fourteen — </w:t>
+      </w:r>
+      <w:r>
+        <w:rPr>
+          <w:b/>
+        </w:rPr>
+        <w:t>rejected</w:t>
+      </w:r>
+      <w:r>
+        <w:t xml:space="preserve">. Leaf n0158 is Edward Newman, sixty-four, of North Carolina, with Anna — </w:t>
+      </w:r>
+      <w:r>
+        <w:rPr>
+          <w:b/>
+        </w:rPr>
+        <w:t>rejected</w:t>
+      </w:r>
+      <w:r>
+        <w:t xml:space="preserve">. Leaf n0212, 7 September, stamped 42, is the S-K 42A household: Will I. Newman, thirty-one, of Virginia, farmer, $400, with Rachel, twenty-three, Sarah A., five, Elizabeth, four, and Martha, one — </w:t>
+      </w:r>
+      <w:r>
+        <w:rPr>
+          <w:b/>
+        </w:rPr>
+        <w:t>rejected</w:t>
+      </w:r>
+      <w:r>
+        <w:t>. Rachel is not Rhoda. Those children are not Decatur and Leaner. S-K NEWNAM 14A/14B is the page-14 window / NIKIRK, visually empty of Newnam. [C1524] [C1525] [C1526] [C1527] [C1528] [C1529] [S1164] [S1165] [S1166] [S1167] [S1169]</w:t>
+      </w:r>
+    </w:p>
+    <w:p>
+      <w:r>
+        <w:t xml:space="preserve">No free license for William Newman and Rhoda Tincher appeared. Parents remain </w:t>
+      </w:r>
+      <w:r>
+        <w:rPr>
+          <w:b/>
+        </w:rPr>
+        <w:t>probable</w:t>
+      </w:r>
+      <w:r>
+        <w:t>. Conflict #28 stands. [C1534] [C1535] [S1180]</w:t>
+      </w:r>
+    </w:p>
+    <w:p>
+      <w:pPr>
+        <w:pStyle w:val="Heading2"/>
+      </w:pPr>
+      <w:r>
+        <w:t>Pass 124. Bath Tincher and Fleming Newman are other households</w:t>
+      </w:r>
+    </w:p>
+    <w:p>
+      <w:r>
+        <w:t>August 1926 is still on film. `item.digitized` is still false. Solr is still zero. [C1541] [S1181] [S1182]</w:t>
+      </w:r>
+    </w:p>
+    <w:p>
+      <w:r>
+        <w:t xml:space="preserve">The Bath hunt had been pointed at the wrong pages. Leaf n0470 is still </w:t>
+      </w:r>
+      <w:r>
+        <w:rPr>
+          <w:b/>
+        </w:rPr>
+        <w:t>2d Division</w:t>
+      </w:r>
+      <w:r>
+        <w:t>, 6 September 1850, stamped 89 — not the 1st Division start. S-K page numbers are the stamped corners. Stewart on n0386 is page 4A; Shrout and Traylor on n0387 are 4B; Spence on n0388 is 5A. Tincher 6A/6B/7A is n0390–n0392. [C1542] [C1543] [S1183] [S1184]</w:t>
+      </w:r>
+    </w:p>
+    <w:p>
+      <w:r>
+        <w:t xml:space="preserve">On 23 July 1850, stamped 6, household 73 is John Tincher, twenty-six, farmer, with Ann, seventeen — </w:t>
+      </w:r>
+      <w:r>
+        <w:rPr>
+          <w:b/>
+        </w:rPr>
+        <w:t>rejected</w:t>
+      </w:r>
+      <w:r>
+        <w:t xml:space="preserve">. The same day, page 12, household 78 is Francis Tincher, thirty-six, a Virginia laborer, with Nancy and four daughters, Louisa, Alsey A., Aley A., and Kitty. Smoot at the foot marks 6B — </w:t>
+      </w:r>
+      <w:r>
+        <w:rPr>
+          <w:b/>
+        </w:rPr>
+        <w:t>rejected</w:t>
+      </w:r>
+      <w:r>
+        <w:t xml:space="preserve">. On 28 July, stamped 13, household 85 is John S. Tincher, forty-seven, a Virginia farmer, with Betsy, forty-two, Andrew, twenty-six, Abigail, sixteen, William, twenty (a son), George, thirteen, Mary, five, and Andrew, two — </w:t>
+      </w:r>
+      <w:r>
+        <w:rPr>
+          <w:b/>
+        </w:rPr>
+        <w:t>rejected</w:t>
+      </w:r>
+      <w:r>
+        <w:t>. William the son is not William the husband of Rhoda. Bath’s S-K N-window is Nelson, Newland, Nichol, Nicholas only. Bath 1850 is closed. [C1544] [C1545] [C1546] [C1547] [C1548] [S1185] [S1186] [S1187] [S1188]</w:t>
+      </w:r>
+    </w:p>
+    <w:p>
+      <w:r>
+        <w:t xml:space="preserve">Fleming District 1, 4 September 1850, stamped 309, shows Alexander Newman, forty-two, and Michael, twenty-one, in the Sapp house, and household 703 John Newman, fifty-five, of Kentucky, with Elizabeth, forty-eight, and six children — </w:t>
+      </w:r>
+      <w:r>
+        <w:rPr>
+          <w:b/>
+        </w:rPr>
+        <w:t>rejected</w:t>
+      </w:r>
+      <w:r>
+        <w:t xml:space="preserve">. On 27 September, household 1022 is John Newman, seventy-eight, a Virginia auctioneer, with Elizabeth, sixty-three, of Maryland. That is S-K 331B — </w:t>
+      </w:r>
+      <w:r>
+        <w:rPr>
+          <w:b/>
+        </w:rPr>
+        <w:t>rejected</w:t>
+      </w:r>
+      <w:r>
+        <w:t xml:space="preserve">. On 27 August in the 2nd Division, household 270 is Thomas Newman, forty, with Margarett and five children including James M., fourteen, of Indiana — </w:t>
+      </w:r>
+      <w:r>
+        <w:rPr>
+          <w:b/>
+        </w:rPr>
+        <w:t>rejected</w:t>
+      </w:r>
+      <w:r>
+        <w:t xml:space="preserve">. Debra Rigdon’s compiled list adds Samuel, thirty-seven, with Sarah; James, thirty-seven, with Mary Ann; and John D., forty-eight, with Manerva Jane — all </w:t>
+      </w:r>
+      <w:r>
+        <w:rPr>
+          <w:b/>
+        </w:rPr>
+        <w:t>rejected</w:t>
+      </w:r>
+      <w:r>
+        <w:t>. District 1 Newman originals are closed. Page 395A remains a residual. [C1549] [C1550] [C1551] [C1552] [C1553] [S1189] [S1190] [S1191] [S1192]</w:t>
+      </w:r>
+    </w:p>
+    <w:p>
+      <w:r>
+        <w:t xml:space="preserve">No free license appeared. Parents remain </w:t>
+      </w:r>
+      <w:r>
+        <w:rPr>
+          <w:b/>
+        </w:rPr>
+        <w:t>probable</w:t>
+      </w:r>
+      <w:r>
+        <w:t xml:space="preserve">. The 1860 widow Rhoda with B. F., seven, is still </w:t>
+      </w:r>
+      <w:r>
+        <w:rPr>
+          <w:b/>
+        </w:rPr>
+        <w:t>proven</w:t>
+      </w:r>
+      <w:r>
+        <w:t xml:space="preserve">. Conflict #28 stands. Abner Newman on Estill 1840 n0092 stays </w:t>
+      </w:r>
+      <w:r>
+        <w:rPr>
+          <w:b/>
+        </w:rPr>
+        <w:t>possible</w:t>
+      </w:r>
+      <w:r>
+        <w:t xml:space="preserve"> only. [C1554] [C1555] [S1210]</w:t>
+      </w:r>
+    </w:p>
+    <w:p>
+      <w:r>
+        <w:t xml:space="preserve">Genealogy Trails Lee WWI tables are live and still name Luther Brandenburg and Underwood only. FamilySearch 1146342, 127913, and 156057 returned SPA shells — roadblock step 65. USGenNet Lee wills still omit Samuel P. Hutchins FAQ 9938 is live. Reel 602 is still 515 images. Do not print 1966. Do not print 1962. Grant, twenty-one, is still not merged with David F. David G. of 1984 is still </w:t>
+      </w:r>
+      <w:r>
+        <w:rPr>
+          <w:b/>
+        </w:rPr>
+        <w:t>possible</w:t>
+      </w:r>
+      <w:r>
+        <w:t xml:space="preserve"> as a junior only. Living 1950-line descendants are withheld. Districts 33-12 and 33-13 were not walked. Do not re-ask Tyler Phillips, Pope 479-968-4368, or Hutchins 859-985-3364. [C1556–C1560] [S1195–S1210]</w:t>
       </w:r>
     </w:p>
     <w:p>
@@ -29877,6 +30484,1882 @@
     </w:p>
     <w:p>
       <w:r>
+        <w:t xml:space="preserve">274. LOC [sn89051008](https://www.loc.gov/item/sn89051008/) `item.digitized: false`. IA Solr Post-Dispatch 1926 </w:t>
+      </w:r>
+      <w:r>
+        <w:rPr>
+          <w:b/>
+        </w:rPr>
+        <w:t>0</w:t>
+      </w:r>
+      <w:r>
+        <w:t xml:space="preserve">. Film unread. *Catalog.* </w:t>
+      </w:r>
+      <w:r>
+        <w:rPr>
+          <w:b/>
+        </w:rPr>
+        <w:t>C1432</w:t>
+      </w:r>
+      <w:r>
+        <w:t xml:space="preserve"> </w:t>
+      </w:r>
+      <w:r>
+        <w:rPr>
+          <w:b/>
+        </w:rPr>
+        <w:t>S1077 S1078</w:t>
+      </w:r>
+      <w:r>
+        <w:t>.</w:t>
+      </w:r>
+    </w:p>
+    <w:p>
+      <w:r>
+        <w:t xml:space="preserve">275. 1840 U.S. census, Clark County, Kentucky. IA [`populationsc18400108unit`](https://archive.org/details/populationsc18400108unit) odd names n0005–n0081 </w:t>
+      </w:r>
+      <w:r>
+        <w:rPr>
+          <w:b/>
+        </w:rPr>
+        <w:t>visually</w:t>
+      </w:r>
+      <w:r>
+        <w:t xml:space="preserve"> read — </w:t>
+      </w:r>
+      <w:r>
+        <w:rPr>
+          <w:b/>
+        </w:rPr>
+        <w:t>nil</w:t>
+      </w:r>
+      <w:r>
+        <w:t xml:space="preserve"> Newman/Tincher. n0081 Total County / Winchester. *Image seen.* </w:t>
+      </w:r>
+      <w:r>
+        <w:rPr>
+          <w:b/>
+        </w:rPr>
+        <w:t>C1433 C1434</w:t>
+      </w:r>
+      <w:r>
+        <w:t xml:space="preserve"> </w:t>
+      </w:r>
+      <w:r>
+        <w:rPr>
+          <w:b/>
+        </w:rPr>
+        <w:t>S1079 S1080</w:t>
+      </w:r>
+      <w:r>
+        <w:t>.</w:t>
+      </w:r>
+    </w:p>
+    <w:p>
+      <w:r>
+        <w:t xml:space="preserve">276. 1850 U.S. census, Owsley County, Kentucky. IA [`populationschedu0216unix`](https://archive.org/details/populationschedu0216unix) n0394–n0432 </w:t>
+      </w:r>
+      <w:r>
+        <w:rPr>
+          <w:b/>
+        </w:rPr>
+        <w:t>nil</w:t>
+      </w:r>
+      <w:r>
+        <w:t xml:space="preserve"> William × Rhoda. n0433 </w:t>
+      </w:r>
+      <w:r>
+        <w:rPr>
+          <w:b/>
+        </w:rPr>
+        <w:t>Pendleton</w:t>
+      </w:r>
+      <w:r>
+        <w:t xml:space="preserve">. n0408 stamped </w:t>
+      </w:r>
+      <w:r>
+        <w:rPr>
+          <w:b/>
+        </w:rPr>
+        <w:t>309</w:t>
+      </w:r>
+      <w:r>
+        <w:t xml:space="preserve"> hh </w:t>
+      </w:r>
+      <w:r>
+        <w:rPr>
+          <w:b/>
+        </w:rPr>
+        <w:t>132</w:t>
+      </w:r>
+      <w:r>
+        <w:t xml:space="preserve"> Thos. Tincher </w:t>
+      </w:r>
+      <w:r>
+        <w:rPr>
+          <w:b/>
+        </w:rPr>
+        <w:t>22</w:t>
+      </w:r>
+      <w:r>
+        <w:t xml:space="preserve"> </w:t>
+      </w:r>
+      <w:r>
+        <w:rPr>
+          <w:b/>
+        </w:rPr>
+        <w:t>REJECT</w:t>
+      </w:r>
+      <w:r>
+        <w:t xml:space="preserve">. [S-K Owsley 1850](https://www.skcensus.com/1850-census-index-owsley-county-kentucky/) NEWMAN </w:t>
+      </w:r>
+      <w:r>
+        <w:rPr>
+          <w:b/>
+        </w:rPr>
+        <w:t>299B–300A</w:t>
+      </w:r>
+      <w:r>
+        <w:t xml:space="preserve"> only. *Image seen / index.* </w:t>
+      </w:r>
+      <w:r>
+        <w:rPr>
+          <w:b/>
+        </w:rPr>
+        <w:t>C1435 C1436 C1437</w:t>
+      </w:r>
+      <w:r>
+        <w:t xml:space="preserve"> </w:t>
+      </w:r>
+      <w:r>
+        <w:rPr>
+          <w:b/>
+        </w:rPr>
+        <w:t>S1081–S1084</w:t>
+      </w:r>
+      <w:r>
+        <w:t>.</w:t>
+      </w:r>
+    </w:p>
+    <w:p>
+      <w:r>
+        <w:t xml:space="preserve">277. Knox 1850 isolate n0006–n0158; Morgan 1850 isolate n0174–n0351. Montage samples </w:t>
+      </w:r>
+      <w:r>
+        <w:rPr>
+          <w:b/>
+        </w:rPr>
+        <w:t>nil</w:t>
+      </w:r>
+      <w:r>
+        <w:t xml:space="preserve"> Newman head. *Image seen.* </w:t>
+      </w:r>
+      <w:r>
+        <w:rPr>
+          <w:b/>
+        </w:rPr>
+        <w:t>C1438 C1439</w:t>
+      </w:r>
+      <w:r>
+        <w:t xml:space="preserve"> </w:t>
+      </w:r>
+      <w:r>
+        <w:rPr>
+          <w:b/>
+        </w:rPr>
+        <w:t>S1086 S1087</w:t>
+      </w:r>
+      <w:r>
+        <w:t>.</w:t>
+      </w:r>
+    </w:p>
+    <w:p>
+      <w:r>
+        <w:t xml:space="preserve">278. No free William × Rhoda license. Parents still </w:t>
+      </w:r>
+      <w:r>
+        <w:rPr>
+          <w:b/>
+        </w:rPr>
+        <w:t>PROBABLE</w:t>
+      </w:r>
+      <w:r>
+        <w:t xml:space="preserve">. 1860 Rhoda widow + B.F. </w:t>
+      </w:r>
+      <w:r>
+        <w:rPr>
+          <w:b/>
+        </w:rPr>
+        <w:t>7</w:t>
+      </w:r>
+      <w:r>
+        <w:t xml:space="preserve"> </w:t>
+      </w:r>
+      <w:r>
+        <w:rPr>
+          <w:b/>
+        </w:rPr>
+        <w:t>PROVEN</w:t>
+      </w:r>
+      <w:r>
+        <w:t xml:space="preserve">. #28 stands. *Negative / analysis.* </w:t>
+      </w:r>
+      <w:r>
+        <w:rPr>
+          <w:b/>
+        </w:rPr>
+        <w:t>C1440 C1441</w:t>
+      </w:r>
+      <w:r>
+        <w:t xml:space="preserve"> </w:t>
+      </w:r>
+      <w:r>
+        <w:rPr>
+          <w:b/>
+        </w:rPr>
+        <w:t>S1092</w:t>
+      </w:r>
+      <w:r>
+        <w:t>.</w:t>
+      </w:r>
+    </w:p>
+    <w:p>
+      <w:r>
+        <w:t xml:space="preserve">279. Hutchins [FAQ 9938](https://libraryanswers.berea.edu/faq/9938) </w:t>
+      </w:r>
+      <w:r>
+        <w:rPr>
+          <w:b/>
+        </w:rPr>
+        <w:t>LIVE</w:t>
+      </w:r>
+      <w:r>
+        <w:t xml:space="preserve"> cards </w:t>
+      </w:r>
+      <w:r>
+        <w:rPr>
+          <w:b/>
+        </w:rPr>
+        <w:t>228–229</w:t>
+      </w:r>
+      <w:r>
+        <w:t xml:space="preserve">. FS </w:t>
+      </w:r>
+      <w:r>
+        <w:rPr>
+          <w:b/>
+        </w:rPr>
+        <w:t>404</w:t>
+      </w:r>
+      <w:r>
+        <w:t xml:space="preserve"> (R011-60). IA </w:t>
+      </w:r>
+      <w:r>
+        <w:rPr>
+          <w:b/>
+        </w:rPr>
+        <w:t>602</w:t>
+      </w:r>
+      <w:r>
+        <w:t xml:space="preserve"> still </w:t>
+      </w:r>
+      <w:r>
+        <w:rPr>
+          <w:b/>
+        </w:rPr>
+        <w:t>515</w:t>
+      </w:r>
+      <w:r>
+        <w:t xml:space="preserve">. USGenNet wills no Samuel P. Do not print 1966 or 1962. *Catalog.* </w:t>
+      </w:r>
+      <w:r>
+        <w:rPr>
+          <w:b/>
+        </w:rPr>
+        <w:t>C1442–C1450</w:t>
+      </w:r>
+      <w:r>
+        <w:t xml:space="preserve"> </w:t>
+      </w:r>
+      <w:r>
+        <w:rPr>
+          <w:b/>
+        </w:rPr>
+        <w:t>S1088–S1092</w:t>
+      </w:r>
+      <w:r>
+        <w:t>.</w:t>
+      </w:r>
+    </w:p>
+    <w:p>
+      <w:r>
+        <w:t xml:space="preserve">280. LOC [sn89051008](https://www.loc.gov/item/sn89051008/) `item.digitized: false` (pass 119). IA Solr Post-Dispatch 1926 </w:t>
+      </w:r>
+      <w:r>
+        <w:rPr>
+          <w:b/>
+        </w:rPr>
+        <w:t>0</w:t>
+      </w:r>
+      <w:r>
+        <w:t xml:space="preserve">. Film unread. *Catalog.* </w:t>
+      </w:r>
+      <w:r>
+        <w:rPr>
+          <w:b/>
+        </w:rPr>
+        <w:t>C1451</w:t>
+      </w:r>
+      <w:r>
+        <w:t xml:space="preserve"> </w:t>
+      </w:r>
+      <w:r>
+        <w:rPr>
+          <w:b/>
+        </w:rPr>
+        <w:t>S1093 S1094</w:t>
+      </w:r>
+      <w:r>
+        <w:t>.</w:t>
+      </w:r>
+    </w:p>
+    <w:p>
+      <w:r>
+        <w:t xml:space="preserve">281. 1850 U.S. census, Knox County, Kentucky. IA [`populationschedu0209unix`](https://archive.org/details/populationschedu0209unix) n0005 Knox start (27 July, W.W. Pope); n0158 Barbourville last named Knox; n0159 blank; n0160 </w:t>
+      </w:r>
+      <w:r>
+        <w:rPr>
+          <w:b/>
+        </w:rPr>
+        <w:t>Larue</w:t>
+      </w:r>
+      <w:r>
+        <w:t xml:space="preserve">. *Image seen.* </w:t>
+      </w:r>
+      <w:r>
+        <w:rPr>
+          <w:b/>
+        </w:rPr>
+        <w:t>C1452 C1453</w:t>
+      </w:r>
+      <w:r>
+        <w:t xml:space="preserve"> </w:t>
+      </w:r>
+      <w:r>
+        <w:rPr>
+          <w:b/>
+        </w:rPr>
+        <w:t>S1095 S1096 S1097</w:t>
+      </w:r>
+      <w:r>
+        <w:t>.</w:t>
+      </w:r>
+    </w:p>
+    <w:p>
+      <w:r>
+        <w:t xml:space="preserve">282. Knox name columns n0005–n0158 OCR token-nil. Visual samples listed in the extract </w:t>
+      </w:r>
+      <w:r>
+        <w:rPr>
+          <w:b/>
+        </w:rPr>
+        <w:t>nil</w:t>
+      </w:r>
+      <w:r>
+        <w:t xml:space="preserve"> Newman/Tincher. Remaining leaves residual. *Image seen / OCR draft.* </w:t>
+      </w:r>
+      <w:r>
+        <w:rPr>
+          <w:b/>
+        </w:rPr>
+        <w:t>C1454</w:t>
+      </w:r>
+      <w:r>
+        <w:t xml:space="preserve"> </w:t>
+      </w:r>
+      <w:r>
+        <w:rPr>
+          <w:b/>
+        </w:rPr>
+        <w:t>S1098 S1099</w:t>
+      </w:r>
+      <w:r>
+        <w:t>.</w:t>
+      </w:r>
+    </w:p>
+    <w:p>
+      <w:r>
+        <w:t xml:space="preserve">283. [KYGenWeb Morgan 1850 index](https://kygenweb.net/morgan/census/1850CList.html) `1850Index.doc`: N = Needham / Nickell / Noble / Norman only. Newton = given name. *Transcription.* </w:t>
+      </w:r>
+      <w:r>
+        <w:rPr>
+          <w:b/>
+        </w:rPr>
+        <w:t>C1455 C1456</w:t>
+      </w:r>
+      <w:r>
+        <w:t xml:space="preserve"> </w:t>
+      </w:r>
+      <w:r>
+        <w:rPr>
+          <w:b/>
+        </w:rPr>
+        <w:t>S1100 S1101</w:t>
+      </w:r>
+      <w:r>
+        <w:t>.</w:t>
+      </w:r>
+    </w:p>
+    <w:p>
+      <w:r>
+        <w:t xml:space="preserve">284. 1850 U.S. census, Morgan County, Kentucky. IA [`populationschedu0214unix`](https://archive.org/details/populationschedu0214unix) n0351 November 1850 certificate; n0352 </w:t>
+      </w:r>
+      <w:r>
+        <w:rPr>
+          <w:b/>
+        </w:rPr>
+        <w:t>Muhlenberg</w:t>
+      </w:r>
+      <w:r>
+        <w:t xml:space="preserve">. County </w:t>
+      </w:r>
+      <w:r>
+        <w:rPr>
+          <w:b/>
+        </w:rPr>
+        <w:t>CLOSED</w:t>
+      </w:r>
+      <w:r>
+        <w:t xml:space="preserve">. *Image seen / index.* </w:t>
+      </w:r>
+      <w:r>
+        <w:rPr>
+          <w:b/>
+        </w:rPr>
+        <w:t>C1457 C1458</w:t>
+      </w:r>
+      <w:r>
+        <w:t xml:space="preserve"> </w:t>
+      </w:r>
+      <w:r>
+        <w:rPr>
+          <w:b/>
+        </w:rPr>
+        <w:t>S1102 S1103 S1104</w:t>
+      </w:r>
+      <w:r>
+        <w:t>.</w:t>
+      </w:r>
+    </w:p>
+    <w:p>
+      <w:r>
+        <w:t xml:space="preserve">285. No free William × Rhoda license. Parents still </w:t>
+      </w:r>
+      <w:r>
+        <w:rPr>
+          <w:b/>
+        </w:rPr>
+        <w:t>PROBABLE</w:t>
+      </w:r>
+      <w:r>
+        <w:t xml:space="preserve">. 1860 Rhoda widow + B.F. </w:t>
+      </w:r>
+      <w:r>
+        <w:rPr>
+          <w:b/>
+        </w:rPr>
+        <w:t>7</w:t>
+      </w:r>
+      <w:r>
+        <w:t xml:space="preserve"> </w:t>
+      </w:r>
+      <w:r>
+        <w:rPr>
+          <w:b/>
+        </w:rPr>
+        <w:t>PROVEN</w:t>
+      </w:r>
+      <w:r>
+        <w:t xml:space="preserve">. #28 stands. *Negative / analysis.* </w:t>
+      </w:r>
+      <w:r>
+        <w:rPr>
+          <w:b/>
+        </w:rPr>
+        <w:t>C1459 C1460</w:t>
+      </w:r>
+      <w:r>
+        <w:t xml:space="preserve"> </w:t>
+      </w:r>
+      <w:r>
+        <w:rPr>
+          <w:b/>
+        </w:rPr>
+        <w:t>S1105</w:t>
+      </w:r>
+      <w:r>
+        <w:t>.</w:t>
+      </w:r>
+    </w:p>
+    <w:p>
+      <w:r>
+        <w:t xml:space="preserve">286. GT [Lee WWI](https://www.genealogytrails.com/ken/lee/wwi_draft_cards.html) </w:t>
+      </w:r>
+      <w:r>
+        <w:rPr>
+          <w:b/>
+        </w:rPr>
+        <w:t>LIVE</w:t>
+      </w:r>
+      <w:r>
+        <w:t xml:space="preserve"> </w:t>
+      </w:r>
+      <w:r>
+        <w:rPr>
+          <w:b/>
+        </w:rPr>
+        <w:t>452540</w:t>
+      </w:r>
+      <w:r>
+        <w:t xml:space="preserve"> nil Newnam. FS </w:t>
+      </w:r>
+      <w:r>
+        <w:rPr>
+          <w:b/>
+        </w:rPr>
+        <w:t>404</w:t>
+      </w:r>
+      <w:r>
+        <w:t xml:space="preserve"> (R011-61). IA </w:t>
+      </w:r>
+      <w:r>
+        <w:rPr>
+          <w:b/>
+        </w:rPr>
+        <w:t>602</w:t>
+      </w:r>
+      <w:r>
+        <w:t xml:space="preserve"> still </w:t>
+      </w:r>
+      <w:r>
+        <w:rPr>
+          <w:b/>
+        </w:rPr>
+        <w:t>515</w:t>
+      </w:r>
+      <w:r>
+        <w:t xml:space="preserve">. USGenNet wills Jane Steele / Elizabeth / Mary F. — no Samuel P. Hutchins [FAQ 9938](https://libraryanswers.berea.edu/faq/9938) </w:t>
+      </w:r>
+      <w:r>
+        <w:rPr>
+          <w:b/>
+        </w:rPr>
+        <w:t>LIVE</w:t>
+      </w:r>
+      <w:r>
+        <w:t xml:space="preserve">. Cert </w:t>
+      </w:r>
+      <w:r>
+        <w:rPr>
+          <w:b/>
+        </w:rPr>
+        <w:t>17762</w:t>
+      </w:r>
+      <w:r>
+        <w:t xml:space="preserve"> unread. Do not print 1966 or 1962. *Catalog.* </w:t>
+      </w:r>
+      <w:r>
+        <w:rPr>
+          <w:b/>
+        </w:rPr>
+        <w:t>C1461–C1470</w:t>
+      </w:r>
+      <w:r>
+        <w:t xml:space="preserve"> </w:t>
+      </w:r>
+      <w:r>
+        <w:rPr>
+          <w:b/>
+        </w:rPr>
+        <w:t>S1106–S1110</w:t>
+      </w:r>
+      <w:r>
+        <w:t>.</w:t>
+      </w:r>
+    </w:p>
+    <w:p>
+      <w:r>
+        <w:t xml:space="preserve">287. LOC [sn89051008](https://www.loc.gov/item/sn89051008/) `item.digitized: false` (pass 120). IA Solr Post-Dispatch 1926 </w:t>
+      </w:r>
+      <w:r>
+        <w:rPr>
+          <w:b/>
+        </w:rPr>
+        <w:t>0</w:t>
+      </w:r>
+      <w:r>
+        <w:t xml:space="preserve">. Film unread. *Catalog.* </w:t>
+      </w:r>
+      <w:r>
+        <w:rPr>
+          <w:b/>
+        </w:rPr>
+        <w:t>C1471</w:t>
+      </w:r>
+      <w:r>
+        <w:t xml:space="preserve"> </w:t>
+      </w:r>
+      <w:r>
+        <w:rPr>
+          <w:b/>
+        </w:rPr>
+        <w:t>S1111 S1112</w:t>
+      </w:r>
+      <w:r>
+        <w:t>.</w:t>
+      </w:r>
+    </w:p>
+    <w:p>
+      <w:r>
+        <w:t xml:space="preserve">288. 1850 U.S. census, Knox County, Kentucky. IA [`populationschedu0209unix`](https://archive.org/details/populationschedu0209unix) n0005–n0158 seventy-seven two-ups + OCR token-nil. County </w:t>
+      </w:r>
+      <w:r>
+        <w:rPr>
+          <w:b/>
+        </w:rPr>
+        <w:t>CLOSED</w:t>
+      </w:r>
+      <w:r>
+        <w:t xml:space="preserve">. *Image seen / OCR draft.* </w:t>
+      </w:r>
+      <w:r>
+        <w:rPr>
+          <w:b/>
+        </w:rPr>
+        <w:t>C1472 C1473</w:t>
+      </w:r>
+      <w:r>
+        <w:t xml:space="preserve"> </w:t>
+      </w:r>
+      <w:r>
+        <w:rPr>
+          <w:b/>
+        </w:rPr>
+        <w:t>S1113 S1114</w:t>
+      </w:r>
+      <w:r>
+        <w:t>.</w:t>
+      </w:r>
+    </w:p>
+    <w:p>
+      <w:r>
+        <w:t xml:space="preserve">289. [KYGenWeb Floyd 1850 family-name index](https://kygenweb.net/floyd/records/census/1850-census-index.html) N = NEAL…NUSOM. IA [`populationschedu0200unix`](https://archive.org/details/populationschedu0200unix) n0003 Floyd start. County </w:t>
+      </w:r>
+      <w:r>
+        <w:rPr>
+          <w:b/>
+        </w:rPr>
+        <w:t>CLOSED</w:t>
+      </w:r>
+      <w:r>
+        <w:t xml:space="preserve"> compiled. *Transcription / image seen.* </w:t>
+      </w:r>
+      <w:r>
+        <w:rPr>
+          <w:b/>
+        </w:rPr>
+        <w:t>C1474 C1475 C1477</w:t>
+      </w:r>
+      <w:r>
+        <w:t xml:space="preserve"> </w:t>
+      </w:r>
+      <w:r>
+        <w:rPr>
+          <w:b/>
+        </w:rPr>
+        <w:t>S1115 S1116</w:t>
+      </w:r>
+      <w:r>
+        <w:t>.</w:t>
+      </w:r>
+    </w:p>
+    <w:p>
+      <w:r>
+        <w:t xml:space="preserve">290. [S-K Pike 1850](https://www.skcensus.com/1850-census-index-pike-county-kentucky/) NEW/NEWSOM/NICHOLS/NUNERY. [S-K Harlan 1850](https://www.skcensus.com/1850-census-index-harlan-county-kentucky/) NANCE…NUNN. IA reel 206 = Jefferson. *Index / catalog.* </w:t>
+      </w:r>
+      <w:r>
+        <w:rPr>
+          <w:b/>
+        </w:rPr>
+        <w:t>C1480–C1483</w:t>
+      </w:r>
+      <w:r>
+        <w:t xml:space="preserve"> </w:t>
+      </w:r>
+      <w:r>
+        <w:rPr>
+          <w:b/>
+        </w:rPr>
+        <w:t>S1120–S1123</w:t>
+      </w:r>
+      <w:r>
+        <w:t>.</w:t>
+      </w:r>
+    </w:p>
+    <w:p>
+      <w:r>
+        <w:t xml:space="preserve">291. No free William × Rhoda license. Parents still </w:t>
+      </w:r>
+      <w:r>
+        <w:rPr>
+          <w:b/>
+        </w:rPr>
+        <w:t>PROBABLE</w:t>
+      </w:r>
+      <w:r>
+        <w:t xml:space="preserve">. 1860 Rhoda widow + B.F. </w:t>
+      </w:r>
+      <w:r>
+        <w:rPr>
+          <w:b/>
+        </w:rPr>
+        <w:t>7</w:t>
+      </w:r>
+      <w:r>
+        <w:t xml:space="preserve"> </w:t>
+      </w:r>
+      <w:r>
+        <w:rPr>
+          <w:b/>
+        </w:rPr>
+        <w:t>PROVEN</w:t>
+      </w:r>
+      <w:r>
+        <w:t xml:space="preserve">. #28 stands. *Negative / analysis.* </w:t>
+      </w:r>
+      <w:r>
+        <w:rPr>
+          <w:b/>
+        </w:rPr>
+        <w:t>C1484 C1485</w:t>
+      </w:r>
+      <w:r>
+        <w:t xml:space="preserve"> </w:t>
+      </w:r>
+      <w:r>
+        <w:rPr>
+          <w:b/>
+        </w:rPr>
+        <w:t>S1130</w:t>
+      </w:r>
+      <w:r>
+        <w:t>.</w:t>
+      </w:r>
+    </w:p>
+    <w:p>
+      <w:r>
+        <w:t xml:space="preserve">292. Clay 1850 n0009 stamped </w:t>
+      </w:r>
+      <w:r>
+        <w:rPr>
+          <w:b/>
+        </w:rPr>
+        <w:t>299</w:t>
+      </w:r>
+      <w:r>
+        <w:t xml:space="preserve"> hh </w:t>
+      </w:r>
+      <w:r>
+        <w:rPr>
+          <w:b/>
+        </w:rPr>
+        <w:t>54</w:t>
+      </w:r>
+      <w:r>
+        <w:t xml:space="preserve"> John Hibbard </w:t>
+      </w:r>
+      <w:r>
+        <w:rPr>
+          <w:b/>
+        </w:rPr>
+        <w:t>75</w:t>
+      </w:r>
+      <w:r>
+        <w:t xml:space="preserve"> Va + </w:t>
+      </w:r>
+      <w:r>
+        <w:rPr>
+          <w:b/>
+        </w:rPr>
+        <w:t>William Newman 42</w:t>
+      </w:r>
+      <w:r>
+        <w:t xml:space="preserve"> M Ten. IA [`populationschedu0197unix`](https://archive.org/details/populationschedu0197unix). </w:t>
+      </w:r>
+      <w:r>
+        <w:rPr>
+          <w:b/>
+        </w:rPr>
+        <w:t>REJECT</w:t>
+      </w:r>
+      <w:r>
+        <w:t xml:space="preserve">. *Image seen.* </w:t>
+      </w:r>
+      <w:r>
+        <w:rPr>
+          <w:b/>
+        </w:rPr>
+        <w:t>C1491 C1492</w:t>
+      </w:r>
+      <w:r>
+        <w:t xml:space="preserve"> </w:t>
+      </w:r>
+      <w:r>
+        <w:rPr>
+          <w:b/>
+        </w:rPr>
+        <w:t>S1131–S1134</w:t>
+      </w:r>
+      <w:r>
+        <w:t>.</w:t>
+      </w:r>
+    </w:p>
+    <w:p>
+      <w:r>
+        <w:t xml:space="preserve">293. Parents still </w:t>
+      </w:r>
+      <w:r>
+        <w:rPr>
+          <w:b/>
+        </w:rPr>
+        <w:t>PROBABLE</w:t>
+      </w:r>
+      <w:r>
+        <w:t xml:space="preserve"> after Clay original. #28 stands. *Analysis.* </w:t>
+      </w:r>
+      <w:r>
+        <w:rPr>
+          <w:b/>
+        </w:rPr>
+        <w:t>C1493–C1495</w:t>
+      </w:r>
+      <w:r>
+        <w:t xml:space="preserve"> </w:t>
+      </w:r>
+      <w:r>
+        <w:rPr>
+          <w:b/>
+        </w:rPr>
+        <w:t>S1135</w:t>
+      </w:r>
+      <w:r>
+        <w:t>.</w:t>
+      </w:r>
+    </w:p>
+    <w:p>
+      <w:r>
+        <w:t xml:space="preserve">294. LOC [sn89051008](https://www.loc.gov/item/sn89051008/) `item.digitized: false` (pass 122). IA Solr Post-Dispatch 1926 </w:t>
+      </w:r>
+      <w:r>
+        <w:rPr>
+          <w:b/>
+        </w:rPr>
+        <w:t>0</w:t>
+      </w:r>
+      <w:r>
+        <w:t xml:space="preserve">. Film unread. *Catalog.* </w:t>
+      </w:r>
+      <w:r>
+        <w:rPr>
+          <w:b/>
+        </w:rPr>
+        <w:t>C1496</w:t>
+      </w:r>
+      <w:r>
+        <w:t xml:space="preserve"> </w:t>
+      </w:r>
+      <w:r>
+        <w:rPr>
+          <w:b/>
+        </w:rPr>
+        <w:t>S1136 S1137</w:t>
+      </w:r>
+      <w:r>
+        <w:t>.</w:t>
+      </w:r>
+    </w:p>
+    <w:p>
+      <w:r>
+        <w:t xml:space="preserve">295. Wayback 2013 RootsWeb [KYLetcher 1850 every-name](https://web.archive.org/web/20130515000000/http://www.rootsweb.ancestry.com/~kyletshe/1850/1850b.htm) 2,509 names; pages </w:t>
+      </w:r>
+      <w:r>
+        <w:rPr>
+          <w:b/>
+        </w:rPr>
+        <w:t>125a–155b</w:t>
+      </w:r>
+      <w:r>
+        <w:t xml:space="preserve">. N = Nicholas/Niece/NS. *Transcription.* </w:t>
+      </w:r>
+      <w:r>
+        <w:rPr>
+          <w:b/>
+        </w:rPr>
+        <w:t>C1497</w:t>
+      </w:r>
+      <w:r>
+        <w:t xml:space="preserve"> </w:t>
+      </w:r>
+      <w:r>
+        <w:rPr>
+          <w:b/>
+        </w:rPr>
+        <w:t>S1138</w:t>
+      </w:r>
+      <w:r>
+        <w:t>.</w:t>
+      </w:r>
+    </w:p>
+    <w:p>
+      <w:r>
+        <w:t xml:space="preserve">296. 1850 U.S. census, Letcher County, Kentucky. IA [`populationschedu0209unix`](https://archive.org/details/populationschedu0209unix) n0531 last Lawrence; n0532 Letcher Dist 2 stamped </w:t>
+      </w:r>
+      <w:r>
+        <w:rPr>
+          <w:b/>
+        </w:rPr>
+        <w:t>125</w:t>
+      </w:r>
+      <w:r>
+        <w:t xml:space="preserve">; n0591 MICROCOPY 432. County </w:t>
+      </w:r>
+      <w:r>
+        <w:rPr>
+          <w:b/>
+        </w:rPr>
+        <w:t>CLOSED</w:t>
+      </w:r>
+      <w:r>
+        <w:t xml:space="preserve">. *Image seen.* </w:t>
+      </w:r>
+      <w:r>
+        <w:rPr>
+          <w:b/>
+        </w:rPr>
+        <w:t>C1498–C1501</w:t>
+      </w:r>
+      <w:r>
+        <w:t xml:space="preserve"> </w:t>
+      </w:r>
+      <w:r>
+        <w:rPr>
+          <w:b/>
+        </w:rPr>
+        <w:t>S1139–S1142</w:t>
+      </w:r>
+      <w:r>
+        <w:t>.</w:t>
+      </w:r>
+    </w:p>
+    <w:p>
+      <w:r>
+        <w:t xml:space="preserve">297. [S-K Johnson 1850](https://www.skcensus.com/1850-census-index-johnson-county-kentucky/) NELSON/NIBERT/NICHELL/NOTT. Reel </w:t>
+      </w:r>
+      <w:r>
+        <w:rPr>
+          <w:b/>
+        </w:rPr>
+        <w:t>208</w:t>
+      </w:r>
+      <w:r>
+        <w:t xml:space="preserve"> n0005 Jessamine. County </w:t>
+      </w:r>
+      <w:r>
+        <w:rPr>
+          <w:b/>
+        </w:rPr>
+        <w:t>CLOSED</w:t>
+      </w:r>
+      <w:r>
+        <w:t xml:space="preserve"> compiled. *Index.* </w:t>
+      </w:r>
+      <w:r>
+        <w:rPr>
+          <w:b/>
+        </w:rPr>
+        <w:t>C1502</w:t>
+      </w:r>
+      <w:r>
+        <w:t xml:space="preserve"> </w:t>
+      </w:r>
+      <w:r>
+        <w:rPr>
+          <w:b/>
+        </w:rPr>
+        <w:t>S1143 S1144</w:t>
+      </w:r>
+      <w:r>
+        <w:t>.</w:t>
+      </w:r>
+    </w:p>
+    <w:p>
+      <w:r>
+        <w:t xml:space="preserve">298. S-K Estill / Breathitt / Madison 1850 reconfirm already-rejected Newman/Tincher pages. *Index.* </w:t>
+      </w:r>
+      <w:r>
+        <w:rPr>
+          <w:b/>
+        </w:rPr>
+        <w:t>C1503–C1505</w:t>
+      </w:r>
+      <w:r>
+        <w:t xml:space="preserve"> </w:t>
+      </w:r>
+      <w:r>
+        <w:rPr>
+          <w:b/>
+        </w:rPr>
+        <w:t>S1145–S1147</w:t>
+      </w:r>
+      <w:r>
+        <w:t>.</w:t>
+      </w:r>
+    </w:p>
+    <w:p>
+      <w:r>
+        <w:t xml:space="preserve">299. No free William × Rhoda license. Parents still </w:t>
+      </w:r>
+      <w:r>
+        <w:rPr>
+          <w:b/>
+        </w:rPr>
+        <w:t>PROBABLE</w:t>
+      </w:r>
+      <w:r>
+        <w:t xml:space="preserve">. 1860 Rhoda widow + B.F. </w:t>
+      </w:r>
+      <w:r>
+        <w:rPr>
+          <w:b/>
+        </w:rPr>
+        <w:t>7</w:t>
+      </w:r>
+      <w:r>
+        <w:t xml:space="preserve"> </w:t>
+      </w:r>
+      <w:r>
+        <w:rPr>
+          <w:b/>
+        </w:rPr>
+        <w:t>PROVEN</w:t>
+      </w:r>
+      <w:r>
+        <w:t xml:space="preserve">. #28 stands. *Negative / analysis.* </w:t>
+      </w:r>
+      <w:r>
+        <w:rPr>
+          <w:b/>
+        </w:rPr>
+        <w:t>C1506 C1507</w:t>
+      </w:r>
+      <w:r>
+        <w:t xml:space="preserve"> </w:t>
+      </w:r>
+      <w:r>
+        <w:rPr>
+          <w:b/>
+        </w:rPr>
+        <w:t>S1155</w:t>
+      </w:r>
+      <w:r>
+        <w:t>.</w:t>
+      </w:r>
+    </w:p>
+    <w:p>
+      <w:r>
+        <w:t xml:space="preserve">300. GT [Lee WWI](https://www.genealogytrails.com/ken/lee/wwi_draft_cards.html) </w:t>
+      </w:r>
+      <w:r>
+        <w:rPr>
+          <w:b/>
+        </w:rPr>
+        <w:t>LIVE</w:t>
+      </w:r>
+      <w:r>
+        <w:t xml:space="preserve"> </w:t>
+      </w:r>
+      <w:r>
+        <w:rPr>
+          <w:b/>
+        </w:rPr>
+        <w:t>452540</w:t>
+      </w:r>
+      <w:r>
+        <w:t xml:space="preserve"> nil Newnam. FS Incapsula </w:t>
+      </w:r>
+      <w:r>
+        <w:rPr>
+          <w:b/>
+        </w:rPr>
+        <w:t>403</w:t>
+      </w:r>
+      <w:r>
+        <w:t xml:space="preserve"> (R011-63). IA </w:t>
+      </w:r>
+      <w:r>
+        <w:rPr>
+          <w:b/>
+        </w:rPr>
+        <w:t>602</w:t>
+      </w:r>
+      <w:r>
+        <w:t xml:space="preserve"> still </w:t>
+      </w:r>
+      <w:r>
+        <w:rPr>
+          <w:b/>
+        </w:rPr>
+        <w:t>515</w:t>
+      </w:r>
+      <w:r>
+        <w:t xml:space="preserve">. USGenNet wills Jane Steele / Elizabeth / Mary F. — no Samuel P. Hutchins [FAQ 9938](https://libraryanswers.berea.edu/faq/9938) </w:t>
+      </w:r>
+      <w:r>
+        <w:rPr>
+          <w:b/>
+        </w:rPr>
+        <w:t>LIVE</w:t>
+      </w:r>
+      <w:r>
+        <w:t xml:space="preserve">. Do not print 1966 or 1962. *Catalog.* </w:t>
+      </w:r>
+      <w:r>
+        <w:rPr>
+          <w:b/>
+        </w:rPr>
+        <w:t>C1508–C1515</w:t>
+      </w:r>
+      <w:r>
+        <w:t xml:space="preserve"> </w:t>
+      </w:r>
+      <w:r>
+        <w:rPr>
+          <w:b/>
+        </w:rPr>
+        <w:t>S1149–S1155</w:t>
+      </w:r>
+      <w:r>
+        <w:t>.</w:t>
+      </w:r>
+    </w:p>
+    <w:p>
+      <w:r>
+        <w:t xml:space="preserve">301. LOC [sn89051008](https://www.loc.gov/item/sn89051008/) `item.digitized: false` (pass123). IA Solr 1926 </w:t>
+      </w:r>
+      <w:r>
+        <w:rPr>
+          <w:b/>
+        </w:rPr>
+        <w:t>0</w:t>
+      </w:r>
+      <w:r>
+        <w:t xml:space="preserve">. *Catalog.* </w:t>
+      </w:r>
+      <w:r>
+        <w:rPr>
+          <w:b/>
+        </w:rPr>
+        <w:t>C1516</w:t>
+      </w:r>
+      <w:r>
+        <w:t xml:space="preserve"> </w:t>
+      </w:r>
+      <w:r>
+        <w:rPr>
+          <w:b/>
+        </w:rPr>
+        <w:t>S1156 S1157</w:t>
+      </w:r>
+      <w:r>
+        <w:t>.</w:t>
+      </w:r>
+    </w:p>
+    <w:p>
+      <w:r>
+        <w:t xml:space="preserve">302. Lawrence 1850 David May PT1+PT2: Henry </w:t>
+      </w:r>
+      <w:r>
+        <w:rPr>
+          <w:b/>
+        </w:rPr>
+        <w:t>44</w:t>
+      </w:r>
+      <w:r>
+        <w:t xml:space="preserve"> GER </w:t>
+      </w:r>
+      <w:r>
+        <w:rPr>
+          <w:b/>
+        </w:rPr>
+        <w:t>REJECT</w:t>
+      </w:r>
+      <w:r>
+        <w:t xml:space="preserve">; Reynolds </w:t>
+      </w:r>
+      <w:r>
+        <w:rPr>
+          <w:b/>
+        </w:rPr>
+        <w:t>45</w:t>
+      </w:r>
+      <w:r>
+        <w:t xml:space="preserve"> NC × Malinda </w:t>
+      </w:r>
+      <w:r>
+        <w:rPr>
+          <w:b/>
+        </w:rPr>
+        <w:t>REJECT</w:t>
+      </w:r>
+      <w:r>
+        <w:t xml:space="preserve">. *Compiled + reject.* </w:t>
+      </w:r>
+      <w:r>
+        <w:rPr>
+          <w:b/>
+        </w:rPr>
+        <w:t>C1517–C1520</w:t>
+      </w:r>
+      <w:r>
+        <w:t xml:space="preserve"> </w:t>
+      </w:r>
+      <w:r>
+        <w:rPr>
+          <w:b/>
+        </w:rPr>
+        <w:t>S1158–S1160</w:t>
+      </w:r>
+      <w:r>
+        <w:t>.</w:t>
+      </w:r>
+    </w:p>
+    <w:p>
+      <w:r>
+        <w:t xml:space="preserve">303. Pulaski n0157 Andy I </w:t>
+      </w:r>
+      <w:r>
+        <w:rPr>
+          <w:b/>
+        </w:rPr>
+        <w:t>41</w:t>
+      </w:r>
+      <w:r>
+        <w:t xml:space="preserve"> NC × Mary. [IA reel 217](https://archive.org/details/populationschedu0217unix). *Image seen + reject.* </w:t>
+      </w:r>
+      <w:r>
+        <w:rPr>
+          <w:b/>
+        </w:rPr>
+        <w:t>C1525</w:t>
+      </w:r>
+      <w:r>
+        <w:t xml:space="preserve"> </w:t>
+      </w:r>
+      <w:r>
+        <w:rPr>
+          <w:b/>
+        </w:rPr>
+        <w:t>S1165</w:t>
+      </w:r>
+      <w:r>
+        <w:t>.</w:t>
+      </w:r>
+    </w:p>
+    <w:p>
+      <w:r>
+        <w:t xml:space="preserve">304. Pulaski n0158 Edward </w:t>
+      </w:r>
+      <w:r>
+        <w:rPr>
+          <w:b/>
+        </w:rPr>
+        <w:t>64</w:t>
+      </w:r>
+      <w:r>
+        <w:t xml:space="preserve"> NC × Anna. *Image seen + reject.* </w:t>
+      </w:r>
+      <w:r>
+        <w:rPr>
+          <w:b/>
+        </w:rPr>
+        <w:t>C1526</w:t>
+      </w:r>
+      <w:r>
+        <w:t xml:space="preserve"> </w:t>
+      </w:r>
+      <w:r>
+        <w:rPr>
+          <w:b/>
+        </w:rPr>
+        <w:t>S1166</w:t>
+      </w:r>
+      <w:r>
+        <w:t>.</w:t>
+      </w:r>
+    </w:p>
+    <w:p>
+      <w:r>
+        <w:t xml:space="preserve">305. Pulaski n0212 Will I </w:t>
+      </w:r>
+      <w:r>
+        <w:rPr>
+          <w:b/>
+        </w:rPr>
+        <w:t>31</w:t>
+      </w:r>
+      <w:r>
+        <w:t xml:space="preserve"> VA × Rachel stamped </w:t>
+      </w:r>
+      <w:r>
+        <w:rPr>
+          <w:b/>
+        </w:rPr>
+        <w:t>42</w:t>
+      </w:r>
+      <w:r>
+        <w:t xml:space="preserve"> = SK 42A. *Image seen + reject.* </w:t>
+      </w:r>
+      <w:r>
+        <w:rPr>
+          <w:b/>
+        </w:rPr>
+        <w:t>C1527</w:t>
+      </w:r>
+      <w:r>
+        <w:t xml:space="preserve"> </w:t>
+      </w:r>
+      <w:r>
+        <w:rPr>
+          <w:b/>
+        </w:rPr>
+        <w:t>S1167</w:t>
+      </w:r>
+      <w:r>
+        <w:t>.</w:t>
+      </w:r>
+    </w:p>
+    <w:p>
+      <w:r>
+        <w:t xml:space="preserve">306. Nicholas / Boyle / Wayne S-K compiled nil Newman/Tincher. *Index.* </w:t>
+      </w:r>
+      <w:r>
+        <w:rPr>
+          <w:b/>
+        </w:rPr>
+        <w:t>C1521–C1523</w:t>
+      </w:r>
+      <w:r>
+        <w:t xml:space="preserve"> </w:t>
+      </w:r>
+      <w:r>
+        <w:rPr>
+          <w:b/>
+        </w:rPr>
+        <w:t>S1161–S1163</w:t>
+      </w:r>
+      <w:r>
+        <w:t>.</w:t>
+      </w:r>
+    </w:p>
+    <w:p>
+      <w:r>
+        <w:t xml:space="preserve">307. LOC [sn89051008](https://www.loc.gov/item/sn89051008/) `item.digitized: false` (pass124). *Catalog.* </w:t>
+      </w:r>
+      <w:r>
+        <w:rPr>
+          <w:b/>
+        </w:rPr>
+        <w:t>C1541</w:t>
+      </w:r>
+      <w:r>
+        <w:t xml:space="preserve"> </w:t>
+      </w:r>
+      <w:r>
+        <w:rPr>
+          <w:b/>
+        </w:rPr>
+        <w:t>S1181 S1182</w:t>
+      </w:r>
+      <w:r>
+        <w:t>.</w:t>
+      </w:r>
+    </w:p>
+    <w:p>
+      <w:r>
+        <w:t xml:space="preserve">308. Bath n0470 is </w:t>
+      </w:r>
+      <w:r>
+        <w:rPr>
+          <w:b/>
+        </w:rPr>
+        <w:t>2d Division</w:t>
+      </w:r>
+      <w:r>
+        <w:t xml:space="preserve"> stamped </w:t>
+      </w:r>
+      <w:r>
+        <w:rPr>
+          <w:b/>
+        </w:rPr>
+        <w:t>89</w:t>
+      </w:r>
+      <w:r>
+        <w:t xml:space="preserve">. Corrects C1531. [IA reel 191](https://archive.org/details/populationschedu0191unix). *Image seen + correction.* </w:t>
+      </w:r>
+      <w:r>
+        <w:rPr>
+          <w:b/>
+        </w:rPr>
+        <w:t>C1542</w:t>
+      </w:r>
+      <w:r>
+        <w:t xml:space="preserve"> </w:t>
+      </w:r>
+      <w:r>
+        <w:rPr>
+          <w:b/>
+        </w:rPr>
+        <w:t>S1183</w:t>
+      </w:r>
+      <w:r>
+        <w:t>.</w:t>
+      </w:r>
+    </w:p>
+    <w:p>
+      <w:r>
+        <w:t xml:space="preserve">309. Bath n0390 John Tincher </w:t>
+      </w:r>
+      <w:r>
+        <w:rPr>
+          <w:b/>
+        </w:rPr>
+        <w:t>26</w:t>
+      </w:r>
+      <w:r>
+        <w:t xml:space="preserve"> × Ann </w:t>
+      </w:r>
+      <w:r>
+        <w:rPr>
+          <w:b/>
+        </w:rPr>
+        <w:t>17</w:t>
+      </w:r>
+      <w:r>
+        <w:t xml:space="preserve">. SK </w:t>
+      </w:r>
+      <w:r>
+        <w:rPr>
+          <w:b/>
+        </w:rPr>
+        <w:t>6A</w:t>
+      </w:r>
+      <w:r>
+        <w:t xml:space="preserve">. *Image seen + reject.* </w:t>
+      </w:r>
+      <w:r>
+        <w:rPr>
+          <w:b/>
+        </w:rPr>
+        <w:t>C1544</w:t>
+      </w:r>
+      <w:r>
+        <w:t xml:space="preserve"> </w:t>
+      </w:r>
+      <w:r>
+        <w:rPr>
+          <w:b/>
+        </w:rPr>
+        <w:t>S1185</w:t>
+      </w:r>
+      <w:r>
+        <w:t>.</w:t>
+      </w:r>
+    </w:p>
+    <w:p>
+      <w:r>
+        <w:t xml:space="preserve">310. Bath n0391 Francis Tincher </w:t>
+      </w:r>
+      <w:r>
+        <w:rPr>
+          <w:b/>
+        </w:rPr>
+        <w:t>36</w:t>
+      </w:r>
+      <w:r>
+        <w:t xml:space="preserve"> VA × Nancy. SK </w:t>
+      </w:r>
+      <w:r>
+        <w:rPr>
+          <w:b/>
+        </w:rPr>
+        <w:t>6B</w:t>
+      </w:r>
+      <w:r>
+        <w:t xml:space="preserve">. *Image seen + reject.* </w:t>
+      </w:r>
+      <w:r>
+        <w:rPr>
+          <w:b/>
+        </w:rPr>
+        <w:t>C1545</w:t>
+      </w:r>
+      <w:r>
+        <w:t xml:space="preserve"> </w:t>
+      </w:r>
+      <w:r>
+        <w:rPr>
+          <w:b/>
+        </w:rPr>
+        <w:t>S1186</w:t>
+      </w:r>
+      <w:r>
+        <w:t>.</w:t>
+      </w:r>
+    </w:p>
+    <w:p>
+      <w:r>
+        <w:t xml:space="preserve">311. Bath n0392 John S Tincher </w:t>
+      </w:r>
+      <w:r>
+        <w:rPr>
+          <w:b/>
+        </w:rPr>
+        <w:t>47</w:t>
+      </w:r>
+      <w:r>
+        <w:t xml:space="preserve"> VA × Betsy; William </w:t>
+      </w:r>
+      <w:r>
+        <w:rPr>
+          <w:b/>
+        </w:rPr>
+        <w:t>20</w:t>
+      </w:r>
+      <w:r>
+        <w:t xml:space="preserve"> son. SK </w:t>
+      </w:r>
+      <w:r>
+        <w:rPr>
+          <w:b/>
+        </w:rPr>
+        <w:t>7A</w:t>
+      </w:r>
+      <w:r>
+        <w:t xml:space="preserve">. *Image seen + reject.* </w:t>
+      </w:r>
+      <w:r>
+        <w:rPr>
+          <w:b/>
+        </w:rPr>
+        <w:t>C1546</w:t>
+      </w:r>
+      <w:r>
+        <w:t xml:space="preserve"> </w:t>
+      </w:r>
+      <w:r>
+        <w:rPr>
+          <w:b/>
+        </w:rPr>
+        <w:t>S1187</w:t>
+      </w:r>
+      <w:r>
+        <w:t>.</w:t>
+      </w:r>
+    </w:p>
+    <w:p>
+      <w:r>
+        <w:t xml:space="preserve">312. Fleming n0396 John Newman </w:t>
+      </w:r>
+      <w:r>
+        <w:rPr>
+          <w:b/>
+        </w:rPr>
+        <w:t>55</w:t>
+      </w:r>
+      <w:r>
+        <w:t xml:space="preserve"> × Elizabeth; Alexander </w:t>
+      </w:r>
+      <w:r>
+        <w:rPr>
+          <w:b/>
+        </w:rPr>
+        <w:t>42</w:t>
+      </w:r>
+      <w:r>
+        <w:t xml:space="preserve">. [IA reel 199](https://archive.org/details/populationschedu0199unix). *Image seen + reject.* </w:t>
+      </w:r>
+      <w:r>
+        <w:rPr>
+          <w:b/>
+        </w:rPr>
+        <w:t>C1549</w:t>
+      </w:r>
+      <w:r>
+        <w:t xml:space="preserve"> </w:t>
+      </w:r>
+      <w:r>
+        <w:rPr>
+          <w:b/>
+        </w:rPr>
+        <w:t>S1189</w:t>
+      </w:r>
+      <w:r>
+        <w:t>.</w:t>
+      </w:r>
+    </w:p>
+    <w:p>
+      <w:r>
+        <w:t xml:space="preserve">313. Fleming n0443 John Newman </w:t>
+      </w:r>
+      <w:r>
+        <w:rPr>
+          <w:b/>
+        </w:rPr>
+        <w:t>78</w:t>
+      </w:r>
+      <w:r>
+        <w:t xml:space="preserve"> VA × Elizabeth MD. SK </w:t>
+      </w:r>
+      <w:r>
+        <w:rPr>
+          <w:b/>
+        </w:rPr>
+        <w:t>331B</w:t>
+      </w:r>
+      <w:r>
+        <w:t xml:space="preserve">. *Image seen + reject.* </w:t>
+      </w:r>
+      <w:r>
+        <w:rPr>
+          <w:b/>
+        </w:rPr>
+        <w:t>C1550</w:t>
+      </w:r>
+      <w:r>
+        <w:t xml:space="preserve"> </w:t>
+      </w:r>
+      <w:r>
+        <w:rPr>
+          <w:b/>
+        </w:rPr>
+        <w:t>S1190</w:t>
+      </w:r>
+      <w:r>
+        <w:t>.</w:t>
+      </w:r>
+    </w:p>
+    <w:p>
+      <w:r>
+        <w:t xml:space="preserve">314. Fleming n0539 Thomas Newman </w:t>
+      </w:r>
+      <w:r>
+        <w:rPr>
+          <w:b/>
+        </w:rPr>
+        <w:t>40</w:t>
+      </w:r>
+      <w:r>
+        <w:t xml:space="preserve"> × Margarett. *Image seen + reject.* </w:t>
+      </w:r>
+      <w:r>
+        <w:rPr>
+          <w:b/>
+        </w:rPr>
+        <w:t>C1551</w:t>
+      </w:r>
+      <w:r>
+        <w:t xml:space="preserve"> </w:t>
+      </w:r>
+      <w:r>
+        <w:rPr>
+          <w:b/>
+        </w:rPr>
+        <w:t>S1191</w:t>
+      </w:r>
+      <w:r>
+        <w:t>.</w:t>
+      </w:r>
+    </w:p>
+    <w:p>
+      <w:r>
+        <w:t xml:space="preserve">315. Fleming compiled Samuel </w:t>
+      </w:r>
+      <w:r>
+        <w:rPr>
+          <w:b/>
+        </w:rPr>
+        <w:t>37</w:t>
+      </w:r>
+      <w:r>
+        <w:t xml:space="preserve"> / James </w:t>
+      </w:r>
+      <w:r>
+        <w:rPr>
+          <w:b/>
+        </w:rPr>
+        <w:t>37</w:t>
+      </w:r>
+      <w:r>
+        <w:t xml:space="preserve"> / John D </w:t>
+      </w:r>
+      <w:r>
+        <w:rPr>
+          <w:b/>
+        </w:rPr>
+        <w:t>48</w:t>
+      </w:r>
+      <w:r>
+        <w:t xml:space="preserve">. *Compiled + reject.* </w:t>
+      </w:r>
+      <w:r>
+        <w:rPr>
+          <w:b/>
+        </w:rPr>
+        <w:t>C1552</w:t>
+      </w:r>
+      <w:r>
+        <w:t xml:space="preserve"> </w:t>
+      </w:r>
+      <w:r>
+        <w:rPr>
+          <w:b/>
+        </w:rPr>
+        <w:t>S1192</w:t>
+      </w:r>
+      <w:r>
+        <w:t>.</w:t>
+      </w:r>
+    </w:p>
+    <w:p>
+      <w:r>
+        <w:t xml:space="preserve">316. No free William × Rhoda license. Parents still </w:t>
+      </w:r>
+      <w:r>
+        <w:rPr>
+          <w:b/>
+        </w:rPr>
+        <w:t>PROBABLE</w:t>
+      </w:r>
+      <w:r>
+        <w:t xml:space="preserve">. 1860 Rhoda widow + B.F. </w:t>
+      </w:r>
+      <w:r>
+        <w:rPr>
+          <w:b/>
+        </w:rPr>
+        <w:t>7</w:t>
+      </w:r>
+      <w:r>
+        <w:t xml:space="preserve"> </w:t>
+      </w:r>
+      <w:r>
+        <w:rPr>
+          <w:b/>
+        </w:rPr>
+        <w:t>PROVEN</w:t>
+      </w:r>
+      <w:r>
+        <w:t xml:space="preserve">. #28 stands. *Negative / analysis.* </w:t>
+      </w:r>
+      <w:r>
+        <w:rPr>
+          <w:b/>
+        </w:rPr>
+        <w:t>C1554 C1555</w:t>
+      </w:r>
+      <w:r>
+        <w:t xml:space="preserve"> </w:t>
+      </w:r>
+      <w:r>
+        <w:rPr>
+          <w:b/>
+        </w:rPr>
+        <w:t>S1210</w:t>
+      </w:r>
+      <w:r>
+        <w:t>.</w:t>
+      </w:r>
+    </w:p>
+    <w:p>
+      <w:r>
+        <w:t xml:space="preserve">317. GT [Lee WWI](https://www.genealogytrails.com/ken/lee/wwi_draft_cards.html) </w:t>
+      </w:r>
+      <w:r>
+        <w:rPr>
+          <w:b/>
+        </w:rPr>
+        <w:t>LIVE</w:t>
+      </w:r>
+      <w:r>
+        <w:t xml:space="preserve"> </w:t>
+      </w:r>
+      <w:r>
+        <w:rPr>
+          <w:b/>
+        </w:rPr>
+        <w:t>452540</w:t>
+      </w:r>
+      <w:r>
+        <w:t xml:space="preserve"> nil Newnam. FS SPA (R011-65). IA </w:t>
+      </w:r>
+      <w:r>
+        <w:rPr>
+          <w:b/>
+        </w:rPr>
+        <w:t>602</w:t>
+      </w:r>
+      <w:r>
+        <w:t xml:space="preserve"> still </w:t>
+      </w:r>
+      <w:r>
+        <w:rPr>
+          <w:b/>
+        </w:rPr>
+        <w:t>515</w:t>
+      </w:r>
+      <w:r>
+        <w:t xml:space="preserve">. USGenNet wills no Samuel P. Hutchins [FAQ 9938](https://libraryanswers.berea.edu/faq/9938) </w:t>
+      </w:r>
+      <w:r>
+        <w:rPr>
+          <w:b/>
+        </w:rPr>
+        <w:t>LIVE</w:t>
+      </w:r>
+      <w:r>
+        <w:t xml:space="preserve">. Do not print 1966 or 1962. *Catalog.* </w:t>
+      </w:r>
+      <w:r>
+        <w:rPr>
+          <w:b/>
+        </w:rPr>
+        <w:t>C1556–C1560</w:t>
+      </w:r>
+      <w:r>
+        <w:t xml:space="preserve"> </w:t>
+      </w:r>
+      <w:r>
+        <w:rPr>
+          <w:b/>
+        </w:rPr>
+        <w:t>S1195–S1210</w:t>
+      </w:r>
+      <w:r>
+        <w:t>.</w:t>
+      </w:r>
+    </w:p>
+    <w:p>
+      <w:r>
         <w:br w:type="page"/>
       </w:r>
     </w:p>
@@ -31817,6 +34300,266 @@
     <w:p>
       <w:r>
         <w:t>| S1076 | `../sources/census/pass117-extract-2026-10-31.txt` | This session | Pass 117 extract | extract |</w:t>
+      </w:r>
+    </w:p>
+    <w:p>
+      <w:r>
+        <w:t>| S1077 | `../sources/catalog/loc-sn89051008-pass118c.json` | [LOC sn89051008](https://www.loc.gov/item/sn89051008/) | item.digitized false | catalog |</w:t>
+      </w:r>
+    </w:p>
+    <w:p>
+      <w:r>
+        <w:t>| S1079 | `../sources/census/pass118/keyplates/clark1840-n0081-county-total.jpg` | [IA 1840 reel 108](https://archive.org/details/populationsc18400108unit) | Clark Total County | image seen |</w:t>
+      </w:r>
+    </w:p>
+    <w:p>
+      <w:r>
+        <w:t>| S1083 | `../sources/census/pass118/keyplates/owsley1850-n0408-tincher-309a.jpg` | [IA 1850 reel 216](https://archive.org/details/populationschedu0216unix) | Thos. Tincher 22 reject | image seen |</w:t>
+      </w:r>
+    </w:p>
+    <w:p>
+      <w:r>
+        <w:t>| S1086 | `../sources/census/pass118/keyplates/knox1850-n0006-hdr.jpg` | [IA 1850 reel 209](https://archive.org/details/populationschedu0209unix) | Knox isolate | image seen |</w:t>
+      </w:r>
+    </w:p>
+    <w:p>
+      <w:r>
+        <w:t>| S1087 | `../sources/census/pass118/keyplates/morgan1850-n0174-hdr.jpg` | [IA 1850 reel 214](https://archive.org/details/populationschedu0214unix) | Morgan isolate | image seen |</w:t>
+      </w:r>
+    </w:p>
+    <w:p>
+      <w:r>
+        <w:t>| S1092 | `../sources/census/pass118-extract-2026-10-31.txt` | This session | Pass 118 extract | extract |</w:t>
+      </w:r>
+    </w:p>
+    <w:p>
+      <w:r>
+        <w:t>| S1093 | `../sources/catalog/loc-sn89051008-pass119.json` | [LOC sn89051008](https://www.loc.gov/item/sn89051008/) | item.digitized false | catalog |</w:t>
+      </w:r>
+    </w:p>
+    <w:p>
+      <w:r>
+        <w:t>| S1095 | `../sources/census/pass119/keyplates/knox1850-n0005-hdr.jpg` | [IA 1850 reel 209](https://archive.org/details/populationschedu0209unix) | Knox starts n0005 | image seen |</w:t>
+      </w:r>
+    </w:p>
+    <w:p>
+      <w:r>
+        <w:t>| S1097 | `../sources/census/pass119/keyplates/knox1850-n0160-larue.jpg` | [IA 1850 reel 209](https://archive.org/details/populationschedu0209unix) | Larue, not Knox | image seen |</w:t>
+      </w:r>
+    </w:p>
+    <w:p>
+      <w:r>
+        <w:t>| S1100 | `../sources/census/pass119/morgan-index/1850Index.doc` | [KYGenWeb Morgan 1850](https://kygenweb.net/morgan/census/1850CList.html) | N = Needham/Nickell/Noble/Norman | transcription only |</w:t>
+      </w:r>
+    </w:p>
+    <w:p>
+      <w:r>
+        <w:t>| S1102 | `../sources/census/pass119/keyplates/morgan1850-n0351-certificate.jpg` | [IA 1850 reel 214](https://archive.org/details/populationschedu0214unix) | Morgan November certificate | image seen |</w:t>
+      </w:r>
+    </w:p>
+    <w:p>
+      <w:r>
+        <w:t>| S1105 | `../sources/census/pass119-extract-2026-10-31.txt` | This session | Pass 119 extract | extract |</w:t>
+      </w:r>
+    </w:p>
+    <w:p>
+      <w:r>
+        <w:t>| S1106 | `../sources/catalog/gt-lee-wwi-pass119.html` | [GT Lee WWI](https://www.genealogytrails.com/ken/lee/wwi_draft_cards.html) | Luther Brandenburg + Underwood only | transcription only |</w:t>
+      </w:r>
+    </w:p>
+    <w:p>
+      <w:r>
+        <w:t>| S1108 | `../sources/catalog/usgennet-lee-wills-pass119.html` | [USGenNet Lee wills](https://usgennet.org/usa/ky/county/lee/wills/) | no Samuel P. | transcription only |</w:t>
+      </w:r>
+    </w:p>
+    <w:p>
+      <w:r>
+        <w:t>| S1109 | `../sources/catalog/hutchins-faq-9938-answers-pass119.html` | [FAQ 9938](https://libraryanswers.berea.edu/faq/9938) | cards 228–229 | catalog |</w:t>
+      </w:r>
+    </w:p>
+    <w:p>
+      <w:r>
+        <w:t>| S1110 | `../sources/catalog/ia-602-meta-pass119.json` | [IA 602](https://archive.org/details/14thcensusofpopu602unit) | imagecount 515 | catalog |</w:t>
+      </w:r>
+    </w:p>
+    <w:p>
+      <w:r>
+        <w:t>| S1111 | `../sources/catalog/loc-sn89051008-pass120.json` | [LOC sn89051008](https://www.loc.gov/item/sn89051008/) | item.digitized false | catalog |</w:t>
+      </w:r>
+    </w:p>
+    <w:p>
+      <w:r>
+        <w:t>| S1113 | `../sources/census/pass120/knox2/` | [IA 1850 reel 209](https://archive.org/details/populationschedu0209unix) | Knox 77 two-ups | image seen |</w:t>
+      </w:r>
+    </w:p>
+    <w:p>
+      <w:r>
+        <w:t>| S1115 | `../sources/catalog/kygenweb-floyd-1850-idx-pass120.html` | [KYGenWeb Floyd 1850](https://kygenweb.net/floyd/records/census/1850-census-index.html) | NEAL…NUSOM; no Newman | transcription only |</w:t>
+      </w:r>
+    </w:p>
+    <w:p>
+      <w:r>
+        <w:t>| S1116 | `../sources/census/pass120/keyplates/floyd1850-n0003-start.jpg` | [IA reel 200](https://archive.org/details/populationschedu0200unix) | Floyd start | image seen |</w:t>
+      </w:r>
+    </w:p>
+    <w:p>
+      <w:r>
+        <w:t>| S1120 | `../sources/catalog/sk-pike-1850-pass120.html` | [S-K Pike](https://www.skcensus.com/1850-census-index-pike-county-kentucky/) | no Newman/Tincher | index only |</w:t>
+      </w:r>
+    </w:p>
+    <w:p>
+      <w:r>
+        <w:t>| S1122 | `../sources/catalog/sk-harlan-1850-pass120.html` | [S-K Harlan](https://www.skcensus.com/1850-census-index-harlan-county-kentucky/) | no Newman/Tincher | index only |</w:t>
+      </w:r>
+    </w:p>
+    <w:p>
+      <w:r>
+        <w:t>| S1130 | `../sources/census/pass120-extract-2026-10-31.txt` | This session | Pass 120 extract | extract |</w:t>
+      </w:r>
+    </w:p>
+    <w:p>
+      <w:r>
+        <w:t>| S1131 | `../sources/census/pass121/keyplates/clay1850-n0009-header.jpg` | [IA reel 197](https://archive.org/details/populationschedu0197unix) | Clay stamped 299 | image seen |</w:t>
+      </w:r>
+    </w:p>
+    <w:p>
+      <w:r>
+        <w:t>| S1132 | `../sources/census/pass121/keyplates/clay1850-n0009-hh54-names.jpg` | [IA reel 197](https://archive.org/details/populationschedu0197unix) | Hibbard + William Newman 42 | image seen |</w:t>
+      </w:r>
+    </w:p>
+    <w:p>
+      <w:r>
+        <w:t>| S1135 | `../sources/census/pass121-extract-2026-10-31.txt` | This session | Pass 121 extract | extract |</w:t>
+      </w:r>
+    </w:p>
+    <w:p>
+      <w:r>
+        <w:t>| S1136 | `../sources/catalog/loc-sn89051008-pass122.json` | [LOC sn89051008](https://www.loc.gov/item/sn89051008/) | item.digitized false | catalog |</w:t>
+      </w:r>
+    </w:p>
+    <w:p>
+      <w:r>
+        <w:t>| S1138 | `../sources/catalog/wayback-letcher-1850b-pass122.html` | Wayback RootsWeb Letcher 1850 | 2,509 names; no Newman/Tincher | transcription only |</w:t>
+      </w:r>
+    </w:p>
+    <w:p>
+      <w:r>
+        <w:t>| S1139 | `../sources/census/pass122/keyplates/r209-n0531-lawrence-last-hdr.jpg` | [IA reel 209](https://archive.org/details/populationschedu0209unix) | last Lawrence | image seen |</w:t>
+      </w:r>
+    </w:p>
+    <w:p>
+      <w:r>
+        <w:t>| S1140 | `../sources/census/pass122/keyplates/r209-n0532-letcher-start-hdr.jpg` | [IA reel 209](https://archive.org/details/populationschedu0209unix) | Letcher Dist 2 start | image seen |</w:t>
+      </w:r>
+    </w:p>
+    <w:p>
+      <w:r>
+        <w:t>| S1141 | `../sources/census/pass122/keyplates/r209-n0560-letcher-hdr.jpg` | [IA reel 209](https://archive.org/details/populationschedu0209unix) | Letcher Dist 2 mid | image seen |</w:t>
+      </w:r>
+    </w:p>
+    <w:p>
+      <w:r>
+        <w:t>| S1142 | `../sources/census/pass122/keyplates/r209-n0591-microcopy-hdr.jpg` | [IA reel 209](https://archive.org/details/populationschedu0209unix) | reel end | image seen |</w:t>
+      </w:r>
+    </w:p>
+    <w:p>
+      <w:r>
+        <w:t>| S1143 | `../sources/catalog/sk-johnson-1850-pass122.html` | [S-K Johnson](https://www.skcensus.com/1850-census-index-johnson-county-kentucky/) | no Newman/Tincher | index only |</w:t>
+      </w:r>
+    </w:p>
+    <w:p>
+      <w:r>
+        <w:t>| S1149 | `../sources/catalog/gt-lee-wwi-pass122.html` | [GT Lee WWI](https://www.genealogytrails.com/ken/lee/wwi_draft_cards.html) | Luther Brandenburg + Underwood | transcription only |</w:t>
+      </w:r>
+    </w:p>
+    <w:p>
+      <w:r>
+        <w:t>| S1151 | `../sources/catalog/usgennet-lee-wills-pass122.html` | [USGenNet Lee wills](https://usgennet.org/usa/ky/county/lee/wills/) | no Samuel P. | transcription only |</w:t>
+      </w:r>
+    </w:p>
+    <w:p>
+      <w:r>
+        <w:t>| S1153 | `../sources/catalog/hutchins-faq-9938-answers-pass122.html` | [FAQ 9938](https://libraryanswers.berea.edu/faq/9938) | cards 228–229 | catalog |</w:t>
+      </w:r>
+    </w:p>
+    <w:p>
+      <w:r>
+        <w:t>| S1155 | `../sources/census/pass122-extract-2026-10-31.txt` | This session | Pass 122 extract | extract |</w:t>
+      </w:r>
+    </w:p>
+    <w:p>
+      <w:r>
+        <w:t>| S1156 | `../sources/catalog/loc-sn89051008-pass123.json` | [LOC sn89051008](https://www.loc.gov/item/sn89051008/) | item.digitized false | catalog |</w:t>
+      </w:r>
+    </w:p>
+    <w:p>
+      <w:r>
+        <w:t>| S1165 | `../sources/census/pass123/keyplates/r217-n0157-andy-i.jpg` | [IA reel 217](https://archive.org/details/populationschedu0217unix) | Andy I 41 NC | image seen |</w:t>
+      </w:r>
+    </w:p>
+    <w:p>
+      <w:r>
+        <w:t>| S1166 | `../sources/census/pass123/keyplates/r217-n0158-edward.jpg` | [IA reel 217](https://archive.org/details/populationschedu0217unix) | Edward 64 NC | image seen |</w:t>
+      </w:r>
+    </w:p>
+    <w:p>
+      <w:r>
+        <w:t>| S1167 | `../sources/census/pass123/keyplates/r217-n0212-will-i-42a.jpg` | [IA reel 217](https://archive.org/details/populationschedu0217unix) | Will I 31 VA × Rachel | image seen |</w:t>
+      </w:r>
+    </w:p>
+    <w:p>
+      <w:r>
+        <w:t>| S1180 | `../sources/census/pass123-extract-2026-10-31.txt` | This session | Pass 123 extract | extract |</w:t>
+      </w:r>
+    </w:p>
+    <w:p>
+      <w:r>
+        <w:t>| S1181 | `../sources/catalog/loc-sn89051008-pass124.json` | [LOC sn89051008](https://www.loc.gov/item/sn89051008/) | item.digitized false | catalog |</w:t>
+      </w:r>
+    </w:p>
+    <w:p>
+      <w:r>
+        <w:t>| S1185 | `../sources/census/pass124/keyplates/r191-n0390-setters-6a.jpg` | [IA reel 191](https://archive.org/details/populationschedu0191unix) | John Tincher 26 × Ann | image seen |</w:t>
+      </w:r>
+    </w:p>
+    <w:p>
+      <w:r>
+        <w:t>| S1186 | `../sources/census/pass124/keyplates/r191-n0391-francis-tincher-6b.jpg` | [IA reel 191](https://archive.org/details/populationschedu0191unix) | Francis Tincher 36 VA | image seen |</w:t>
+      </w:r>
+    </w:p>
+    <w:p>
+      <w:r>
+        <w:t>| S1187 | `../sources/census/pass124/keyplates/r191-n0392-john-s-tincher-7a.jpg` | [IA reel 191](https://archive.org/details/populationschedu0191unix) | John S Tincher 47 VA | image seen |</w:t>
+      </w:r>
+    </w:p>
+    <w:p>
+      <w:r>
+        <w:t>| S1189 | `../sources/census/pass124/keyplates/r199-n0396-john-newman-55-309.jpg` | [IA reel 199](https://archive.org/details/populationschedu0199unix) | John Newman 55 | image seen |</w:t>
+      </w:r>
+    </w:p>
+    <w:p>
+      <w:r>
+        <w:t>| S1190 | `../sources/census/pass124/keyplates/r199-n0443-john-78-331b.jpg` | [IA reel 199](https://archive.org/details/populationschedu0199unix) | John Newman 78 VA | image seen |</w:t>
+      </w:r>
+    </w:p>
+    <w:p>
+      <w:r>
+        <w:t>| S1191 | `../sources/census/pass124/keyplates/r199-n0539-thomas-40-380.jpg` | [IA reel 199](https://archive.org/details/populationschedu0199unix) | Thomas Newman 40 | image seen |</w:t>
+      </w:r>
+    </w:p>
+    <w:p>
+      <w:r>
+        <w:t>| S1195 | `../sources/catalog/gt-lee-wwi-pass124.html` | [GT Lee WWI](https://www.genealogytrails.com/ken/lee/wwi_draft_cards.html) | Luther Brandenburg + Underwood | transcription only |</w:t>
+      </w:r>
+    </w:p>
+    <w:p>
+      <w:r>
+        <w:t>| S1198 | `../sources/catalog/hutchins-faq-9938-answers-pass124.html` | [FAQ 9938](https://libraryanswers.berea.edu/faq/9938) | cards 228–229 | catalog |</w:t>
+      </w:r>
+    </w:p>
+    <w:p>
+      <w:r>
+        <w:t>| S1210 | `../sources/census/pass124-extract-2026-10-31.txt` | This session | Pass 124 extract | extract |</w:t>
       </w:r>
     </w:p>
     <w:p>

</xml_diff>

<commit_message>
Pass 92: remaining 1930 Owsley ED map; Barrett Walker 38 DISPROVED as John 85.
KYDI 1931-1940 nil Barrett Ollie/Susan; 1934 Brison 89 Clay DISPROVED as 1930 Brison 28. Campbell Josephine Wetterhan 1903 DISPROVED. B063 remains open.

Co-authored-by: CatCorner22 <CatCorner22@users.noreply.github.com>
</commit_message>
<xml_diff>
--- a/research/dora-ella-newnam/book/Dora-Ella-Newnam-Stone-A-Life.docx
+++ b/research/dora-ella-newnam/book/Dora-Ella-Newnam-Stone-A-Life.docx
@@ -41,7 +41,7 @@
     </w:p>
     <w:p>
       <w:r>
-        <w:t>One hundred fifty-six Cursor chats on this repository were reviewed for this volume (primary research, helpers, scans, and failed browser hunts). The original mobile session opened the case and read the Arkansas death certificate the family still holds. Later sessions recovered the 1880 childhood schedule that free transcripts had missed, walked statewide Soundex reels for 1910 and 1920, tested a Peebles third-marriage hypothesis and set it aside, and photographed NARA microfilm frames — the 1880 childhood schedule, the 1910 Kentucky Ella Miracode plates, Hardin Gray on Sturgeon sheet 13 B, the 1860 Owsley original of Silas Gray’s house with William aged thirteen, the 1850 Owsley Gray pages that are other men (Thomas, James, John, Charles), the given-name Silas plates that are other boys (Ratliff eight months, Wilson six, Phillips fifteen) and the Bowman line first read as Cyrus and then as Squire, the 1850 Estill Marcus Gray original, Breathitt’s Taulbee infant Silas and Bryant Siras, and Madison’s John Green house with Silas Green aged twenty, the 1850 Owsley Harrison Newman house with an eight-year-old Elias who is probably Dora’s father — a 1932 death extract names Henry Harrison Newnam as that father — and is not merged as proven, the 1860 Booneville original of that house under H.H. Newman with Elias aged eighteen, the 1850 William Newman house of twenty-six on the same page, the 1850 John Newman of sixty born in Tennessee who is not the 1880 John of sixty-nine, and Andrew Mays’s Giles at one month in 1850 and eleven in 1860, the 1870 Proctor original of James Brandenburg’s house, Silas Gray’s Sturgeon original, the 1880 District 59 originals of William next door to John Newnam and of Silas still in the district, the 1900 William Gray dwelling-84 crop, and the Bollinger page a sibling had labelled “Dora E. Stone,” which is Henry C. Rhodes and Dora M. of Missouri, and the 1920 Booneville, Buffalo, and Buck Creek originals with the rejected Taylor, Marcum, Magee, McIntosh, Baker, and McPherson houses, the 1910 Sturgeon Gilbert×Josie house, Lynch’s wife Laura without a Newman on the original, and the Buffalo Baker household whose Soundex card misnamed Gilbert John as Robert, the 1910 Buffalo Gilbert, John house next door to Baker, Robert H., and the Soundex Douglas card that shows the clerks indexed filmed Buffalo sheets, the 1910 Buffalo Bales house first read as Bowman, and the 1920 Bowman Henry, Jack, and Dean George × Jane originals that are other people, and the filmed Buffalo Dean George × Martha house that is probably the 1910 couple, and Kentucky’s B-630 Barrett Ben given-name slot now every-leaf closed — the two Barrett, Ben heads are eighteen in Franklin and sixty in Livingston, and Owsley Barrett, Bent, twenty-four, is a Booneville house with Mary, Maybe, and Stanley, not the 1910 Buffalo Ben — and Kentucky’s B-630 Barrett Bruce given-name slot now every-leaf closed as well: card 2451 copies the original Buffalo Bruce house, Billy twenty-two is the next dwelling, and Board Bruce of Muhlenberg is another man, and Kentucky’s B-630 Barrett John given-name slot now every-leaf closed: there is no Barrett, John of about seventy-five in Owsley district 92 as a head, Madison John seventy-one with grandson Sam and Lee County John fifty-six with Hershel are other men, and Soundex Beard, John, seventy-one, of Owsley district 90 copies the original Island Creek house of Beard, John, Virginia-born, with Margruy[?] and Herbert, not the 1910 Buffalo Barrett John, and Kentucky’s B-630 Barrett James given-name slot now every-leaf closed as a hit: original Buffalo dwelling 102 is Barrett, James, thirty, with Ollie, Ivory, Pearl, and mother Susan, sixty-eight, a widow — probably the 1910 James twenty-three and Susan sixty-two — and John is not in that house, and the Lee given-name slot is now every-leaf closed with no Barrett, Lee of about forty-nine in Owsley district 92 as a head. Statewide Kentucky death index 1911–1920 has no Barrett, John of about seventy in Lee, Owsley, Clay, Jackson, Estill, or Breathitt; Lee’s 1913 John Barrett, twenty-eight, is William and M. Roberts’s son, not the 1910 man. Statewide Kentucky death index 1921–1930 still has no Barrett, John of about eighty in those neighboring counties except Lee’s 12 April 1925 John Barrett, about seventy, at Beattyville, parents blank, who is not merged. Owsley’s 4 February 1921 Susan Barrett, sixty-five, daughter of Lacy Abner and Sintha Combs, is not James’s mother sixty-eight. The 12 April 1930 original Buffalo schedule — district 95-6, sheet 6 A, dwelling 92 — is Barrett, James, forty-five, with Ollie, thirty-four, Minnie, Pearl thirteen, Virgie, Martha, and Horton; that is probably the 1920 house, and Soundex B-630 missed it. John and Susan are not in the house and are not Barrett heads in that entire Buffalo district. Statewide Kentucky death index 1931–1940 has no Barrett, John of about ninety in those neighboring counties; a 1937 John Barrett, eighty-nine, of Nicholas County, is not merged. The 1940 Owsley HTML has no James of about fifty with Ollie; James sixty with Martha is another couple. This volume folds those chats into one narrative. The case dossier remains the working file; this book is the public reading of it. Sibling work on Greene ED 37 through 41 is now on merged PR #26 through Pass 59; remaining Greene ED 38 B-sides, 1900 Liberty, and 1900 hh 85 are inventoried, not duplicated. Do not import their “Dora E. Stone” as this woman.</w:t>
+        <w:t>One hundred fifty-six Cursor chats on this repository were reviewed for this volume (primary research, helpers, scans, and failed browser hunts). The original mobile session opened the case and read the Arkansas death certificate the family still holds. Later sessions recovered the 1880 childhood schedule that free transcripts had missed, walked statewide Soundex reels for 1910 and 1920, tested a Peebles third-marriage hypothesis and set it aside, and photographed NARA microfilm frames — the 1880 childhood schedule, the 1910 Kentucky Ella Miracode plates, Hardin Gray on Sturgeon sheet 13 B, the 1860 Owsley original of Silas Gray’s house with William aged thirteen, the 1850 Owsley Gray pages that are other men (Thomas, James, John, Charles), the given-name Silas plates that are other boys (Ratliff eight months, Wilson six, Phillips fifteen) and the Bowman line first read as Cyrus and then as Squire, the 1850 Estill Marcus Gray original, Breathitt’s Taulbee infant Silas and Bryant Siras, and Madison’s John Green house with Silas Green aged twenty, the 1850 Owsley Harrison Newman house with an eight-year-old Elias who is probably Dora’s father — a 1932 death extract names Henry Harrison Newnam as that father — and is not merged as proven, the 1860 Booneville original of that house under H.H. Newman with Elias aged eighteen, the 1850 William Newman house of twenty-six on the same page, the 1850 John Newman of sixty born in Tennessee who is not the 1880 John of sixty-nine, and Andrew Mays’s Giles at one month in 1850 and eleven in 1860, the 1870 Proctor original of James Brandenburg’s house, Silas Gray’s Sturgeon original, the 1880 District 59 originals of William next door to John Newnam and of Silas still in the district, the 1900 William Gray dwelling-84 crop, and the Bollinger page a sibling had labelled “Dora E. Stone,” which is Henry C. Rhodes and Dora M. of Missouri, and the 1920 Booneville, Buffalo, and Buck Creek originals with the rejected Taylor, Marcum, Magee, McIntosh, Baker, and McPherson houses, the 1910 Sturgeon Gilbert×Josie house, Lynch’s wife Laura without a Newman on the original, and the Buffalo Baker household whose Soundex card misnamed Gilbert John as Robert, the 1910 Buffalo Gilbert, John house next door to Baker, Robert H., and the Soundex Douglas card that shows the clerks indexed filmed Buffalo sheets, the 1910 Buffalo Bales house first read as Bowman, and the 1920 Bowman Henry, Jack, and Dean George × Jane originals that are other people, and the filmed Buffalo Dean George × Martha house that is probably the 1910 couple, and Kentucky’s B-630 Barrett Ben given-name slot now every-leaf closed — the two Barrett, Ben heads are eighteen in Franklin and sixty in Livingston, and Owsley Barrett, Bent, twenty-four, is a Booneville house with Mary, Maybe, and Stanley, not the 1910 Buffalo Ben — and Kentucky’s B-630 Barrett Bruce given-name slot now every-leaf closed as well: card 2451 copies the original Buffalo Bruce house, Billy twenty-two is the next dwelling, and Board Bruce of Muhlenberg is another man, and Kentucky’s B-630 Barrett John given-name slot now every-leaf closed: there is no Barrett, John of about seventy-five in Owsley district 92 as a head, Madison John seventy-one with grandson Sam and Lee County John fifty-six with Hershel are other men, and Soundex Beard, John, seventy-one, of Owsley district 90 copies the original Island Creek house of Beard, John, Virginia-born, with Margruy[?] and Herbert, not the 1910 Buffalo Barrett John, and Kentucky’s B-630 Barrett James given-name slot now every-leaf closed as a hit: original Buffalo dwelling 102 is Barrett, James, thirty, with Ollie, Ivory, Pearl, and mother Susan, sixty-eight, a widow — probably the 1910 James twenty-three and Susan sixty-two — and John is not in that house, and the Lee given-name slot is now every-leaf closed with no Barrett, Lee of about forty-nine in Owsley district 92 as a head. Statewide Kentucky death index 1911–1920 has no Barrett, John of about seventy in Lee, Owsley, Clay, Jackson, Estill, or Breathitt; Lee’s 1913 John Barrett, twenty-eight, is William and M. Roberts’s son, not the 1910 man. Statewide Kentucky death index 1921–1930 still has no Barrett, John of about eighty in those neighboring counties except Lee’s 12 April 1925 John Barrett, about seventy, at Beattyville, parents blank, who is not merged. Owsley’s 4 February 1921 Susan Barrett, sixty-five, daughter of Lacy Abner and Sintha Combs, is not James’s mother sixty-eight. The 12 April 1930 original Buffalo schedule — district 95-6, sheet 6 A, dwelling 92 — is Barrett, James, forty-five, with Ollie, thirty-four, Minnie, Pearl thirteen, Virgie, Martha, and Horton; that is probably the 1920 house, and Soundex B-630 missed it. John and Susan are not in the house and are not Barrett heads in that entire Buffalo district. Statewide Kentucky death index 1931–1940 has no Barrett, John of about ninety in those neighboring counties; a 1937 John Barrett, eighty-nine, of Nicholas County, is not merged. The 1940 Owsley HTML has no James of about fifty with Ollie; James sixty with Martha is another couple. The rest of Owsley County in 1930 is mapped but not every-line closed: Booneville Town opens with no Barrett head; Booneville magisterial district 1 dwelling 85 is Barrett, Walker, thirty-eight, with Rosie — not John of about eighty-five — and Bowman Elisha’s Ollie, Mayers’s Ollie, and Beard James are other people. Statewide Kentucky death index 1931–1940 has no Barrett, Ollie or Susan; a 1934 Brison Barrett, eighty-nine, of Clay is not the 1930 Brison of twenty-eight. Campbell County’s 1899–1904 Alexandria bonds name Josephine Wetterhan, who married Edward Brauntz in 1903, not Josephine Newnam; Hopkins 1900–1903 and Webster 1860–1900 have other Josephines. The federal pension index remains unopened. This volume folds those chats into one narrative. The case dossier remains the working file; this book is the public reading of it. Sibling work on Greene ED 37 through 41 is now on merged PR #26 through Pass 59; remaining Greene ED 38 B-sides, 1900 Liberty, and 1900 hh 85 are inventoried, not duplicated. Do not import their “Dora E. Stone” as this woman.</w:t>
       </w:r>
     </w:p>
     <w:p>
@@ -903,7 +903,7 @@
         <w:t>Susan</w:t>
       </w:r>
       <w:r>
-        <w:t xml:space="preserve">, sixty-eight, a widow. Kentucky’s B-630 card 3382 copies that original; the clerk’s ages thirty-six and Pearl two yield to the schedule. That is probably the 1910 Buffalo James of twenty-three and Susan of sixty-two: Barrett James plus Owsley Buffalo plus mother Susan. Ages thirty versus about thirty-three and sixty-eight versus about seventy-two are disclosed and not averaged. John is not in the house. Susan’s widow mark plus that absence is a possible death between 1910 and 1920, not a proved death. Statewide Kentucky death index 1911–1920 has no Barrett, John of about seventy in those neighboring counties. Lee’s 11 October 1913 John Barrett, twenty-eight, father William, mother M. Roberts, is another man. Statewide Kentucky death index 1921–1930 still has no Barrett, John of about eighty in those neighboring counties except Lee’s 12 April 1925 John Barrett, about seventy, at Beattyville, parents blank, who is not merged. Owsley’s 4 February 1921 Susan Barrett, sixty-five, daughter of Lacy Abner and Sintha Combs, is not James’s mother sixty-eight. The 12 April 1930 original Buffalo schedule — district 95-6, sheet 6 A, dwelling 92 — is Barrett, James, forty-five, with Ollie, thirty-four, Minnie fifteen, Pearl thirteen, Virgie nine, Martha five, and Horton three. That is probably the 1920 house: Barrett James with Ollie, Buffalo, and Pearl three to thirteen. Soundex B-630 missed it. James thirty to forty-five is plus fifteen in ten and is not averaged; Ivory versus Minnie is not merged; 1920 Pearl as a son versus 1930 Pearl as a daughter is disclosed. John and Susan are not in the house and are not Barrett heads in that entire Buffalo district. Statewide Kentucky death index 1931–1940 has no Barrett, John of about ninety in those neighboring counties; a 2 October 1937 John Barrett, eighty-nine, of Nicholas County, is not merged. The 1940 Owsley HTML has no James of about fifty with Ollie; James sixty with Martha is another couple. A 1933 Owsley James Barrett, thirty-four, son of Dan and Nancy Ann Bowles, is another man. Kentucky’s B-630 Lee given-name slot is now every-leaf closed: there is no Barrett, Lee of about forty-nine in Owsley district 92 as a head, and Lee is not in James’s house. Baird, Lee, forty-nine, of Clay is another man. Sheet 7 A dwelling </w:t>
+        <w:t xml:space="preserve">, sixty-eight, a widow. Kentucky’s B-630 card 3382 copies that original; the clerk’s ages thirty-six and Pearl two yield to the schedule. That is probably the 1910 Buffalo James of twenty-three and Susan of sixty-two: Barrett James plus Owsley Buffalo plus mother Susan. Ages thirty versus about thirty-three and sixty-eight versus about seventy-two are disclosed and not averaged. John is not in the house. Susan’s widow mark plus that absence is a possible death between 1910 and 1920, not a proved death. Statewide Kentucky death index 1911–1920 has no Barrett, John of about seventy in those neighboring counties. Lee’s 11 October 1913 John Barrett, twenty-eight, father William, mother M. Roberts, is another man. Statewide Kentucky death index 1921–1930 still has no Barrett, John of about eighty in those neighboring counties except Lee’s 12 April 1925 John Barrett, about seventy, at Beattyville, parents blank, who is not merged. Owsley’s 4 February 1921 Susan Barrett, sixty-five, daughter of Lacy Abner and Sintha Combs, is not James’s mother sixty-eight. The 12 April 1930 original Buffalo schedule — district 95-6, sheet 6 A, dwelling 92 — is Barrett, James, forty-five, with Ollie, thirty-four, Minnie fifteen, Pearl thirteen, Virgie nine, Martha five, and Horton three. That is probably the 1920 house: Barrett James with Ollie, Buffalo, and Pearl three to thirteen. Soundex B-630 missed it. James thirty to forty-five is plus fifteen in ten and is not averaged; Ivory versus Minnie is not merged; 1920 Pearl as a son versus 1930 Pearl as a daughter is disclosed. John and Susan are not in the house and are not Barrett heads in that entire Buffalo district. Statewide Kentucky death index 1931–1940 has no Barrett, John of about ninety in those neighboring counties; a 2 October 1937 John Barrett, eighty-nine, of Nicholas County, is not merged. The 1940 Owsley HTML has no James of about fifty with Ollie; James sixty with Martha is another couple. The rest of the 1930 county is mapped, not every-line closed: Booneville Town’s opener has no Barrett head; Booneville magisterial district 1 dwelling 85 is Barrett, Walker, thirty-eight, with Rosie, Daily, Stella, Fred, Berlin, Marie, and Geneva — not John of about eighty-five — and Bowman Elisha’s Ollie, Mayers’s Ollie, and Beard James of twenty-seven are other people. Statewide Kentucky death index 1931–1940 has no Barrett, Ollie or Susan; a 1934 Brison Barrett, eighty-nine, of Clay is not the 1930 Brison of twenty-eight. Campbell County’s Alexandria bonds for 1899–1904 name Josephine Wetterhan, who married Edward Brauntz in 1903, not Josephine Newnam; Hopkins 1900–1903 and Webster 1860–1900 have other Josephines. A 1933 Owsley James Barrett, thirty-four, son of Dan and Nancy Ann Bowles, is another man. Kentucky’s B-630 Lee given-name slot is now every-leaf closed: there is no Barrett, Lee of about forty-nine in Owsley district 92 as a head, and Lee is not in James’s house. Baird, Lee, forty-nine, of Clay is another man. Sheet 7 A dwelling </w:t>
       </w:r>
       <w:r>
         <w:rPr>
@@ -1551,7 +1551,7 @@
         <w:t>Dara</w:t>
       </w:r>
       <w:r>
-        <w:t>, forty — the enumerator wrote an open a, not o — is another person. Kentucky’s 1920 Soundex has no Manerva or Minerva Newman card, and the Walter given-name window has no Owsley or Lee Walter with Manerva. Kentucky’s 1920 death index has no Manerva Newnam row on 28 August; the Owsley table that day is an infant Bates. Mary Ann Smallwood, born April 1842, came from the Owsley Smallwoods. The 11 July 1918 cemetery date is still unmatched in Kentucky’s civil index. [C669] [C672] [C693] [C694] [C690] [C691] [C709] [C711] [C712] [C713] [C717] [C729] [C730] [C739] [C740] [C741] [C742] [C743] [C744] [C745] [C746] [C747] [C748] [C752] [C753] [C754] [C756] [C759] [C763] [C765] [C768] [C775] [C776] [C777] [C779] [C780] [C782] [C783] [C784] [C789] [C790] [C791] [C792] [C793] [C794] [C795] [C796] [C797] [C801] [C802] [C803] [C804] [C808] [C809] [C810] [C811] [C812] [C813] [C814] [C818] [C819] [C820] [C821] [C822] [C823] [C824] [C825] [C826] [C827] [C828] [C832] [C833] [C847] [C848] [C849] [C851] [C857] [C859] [C860] [C861] [C863] [C868] [C869] [C872] [C873] [C874] [C875] [C876] [C877] [C880] [C881] [C882] [C883] [C884] [C887] [C888] [C892] [C893] [C894] [C896] [C941] [C942] [C943] [C944] [C945] [C946] [C947] [C948] [C949] [C950] [C951] [C952] [C953] [C954] [C955] [C956] [C957] [C958] [C959] [C960] [C961] [C962] [C963] [C964] [C965] [C966] [C967] [C968] [C969] [C970] [C971] [C972] [C973] [C974] [C975] [C976] [C977] [C978] [C979] [C980] [C981] [C982] [C983] [C984]</w:t>
+        <w:t>, forty — the enumerator wrote an open a, not o — is another person. Kentucky’s 1920 Soundex has no Manerva or Minerva Newman card, and the Walter given-name window has no Owsley or Lee Walter with Manerva. Kentucky’s 1920 death index has no Manerva Newnam row on 28 August; the Owsley table that day is an infant Bates. Mary Ann Smallwood, born April 1842, came from the Owsley Smallwoods. The 11 July 1918 cemetery date is still unmatched in Kentucky’s civil index. [C669] [C672] [C693] [C694] [C690] [C691] [C709] [C711] [C712] [C713] [C717] [C729] [C730] [C739] [C740] [C741] [C742] [C743] [C744] [C745] [C746] [C747] [C748] [C752] [C753] [C754] [C756] [C759] [C763] [C765] [C768] [C775] [C776] [C777] [C779] [C780] [C782] [C783] [C784] [C789] [C790] [C791] [C792] [C793] [C794] [C795] [C796] [C797] [C801] [C802] [C803] [C804] [C808] [C809] [C810] [C811] [C812] [C813] [C814] [C818] [C819] [C820] [C821] [C822] [C823] [C824] [C825] [C826] [C827] [C828] [C832] [C833] [C847] [C848] [C849] [C851] [C857] [C859] [C860] [C861] [C863] [C868] [C869] [C872] [C873] [C874] [C875] [C876] [C877] [C880] [C881] [C882] [C883] [C884] [C887] [C888] [C892] [C893] [C894] [C896] [C941] [C942] [C943] [C944] [C945] [C946] [C947] [C948] [C949] [C950] [C951] [C952] [C953] [C954] [C955] [C956] [C957] [C958] [C959] [C960] [C961] [C962] [C963] [C964] [C965] [C966] [C967] [C968] [C969] [C970] [C971] [C972] [C973] [C974] [C975] [C976] [C977] [C978] [C979] [C980] [C981] [C982] [C983] [C984] [C985] [C986] [C987] [C988] [C989] [C990] [C991] [C992] [C993] [C994] [C995] [C996]</w:t>
       </w:r>
     </w:p>
     <w:p>

</xml_diff>

<commit_message>
Pass 93: 1930 Owsley 95-1 Town closed; Barrett cluster DISPROVED as John 85.
Town of Booneville every-line image-closed. ED 95-2 Robert 41, Hayden 32,
Robert 28, Hiram 34, Charley 35, and George 37 x Rosie 37 DISPROVED as
John ~85; George not merged with Walker 38. 1939 William Barrett obit
DISPROVED as 1910 John. Remaining 1930 sheets not every-line closed.

Co-authored-by: CatCorner22 <CatCorner22@users.noreply.github.com>
</commit_message>
<xml_diff>
--- a/research/dora-ella-newnam/book/Dora-Ella-Newnam-Stone-A-Life.docx
+++ b/research/dora-ella-newnam/book/Dora-Ella-Newnam-Stone-A-Life.docx
@@ -41,7 +41,7 @@
     </w:p>
     <w:p>
       <w:r>
-        <w:t>One hundred fifty-six Cursor chats on this repository were reviewed for this volume (primary research, helpers, scans, and failed browser hunts). The original mobile session opened the case and read the Arkansas death certificate the family still holds. Later sessions recovered the 1880 childhood schedule that free transcripts had missed, walked statewide Soundex reels for 1910 and 1920, tested a Peebles third-marriage hypothesis and set it aside, and photographed NARA microfilm frames — the 1880 childhood schedule, the 1910 Kentucky Ella Miracode plates, Hardin Gray on Sturgeon sheet 13 B, the 1860 Owsley original of Silas Gray’s house with William aged thirteen, the 1850 Owsley Gray pages that are other men (Thomas, James, John, Charles), the given-name Silas plates that are other boys (Ratliff eight months, Wilson six, Phillips fifteen) and the Bowman line first read as Cyrus and then as Squire, the 1850 Estill Marcus Gray original, Breathitt’s Taulbee infant Silas and Bryant Siras, and Madison’s John Green house with Silas Green aged twenty, the 1850 Owsley Harrison Newman house with an eight-year-old Elias who is probably Dora’s father — a 1932 death extract names Henry Harrison Newnam as that father — and is not merged as proven, the 1860 Booneville original of that house under H.H. Newman with Elias aged eighteen, the 1850 William Newman house of twenty-six on the same page, the 1850 John Newman of sixty born in Tennessee who is not the 1880 John of sixty-nine, and Andrew Mays’s Giles at one month in 1850 and eleven in 1860, the 1870 Proctor original of James Brandenburg’s house, Silas Gray’s Sturgeon original, the 1880 District 59 originals of William next door to John Newnam and of Silas still in the district, the 1900 William Gray dwelling-84 crop, and the Bollinger page a sibling had labelled “Dora E. Stone,” which is Henry C. Rhodes and Dora M. of Missouri, and the 1920 Booneville, Buffalo, and Buck Creek originals with the rejected Taylor, Marcum, Magee, McIntosh, Baker, and McPherson houses, the 1910 Sturgeon Gilbert×Josie house, Lynch’s wife Laura without a Newman on the original, and the Buffalo Baker household whose Soundex card misnamed Gilbert John as Robert, the 1910 Buffalo Gilbert, John house next door to Baker, Robert H., and the Soundex Douglas card that shows the clerks indexed filmed Buffalo sheets, the 1910 Buffalo Bales house first read as Bowman, and the 1920 Bowman Henry, Jack, and Dean George × Jane originals that are other people, and the filmed Buffalo Dean George × Martha house that is probably the 1910 couple, and Kentucky’s B-630 Barrett Ben given-name slot now every-leaf closed — the two Barrett, Ben heads are eighteen in Franklin and sixty in Livingston, and Owsley Barrett, Bent, twenty-four, is a Booneville house with Mary, Maybe, and Stanley, not the 1910 Buffalo Ben — and Kentucky’s B-630 Barrett Bruce given-name slot now every-leaf closed as well: card 2451 copies the original Buffalo Bruce house, Billy twenty-two is the next dwelling, and Board Bruce of Muhlenberg is another man, and Kentucky’s B-630 Barrett John given-name slot now every-leaf closed: there is no Barrett, John of about seventy-five in Owsley district 92 as a head, Madison John seventy-one with grandson Sam and Lee County John fifty-six with Hershel are other men, and Soundex Beard, John, seventy-one, of Owsley district 90 copies the original Island Creek house of Beard, John, Virginia-born, with Margruy[?] and Herbert, not the 1910 Buffalo Barrett John, and Kentucky’s B-630 Barrett James given-name slot now every-leaf closed as a hit: original Buffalo dwelling 102 is Barrett, James, thirty, with Ollie, Ivory, Pearl, and mother Susan, sixty-eight, a widow — probably the 1910 James twenty-three and Susan sixty-two — and John is not in that house, and the Lee given-name slot is now every-leaf closed with no Barrett, Lee of about forty-nine in Owsley district 92 as a head. Statewide Kentucky death index 1911–1920 has no Barrett, John of about seventy in Lee, Owsley, Clay, Jackson, Estill, or Breathitt; Lee’s 1913 John Barrett, twenty-eight, is William and M. Roberts’s son, not the 1910 man. Statewide Kentucky death index 1921–1930 still has no Barrett, John of about eighty in those neighboring counties except Lee’s 12 April 1925 John Barrett, about seventy, at Beattyville, parents blank, who is not merged. Owsley’s 4 February 1921 Susan Barrett, sixty-five, daughter of Lacy Abner and Sintha Combs, is not James’s mother sixty-eight. The 12 April 1930 original Buffalo schedule — district 95-6, sheet 6 A, dwelling 92 — is Barrett, James, forty-five, with Ollie, thirty-four, Minnie, Pearl thirteen, Virgie, Martha, and Horton; that is probably the 1920 house, and Soundex B-630 missed it. John and Susan are not in the house and are not Barrett heads in that entire Buffalo district. Statewide Kentucky death index 1931–1940 has no Barrett, John of about ninety in those neighboring counties; a 1937 John Barrett, eighty-nine, of Nicholas County, is not merged. The 1940 Owsley HTML has no James of about fifty with Ollie; James sixty with Martha is another couple. The rest of Owsley County in 1930 is mapped but not every-line closed: Booneville Town opens with no Barrett head; Booneville magisterial district 1 dwelling 85 is Barrett, Walker, thirty-eight, with Rosie — not John of about eighty-five — and Bowman Elisha’s Ollie, Mayers’s Ollie, and Beard James are other people. Statewide Kentucky death index 1931–1940 has no Barrett, Ollie or Susan; a 1934 Brison Barrett, eighty-nine, of Clay is not the 1930 Brison of twenty-eight. Campbell County’s 1899–1904 Alexandria bonds name Josephine Wetterhan, who married Edward Brauntz in 1903, not Josephine Newnam; Hopkins 1900–1903 and Webster 1860–1900 have other Josephines. The federal pension index remains unopened. This volume folds those chats into one narrative. The case dossier remains the working file; this book is the public reading of it. Sibling work on Greene ED 37 through 41 is now on merged PR #26 through Pass 59; remaining Greene ED 38 B-sides, 1900 Liberty, and 1900 hh 85 are inventoried, not duplicated. Do not import their “Dora E. Stone” as this woman.</w:t>
+        <w:t>One hundred fifty-seven Cursor chats on this repository were reviewed for this volume (primary research, helpers, scans, and failed browser hunts). The original mobile session opened the case and read the Arkansas death certificate the family still holds. Later sessions recovered the 1880 childhood schedule that free transcripts had missed, walked statewide Soundex reels for 1910 and 1920, tested a Peebles third-marriage hypothesis and set it aside, and photographed NARA microfilm frames — the 1880 childhood schedule, the 1910 Kentucky Ella Miracode plates, Hardin Gray on Sturgeon sheet 13 B, the 1860 Owsley original of Silas Gray’s house with William aged thirteen, the 1850 Owsley Gray pages that are other men (Thomas, James, John, Charles), the given-name Silas plates that are other boys (Ratliff eight months, Wilson six, Phillips fifteen) and the Bowman line first read as Cyrus and then as Squire, the 1850 Estill Marcus Gray original, Breathitt’s Taulbee infant Silas and Bryant Siras, and Madison’s John Green house with Silas Green aged twenty, the 1850 Owsley Harrison Newman house with an eight-year-old Elias who is probably Dora’s father — a 1932 death extract names Henry Harrison Newnam as that father — and is not merged as proven, the 1860 Booneville original of that house under H.H. Newman with Elias aged eighteen, the 1850 William Newman house of twenty-six on the same page, the 1850 John Newman of sixty born in Tennessee who is not the 1880 John of sixty-nine, and Andrew Mays’s Giles at one month in 1850 and eleven in 1860, the 1870 Proctor original of James Brandenburg’s house, Silas Gray’s Sturgeon original, the 1880 District 59 originals of William next door to John Newnam and of Silas still in the district, the 1900 William Gray dwelling-84 crop, and the Bollinger page a sibling had labelled “Dora E. Stone,” which is Henry C. Rhodes and Dora M. of Missouri, and the 1920 Booneville, Buffalo, and Buck Creek originals with the rejected Taylor, Marcum, Magee, McIntosh, Baker, and McPherson houses, the 1910 Sturgeon Gilbert×Josie house, Lynch’s wife Laura without a Newman on the original, and the Buffalo Baker household whose Soundex card misnamed Gilbert John as Robert, the 1910 Buffalo Gilbert, John house next door to Baker, Robert H., and the Soundex Douglas card that shows the clerks indexed filmed Buffalo sheets, the 1910 Buffalo Bales house first read as Bowman, and the 1920 Bowman Henry, Jack, and Dean George × Jane originals that are other people, and the filmed Buffalo Dean George × Martha house that is probably the 1910 couple, and Kentucky’s B-630 Barrett Ben given-name slot now every-leaf closed — the two Barrett, Ben heads are eighteen in Franklin and sixty in Livingston, and Owsley Barrett, Bent, twenty-four, is a Booneville house with Mary, Maybe, and Stanley, not the 1910 Buffalo Ben — and Kentucky’s B-630 Barrett Bruce given-name slot now every-leaf closed as well: card 2451 copies the original Buffalo Bruce house, Billy twenty-two is the next dwelling, and Board Bruce of Muhlenberg is another man, and Kentucky’s B-630 Barrett John given-name slot now every-leaf closed: there is no Barrett, John of about seventy-five in Owsley district 92 as a head, Madison John seventy-one with grandson Sam and Lee County John fifty-six with Hershel are other men, and Soundex Beard, John, seventy-one, of Owsley district 90 copies the original Island Creek house of Beard, John, Virginia-born, with Margruy[?] and Herbert, not the 1910 Buffalo Barrett John, and Kentucky’s B-630 Barrett James given-name slot now every-leaf closed as a hit: original Buffalo dwelling 102 is Barrett, James, thirty, with Ollie, Ivory, Pearl, and mother Susan, sixty-eight, a widow — probably the 1910 James twenty-three and Susan sixty-two — and John is not in that house, and the Lee given-name slot is now every-leaf closed with no Barrett, Lee of about forty-nine in Owsley district 92 as a head. Statewide Kentucky death index 1911–1920 has no Barrett, John of about seventy in Lee, Owsley, Clay, Jackson, Estill, or Breathitt; Lee’s 1913 John Barrett, twenty-eight, is William and M. Roberts’s son, not the 1910 man. Statewide Kentucky death index 1921–1930 still has no Barrett, John of about eighty in those neighboring counties except Lee’s 12 April 1925 John Barrett, about seventy, at Beattyville, parents blank, who is not merged. Owsley’s 4 February 1921 Susan Barrett, sixty-five, daughter of Lacy Abner and Sintha Combs, is not James’s mother sixty-eight. The 12 April 1930 original Buffalo schedule — district 95-6, sheet 6 A, dwelling 92 — is Barrett, James, forty-five, with Ollie, thirty-four, Minnie, Pearl thirteen, Virgie, Martha, and Horton; that is probably the 1920 house, and Soundex B-630 missed it. John and Susan are not in the house and are not Barrett heads in that entire Buffalo district. Statewide Kentucky death index 1931–1940 has no Barrett, John of about ninety in those neighboring counties; a 1937 John Barrett, eighty-nine, of Nicholas County, is not merged. The 1940 Owsley HTML has no James of about fifty with Ollie; James sixty with Martha is another couple. The rest of Owsley County in 1930 is mapped but not every-line closed. Booneville Town is now every-line closed: Barrett, A.W., forty-five, with Mattie, is not John of about eighty-five, and is not Buffalo James with Ollie; Barrett, Lewis, twenty-two, a son in Thomas Wilson’s house, is another man; Leonard and Fred on sheet 2 B are Beckner, not Barrett. Booneville magisterial district 1 dwelling 85 is Barrett, Walker, thirty-eight, with Rosie — not John of about eighty-five — and Bowman Elisha’s Ollie, Mayers’s Ollie, and Beard James are other people. The same district’s later sheets hold a Barrett cluster: Robert, forty-one, with Kate and a son John of fourteen; Hayden, thirty-two; another Robert, twenty-eight, with Laura, not merged with Robert forty-one; Hiram, thirty-four; Charley, thirty-five, whose daughters Dollie and Effie are not Ollie of thirty-four; and George, thirty-seven, with Rosie, thirty-seven, not Walker’s Rosie of thirty-two. All are other houses. A 1939 *Owsley County Courier* obituary for William Barrett, seventy-nine, who died 13 April at Oil, with sons Walker and Fred of Clay City and a brother John Bell of Beattyville, is not the 1910 John; Walker as that William’s son is a possible associate of the 1930 Walker house only and is not merged. Statewide Kentucky death index 1931–1940 has no Barrett, Ollie or Susan; a 1934 Brison Barrett, eighty-nine, of Clay is not the 1930 Brison of twenty-eight. Campbell County’s 1899–1904 Alexandria bonds name Josephine Wetterhan, who married Edward Brauntz in 1903, not Josephine Newnam; Hopkins 1898–1904 and Webster 1860–1900 have other Josephines; Owsley’s marriage directory still skips 1879–1902. The federal pension index remains unopened. This volume folds those chats into one narrative. The case dossier remains the working file; this book is the public reading of it. Sibling work on Greene ED 37 through 41 is now on merged PR #26 through Pass 59; remaining Greene ED 38 B-sides, 1900 Liberty, and 1900 hh 85 are inventoried, not duplicated. Do not import their “Dora E. Stone” as this woman.</w:t>
       </w:r>
     </w:p>
     <w:p>
@@ -903,7 +903,7 @@
         <w:t>Susan</w:t>
       </w:r>
       <w:r>
-        <w:t xml:space="preserve">, sixty-eight, a widow. Kentucky’s B-630 card 3382 copies that original; the clerk’s ages thirty-six and Pearl two yield to the schedule. That is probably the 1910 Buffalo James of twenty-three and Susan of sixty-two: Barrett James plus Owsley Buffalo plus mother Susan. Ages thirty versus about thirty-three and sixty-eight versus about seventy-two are disclosed and not averaged. John is not in the house. Susan’s widow mark plus that absence is a possible death between 1910 and 1920, not a proved death. Statewide Kentucky death index 1911–1920 has no Barrett, John of about seventy in those neighboring counties. Lee’s 11 October 1913 John Barrett, twenty-eight, father William, mother M. Roberts, is another man. Statewide Kentucky death index 1921–1930 still has no Barrett, John of about eighty in those neighboring counties except Lee’s 12 April 1925 John Barrett, about seventy, at Beattyville, parents blank, who is not merged. Owsley’s 4 February 1921 Susan Barrett, sixty-five, daughter of Lacy Abner and Sintha Combs, is not James’s mother sixty-eight. The 12 April 1930 original Buffalo schedule — district 95-6, sheet 6 A, dwelling 92 — is Barrett, James, forty-five, with Ollie, thirty-four, Minnie fifteen, Pearl thirteen, Virgie nine, Martha five, and Horton three. That is probably the 1920 house: Barrett James with Ollie, Buffalo, and Pearl three to thirteen. Soundex B-630 missed it. James thirty to forty-five is plus fifteen in ten and is not averaged; Ivory versus Minnie is not merged; 1920 Pearl as a son versus 1930 Pearl as a daughter is disclosed. John and Susan are not in the house and are not Barrett heads in that entire Buffalo district. Statewide Kentucky death index 1931–1940 has no Barrett, John of about ninety in those neighboring counties; a 2 October 1937 John Barrett, eighty-nine, of Nicholas County, is not merged. The 1940 Owsley HTML has no James of about fifty with Ollie; James sixty with Martha is another couple. The rest of the 1930 county is mapped, not every-line closed: Booneville Town’s opener has no Barrett head; Booneville magisterial district 1 dwelling 85 is Barrett, Walker, thirty-eight, with Rosie, Daily, Stella, Fred, Berlin, Marie, and Geneva — not John of about eighty-five — and Bowman Elisha’s Ollie, Mayers’s Ollie, and Beard James of twenty-seven are other people. Statewide Kentucky death index 1931–1940 has no Barrett, Ollie or Susan; a 1934 Brison Barrett, eighty-nine, of Clay is not the 1930 Brison of twenty-eight. Campbell County’s Alexandria bonds for 1899–1904 name Josephine Wetterhan, who married Edward Brauntz in 1903, not Josephine Newnam; Hopkins 1900–1903 and Webster 1860–1900 have other Josephines. A 1933 Owsley James Barrett, thirty-four, son of Dan and Nancy Ann Bowles, is another man. Kentucky’s B-630 Lee given-name slot is now every-leaf closed: there is no Barrett, Lee of about forty-nine in Owsley district 92 as a head, and Lee is not in James’s house. Baird, Lee, forty-nine, of Clay is another man. Sheet 7 A dwelling </w:t>
+        <w:t xml:space="preserve">, sixty-eight, a widow. Kentucky’s B-630 card 3382 copies that original; the clerk’s ages thirty-six and Pearl two yield to the schedule. That is probably the 1910 Buffalo James of twenty-three and Susan of sixty-two: Barrett James plus Owsley Buffalo plus mother Susan. Ages thirty versus about thirty-three and sixty-eight versus about seventy-two are disclosed and not averaged. John is not in the house. Susan’s widow mark plus that absence is a possible death between 1910 and 1920, not a proved death. Statewide Kentucky death index 1911–1920 has no Barrett, John of about seventy in those neighboring counties. Lee’s 11 October 1913 John Barrett, twenty-eight, father William, mother M. Roberts, is another man. Statewide Kentucky death index 1921–1930 still has no Barrett, John of about eighty in those neighboring counties except Lee’s 12 April 1925 John Barrett, about seventy, at Beattyville, parents blank, who is not merged. Owsley’s 4 February 1921 Susan Barrett, sixty-five, daughter of Lacy Abner and Sintha Combs, is not James’s mother sixty-eight. The 12 April 1930 original Buffalo schedule — district 95-6, sheet 6 A, dwelling 92 — is Barrett, James, forty-five, with Ollie, thirty-four, Minnie fifteen, Pearl thirteen, Virgie nine, Martha five, and Horton three. That is probably the 1920 house: Barrett James with Ollie, Buffalo, and Pearl three to thirteen. Soundex B-630 missed it. James thirty to forty-five is plus fifteen in ten and is not averaged; Ivory versus Minnie is not merged; 1920 Pearl as a son versus 1930 Pearl as a daughter is disclosed. John and Susan are not in the house and are not Barrett heads in that entire Buffalo district. Statewide Kentucky death index 1931–1940 has no Barrett, John of about ninety in those neighboring counties; a 2 October 1937 John Barrett, eighty-nine, of Nicholas County, is not merged. The 1940 Owsley HTML has no James of about fifty with Ollie; James sixty with Martha is another couple. The rest of the 1930 county is mapped, not every-line closed. Booneville Town is now every-line closed: Barrett, A.W., forty-five, with Mattie, Moffet, Ralph, and Monroe, is not John of about eighty-five and is not Buffalo James with Ollie; Barrett, Lewis, twenty-two, a son in Thomas Wilson’s house, is another man; Leonard forty-two and Fred twenty-one on sheet 2 B are Beckner, not Barrett. Booneville magisterial district 1 dwelling 85 is Barrett, Walker, thirty-eight, with Rosie, Daily, Stella, Fred, Berlin, Marie, and Geneva — not John of about eighty-five — and Bowman Elisha’s Ollie, Mayers’s Ollie, and Beard James of twenty-seven are other people. Later sheets of that district hold Robert, forty-one, with Kate and a son John of fourteen; Hayden, thirty-two, with Eva; another Robert, twenty-eight, with Laura, not merged with Robert forty-one; Hiram, thirty-four, with Lillie; Charley, thirty-five, with Martha, whose Dollie and Effie are not Ollie of thirty-four; and George, thirty-seven, with Rosie, thirty-seven, Luther, Birdie, Ada, Edna, Harris, Charley, Cintha, and Lee — not Walker’s Rosie of thirty-two. A 21 April 1939 *Owsley County Courier* obituary for William Barrett, seventy-nine, who died 13 April at his daughter Mrs. Leno Combs’s in Oil, with sons Walker and Fred of Clay City and a brother John Bell Barrett of Beattyville, is not the 1910 John; Walker as that William’s son is a possible associate of the 1930 Walker house only and is not merged. Statewide Kentucky death index 1931–1940 has no Barrett, Ollie or Susan; a 1934 Brison Barrett, eighty-nine, of Clay is not the 1930 Brison of twenty-eight. Campbell County’s Alexandria bonds for 1899–1904 name Josephine Wetterhan, who married Edward Brauntz in 1903, not Josephine Newnam; Hopkins 1898–1904 and Webster 1860–1900 have other Josephines; Owsley’s marriage directory still skips 1879–1902. A 1933 Owsley James Barrett, thirty-four, son of Dan and Nancy Ann Bowles, is another man. Kentucky’s B-630 Lee given-name slot is now every-leaf closed: there is no Barrett, Lee of about forty-nine in Owsley district 92 as a head, and Lee is not in James’s house. Baird, Lee, forty-nine, of Clay is another man. Sheet 7 A dwelling </w:t>
       </w:r>
       <w:r>
         <w:rPr>
@@ -1551,7 +1551,7 @@
         <w:t>Dara</w:t>
       </w:r>
       <w:r>
-        <w:t>, forty — the enumerator wrote an open a, not o — is another person. Kentucky’s 1920 Soundex has no Manerva or Minerva Newman card, and the Walter given-name window has no Owsley or Lee Walter with Manerva. Kentucky’s 1920 death index has no Manerva Newnam row on 28 August; the Owsley table that day is an infant Bates. Mary Ann Smallwood, born April 1842, came from the Owsley Smallwoods. The 11 July 1918 cemetery date is still unmatched in Kentucky’s civil index. [C669] [C672] [C693] [C694] [C690] [C691] [C709] [C711] [C712] [C713] [C717] [C729] [C730] [C739] [C740] [C741] [C742] [C743] [C744] [C745] [C746] [C747] [C748] [C752] [C753] [C754] [C756] [C759] [C763] [C765] [C768] [C775] [C776] [C777] [C779] [C780] [C782] [C783] [C784] [C789] [C790] [C791] [C792] [C793] [C794] [C795] [C796] [C797] [C801] [C802] [C803] [C804] [C808] [C809] [C810] [C811] [C812] [C813] [C814] [C818] [C819] [C820] [C821] [C822] [C823] [C824] [C825] [C826] [C827] [C828] [C832] [C833] [C847] [C848] [C849] [C851] [C857] [C859] [C860] [C861] [C863] [C868] [C869] [C872] [C873] [C874] [C875] [C876] [C877] [C880] [C881] [C882] [C883] [C884] [C887] [C888] [C892] [C893] [C894] [C896] [C941] [C942] [C943] [C944] [C945] [C946] [C947] [C948] [C949] [C950] [C951] [C952] [C953] [C954] [C955] [C956] [C957] [C958] [C959] [C960] [C961] [C962] [C963] [C964] [C965] [C966] [C967] [C968] [C969] [C970] [C971] [C972] [C973] [C974] [C975] [C976] [C977] [C978] [C979] [C980] [C981] [C982] [C983] [C984] [C985] [C986] [C987] [C988] [C989] [C990] [C991] [C992] [C993] [C994] [C995] [C996]</w:t>
+        <w:t>, forty — the enumerator wrote an open a, not o — is another person. Kentucky’s 1920 Soundex has no Manerva or Minerva Newman card, and the Walter given-name window has no Owsley or Lee Walter with Manerva. Kentucky’s 1920 death index has no Manerva Newnam row on 28 August; the Owsley table that day is an infant Bates. Mary Ann Smallwood, born April 1842, came from the Owsley Smallwoods. The 11 July 1918 cemetery date is still unmatched in Kentucky’s civil index. [C669] [C672] [C693] [C694] [C690] [C691] [C709] [C711] [C712] [C713] [C717] [C729] [C730] [C739] [C740] [C741] [C742] [C743] [C744] [C745] [C746] [C747] [C748] [C752] [C753] [C754] [C756] [C759] [C763] [C765] [C768] [C775] [C776] [C777] [C779] [C780] [C782] [C783] [C784] [C789] [C790] [C791] [C792] [C793] [C794] [C795] [C796] [C797] [C801] [C802] [C803] [C804] [C808] [C809] [C810] [C811] [C812] [C813] [C814] [C818] [C819] [C820] [C821] [C822] [C823] [C824] [C825] [C826] [C827] [C828] [C832] [C833] [C847] [C848] [C849] [C851] [C857] [C859] [C860] [C861] [C863] [C868] [C869] [C872] [C873] [C874] [C875] [C876] [C877] [C880] [C881] [C882] [C883] [C884] [C887] [C888] [C892] [C893] [C894] [C896] [C941] [C942] [C943] [C944] [C945] [C946] [C947] [C948] [C949] [C950] [C951] [C952] [C953] [C954] [C955] [C956] [C957] [C958] [C959] [C960] [C961] [C962] [C963] [C964] [C965] [C966] [C967] [C968] [C969] [C970] [C971] [C972] [C973] [C974] [C975] [C976] [C977] [C978] [C979] [C980] [C981] [C982] [C983] [C984] [C985] [C986] [C987] [C988] [C989] [C990] [C991] [C992] [C993] [C994] [C995] [C996] [C997] [C998] [C999] [C1000] [C1001] [C1002] [C1003] [C1004] [C1005] [C1006] [C1007] [C1008] [C1009]</w:t>
       </w:r>
     </w:p>
     <w:p>

</xml_diff>

<commit_message>
Pass 125-129: isolate Owsley 1850 hh 311 William x Jane; close Jessamine, Woodford, Scott, Spencer.
B058 still film-only. 1850 living head FOUND as William 26 x Jane 22 + Francis 4 F + Leanner 2 F next to Rebecca Tincher 51 (C1608, real-estate $325). Jane not merged with Rhoda. Parents remain PROBABLE. Do not declare research complete.

Co-authored-by: blakereaganlaw <blakereaganlaw@gmail.com>
</commit_message>
<xml_diff>
--- a/research/dora-ella-newnam/book/Dora-Ella-Newnam-Stone-A-Life.docx
+++ b/research/dora-ella-newnam/book/Dora-Ella-Newnam-Stone-A-Life.docx
@@ -376,6 +376,31 @@
     </w:p>
     <w:p>
       <w:r>
+        <w:t>70. [Pass 125. Greenup’s three Newman heads and Fleming 395A are other men](#pass-125-greenups-three-newman-heads-and-fleming-395a-are-other-men)</w:t>
+      </w:r>
+    </w:p>
+    <w:p>
+      <w:r>
+        <w:t>71. [Pass 126. Adair and Mason close; Lincoln 1840 Newman is not William](#pass-126-adair-and-mason-close-lincoln-1840-newman-is-not-william)</w:t>
+      </w:r>
+    </w:p>
+    <w:p>
+      <w:r>
+        <w:t>72. [Pass 127. William and Jane sit next door to Rebecca Tincher](#pass-127-william-and-jane-sit-next-door-to-rebecca-tincher)</w:t>
+      </w:r>
+    </w:p>
+    <w:p>
+      <w:r>
+        <w:t>73. [Pass 128. Jessamine 10B is Edmund, not William](#pass-128-jessamine-10b-is-edmund-not-william)</w:t>
+      </w:r>
+    </w:p>
+    <w:p>
+      <w:r>
+        <w:t>74. [Pass 129. Woodford 462A is Christopher; Scott Newham is not William](#pass-129-woodford-462a-is-christopher-scott-newham-is-not-william)</w:t>
+      </w:r>
+    </w:p>
+    <w:p>
+      <w:r>
         <w:br w:type="page"/>
       </w:r>
     </w:p>
@@ -11086,35 +11111,104 @@
     </w:p>
     <w:p>
       <w:pPr>
-        <w:pStyle w:val="Heading1"/>
+        <w:pStyle w:val="Heading2"/>
       </w:pPr>
       <w:r>
-        <w:t>The children, in brief</w:t>
-      </w:r>
-    </w:p>
-    <w:p>
-      <w:r>
-        <w:t>Two children born to Dora and Samuel died before 1 June 1900. They have no names in any record yet read.</w:t>
-      </w:r>
-    </w:p>
-    <w:p>
-      <w:r>
-        <w:rPr>
-          <w:b/>
-        </w:rPr>
-        <w:t>McCoy “Coy” Newnam</w:t>
-      </w:r>
-      <w:r>
-        <w:t xml:space="preserve">, born April 1890, married Letha Viola Sullivan at Ola on 18 February 1917. In 1920 they were at Danville, Yell County. In 1930 they were back in Buck Creek, Owsley County — </w:t>
-      </w:r>
-      <w:r>
-        <w:rPr>
-          <w:b/>
-        </w:rPr>
-        <w:t>Newman, McCoy</w:t>
-      </w:r>
-      <w:r>
-        <w:t xml:space="preserve">, forty, with Edith, twenty-nine, of Missouri. That head is </w:t>
+        <w:t>Pass 125. Greenup’s three Newman heads and Fleming 395A are other men</w:t>
+      </w:r>
+    </w:p>
+    <w:p>
+      <w:r>
+        <w:t>August 1926 is still on film. The Library of Congress item still reads `item.digitized: false`. Internet Archive Solr for 1926 returned zero items. The phone is already recorded. [C1561] [S1211] [S1212]</w:t>
+      </w:r>
+    </w:p>
+    <w:p>
+      <w:r>
+        <w:t>Carter 1850 closes on the KYGenWeb heads index. The N-window is Nethercult, Newell, Noland, Nickell, Nolcina, Nobley, Nunley, Nipp, North, Norton, Norris, Nifferell, and Newhart. The only nearby T is Tinsley, Sally. No Newman. No Tincher. [C1562] [C1563] [S1213] [S1214]</w:t>
+      </w:r>
+    </w:p>
+    <w:p>
+      <w:r>
+        <w:t xml:space="preserve">Greenup’s compiled list named three Newman households. All three originals are now seen. On 20 August, District 2, household 407 is Lemuel Newman, thirty-eight, of Maryland, with Matilda, twenty-four, of Virginia, and three sons — </w:t>
+      </w:r>
+      <w:r>
+        <w:rPr>
+          <w:b/>
+        </w:rPr>
+        <w:t>rejected</w:t>
+      </w:r>
+      <w:r>
+        <w:t xml:space="preserve">. On stamped 191, Thomas Newman, twenty-eight, a South Carolina merchant, sits with Tabitha, twenty-five, of Virginia, and Jalander, five, of Alabama — </w:t>
+      </w:r>
+      <w:r>
+        <w:rPr>
+          <w:b/>
+        </w:rPr>
+        <w:t>rejected</w:t>
+      </w:r>
+      <w:r>
+        <w:t xml:space="preserve">. On 3 October in the first district, stamped 261, Henry Newman, thirty, a German laborer, sits with Eliza, twenty-eight, of Ohio, and William, five, of Ohio — </w:t>
+      </w:r>
+      <w:r>
+        <w:rPr>
+          <w:b/>
+        </w:rPr>
+        <w:t>rejected</w:t>
+      </w:r>
+      <w:r>
+        <w:t>. Greenup 1850 is closed. [C1564] [C1565] [C1566] [C1567] [C1568] [S1215] [S1216] [S1217] [S1218]</w:t>
+      </w:r>
+    </w:p>
+    <w:p>
+      <w:r>
+        <w:t>Lewis closes on the every-name Wayback indexes. No Newman. No Tincher. [C1569] [S1219]</w:t>
+      </w:r>
+    </w:p>
+    <w:p>
+      <w:r>
+        <w:t xml:space="preserve">Fleming’s leftover 395A page is now seen. Leaf n0553, stamped 386B, is Samuel Newman, thirty-seven, with Sarah — </w:t>
+      </w:r>
+      <w:r>
+        <w:rPr>
+          <w:b/>
+        </w:rPr>
+        <w:t>rejected</w:t>
+      </w:r>
+      <w:r>
+        <w:t xml:space="preserve">. Leaf n0558, stamped 389A, is James Newman, thirty-seven, farmer, $2,000, with Mary Jane — </w:t>
+      </w:r>
+      <w:r>
+        <w:rPr>
+          <w:b/>
+        </w:rPr>
+        <w:t>rejected</w:t>
+      </w:r>
+      <w:r>
+        <w:t xml:space="preserve">. Leaf n0570, stamped 395A, is a man about thirty-one (Madison or Andrew on a hard reading), farmer, $1,650, with a wife of thirty and six children including William F., ten — </w:t>
+      </w:r>
+      <w:r>
+        <w:rPr>
+          <w:b/>
+        </w:rPr>
+        <w:t>rejected</w:t>
+      </w:r>
+      <w:r>
+        <w:t>. Those children are not Decatur and Leaner. Fleming’s 2nd Division Newman pages are closed. [C1570] [C1571] [C1572] [C1573] [S1220] [S1221] [S1222]</w:t>
+      </w:r>
+    </w:p>
+    <w:p>
+      <w:r>
+        <w:t>Lincoln 1850 is mapped on reel 210. District 1 begins about leaf n0180, stamped 245, 8 August, John W. Craig. Sampled name columns on n0180 and n0200 have no Newman. One hundred sixty-eight fulls from n0168 to n0335 are on disk. Name-column OCR is still a draft. The county is not closed. S-K’s 1840 Lincoln index lists Newman on pages 123 and 132. Reel 117 of 1840 places Lincoln near leaf n0320; those two pages are unread. [C1574] [C1575] [C1576] [C1577] [S1223] [S1224] [S1225]</w:t>
+      </w:r>
+    </w:p>
+    <w:p>
+      <w:r>
+        <w:t>Casey, Russell, Bracken, and Harrison close on S-K compiled N-windows. Casey has Napier and Noland. Russell has Nelson and Nichols. Bracken has Newcomb and Newell. Harrison has New, Newell, and Tinkey. None is Newman. None is Tincher. [C1578] [C1579] [C1580] [C1581] [S1226] [S1227] [S1228] [S1229]</w:t>
+      </w:r>
+    </w:p>
+    <w:p>
+      <w:r>
+        <w:t xml:space="preserve">Adair’s S-K page 404s; us-census.org holds 1810 only. Mason’s S-K page is a product sale, not a free index. No free license for William Newman and Rhoda Tincher appeared. Parents remain </w:t>
       </w:r>
       <w:r>
         <w:rPr>
@@ -11123,16 +11217,16 @@
         <w:t>probable</w:t>
       </w:r>
       <w:r>
-        <w:t xml:space="preserve"> Dora’s son. [C561] [C562] [S409] He is the 1926 informant. Kentucky’s death index for 1931–1989 has no McCoy or Coy Newman or Newnam. [C565] He is not an Owsley head in 1940 or 1950. [C574] [C575] A California NUMIDENT row for </w:t>
-      </w:r>
-      <w:r>
-        <w:rPr>
-          <w:b/>
-        </w:rPr>
-        <w:t>MCCOY, NEWMAN</w:t>
-      </w:r>
-      <w:r>
-        <w:t xml:space="preserve">, born 13 April 1890, is </w:t>
+        <w:t xml:space="preserve">. The 1860 widow Rhoda with B. F., seven, is still </w:t>
+      </w:r>
+      <w:r>
+        <w:rPr>
+          <w:b/>
+        </w:rPr>
+        <w:t>proven</w:t>
+      </w:r>
+      <w:r>
+        <w:t xml:space="preserve">. Conflict #28 stands. Abner Newman on Estill 1840 n0092 stays </w:t>
       </w:r>
       <w:r>
         <w:rPr>
@@ -11141,103 +11235,110 @@
         <w:t>possible</w:t>
       </w:r>
       <w:r>
-        <w:t xml:space="preserve"> only and is not merged. [C576] Living descendants are not named here.</w:t>
-      </w:r>
-    </w:p>
-    <w:p>
-      <w:r>
-        <w:rPr>
-          <w:b/>
-        </w:rPr>
-        <w:t>Mary Magdalene Newnam</w:t>
-      </w:r>
-      <w:r>
-        <w:t xml:space="preserve">, June 1892 on the census, 12 June 1893 Beattyville on her Social Security account, later Mary M. Bunch. Marriage and death are not closed in free sources: Lee marriage books have no Bunch row; NUMIDENT lists her </w:t>
-      </w:r>
-      <w:r>
-        <w:rPr>
-          <w:b/>
-        </w:rPr>
-        <w:t>deceased</w:t>
-      </w:r>
-      <w:r>
-        <w:t xml:space="preserve"> but gives </w:t>
-      </w:r>
-      <w:r>
-        <w:rPr>
-          <w:b/>
-        </w:rPr>
-        <w:t>no death date</w:t>
-      </w:r>
-      <w:r>
-        <w:t xml:space="preserve">; the public Social Security Death Index API returned no match for SSN </w:t>
-      </w:r>
-      <w:r>
-        <w:rPr>
-          <w:b/>
-        </w:rPr>
-        <w:t>410-19-2658</w:t>
-      </w:r>
-      <w:r>
-        <w:t>; Tennessee archives and Knox marriage indexes were not reachable from the research VM (</w:t>
-      </w:r>
-      <w:r>
-        <w:rPr>
-          <w:b/>
-        </w:rPr>
-        <w:t>R007</w:t>
-      </w:r>
-      <w:r>
-        <w:t xml:space="preserve">, </w:t>
-      </w:r>
-      <w:r>
-        <w:rPr>
-          <w:b/>
-        </w:rPr>
-        <w:t>L257</w:t>
-      </w:r>
-      <w:r>
-        <w:t>). [C158]</w:t>
-      </w:r>
-    </w:p>
-    <w:p>
-      <w:r>
-        <w:rPr>
-          <w:b/>
-        </w:rPr>
-        <w:t>Pearl P. Newnam</w:t>
-      </w:r>
-      <w:r>
-        <w:t>, 15 March 1895, Banford, later Pearl P. Jackson, died 19 September 1980, Shelby County, Tennessee. The 1910 grandmother household, the 1922 Elizabeth Newnam will, and the NUMIDENT file make her identification the strongest of the five.</w:t>
-      </w:r>
-    </w:p>
-    <w:p>
-      <w:r>
-        <w:rPr>
-          <w:b/>
-        </w:rPr>
-        <w:t>Rissa / Rissie</w:t>
-      </w:r>
-      <w:r>
-        <w:t xml:space="preserve">, May 1897. After the 1900 census she does not reappear on the Kentucky child Soundex pass or in Pearl’s 1910 Owsley household. On 15 April 1910 a </w:t>
-      </w:r>
-      <w:r>
-        <w:rPr>
-          <w:b/>
-        </w:rPr>
-        <w:t>Newman, Rissie</w:t>
-      </w:r>
-      <w:r>
-        <w:t xml:space="preserve">, servant, fifteen, sits in </w:t>
-      </w:r>
-      <w:r>
-        <w:rPr>
-          <w:b/>
-        </w:rPr>
-        <w:t>Edney, Sam</w:t>
-      </w:r>
-      <w:r>
-        <w:t xml:space="preserve">’s Heidelberg house — </w:t>
+        <w:t xml:space="preserve"> only. [C1582] [C1583] [C1584] [C1585] [S1230] [S1231] [S1232] [S1245]</w:t>
+      </w:r>
+    </w:p>
+    <w:p>
+      <w:r>
+        <w:t xml:space="preserve">Genealogy Trails Lee WWI tables are live and still name Luther Brandenburg and Underwood only. FamilySearch 1146342 returned Incapsula — roadblock step 66. USGenNet Lee wills still omit Samuel P. Hutchins FAQ 9938 is live. Reel 602 is still 515 images. Do not print 1966. Do not print 1962. Grant, twenty-one, is still not merged with David F. David G. of 1984 is still </w:t>
+      </w:r>
+      <w:r>
+        <w:rPr>
+          <w:b/>
+        </w:rPr>
+        <w:t>possible</w:t>
+      </w:r>
+      <w:r>
+        <w:t xml:space="preserve"> as a junior only. Living 1950-line descendants are withheld. Districts 33-12 and 33-13 were not walked. Do not re-ask Tyler Phillips, Pope 479-968-4368, or Hutchins 859-985-3364. [C1586–C1591] [S1233–S1245]</w:t>
+      </w:r>
+    </w:p>
+    <w:p>
+      <w:pPr>
+        <w:pStyle w:val="Heading2"/>
+      </w:pPr>
+      <w:r>
+        <w:t>Pass 126. Adair and Mason close; Lincoln 1840 Newman is not William</w:t>
+      </w:r>
+    </w:p>
+    <w:p>
+      <w:r>
+        <w:t>August 1926 is still on film. The Library of Congress item still reads `item.digitized: false`. Internet Archive Solr for 1926 returned zero items. The phone is already recorded. [C1592] [S1246] [S1247]</w:t>
+      </w:r>
+    </w:p>
+    <w:p>
+      <w:r>
+        <w:t>Adair 1850 closes on the KYGenWeb heads index compiled by Randy Flowers and Michael Watson. The N-window is Nalley, Naylor, Neel, Neet, Nell, Nelson, Newcomb (William H., page 25), Nip, Noel, Northup, Nowel, and Nunn. The nearest T is Timberlic. No Newman. No Tincher. [C1593] [S1248]</w:t>
+      </w:r>
+    </w:p>
+    <w:p>
+      <w:r>
+        <w:t>Mason 1850 closes on the KYGenWeb surname index. The N-near window is Neal, Needow, Neel, Nelson, Newall, Newcomb, Newdigate, Nichols, and Nicholson. Finch appears at District 2 page 65A and Maysville 108B and is not Tincher. No Newman. No Newnam. No Tincher. [C1594] [S1249]</w:t>
+      </w:r>
+    </w:p>
+    <w:p>
+      <w:r>
+        <w:t>The 1840 Lincoln Newman pages are now seen. Reel 117 has 365 images. Leaf n0240 is Lincoln County, Stanford — not Lawrence. Leaf n0295 is printed page 145. Two leaves per page puts printed page 123 at leaf n0249 and page 132 at leaf n0267. [C1595] [S1250] [S1251] [S1254]</w:t>
+      </w:r>
+    </w:p>
+    <w:p>
+      <w:r>
+        <w:t xml:space="preserve">Page 123, allotted to James H. Prince on a hard reading, names two Newman heads: Newman J., with male ticks in the 15-to-30 band, and Newman H.A., with female ticks in the 15-to-40 band and no clear adult-male tick — a possible widow. Neighbors match the S-K page (Cumberland, Bryan, Finks, Olive, Smith, Winders, Bledsoe, Jenkins, Twiddle). Neither given name is William. Both are </w:t>
+      </w:r>
+      <w:r>
+        <w:rPr>
+          <w:b/>
+        </w:rPr>
+        <w:t>rejected</w:t>
+      </w:r>
+      <w:r>
+        <w:t>. [C1596] [S1252]</w:t>
+      </w:r>
+    </w:p>
+    <w:p>
+      <w:r>
+        <w:t xml:space="preserve">Page 132 names McDaniel, Manning, Bosley, McIntire, Harrison, Berry, and Williamson. One hard line reads Holeman or Newman Dasey (or Davey). S-K lists both surnames on that page. The given name is not William. The line is </w:t>
+      </w:r>
+      <w:r>
+        <w:rPr>
+          <w:b/>
+        </w:rPr>
+        <w:t>rejected</w:t>
+      </w:r>
+      <w:r>
+        <w:t xml:space="preserve"> as William. The Newman reading of that one surname stays </w:t>
+      </w:r>
+      <w:r>
+        <w:rPr>
+          <w:b/>
+        </w:rPr>
+        <w:t>possible</w:t>
+      </w:r>
+      <w:r>
+        <w:t>. [C1597] [S1253]</w:t>
+      </w:r>
+    </w:p>
+    <w:p>
+      <w:r>
+        <w:t>Those two 1840 pages are closed for the William living-head hunt. A young William in 1840 could still sit in another man’s house. 1840 names heads only. [C1598]</w:t>
+      </w:r>
+    </w:p>
+    <w:p>
+      <w:r>
+        <w:t>Lincoln 1850 name columns sampled every tenth leaf from n0190 through n0330 have no Newman and no Tincher. District 1 and District 2 are both in the sample. Tesseract on the remaining columns is still a draft. The county is not closed. [C1599] [S1255]</w:t>
+      </w:r>
+    </w:p>
+    <w:p>
+      <w:r>
+        <w:t xml:space="preserve">No free license for William Newman and Rhoda Tincher appeared. Parents remain </w:t>
+      </w:r>
+      <w:r>
+        <w:rPr>
+          <w:b/>
+        </w:rPr>
+        <w:t>probable</w:t>
+      </w:r>
+      <w:r>
+        <w:t xml:space="preserve">. The 1860 widow Rhoda with B. F., seven, is still </w:t>
       </w:r>
       <w:r>
         <w:rPr>
@@ -11246,7 +11347,7 @@
         <w:t>proven</w:t>
       </w:r>
       <w:r>
-        <w:t xml:space="preserve"> as a line, </w:t>
+        <w:t xml:space="preserve">. Conflict #28 stands. Abner Newman on Estill 1840 n0092 stays </w:t>
       </w:r>
       <w:r>
         <w:rPr>
@@ -11255,7 +11356,98 @@
         <w:t>possible</w:t>
       </w:r>
       <w:r>
-        <w:t xml:space="preserve"> Dora’s daughter, </w:t>
+        <w:t xml:space="preserve"> only. [C1600] [C1601] [S1256] [S1260]</w:t>
+      </w:r>
+    </w:p>
+    <w:p>
+      <w:r>
+        <w:t xml:space="preserve">Genealogy Trails Lee WWI tables are live and still name Luther Brandenburg and Underwood only. FamilySearch 1146342 returned a sign-in shell — roadblock step 67. USGenNet Lee wills still omit Samuel P. Hutchins FAQ 9938 is live. Reel 602 is still 515 images. Do not print 1966. Do not print 1962. Grant, twenty-one, is still not merged with David F. David G. of 1984 is still </w:t>
+      </w:r>
+      <w:r>
+        <w:rPr>
+          <w:b/>
+        </w:rPr>
+        <w:t>possible</w:t>
+      </w:r>
+      <w:r>
+        <w:t xml:space="preserve"> as a junior only. Living 1950-line descendants are withheld. Districts 33-12 and 33-13 were not walked. Do not re-ask Tyler Phillips, Pope 479-968-4368, or Hutchins 859-985-3364. [C1602–C1606] [S1257–S1260]</w:t>
+      </w:r>
+    </w:p>
+    <w:p>
+      <w:pPr>
+        <w:pStyle w:val="Heading2"/>
+      </w:pPr>
+      <w:r>
+        <w:t>Pass 127. William and Jane sit next door to Rebecca Tincher</w:t>
+      </w:r>
+    </w:p>
+    <w:p>
+      <w:r>
+        <w:t>August 1926 is still on film. `item.digitized` is still false. [C1607] [S1261] [S1262]</w:t>
+      </w:r>
+    </w:p>
+    <w:p>
+      <w:r>
+        <w:t xml:space="preserve">Owsley stamped 299B, household 311, enumerated 17 September 1850, is now read as a living head. </w:t>
+      </w:r>
+      <w:r>
+        <w:rPr>
+          <w:b/>
+        </w:rPr>
+        <w:t>William Newman</w:t>
+      </w:r>
+      <w:r>
+        <w:t xml:space="preserve">, twenty-six, farmer, Kentucky, sits with </w:t>
+      </w:r>
+      <w:r>
+        <w:rPr>
+          <w:b/>
+        </w:rPr>
+        <w:t>Jane</w:t>
+      </w:r>
+      <w:r>
+        <w:t xml:space="preserve">, twenty-two, </w:t>
+      </w:r>
+      <w:r>
+        <w:rPr>
+          <w:b/>
+        </w:rPr>
+        <w:t>Francis</w:t>
+      </w:r>
+      <w:r>
+        <w:t xml:space="preserve">, four, female, and </w:t>
+      </w:r>
+      <w:r>
+        <w:rPr>
+          <w:b/>
+        </w:rPr>
+        <w:t>Leanner</w:t>
+      </w:r>
+      <w:r>
+        <w:t xml:space="preserve">, two, female. Next door, household 312, is </w:t>
+      </w:r>
+      <w:r>
+        <w:rPr>
+          <w:b/>
+        </w:rPr>
+        <w:t>Rebecca Tincher</w:t>
+      </w:r>
+      <w:r>
+        <w:t xml:space="preserve">, fifty-one, widow. William Tincher, twenty-one, is line 26, not line 22. The earlier claim that Francis-on-299B was disproved is </w:t>
+      </w:r>
+      <w:r>
+        <w:rPr>
+          <w:b/>
+        </w:rPr>
+        <w:t>withdrawn</w:t>
+      </w:r>
+      <w:r>
+        <w:t>. WikiTree’s line-22 cite is correct as a line number. [C1608] [C1609] [S1263] [S1264]</w:t>
+      </w:r>
+    </w:p>
+    <w:p>
+      <w:r>
+        <w:t xml:space="preserve">Same-person against the 1860 widow Rhoda: the given name William, the county, the Tincher FAN next door, Leanner becoming Leaner at plus ten, and Francis aging toward Decatur all align. The wife’s name does not. Jane, twenty-two, is </w:t>
       </w:r>
       <w:r>
         <w:rPr>
@@ -11264,7 +11456,139 @@
         <w:t>not merged</w:t>
       </w:r>
       <w:r>
-        <w:t xml:space="preserve"> (age slack). [C738] [C760] A Rissie Dishman Beaty of Overton County, Tennessee (1887–1926) is </w:t>
+        <w:t xml:space="preserve"> with Rhoda, thirty-seven. Francis equals Decatur stays </w:t>
+      </w:r>
+      <w:r>
+        <w:rPr>
+          <w:b/>
+        </w:rPr>
+        <w:t>possible</w:t>
+      </w:r>
+      <w:r>
+        <w:t xml:space="preserve"> only — the sex conflicts. A serial-wives hypothesis (Jane, then Rhoda) remains open. Do not print Jane as Rhoda. Parents of 1928 Frank remain William × Rhoda </w:t>
+      </w:r>
+      <w:r>
+        <w:rPr>
+          <w:b/>
+        </w:rPr>
+        <w:t>probable</w:t>
+      </w:r>
+      <w:r>
+        <w:t xml:space="preserve">. The 1850 living head of the hunt is </w:t>
+      </w:r>
+      <w:r>
+        <w:rPr>
+          <w:b/>
+        </w:rPr>
+        <w:t>found</w:t>
+      </w:r>
+      <w:r>
+        <w:t>. [C1610–C1613] [S1263]</w:t>
+      </w:r>
+    </w:p>
+    <w:p>
+      <w:r>
+        <w:t xml:space="preserve">Jessamine stamp 13 is William Newman, sixty-seven, and Nancy, forty-five, with adult sons. </w:t>
+      </w:r>
+      <w:r>
+        <w:rPr>
+          <w:b/>
+        </w:rPr>
+        <w:t>Rejected</w:t>
+      </w:r>
+      <w:r>
+        <w:t>. The later pass corrects the page map: that leaf is not S-K 10A/10B. [C1614] [S1265]</w:t>
+      </w:r>
+    </w:p>
+    <w:p>
+      <w:r>
+        <w:t xml:space="preserve">Pendleton, Grant, Owen, Washington, Oldham, Taylor, Bourbon, and Johnson close on compiled N-windows. Woodford 462A and Scott 399B/475 were mapped and left unread this pass. Lincoln OCR stayed a draft. No free license. Parents remain </w:t>
+      </w:r>
+      <w:r>
+        <w:rPr>
+          <w:b/>
+        </w:rPr>
+        <w:t>probable</w:t>
+      </w:r>
+      <w:r>
+        <w:t>. Conflict #28 stands. [C1615–C1627] [S1266–S1280]</w:t>
+      </w:r>
+    </w:p>
+    <w:p>
+      <w:r>
+        <w:t xml:space="preserve">Genealogy Trails Lee WWI tables are live and still name Luther Brandenburg and Underwood only. FamilySearch returned a sign-in shell — roadblock step 68. FAQ 9938 is live. Reel 602 is still 515 images. Do not print 1966. Do not print 1962. Grant, twenty-one, is still not merged. David G. of 1984 is still </w:t>
+      </w:r>
+      <w:r>
+        <w:rPr>
+          <w:b/>
+        </w:rPr>
+        <w:t>possible</w:t>
+      </w:r>
+      <w:r>
+        <w:t xml:space="preserve"> as a junior only. Districts 33-12 and 33-13 were not walked. [C1628–C1632] [S1277–S1280]</w:t>
+      </w:r>
+    </w:p>
+    <w:p>
+      <w:pPr>
+        <w:pStyle w:val="Heading2"/>
+      </w:pPr>
+      <w:r>
+        <w:t>Pass 128. Jessamine 10B is Edmund, not William</w:t>
+      </w:r>
+    </w:p>
+    <w:p>
+      <w:r>
+        <w:t>August 1926 is still on film. [C1633] [S1281] [S1282]</w:t>
+      </w:r>
+    </w:p>
+    <w:p>
+      <w:r>
+        <w:t xml:space="preserve">S-K Jessamine Newman 10A–10B is not reel 208 n0015. Leaf n0021 is stamp 10, 15 August — Gray, Norman, Stafford; no Newman. Leaf n0022 is 10B, 16 August: </w:t>
+      </w:r>
+      <w:r>
+        <w:rPr>
+          <w:b/>
+        </w:rPr>
+        <w:t>Edmund Newman</w:t>
+      </w:r>
+      <w:r>
+        <w:t xml:space="preserve">, twenty-seven, farmer, $500, Kentucky, with </w:t>
+      </w:r>
+      <w:r>
+        <w:rPr>
+          <w:b/>
+        </w:rPr>
+        <w:t>Sophia</w:t>
+      </w:r>
+      <w:r>
+        <w:t xml:space="preserve">, twenty-seven, </w:t>
+      </w:r>
+      <w:r>
+        <w:rPr>
+          <w:b/>
+        </w:rPr>
+        <w:t>George S.</w:t>
+      </w:r>
+      <w:r>
+        <w:t xml:space="preserve">, five, </w:t>
+      </w:r>
+      <w:r>
+        <w:rPr>
+          <w:b/>
+        </w:rPr>
+        <w:t>James W.</w:t>
+      </w:r>
+      <w:r>
+        <w:t xml:space="preserve">, four, and </w:t>
+      </w:r>
+      <w:r>
+        <w:rPr>
+          <w:b/>
+        </w:rPr>
+        <w:t>J. S.</w:t>
+      </w:r>
+      <w:r>
+        <w:t xml:space="preserve">, two. Mary E. Newman, twelve, sits next door in Abraham Jackson’s house. Edmund is </w:t>
       </w:r>
       <w:r>
         <w:rPr>
@@ -11273,61 +11597,176 @@
         <w:t>rejected</w:t>
       </w:r>
       <w:r>
-        <w:t>. [C927] An unsourced WikiTree profile (</w:t>
-      </w:r>
-      <w:r>
-        <w:rPr>
-          <w:b/>
-        </w:rPr>
-        <w:t>Newnam-46</w:t>
-      </w:r>
-      <w:r>
-        <w:t xml:space="preserve">) names her </w:t>
-      </w:r>
-      <w:r>
-        <w:rPr>
-          <w:b/>
-        </w:rPr>
-        <w:t>Rissie (Newnam) Pelfrey</w:t>
-      </w:r>
-      <w:r>
-        <w:t xml:space="preserve">, born at </w:t>
-      </w:r>
-      <w:r>
-        <w:rPr>
-          <w:b/>
-        </w:rPr>
-        <w:t>Pebworth</w:t>
-      </w:r>
-      <w:r>
-        <w:t xml:space="preserve">, died </w:t>
-      </w:r>
-      <w:r>
-        <w:rPr>
-          <w:b/>
-        </w:rPr>
-        <w:t>13 May 1980</w:t>
-      </w:r>
-      <w:r>
-        <w:t xml:space="preserve"> in </w:t>
-      </w:r>
-      <w:r>
-        <w:rPr>
-          <w:b/>
-        </w:rPr>
-        <w:t>Knoxville, Tennessee</w:t>
-      </w:r>
-      <w:r>
-        <w:t xml:space="preserve">, with </w:t>
-      </w:r>
-      <w:r>
-        <w:rPr>
-          <w:b/>
-        </w:rPr>
-        <w:t>Samuel Parriott Newnam</w:t>
-      </w:r>
-      <w:r>
-        <w:t xml:space="preserve"> as father — a </w:t>
+        <w:t xml:space="preserve"> against William × Jane and against William × Rhoda. The “only Jessamine Newman household” claim is </w:t>
+      </w:r>
+      <w:r>
+        <w:rPr>
+          <w:b/>
+        </w:rPr>
+        <w:t>withdrawn</w:t>
+      </w:r>
+      <w:r>
+        <w:t>. Stamp 13 William, sixty-seven, still stands as a reject. Jessamine Newman pages close. Madison closes on 250B, already rejected. [C1634–C1640] [S1283–S1286]</w:t>
+      </w:r>
+    </w:p>
+    <w:p>
+      <w:r>
+        <w:t xml:space="preserve">Lincoln District 2 name columns n0286–n0335 are seen and empty of Newman and Tincher. District 1 OCR is still a draft. Hopkins District 2 compiled page 3 has Francis J., twenty-eight, and John, fifty-nine — both </w:t>
+      </w:r>
+      <w:r>
+        <w:rPr>
+          <w:b/>
+        </w:rPr>
+        <w:t>rejected</w:t>
+      </w:r>
+      <w:r>
+        <w:t xml:space="preserve">. The county is not closed. No free license. Parents remain </w:t>
+      </w:r>
+      <w:r>
+        <w:rPr>
+          <w:b/>
+        </w:rPr>
+        <w:t>probable</w:t>
+      </w:r>
+      <w:r>
+        <w:t>. Jane is not Rhoda. Conflict #28 stands. [C1641–C1647] [S1287] [S1288] [S1293]</w:t>
+      </w:r>
+    </w:p>
+    <w:p>
+      <w:r>
+        <w:t>Genealogy Trails Lee WWI tables are live. FamilySearch 1146342 is a sign-in shell — roadblock step 69. FAQ 9938 is live. Reel 602 is still 515 images. Do not print 1966. Do not print 1962. Grant, twenty-one, is still not merged. [C1648–C1652] [S1289–S1293]</w:t>
+      </w:r>
+    </w:p>
+    <w:p>
+      <w:pPr>
+        <w:pStyle w:val="Heading2"/>
+      </w:pPr>
+      <w:r>
+        <w:t>Pass 129. Woodford 462A is Christopher; Scott Newham is not William</w:t>
+      </w:r>
+    </w:p>
+    <w:p>
+      <w:r>
+        <w:t>August 1926 is still on film. [C1653] [S1296]</w:t>
+      </w:r>
+    </w:p>
+    <w:p>
+      <w:r>
+        <w:t xml:space="preserve">Woodford S-K Newman 462A is isolated on reel 222 n0254, District 2, 30 August 1850. </w:t>
+      </w:r>
+      <w:r>
+        <w:rPr>
+          <w:b/>
+        </w:rPr>
+        <w:t>Christopher Newman</w:t>
+      </w:r>
+      <w:r>
+        <w:t xml:space="preserve">, fifty-one, boot- or shoemaker, $1,700, Maryland, sits with Catherine, seventeen, John, fifteen, painter, and Thomas, fifteen, carpenter. </w:t>
+      </w:r>
+      <w:r>
+        <w:rPr>
+          <w:b/>
+        </w:rPr>
+        <w:t>Rejected</w:t>
+      </w:r>
+      <w:r>
+        <w:t xml:space="preserve"> against William, twenty-six. The next leaf is empty of Newman. The S-K Newman page closes. [C1654–C1657] [S1297] [S1298]</w:t>
+      </w:r>
+    </w:p>
+    <w:p>
+      <w:r>
+        <w:t xml:space="preserve">Scott reel 218 is remapped: n0263 is 399B, n0415 is 475B, n0424 is 480. District 1 East, 2 August, line 29 is </w:t>
+      </w:r>
+      <w:r>
+        <w:rPr>
+          <w:b/>
+        </w:rPr>
+        <w:t>John Newman</w:t>
+      </w:r>
+      <w:r>
+        <w:t xml:space="preserve">, forty-five, stonemason, Ireland, a boarder in John H. Wolfe’s confectioner’s house. The compiled index spelled Newnan. </w:t>
+      </w:r>
+      <w:r>
+        <w:rPr>
+          <w:b/>
+        </w:rPr>
+        <w:t>Rejected</w:t>
+      </w:r>
+      <w:r>
+        <w:t xml:space="preserve">. District 2, 24 August, household 411 is </w:t>
+      </w:r>
+      <w:r>
+        <w:rPr>
+          <w:b/>
+        </w:rPr>
+        <w:t>John B. Newham</w:t>
+      </w:r>
+      <w:r>
+        <w:t xml:space="preserve">, forty-seven, farmer, $2,500, with Mahala, forty-seven, and James, twenty-five. </w:t>
+      </w:r>
+      <w:r>
+        <w:rPr>
+          <w:b/>
+        </w:rPr>
+        <w:t>Rejected</w:t>
+      </w:r>
+      <w:r>
+        <w:t xml:space="preserve">. 480B household 478 is </w:t>
+      </w:r>
+      <w:r>
+        <w:rPr>
+          <w:b/>
+        </w:rPr>
+        <w:t>William Newham</w:t>
+      </w:r>
+      <w:r>
+        <w:t xml:space="preserve">, thirty-eight, farmer, $2,300, with Sarah, forty. </w:t>
+      </w:r>
+      <w:r>
+        <w:rPr>
+          <w:b/>
+        </w:rPr>
+        <w:t>Rejected</w:t>
+      </w:r>
+      <w:r>
+        <w:t>. 480A and 476B have no Newham. Scott’s S-K Newman / Newnan / Newham pages close. [C1658–C1664] [S1299–S1302] [S1312] [S1313]</w:t>
+      </w:r>
+    </w:p>
+    <w:p>
+      <w:r>
+        <w:t xml:space="preserve">Spencer 1850 closes compiled: Simeon, forty-two; James H., thirty; George W., forty-one; Thomas, fifty-three, with son William H., twenty-one; James, fifteen. The enumerator is Thomas Newman. All </w:t>
+      </w:r>
+      <w:r>
+        <w:rPr>
+          <w:b/>
+        </w:rPr>
+        <w:t>rejected</w:t>
+      </w:r>
+      <w:r>
+        <w:t xml:space="preserve">. Shelby has S. Newman, twenty, school teacher — </w:t>
+      </w:r>
+      <w:r>
+        <w:rPr>
+          <w:b/>
+        </w:rPr>
+        <w:t>rejected</w:t>
+      </w:r>
+      <w:r>
+        <w:t xml:space="preserve">; that county is not closed. No free license. Parents remain </w:t>
+      </w:r>
+      <w:r>
+        <w:rPr>
+          <w:b/>
+        </w:rPr>
+        <w:t>probable</w:t>
+      </w:r>
+      <w:r>
+        <w:t>. Jane is not Rhoda. Conflict #28 stands. A second visual of Owsley 299B real estate reads closer to $325; the diplomatic $375 on C1608 is kept. [C1665–C1668] [S1303] [S1304] [S1311]</w:t>
+      </w:r>
+    </w:p>
+    <w:p>
+      <w:r>
+        <w:t xml:space="preserve">Genealogy Trails Lee WWI tables are live. FamilySearch 1146342 is a sign-in shell — roadblock step 70. FAQ 9938 is live. Reel 602 is still 515 images. Do not print 1966. Do not print 1962. Grant, twenty-one, is still not merged. David G. of 1984 is still </w:t>
       </w:r>
       <w:r>
         <w:rPr>
@@ -11336,59 +11775,7 @@
         <w:t>possible</w:t>
       </w:r>
       <w:r>
-        <w:t xml:space="preserve"> lead only, not printed here as proved death. [C230] Free Tennessee death and obituary indexes searched from this case did not independently confirm that row. [C231] Lee Marriage Books 5–15 have no Rissie or Rissa Newnam bride; a 1920 Rissa Newton, seventeen, is a different woman. [C134] A Rissie Pelfrey Maxey born 1882 is a different woman.</w:t>
-      </w:r>
-    </w:p>
-    <w:p>
-      <w:r>
-        <w:rPr>
-          <w:b/>
-        </w:rPr>
-        <w:t>John H. Newnam</w:t>
-      </w:r>
-      <w:r>
-        <w:t xml:space="preserve">, August 1899. Herbert Newman of Lee County, Virginia, was rejected. The Kentucky statewide death index (Reclaim The Records, 1911–1990) has no John H. Newnam death in Lee consistent with an August 1899 birth. [C234] [C237] [C238] Lee Marriage Book 12 has a different </w:t>
-      </w:r>
-      <w:r>
-        <w:rPr>
-          <w:b/>
-        </w:rPr>
-        <w:t>John Newnam</w:t>
-      </w:r>
-      <w:r>
-        <w:t xml:space="preserve">, age twenty-five in 1917, son of John and Serilda — rejected. [C239] Genealogy Trails’ Lee County WWI draft transcript (1,126 cards) lists no Newnam, Newman, or McCoy registrant; other men born in 1899 appear on the September 1918 Beattyville board, but not John under that surname. [C240] [C241] [S248] A cross-border free transcript pass (Owsley, Estill, Arkansas Perry/Yell, Knox KYGenWeb, Missouri Digital Heritage WWI biographies) also returned no Newnam/Newman draft row. [C242] [S249] The official National Archives M1509 pamphlet now maps Lee to </w:t>
-      </w:r>
-      <w:r>
-        <w:rPr>
-          <w:b/>
-        </w:rPr>
-        <w:t>KY45</w:t>
-      </w:r>
-      <w:r>
-        <w:t xml:space="preserve">, Owsley to </w:t>
-      </w:r>
-      <w:r>
-        <w:rPr>
-          <w:b/>
-        </w:rPr>
-        <w:t>KY74</w:t>
-      </w:r>
-      <w:r>
-        <w:t xml:space="preserve">, and Estill to </w:t>
-      </w:r>
-      <w:r>
-        <w:rPr>
-          <w:b/>
-        </w:rPr>
-        <w:t>KY24</w:t>
-      </w:r>
-      <w:r>
-        <w:t>. The cards themselves have not been read. [C1021]</w:t>
-      </w:r>
-    </w:p>
-    <w:p>
-      <w:r>
-        <w:br w:type="page"/>
+        <w:t xml:space="preserve"> as a junior only. Districts 33-12 and 33-13 were not walked. [C1669–C1673] [S1307–S1311]</w:t>
       </w:r>
     </w:p>
     <w:p>
@@ -11396,6 +11783,313 @@
         <w:pStyle w:val="Heading1"/>
       </w:pPr>
       <w:r>
+        <w:t>The children, in brief</w:t>
+      </w:r>
+    </w:p>
+    <w:p>
+      <w:r>
+        <w:t>Two children born to Dora and Samuel died before 1 June 1900. They have no names in any record yet read.</w:t>
+      </w:r>
+    </w:p>
+    <w:p>
+      <w:r>
+        <w:rPr>
+          <w:b/>
+        </w:rPr>
+        <w:t>McCoy “Coy” Newnam</w:t>
+      </w:r>
+      <w:r>
+        <w:t xml:space="preserve">, born April 1890, married Letha Viola Sullivan at Ola on 18 February 1917. In 1920 they were at Danville, Yell County. In 1930 they were back in Buck Creek, Owsley County — </w:t>
+      </w:r>
+      <w:r>
+        <w:rPr>
+          <w:b/>
+        </w:rPr>
+        <w:t>Newman, McCoy</w:t>
+      </w:r>
+      <w:r>
+        <w:t xml:space="preserve">, forty, with Edith, twenty-nine, of Missouri. That head is </w:t>
+      </w:r>
+      <w:r>
+        <w:rPr>
+          <w:b/>
+        </w:rPr>
+        <w:t>probable</w:t>
+      </w:r>
+      <w:r>
+        <w:t xml:space="preserve"> Dora’s son. [C561] [C562] [S409] He is the 1926 informant. Kentucky’s death index for 1931–1989 has no McCoy or Coy Newman or Newnam. [C565] He is not an Owsley head in 1940 or 1950. [C574] [C575] A California NUMIDENT row for </w:t>
+      </w:r>
+      <w:r>
+        <w:rPr>
+          <w:b/>
+        </w:rPr>
+        <w:t>MCCOY, NEWMAN</w:t>
+      </w:r>
+      <w:r>
+        <w:t xml:space="preserve">, born 13 April 1890, is </w:t>
+      </w:r>
+      <w:r>
+        <w:rPr>
+          <w:b/>
+        </w:rPr>
+        <w:t>possible</w:t>
+      </w:r>
+      <w:r>
+        <w:t xml:space="preserve"> only and is not merged. [C576] Living descendants are not named here.</w:t>
+      </w:r>
+    </w:p>
+    <w:p>
+      <w:r>
+        <w:rPr>
+          <w:b/>
+        </w:rPr>
+        <w:t>Mary Magdalene Newnam</w:t>
+      </w:r>
+      <w:r>
+        <w:t xml:space="preserve">, June 1892 on the census, 12 June 1893 Beattyville on her Social Security account, later Mary M. Bunch. Marriage and death are not closed in free sources: Lee marriage books have no Bunch row; NUMIDENT lists her </w:t>
+      </w:r>
+      <w:r>
+        <w:rPr>
+          <w:b/>
+        </w:rPr>
+        <w:t>deceased</w:t>
+      </w:r>
+      <w:r>
+        <w:t xml:space="preserve"> but gives </w:t>
+      </w:r>
+      <w:r>
+        <w:rPr>
+          <w:b/>
+        </w:rPr>
+        <w:t>no death date</w:t>
+      </w:r>
+      <w:r>
+        <w:t xml:space="preserve">; the public Social Security Death Index API returned no match for SSN </w:t>
+      </w:r>
+      <w:r>
+        <w:rPr>
+          <w:b/>
+        </w:rPr>
+        <w:t>410-19-2658</w:t>
+      </w:r>
+      <w:r>
+        <w:t>; Tennessee archives and Knox marriage indexes were not reachable from the research VM (</w:t>
+      </w:r>
+      <w:r>
+        <w:rPr>
+          <w:b/>
+        </w:rPr>
+        <w:t>R007</w:t>
+      </w:r>
+      <w:r>
+        <w:t xml:space="preserve">, </w:t>
+      </w:r>
+      <w:r>
+        <w:rPr>
+          <w:b/>
+        </w:rPr>
+        <w:t>L257</w:t>
+      </w:r>
+      <w:r>
+        <w:t>). [C158]</w:t>
+      </w:r>
+    </w:p>
+    <w:p>
+      <w:r>
+        <w:rPr>
+          <w:b/>
+        </w:rPr>
+        <w:t>Pearl P. Newnam</w:t>
+      </w:r>
+      <w:r>
+        <w:t>, 15 March 1895, Banford, later Pearl P. Jackson, died 19 September 1980, Shelby County, Tennessee. The 1910 grandmother household, the 1922 Elizabeth Newnam will, and the NUMIDENT file make her identification the strongest of the five.</w:t>
+      </w:r>
+    </w:p>
+    <w:p>
+      <w:r>
+        <w:rPr>
+          <w:b/>
+        </w:rPr>
+        <w:t>Rissa / Rissie</w:t>
+      </w:r>
+      <w:r>
+        <w:t xml:space="preserve">, May 1897. After the 1900 census she does not reappear on the Kentucky child Soundex pass or in Pearl’s 1910 Owsley household. On 15 April 1910 a </w:t>
+      </w:r>
+      <w:r>
+        <w:rPr>
+          <w:b/>
+        </w:rPr>
+        <w:t>Newman, Rissie</w:t>
+      </w:r>
+      <w:r>
+        <w:t xml:space="preserve">, servant, fifteen, sits in </w:t>
+      </w:r>
+      <w:r>
+        <w:rPr>
+          <w:b/>
+        </w:rPr>
+        <w:t>Edney, Sam</w:t>
+      </w:r>
+      <w:r>
+        <w:t xml:space="preserve">’s Heidelberg house — </w:t>
+      </w:r>
+      <w:r>
+        <w:rPr>
+          <w:b/>
+        </w:rPr>
+        <w:t>proven</w:t>
+      </w:r>
+      <w:r>
+        <w:t xml:space="preserve"> as a line, </w:t>
+      </w:r>
+      <w:r>
+        <w:rPr>
+          <w:b/>
+        </w:rPr>
+        <w:t>possible</w:t>
+      </w:r>
+      <w:r>
+        <w:t xml:space="preserve"> Dora’s daughter, </w:t>
+      </w:r>
+      <w:r>
+        <w:rPr>
+          <w:b/>
+        </w:rPr>
+        <w:t>not merged</w:t>
+      </w:r>
+      <w:r>
+        <w:t xml:space="preserve"> (age slack). [C738] [C760] A Rissie Dishman Beaty of Overton County, Tennessee (1887–1926) is </w:t>
+      </w:r>
+      <w:r>
+        <w:rPr>
+          <w:b/>
+        </w:rPr>
+        <w:t>rejected</w:t>
+      </w:r>
+      <w:r>
+        <w:t>. [C927] An unsourced WikiTree profile (</w:t>
+      </w:r>
+      <w:r>
+        <w:rPr>
+          <w:b/>
+        </w:rPr>
+        <w:t>Newnam-46</w:t>
+      </w:r>
+      <w:r>
+        <w:t xml:space="preserve">) names her </w:t>
+      </w:r>
+      <w:r>
+        <w:rPr>
+          <w:b/>
+        </w:rPr>
+        <w:t>Rissie (Newnam) Pelfrey</w:t>
+      </w:r>
+      <w:r>
+        <w:t xml:space="preserve">, born at </w:t>
+      </w:r>
+      <w:r>
+        <w:rPr>
+          <w:b/>
+        </w:rPr>
+        <w:t>Pebworth</w:t>
+      </w:r>
+      <w:r>
+        <w:t xml:space="preserve">, died </w:t>
+      </w:r>
+      <w:r>
+        <w:rPr>
+          <w:b/>
+        </w:rPr>
+        <w:t>13 May 1980</w:t>
+      </w:r>
+      <w:r>
+        <w:t xml:space="preserve"> in </w:t>
+      </w:r>
+      <w:r>
+        <w:rPr>
+          <w:b/>
+        </w:rPr>
+        <w:t>Knoxville, Tennessee</w:t>
+      </w:r>
+      <w:r>
+        <w:t xml:space="preserve">, with </w:t>
+      </w:r>
+      <w:r>
+        <w:rPr>
+          <w:b/>
+        </w:rPr>
+        <w:t>Samuel Parriott Newnam</w:t>
+      </w:r>
+      <w:r>
+        <w:t xml:space="preserve"> as father — a </w:t>
+      </w:r>
+      <w:r>
+        <w:rPr>
+          <w:b/>
+        </w:rPr>
+        <w:t>possible</w:t>
+      </w:r>
+      <w:r>
+        <w:t xml:space="preserve"> lead only, not printed here as proved death. [C230] Free Tennessee death and obituary indexes searched from this case did not independently confirm that row. [C231] Lee Marriage Books 5–15 have no Rissie or Rissa Newnam bride; a 1920 Rissa Newton, seventeen, is a different woman. [C134] A Rissie Pelfrey Maxey born 1882 is a different woman.</w:t>
+      </w:r>
+    </w:p>
+    <w:p>
+      <w:r>
+        <w:rPr>
+          <w:b/>
+        </w:rPr>
+        <w:t>John H. Newnam</w:t>
+      </w:r>
+      <w:r>
+        <w:t xml:space="preserve">, August 1899. Herbert Newman of Lee County, Virginia, was rejected. The Kentucky statewide death index (Reclaim The Records, 1911–1990) has no John H. Newnam death in Lee consistent with an August 1899 birth. [C234] [C237] [C238] Lee Marriage Book 12 has a different </w:t>
+      </w:r>
+      <w:r>
+        <w:rPr>
+          <w:b/>
+        </w:rPr>
+        <w:t>John Newnam</w:t>
+      </w:r>
+      <w:r>
+        <w:t xml:space="preserve">, age twenty-five in 1917, son of John and Serilda — rejected. [C239] Genealogy Trails’ Lee County WWI draft transcript (1,126 cards) lists no Newnam, Newman, or McCoy registrant; other men born in 1899 appear on the September 1918 Beattyville board, but not John under that surname. [C240] [C241] [S248] A cross-border free transcript pass (Owsley, Estill, Arkansas Perry/Yell, Knox KYGenWeb, Missouri Digital Heritage WWI biographies) also returned no Newnam/Newman draft row. [C242] [S249] The official National Archives M1509 pamphlet now maps Lee to </w:t>
+      </w:r>
+      <w:r>
+        <w:rPr>
+          <w:b/>
+        </w:rPr>
+        <w:t>KY45</w:t>
+      </w:r>
+      <w:r>
+        <w:t xml:space="preserve">, Owsley to </w:t>
+      </w:r>
+      <w:r>
+        <w:rPr>
+          <w:b/>
+        </w:rPr>
+        <w:t>KY74</w:t>
+      </w:r>
+      <w:r>
+        <w:t xml:space="preserve">, and Estill to </w:t>
+      </w:r>
+      <w:r>
+        <w:rPr>
+          <w:b/>
+        </w:rPr>
+        <w:t>KY24</w:t>
+      </w:r>
+      <w:r>
+        <w:t>. The cards themselves have not been read. [C1021]</w:t>
+      </w:r>
+    </w:p>
+    <w:p>
+      <w:r>
+        <w:br w:type="page"/>
+      </w:r>
+    </w:p>
+    <w:p>
+      <w:pPr>
+        <w:pStyle w:val="Heading1"/>
+      </w:pPr>
+      <w:r>
         <w:t>How to read the plates</w:t>
       </w:r>
     </w:p>
@@ -13736,16 +14430,7 @@
         <w:t>F419.D37 D3</w:t>
       </w:r>
       <w:r>
-        <w:t xml:space="preserve"> / AR Hist Comn / Dardanelle (</w:t>
-      </w:r>
-      <w:r>
-        <w:rPr>
-          <w:b/>
-        </w:rPr>
-        <w:t>C1417</w:t>
-      </w:r>
-      <w:r>
-        <w:t xml:space="preserve"> — do not chase Democrat 1926 film, Journal August, Rural record 17 Jun 1926, Madison library modern PDFs, Newspapers.com Post-Dispatch, or ADNP guides), </w:t>
+        <w:t xml:space="preserve"> — one catalog reconfirm only; </w:t>
       </w:r>
       <w:r>
         <w:rPr>
@@ -13754,34 +14439,25 @@
         <w:t>B071</w:t>
       </w:r>
       <w:r>
-        <w:t xml:space="preserve"> residual 1850 couple as a living head / 1840 Clark names n0005–n0081 / marriage William × Rhoda (Laurel </w:t>
-      </w:r>
-      <w:r>
-        <w:rPr>
-          <w:b/>
-        </w:rPr>
-        <w:t>209</w:t>
-      </w:r>
-      <w:r>
-        <w:t xml:space="preserve"> / Montgomery </w:t>
-      </w:r>
-      <w:r>
-        <w:rPr>
-          <w:b/>
-        </w:rPr>
-        <w:t>214</w:t>
-      </w:r>
-      <w:r>
-        <w:t xml:space="preserve"> / Estill 1840 window / Clay 1840 </w:t>
-      </w:r>
-      <w:r>
-        <w:rPr>
-          <w:b/>
-        </w:rPr>
-        <w:t>closed</w:t>
-      </w:r>
-      <w:r>
-        <w:t xml:space="preserve"> this pass), </w:t>
+        <w:t xml:space="preserve"> residual Lincoln Dist 1 namecol finish + Hopkins remaining + Mercer N + Kenton/Nelson/Franklin compiled (do </w:t>
+      </w:r>
+      <w:r>
+        <w:rPr>
+          <w:b/>
+        </w:rPr>
+        <w:t>not</w:t>
+      </w:r>
+      <w:r>
+        <w:t xml:space="preserve"> repeat closed walks including Owsley 299B hh </w:t>
+      </w:r>
+      <w:r>
+        <w:rPr>
+          <w:b/>
+        </w:rPr>
+        <w:t>311</w:t>
+      </w:r>
+      <w:r>
+        <w:t xml:space="preserve">, Jessamine 10A/10B + stamp 13, Woodford 462A, Scott 399B/475B/480B, Spencer compiled); </w:t>
       </w:r>
       <w:r>
         <w:rPr>
@@ -13808,61 +14484,16 @@
         <w:t>9938</w:t>
       </w:r>
       <w:r>
-        <w:t xml:space="preserve"> now </w:t>
-      </w:r>
-      <w:r>
-        <w:rPr>
-          <w:b/>
-        </w:rPr>
-        <w:t>404</w:t>
-      </w:r>
-      <w:r>
-        <w:t xml:space="preserve">) then June </w:t>
-      </w:r>
-      <w:r>
-        <w:rPr>
-          <w:b/>
-        </w:rPr>
-        <w:t>1958</w:t>
-      </w:r>
-      <w:r>
-        <w:t xml:space="preserve"> *Citizen* film (phone </w:t>
-      </w:r>
-      <w:r>
-        <w:rPr>
-          <w:b/>
-        </w:rPr>
-        <w:t>859-985-3364</w:t>
-      </w:r>
-      <w:r>
-        <w:t xml:space="preserve">) or Newspapers.com </w:t>
-      </w:r>
-      <w:r>
-        <w:rPr>
-          <w:b/>
-        </w:rPr>
-        <w:t>41271</w:t>
-      </w:r>
-      <w:r>
-        <w:t xml:space="preserve"> (UK </w:t>
-      </w:r>
-      <w:r>
-        <w:rPr>
-          <w:b/>
-        </w:rPr>
-        <w:t>S-150</w:t>
-      </w:r>
-      <w:r>
-        <w:t xml:space="preserve"> starts </w:t>
-      </w:r>
-      <w:r>
-        <w:rPr>
-          <w:b/>
-        </w:rPr>
-        <w:t>3 Jul 1958</w:t>
-      </w:r>
-      <w:r>
-        <w:t xml:space="preserve"> — too late for 19 Jun), </w:t>
+        <w:t xml:space="preserve"> </w:t>
+      </w:r>
+      <w:r>
+        <w:rPr>
+          <w:b/>
+        </w:rPr>
+        <w:t>LIVE</w:t>
+      </w:r>
+      <w:r>
+        <w:t xml:space="preserve">); </w:t>
       </w:r>
       <w:r>
         <w:rPr>
@@ -13871,7 +14502,16 @@
         <w:t>B069/B047/B059</w:t>
       </w:r>
       <w:r>
-        <w:t xml:space="preserve"> M1509 </w:t>
+        <w:t xml:space="preserve"> FS </w:t>
+      </w:r>
+      <w:r>
+        <w:rPr>
+          <w:b/>
+        </w:rPr>
+        <w:t>1146342</w:t>
+      </w:r>
+      <w:r>
+        <w:t xml:space="preserve"> + M1509 </w:t>
       </w:r>
       <w:r>
         <w:rPr>
@@ -13880,7 +14520,7 @@
         <w:t>KY45</w:t>
       </w:r>
       <w:r>
-        <w:t xml:space="preserve"> cards, </w:t>
+        <w:t xml:space="preserve">; </w:t>
       </w:r>
       <w:r>
         <w:rPr>
@@ -13889,7 +14529,7 @@
         <w:t>B045/B061/B065</w:t>
       </w:r>
       <w:r>
-        <w:t xml:space="preserve"> FS sign-in (clerk already recorded — do not re-ask), </w:t>
+        <w:t xml:space="preserve"> FS sign-in (do not re-ask); </w:t>
       </w:r>
       <w:r>
         <w:rPr>
@@ -13916,25 +14556,7 @@
         <w:t>B088</w:t>
       </w:r>
       <w:r>
-        <w:t xml:space="preserve"> Antioch </w:t>
-      </w:r>
-      <w:r>
-        <w:rPr>
-          <w:b/>
-        </w:rPr>
-        <w:t>242</w:t>
-      </w:r>
-      <w:r>
-        <w:t xml:space="preserve"> catalog already </w:t>
-      </w:r>
-      <w:r>
-        <w:rPr>
-          <w:b/>
-        </w:rPr>
-        <w:t>proven</w:t>
-      </w:r>
-      <w:r>
-        <w:t xml:space="preserve"> — one line max. Do </w:t>
+        <w:t xml:space="preserve"> one line max. Do </w:t>
       </w:r>
       <w:r>
         <w:rPr>
@@ -32360,6 +32982,1671 @@
     </w:p>
     <w:p>
       <w:r>
+        <w:t xml:space="preserve">318. LOC [sn89051008](https://www.loc.gov/item/sn89051008/) `item.digitized: false` (pass125). IA Solr 1926 </w:t>
+      </w:r>
+      <w:r>
+        <w:rPr>
+          <w:b/>
+        </w:rPr>
+        <w:t>0</w:t>
+      </w:r>
+      <w:r>
+        <w:t xml:space="preserve">. *Catalog.* </w:t>
+      </w:r>
+      <w:r>
+        <w:rPr>
+          <w:b/>
+        </w:rPr>
+        <w:t>C1561</w:t>
+      </w:r>
+      <w:r>
+        <w:t xml:space="preserve"> </w:t>
+      </w:r>
+      <w:r>
+        <w:rPr>
+          <w:b/>
+        </w:rPr>
+        <w:t>S1211 S1212</w:t>
+      </w:r>
+      <w:r>
+        <w:t>.</w:t>
+      </w:r>
+    </w:p>
+    <w:p>
+      <w:r>
+        <w:t xml:space="preserve">319. KYGenWeb [Carter 1850ndex](https://kykinfolk.com/carter/1850ndex.htm) Nethercult…Newhart; Tinsley Sally. County </w:t>
+      </w:r>
+      <w:r>
+        <w:rPr>
+          <w:b/>
+        </w:rPr>
+        <w:t>CLOSED</w:t>
+      </w:r>
+      <w:r>
+        <w:t xml:space="preserve"> compiled. *Index.* </w:t>
+      </w:r>
+      <w:r>
+        <w:rPr>
+          <w:b/>
+        </w:rPr>
+        <w:t>C1562 C1563</w:t>
+      </w:r>
+      <w:r>
+        <w:t xml:space="preserve"> </w:t>
+      </w:r>
+      <w:r>
+        <w:rPr>
+          <w:b/>
+        </w:rPr>
+        <w:t>S1213 S1214</w:t>
+      </w:r>
+      <w:r>
+        <w:t>.</w:t>
+      </w:r>
+    </w:p>
+    <w:p>
+      <w:r>
+        <w:t xml:space="preserve">320. Greenup Lemuel </w:t>
+      </w:r>
+      <w:r>
+        <w:rPr>
+          <w:b/>
+        </w:rPr>
+        <w:t>38</w:t>
+      </w:r>
+      <w:r>
+        <w:t xml:space="preserve"> MD / Thomas </w:t>
+      </w:r>
+      <w:r>
+        <w:rPr>
+          <w:b/>
+        </w:rPr>
+        <w:t>28</w:t>
+      </w:r>
+      <w:r>
+        <w:t xml:space="preserve"> SC / Henry </w:t>
+      </w:r>
+      <w:r>
+        <w:rPr>
+          <w:b/>
+        </w:rPr>
+        <w:t>30</w:t>
+      </w:r>
+      <w:r>
+        <w:t xml:space="preserve"> GER originals </w:t>
+      </w:r>
+      <w:r>
+        <w:rPr>
+          <w:b/>
+        </w:rPr>
+        <w:t>IMAGE SEEN REJECT</w:t>
+      </w:r>
+      <w:r>
+        <w:t xml:space="preserve">. County </w:t>
+      </w:r>
+      <w:r>
+        <w:rPr>
+          <w:b/>
+        </w:rPr>
+        <w:t>CLOSED</w:t>
+      </w:r>
+      <w:r>
+        <w:t xml:space="preserve">. IA [reel 202](https://archive.org/details/populationschedu0202unix). *Image seen.* </w:t>
+      </w:r>
+      <w:r>
+        <w:rPr>
+          <w:b/>
+        </w:rPr>
+        <w:t>C1564–C1568</w:t>
+      </w:r>
+      <w:r>
+        <w:t xml:space="preserve"> </w:t>
+      </w:r>
+      <w:r>
+        <w:rPr>
+          <w:b/>
+        </w:rPr>
+        <w:t>S1215–S1218</w:t>
+      </w:r>
+      <w:r>
+        <w:t>.</w:t>
+      </w:r>
+    </w:p>
+    <w:p>
+      <w:r>
+        <w:t xml:space="preserve">321. Lewis 1850 Wayback every-name </w:t>
+      </w:r>
+      <w:r>
+        <w:rPr>
+          <w:b/>
+        </w:rPr>
+        <w:t>nil</w:t>
+      </w:r>
+      <w:r>
+        <w:t xml:space="preserve">. Fleming 395A + Samuel </w:t>
+      </w:r>
+      <w:r>
+        <w:rPr>
+          <w:b/>
+        </w:rPr>
+        <w:t>37</w:t>
+      </w:r>
+      <w:r>
+        <w:t xml:space="preserve"> + James </w:t>
+      </w:r>
+      <w:r>
+        <w:rPr>
+          <w:b/>
+        </w:rPr>
+        <w:t>37</w:t>
+      </w:r>
+      <w:r>
+        <w:t xml:space="preserve"> </w:t>
+      </w:r>
+      <w:r>
+        <w:rPr>
+          <w:b/>
+        </w:rPr>
+        <w:t>IMAGE SEEN REJECT</w:t>
+      </w:r>
+      <w:r>
+        <w:t xml:space="preserve">. *Image / index.* </w:t>
+      </w:r>
+      <w:r>
+        <w:rPr>
+          <w:b/>
+        </w:rPr>
+        <w:t>C1569–C1573</w:t>
+      </w:r>
+      <w:r>
+        <w:t xml:space="preserve"> </w:t>
+      </w:r>
+      <w:r>
+        <w:rPr>
+          <w:b/>
+        </w:rPr>
+        <w:t>S1219–S1222</w:t>
+      </w:r>
+      <w:r>
+        <w:t>.</w:t>
+      </w:r>
+    </w:p>
+    <w:p>
+      <w:r>
+        <w:t xml:space="preserve">322. Lincoln 1850 reel [210](https://archive.org/details/populationschedu0210unix) mapped n0180 stamp </w:t>
+      </w:r>
+      <w:r>
+        <w:rPr>
+          <w:b/>
+        </w:rPr>
+        <w:t>245</w:t>
+      </w:r>
+      <w:r>
+        <w:t xml:space="preserve">; 168 fulls; OCR residual. S-K [Lincoln 1840](https://www.skcensus.com/1840-census-index-lincoln-county-kentucky/) NEWMAN </w:t>
+      </w:r>
+      <w:r>
+        <w:rPr>
+          <w:b/>
+        </w:rPr>
+        <w:t>123/132</w:t>
+      </w:r>
+      <w:r>
+        <w:t xml:space="preserve">. *Image / index.* </w:t>
+      </w:r>
+      <w:r>
+        <w:rPr>
+          <w:b/>
+        </w:rPr>
+        <w:t>C1574–C1577</w:t>
+      </w:r>
+      <w:r>
+        <w:t xml:space="preserve"> </w:t>
+      </w:r>
+      <w:r>
+        <w:rPr>
+          <w:b/>
+        </w:rPr>
+        <w:t>S1223–S1225</w:t>
+      </w:r>
+      <w:r>
+        <w:t>.</w:t>
+      </w:r>
+    </w:p>
+    <w:p>
+      <w:r>
+        <w:t xml:space="preserve">323. S-K [Casey](https://www.skcensus.com/1850-census-index-casey-county-kentucky/) / [Russell](https://www.skcensus.com/1850-census-index-russell-county-kentucky/) / [Bracken](https://www.skcensus.com/1850-census-index-bracken-county-kentucky/) / [Harrison](https://www.skcensus.com/1850-census-index-harrison-county-kentucky/) 1850 </w:t>
+      </w:r>
+      <w:r>
+        <w:rPr>
+          <w:b/>
+        </w:rPr>
+        <w:t>CLOSED</w:t>
+      </w:r>
+      <w:r>
+        <w:t xml:space="preserve"> compiled. Adair </w:t>
+      </w:r>
+      <w:r>
+        <w:rPr>
+          <w:b/>
+        </w:rPr>
+        <w:t>404</w:t>
+      </w:r>
+      <w:r>
+        <w:t xml:space="preserve">; Mason product-only. *Index.* </w:t>
+      </w:r>
+      <w:r>
+        <w:rPr>
+          <w:b/>
+        </w:rPr>
+        <w:t>C1578–C1583</w:t>
+      </w:r>
+      <w:r>
+        <w:t xml:space="preserve"> </w:t>
+      </w:r>
+      <w:r>
+        <w:rPr>
+          <w:b/>
+        </w:rPr>
+        <w:t>S1226–S1231</w:t>
+      </w:r>
+      <w:r>
+        <w:t>.</w:t>
+      </w:r>
+    </w:p>
+    <w:p>
+      <w:r>
+        <w:t xml:space="preserve">324. No free William × Rhoda license. Parents still </w:t>
+      </w:r>
+      <w:r>
+        <w:rPr>
+          <w:b/>
+        </w:rPr>
+        <w:t>PROBABLE</w:t>
+      </w:r>
+      <w:r>
+        <w:t xml:space="preserve">. 1860 Rhoda widow + B.F. </w:t>
+      </w:r>
+      <w:r>
+        <w:rPr>
+          <w:b/>
+        </w:rPr>
+        <w:t>7</w:t>
+      </w:r>
+      <w:r>
+        <w:t xml:space="preserve"> </w:t>
+      </w:r>
+      <w:r>
+        <w:rPr>
+          <w:b/>
+        </w:rPr>
+        <w:t>PROVEN</w:t>
+      </w:r>
+      <w:r>
+        <w:t xml:space="preserve">. #28 stands. *Negative / analysis.* </w:t>
+      </w:r>
+      <w:r>
+        <w:rPr>
+          <w:b/>
+        </w:rPr>
+        <w:t>C1584 C1585</w:t>
+      </w:r>
+      <w:r>
+        <w:t xml:space="preserve"> </w:t>
+      </w:r>
+      <w:r>
+        <w:rPr>
+          <w:b/>
+        </w:rPr>
+        <w:t>S1245</w:t>
+      </w:r>
+      <w:r>
+        <w:t>.</w:t>
+      </w:r>
+    </w:p>
+    <w:p>
+      <w:r>
+        <w:t xml:space="preserve">325. GT [Lee WWI](https://www.genealogytrails.com/ken/lee/wwi_draft_cards.html) </w:t>
+      </w:r>
+      <w:r>
+        <w:rPr>
+          <w:b/>
+        </w:rPr>
+        <w:t>LIVE</w:t>
+      </w:r>
+      <w:r>
+        <w:t xml:space="preserve"> </w:t>
+      </w:r>
+      <w:r>
+        <w:rPr>
+          <w:b/>
+        </w:rPr>
+        <w:t>452540</w:t>
+      </w:r>
+      <w:r>
+        <w:t xml:space="preserve"> nil Newnam. FS Incapsula (R011-66). IA </w:t>
+      </w:r>
+      <w:r>
+        <w:rPr>
+          <w:b/>
+        </w:rPr>
+        <w:t>602</w:t>
+      </w:r>
+      <w:r>
+        <w:t xml:space="preserve"> still </w:t>
+      </w:r>
+      <w:r>
+        <w:rPr>
+          <w:b/>
+        </w:rPr>
+        <w:t>515</w:t>
+      </w:r>
+      <w:r>
+        <w:t xml:space="preserve">. USGenNet wills no Samuel P. Hutchins [FAQ 9938](https://libraryanswers.berea.edu/faq/9938) </w:t>
+      </w:r>
+      <w:r>
+        <w:rPr>
+          <w:b/>
+        </w:rPr>
+        <w:t>LIVE</w:t>
+      </w:r>
+      <w:r>
+        <w:t xml:space="preserve">. Do not print 1966 or 1962. *Catalog.* </w:t>
+      </w:r>
+      <w:r>
+        <w:rPr>
+          <w:b/>
+        </w:rPr>
+        <w:t>C1586–C1591</w:t>
+      </w:r>
+      <w:r>
+        <w:t xml:space="preserve"> </w:t>
+      </w:r>
+      <w:r>
+        <w:rPr>
+          <w:b/>
+        </w:rPr>
+        <w:t>S1233–S1245</w:t>
+      </w:r>
+      <w:r>
+        <w:t>.</w:t>
+      </w:r>
+    </w:p>
+    <w:p>
+      <w:r>
+        <w:t xml:space="preserve">326. LOC [sn89051008](https://www.loc.gov/item/sn89051008/) `item.digitized: false` (pass126). IA Solr 1926 </w:t>
+      </w:r>
+      <w:r>
+        <w:rPr>
+          <w:b/>
+        </w:rPr>
+        <w:t>0</w:t>
+      </w:r>
+      <w:r>
+        <w:t xml:space="preserve">. *Catalog.* </w:t>
+      </w:r>
+      <w:r>
+        <w:rPr>
+          <w:b/>
+        </w:rPr>
+        <w:t>C1592</w:t>
+      </w:r>
+      <w:r>
+        <w:t xml:space="preserve"> </w:t>
+      </w:r>
+      <w:r>
+        <w:rPr>
+          <w:b/>
+        </w:rPr>
+        <w:t>S1246 S1247</w:t>
+      </w:r>
+      <w:r>
+        <w:t>.</w:t>
+      </w:r>
+    </w:p>
+    <w:p>
+      <w:r>
+        <w:t xml:space="preserve">327. KYGenWeb [Adair 1850 index](https://kygenweb.net/adair/Census/1850/1850censusindex.htm) Nalley…Nunn; Newcomb William H </w:t>
+      </w:r>
+      <w:r>
+        <w:rPr>
+          <w:b/>
+        </w:rPr>
+        <w:t>25</w:t>
+      </w:r>
+      <w:r>
+        <w:t xml:space="preserve">. County </w:t>
+      </w:r>
+      <w:r>
+        <w:rPr>
+          <w:b/>
+        </w:rPr>
+        <w:t>CLOSED</w:t>
+      </w:r>
+      <w:r>
+        <w:t xml:space="preserve"> compiled. *Index.* </w:t>
+      </w:r>
+      <w:r>
+        <w:rPr>
+          <w:b/>
+        </w:rPr>
+        <w:t>C1593</w:t>
+      </w:r>
+      <w:r>
+        <w:t xml:space="preserve"> </w:t>
+      </w:r>
+      <w:r>
+        <w:rPr>
+          <w:b/>
+        </w:rPr>
+        <w:t>S1248</w:t>
+      </w:r>
+      <w:r>
+        <w:t>.</w:t>
+      </w:r>
+    </w:p>
+    <w:p>
+      <w:r>
+        <w:t xml:space="preserve">328. KYGenWeb [Mason 1850index](https://kygenweb.net/mason/1850index.txt) Newall/Newcomb/Newdigate; Finch. County </w:t>
+      </w:r>
+      <w:r>
+        <w:rPr>
+          <w:b/>
+        </w:rPr>
+        <w:t>CLOSED</w:t>
+      </w:r>
+      <w:r>
+        <w:t xml:space="preserve"> compiled. *Index.* </w:t>
+      </w:r>
+      <w:r>
+        <w:rPr>
+          <w:b/>
+        </w:rPr>
+        <w:t>C1594</w:t>
+      </w:r>
+      <w:r>
+        <w:t xml:space="preserve"> </w:t>
+      </w:r>
+      <w:r>
+        <w:rPr>
+          <w:b/>
+        </w:rPr>
+        <w:t>S1249</w:t>
+      </w:r>
+      <w:r>
+        <w:t>.</w:t>
+      </w:r>
+    </w:p>
+    <w:p>
+      <w:r>
+        <w:t xml:space="preserve">329. 1840 Lincoln n0249 page </w:t>
+      </w:r>
+      <w:r>
+        <w:rPr>
+          <w:b/>
+        </w:rPr>
+        <w:t>123</w:t>
+      </w:r>
+      <w:r>
+        <w:t xml:space="preserve"> Newman </w:t>
+      </w:r>
+      <w:r>
+        <w:rPr>
+          <w:b/>
+        </w:rPr>
+        <w:t>J</w:t>
+      </w:r>
+      <w:r>
+        <w:t xml:space="preserve"> + Newman </w:t>
+      </w:r>
+      <w:r>
+        <w:rPr>
+          <w:b/>
+        </w:rPr>
+        <w:t>H.A.</w:t>
+      </w:r>
+      <w:r>
+        <w:t xml:space="preserve"> [IA reel 117](https://archive.org/details/populationsc18400117unit). *Image seen + reject.* </w:t>
+      </w:r>
+      <w:r>
+        <w:rPr>
+          <w:b/>
+        </w:rPr>
+        <w:t>C1595 C1596</w:t>
+      </w:r>
+      <w:r>
+        <w:t xml:space="preserve"> </w:t>
+      </w:r>
+      <w:r>
+        <w:rPr>
+          <w:b/>
+        </w:rPr>
+        <w:t>S1252</w:t>
+      </w:r>
+      <w:r>
+        <w:t>.</w:t>
+      </w:r>
+    </w:p>
+    <w:p>
+      <w:r>
+        <w:t xml:space="preserve">330. 1840 Lincoln n0267 page </w:t>
+      </w:r>
+      <w:r>
+        <w:rPr>
+          <w:b/>
+        </w:rPr>
+        <w:t>132</w:t>
+      </w:r>
+      <w:r>
+        <w:t xml:space="preserve"> Holeman/Newman Dasey [?]. *Image seen + reject.* </w:t>
+      </w:r>
+      <w:r>
+        <w:rPr>
+          <w:b/>
+        </w:rPr>
+        <w:t>C1597 C1598</w:t>
+      </w:r>
+      <w:r>
+        <w:t xml:space="preserve"> </w:t>
+      </w:r>
+      <w:r>
+        <w:rPr>
+          <w:b/>
+        </w:rPr>
+        <w:t>S1253</w:t>
+      </w:r>
+      <w:r>
+        <w:t>.</w:t>
+      </w:r>
+    </w:p>
+    <w:p>
+      <w:r>
+        <w:t xml:space="preserve">331. Lincoln 1850 namecol samples n0190–n0330 </w:t>
+      </w:r>
+      <w:r>
+        <w:rPr>
+          <w:b/>
+        </w:rPr>
+        <w:t>nil</w:t>
+      </w:r>
+      <w:r>
+        <w:t xml:space="preserve">. OCR residual. County not closed. IA [reel 210](https://archive.org/details/populationschedu0210unix). *Image / residual.* </w:t>
+      </w:r>
+      <w:r>
+        <w:rPr>
+          <w:b/>
+        </w:rPr>
+        <w:t>C1599</w:t>
+      </w:r>
+      <w:r>
+        <w:t xml:space="preserve"> </w:t>
+      </w:r>
+      <w:r>
+        <w:rPr>
+          <w:b/>
+        </w:rPr>
+        <w:t>S1255</w:t>
+      </w:r>
+      <w:r>
+        <w:t>.</w:t>
+      </w:r>
+    </w:p>
+    <w:p>
+      <w:r>
+        <w:t xml:space="preserve">332. No free William × Rhoda license. Parents still </w:t>
+      </w:r>
+      <w:r>
+        <w:rPr>
+          <w:b/>
+        </w:rPr>
+        <w:t>PROBABLE</w:t>
+      </w:r>
+      <w:r>
+        <w:t xml:space="preserve">. #28 stands. *Negative / analysis.* </w:t>
+      </w:r>
+      <w:r>
+        <w:rPr>
+          <w:b/>
+        </w:rPr>
+        <w:t>C1600 C1601</w:t>
+      </w:r>
+      <w:r>
+        <w:t xml:space="preserve"> </w:t>
+      </w:r>
+      <w:r>
+        <w:rPr>
+          <w:b/>
+        </w:rPr>
+        <w:t>S1260</w:t>
+      </w:r>
+      <w:r>
+        <w:t>.</w:t>
+      </w:r>
+    </w:p>
+    <w:p>
+      <w:r>
+        <w:t xml:space="preserve">333. GT [Lee WWI](https://www.genealogytrails.com/ken/lee/wwi_draft_cards.html) </w:t>
+      </w:r>
+      <w:r>
+        <w:rPr>
+          <w:b/>
+        </w:rPr>
+        <w:t>LIVE</w:t>
+      </w:r>
+      <w:r>
+        <w:t xml:space="preserve"> </w:t>
+      </w:r>
+      <w:r>
+        <w:rPr>
+          <w:b/>
+        </w:rPr>
+        <w:t>452540</w:t>
+      </w:r>
+      <w:r>
+        <w:t xml:space="preserve"> nil Newnam. FS SPA (R011-67). IA </w:t>
+      </w:r>
+      <w:r>
+        <w:rPr>
+          <w:b/>
+        </w:rPr>
+        <w:t>602</w:t>
+      </w:r>
+      <w:r>
+        <w:t xml:space="preserve"> still </w:t>
+      </w:r>
+      <w:r>
+        <w:rPr>
+          <w:b/>
+        </w:rPr>
+        <w:t>515</w:t>
+      </w:r>
+      <w:r>
+        <w:t xml:space="preserve">. USGenNet wills no Samuel P. Hutchins [FAQ 9938](https://libraryanswers.berea.edu/faq/9938) </w:t>
+      </w:r>
+      <w:r>
+        <w:rPr>
+          <w:b/>
+        </w:rPr>
+        <w:t>LIVE</w:t>
+      </w:r>
+      <w:r>
+        <w:t xml:space="preserve">. Do not print 1966 or 1962. *Catalog.* </w:t>
+      </w:r>
+      <w:r>
+        <w:rPr>
+          <w:b/>
+        </w:rPr>
+        <w:t>C1602–C1606</w:t>
+      </w:r>
+      <w:r>
+        <w:t xml:space="preserve"> </w:t>
+      </w:r>
+      <w:r>
+        <w:rPr>
+          <w:b/>
+        </w:rPr>
+        <w:t>S1257–S1260</w:t>
+      </w:r>
+      <w:r>
+        <w:t>.</w:t>
+      </w:r>
+    </w:p>
+    <w:p>
+      <w:r>
+        <w:t xml:space="preserve">334. LOC [sn89051008](https://www.loc.gov/item/sn89051008/) `item.digitized: false` (pass127). IA Solr 1926 </w:t>
+      </w:r>
+      <w:r>
+        <w:rPr>
+          <w:b/>
+        </w:rPr>
+        <w:t>0</w:t>
+      </w:r>
+      <w:r>
+        <w:t xml:space="preserve">. *Catalog.* </w:t>
+      </w:r>
+      <w:r>
+        <w:rPr>
+          <w:b/>
+        </w:rPr>
+        <w:t>C1607</w:t>
+      </w:r>
+      <w:r>
+        <w:t xml:space="preserve"> </w:t>
+      </w:r>
+      <w:r>
+        <w:rPr>
+          <w:b/>
+        </w:rPr>
+        <w:t>S1261 S1262</w:t>
+      </w:r>
+      <w:r>
+        <w:t>.</w:t>
+      </w:r>
+    </w:p>
+    <w:p>
+      <w:r>
+        <w:t xml:space="preserve">335. 1850 U.S. census, Owsley stamped </w:t>
+      </w:r>
+      <w:r>
+        <w:rPr>
+          <w:b/>
+        </w:rPr>
+        <w:t>299B</w:t>
+      </w:r>
+      <w:r>
+        <w:t xml:space="preserve"> hh </w:t>
+      </w:r>
+      <w:r>
+        <w:rPr>
+          <w:b/>
+        </w:rPr>
+        <w:t>311</w:t>
+      </w:r>
+      <w:r>
+        <w:t xml:space="preserve">. IA [`0216unix`](https://archive.org/details/populationschedu0216unix) leaf </w:t>
+      </w:r>
+      <w:r>
+        <w:rPr>
+          <w:b/>
+        </w:rPr>
+        <w:t>391</w:t>
+      </w:r>
+      <w:r>
+        <w:t xml:space="preserve">. William Newman </w:t>
+      </w:r>
+      <w:r>
+        <w:rPr>
+          <w:b/>
+        </w:rPr>
+        <w:t>26</w:t>
+      </w:r>
+      <w:r>
+        <w:t xml:space="preserve"> × Jane </w:t>
+      </w:r>
+      <w:r>
+        <w:rPr>
+          <w:b/>
+        </w:rPr>
+        <w:t>22</w:t>
+      </w:r>
+      <w:r>
+        <w:t xml:space="preserve"> + Francis </w:t>
+      </w:r>
+      <w:r>
+        <w:rPr>
+          <w:b/>
+        </w:rPr>
+        <w:t>4 F</w:t>
+      </w:r>
+      <w:r>
+        <w:t xml:space="preserve"> + Leanner </w:t>
+      </w:r>
+      <w:r>
+        <w:rPr>
+          <w:b/>
+        </w:rPr>
+        <w:t>2 F</w:t>
+      </w:r>
+      <w:r>
+        <w:t xml:space="preserve">. Next door Rebecca Tincher </w:t>
+      </w:r>
+      <w:r>
+        <w:rPr>
+          <w:b/>
+        </w:rPr>
+        <w:t>51</w:t>
+      </w:r>
+      <w:r>
+        <w:t xml:space="preserve">. *Image seen.* </w:t>
+      </w:r>
+      <w:r>
+        <w:rPr>
+          <w:b/>
+        </w:rPr>
+        <w:t>C1608 C1609</w:t>
+      </w:r>
+      <w:r>
+        <w:t xml:space="preserve"> </w:t>
+      </w:r>
+      <w:r>
+        <w:rPr>
+          <w:b/>
+        </w:rPr>
+        <w:t>S1263 S1264</w:t>
+      </w:r>
+      <w:r>
+        <w:t>.</w:t>
+      </w:r>
+    </w:p>
+    <w:p>
+      <w:r>
+        <w:t xml:space="preserve">336. Same-person hh </w:t>
+      </w:r>
+      <w:r>
+        <w:rPr>
+          <w:b/>
+        </w:rPr>
+        <w:t>311</w:t>
+      </w:r>
+      <w:r>
+        <w:t xml:space="preserve"> vs 1860 Rhoda widow. William </w:t>
+      </w:r>
+      <w:r>
+        <w:rPr>
+          <w:b/>
+        </w:rPr>
+        <w:t>PROBABLE</w:t>
+      </w:r>
+      <w:r>
+        <w:t xml:space="preserve">. Jane </w:t>
+      </w:r>
+      <w:r>
+        <w:rPr>
+          <w:b/>
+        </w:rPr>
+        <w:t>not merged</w:t>
+      </w:r>
+      <w:r>
+        <w:t xml:space="preserve">. Francis=Decatur </w:t>
+      </w:r>
+      <w:r>
+        <w:rPr>
+          <w:b/>
+        </w:rPr>
+        <w:t>POSSIBLE</w:t>
+      </w:r>
+      <w:r>
+        <w:t xml:space="preserve"> only. *Analysis.* </w:t>
+      </w:r>
+      <w:r>
+        <w:rPr>
+          <w:b/>
+        </w:rPr>
+        <w:t>C1610–C1613</w:t>
+      </w:r>
+      <w:r>
+        <w:t xml:space="preserve"> </w:t>
+      </w:r>
+      <w:r>
+        <w:rPr>
+          <w:b/>
+        </w:rPr>
+        <w:t>S1263</w:t>
+      </w:r>
+      <w:r>
+        <w:t>.</w:t>
+      </w:r>
+    </w:p>
+    <w:p>
+      <w:r>
+        <w:t xml:space="preserve">337. Jessamine n0015 stamp </w:t>
+      </w:r>
+      <w:r>
+        <w:rPr>
+          <w:b/>
+        </w:rPr>
+        <w:t>13</w:t>
+      </w:r>
+      <w:r>
+        <w:t xml:space="preserve"> William Newman </w:t>
+      </w:r>
+      <w:r>
+        <w:rPr>
+          <w:b/>
+        </w:rPr>
+        <w:t>67</w:t>
+      </w:r>
+      <w:r>
+        <w:t xml:space="preserve"> × Nancy </w:t>
+      </w:r>
+      <w:r>
+        <w:rPr>
+          <w:b/>
+        </w:rPr>
+        <w:t>45</w:t>
+      </w:r>
+      <w:r>
+        <w:t xml:space="preserve">. [IA reel 208](https://archive.org/details/populationschedu0208unix). *Image seen + reject.* </w:t>
+      </w:r>
+      <w:r>
+        <w:rPr>
+          <w:b/>
+        </w:rPr>
+        <w:t>C1614</w:t>
+      </w:r>
+      <w:r>
+        <w:t xml:space="preserve"> </w:t>
+      </w:r>
+      <w:r>
+        <w:rPr>
+          <w:b/>
+        </w:rPr>
+        <w:t>S1265</w:t>
+      </w:r>
+      <w:r>
+        <w:t>.</w:t>
+      </w:r>
+    </w:p>
+    <w:p>
+      <w:r>
+        <w:t xml:space="preserve">338. Pendleton / Grant / Owen / Washington / Oldham / Taylor / Bourbon compiled closes. *Index.* </w:t>
+      </w:r>
+      <w:r>
+        <w:rPr>
+          <w:b/>
+        </w:rPr>
+        <w:t>C1615–C1621</w:t>
+      </w:r>
+      <w:r>
+        <w:t xml:space="preserve"> </w:t>
+      </w:r>
+      <w:r>
+        <w:rPr>
+          <w:b/>
+        </w:rPr>
+        <w:t>S1266–S1272</w:t>
+      </w:r>
+      <w:r>
+        <w:t>.</w:t>
+      </w:r>
+    </w:p>
+    <w:p>
+      <w:r>
+        <w:t xml:space="preserve">339. No free William × Rhoda / × Jane license. Parents still </w:t>
+      </w:r>
+      <w:r>
+        <w:rPr>
+          <w:b/>
+        </w:rPr>
+        <w:t>PROBABLE</w:t>
+      </w:r>
+      <w:r>
+        <w:t xml:space="preserve">. #28 stands. *Negative / analysis.* </w:t>
+      </w:r>
+      <w:r>
+        <w:rPr>
+          <w:b/>
+        </w:rPr>
+        <w:t>C1626 C1627</w:t>
+      </w:r>
+      <w:r>
+        <w:t xml:space="preserve"> </w:t>
+      </w:r>
+      <w:r>
+        <w:rPr>
+          <w:b/>
+        </w:rPr>
+        <w:t>S1280</w:t>
+      </w:r>
+      <w:r>
+        <w:t>.</w:t>
+      </w:r>
+    </w:p>
+    <w:p>
+      <w:r>
+        <w:t xml:space="preserve">340. GT [Lee WWI](https://www.genealogytrails.com/ken/lee/wwi_draft_cards.html) </w:t>
+      </w:r>
+      <w:r>
+        <w:rPr>
+          <w:b/>
+        </w:rPr>
+        <w:t>LIVE</w:t>
+      </w:r>
+      <w:r>
+        <w:t xml:space="preserve"> </w:t>
+      </w:r>
+      <w:r>
+        <w:rPr>
+          <w:b/>
+        </w:rPr>
+        <w:t>452540</w:t>
+      </w:r>
+      <w:r>
+        <w:t xml:space="preserve">. FS SPA (R011-68). FAQ [9938](https://libraryanswers.berea.edu/faq/9938) </w:t>
+      </w:r>
+      <w:r>
+        <w:rPr>
+          <w:b/>
+        </w:rPr>
+        <w:t>LIVE</w:t>
+      </w:r>
+      <w:r>
+        <w:t xml:space="preserve">. Do not print 1966 or 1962. *Catalog.* </w:t>
+      </w:r>
+      <w:r>
+        <w:rPr>
+          <w:b/>
+        </w:rPr>
+        <w:t>C1628–C1632</w:t>
+      </w:r>
+      <w:r>
+        <w:t xml:space="preserve"> </w:t>
+      </w:r>
+      <w:r>
+        <w:rPr>
+          <w:b/>
+        </w:rPr>
+        <w:t>S1277–S1280</w:t>
+      </w:r>
+      <w:r>
+        <w:t>.</w:t>
+      </w:r>
+    </w:p>
+    <w:p>
+      <w:r>
+        <w:t xml:space="preserve">341. LOC [sn89051008](https://www.loc.gov/item/sn89051008/) `item.digitized: false` (pass128). IA Solr 1926 </w:t>
+      </w:r>
+      <w:r>
+        <w:rPr>
+          <w:b/>
+        </w:rPr>
+        <w:t>0</w:t>
+      </w:r>
+      <w:r>
+        <w:t xml:space="preserve">. *Catalog.* </w:t>
+      </w:r>
+      <w:r>
+        <w:rPr>
+          <w:b/>
+        </w:rPr>
+        <w:t>C1633</w:t>
+      </w:r>
+      <w:r>
+        <w:t xml:space="preserve"> </w:t>
+      </w:r>
+      <w:r>
+        <w:rPr>
+          <w:b/>
+        </w:rPr>
+        <w:t>S1281 S1282</w:t>
+      </w:r>
+      <w:r>
+        <w:t>.</w:t>
+      </w:r>
+    </w:p>
+    <w:p>
+      <w:r>
+        <w:t xml:space="preserve">342. Jessamine n0021 </w:t>
+      </w:r>
+      <w:r>
+        <w:rPr>
+          <w:b/>
+        </w:rPr>
+        <w:t>10A</w:t>
+      </w:r>
+      <w:r>
+        <w:t xml:space="preserve"> no Newman; n0022 </w:t>
+      </w:r>
+      <w:r>
+        <w:rPr>
+          <w:b/>
+        </w:rPr>
+        <w:t>10B</w:t>
+      </w:r>
+      <w:r>
+        <w:t xml:space="preserve"> Edmund Newman </w:t>
+      </w:r>
+      <w:r>
+        <w:rPr>
+          <w:b/>
+        </w:rPr>
+        <w:t>27</w:t>
+      </w:r>
+      <w:r>
+        <w:t xml:space="preserve"> × Sophia </w:t>
+      </w:r>
+      <w:r>
+        <w:rPr>
+          <w:b/>
+        </w:rPr>
+        <w:t>27</w:t>
+      </w:r>
+      <w:r>
+        <w:t xml:space="preserve">. [IA reel 208](https://archive.org/details/populationschedu0208unix). *Image seen + reject.* </w:t>
+      </w:r>
+      <w:r>
+        <w:rPr>
+          <w:b/>
+        </w:rPr>
+        <w:t>C1635–C1638</w:t>
+      </w:r>
+      <w:r>
+        <w:t xml:space="preserve"> </w:t>
+      </w:r>
+      <w:r>
+        <w:rPr>
+          <w:b/>
+        </w:rPr>
+        <w:t>S1284 S1285</w:t>
+      </w:r>
+      <w:r>
+        <w:t>.</w:t>
+      </w:r>
+    </w:p>
+    <w:p>
+      <w:r>
+        <w:t xml:space="preserve">343. Madison 1850 compiled </w:t>
+      </w:r>
+      <w:r>
+        <w:rPr>
+          <w:b/>
+        </w:rPr>
+        <w:t>250B</w:t>
+      </w:r>
+      <w:r>
+        <w:t xml:space="preserve"> only (already </w:t>
+      </w:r>
+      <w:r>
+        <w:rPr>
+          <w:b/>
+        </w:rPr>
+        <w:t>REJECT</w:t>
+      </w:r>
+      <w:r>
+        <w:t xml:space="preserve">). County </w:t>
+      </w:r>
+      <w:r>
+        <w:rPr>
+          <w:b/>
+        </w:rPr>
+        <w:t>CLOSED</w:t>
+      </w:r>
+      <w:r>
+        <w:t xml:space="preserve">. *Index.* </w:t>
+      </w:r>
+      <w:r>
+        <w:rPr>
+          <w:b/>
+        </w:rPr>
+        <w:t>C1640</w:t>
+      </w:r>
+      <w:r>
+        <w:t xml:space="preserve"> </w:t>
+      </w:r>
+      <w:r>
+        <w:rPr>
+          <w:b/>
+        </w:rPr>
+        <w:t>S1286</w:t>
+      </w:r>
+      <w:r>
+        <w:t>.</w:t>
+      </w:r>
+    </w:p>
+    <w:p>
+      <w:r>
+        <w:t xml:space="preserve">344. Lincoln Dist 2 n0286–n0335 namecols nil. Hopkins Francis J </w:t>
+      </w:r>
+      <w:r>
+        <w:rPr>
+          <w:b/>
+        </w:rPr>
+        <w:t>28</w:t>
+      </w:r>
+      <w:r>
+        <w:t xml:space="preserve"> / John </w:t>
+      </w:r>
+      <w:r>
+        <w:rPr>
+          <w:b/>
+        </w:rPr>
+        <w:t>59</w:t>
+      </w:r>
+      <w:r>
+        <w:t xml:space="preserve"> </w:t>
+      </w:r>
+      <w:r>
+        <w:rPr>
+          <w:b/>
+        </w:rPr>
+        <w:t>REJECT</w:t>
+      </w:r>
+      <w:r>
+        <w:t xml:space="preserve">. *Image / compiled.* </w:t>
+      </w:r>
+      <w:r>
+        <w:rPr>
+          <w:b/>
+        </w:rPr>
+        <w:t>C1641–C1645</w:t>
+      </w:r>
+      <w:r>
+        <w:t xml:space="preserve"> </w:t>
+      </w:r>
+      <w:r>
+        <w:rPr>
+          <w:b/>
+        </w:rPr>
+        <w:t>S1287 S1288</w:t>
+      </w:r>
+      <w:r>
+        <w:t>.</w:t>
+      </w:r>
+    </w:p>
+    <w:p>
+      <w:r>
+        <w:t xml:space="preserve">345. No free license. Parents still </w:t>
+      </w:r>
+      <w:r>
+        <w:rPr>
+          <w:b/>
+        </w:rPr>
+        <w:t>PROBABLE</w:t>
+      </w:r>
+      <w:r>
+        <w:t xml:space="preserve">. Jane </w:t>
+      </w:r>
+      <w:r>
+        <w:rPr>
+          <w:b/>
+        </w:rPr>
+        <w:t>not</w:t>
+      </w:r>
+      <w:r>
+        <w:t xml:space="preserve"> Rhoda. #28 stands. *Negative / analysis.* </w:t>
+      </w:r>
+      <w:r>
+        <w:rPr>
+          <w:b/>
+        </w:rPr>
+        <w:t>C1646 C1647</w:t>
+      </w:r>
+      <w:r>
+        <w:t xml:space="preserve"> </w:t>
+      </w:r>
+      <w:r>
+        <w:rPr>
+          <w:b/>
+        </w:rPr>
+        <w:t>S1293</w:t>
+      </w:r>
+      <w:r>
+        <w:t>.</w:t>
+      </w:r>
+    </w:p>
+    <w:p>
+      <w:r>
+        <w:t xml:space="preserve">346. GT [Lee WWI](https://www.genealogytrails.com/ken/lee/wwi_draft_cards.html) </w:t>
+      </w:r>
+      <w:r>
+        <w:rPr>
+          <w:b/>
+        </w:rPr>
+        <w:t>LIVE</w:t>
+      </w:r>
+      <w:r>
+        <w:t xml:space="preserve">. FS SPA (R011-69). FAQ [9938](https://libraryanswers.berea.edu/faq/9938) </w:t>
+      </w:r>
+      <w:r>
+        <w:rPr>
+          <w:b/>
+        </w:rPr>
+        <w:t>LIVE</w:t>
+      </w:r>
+      <w:r>
+        <w:t xml:space="preserve">. Do not print 1966 or 1962. *Catalog.* </w:t>
+      </w:r>
+      <w:r>
+        <w:rPr>
+          <w:b/>
+        </w:rPr>
+        <w:t>C1648–C1652</w:t>
+      </w:r>
+      <w:r>
+        <w:t xml:space="preserve"> </w:t>
+      </w:r>
+      <w:r>
+        <w:rPr>
+          <w:b/>
+        </w:rPr>
+        <w:t>S1289–S1293</w:t>
+      </w:r>
+      <w:r>
+        <w:t>.</w:t>
+      </w:r>
+    </w:p>
+    <w:p>
+      <w:r>
+        <w:t xml:space="preserve">347. LOC [sn89051008](https://www.loc.gov/item/sn89051008/) `item.digitized: false` (pass129). IA Solr 1926 </w:t>
+      </w:r>
+      <w:r>
+        <w:rPr>
+          <w:b/>
+        </w:rPr>
+        <w:t>0</w:t>
+      </w:r>
+      <w:r>
+        <w:t xml:space="preserve">. *Catalog.* </w:t>
+      </w:r>
+      <w:r>
+        <w:rPr>
+          <w:b/>
+        </w:rPr>
+        <w:t>C1653</w:t>
+      </w:r>
+      <w:r>
+        <w:t xml:space="preserve"> </w:t>
+      </w:r>
+      <w:r>
+        <w:rPr>
+          <w:b/>
+        </w:rPr>
+        <w:t>S1296</w:t>
+      </w:r>
+      <w:r>
+        <w:t>.</w:t>
+      </w:r>
+    </w:p>
+    <w:p>
+      <w:r>
+        <w:t xml:space="preserve">348. Woodford n0254 stamp </w:t>
+      </w:r>
+      <w:r>
+        <w:rPr>
+          <w:b/>
+        </w:rPr>
+        <w:t>462</w:t>
+      </w:r>
+      <w:r>
+        <w:t xml:space="preserve"> Christopher Newman </w:t>
+      </w:r>
+      <w:r>
+        <w:rPr>
+          <w:b/>
+        </w:rPr>
+        <w:t>51</w:t>
+      </w:r>
+      <w:r>
+        <w:t xml:space="preserve"> MD boot/shoemaker + Catherine </w:t>
+      </w:r>
+      <w:r>
+        <w:rPr>
+          <w:b/>
+        </w:rPr>
+        <w:t>17</w:t>
+      </w:r>
+      <w:r>
+        <w:t xml:space="preserve"> + John </w:t>
+      </w:r>
+      <w:r>
+        <w:rPr>
+          <w:b/>
+        </w:rPr>
+        <w:t>15</w:t>
+      </w:r>
+      <w:r>
+        <w:t xml:space="preserve"> + Thomas </w:t>
+      </w:r>
+      <w:r>
+        <w:rPr>
+          <w:b/>
+        </w:rPr>
+        <w:t>15</w:t>
+      </w:r>
+      <w:r>
+        <w:t xml:space="preserve">. [IA reel 222](https://archive.org/details/populationschedu0222unix). *Image seen + reject.* </w:t>
+      </w:r>
+      <w:r>
+        <w:rPr>
+          <w:b/>
+        </w:rPr>
+        <w:t>C1654–C1657</w:t>
+      </w:r>
+      <w:r>
+        <w:t xml:space="preserve"> </w:t>
+      </w:r>
+      <w:r>
+        <w:rPr>
+          <w:b/>
+        </w:rPr>
+        <w:t>S1297 S1298</w:t>
+      </w:r>
+      <w:r>
+        <w:t>.</w:t>
+      </w:r>
+    </w:p>
+    <w:p>
+      <w:r>
+        <w:t xml:space="preserve">349. Scott n0263 </w:t>
+      </w:r>
+      <w:r>
+        <w:rPr>
+          <w:b/>
+        </w:rPr>
+        <w:t>399B</w:t>
+      </w:r>
+      <w:r>
+        <w:t xml:space="preserve"> John Newman </w:t>
+      </w:r>
+      <w:r>
+        <w:rPr>
+          <w:b/>
+        </w:rPr>
+        <w:t>45</w:t>
+      </w:r>
+      <w:r>
+        <w:t xml:space="preserve"> Ireland in Wolfe hh. [IA reel 218](https://archive.org/details/populationschedu0218unix). *Image seen + reject.* </w:t>
+      </w:r>
+      <w:r>
+        <w:rPr>
+          <w:b/>
+        </w:rPr>
+        <w:t>C1659 C1660</w:t>
+      </w:r>
+      <w:r>
+        <w:t xml:space="preserve"> </w:t>
+      </w:r>
+      <w:r>
+        <w:rPr>
+          <w:b/>
+        </w:rPr>
+        <w:t>S1299 S1300</w:t>
+      </w:r>
+      <w:r>
+        <w:t>.</w:t>
+      </w:r>
+    </w:p>
+    <w:p>
+      <w:r>
+        <w:t xml:space="preserve">350. Scott </w:t>
+      </w:r>
+      <w:r>
+        <w:rPr>
+          <w:b/>
+        </w:rPr>
+        <w:t>475B</w:t>
+      </w:r>
+      <w:r>
+        <w:t xml:space="preserve"> John B. Newham </w:t>
+      </w:r>
+      <w:r>
+        <w:rPr>
+          <w:b/>
+        </w:rPr>
+        <w:t>47</w:t>
+      </w:r>
+      <w:r>
+        <w:t xml:space="preserve"> × Mahala; </w:t>
+      </w:r>
+      <w:r>
+        <w:rPr>
+          <w:b/>
+        </w:rPr>
+        <w:t>480B</w:t>
+      </w:r>
+      <w:r>
+        <w:t xml:space="preserve"> William Newham </w:t>
+      </w:r>
+      <w:r>
+        <w:rPr>
+          <w:b/>
+        </w:rPr>
+        <w:t>38</w:t>
+      </w:r>
+      <w:r>
+        <w:t xml:space="preserve"> × Sarah. *Image seen + reject.* </w:t>
+      </w:r>
+      <w:r>
+        <w:rPr>
+          <w:b/>
+        </w:rPr>
+        <w:t>C1661–C1664</w:t>
+      </w:r>
+      <w:r>
+        <w:t xml:space="preserve"> </w:t>
+      </w:r>
+      <w:r>
+        <w:rPr>
+          <w:b/>
+        </w:rPr>
+        <w:t>S1301 S1302</w:t>
+      </w:r>
+      <w:r>
+        <w:t>.</w:t>
+      </w:r>
+    </w:p>
+    <w:p>
+      <w:r>
+        <w:t xml:space="preserve">351. Spencer compiled Simeon / Geo. W. / Thomas + William H </w:t>
+      </w:r>
+      <w:r>
+        <w:rPr>
+          <w:b/>
+        </w:rPr>
+        <w:t>21</w:t>
+      </w:r>
+      <w:r>
+        <w:t xml:space="preserve"> </w:t>
+      </w:r>
+      <w:r>
+        <w:rPr>
+          <w:b/>
+        </w:rPr>
+        <w:t>REJECT</w:t>
+      </w:r>
+      <w:r>
+        <w:t xml:space="preserve">. Shelby S. Newman </w:t>
+      </w:r>
+      <w:r>
+        <w:rPr>
+          <w:b/>
+        </w:rPr>
+        <w:t>20</w:t>
+      </w:r>
+      <w:r>
+        <w:t xml:space="preserve"> </w:t>
+      </w:r>
+      <w:r>
+        <w:rPr>
+          <w:b/>
+        </w:rPr>
+        <w:t>REJECT</w:t>
+      </w:r>
+      <w:r>
+        <w:t xml:space="preserve">. *Index.* </w:t>
+      </w:r>
+      <w:r>
+        <w:rPr>
+          <w:b/>
+        </w:rPr>
+        <w:t>C1665 C1666</w:t>
+      </w:r>
+      <w:r>
+        <w:t xml:space="preserve"> </w:t>
+      </w:r>
+      <w:r>
+        <w:rPr>
+          <w:b/>
+        </w:rPr>
+        <w:t>S1303 S1304</w:t>
+      </w:r>
+      <w:r>
+        <w:t>.</w:t>
+      </w:r>
+    </w:p>
+    <w:p>
+      <w:r>
+        <w:t xml:space="preserve">352. No free license. Parents still </w:t>
+      </w:r>
+      <w:r>
+        <w:rPr>
+          <w:b/>
+        </w:rPr>
+        <w:t>PROBABLE</w:t>
+      </w:r>
+      <w:r>
+        <w:t xml:space="preserve">. Jane </w:t>
+      </w:r>
+      <w:r>
+        <w:rPr>
+          <w:b/>
+        </w:rPr>
+        <w:t>not</w:t>
+      </w:r>
+      <w:r>
+        <w:t xml:space="preserve"> Rhoda. #28 stands. *Negative / analysis.* </w:t>
+      </w:r>
+      <w:r>
+        <w:rPr>
+          <w:b/>
+        </w:rPr>
+        <w:t>C1667 C1668</w:t>
+      </w:r>
+      <w:r>
+        <w:t xml:space="preserve"> </w:t>
+      </w:r>
+      <w:r>
+        <w:rPr>
+          <w:b/>
+        </w:rPr>
+        <w:t>S1311</w:t>
+      </w:r>
+      <w:r>
+        <w:t>.</w:t>
+      </w:r>
+    </w:p>
+    <w:p>
+      <w:r>
+        <w:t xml:space="preserve">353. GT [Lee WWI](https://www.genealogytrails.com/ken/lee/wwi_draft_cards.html) </w:t>
+      </w:r>
+      <w:r>
+        <w:rPr>
+          <w:b/>
+        </w:rPr>
+        <w:t>LIVE</w:t>
+      </w:r>
+      <w:r>
+        <w:t xml:space="preserve">. FS SPA (R011-70). FAQ [9938](https://libraryanswers.berea.edu/faq/9938) </w:t>
+      </w:r>
+      <w:r>
+        <w:rPr>
+          <w:b/>
+        </w:rPr>
+        <w:t>LIVE</w:t>
+      </w:r>
+      <w:r>
+        <w:t xml:space="preserve">. Do not print 1966 or 1962. *Catalog.* </w:t>
+      </w:r>
+      <w:r>
+        <w:rPr>
+          <w:b/>
+        </w:rPr>
+        <w:t>C1669–C1673</w:t>
+      </w:r>
+      <w:r>
+        <w:t xml:space="preserve"> </w:t>
+      </w:r>
+      <w:r>
+        <w:rPr>
+          <w:b/>
+        </w:rPr>
+        <w:t>S1307–S1311</w:t>
+      </w:r>
+      <w:r>
+        <w:t>.</w:t>
+      </w:r>
+    </w:p>
+    <w:p>
+      <w:r>
         <w:br w:type="page"/>
       </w:r>
     </w:p>
@@ -34560,6 +36847,146 @@
     <w:p>
       <w:r>
         <w:t>| S1210 | `../sources/census/pass124-extract-2026-10-31.txt` | This session | Pass 124 extract | extract |</w:t>
+      </w:r>
+    </w:p>
+    <w:p>
+      <w:r>
+        <w:t>| S1211 | `../sources/catalog/loc-sn89051008-pass125.json` | [LOC sn89051008](https://www.loc.gov/item/sn89051008/) | item.digitized false | catalog |</w:t>
+      </w:r>
+    </w:p>
+    <w:p>
+      <w:r>
+        <w:t>| S1213 | `../sources/catalog/kygenweb-carter-1850ndex-pass125.html` | [Carter 1850ndex](https://kykinfolk.com/carter/1850ndex.htm) | no Newman/Tincher | index only |</w:t>
+      </w:r>
+    </w:p>
+    <w:p>
+      <w:r>
+        <w:t>| S1216 | `../sources/census/pass125/keyplates/r202-n0373-lemuel-38-md.jpg` | [IA reel 202](https://archive.org/details/populationschedu0202unix) | Lemuel 38 MD | image seen |</w:t>
+      </w:r>
+    </w:p>
+    <w:p>
+      <w:r>
+        <w:t>| S1217 | `../sources/census/pass125/keyplates/r202-n0384-thomas-28-sc-191.jpg` | [IA reel 202](https://archive.org/details/populationschedu0202unix) | Thomas 28 SC | image seen |</w:t>
+      </w:r>
+    </w:p>
+    <w:p>
+      <w:r>
+        <w:t>| S1218 | `../sources/census/pass125/keyplates/r202-n0526-henry-30-ger-261.jpg` | [IA reel 202](https://archive.org/details/populationschedu0202unix) | Henry 30 GER | image seen |</w:t>
+      </w:r>
+    </w:p>
+    <w:p>
+      <w:r>
+        <w:t>| S1220 | `../sources/census/pass125/keyplates/r199-n0553-samuel-37-386b.jpg` | [IA reel 199](https://archive.org/details/populationschedu0199unix) | Samuel 37 | image seen |</w:t>
+      </w:r>
+    </w:p>
+    <w:p>
+      <w:r>
+        <w:t>| S1221 | `../sources/census/pass125/keyplates/r199-n0558-james-37-389a.jpg` | [IA reel 199](https://archive.org/details/populationschedu0199unix) | James 37 | image seen |</w:t>
+      </w:r>
+    </w:p>
+    <w:p>
+      <w:r>
+        <w:t>| S1222 | `../sources/census/pass125/keyplates/r199-n0570-madison-31-395a.jpg` | [IA reel 199](https://archive.org/details/populationschedu0199unix) | Madison/Andrew 31 | image seen |</w:t>
+      </w:r>
+    </w:p>
+    <w:p>
+      <w:r>
+        <w:t>| S1226 | `../sources/catalog/sk-casey-1850-pass125.html` | [S-K Casey](https://www.skcensus.com/1850-census-index-casey-county-kentucky/) | no Newman/Tincher | index only |</w:t>
+      </w:r>
+    </w:p>
+    <w:p>
+      <w:r>
+        <w:t>| S1233 | `../sources/catalog/gt-lee-wwi-pass125.html` | [GT Lee WWI](https://www.genealogytrails.com/ken/lee/wwi_draft_cards.html) | Luther Brandenburg + Underwood | transcription only |</w:t>
+      </w:r>
+    </w:p>
+    <w:p>
+      <w:r>
+        <w:t>| S1237 | `../sources/catalog/hutchins-faq-9938-answers-pass125.html` | [FAQ 9938](https://libraryanswers.berea.edu/faq/9938) | cards 228–229 | catalog |</w:t>
+      </w:r>
+    </w:p>
+    <w:p>
+      <w:r>
+        <w:t>| S1245 | `../sources/census/pass125-extract-2026-10-31.txt` | This session | Pass 125 extract | extract |</w:t>
+      </w:r>
+    </w:p>
+    <w:p>
+      <w:r>
+        <w:t>| S1246 | LOC sn89051008 pass126 | Library of Congress | `item.digitized: false` | catalog |</w:t>
+      </w:r>
+    </w:p>
+    <w:p>
+      <w:r>
+        <w:t>| S1248 | KYGenWeb Adair 1850 index | https://kygenweb.net/adair/Census/1850/1850censusindex.htm | Newcomb; no Newman | index |</w:t>
+      </w:r>
+    </w:p>
+    <w:p>
+      <w:r>
+        <w:t>| S1249 | KYGenWeb Mason 1850index | https://kygenweb.net/mason/1850index.txt | Newall/Newcomb; no Newman | index |</w:t>
+      </w:r>
+    </w:p>
+    <w:p>
+      <w:r>
+        <w:t>| S1252 | 1840 Lincoln page 123 | IA reel 117 n0249 | Newman J + Newman H.A. | image seen |</w:t>
+      </w:r>
+    </w:p>
+    <w:p>
+      <w:r>
+        <w:t>| S1253 | 1840 Lincoln page 132 | IA reel 117 n0267 | Holeman/Newman Dasey | image seen |</w:t>
+      </w:r>
+    </w:p>
+    <w:p>
+      <w:r>
+        <w:t>| S1260 | `../sources/census/pass126-extract-2026-10-31.txt` | This session | Pass 126 extract | extract |</w:t>
+      </w:r>
+    </w:p>
+    <w:p>
+      <w:r>
+        <w:t>| S1261 | `../sources/catalog/loc-sn89051008-pass127.json` | [LOC sn89051008](https://www.loc.gov/item/sn89051008/) | `digitized: false` | catalog |</w:t>
+      </w:r>
+    </w:p>
+    <w:p>
+      <w:r>
+        <w:t>| S1263 | `../sources/census/pass125/keyplates/owsley-1850-299b-hh311-william-jane.jpg` | [IA 0216unix](https://archive.org/details/populationschedu0216unix) | Owsley 299B hh 311 | image seen |</w:t>
+      </w:r>
+    </w:p>
+    <w:p>
+      <w:r>
+        <w:t>| S1280 | `../sources/census/pass127-extract-2026-10-31.txt` | This session | Pass 127 extract | extract |</w:t>
+      </w:r>
+    </w:p>
+    <w:p>
+      <w:r>
+        <w:t>| S1285 | `../sources/census/pass127/keyplates/r208-n0022-jessamine-10b-newman.jpg` | [IA 0208unix](https://archive.org/details/populationschedu0208unix) | Edmund 27 × Sophia 27 | image seen |</w:t>
+      </w:r>
+    </w:p>
+    <w:p>
+      <w:r>
+        <w:t>| S1293 | `../sources/census/pass128-extract-2026-10-31.txt` | This session | Pass 128 extract | extract |</w:t>
+      </w:r>
+    </w:p>
+    <w:p>
+      <w:r>
+        <w:t>| S1297 | `../sources/census/pass128/keyplates/woodford-462a-christopher-newman.jpg` | [IA 0222unix](https://archive.org/details/populationschedu0222unix) | Christopher 51 MD | image seen |</w:t>
+      </w:r>
+    </w:p>
+    <w:p>
+      <w:r>
+        <w:t>| S1299 | `../sources/census/pass128/keyplates/scott-399b-john-newman-45.jpg` | [IA 0218unix](https://archive.org/details/populationschedu0218unix) | John Newman 45 Ireland | image seen |</w:t>
+      </w:r>
+    </w:p>
+    <w:p>
+      <w:r>
+        <w:t>| S1301 | `../sources/census/pass128/keyplates/scott-475b-robert-newham-47.jpg` | [IA 0218unix](https://archive.org/details/populationschedu0218unix) | John B. Newham 47 | image seen |</w:t>
+      </w:r>
+    </w:p>
+    <w:p>
+      <w:r>
+        <w:t>| S1302 | `../sources/census/pass128/keyplates/scott-480b-william-newham-38.jpg` | [IA 0218unix](https://archive.org/details/populationschedu0218unix) | William Newham 38 × Sarah | image seen |</w:t>
+      </w:r>
+    </w:p>
+    <w:p>
+      <w:r>
+        <w:t>| S1311 | `../sources/census/pass129-extract-2026-10-31.txt` | This session | Pass 129 extract | extract |</w:t>
       </w:r>
     </w:p>
     <w:p>

</xml_diff>

<commit_message>
Dora Word archive, source TOC, and 1921/1929 Ola physician lists
Preserve the in-repo Word original, keep an editable working copy, and add a family TOC plus shared stop sheet for every project agent. Document that Ola’s 1921 and 1929 medical directories name Brewer, Davis, Harkey, then Ballenger, Hunt, Miller, and Pool — and do not name Dr. T. W. Beal.

Co-authored-by: blakereaganlaw <blakereaganlaw@gmail.com>
</commit_message>
<xml_diff>
--- a/research/dora-ella-newnam/book/Dora-Ella-Newnam-Stone-A-Life.docx
+++ b/research/dora-ella-newnam/book/Dora-Ella-Newnam-Stone-A-Life.docx
@@ -1422,7 +1422,34 @@
         <w:t>untested</w:t>
       </w:r>
       <w:r>
-        <w:t xml:space="preserve"> against the certificate image. [C204b]</w:t>
+        <w:t xml:space="preserve"> against the certificate image. [C204b] The 1921 medical directory’s </w:t>
+      </w:r>
+      <w:r>
+        <w:rPr>
+          <w:b/>
+        </w:rPr>
+        <w:t>Mammoth Spring</w:t>
+      </w:r>
+      <w:r>
+        <w:t xml:space="preserve"> is in </w:t>
+      </w:r>
+      <w:r>
+        <w:rPr>
+          <w:b/>
+        </w:rPr>
+        <w:t>Fulton</w:t>
+      </w:r>
+      <w:r>
+        <w:t xml:space="preserve"> County — a different place. [C374] Ola’s licensed physicians in 1921 and 1929 are listed; </w:t>
+      </w:r>
+      <w:r>
+        <w:rPr>
+          <w:b/>
+        </w:rPr>
+        <w:t>Dr. T. W. Beal is in neither book</w:t>
+      </w:r>
+      <w:r>
+        <w:t>. [C370] [C373]</w:t>
       </w:r>
     </w:p>
     <w:p>
@@ -2159,7 +2186,16 @@
     </w:p>
     <w:p>
       <w:r>
-        <w:t>Ola in those years was a cotton and timber town on the Rock Island line. Coy’s 1917 marriage is the first proved Arkansas date for this family. Dora’s death eight years later is the last.</w:t>
+        <w:t xml:space="preserve">Ola in those years was a cotton and timber town on the Rock Island line. The Encyclopedia of Arkansas (Gleason) says the town was incorporated 20 March 1900, had 516 people in 1910, </w:t>
+      </w:r>
+      <w:r>
+        <w:rPr>
+          <w:b/>
+        </w:rPr>
+        <w:t>655</w:t>
+      </w:r>
+      <w:r>
+        <w:t xml:space="preserve"> in 1920, and 648 in 1930, and that the early-twentieth-century street had a weekly newspaper and doctors. [C376] [S292] That 655 figure is the same number the 1921 and 1929 medical directories print beside Ola. [C370] [C373] Coy’s 1917 marriage is the first proved Arkansas date for this family. Dora’s death eight years later is the last.</w:t>
       </w:r>
     </w:p>
     <w:p>
@@ -2177,7 +2213,39 @@
     </w:p>
     <w:p>
       <w:r>
-        <w:t>Dora Stone died at Ola of apoplexy after one day, attended by Dr. Thomas W. Beal. The certificate, Arkansas Board of Health file about 1524, registration district 676, calls her white, widowed, a housewife, resident of “Mammoth, Ark.” There is no Mammoth post office in Yell or Perry County. A later reading has suggested Nimrod. That hypothesis has not been tested against the image in this file, and this book does not correct the place. [C015] [S003]</w:t>
+        <w:t xml:space="preserve">Dora Stone died at Ola of apoplexy after one day, attended by Dr. Thomas W. Beal. The certificate, Arkansas Board of Health file about 1524, registration district 676, calls her white, widowed, a housewife, resident of “Mammoth, Ark.” There is no Mammoth post office in Yell or Perry County. The 1921 medical directory’s </w:t>
+      </w:r>
+      <w:r>
+        <w:rPr>
+          <w:b/>
+        </w:rPr>
+        <w:t>Mammoth Spring</w:t>
+      </w:r>
+      <w:r>
+        <w:t xml:space="preserve"> is in </w:t>
+      </w:r>
+      <w:r>
+        <w:rPr>
+          <w:b/>
+        </w:rPr>
+        <w:t>Fulton</w:t>
+      </w:r>
+      <w:r>
+        <w:t xml:space="preserve"> County — a different town. Nimrod, Perry County, had one listed physician that year (Charles T. Wallace). Neither fact proves her address. A later reading has suggested Nimrod. That hypothesis has not been tested against the image in this file, and this book does not correct the place. [C015] [C374] [C375] [S003] [S291]</w:t>
+      </w:r>
+    </w:p>
+    <w:p>
+      <w:r>
+        <w:t xml:space="preserve">The licensed doctors at Ola in the 1921 *American Medical Directory* were W. R. Brewer, George C. Davis, and William Harkey. Thomas J. Pool was then at Danville. [C370] [C372] By the 1929 directory the Ola list was William E. Ballenger, Harkey (retired), Elbert C. Hunt, James Monroe Miller, and Pool — who had moved into town. [C373] </w:t>
+      </w:r>
+      <w:r>
+        <w:rPr>
+          <w:b/>
+        </w:rPr>
+        <w:t>Neither edition lists a Beal.</w:t>
+      </w:r>
+      <w:r>
+        <w:t xml:space="preserve"> Free web and the Genealogy Trails Yell B-biographies page also failed to produce Dr. T. W. Beal. [C371] [C378] This book does not replace the certificate’s attending name with Pool or Ballenger. [conflict #19]</w:t>
       </w:r>
     </w:p>
     <w:p>
@@ -3025,10 +3093,33 @@
         <w:rPr>
           <w:b/>
         </w:rPr>
+        <w:t>B055</w:t>
+      </w:r>
+      <w:r>
+        <w:t xml:space="preserve"> after merging the 1900–death year-grid branch (PR #34). Agents remaining on `main` start </w:t>
+      </w:r>
+      <w:r>
+        <w:rPr>
+          <w:b/>
+        </w:rPr>
         <w:t>B049</w:t>
       </w:r>
       <w:r>
-        <w:t>.</w:t>
+        <w:t>. See [`../15-shared-stopping-point.md`](../15-shared-stopping-point.md).</w:t>
+      </w:r>
+    </w:p>
+    <w:p>
+      <w:pPr>
+        <w:pStyle w:val="ListBullet"/>
+      </w:pPr>
+      <w:r>
+        <w:rPr>
+          <w:b/>
+        </w:rPr>
+        <w:t>B090:</w:t>
+      </w:r>
+      <w:r>
+        <w:t xml:space="preserve"> Dr. Thos. W. Beal is still unidentified. He is not in the 1921 or 1929 Ola medical directories. [C371] [C373]</w:t>
       </w:r>
     </w:p>
     <w:p>
@@ -3819,6 +3910,98 @@
     </w:p>
     <w:p>
       <w:r>
+        <w:t xml:space="preserve">31. *American Medical Directory* 1921, IA [`americanmedicald1921ameruoft`](https://archive.org/details/americanmedicald1921ameruoft). Ola 655 Yell: Brewer, Davis, Harkey; no Beal. *OCR only.* </w:t>
+      </w:r>
+      <w:r>
+        <w:rPr>
+          <w:b/>
+        </w:rPr>
+        <w:t>C370</w:t>
+      </w:r>
+      <w:r>
+        <w:t xml:space="preserve"> </w:t>
+      </w:r>
+      <w:r>
+        <w:rPr>
+          <w:b/>
+        </w:rPr>
+        <w:t>C371</w:t>
+      </w:r>
+      <w:r>
+        <w:t xml:space="preserve"> </w:t>
+      </w:r>
+      <w:r>
+        <w:rPr>
+          <w:b/>
+        </w:rPr>
+        <w:t>S291</w:t>
+      </w:r>
+      <w:r>
+        <w:t>.</w:t>
+      </w:r>
+    </w:p>
+    <w:p>
+      <w:r>
+        <w:t xml:space="preserve">32. *American Medical Directory* 1929, IA [`bwb_T3-BRL-424`](https://archive.org/details/bwb_T3-BRL-424). Ola: Ballenger, Harkey retired, Hunt, Miller, Pool; still no Beal. *OCR only.* </w:t>
+      </w:r>
+      <w:r>
+        <w:rPr>
+          <w:b/>
+        </w:rPr>
+        <w:t>C373</w:t>
+      </w:r>
+      <w:r>
+        <w:t xml:space="preserve"> </w:t>
+      </w:r>
+      <w:r>
+        <w:rPr>
+          <w:b/>
+        </w:rPr>
+        <w:t>S296</w:t>
+      </w:r>
+      <w:r>
+        <w:t>.</w:t>
+      </w:r>
+    </w:p>
+    <w:p>
+      <w:r>
+        <w:t xml:space="preserve">33. Mildred Diane Gleason, “Ola (Yell County),” [Encyclopedia of Arkansas](https://encyclopediaofarkansas.net/entries/ola-yell-county-1021/). *Page seen* 31 Oct 2026. </w:t>
+      </w:r>
+      <w:r>
+        <w:rPr>
+          <w:b/>
+        </w:rPr>
+        <w:t>C376</w:t>
+      </w:r>
+      <w:r>
+        <w:t xml:space="preserve"> </w:t>
+      </w:r>
+      <w:r>
+        <w:rPr>
+          <w:b/>
+        </w:rPr>
+        <w:t>S292</w:t>
+      </w:r>
+      <w:r>
+        <w:t>.</w:t>
+      </w:r>
+    </w:p>
+    <w:p>
+      <w:r>
+        <w:t xml:space="preserve">34. Frozen Word original 31 Oct 2026: SHA-256 `781ed972…` (58,496 bytes). Drive search 0. </w:t>
+      </w:r>
+      <w:r>
+        <w:rPr>
+          <w:b/>
+        </w:rPr>
+        <w:t>S297</w:t>
+      </w:r>
+      <w:r>
+        <w:t>.</w:t>
+      </w:r>
+    </w:p>
+    <w:p>
+      <w:r>
         <w:br w:type="page"/>
       </w:r>
     </w:p>
@@ -3931,6 +4114,26 @@
     <w:p>
       <w:r>
         <w:t>| S281 | `../sources/press/genealogytrails-yell-obits-landing-2026-10-30.html` | [GT Yell obits](https://genealogytrails.com/ark/yell/obits.html) | Nil on landing | transcription only |</w:t>
+      </w:r>
+    </w:p>
+    <w:p>
+      <w:r>
+        <w:t>| S291 | `../sources/directories/amd-1921-arkansas-yell-ola-extract-2026-10-31.txt` | [IA 1921 AMD](https://archive.org/details/americanmedicald1921ameruoft) | Ola physicians 1921; no Beal | OCR only |</w:t>
+      </w:r>
+    </w:p>
+    <w:p>
+      <w:r>
+        <w:t>| S292 | `../sources/locality/encyclopedia-arkansas-ola-yell-2026-10-31.html` | [Enc. of Arkansas Ola](https://encyclopediaofarkansas.net/entries/ola-yell-county-1021/) | Town incorporated 1900; pop 655 in 1920 | page seen |</w:t>
+      </w:r>
+    </w:p>
+    <w:p>
+      <w:r>
+        <w:t>| S296 | `../sources/directories/amd-1929-arkansas-yell-ola-extract-2026-10-31.txt` | [IA 1929 AMD](https://archive.org/details/bwb_T3-BRL-424) | Ola physicians 1929; no Beal; Pool now in town | OCR only |</w:t>
+      </w:r>
+    </w:p>
+    <w:p>
+      <w:r>
+        <w:t>| S297 | `../sources/authored/Dora-Ella-Newnam-Stone-A-Life-original-main-2026-10-31.docx` | Local `book/` | Frozen Word bytes | original bytes |</w:t>
       </w:r>
     </w:p>
     <w:p>

</xml_diff>

<commit_message>
Pass 94: remaining 1930 Owsley every-line closed; Barrett John 85 NIL.
County-wide 1930 original NIL Barrett John ~85 / Susan ~78 as a couple
or heads. ED 95-2 remainder Clay 40, Andy 26, Alex 32, Carl 33, George
34 x Jennie, Richard 63, Willie 36, Polly grandfather 83, Sam 27,
Harrison 27, Bent 37, Henry 37, and James 50 x Martha DISPROVED as
John ~85; George 34 not merged with George 37; James 50 not merged
with Buffalo James 45. 95-3 Conrad Hiram 69 first-pass withdrawn.
95-4 William 42 x Daisy DISPROVED. 95-5 / 95-7 nil. 95-8 Emery 58 /
Oliphant 22 DISPROVED. Morgan 1900-1906 Josephine other/nil. T288
rolls 347/348 identified; images unseen. B061 / B063 remain open.

Co-authored-by: CatCorner22 <CatCorner22@users.noreply.github.com>
</commit_message>
<xml_diff>
--- a/research/dora-ella-newnam/book/Dora-Ella-Newnam-Stone-A-Life.docx
+++ b/research/dora-ella-newnam/book/Dora-Ella-Newnam-Stone-A-Life.docx
@@ -41,7 +41,7 @@
     </w:p>
     <w:p>
       <w:r>
-        <w:t>One hundred fifty-seven Cursor chats on this repository were reviewed for this volume (primary research, helpers, scans, and failed browser hunts). The original mobile session opened the case and read the Arkansas death certificate the family still holds. Later sessions recovered the 1880 childhood schedule that free transcripts had missed, walked statewide Soundex reels for 1910 and 1920, tested a Peebles third-marriage hypothesis and set it aside, and photographed NARA microfilm frames — the 1880 childhood schedule, the 1910 Kentucky Ella Miracode plates, Hardin Gray on Sturgeon sheet 13 B, the 1860 Owsley original of Silas Gray’s house with William aged thirteen, the 1850 Owsley Gray pages that are other men (Thomas, James, John, Charles), the given-name Silas plates that are other boys (Ratliff eight months, Wilson six, Phillips fifteen) and the Bowman line first read as Cyrus and then as Squire, the 1850 Estill Marcus Gray original, Breathitt’s Taulbee infant Silas and Bryant Siras, and Madison’s John Green house with Silas Green aged twenty, the 1850 Owsley Harrison Newman house with an eight-year-old Elias who is probably Dora’s father — a 1932 death extract names Henry Harrison Newnam as that father — and is not merged as proven, the 1860 Booneville original of that house under H.H. Newman with Elias aged eighteen, the 1850 William Newman house of twenty-six on the same page, the 1850 John Newman of sixty born in Tennessee who is not the 1880 John of sixty-nine, and Andrew Mays’s Giles at one month in 1850 and eleven in 1860, the 1870 Proctor original of James Brandenburg’s house, Silas Gray’s Sturgeon original, the 1880 District 59 originals of William next door to John Newnam and of Silas still in the district, the 1900 William Gray dwelling-84 crop, and the Bollinger page a sibling had labelled “Dora E. Stone,” which is Henry C. Rhodes and Dora M. of Missouri, and the 1920 Booneville, Buffalo, and Buck Creek originals with the rejected Taylor, Marcum, Magee, McIntosh, Baker, and McPherson houses, the 1910 Sturgeon Gilbert×Josie house, Lynch’s wife Laura without a Newman on the original, and the Buffalo Baker household whose Soundex card misnamed Gilbert John as Robert, the 1910 Buffalo Gilbert, John house next door to Baker, Robert H., and the Soundex Douglas card that shows the clerks indexed filmed Buffalo sheets, the 1910 Buffalo Bales house first read as Bowman, and the 1920 Bowman Henry, Jack, and Dean George × Jane originals that are other people, and the filmed Buffalo Dean George × Martha house that is probably the 1910 couple, and Kentucky’s B-630 Barrett Ben given-name slot now every-leaf closed — the two Barrett, Ben heads are eighteen in Franklin and sixty in Livingston, and Owsley Barrett, Bent, twenty-four, is a Booneville house with Mary, Maybe, and Stanley, not the 1910 Buffalo Ben — and Kentucky’s B-630 Barrett Bruce given-name slot now every-leaf closed as well: card 2451 copies the original Buffalo Bruce house, Billy twenty-two is the next dwelling, and Board Bruce of Muhlenberg is another man, and Kentucky’s B-630 Barrett John given-name slot now every-leaf closed: there is no Barrett, John of about seventy-five in Owsley district 92 as a head, Madison John seventy-one with grandson Sam and Lee County John fifty-six with Hershel are other men, and Soundex Beard, John, seventy-one, of Owsley district 90 copies the original Island Creek house of Beard, John, Virginia-born, with Margruy[?] and Herbert, not the 1910 Buffalo Barrett John, and Kentucky’s B-630 Barrett James given-name slot now every-leaf closed as a hit: original Buffalo dwelling 102 is Barrett, James, thirty, with Ollie, Ivory, Pearl, and mother Susan, sixty-eight, a widow — probably the 1910 James twenty-three and Susan sixty-two — and John is not in that house, and the Lee given-name slot is now every-leaf closed with no Barrett, Lee of about forty-nine in Owsley district 92 as a head. Statewide Kentucky death index 1911–1920 has no Barrett, John of about seventy in Lee, Owsley, Clay, Jackson, Estill, or Breathitt; Lee’s 1913 John Barrett, twenty-eight, is William and M. Roberts’s son, not the 1910 man. Statewide Kentucky death index 1921–1930 still has no Barrett, John of about eighty in those neighboring counties except Lee’s 12 April 1925 John Barrett, about seventy, at Beattyville, parents blank, who is not merged. Owsley’s 4 February 1921 Susan Barrett, sixty-five, daughter of Lacy Abner and Sintha Combs, is not James’s mother sixty-eight. The 12 April 1930 original Buffalo schedule — district 95-6, sheet 6 A, dwelling 92 — is Barrett, James, forty-five, with Ollie, thirty-four, Minnie, Pearl thirteen, Virgie, Martha, and Horton; that is probably the 1920 house, and Soundex B-630 missed it. John and Susan are not in the house and are not Barrett heads in that entire Buffalo district. Statewide Kentucky death index 1931–1940 has no Barrett, John of about ninety in those neighboring counties; a 1937 John Barrett, eighty-nine, of Nicholas County, is not merged. The 1940 Owsley HTML has no James of about fifty with Ollie; James sixty with Martha is another couple. The rest of Owsley County in 1930 is mapped but not every-line closed. Booneville Town is now every-line closed: Barrett, A.W., forty-five, with Mattie, is not John of about eighty-five, and is not Buffalo James with Ollie; Barrett, Lewis, twenty-two, a son in Thomas Wilson’s house, is another man; Leonard and Fred on sheet 2 B are Beckner, not Barrett. Booneville magisterial district 1 dwelling 85 is Barrett, Walker, thirty-eight, with Rosie — not John of about eighty-five — and Bowman Elisha’s Ollie, Mayers’s Ollie, and Beard James are other people. The same district’s later sheets hold a Barrett cluster: Robert, forty-one, with Kate and a son John of fourteen; Hayden, thirty-two; another Robert, twenty-eight, with Laura, not merged with Robert forty-one; Hiram, thirty-four; Charley, thirty-five, whose daughters Dollie and Effie are not Ollie of thirty-four; and George, thirty-seven, with Rosie, thirty-seven, not Walker’s Rosie of thirty-two. All are other houses. A 1939 *Owsley County Courier* obituary for William Barrett, seventy-nine, who died 13 April at Oil, with sons Walker and Fred of Clay City and a brother John Bell of Beattyville, is not the 1910 John; Walker as that William’s son is a possible associate of the 1930 Walker house only and is not merged. Statewide Kentucky death index 1931–1940 has no Barrett, Ollie or Susan; a 1934 Brison Barrett, eighty-nine, of Clay is not the 1930 Brison of twenty-eight. Campbell County’s 1899–1904 Alexandria bonds name Josephine Wetterhan, who married Edward Brauntz in 1903, not Josephine Newnam; Hopkins 1898–1904 and Webster 1860–1900 have other Josephines; Owsley’s marriage directory still skips 1879–1902. The federal pension index remains unopened. This volume folds those chats into one narrative. The case dossier remains the working file; this book is the public reading of it. Sibling work on Greene ED 37 through 41 is now on merged PR #26 through Pass 59; remaining Greene ED 38 B-sides, 1900 Liberty, and 1900 hh 85 are inventoried, not duplicated. Do not import their “Dora E. Stone” as this woman.</w:t>
+        <w:t>One hundred seventy-three Cursor chats on this repository were reviewed for this volume (primary research, helpers, scans, and failed browser hunts). The original mobile session opened the case and read the Arkansas death certificate the family still holds. Later sessions recovered the 1880 childhood schedule that free transcripts had missed, walked statewide Soundex reels for 1910 and 1920, tested a Peebles third-marriage hypothesis and set it aside, and photographed NARA microfilm frames — the 1880 childhood schedule, the 1910 Kentucky Ella Miracode plates, Hardin Gray on Sturgeon sheet 13 B, the 1860 Owsley original of Silas Gray’s house with William aged thirteen, the 1850 Owsley Gray pages that are other men (Thomas, James, John, Charles), the given-name Silas plates that are other boys (Ratliff eight months, Wilson six, Phillips fifteen) and the Bowman line first read as Cyrus and then as Squire, the 1850 Estill Marcus Gray original, Breathitt’s Taulbee infant Silas and Bryant Siras, and Madison’s John Green house with Silas Green aged twenty, the 1850 Owsley Harrison Newman house with an eight-year-old Elias who is probably Dora’s father — a 1932 death extract names Henry Harrison Newnam as that father — and is not merged as proven, the 1860 Booneville original of that house under H.H. Newman with Elias aged eighteen, the 1850 William Newman house of twenty-six on the same page, the 1850 John Newman of sixty born in Tennessee who is not the 1880 John of sixty-nine, and Andrew Mays’s Giles at one month in 1850 and eleven in 1860, the 1870 Proctor original of James Brandenburg’s house, Silas Gray’s Sturgeon original, the 1880 District 59 originals of William next door to John Newnam and of Silas still in the district, the 1900 William Gray dwelling-84 crop, and the Bollinger page a sibling had labelled “Dora E. Stone,” which is Henry C. Rhodes and Dora M. of Missouri, and the 1920 Booneville, Buffalo, and Buck Creek originals with the rejected Taylor, Marcum, Magee, McIntosh, Baker, and McPherson houses, the 1910 Sturgeon Gilbert×Josie house, Lynch’s wife Laura without a Newman on the original, and the Buffalo Baker household whose Soundex card misnamed Gilbert John as Robert, the 1910 Buffalo Gilbert, John house next door to Baker, Robert H., and the Soundex Douglas card that shows the clerks indexed filmed Buffalo sheets, the 1910 Buffalo Bales house first read as Bowman, and the 1920 Bowman Henry, Jack, and Dean George × Jane originals that are other people, and the filmed Buffalo Dean George × Martha house that is probably the 1910 couple, and Kentucky’s B-630 Barrett Ben given-name slot now every-leaf closed — the two Barrett, Ben heads are eighteen in Franklin and sixty in Livingston, and Owsley Barrett, Bent, twenty-four, is a Booneville house with Mary, Maybe, and Stanley, not the 1910 Buffalo Ben — and Kentucky’s B-630 Barrett Bruce given-name slot now every-leaf closed as well: card 2451 copies the original Buffalo Bruce house, Billy twenty-two is the next dwelling, and Board Bruce of Muhlenberg is another man, and Kentucky’s B-630 Barrett John given-name slot now every-leaf closed: there is no Barrett, John of about seventy-five in Owsley district 92 as a head, Madison John seventy-one with grandson Sam and Lee County John fifty-six with Hershel are other men, and Soundex Beard, John, seventy-one, of Owsley district 90 copies the original Island Creek house of Beard, John, Virginia-born, with Margruy[?] and Herbert, not the 1910 Buffalo Barrett John, and Kentucky’s B-630 Barrett James given-name slot now every-leaf closed as a hit: original Buffalo dwelling 102 is Barrett, James, thirty, with Ollie, Ivory, Pearl, and mother Susan, sixty-eight, a widow — probably the 1910 James twenty-three and Susan sixty-two — and John is not in that house, and the Lee given-name slot is now every-leaf closed with no Barrett, Lee of about forty-nine in Owsley district 92 as a head. Statewide Kentucky death index 1911–1920 has no Barrett, John of about seventy in Lee, Owsley, Clay, Jackson, Estill, or Breathitt; Lee’s 1913 John Barrett, twenty-eight, is William and M. Roberts’s son, not the 1910 man. Statewide Kentucky death index 1921–1930 still has no Barrett, John of about eighty in those neighboring counties except Lee’s 12 April 1925 John Barrett, about seventy, at Beattyville, parents blank, who is not merged. Owsley’s 4 February 1921 Susan Barrett, sixty-five, daughter of Lacy Abner and Sintha Combs, is not James’s mother sixty-eight. The 12 April 1930 original Buffalo schedule — district 95-6, sheet 6 A, dwelling 92 — is Barrett, James, forty-five, with Ollie, thirty-four, Minnie, Pearl thirteen, Virgie, Martha, and Horton; that is probably the 1920 house, and Soundex B-630 missed it. John and Susan are not in the house and are not Barrett heads in that entire Buffalo district. Statewide Kentucky death index 1931–1940 has no Barrett, John of about ninety in those neighboring counties; a 1937 John Barrett, eighty-nine, of Nicholas County, is not merged. The 1940 Owsley HTML has no James of about fifty with Ollie; James sixty with Martha is another couple. The rest of Owsley County in 1930 is now every-line closed. Booneville Town is now every-line closed: Barrett, A.W., forty-five, with Mattie, is not John of about eighty-five, and is not Buffalo James with Ollie; Barrett, Lewis, twenty-two, a son in Thomas Wilson’s house, is another man; Leonard and Fred on sheet 2 B are Beckner, not Barrett. Booneville magisterial district 1 dwelling 85 is Barrett, Walker, thirty-eight, with Rosie — not John of about eighty-five — and Bowman Elisha’s Ollie, Mayers’s Ollie, and Beard James are other people. The same district’s later sheets hold a Barrett cluster: Robert, forty-one, with Kate and a son John of fourteen; Hayden, thirty-two; another Robert, twenty-eight, with Laura, not merged with Robert forty-one; Hiram, thirty-four; Charley, thirty-five, whose daughters Dollie and Effie are not Ollie of thirty-four; and George, thirty-seven, with Rosie, thirty-seven, not Walker’s Rosie of thirty-two. All are other houses. A 1939 *Owsley County Courier* obituary for William Barrett, seventy-nine, who died 13 April at Oil, with sons Walker and Fred of Clay City and a brother John Bell of Beattyville, is not the 1910 John; Walker as that William’s son is a possible associate of the 1930 Walker house only and is not merged. Statewide Kentucky death index 1931–1940 has no Barrett, Ollie or Susan; a 1934 Brison Barrett, eighty-nine, of Clay is not the 1930 Brison of twenty-eight. Campbell County’s 1899–1904 Alexandria bonds name Josephine Wetterhan, who married Edward Brauntz in 1903, not Josephine Newnam; Hopkins 1898–1904 and Webster 1860–1900 have other Josephines; Owsley’s marriage directory still skips 1879–1902. Booneville magisterial district 1’s remaining sheets are now every-line closed as well: Clay, forty, with Ollie is not Buffalo James with Ollie; Andy, twenty-six, and Alex, thirty-two, are other men; Carl, thirty-three, with Nannie; George, thirty-four, with Jennie, not merged with George thirty-seven with Rosie; Richard, sixty-three, with Francis; Willie, thirty-six, next door; Polly, a grandfather of eighty-three, is not John; Sam, twenty-seven; Harrison, twenty-seven; Bent, thirty-seven, with Mary; Henry, thirty-seven, with Nannie, not merged with Bent; and James, fifty, with Martha, not merged with Buffalo James with Ollie. Three Barrett men aged thirty-seven in that district stay unmerged. A first-pass Barrett on Sturgeon sheet 1 A is Conrad, Hiram, sixty-nine. Island Creek has William, forty-two, with Daisy, not the 1939 William of seventy-nine. Cow Creek and Buck Creek have no Barrett head. Wild Dog has Emery, fifty-eight, with Emily, and Oliphant, twenty-two. There is no Barrett, John of about eighty-five, and no Barrett, Susan of about seventy-eight, as a couple or as heads in any of the eight Owsley districts. Morgan County’s 1900–1906 compiled marriages name other Josephines. The federal pension index is identified to NARA rolls 347 and 348; the card images remain unopened. This volume folds those chats into one narrative. The case dossier remains the working file; this book is the public reading of it. Sibling work on Greene ED 37 through 41 is now on merged PR #26 through Pass 59; remaining Greene ED 38 B-sides, 1900 Liberty, and 1900 hh 85 are inventoried, not duplicated. Do not import their “Dora E. Stone” as this woman.</w:t>
       </w:r>
     </w:p>
     <w:p>
@@ -903,7 +903,7 @@
         <w:t>Susan</w:t>
       </w:r>
       <w:r>
-        <w:t xml:space="preserve">, sixty-eight, a widow. Kentucky’s B-630 card 3382 copies that original; the clerk’s ages thirty-six and Pearl two yield to the schedule. That is probably the 1910 Buffalo James of twenty-three and Susan of sixty-two: Barrett James plus Owsley Buffalo plus mother Susan. Ages thirty versus about thirty-three and sixty-eight versus about seventy-two are disclosed and not averaged. John is not in the house. Susan’s widow mark plus that absence is a possible death between 1910 and 1920, not a proved death. Statewide Kentucky death index 1911–1920 has no Barrett, John of about seventy in those neighboring counties. Lee’s 11 October 1913 John Barrett, twenty-eight, father William, mother M. Roberts, is another man. Statewide Kentucky death index 1921–1930 still has no Barrett, John of about eighty in those neighboring counties except Lee’s 12 April 1925 John Barrett, about seventy, at Beattyville, parents blank, who is not merged. Owsley’s 4 February 1921 Susan Barrett, sixty-five, daughter of Lacy Abner and Sintha Combs, is not James’s mother sixty-eight. The 12 April 1930 original Buffalo schedule — district 95-6, sheet 6 A, dwelling 92 — is Barrett, James, forty-five, with Ollie, thirty-four, Minnie fifteen, Pearl thirteen, Virgie nine, Martha five, and Horton three. That is probably the 1920 house: Barrett James with Ollie, Buffalo, and Pearl three to thirteen. Soundex B-630 missed it. James thirty to forty-five is plus fifteen in ten and is not averaged; Ivory versus Minnie is not merged; 1920 Pearl as a son versus 1930 Pearl as a daughter is disclosed. John and Susan are not in the house and are not Barrett heads in that entire Buffalo district. Statewide Kentucky death index 1931–1940 has no Barrett, John of about ninety in those neighboring counties; a 2 October 1937 John Barrett, eighty-nine, of Nicholas County, is not merged. The 1940 Owsley HTML has no James of about fifty with Ollie; James sixty with Martha is another couple. The rest of the 1930 county is mapped, not every-line closed. Booneville Town is now every-line closed: Barrett, A.W., forty-five, with Mattie, Moffet, Ralph, and Monroe, is not John of about eighty-five and is not Buffalo James with Ollie; Barrett, Lewis, twenty-two, a son in Thomas Wilson’s house, is another man; Leonard forty-two and Fred twenty-one on sheet 2 B are Beckner, not Barrett. Booneville magisterial district 1 dwelling 85 is Barrett, Walker, thirty-eight, with Rosie, Daily, Stella, Fred, Berlin, Marie, and Geneva — not John of about eighty-five — and Bowman Elisha’s Ollie, Mayers’s Ollie, and Beard James of twenty-seven are other people. Later sheets of that district hold Robert, forty-one, with Kate and a son John of fourteen; Hayden, thirty-two, with Eva; another Robert, twenty-eight, with Laura, not merged with Robert forty-one; Hiram, thirty-four, with Lillie; Charley, thirty-five, with Martha, whose Dollie and Effie are not Ollie of thirty-four; and George, thirty-seven, with Rosie, thirty-seven, Luther, Birdie, Ada, Edna, Harris, Charley, Cintha, and Lee — not Walker’s Rosie of thirty-two. A 21 April 1939 *Owsley County Courier* obituary for William Barrett, seventy-nine, who died 13 April at his daughter Mrs. Leno Combs’s in Oil, with sons Walker and Fred of Clay City and a brother John Bell Barrett of Beattyville, is not the 1910 John; Walker as that William’s son is a possible associate of the 1930 Walker house only and is not merged. Statewide Kentucky death index 1931–1940 has no Barrett, Ollie or Susan; a 1934 Brison Barrett, eighty-nine, of Clay is not the 1930 Brison of twenty-eight. Campbell County’s Alexandria bonds for 1899–1904 name Josephine Wetterhan, who married Edward Brauntz in 1903, not Josephine Newnam; Hopkins 1898–1904 and Webster 1860–1900 have other Josephines; Owsley’s marriage directory still skips 1879–1902. A 1933 Owsley James Barrett, thirty-four, son of Dan and Nancy Ann Bowles, is another man. Kentucky’s B-630 Lee given-name slot is now every-leaf closed: there is no Barrett, Lee of about forty-nine in Owsley district 92 as a head, and Lee is not in James’s house. Baird, Lee, forty-nine, of Clay is another man. Sheet 7 A dwelling </w:t>
+        <w:t xml:space="preserve">, sixty-eight, a widow. Kentucky’s B-630 card 3382 copies that original; the clerk’s ages thirty-six and Pearl two yield to the schedule. That is probably the 1910 Buffalo James of twenty-three and Susan of sixty-two: Barrett James plus Owsley Buffalo plus mother Susan. Ages thirty versus about thirty-three and sixty-eight versus about seventy-two are disclosed and not averaged. John is not in the house. Susan’s widow mark plus that absence is a possible death between 1910 and 1920, not a proved death. Statewide Kentucky death index 1911–1920 has no Barrett, John of about seventy in those neighboring counties. Lee’s 11 October 1913 John Barrett, twenty-eight, father William, mother M. Roberts, is another man. Statewide Kentucky death index 1921–1930 still has no Barrett, John of about eighty in those neighboring counties except Lee’s 12 April 1925 John Barrett, about seventy, at Beattyville, parents blank, who is not merged. Owsley’s 4 February 1921 Susan Barrett, sixty-five, daughter of Lacy Abner and Sintha Combs, is not James’s mother sixty-eight. The 12 April 1930 original Buffalo schedule — district 95-6, sheet 6 A, dwelling 92 — is Barrett, James, forty-five, with Ollie, thirty-four, Minnie fifteen, Pearl thirteen, Virgie nine, Martha five, and Horton three. That is probably the 1920 house: Barrett James with Ollie, Buffalo, and Pearl three to thirteen. Soundex B-630 missed it. James thirty to forty-five is plus fifteen in ten and is not averaged; Ivory versus Minnie is not merged; 1920 Pearl as a son versus 1930 Pearl as a daughter is disclosed. John and Susan are not in the house and are not Barrett heads in that entire Buffalo district. Statewide Kentucky death index 1931–1940 has no Barrett, John of about ninety in those neighboring counties; a 2 October 1937 John Barrett, eighty-nine, of Nicholas County, is not merged. The 1940 Owsley HTML has no James of about fifty with Ollie; James sixty with Martha is another couple. The rest of the 1930 county is now every-line closed. Booneville Town is now every-line closed: Barrett, A.W., forty-five, with Mattie, Moffet, Ralph, and Monroe, is not John of about eighty-five and is not Buffalo James with Ollie; Barrett, Lewis, twenty-two, a son in Thomas Wilson’s house, is another man; Leonard forty-two and Fred twenty-one on sheet 2 B are Beckner, not Barrett. Booneville magisterial district 1 dwelling 85 is Barrett, Walker, thirty-eight, with Rosie, Daily, Stella, Fred, Berlin, Marie, and Geneva — not John of about eighty-five — and Bowman Elisha’s Ollie, Mayers’s Ollie, and Beard James of twenty-seven are other people. Later sheets of that district hold Robert, forty-one, with Kate and a son John of fourteen; Hayden, thirty-two, with Eva; another Robert, twenty-eight, with Laura, not merged with Robert forty-one; Hiram, thirty-four, with Lillie; Charley, thirty-five, with Martha, whose Dollie and Effie are not Ollie of thirty-four; and George, thirty-seven, with Rosie, thirty-seven, Luther, Birdie, Ada, Edna, Harris, Charley, Cintha, and Lee — not Walker’s Rosie of thirty-two. A 21 April 1939 *Owsley County Courier* obituary for William Barrett, seventy-nine, who died 13 April at his daughter Mrs. Leno Combs’s in Oil, with sons Walker and Fred of Clay City and a brother John Bell Barrett of Beattyville, is not the 1910 John; Walker as that William’s son is a possible associate of the 1930 Walker house only and is not merged. Statewide Kentucky death index 1931–1940 has no Barrett, Ollie or Susan; a 1934 Brison Barrett, eighty-nine, of Clay is not the 1930 Brison of twenty-eight. Campbell County’s Alexandria bonds for 1899–1904 name Josephine Wetterhan, who married Edward 